<commit_message>
Removed extra folder of screenshots. Worked on manual, barebones up to Menus Guide.
</commit_message>
<xml_diff>
--- a/9tapUserManual.docx
+++ b/9tapUserManual.docx
@@ -25,7 +25,10 @@
         <w:pStyle w:val="CompanyName"/>
       </w:pPr>
       <w:r>
-        <w:t>9 TAP TOUR</w:t>
+        <w:t>9-</w:t>
+      </w:r>
+      <w:r>
+        <w:t>TAP TOUR</w:t>
       </w:r>
     </w:p>
     <w:p>
@@ -38,6 +41,7 @@
         <w:pStyle w:val="TitleCover"/>
         <w:sectPr>
           <w:footerReference w:type="default" r:id="rId8"/>
+          <w:headerReference w:type="first" r:id="rId9"/>
           <w:pgSz w:w="12240" w:h="15840" w:code="1"/>
           <w:pgMar w:top="960" w:right="960" w:bottom="1440" w:left="960" w:header="0" w:footer="0" w:gutter="0"/>
           <w:pgNumType w:start="0"/>
@@ -58,7 +62,13 @@
       </w:pPr>
       <w:r>
         <w:lastRenderedPageBreak/>
-        <w:t>9 tap tour</w:t>
+        <w:t>9</w:t>
+      </w:r>
+      <w:r>
+        <w:t>-</w:t>
+      </w:r>
+      <w:r>
+        <w:t>tap tour</w:t>
       </w:r>
     </w:p>
     <w:p>
@@ -77,7 +87,13 @@
         <w:sym w:font="Symbol" w:char="F0E3"/>
       </w:r>
       <w:r>
-        <w:t xml:space="preserve"> 9 Tap Tour</w:t>
+        <w:t xml:space="preserve"> 9</w:t>
+      </w:r>
+      <w:r>
+        <w:t>-</w:t>
+      </w:r>
+      <w:r>
+        <w:t>Tap Tour</w:t>
       </w:r>
     </w:p>
     <w:p>
@@ -99,18 +115,26 @@
     <w:p>
       <w:pPr>
         <w:pStyle w:val="ReturnAddress"/>
+      </w:pPr>
+      <w:r>
+        <w:t xml:space="preserve">Phone </w:t>
+      </w:r>
+      <w:r>
+        <w:t>253.</w:t>
+      </w:r>
+      <w:r>
+        <w:t>987.7975</w:t>
+      </w:r>
+    </w:p>
+    <w:p>
+      <w:pPr>
+        <w:pStyle w:val="ReturnAddress"/>
         <w:rPr>
           <w:spacing w:val="0"/>
         </w:rPr>
       </w:pPr>
       <w:r>
-        <w:t xml:space="preserve">Phone </w:t>
-      </w:r>
-      <w:r>
-        <w:t>253.</w:t>
-      </w:r>
-      <w:r>
-        <w:t>987.7975</w:t>
+        <w:t xml:space="preserve">Email </w:t>
       </w:r>
     </w:p>
     <w:p>
@@ -122,10 +146,11 @@
       </w:pPr>
     </w:p>
     <w:p/>
+    <w:p/>
     <w:p>
       <w:pPr>
         <w:sectPr>
-          <w:footerReference w:type="first" r:id="rId9"/>
+          <w:footerReference w:type="first" r:id="rId10"/>
           <w:pgSz w:w="12240" w:h="15840" w:code="1"/>
           <w:pgMar w:top="1800" w:right="1200" w:bottom="1440" w:left="1200" w:header="960" w:footer="960" w:gutter="0"/>
           <w:pgNumType w:fmt="lowerRoman" w:start="1"/>
@@ -138,12 +163,13 @@
       <w:pPr>
         <w:pStyle w:val="SectionLabel"/>
         <w:sectPr>
-          <w:headerReference w:type="default" r:id="rId10"/>
-          <w:footerReference w:type="default" r:id="rId11"/>
+          <w:headerReference w:type="default" r:id="rId11"/>
+          <w:footerReference w:type="default" r:id="rId12"/>
           <w:pgSz w:w="12240" w:h="15840" w:code="1"/>
-          <w:pgMar w:top="1200" w:right="1200" w:bottom="1440" w:left="1200" w:header="0" w:footer="960" w:gutter="0"/>
+          <w:pgMar w:top="1200" w:right="1200" w:bottom="1440" w:left="1200" w:header="864" w:footer="960" w:gutter="0"/>
           <w:pgNumType w:fmt="lowerRoman" w:start="1"/>
           <w:cols w:space="720"/>
+          <w:docGrid w:linePitch="218"/>
         </w:sectPr>
       </w:pPr>
       <w:r>
@@ -265,7 +291,21 @@
             <w:rStyle w:val="Hyperlink"/>
             <w:noProof/>
           </w:rPr>
-          <w:t>Installation of 9 Tap program</w:t>
+          <w:t>Installation of 9</w:t>
+        </w:r>
+        <w:r>
+          <w:rPr>
+            <w:rStyle w:val="Hyperlink"/>
+            <w:noProof/>
+          </w:rPr>
+          <w:t>-</w:t>
+        </w:r>
+        <w:r>
+          <w:rPr>
+            <w:rStyle w:val="Hyperlink"/>
+            <w:noProof/>
+          </w:rPr>
+          <w:t>Tap program</w:t>
         </w:r>
         <w:r>
           <w:rPr>
@@ -1050,19 +1090,42 @@
         <w:t>1</w:t>
       </w:r>
     </w:p>
-    <w:p>
-      <w:pPr>
-        <w:sectPr>
-          <w:headerReference w:type="default" r:id="rId12"/>
-          <w:footerReference w:type="default" r:id="rId13"/>
-          <w:headerReference w:type="first" r:id="rId14"/>
-          <w:footerReference w:type="first" r:id="rId15"/>
-          <w:pgSz w:w="12240" w:h="15840" w:code="1"/>
-          <w:pgMar w:top="1800" w:right="1200" w:bottom="1440" w:left="1200" w:header="960" w:footer="960" w:gutter="0"/>
-          <w:pgNumType w:start="1"/>
-          <w:cols w:space="360"/>
-        </w:sectPr>
-      </w:pPr>
+    <w:p/>
+    <w:p/>
+    <w:p/>
+    <w:p/>
+    <w:p/>
+    <w:p/>
+    <w:p/>
+    <w:p/>
+    <w:p/>
+    <w:p/>
+    <w:p/>
+    <w:p/>
+    <w:p/>
+    <w:p>
+      <w:pPr>
+        <w:pStyle w:val="Subtitle"/>
+      </w:pPr>
+      <w:r>
+        <w:t>9-tap tour</w:t>
+      </w:r>
+    </w:p>
+    <w:p>
+      <w:pPr>
+        <w:pStyle w:val="Title"/>
+      </w:pPr>
+      <w:r>
+        <w:t>Welcome</w:t>
+      </w:r>
+    </w:p>
+    <w:p>
+      <w:pPr>
+        <w:pStyle w:val="Caption"/>
+      </w:pPr>
+      <w:r>
+        <w:br w:type="page"/>
+      </w:r>
     </w:p>
     <w:p>
       <w:pPr>
@@ -1070,10 +1133,7 @@
       </w:pPr>
       <w:r>
         <w:lastRenderedPageBreak/>
-        <w:t>About 9 Tap Tour</w:t>
-      </w:r>
-      <w:r>
-        <w:t xml:space="preserve"> INC</w:t>
+        <w:t>About 9 Tap Tour INC</w:t>
       </w:r>
     </w:p>
     <w:p>
@@ -1088,49 +1148,7 @@
         <w:rPr>
           <w:spacing w:val="-5"/>
         </w:rPr>
-        <w:t xml:space="preserve">Welcome to the 9 Tap Tour Program. </w:t>
-      </w:r>
-      <w:r>
-        <w:rPr>
-          <w:spacing w:val="-5"/>
-        </w:rPr>
-        <w:t xml:space="preserve">9-Tap Tour, INC. is a unique, fun and professionally run tournament. Members enjoy our </w:t>
-      </w:r>
-      <w:r>
-        <w:rPr>
-          <w:spacing w:val="-5"/>
-        </w:rPr>
-        <w:t>“</w:t>
-      </w:r>
-      <w:r>
-        <w:rPr>
-          <w:spacing w:val="-5"/>
-        </w:rPr>
-        <w:t>Beat the Board</w:t>
-      </w:r>
-      <w:r>
-        <w:rPr>
-          <w:spacing w:val="-5"/>
-        </w:rPr>
-        <w:t>”</w:t>
-      </w:r>
-      <w:r>
-        <w:rPr>
-          <w:spacing w:val="-5"/>
-        </w:rPr>
-        <w:t xml:space="preserve"> format, with four games per squad. Yet the fun, big payouts, special </w:t>
-      </w:r>
-      <w:r>
-        <w:rPr>
-          <w:spacing w:val="-5"/>
-        </w:rPr>
-        <w:t>pots</w:t>
-      </w:r>
-      <w:r>
-        <w:rPr>
-          <w:spacing w:val="-5"/>
-        </w:rPr>
-        <w:t xml:space="preserve"> and the 9-Tap version of bowling itself, brings new excitement to tournaments.</w:t>
+        <w:t>Welcome to the 9 Tap Tour Program. 9-Tap Tour, INC. is a unique, fun and professionally run tournament. Members enjoy our “Beat the Board” format, with four games per squad. Yet the fun, big payouts, special pots and the 9-Tap version of bowling itself, brings new excitement to tournaments.</w:t>
       </w:r>
     </w:p>
     <w:p>
@@ -1269,8 +1287,11 @@
     </w:p>
     <w:p>
       <w:pPr>
-        <w:pStyle w:val="Heading1"/>
-        <w:rPr>
+        <w:rPr>
+          <w:rFonts w:ascii="Arial Black" w:hAnsi="Arial Black"/>
+          <w:color w:val="808080"/>
+          <w:spacing w:val="-25"/>
+          <w:kern w:val="28"/>
           <w:sz w:val="40"/>
           <w:szCs w:val="40"/>
         </w:rPr>
@@ -1280,57 +1301,22 @@
           <w:sz w:val="40"/>
           <w:szCs w:val="40"/>
         </w:rPr>
+        <w:br w:type="page"/>
+      </w:r>
+    </w:p>
+    <w:p>
+      <w:pPr>
+        <w:pStyle w:val="Heading2"/>
+        <w:rPr>
+          <w:szCs w:val="20"/>
+        </w:rPr>
+      </w:pPr>
+      <w:r>
+        <w:rPr>
+          <w:szCs w:val="20"/>
+        </w:rPr>
         <w:lastRenderedPageBreak/>
-        <w:t>Setup and Installation</w:t>
-      </w:r>
-    </w:p>
-    <w:p>
-      <w:pPr>
-        <w:pStyle w:val="Heading2"/>
-        <w:rPr>
-          <w:sz w:val="24"/>
-          <w:szCs w:val="24"/>
-        </w:rPr>
-      </w:pPr>
-      <w:r>
-        <w:rPr>
-          <w:sz w:val="24"/>
-          <w:szCs w:val="24"/>
-        </w:rPr>
-        <w:t>System Requirements</w:t>
-      </w:r>
-    </w:p>
-    <w:p>
-      <w:pPr>
-        <w:pStyle w:val="BodyTextKeep"/>
-      </w:pPr>
-      <w:r>
-        <w:t>The s</w:t>
-      </w:r>
-      <w:r>
-        <w:t>ystem requirements to run the 9 tap software are as follows:</w:t>
-      </w:r>
-      <w:r>
-        <w:t xml:space="preserve"> Windows 10, (Windows 8, or Windows 7). Storage: how much? USB port. Dot matrix and ink/laser-jet</w:t>
-      </w:r>
-      <w:r>
-        <w:t xml:space="preserve"> printers. Microsoft Excel must be installed on the computer for the 9 Tap Tour program to work.</w:t>
-      </w:r>
-    </w:p>
-    <w:p>
-      <w:pPr>
-        <w:pStyle w:val="Heading2"/>
-        <w:rPr>
-          <w:sz w:val="24"/>
-          <w:szCs w:val="24"/>
-        </w:rPr>
-      </w:pPr>
-      <w:r>
-        <w:rPr>
-          <w:sz w:val="24"/>
-          <w:szCs w:val="24"/>
-        </w:rPr>
-        <w:t>WARNING:</w:t>
+        <w:t>Dedication:</w:t>
       </w:r>
     </w:p>
     <w:p>
@@ -1338,241 +1324,18 @@
         <w:pStyle w:val="BodyText"/>
       </w:pPr>
       <w:r>
-        <w:t xml:space="preserve">If tournament has </w:t>
-      </w:r>
-      <w:r>
-        <w:t>five (5) or fewer</w:t>
-      </w:r>
-      <w:r>
-        <w:t xml:space="preserve"> participants, DO NOT USE PROGRAM. Keep track of player data manually.</w:t>
-      </w:r>
-    </w:p>
-    <w:p>
-      <w:pPr>
-        <w:pStyle w:val="Heading2"/>
-        <w:rPr>
-          <w:sz w:val="24"/>
-          <w:szCs w:val="24"/>
-        </w:rPr>
-      </w:pPr>
-      <w:r>
-        <w:rPr>
-          <w:sz w:val="24"/>
-          <w:szCs w:val="24"/>
-        </w:rPr>
-        <w:t>Installation</w:t>
-      </w:r>
-    </w:p>
-    <w:p>
-      <w:pPr>
-        <w:pStyle w:val="BodyText"/>
-        <w:numPr>
-          <w:ilvl w:val="0"/>
-          <w:numId w:val="40"/>
-        </w:numPr>
-      </w:pPr>
-      <w:r>
-        <w:t>Start Windows and exit all other applications.</w:t>
-      </w:r>
-    </w:p>
-    <w:p>
-      <w:pPr>
-        <w:pStyle w:val="BodyText"/>
-        <w:numPr>
-          <w:ilvl w:val="0"/>
-          <w:numId w:val="40"/>
-        </w:numPr>
-      </w:pPr>
-      <w:r>
-        <w:t>Insert the 9 Tap Tour USB drive into your computer’s USB port.</w:t>
-      </w:r>
-    </w:p>
-    <w:p>
-      <w:pPr>
-        <w:pStyle w:val="BodyText"/>
-        <w:numPr>
-          <w:ilvl w:val="0"/>
-          <w:numId w:val="40"/>
-        </w:numPr>
-      </w:pPr>
-      <w:r>
-        <w:t>If the file manager dialog does not appear, click the Start button on your Windows taskbar, then click Run. Type D:\Setup and click on OK. (Note: If your removable USB drive is assigned a letter other than D, use that letter.)</w:t>
-      </w:r>
-    </w:p>
-    <w:p>
-      <w:pPr>
-        <w:pStyle w:val="BodyText"/>
-        <w:numPr>
-          <w:ilvl w:val="0"/>
-          <w:numId w:val="40"/>
-        </w:numPr>
-      </w:pPr>
-      <w:r>
-        <w:t>The installation wizard will now run.</w:t>
-      </w:r>
-    </w:p>
-    <w:p>
-      <w:pPr>
-        <w:pStyle w:val="BodyText"/>
-        <w:numPr>
-          <w:ilvl w:val="0"/>
-          <w:numId w:val="40"/>
-        </w:numPr>
-      </w:pPr>
-      <w:r>
-        <w:t>The next window will prompt you to shut down all other running programs before starting the 9 Tap Tour installation process. Do this and then click “Next” to continue.</w:t>
-      </w:r>
-    </w:p>
-    <w:p>
-      <w:pPr>
-        <w:pStyle w:val="BodyText"/>
-        <w:numPr>
-          <w:ilvl w:val="0"/>
-          <w:numId w:val="40"/>
-        </w:numPr>
-      </w:pPr>
-      <w:r>
-        <w:t>End User License agreement.</w:t>
-      </w:r>
-      <w:r>
-        <w:t xml:space="preserve"> Read the agreement, and if you agree to the terms and conditions chose “I agree.” Then click the “I Agree” button to continue the installation process.</w:t>
-      </w:r>
-    </w:p>
-    <w:p>
-      <w:pPr>
-        <w:pStyle w:val="BodyText"/>
-        <w:numPr>
-          <w:ilvl w:val="0"/>
-          <w:numId w:val="40"/>
-        </w:numPr>
-      </w:pPr>
-      <w:r>
-        <w:t>Next, chose an install location for the program. Either accept the default location or choose another location. Once you’re satisfied with your choice, click “Next” to continue installing.</w:t>
-      </w:r>
-    </w:p>
-    <w:p>
-      <w:pPr>
-        <w:pStyle w:val="BodyText"/>
-        <w:numPr>
-          <w:ilvl w:val="0"/>
-          <w:numId w:val="40"/>
-        </w:numPr>
-      </w:pPr>
-      <w:r>
-        <w:t xml:space="preserve">Select a Start Menu Folder for 9 Tap Tour. Either accept the default location or chose another. If you don’t want a Start Menu folder to be created check the box “Do Not Create </w:t>
-      </w:r>
-      <w:proofErr w:type="gramStart"/>
-      <w:r>
-        <w:t>A</w:t>
-      </w:r>
-      <w:proofErr w:type="gramEnd"/>
-      <w:r>
-        <w:t xml:space="preserve"> Start Menu Folder”. Once you are satisfied with your selection click the “Next” button to continue.</w:t>
-      </w:r>
-    </w:p>
-    <w:p>
-      <w:pPr>
-        <w:pStyle w:val="BodyText"/>
-        <w:numPr>
-          <w:ilvl w:val="0"/>
-          <w:numId w:val="40"/>
-        </w:numPr>
-      </w:pPr>
-      <w:r>
-        <w:t>Select the shortcuts you want created. Chose to create shortcuts on the Desktop, Quick Launch Toolbar, or neither. Once you are satisfied with your selection click on the “Next” button to continue.</w:t>
-      </w:r>
-    </w:p>
-    <w:p>
-      <w:pPr>
-        <w:pStyle w:val="BodyText"/>
-        <w:numPr>
-          <w:ilvl w:val="0"/>
-          <w:numId w:val="40"/>
-        </w:numPr>
-      </w:pPr>
-      <w:r>
-        <w:t>The 9 Tap Tour will now begin installing. When the “Install complete” message</w:t>
-      </w:r>
-      <w:r>
-        <w:t xml:space="preserve"> displays, click the “Next:” button to continue.</w:t>
-      </w:r>
-    </w:p>
-    <w:p>
-      <w:pPr>
-        <w:pStyle w:val="BodyText"/>
-        <w:numPr>
-          <w:ilvl w:val="0"/>
-          <w:numId w:val="40"/>
-        </w:numPr>
-      </w:pPr>
-      <w:r>
-        <w:lastRenderedPageBreak/>
-        <w:t xml:space="preserve">The 9 Tap Tour program has now been successfully installed. Choose “Run 9 Tap Tour” to </w:t>
-      </w:r>
-      <w:r>
-        <w:t>immediately</w:t>
-      </w:r>
-      <w:r>
-        <w:t xml:space="preserve"> </w:t>
-      </w:r>
-      <w:r>
-        <w:t>launch</w:t>
-      </w:r>
-      <w:r>
-        <w:t xml:space="preserve"> the program, or “View ReadMe.txt” to view the ReadMe file where you can view updated program information made after the game manual was printed.</w:t>
-      </w:r>
-    </w:p>
-    <w:p>
-      <w:pPr>
-        <w:pStyle w:val="Heading2"/>
-        <w:rPr>
-          <w:sz w:val="24"/>
-          <w:szCs w:val="24"/>
-        </w:rPr>
-      </w:pPr>
-      <w:r>
-        <w:rPr>
-          <w:sz w:val="24"/>
-          <w:szCs w:val="24"/>
-        </w:rPr>
-        <w:t>ReadMe File</w:t>
-      </w:r>
-    </w:p>
-    <w:p>
-      <w:pPr>
-        <w:pStyle w:val="BodyText"/>
-      </w:pPr>
-      <w:r>
-        <w:t>The 9 Tap Tour program contains a ReadMe file where you can view updated program information. We strongly encourage you to take the t</w:t>
-      </w:r>
-      <w:r>
-        <w:t>ime</w:t>
-      </w:r>
-      <w:r>
-        <w:t xml:space="preserve"> look over this file to get information on changes made after this manual went to print.</w:t>
-      </w:r>
-    </w:p>
-    <w:p>
-      <w:pPr>
-        <w:pStyle w:val="BodyText"/>
-      </w:pPr>
-      <w:r>
-        <w:t>To view this file, double-click on it in the 9 Tap Tour directory found on your hard drive (usually C:\Program Files\9TapTour\docs\readme_en.txt). You can also view the ReadMe file by clicking on the Start button on your Windows taskbar, then on Programs, then on 9 Tap Tour, then on View Readme.txt.</w:t>
+        <w:t>Who did the work?</w:t>
       </w:r>
     </w:p>
     <w:p>
       <w:pPr>
         <w:pStyle w:val="Heading1"/>
-      </w:pPr>
-      <w:r>
-        <w:t>Using 9 Tap Tour</w:t>
-      </w:r>
-    </w:p>
-    <w:p>
-      <w:pPr>
-        <w:pStyle w:val="Heading1"/>
+        <w:rPr>
+          <w:sz w:val="40"/>
+          <w:szCs w:val="40"/>
+        </w:rPr>
         <w:sectPr>
-          <w:footerReference w:type="default" r:id="rId16"/>
+          <w:footerReference w:type="default" r:id="rId13"/>
           <w:type w:val="continuous"/>
           <w:pgSz w:w="12240" w:h="15840" w:code="1"/>
           <w:pgMar w:top="1800" w:right="1195" w:bottom="1440" w:left="3355" w:header="965" w:footer="965" w:gutter="0"/>
@@ -1583,23 +1346,35 @@
     </w:p>
     <w:p>
       <w:pPr>
-        <w:pStyle w:val="Heading2"/>
-        <w:rPr>
-          <w:sz w:val="22"/>
-          <w:szCs w:val="22"/>
-        </w:rPr>
-      </w:pPr>
-      <w:r>
-        <w:rPr>
-          <w:sz w:val="22"/>
-          <w:szCs w:val="22"/>
-        </w:rPr>
-        <w:t>Main Menu</w:t>
-      </w:r>
-    </w:p>
-    <w:p>
-      <w:pPr>
-        <w:pStyle w:val="Picture"/>
+        <w:pStyle w:val="Heading1"/>
+        <w:rPr>
+          <w:sz w:val="40"/>
+          <w:szCs w:val="40"/>
+        </w:rPr>
+      </w:pPr>
+      <w:r>
+        <w:rPr>
+          <w:sz w:val="40"/>
+          <w:szCs w:val="40"/>
+        </w:rPr>
+        <w:t>What is9-Tap?</w:t>
+      </w:r>
+    </w:p>
+    <w:p>
+      <w:pPr>
+        <w:pStyle w:val="BodyText"/>
+      </w:pPr>
+      <w:r>
+        <w:t>9-Tap is a purpose built, full featured bowling tournament management software</w:t>
+      </w:r>
+      <w:r>
+        <w:t xml:space="preserve"> system with a variety of different functions.</w:t>
+      </w:r>
+    </w:p>
+    <w:p>
+      <w:pPr>
+        <w:pStyle w:val="BodyText"/>
+        <w:keepNext/>
       </w:pPr>
       <w:r>
         <w:rPr>
@@ -1607,9 +1382,9 @@
         </w:rPr>
         <w:drawing>
           <wp:inline distT="0" distB="0" distL="0" distR="0">
-            <wp:extent cx="4648200" cy="3640667"/>
-            <wp:effectExtent l="0" t="0" r="0" b="0"/>
-            <wp:docPr id="2" name="Picture 2"/>
+            <wp:extent cx="4883150" cy="3824605"/>
+            <wp:effectExtent l="0" t="0" r="0" b="4445"/>
+            <wp:docPr id="3" name="Picture 3"/>
             <wp:cNvGraphicFramePr>
               <a:graphicFrameLocks xmlns:a="http://schemas.openxmlformats.org/drawingml/2006/main" noChangeAspect="1"/>
             </wp:cNvGraphicFramePr>
@@ -1617,7 +1392,688 @@
               <a:graphicData uri="http://schemas.openxmlformats.org/drawingml/2006/picture">
                 <pic:pic xmlns:pic="http://schemas.openxmlformats.org/drawingml/2006/picture">
                   <pic:nvPicPr>
-                    <pic:cNvPr id="2" name="MainMenu.PNG"/>
+                    <pic:cNvPr id="3" name="MainMenu.PNG"/>
+                    <pic:cNvPicPr/>
+                  </pic:nvPicPr>
+                  <pic:blipFill>
+                    <a:blip r:embed="rId14">
+                      <a:extLst>
+                        <a:ext uri="{28A0092B-C50C-407E-A947-70E740481C1C}">
+                          <a14:useLocalDpi xmlns:a14="http://schemas.microsoft.com/office/drawing/2010/main" val="0"/>
+                        </a:ext>
+                      </a:extLst>
+                    </a:blip>
+                    <a:stretch>
+                      <a:fillRect/>
+                    </a:stretch>
+                  </pic:blipFill>
+                  <pic:spPr>
+                    <a:xfrm>
+                      <a:off x="0" y="0"/>
+                      <a:ext cx="4883150" cy="3824605"/>
+                    </a:xfrm>
+                    <a:prstGeom prst="rect">
+                      <a:avLst/>
+                    </a:prstGeom>
+                  </pic:spPr>
+                </pic:pic>
+              </a:graphicData>
+            </a:graphic>
+          </wp:inline>
+        </w:drawing>
+      </w:r>
+    </w:p>
+    <w:p>
+      <w:pPr>
+        <w:pStyle w:val="Caption"/>
+        <w:jc w:val="both"/>
+      </w:pPr>
+      <w:r>
+        <w:t xml:space="preserve">Figure </w:t>
+      </w:r>
+      <w:fldSimple w:instr=" SEQ Figure \* ARABIC ">
+        <w:r>
+          <w:rPr>
+            <w:noProof/>
+          </w:rPr>
+          <w:t>1</w:t>
+        </w:r>
+      </w:fldSimple>
+      <w:r>
+        <w:t>: 9-Tap Main Menu</w:t>
+      </w:r>
+    </w:p>
+    <w:p>
+      <w:pPr>
+        <w:pStyle w:val="Heading1"/>
+        <w:rPr>
+          <w:sz w:val="40"/>
+          <w:szCs w:val="40"/>
+        </w:rPr>
+        <w:sectPr>
+          <w:type w:val="continuous"/>
+          <w:pgSz w:w="12240" w:h="15840" w:code="1"/>
+          <w:pgMar w:top="1800" w:right="1195" w:bottom="1440" w:left="3355" w:header="965" w:footer="965" w:gutter="0"/>
+          <w:cols w:space="360"/>
+          <w:titlePg/>
+        </w:sectPr>
+      </w:pPr>
+    </w:p>
+    <w:p>
+      <w:pPr>
+        <w:pStyle w:val="Heading1"/>
+        <w:rPr>
+          <w:sz w:val="40"/>
+          <w:szCs w:val="40"/>
+        </w:rPr>
+      </w:pPr>
+      <w:r>
+        <w:rPr>
+          <w:sz w:val="40"/>
+          <w:szCs w:val="40"/>
+        </w:rPr>
+        <w:t>A good place to start</w:t>
+      </w:r>
+    </w:p>
+    <w:p>
+      <w:pPr>
+        <w:pStyle w:val="Heading2"/>
+      </w:pPr>
+      <w:r>
+        <w:t>Quick start guide</w:t>
+      </w:r>
+    </w:p>
+    <w:p>
+      <w:pPr>
+        <w:pStyle w:val="BodyText"/>
+      </w:pPr>
+      <w:r>
+        <w:t>You can find this on page #</w:t>
+      </w:r>
+    </w:p>
+    <w:p>
+      <w:pPr>
+        <w:pStyle w:val="Heading2"/>
+      </w:pPr>
+      <w:r>
+        <w:t>Troubleshooting</w:t>
+      </w:r>
+    </w:p>
+    <w:p>
+      <w:pPr>
+        <w:pStyle w:val="BodyText"/>
+      </w:pPr>
+      <w:r>
+        <w:t>You can find this on page ##</w:t>
+      </w:r>
+    </w:p>
+    <w:p>
+      <w:pPr>
+        <w:pStyle w:val="Heading1"/>
+      </w:pPr>
+      <w:r>
+        <w:lastRenderedPageBreak/>
+        <w:t>Menus guide</w:t>
+      </w:r>
+    </w:p>
+    <w:p>
+      <w:pPr>
+        <w:pStyle w:val="BodyText"/>
+      </w:pPr>
+      <w:r>
+        <w:t>Familiarization guide .longwinded?</w:t>
+      </w:r>
+    </w:p>
+    <w:p>
+      <w:pPr>
+        <w:pStyle w:val="BodyText"/>
+      </w:pPr>
+      <w:r>
+        <w:br w:type="page"/>
+      </w:r>
+    </w:p>
+    <w:p>
+      <w:pPr>
+        <w:pStyle w:val="PartTitle"/>
+        <w:framePr w:wrap="notBeside"/>
+      </w:pPr>
+      <w:r>
+        <w:lastRenderedPageBreak/>
+        <w:t>Chapter</w:t>
+      </w:r>
+    </w:p>
+    <w:p>
+      <w:pPr>
+        <w:pStyle w:val="PartLabel"/>
+        <w:framePr w:wrap="notBeside"/>
+      </w:pPr>
+      <w:r>
+        <w:t>2</w:t>
+      </w:r>
+    </w:p>
+    <w:p/>
+    <w:p/>
+    <w:p/>
+    <w:p/>
+    <w:p/>
+    <w:p/>
+    <w:p/>
+    <w:p/>
+    <w:p/>
+    <w:p/>
+    <w:p/>
+    <w:p/>
+    <w:p/>
+    <w:p>
+      <w:pPr>
+        <w:pStyle w:val="Subtitle"/>
+      </w:pPr>
+      <w:r>
+        <w:t>9-tap tour</w:t>
+      </w:r>
+    </w:p>
+    <w:p>
+      <w:pPr>
+        <w:pStyle w:val="Title"/>
+      </w:pPr>
+      <w:r>
+        <w:t>Quick Start</w:t>
+      </w:r>
+    </w:p>
+    <w:p>
+      <w:pPr>
+        <w:pStyle w:val="Caption"/>
+      </w:pPr>
+      <w:r>
+        <w:br w:type="page"/>
+      </w:r>
+    </w:p>
+    <w:p>
+      <w:pPr>
+        <w:pStyle w:val="Heading8"/>
+        <w:framePr w:wrap="around"/>
+      </w:pPr>
+      <w:r>
+        <w:lastRenderedPageBreak/>
+        <w:t>To get started quickly, follow these guidelines.</w:t>
+      </w:r>
+    </w:p>
+    <w:p>
+      <w:pPr>
+        <w:pStyle w:val="Heading2"/>
+      </w:pPr>
+      <w:r>
+        <w:t>How do I Launch 9-Tap?</w:t>
+      </w:r>
+    </w:p>
+    <w:p>
+      <w:pPr>
+        <w:pStyle w:val="BodyText"/>
+      </w:pPr>
+      <w:r>
+        <w:t>3. 2. 1. Liftoff…</w:t>
+      </w:r>
+    </w:p>
+    <w:p>
+      <w:pPr>
+        <w:pStyle w:val="BodyText"/>
+      </w:pPr>
+      <w:r>
+        <w:t>Screen shots of desktop icon &amp; system menu</w:t>
+      </w:r>
+    </w:p>
+    <w:p>
+      <w:pPr>
+        <w:pStyle w:val="Heading2"/>
+      </w:pPr>
+      <w:r>
+        <w:t>How do I enter a new player?</w:t>
+      </w:r>
+    </w:p>
+    <w:p>
+      <w:pPr>
+        <w:pStyle w:val="BodyText"/>
+      </w:pPr>
+      <w:r>
+        <w:t>answers</w:t>
+      </w:r>
+    </w:p>
+    <w:p>
+      <w:pPr>
+        <w:pStyle w:val="Heading1"/>
+        <w:rPr>
+          <w:sz w:val="40"/>
+          <w:szCs w:val="40"/>
+        </w:rPr>
+      </w:pPr>
+    </w:p>
+    <w:p>
+      <w:pPr>
+        <w:pStyle w:val="BodyText"/>
+        <w:rPr>
+          <w:rFonts w:ascii="Arial Black" w:hAnsi="Arial Black"/>
+          <w:color w:val="808080"/>
+          <w:spacing w:val="-25"/>
+          <w:kern w:val="28"/>
+        </w:rPr>
+      </w:pPr>
+      <w:r>
+        <w:br w:type="page"/>
+      </w:r>
+    </w:p>
+    <w:p>
+      <w:pPr>
+        <w:pStyle w:val="PartTitle"/>
+        <w:framePr w:wrap="notBeside"/>
+      </w:pPr>
+      <w:r>
+        <w:lastRenderedPageBreak/>
+        <w:t>Chapter</w:t>
+      </w:r>
+    </w:p>
+    <w:p>
+      <w:pPr>
+        <w:pStyle w:val="PartLabel"/>
+        <w:framePr w:wrap="notBeside"/>
+      </w:pPr>
+      <w:r>
+        <w:t>3</w:t>
+      </w:r>
+    </w:p>
+    <w:p/>
+    <w:p/>
+    <w:p/>
+    <w:p/>
+    <w:p/>
+    <w:p/>
+    <w:p/>
+    <w:p/>
+    <w:p/>
+    <w:p/>
+    <w:p/>
+    <w:p/>
+    <w:p/>
+    <w:p>
+      <w:pPr>
+        <w:pStyle w:val="Subtitle"/>
+      </w:pPr>
+      <w:r>
+        <w:t>9-tap tour</w:t>
+      </w:r>
+    </w:p>
+    <w:p>
+      <w:pPr>
+        <w:pStyle w:val="Title"/>
+      </w:pPr>
+      <w:r>
+        <w:t>Menus</w:t>
+      </w:r>
+      <w:r>
+        <w:t xml:space="preserve"> and Forms</w:t>
+      </w:r>
+      <w:r>
+        <w:t xml:space="preserve"> Guide</w:t>
+      </w:r>
+    </w:p>
+    <w:p>
+      <w:pPr>
+        <w:pStyle w:val="Caption"/>
+      </w:pPr>
+      <w:r>
+        <w:br w:type="page"/>
+      </w:r>
+    </w:p>
+    <w:p>
+      <w:pPr>
+        <w:pStyle w:val="Heading1"/>
+        <w:rPr>
+          <w:sz w:val="40"/>
+          <w:szCs w:val="40"/>
+        </w:rPr>
+        <w:sectPr>
+          <w:type w:val="continuous"/>
+          <w:pgSz w:w="12240" w:h="15840" w:code="1"/>
+          <w:pgMar w:top="1800" w:right="1195" w:bottom="1440" w:left="3355" w:header="965" w:footer="965" w:gutter="0"/>
+          <w:cols w:space="360"/>
+          <w:titlePg/>
+        </w:sectPr>
+      </w:pPr>
+    </w:p>
+    <w:p>
+      <w:pPr>
+        <w:pStyle w:val="Heading1"/>
+        <w:rPr>
+          <w:szCs w:val="32"/>
+        </w:rPr>
+      </w:pPr>
+      <w:r>
+        <w:rPr>
+          <w:szCs w:val="32"/>
+        </w:rPr>
+        <w:lastRenderedPageBreak/>
+        <w:t>Start Menu</w:t>
+      </w:r>
+    </w:p>
+    <w:p>
+      <w:pPr>
+        <w:pStyle w:val="BodyText"/>
+        <w:keepNext/>
+      </w:pPr>
+      <w:r>
+        <w:t>Craft beer sartorial copper mug tbh jianbing, locavore VHS salvia +1 vegan gluten-free kogi pug vexillologist affogato. Fanny pack palo santo proident blog bespoke commodo tilde hammock taiyaki wayfarers gentrify. Cardigan ugh slow-carb, ea DIY hot chicken commodo godard. Lorem sint qui 3 wolf moon enim voluptate, velit veniam. Fanny pack man bun helvetica viral, edison bulb cliche jianbing.</w:t>
+      </w:r>
+    </w:p>
+    <w:p>
+      <w:pPr>
+        <w:pStyle w:val="BodyText"/>
+        <w:keepNext/>
+      </w:pPr>
+      <w:r>
+        <w:rPr>
+          <w:noProof/>
+        </w:rPr>
+        <w:drawing>
+          <wp:inline distT="0" distB="0" distL="0" distR="0">
+            <wp:extent cx="4883150" cy="3824605"/>
+            <wp:effectExtent l="0" t="0" r="0" b="4445"/>
+            <wp:docPr id="4" name="Picture 4"/>
+            <wp:cNvGraphicFramePr>
+              <a:graphicFrameLocks xmlns:a="http://schemas.openxmlformats.org/drawingml/2006/main" noChangeAspect="1"/>
+            </wp:cNvGraphicFramePr>
+            <a:graphic xmlns:a="http://schemas.openxmlformats.org/drawingml/2006/main">
+              <a:graphicData uri="http://schemas.openxmlformats.org/drawingml/2006/picture">
+                <pic:pic xmlns:pic="http://schemas.openxmlformats.org/drawingml/2006/picture">
+                  <pic:nvPicPr>
+                    <pic:cNvPr id="4" name="MainMenu.PNG"/>
+                    <pic:cNvPicPr/>
+                  </pic:nvPicPr>
+                  <pic:blipFill>
+                    <a:blip r:embed="rId14">
+                      <a:extLst>
+                        <a:ext uri="{28A0092B-C50C-407E-A947-70E740481C1C}">
+                          <a14:useLocalDpi xmlns:a14="http://schemas.microsoft.com/office/drawing/2010/main" val="0"/>
+                        </a:ext>
+                      </a:extLst>
+                    </a:blip>
+                    <a:stretch>
+                      <a:fillRect/>
+                    </a:stretch>
+                  </pic:blipFill>
+                  <pic:spPr>
+                    <a:xfrm>
+                      <a:off x="0" y="0"/>
+                      <a:ext cx="4883150" cy="3824605"/>
+                    </a:xfrm>
+                    <a:prstGeom prst="rect">
+                      <a:avLst/>
+                    </a:prstGeom>
+                  </pic:spPr>
+                </pic:pic>
+              </a:graphicData>
+            </a:graphic>
+          </wp:inline>
+        </w:drawing>
+      </w:r>
+    </w:p>
+    <w:p>
+      <w:pPr>
+        <w:pStyle w:val="Caption"/>
+        <w:jc w:val="both"/>
+      </w:pPr>
+      <w:r>
+        <w:t xml:space="preserve">Figure </w:t>
+      </w:r>
+      <w:fldSimple w:instr=" SEQ Figure \* ARABIC ">
+        <w:r>
+          <w:rPr>
+            <w:noProof/>
+          </w:rPr>
+          <w:t>2</w:t>
+        </w:r>
+      </w:fldSimple>
+      <w:r>
+        <w:t>: Main Menu</w:t>
+      </w:r>
+    </w:p>
+    <w:p>
+      <w:pPr>
+        <w:pStyle w:val="Heading1"/>
+      </w:pPr>
+      <w:r>
+        <w:lastRenderedPageBreak/>
+        <w:t>Tools</w:t>
+      </w:r>
+    </w:p>
+    <w:p>
+      <w:pPr>
+        <w:pStyle w:val="BodyText"/>
+        <w:keepNext/>
+      </w:pPr>
+      <w:r>
+        <w:t>Craft beer sartorial copper mug tbh jianbing, locavore VHS salvia +1 vegan gluten-free kogi pug vexillologist affogato. Fanny pack palo santo proident blog bespoke commodo tilde hammock taiyaki wayfarers gentrify. Cardigan ugh slow-carb, ea DIY hot chicken commodo godard. Lorem sint qui 3 wolf moon enim voluptate, velit veniam. Fanny pack man bun helvetica viral, edison bulb cliche jianbing.</w:t>
+      </w:r>
+    </w:p>
+    <w:p>
+      <w:pPr>
+        <w:pStyle w:val="BodyText"/>
+        <w:keepNext/>
+        <w:jc w:val="center"/>
+      </w:pPr>
+      <w:r>
+        <w:rPr>
+          <w:noProof/>
+        </w:rPr>
+        <w:drawing>
+          <wp:inline distT="0" distB="0" distL="0" distR="0">
+            <wp:extent cx="2343150" cy="3836334"/>
+            <wp:effectExtent l="0" t="0" r="0" b="0"/>
+            <wp:docPr id="13" name="Picture 13"/>
+            <wp:cNvGraphicFramePr>
+              <a:graphicFrameLocks xmlns:a="http://schemas.openxmlformats.org/drawingml/2006/main" noChangeAspect="1"/>
+            </wp:cNvGraphicFramePr>
+            <a:graphic xmlns:a="http://schemas.openxmlformats.org/drawingml/2006/main">
+              <a:graphicData uri="http://schemas.openxmlformats.org/drawingml/2006/picture">
+                <pic:pic xmlns:pic="http://schemas.openxmlformats.org/drawingml/2006/picture">
+                  <pic:nvPicPr>
+                    <pic:cNvPr id="13" name="UpdateInactiveMembersForm.PNG"/>
+                    <pic:cNvPicPr/>
+                  </pic:nvPicPr>
+                  <pic:blipFill>
+                    <a:blip r:embed="rId15">
+                      <a:extLst>
+                        <a:ext uri="{28A0092B-C50C-407E-A947-70E740481C1C}">
+                          <a14:useLocalDpi xmlns:a14="http://schemas.microsoft.com/office/drawing/2010/main" val="0"/>
+                        </a:ext>
+                      </a:extLst>
+                    </a:blip>
+                    <a:stretch>
+                      <a:fillRect/>
+                    </a:stretch>
+                  </pic:blipFill>
+                  <pic:spPr>
+                    <a:xfrm>
+                      <a:off x="0" y="0"/>
+                      <a:ext cx="2361540" cy="3866443"/>
+                    </a:xfrm>
+                    <a:prstGeom prst="rect">
+                      <a:avLst/>
+                    </a:prstGeom>
+                  </pic:spPr>
+                </pic:pic>
+              </a:graphicData>
+            </a:graphic>
+          </wp:inline>
+        </w:drawing>
+      </w:r>
+    </w:p>
+    <w:p>
+      <w:pPr>
+        <w:pStyle w:val="Caption"/>
+        <w:jc w:val="center"/>
+      </w:pPr>
+      <w:r>
+        <w:t xml:space="preserve">Figure </w:t>
+      </w:r>
+      <w:fldSimple w:instr=" SEQ Figure \* ARABIC ">
+        <w:r>
+          <w:rPr>
+            <w:noProof/>
+          </w:rPr>
+          <w:t>3</w:t>
+        </w:r>
+      </w:fldSimple>
+      <w:r>
+        <w:t>: Under Tools, Update Inactive status</w:t>
+      </w:r>
+    </w:p>
+    <w:p>
+      <w:pPr>
+        <w:pStyle w:val="Heading1"/>
+      </w:pPr>
+      <w:r>
+        <w:lastRenderedPageBreak/>
+        <w:t xml:space="preserve">Member Info </w:t>
+      </w:r>
+      <w:r>
+        <w:t>Form</w:t>
+      </w:r>
+    </w:p>
+    <w:p>
+      <w:pPr>
+        <w:pStyle w:val="BodyText"/>
+        <w:keepNext/>
+      </w:pPr>
+      <w:r>
+        <w:t>Craft beer sartorial copper mug tbh jianbing, locavore VHS salvia +1 vegan gluten-free kogi pug vexillologist affogato. Fanny pack palo santo proident blog bespoke commodo tilde hammock taiyaki wayfarers gentrify. Cardigan ugh slow-carb, ea DIY hot chicken commodo godard. Lorem sint qui 3 wolf moon enim voluptate, velit veniam. Fanny pack man bun helvetica viral, edison bulb cliche jianbing.</w:t>
+      </w:r>
+    </w:p>
+    <w:p>
+      <w:pPr>
+        <w:pStyle w:val="BodyText"/>
+        <w:keepNext/>
+        <w:jc w:val="center"/>
+      </w:pPr>
+      <w:r>
+        <w:rPr>
+          <w:noProof/>
+        </w:rPr>
+        <w:drawing>
+          <wp:inline distT="0" distB="0" distL="0" distR="0">
+            <wp:extent cx="4448175" cy="3980962"/>
+            <wp:effectExtent l="0" t="0" r="0" b="635"/>
+            <wp:docPr id="5" name="Picture 5" descr="The form where member information is entered and edited." title="member info form"/>
+            <wp:cNvGraphicFramePr>
+              <a:graphicFrameLocks xmlns:a="http://schemas.openxmlformats.org/drawingml/2006/main" noChangeAspect="1"/>
+            </wp:cNvGraphicFramePr>
+            <a:graphic xmlns:a="http://schemas.openxmlformats.org/drawingml/2006/main">
+              <a:graphicData uri="http://schemas.openxmlformats.org/drawingml/2006/picture">
+                <pic:pic xmlns:pic="http://schemas.openxmlformats.org/drawingml/2006/picture">
+                  <pic:nvPicPr>
+                    <pic:cNvPr id="5" name="MemberInfoForm.PNG"/>
+                    <pic:cNvPicPr/>
+                  </pic:nvPicPr>
+                  <pic:blipFill rotWithShape="1">
+                    <a:blip r:embed="rId16">
+                      <a:extLst>
+                        <a:ext uri="{28A0092B-C50C-407E-A947-70E740481C1C}">
+                          <a14:useLocalDpi xmlns:a14="http://schemas.microsoft.com/office/drawing/2010/main" val="0"/>
+                        </a:ext>
+                      </a:extLst>
+                    </a:blip>
+                    <a:srcRect l="1" r="40077"/>
+                    <a:stretch/>
+                  </pic:blipFill>
+                  <pic:spPr bwMode="auto">
+                    <a:xfrm>
+                      <a:off x="0" y="0"/>
+                      <a:ext cx="4467314" cy="3998091"/>
+                    </a:xfrm>
+                    <a:prstGeom prst="rect">
+                      <a:avLst/>
+                    </a:prstGeom>
+                    <a:ln>
+                      <a:noFill/>
+                    </a:ln>
+                    <a:extLst>
+                      <a:ext uri="{53640926-AAD7-44D8-BBD7-CCE9431645EC}">
+                        <a14:shadowObscured xmlns:a14="http://schemas.microsoft.com/office/drawing/2010/main"/>
+                      </a:ext>
+                    </a:extLst>
+                  </pic:spPr>
+                </pic:pic>
+              </a:graphicData>
+            </a:graphic>
+          </wp:inline>
+        </w:drawing>
+      </w:r>
+    </w:p>
+    <w:p>
+      <w:pPr>
+        <w:pStyle w:val="Caption"/>
+        <w:jc w:val="center"/>
+      </w:pPr>
+      <w:r>
+        <w:t xml:space="preserve">Figure </w:t>
+      </w:r>
+      <w:fldSimple w:instr=" SEQ Figure \* ARABIC ">
+        <w:r>
+          <w:rPr>
+            <w:noProof/>
+          </w:rPr>
+          <w:t>4</w:t>
+        </w:r>
+      </w:fldSimple>
+      <w:r>
+        <w:t>: Member Information</w:t>
+      </w:r>
+    </w:p>
+    <w:p>
+      <w:pPr>
+        <w:pStyle w:val="Heading2"/>
+        <w:rPr>
+          <w:szCs w:val="20"/>
+        </w:rPr>
+      </w:pPr>
+      <w:r>
+        <w:rPr>
+          <w:szCs w:val="20"/>
+        </w:rPr>
+        <w:lastRenderedPageBreak/>
+        <w:t>Stats</w:t>
+      </w:r>
+    </w:p>
+    <w:p>
+      <w:pPr>
+        <w:pStyle w:val="BodyText"/>
+        <w:keepNext/>
+      </w:pPr>
+      <w:r>
+        <w:t>Craft beer sartorial copper mug tbh jianbing, locavore VHS salvia +1 vegan gluten-free kogi pug vexillologist affogato. Fanny pack palo santo proident blog bespoke commodo tilde hammock taiyaki wayfarers gentrify. Cardigan ugh slow-carb, ea DIY hot chicken commodo godard. Lorem sint qui 3 wolf moon enim voluptate, velit veniam. Fanny pack man bun helvetica viral, edison bulb cliche jianbing.</w:t>
+      </w:r>
+    </w:p>
+    <w:p>
+      <w:pPr>
+        <w:pStyle w:val="BodyText"/>
+        <w:keepNext/>
+        <w:jc w:val="center"/>
+      </w:pPr>
+      <w:r>
+        <w:rPr>
+          <w:noProof/>
+        </w:rPr>
+        <w:drawing>
+          <wp:inline distT="0" distB="0" distL="0" distR="0">
+            <wp:extent cx="4883150" cy="2831465"/>
+            <wp:effectExtent l="0" t="0" r="0" b="6985"/>
+            <wp:docPr id="7" name="Picture 7"/>
+            <wp:cNvGraphicFramePr>
+              <a:graphicFrameLocks xmlns:a="http://schemas.openxmlformats.org/drawingml/2006/main" noChangeAspect="1"/>
+            </wp:cNvGraphicFramePr>
+            <a:graphic xmlns:a="http://schemas.openxmlformats.org/drawingml/2006/main">
+              <a:graphicData uri="http://schemas.openxmlformats.org/drawingml/2006/picture">
+                <pic:pic xmlns:pic="http://schemas.openxmlformats.org/drawingml/2006/picture">
+                  <pic:nvPicPr>
+                    <pic:cNvPr id="7" name="StatsForm.PNG"/>
                     <pic:cNvPicPr/>
                   </pic:nvPicPr>
                   <pic:blipFill>
@@ -1635,7 +2091,7 @@
                   <pic:spPr>
                     <a:xfrm>
                       <a:off x="0" y="0"/>
-                      <a:ext cx="4680307" cy="3665814"/>
+                      <a:ext cx="4883150" cy="2831465"/>
                     </a:xfrm>
                     <a:prstGeom prst="rect">
                       <a:avLst/>
@@ -1651,210 +2107,36 @@
     <w:p>
       <w:pPr>
         <w:pStyle w:val="Caption"/>
-        <w:jc w:val="both"/>
+        <w:jc w:val="center"/>
       </w:pPr>
       <w:r>
         <w:t xml:space="preserve">Figure </w:t>
       </w:r>
-      <w:r>
-        <w:fldChar w:fldCharType="begin"/>
-      </w:r>
-      <w:r>
-        <w:instrText xml:space="preserve"> SEQ Figure \* ARABIC </w:instrText>
-      </w:r>
-      <w:r>
-        <w:fldChar w:fldCharType="separate"/>
-      </w:r>
-      <w:r>
-        <w:rPr>
-          <w:noProof/>
-        </w:rPr>
-        <w:t>1</w:t>
-      </w:r>
-      <w:r>
-        <w:rPr>
-          <w:noProof/>
-        </w:rPr>
-        <w:fldChar w:fldCharType="end"/>
-      </w:r>
-      <w:r>
-        <w:t>: Main Menu</w:t>
-      </w:r>
-    </w:p>
-    <w:p>
-      <w:pPr>
-        <w:pStyle w:val="Caption"/>
-        <w:jc w:val="both"/>
-        <w:rPr>
-          <w:sz w:val="24"/>
-          <w:szCs w:val="24"/>
-        </w:rPr>
-      </w:pPr>
-      <w:r>
-        <w:rPr>
-          <w:sz w:val="24"/>
-          <w:szCs w:val="24"/>
-        </w:rPr>
-        <w:t>Launch 9 Tap Tour. Once it’s running you should see the Main Menu screen.</w:t>
-      </w:r>
-      <w:r>
-        <w:rPr>
-          <w:sz w:val="24"/>
-          <w:szCs w:val="24"/>
-        </w:rPr>
-        <w:t xml:space="preserve"> To enter bowler information or scores there are two main ways to get there, the tabs across the top and the left hand buttons.</w:t>
-      </w:r>
-    </w:p>
-    <w:p>
-      <w:pPr>
-        <w:pStyle w:val="BodyText"/>
-      </w:pPr>
-      <w:r>
+      <w:fldSimple w:instr=" SEQ Figure \* ARABIC ">
+        <w:r>
+          <w:rPr>
+            <w:noProof/>
+          </w:rPr>
+          <w:t>5</w:t>
+        </w:r>
+      </w:fldSimple>
+      <w:r>
+        <w:t>: Stats Form</w:t>
+      </w:r>
+    </w:p>
+    <w:p>
+      <w:pPr>
+        <w:pStyle w:val="Heading2"/>
+        <w:rPr>
+          <w:szCs w:val="20"/>
+        </w:rPr>
+      </w:pPr>
+      <w:r>
+        <w:rPr>
+          <w:szCs w:val="20"/>
+        </w:rPr>
         <w:lastRenderedPageBreak/>
-        <w:t>The top tabs are:</w:t>
-      </w:r>
-    </w:p>
-    <w:p>
-      <w:pPr>
-        <w:pStyle w:val="BodyText"/>
-        <w:numPr>
-          <w:ilvl w:val="0"/>
-          <w:numId w:val="42"/>
-        </w:numPr>
-      </w:pPr>
-      <w:r>
-        <w:t>Home—takes you back to the Main Menu.</w:t>
-      </w:r>
-    </w:p>
-    <w:p>
-      <w:pPr>
-        <w:pStyle w:val="BodyText"/>
-        <w:numPr>
-          <w:ilvl w:val="0"/>
-          <w:numId w:val="42"/>
-        </w:numPr>
-      </w:pPr>
-      <w:r>
-        <w:t xml:space="preserve">Member Info—takes you to the Member Information form. </w:t>
-      </w:r>
-    </w:p>
-    <w:p>
-      <w:pPr>
-        <w:pStyle w:val="BodyText"/>
-        <w:numPr>
-          <w:ilvl w:val="0"/>
-          <w:numId w:val="42"/>
-        </w:numPr>
-      </w:pPr>
-      <w:r>
-        <w:t>Member Scores—takes you to the Member Scores Form. From there, you can access Tournament creation and editing.</w:t>
-      </w:r>
-    </w:p>
-    <w:p>
-      <w:pPr>
-        <w:pStyle w:val="BodyText"/>
-        <w:numPr>
-          <w:ilvl w:val="0"/>
-          <w:numId w:val="42"/>
-        </w:numPr>
-      </w:pPr>
-      <w:r>
-        <w:t>Tools—take you to the active/inactive member dialog.</w:t>
-      </w:r>
-    </w:p>
-    <w:p>
-      <w:pPr>
-        <w:pStyle w:val="BodyText"/>
-      </w:pPr>
-      <w:r>
-        <w:t>The left hand buttons are:</w:t>
-      </w:r>
-    </w:p>
-    <w:p>
-      <w:pPr>
-        <w:pStyle w:val="BodyText"/>
-        <w:numPr>
-          <w:ilvl w:val="0"/>
-          <w:numId w:val="41"/>
-        </w:numPr>
-      </w:pPr>
-      <w:r>
-        <w:t>“Member Info”—Left click on this to go to the member information form. Here is where new member information is entered and saved. Player statistics can be found here too. Also importing member information from Microsoft Excel files is done here</w:t>
-      </w:r>
-    </w:p>
-    <w:p>
-      <w:pPr>
-        <w:pStyle w:val="BodyText"/>
-        <w:numPr>
-          <w:ilvl w:val="0"/>
-          <w:numId w:val="41"/>
-        </w:numPr>
-      </w:pPr>
-      <w:r>
-        <w:t>“Member Scores”—accesses the Member Scores form. From there, access Tournament forms</w:t>
-      </w:r>
-    </w:p>
-    <w:p>
-      <w:pPr>
-        <w:pStyle w:val="BodyText"/>
-        <w:numPr>
-          <w:ilvl w:val="0"/>
-          <w:numId w:val="41"/>
-        </w:numPr>
-      </w:pPr>
-      <w:r>
-        <w:t>“About”—About the 9Tap Tour</w:t>
-      </w:r>
-    </w:p>
-    <w:p>
-      <w:pPr>
-        <w:pStyle w:val="BodyText"/>
-        <w:numPr>
-          <w:ilvl w:val="0"/>
-          <w:numId w:val="41"/>
-        </w:numPr>
-      </w:pPr>
-      <w:r>
-        <w:t>“Exit”—exits the 9Tap Tour program</w:t>
-      </w:r>
-    </w:p>
-    <w:p>
-      <w:pPr>
-        <w:pStyle w:val="BodyText"/>
-        <w:numPr>
-          <w:ilvl w:val="0"/>
-          <w:numId w:val="41"/>
-        </w:numPr>
-      </w:pPr>
-      <w:r>
-        <w:t>Region—drop down menu to pick location. Default is “local”.</w:t>
-      </w:r>
-    </w:p>
-    <w:p>
-      <w:pPr>
-        <w:pStyle w:val="BodyText"/>
-        <w:numPr>
-          <w:ilvl w:val="0"/>
-          <w:numId w:val="41"/>
-        </w:numPr>
-      </w:pPr>
-      <w:r>
-        <w:t>“Add Region”—goes to “Add Region” dialog.</w:t>
-      </w:r>
-    </w:p>
-    <w:p>
-      <w:pPr>
-        <w:pStyle w:val="Heading1"/>
-      </w:pPr>
-      <w:r>
-        <w:lastRenderedPageBreak/>
-        <w:t>Member I</w:t>
-      </w:r>
-      <w:r>
-        <w:t>n</w:t>
-      </w:r>
-      <w:r>
-        <w:t>fo</w:t>
+        <w:t>Member Search</w:t>
       </w:r>
     </w:p>
     <w:p>
@@ -1863,14 +2145,24 @@
         <w:keepNext/>
       </w:pPr>
       <w:r>
+        <w:t>Craft beer sartorial copper mug tbh jianbing, locavore VHS salvia +1 vegan gluten-free kogi pug vexillologist affogato. Fanny pack palo santo proident blog bespoke commodo tilde hammock taiyaki wayfarers gentrify. Cardigan ugh slow-carb, ea DIY hot chicken commodo godard. Lorem sint qui 3 wolf moon enim voluptate, velit veniam. Fanny pack man bun helvetica viral, edison bulb cliche jianbing.</w:t>
+      </w:r>
+    </w:p>
+    <w:p>
+      <w:pPr>
+        <w:pStyle w:val="BodyText"/>
+        <w:keepNext/>
+        <w:jc w:val="center"/>
+      </w:pPr>
+      <w:r>
         <w:rPr>
           <w:noProof/>
         </w:rPr>
         <w:drawing>
           <wp:inline distT="0" distB="0" distL="0" distR="0">
-            <wp:extent cx="4883150" cy="2618740"/>
-            <wp:effectExtent l="0" t="0" r="0" b="0"/>
-            <wp:docPr id="1" name="Picture 1"/>
+            <wp:extent cx="4883150" cy="3178175"/>
+            <wp:effectExtent l="0" t="0" r="0" b="3175"/>
+            <wp:docPr id="8" name="Picture 8"/>
             <wp:cNvGraphicFramePr>
               <a:graphicFrameLocks xmlns:a="http://schemas.openxmlformats.org/drawingml/2006/main" noChangeAspect="1"/>
             </wp:cNvGraphicFramePr>
@@ -1878,11 +2170,11 @@
               <a:graphicData uri="http://schemas.openxmlformats.org/drawingml/2006/picture">
                 <pic:pic xmlns:pic="http://schemas.openxmlformats.org/drawingml/2006/picture">
                   <pic:nvPicPr>
-                    <pic:cNvPr id="1" name="MemberInfoForm.PNG"/>
+                    <pic:cNvPr id="8" name="SearchMembersForm.PNG"/>
                     <pic:cNvPicPr/>
                   </pic:nvPicPr>
                   <pic:blipFill>
-                    <a:blip r:embed="rId18" cstate="print">
+                    <a:blip r:embed="rId18">
                       <a:extLst>
                         <a:ext uri="{28A0092B-C50C-407E-A947-70E740481C1C}">
                           <a14:useLocalDpi xmlns:a14="http://schemas.microsoft.com/office/drawing/2010/main" val="0"/>
@@ -1896,7 +2188,7 @@
                   <pic:spPr>
                     <a:xfrm>
                       <a:off x="0" y="0"/>
-                      <a:ext cx="4883150" cy="2618740"/>
+                      <a:ext cx="4883150" cy="3178175"/>
                     </a:xfrm>
                     <a:prstGeom prst="rect">
                       <a:avLst/>
@@ -1908,38 +2200,1347 @@
           </wp:inline>
         </w:drawing>
       </w:r>
+      <w:r>
+        <w:rPr>
+          <w:noProof/>
+        </w:rPr>
+        <w:drawing>
+          <wp:inline distT="0" distB="0" distL="0" distR="0">
+            <wp:extent cx="4883150" cy="3164840"/>
+            <wp:effectExtent l="0" t="0" r="0" b="0"/>
+            <wp:docPr id="9" name="Picture 9"/>
+            <wp:cNvGraphicFramePr>
+              <a:graphicFrameLocks xmlns:a="http://schemas.openxmlformats.org/drawingml/2006/main" noChangeAspect="1"/>
+            </wp:cNvGraphicFramePr>
+            <a:graphic xmlns:a="http://schemas.openxmlformats.org/drawingml/2006/main">
+              <a:graphicData uri="http://schemas.openxmlformats.org/drawingml/2006/picture">
+                <pic:pic xmlns:pic="http://schemas.openxmlformats.org/drawingml/2006/picture">
+                  <pic:nvPicPr>
+                    <pic:cNvPr id="9" name="SearchMembersSearchClicked.PNG"/>
+                    <pic:cNvPicPr/>
+                  </pic:nvPicPr>
+                  <pic:blipFill>
+                    <a:blip r:embed="rId19">
+                      <a:extLst>
+                        <a:ext uri="{28A0092B-C50C-407E-A947-70E740481C1C}">
+                          <a14:useLocalDpi xmlns:a14="http://schemas.microsoft.com/office/drawing/2010/main" val="0"/>
+                        </a:ext>
+                      </a:extLst>
+                    </a:blip>
+                    <a:stretch>
+                      <a:fillRect/>
+                    </a:stretch>
+                  </pic:blipFill>
+                  <pic:spPr>
+                    <a:xfrm>
+                      <a:off x="0" y="0"/>
+                      <a:ext cx="4883150" cy="3164840"/>
+                    </a:xfrm>
+                    <a:prstGeom prst="rect">
+                      <a:avLst/>
+                    </a:prstGeom>
+                  </pic:spPr>
+                </pic:pic>
+              </a:graphicData>
+            </a:graphic>
+          </wp:inline>
+        </w:drawing>
+      </w:r>
+    </w:p>
+    <w:p>
+      <w:pPr>
+        <w:pStyle w:val="Caption"/>
+        <w:jc w:val="center"/>
+      </w:pPr>
+      <w:r>
+        <w:t xml:space="preserve">Figure </w:t>
+      </w:r>
+      <w:fldSimple w:instr=" SEQ Figure \* ARABIC ">
+        <w:r>
+          <w:rPr>
+            <w:noProof/>
+          </w:rPr>
+          <w:t>6</w:t>
+        </w:r>
+      </w:fldSimple>
+      <w:r>
+        <w:t>: Member search, blank and with results</w:t>
+      </w:r>
+    </w:p>
+    <w:p>
+      <w:pPr>
+        <w:pStyle w:val="Heading2"/>
+        <w:rPr>
+          <w:szCs w:val="20"/>
+        </w:rPr>
+      </w:pPr>
+      <w:r>
+        <w:rPr>
+          <w:szCs w:val="20"/>
+        </w:rPr>
+        <w:lastRenderedPageBreak/>
+        <w:t>Print Recaps</w:t>
+      </w:r>
+    </w:p>
+    <w:p>
+      <w:pPr>
+        <w:pStyle w:val="BodyText"/>
+        <w:keepNext/>
+      </w:pPr>
+      <w:r>
+        <w:t>Craft beer sartorial copper mug tbh jianbing, locavore VHS salvia +1 vegan gluten-free kogi pug vexillologist affogato. Fanny pack palo santo proident blog bespoke commodo tilde hammock taiyaki wayfarers gentrify. Cardigan ugh slow-carb, ea DIY hot chicken commodo godard. Lorem sint qui 3 wolf moon enim voluptate, velit veniam. Fanny pack man bun helvetica viral, edison bulb cliche jianbing.</w:t>
+      </w:r>
+    </w:p>
+    <w:p>
+      <w:pPr>
+        <w:pStyle w:val="BodyText"/>
+        <w:keepNext/>
+        <w:jc w:val="center"/>
+      </w:pPr>
+      <w:r>
+        <w:rPr>
+          <w:noProof/>
+        </w:rPr>
+        <w:drawing>
+          <wp:inline distT="0" distB="0" distL="0" distR="0">
+            <wp:extent cx="4305901" cy="3277057"/>
+            <wp:effectExtent l="0" t="0" r="0" b="0"/>
+            <wp:docPr id="10" name="Picture 10"/>
+            <wp:cNvGraphicFramePr>
+              <a:graphicFrameLocks xmlns:a="http://schemas.openxmlformats.org/drawingml/2006/main" noChangeAspect="1"/>
+            </wp:cNvGraphicFramePr>
+            <a:graphic xmlns:a="http://schemas.openxmlformats.org/drawingml/2006/main">
+              <a:graphicData uri="http://schemas.openxmlformats.org/drawingml/2006/picture">
+                <pic:pic xmlns:pic="http://schemas.openxmlformats.org/drawingml/2006/picture">
+                  <pic:nvPicPr>
+                    <pic:cNvPr id="10" name="PrinterDialog.PNG"/>
+                    <pic:cNvPicPr/>
+                  </pic:nvPicPr>
+                  <pic:blipFill>
+                    <a:blip r:embed="rId20">
+                      <a:extLst>
+                        <a:ext uri="{28A0092B-C50C-407E-A947-70E740481C1C}">
+                          <a14:useLocalDpi xmlns:a14="http://schemas.microsoft.com/office/drawing/2010/main" val="0"/>
+                        </a:ext>
+                      </a:extLst>
+                    </a:blip>
+                    <a:stretch>
+                      <a:fillRect/>
+                    </a:stretch>
+                  </pic:blipFill>
+                  <pic:spPr>
+                    <a:xfrm>
+                      <a:off x="0" y="0"/>
+                      <a:ext cx="4305901" cy="3277057"/>
+                    </a:xfrm>
+                    <a:prstGeom prst="rect">
+                      <a:avLst/>
+                    </a:prstGeom>
+                  </pic:spPr>
+                </pic:pic>
+              </a:graphicData>
+            </a:graphic>
+          </wp:inline>
+        </w:drawing>
+      </w:r>
+    </w:p>
+    <w:p>
+      <w:pPr>
+        <w:pStyle w:val="Caption"/>
+        <w:jc w:val="center"/>
+      </w:pPr>
+      <w:r>
+        <w:t xml:space="preserve">Figure </w:t>
+      </w:r>
+      <w:fldSimple w:instr=" SEQ Figure \* ARABIC ">
+        <w:r>
+          <w:rPr>
+            <w:noProof/>
+          </w:rPr>
+          <w:t>7</w:t>
+        </w:r>
+      </w:fldSimple>
+      <w:r>
+        <w:t>: basic printer dialog</w:t>
+      </w:r>
+    </w:p>
+    <w:p>
+      <w:pPr>
+        <w:pStyle w:val="Heading2"/>
+        <w:rPr>
+          <w:szCs w:val="20"/>
+        </w:rPr>
+      </w:pPr>
+      <w:r>
+        <w:rPr>
+          <w:szCs w:val="20"/>
+        </w:rPr>
+        <w:lastRenderedPageBreak/>
+        <w:t>Labels</w:t>
+      </w:r>
+    </w:p>
+    <w:p>
+      <w:pPr>
+        <w:pStyle w:val="BodyText"/>
+        <w:keepNext/>
+      </w:pPr>
+      <w:r>
+        <w:t>Craft beer sartorial copper mug tbh jianbing, locavore VHS salvia +1 vegan gluten-free kogi pug vexillologist affogato. Fanny pack palo santo proident blog bespoke commodo tilde hammock taiyaki wayfarers gentrify. Cardigan ugh slow-carb, ea DIY hot chicken commodo godard. Lorem sint qui 3 wolf moon enim voluptate, velit veniam. Fanny pack man bun helvetica viral, edison bulb cliche jianbing.</w:t>
+      </w:r>
+    </w:p>
+    <w:p>
+      <w:pPr>
+        <w:pStyle w:val="BodyText"/>
+        <w:keepNext/>
+        <w:jc w:val="center"/>
+      </w:pPr>
+      <w:r>
+        <w:rPr>
+          <w:noProof/>
+        </w:rPr>
+        <w:drawing>
+          <wp:inline distT="0" distB="0" distL="0" distR="0">
+            <wp:extent cx="4883150" cy="3590925"/>
+            <wp:effectExtent l="0" t="0" r="0" b="9525"/>
+            <wp:docPr id="11" name="Picture 11"/>
+            <wp:cNvGraphicFramePr>
+              <a:graphicFrameLocks xmlns:a="http://schemas.openxmlformats.org/drawingml/2006/main" noChangeAspect="1"/>
+            </wp:cNvGraphicFramePr>
+            <a:graphic xmlns:a="http://schemas.openxmlformats.org/drawingml/2006/main">
+              <a:graphicData uri="http://schemas.openxmlformats.org/drawingml/2006/picture">
+                <pic:pic xmlns:pic="http://schemas.openxmlformats.org/drawingml/2006/picture">
+                  <pic:nvPicPr>
+                    <pic:cNvPr id="11" name="PrintAddressLablesForm.PNG"/>
+                    <pic:cNvPicPr/>
+                  </pic:nvPicPr>
+                  <pic:blipFill>
+                    <a:blip r:embed="rId21">
+                      <a:extLst>
+                        <a:ext uri="{28A0092B-C50C-407E-A947-70E740481C1C}">
+                          <a14:useLocalDpi xmlns:a14="http://schemas.microsoft.com/office/drawing/2010/main" val="0"/>
+                        </a:ext>
+                      </a:extLst>
+                    </a:blip>
+                    <a:stretch>
+                      <a:fillRect/>
+                    </a:stretch>
+                  </pic:blipFill>
+                  <pic:spPr>
+                    <a:xfrm>
+                      <a:off x="0" y="0"/>
+                      <a:ext cx="4883150" cy="3590925"/>
+                    </a:xfrm>
+                    <a:prstGeom prst="rect">
+                      <a:avLst/>
+                    </a:prstGeom>
+                  </pic:spPr>
+                </pic:pic>
+              </a:graphicData>
+            </a:graphic>
+          </wp:inline>
+        </w:drawing>
+      </w:r>
+    </w:p>
+    <w:p>
+      <w:pPr>
+        <w:pStyle w:val="Caption"/>
+        <w:jc w:val="center"/>
+      </w:pPr>
+      <w:r>
+        <w:t xml:space="preserve">Figure </w:t>
+      </w:r>
+      <w:fldSimple w:instr=" SEQ Figure \* ARABIC ">
+        <w:r>
+          <w:rPr>
+            <w:noProof/>
+          </w:rPr>
+          <w:t>8</w:t>
+        </w:r>
+      </w:fldSimple>
+      <w:r>
+        <w:t>: Print Labels Dialog</w:t>
+      </w:r>
+    </w:p>
+    <w:p>
+      <w:pPr>
+        <w:pStyle w:val="Heading2"/>
+        <w:rPr>
+          <w:szCs w:val="20"/>
+        </w:rPr>
+      </w:pPr>
+      <w:r>
+        <w:rPr>
+          <w:szCs w:val="20"/>
+        </w:rPr>
+        <w:lastRenderedPageBreak/>
+        <w:t>Import</w:t>
+      </w:r>
+    </w:p>
+    <w:p>
+      <w:pPr>
+        <w:pStyle w:val="BodyText"/>
+        <w:keepNext/>
+      </w:pPr>
+      <w:r>
+        <w:t>Craft beer sartorial copper mug tbh jianbing, locavore VHS salvia +1 vegan gluten-free kogi pug vexillologist affogato. Fanny pack palo santo proident blog bespoke commodo tilde hammock taiyaki wayfarers gentrify. Cardigan ugh slow-carb, ea DIY hot chicken commodo godard. Lorem sint qui 3 wolf moon enim voluptate, velit veniam. Fanny pack man bun helvetica viral, edison bulb cliche jianbing.</w:t>
+      </w:r>
+    </w:p>
+    <w:p>
+      <w:pPr>
+        <w:pStyle w:val="BodyText"/>
+        <w:keepNext/>
+        <w:jc w:val="center"/>
+      </w:pPr>
+      <w:r>
+        <w:rPr>
+          <w:noProof/>
+        </w:rPr>
+        <w:drawing>
+          <wp:inline distT="0" distB="0" distL="0" distR="0">
+            <wp:extent cx="4883150" cy="2945765"/>
+            <wp:effectExtent l="0" t="0" r="0" b="6985"/>
+            <wp:docPr id="12" name="Picture 12"/>
+            <wp:cNvGraphicFramePr>
+              <a:graphicFrameLocks xmlns:a="http://schemas.openxmlformats.org/drawingml/2006/main" noChangeAspect="1"/>
+            </wp:cNvGraphicFramePr>
+            <a:graphic xmlns:a="http://schemas.openxmlformats.org/drawingml/2006/main">
+              <a:graphicData uri="http://schemas.openxmlformats.org/drawingml/2006/picture">
+                <pic:pic xmlns:pic="http://schemas.openxmlformats.org/drawingml/2006/picture">
+                  <pic:nvPicPr>
+                    <pic:cNvPr id="12" name="ImportRecord.PNG"/>
+                    <pic:cNvPicPr/>
+                  </pic:nvPicPr>
+                  <pic:blipFill>
+                    <a:blip r:embed="rId22">
+                      <a:extLst>
+                        <a:ext uri="{28A0092B-C50C-407E-A947-70E740481C1C}">
+                          <a14:useLocalDpi xmlns:a14="http://schemas.microsoft.com/office/drawing/2010/main" val="0"/>
+                        </a:ext>
+                      </a:extLst>
+                    </a:blip>
+                    <a:stretch>
+                      <a:fillRect/>
+                    </a:stretch>
+                  </pic:blipFill>
+                  <pic:spPr>
+                    <a:xfrm>
+                      <a:off x="0" y="0"/>
+                      <a:ext cx="4883150" cy="2945765"/>
+                    </a:xfrm>
+                    <a:prstGeom prst="rect">
+                      <a:avLst/>
+                    </a:prstGeom>
+                  </pic:spPr>
+                </pic:pic>
+              </a:graphicData>
+            </a:graphic>
+          </wp:inline>
+        </w:drawing>
+      </w:r>
+    </w:p>
+    <w:p>
+      <w:pPr>
+        <w:pStyle w:val="Caption"/>
+        <w:jc w:val="center"/>
+      </w:pPr>
+      <w:r>
+        <w:t xml:space="preserve">Figure </w:t>
+      </w:r>
+      <w:fldSimple w:instr=" SEQ Figure \* ARABIC ">
+        <w:r>
+          <w:rPr>
+            <w:noProof/>
+          </w:rPr>
+          <w:t>9</w:t>
+        </w:r>
+      </w:fldSimple>
+      <w:r>
+        <w:t>: Importing existing player information</w:t>
+      </w:r>
+    </w:p>
+    <w:p>
+      <w:pPr>
+        <w:pStyle w:val="Heading1"/>
+        <w:sectPr>
+          <w:type w:val="continuous"/>
+          <w:pgSz w:w="12240" w:h="15840" w:code="1"/>
+          <w:pgMar w:top="1800" w:right="1195" w:bottom="1440" w:left="3355" w:header="965" w:footer="965" w:gutter="0"/>
+          <w:cols w:space="360"/>
+          <w:titlePg/>
+        </w:sectPr>
+      </w:pPr>
+    </w:p>
+    <w:p>
+      <w:pPr>
+        <w:pStyle w:val="Heading1"/>
+      </w:pPr>
+      <w:r>
+        <w:lastRenderedPageBreak/>
+        <w:t>Member Scores</w:t>
+      </w:r>
+      <w:r>
+        <w:t xml:space="preserve"> Form</w:t>
+      </w:r>
+    </w:p>
+    <w:p>
+      <w:pPr>
+        <w:pStyle w:val="BodyText"/>
+        <w:keepNext/>
+      </w:pPr>
+      <w:r>
+        <w:t>Craft beer sartorial copper mug tbh jianbing, locavore VHS salvia +1 vegan gluten-free kogi pug vexillologist affogato. Fanny pack palo santo proident blog bespoke commodo tilde hammock taiyaki wayfarers gentrify. Cardigan ugh slow-carb, ea DIY hot chicken commodo godard. Lorem sint qui 3 wolf moon enim voluptate, velit veniam. Fanny pack man bun helvetica viral, edison bulb cliche jianbing.</w:t>
+      </w:r>
+    </w:p>
+    <w:p>
+      <w:pPr>
+        <w:pStyle w:val="BodyText"/>
+        <w:keepNext/>
+        <w:jc w:val="center"/>
+      </w:pPr>
+      <w:r>
+        <w:rPr>
+          <w:noProof/>
+        </w:rPr>
+        <w:drawing>
+          <wp:inline distT="0" distB="0" distL="0" distR="0">
+            <wp:extent cx="4857750" cy="4342247"/>
+            <wp:effectExtent l="0" t="0" r="0" b="1270"/>
+            <wp:docPr id="6" name="Picture 6"/>
+            <wp:cNvGraphicFramePr>
+              <a:graphicFrameLocks xmlns:a="http://schemas.openxmlformats.org/drawingml/2006/main" noChangeAspect="1"/>
+            </wp:cNvGraphicFramePr>
+            <a:graphic xmlns:a="http://schemas.openxmlformats.org/drawingml/2006/main">
+              <a:graphicData uri="http://schemas.openxmlformats.org/drawingml/2006/picture">
+                <pic:pic xmlns:pic="http://schemas.openxmlformats.org/drawingml/2006/picture">
+                  <pic:nvPicPr>
+                    <pic:cNvPr id="6" name="MemberScoresForm.PNG"/>
+                    <pic:cNvPicPr/>
+                  </pic:nvPicPr>
+                  <pic:blipFill rotWithShape="1">
+                    <a:blip r:embed="rId23">
+                      <a:extLst>
+                        <a:ext uri="{28A0092B-C50C-407E-A947-70E740481C1C}">
+                          <a14:useLocalDpi xmlns:a14="http://schemas.microsoft.com/office/drawing/2010/main" val="0"/>
+                        </a:ext>
+                      </a:extLst>
+                    </a:blip>
+                    <a:srcRect l="-1" r="40078"/>
+                    <a:stretch/>
+                  </pic:blipFill>
+                  <pic:spPr bwMode="auto">
+                    <a:xfrm>
+                      <a:off x="0" y="0"/>
+                      <a:ext cx="4883434" cy="4365206"/>
+                    </a:xfrm>
+                    <a:prstGeom prst="rect">
+                      <a:avLst/>
+                    </a:prstGeom>
+                    <a:ln>
+                      <a:noFill/>
+                    </a:ln>
+                    <a:extLst>
+                      <a:ext uri="{53640926-AAD7-44D8-BBD7-CCE9431645EC}">
+                        <a14:shadowObscured xmlns:a14="http://schemas.microsoft.com/office/drawing/2010/main"/>
+                      </a:ext>
+                    </a:extLst>
+                  </pic:spPr>
+                </pic:pic>
+              </a:graphicData>
+            </a:graphic>
+          </wp:inline>
+        </w:drawing>
+      </w:r>
+    </w:p>
+    <w:p>
+      <w:pPr>
+        <w:pStyle w:val="Caption"/>
+        <w:jc w:val="center"/>
+      </w:pPr>
+      <w:r>
+        <w:t xml:space="preserve">Figure </w:t>
+      </w:r>
+      <w:fldSimple w:instr=" SEQ Figure \* ARABIC ">
+        <w:r>
+          <w:rPr>
+            <w:noProof/>
+          </w:rPr>
+          <w:t>10</w:t>
+        </w:r>
+      </w:fldSimple>
+      <w:r>
+        <w:t>: Member Scores</w:t>
+      </w:r>
+    </w:p>
+    <w:p>
+      <w:pPr>
+        <w:pStyle w:val="Heading2"/>
+        <w:rPr>
+          <w:szCs w:val="20"/>
+        </w:rPr>
+      </w:pPr>
+      <w:r>
+        <w:rPr>
+          <w:szCs w:val="20"/>
+        </w:rPr>
+        <w:lastRenderedPageBreak/>
+        <w:t>Tournament Stats</w:t>
+      </w:r>
+    </w:p>
+    <w:p>
+      <w:pPr>
+        <w:pStyle w:val="BodyText"/>
+        <w:keepNext/>
+      </w:pPr>
+      <w:r>
+        <w:t>Craft beer sartorial copper mug tbh jianbing, locavore VHS salvia +1 vegan gluten-free kogi pug vexillologist affogato. Fanny pack palo santo proident blog bespoke commodo tilde hammock taiyaki wayfarers gentrify. Cardigan ugh slow-carb, ea DIY hot chicken commodo godard. Lorem sint qui 3 wolf moon enim voluptate, velit veniam. Fanny pack man bun helvetica viral, edison bulb cliche jianbing.</w:t>
+      </w:r>
+    </w:p>
+    <w:p>
+      <w:pPr>
+        <w:pStyle w:val="BodyText"/>
+        <w:keepNext/>
+        <w:jc w:val="center"/>
+      </w:pPr>
+      <w:r>
+        <w:rPr>
+          <w:noProof/>
+        </w:rPr>
+        <w:drawing>
+          <wp:inline distT="0" distB="0" distL="0" distR="0">
+            <wp:extent cx="4883150" cy="2634615"/>
+            <wp:effectExtent l="0" t="0" r="0" b="0"/>
+            <wp:docPr id="14" name="Picture 14"/>
+            <wp:cNvGraphicFramePr>
+              <a:graphicFrameLocks xmlns:a="http://schemas.openxmlformats.org/drawingml/2006/main" noChangeAspect="1"/>
+            </wp:cNvGraphicFramePr>
+            <a:graphic xmlns:a="http://schemas.openxmlformats.org/drawingml/2006/main">
+              <a:graphicData uri="http://schemas.openxmlformats.org/drawingml/2006/picture">
+                <pic:pic xmlns:pic="http://schemas.openxmlformats.org/drawingml/2006/picture">
+                  <pic:nvPicPr>
+                    <pic:cNvPr id="14" name="TournamentStatsForm.PNG"/>
+                    <pic:cNvPicPr/>
+                  </pic:nvPicPr>
+                  <pic:blipFill>
+                    <a:blip r:embed="rId24" cstate="print">
+                      <a:extLst>
+                        <a:ext uri="{28A0092B-C50C-407E-A947-70E740481C1C}">
+                          <a14:useLocalDpi xmlns:a14="http://schemas.microsoft.com/office/drawing/2010/main" val="0"/>
+                        </a:ext>
+                      </a:extLst>
+                    </a:blip>
+                    <a:stretch>
+                      <a:fillRect/>
+                    </a:stretch>
+                  </pic:blipFill>
+                  <pic:spPr>
+                    <a:xfrm>
+                      <a:off x="0" y="0"/>
+                      <a:ext cx="4883150" cy="2634615"/>
+                    </a:xfrm>
+                    <a:prstGeom prst="rect">
+                      <a:avLst/>
+                    </a:prstGeom>
+                  </pic:spPr>
+                </pic:pic>
+              </a:graphicData>
+            </a:graphic>
+          </wp:inline>
+        </w:drawing>
+      </w:r>
+    </w:p>
+    <w:p>
+      <w:pPr>
+        <w:pStyle w:val="Caption"/>
+        <w:jc w:val="center"/>
+      </w:pPr>
+      <w:r>
+        <w:t xml:space="preserve">Figure </w:t>
+      </w:r>
+      <w:fldSimple w:instr=" SEQ Figure \* ARABIC ">
+        <w:r>
+          <w:rPr>
+            <w:noProof/>
+          </w:rPr>
+          <w:t>11</w:t>
+        </w:r>
+      </w:fldSimple>
+      <w:r>
+        <w:t>: Tournament Stats Form</w:t>
+      </w:r>
+    </w:p>
+    <w:p>
+      <w:pPr>
+        <w:pStyle w:val="Heading2"/>
+        <w:rPr>
+          <w:szCs w:val="20"/>
+        </w:rPr>
+      </w:pPr>
+      <w:r>
+        <w:rPr>
+          <w:szCs w:val="20"/>
+        </w:rPr>
+        <w:t>Print Recaps By Tournament</w:t>
+      </w:r>
+    </w:p>
+    <w:p>
+      <w:pPr>
+        <w:pStyle w:val="BodyText"/>
+        <w:keepNext/>
+      </w:pPr>
+      <w:r>
+        <w:t>Craft beer sartorial copper mug tbh jianbing, locavore VHS salvia +1 vegan gluten-free kogi pug vexillologist affogato. Fanny pack palo santo proident blog bespoke commodo tilde hammock taiyaki wayfarers gentrify. Cardigan ugh slow-carb, ea DIY hot chicken commodo godard. Lorem sint qui 3 wolf moon enim voluptate, velit veniam. Fanny pack man bun helvetica viral, edison bulb cliche jianbing.</w:t>
+      </w:r>
+    </w:p>
+    <w:p>
+      <w:pPr>
+        <w:pStyle w:val="BodyText"/>
+      </w:pPr>
+    </w:p>
+    <w:p>
+      <w:pPr>
+        <w:pStyle w:val="Heading2"/>
+      </w:pPr>
+      <w:r>
+        <w:lastRenderedPageBreak/>
+        <w:t>Tournament Place Standings</w:t>
+      </w:r>
+    </w:p>
+    <w:p>
+      <w:pPr>
+        <w:pStyle w:val="BodyText"/>
+        <w:keepNext/>
+      </w:pPr>
+      <w:r>
+        <w:t>Craft beer sartorial copper mug tbh jianbing, locavore VHS salvia +1 vegan gluten-free kogi pug vexillologist affogato. Fanny pack palo santo proident blog bespoke commodo tilde hammock taiyaki wayfarers gentrify. Cardigan ugh slow-carb, ea DIY hot chicken commodo godard. Lorem sint qui 3 wolf moon enim voluptate, velit veniam. Fanny pack man bun helvetica viral, edison bulb cliche jianbing.</w:t>
+      </w:r>
+    </w:p>
+    <w:p>
+      <w:pPr>
+        <w:pStyle w:val="BodyText"/>
+        <w:keepNext/>
+        <w:jc w:val="center"/>
+      </w:pPr>
+      <w:r>
+        <w:rPr>
+          <w:noProof/>
+        </w:rPr>
+        <w:drawing>
+          <wp:inline distT="0" distB="0" distL="0" distR="0">
+            <wp:extent cx="4883150" cy="2475865"/>
+            <wp:effectExtent l="0" t="0" r="0" b="635"/>
+            <wp:docPr id="15" name="Picture 15"/>
+            <wp:cNvGraphicFramePr>
+              <a:graphicFrameLocks xmlns:a="http://schemas.openxmlformats.org/drawingml/2006/main" noChangeAspect="1"/>
+            </wp:cNvGraphicFramePr>
+            <a:graphic xmlns:a="http://schemas.openxmlformats.org/drawingml/2006/main">
+              <a:graphicData uri="http://schemas.openxmlformats.org/drawingml/2006/picture">
+                <pic:pic xmlns:pic="http://schemas.openxmlformats.org/drawingml/2006/picture">
+                  <pic:nvPicPr>
+                    <pic:cNvPr id="15" name="TournamentPlaceStandings.PNG"/>
+                    <pic:cNvPicPr/>
+                  </pic:nvPicPr>
+                  <pic:blipFill>
+                    <a:blip r:embed="rId25" cstate="print">
+                      <a:extLst>
+                        <a:ext uri="{28A0092B-C50C-407E-A947-70E740481C1C}">
+                          <a14:useLocalDpi xmlns:a14="http://schemas.microsoft.com/office/drawing/2010/main" val="0"/>
+                        </a:ext>
+                      </a:extLst>
+                    </a:blip>
+                    <a:stretch>
+                      <a:fillRect/>
+                    </a:stretch>
+                  </pic:blipFill>
+                  <pic:spPr>
+                    <a:xfrm>
+                      <a:off x="0" y="0"/>
+                      <a:ext cx="4883150" cy="2475865"/>
+                    </a:xfrm>
+                    <a:prstGeom prst="rect">
+                      <a:avLst/>
+                    </a:prstGeom>
+                  </pic:spPr>
+                </pic:pic>
+              </a:graphicData>
+            </a:graphic>
+          </wp:inline>
+        </w:drawing>
+      </w:r>
+    </w:p>
+    <w:p>
+      <w:pPr>
+        <w:pStyle w:val="Caption"/>
+        <w:jc w:val="center"/>
+      </w:pPr>
+      <w:r>
+        <w:t xml:space="preserve">Figure </w:t>
+      </w:r>
+      <w:fldSimple w:instr=" SEQ Figure \* ARABIC ">
+        <w:r>
+          <w:rPr>
+            <w:noProof/>
+          </w:rPr>
+          <w:t>12</w:t>
+        </w:r>
+      </w:fldSimple>
+      <w:r>
+        <w:t>: Tournament Place Standings</w:t>
+      </w:r>
+    </w:p>
+    <w:p>
+      <w:pPr>
+        <w:pStyle w:val="Heading2"/>
+      </w:pPr>
+      <w:r>
+        <w:lastRenderedPageBreak/>
+        <w:t>Create/Edit Tournament</w:t>
+      </w:r>
+    </w:p>
+    <w:p>
+      <w:pPr>
+        <w:pStyle w:val="BodyText"/>
+        <w:keepNext/>
+      </w:pPr>
+      <w:r>
+        <w:t>Craft beer sartorial copper mug tbh jianbing, locavore VHS salvia +1 vegan gluten-free kogi pug vexillologist affogato. Fanny pack palo santo proident blog bespoke commodo tilde hammock taiyaki wayfarers gentrify. Cardigan ugh slow-carb, ea DIY hot chicken commodo godard. Lorem sint qui 3 wolf moon enim voluptate, velit veniam. Fanny pack man bun helvetica viral, edison bulb cliche jianbing.</w:t>
+      </w:r>
+    </w:p>
+    <w:p>
+      <w:pPr>
+        <w:pStyle w:val="BodyText"/>
+        <w:keepNext/>
+        <w:jc w:val="center"/>
+      </w:pPr>
+      <w:r>
+        <w:rPr>
+          <w:noProof/>
+        </w:rPr>
+        <w:drawing>
+          <wp:inline distT="0" distB="0" distL="0" distR="0">
+            <wp:extent cx="2829320" cy="5125165"/>
+            <wp:effectExtent l="19050" t="19050" r="28575" b="18415"/>
+            <wp:docPr id="16" name="Picture 16"/>
+            <wp:cNvGraphicFramePr>
+              <a:graphicFrameLocks xmlns:a="http://schemas.openxmlformats.org/drawingml/2006/main" noChangeAspect="1"/>
+            </wp:cNvGraphicFramePr>
+            <a:graphic xmlns:a="http://schemas.openxmlformats.org/drawingml/2006/main">
+              <a:graphicData uri="http://schemas.openxmlformats.org/drawingml/2006/picture">
+                <pic:pic xmlns:pic="http://schemas.openxmlformats.org/drawingml/2006/picture">
+                  <pic:nvPicPr>
+                    <pic:cNvPr id="16" name="NewTournamentForm.PNG"/>
+                    <pic:cNvPicPr/>
+                  </pic:nvPicPr>
+                  <pic:blipFill>
+                    <a:blip r:embed="rId26">
+                      <a:extLst>
+                        <a:ext uri="{28A0092B-C50C-407E-A947-70E740481C1C}">
+                          <a14:useLocalDpi xmlns:a14="http://schemas.microsoft.com/office/drawing/2010/main" val="0"/>
+                        </a:ext>
+                      </a:extLst>
+                    </a:blip>
+                    <a:stretch>
+                      <a:fillRect/>
+                    </a:stretch>
+                  </pic:blipFill>
+                  <pic:spPr>
+                    <a:xfrm>
+                      <a:off x="0" y="0"/>
+                      <a:ext cx="2829320" cy="5125165"/>
+                    </a:xfrm>
+                    <a:prstGeom prst="rect">
+                      <a:avLst/>
+                    </a:prstGeom>
+                    <a:ln>
+                      <a:solidFill>
+                        <a:schemeClr val="bg1">
+                          <a:lumMod val="85000"/>
+                        </a:schemeClr>
+                      </a:solidFill>
+                    </a:ln>
+                    <a:effectLst/>
+                  </pic:spPr>
+                </pic:pic>
+              </a:graphicData>
+            </a:graphic>
+          </wp:inline>
+        </w:drawing>
+      </w:r>
+    </w:p>
+    <w:p>
+      <w:pPr>
+        <w:pStyle w:val="Caption"/>
+        <w:jc w:val="center"/>
+        <w:rPr>
+          <w14:shadow w14:blurRad="50800" w14:dist="50800" w14:dir="1800000" w14:sx="0" w14:sy="0" w14:kx="0" w14:ky="0" w14:algn="ctr">
+            <w14:srgbClr w14:val="000000">
+              <w14:alpha w14:val="56870"/>
+            </w14:srgbClr>
+          </w14:shadow>
+        </w:rPr>
+      </w:pPr>
+      <w:r>
+        <w:t xml:space="preserve">Figure </w:t>
+      </w:r>
+      <w:fldSimple w:instr=" SEQ Figure \* ARABIC ">
+        <w:r>
+          <w:rPr>
+            <w:noProof/>
+          </w:rPr>
+          <w:t>13</w:t>
+        </w:r>
+      </w:fldSimple>
+      <w:r>
+        <w:t>: Creat/Edit Tournament Form</w:t>
+      </w:r>
+    </w:p>
+    <w:p>
+      <w:pPr>
+        <w:pStyle w:val="Heading2"/>
+      </w:pPr>
+      <w:r>
+        <w:lastRenderedPageBreak/>
+        <w:t>Search Tournaments</w:t>
+      </w:r>
+    </w:p>
+    <w:p>
+      <w:pPr>
+        <w:pStyle w:val="BodyText"/>
+        <w:keepNext/>
+      </w:pPr>
+      <w:r>
+        <w:t>Craft beer sartorial copper mug tbh jianbing, locavore VHS salvia +1 vegan gluten-free kogi pug vexillologist affogato. Fanny pack palo santo proident blog bespoke commodo tilde hammock taiyaki wayfarers gentrify. Cardigan ugh slow-carb, ea DIY hot chicken commodo godard. Lorem sint qui 3 wolf moon enim voluptate, velit veniam. Fanny pack man bun helvetica viral, edison bulb cliche jianbing.</w:t>
+      </w:r>
+    </w:p>
+    <w:p>
+      <w:pPr>
+        <w:pStyle w:val="BodyText"/>
+        <w:keepNext/>
+        <w:jc w:val="center"/>
+      </w:pPr>
+      <w:r>
+        <w:rPr>
+          <w:noProof/>
+        </w:rPr>
+        <w:drawing>
+          <wp:inline distT="0" distB="0" distL="0" distR="0">
+            <wp:extent cx="2311386" cy="3486150"/>
+            <wp:effectExtent l="0" t="0" r="0" b="0"/>
+            <wp:docPr id="17" name="Picture 17"/>
+            <wp:cNvGraphicFramePr>
+              <a:graphicFrameLocks xmlns:a="http://schemas.openxmlformats.org/drawingml/2006/main" noChangeAspect="1"/>
+            </wp:cNvGraphicFramePr>
+            <a:graphic xmlns:a="http://schemas.openxmlformats.org/drawingml/2006/main">
+              <a:graphicData uri="http://schemas.openxmlformats.org/drawingml/2006/picture">
+                <pic:pic xmlns:pic="http://schemas.openxmlformats.org/drawingml/2006/picture">
+                  <pic:nvPicPr>
+                    <pic:cNvPr id="17" name="SearchTournamentsForm.PNG"/>
+                    <pic:cNvPicPr/>
+                  </pic:nvPicPr>
+                  <pic:blipFill>
+                    <a:blip r:embed="rId27">
+                      <a:extLst>
+                        <a:ext uri="{28A0092B-C50C-407E-A947-70E740481C1C}">
+                          <a14:useLocalDpi xmlns:a14="http://schemas.microsoft.com/office/drawing/2010/main" val="0"/>
+                        </a:ext>
+                      </a:extLst>
+                    </a:blip>
+                    <a:stretch>
+                      <a:fillRect/>
+                    </a:stretch>
+                  </pic:blipFill>
+                  <pic:spPr>
+                    <a:xfrm>
+                      <a:off x="0" y="0"/>
+                      <a:ext cx="2331331" cy="3516233"/>
+                    </a:xfrm>
+                    <a:prstGeom prst="rect">
+                      <a:avLst/>
+                    </a:prstGeom>
+                  </pic:spPr>
+                </pic:pic>
+              </a:graphicData>
+            </a:graphic>
+          </wp:inline>
+        </w:drawing>
+      </w:r>
+      <w:bookmarkStart w:id="0" w:name="_GoBack"/>
+      <w:r>
+        <w:rPr>
+          <w:noProof/>
+        </w:rPr>
+        <w:drawing>
+          <wp:inline distT="0" distB="0" distL="0" distR="0">
+            <wp:extent cx="2466975" cy="3704508"/>
+            <wp:effectExtent l="0" t="0" r="0" b="0"/>
+            <wp:docPr id="18" name="Picture 18"/>
+            <wp:cNvGraphicFramePr>
+              <a:graphicFrameLocks xmlns:a="http://schemas.openxmlformats.org/drawingml/2006/main" noChangeAspect="1"/>
+            </wp:cNvGraphicFramePr>
+            <a:graphic xmlns:a="http://schemas.openxmlformats.org/drawingml/2006/main">
+              <a:graphicData uri="http://schemas.openxmlformats.org/drawingml/2006/picture">
+                <pic:pic xmlns:pic="http://schemas.openxmlformats.org/drawingml/2006/picture">
+                  <pic:nvPicPr>
+                    <pic:cNvPr id="18" name="SearchTournamentsByDate.PNG"/>
+                    <pic:cNvPicPr/>
+                  </pic:nvPicPr>
+                  <pic:blipFill>
+                    <a:blip r:embed="rId28">
+                      <a:extLst>
+                        <a:ext uri="{28A0092B-C50C-407E-A947-70E740481C1C}">
+                          <a14:useLocalDpi xmlns:a14="http://schemas.microsoft.com/office/drawing/2010/main" val="0"/>
+                        </a:ext>
+                      </a:extLst>
+                    </a:blip>
+                    <a:stretch>
+                      <a:fillRect/>
+                    </a:stretch>
+                  </pic:blipFill>
+                  <pic:spPr>
+                    <a:xfrm>
+                      <a:off x="0" y="0"/>
+                      <a:ext cx="2476952" cy="3719489"/>
+                    </a:xfrm>
+                    <a:prstGeom prst="rect">
+                      <a:avLst/>
+                    </a:prstGeom>
+                  </pic:spPr>
+                </pic:pic>
+              </a:graphicData>
+            </a:graphic>
+          </wp:inline>
+        </w:drawing>
+      </w:r>
+      <w:bookmarkEnd w:id="0"/>
+    </w:p>
+    <w:p>
+      <w:pPr>
+        <w:pStyle w:val="Caption"/>
+        <w:jc w:val="center"/>
+      </w:pPr>
+      <w:r>
+        <w:t xml:space="preserve">Figure </w:t>
+      </w:r>
+      <w:fldSimple w:instr=" SEQ Figure \* ARABIC ">
+        <w:r>
+          <w:rPr>
+            <w:noProof/>
+          </w:rPr>
+          <w:t>14</w:t>
+        </w:r>
+      </w:fldSimple>
+      <w:r>
+        <w:t>: Tournament Search Forms</w:t>
+      </w:r>
+    </w:p>
+    <w:p>
+      <w:pPr>
+        <w:pStyle w:val="Heading2"/>
+      </w:pPr>
+      <w:r>
+        <w:t>List Tournaments by year</w:t>
+      </w:r>
+    </w:p>
+    <w:p>
+      <w:pPr>
+        <w:pStyle w:val="BodyText"/>
+        <w:keepNext/>
+      </w:pPr>
+      <w:r>
+        <w:t>Craft beer sartorial copper mug tbh jianbing, locavore VHS salvia +1 vegan gluten-free kogi pug vexillologist affogato. Fanny pack palo santo proident blog bespoke commodo tilde hammock taiyaki wayfarers gentrify. Cardigan ugh slow-carb, ea DIY hot chicken commodo godard. Lorem sint qui 3 wolf moon enim voluptate, velit veniam. Fanny pack man bun helvetica viral, edison bulb cliche jianbing.</w:t>
+      </w:r>
+    </w:p>
+    <w:p>
+      <w:pPr>
+        <w:pStyle w:val="BodyText"/>
+      </w:pPr>
+    </w:p>
+    <w:p>
+      <w:pPr>
+        <w:pStyle w:val="Heading2"/>
+      </w:pPr>
+      <w:r>
+        <w:lastRenderedPageBreak/>
+        <w:t>Reports</w:t>
+      </w:r>
+    </w:p>
+    <w:p>
+      <w:pPr>
+        <w:pStyle w:val="BodyText"/>
+        <w:keepNext/>
+      </w:pPr>
+      <w:r>
+        <w:t>Craft beer sartorial copper mug tbh jianbing, locavore VHS salvia +1 vegan gluten-free kogi pug vexillologist affogato. Fanny pack palo santo proident blog bespoke commodo tilde hammock taiyaki wayfarers gentrify. Cardigan ugh slow-carb, ea DIY hot chicken commodo godard. Lorem sint qui 3 wolf moon enim voluptate, velit veniam. Fanny pack man bun helvetica viral, edison bulb cliche jianbing.</w:t>
+      </w:r>
+    </w:p>
+    <w:p>
+      <w:pPr>
+        <w:pStyle w:val="BodyText"/>
+      </w:pPr>
+    </w:p>
+    <w:p>
+      <w:pPr>
+        <w:pStyle w:val="Heading2"/>
+      </w:pPr>
+      <w:r>
+        <w:t>Finalize Tournament</w:t>
+      </w:r>
+    </w:p>
+    <w:p>
+      <w:pPr>
+        <w:pStyle w:val="BodyText"/>
+        <w:keepNext/>
+      </w:pPr>
+      <w:r>
+        <w:t>Craft beer sartorial copper mug tbh jianbing, locavore VHS salvia +1 vegan gluten-free kogi pug vexillologist affogato. Fanny pack palo santo proident blog bespoke commodo tilde hammock taiyaki wayfarers gentrify. Cardigan ugh slow-carb, ea DIY hot chicken commodo godard. Lorem sint qui 3 wolf moon enim voluptate, velit veniam. Fanny pack man bun helvetica viral, edison bulb cliche jianbing.</w:t>
+      </w:r>
+    </w:p>
+    <w:p>
+      <w:pPr>
+        <w:pStyle w:val="BodyText"/>
+      </w:pPr>
+    </w:p>
+    <w:p>
+      <w:pPr>
+        <w:pStyle w:val="Heading1"/>
+        <w:rPr>
+          <w:sz w:val="40"/>
+          <w:szCs w:val="40"/>
+        </w:rPr>
+      </w:pPr>
+      <w:r>
+        <w:rPr>
+          <w:sz w:val="40"/>
+          <w:szCs w:val="40"/>
+        </w:rPr>
+        <w:t>Setup and Installation</w:t>
+      </w:r>
+    </w:p>
+    <w:p>
+      <w:pPr>
+        <w:pStyle w:val="Heading2"/>
+        <w:rPr>
+          <w:sz w:val="24"/>
+          <w:szCs w:val="24"/>
+        </w:rPr>
+      </w:pPr>
+      <w:r>
+        <w:rPr>
+          <w:sz w:val="24"/>
+          <w:szCs w:val="24"/>
+        </w:rPr>
+        <w:t>System Requirements</w:t>
+      </w:r>
+    </w:p>
+    <w:p>
+      <w:pPr>
+        <w:pStyle w:val="BodyTextKeep"/>
+      </w:pPr>
+      <w:r>
+        <w:t>The s</w:t>
+      </w:r>
+      <w:r>
+        <w:t>ystem requirements to run the 9 tap software are as follows:</w:t>
+      </w:r>
+      <w:r>
+        <w:t xml:space="preserve"> Windows 10, (Windows 8, or Windows 7). Storage: how much? USB port. Dot matrix and ink/laser-jet</w:t>
+      </w:r>
+      <w:r>
+        <w:t xml:space="preserve"> printers. Microsoft Excel must be installed on the computer for the 9 Tap Tour program to work.</w:t>
+      </w:r>
+    </w:p>
+    <w:p>
+      <w:pPr>
+        <w:pStyle w:val="Heading2"/>
+        <w:rPr>
+          <w:sz w:val="24"/>
+          <w:szCs w:val="24"/>
+        </w:rPr>
+      </w:pPr>
+      <w:r>
+        <w:rPr>
+          <w:sz w:val="24"/>
+          <w:szCs w:val="24"/>
+        </w:rPr>
+        <w:t>WARNING:</w:t>
+      </w:r>
+    </w:p>
+    <w:p>
+      <w:pPr>
+        <w:pStyle w:val="BodyText"/>
+      </w:pPr>
+      <w:r>
+        <w:t xml:space="preserve">If tournament has </w:t>
+      </w:r>
+      <w:r>
+        <w:t>five (5) or fewer</w:t>
+      </w:r>
+      <w:r>
+        <w:t xml:space="preserve"> participants, DO NOT USE PROGRAM. Keep track of player data manually.</w:t>
+      </w:r>
+    </w:p>
+    <w:p>
+      <w:pPr>
+        <w:pStyle w:val="Heading2"/>
+        <w:rPr>
+          <w:sz w:val="24"/>
+          <w:szCs w:val="24"/>
+        </w:rPr>
+      </w:pPr>
+      <w:r>
+        <w:rPr>
+          <w:sz w:val="24"/>
+          <w:szCs w:val="24"/>
+        </w:rPr>
+        <w:t>Installation</w:t>
+      </w:r>
+    </w:p>
+    <w:p>
+      <w:pPr>
+        <w:pStyle w:val="BodyText"/>
+        <w:numPr>
+          <w:ilvl w:val="0"/>
+          <w:numId w:val="40"/>
+        </w:numPr>
+      </w:pPr>
+      <w:r>
+        <w:t>Start Windows and exit all other applications.</w:t>
+      </w:r>
+    </w:p>
+    <w:p>
+      <w:pPr>
+        <w:pStyle w:val="BodyText"/>
+        <w:numPr>
+          <w:ilvl w:val="0"/>
+          <w:numId w:val="40"/>
+        </w:numPr>
+      </w:pPr>
+      <w:r>
+        <w:t>Insert the 9 Tap Tour USB drive into your computer’s USB port.</w:t>
+      </w:r>
+    </w:p>
+    <w:p>
+      <w:pPr>
+        <w:pStyle w:val="BodyText"/>
+        <w:numPr>
+          <w:ilvl w:val="0"/>
+          <w:numId w:val="40"/>
+        </w:numPr>
+      </w:pPr>
+      <w:r>
+        <w:t>If the file manager dialog does not appear, click the Start button on your Windows taskbar, then click Run. Type D:\Setup and click on OK. (Note: If your removable USB drive is assigned a letter other than D, use that letter.)</w:t>
+      </w:r>
+    </w:p>
+    <w:p>
+      <w:pPr>
+        <w:pStyle w:val="BodyText"/>
+        <w:numPr>
+          <w:ilvl w:val="0"/>
+          <w:numId w:val="40"/>
+        </w:numPr>
+      </w:pPr>
+      <w:r>
+        <w:t>The installation wizard will now run.</w:t>
+      </w:r>
+    </w:p>
+    <w:p>
+      <w:pPr>
+        <w:pStyle w:val="BodyText"/>
+        <w:numPr>
+          <w:ilvl w:val="0"/>
+          <w:numId w:val="40"/>
+        </w:numPr>
+      </w:pPr>
+      <w:r>
+        <w:t>The next window will prompt you to shut down all other running programs before starting the 9 Tap Tour installation process. Do this and then click “Next” to continue.</w:t>
+      </w:r>
+    </w:p>
+    <w:p>
+      <w:pPr>
+        <w:pStyle w:val="BodyText"/>
+        <w:numPr>
+          <w:ilvl w:val="0"/>
+          <w:numId w:val="40"/>
+        </w:numPr>
+      </w:pPr>
+      <w:r>
+        <w:lastRenderedPageBreak/>
+        <w:t>End User License agreement.</w:t>
+      </w:r>
+      <w:r>
+        <w:t xml:space="preserve"> Read the agreement, and if you agree to the terms and conditions chose “I agree.” Then click the “I Agree” button to continue the installation process.</w:t>
+      </w:r>
+    </w:p>
+    <w:p>
+      <w:pPr>
+        <w:pStyle w:val="BodyText"/>
+        <w:numPr>
+          <w:ilvl w:val="0"/>
+          <w:numId w:val="40"/>
+        </w:numPr>
+      </w:pPr>
+      <w:r>
+        <w:t>Next, chose an install location for the program. Either accept the default location or choose another location. Once you’re satisfied with your choice, click “Next” to continue installing.</w:t>
+      </w:r>
+    </w:p>
+    <w:p>
+      <w:pPr>
+        <w:pStyle w:val="BodyText"/>
+        <w:numPr>
+          <w:ilvl w:val="0"/>
+          <w:numId w:val="40"/>
+        </w:numPr>
+      </w:pPr>
+      <w:r>
+        <w:t>Select a Start Menu Folder for 9 Tap Tour. Either accept the default location or chose another. If you don’t want a Start Menu folder to be created check the box “Do Not Create A Start Menu Folder”. Once you are satisfied with your selection click the “Next” button to continue.</w:t>
+      </w:r>
+    </w:p>
+    <w:p>
+      <w:pPr>
+        <w:pStyle w:val="BodyText"/>
+        <w:numPr>
+          <w:ilvl w:val="0"/>
+          <w:numId w:val="40"/>
+        </w:numPr>
+      </w:pPr>
+      <w:r>
+        <w:t>Select the shortcuts you want created. Chose to create shortcuts on the Desktop, Quick Launch Toolbar, or neither. Once you are satisfied with your selection click on the “Next” button to continue.</w:t>
+      </w:r>
+    </w:p>
+    <w:p>
+      <w:pPr>
+        <w:pStyle w:val="BodyText"/>
+        <w:numPr>
+          <w:ilvl w:val="0"/>
+          <w:numId w:val="40"/>
+        </w:numPr>
+      </w:pPr>
+      <w:r>
+        <w:t>The 9 Tap Tour will now begin installing. When the “Install complete” message</w:t>
+      </w:r>
+      <w:r>
+        <w:t xml:space="preserve"> displays, click the “Next:” button to continue.</w:t>
+      </w:r>
+    </w:p>
+    <w:p>
+      <w:pPr>
+        <w:pStyle w:val="BodyText"/>
+        <w:numPr>
+          <w:ilvl w:val="0"/>
+          <w:numId w:val="40"/>
+        </w:numPr>
+      </w:pPr>
+      <w:r>
+        <w:t xml:space="preserve">The 9 Tap Tour program has now been successfully installed. Choose “Run 9 Tap Tour” to </w:t>
+      </w:r>
+      <w:r>
+        <w:t>immediately</w:t>
+      </w:r>
+      <w:r>
+        <w:t xml:space="preserve"> </w:t>
+      </w:r>
+      <w:r>
+        <w:t>launch</w:t>
+      </w:r>
+      <w:r>
+        <w:t xml:space="preserve"> the program, or “View ReadMe.txt” to view the ReadMe file where you can view updated program information made after the game manual was printed.</w:t>
+      </w:r>
+    </w:p>
+    <w:p>
+      <w:pPr>
+        <w:pStyle w:val="Heading2"/>
+        <w:rPr>
+          <w:sz w:val="24"/>
+          <w:szCs w:val="24"/>
+        </w:rPr>
+      </w:pPr>
+      <w:r>
+        <w:rPr>
+          <w:sz w:val="24"/>
+          <w:szCs w:val="24"/>
+        </w:rPr>
+        <w:t>ReadMe File</w:t>
+      </w:r>
+    </w:p>
+    <w:p>
+      <w:pPr>
+        <w:pStyle w:val="BodyText"/>
+      </w:pPr>
+      <w:r>
+        <w:t>The 9 Tap Tour program contains a ReadMe file where you can view updated program information. We strongly encourage you to take the t</w:t>
+      </w:r>
+      <w:r>
+        <w:t>ime</w:t>
+      </w:r>
+      <w:r>
+        <w:t xml:space="preserve"> look over this file to get information on changes made after this manual went to print.</w:t>
+      </w:r>
+    </w:p>
+    <w:p>
+      <w:pPr>
+        <w:pStyle w:val="BodyText"/>
+      </w:pPr>
+      <w:r>
+        <w:t>To view this file, double-click on it in the 9 Tap Tour directory found on your hard drive (usually C:\Program Files\9TapTour\docs\readme_en.txt). You can also view the ReadMe file by clicking on the Start button on your Windows taskbar, then on Programs, then on 9 Tap Tour, then on View Readme.txt.</w:t>
+      </w:r>
+    </w:p>
+    <w:p>
+      <w:pPr>
+        <w:pStyle w:val="Heading1"/>
+      </w:pPr>
+      <w:r>
+        <w:t>Using 9 Tap Tour</w:t>
+      </w:r>
+    </w:p>
+    <w:p>
+      <w:pPr>
+        <w:pStyle w:val="Heading1"/>
+        <w:sectPr>
+          <w:type w:val="continuous"/>
+          <w:pgSz w:w="12240" w:h="15840" w:code="1"/>
+          <w:pgMar w:top="1800" w:right="1195" w:bottom="1440" w:left="3355" w:header="965" w:footer="965" w:gutter="0"/>
+          <w:cols w:space="360"/>
+          <w:titlePg/>
+        </w:sectPr>
+      </w:pPr>
+    </w:p>
+    <w:p>
+      <w:pPr>
+        <w:pStyle w:val="Heading2"/>
+        <w:rPr>
+          <w:sz w:val="22"/>
+          <w:szCs w:val="22"/>
+        </w:rPr>
+      </w:pPr>
+      <w:r>
+        <w:rPr>
+          <w:sz w:val="22"/>
+          <w:szCs w:val="22"/>
+        </w:rPr>
+        <w:t>Main Menu</w:t>
+      </w:r>
     </w:p>
     <w:p>
       <w:pPr>
         <w:pStyle w:val="Caption"/>
         <w:jc w:val="both"/>
-      </w:pPr>
-      <w:r>
-        <w:t xml:space="preserve">Figure </w:t>
-      </w:r>
-      <w:r>
-        <w:fldChar w:fldCharType="begin"/>
-      </w:r>
-      <w:r>
-        <w:instrText xml:space="preserve"> SEQ Figure \* ARABIC </w:instrText>
-      </w:r>
-      <w:r>
-        <w:fldChar w:fldCharType="separate"/>
-      </w:r>
-      <w:r>
-        <w:rPr>
-          <w:noProof/>
-        </w:rPr>
-        <w:t>2</w:t>
-      </w:r>
-      <w:r>
-        <w:rPr>
-          <w:noProof/>
-        </w:rPr>
-        <w:fldChar w:fldCharType="end"/>
-      </w:r>
-      <w:r>
-        <w:t>: Member Info form</w:t>
+        <w:rPr>
+          <w:sz w:val="24"/>
+          <w:szCs w:val="24"/>
+        </w:rPr>
+      </w:pPr>
+      <w:r>
+        <w:rPr>
+          <w:sz w:val="24"/>
+          <w:szCs w:val="24"/>
+        </w:rPr>
+        <w:t>Launch 9 Tap Tour. Once it’s running you should see the Main Menu screen.</w:t>
+      </w:r>
+      <w:r>
+        <w:rPr>
+          <w:sz w:val="24"/>
+          <w:szCs w:val="24"/>
+        </w:rPr>
+        <w:t xml:space="preserve"> To enter bowler information or scores there are two main ways to get there, the tabs across the top and the left hand buttons.</w:t>
       </w:r>
     </w:p>
     <w:p>
@@ -1947,18 +3548,164 @@
         <w:pStyle w:val="BodyText"/>
       </w:pPr>
       <w:r>
+        <w:t>The top tabs are:</w:t>
+      </w:r>
+    </w:p>
+    <w:p>
+      <w:pPr>
+        <w:pStyle w:val="BodyText"/>
+        <w:numPr>
+          <w:ilvl w:val="0"/>
+          <w:numId w:val="42"/>
+        </w:numPr>
+      </w:pPr>
+      <w:r>
+        <w:t>Home—takes you back to the Main Menu.</w:t>
+      </w:r>
+    </w:p>
+    <w:p>
+      <w:pPr>
+        <w:pStyle w:val="BodyText"/>
+        <w:numPr>
+          <w:ilvl w:val="0"/>
+          <w:numId w:val="42"/>
+        </w:numPr>
+      </w:pPr>
+      <w:r>
+        <w:lastRenderedPageBreak/>
+        <w:t xml:space="preserve">Member Info—takes you to the Member Information form. </w:t>
+      </w:r>
+    </w:p>
+    <w:p>
+      <w:pPr>
+        <w:pStyle w:val="BodyText"/>
+        <w:numPr>
+          <w:ilvl w:val="0"/>
+          <w:numId w:val="42"/>
+        </w:numPr>
+      </w:pPr>
+      <w:r>
+        <w:t>Member Scores—takes you to the Member Scores Form. From there, you can access Tournament creation and editing.</w:t>
+      </w:r>
+    </w:p>
+    <w:p>
+      <w:pPr>
+        <w:pStyle w:val="BodyText"/>
+        <w:numPr>
+          <w:ilvl w:val="0"/>
+          <w:numId w:val="42"/>
+        </w:numPr>
+      </w:pPr>
+      <w:r>
+        <w:t>Tools—take you to the active/inactive member dialog.</w:t>
+      </w:r>
+    </w:p>
+    <w:p>
+      <w:pPr>
+        <w:pStyle w:val="BodyText"/>
+      </w:pPr>
+      <w:r>
+        <w:t>The left hand buttons are:</w:t>
+      </w:r>
+    </w:p>
+    <w:p>
+      <w:pPr>
+        <w:pStyle w:val="BodyText"/>
+        <w:numPr>
+          <w:ilvl w:val="0"/>
+          <w:numId w:val="41"/>
+        </w:numPr>
+      </w:pPr>
+      <w:r>
+        <w:t>“Member Info”—Left click on this to go to the member information form. Here is where new member information is entered and saved. Player statistics can be found here too. Also importing member information from Microsoft Excel files is done here</w:t>
+      </w:r>
+    </w:p>
+    <w:p>
+      <w:pPr>
+        <w:pStyle w:val="BodyText"/>
+        <w:numPr>
+          <w:ilvl w:val="0"/>
+          <w:numId w:val="41"/>
+        </w:numPr>
+      </w:pPr>
+      <w:r>
+        <w:t>“Member Scores”—accesses the Member Scores form. From there, access Tournament forms</w:t>
+      </w:r>
+    </w:p>
+    <w:p>
+      <w:pPr>
+        <w:pStyle w:val="BodyText"/>
+        <w:numPr>
+          <w:ilvl w:val="0"/>
+          <w:numId w:val="41"/>
+        </w:numPr>
+      </w:pPr>
+      <w:r>
+        <w:t>“About”—About the 9Tap Tour</w:t>
+      </w:r>
+    </w:p>
+    <w:p>
+      <w:pPr>
+        <w:pStyle w:val="BodyText"/>
+        <w:numPr>
+          <w:ilvl w:val="0"/>
+          <w:numId w:val="41"/>
+        </w:numPr>
+      </w:pPr>
+      <w:r>
+        <w:t>“Exit”—exits the 9Tap Tour program</w:t>
+      </w:r>
+    </w:p>
+    <w:p>
+      <w:pPr>
+        <w:pStyle w:val="BodyText"/>
+        <w:numPr>
+          <w:ilvl w:val="0"/>
+          <w:numId w:val="41"/>
+        </w:numPr>
+      </w:pPr>
+      <w:r>
+        <w:t>Region—drop down menu to pick location. Default is “local”.</w:t>
+      </w:r>
+    </w:p>
+    <w:p>
+      <w:pPr>
+        <w:pStyle w:val="BodyText"/>
+        <w:numPr>
+          <w:ilvl w:val="0"/>
+          <w:numId w:val="41"/>
+        </w:numPr>
+      </w:pPr>
+      <w:r>
+        <w:t>“Add Region”—goes to “Add Region” dialog.</w:t>
+      </w:r>
+    </w:p>
+    <w:p>
+      <w:pPr>
+        <w:pStyle w:val="Heading1"/>
+      </w:pPr>
+      <w:r>
+        <w:t>Member I</w:t>
+      </w:r>
+      <w:r>
+        <w:t>n</w:t>
+      </w:r>
+      <w:r>
+        <w:t>fo</w:t>
+      </w:r>
+    </w:p>
+    <w:p>
+      <w:pPr>
+        <w:pStyle w:val="BodyText"/>
+      </w:pPr>
+      <w:r>
         <w:t>To enter a new member: Click “New” Button under record. Enter the player’s Last, First, and, if applicable, Middle name at the top of the form. The member number automatically generates. You can click “Save” at this point to come back and finish filling out the player’s information later</w:t>
       </w:r>
       <w:r>
         <w:t>.</w:t>
       </w:r>
       <w:r>
-        <w:t xml:space="preserve"> When you have the time, you can fill out the remaining information: member birthdate, social security number, address, city, state, zip code</w:t>
-      </w:r>
-      <w:bookmarkStart w:id="0" w:name="_GoBack"/>
-      <w:bookmarkEnd w:id="0"/>
-      <w:r>
-        <w:t>, date joined or rejoined,</w:t>
+        <w:t xml:space="preserve"> When you have the time, you can fill out the remaining information: member birthdate, social security number, address, city, state, zip code, date joined or rejoined,</w:t>
       </w:r>
     </w:p>
     <w:p>
@@ -1966,6 +3713,7 @@
         <w:pStyle w:val="Heading1"/>
       </w:pPr>
       <w:r>
+        <w:lastRenderedPageBreak/>
         <w:t>Tournaments</w:t>
       </w:r>
     </w:p>
@@ -2012,42 +3760,46 @@
     </w:p>
     <w:p>
       <w:pPr>
-        <w:pStyle w:val="Caption"/>
+        <w:rPr>
+          <w:rFonts w:ascii="Arial Black" w:hAnsi="Arial Black"/>
+          <w:color w:val="808080"/>
+          <w:spacing w:val="-25"/>
+          <w:kern w:val="28"/>
+          <w:sz w:val="32"/>
+        </w:rPr>
+      </w:pPr>
+      <w:r>
+        <w:br w:type="page"/>
+      </w:r>
+    </w:p>
+    <w:p>
+      <w:pPr>
+        <w:pStyle w:val="Heading1"/>
+      </w:pPr>
+      <w:r>
+        <w:lastRenderedPageBreak/>
+        <w:t>Index</w:t>
+      </w:r>
+      <w:bookmarkEnd w:id="1"/>
+      <w:bookmarkEnd w:id="2"/>
+      <w:bookmarkEnd w:id="3"/>
+    </w:p>
+    <w:p>
+      <w:pPr>
+        <w:pStyle w:val="BodyText"/>
+        <w:rPr>
+          <w:noProof/>
+        </w:rPr>
         <w:sectPr>
-          <w:headerReference w:type="default" r:id="rId19"/>
-          <w:footerReference w:type="default" r:id="rId20"/>
-          <w:headerReference w:type="first" r:id="rId21"/>
+          <w:headerReference w:type="default" r:id="rId29"/>
+          <w:footerReference w:type="default" r:id="rId30"/>
+          <w:headerReference w:type="first" r:id="rId31"/>
           <w:type w:val="continuous"/>
           <w:pgSz w:w="12240" w:h="15840" w:code="1"/>
           <w:pgMar w:top="1800" w:right="1195" w:bottom="1440" w:left="3355" w:header="720" w:footer="720" w:gutter="0"/>
           <w:cols w:space="720"/>
         </w:sectPr>
       </w:pPr>
-    </w:p>
-    <w:p>
-      <w:pPr>
-        <w:pStyle w:val="Heading1"/>
-      </w:pPr>
-      <w:r>
-        <w:t>Index</w:t>
-      </w:r>
-      <w:bookmarkEnd w:id="1"/>
-      <w:bookmarkEnd w:id="2"/>
-      <w:bookmarkEnd w:id="3"/>
-    </w:p>
-    <w:p>
-      <w:pPr>
-        <w:pStyle w:val="BodyText"/>
-        <w:rPr>
-          <w:noProof/>
-        </w:rPr>
-        <w:sectPr>
-          <w:type w:val="continuous"/>
-          <w:pgSz w:w="12240" w:h="15840" w:code="1"/>
-          <w:pgMar w:top="1800" w:right="1195" w:bottom="1440" w:left="3355" w:header="720" w:footer="720" w:gutter="0"/>
-          <w:cols w:space="720"/>
-        </w:sectPr>
-      </w:pPr>
       <w:r>
         <w:fldChar w:fldCharType="begin"/>
       </w:r>
@@ -2174,7 +3926,6 @@
         <w:rPr>
           <w:noProof/>
         </w:rPr>
-        <w:lastRenderedPageBreak/>
         <w:t>drop cap, 1</w:t>
       </w:r>
     </w:p>
@@ -2658,6 +4409,10 @@
   <w:p>
     <w:pPr>
       <w:pStyle w:val="Footer"/>
+      <w:framePr w:wrap="notBeside" w:vAnchor="text" w:hAnchor="margin" w:xAlign="center" w:y="1"/>
+      <w:rPr>
+        <w:rStyle w:val="PageNumber"/>
+      </w:rPr>
     </w:pPr>
     <w:r>
       <w:rPr>
@@ -2669,7 +4424,7 @@
       <w:rPr>
         <w:rStyle w:val="PageNumber"/>
       </w:rPr>
-      <w:instrText xml:space="preserve"> PAGE </w:instrText>
+      <w:instrText xml:space="preserve">PAGE  </w:instrText>
     </w:r>
     <w:r>
       <w:rPr>
@@ -2682,7 +4437,7 @@
         <w:rStyle w:val="PageNumber"/>
         <w:noProof/>
       </w:rPr>
-      <w:t>1</w:t>
+      <w:t>22</w:t>
     </w:r>
     <w:r>
       <w:rPr>
@@ -2691,11 +4446,6 @@
       <w:fldChar w:fldCharType="end"/>
     </w:r>
   </w:p>
-</w:ftr>
-</file>
-
-<file path=word/footer5.xml><?xml version="1.0" encoding="utf-8"?>
-<w:ftr xmlns:wpc="http://schemas.microsoft.com/office/word/2010/wordprocessingCanvas" xmlns:mc="http://schemas.openxmlformats.org/markup-compatibility/2006" xmlns:o="urn:schemas-microsoft-com:office:office" xmlns:r="http://schemas.openxmlformats.org/officeDocument/2006/relationships" xmlns:m="http://schemas.openxmlformats.org/officeDocument/2006/math" xmlns:v="urn:schemas-microsoft-com:vml" xmlns:wp14="http://schemas.microsoft.com/office/word/2010/wordprocessingDrawing" xmlns:wp="http://schemas.openxmlformats.org/drawingml/2006/wordprocessingDrawing" xmlns:w10="urn:schemas-microsoft-com:office:word" xmlns:w="http://schemas.openxmlformats.org/wordprocessingml/2006/main" xmlns:w14="http://schemas.microsoft.com/office/word/2010/wordml" xmlns:w15="http://schemas.microsoft.com/office/word/2012/wordml" xmlns:wpg="http://schemas.microsoft.com/office/word/2010/wordprocessingGroup" xmlns:wpi="http://schemas.microsoft.com/office/word/2010/wordprocessingInk" xmlns:wne="http://schemas.microsoft.com/office/word/2006/wordml" xmlns:wps="http://schemas.microsoft.com/office/word/2010/wordprocessingShape" mc:Ignorable="w14 w15 wp14">
   <w:p>
     <w:pPr>
       <w:pStyle w:val="Footer"/>
@@ -2704,7 +4454,7 @@
 </w:ftr>
 </file>
 
-<file path=word/footer6.xml><?xml version="1.0" encoding="utf-8"?>
+<file path=word/footer5.xml><?xml version="1.0" encoding="utf-8"?>
 <w:ftr xmlns:wpc="http://schemas.microsoft.com/office/word/2010/wordprocessingCanvas" xmlns:mc="http://schemas.openxmlformats.org/markup-compatibility/2006" xmlns:o="urn:schemas-microsoft-com:office:office" xmlns:r="http://schemas.openxmlformats.org/officeDocument/2006/relationships" xmlns:m="http://schemas.openxmlformats.org/officeDocument/2006/math" xmlns:v="urn:schemas-microsoft-com:vml" xmlns:wp14="http://schemas.microsoft.com/office/word/2010/wordprocessingDrawing" xmlns:wp="http://schemas.openxmlformats.org/drawingml/2006/wordprocessingDrawing" xmlns:w10="urn:schemas-microsoft-com:office:word" xmlns:w="http://schemas.openxmlformats.org/wordprocessingml/2006/main" xmlns:w14="http://schemas.microsoft.com/office/word/2010/wordml" xmlns:w15="http://schemas.microsoft.com/office/word/2012/wordml" xmlns:wpg="http://schemas.microsoft.com/office/word/2010/wordprocessingGroup" xmlns:wpi="http://schemas.microsoft.com/office/word/2010/wordprocessingInk" xmlns:wne="http://schemas.microsoft.com/office/word/2006/wordml" xmlns:wps="http://schemas.microsoft.com/office/word/2010/wordprocessingShape" mc:Ignorable="w14 w15 wp14">
   <w:p>
     <w:pPr>
@@ -2737,57 +4487,7 @@
         <w:rStyle w:val="PageNumber"/>
         <w:noProof/>
       </w:rPr>
-      <w:t>4</w:t>
-    </w:r>
-    <w:r>
-      <w:rPr>
-        <w:rStyle w:val="PageNumber"/>
-      </w:rPr>
-      <w:fldChar w:fldCharType="end"/>
-    </w:r>
-  </w:p>
-  <w:p>
-    <w:pPr>
-      <w:pStyle w:val="Footer"/>
-    </w:pPr>
-  </w:p>
-</w:ftr>
-</file>
-
-<file path=word/footer7.xml><?xml version="1.0" encoding="utf-8"?>
-<w:ftr xmlns:wpc="http://schemas.microsoft.com/office/word/2010/wordprocessingCanvas" xmlns:mc="http://schemas.openxmlformats.org/markup-compatibility/2006" xmlns:o="urn:schemas-microsoft-com:office:office" xmlns:r="http://schemas.openxmlformats.org/officeDocument/2006/relationships" xmlns:m="http://schemas.openxmlformats.org/officeDocument/2006/math" xmlns:v="urn:schemas-microsoft-com:vml" xmlns:wp14="http://schemas.microsoft.com/office/word/2010/wordprocessingDrawing" xmlns:wp="http://schemas.openxmlformats.org/drawingml/2006/wordprocessingDrawing" xmlns:w10="urn:schemas-microsoft-com:office:word" xmlns:w="http://schemas.openxmlformats.org/wordprocessingml/2006/main" xmlns:w14="http://schemas.microsoft.com/office/word/2010/wordml" xmlns:w15="http://schemas.microsoft.com/office/word/2012/wordml" xmlns:wpg="http://schemas.microsoft.com/office/word/2010/wordprocessingGroup" xmlns:wpi="http://schemas.microsoft.com/office/word/2010/wordprocessingInk" xmlns:wne="http://schemas.microsoft.com/office/word/2006/wordml" xmlns:wps="http://schemas.microsoft.com/office/word/2010/wordprocessingShape" mc:Ignorable="w14 w15 wp14">
-  <w:p>
-    <w:pPr>
-      <w:pStyle w:val="Footer"/>
-      <w:framePr w:wrap="notBeside" w:vAnchor="text" w:hAnchor="margin" w:xAlign="center" w:y="1"/>
-      <w:rPr>
-        <w:rStyle w:val="PageNumber"/>
-      </w:rPr>
-    </w:pPr>
-    <w:r>
-      <w:rPr>
-        <w:rStyle w:val="PageNumber"/>
-      </w:rPr>
-      <w:fldChar w:fldCharType="begin"/>
-    </w:r>
-    <w:r>
-      <w:rPr>
-        <w:rStyle w:val="PageNumber"/>
-      </w:rPr>
-      <w:instrText xml:space="preserve">PAGE  </w:instrText>
-    </w:r>
-    <w:r>
-      <w:rPr>
-        <w:rStyle w:val="PageNumber"/>
-      </w:rPr>
-      <w:fldChar w:fldCharType="separate"/>
-    </w:r>
-    <w:r>
-      <w:rPr>
-        <w:rStyle w:val="PageNumber"/>
-        <w:noProof/>
-      </w:rPr>
-      <w:t>7</w:t>
+      <w:t>25</w:t>
     </w:r>
     <w:r>
       <w:rPr>
@@ -2829,6 +4529,9 @@
     <w:pPr>
       <w:pStyle w:val="Header"/>
     </w:pPr>
+    <w:r>
+      <w:t>9-tap tour</w:t>
+    </w:r>
   </w:p>
 </w:hdr>
 </file>
@@ -2840,7 +4543,7 @@
       <w:pStyle w:val="Header"/>
     </w:pPr>
     <w:r>
-      <w:t>9tap tour</w:t>
+      <w:t>9-tap tour</w:t>
     </w:r>
   </w:p>
 </w:hdr>
@@ -2853,26 +4556,13 @@
       <w:pStyle w:val="Header"/>
     </w:pPr>
     <w:r>
-      <w:t>9-tap tour</w:t>
+      <w:t>9 Tap Tour</w:t>
     </w:r>
   </w:p>
 </w:hdr>
 </file>
 
 <file path=word/header4.xml><?xml version="1.0" encoding="utf-8"?>
-<w:hdr xmlns:wpc="http://schemas.microsoft.com/office/word/2010/wordprocessingCanvas" xmlns:mc="http://schemas.openxmlformats.org/markup-compatibility/2006" xmlns:o="urn:schemas-microsoft-com:office:office" xmlns:r="http://schemas.openxmlformats.org/officeDocument/2006/relationships" xmlns:m="http://schemas.openxmlformats.org/officeDocument/2006/math" xmlns:v="urn:schemas-microsoft-com:vml" xmlns:wp14="http://schemas.microsoft.com/office/word/2010/wordprocessingDrawing" xmlns:wp="http://schemas.openxmlformats.org/drawingml/2006/wordprocessingDrawing" xmlns:w10="urn:schemas-microsoft-com:office:word" xmlns:w="http://schemas.openxmlformats.org/wordprocessingml/2006/main" xmlns:w14="http://schemas.microsoft.com/office/word/2010/wordml" xmlns:w15="http://schemas.microsoft.com/office/word/2012/wordml" xmlns:wpg="http://schemas.microsoft.com/office/word/2010/wordprocessingGroup" xmlns:wpi="http://schemas.microsoft.com/office/word/2010/wordprocessingInk" xmlns:wne="http://schemas.microsoft.com/office/word/2006/wordml" xmlns:wps="http://schemas.microsoft.com/office/word/2010/wordprocessingShape" mc:Ignorable="w14 w15 wp14">
-  <w:p>
-    <w:pPr>
-      <w:pStyle w:val="Header"/>
-    </w:pPr>
-    <w:r>
-      <w:t>9 Tap Tour</w:t>
-    </w:r>
-  </w:p>
-</w:hdr>
-</file>
-
-<file path=word/header5.xml><?xml version="1.0" encoding="utf-8"?>
 <w:hdr xmlns:wpc="http://schemas.microsoft.com/office/word/2010/wordprocessingCanvas" xmlns:mc="http://schemas.openxmlformats.org/markup-compatibility/2006" xmlns:o="urn:schemas-microsoft-com:office:office" xmlns:r="http://schemas.openxmlformats.org/officeDocument/2006/relationships" xmlns:m="http://schemas.openxmlformats.org/officeDocument/2006/math" xmlns:v="urn:schemas-microsoft-com:vml" xmlns:wp14="http://schemas.microsoft.com/office/word/2010/wordprocessingDrawing" xmlns:wp="http://schemas.openxmlformats.org/drawingml/2006/wordprocessingDrawing" xmlns:w10="urn:schemas-microsoft-com:office:word" xmlns:w="http://schemas.openxmlformats.org/wordprocessingml/2006/main" xmlns:w14="http://schemas.microsoft.com/office/word/2010/wordml" xmlns:w15="http://schemas.microsoft.com/office/word/2012/wordml" xmlns:wpg="http://schemas.microsoft.com/office/word/2010/wordprocessingGroup" xmlns:wpi="http://schemas.microsoft.com/office/word/2010/wordprocessingInk" xmlns:wne="http://schemas.microsoft.com/office/word/2006/wordml" xmlns:wps="http://schemas.microsoft.com/office/word/2010/wordprocessingShape" mc:Ignorable="w14 w15 wp14">
   <w:p>
     <w:pPr>
@@ -3357,6 +5047,119 @@
     </w:lvl>
   </w:abstractNum>
   <w:abstractNum w:abstractNumId="14" w15:restartNumberingAfterBreak="0">
+    <w:nsid w:val="4BDD1E38"/>
+    <w:multiLevelType w:val="hybridMultilevel"/>
+    <w:tmpl w:val="FB46515A"/>
+    <w:lvl w:ilvl="0" w:tplc="04090001">
+      <w:start w:val="1"/>
+      <w:numFmt w:val="bullet"/>
+      <w:lvlText w:val=""/>
+      <w:lvlJc w:val="left"/>
+      <w:pPr>
+        <w:ind w:left="720" w:hanging="360"/>
+      </w:pPr>
+      <w:rPr>
+        <w:rFonts w:ascii="Symbol" w:hAnsi="Symbol" w:hint="default"/>
+      </w:rPr>
+    </w:lvl>
+    <w:lvl w:ilvl="1" w:tplc="04090003" w:tentative="1">
+      <w:start w:val="1"/>
+      <w:numFmt w:val="bullet"/>
+      <w:lvlText w:val="o"/>
+      <w:lvlJc w:val="left"/>
+      <w:pPr>
+        <w:ind w:left="1440" w:hanging="360"/>
+      </w:pPr>
+      <w:rPr>
+        <w:rFonts w:ascii="Courier New" w:hAnsi="Courier New" w:cs="Courier New" w:hint="default"/>
+      </w:rPr>
+    </w:lvl>
+    <w:lvl w:ilvl="2" w:tplc="04090005" w:tentative="1">
+      <w:start w:val="1"/>
+      <w:numFmt w:val="bullet"/>
+      <w:lvlText w:val=""/>
+      <w:lvlJc w:val="left"/>
+      <w:pPr>
+        <w:ind w:left="2160" w:hanging="360"/>
+      </w:pPr>
+      <w:rPr>
+        <w:rFonts w:ascii="Wingdings" w:hAnsi="Wingdings" w:hint="default"/>
+      </w:rPr>
+    </w:lvl>
+    <w:lvl w:ilvl="3" w:tplc="04090001" w:tentative="1">
+      <w:start w:val="1"/>
+      <w:numFmt w:val="bullet"/>
+      <w:lvlText w:val=""/>
+      <w:lvlJc w:val="left"/>
+      <w:pPr>
+        <w:ind w:left="2880" w:hanging="360"/>
+      </w:pPr>
+      <w:rPr>
+        <w:rFonts w:ascii="Symbol" w:hAnsi="Symbol" w:hint="default"/>
+      </w:rPr>
+    </w:lvl>
+    <w:lvl w:ilvl="4" w:tplc="04090003" w:tentative="1">
+      <w:start w:val="1"/>
+      <w:numFmt w:val="bullet"/>
+      <w:lvlText w:val="o"/>
+      <w:lvlJc w:val="left"/>
+      <w:pPr>
+        <w:ind w:left="3600" w:hanging="360"/>
+      </w:pPr>
+      <w:rPr>
+        <w:rFonts w:ascii="Courier New" w:hAnsi="Courier New" w:cs="Courier New" w:hint="default"/>
+      </w:rPr>
+    </w:lvl>
+    <w:lvl w:ilvl="5" w:tplc="04090005" w:tentative="1">
+      <w:start w:val="1"/>
+      <w:numFmt w:val="bullet"/>
+      <w:lvlText w:val=""/>
+      <w:lvlJc w:val="left"/>
+      <w:pPr>
+        <w:ind w:left="4320" w:hanging="360"/>
+      </w:pPr>
+      <w:rPr>
+        <w:rFonts w:ascii="Wingdings" w:hAnsi="Wingdings" w:hint="default"/>
+      </w:rPr>
+    </w:lvl>
+    <w:lvl w:ilvl="6" w:tplc="04090001" w:tentative="1">
+      <w:start w:val="1"/>
+      <w:numFmt w:val="bullet"/>
+      <w:lvlText w:val=""/>
+      <w:lvlJc w:val="left"/>
+      <w:pPr>
+        <w:ind w:left="5040" w:hanging="360"/>
+      </w:pPr>
+      <w:rPr>
+        <w:rFonts w:ascii="Symbol" w:hAnsi="Symbol" w:hint="default"/>
+      </w:rPr>
+    </w:lvl>
+    <w:lvl w:ilvl="7" w:tplc="04090003" w:tentative="1">
+      <w:start w:val="1"/>
+      <w:numFmt w:val="bullet"/>
+      <w:lvlText w:val="o"/>
+      <w:lvlJc w:val="left"/>
+      <w:pPr>
+        <w:ind w:left="5760" w:hanging="360"/>
+      </w:pPr>
+      <w:rPr>
+        <w:rFonts w:ascii="Courier New" w:hAnsi="Courier New" w:cs="Courier New" w:hint="default"/>
+      </w:rPr>
+    </w:lvl>
+    <w:lvl w:ilvl="8" w:tplc="04090005" w:tentative="1">
+      <w:start w:val="1"/>
+      <w:numFmt w:val="bullet"/>
+      <w:lvlText w:val=""/>
+      <w:lvlJc w:val="left"/>
+      <w:pPr>
+        <w:ind w:left="6480" w:hanging="360"/>
+      </w:pPr>
+      <w:rPr>
+        <w:rFonts w:ascii="Wingdings" w:hAnsi="Wingdings" w:hint="default"/>
+      </w:rPr>
+    </w:lvl>
+  </w:abstractNum>
+  <w:abstractNum w:abstractNumId="15" w15:restartNumberingAfterBreak="0">
     <w:nsid w:val="4C510602"/>
     <w:multiLevelType w:val="singleLevel"/>
     <w:tmpl w:val="F1444738"/>
@@ -3377,7 +5180,7 @@
       </w:rPr>
     </w:lvl>
   </w:abstractNum>
-  <w:abstractNum w:abstractNumId="15" w15:restartNumberingAfterBreak="0">
+  <w:abstractNum w:abstractNumId="16" w15:restartNumberingAfterBreak="0">
     <w:nsid w:val="4F61077B"/>
     <w:multiLevelType w:val="singleLevel"/>
     <w:tmpl w:val="39CC91A4"/>
@@ -3392,7 +5195,7 @@
       </w:pPr>
     </w:lvl>
   </w:abstractNum>
-  <w:abstractNum w:abstractNumId="16" w15:restartNumberingAfterBreak="0">
+  <w:abstractNum w:abstractNumId="17" w15:restartNumberingAfterBreak="0">
     <w:nsid w:val="51045A21"/>
     <w:multiLevelType w:val="hybridMultilevel"/>
     <w:tmpl w:val="FD880446"/>
@@ -3505,7 +5308,7 @@
       </w:rPr>
     </w:lvl>
   </w:abstractNum>
-  <w:abstractNum w:abstractNumId="17" w15:restartNumberingAfterBreak="0">
+  <w:abstractNum w:abstractNumId="18" w15:restartNumberingAfterBreak="0">
     <w:nsid w:val="579B0C49"/>
     <w:multiLevelType w:val="singleLevel"/>
     <w:tmpl w:val="B8D67778"/>
@@ -3524,7 +5327,7 @@
       </w:rPr>
     </w:lvl>
   </w:abstractNum>
-  <w:abstractNum w:abstractNumId="18" w15:restartNumberingAfterBreak="0">
+  <w:abstractNum w:abstractNumId="19" w15:restartNumberingAfterBreak="0">
     <w:nsid w:val="5F436190"/>
     <w:multiLevelType w:val="singleLevel"/>
     <w:tmpl w:val="D7CE7166"/>
@@ -3545,7 +5348,7 @@
       </w:rPr>
     </w:lvl>
   </w:abstractNum>
-  <w:abstractNum w:abstractNumId="19" w15:restartNumberingAfterBreak="0">
+  <w:abstractNum w:abstractNumId="20" w15:restartNumberingAfterBreak="0">
     <w:nsid w:val="62540DA9"/>
     <w:multiLevelType w:val="singleLevel"/>
     <w:tmpl w:val="B8D67778"/>
@@ -3564,7 +5367,7 @@
       </w:rPr>
     </w:lvl>
   </w:abstractNum>
-  <w:abstractNum w:abstractNumId="20" w15:restartNumberingAfterBreak="0">
+  <w:abstractNum w:abstractNumId="21" w15:restartNumberingAfterBreak="0">
     <w:nsid w:val="63882B2E"/>
     <w:multiLevelType w:val="singleLevel"/>
     <w:tmpl w:val="8D1E4DD4"/>
@@ -3576,7 +5379,7 @@
       <w:lvlJc w:val="left"/>
     </w:lvl>
   </w:abstractNum>
-  <w:abstractNum w:abstractNumId="21" w15:restartNumberingAfterBreak="0">
+  <w:abstractNum w:abstractNumId="22" w15:restartNumberingAfterBreak="0">
     <w:nsid w:val="6C98497C"/>
     <w:multiLevelType w:val="hybridMultilevel"/>
     <w:tmpl w:val="7EC604A2"/>
@@ -3689,7 +5492,7 @@
       </w:rPr>
     </w:lvl>
   </w:abstractNum>
-  <w:abstractNum w:abstractNumId="22" w15:restartNumberingAfterBreak="0">
+  <w:abstractNum w:abstractNumId="23" w15:restartNumberingAfterBreak="0">
     <w:nsid w:val="70507BFC"/>
     <w:multiLevelType w:val="singleLevel"/>
     <w:tmpl w:val="80DE380C"/>
@@ -3701,7 +5504,7 @@
       <w:lvlJc w:val="left"/>
     </w:lvl>
   </w:abstractNum>
-  <w:abstractNum w:abstractNumId="23" w15:restartNumberingAfterBreak="0">
+  <w:abstractNum w:abstractNumId="24" w15:restartNumberingAfterBreak="0">
     <w:nsid w:val="749D7287"/>
     <w:multiLevelType w:val="singleLevel"/>
     <w:tmpl w:val="DE76053A"/>
@@ -3713,7 +5516,7 @@
       <w:lvlJc w:val="left"/>
     </w:lvl>
   </w:abstractNum>
-  <w:abstractNum w:abstractNumId="24" w15:restartNumberingAfterBreak="0">
+  <w:abstractNum w:abstractNumId="25" w15:restartNumberingAfterBreak="0">
     <w:nsid w:val="75D550E5"/>
     <w:multiLevelType w:val="hybridMultilevel"/>
     <w:tmpl w:val="57ACD532"/>
@@ -3826,7 +5629,7 @@
       </w:pPr>
     </w:lvl>
   </w:abstractNum>
-  <w:abstractNum w:abstractNumId="25" w15:restartNumberingAfterBreak="0">
+  <w:abstractNum w:abstractNumId="26" w15:restartNumberingAfterBreak="0">
     <w:nsid w:val="77CA5CEA"/>
     <w:multiLevelType w:val="hybridMultilevel"/>
     <w:tmpl w:val="7DC45528"/>
@@ -4030,10 +5833,10 @@
     <w:abstractNumId w:val="8"/>
   </w:num>
   <w:num w:numId="8">
-    <w:abstractNumId w:val="17"/>
+    <w:abstractNumId w:val="18"/>
   </w:num>
   <w:num w:numId="9">
-    <w:abstractNumId w:val="19"/>
+    <w:abstractNumId w:val="20"/>
   </w:num>
   <w:num w:numId="10">
     <w:abstractNumId w:val="4"/>
@@ -4055,7 +5858,7 @@
     </w:lvlOverride>
   </w:num>
   <w:num w:numId="11">
-    <w:abstractNumId w:val="18"/>
+    <w:abstractNumId w:val="19"/>
   </w:num>
   <w:num w:numId="12">
     <w:abstractNumId w:val="4"/>
@@ -4077,7 +5880,7 @@
     </w:lvlOverride>
   </w:num>
   <w:num w:numId="13">
-    <w:abstractNumId w:val="14"/>
+    <w:abstractNumId w:val="15"/>
   </w:num>
   <w:num w:numId="14">
     <w:abstractNumId w:val="4"/>
@@ -4156,25 +5959,25 @@
     </w:lvlOverride>
   </w:num>
   <w:num w:numId="18">
-    <w:abstractNumId w:val="20"/>
+    <w:abstractNumId w:val="21"/>
   </w:num>
   <w:num w:numId="19">
     <w:abstractNumId w:val="5"/>
   </w:num>
   <w:num w:numId="20">
-    <w:abstractNumId w:val="23"/>
+    <w:abstractNumId w:val="24"/>
   </w:num>
   <w:num w:numId="21">
-    <w:abstractNumId w:val="22"/>
+    <w:abstractNumId w:val="23"/>
   </w:num>
   <w:num w:numId="22">
     <w:abstractNumId w:val="11"/>
   </w:num>
   <w:num w:numId="23">
-    <w:abstractNumId w:val="15"/>
+    <w:abstractNumId w:val="16"/>
   </w:num>
   <w:num w:numId="24">
-    <w:abstractNumId w:val="15"/>
+    <w:abstractNumId w:val="16"/>
     <w:lvlOverride w:ilvl="0">
       <w:lvl w:ilvl="0">
         <w:start w:val="1"/>
@@ -4189,7 +5992,7 @@
     </w:lvlOverride>
   </w:num>
   <w:num w:numId="25">
-    <w:abstractNumId w:val="15"/>
+    <w:abstractNumId w:val="16"/>
     <w:lvlOverride w:ilvl="0">
       <w:lvl w:ilvl="0">
         <w:start w:val="1"/>
@@ -4204,7 +6007,7 @@
     </w:lvlOverride>
   </w:num>
   <w:num w:numId="26">
-    <w:abstractNumId w:val="15"/>
+    <w:abstractNumId w:val="16"/>
     <w:lvlOverride w:ilvl="0">
       <w:lvl w:ilvl="0">
         <w:start w:val="1"/>
@@ -4219,7 +6022,7 @@
     </w:lvlOverride>
   </w:num>
   <w:num w:numId="27">
-    <w:abstractNumId w:val="15"/>
+    <w:abstractNumId w:val="16"/>
     <w:lvlOverride w:ilvl="0">
       <w:lvl w:ilvl="0">
         <w:start w:val="1"/>
@@ -4252,13 +6055,13 @@
     <w:abstractNumId w:val="1"/>
   </w:num>
   <w:num w:numId="34">
-    <w:abstractNumId w:val="24"/>
+    <w:abstractNumId w:val="25"/>
   </w:num>
   <w:num w:numId="35">
     <w:abstractNumId w:val="13"/>
   </w:num>
   <w:num w:numId="36">
-    <w:abstractNumId w:val="19"/>
+    <w:abstractNumId w:val="20"/>
     <w:lvlOverride w:ilvl="0">
       <w:lvl w:ilvl="0">
         <w:start w:val="1"/>
@@ -4286,13 +6089,16 @@
     <w:abstractNumId w:val="9"/>
   </w:num>
   <w:num w:numId="40">
-    <w:abstractNumId w:val="25"/>
+    <w:abstractNumId w:val="26"/>
   </w:num>
   <w:num w:numId="41">
-    <w:abstractNumId w:val="21"/>
+    <w:abstractNumId w:val="22"/>
   </w:num>
   <w:num w:numId="42">
-    <w:abstractNumId w:val="16"/>
+    <w:abstractNumId w:val="17"/>
+  </w:num>
+  <w:num w:numId="43">
+    <w:abstractNumId w:val="14"/>
   </w:num>
 </w:numbering>
 </file>
@@ -4375,7 +6181,7 @@
     <w:lsdException w:name="Closing" w:semiHidden="1" w:unhideWhenUsed="1"/>
     <w:lsdException w:name="Signature" w:semiHidden="1" w:unhideWhenUsed="1"/>
     <w:lsdException w:name="Default Paragraph Font" w:semiHidden="1" w:uiPriority="1" w:unhideWhenUsed="1"/>
-    <w:lsdException w:name="Body Text" w:semiHidden="1" w:unhideWhenUsed="1"/>
+    <w:lsdException w:name="Body Text" w:semiHidden="1" w:uiPriority="0" w:unhideWhenUsed="1"/>
     <w:lsdException w:name="Body Text Indent" w:semiHidden="1" w:unhideWhenUsed="1"/>
     <w:lsdException w:name="List Continue" w:semiHidden="1" w:unhideWhenUsed="1"/>
     <w:lsdException w:name="List Continue 2" w:semiHidden="1" w:unhideWhenUsed="1"/>
@@ -4714,7 +6520,7 @@
     <w:basedOn w:val="Normal"/>
     <w:next w:val="BodyText"/>
     <w:qFormat/>
-    <w:rsid w:val="00DA28BB"/>
+    <w:rsid w:val="009E46E4"/>
     <w:pPr>
       <w:keepNext/>
       <w:spacing w:line="240" w:lineRule="atLeast"/>
@@ -4724,6 +6530,7 @@
       <w:rFonts w:ascii="Arial Black" w:hAnsi="Arial Black"/>
       <w:spacing w:val="-10"/>
       <w:kern w:val="28"/>
+      <w:sz w:val="20"/>
       <w:szCs w:val="16"/>
     </w:rPr>
   </w:style>
@@ -4898,6 +6705,7 @@
   <w:style w:type="paragraph" w:styleId="CommentText">
     <w:name w:val="annotation text"/>
     <w:basedOn w:val="Normal"/>
+    <w:link w:val="CommentTextChar"/>
     <w:semiHidden/>
     <w:pPr>
       <w:tabs>
@@ -5699,6 +7507,53 @@
       <w:u w:val="single"/>
     </w:rPr>
   </w:style>
+  <w:style w:type="paragraph" w:styleId="CommentSubject">
+    <w:name w:val="annotation subject"/>
+    <w:basedOn w:val="CommentText"/>
+    <w:next w:val="CommentText"/>
+    <w:link w:val="CommentSubjectChar"/>
+    <w:uiPriority w:val="99"/>
+    <w:semiHidden/>
+    <w:unhideWhenUsed/>
+    <w:rsid w:val="00ED49F3"/>
+    <w:pPr>
+      <w:tabs>
+        <w:tab w:val="clear" w:pos="187"/>
+      </w:tabs>
+      <w:spacing w:after="0" w:line="240" w:lineRule="auto"/>
+      <w:ind w:left="0" w:firstLine="0"/>
+    </w:pPr>
+    <w:rPr>
+      <w:b/>
+      <w:bCs/>
+      <w:sz w:val="20"/>
+    </w:rPr>
+  </w:style>
+  <w:style w:type="character" w:customStyle="1" w:styleId="CommentTextChar">
+    <w:name w:val="Comment Text Char"/>
+    <w:basedOn w:val="DefaultParagraphFont"/>
+    <w:link w:val="CommentText"/>
+    <w:semiHidden/>
+    <w:rsid w:val="00ED49F3"/>
+    <w:rPr>
+      <w:rFonts w:ascii="Garamond" w:hAnsi="Garamond"/>
+      <w:sz w:val="16"/>
+    </w:rPr>
+  </w:style>
+  <w:style w:type="character" w:customStyle="1" w:styleId="CommentSubjectChar">
+    <w:name w:val="Comment Subject Char"/>
+    <w:basedOn w:val="CommentTextChar"/>
+    <w:link w:val="CommentSubject"/>
+    <w:uiPriority w:val="99"/>
+    <w:semiHidden/>
+    <w:rsid w:val="00ED49F3"/>
+    <w:rPr>
+      <w:rFonts w:ascii="Garamond" w:hAnsi="Garamond"/>
+      <w:b/>
+      <w:bCs/>
+      <w:sz w:val="16"/>
+    </w:rPr>
+  </w:style>
 </w:styles>
 </file>
 
@@ -5968,7 +7823,7 @@
 </file>
 
 <file path=customXml/itemProps1.xml><?xml version="1.0" encoding="utf-8"?>
-<ds:datastoreItem xmlns:ds="http://schemas.openxmlformats.org/officeDocument/2006/customXml" ds:itemID="{B079A1C9-2AAB-4ADD-9768-CD2BEB8D8216}">
+<ds:datastoreItem xmlns:ds="http://schemas.openxmlformats.org/officeDocument/2006/customXml" ds:itemID="{497F7A78-FF4F-44DF-BD2B-9134B1A56C23}">
   <ds:schemaRefs>
     <ds:schemaRef ds:uri="http://schemas.openxmlformats.org/officeDocument/2006/bibliography"/>
   </ds:schemaRefs>

</xml_diff>

<commit_message>
Finished rough out of first three chapters. Proper information will come later.
</commit_message>
<xml_diff>
--- a/9tapUserManual.docx
+++ b/9tapUserManual.docx
@@ -1431,14 +1431,27 @@
       <w:r>
         <w:t xml:space="preserve">Figure </w:t>
       </w:r>
-      <w:fldSimple w:instr=" SEQ Figure \* ARABIC ">
-        <w:r>
-          <w:rPr>
-            <w:noProof/>
-          </w:rPr>
-          <w:t>1</w:t>
-        </w:r>
-      </w:fldSimple>
+      <w:r>
+        <w:fldChar w:fldCharType="begin"/>
+      </w:r>
+      <w:r>
+        <w:instrText xml:space="preserve"> SEQ Figure \* ARABIC </w:instrText>
+      </w:r>
+      <w:r>
+        <w:fldChar w:fldCharType="separate"/>
+      </w:r>
+      <w:r>
+        <w:rPr>
+          <w:noProof/>
+        </w:rPr>
+        <w:t>1</w:t>
+      </w:r>
+      <w:r>
+        <w:rPr>
+          <w:noProof/>
+        </w:rPr>
+        <w:fldChar w:fldCharType="end"/>
+      </w:r>
       <w:r>
         <w:t>: 9-Tap Main Menu</w:t>
       </w:r>
@@ -1634,9 +1647,11 @@
       <w:pPr>
         <w:pStyle w:val="BodyText"/>
       </w:pPr>
+      <w:proofErr w:type="gramStart"/>
       <w:r>
         <w:t>answers</w:t>
       </w:r>
+      <w:proofErr w:type="gramEnd"/>
     </w:p>
     <w:p>
       <w:pPr>
@@ -1760,7 +1775,187 @@
         <w:keepNext/>
       </w:pPr>
       <w:r>
-        <w:t>Craft beer sartorial copper mug tbh jianbing, locavore VHS salvia +1 vegan gluten-free kogi pug vexillologist affogato. Fanny pack palo santo proident blog bespoke commodo tilde hammock taiyaki wayfarers gentrify. Cardigan ugh slow-carb, ea DIY hot chicken commodo godard. Lorem sint qui 3 wolf moon enim voluptate, velit veniam. Fanny pack man bun helvetica viral, edison bulb cliche jianbing.</w:t>
+        <w:t xml:space="preserve">Craft beer sartorial copper mug </w:t>
+      </w:r>
+      <w:proofErr w:type="spellStart"/>
+      <w:r>
+        <w:t>tbh</w:t>
+      </w:r>
+      <w:proofErr w:type="spellEnd"/>
+      <w:r>
+        <w:t xml:space="preserve"> </w:t>
+      </w:r>
+      <w:proofErr w:type="spellStart"/>
+      <w:r>
+        <w:t>jianbing</w:t>
+      </w:r>
+      <w:proofErr w:type="spellEnd"/>
+      <w:r>
+        <w:t xml:space="preserve">, locavore VHS salvia +1 vegan gluten-free </w:t>
+      </w:r>
+      <w:proofErr w:type="spellStart"/>
+      <w:r>
+        <w:t>kogi</w:t>
+      </w:r>
+      <w:proofErr w:type="spellEnd"/>
+      <w:r>
+        <w:t xml:space="preserve"> pug </w:t>
+      </w:r>
+      <w:proofErr w:type="spellStart"/>
+      <w:r>
+        <w:t>vexillologist</w:t>
+      </w:r>
+      <w:proofErr w:type="spellEnd"/>
+      <w:r>
+        <w:t xml:space="preserve"> </w:t>
+      </w:r>
+      <w:proofErr w:type="spellStart"/>
+      <w:r>
+        <w:t>affogato</w:t>
+      </w:r>
+      <w:proofErr w:type="spellEnd"/>
+      <w:r>
+        <w:t xml:space="preserve">. Fanny pack </w:t>
+      </w:r>
+      <w:proofErr w:type="spellStart"/>
+      <w:r>
+        <w:t>palo</w:t>
+      </w:r>
+      <w:proofErr w:type="spellEnd"/>
+      <w:r>
+        <w:t xml:space="preserve"> </w:t>
+      </w:r>
+      <w:proofErr w:type="spellStart"/>
+      <w:r>
+        <w:t>santo</w:t>
+      </w:r>
+      <w:proofErr w:type="spellEnd"/>
+      <w:r>
+        <w:t xml:space="preserve"> </w:t>
+      </w:r>
+      <w:proofErr w:type="spellStart"/>
+      <w:r>
+        <w:t>proident</w:t>
+      </w:r>
+      <w:proofErr w:type="spellEnd"/>
+      <w:r>
+        <w:t xml:space="preserve"> blog bespoke </w:t>
+      </w:r>
+      <w:proofErr w:type="spellStart"/>
+      <w:r>
+        <w:t>commodo</w:t>
+      </w:r>
+      <w:proofErr w:type="spellEnd"/>
+      <w:r>
+        <w:t xml:space="preserve"> tilde hammock </w:t>
+      </w:r>
+      <w:proofErr w:type="spellStart"/>
+      <w:r>
+        <w:t>taiyaki</w:t>
+      </w:r>
+      <w:proofErr w:type="spellEnd"/>
+      <w:r>
+        <w:t xml:space="preserve"> wayfarers gentrify. Cardigan ugh slow-carb, </w:t>
+      </w:r>
+      <w:proofErr w:type="spellStart"/>
+      <w:r>
+        <w:t>ea</w:t>
+      </w:r>
+      <w:proofErr w:type="spellEnd"/>
+      <w:r>
+        <w:t xml:space="preserve"> DIY hot chicken </w:t>
+      </w:r>
+      <w:proofErr w:type="spellStart"/>
+      <w:r>
+        <w:t>commodo</w:t>
+      </w:r>
+      <w:proofErr w:type="spellEnd"/>
+      <w:r>
+        <w:t xml:space="preserve"> </w:t>
+      </w:r>
+      <w:proofErr w:type="spellStart"/>
+      <w:proofErr w:type="gramStart"/>
+      <w:r>
+        <w:t>godard</w:t>
+      </w:r>
+      <w:proofErr w:type="spellEnd"/>
+      <w:proofErr w:type="gramEnd"/>
+      <w:r>
+        <w:t xml:space="preserve">. Lorem </w:t>
+      </w:r>
+      <w:proofErr w:type="spellStart"/>
+      <w:r>
+        <w:t>sint</w:t>
+      </w:r>
+      <w:proofErr w:type="spellEnd"/>
+      <w:r>
+        <w:t xml:space="preserve"> qui 3 wolf moon </w:t>
+      </w:r>
+      <w:proofErr w:type="spellStart"/>
+      <w:r>
+        <w:t>enim</w:t>
+      </w:r>
+      <w:proofErr w:type="spellEnd"/>
+      <w:r>
+        <w:t xml:space="preserve"> </w:t>
+      </w:r>
+      <w:proofErr w:type="spellStart"/>
+      <w:r>
+        <w:t>voluptate</w:t>
+      </w:r>
+      <w:proofErr w:type="spellEnd"/>
+      <w:r>
+        <w:t xml:space="preserve">, </w:t>
+      </w:r>
+      <w:proofErr w:type="spellStart"/>
+      <w:r>
+        <w:t>velit</w:t>
+      </w:r>
+      <w:proofErr w:type="spellEnd"/>
+      <w:r>
+        <w:t xml:space="preserve"> </w:t>
+      </w:r>
+      <w:proofErr w:type="spellStart"/>
+      <w:r>
+        <w:t>veniam</w:t>
+      </w:r>
+      <w:proofErr w:type="spellEnd"/>
+      <w:r>
+        <w:t xml:space="preserve">. Fanny pack man bun </w:t>
+      </w:r>
+      <w:proofErr w:type="spellStart"/>
+      <w:r>
+        <w:t>helvetica</w:t>
+      </w:r>
+      <w:proofErr w:type="spellEnd"/>
+      <w:r>
+        <w:t xml:space="preserve"> viral, </w:t>
+      </w:r>
+      <w:proofErr w:type="spellStart"/>
+      <w:proofErr w:type="gramStart"/>
+      <w:r>
+        <w:t>edison</w:t>
+      </w:r>
+      <w:proofErr w:type="spellEnd"/>
+      <w:proofErr w:type="gramEnd"/>
+      <w:r>
+        <w:t xml:space="preserve"> bulb </w:t>
+      </w:r>
+      <w:proofErr w:type="spellStart"/>
+      <w:r>
+        <w:t>cliche</w:t>
+      </w:r>
+      <w:proofErr w:type="spellEnd"/>
+      <w:r>
+        <w:t xml:space="preserve"> </w:t>
+      </w:r>
+      <w:proofErr w:type="spellStart"/>
+      <w:r>
+        <w:t>jianbing</w:t>
+      </w:r>
+      <w:proofErr w:type="spellEnd"/>
+      <w:r>
+        <w:t>.</w:t>
       </w:r>
     </w:p>
     <w:p>
@@ -1823,14 +2018,30 @@
       <w:r>
         <w:t xml:space="preserve">Figure </w:t>
       </w:r>
-      <w:fldSimple w:instr=" SEQ Figure \* ARABIC ">
-        <w:r>
-          <w:rPr>
-            <w:noProof/>
-          </w:rPr>
-          <w:t>2</w:t>
-        </w:r>
-      </w:fldSimple>
+      <w:r>
+        <w:fldChar w:fldCharType="begin"/>
+      </w:r>
+      <w:r>
+        <w:instrText xml:space="preserve"> SEQ Figure \</w:instrText>
+      </w:r>
+      <w:r>
+        <w:instrText xml:space="preserve">* ARABIC </w:instrText>
+      </w:r>
+      <w:r>
+        <w:fldChar w:fldCharType="separate"/>
+      </w:r>
+      <w:r>
+        <w:rPr>
+          <w:noProof/>
+        </w:rPr>
+        <w:t>2</w:t>
+      </w:r>
+      <w:r>
+        <w:rPr>
+          <w:noProof/>
+        </w:rPr>
+        <w:fldChar w:fldCharType="end"/>
+      </w:r>
       <w:r>
         <w:t>: Main Menu</w:t>
       </w:r>
@@ -1850,7 +2061,187 @@
         <w:keepNext/>
       </w:pPr>
       <w:r>
-        <w:t>Craft beer sartorial copper mug tbh jianbing, locavore VHS salvia +1 vegan gluten-free kogi pug vexillologist affogato. Fanny pack palo santo proident blog bespoke commodo tilde hammock taiyaki wayfarers gentrify. Cardigan ugh slow-carb, ea DIY hot chicken commodo godard. Lorem sint qui 3 wolf moon enim voluptate, velit veniam. Fanny pack man bun helvetica viral, edison bulb cliche jianbing.</w:t>
+        <w:t xml:space="preserve">Craft beer sartorial copper mug </w:t>
+      </w:r>
+      <w:proofErr w:type="spellStart"/>
+      <w:r>
+        <w:t>tbh</w:t>
+      </w:r>
+      <w:proofErr w:type="spellEnd"/>
+      <w:r>
+        <w:t xml:space="preserve"> </w:t>
+      </w:r>
+      <w:proofErr w:type="spellStart"/>
+      <w:r>
+        <w:t>jianbing</w:t>
+      </w:r>
+      <w:proofErr w:type="spellEnd"/>
+      <w:r>
+        <w:t xml:space="preserve">, locavore VHS salvia +1 vegan gluten-free </w:t>
+      </w:r>
+      <w:proofErr w:type="spellStart"/>
+      <w:r>
+        <w:t>kogi</w:t>
+      </w:r>
+      <w:proofErr w:type="spellEnd"/>
+      <w:r>
+        <w:t xml:space="preserve"> pug </w:t>
+      </w:r>
+      <w:proofErr w:type="spellStart"/>
+      <w:r>
+        <w:t>vexillologist</w:t>
+      </w:r>
+      <w:proofErr w:type="spellEnd"/>
+      <w:r>
+        <w:t xml:space="preserve"> </w:t>
+      </w:r>
+      <w:proofErr w:type="spellStart"/>
+      <w:r>
+        <w:t>affogato</w:t>
+      </w:r>
+      <w:proofErr w:type="spellEnd"/>
+      <w:r>
+        <w:t xml:space="preserve">. Fanny pack </w:t>
+      </w:r>
+      <w:proofErr w:type="spellStart"/>
+      <w:r>
+        <w:t>palo</w:t>
+      </w:r>
+      <w:proofErr w:type="spellEnd"/>
+      <w:r>
+        <w:t xml:space="preserve"> </w:t>
+      </w:r>
+      <w:proofErr w:type="spellStart"/>
+      <w:r>
+        <w:t>santo</w:t>
+      </w:r>
+      <w:proofErr w:type="spellEnd"/>
+      <w:r>
+        <w:t xml:space="preserve"> </w:t>
+      </w:r>
+      <w:proofErr w:type="spellStart"/>
+      <w:r>
+        <w:t>proident</w:t>
+      </w:r>
+      <w:proofErr w:type="spellEnd"/>
+      <w:r>
+        <w:t xml:space="preserve"> blog bespoke </w:t>
+      </w:r>
+      <w:proofErr w:type="spellStart"/>
+      <w:r>
+        <w:t>commodo</w:t>
+      </w:r>
+      <w:proofErr w:type="spellEnd"/>
+      <w:r>
+        <w:t xml:space="preserve"> tilde hammock </w:t>
+      </w:r>
+      <w:proofErr w:type="spellStart"/>
+      <w:r>
+        <w:t>taiyaki</w:t>
+      </w:r>
+      <w:proofErr w:type="spellEnd"/>
+      <w:r>
+        <w:t xml:space="preserve"> wayfarers gentrify. Cardigan ugh slow-carb, </w:t>
+      </w:r>
+      <w:proofErr w:type="spellStart"/>
+      <w:r>
+        <w:t>ea</w:t>
+      </w:r>
+      <w:proofErr w:type="spellEnd"/>
+      <w:r>
+        <w:t xml:space="preserve"> DIY hot chicken </w:t>
+      </w:r>
+      <w:proofErr w:type="spellStart"/>
+      <w:r>
+        <w:t>commodo</w:t>
+      </w:r>
+      <w:proofErr w:type="spellEnd"/>
+      <w:r>
+        <w:t xml:space="preserve"> </w:t>
+      </w:r>
+      <w:proofErr w:type="spellStart"/>
+      <w:proofErr w:type="gramStart"/>
+      <w:r>
+        <w:t>godard</w:t>
+      </w:r>
+      <w:proofErr w:type="spellEnd"/>
+      <w:proofErr w:type="gramEnd"/>
+      <w:r>
+        <w:t xml:space="preserve">. Lorem </w:t>
+      </w:r>
+      <w:proofErr w:type="spellStart"/>
+      <w:r>
+        <w:t>sint</w:t>
+      </w:r>
+      <w:proofErr w:type="spellEnd"/>
+      <w:r>
+        <w:t xml:space="preserve"> qui 3 wolf moon </w:t>
+      </w:r>
+      <w:proofErr w:type="spellStart"/>
+      <w:r>
+        <w:t>enim</w:t>
+      </w:r>
+      <w:proofErr w:type="spellEnd"/>
+      <w:r>
+        <w:t xml:space="preserve"> </w:t>
+      </w:r>
+      <w:proofErr w:type="spellStart"/>
+      <w:r>
+        <w:t>voluptate</w:t>
+      </w:r>
+      <w:proofErr w:type="spellEnd"/>
+      <w:r>
+        <w:t xml:space="preserve">, </w:t>
+      </w:r>
+      <w:proofErr w:type="spellStart"/>
+      <w:r>
+        <w:t>velit</w:t>
+      </w:r>
+      <w:proofErr w:type="spellEnd"/>
+      <w:r>
+        <w:t xml:space="preserve"> </w:t>
+      </w:r>
+      <w:proofErr w:type="spellStart"/>
+      <w:r>
+        <w:t>veniam</w:t>
+      </w:r>
+      <w:proofErr w:type="spellEnd"/>
+      <w:r>
+        <w:t xml:space="preserve">. Fanny pack man bun </w:t>
+      </w:r>
+      <w:proofErr w:type="spellStart"/>
+      <w:r>
+        <w:t>helvetica</w:t>
+      </w:r>
+      <w:proofErr w:type="spellEnd"/>
+      <w:r>
+        <w:t xml:space="preserve"> viral, </w:t>
+      </w:r>
+      <w:proofErr w:type="spellStart"/>
+      <w:proofErr w:type="gramStart"/>
+      <w:r>
+        <w:t>edison</w:t>
+      </w:r>
+      <w:proofErr w:type="spellEnd"/>
+      <w:proofErr w:type="gramEnd"/>
+      <w:r>
+        <w:t xml:space="preserve"> bulb </w:t>
+      </w:r>
+      <w:proofErr w:type="spellStart"/>
+      <w:r>
+        <w:t>cliche</w:t>
+      </w:r>
+      <w:proofErr w:type="spellEnd"/>
+      <w:r>
+        <w:t xml:space="preserve"> </w:t>
+      </w:r>
+      <w:proofErr w:type="spellStart"/>
+      <w:r>
+        <w:t>jianbing</w:t>
+      </w:r>
+      <w:proofErr w:type="spellEnd"/>
+      <w:r>
+        <w:t>.</w:t>
       </w:r>
     </w:p>
     <w:p>
@@ -1914,14 +2305,27 @@
       <w:r>
         <w:t xml:space="preserve">Figure </w:t>
       </w:r>
-      <w:fldSimple w:instr=" SEQ Figure \* ARABIC ">
-        <w:r>
-          <w:rPr>
-            <w:noProof/>
-          </w:rPr>
-          <w:t>3</w:t>
-        </w:r>
-      </w:fldSimple>
+      <w:r>
+        <w:fldChar w:fldCharType="begin"/>
+      </w:r>
+      <w:r>
+        <w:instrText xml:space="preserve"> SEQ Figure \* ARABIC </w:instrText>
+      </w:r>
+      <w:r>
+        <w:fldChar w:fldCharType="separate"/>
+      </w:r>
+      <w:r>
+        <w:rPr>
+          <w:noProof/>
+        </w:rPr>
+        <w:t>3</w:t>
+      </w:r>
+      <w:r>
+        <w:rPr>
+          <w:noProof/>
+        </w:rPr>
+        <w:fldChar w:fldCharType="end"/>
+      </w:r>
       <w:r>
         <w:t>: Under Tools, Update Inactive status</w:t>
       </w:r>
@@ -1944,7 +2348,187 @@
         <w:keepNext/>
       </w:pPr>
       <w:r>
-        <w:t>Craft beer sartorial copper mug tbh jianbing, locavore VHS salvia +1 vegan gluten-free kogi pug vexillologist affogato. Fanny pack palo santo proident blog bespoke commodo tilde hammock taiyaki wayfarers gentrify. Cardigan ugh slow-carb, ea DIY hot chicken commodo godard. Lorem sint qui 3 wolf moon enim voluptate, velit veniam. Fanny pack man bun helvetica viral, edison bulb cliche jianbing.</w:t>
+        <w:t xml:space="preserve">Craft beer sartorial copper mug </w:t>
+      </w:r>
+      <w:proofErr w:type="spellStart"/>
+      <w:r>
+        <w:t>tbh</w:t>
+      </w:r>
+      <w:proofErr w:type="spellEnd"/>
+      <w:r>
+        <w:t xml:space="preserve"> </w:t>
+      </w:r>
+      <w:proofErr w:type="spellStart"/>
+      <w:r>
+        <w:t>jianbing</w:t>
+      </w:r>
+      <w:proofErr w:type="spellEnd"/>
+      <w:r>
+        <w:t xml:space="preserve">, locavore VHS salvia +1 vegan gluten-free </w:t>
+      </w:r>
+      <w:proofErr w:type="spellStart"/>
+      <w:r>
+        <w:t>kogi</w:t>
+      </w:r>
+      <w:proofErr w:type="spellEnd"/>
+      <w:r>
+        <w:t xml:space="preserve"> pug </w:t>
+      </w:r>
+      <w:proofErr w:type="spellStart"/>
+      <w:r>
+        <w:t>vexillologist</w:t>
+      </w:r>
+      <w:proofErr w:type="spellEnd"/>
+      <w:r>
+        <w:t xml:space="preserve"> </w:t>
+      </w:r>
+      <w:proofErr w:type="spellStart"/>
+      <w:r>
+        <w:t>affogato</w:t>
+      </w:r>
+      <w:proofErr w:type="spellEnd"/>
+      <w:r>
+        <w:t xml:space="preserve">. Fanny pack </w:t>
+      </w:r>
+      <w:proofErr w:type="spellStart"/>
+      <w:r>
+        <w:t>palo</w:t>
+      </w:r>
+      <w:proofErr w:type="spellEnd"/>
+      <w:r>
+        <w:t xml:space="preserve"> </w:t>
+      </w:r>
+      <w:proofErr w:type="spellStart"/>
+      <w:r>
+        <w:t>santo</w:t>
+      </w:r>
+      <w:proofErr w:type="spellEnd"/>
+      <w:r>
+        <w:t xml:space="preserve"> </w:t>
+      </w:r>
+      <w:proofErr w:type="spellStart"/>
+      <w:r>
+        <w:t>proident</w:t>
+      </w:r>
+      <w:proofErr w:type="spellEnd"/>
+      <w:r>
+        <w:t xml:space="preserve"> blog bespoke </w:t>
+      </w:r>
+      <w:proofErr w:type="spellStart"/>
+      <w:r>
+        <w:t>commodo</w:t>
+      </w:r>
+      <w:proofErr w:type="spellEnd"/>
+      <w:r>
+        <w:t xml:space="preserve"> tilde hammock </w:t>
+      </w:r>
+      <w:proofErr w:type="spellStart"/>
+      <w:r>
+        <w:t>taiyaki</w:t>
+      </w:r>
+      <w:proofErr w:type="spellEnd"/>
+      <w:r>
+        <w:t xml:space="preserve"> wayfarers gentrify. Cardigan ugh slow-carb, </w:t>
+      </w:r>
+      <w:proofErr w:type="spellStart"/>
+      <w:r>
+        <w:t>ea</w:t>
+      </w:r>
+      <w:proofErr w:type="spellEnd"/>
+      <w:r>
+        <w:t xml:space="preserve"> DIY hot chicken </w:t>
+      </w:r>
+      <w:proofErr w:type="spellStart"/>
+      <w:r>
+        <w:t>commodo</w:t>
+      </w:r>
+      <w:proofErr w:type="spellEnd"/>
+      <w:r>
+        <w:t xml:space="preserve"> </w:t>
+      </w:r>
+      <w:proofErr w:type="spellStart"/>
+      <w:proofErr w:type="gramStart"/>
+      <w:r>
+        <w:t>godard</w:t>
+      </w:r>
+      <w:proofErr w:type="spellEnd"/>
+      <w:proofErr w:type="gramEnd"/>
+      <w:r>
+        <w:t xml:space="preserve">. Lorem </w:t>
+      </w:r>
+      <w:proofErr w:type="spellStart"/>
+      <w:r>
+        <w:t>sint</w:t>
+      </w:r>
+      <w:proofErr w:type="spellEnd"/>
+      <w:r>
+        <w:t xml:space="preserve"> qui 3 wolf moon </w:t>
+      </w:r>
+      <w:proofErr w:type="spellStart"/>
+      <w:r>
+        <w:t>enim</w:t>
+      </w:r>
+      <w:proofErr w:type="spellEnd"/>
+      <w:r>
+        <w:t xml:space="preserve"> </w:t>
+      </w:r>
+      <w:proofErr w:type="spellStart"/>
+      <w:r>
+        <w:t>voluptate</w:t>
+      </w:r>
+      <w:proofErr w:type="spellEnd"/>
+      <w:r>
+        <w:t xml:space="preserve">, </w:t>
+      </w:r>
+      <w:proofErr w:type="spellStart"/>
+      <w:r>
+        <w:t>velit</w:t>
+      </w:r>
+      <w:proofErr w:type="spellEnd"/>
+      <w:r>
+        <w:t xml:space="preserve"> </w:t>
+      </w:r>
+      <w:proofErr w:type="spellStart"/>
+      <w:r>
+        <w:t>veniam</w:t>
+      </w:r>
+      <w:proofErr w:type="spellEnd"/>
+      <w:r>
+        <w:t xml:space="preserve">. Fanny pack man bun </w:t>
+      </w:r>
+      <w:proofErr w:type="spellStart"/>
+      <w:r>
+        <w:t>helvetica</w:t>
+      </w:r>
+      <w:proofErr w:type="spellEnd"/>
+      <w:r>
+        <w:t xml:space="preserve"> viral, </w:t>
+      </w:r>
+      <w:proofErr w:type="spellStart"/>
+      <w:proofErr w:type="gramStart"/>
+      <w:r>
+        <w:t>edison</w:t>
+      </w:r>
+      <w:proofErr w:type="spellEnd"/>
+      <w:proofErr w:type="gramEnd"/>
+      <w:r>
+        <w:t xml:space="preserve"> bulb </w:t>
+      </w:r>
+      <w:proofErr w:type="spellStart"/>
+      <w:r>
+        <w:t>cliche</w:t>
+      </w:r>
+      <w:proofErr w:type="spellEnd"/>
+      <w:r>
+        <w:t xml:space="preserve"> </w:t>
+      </w:r>
+      <w:proofErr w:type="spellStart"/>
+      <w:r>
+        <w:t>jianbing</w:t>
+      </w:r>
+      <w:proofErr w:type="spellEnd"/>
+      <w:r>
+        <w:t>.</w:t>
       </w:r>
     </w:p>
     <w:p>
@@ -2015,14 +2599,27 @@
       <w:r>
         <w:t xml:space="preserve">Figure </w:t>
       </w:r>
-      <w:fldSimple w:instr=" SEQ Figure \* ARABIC ">
-        <w:r>
-          <w:rPr>
-            <w:noProof/>
-          </w:rPr>
-          <w:t>4</w:t>
-        </w:r>
-      </w:fldSimple>
+      <w:r>
+        <w:fldChar w:fldCharType="begin"/>
+      </w:r>
+      <w:r>
+        <w:instrText xml:space="preserve"> SEQ Figure \* ARABIC </w:instrText>
+      </w:r>
+      <w:r>
+        <w:fldChar w:fldCharType="separate"/>
+      </w:r>
+      <w:r>
+        <w:rPr>
+          <w:noProof/>
+        </w:rPr>
+        <w:t>4</w:t>
+      </w:r>
+      <w:r>
+        <w:rPr>
+          <w:noProof/>
+        </w:rPr>
+        <w:fldChar w:fldCharType="end"/>
+      </w:r>
       <w:r>
         <w:t>: Member Information</w:t>
       </w:r>
@@ -2048,7 +2645,187 @@
         <w:keepNext/>
       </w:pPr>
       <w:r>
-        <w:t>Craft beer sartorial copper mug tbh jianbing, locavore VHS salvia +1 vegan gluten-free kogi pug vexillologist affogato. Fanny pack palo santo proident blog bespoke commodo tilde hammock taiyaki wayfarers gentrify. Cardigan ugh slow-carb, ea DIY hot chicken commodo godard. Lorem sint qui 3 wolf moon enim voluptate, velit veniam. Fanny pack man bun helvetica viral, edison bulb cliche jianbing.</w:t>
+        <w:t xml:space="preserve">Craft beer sartorial copper mug </w:t>
+      </w:r>
+      <w:proofErr w:type="spellStart"/>
+      <w:r>
+        <w:t>tbh</w:t>
+      </w:r>
+      <w:proofErr w:type="spellEnd"/>
+      <w:r>
+        <w:t xml:space="preserve"> </w:t>
+      </w:r>
+      <w:proofErr w:type="spellStart"/>
+      <w:r>
+        <w:t>jianbing</w:t>
+      </w:r>
+      <w:proofErr w:type="spellEnd"/>
+      <w:r>
+        <w:t xml:space="preserve">, locavore VHS salvia +1 vegan gluten-free </w:t>
+      </w:r>
+      <w:proofErr w:type="spellStart"/>
+      <w:r>
+        <w:t>kogi</w:t>
+      </w:r>
+      <w:proofErr w:type="spellEnd"/>
+      <w:r>
+        <w:t xml:space="preserve"> pug </w:t>
+      </w:r>
+      <w:proofErr w:type="spellStart"/>
+      <w:r>
+        <w:t>vexillologist</w:t>
+      </w:r>
+      <w:proofErr w:type="spellEnd"/>
+      <w:r>
+        <w:t xml:space="preserve"> </w:t>
+      </w:r>
+      <w:proofErr w:type="spellStart"/>
+      <w:r>
+        <w:t>affogato</w:t>
+      </w:r>
+      <w:proofErr w:type="spellEnd"/>
+      <w:r>
+        <w:t xml:space="preserve">. Fanny pack </w:t>
+      </w:r>
+      <w:proofErr w:type="spellStart"/>
+      <w:r>
+        <w:t>palo</w:t>
+      </w:r>
+      <w:proofErr w:type="spellEnd"/>
+      <w:r>
+        <w:t xml:space="preserve"> </w:t>
+      </w:r>
+      <w:proofErr w:type="spellStart"/>
+      <w:r>
+        <w:t>santo</w:t>
+      </w:r>
+      <w:proofErr w:type="spellEnd"/>
+      <w:r>
+        <w:t xml:space="preserve"> </w:t>
+      </w:r>
+      <w:proofErr w:type="spellStart"/>
+      <w:r>
+        <w:t>proident</w:t>
+      </w:r>
+      <w:proofErr w:type="spellEnd"/>
+      <w:r>
+        <w:t xml:space="preserve"> blog bespoke </w:t>
+      </w:r>
+      <w:proofErr w:type="spellStart"/>
+      <w:r>
+        <w:t>commodo</w:t>
+      </w:r>
+      <w:proofErr w:type="spellEnd"/>
+      <w:r>
+        <w:t xml:space="preserve"> tilde hammock </w:t>
+      </w:r>
+      <w:proofErr w:type="spellStart"/>
+      <w:r>
+        <w:t>taiyaki</w:t>
+      </w:r>
+      <w:proofErr w:type="spellEnd"/>
+      <w:r>
+        <w:t xml:space="preserve"> wayfarers gentrify. Cardigan ugh slow-carb, </w:t>
+      </w:r>
+      <w:proofErr w:type="spellStart"/>
+      <w:r>
+        <w:t>ea</w:t>
+      </w:r>
+      <w:proofErr w:type="spellEnd"/>
+      <w:r>
+        <w:t xml:space="preserve"> DIY hot chicken </w:t>
+      </w:r>
+      <w:proofErr w:type="spellStart"/>
+      <w:r>
+        <w:t>commodo</w:t>
+      </w:r>
+      <w:proofErr w:type="spellEnd"/>
+      <w:r>
+        <w:t xml:space="preserve"> </w:t>
+      </w:r>
+      <w:proofErr w:type="spellStart"/>
+      <w:proofErr w:type="gramStart"/>
+      <w:r>
+        <w:t>godard</w:t>
+      </w:r>
+      <w:proofErr w:type="spellEnd"/>
+      <w:proofErr w:type="gramEnd"/>
+      <w:r>
+        <w:t xml:space="preserve">. Lorem </w:t>
+      </w:r>
+      <w:proofErr w:type="spellStart"/>
+      <w:r>
+        <w:t>sint</w:t>
+      </w:r>
+      <w:proofErr w:type="spellEnd"/>
+      <w:r>
+        <w:t xml:space="preserve"> qui 3 wolf moon </w:t>
+      </w:r>
+      <w:proofErr w:type="spellStart"/>
+      <w:r>
+        <w:t>enim</w:t>
+      </w:r>
+      <w:proofErr w:type="spellEnd"/>
+      <w:r>
+        <w:t xml:space="preserve"> </w:t>
+      </w:r>
+      <w:proofErr w:type="spellStart"/>
+      <w:r>
+        <w:t>voluptate</w:t>
+      </w:r>
+      <w:proofErr w:type="spellEnd"/>
+      <w:r>
+        <w:t xml:space="preserve">, </w:t>
+      </w:r>
+      <w:proofErr w:type="spellStart"/>
+      <w:r>
+        <w:t>velit</w:t>
+      </w:r>
+      <w:proofErr w:type="spellEnd"/>
+      <w:r>
+        <w:t xml:space="preserve"> </w:t>
+      </w:r>
+      <w:proofErr w:type="spellStart"/>
+      <w:r>
+        <w:t>veniam</w:t>
+      </w:r>
+      <w:proofErr w:type="spellEnd"/>
+      <w:r>
+        <w:t xml:space="preserve">. Fanny pack man bun </w:t>
+      </w:r>
+      <w:proofErr w:type="spellStart"/>
+      <w:r>
+        <w:t>helvetica</w:t>
+      </w:r>
+      <w:proofErr w:type="spellEnd"/>
+      <w:r>
+        <w:t xml:space="preserve"> viral, </w:t>
+      </w:r>
+      <w:proofErr w:type="spellStart"/>
+      <w:proofErr w:type="gramStart"/>
+      <w:r>
+        <w:t>edison</w:t>
+      </w:r>
+      <w:proofErr w:type="spellEnd"/>
+      <w:proofErr w:type="gramEnd"/>
+      <w:r>
+        <w:t xml:space="preserve"> bulb </w:t>
+      </w:r>
+      <w:proofErr w:type="spellStart"/>
+      <w:r>
+        <w:t>cliche</w:t>
+      </w:r>
+      <w:proofErr w:type="spellEnd"/>
+      <w:r>
+        <w:t xml:space="preserve"> </w:t>
+      </w:r>
+      <w:proofErr w:type="spellStart"/>
+      <w:r>
+        <w:t>jianbing</w:t>
+      </w:r>
+      <w:proofErr w:type="spellEnd"/>
+      <w:r>
+        <w:t>.</w:t>
       </w:r>
     </w:p>
     <w:p>
@@ -2112,14 +2889,27 @@
       <w:r>
         <w:t xml:space="preserve">Figure </w:t>
       </w:r>
-      <w:fldSimple w:instr=" SEQ Figure \* ARABIC ">
-        <w:r>
-          <w:rPr>
-            <w:noProof/>
-          </w:rPr>
-          <w:t>5</w:t>
-        </w:r>
-      </w:fldSimple>
+      <w:r>
+        <w:fldChar w:fldCharType="begin"/>
+      </w:r>
+      <w:r>
+        <w:instrText xml:space="preserve"> SEQ Figure \* ARABIC </w:instrText>
+      </w:r>
+      <w:r>
+        <w:fldChar w:fldCharType="separate"/>
+      </w:r>
+      <w:r>
+        <w:rPr>
+          <w:noProof/>
+        </w:rPr>
+        <w:t>5</w:t>
+      </w:r>
+      <w:r>
+        <w:rPr>
+          <w:noProof/>
+        </w:rPr>
+        <w:fldChar w:fldCharType="end"/>
+      </w:r>
       <w:r>
         <w:t>: Stats Form</w:t>
       </w:r>
@@ -2145,7 +2935,187 @@
         <w:keepNext/>
       </w:pPr>
       <w:r>
-        <w:t>Craft beer sartorial copper mug tbh jianbing, locavore VHS salvia +1 vegan gluten-free kogi pug vexillologist affogato. Fanny pack palo santo proident blog bespoke commodo tilde hammock taiyaki wayfarers gentrify. Cardigan ugh slow-carb, ea DIY hot chicken commodo godard. Lorem sint qui 3 wolf moon enim voluptate, velit veniam. Fanny pack man bun helvetica viral, edison bulb cliche jianbing.</w:t>
+        <w:t xml:space="preserve">Craft beer sartorial copper mug </w:t>
+      </w:r>
+      <w:proofErr w:type="spellStart"/>
+      <w:r>
+        <w:t>tbh</w:t>
+      </w:r>
+      <w:proofErr w:type="spellEnd"/>
+      <w:r>
+        <w:t xml:space="preserve"> </w:t>
+      </w:r>
+      <w:proofErr w:type="spellStart"/>
+      <w:r>
+        <w:t>jianbing</w:t>
+      </w:r>
+      <w:proofErr w:type="spellEnd"/>
+      <w:r>
+        <w:t xml:space="preserve">, locavore VHS salvia +1 vegan gluten-free </w:t>
+      </w:r>
+      <w:proofErr w:type="spellStart"/>
+      <w:r>
+        <w:t>kogi</w:t>
+      </w:r>
+      <w:proofErr w:type="spellEnd"/>
+      <w:r>
+        <w:t xml:space="preserve"> pug </w:t>
+      </w:r>
+      <w:proofErr w:type="spellStart"/>
+      <w:r>
+        <w:t>vexillologist</w:t>
+      </w:r>
+      <w:proofErr w:type="spellEnd"/>
+      <w:r>
+        <w:t xml:space="preserve"> </w:t>
+      </w:r>
+      <w:proofErr w:type="spellStart"/>
+      <w:r>
+        <w:t>affogato</w:t>
+      </w:r>
+      <w:proofErr w:type="spellEnd"/>
+      <w:r>
+        <w:t xml:space="preserve">. Fanny pack </w:t>
+      </w:r>
+      <w:proofErr w:type="spellStart"/>
+      <w:r>
+        <w:t>palo</w:t>
+      </w:r>
+      <w:proofErr w:type="spellEnd"/>
+      <w:r>
+        <w:t xml:space="preserve"> </w:t>
+      </w:r>
+      <w:proofErr w:type="spellStart"/>
+      <w:r>
+        <w:t>santo</w:t>
+      </w:r>
+      <w:proofErr w:type="spellEnd"/>
+      <w:r>
+        <w:t xml:space="preserve"> </w:t>
+      </w:r>
+      <w:proofErr w:type="spellStart"/>
+      <w:r>
+        <w:t>proident</w:t>
+      </w:r>
+      <w:proofErr w:type="spellEnd"/>
+      <w:r>
+        <w:t xml:space="preserve"> blog bespoke </w:t>
+      </w:r>
+      <w:proofErr w:type="spellStart"/>
+      <w:r>
+        <w:t>commodo</w:t>
+      </w:r>
+      <w:proofErr w:type="spellEnd"/>
+      <w:r>
+        <w:t xml:space="preserve"> tilde hammock </w:t>
+      </w:r>
+      <w:proofErr w:type="spellStart"/>
+      <w:r>
+        <w:t>taiyaki</w:t>
+      </w:r>
+      <w:proofErr w:type="spellEnd"/>
+      <w:r>
+        <w:t xml:space="preserve"> wayfarers gentrify. Cardigan ugh slow-carb, </w:t>
+      </w:r>
+      <w:proofErr w:type="spellStart"/>
+      <w:r>
+        <w:t>ea</w:t>
+      </w:r>
+      <w:proofErr w:type="spellEnd"/>
+      <w:r>
+        <w:t xml:space="preserve"> DIY hot chicken </w:t>
+      </w:r>
+      <w:proofErr w:type="spellStart"/>
+      <w:r>
+        <w:t>commodo</w:t>
+      </w:r>
+      <w:proofErr w:type="spellEnd"/>
+      <w:r>
+        <w:t xml:space="preserve"> </w:t>
+      </w:r>
+      <w:proofErr w:type="spellStart"/>
+      <w:proofErr w:type="gramStart"/>
+      <w:r>
+        <w:t>godard</w:t>
+      </w:r>
+      <w:proofErr w:type="spellEnd"/>
+      <w:proofErr w:type="gramEnd"/>
+      <w:r>
+        <w:t xml:space="preserve">. Lorem </w:t>
+      </w:r>
+      <w:proofErr w:type="spellStart"/>
+      <w:r>
+        <w:t>sint</w:t>
+      </w:r>
+      <w:proofErr w:type="spellEnd"/>
+      <w:r>
+        <w:t xml:space="preserve"> qui 3 wolf moon </w:t>
+      </w:r>
+      <w:proofErr w:type="spellStart"/>
+      <w:r>
+        <w:t>enim</w:t>
+      </w:r>
+      <w:proofErr w:type="spellEnd"/>
+      <w:r>
+        <w:t xml:space="preserve"> </w:t>
+      </w:r>
+      <w:proofErr w:type="spellStart"/>
+      <w:r>
+        <w:t>voluptate</w:t>
+      </w:r>
+      <w:proofErr w:type="spellEnd"/>
+      <w:r>
+        <w:t xml:space="preserve">, </w:t>
+      </w:r>
+      <w:proofErr w:type="spellStart"/>
+      <w:r>
+        <w:t>velit</w:t>
+      </w:r>
+      <w:proofErr w:type="spellEnd"/>
+      <w:r>
+        <w:t xml:space="preserve"> </w:t>
+      </w:r>
+      <w:proofErr w:type="spellStart"/>
+      <w:r>
+        <w:t>veniam</w:t>
+      </w:r>
+      <w:proofErr w:type="spellEnd"/>
+      <w:r>
+        <w:t xml:space="preserve">. Fanny pack man bun </w:t>
+      </w:r>
+      <w:proofErr w:type="spellStart"/>
+      <w:r>
+        <w:t>helvetica</w:t>
+      </w:r>
+      <w:proofErr w:type="spellEnd"/>
+      <w:r>
+        <w:t xml:space="preserve"> viral, </w:t>
+      </w:r>
+      <w:proofErr w:type="spellStart"/>
+      <w:proofErr w:type="gramStart"/>
+      <w:r>
+        <w:t>edison</w:t>
+      </w:r>
+      <w:proofErr w:type="spellEnd"/>
+      <w:proofErr w:type="gramEnd"/>
+      <w:r>
+        <w:t xml:space="preserve"> bulb </w:t>
+      </w:r>
+      <w:proofErr w:type="spellStart"/>
+      <w:r>
+        <w:t>cliche</w:t>
+      </w:r>
+      <w:proofErr w:type="spellEnd"/>
+      <w:r>
+        <w:t xml:space="preserve"> </w:t>
+      </w:r>
+      <w:proofErr w:type="spellStart"/>
+      <w:r>
+        <w:t>jianbing</w:t>
+      </w:r>
+      <w:proofErr w:type="spellEnd"/>
+      <w:r>
+        <w:t>.</w:t>
       </w:r>
     </w:p>
     <w:p>
@@ -2255,14 +3225,27 @@
       <w:r>
         <w:t xml:space="preserve">Figure </w:t>
       </w:r>
-      <w:fldSimple w:instr=" SEQ Figure \* ARABIC ">
-        <w:r>
-          <w:rPr>
-            <w:noProof/>
-          </w:rPr>
-          <w:t>6</w:t>
-        </w:r>
-      </w:fldSimple>
+      <w:r>
+        <w:fldChar w:fldCharType="begin"/>
+      </w:r>
+      <w:r>
+        <w:instrText xml:space="preserve"> SEQ Figure \* ARABIC </w:instrText>
+      </w:r>
+      <w:r>
+        <w:fldChar w:fldCharType="separate"/>
+      </w:r>
+      <w:r>
+        <w:rPr>
+          <w:noProof/>
+        </w:rPr>
+        <w:t>6</w:t>
+      </w:r>
+      <w:r>
+        <w:rPr>
+          <w:noProof/>
+        </w:rPr>
+        <w:fldChar w:fldCharType="end"/>
+      </w:r>
       <w:r>
         <w:t>: Member search, blank and with results</w:t>
       </w:r>
@@ -2288,7 +3271,187 @@
         <w:keepNext/>
       </w:pPr>
       <w:r>
-        <w:t>Craft beer sartorial copper mug tbh jianbing, locavore VHS salvia +1 vegan gluten-free kogi pug vexillologist affogato. Fanny pack palo santo proident blog bespoke commodo tilde hammock taiyaki wayfarers gentrify. Cardigan ugh slow-carb, ea DIY hot chicken commodo godard. Lorem sint qui 3 wolf moon enim voluptate, velit veniam. Fanny pack man bun helvetica viral, edison bulb cliche jianbing.</w:t>
+        <w:t xml:space="preserve">Craft beer sartorial copper mug </w:t>
+      </w:r>
+      <w:proofErr w:type="spellStart"/>
+      <w:r>
+        <w:t>tbh</w:t>
+      </w:r>
+      <w:proofErr w:type="spellEnd"/>
+      <w:r>
+        <w:t xml:space="preserve"> </w:t>
+      </w:r>
+      <w:proofErr w:type="spellStart"/>
+      <w:r>
+        <w:t>jianbing</w:t>
+      </w:r>
+      <w:proofErr w:type="spellEnd"/>
+      <w:r>
+        <w:t xml:space="preserve">, locavore VHS salvia +1 vegan gluten-free </w:t>
+      </w:r>
+      <w:proofErr w:type="spellStart"/>
+      <w:r>
+        <w:t>kogi</w:t>
+      </w:r>
+      <w:proofErr w:type="spellEnd"/>
+      <w:r>
+        <w:t xml:space="preserve"> pug </w:t>
+      </w:r>
+      <w:proofErr w:type="spellStart"/>
+      <w:r>
+        <w:t>vexillologist</w:t>
+      </w:r>
+      <w:proofErr w:type="spellEnd"/>
+      <w:r>
+        <w:t xml:space="preserve"> </w:t>
+      </w:r>
+      <w:proofErr w:type="spellStart"/>
+      <w:r>
+        <w:t>affogato</w:t>
+      </w:r>
+      <w:proofErr w:type="spellEnd"/>
+      <w:r>
+        <w:t xml:space="preserve">. Fanny pack </w:t>
+      </w:r>
+      <w:proofErr w:type="spellStart"/>
+      <w:r>
+        <w:t>palo</w:t>
+      </w:r>
+      <w:proofErr w:type="spellEnd"/>
+      <w:r>
+        <w:t xml:space="preserve"> </w:t>
+      </w:r>
+      <w:proofErr w:type="spellStart"/>
+      <w:r>
+        <w:t>santo</w:t>
+      </w:r>
+      <w:proofErr w:type="spellEnd"/>
+      <w:r>
+        <w:t xml:space="preserve"> </w:t>
+      </w:r>
+      <w:proofErr w:type="spellStart"/>
+      <w:r>
+        <w:t>proident</w:t>
+      </w:r>
+      <w:proofErr w:type="spellEnd"/>
+      <w:r>
+        <w:t xml:space="preserve"> blog bespoke </w:t>
+      </w:r>
+      <w:proofErr w:type="spellStart"/>
+      <w:r>
+        <w:t>commodo</w:t>
+      </w:r>
+      <w:proofErr w:type="spellEnd"/>
+      <w:r>
+        <w:t xml:space="preserve"> tilde hammock </w:t>
+      </w:r>
+      <w:proofErr w:type="spellStart"/>
+      <w:r>
+        <w:t>taiyaki</w:t>
+      </w:r>
+      <w:proofErr w:type="spellEnd"/>
+      <w:r>
+        <w:t xml:space="preserve"> wayfarers gentrify. Cardigan ugh slow-carb, </w:t>
+      </w:r>
+      <w:proofErr w:type="spellStart"/>
+      <w:r>
+        <w:t>ea</w:t>
+      </w:r>
+      <w:proofErr w:type="spellEnd"/>
+      <w:r>
+        <w:t xml:space="preserve"> DIY hot chicken </w:t>
+      </w:r>
+      <w:proofErr w:type="spellStart"/>
+      <w:r>
+        <w:t>commodo</w:t>
+      </w:r>
+      <w:proofErr w:type="spellEnd"/>
+      <w:r>
+        <w:t xml:space="preserve"> </w:t>
+      </w:r>
+      <w:proofErr w:type="spellStart"/>
+      <w:proofErr w:type="gramStart"/>
+      <w:r>
+        <w:t>godard</w:t>
+      </w:r>
+      <w:proofErr w:type="spellEnd"/>
+      <w:proofErr w:type="gramEnd"/>
+      <w:r>
+        <w:t xml:space="preserve">. Lorem </w:t>
+      </w:r>
+      <w:proofErr w:type="spellStart"/>
+      <w:r>
+        <w:t>sint</w:t>
+      </w:r>
+      <w:proofErr w:type="spellEnd"/>
+      <w:r>
+        <w:t xml:space="preserve"> qui 3 wolf moon </w:t>
+      </w:r>
+      <w:proofErr w:type="spellStart"/>
+      <w:r>
+        <w:t>enim</w:t>
+      </w:r>
+      <w:proofErr w:type="spellEnd"/>
+      <w:r>
+        <w:t xml:space="preserve"> </w:t>
+      </w:r>
+      <w:proofErr w:type="spellStart"/>
+      <w:r>
+        <w:t>voluptate</w:t>
+      </w:r>
+      <w:proofErr w:type="spellEnd"/>
+      <w:r>
+        <w:t xml:space="preserve">, </w:t>
+      </w:r>
+      <w:proofErr w:type="spellStart"/>
+      <w:r>
+        <w:t>velit</w:t>
+      </w:r>
+      <w:proofErr w:type="spellEnd"/>
+      <w:r>
+        <w:t xml:space="preserve"> </w:t>
+      </w:r>
+      <w:proofErr w:type="spellStart"/>
+      <w:r>
+        <w:t>veniam</w:t>
+      </w:r>
+      <w:proofErr w:type="spellEnd"/>
+      <w:r>
+        <w:t xml:space="preserve">. Fanny pack man bun </w:t>
+      </w:r>
+      <w:proofErr w:type="spellStart"/>
+      <w:r>
+        <w:t>helvetica</w:t>
+      </w:r>
+      <w:proofErr w:type="spellEnd"/>
+      <w:r>
+        <w:t xml:space="preserve"> viral, </w:t>
+      </w:r>
+      <w:proofErr w:type="spellStart"/>
+      <w:proofErr w:type="gramStart"/>
+      <w:r>
+        <w:t>edison</w:t>
+      </w:r>
+      <w:proofErr w:type="spellEnd"/>
+      <w:proofErr w:type="gramEnd"/>
+      <w:r>
+        <w:t xml:space="preserve"> bulb </w:t>
+      </w:r>
+      <w:proofErr w:type="spellStart"/>
+      <w:r>
+        <w:t>cliche</w:t>
+      </w:r>
+      <w:proofErr w:type="spellEnd"/>
+      <w:r>
+        <w:t xml:space="preserve"> </w:t>
+      </w:r>
+      <w:proofErr w:type="spellStart"/>
+      <w:r>
+        <w:t>jianbing</w:t>
+      </w:r>
+      <w:proofErr w:type="spellEnd"/>
+      <w:r>
+        <w:t>.</w:t>
       </w:r>
     </w:p>
     <w:p>
@@ -2352,14 +3515,27 @@
       <w:r>
         <w:t xml:space="preserve">Figure </w:t>
       </w:r>
-      <w:fldSimple w:instr=" SEQ Figure \* ARABIC ">
-        <w:r>
-          <w:rPr>
-            <w:noProof/>
-          </w:rPr>
-          <w:t>7</w:t>
-        </w:r>
-      </w:fldSimple>
+      <w:r>
+        <w:fldChar w:fldCharType="begin"/>
+      </w:r>
+      <w:r>
+        <w:instrText xml:space="preserve"> SEQ Figure \* ARABIC </w:instrText>
+      </w:r>
+      <w:r>
+        <w:fldChar w:fldCharType="separate"/>
+      </w:r>
+      <w:r>
+        <w:rPr>
+          <w:noProof/>
+        </w:rPr>
+        <w:t>7</w:t>
+      </w:r>
+      <w:r>
+        <w:rPr>
+          <w:noProof/>
+        </w:rPr>
+        <w:fldChar w:fldCharType="end"/>
+      </w:r>
       <w:r>
         <w:t>: basic printer dialog</w:t>
       </w:r>
@@ -2385,7 +3561,187 @@
         <w:keepNext/>
       </w:pPr>
       <w:r>
-        <w:t>Craft beer sartorial copper mug tbh jianbing, locavore VHS salvia +1 vegan gluten-free kogi pug vexillologist affogato. Fanny pack palo santo proident blog bespoke commodo tilde hammock taiyaki wayfarers gentrify. Cardigan ugh slow-carb, ea DIY hot chicken commodo godard. Lorem sint qui 3 wolf moon enim voluptate, velit veniam. Fanny pack man bun helvetica viral, edison bulb cliche jianbing.</w:t>
+        <w:t xml:space="preserve">Craft beer sartorial copper mug </w:t>
+      </w:r>
+      <w:proofErr w:type="spellStart"/>
+      <w:r>
+        <w:t>tbh</w:t>
+      </w:r>
+      <w:proofErr w:type="spellEnd"/>
+      <w:r>
+        <w:t xml:space="preserve"> </w:t>
+      </w:r>
+      <w:proofErr w:type="spellStart"/>
+      <w:r>
+        <w:t>jianbing</w:t>
+      </w:r>
+      <w:proofErr w:type="spellEnd"/>
+      <w:r>
+        <w:t xml:space="preserve">, locavore VHS salvia +1 vegan gluten-free </w:t>
+      </w:r>
+      <w:proofErr w:type="spellStart"/>
+      <w:r>
+        <w:t>kogi</w:t>
+      </w:r>
+      <w:proofErr w:type="spellEnd"/>
+      <w:r>
+        <w:t xml:space="preserve"> pug </w:t>
+      </w:r>
+      <w:proofErr w:type="spellStart"/>
+      <w:r>
+        <w:t>vexillologist</w:t>
+      </w:r>
+      <w:proofErr w:type="spellEnd"/>
+      <w:r>
+        <w:t xml:space="preserve"> </w:t>
+      </w:r>
+      <w:proofErr w:type="spellStart"/>
+      <w:r>
+        <w:t>affogato</w:t>
+      </w:r>
+      <w:proofErr w:type="spellEnd"/>
+      <w:r>
+        <w:t xml:space="preserve">. Fanny pack </w:t>
+      </w:r>
+      <w:proofErr w:type="spellStart"/>
+      <w:r>
+        <w:t>palo</w:t>
+      </w:r>
+      <w:proofErr w:type="spellEnd"/>
+      <w:r>
+        <w:t xml:space="preserve"> </w:t>
+      </w:r>
+      <w:proofErr w:type="spellStart"/>
+      <w:r>
+        <w:t>santo</w:t>
+      </w:r>
+      <w:proofErr w:type="spellEnd"/>
+      <w:r>
+        <w:t xml:space="preserve"> </w:t>
+      </w:r>
+      <w:proofErr w:type="spellStart"/>
+      <w:r>
+        <w:t>proident</w:t>
+      </w:r>
+      <w:proofErr w:type="spellEnd"/>
+      <w:r>
+        <w:t xml:space="preserve"> blog bespoke </w:t>
+      </w:r>
+      <w:proofErr w:type="spellStart"/>
+      <w:r>
+        <w:t>commodo</w:t>
+      </w:r>
+      <w:proofErr w:type="spellEnd"/>
+      <w:r>
+        <w:t xml:space="preserve"> tilde hammock </w:t>
+      </w:r>
+      <w:proofErr w:type="spellStart"/>
+      <w:r>
+        <w:t>taiyaki</w:t>
+      </w:r>
+      <w:proofErr w:type="spellEnd"/>
+      <w:r>
+        <w:t xml:space="preserve"> wayfarers gentrify. Cardigan ugh slow-carb, </w:t>
+      </w:r>
+      <w:proofErr w:type="spellStart"/>
+      <w:r>
+        <w:t>ea</w:t>
+      </w:r>
+      <w:proofErr w:type="spellEnd"/>
+      <w:r>
+        <w:t xml:space="preserve"> DIY hot chicken </w:t>
+      </w:r>
+      <w:proofErr w:type="spellStart"/>
+      <w:r>
+        <w:t>commodo</w:t>
+      </w:r>
+      <w:proofErr w:type="spellEnd"/>
+      <w:r>
+        <w:t xml:space="preserve"> </w:t>
+      </w:r>
+      <w:proofErr w:type="spellStart"/>
+      <w:proofErr w:type="gramStart"/>
+      <w:r>
+        <w:t>godard</w:t>
+      </w:r>
+      <w:proofErr w:type="spellEnd"/>
+      <w:proofErr w:type="gramEnd"/>
+      <w:r>
+        <w:t xml:space="preserve">. Lorem </w:t>
+      </w:r>
+      <w:proofErr w:type="spellStart"/>
+      <w:r>
+        <w:t>sint</w:t>
+      </w:r>
+      <w:proofErr w:type="spellEnd"/>
+      <w:r>
+        <w:t xml:space="preserve"> qui 3 wolf moon </w:t>
+      </w:r>
+      <w:proofErr w:type="spellStart"/>
+      <w:r>
+        <w:t>enim</w:t>
+      </w:r>
+      <w:proofErr w:type="spellEnd"/>
+      <w:r>
+        <w:t xml:space="preserve"> </w:t>
+      </w:r>
+      <w:proofErr w:type="spellStart"/>
+      <w:r>
+        <w:t>voluptate</w:t>
+      </w:r>
+      <w:proofErr w:type="spellEnd"/>
+      <w:r>
+        <w:t xml:space="preserve">, </w:t>
+      </w:r>
+      <w:proofErr w:type="spellStart"/>
+      <w:r>
+        <w:t>velit</w:t>
+      </w:r>
+      <w:proofErr w:type="spellEnd"/>
+      <w:r>
+        <w:t xml:space="preserve"> </w:t>
+      </w:r>
+      <w:proofErr w:type="spellStart"/>
+      <w:r>
+        <w:t>veniam</w:t>
+      </w:r>
+      <w:proofErr w:type="spellEnd"/>
+      <w:r>
+        <w:t xml:space="preserve">. Fanny pack man bun </w:t>
+      </w:r>
+      <w:proofErr w:type="spellStart"/>
+      <w:r>
+        <w:t>helvetica</w:t>
+      </w:r>
+      <w:proofErr w:type="spellEnd"/>
+      <w:r>
+        <w:t xml:space="preserve"> viral, </w:t>
+      </w:r>
+      <w:proofErr w:type="spellStart"/>
+      <w:proofErr w:type="gramStart"/>
+      <w:r>
+        <w:t>edison</w:t>
+      </w:r>
+      <w:proofErr w:type="spellEnd"/>
+      <w:proofErr w:type="gramEnd"/>
+      <w:r>
+        <w:t xml:space="preserve"> bulb </w:t>
+      </w:r>
+      <w:proofErr w:type="spellStart"/>
+      <w:r>
+        <w:t>cliche</w:t>
+      </w:r>
+      <w:proofErr w:type="spellEnd"/>
+      <w:r>
+        <w:t xml:space="preserve"> </w:t>
+      </w:r>
+      <w:proofErr w:type="spellStart"/>
+      <w:r>
+        <w:t>jianbing</w:t>
+      </w:r>
+      <w:proofErr w:type="spellEnd"/>
+      <w:r>
+        <w:t>.</w:t>
       </w:r>
     </w:p>
     <w:p>
@@ -2449,14 +3805,27 @@
       <w:r>
         <w:t xml:space="preserve">Figure </w:t>
       </w:r>
-      <w:fldSimple w:instr=" SEQ Figure \* ARABIC ">
-        <w:r>
-          <w:rPr>
-            <w:noProof/>
-          </w:rPr>
-          <w:t>8</w:t>
-        </w:r>
-      </w:fldSimple>
+      <w:r>
+        <w:fldChar w:fldCharType="begin"/>
+      </w:r>
+      <w:r>
+        <w:instrText xml:space="preserve"> SEQ Figure \* ARABIC </w:instrText>
+      </w:r>
+      <w:r>
+        <w:fldChar w:fldCharType="separate"/>
+      </w:r>
+      <w:r>
+        <w:rPr>
+          <w:noProof/>
+        </w:rPr>
+        <w:t>8</w:t>
+      </w:r>
+      <w:r>
+        <w:rPr>
+          <w:noProof/>
+        </w:rPr>
+        <w:fldChar w:fldCharType="end"/>
+      </w:r>
       <w:r>
         <w:t>: Print Labels Dialog</w:t>
       </w:r>
@@ -2482,7 +3851,187 @@
         <w:keepNext/>
       </w:pPr>
       <w:r>
-        <w:t>Craft beer sartorial copper mug tbh jianbing, locavore VHS salvia +1 vegan gluten-free kogi pug vexillologist affogato. Fanny pack palo santo proident blog bespoke commodo tilde hammock taiyaki wayfarers gentrify. Cardigan ugh slow-carb, ea DIY hot chicken commodo godard. Lorem sint qui 3 wolf moon enim voluptate, velit veniam. Fanny pack man bun helvetica viral, edison bulb cliche jianbing.</w:t>
+        <w:t xml:space="preserve">Craft beer sartorial copper mug </w:t>
+      </w:r>
+      <w:proofErr w:type="spellStart"/>
+      <w:r>
+        <w:t>tbh</w:t>
+      </w:r>
+      <w:proofErr w:type="spellEnd"/>
+      <w:r>
+        <w:t xml:space="preserve"> </w:t>
+      </w:r>
+      <w:proofErr w:type="spellStart"/>
+      <w:r>
+        <w:t>jianbing</w:t>
+      </w:r>
+      <w:proofErr w:type="spellEnd"/>
+      <w:r>
+        <w:t xml:space="preserve">, locavore VHS salvia +1 vegan gluten-free </w:t>
+      </w:r>
+      <w:proofErr w:type="spellStart"/>
+      <w:r>
+        <w:t>kogi</w:t>
+      </w:r>
+      <w:proofErr w:type="spellEnd"/>
+      <w:r>
+        <w:t xml:space="preserve"> pug </w:t>
+      </w:r>
+      <w:proofErr w:type="spellStart"/>
+      <w:r>
+        <w:t>vexillologist</w:t>
+      </w:r>
+      <w:proofErr w:type="spellEnd"/>
+      <w:r>
+        <w:t xml:space="preserve"> </w:t>
+      </w:r>
+      <w:proofErr w:type="spellStart"/>
+      <w:r>
+        <w:t>affogato</w:t>
+      </w:r>
+      <w:proofErr w:type="spellEnd"/>
+      <w:r>
+        <w:t xml:space="preserve">. Fanny pack </w:t>
+      </w:r>
+      <w:proofErr w:type="spellStart"/>
+      <w:r>
+        <w:t>palo</w:t>
+      </w:r>
+      <w:proofErr w:type="spellEnd"/>
+      <w:r>
+        <w:t xml:space="preserve"> </w:t>
+      </w:r>
+      <w:proofErr w:type="spellStart"/>
+      <w:r>
+        <w:t>santo</w:t>
+      </w:r>
+      <w:proofErr w:type="spellEnd"/>
+      <w:r>
+        <w:t xml:space="preserve"> </w:t>
+      </w:r>
+      <w:proofErr w:type="spellStart"/>
+      <w:r>
+        <w:t>proident</w:t>
+      </w:r>
+      <w:proofErr w:type="spellEnd"/>
+      <w:r>
+        <w:t xml:space="preserve"> blog bespoke </w:t>
+      </w:r>
+      <w:proofErr w:type="spellStart"/>
+      <w:r>
+        <w:t>commodo</w:t>
+      </w:r>
+      <w:proofErr w:type="spellEnd"/>
+      <w:r>
+        <w:t xml:space="preserve"> tilde hammock </w:t>
+      </w:r>
+      <w:proofErr w:type="spellStart"/>
+      <w:r>
+        <w:t>taiyaki</w:t>
+      </w:r>
+      <w:proofErr w:type="spellEnd"/>
+      <w:r>
+        <w:t xml:space="preserve"> wayfarers gentrify. Cardigan ugh slow-carb, </w:t>
+      </w:r>
+      <w:proofErr w:type="spellStart"/>
+      <w:r>
+        <w:t>ea</w:t>
+      </w:r>
+      <w:proofErr w:type="spellEnd"/>
+      <w:r>
+        <w:t xml:space="preserve"> DIY hot chicken </w:t>
+      </w:r>
+      <w:proofErr w:type="spellStart"/>
+      <w:r>
+        <w:t>commodo</w:t>
+      </w:r>
+      <w:proofErr w:type="spellEnd"/>
+      <w:r>
+        <w:t xml:space="preserve"> </w:t>
+      </w:r>
+      <w:proofErr w:type="spellStart"/>
+      <w:proofErr w:type="gramStart"/>
+      <w:r>
+        <w:t>godard</w:t>
+      </w:r>
+      <w:proofErr w:type="spellEnd"/>
+      <w:proofErr w:type="gramEnd"/>
+      <w:r>
+        <w:t xml:space="preserve">. Lorem </w:t>
+      </w:r>
+      <w:proofErr w:type="spellStart"/>
+      <w:r>
+        <w:t>sint</w:t>
+      </w:r>
+      <w:proofErr w:type="spellEnd"/>
+      <w:r>
+        <w:t xml:space="preserve"> qui 3 wolf moon </w:t>
+      </w:r>
+      <w:proofErr w:type="spellStart"/>
+      <w:r>
+        <w:t>enim</w:t>
+      </w:r>
+      <w:proofErr w:type="spellEnd"/>
+      <w:r>
+        <w:t xml:space="preserve"> </w:t>
+      </w:r>
+      <w:proofErr w:type="spellStart"/>
+      <w:r>
+        <w:t>voluptate</w:t>
+      </w:r>
+      <w:proofErr w:type="spellEnd"/>
+      <w:r>
+        <w:t xml:space="preserve">, </w:t>
+      </w:r>
+      <w:proofErr w:type="spellStart"/>
+      <w:r>
+        <w:t>velit</w:t>
+      </w:r>
+      <w:proofErr w:type="spellEnd"/>
+      <w:r>
+        <w:t xml:space="preserve"> </w:t>
+      </w:r>
+      <w:proofErr w:type="spellStart"/>
+      <w:r>
+        <w:t>veniam</w:t>
+      </w:r>
+      <w:proofErr w:type="spellEnd"/>
+      <w:r>
+        <w:t xml:space="preserve">. Fanny pack man bun </w:t>
+      </w:r>
+      <w:proofErr w:type="spellStart"/>
+      <w:r>
+        <w:t>helvetica</w:t>
+      </w:r>
+      <w:proofErr w:type="spellEnd"/>
+      <w:r>
+        <w:t xml:space="preserve"> viral, </w:t>
+      </w:r>
+      <w:proofErr w:type="spellStart"/>
+      <w:proofErr w:type="gramStart"/>
+      <w:r>
+        <w:t>edison</w:t>
+      </w:r>
+      <w:proofErr w:type="spellEnd"/>
+      <w:proofErr w:type="gramEnd"/>
+      <w:r>
+        <w:t xml:space="preserve"> bulb </w:t>
+      </w:r>
+      <w:proofErr w:type="spellStart"/>
+      <w:r>
+        <w:t>cliche</w:t>
+      </w:r>
+      <w:proofErr w:type="spellEnd"/>
+      <w:r>
+        <w:t xml:space="preserve"> </w:t>
+      </w:r>
+      <w:proofErr w:type="spellStart"/>
+      <w:r>
+        <w:t>jianbing</w:t>
+      </w:r>
+      <w:proofErr w:type="spellEnd"/>
+      <w:r>
+        <w:t>.</w:t>
       </w:r>
     </w:p>
     <w:p>
@@ -2546,14 +4095,27 @@
       <w:r>
         <w:t xml:space="preserve">Figure </w:t>
       </w:r>
-      <w:fldSimple w:instr=" SEQ Figure \* ARABIC ">
-        <w:r>
-          <w:rPr>
-            <w:noProof/>
-          </w:rPr>
-          <w:t>9</w:t>
-        </w:r>
-      </w:fldSimple>
+      <w:r>
+        <w:fldChar w:fldCharType="begin"/>
+      </w:r>
+      <w:r>
+        <w:instrText xml:space="preserve"> SEQ Figure \* ARABIC </w:instrText>
+      </w:r>
+      <w:r>
+        <w:fldChar w:fldCharType="separate"/>
+      </w:r>
+      <w:r>
+        <w:rPr>
+          <w:noProof/>
+        </w:rPr>
+        <w:t>9</w:t>
+      </w:r>
+      <w:r>
+        <w:rPr>
+          <w:noProof/>
+        </w:rPr>
+        <w:fldChar w:fldCharType="end"/>
+      </w:r>
       <w:r>
         <w:t>: Importing existing player information</w:t>
       </w:r>
@@ -2588,7 +4150,187 @@
         <w:keepNext/>
       </w:pPr>
       <w:r>
-        <w:t>Craft beer sartorial copper mug tbh jianbing, locavore VHS salvia +1 vegan gluten-free kogi pug vexillologist affogato. Fanny pack palo santo proident blog bespoke commodo tilde hammock taiyaki wayfarers gentrify. Cardigan ugh slow-carb, ea DIY hot chicken commodo godard. Lorem sint qui 3 wolf moon enim voluptate, velit veniam. Fanny pack man bun helvetica viral, edison bulb cliche jianbing.</w:t>
+        <w:t xml:space="preserve">Craft beer sartorial copper mug </w:t>
+      </w:r>
+      <w:proofErr w:type="spellStart"/>
+      <w:r>
+        <w:t>tbh</w:t>
+      </w:r>
+      <w:proofErr w:type="spellEnd"/>
+      <w:r>
+        <w:t xml:space="preserve"> </w:t>
+      </w:r>
+      <w:proofErr w:type="spellStart"/>
+      <w:r>
+        <w:t>jianbing</w:t>
+      </w:r>
+      <w:proofErr w:type="spellEnd"/>
+      <w:r>
+        <w:t xml:space="preserve">, locavore VHS salvia +1 vegan gluten-free </w:t>
+      </w:r>
+      <w:proofErr w:type="spellStart"/>
+      <w:r>
+        <w:t>kogi</w:t>
+      </w:r>
+      <w:proofErr w:type="spellEnd"/>
+      <w:r>
+        <w:t xml:space="preserve"> pug </w:t>
+      </w:r>
+      <w:proofErr w:type="spellStart"/>
+      <w:r>
+        <w:t>vexillologist</w:t>
+      </w:r>
+      <w:proofErr w:type="spellEnd"/>
+      <w:r>
+        <w:t xml:space="preserve"> </w:t>
+      </w:r>
+      <w:proofErr w:type="spellStart"/>
+      <w:r>
+        <w:t>affogato</w:t>
+      </w:r>
+      <w:proofErr w:type="spellEnd"/>
+      <w:r>
+        <w:t xml:space="preserve">. Fanny pack </w:t>
+      </w:r>
+      <w:proofErr w:type="spellStart"/>
+      <w:r>
+        <w:t>palo</w:t>
+      </w:r>
+      <w:proofErr w:type="spellEnd"/>
+      <w:r>
+        <w:t xml:space="preserve"> </w:t>
+      </w:r>
+      <w:proofErr w:type="spellStart"/>
+      <w:r>
+        <w:t>santo</w:t>
+      </w:r>
+      <w:proofErr w:type="spellEnd"/>
+      <w:r>
+        <w:t xml:space="preserve"> </w:t>
+      </w:r>
+      <w:proofErr w:type="spellStart"/>
+      <w:r>
+        <w:t>proident</w:t>
+      </w:r>
+      <w:proofErr w:type="spellEnd"/>
+      <w:r>
+        <w:t xml:space="preserve"> blog bespoke </w:t>
+      </w:r>
+      <w:proofErr w:type="spellStart"/>
+      <w:r>
+        <w:t>commodo</w:t>
+      </w:r>
+      <w:proofErr w:type="spellEnd"/>
+      <w:r>
+        <w:t xml:space="preserve"> tilde hammock </w:t>
+      </w:r>
+      <w:proofErr w:type="spellStart"/>
+      <w:r>
+        <w:t>taiyaki</w:t>
+      </w:r>
+      <w:proofErr w:type="spellEnd"/>
+      <w:r>
+        <w:t xml:space="preserve"> wayfarers gentrify. Cardigan ugh slow-carb, </w:t>
+      </w:r>
+      <w:proofErr w:type="spellStart"/>
+      <w:r>
+        <w:t>ea</w:t>
+      </w:r>
+      <w:proofErr w:type="spellEnd"/>
+      <w:r>
+        <w:t xml:space="preserve"> DIY hot chicken </w:t>
+      </w:r>
+      <w:proofErr w:type="spellStart"/>
+      <w:r>
+        <w:t>commodo</w:t>
+      </w:r>
+      <w:proofErr w:type="spellEnd"/>
+      <w:r>
+        <w:t xml:space="preserve"> </w:t>
+      </w:r>
+      <w:proofErr w:type="spellStart"/>
+      <w:proofErr w:type="gramStart"/>
+      <w:r>
+        <w:t>godard</w:t>
+      </w:r>
+      <w:proofErr w:type="spellEnd"/>
+      <w:proofErr w:type="gramEnd"/>
+      <w:r>
+        <w:t xml:space="preserve">. Lorem </w:t>
+      </w:r>
+      <w:proofErr w:type="spellStart"/>
+      <w:r>
+        <w:t>sint</w:t>
+      </w:r>
+      <w:proofErr w:type="spellEnd"/>
+      <w:r>
+        <w:t xml:space="preserve"> qui 3 wolf moon </w:t>
+      </w:r>
+      <w:proofErr w:type="spellStart"/>
+      <w:r>
+        <w:t>enim</w:t>
+      </w:r>
+      <w:proofErr w:type="spellEnd"/>
+      <w:r>
+        <w:t xml:space="preserve"> </w:t>
+      </w:r>
+      <w:proofErr w:type="spellStart"/>
+      <w:r>
+        <w:t>voluptate</w:t>
+      </w:r>
+      <w:proofErr w:type="spellEnd"/>
+      <w:r>
+        <w:t xml:space="preserve">, </w:t>
+      </w:r>
+      <w:proofErr w:type="spellStart"/>
+      <w:r>
+        <w:t>velit</w:t>
+      </w:r>
+      <w:proofErr w:type="spellEnd"/>
+      <w:r>
+        <w:t xml:space="preserve"> </w:t>
+      </w:r>
+      <w:proofErr w:type="spellStart"/>
+      <w:r>
+        <w:t>veniam</w:t>
+      </w:r>
+      <w:proofErr w:type="spellEnd"/>
+      <w:r>
+        <w:t xml:space="preserve">. Fanny pack man bun </w:t>
+      </w:r>
+      <w:proofErr w:type="spellStart"/>
+      <w:r>
+        <w:t>helvetica</w:t>
+      </w:r>
+      <w:proofErr w:type="spellEnd"/>
+      <w:r>
+        <w:t xml:space="preserve"> viral, </w:t>
+      </w:r>
+      <w:proofErr w:type="spellStart"/>
+      <w:proofErr w:type="gramStart"/>
+      <w:r>
+        <w:t>edison</w:t>
+      </w:r>
+      <w:proofErr w:type="spellEnd"/>
+      <w:proofErr w:type="gramEnd"/>
+      <w:r>
+        <w:t xml:space="preserve"> bulb </w:t>
+      </w:r>
+      <w:proofErr w:type="spellStart"/>
+      <w:r>
+        <w:t>cliche</w:t>
+      </w:r>
+      <w:proofErr w:type="spellEnd"/>
+      <w:r>
+        <w:t xml:space="preserve"> </w:t>
+      </w:r>
+      <w:proofErr w:type="spellStart"/>
+      <w:r>
+        <w:t>jianbing</w:t>
+      </w:r>
+      <w:proofErr w:type="spellEnd"/>
+      <w:r>
+        <w:t>.</w:t>
       </w:r>
     </w:p>
     <w:p>
@@ -2659,14 +4401,27 @@
       <w:r>
         <w:t xml:space="preserve">Figure </w:t>
       </w:r>
-      <w:fldSimple w:instr=" SEQ Figure \* ARABIC ">
-        <w:r>
-          <w:rPr>
-            <w:noProof/>
-          </w:rPr>
-          <w:t>10</w:t>
-        </w:r>
-      </w:fldSimple>
+      <w:r>
+        <w:fldChar w:fldCharType="begin"/>
+      </w:r>
+      <w:r>
+        <w:instrText xml:space="preserve"> SEQ Figure \* ARABIC </w:instrText>
+      </w:r>
+      <w:r>
+        <w:fldChar w:fldCharType="separate"/>
+      </w:r>
+      <w:r>
+        <w:rPr>
+          <w:noProof/>
+        </w:rPr>
+        <w:t>10</w:t>
+      </w:r>
+      <w:r>
+        <w:rPr>
+          <w:noProof/>
+        </w:rPr>
+        <w:fldChar w:fldCharType="end"/>
+      </w:r>
       <w:r>
         <w:t>: Member Scores</w:t>
       </w:r>
@@ -2692,7 +4447,187 @@
         <w:keepNext/>
       </w:pPr>
       <w:r>
-        <w:t>Craft beer sartorial copper mug tbh jianbing, locavore VHS salvia +1 vegan gluten-free kogi pug vexillologist affogato. Fanny pack palo santo proident blog bespoke commodo tilde hammock taiyaki wayfarers gentrify. Cardigan ugh slow-carb, ea DIY hot chicken commodo godard. Lorem sint qui 3 wolf moon enim voluptate, velit veniam. Fanny pack man bun helvetica viral, edison bulb cliche jianbing.</w:t>
+        <w:t xml:space="preserve">Craft beer sartorial copper mug </w:t>
+      </w:r>
+      <w:proofErr w:type="spellStart"/>
+      <w:r>
+        <w:t>tbh</w:t>
+      </w:r>
+      <w:proofErr w:type="spellEnd"/>
+      <w:r>
+        <w:t xml:space="preserve"> </w:t>
+      </w:r>
+      <w:proofErr w:type="spellStart"/>
+      <w:r>
+        <w:t>jianbing</w:t>
+      </w:r>
+      <w:proofErr w:type="spellEnd"/>
+      <w:r>
+        <w:t xml:space="preserve">, locavore VHS salvia +1 vegan gluten-free </w:t>
+      </w:r>
+      <w:proofErr w:type="spellStart"/>
+      <w:r>
+        <w:t>kogi</w:t>
+      </w:r>
+      <w:proofErr w:type="spellEnd"/>
+      <w:r>
+        <w:t xml:space="preserve"> pug </w:t>
+      </w:r>
+      <w:proofErr w:type="spellStart"/>
+      <w:r>
+        <w:t>vexillologist</w:t>
+      </w:r>
+      <w:proofErr w:type="spellEnd"/>
+      <w:r>
+        <w:t xml:space="preserve"> </w:t>
+      </w:r>
+      <w:proofErr w:type="spellStart"/>
+      <w:r>
+        <w:t>affogato</w:t>
+      </w:r>
+      <w:proofErr w:type="spellEnd"/>
+      <w:r>
+        <w:t xml:space="preserve">. Fanny pack </w:t>
+      </w:r>
+      <w:proofErr w:type="spellStart"/>
+      <w:r>
+        <w:t>palo</w:t>
+      </w:r>
+      <w:proofErr w:type="spellEnd"/>
+      <w:r>
+        <w:t xml:space="preserve"> </w:t>
+      </w:r>
+      <w:proofErr w:type="spellStart"/>
+      <w:r>
+        <w:t>santo</w:t>
+      </w:r>
+      <w:proofErr w:type="spellEnd"/>
+      <w:r>
+        <w:t xml:space="preserve"> </w:t>
+      </w:r>
+      <w:proofErr w:type="spellStart"/>
+      <w:r>
+        <w:t>proident</w:t>
+      </w:r>
+      <w:proofErr w:type="spellEnd"/>
+      <w:r>
+        <w:t xml:space="preserve"> blog bespoke </w:t>
+      </w:r>
+      <w:proofErr w:type="spellStart"/>
+      <w:r>
+        <w:t>commodo</w:t>
+      </w:r>
+      <w:proofErr w:type="spellEnd"/>
+      <w:r>
+        <w:t xml:space="preserve"> tilde hammock </w:t>
+      </w:r>
+      <w:proofErr w:type="spellStart"/>
+      <w:r>
+        <w:t>taiyaki</w:t>
+      </w:r>
+      <w:proofErr w:type="spellEnd"/>
+      <w:r>
+        <w:t xml:space="preserve"> wayfarers gentrify. Cardigan ugh slow-carb, </w:t>
+      </w:r>
+      <w:proofErr w:type="spellStart"/>
+      <w:r>
+        <w:t>ea</w:t>
+      </w:r>
+      <w:proofErr w:type="spellEnd"/>
+      <w:r>
+        <w:t xml:space="preserve"> DIY hot chicken </w:t>
+      </w:r>
+      <w:proofErr w:type="spellStart"/>
+      <w:r>
+        <w:t>commodo</w:t>
+      </w:r>
+      <w:proofErr w:type="spellEnd"/>
+      <w:r>
+        <w:t xml:space="preserve"> </w:t>
+      </w:r>
+      <w:proofErr w:type="spellStart"/>
+      <w:proofErr w:type="gramStart"/>
+      <w:r>
+        <w:t>godard</w:t>
+      </w:r>
+      <w:proofErr w:type="spellEnd"/>
+      <w:proofErr w:type="gramEnd"/>
+      <w:r>
+        <w:t xml:space="preserve">. Lorem </w:t>
+      </w:r>
+      <w:proofErr w:type="spellStart"/>
+      <w:r>
+        <w:t>sint</w:t>
+      </w:r>
+      <w:proofErr w:type="spellEnd"/>
+      <w:r>
+        <w:t xml:space="preserve"> qui 3 wolf moon </w:t>
+      </w:r>
+      <w:proofErr w:type="spellStart"/>
+      <w:r>
+        <w:t>enim</w:t>
+      </w:r>
+      <w:proofErr w:type="spellEnd"/>
+      <w:r>
+        <w:t xml:space="preserve"> </w:t>
+      </w:r>
+      <w:proofErr w:type="spellStart"/>
+      <w:r>
+        <w:t>voluptate</w:t>
+      </w:r>
+      <w:proofErr w:type="spellEnd"/>
+      <w:r>
+        <w:t xml:space="preserve">, </w:t>
+      </w:r>
+      <w:proofErr w:type="spellStart"/>
+      <w:r>
+        <w:t>velit</w:t>
+      </w:r>
+      <w:proofErr w:type="spellEnd"/>
+      <w:r>
+        <w:t xml:space="preserve"> </w:t>
+      </w:r>
+      <w:proofErr w:type="spellStart"/>
+      <w:r>
+        <w:t>veniam</w:t>
+      </w:r>
+      <w:proofErr w:type="spellEnd"/>
+      <w:r>
+        <w:t xml:space="preserve">. Fanny pack man bun </w:t>
+      </w:r>
+      <w:proofErr w:type="spellStart"/>
+      <w:r>
+        <w:t>helvetica</w:t>
+      </w:r>
+      <w:proofErr w:type="spellEnd"/>
+      <w:r>
+        <w:t xml:space="preserve"> viral, </w:t>
+      </w:r>
+      <w:proofErr w:type="spellStart"/>
+      <w:proofErr w:type="gramStart"/>
+      <w:r>
+        <w:t>edison</w:t>
+      </w:r>
+      <w:proofErr w:type="spellEnd"/>
+      <w:proofErr w:type="gramEnd"/>
+      <w:r>
+        <w:t xml:space="preserve"> bulb </w:t>
+      </w:r>
+      <w:proofErr w:type="spellStart"/>
+      <w:r>
+        <w:t>cliche</w:t>
+      </w:r>
+      <w:proofErr w:type="spellEnd"/>
+      <w:r>
+        <w:t xml:space="preserve"> </w:t>
+      </w:r>
+      <w:proofErr w:type="spellStart"/>
+      <w:r>
+        <w:t>jianbing</w:t>
+      </w:r>
+      <w:proofErr w:type="spellEnd"/>
+      <w:r>
+        <w:t>.</w:t>
       </w:r>
     </w:p>
     <w:p>
@@ -2756,14 +4691,27 @@
       <w:r>
         <w:t xml:space="preserve">Figure </w:t>
       </w:r>
-      <w:fldSimple w:instr=" SEQ Figure \* ARABIC ">
-        <w:r>
-          <w:rPr>
-            <w:noProof/>
-          </w:rPr>
-          <w:t>11</w:t>
-        </w:r>
-      </w:fldSimple>
+      <w:r>
+        <w:fldChar w:fldCharType="begin"/>
+      </w:r>
+      <w:r>
+        <w:instrText xml:space="preserve"> SEQ Figure \* ARABIC </w:instrText>
+      </w:r>
+      <w:r>
+        <w:fldChar w:fldCharType="separate"/>
+      </w:r>
+      <w:r>
+        <w:rPr>
+          <w:noProof/>
+        </w:rPr>
+        <w:t>11</w:t>
+      </w:r>
+      <w:r>
+        <w:rPr>
+          <w:noProof/>
+        </w:rPr>
+        <w:fldChar w:fldCharType="end"/>
+      </w:r>
       <w:r>
         <w:t>: Tournament Stats Form</w:t>
       </w:r>
@@ -2779,7 +4727,21 @@
         <w:rPr>
           <w:szCs w:val="20"/>
         </w:rPr>
-        <w:t>Print Recaps By Tournament</w:t>
+        <w:t xml:space="preserve">Print Recaps </w:t>
+      </w:r>
+      <w:proofErr w:type="gramStart"/>
+      <w:r>
+        <w:rPr>
+          <w:szCs w:val="20"/>
+        </w:rPr>
+        <w:t>By</w:t>
+      </w:r>
+      <w:proofErr w:type="gramEnd"/>
+      <w:r>
+        <w:rPr>
+          <w:szCs w:val="20"/>
+        </w:rPr>
+        <w:t xml:space="preserve"> Tournament</w:t>
       </w:r>
     </w:p>
     <w:p>
@@ -2788,7 +4750,187 @@
         <w:keepNext/>
       </w:pPr>
       <w:r>
-        <w:t>Craft beer sartorial copper mug tbh jianbing, locavore VHS salvia +1 vegan gluten-free kogi pug vexillologist affogato. Fanny pack palo santo proident blog bespoke commodo tilde hammock taiyaki wayfarers gentrify. Cardigan ugh slow-carb, ea DIY hot chicken commodo godard. Lorem sint qui 3 wolf moon enim voluptate, velit veniam. Fanny pack man bun helvetica viral, edison bulb cliche jianbing.</w:t>
+        <w:t xml:space="preserve">Craft beer sartorial copper mug </w:t>
+      </w:r>
+      <w:proofErr w:type="spellStart"/>
+      <w:r>
+        <w:t>tbh</w:t>
+      </w:r>
+      <w:proofErr w:type="spellEnd"/>
+      <w:r>
+        <w:t xml:space="preserve"> </w:t>
+      </w:r>
+      <w:proofErr w:type="spellStart"/>
+      <w:r>
+        <w:t>jianbing</w:t>
+      </w:r>
+      <w:proofErr w:type="spellEnd"/>
+      <w:r>
+        <w:t xml:space="preserve">, locavore VHS salvia +1 vegan gluten-free </w:t>
+      </w:r>
+      <w:proofErr w:type="spellStart"/>
+      <w:r>
+        <w:t>kogi</w:t>
+      </w:r>
+      <w:proofErr w:type="spellEnd"/>
+      <w:r>
+        <w:t xml:space="preserve"> pug </w:t>
+      </w:r>
+      <w:proofErr w:type="spellStart"/>
+      <w:r>
+        <w:t>vexillologist</w:t>
+      </w:r>
+      <w:proofErr w:type="spellEnd"/>
+      <w:r>
+        <w:t xml:space="preserve"> </w:t>
+      </w:r>
+      <w:proofErr w:type="spellStart"/>
+      <w:r>
+        <w:t>affogato</w:t>
+      </w:r>
+      <w:proofErr w:type="spellEnd"/>
+      <w:r>
+        <w:t xml:space="preserve">. Fanny pack </w:t>
+      </w:r>
+      <w:proofErr w:type="spellStart"/>
+      <w:r>
+        <w:t>palo</w:t>
+      </w:r>
+      <w:proofErr w:type="spellEnd"/>
+      <w:r>
+        <w:t xml:space="preserve"> </w:t>
+      </w:r>
+      <w:proofErr w:type="spellStart"/>
+      <w:r>
+        <w:t>santo</w:t>
+      </w:r>
+      <w:proofErr w:type="spellEnd"/>
+      <w:r>
+        <w:t xml:space="preserve"> </w:t>
+      </w:r>
+      <w:proofErr w:type="spellStart"/>
+      <w:r>
+        <w:t>proident</w:t>
+      </w:r>
+      <w:proofErr w:type="spellEnd"/>
+      <w:r>
+        <w:t xml:space="preserve"> blog bespoke </w:t>
+      </w:r>
+      <w:proofErr w:type="spellStart"/>
+      <w:r>
+        <w:t>commodo</w:t>
+      </w:r>
+      <w:proofErr w:type="spellEnd"/>
+      <w:r>
+        <w:t xml:space="preserve"> tilde hammock </w:t>
+      </w:r>
+      <w:proofErr w:type="spellStart"/>
+      <w:r>
+        <w:t>taiyaki</w:t>
+      </w:r>
+      <w:proofErr w:type="spellEnd"/>
+      <w:r>
+        <w:t xml:space="preserve"> wayfarers gentrify. Cardigan ugh slow-carb, </w:t>
+      </w:r>
+      <w:proofErr w:type="spellStart"/>
+      <w:r>
+        <w:t>ea</w:t>
+      </w:r>
+      <w:proofErr w:type="spellEnd"/>
+      <w:r>
+        <w:t xml:space="preserve"> DIY hot chicken </w:t>
+      </w:r>
+      <w:proofErr w:type="spellStart"/>
+      <w:r>
+        <w:t>commodo</w:t>
+      </w:r>
+      <w:proofErr w:type="spellEnd"/>
+      <w:r>
+        <w:t xml:space="preserve"> </w:t>
+      </w:r>
+      <w:proofErr w:type="spellStart"/>
+      <w:proofErr w:type="gramStart"/>
+      <w:r>
+        <w:t>godard</w:t>
+      </w:r>
+      <w:proofErr w:type="spellEnd"/>
+      <w:proofErr w:type="gramEnd"/>
+      <w:r>
+        <w:t xml:space="preserve">. Lorem </w:t>
+      </w:r>
+      <w:proofErr w:type="spellStart"/>
+      <w:r>
+        <w:t>sint</w:t>
+      </w:r>
+      <w:proofErr w:type="spellEnd"/>
+      <w:r>
+        <w:t xml:space="preserve"> qui 3 wolf moon </w:t>
+      </w:r>
+      <w:proofErr w:type="spellStart"/>
+      <w:r>
+        <w:t>enim</w:t>
+      </w:r>
+      <w:proofErr w:type="spellEnd"/>
+      <w:r>
+        <w:t xml:space="preserve"> </w:t>
+      </w:r>
+      <w:proofErr w:type="spellStart"/>
+      <w:r>
+        <w:t>voluptate</w:t>
+      </w:r>
+      <w:proofErr w:type="spellEnd"/>
+      <w:r>
+        <w:t xml:space="preserve">, </w:t>
+      </w:r>
+      <w:proofErr w:type="spellStart"/>
+      <w:r>
+        <w:t>velit</w:t>
+      </w:r>
+      <w:proofErr w:type="spellEnd"/>
+      <w:r>
+        <w:t xml:space="preserve"> </w:t>
+      </w:r>
+      <w:proofErr w:type="spellStart"/>
+      <w:r>
+        <w:t>veniam</w:t>
+      </w:r>
+      <w:proofErr w:type="spellEnd"/>
+      <w:r>
+        <w:t xml:space="preserve">. Fanny pack man bun </w:t>
+      </w:r>
+      <w:proofErr w:type="spellStart"/>
+      <w:r>
+        <w:t>helvetica</w:t>
+      </w:r>
+      <w:proofErr w:type="spellEnd"/>
+      <w:r>
+        <w:t xml:space="preserve"> viral, </w:t>
+      </w:r>
+      <w:proofErr w:type="spellStart"/>
+      <w:proofErr w:type="gramStart"/>
+      <w:r>
+        <w:t>edison</w:t>
+      </w:r>
+      <w:proofErr w:type="spellEnd"/>
+      <w:proofErr w:type="gramEnd"/>
+      <w:r>
+        <w:t xml:space="preserve"> bulb </w:t>
+      </w:r>
+      <w:proofErr w:type="spellStart"/>
+      <w:r>
+        <w:t>cliche</w:t>
+      </w:r>
+      <w:proofErr w:type="spellEnd"/>
+      <w:r>
+        <w:t xml:space="preserve"> </w:t>
+      </w:r>
+      <w:proofErr w:type="spellStart"/>
+      <w:r>
+        <w:t>jianbing</w:t>
+      </w:r>
+      <w:proofErr w:type="spellEnd"/>
+      <w:r>
+        <w:t>.</w:t>
       </w:r>
     </w:p>
     <w:p>
@@ -2811,7 +4953,187 @@
         <w:keepNext/>
       </w:pPr>
       <w:r>
-        <w:t>Craft beer sartorial copper mug tbh jianbing, locavore VHS salvia +1 vegan gluten-free kogi pug vexillologist affogato. Fanny pack palo santo proident blog bespoke commodo tilde hammock taiyaki wayfarers gentrify. Cardigan ugh slow-carb, ea DIY hot chicken commodo godard. Lorem sint qui 3 wolf moon enim voluptate, velit veniam. Fanny pack man bun helvetica viral, edison bulb cliche jianbing.</w:t>
+        <w:t xml:space="preserve">Craft beer sartorial copper mug </w:t>
+      </w:r>
+      <w:proofErr w:type="spellStart"/>
+      <w:r>
+        <w:t>tbh</w:t>
+      </w:r>
+      <w:proofErr w:type="spellEnd"/>
+      <w:r>
+        <w:t xml:space="preserve"> </w:t>
+      </w:r>
+      <w:proofErr w:type="spellStart"/>
+      <w:r>
+        <w:t>jianbing</w:t>
+      </w:r>
+      <w:proofErr w:type="spellEnd"/>
+      <w:r>
+        <w:t xml:space="preserve">, locavore VHS salvia +1 vegan gluten-free </w:t>
+      </w:r>
+      <w:proofErr w:type="spellStart"/>
+      <w:r>
+        <w:t>kogi</w:t>
+      </w:r>
+      <w:proofErr w:type="spellEnd"/>
+      <w:r>
+        <w:t xml:space="preserve"> pug </w:t>
+      </w:r>
+      <w:proofErr w:type="spellStart"/>
+      <w:r>
+        <w:t>vexillologist</w:t>
+      </w:r>
+      <w:proofErr w:type="spellEnd"/>
+      <w:r>
+        <w:t xml:space="preserve"> </w:t>
+      </w:r>
+      <w:proofErr w:type="spellStart"/>
+      <w:r>
+        <w:t>affogato</w:t>
+      </w:r>
+      <w:proofErr w:type="spellEnd"/>
+      <w:r>
+        <w:t xml:space="preserve">. Fanny pack </w:t>
+      </w:r>
+      <w:proofErr w:type="spellStart"/>
+      <w:r>
+        <w:t>palo</w:t>
+      </w:r>
+      <w:proofErr w:type="spellEnd"/>
+      <w:r>
+        <w:t xml:space="preserve"> </w:t>
+      </w:r>
+      <w:proofErr w:type="spellStart"/>
+      <w:r>
+        <w:t>santo</w:t>
+      </w:r>
+      <w:proofErr w:type="spellEnd"/>
+      <w:r>
+        <w:t xml:space="preserve"> </w:t>
+      </w:r>
+      <w:proofErr w:type="spellStart"/>
+      <w:r>
+        <w:t>proident</w:t>
+      </w:r>
+      <w:proofErr w:type="spellEnd"/>
+      <w:r>
+        <w:t xml:space="preserve"> blog bespoke </w:t>
+      </w:r>
+      <w:proofErr w:type="spellStart"/>
+      <w:r>
+        <w:t>commodo</w:t>
+      </w:r>
+      <w:proofErr w:type="spellEnd"/>
+      <w:r>
+        <w:t xml:space="preserve"> tilde hammock </w:t>
+      </w:r>
+      <w:proofErr w:type="spellStart"/>
+      <w:r>
+        <w:t>taiyaki</w:t>
+      </w:r>
+      <w:proofErr w:type="spellEnd"/>
+      <w:r>
+        <w:t xml:space="preserve"> wayfarers gentrify. Cardigan ugh slow-carb, </w:t>
+      </w:r>
+      <w:proofErr w:type="spellStart"/>
+      <w:r>
+        <w:t>ea</w:t>
+      </w:r>
+      <w:proofErr w:type="spellEnd"/>
+      <w:r>
+        <w:t xml:space="preserve"> DIY hot chicken </w:t>
+      </w:r>
+      <w:proofErr w:type="spellStart"/>
+      <w:r>
+        <w:t>commodo</w:t>
+      </w:r>
+      <w:proofErr w:type="spellEnd"/>
+      <w:r>
+        <w:t xml:space="preserve"> </w:t>
+      </w:r>
+      <w:proofErr w:type="spellStart"/>
+      <w:proofErr w:type="gramStart"/>
+      <w:r>
+        <w:t>godard</w:t>
+      </w:r>
+      <w:proofErr w:type="spellEnd"/>
+      <w:proofErr w:type="gramEnd"/>
+      <w:r>
+        <w:t xml:space="preserve">. Lorem </w:t>
+      </w:r>
+      <w:proofErr w:type="spellStart"/>
+      <w:r>
+        <w:t>sint</w:t>
+      </w:r>
+      <w:proofErr w:type="spellEnd"/>
+      <w:r>
+        <w:t xml:space="preserve"> qui 3 wolf moon </w:t>
+      </w:r>
+      <w:proofErr w:type="spellStart"/>
+      <w:r>
+        <w:t>enim</w:t>
+      </w:r>
+      <w:proofErr w:type="spellEnd"/>
+      <w:r>
+        <w:t xml:space="preserve"> </w:t>
+      </w:r>
+      <w:proofErr w:type="spellStart"/>
+      <w:r>
+        <w:t>voluptate</w:t>
+      </w:r>
+      <w:proofErr w:type="spellEnd"/>
+      <w:r>
+        <w:t xml:space="preserve">, </w:t>
+      </w:r>
+      <w:proofErr w:type="spellStart"/>
+      <w:r>
+        <w:t>velit</w:t>
+      </w:r>
+      <w:proofErr w:type="spellEnd"/>
+      <w:r>
+        <w:t xml:space="preserve"> </w:t>
+      </w:r>
+      <w:proofErr w:type="spellStart"/>
+      <w:r>
+        <w:t>veniam</w:t>
+      </w:r>
+      <w:proofErr w:type="spellEnd"/>
+      <w:r>
+        <w:t xml:space="preserve">. Fanny pack man bun </w:t>
+      </w:r>
+      <w:proofErr w:type="spellStart"/>
+      <w:r>
+        <w:t>helvetica</w:t>
+      </w:r>
+      <w:proofErr w:type="spellEnd"/>
+      <w:r>
+        <w:t xml:space="preserve"> viral, </w:t>
+      </w:r>
+      <w:proofErr w:type="spellStart"/>
+      <w:proofErr w:type="gramStart"/>
+      <w:r>
+        <w:t>edison</w:t>
+      </w:r>
+      <w:proofErr w:type="spellEnd"/>
+      <w:proofErr w:type="gramEnd"/>
+      <w:r>
+        <w:t xml:space="preserve"> bulb </w:t>
+      </w:r>
+      <w:proofErr w:type="spellStart"/>
+      <w:r>
+        <w:t>cliche</w:t>
+      </w:r>
+      <w:proofErr w:type="spellEnd"/>
+      <w:r>
+        <w:t xml:space="preserve"> </w:t>
+      </w:r>
+      <w:proofErr w:type="spellStart"/>
+      <w:r>
+        <w:t>jianbing</w:t>
+      </w:r>
+      <w:proofErr w:type="spellEnd"/>
+      <w:r>
+        <w:t>.</w:t>
       </w:r>
     </w:p>
     <w:p>
@@ -2875,14 +5197,27 @@
       <w:r>
         <w:t xml:space="preserve">Figure </w:t>
       </w:r>
-      <w:fldSimple w:instr=" SEQ Figure \* ARABIC ">
-        <w:r>
-          <w:rPr>
-            <w:noProof/>
-          </w:rPr>
-          <w:t>12</w:t>
-        </w:r>
-      </w:fldSimple>
+      <w:r>
+        <w:fldChar w:fldCharType="begin"/>
+      </w:r>
+      <w:r>
+        <w:instrText xml:space="preserve"> SEQ Figure \* ARABIC </w:instrText>
+      </w:r>
+      <w:r>
+        <w:fldChar w:fldCharType="separate"/>
+      </w:r>
+      <w:r>
+        <w:rPr>
+          <w:noProof/>
+        </w:rPr>
+        <w:t>12</w:t>
+      </w:r>
+      <w:r>
+        <w:rPr>
+          <w:noProof/>
+        </w:rPr>
+        <w:fldChar w:fldCharType="end"/>
+      </w:r>
       <w:r>
         <w:t>: Tournament Place Standings</w:t>
       </w:r>
@@ -2902,7 +5237,187 @@
         <w:keepNext/>
       </w:pPr>
       <w:r>
-        <w:t>Craft beer sartorial copper mug tbh jianbing, locavore VHS salvia +1 vegan gluten-free kogi pug vexillologist affogato. Fanny pack palo santo proident blog bespoke commodo tilde hammock taiyaki wayfarers gentrify. Cardigan ugh slow-carb, ea DIY hot chicken commodo godard. Lorem sint qui 3 wolf moon enim voluptate, velit veniam. Fanny pack man bun helvetica viral, edison bulb cliche jianbing.</w:t>
+        <w:t xml:space="preserve">Craft beer sartorial copper mug </w:t>
+      </w:r>
+      <w:proofErr w:type="spellStart"/>
+      <w:r>
+        <w:t>tbh</w:t>
+      </w:r>
+      <w:proofErr w:type="spellEnd"/>
+      <w:r>
+        <w:t xml:space="preserve"> </w:t>
+      </w:r>
+      <w:proofErr w:type="spellStart"/>
+      <w:r>
+        <w:t>jianbing</w:t>
+      </w:r>
+      <w:proofErr w:type="spellEnd"/>
+      <w:r>
+        <w:t xml:space="preserve">, locavore VHS salvia +1 vegan gluten-free </w:t>
+      </w:r>
+      <w:proofErr w:type="spellStart"/>
+      <w:r>
+        <w:t>kogi</w:t>
+      </w:r>
+      <w:proofErr w:type="spellEnd"/>
+      <w:r>
+        <w:t xml:space="preserve"> pug </w:t>
+      </w:r>
+      <w:proofErr w:type="spellStart"/>
+      <w:r>
+        <w:t>vexillologist</w:t>
+      </w:r>
+      <w:proofErr w:type="spellEnd"/>
+      <w:r>
+        <w:t xml:space="preserve"> </w:t>
+      </w:r>
+      <w:proofErr w:type="spellStart"/>
+      <w:r>
+        <w:t>affogato</w:t>
+      </w:r>
+      <w:proofErr w:type="spellEnd"/>
+      <w:r>
+        <w:t xml:space="preserve">. Fanny pack </w:t>
+      </w:r>
+      <w:proofErr w:type="spellStart"/>
+      <w:r>
+        <w:t>palo</w:t>
+      </w:r>
+      <w:proofErr w:type="spellEnd"/>
+      <w:r>
+        <w:t xml:space="preserve"> </w:t>
+      </w:r>
+      <w:proofErr w:type="spellStart"/>
+      <w:r>
+        <w:t>santo</w:t>
+      </w:r>
+      <w:proofErr w:type="spellEnd"/>
+      <w:r>
+        <w:t xml:space="preserve"> </w:t>
+      </w:r>
+      <w:proofErr w:type="spellStart"/>
+      <w:r>
+        <w:t>proident</w:t>
+      </w:r>
+      <w:proofErr w:type="spellEnd"/>
+      <w:r>
+        <w:t xml:space="preserve"> blog bespoke </w:t>
+      </w:r>
+      <w:proofErr w:type="spellStart"/>
+      <w:r>
+        <w:t>commodo</w:t>
+      </w:r>
+      <w:proofErr w:type="spellEnd"/>
+      <w:r>
+        <w:t xml:space="preserve"> tilde hammock </w:t>
+      </w:r>
+      <w:proofErr w:type="spellStart"/>
+      <w:r>
+        <w:t>taiyaki</w:t>
+      </w:r>
+      <w:proofErr w:type="spellEnd"/>
+      <w:r>
+        <w:t xml:space="preserve"> wayfarers gentrify. Cardigan ugh slow-carb, </w:t>
+      </w:r>
+      <w:proofErr w:type="spellStart"/>
+      <w:r>
+        <w:t>ea</w:t>
+      </w:r>
+      <w:proofErr w:type="spellEnd"/>
+      <w:r>
+        <w:t xml:space="preserve"> DIY hot chicken </w:t>
+      </w:r>
+      <w:proofErr w:type="spellStart"/>
+      <w:r>
+        <w:t>commodo</w:t>
+      </w:r>
+      <w:proofErr w:type="spellEnd"/>
+      <w:r>
+        <w:t xml:space="preserve"> </w:t>
+      </w:r>
+      <w:proofErr w:type="spellStart"/>
+      <w:proofErr w:type="gramStart"/>
+      <w:r>
+        <w:t>godard</w:t>
+      </w:r>
+      <w:proofErr w:type="spellEnd"/>
+      <w:proofErr w:type="gramEnd"/>
+      <w:r>
+        <w:t xml:space="preserve">. Lorem </w:t>
+      </w:r>
+      <w:proofErr w:type="spellStart"/>
+      <w:r>
+        <w:t>sint</w:t>
+      </w:r>
+      <w:proofErr w:type="spellEnd"/>
+      <w:r>
+        <w:t xml:space="preserve"> qui 3 wolf moon </w:t>
+      </w:r>
+      <w:proofErr w:type="spellStart"/>
+      <w:r>
+        <w:t>enim</w:t>
+      </w:r>
+      <w:proofErr w:type="spellEnd"/>
+      <w:r>
+        <w:t xml:space="preserve"> </w:t>
+      </w:r>
+      <w:proofErr w:type="spellStart"/>
+      <w:r>
+        <w:t>voluptate</w:t>
+      </w:r>
+      <w:proofErr w:type="spellEnd"/>
+      <w:r>
+        <w:t xml:space="preserve">, </w:t>
+      </w:r>
+      <w:proofErr w:type="spellStart"/>
+      <w:r>
+        <w:t>velit</w:t>
+      </w:r>
+      <w:proofErr w:type="spellEnd"/>
+      <w:r>
+        <w:t xml:space="preserve"> </w:t>
+      </w:r>
+      <w:proofErr w:type="spellStart"/>
+      <w:r>
+        <w:t>veniam</w:t>
+      </w:r>
+      <w:proofErr w:type="spellEnd"/>
+      <w:r>
+        <w:t xml:space="preserve">. Fanny pack man bun </w:t>
+      </w:r>
+      <w:proofErr w:type="spellStart"/>
+      <w:r>
+        <w:t>helvetica</w:t>
+      </w:r>
+      <w:proofErr w:type="spellEnd"/>
+      <w:r>
+        <w:t xml:space="preserve"> viral, </w:t>
+      </w:r>
+      <w:proofErr w:type="spellStart"/>
+      <w:proofErr w:type="gramStart"/>
+      <w:r>
+        <w:t>edison</w:t>
+      </w:r>
+      <w:proofErr w:type="spellEnd"/>
+      <w:proofErr w:type="gramEnd"/>
+      <w:r>
+        <w:t xml:space="preserve"> bulb </w:t>
+      </w:r>
+      <w:proofErr w:type="spellStart"/>
+      <w:r>
+        <w:t>cliche</w:t>
+      </w:r>
+      <w:proofErr w:type="spellEnd"/>
+      <w:r>
+        <w:t xml:space="preserve"> </w:t>
+      </w:r>
+      <w:proofErr w:type="spellStart"/>
+      <w:r>
+        <w:t>jianbing</w:t>
+      </w:r>
+      <w:proofErr w:type="spellEnd"/>
+      <w:r>
+        <w:t>.</w:t>
       </w:r>
     </w:p>
     <w:p>
@@ -2981,16 +5496,40 @@
       <w:r>
         <w:t xml:space="preserve">Figure </w:t>
       </w:r>
-      <w:fldSimple w:instr=" SEQ Figure \* ARABIC ">
-        <w:r>
-          <w:rPr>
-            <w:noProof/>
-          </w:rPr>
-          <w:t>13</w:t>
-        </w:r>
-      </w:fldSimple>
-      <w:r>
-        <w:t>: Creat/Edit Tournament Form</w:t>
+      <w:r>
+        <w:fldChar w:fldCharType="begin"/>
+      </w:r>
+      <w:r>
+        <w:instrText xml:space="preserve"> </w:instrText>
+      </w:r>
+      <w:r>
+        <w:instrText xml:space="preserve">SEQ Figure \* ARABIC </w:instrText>
+      </w:r>
+      <w:r>
+        <w:fldChar w:fldCharType="separate"/>
+      </w:r>
+      <w:r>
+        <w:rPr>
+          <w:noProof/>
+        </w:rPr>
+        <w:t>13</w:t>
+      </w:r>
+      <w:r>
+        <w:rPr>
+          <w:noProof/>
+        </w:rPr>
+        <w:fldChar w:fldCharType="end"/>
+      </w:r>
+      <w:r>
+        <w:t xml:space="preserve">: </w:t>
+      </w:r>
+      <w:proofErr w:type="spellStart"/>
+      <w:r>
+        <w:t>Creat</w:t>
+      </w:r>
+      <w:proofErr w:type="spellEnd"/>
+      <w:r>
+        <w:t>/Edit Tournament Form</w:t>
       </w:r>
     </w:p>
     <w:p>
@@ -3008,7 +5547,187 @@
         <w:keepNext/>
       </w:pPr>
       <w:r>
-        <w:t>Craft beer sartorial copper mug tbh jianbing, locavore VHS salvia +1 vegan gluten-free kogi pug vexillologist affogato. Fanny pack palo santo proident blog bespoke commodo tilde hammock taiyaki wayfarers gentrify. Cardigan ugh slow-carb, ea DIY hot chicken commodo godard. Lorem sint qui 3 wolf moon enim voluptate, velit veniam. Fanny pack man bun helvetica viral, edison bulb cliche jianbing.</w:t>
+        <w:t xml:space="preserve">Craft beer sartorial copper mug </w:t>
+      </w:r>
+      <w:proofErr w:type="spellStart"/>
+      <w:r>
+        <w:t>tbh</w:t>
+      </w:r>
+      <w:proofErr w:type="spellEnd"/>
+      <w:r>
+        <w:t xml:space="preserve"> </w:t>
+      </w:r>
+      <w:proofErr w:type="spellStart"/>
+      <w:r>
+        <w:t>jianbing</w:t>
+      </w:r>
+      <w:proofErr w:type="spellEnd"/>
+      <w:r>
+        <w:t xml:space="preserve">, locavore VHS salvia +1 vegan gluten-free </w:t>
+      </w:r>
+      <w:proofErr w:type="spellStart"/>
+      <w:r>
+        <w:t>kogi</w:t>
+      </w:r>
+      <w:proofErr w:type="spellEnd"/>
+      <w:r>
+        <w:t xml:space="preserve"> pug </w:t>
+      </w:r>
+      <w:proofErr w:type="spellStart"/>
+      <w:r>
+        <w:t>vexillologist</w:t>
+      </w:r>
+      <w:proofErr w:type="spellEnd"/>
+      <w:r>
+        <w:t xml:space="preserve"> </w:t>
+      </w:r>
+      <w:proofErr w:type="spellStart"/>
+      <w:r>
+        <w:t>affogato</w:t>
+      </w:r>
+      <w:proofErr w:type="spellEnd"/>
+      <w:r>
+        <w:t xml:space="preserve">. Fanny pack </w:t>
+      </w:r>
+      <w:proofErr w:type="spellStart"/>
+      <w:r>
+        <w:t>palo</w:t>
+      </w:r>
+      <w:proofErr w:type="spellEnd"/>
+      <w:r>
+        <w:t xml:space="preserve"> </w:t>
+      </w:r>
+      <w:proofErr w:type="spellStart"/>
+      <w:r>
+        <w:t>santo</w:t>
+      </w:r>
+      <w:proofErr w:type="spellEnd"/>
+      <w:r>
+        <w:t xml:space="preserve"> </w:t>
+      </w:r>
+      <w:proofErr w:type="spellStart"/>
+      <w:r>
+        <w:t>proident</w:t>
+      </w:r>
+      <w:proofErr w:type="spellEnd"/>
+      <w:r>
+        <w:t xml:space="preserve"> blog bespoke </w:t>
+      </w:r>
+      <w:proofErr w:type="spellStart"/>
+      <w:r>
+        <w:t>commodo</w:t>
+      </w:r>
+      <w:proofErr w:type="spellEnd"/>
+      <w:r>
+        <w:t xml:space="preserve"> tilde hammock </w:t>
+      </w:r>
+      <w:proofErr w:type="spellStart"/>
+      <w:r>
+        <w:t>taiyaki</w:t>
+      </w:r>
+      <w:proofErr w:type="spellEnd"/>
+      <w:r>
+        <w:t xml:space="preserve"> wayfarers gentrify. Cardigan ugh slow-carb, </w:t>
+      </w:r>
+      <w:proofErr w:type="spellStart"/>
+      <w:r>
+        <w:t>ea</w:t>
+      </w:r>
+      <w:proofErr w:type="spellEnd"/>
+      <w:r>
+        <w:t xml:space="preserve"> DIY hot chicken </w:t>
+      </w:r>
+      <w:proofErr w:type="spellStart"/>
+      <w:r>
+        <w:t>commodo</w:t>
+      </w:r>
+      <w:proofErr w:type="spellEnd"/>
+      <w:r>
+        <w:t xml:space="preserve"> </w:t>
+      </w:r>
+      <w:proofErr w:type="spellStart"/>
+      <w:proofErr w:type="gramStart"/>
+      <w:r>
+        <w:t>godard</w:t>
+      </w:r>
+      <w:proofErr w:type="spellEnd"/>
+      <w:proofErr w:type="gramEnd"/>
+      <w:r>
+        <w:t xml:space="preserve">. Lorem </w:t>
+      </w:r>
+      <w:proofErr w:type="spellStart"/>
+      <w:r>
+        <w:t>sint</w:t>
+      </w:r>
+      <w:proofErr w:type="spellEnd"/>
+      <w:r>
+        <w:t xml:space="preserve"> qui 3 wolf moon </w:t>
+      </w:r>
+      <w:proofErr w:type="spellStart"/>
+      <w:r>
+        <w:t>enim</w:t>
+      </w:r>
+      <w:proofErr w:type="spellEnd"/>
+      <w:r>
+        <w:t xml:space="preserve"> </w:t>
+      </w:r>
+      <w:proofErr w:type="spellStart"/>
+      <w:r>
+        <w:t>voluptate</w:t>
+      </w:r>
+      <w:proofErr w:type="spellEnd"/>
+      <w:r>
+        <w:t xml:space="preserve">, </w:t>
+      </w:r>
+      <w:proofErr w:type="spellStart"/>
+      <w:r>
+        <w:t>velit</w:t>
+      </w:r>
+      <w:proofErr w:type="spellEnd"/>
+      <w:r>
+        <w:t xml:space="preserve"> </w:t>
+      </w:r>
+      <w:proofErr w:type="spellStart"/>
+      <w:r>
+        <w:t>veniam</w:t>
+      </w:r>
+      <w:proofErr w:type="spellEnd"/>
+      <w:r>
+        <w:t xml:space="preserve">. Fanny pack man bun </w:t>
+      </w:r>
+      <w:proofErr w:type="spellStart"/>
+      <w:r>
+        <w:t>helvetica</w:t>
+      </w:r>
+      <w:proofErr w:type="spellEnd"/>
+      <w:r>
+        <w:t xml:space="preserve"> viral, </w:t>
+      </w:r>
+      <w:proofErr w:type="spellStart"/>
+      <w:proofErr w:type="gramStart"/>
+      <w:r>
+        <w:t>edison</w:t>
+      </w:r>
+      <w:proofErr w:type="spellEnd"/>
+      <w:proofErr w:type="gramEnd"/>
+      <w:r>
+        <w:t xml:space="preserve"> bulb </w:t>
+      </w:r>
+      <w:proofErr w:type="spellStart"/>
+      <w:r>
+        <w:t>cliche</w:t>
+      </w:r>
+      <w:proofErr w:type="spellEnd"/>
+      <w:r>
+        <w:t xml:space="preserve"> </w:t>
+      </w:r>
+      <w:proofErr w:type="spellStart"/>
+      <w:r>
+        <w:t>jianbing</w:t>
+      </w:r>
+      <w:proofErr w:type="spellEnd"/>
+      <w:r>
+        <w:t>.</w:t>
       </w:r>
     </w:p>
     <w:p>
@@ -3063,7 +5782,6 @@
           </wp:inline>
         </w:drawing>
       </w:r>
-      <w:bookmarkStart w:id="0" w:name="_GoBack"/>
       <w:r>
         <w:rPr>
           <w:noProof/>
@@ -3110,7 +5828,290 @@
           </wp:inline>
         </w:drawing>
       </w:r>
-      <w:bookmarkEnd w:id="0"/>
+    </w:p>
+    <w:p>
+      <w:pPr>
+        <w:pStyle w:val="Caption"/>
+        <w:jc w:val="center"/>
+      </w:pPr>
+      <w:r>
+        <w:t xml:space="preserve">Figure </w:t>
+      </w:r>
+      <w:r>
+        <w:fldChar w:fldCharType="begin"/>
+      </w:r>
+      <w:r>
+        <w:instrText xml:space="preserve"> SEQ Figure \* ARABIC </w:instrText>
+      </w:r>
+      <w:r>
+        <w:fldChar w:fldCharType="separate"/>
+      </w:r>
+      <w:r>
+        <w:rPr>
+          <w:noProof/>
+        </w:rPr>
+        <w:t>14</w:t>
+      </w:r>
+      <w:r>
+        <w:rPr>
+          <w:noProof/>
+        </w:rPr>
+        <w:fldChar w:fldCharType="end"/>
+      </w:r>
+      <w:r>
+        <w:t>: Tournament Search Forms</w:t>
+      </w:r>
+    </w:p>
+    <w:p>
+      <w:pPr>
+        <w:pStyle w:val="Heading2"/>
+      </w:pPr>
+      <w:r>
+        <w:lastRenderedPageBreak/>
+        <w:t>List Tournaments by year</w:t>
+      </w:r>
+    </w:p>
+    <w:p>
+      <w:pPr>
+        <w:pStyle w:val="BodyText"/>
+        <w:keepNext/>
+      </w:pPr>
+      <w:r>
+        <w:t xml:space="preserve">Craft beer sartorial copper mug </w:t>
+      </w:r>
+      <w:proofErr w:type="spellStart"/>
+      <w:r>
+        <w:t>tbh</w:t>
+      </w:r>
+      <w:proofErr w:type="spellEnd"/>
+      <w:r>
+        <w:t xml:space="preserve"> </w:t>
+      </w:r>
+      <w:proofErr w:type="spellStart"/>
+      <w:r>
+        <w:t>jianbing</w:t>
+      </w:r>
+      <w:proofErr w:type="spellEnd"/>
+      <w:r>
+        <w:t xml:space="preserve">, locavore VHS salvia +1 vegan gluten-free </w:t>
+      </w:r>
+      <w:proofErr w:type="spellStart"/>
+      <w:r>
+        <w:t>kogi</w:t>
+      </w:r>
+      <w:proofErr w:type="spellEnd"/>
+      <w:r>
+        <w:t xml:space="preserve"> pug </w:t>
+      </w:r>
+      <w:proofErr w:type="spellStart"/>
+      <w:r>
+        <w:t>vexillologist</w:t>
+      </w:r>
+      <w:proofErr w:type="spellEnd"/>
+      <w:r>
+        <w:t xml:space="preserve"> </w:t>
+      </w:r>
+      <w:proofErr w:type="spellStart"/>
+      <w:r>
+        <w:t>affogato</w:t>
+      </w:r>
+      <w:proofErr w:type="spellEnd"/>
+      <w:r>
+        <w:t xml:space="preserve">. Fanny pack </w:t>
+      </w:r>
+      <w:proofErr w:type="spellStart"/>
+      <w:r>
+        <w:t>palo</w:t>
+      </w:r>
+      <w:proofErr w:type="spellEnd"/>
+      <w:r>
+        <w:t xml:space="preserve"> </w:t>
+      </w:r>
+      <w:proofErr w:type="spellStart"/>
+      <w:r>
+        <w:t>santo</w:t>
+      </w:r>
+      <w:proofErr w:type="spellEnd"/>
+      <w:r>
+        <w:t xml:space="preserve"> </w:t>
+      </w:r>
+      <w:proofErr w:type="spellStart"/>
+      <w:r>
+        <w:t>proident</w:t>
+      </w:r>
+      <w:proofErr w:type="spellEnd"/>
+      <w:r>
+        <w:t xml:space="preserve"> blog bespoke </w:t>
+      </w:r>
+      <w:proofErr w:type="spellStart"/>
+      <w:r>
+        <w:t>commodo</w:t>
+      </w:r>
+      <w:proofErr w:type="spellEnd"/>
+      <w:r>
+        <w:t xml:space="preserve"> tilde hammock </w:t>
+      </w:r>
+      <w:proofErr w:type="spellStart"/>
+      <w:r>
+        <w:t>taiyaki</w:t>
+      </w:r>
+      <w:proofErr w:type="spellEnd"/>
+      <w:r>
+        <w:t xml:space="preserve"> wayfarers gentrify. Cardigan ugh slow-carb, </w:t>
+      </w:r>
+      <w:proofErr w:type="spellStart"/>
+      <w:r>
+        <w:t>ea</w:t>
+      </w:r>
+      <w:proofErr w:type="spellEnd"/>
+      <w:r>
+        <w:t xml:space="preserve"> DIY hot chicken </w:t>
+      </w:r>
+      <w:proofErr w:type="spellStart"/>
+      <w:r>
+        <w:t>commodo</w:t>
+      </w:r>
+      <w:proofErr w:type="spellEnd"/>
+      <w:r>
+        <w:t xml:space="preserve"> </w:t>
+      </w:r>
+      <w:proofErr w:type="spellStart"/>
+      <w:proofErr w:type="gramStart"/>
+      <w:r>
+        <w:t>godard</w:t>
+      </w:r>
+      <w:proofErr w:type="spellEnd"/>
+      <w:proofErr w:type="gramEnd"/>
+      <w:r>
+        <w:t xml:space="preserve">. Lorem </w:t>
+      </w:r>
+      <w:proofErr w:type="spellStart"/>
+      <w:r>
+        <w:t>sint</w:t>
+      </w:r>
+      <w:proofErr w:type="spellEnd"/>
+      <w:r>
+        <w:t xml:space="preserve"> qui 3 wolf moon </w:t>
+      </w:r>
+      <w:proofErr w:type="spellStart"/>
+      <w:r>
+        <w:t>enim</w:t>
+      </w:r>
+      <w:proofErr w:type="spellEnd"/>
+      <w:r>
+        <w:t xml:space="preserve"> </w:t>
+      </w:r>
+      <w:proofErr w:type="spellStart"/>
+      <w:r>
+        <w:t>voluptate</w:t>
+      </w:r>
+      <w:proofErr w:type="spellEnd"/>
+      <w:r>
+        <w:t xml:space="preserve">, </w:t>
+      </w:r>
+      <w:proofErr w:type="spellStart"/>
+      <w:r>
+        <w:t>velit</w:t>
+      </w:r>
+      <w:proofErr w:type="spellEnd"/>
+      <w:r>
+        <w:t xml:space="preserve"> </w:t>
+      </w:r>
+      <w:proofErr w:type="spellStart"/>
+      <w:r>
+        <w:t>veniam</w:t>
+      </w:r>
+      <w:proofErr w:type="spellEnd"/>
+      <w:r>
+        <w:t xml:space="preserve">. Fanny pack man bun </w:t>
+      </w:r>
+      <w:proofErr w:type="spellStart"/>
+      <w:r>
+        <w:t>helvetica</w:t>
+      </w:r>
+      <w:proofErr w:type="spellEnd"/>
+      <w:r>
+        <w:t xml:space="preserve"> viral, </w:t>
+      </w:r>
+      <w:proofErr w:type="spellStart"/>
+      <w:proofErr w:type="gramStart"/>
+      <w:r>
+        <w:t>edison</w:t>
+      </w:r>
+      <w:proofErr w:type="spellEnd"/>
+      <w:proofErr w:type="gramEnd"/>
+      <w:r>
+        <w:t xml:space="preserve"> bulb </w:t>
+      </w:r>
+      <w:proofErr w:type="spellStart"/>
+      <w:r>
+        <w:t>cliche</w:t>
+      </w:r>
+      <w:proofErr w:type="spellEnd"/>
+      <w:r>
+        <w:t xml:space="preserve"> </w:t>
+      </w:r>
+      <w:proofErr w:type="spellStart"/>
+      <w:r>
+        <w:t>jianbing</w:t>
+      </w:r>
+      <w:proofErr w:type="spellEnd"/>
+      <w:r>
+        <w:t>.</w:t>
+      </w:r>
+    </w:p>
+    <w:p>
+      <w:pPr>
+        <w:pStyle w:val="BodyText"/>
+        <w:keepNext/>
+        <w:jc w:val="center"/>
+      </w:pPr>
+      <w:r>
+        <w:rPr>
+          <w:noProof/>
+        </w:rPr>
+        <w:drawing>
+          <wp:inline distT="0" distB="0" distL="0" distR="0">
+            <wp:extent cx="4883150" cy="3150870"/>
+            <wp:effectExtent l="0" t="0" r="0" b="0"/>
+            <wp:docPr id="1" name="Picture 1"/>
+            <wp:cNvGraphicFramePr>
+              <a:graphicFrameLocks xmlns:a="http://schemas.openxmlformats.org/drawingml/2006/main" noChangeAspect="1"/>
+            </wp:cNvGraphicFramePr>
+            <a:graphic xmlns:a="http://schemas.openxmlformats.org/drawingml/2006/main">
+              <a:graphicData uri="http://schemas.openxmlformats.org/drawingml/2006/picture">
+                <pic:pic xmlns:pic="http://schemas.openxmlformats.org/drawingml/2006/picture">
+                  <pic:nvPicPr>
+                    <pic:cNvPr id="1" name="TournamentsByYear.PNG"/>
+                    <pic:cNvPicPr/>
+                  </pic:nvPicPr>
+                  <pic:blipFill>
+                    <a:blip r:embed="rId29">
+                      <a:extLst>
+                        <a:ext uri="{28A0092B-C50C-407E-A947-70E740481C1C}">
+                          <a14:useLocalDpi xmlns:a14="http://schemas.microsoft.com/office/drawing/2010/main" val="0"/>
+                        </a:ext>
+                      </a:extLst>
+                    </a:blip>
+                    <a:stretch>
+                      <a:fillRect/>
+                    </a:stretch>
+                  </pic:blipFill>
+                  <pic:spPr>
+                    <a:xfrm>
+                      <a:off x="0" y="0"/>
+                      <a:ext cx="4883150" cy="3150870"/>
+                    </a:xfrm>
+                    <a:prstGeom prst="rect">
+                      <a:avLst/>
+                    </a:prstGeom>
+                  </pic:spPr>
+                </pic:pic>
+              </a:graphicData>
+            </a:graphic>
+          </wp:inline>
+        </w:drawing>
+      </w:r>
     </w:p>
     <w:p>
       <w:pPr>
@@ -3125,11 +6126,11 @@
           <w:rPr>
             <w:noProof/>
           </w:rPr>
-          <w:t>14</w:t>
+          <w:t>15</w:t>
         </w:r>
       </w:fldSimple>
       <w:r>
-        <w:t>: Tournament Search Forms</w:t>
+        <w:t>: Tournaments by Year</w:t>
       </w:r>
     </w:p>
     <w:p>
@@ -3137,7 +6138,7 @@
         <w:pStyle w:val="Heading2"/>
       </w:pPr>
       <w:r>
-        <w:t>List Tournaments by year</w:t>
+        <w:t>Reports</w:t>
       </w:r>
     </w:p>
     <w:p>
@@ -3146,21 +6147,207 @@
         <w:keepNext/>
       </w:pPr>
       <w:r>
-        <w:t>Craft beer sartorial copper mug tbh jianbing, locavore VHS salvia +1 vegan gluten-free kogi pug vexillologist affogato. Fanny pack palo santo proident blog bespoke commodo tilde hammock taiyaki wayfarers gentrify. Cardigan ugh slow-carb, ea DIY hot chicken commodo godard. Lorem sint qui 3 wolf moon enim voluptate, velit veniam. Fanny pack man bun helvetica viral, edison bulb cliche jianbing.</w:t>
+        <w:t xml:space="preserve">Craft beer sartorial copper mug </w:t>
+      </w:r>
+      <w:proofErr w:type="spellStart"/>
+      <w:r>
+        <w:t>tbh</w:t>
+      </w:r>
+      <w:proofErr w:type="spellEnd"/>
+      <w:r>
+        <w:t xml:space="preserve"> </w:t>
+      </w:r>
+      <w:proofErr w:type="spellStart"/>
+      <w:r>
+        <w:t>jianbing</w:t>
+      </w:r>
+      <w:proofErr w:type="spellEnd"/>
+      <w:r>
+        <w:t xml:space="preserve">, locavore VHS salvia +1 vegan gluten-free </w:t>
+      </w:r>
+      <w:proofErr w:type="spellStart"/>
+      <w:r>
+        <w:t>kogi</w:t>
+      </w:r>
+      <w:proofErr w:type="spellEnd"/>
+      <w:r>
+        <w:t xml:space="preserve"> pug </w:t>
+      </w:r>
+      <w:proofErr w:type="spellStart"/>
+      <w:r>
+        <w:t>vexillologist</w:t>
+      </w:r>
+      <w:proofErr w:type="spellEnd"/>
+      <w:r>
+        <w:t xml:space="preserve"> </w:t>
+      </w:r>
+      <w:proofErr w:type="spellStart"/>
+      <w:r>
+        <w:t>affogato</w:t>
+      </w:r>
+      <w:proofErr w:type="spellEnd"/>
+      <w:r>
+        <w:t xml:space="preserve">. Fanny pack </w:t>
+      </w:r>
+      <w:proofErr w:type="spellStart"/>
+      <w:r>
+        <w:t>palo</w:t>
+      </w:r>
+      <w:proofErr w:type="spellEnd"/>
+      <w:r>
+        <w:t xml:space="preserve"> </w:t>
+      </w:r>
+      <w:proofErr w:type="spellStart"/>
+      <w:r>
+        <w:t>santo</w:t>
+      </w:r>
+      <w:proofErr w:type="spellEnd"/>
+      <w:r>
+        <w:t xml:space="preserve"> </w:t>
+      </w:r>
+      <w:proofErr w:type="spellStart"/>
+      <w:r>
+        <w:t>proident</w:t>
+      </w:r>
+      <w:proofErr w:type="spellEnd"/>
+      <w:r>
+        <w:t xml:space="preserve"> blog bespoke </w:t>
+      </w:r>
+      <w:proofErr w:type="spellStart"/>
+      <w:r>
+        <w:t>commodo</w:t>
+      </w:r>
+      <w:proofErr w:type="spellEnd"/>
+      <w:r>
+        <w:t xml:space="preserve"> tilde hammock </w:t>
+      </w:r>
+      <w:proofErr w:type="spellStart"/>
+      <w:r>
+        <w:t>taiyaki</w:t>
+      </w:r>
+      <w:proofErr w:type="spellEnd"/>
+      <w:r>
+        <w:t xml:space="preserve"> wayfarers gentrify. Cardigan ugh slow-carb, </w:t>
+      </w:r>
+      <w:proofErr w:type="spellStart"/>
+      <w:r>
+        <w:t>ea</w:t>
+      </w:r>
+      <w:proofErr w:type="spellEnd"/>
+      <w:r>
+        <w:t xml:space="preserve"> DIY hot chicken </w:t>
+      </w:r>
+      <w:proofErr w:type="spellStart"/>
+      <w:r>
+        <w:t>commodo</w:t>
+      </w:r>
+      <w:proofErr w:type="spellEnd"/>
+      <w:r>
+        <w:t xml:space="preserve"> </w:t>
+      </w:r>
+      <w:proofErr w:type="spellStart"/>
+      <w:proofErr w:type="gramStart"/>
+      <w:r>
+        <w:t>godard</w:t>
+      </w:r>
+      <w:proofErr w:type="spellEnd"/>
+      <w:proofErr w:type="gramEnd"/>
+      <w:r>
+        <w:t xml:space="preserve">. Lorem </w:t>
+      </w:r>
+      <w:proofErr w:type="spellStart"/>
+      <w:r>
+        <w:t>sint</w:t>
+      </w:r>
+      <w:proofErr w:type="spellEnd"/>
+      <w:r>
+        <w:t xml:space="preserve"> qui 3 wolf moon </w:t>
+      </w:r>
+      <w:proofErr w:type="spellStart"/>
+      <w:r>
+        <w:t>enim</w:t>
+      </w:r>
+      <w:proofErr w:type="spellEnd"/>
+      <w:r>
+        <w:t xml:space="preserve"> </w:t>
+      </w:r>
+      <w:proofErr w:type="spellStart"/>
+      <w:r>
+        <w:t>voluptate</w:t>
+      </w:r>
+      <w:proofErr w:type="spellEnd"/>
+      <w:r>
+        <w:t xml:space="preserve">, </w:t>
+      </w:r>
+      <w:proofErr w:type="spellStart"/>
+      <w:r>
+        <w:t>velit</w:t>
+      </w:r>
+      <w:proofErr w:type="spellEnd"/>
+      <w:r>
+        <w:t xml:space="preserve"> </w:t>
+      </w:r>
+      <w:proofErr w:type="spellStart"/>
+      <w:r>
+        <w:t>veniam</w:t>
+      </w:r>
+      <w:proofErr w:type="spellEnd"/>
+      <w:r>
+        <w:t xml:space="preserve">. Fanny pack man bun </w:t>
+      </w:r>
+      <w:proofErr w:type="spellStart"/>
+      <w:r>
+        <w:t>helvetica</w:t>
+      </w:r>
+      <w:proofErr w:type="spellEnd"/>
+      <w:r>
+        <w:t xml:space="preserve"> viral, </w:t>
+      </w:r>
+      <w:proofErr w:type="spellStart"/>
+      <w:proofErr w:type="gramStart"/>
+      <w:r>
+        <w:t>edison</w:t>
+      </w:r>
+      <w:proofErr w:type="spellEnd"/>
+      <w:proofErr w:type="gramEnd"/>
+      <w:r>
+        <w:t xml:space="preserve"> bulb </w:t>
+      </w:r>
+      <w:proofErr w:type="spellStart"/>
+      <w:r>
+        <w:t>cliche</w:t>
+      </w:r>
+      <w:proofErr w:type="spellEnd"/>
+      <w:r>
+        <w:t xml:space="preserve"> </w:t>
+      </w:r>
+      <w:proofErr w:type="spellStart"/>
+      <w:r>
+        <w:t>jianbing</w:t>
+      </w:r>
+      <w:proofErr w:type="spellEnd"/>
+      <w:r>
+        <w:t>.</w:t>
       </w:r>
     </w:p>
     <w:p>
       <w:pPr>
         <w:pStyle w:val="BodyText"/>
-      </w:pPr>
+        <w:jc w:val="center"/>
+      </w:pPr>
+      <w:r>
+        <w:t>Screenshot of</w:t>
+      </w:r>
+      <w:r>
+        <w:t xml:space="preserve"> Reports dialog</w:t>
+      </w:r>
     </w:p>
     <w:p>
       <w:pPr>
         <w:pStyle w:val="Heading2"/>
       </w:pPr>
       <w:r>
-        <w:lastRenderedPageBreak/>
-        <w:t>Reports</w:t>
+        <w:t>Finalize Tournament</w:t>
       </w:r>
     </w:p>
     <w:p>
@@ -3169,50 +6356,287 @@
         <w:keepNext/>
       </w:pPr>
       <w:r>
-        <w:t>Craft beer sartorial copper mug tbh jianbing, locavore VHS salvia +1 vegan gluten-free kogi pug vexillologist affogato. Fanny pack palo santo proident blog bespoke commodo tilde hammock taiyaki wayfarers gentrify. Cardigan ugh slow-carb, ea DIY hot chicken commodo godard. Lorem sint qui 3 wolf moon enim voluptate, velit veniam. Fanny pack man bun helvetica viral, edison bulb cliche jianbing.</w:t>
+        <w:t xml:space="preserve">Craft beer sartorial copper mug </w:t>
+      </w:r>
+      <w:proofErr w:type="spellStart"/>
+      <w:r>
+        <w:t>tbh</w:t>
+      </w:r>
+      <w:proofErr w:type="spellEnd"/>
+      <w:r>
+        <w:t xml:space="preserve"> </w:t>
+      </w:r>
+      <w:proofErr w:type="spellStart"/>
+      <w:r>
+        <w:t>jianbing</w:t>
+      </w:r>
+      <w:proofErr w:type="spellEnd"/>
+      <w:r>
+        <w:t xml:space="preserve">, locavore VHS salvia +1 vegan gluten-free </w:t>
+      </w:r>
+      <w:proofErr w:type="spellStart"/>
+      <w:r>
+        <w:t>kogi</w:t>
+      </w:r>
+      <w:proofErr w:type="spellEnd"/>
+      <w:r>
+        <w:t xml:space="preserve"> pug </w:t>
+      </w:r>
+      <w:proofErr w:type="spellStart"/>
+      <w:r>
+        <w:t>vexillologist</w:t>
+      </w:r>
+      <w:proofErr w:type="spellEnd"/>
+      <w:r>
+        <w:t xml:space="preserve"> </w:t>
+      </w:r>
+      <w:proofErr w:type="spellStart"/>
+      <w:r>
+        <w:t>affogato</w:t>
+      </w:r>
+      <w:proofErr w:type="spellEnd"/>
+      <w:r>
+        <w:t xml:space="preserve">. Fanny pack </w:t>
+      </w:r>
+      <w:proofErr w:type="spellStart"/>
+      <w:r>
+        <w:t>palo</w:t>
+      </w:r>
+      <w:proofErr w:type="spellEnd"/>
+      <w:r>
+        <w:t xml:space="preserve"> </w:t>
+      </w:r>
+      <w:proofErr w:type="spellStart"/>
+      <w:r>
+        <w:t>santo</w:t>
+      </w:r>
+      <w:proofErr w:type="spellEnd"/>
+      <w:r>
+        <w:t xml:space="preserve"> </w:t>
+      </w:r>
+      <w:r>
+        <w:pgNum/>
+      </w:r>
+      <w:proofErr w:type="spellStart"/>
+      <w:r>
+        <w:t>dison</w:t>
+      </w:r>
+      <w:proofErr w:type="spellEnd"/>
+      <w:r>
+        <w:pgNum/>
+        <w:t>ca</w:t>
+      </w:r>
+      <w:r>
+        <w:t xml:space="preserve"> blog bespoke </w:t>
+      </w:r>
+      <w:proofErr w:type="spellStart"/>
+      <w:r>
+        <w:t>commodo</w:t>
+      </w:r>
+      <w:proofErr w:type="spellEnd"/>
+      <w:r>
+        <w:t xml:space="preserve"> tilde hammock </w:t>
+      </w:r>
+      <w:proofErr w:type="spellStart"/>
+      <w:r>
+        <w:t>taiyaki</w:t>
+      </w:r>
+      <w:proofErr w:type="spellEnd"/>
+      <w:r>
+        <w:t xml:space="preserve"> wayfarers gentrify. Cardigan ugh slow-carb, </w:t>
+      </w:r>
+      <w:proofErr w:type="spellStart"/>
+      <w:r>
+        <w:t>ea</w:t>
+      </w:r>
+      <w:proofErr w:type="spellEnd"/>
+      <w:r>
+        <w:t xml:space="preserve"> DIY hot chicken </w:t>
+      </w:r>
+      <w:proofErr w:type="spellStart"/>
+      <w:r>
+        <w:t>commodo</w:t>
+      </w:r>
+      <w:proofErr w:type="spellEnd"/>
+      <w:r>
+        <w:t xml:space="preserve"> </w:t>
+      </w:r>
+      <w:proofErr w:type="spellStart"/>
+      <w:proofErr w:type="gramStart"/>
+      <w:r>
+        <w:t>godard</w:t>
+      </w:r>
+      <w:proofErr w:type="spellEnd"/>
+      <w:proofErr w:type="gramEnd"/>
+      <w:r>
+        <w:t xml:space="preserve">. Lorem </w:t>
+      </w:r>
+      <w:proofErr w:type="spellStart"/>
+      <w:r>
+        <w:t>sint</w:t>
+      </w:r>
+      <w:proofErr w:type="spellEnd"/>
+      <w:r>
+        <w:t xml:space="preserve"> qui 3 wolf moon </w:t>
+      </w:r>
+      <w:proofErr w:type="spellStart"/>
+      <w:r>
+        <w:t>enim</w:t>
+      </w:r>
+      <w:proofErr w:type="spellEnd"/>
+      <w:r>
+        <w:t xml:space="preserve"> </w:t>
+      </w:r>
+      <w:proofErr w:type="spellStart"/>
+      <w:r>
+        <w:t>voluptate</w:t>
+      </w:r>
+      <w:proofErr w:type="spellEnd"/>
+      <w:r>
+        <w:t xml:space="preserve">, </w:t>
+      </w:r>
+      <w:proofErr w:type="spellStart"/>
+      <w:r>
+        <w:t>velit</w:t>
+      </w:r>
+      <w:proofErr w:type="spellEnd"/>
+      <w:r>
+        <w:t xml:space="preserve"> </w:t>
+      </w:r>
+      <w:proofErr w:type="spellStart"/>
+      <w:r>
+        <w:t>veniam</w:t>
+      </w:r>
+      <w:proofErr w:type="spellEnd"/>
+      <w:r>
+        <w:t xml:space="preserve">. Fanny pack man bun </w:t>
+      </w:r>
+      <w:proofErr w:type="spellStart"/>
+      <w:r>
+        <w:t>helvetica</w:t>
+      </w:r>
+      <w:proofErr w:type="spellEnd"/>
+      <w:r>
+        <w:t xml:space="preserve"> viral, </w:t>
+      </w:r>
+      <w:proofErr w:type="spellStart"/>
+      <w:proofErr w:type="gramStart"/>
+      <w:r>
+        <w:t>edison</w:t>
+      </w:r>
+      <w:proofErr w:type="spellEnd"/>
+      <w:proofErr w:type="gramEnd"/>
+      <w:r>
+        <w:t xml:space="preserve"> bulb </w:t>
+      </w:r>
+      <w:proofErr w:type="spellStart"/>
+      <w:r>
+        <w:t>cliche</w:t>
+      </w:r>
+      <w:proofErr w:type="spellEnd"/>
+      <w:r>
+        <w:t xml:space="preserve"> </w:t>
+      </w:r>
+      <w:proofErr w:type="spellStart"/>
+      <w:r>
+        <w:t>jianbing</w:t>
+      </w:r>
+      <w:proofErr w:type="spellEnd"/>
+      <w:r>
+        <w:t>.</w:t>
       </w:r>
     </w:p>
     <w:p>
       <w:pPr>
         <w:pStyle w:val="BodyText"/>
-      </w:pPr>
-    </w:p>
-    <w:p>
-      <w:pPr>
-        <w:pStyle w:val="Heading2"/>
-      </w:pPr>
-      <w:r>
-        <w:t>Finalize Tournament</w:t>
-      </w:r>
-    </w:p>
-    <w:p>
-      <w:pPr>
-        <w:pStyle w:val="BodyText"/>
-        <w:keepNext/>
-      </w:pPr>
-      <w:r>
-        <w:t>Craft beer sartorial copper mug tbh jianbing, locavore VHS salvia +1 vegan gluten-free kogi pug vexillologist affogato. Fanny pack palo santo proident blog bespoke commodo tilde hammock taiyaki wayfarers gentrify. Cardigan ugh slow-carb, ea DIY hot chicken commodo godard. Lorem sint qui 3 wolf moon enim voluptate, velit veniam. Fanny pack man bun helvetica viral, edison bulb cliche jianbing.</w:t>
-      </w:r>
-    </w:p>
-    <w:p>
-      <w:pPr>
-        <w:pStyle w:val="BodyText"/>
-      </w:pPr>
+        <w:jc w:val="center"/>
+      </w:pPr>
+      <w:r>
+        <w:t xml:space="preserve">Screenshot </w:t>
+      </w:r>
+      <w:r>
+        <w:t>of Finalize tournament</w:t>
+      </w:r>
+    </w:p>
+    <w:p/>
+    <w:p>
+      <w:pPr>
+        <w:pStyle w:val="PartTitle"/>
+        <w:framePr w:wrap="notBeside"/>
+      </w:pPr>
+      <w:r>
+        <w:lastRenderedPageBreak/>
+        <w:t>Chapter</w:t>
+      </w:r>
+    </w:p>
+    <w:p>
+      <w:pPr>
+        <w:pStyle w:val="PartLabel"/>
+        <w:framePr w:wrap="notBeside"/>
+      </w:pPr>
+      <w:r>
+        <w:t>4</w:t>
+      </w:r>
+    </w:p>
+    <w:p/>
+    <w:p/>
+    <w:p/>
+    <w:p/>
+    <w:p/>
+    <w:p/>
+    <w:p/>
+    <w:p/>
+    <w:p/>
+    <w:p/>
+    <w:p/>
+    <w:p>
+      <w:pPr>
+        <w:pStyle w:val="Subtitle"/>
+      </w:pPr>
+      <w:r>
+        <w:t>9-tap tour</w:t>
+      </w:r>
+    </w:p>
+    <w:p>
+      <w:pPr>
+        <w:pStyle w:val="Title"/>
+      </w:pPr>
+      <w:r>
+        <w:t>General Information</w:t>
+      </w:r>
+    </w:p>
+    <w:p>
+      <w:pPr>
+        <w:pStyle w:val="Caption"/>
+      </w:pPr>
+      <w:r>
+        <w:br w:type="page"/>
+      </w:r>
     </w:p>
     <w:p>
       <w:pPr>
         <w:pStyle w:val="Heading1"/>
-        <w:rPr>
-          <w:sz w:val="40"/>
-          <w:szCs w:val="40"/>
-        </w:rPr>
-      </w:pPr>
-      <w:r>
-        <w:rPr>
-          <w:sz w:val="40"/>
-          <w:szCs w:val="40"/>
-        </w:rPr>
-        <w:t>Setup and Installation</w:t>
+      </w:pPr>
+      <w:r>
+        <w:lastRenderedPageBreak/>
+        <w:t>System Requirements</w:t>
+      </w:r>
+    </w:p>
+    <w:p>
+      <w:pPr>
+        <w:pStyle w:val="BodyTextKeep"/>
+      </w:pPr>
+      <w:r>
+        <w:t>The s</w:t>
+      </w:r>
+      <w:r>
+        <w:t>ystem requirements to run the 9 tap software are as follows:</w:t>
+      </w:r>
+      <w:r>
+        <w:t xml:space="preserve"> Windows 10, (Windows 8, or Windows 7). Storage: how much? USB port. Dot matrix and ink/laser-jet</w:t>
+      </w:r>
+      <w:r>
+        <w:t xml:space="preserve"> printers. Microsoft Excel must be installed on the computer for the 9 Tap Tour program to work.</w:t>
       </w:r>
     </w:p>
     <w:p>
@@ -3223,47 +6647,16 @@
           <w:szCs w:val="24"/>
         </w:rPr>
       </w:pPr>
+      <w:bookmarkStart w:id="0" w:name="_GoBack"/>
       <w:r>
         <w:rPr>
           <w:sz w:val="24"/>
           <w:szCs w:val="24"/>
         </w:rPr>
-        <w:t>System Requirements</w:t>
-      </w:r>
-    </w:p>
-    <w:p>
-      <w:pPr>
-        <w:pStyle w:val="BodyTextKeep"/>
-      </w:pPr>
-      <w:r>
-        <w:t>The s</w:t>
-      </w:r>
-      <w:r>
-        <w:t>ystem requirements to run the 9 tap software are as follows:</w:t>
-      </w:r>
-      <w:r>
-        <w:t xml:space="preserve"> Windows 10, (Windows 8, or Windows 7). Storage: how much? USB port. Dot matrix and ink/laser-jet</w:t>
-      </w:r>
-      <w:r>
-        <w:t xml:space="preserve"> printers. Microsoft Excel must be installed on the computer for the 9 Tap Tour program to work.</w:t>
-      </w:r>
-    </w:p>
-    <w:p>
-      <w:pPr>
-        <w:pStyle w:val="Heading2"/>
-        <w:rPr>
-          <w:sz w:val="24"/>
-          <w:szCs w:val="24"/>
-        </w:rPr>
-      </w:pPr>
-      <w:r>
-        <w:rPr>
-          <w:sz w:val="24"/>
-          <w:szCs w:val="24"/>
-        </w:rPr>
         <w:t>WARNING:</w:t>
       </w:r>
     </w:p>
+    <w:bookmarkEnd w:id="0"/>
     <w:p>
       <w:pPr>
         <w:pStyle w:val="BodyText"/>
@@ -3363,7 +6756,6 @@
         </w:numPr>
       </w:pPr>
       <w:r>
-        <w:lastRenderedPageBreak/>
         <w:t>End User License agreement.</w:t>
       </w:r>
       <w:r>
@@ -3391,7 +6783,15 @@
         </w:numPr>
       </w:pPr>
       <w:r>
-        <w:t>Select a Start Menu Folder for 9 Tap Tour. Either accept the default location or chose another. If you don’t want a Start Menu folder to be created check the box “Do Not Create A Start Menu Folder”. Once you are satisfied with your selection click the “Next” button to continue.</w:t>
+        <w:t xml:space="preserve">Select a Start Menu Folder for 9 Tap Tour. Either accept the default location or chose another. If you don’t want a Start Menu folder to be created check the box “Do Not Create </w:t>
+      </w:r>
+      <w:proofErr w:type="gramStart"/>
+      <w:r>
+        <w:t>A</w:t>
+      </w:r>
+      <w:proofErr w:type="gramEnd"/>
+      <w:r>
+        <w:t xml:space="preserve"> Start Menu Folder”. Once you are satisfied with your selection click the “Next” button to continue.</w:t>
       </w:r>
     </w:p>
     <w:p>
@@ -3430,6 +6830,7 @@
         </w:numPr>
       </w:pPr>
       <w:r>
+        <w:lastRenderedPageBreak/>
         <w:t xml:space="preserve">The 9 Tap Tour program has now been successfully installed. Choose “Run 9 Tap Tour” to </w:t>
       </w:r>
       <w:r>
@@ -3572,7 +6973,6 @@
         </w:numPr>
       </w:pPr>
       <w:r>
-        <w:lastRenderedPageBreak/>
         <w:t xml:space="preserve">Member Info—takes you to the Member Information form. </w:t>
       </w:r>
     </w:p>
@@ -3665,6 +7065,7 @@
         </w:numPr>
       </w:pPr>
       <w:r>
+        <w:lastRenderedPageBreak/>
         <w:t>Region—drop down menu to pick location. Default is “local”.</w:t>
       </w:r>
     </w:p>
@@ -3713,7 +7114,6 @@
         <w:pStyle w:val="Heading1"/>
       </w:pPr>
       <w:r>
-        <w:lastRenderedPageBreak/>
         <w:t>Tournaments</w:t>
       </w:r>
     </w:p>
@@ -3756,6 +7156,12 @@
           <w:sz w:val="20"/>
         </w:rPr>
         <w:t xml:space="preserve">Deal with the </w:t>
+      </w:r>
+      <w:r>
+        <w:rPr>
+          <w:sz w:val="20"/>
+        </w:rPr>
+        <w:t>Problems</w:t>
       </w:r>
     </w:p>
     <w:p>
@@ -3791,9 +7197,9 @@
           <w:noProof/>
         </w:rPr>
         <w:sectPr>
-          <w:headerReference w:type="default" r:id="rId29"/>
-          <w:footerReference w:type="default" r:id="rId30"/>
-          <w:headerReference w:type="first" r:id="rId31"/>
+          <w:headerReference w:type="default" r:id="rId30"/>
+          <w:footerReference w:type="default" r:id="rId31"/>
+          <w:headerReference w:type="first" r:id="rId32"/>
           <w:type w:val="continuous"/>
           <w:pgSz w:w="12240" w:h="15840" w:code="1"/>
           <w:pgMar w:top="1800" w:right="1195" w:bottom="1440" w:left="3355" w:header="720" w:footer="720" w:gutter="0"/>
@@ -4437,7 +7843,7 @@
         <w:rStyle w:val="PageNumber"/>
         <w:noProof/>
       </w:rPr>
-      <w:t>22</w:t>
+      <w:t>25</w:t>
     </w:r>
     <w:r>
       <w:rPr>
@@ -4487,7 +7893,7 @@
         <w:rStyle w:val="PageNumber"/>
         <w:noProof/>
       </w:rPr>
-      <w:t>25</w:t>
+      <w:t>26</w:t>
     </w:r>
     <w:r>
       <w:rPr>
@@ -7823,7 +11229,7 @@
 </file>
 
 <file path=customXml/itemProps1.xml><?xml version="1.0" encoding="utf-8"?>
-<ds:datastoreItem xmlns:ds="http://schemas.openxmlformats.org/officeDocument/2006/customXml" ds:itemID="{497F7A78-FF4F-44DF-BD2B-9134B1A56C23}">
+<ds:datastoreItem xmlns:ds="http://schemas.openxmlformats.org/officeDocument/2006/customXml" ds:itemID="{061B2D37-3E32-49DB-AF59-3F210BC88E17}">
   <ds:schemaRefs>
     <ds:schemaRef ds:uri="http://schemas.openxmlformats.org/officeDocument/2006/bibliography"/>
   </ds:schemaRefs>

</xml_diff>

<commit_message>
updated to new screen shots
updated to the most recent screen captures. Have started to update the quick start and member information screens.
</commit_message>
<xml_diff>
--- a/9tapUserManual.docx
+++ b/9tapUserManual.docx
@@ -1,6 +1,6 @@
 
 <file path=word/document.xml><?xml version="1.0" encoding="utf-8"?>
-<w:document xmlns:wpc="http://schemas.microsoft.com/office/word/2010/wordprocessingCanvas" xmlns:cx="http://schemas.microsoft.com/office/drawing/2014/chartex" xmlns:cx1="http://schemas.microsoft.com/office/drawing/2015/9/8/chartex" xmlns:cx2="http://schemas.microsoft.com/office/drawing/2015/10/21/chartex" xmlns:cx3="http://schemas.microsoft.com/office/drawing/2016/5/9/chartex" xmlns:cx4="http://schemas.microsoft.com/office/drawing/2016/5/10/chartex" xmlns:cx5="http://schemas.microsoft.com/office/drawing/2016/5/11/chartex" xmlns:cx6="http://schemas.microsoft.com/office/drawing/2016/5/12/chartex" xmlns:cx7="http://schemas.microsoft.com/office/drawing/2016/5/13/chartex" xmlns:cx8="http://schemas.microsoft.com/office/drawing/2016/5/14/chartex" xmlns:mc="http://schemas.openxmlformats.org/markup-compatibility/2006" xmlns:aink="http://schemas.microsoft.com/office/drawing/2016/ink" xmlns:am3d="http://schemas.microsoft.com/office/drawing/2017/model3d" xmlns:o="urn:schemas-microsoft-com:office:office" xmlns:r="http://schemas.openxmlformats.org/officeDocument/2006/relationships" xmlns:m="http://schemas.openxmlformats.org/officeDocument/2006/math" xmlns:v="urn:schemas-microsoft-com:vml" xmlns:wp14="http://schemas.microsoft.com/office/word/2010/wordprocessingDrawing" xmlns:wp="http://schemas.openxmlformats.org/drawingml/2006/wordprocessingDrawing" xmlns:w10="urn:schemas-microsoft-com:office:word" xmlns:w="http://schemas.openxmlformats.org/wordprocessingml/2006/main" xmlns:w14="http://schemas.microsoft.com/office/word/2010/wordml" xmlns:w15="http://schemas.microsoft.com/office/word/2012/wordml" xmlns:w16cid="http://schemas.microsoft.com/office/word/2016/wordml/cid" xmlns:w16se="http://schemas.microsoft.com/office/word/2015/wordml/symex" xmlns:wpg="http://schemas.microsoft.com/office/word/2010/wordprocessingGroup" xmlns:wpi="http://schemas.microsoft.com/office/word/2010/wordprocessingInk" xmlns:wne="http://schemas.microsoft.com/office/word/2006/wordml" xmlns:wps="http://schemas.microsoft.com/office/word/2010/wordprocessingShape" mc:Ignorable="w14 w15 w16se w16cid wp14">
+<w:document xmlns:wpc="http://schemas.microsoft.com/office/word/2010/wordprocessingCanvas" xmlns:mc="http://schemas.openxmlformats.org/markup-compatibility/2006" xmlns:o="urn:schemas-microsoft-com:office:office" xmlns:r="http://schemas.openxmlformats.org/officeDocument/2006/relationships" xmlns:m="http://schemas.openxmlformats.org/officeDocument/2006/math" xmlns:v="urn:schemas-microsoft-com:vml" xmlns:wp14="http://schemas.microsoft.com/office/word/2010/wordprocessingDrawing" xmlns:wp="http://schemas.openxmlformats.org/drawingml/2006/wordprocessingDrawing" xmlns:w10="urn:schemas-microsoft-com:office:word" xmlns:w="http://schemas.openxmlformats.org/wordprocessingml/2006/main" xmlns:w14="http://schemas.microsoft.com/office/word/2010/wordml" xmlns:w15="http://schemas.microsoft.com/office/word/2012/wordml" xmlns:wpg="http://schemas.microsoft.com/office/word/2010/wordprocessingGroup" xmlns:wpi="http://schemas.microsoft.com/office/word/2010/wordprocessingInk" xmlns:wne="http://schemas.microsoft.com/office/word/2006/wordml" xmlns:wps="http://schemas.microsoft.com/office/word/2010/wordprocessingShape" mc:Ignorable="w14 w15 wp14">
   <w:body>
     <w:p>
       <w:pPr>
@@ -1382,8 +1382,8 @@
         </w:rPr>
         <w:drawing>
           <wp:inline distT="0" distB="0" distL="0" distR="0">
-            <wp:extent cx="4883150" cy="3824605"/>
-            <wp:effectExtent l="0" t="0" r="0" b="4445"/>
+            <wp:extent cx="4883150" cy="2623280"/>
+            <wp:effectExtent l="0" t="0" r="0" b="5715"/>
             <wp:docPr id="3" name="Picture 3"/>
             <wp:cNvGraphicFramePr>
               <a:graphicFrameLocks xmlns:a="http://schemas.openxmlformats.org/drawingml/2006/main" noChangeAspect="1"/>
@@ -1396,7 +1396,7 @@
                     <pic:cNvPicPr/>
                   </pic:nvPicPr>
                   <pic:blipFill>
-                    <a:blip r:embed="rId14">
+                    <a:blip r:embed="rId14" cstate="print">
                       <a:extLst>
                         <a:ext uri="{28A0092B-C50C-407E-A947-70E740481C1C}">
                           <a14:useLocalDpi xmlns:a14="http://schemas.microsoft.com/office/drawing/2010/main" val="0"/>
@@ -1410,7 +1410,7 @@
                   <pic:spPr>
                     <a:xfrm>
                       <a:off x="0" y="0"/>
-                      <a:ext cx="4883150" cy="3824605"/>
+                      <a:ext cx="4883150" cy="2623280"/>
                     </a:xfrm>
                     <a:prstGeom prst="rect">
                       <a:avLst/>
@@ -1431,14 +1431,27 @@
       <w:r>
         <w:t xml:space="preserve">Figure </w:t>
       </w:r>
-      <w:fldSimple w:instr=" SEQ Figure \* ARABIC ">
-        <w:r>
-          <w:rPr>
-            <w:noProof/>
-          </w:rPr>
-          <w:t>1</w:t>
-        </w:r>
-      </w:fldSimple>
+      <w:r>
+        <w:fldChar w:fldCharType="begin"/>
+      </w:r>
+      <w:r>
+        <w:instrText xml:space="preserve"> SEQ Figure \* ARABIC </w:instrText>
+      </w:r>
+      <w:r>
+        <w:fldChar w:fldCharType="separate"/>
+      </w:r>
+      <w:r>
+        <w:rPr>
+          <w:noProof/>
+        </w:rPr>
+        <w:t>1</w:t>
+      </w:r>
+      <w:r>
+        <w:rPr>
+          <w:noProof/>
+        </w:rPr>
+        <w:fldChar w:fldCharType="end"/>
+      </w:r>
       <w:r>
         <w:t>: 9-Tap Main Menu</w:t>
       </w:r>
@@ -1480,7 +1493,10 @@
         <w:pStyle w:val="BodyText"/>
       </w:pPr>
       <w:r>
-        <w:t>You can find this on page #</w:t>
+        <w:t xml:space="preserve">You can find this on page </w:t>
+      </w:r>
+      <w:r>
+        <w:t>5.</w:t>
       </w:r>
     </w:p>
     <w:p>
@@ -1496,7 +1512,10 @@
         <w:pStyle w:val="BodyText"/>
       </w:pPr>
       <w:r>
-        <w:t>You can find this on page ##</w:t>
+        <w:t xml:space="preserve">You can find this on page </w:t>
+      </w:r>
+      <w:r>
+        <w:t>24.</w:t>
       </w:r>
     </w:p>
     <w:p>
@@ -1512,15 +1531,7 @@
         <w:pStyle w:val="BodyText"/>
       </w:pPr>
       <w:r>
-        <w:t xml:space="preserve">Familiarization </w:t>
-      </w:r>
-      <w:proofErr w:type="gramStart"/>
-      <w:r>
-        <w:t>guide .longwinded</w:t>
-      </w:r>
-      <w:proofErr w:type="gramEnd"/>
-      <w:r>
-        <w:t>?</w:t>
+        <w:t>An in depth explanation of the program menus can be found on page 9.</w:t>
       </w:r>
     </w:p>
     <w:p>
@@ -1605,15 +1616,13 @@
         <w:framePr w:wrap="around"/>
       </w:pPr>
       <w:r>
-        <w:t>hELPFUL GUIDELINES</w:t>
-      </w:r>
-      <w:bookmarkStart w:id="0" w:name="_GoBack"/>
-      <w:bookmarkEnd w:id="0"/>
-      <w:r>
-        <w:t xml:space="preserve"> TO GET 9-tAP UP AND RUNNING</w:t>
-      </w:r>
-      <w:r>
-        <w:t>.</w:t>
+        <w:t xml:space="preserve">hELPFUL </w:t>
+      </w:r>
+      <w:r>
+        <w:t>Tips</w:t>
+      </w:r>
+      <w:r>
+        <w:t xml:space="preserve"> TO GET 9-tAP UP AND RUNNING.</w:t>
       </w:r>
     </w:p>
     <w:p>
@@ -1629,7 +1638,19 @@
         <w:pStyle w:val="BodyTextKeep"/>
       </w:pPr>
       <w:r>
-        <w:t>The system requirements to run the 9-tap software are as follows: Windows 10, (Windows 8, or Windows 7). Storage: how much? USB port. Dot matrix and ink/laser-jet printers. Microsoft Excel must be installed on the computer for the 9-Tap Tour program to work.</w:t>
+        <w:t xml:space="preserve">The system requirements to run the 9-tap software are </w:t>
+      </w:r>
+      <w:r>
+        <w:t>Windows 7 and above</w:t>
+      </w:r>
+      <w:r>
+        <w:t xml:space="preserve">. </w:t>
+      </w:r>
+      <w:r>
+        <w:t>13MB free disk space.</w:t>
+      </w:r>
+      <w:r>
+        <w:t xml:space="preserve"> USB port. Dot matrix and ink/laser-jet printers. Microsoft Excel must be installed on the computer for the 9-Tap Tour program to work.</w:t>
       </w:r>
     </w:p>
     <w:p>
@@ -1668,6 +1689,12 @@
       <w:r>
         <w:t>Insert the 9 Tap Tour USB drive into your computer’s USB port.</w:t>
       </w:r>
+      <w:r>
+        <w:t xml:space="preserve"> </w:t>
+      </w:r>
+      <w:r>
+        <w:t>Or navigate to the download site. Download 9-Tap.exe.</w:t>
+      </w:r>
     </w:p>
     <w:p>
       <w:pPr>
@@ -1926,14 +1953,6 @@
         <w:pStyle w:val="BodyText"/>
       </w:pPr>
       <w:r>
-        <w:t>Screen shots of desktop icon &amp; system menu</w:t>
-      </w:r>
-    </w:p>
-    <w:p>
-      <w:pPr>
-        <w:pStyle w:val="BodyText"/>
-      </w:pPr>
-      <w:r>
         <w:t xml:space="preserve">Double click on the desktop </w:t>
       </w:r>
       <w:r>
@@ -1941,6 +1960,9 @@
       </w:r>
       <w:r>
         <w:t xml:space="preserve"> go to the program in the system menu and click on it.</w:t>
+      </w:r>
+      <w:r>
+        <w:t xml:space="preserve"> This will launch 9-Tap.</w:t>
       </w:r>
     </w:p>
     <w:p>
@@ -1976,7 +1998,51 @@
         <w:pStyle w:val="BodyText"/>
       </w:pPr>
       <w:r>
-        <w:t>On the Member Info screen, Click new. A new blank record will display. Start filling in the player’s information, at a minimum his first and last name. Save the record.</w:t>
+        <w:t>On the Member Info screen, Click new. A new blank record will display. Start filling in the player’s information</w:t>
+      </w:r>
+      <w:r>
+        <w:t>, first and last name are required at time of creation</w:t>
+      </w:r>
+      <w:r>
+        <w:t>. Save the record.</w:t>
+      </w:r>
+    </w:p>
+    <w:p>
+      <w:pPr>
+        <w:pStyle w:val="Heading2"/>
+      </w:pPr>
+      <w:r>
+        <w:t>How do I create a tournament?</w:t>
+      </w:r>
+    </w:p>
+    <w:p>
+      <w:pPr>
+        <w:pStyle w:val="BodyText"/>
+      </w:pPr>
+      <w:r>
+        <w:t xml:space="preserve">On the Member Scores screen, </w:t>
+      </w:r>
+      <w:r>
+        <w:t>click on the Create/Ed</w:t>
+      </w:r>
+      <w:r>
+        <w:t>it Tournament… button. This launches the New Tournament screen. Fill in the necessary information.</w:t>
+      </w:r>
+    </w:p>
+    <w:p>
+      <w:pPr>
+        <w:pStyle w:val="Heading2"/>
+      </w:pPr>
+      <w:r>
+        <w:t>How do I enter a bowler’s scores?</w:t>
+      </w:r>
+    </w:p>
+    <w:p>
+      <w:pPr>
+        <w:pStyle w:val="BodyText"/>
+      </w:pPr>
+      <w:r>
+        <w:t xml:space="preserve">On the Member Scores screen, in the Tournament Files section, select the tournament from the drop down menu. Once the tournament is selected, enter the member number and click enter. The player information and status will auto-populate. Pick which squad they bowled in. Enter the player’s scratch scores in a three digit format. 9-Tap will tab through as the scores are entered. Before clicking “Add New/Update Record” double check that the entered scores are correct. </w:t>
       </w:r>
     </w:p>
     <w:p>
@@ -2101,159 +2167,7 @@
         <w:keepNext/>
       </w:pPr>
       <w:r>
-        <w:t xml:space="preserve">Craft beer sartorial copper mug </w:t>
-      </w:r>
-      <w:proofErr w:type="spellStart"/>
-      <w:r>
-        <w:t>tbh</w:t>
-      </w:r>
-      <w:proofErr w:type="spellEnd"/>
-      <w:r>
-        <w:t xml:space="preserve"> jianbing, locavore VHS salvia +1 vegan gluten-free </w:t>
-      </w:r>
-      <w:proofErr w:type="spellStart"/>
-      <w:r>
-        <w:t>kogi</w:t>
-      </w:r>
-      <w:proofErr w:type="spellEnd"/>
-      <w:r>
-        <w:t xml:space="preserve"> pug </w:t>
-      </w:r>
-      <w:proofErr w:type="spellStart"/>
-      <w:r>
-        <w:t>vexillologist</w:t>
-      </w:r>
-      <w:proofErr w:type="spellEnd"/>
-      <w:r>
-        <w:t xml:space="preserve"> affogato. Fanny pack </w:t>
-      </w:r>
-      <w:proofErr w:type="spellStart"/>
-      <w:r>
-        <w:t>palo</w:t>
-      </w:r>
-      <w:proofErr w:type="spellEnd"/>
-      <w:r>
-        <w:t xml:space="preserve"> </w:t>
-      </w:r>
-      <w:proofErr w:type="spellStart"/>
-      <w:r>
-        <w:t>santo</w:t>
-      </w:r>
-      <w:proofErr w:type="spellEnd"/>
-      <w:r>
-        <w:t xml:space="preserve"> </w:t>
-      </w:r>
-      <w:proofErr w:type="spellStart"/>
-      <w:r>
-        <w:t>proident</w:t>
-      </w:r>
-      <w:proofErr w:type="spellEnd"/>
-      <w:r>
-        <w:t xml:space="preserve"> blog bespoke </w:t>
-      </w:r>
-      <w:proofErr w:type="spellStart"/>
-      <w:r>
-        <w:t>commodo</w:t>
-      </w:r>
-      <w:proofErr w:type="spellEnd"/>
-      <w:r>
-        <w:t xml:space="preserve"> tilde hammock </w:t>
-      </w:r>
-      <w:proofErr w:type="spellStart"/>
-      <w:r>
-        <w:t>taiyaki</w:t>
-      </w:r>
-      <w:proofErr w:type="spellEnd"/>
-      <w:r>
-        <w:t xml:space="preserve"> wayfarers gentrify. Cardigan ugh slow-carb, </w:t>
-      </w:r>
-      <w:proofErr w:type="spellStart"/>
-      <w:r>
-        <w:t>ea</w:t>
-      </w:r>
-      <w:proofErr w:type="spellEnd"/>
-      <w:r>
-        <w:t xml:space="preserve"> DIY hot chicken </w:t>
-      </w:r>
-      <w:proofErr w:type="spellStart"/>
-      <w:r>
-        <w:t>commodo</w:t>
-      </w:r>
-      <w:proofErr w:type="spellEnd"/>
-      <w:r>
-        <w:t xml:space="preserve"> </w:t>
-      </w:r>
-      <w:proofErr w:type="spellStart"/>
-      <w:r>
-        <w:t>godard</w:t>
-      </w:r>
-      <w:proofErr w:type="spellEnd"/>
-      <w:r>
-        <w:t xml:space="preserve">. Lorem </w:t>
-      </w:r>
-      <w:proofErr w:type="spellStart"/>
-      <w:r>
-        <w:t>sint</w:t>
-      </w:r>
-      <w:proofErr w:type="spellEnd"/>
-      <w:r>
-        <w:t xml:space="preserve"> qui 3 wolf moon </w:t>
-      </w:r>
-      <w:proofErr w:type="spellStart"/>
-      <w:r>
-        <w:t>enim</w:t>
-      </w:r>
-      <w:proofErr w:type="spellEnd"/>
-      <w:r>
-        <w:t xml:space="preserve"> </w:t>
-      </w:r>
-      <w:proofErr w:type="spellStart"/>
-      <w:r>
-        <w:t>voluptate</w:t>
-      </w:r>
-      <w:proofErr w:type="spellEnd"/>
-      <w:r>
-        <w:t xml:space="preserve">, </w:t>
-      </w:r>
-      <w:proofErr w:type="spellStart"/>
-      <w:r>
-        <w:t>velit</w:t>
-      </w:r>
-      <w:proofErr w:type="spellEnd"/>
-      <w:r>
-        <w:t xml:space="preserve"> </w:t>
-      </w:r>
-      <w:proofErr w:type="spellStart"/>
-      <w:r>
-        <w:t>veniam</w:t>
-      </w:r>
-      <w:proofErr w:type="spellEnd"/>
-      <w:r>
-        <w:t xml:space="preserve">. Fanny pack man bun </w:t>
-      </w:r>
-      <w:proofErr w:type="spellStart"/>
-      <w:r>
-        <w:t>helvetica</w:t>
-      </w:r>
-      <w:proofErr w:type="spellEnd"/>
-      <w:r>
-        <w:t xml:space="preserve"> viral, </w:t>
-      </w:r>
-      <w:proofErr w:type="spellStart"/>
-      <w:r>
-        <w:t>edison</w:t>
-      </w:r>
-      <w:proofErr w:type="spellEnd"/>
-      <w:r>
-        <w:t xml:space="preserve"> bulb </w:t>
-      </w:r>
-      <w:proofErr w:type="spellStart"/>
-      <w:r>
-        <w:t>cliche</w:t>
-      </w:r>
-      <w:proofErr w:type="spellEnd"/>
-      <w:r>
-        <w:t xml:space="preserve"> jianbing.</w:t>
+        <w:t>The main menu is where you access the various functions of the program. Member Info, button and tab. Member Scores, button and tab. The About and Exit buttons. The Region picker. And the “Add Region” button. Also, the tools tab accesses the active/inactive member dialog.</w:t>
       </w:r>
     </w:p>
     <w:p>
@@ -2267,8 +2181,8 @@
         </w:rPr>
         <w:drawing>
           <wp:inline distT="0" distB="0" distL="0" distR="0">
-            <wp:extent cx="4883150" cy="3824605"/>
-            <wp:effectExtent l="0" t="0" r="0" b="4445"/>
+            <wp:extent cx="4883150" cy="2623280"/>
+            <wp:effectExtent l="0" t="0" r="0" b="5715"/>
             <wp:docPr id="4" name="Picture 4"/>
             <wp:cNvGraphicFramePr>
               <a:graphicFrameLocks xmlns:a="http://schemas.openxmlformats.org/drawingml/2006/main" noChangeAspect="1"/>
@@ -2281,7 +2195,7 @@
                     <pic:cNvPicPr/>
                   </pic:nvPicPr>
                   <pic:blipFill>
-                    <a:blip r:embed="rId14">
+                    <a:blip r:embed="rId14" cstate="print">
                       <a:extLst>
                         <a:ext uri="{28A0092B-C50C-407E-A947-70E740481C1C}">
                           <a14:useLocalDpi xmlns:a14="http://schemas.microsoft.com/office/drawing/2010/main" val="0"/>
@@ -2295,7 +2209,7 @@
                   <pic:spPr>
                     <a:xfrm>
                       <a:off x="0" y="0"/>
-                      <a:ext cx="4883150" cy="3824605"/>
+                      <a:ext cx="4883150" cy="2623280"/>
                     </a:xfrm>
                     <a:prstGeom prst="rect">
                       <a:avLst/>
@@ -2316,14 +2230,27 @@
       <w:r>
         <w:t xml:space="preserve">Figure </w:t>
       </w:r>
-      <w:fldSimple w:instr=" SEQ Figure \* ARABIC ">
-        <w:r>
-          <w:rPr>
-            <w:noProof/>
-          </w:rPr>
-          <w:t>2</w:t>
-        </w:r>
-      </w:fldSimple>
+      <w:r>
+        <w:fldChar w:fldCharType="begin"/>
+      </w:r>
+      <w:r>
+        <w:instrText xml:space="preserve"> SEQ Figure \* ARABIC </w:instrText>
+      </w:r>
+      <w:r>
+        <w:fldChar w:fldCharType="separate"/>
+      </w:r>
+      <w:r>
+        <w:rPr>
+          <w:noProof/>
+        </w:rPr>
+        <w:t>2</w:t>
+      </w:r>
+      <w:r>
+        <w:rPr>
+          <w:noProof/>
+        </w:rPr>
+        <w:fldChar w:fldCharType="end"/>
+      </w:r>
       <w:r>
         <w:t>: Main Menu</w:t>
       </w:r>
@@ -2343,159 +2270,7 @@
         <w:keepNext/>
       </w:pPr>
       <w:r>
-        <w:t xml:space="preserve">Craft beer sartorial copper mug </w:t>
-      </w:r>
-      <w:proofErr w:type="spellStart"/>
-      <w:r>
-        <w:t>tbh</w:t>
-      </w:r>
-      <w:proofErr w:type="spellEnd"/>
-      <w:r>
-        <w:t xml:space="preserve"> jianbing, locavore VHS salvia +1 vegan gluten-free </w:t>
-      </w:r>
-      <w:proofErr w:type="spellStart"/>
-      <w:r>
-        <w:t>kogi</w:t>
-      </w:r>
-      <w:proofErr w:type="spellEnd"/>
-      <w:r>
-        <w:t xml:space="preserve"> pug </w:t>
-      </w:r>
-      <w:proofErr w:type="spellStart"/>
-      <w:r>
-        <w:t>vexillologist</w:t>
-      </w:r>
-      <w:proofErr w:type="spellEnd"/>
-      <w:r>
-        <w:t xml:space="preserve"> affogato. Fanny pack </w:t>
-      </w:r>
-      <w:proofErr w:type="spellStart"/>
-      <w:r>
-        <w:t>palo</w:t>
-      </w:r>
-      <w:proofErr w:type="spellEnd"/>
-      <w:r>
-        <w:t xml:space="preserve"> </w:t>
-      </w:r>
-      <w:proofErr w:type="spellStart"/>
-      <w:r>
-        <w:t>santo</w:t>
-      </w:r>
-      <w:proofErr w:type="spellEnd"/>
-      <w:r>
-        <w:t xml:space="preserve"> </w:t>
-      </w:r>
-      <w:proofErr w:type="spellStart"/>
-      <w:r>
-        <w:t>proident</w:t>
-      </w:r>
-      <w:proofErr w:type="spellEnd"/>
-      <w:r>
-        <w:t xml:space="preserve"> blog bespoke </w:t>
-      </w:r>
-      <w:proofErr w:type="spellStart"/>
-      <w:r>
-        <w:t>commodo</w:t>
-      </w:r>
-      <w:proofErr w:type="spellEnd"/>
-      <w:r>
-        <w:t xml:space="preserve"> tilde hammock </w:t>
-      </w:r>
-      <w:proofErr w:type="spellStart"/>
-      <w:r>
-        <w:t>taiyaki</w:t>
-      </w:r>
-      <w:proofErr w:type="spellEnd"/>
-      <w:r>
-        <w:t xml:space="preserve"> wayfarers gentrify. Cardigan ugh slow-carb, </w:t>
-      </w:r>
-      <w:proofErr w:type="spellStart"/>
-      <w:r>
-        <w:t>ea</w:t>
-      </w:r>
-      <w:proofErr w:type="spellEnd"/>
-      <w:r>
-        <w:t xml:space="preserve"> DIY hot chicken </w:t>
-      </w:r>
-      <w:proofErr w:type="spellStart"/>
-      <w:r>
-        <w:t>commodo</w:t>
-      </w:r>
-      <w:proofErr w:type="spellEnd"/>
-      <w:r>
-        <w:t xml:space="preserve"> </w:t>
-      </w:r>
-      <w:proofErr w:type="spellStart"/>
-      <w:r>
-        <w:t>godard</w:t>
-      </w:r>
-      <w:proofErr w:type="spellEnd"/>
-      <w:r>
-        <w:t xml:space="preserve">. Lorem </w:t>
-      </w:r>
-      <w:proofErr w:type="spellStart"/>
-      <w:r>
-        <w:t>sint</w:t>
-      </w:r>
-      <w:proofErr w:type="spellEnd"/>
-      <w:r>
-        <w:t xml:space="preserve"> qui 3 wolf moon </w:t>
-      </w:r>
-      <w:proofErr w:type="spellStart"/>
-      <w:r>
-        <w:t>enim</w:t>
-      </w:r>
-      <w:proofErr w:type="spellEnd"/>
-      <w:r>
-        <w:t xml:space="preserve"> </w:t>
-      </w:r>
-      <w:proofErr w:type="spellStart"/>
-      <w:r>
-        <w:t>voluptate</w:t>
-      </w:r>
-      <w:proofErr w:type="spellEnd"/>
-      <w:r>
-        <w:t xml:space="preserve">, </w:t>
-      </w:r>
-      <w:proofErr w:type="spellStart"/>
-      <w:r>
-        <w:t>velit</w:t>
-      </w:r>
-      <w:proofErr w:type="spellEnd"/>
-      <w:r>
-        <w:t xml:space="preserve"> </w:t>
-      </w:r>
-      <w:proofErr w:type="spellStart"/>
-      <w:r>
-        <w:t>veniam</w:t>
-      </w:r>
-      <w:proofErr w:type="spellEnd"/>
-      <w:r>
-        <w:t xml:space="preserve">. Fanny pack man bun </w:t>
-      </w:r>
-      <w:proofErr w:type="spellStart"/>
-      <w:r>
-        <w:t>helvetica</w:t>
-      </w:r>
-      <w:proofErr w:type="spellEnd"/>
-      <w:r>
-        <w:t xml:space="preserve"> viral, </w:t>
-      </w:r>
-      <w:proofErr w:type="spellStart"/>
-      <w:r>
-        <w:t>edison</w:t>
-      </w:r>
-      <w:proofErr w:type="spellEnd"/>
-      <w:r>
-        <w:t xml:space="preserve"> bulb </w:t>
-      </w:r>
-      <w:proofErr w:type="spellStart"/>
-      <w:r>
-        <w:t>cliche</w:t>
-      </w:r>
-      <w:proofErr w:type="spellEnd"/>
-      <w:r>
-        <w:t xml:space="preserve"> jianbing.</w:t>
+        <w:t>Under Tools you will find the Update Inactive Members screen. Pick the date to find which members haven’t bowled for more than 180 days. You can click the check box by the names of the players to update to inactive status. Click “Update” to update the member information.</w:t>
       </w:r>
     </w:p>
     <w:p>
@@ -2559,14 +2334,27 @@
       <w:r>
         <w:t xml:space="preserve">Figure </w:t>
       </w:r>
-      <w:fldSimple w:instr=" SEQ Figure \* ARABIC ">
-        <w:r>
-          <w:rPr>
-            <w:noProof/>
-          </w:rPr>
-          <w:t>3</w:t>
-        </w:r>
-      </w:fldSimple>
+      <w:r>
+        <w:fldChar w:fldCharType="begin"/>
+      </w:r>
+      <w:r>
+        <w:instrText xml:space="preserve"> SEQ Figure \* ARABIC </w:instrText>
+      </w:r>
+      <w:r>
+        <w:fldChar w:fldCharType="separate"/>
+      </w:r>
+      <w:r>
+        <w:rPr>
+          <w:noProof/>
+        </w:rPr>
+        <w:t>3</w:t>
+      </w:r>
+      <w:r>
+        <w:rPr>
+          <w:noProof/>
+        </w:rPr>
+        <w:fldChar w:fldCharType="end"/>
+      </w:r>
       <w:r>
         <w:t>: Under Tools, Update Inactive status</w:t>
       </w:r>
@@ -2589,159 +2377,18 @@
         <w:keepNext/>
       </w:pPr>
       <w:r>
-        <w:t xml:space="preserve">Craft beer sartorial copper mug </w:t>
-      </w:r>
-      <w:proofErr w:type="spellStart"/>
-      <w:r>
-        <w:t>tbh</w:t>
-      </w:r>
-      <w:proofErr w:type="spellEnd"/>
-      <w:r>
-        <w:t xml:space="preserve"> jianbing, locavore VHS salvia +1 vegan gluten-free </w:t>
-      </w:r>
-      <w:proofErr w:type="spellStart"/>
-      <w:r>
-        <w:t>kogi</w:t>
-      </w:r>
-      <w:proofErr w:type="spellEnd"/>
-      <w:r>
-        <w:t xml:space="preserve"> pug </w:t>
-      </w:r>
-      <w:proofErr w:type="spellStart"/>
-      <w:r>
-        <w:t>vexillologist</w:t>
-      </w:r>
-      <w:proofErr w:type="spellEnd"/>
-      <w:r>
-        <w:t xml:space="preserve"> affogato. Fanny pack </w:t>
-      </w:r>
-      <w:proofErr w:type="spellStart"/>
-      <w:r>
-        <w:t>palo</w:t>
-      </w:r>
-      <w:proofErr w:type="spellEnd"/>
-      <w:r>
-        <w:t xml:space="preserve"> </w:t>
-      </w:r>
-      <w:proofErr w:type="spellStart"/>
-      <w:r>
-        <w:t>santo</w:t>
-      </w:r>
-      <w:proofErr w:type="spellEnd"/>
-      <w:r>
-        <w:t xml:space="preserve"> </w:t>
-      </w:r>
-      <w:proofErr w:type="spellStart"/>
-      <w:r>
-        <w:t>proident</w:t>
-      </w:r>
-      <w:proofErr w:type="spellEnd"/>
-      <w:r>
-        <w:t xml:space="preserve"> blog bespoke </w:t>
-      </w:r>
-      <w:proofErr w:type="spellStart"/>
-      <w:r>
-        <w:t>commodo</w:t>
-      </w:r>
-      <w:proofErr w:type="spellEnd"/>
-      <w:r>
-        <w:t xml:space="preserve"> tilde hammock </w:t>
-      </w:r>
-      <w:proofErr w:type="spellStart"/>
-      <w:r>
-        <w:t>taiyaki</w:t>
-      </w:r>
-      <w:proofErr w:type="spellEnd"/>
-      <w:r>
-        <w:t xml:space="preserve"> wayfarers gentrify. Cardigan ugh slow-carb, </w:t>
-      </w:r>
-      <w:proofErr w:type="spellStart"/>
-      <w:r>
-        <w:t>ea</w:t>
-      </w:r>
-      <w:proofErr w:type="spellEnd"/>
-      <w:r>
-        <w:t xml:space="preserve"> DIY hot chicken </w:t>
-      </w:r>
-      <w:proofErr w:type="spellStart"/>
-      <w:r>
-        <w:t>commodo</w:t>
-      </w:r>
-      <w:proofErr w:type="spellEnd"/>
-      <w:r>
-        <w:t xml:space="preserve"> </w:t>
-      </w:r>
-      <w:proofErr w:type="spellStart"/>
-      <w:r>
-        <w:t>godard</w:t>
-      </w:r>
-      <w:proofErr w:type="spellEnd"/>
-      <w:r>
-        <w:t xml:space="preserve">. Lorem </w:t>
-      </w:r>
-      <w:proofErr w:type="spellStart"/>
-      <w:r>
-        <w:t>sint</w:t>
-      </w:r>
-      <w:proofErr w:type="spellEnd"/>
-      <w:r>
-        <w:t xml:space="preserve"> qui 3 wolf moon </w:t>
-      </w:r>
-      <w:proofErr w:type="spellStart"/>
-      <w:r>
-        <w:t>enim</w:t>
-      </w:r>
-      <w:proofErr w:type="spellEnd"/>
-      <w:r>
-        <w:t xml:space="preserve"> </w:t>
-      </w:r>
-      <w:proofErr w:type="spellStart"/>
-      <w:r>
-        <w:t>voluptate</w:t>
-      </w:r>
-      <w:proofErr w:type="spellEnd"/>
-      <w:r>
-        <w:t xml:space="preserve">, </w:t>
-      </w:r>
-      <w:proofErr w:type="spellStart"/>
-      <w:r>
-        <w:t>velit</w:t>
-      </w:r>
-      <w:proofErr w:type="spellEnd"/>
-      <w:r>
-        <w:t xml:space="preserve"> </w:t>
-      </w:r>
-      <w:proofErr w:type="spellStart"/>
-      <w:r>
-        <w:t>veniam</w:t>
-      </w:r>
-      <w:proofErr w:type="spellEnd"/>
-      <w:r>
-        <w:t xml:space="preserve">. Fanny pack man bun </w:t>
-      </w:r>
-      <w:proofErr w:type="spellStart"/>
-      <w:r>
-        <w:t>helvetica</w:t>
-      </w:r>
-      <w:proofErr w:type="spellEnd"/>
-      <w:r>
-        <w:t xml:space="preserve"> viral, </w:t>
-      </w:r>
-      <w:proofErr w:type="spellStart"/>
-      <w:r>
-        <w:t>edison</w:t>
-      </w:r>
-      <w:proofErr w:type="spellEnd"/>
-      <w:r>
-        <w:t xml:space="preserve"> bulb </w:t>
-      </w:r>
-      <w:proofErr w:type="spellStart"/>
-      <w:r>
-        <w:t>cliche</w:t>
-      </w:r>
-      <w:proofErr w:type="spellEnd"/>
-      <w:r>
-        <w:t xml:space="preserve"> jianbing.</w:t>
+        <w:t>The Member Info screen is where new players are entered</w:t>
+      </w:r>
+      <w:r>
+        <w:t>; member information is updated; and member information can be imported from Excel files. The member number is auto-generated for each new member. The member last and first name are required. If you are pressed for time, you can save the member at this point, then come back and fill in the other information. Select if they are active or inactive under Status. Based on the member’s birthdate, are they old enough to be in the senior bracket? If yes, check the “</w:t>
+      </w:r>
+      <w:proofErr w:type="gramStart"/>
+      <w:r>
+        <w:t>Senior</w:t>
+      </w:r>
+      <w:proofErr w:type="gramEnd"/>
+      <w:r>
+        <w:t xml:space="preserve">” box. Select gender under Gender section. </w:t>
       </w:r>
     </w:p>
     <w:p>
@@ -2812,17 +2459,35 @@
       <w:r>
         <w:t xml:space="preserve">Figure </w:t>
       </w:r>
-      <w:fldSimple w:instr=" SEQ Figure \* ARABIC ">
-        <w:r>
-          <w:rPr>
-            <w:noProof/>
-          </w:rPr>
-          <w:t>4</w:t>
-        </w:r>
-      </w:fldSimple>
+      <w:r>
+        <w:fldChar w:fldCharType="begin"/>
+      </w:r>
+      <w:r>
+        <w:instrText xml:space="preserve"> SEQ Figure \* ARABIC </w:instrText>
+      </w:r>
+      <w:r>
+        <w:fldChar w:fldCharType="separate"/>
+      </w:r>
+      <w:r>
+        <w:rPr>
+          <w:noProof/>
+        </w:rPr>
+        <w:t>4</w:t>
+      </w:r>
+      <w:r>
+        <w:rPr>
+          <w:noProof/>
+        </w:rPr>
+        <w:fldChar w:fldCharType="end"/>
+      </w:r>
       <w:r>
         <w:t>: Member Information</w:t>
       </w:r>
+    </w:p>
+    <w:p>
+      <w:pPr>
+        <w:pStyle w:val="BodyText"/>
+      </w:pPr>
     </w:p>
     <w:p>
       <w:pPr>
@@ -2853,7 +2518,15 @@
       </w:r>
       <w:proofErr w:type="spellEnd"/>
       <w:r>
-        <w:t xml:space="preserve"> jianbing, locavore VHS salvia +1 vegan gluten-free </w:t>
+        <w:t xml:space="preserve"> </w:t>
+      </w:r>
+      <w:proofErr w:type="spellStart"/>
+      <w:r>
+        <w:t>jianbing</w:t>
+      </w:r>
+      <w:proofErr w:type="spellEnd"/>
+      <w:r>
+        <w:t xml:space="preserve">, locavore VHS salvia +1 vegan gluten-free </w:t>
       </w:r>
       <w:proofErr w:type="spellStart"/>
       <w:r>
@@ -2869,7 +2542,15 @@
       </w:r>
       <w:proofErr w:type="spellEnd"/>
       <w:r>
-        <w:t xml:space="preserve"> affogato. Fanny pack </w:t>
+        <w:t xml:space="preserve"> </w:t>
+      </w:r>
+      <w:proofErr w:type="spellStart"/>
+      <w:r>
+        <w:t>affogato</w:t>
+      </w:r>
+      <w:proofErr w:type="spellEnd"/>
+      <w:r>
+        <w:t xml:space="preserve">. Fanny pack </w:t>
       </w:r>
       <w:proofErr w:type="spellStart"/>
       <w:r>
@@ -2997,7 +2678,15 @@
       </w:r>
       <w:proofErr w:type="spellEnd"/>
       <w:r>
-        <w:t xml:space="preserve"> jianbing.</w:t>
+        <w:t xml:space="preserve"> </w:t>
+      </w:r>
+      <w:proofErr w:type="spellStart"/>
+      <w:r>
+        <w:t>jianbing</w:t>
+      </w:r>
+      <w:proofErr w:type="spellEnd"/>
+      <w:r>
+        <w:t>.</w:t>
       </w:r>
     </w:p>
     <w:p>
@@ -3061,14 +2750,27 @@
       <w:r>
         <w:t xml:space="preserve">Figure </w:t>
       </w:r>
-      <w:fldSimple w:instr=" SEQ Figure \* ARABIC ">
-        <w:r>
-          <w:rPr>
-            <w:noProof/>
-          </w:rPr>
-          <w:t>5</w:t>
-        </w:r>
-      </w:fldSimple>
+      <w:r>
+        <w:fldChar w:fldCharType="begin"/>
+      </w:r>
+      <w:r>
+        <w:instrText xml:space="preserve"> SEQ Figure \* ARABIC </w:instrText>
+      </w:r>
+      <w:r>
+        <w:fldChar w:fldCharType="separate"/>
+      </w:r>
+      <w:r>
+        <w:rPr>
+          <w:noProof/>
+        </w:rPr>
+        <w:t>5</w:t>
+      </w:r>
+      <w:r>
+        <w:rPr>
+          <w:noProof/>
+        </w:rPr>
+        <w:fldChar w:fldCharType="end"/>
+      </w:r>
       <w:r>
         <w:t>: Stats Form</w:t>
       </w:r>
@@ -3102,7 +2804,15 @@
       </w:r>
       <w:proofErr w:type="spellEnd"/>
       <w:r>
-        <w:t xml:space="preserve"> jianbing, locavore VHS salvia +1 vegan gluten-free </w:t>
+        <w:t xml:space="preserve"> </w:t>
+      </w:r>
+      <w:proofErr w:type="spellStart"/>
+      <w:r>
+        <w:t>jianbing</w:t>
+      </w:r>
+      <w:proofErr w:type="spellEnd"/>
+      <w:r>
+        <w:t xml:space="preserve">, locavore VHS salvia +1 vegan gluten-free </w:t>
       </w:r>
       <w:proofErr w:type="spellStart"/>
       <w:r>
@@ -3118,7 +2828,15 @@
       </w:r>
       <w:proofErr w:type="spellEnd"/>
       <w:r>
-        <w:t xml:space="preserve"> affogato. Fanny pack </w:t>
+        <w:t xml:space="preserve"> </w:t>
+      </w:r>
+      <w:proofErr w:type="spellStart"/>
+      <w:r>
+        <w:t>affogato</w:t>
+      </w:r>
+      <w:proofErr w:type="spellEnd"/>
+      <w:r>
+        <w:t xml:space="preserve">. Fanny pack </w:t>
       </w:r>
       <w:proofErr w:type="spellStart"/>
       <w:r>
@@ -3246,7 +2964,15 @@
       </w:r>
       <w:proofErr w:type="spellEnd"/>
       <w:r>
-        <w:t xml:space="preserve"> jianbing.</w:t>
+        <w:t xml:space="preserve"> </w:t>
+      </w:r>
+      <w:proofErr w:type="spellStart"/>
+      <w:r>
+        <w:t>jianbing</w:t>
+      </w:r>
+      <w:proofErr w:type="spellEnd"/>
+      <w:r>
+        <w:t>.</w:t>
       </w:r>
     </w:p>
     <w:p>
@@ -3356,14 +3082,27 @@
       <w:r>
         <w:t xml:space="preserve">Figure </w:t>
       </w:r>
-      <w:fldSimple w:instr=" SEQ Figure \* ARABIC ">
-        <w:r>
-          <w:rPr>
-            <w:noProof/>
-          </w:rPr>
-          <w:t>6</w:t>
-        </w:r>
-      </w:fldSimple>
+      <w:r>
+        <w:fldChar w:fldCharType="begin"/>
+      </w:r>
+      <w:r>
+        <w:instrText xml:space="preserve"> SEQ Figure \* ARABIC </w:instrText>
+      </w:r>
+      <w:r>
+        <w:fldChar w:fldCharType="separate"/>
+      </w:r>
+      <w:r>
+        <w:rPr>
+          <w:noProof/>
+        </w:rPr>
+        <w:t>6</w:t>
+      </w:r>
+      <w:r>
+        <w:rPr>
+          <w:noProof/>
+        </w:rPr>
+        <w:fldChar w:fldCharType="end"/>
+      </w:r>
       <w:r>
         <w:t>: Member search, blank and with results</w:t>
       </w:r>
@@ -3389,159 +3128,7 @@
         <w:keepNext/>
       </w:pPr>
       <w:r>
-        <w:t xml:space="preserve">Craft beer sartorial copper mug </w:t>
-      </w:r>
-      <w:proofErr w:type="spellStart"/>
-      <w:r>
-        <w:t>tbh</w:t>
-      </w:r>
-      <w:proofErr w:type="spellEnd"/>
-      <w:r>
-        <w:t xml:space="preserve"> jianbing, locavore VHS salvia +1 vegan gluten-free </w:t>
-      </w:r>
-      <w:proofErr w:type="spellStart"/>
-      <w:r>
-        <w:t>kogi</w:t>
-      </w:r>
-      <w:proofErr w:type="spellEnd"/>
-      <w:r>
-        <w:t xml:space="preserve"> pug </w:t>
-      </w:r>
-      <w:proofErr w:type="spellStart"/>
-      <w:r>
-        <w:t>vexillologist</w:t>
-      </w:r>
-      <w:proofErr w:type="spellEnd"/>
-      <w:r>
-        <w:t xml:space="preserve"> affogato. Fanny pack </w:t>
-      </w:r>
-      <w:proofErr w:type="spellStart"/>
-      <w:r>
-        <w:t>palo</w:t>
-      </w:r>
-      <w:proofErr w:type="spellEnd"/>
-      <w:r>
-        <w:t xml:space="preserve"> </w:t>
-      </w:r>
-      <w:proofErr w:type="spellStart"/>
-      <w:r>
-        <w:t>santo</w:t>
-      </w:r>
-      <w:proofErr w:type="spellEnd"/>
-      <w:r>
-        <w:t xml:space="preserve"> </w:t>
-      </w:r>
-      <w:proofErr w:type="spellStart"/>
-      <w:r>
-        <w:t>proident</w:t>
-      </w:r>
-      <w:proofErr w:type="spellEnd"/>
-      <w:r>
-        <w:t xml:space="preserve"> blog bespoke </w:t>
-      </w:r>
-      <w:proofErr w:type="spellStart"/>
-      <w:r>
-        <w:t>commodo</w:t>
-      </w:r>
-      <w:proofErr w:type="spellEnd"/>
-      <w:r>
-        <w:t xml:space="preserve"> tilde hammock </w:t>
-      </w:r>
-      <w:proofErr w:type="spellStart"/>
-      <w:r>
-        <w:t>taiyaki</w:t>
-      </w:r>
-      <w:proofErr w:type="spellEnd"/>
-      <w:r>
-        <w:t xml:space="preserve"> wayfarers gentrify. Cardigan ugh slow-carb, </w:t>
-      </w:r>
-      <w:proofErr w:type="spellStart"/>
-      <w:r>
-        <w:t>ea</w:t>
-      </w:r>
-      <w:proofErr w:type="spellEnd"/>
-      <w:r>
-        <w:t xml:space="preserve"> DIY hot chicken </w:t>
-      </w:r>
-      <w:proofErr w:type="spellStart"/>
-      <w:r>
-        <w:t>commodo</w:t>
-      </w:r>
-      <w:proofErr w:type="spellEnd"/>
-      <w:r>
-        <w:t xml:space="preserve"> </w:t>
-      </w:r>
-      <w:proofErr w:type="spellStart"/>
-      <w:r>
-        <w:t>godard</w:t>
-      </w:r>
-      <w:proofErr w:type="spellEnd"/>
-      <w:r>
-        <w:t xml:space="preserve">. Lorem </w:t>
-      </w:r>
-      <w:proofErr w:type="spellStart"/>
-      <w:r>
-        <w:t>sint</w:t>
-      </w:r>
-      <w:proofErr w:type="spellEnd"/>
-      <w:r>
-        <w:t xml:space="preserve"> qui 3 wolf moon </w:t>
-      </w:r>
-      <w:proofErr w:type="spellStart"/>
-      <w:r>
-        <w:t>enim</w:t>
-      </w:r>
-      <w:proofErr w:type="spellEnd"/>
-      <w:r>
-        <w:t xml:space="preserve"> </w:t>
-      </w:r>
-      <w:proofErr w:type="spellStart"/>
-      <w:r>
-        <w:t>voluptate</w:t>
-      </w:r>
-      <w:proofErr w:type="spellEnd"/>
-      <w:r>
-        <w:t xml:space="preserve">, </w:t>
-      </w:r>
-      <w:proofErr w:type="spellStart"/>
-      <w:r>
-        <w:t>velit</w:t>
-      </w:r>
-      <w:proofErr w:type="spellEnd"/>
-      <w:r>
-        <w:t xml:space="preserve"> </w:t>
-      </w:r>
-      <w:proofErr w:type="spellStart"/>
-      <w:r>
-        <w:t>veniam</w:t>
-      </w:r>
-      <w:proofErr w:type="spellEnd"/>
-      <w:r>
-        <w:t xml:space="preserve">. Fanny pack man bun </w:t>
-      </w:r>
-      <w:proofErr w:type="spellStart"/>
-      <w:r>
-        <w:t>helvetica</w:t>
-      </w:r>
-      <w:proofErr w:type="spellEnd"/>
-      <w:r>
-        <w:t xml:space="preserve"> viral, </w:t>
-      </w:r>
-      <w:proofErr w:type="spellStart"/>
-      <w:r>
-        <w:t>edison</w:t>
-      </w:r>
-      <w:proofErr w:type="spellEnd"/>
-      <w:r>
-        <w:t xml:space="preserve"> bulb </w:t>
-      </w:r>
-      <w:proofErr w:type="spellStart"/>
-      <w:r>
-        <w:t>cliche</w:t>
-      </w:r>
-      <w:proofErr w:type="spellEnd"/>
-      <w:r>
-        <w:t xml:space="preserve"> jianbing.</w:t>
+        <w:t xml:space="preserve">The “Print Single” and “Print Tournament” buttons go directly to your computers print dialog. You can then “print to pdf” to save the information as a pdf file. The “Print by Date” button </w:t>
       </w:r>
     </w:p>
     <w:p>
@@ -3556,8 +3143,8 @@
         </w:rPr>
         <w:drawing>
           <wp:inline distT="0" distB="0" distL="0" distR="0">
-            <wp:extent cx="4305901" cy="3277057"/>
-            <wp:effectExtent l="0" t="0" r="0" b="0"/>
+            <wp:extent cx="4092538" cy="3114675"/>
+            <wp:effectExtent l="0" t="0" r="3810" b="0"/>
             <wp:docPr id="10" name="Picture 10"/>
             <wp:cNvGraphicFramePr>
               <a:graphicFrameLocks xmlns:a="http://schemas.openxmlformats.org/drawingml/2006/main" noChangeAspect="1"/>
@@ -3584,7 +3171,7 @@
                   <pic:spPr>
                     <a:xfrm>
                       <a:off x="0" y="0"/>
-                      <a:ext cx="4305901" cy="3277057"/>
+                      <a:ext cx="4098949" cy="3119554"/>
                     </a:xfrm>
                     <a:prstGeom prst="rect">
                       <a:avLst/>
@@ -3605,16 +3192,92 @@
       <w:r>
         <w:t xml:space="preserve">Figure </w:t>
       </w:r>
-      <w:fldSimple w:instr=" SEQ Figure \* ARABIC ">
-        <w:r>
-          <w:rPr>
-            <w:noProof/>
-          </w:rPr>
-          <w:t>7</w:t>
-        </w:r>
-      </w:fldSimple>
+      <w:r>
+        <w:fldChar w:fldCharType="begin"/>
+      </w:r>
+      <w:r>
+        <w:instrText xml:space="preserve"> SEQ Figure \* ARABIC </w:instrText>
+      </w:r>
+      <w:r>
+        <w:fldChar w:fldCharType="separate"/>
+      </w:r>
+      <w:r>
+        <w:rPr>
+          <w:noProof/>
+        </w:rPr>
+        <w:t>7</w:t>
+      </w:r>
+      <w:r>
+        <w:rPr>
+          <w:noProof/>
+        </w:rPr>
+        <w:fldChar w:fldCharType="end"/>
+      </w:r>
       <w:r>
         <w:t>: basic printer dialog</w:t>
+      </w:r>
+      <w:r>
+        <w:t xml:space="preserve">, Print </w:t>
+      </w:r>
+      <w:proofErr w:type="gramStart"/>
+      <w:r>
+        <w:t>By</w:t>
+      </w:r>
+      <w:proofErr w:type="gramEnd"/>
+      <w:r>
+        <w:t xml:space="preserve"> Date form.</w:t>
+      </w:r>
+    </w:p>
+    <w:p>
+      <w:pPr>
+        <w:pStyle w:val="BodyText"/>
+        <w:jc w:val="center"/>
+      </w:pPr>
+      <w:r>
+        <w:rPr>
+          <w:noProof/>
+        </w:rPr>
+        <w:drawing>
+          <wp:inline distT="0" distB="0" distL="0" distR="0">
+            <wp:extent cx="2810267" cy="3534268"/>
+            <wp:effectExtent l="0" t="0" r="9525" b="9525"/>
+            <wp:docPr id="2" name="Picture 2"/>
+            <wp:cNvGraphicFramePr>
+              <a:graphicFrameLocks xmlns:a="http://schemas.openxmlformats.org/drawingml/2006/main" noChangeAspect="1"/>
+            </wp:cNvGraphicFramePr>
+            <a:graphic xmlns:a="http://schemas.openxmlformats.org/drawingml/2006/main">
+              <a:graphicData uri="http://schemas.openxmlformats.org/drawingml/2006/picture">
+                <pic:pic xmlns:pic="http://schemas.openxmlformats.org/drawingml/2006/picture">
+                  <pic:nvPicPr>
+                    <pic:cNvPr id="2" name="PrintByDateForm.PNG"/>
+                    <pic:cNvPicPr/>
+                  </pic:nvPicPr>
+                  <pic:blipFill>
+                    <a:blip r:embed="rId21">
+                      <a:extLst>
+                        <a:ext uri="{28A0092B-C50C-407E-A947-70E740481C1C}">
+                          <a14:useLocalDpi xmlns:a14="http://schemas.microsoft.com/office/drawing/2010/main" val="0"/>
+                        </a:ext>
+                      </a:extLst>
+                    </a:blip>
+                    <a:stretch>
+                      <a:fillRect/>
+                    </a:stretch>
+                  </pic:blipFill>
+                  <pic:spPr>
+                    <a:xfrm>
+                      <a:off x="0" y="0"/>
+                      <a:ext cx="2810267" cy="3534268"/>
+                    </a:xfrm>
+                    <a:prstGeom prst="rect">
+                      <a:avLst/>
+                    </a:prstGeom>
+                  </pic:spPr>
+                </pic:pic>
+              </a:graphicData>
+            </a:graphic>
+          </wp:inline>
+        </w:drawing>
       </w:r>
     </w:p>
     <w:p>
@@ -3646,7 +3309,15 @@
       </w:r>
       <w:proofErr w:type="spellEnd"/>
       <w:r>
-        <w:t xml:space="preserve"> jianbing, locavore VHS salvia +1 vegan gluten-free </w:t>
+        <w:t xml:space="preserve"> </w:t>
+      </w:r>
+      <w:proofErr w:type="spellStart"/>
+      <w:r>
+        <w:t>jianbing</w:t>
+      </w:r>
+      <w:proofErr w:type="spellEnd"/>
+      <w:r>
+        <w:t xml:space="preserve">, locavore VHS salvia +1 vegan gluten-free </w:t>
       </w:r>
       <w:proofErr w:type="spellStart"/>
       <w:r>
@@ -3662,7 +3333,15 @@
       </w:r>
       <w:proofErr w:type="spellEnd"/>
       <w:r>
-        <w:t xml:space="preserve"> affogato. Fanny pack </w:t>
+        <w:t xml:space="preserve"> </w:t>
+      </w:r>
+      <w:proofErr w:type="spellStart"/>
+      <w:r>
+        <w:t>affogato</w:t>
+      </w:r>
+      <w:proofErr w:type="spellEnd"/>
+      <w:r>
+        <w:t xml:space="preserve">. Fanny pack </w:t>
       </w:r>
       <w:proofErr w:type="spellStart"/>
       <w:r>
@@ -3790,7 +3469,15 @@
       </w:r>
       <w:proofErr w:type="spellEnd"/>
       <w:r>
-        <w:t xml:space="preserve"> jianbing.</w:t>
+        <w:t xml:space="preserve"> </w:t>
+      </w:r>
+      <w:proofErr w:type="spellStart"/>
+      <w:r>
+        <w:t>jianbing</w:t>
+      </w:r>
+      <w:proofErr w:type="spellEnd"/>
+      <w:r>
+        <w:t>.</w:t>
       </w:r>
     </w:p>
     <w:p>
@@ -3819,7 +3506,7 @@
                     <pic:cNvPicPr/>
                   </pic:nvPicPr>
                   <pic:blipFill>
-                    <a:blip r:embed="rId21">
+                    <a:blip r:embed="rId22">
                       <a:extLst>
                         <a:ext uri="{28A0092B-C50C-407E-A947-70E740481C1C}">
                           <a14:useLocalDpi xmlns:a14="http://schemas.microsoft.com/office/drawing/2010/main" val="0"/>
@@ -3854,14 +3541,27 @@
       <w:r>
         <w:t xml:space="preserve">Figure </w:t>
       </w:r>
-      <w:fldSimple w:instr=" SEQ Figure \* ARABIC ">
-        <w:r>
-          <w:rPr>
-            <w:noProof/>
-          </w:rPr>
-          <w:t>8</w:t>
-        </w:r>
-      </w:fldSimple>
+      <w:r>
+        <w:fldChar w:fldCharType="begin"/>
+      </w:r>
+      <w:r>
+        <w:instrText xml:space="preserve"> SEQ Figure \* ARABIC </w:instrText>
+      </w:r>
+      <w:r>
+        <w:fldChar w:fldCharType="separate"/>
+      </w:r>
+      <w:r>
+        <w:rPr>
+          <w:noProof/>
+        </w:rPr>
+        <w:t>8</w:t>
+      </w:r>
+      <w:r>
+        <w:rPr>
+          <w:noProof/>
+        </w:rPr>
+        <w:fldChar w:fldCharType="end"/>
+      </w:r>
       <w:r>
         <w:t>: Print Labels Dialog</w:t>
       </w:r>
@@ -3895,7 +3595,15 @@
       </w:r>
       <w:proofErr w:type="spellEnd"/>
       <w:r>
-        <w:t xml:space="preserve"> jianbing, locavore VHS salvia +1 vegan gluten-free </w:t>
+        <w:t xml:space="preserve"> </w:t>
+      </w:r>
+      <w:proofErr w:type="spellStart"/>
+      <w:r>
+        <w:t>jianbing</w:t>
+      </w:r>
+      <w:proofErr w:type="spellEnd"/>
+      <w:r>
+        <w:t xml:space="preserve">, locavore VHS salvia +1 vegan gluten-free </w:t>
       </w:r>
       <w:proofErr w:type="spellStart"/>
       <w:r>
@@ -3911,7 +3619,15 @@
       </w:r>
       <w:proofErr w:type="spellEnd"/>
       <w:r>
-        <w:t xml:space="preserve"> affogato. Fanny pack </w:t>
+        <w:t xml:space="preserve"> </w:t>
+      </w:r>
+      <w:proofErr w:type="spellStart"/>
+      <w:r>
+        <w:t>affogato</w:t>
+      </w:r>
+      <w:proofErr w:type="spellEnd"/>
+      <w:r>
+        <w:t xml:space="preserve">. Fanny pack </w:t>
       </w:r>
       <w:proofErr w:type="spellStart"/>
       <w:r>
@@ -4039,7 +3755,15 @@
       </w:r>
       <w:proofErr w:type="spellEnd"/>
       <w:r>
-        <w:t xml:space="preserve"> jianbing.</w:t>
+        <w:t xml:space="preserve"> </w:t>
+      </w:r>
+      <w:proofErr w:type="spellStart"/>
+      <w:r>
+        <w:t>jianbing</w:t>
+      </w:r>
+      <w:proofErr w:type="spellEnd"/>
+      <w:r>
+        <w:t>.</w:t>
       </w:r>
     </w:p>
     <w:p>
@@ -4068,7 +3792,7 @@
                     <pic:cNvPicPr/>
                   </pic:nvPicPr>
                   <pic:blipFill>
-                    <a:blip r:embed="rId22">
+                    <a:blip r:embed="rId23">
                       <a:extLst>
                         <a:ext uri="{28A0092B-C50C-407E-A947-70E740481C1C}">
                           <a14:useLocalDpi xmlns:a14="http://schemas.microsoft.com/office/drawing/2010/main" val="0"/>
@@ -4103,14 +3827,27 @@
       <w:r>
         <w:t xml:space="preserve">Figure </w:t>
       </w:r>
-      <w:fldSimple w:instr=" SEQ Figure \* ARABIC ">
-        <w:r>
-          <w:rPr>
-            <w:noProof/>
-          </w:rPr>
-          <w:t>9</w:t>
-        </w:r>
-      </w:fldSimple>
+      <w:r>
+        <w:fldChar w:fldCharType="begin"/>
+      </w:r>
+      <w:r>
+        <w:instrText xml:space="preserve"> SEQ Figure \* ARABIC </w:instrText>
+      </w:r>
+      <w:r>
+        <w:fldChar w:fldCharType="separate"/>
+      </w:r>
+      <w:r>
+        <w:rPr>
+          <w:noProof/>
+        </w:rPr>
+        <w:t>9</w:t>
+      </w:r>
+      <w:r>
+        <w:rPr>
+          <w:noProof/>
+        </w:rPr>
+        <w:fldChar w:fldCharType="end"/>
+      </w:r>
       <w:r>
         <w:t>: Importing existing player information</w:t>
       </w:r>
@@ -4153,7 +3890,15 @@
       </w:r>
       <w:proofErr w:type="spellEnd"/>
       <w:r>
-        <w:t xml:space="preserve"> jianbing, locavore VHS salvia +1 vegan gluten-free </w:t>
+        <w:t xml:space="preserve"> </w:t>
+      </w:r>
+      <w:proofErr w:type="spellStart"/>
+      <w:r>
+        <w:t>jianbing</w:t>
+      </w:r>
+      <w:proofErr w:type="spellEnd"/>
+      <w:r>
+        <w:t xml:space="preserve">, locavore VHS salvia +1 vegan gluten-free </w:t>
       </w:r>
       <w:proofErr w:type="spellStart"/>
       <w:r>
@@ -4169,7 +3914,15 @@
       </w:r>
       <w:proofErr w:type="spellEnd"/>
       <w:r>
-        <w:t xml:space="preserve"> affogato. Fanny pack </w:t>
+        <w:t xml:space="preserve"> </w:t>
+      </w:r>
+      <w:proofErr w:type="spellStart"/>
+      <w:r>
+        <w:t>affogato</w:t>
+      </w:r>
+      <w:proofErr w:type="spellEnd"/>
+      <w:r>
+        <w:t xml:space="preserve">. Fanny pack </w:t>
       </w:r>
       <w:proofErr w:type="spellStart"/>
       <w:r>
@@ -4297,7 +4050,15 @@
       </w:r>
       <w:proofErr w:type="spellEnd"/>
       <w:r>
-        <w:t xml:space="preserve"> jianbing.</w:t>
+        <w:t xml:space="preserve"> </w:t>
+      </w:r>
+      <w:proofErr w:type="spellStart"/>
+      <w:r>
+        <w:t>jianbing</w:t>
+      </w:r>
+      <w:proofErr w:type="spellEnd"/>
+      <w:r>
+        <w:t>.</w:t>
       </w:r>
     </w:p>
     <w:p>
@@ -4306,14 +4067,15 @@
         <w:keepNext/>
         <w:jc w:val="center"/>
       </w:pPr>
+      <w:bookmarkStart w:id="0" w:name="_GoBack"/>
       <w:r>
         <w:rPr>
           <w:noProof/>
         </w:rPr>
         <w:drawing>
           <wp:inline distT="0" distB="0" distL="0" distR="0">
-            <wp:extent cx="4857750" cy="4342247"/>
-            <wp:effectExtent l="0" t="0" r="0" b="1270"/>
+            <wp:extent cx="4858133" cy="4365206"/>
+            <wp:effectExtent l="0" t="0" r="0" b="0"/>
             <wp:docPr id="6" name="Picture 6"/>
             <wp:cNvGraphicFramePr>
               <a:graphicFrameLocks xmlns:a="http://schemas.openxmlformats.org/drawingml/2006/main" noChangeAspect="1"/>
@@ -4325,21 +4087,22 @@
                     <pic:cNvPr id="6" name="MemberScoresForm.PNG"/>
                     <pic:cNvPicPr/>
                   </pic:nvPicPr>
-                  <pic:blipFill rotWithShape="1">
-                    <a:blip r:embed="rId23">
+                  <pic:blipFill>
+                    <a:blip r:embed="rId24">
                       <a:extLst>
                         <a:ext uri="{28A0092B-C50C-407E-A947-70E740481C1C}">
                           <a14:useLocalDpi xmlns:a14="http://schemas.microsoft.com/office/drawing/2010/main" val="0"/>
                         </a:ext>
                       </a:extLst>
                     </a:blip>
-                    <a:srcRect l="-1" r="40078"/>
-                    <a:stretch/>
+                    <a:stretch>
+                      <a:fillRect/>
+                    </a:stretch>
                   </pic:blipFill>
                   <pic:spPr bwMode="auto">
                     <a:xfrm>
                       <a:off x="0" y="0"/>
-                      <a:ext cx="4883434" cy="4365206"/>
+                      <a:ext cx="4858133" cy="4365206"/>
                     </a:xfrm>
                     <a:prstGeom prst="rect">
                       <a:avLst/>
@@ -4359,6 +4122,7 @@
           </wp:inline>
         </w:drawing>
       </w:r>
+      <w:bookmarkEnd w:id="0"/>
     </w:p>
     <w:p>
       <w:pPr>
@@ -4368,14 +4132,27 @@
       <w:r>
         <w:t xml:space="preserve">Figure </w:t>
       </w:r>
-      <w:fldSimple w:instr=" SEQ Figure \* ARABIC ">
-        <w:r>
-          <w:rPr>
-            <w:noProof/>
-          </w:rPr>
-          <w:t>10</w:t>
-        </w:r>
-      </w:fldSimple>
+      <w:r>
+        <w:fldChar w:fldCharType="begin"/>
+      </w:r>
+      <w:r>
+        <w:instrText xml:space="preserve"> SEQ Figure \* ARABIC </w:instrText>
+      </w:r>
+      <w:r>
+        <w:fldChar w:fldCharType="separate"/>
+      </w:r>
+      <w:r>
+        <w:rPr>
+          <w:noProof/>
+        </w:rPr>
+        <w:t>10</w:t>
+      </w:r>
+      <w:r>
+        <w:rPr>
+          <w:noProof/>
+        </w:rPr>
+        <w:fldChar w:fldCharType="end"/>
+      </w:r>
       <w:r>
         <w:t>: Member Scores</w:t>
       </w:r>
@@ -4409,7 +4186,15 @@
       </w:r>
       <w:proofErr w:type="spellEnd"/>
       <w:r>
-        <w:t xml:space="preserve"> jianbing, locavore VHS salvia +1 vegan gluten-free </w:t>
+        <w:t xml:space="preserve"> </w:t>
+      </w:r>
+      <w:proofErr w:type="spellStart"/>
+      <w:r>
+        <w:t>jianbing</w:t>
+      </w:r>
+      <w:proofErr w:type="spellEnd"/>
+      <w:r>
+        <w:t xml:space="preserve">, locavore VHS salvia +1 vegan gluten-free </w:t>
       </w:r>
       <w:proofErr w:type="spellStart"/>
       <w:r>
@@ -4425,7 +4210,15 @@
       </w:r>
       <w:proofErr w:type="spellEnd"/>
       <w:r>
-        <w:t xml:space="preserve"> affogato. Fanny pack </w:t>
+        <w:t xml:space="preserve"> </w:t>
+      </w:r>
+      <w:proofErr w:type="spellStart"/>
+      <w:r>
+        <w:t>affogato</w:t>
+      </w:r>
+      <w:proofErr w:type="spellEnd"/>
+      <w:r>
+        <w:t xml:space="preserve">. Fanny pack </w:t>
       </w:r>
       <w:proofErr w:type="spellStart"/>
       <w:r>
@@ -4553,7 +4346,15 @@
       </w:r>
       <w:proofErr w:type="spellEnd"/>
       <w:r>
-        <w:t xml:space="preserve"> jianbing.</w:t>
+        <w:t xml:space="preserve"> </w:t>
+      </w:r>
+      <w:proofErr w:type="spellStart"/>
+      <w:r>
+        <w:t>jianbing</w:t>
+      </w:r>
+      <w:proofErr w:type="spellEnd"/>
+      <w:r>
+        <w:t>.</w:t>
       </w:r>
     </w:p>
     <w:p>
@@ -4582,7 +4383,7 @@
                     <pic:cNvPicPr/>
                   </pic:nvPicPr>
                   <pic:blipFill>
-                    <a:blip r:embed="rId24" cstate="print">
+                    <a:blip r:embed="rId25" cstate="print">
                       <a:extLst>
                         <a:ext uri="{28A0092B-C50C-407E-A947-70E740481C1C}">
                           <a14:useLocalDpi xmlns:a14="http://schemas.microsoft.com/office/drawing/2010/main" val="0"/>
@@ -4617,14 +4418,27 @@
       <w:r>
         <w:t xml:space="preserve">Figure </w:t>
       </w:r>
-      <w:fldSimple w:instr=" SEQ Figure \* ARABIC ">
-        <w:r>
-          <w:rPr>
-            <w:noProof/>
-          </w:rPr>
-          <w:t>11</w:t>
-        </w:r>
-      </w:fldSimple>
+      <w:r>
+        <w:fldChar w:fldCharType="begin"/>
+      </w:r>
+      <w:r>
+        <w:instrText xml:space="preserve"> SEQ Figure \* ARABIC </w:instrText>
+      </w:r>
+      <w:r>
+        <w:fldChar w:fldCharType="separate"/>
+      </w:r>
+      <w:r>
+        <w:rPr>
+          <w:noProof/>
+        </w:rPr>
+        <w:t>11</w:t>
+      </w:r>
+      <w:r>
+        <w:rPr>
+          <w:noProof/>
+        </w:rPr>
+        <w:fldChar w:fldCharType="end"/>
+      </w:r>
       <w:r>
         <w:t>: Tournament Stats Form</w:t>
       </w:r>
@@ -4671,7 +4485,15 @@
       </w:r>
       <w:proofErr w:type="spellEnd"/>
       <w:r>
-        <w:t xml:space="preserve"> jianbing, locavore VHS salvia +1 vegan gluten-free </w:t>
+        <w:t xml:space="preserve"> </w:t>
+      </w:r>
+      <w:proofErr w:type="spellStart"/>
+      <w:r>
+        <w:t>jianbing</w:t>
+      </w:r>
+      <w:proofErr w:type="spellEnd"/>
+      <w:r>
+        <w:t xml:space="preserve">, locavore VHS salvia +1 vegan gluten-free </w:t>
       </w:r>
       <w:proofErr w:type="spellStart"/>
       <w:r>
@@ -4687,7 +4509,15 @@
       </w:r>
       <w:proofErr w:type="spellEnd"/>
       <w:r>
-        <w:t xml:space="preserve"> affogato. Fanny pack </w:t>
+        <w:t xml:space="preserve"> </w:t>
+      </w:r>
+      <w:proofErr w:type="spellStart"/>
+      <w:r>
+        <w:t>affogato</w:t>
+      </w:r>
+      <w:proofErr w:type="spellEnd"/>
+      <w:r>
+        <w:t xml:space="preserve">. Fanny pack </w:t>
       </w:r>
       <w:proofErr w:type="spellStart"/>
       <w:r>
@@ -4815,7 +4645,15 @@
       </w:r>
       <w:proofErr w:type="spellEnd"/>
       <w:r>
-        <w:t xml:space="preserve"> jianbing.</w:t>
+        <w:t xml:space="preserve"> </w:t>
+      </w:r>
+      <w:proofErr w:type="spellStart"/>
+      <w:r>
+        <w:t>jianbing</w:t>
+      </w:r>
+      <w:proofErr w:type="spellEnd"/>
+      <w:r>
+        <w:t>.</w:t>
       </w:r>
     </w:p>
     <w:p>
@@ -4846,7 +4684,15 @@
       </w:r>
       <w:proofErr w:type="spellEnd"/>
       <w:r>
-        <w:t xml:space="preserve"> jianbing, locavore VHS salvia +1 vegan gluten-free </w:t>
+        <w:t xml:space="preserve"> </w:t>
+      </w:r>
+      <w:proofErr w:type="spellStart"/>
+      <w:r>
+        <w:t>jianbing</w:t>
+      </w:r>
+      <w:proofErr w:type="spellEnd"/>
+      <w:r>
+        <w:t xml:space="preserve">, locavore VHS salvia +1 vegan gluten-free </w:t>
       </w:r>
       <w:proofErr w:type="spellStart"/>
       <w:r>
@@ -4862,7 +4708,15 @@
       </w:r>
       <w:proofErr w:type="spellEnd"/>
       <w:r>
-        <w:t xml:space="preserve"> affogato. Fanny pack </w:t>
+        <w:t xml:space="preserve"> </w:t>
+      </w:r>
+      <w:proofErr w:type="spellStart"/>
+      <w:r>
+        <w:t>affogato</w:t>
+      </w:r>
+      <w:proofErr w:type="spellEnd"/>
+      <w:r>
+        <w:t xml:space="preserve">. Fanny pack </w:t>
       </w:r>
       <w:proofErr w:type="spellStart"/>
       <w:r>
@@ -4990,7 +4844,15 @@
       </w:r>
       <w:proofErr w:type="spellEnd"/>
       <w:r>
-        <w:t xml:space="preserve"> jianbing.</w:t>
+        <w:t xml:space="preserve"> </w:t>
+      </w:r>
+      <w:proofErr w:type="spellStart"/>
+      <w:r>
+        <w:t>jianbing</w:t>
+      </w:r>
+      <w:proofErr w:type="spellEnd"/>
+      <w:r>
+        <w:t>.</w:t>
       </w:r>
     </w:p>
     <w:p>
@@ -5019,7 +4881,7 @@
                     <pic:cNvPicPr/>
                   </pic:nvPicPr>
                   <pic:blipFill>
-                    <a:blip r:embed="rId25" cstate="print">
+                    <a:blip r:embed="rId26" cstate="print">
                       <a:extLst>
                         <a:ext uri="{28A0092B-C50C-407E-A947-70E740481C1C}">
                           <a14:useLocalDpi xmlns:a14="http://schemas.microsoft.com/office/drawing/2010/main" val="0"/>
@@ -5054,14 +4916,27 @@
       <w:r>
         <w:t xml:space="preserve">Figure </w:t>
       </w:r>
-      <w:fldSimple w:instr=" SEQ Figure \* ARABIC ">
-        <w:r>
-          <w:rPr>
-            <w:noProof/>
-          </w:rPr>
-          <w:t>12</w:t>
-        </w:r>
-      </w:fldSimple>
+      <w:r>
+        <w:fldChar w:fldCharType="begin"/>
+      </w:r>
+      <w:r>
+        <w:instrText xml:space="preserve"> SEQ Figure \* ARABIC </w:instrText>
+      </w:r>
+      <w:r>
+        <w:fldChar w:fldCharType="separate"/>
+      </w:r>
+      <w:r>
+        <w:rPr>
+          <w:noProof/>
+        </w:rPr>
+        <w:t>12</w:t>
+      </w:r>
+      <w:r>
+        <w:rPr>
+          <w:noProof/>
+        </w:rPr>
+        <w:fldChar w:fldCharType="end"/>
+      </w:r>
       <w:r>
         <w:t>: Tournament Place Standings</w:t>
       </w:r>
@@ -5089,7 +4964,15 @@
       </w:r>
       <w:proofErr w:type="spellEnd"/>
       <w:r>
-        <w:t xml:space="preserve"> jianbing, locavore VHS salvia +1 vegan gluten-free </w:t>
+        <w:t xml:space="preserve"> </w:t>
+      </w:r>
+      <w:proofErr w:type="spellStart"/>
+      <w:r>
+        <w:t>jianbing</w:t>
+      </w:r>
+      <w:proofErr w:type="spellEnd"/>
+      <w:r>
+        <w:t xml:space="preserve">, locavore VHS salvia +1 vegan gluten-free </w:t>
       </w:r>
       <w:proofErr w:type="spellStart"/>
       <w:r>
@@ -5105,7 +4988,15 @@
       </w:r>
       <w:proofErr w:type="spellEnd"/>
       <w:r>
-        <w:t xml:space="preserve"> affogato. Fanny pack </w:t>
+        <w:t xml:space="preserve"> </w:t>
+      </w:r>
+      <w:proofErr w:type="spellStart"/>
+      <w:r>
+        <w:t>affogato</w:t>
+      </w:r>
+      <w:proofErr w:type="spellEnd"/>
+      <w:r>
+        <w:t xml:space="preserve">. Fanny pack </w:t>
       </w:r>
       <w:proofErr w:type="spellStart"/>
       <w:r>
@@ -5233,7 +5124,15 @@
       </w:r>
       <w:proofErr w:type="spellEnd"/>
       <w:r>
-        <w:t xml:space="preserve"> jianbing.</w:t>
+        <w:t xml:space="preserve"> </w:t>
+      </w:r>
+      <w:proofErr w:type="spellStart"/>
+      <w:r>
+        <w:t>jianbing</w:t>
+      </w:r>
+      <w:proofErr w:type="spellEnd"/>
+      <w:r>
+        <w:t>.</w:t>
       </w:r>
     </w:p>
     <w:p>
@@ -5262,7 +5161,7 @@
                     <pic:cNvPicPr/>
                   </pic:nvPicPr>
                   <pic:blipFill>
-                    <a:blip r:embed="rId26">
+                    <a:blip r:embed="rId27">
                       <a:extLst>
                         <a:ext uri="{28A0092B-C50C-407E-A947-70E740481C1C}">
                           <a14:useLocalDpi xmlns:a14="http://schemas.microsoft.com/office/drawing/2010/main" val="0"/>
@@ -5312,14 +5211,27 @@
       <w:r>
         <w:t xml:space="preserve">Figure </w:t>
       </w:r>
-      <w:fldSimple w:instr=" SEQ Figure \* ARABIC ">
-        <w:r>
-          <w:rPr>
-            <w:noProof/>
-          </w:rPr>
-          <w:t>13</w:t>
-        </w:r>
-      </w:fldSimple>
+      <w:r>
+        <w:fldChar w:fldCharType="begin"/>
+      </w:r>
+      <w:r>
+        <w:instrText xml:space="preserve"> SEQ Figure \* ARABIC </w:instrText>
+      </w:r>
+      <w:r>
+        <w:fldChar w:fldCharType="separate"/>
+      </w:r>
+      <w:r>
+        <w:rPr>
+          <w:noProof/>
+        </w:rPr>
+        <w:t>13</w:t>
+      </w:r>
+      <w:r>
+        <w:rPr>
+          <w:noProof/>
+        </w:rPr>
+        <w:fldChar w:fldCharType="end"/>
+      </w:r>
       <w:r>
         <w:t xml:space="preserve">: </w:t>
       </w:r>
@@ -5355,7 +5267,15 @@
       </w:r>
       <w:proofErr w:type="spellEnd"/>
       <w:r>
-        <w:t xml:space="preserve"> jianbing, locavore VHS salvia +1 vegan gluten-free </w:t>
+        <w:t xml:space="preserve"> </w:t>
+      </w:r>
+      <w:proofErr w:type="spellStart"/>
+      <w:r>
+        <w:t>jianbing</w:t>
+      </w:r>
+      <w:proofErr w:type="spellEnd"/>
+      <w:r>
+        <w:t xml:space="preserve">, locavore VHS salvia +1 vegan gluten-free </w:t>
       </w:r>
       <w:proofErr w:type="spellStart"/>
       <w:r>
@@ -5371,7 +5291,15 @@
       </w:r>
       <w:proofErr w:type="spellEnd"/>
       <w:r>
-        <w:t xml:space="preserve"> affogato. Fanny pack </w:t>
+        <w:t xml:space="preserve"> </w:t>
+      </w:r>
+      <w:proofErr w:type="spellStart"/>
+      <w:r>
+        <w:t>affogato</w:t>
+      </w:r>
+      <w:proofErr w:type="spellEnd"/>
+      <w:r>
+        <w:t xml:space="preserve">. Fanny pack </w:t>
       </w:r>
       <w:proofErr w:type="spellStart"/>
       <w:r>
@@ -5499,7 +5427,15 @@
       </w:r>
       <w:proofErr w:type="spellEnd"/>
       <w:r>
-        <w:t xml:space="preserve"> jianbing.</w:t>
+        <w:t xml:space="preserve"> </w:t>
+      </w:r>
+      <w:proofErr w:type="spellStart"/>
+      <w:r>
+        <w:t>jianbing</w:t>
+      </w:r>
+      <w:proofErr w:type="spellEnd"/>
+      <w:r>
+        <w:t>.</w:t>
       </w:r>
     </w:p>
     <w:p>
@@ -5528,7 +5464,7 @@
                     <pic:cNvPicPr/>
                   </pic:nvPicPr>
                   <pic:blipFill>
-                    <a:blip r:embed="rId27">
+                    <a:blip r:embed="rId28">
                       <a:extLst>
                         <a:ext uri="{28A0092B-C50C-407E-A947-70E740481C1C}">
                           <a14:useLocalDpi xmlns:a14="http://schemas.microsoft.com/office/drawing/2010/main" val="0"/>
@@ -5574,7 +5510,7 @@
                     <pic:cNvPicPr/>
                   </pic:nvPicPr>
                   <pic:blipFill>
-                    <a:blip r:embed="rId28">
+                    <a:blip r:embed="rId29">
                       <a:extLst>
                         <a:ext uri="{28A0092B-C50C-407E-A947-70E740481C1C}">
                           <a14:useLocalDpi xmlns:a14="http://schemas.microsoft.com/office/drawing/2010/main" val="0"/>
@@ -5609,14 +5545,27 @@
       <w:r>
         <w:t xml:space="preserve">Figure </w:t>
       </w:r>
-      <w:fldSimple w:instr=" SEQ Figure \* ARABIC ">
-        <w:r>
-          <w:rPr>
-            <w:noProof/>
-          </w:rPr>
-          <w:t>14</w:t>
-        </w:r>
-      </w:fldSimple>
+      <w:r>
+        <w:fldChar w:fldCharType="begin"/>
+      </w:r>
+      <w:r>
+        <w:instrText xml:space="preserve"> SEQ Figure \* ARABIC </w:instrText>
+      </w:r>
+      <w:r>
+        <w:fldChar w:fldCharType="separate"/>
+      </w:r>
+      <w:r>
+        <w:rPr>
+          <w:noProof/>
+        </w:rPr>
+        <w:t>14</w:t>
+      </w:r>
+      <w:r>
+        <w:rPr>
+          <w:noProof/>
+        </w:rPr>
+        <w:fldChar w:fldCharType="end"/>
+      </w:r>
       <w:r>
         <w:t>: Tournament Search Forms</w:t>
       </w:r>
@@ -5644,7 +5593,15 @@
       </w:r>
       <w:proofErr w:type="spellEnd"/>
       <w:r>
-        <w:t xml:space="preserve"> jianbing, locavore VHS salvia +1 vegan gluten-free </w:t>
+        <w:t xml:space="preserve"> </w:t>
+      </w:r>
+      <w:proofErr w:type="spellStart"/>
+      <w:r>
+        <w:t>jianbing</w:t>
+      </w:r>
+      <w:proofErr w:type="spellEnd"/>
+      <w:r>
+        <w:t xml:space="preserve">, locavore VHS salvia +1 vegan gluten-free </w:t>
       </w:r>
       <w:proofErr w:type="spellStart"/>
       <w:r>
@@ -5660,7 +5617,15 @@
       </w:r>
       <w:proofErr w:type="spellEnd"/>
       <w:r>
-        <w:t xml:space="preserve"> affogato. Fanny pack </w:t>
+        <w:t xml:space="preserve"> </w:t>
+      </w:r>
+      <w:proofErr w:type="spellStart"/>
+      <w:r>
+        <w:t>affogato</w:t>
+      </w:r>
+      <w:proofErr w:type="spellEnd"/>
+      <w:r>
+        <w:t xml:space="preserve">. Fanny pack </w:t>
       </w:r>
       <w:proofErr w:type="spellStart"/>
       <w:r>
@@ -5788,7 +5753,15 @@
       </w:r>
       <w:proofErr w:type="spellEnd"/>
       <w:r>
-        <w:t xml:space="preserve"> jianbing.</w:t>
+        <w:t xml:space="preserve"> </w:t>
+      </w:r>
+      <w:proofErr w:type="spellStart"/>
+      <w:r>
+        <w:t>jianbing</w:t>
+      </w:r>
+      <w:proofErr w:type="spellEnd"/>
+      <w:r>
+        <w:t>.</w:t>
       </w:r>
     </w:p>
     <w:p>
@@ -5817,7 +5790,7 @@
                     <pic:cNvPicPr/>
                   </pic:nvPicPr>
                   <pic:blipFill>
-                    <a:blip r:embed="rId29">
+                    <a:blip r:embed="rId30">
                       <a:extLst>
                         <a:ext uri="{28A0092B-C50C-407E-A947-70E740481C1C}">
                           <a14:useLocalDpi xmlns:a14="http://schemas.microsoft.com/office/drawing/2010/main" val="0"/>
@@ -5852,14 +5825,27 @@
       <w:r>
         <w:t xml:space="preserve">Figure </w:t>
       </w:r>
-      <w:fldSimple w:instr=" SEQ Figure \* ARABIC ">
-        <w:r>
-          <w:rPr>
-            <w:noProof/>
-          </w:rPr>
-          <w:t>15</w:t>
-        </w:r>
-      </w:fldSimple>
+      <w:r>
+        <w:fldChar w:fldCharType="begin"/>
+      </w:r>
+      <w:r>
+        <w:instrText xml:space="preserve"> SEQ Figure \* ARABIC </w:instrText>
+      </w:r>
+      <w:r>
+        <w:fldChar w:fldCharType="separate"/>
+      </w:r>
+      <w:r>
+        <w:rPr>
+          <w:noProof/>
+        </w:rPr>
+        <w:t>15</w:t>
+      </w:r>
+      <w:r>
+        <w:rPr>
+          <w:noProof/>
+        </w:rPr>
+        <w:fldChar w:fldCharType="end"/>
+      </w:r>
       <w:r>
         <w:t>: Tournaments by Year</w:t>
       </w:r>
@@ -5886,7 +5872,15 @@
       </w:r>
       <w:proofErr w:type="spellEnd"/>
       <w:r>
-        <w:t xml:space="preserve"> jianbing, locavore VHS salvia +1 vegan gluten-free </w:t>
+        <w:t xml:space="preserve"> </w:t>
+      </w:r>
+      <w:proofErr w:type="spellStart"/>
+      <w:r>
+        <w:t>jianbing</w:t>
+      </w:r>
+      <w:proofErr w:type="spellEnd"/>
+      <w:r>
+        <w:t xml:space="preserve">, locavore VHS salvia +1 vegan gluten-free </w:t>
       </w:r>
       <w:proofErr w:type="spellStart"/>
       <w:r>
@@ -5902,7 +5896,15 @@
       </w:r>
       <w:proofErr w:type="spellEnd"/>
       <w:r>
-        <w:t xml:space="preserve"> affogato. Fanny pack </w:t>
+        <w:t xml:space="preserve"> </w:t>
+      </w:r>
+      <w:proofErr w:type="spellStart"/>
+      <w:r>
+        <w:t>affogato</w:t>
+      </w:r>
+      <w:proofErr w:type="spellEnd"/>
+      <w:r>
+        <w:t xml:space="preserve">. Fanny pack </w:t>
       </w:r>
       <w:proofErr w:type="spellStart"/>
       <w:r>
@@ -6030,7 +6032,15 @@
       </w:r>
       <w:proofErr w:type="spellEnd"/>
       <w:r>
-        <w:t xml:space="preserve"> jianbing.</w:t>
+        <w:t xml:space="preserve"> </w:t>
+      </w:r>
+      <w:proofErr w:type="spellStart"/>
+      <w:r>
+        <w:t>jianbing</w:t>
+      </w:r>
+      <w:proofErr w:type="spellEnd"/>
+      <w:r>
+        <w:t>.</w:t>
       </w:r>
     </w:p>
     <w:p>
@@ -6067,7 +6077,15 @@
       </w:r>
       <w:proofErr w:type="spellEnd"/>
       <w:r>
-        <w:t xml:space="preserve"> jianbing, locavore VHS salvia +1 vegan gluten-free </w:t>
+        <w:t xml:space="preserve"> </w:t>
+      </w:r>
+      <w:proofErr w:type="spellStart"/>
+      <w:r>
+        <w:t>jianbing</w:t>
+      </w:r>
+      <w:proofErr w:type="spellEnd"/>
+      <w:r>
+        <w:t xml:space="preserve">, locavore VHS salvia +1 vegan gluten-free </w:t>
       </w:r>
       <w:proofErr w:type="spellStart"/>
       <w:r>
@@ -6083,7 +6101,15 @@
       </w:r>
       <w:proofErr w:type="spellEnd"/>
       <w:r>
-        <w:t xml:space="preserve"> affogato. Fanny pack </w:t>
+        <w:t xml:space="preserve"> </w:t>
+      </w:r>
+      <w:proofErr w:type="spellStart"/>
+      <w:r>
+        <w:t>affogato</w:t>
+      </w:r>
+      <w:proofErr w:type="spellEnd"/>
+      <w:r>
+        <w:t xml:space="preserve">. Fanny pack </w:t>
       </w:r>
       <w:proofErr w:type="spellStart"/>
       <w:r>
@@ -6220,7 +6246,15 @@
       </w:r>
       <w:proofErr w:type="spellEnd"/>
       <w:r>
-        <w:t xml:space="preserve"> jianbing.</w:t>
+        <w:t xml:space="preserve"> </w:t>
+      </w:r>
+      <w:proofErr w:type="spellStart"/>
+      <w:r>
+        <w:t>jianbing</w:t>
+      </w:r>
+      <w:proofErr w:type="spellEnd"/>
+      <w:r>
+        <w:t>.</w:t>
       </w:r>
     </w:p>
     <w:p>
@@ -6704,9 +6738,9 @@
           <w:noProof/>
         </w:rPr>
         <w:sectPr>
-          <w:headerReference w:type="default" r:id="rId30"/>
-          <w:footerReference w:type="default" r:id="rId31"/>
-          <w:headerReference w:type="first" r:id="rId32"/>
+          <w:headerReference w:type="default" r:id="rId31"/>
+          <w:footerReference w:type="default" r:id="rId32"/>
+          <w:headerReference w:type="first" r:id="rId33"/>
           <w:type w:val="continuous"/>
           <w:pgSz w:w="12240" w:h="15840" w:code="1"/>
           <w:pgMar w:top="1800" w:right="1195" w:bottom="1440" w:left="3355" w:header="720" w:footer="720" w:gutter="0"/>
@@ -7238,7 +7272,7 @@
 </file>
 
 <file path=word/endnotes.xml><?xml version="1.0" encoding="utf-8"?>
-<w:endnotes xmlns:wpc="http://schemas.microsoft.com/office/word/2010/wordprocessingCanvas" xmlns:cx="http://schemas.microsoft.com/office/drawing/2014/chartex" xmlns:cx1="http://schemas.microsoft.com/office/drawing/2015/9/8/chartex" xmlns:cx2="http://schemas.microsoft.com/office/drawing/2015/10/21/chartex" xmlns:cx3="http://schemas.microsoft.com/office/drawing/2016/5/9/chartex" xmlns:cx4="http://schemas.microsoft.com/office/drawing/2016/5/10/chartex" xmlns:cx5="http://schemas.microsoft.com/office/drawing/2016/5/11/chartex" xmlns:cx6="http://schemas.microsoft.com/office/drawing/2016/5/12/chartex" xmlns:cx7="http://schemas.microsoft.com/office/drawing/2016/5/13/chartex" xmlns:cx8="http://schemas.microsoft.com/office/drawing/2016/5/14/chartex" xmlns:mc="http://schemas.openxmlformats.org/markup-compatibility/2006" xmlns:aink="http://schemas.microsoft.com/office/drawing/2016/ink" xmlns:am3d="http://schemas.microsoft.com/office/drawing/2017/model3d" xmlns:o="urn:schemas-microsoft-com:office:office" xmlns:r="http://schemas.openxmlformats.org/officeDocument/2006/relationships" xmlns:m="http://schemas.openxmlformats.org/officeDocument/2006/math" xmlns:v="urn:schemas-microsoft-com:vml" xmlns:wp14="http://schemas.microsoft.com/office/word/2010/wordprocessingDrawing" xmlns:wp="http://schemas.openxmlformats.org/drawingml/2006/wordprocessingDrawing" xmlns:w10="urn:schemas-microsoft-com:office:word" xmlns:w="http://schemas.openxmlformats.org/wordprocessingml/2006/main" xmlns:w14="http://schemas.microsoft.com/office/word/2010/wordml" xmlns:w15="http://schemas.microsoft.com/office/word/2012/wordml" xmlns:w16cid="http://schemas.microsoft.com/office/word/2016/wordml/cid" xmlns:w16se="http://schemas.microsoft.com/office/word/2015/wordml/symex" xmlns:wpg="http://schemas.microsoft.com/office/word/2010/wordprocessingGroup" xmlns:wpi="http://schemas.microsoft.com/office/word/2010/wordprocessingInk" xmlns:wne="http://schemas.microsoft.com/office/word/2006/wordml" xmlns:wps="http://schemas.microsoft.com/office/word/2010/wordprocessingShape" mc:Ignorable="w14 w15 w16se w16cid wp14">
+<w:endnotes xmlns:wpc="http://schemas.microsoft.com/office/word/2010/wordprocessingCanvas" xmlns:mc="http://schemas.openxmlformats.org/markup-compatibility/2006" xmlns:o="urn:schemas-microsoft-com:office:office" xmlns:r="http://schemas.openxmlformats.org/officeDocument/2006/relationships" xmlns:m="http://schemas.openxmlformats.org/officeDocument/2006/math" xmlns:v="urn:schemas-microsoft-com:vml" xmlns:wp14="http://schemas.microsoft.com/office/word/2010/wordprocessingDrawing" xmlns:wp="http://schemas.openxmlformats.org/drawingml/2006/wordprocessingDrawing" xmlns:w10="urn:schemas-microsoft-com:office:word" xmlns:w="http://schemas.openxmlformats.org/wordprocessingml/2006/main" xmlns:w14="http://schemas.microsoft.com/office/word/2010/wordml" xmlns:w15="http://schemas.microsoft.com/office/word/2012/wordml" xmlns:wpg="http://schemas.microsoft.com/office/word/2010/wordprocessingGroup" xmlns:wpi="http://schemas.microsoft.com/office/word/2010/wordprocessingInk" xmlns:wne="http://schemas.microsoft.com/office/word/2006/wordml" xmlns:wps="http://schemas.microsoft.com/office/word/2010/wordprocessingShape" mc:Ignorable="w14 w15 wp14">
   <w:endnote w:type="separator" w:id="-1">
     <w:p>
       <w:r>
@@ -7257,7 +7291,7 @@
 </file>
 
 <file path=word/footer1.xml><?xml version="1.0" encoding="utf-8"?>
-<w:ftr xmlns:wpc="http://schemas.microsoft.com/office/word/2010/wordprocessingCanvas" xmlns:cx="http://schemas.microsoft.com/office/drawing/2014/chartex" xmlns:cx1="http://schemas.microsoft.com/office/drawing/2015/9/8/chartex" xmlns:cx2="http://schemas.microsoft.com/office/drawing/2015/10/21/chartex" xmlns:cx3="http://schemas.microsoft.com/office/drawing/2016/5/9/chartex" xmlns:cx4="http://schemas.microsoft.com/office/drawing/2016/5/10/chartex" xmlns:cx5="http://schemas.microsoft.com/office/drawing/2016/5/11/chartex" xmlns:cx6="http://schemas.microsoft.com/office/drawing/2016/5/12/chartex" xmlns:cx7="http://schemas.microsoft.com/office/drawing/2016/5/13/chartex" xmlns:cx8="http://schemas.microsoft.com/office/drawing/2016/5/14/chartex" xmlns:mc="http://schemas.openxmlformats.org/markup-compatibility/2006" xmlns:aink="http://schemas.microsoft.com/office/drawing/2016/ink" xmlns:am3d="http://schemas.microsoft.com/office/drawing/2017/model3d" xmlns:o="urn:schemas-microsoft-com:office:office" xmlns:r="http://schemas.openxmlformats.org/officeDocument/2006/relationships" xmlns:m="http://schemas.openxmlformats.org/officeDocument/2006/math" xmlns:v="urn:schemas-microsoft-com:vml" xmlns:wp14="http://schemas.microsoft.com/office/word/2010/wordprocessingDrawing" xmlns:wp="http://schemas.openxmlformats.org/drawingml/2006/wordprocessingDrawing" xmlns:w10="urn:schemas-microsoft-com:office:word" xmlns:w="http://schemas.openxmlformats.org/wordprocessingml/2006/main" xmlns:w14="http://schemas.microsoft.com/office/word/2010/wordml" xmlns:w15="http://schemas.microsoft.com/office/word/2012/wordml" xmlns:w16cid="http://schemas.microsoft.com/office/word/2016/wordml/cid" xmlns:w16se="http://schemas.microsoft.com/office/word/2015/wordml/symex" xmlns:wpg="http://schemas.microsoft.com/office/word/2010/wordprocessingGroup" xmlns:wpi="http://schemas.microsoft.com/office/word/2010/wordprocessingInk" xmlns:wne="http://schemas.microsoft.com/office/word/2006/wordml" xmlns:wps="http://schemas.microsoft.com/office/word/2010/wordprocessingShape" mc:Ignorable="w14 w15 w16se w16cid wp14">
+<w:ftr xmlns:wpc="http://schemas.microsoft.com/office/word/2010/wordprocessingCanvas" xmlns:mc="http://schemas.openxmlformats.org/markup-compatibility/2006" xmlns:o="urn:schemas-microsoft-com:office:office" xmlns:r="http://schemas.openxmlformats.org/officeDocument/2006/relationships" xmlns:m="http://schemas.openxmlformats.org/officeDocument/2006/math" xmlns:v="urn:schemas-microsoft-com:vml" xmlns:wp14="http://schemas.microsoft.com/office/word/2010/wordprocessingDrawing" xmlns:wp="http://schemas.openxmlformats.org/drawingml/2006/wordprocessingDrawing" xmlns:w10="urn:schemas-microsoft-com:office:word" xmlns:w="http://schemas.openxmlformats.org/wordprocessingml/2006/main" xmlns:w14="http://schemas.microsoft.com/office/word/2010/wordml" xmlns:w15="http://schemas.microsoft.com/office/word/2012/wordml" xmlns:wpg="http://schemas.microsoft.com/office/word/2010/wordprocessingGroup" xmlns:wpi="http://schemas.microsoft.com/office/word/2010/wordprocessingInk" xmlns:wne="http://schemas.microsoft.com/office/word/2006/wordml" xmlns:wps="http://schemas.microsoft.com/office/word/2010/wordprocessingShape" mc:Ignorable="w14 w15 wp14">
   <w:p>
     <w:pPr>
       <w:pStyle w:val="Footer"/>
@@ -7298,7 +7332,7 @@
 </file>
 
 <file path=word/footer2.xml><?xml version="1.0" encoding="utf-8"?>
-<w:ftr xmlns:wpc="http://schemas.microsoft.com/office/word/2010/wordprocessingCanvas" xmlns:cx="http://schemas.microsoft.com/office/drawing/2014/chartex" xmlns:cx1="http://schemas.microsoft.com/office/drawing/2015/9/8/chartex" xmlns:cx2="http://schemas.microsoft.com/office/drawing/2015/10/21/chartex" xmlns:cx3="http://schemas.microsoft.com/office/drawing/2016/5/9/chartex" xmlns:cx4="http://schemas.microsoft.com/office/drawing/2016/5/10/chartex" xmlns:cx5="http://schemas.microsoft.com/office/drawing/2016/5/11/chartex" xmlns:cx6="http://schemas.microsoft.com/office/drawing/2016/5/12/chartex" xmlns:cx7="http://schemas.microsoft.com/office/drawing/2016/5/13/chartex" xmlns:cx8="http://schemas.microsoft.com/office/drawing/2016/5/14/chartex" xmlns:mc="http://schemas.openxmlformats.org/markup-compatibility/2006" xmlns:aink="http://schemas.microsoft.com/office/drawing/2016/ink" xmlns:am3d="http://schemas.microsoft.com/office/drawing/2017/model3d" xmlns:o="urn:schemas-microsoft-com:office:office" xmlns:r="http://schemas.openxmlformats.org/officeDocument/2006/relationships" xmlns:m="http://schemas.openxmlformats.org/officeDocument/2006/math" xmlns:v="urn:schemas-microsoft-com:vml" xmlns:wp14="http://schemas.microsoft.com/office/word/2010/wordprocessingDrawing" xmlns:wp="http://schemas.openxmlformats.org/drawingml/2006/wordprocessingDrawing" xmlns:w10="urn:schemas-microsoft-com:office:word" xmlns:w="http://schemas.openxmlformats.org/wordprocessingml/2006/main" xmlns:w14="http://schemas.microsoft.com/office/word/2010/wordml" xmlns:w15="http://schemas.microsoft.com/office/word/2012/wordml" xmlns:w16cid="http://schemas.microsoft.com/office/word/2016/wordml/cid" xmlns:w16se="http://schemas.microsoft.com/office/word/2015/wordml/symex" xmlns:wpg="http://schemas.microsoft.com/office/word/2010/wordprocessingGroup" xmlns:wpi="http://schemas.microsoft.com/office/word/2010/wordprocessingInk" xmlns:wne="http://schemas.microsoft.com/office/word/2006/wordml" xmlns:wps="http://schemas.microsoft.com/office/word/2010/wordprocessingShape" mc:Ignorable="w14 w15 w16se w16cid wp14">
+<w:ftr xmlns:wpc="http://schemas.microsoft.com/office/word/2010/wordprocessingCanvas" xmlns:mc="http://schemas.openxmlformats.org/markup-compatibility/2006" xmlns:o="urn:schemas-microsoft-com:office:office" xmlns:r="http://schemas.openxmlformats.org/officeDocument/2006/relationships" xmlns:m="http://schemas.openxmlformats.org/officeDocument/2006/math" xmlns:v="urn:schemas-microsoft-com:vml" xmlns:wp14="http://schemas.microsoft.com/office/word/2010/wordprocessingDrawing" xmlns:wp="http://schemas.openxmlformats.org/drawingml/2006/wordprocessingDrawing" xmlns:w10="urn:schemas-microsoft-com:office:word" xmlns:w="http://schemas.openxmlformats.org/wordprocessingml/2006/main" xmlns:w14="http://schemas.microsoft.com/office/word/2010/wordml" xmlns:w15="http://schemas.microsoft.com/office/word/2012/wordml" xmlns:wpg="http://schemas.microsoft.com/office/word/2010/wordprocessingGroup" xmlns:wpi="http://schemas.microsoft.com/office/word/2010/wordprocessingInk" xmlns:wne="http://schemas.microsoft.com/office/word/2006/wordml" xmlns:wps="http://schemas.microsoft.com/office/word/2010/wordprocessingShape" mc:Ignorable="w14 w15 wp14">
   <w:p>
     <w:pPr>
       <w:pStyle w:val="Footer"/>
@@ -7308,7 +7342,7 @@
 </file>
 
 <file path=word/footer3.xml><?xml version="1.0" encoding="utf-8"?>
-<w:ftr xmlns:wpc="http://schemas.microsoft.com/office/word/2010/wordprocessingCanvas" xmlns:cx="http://schemas.microsoft.com/office/drawing/2014/chartex" xmlns:cx1="http://schemas.microsoft.com/office/drawing/2015/9/8/chartex" xmlns:cx2="http://schemas.microsoft.com/office/drawing/2015/10/21/chartex" xmlns:cx3="http://schemas.microsoft.com/office/drawing/2016/5/9/chartex" xmlns:cx4="http://schemas.microsoft.com/office/drawing/2016/5/10/chartex" xmlns:cx5="http://schemas.microsoft.com/office/drawing/2016/5/11/chartex" xmlns:cx6="http://schemas.microsoft.com/office/drawing/2016/5/12/chartex" xmlns:cx7="http://schemas.microsoft.com/office/drawing/2016/5/13/chartex" xmlns:cx8="http://schemas.microsoft.com/office/drawing/2016/5/14/chartex" xmlns:mc="http://schemas.openxmlformats.org/markup-compatibility/2006" xmlns:aink="http://schemas.microsoft.com/office/drawing/2016/ink" xmlns:am3d="http://schemas.microsoft.com/office/drawing/2017/model3d" xmlns:o="urn:schemas-microsoft-com:office:office" xmlns:r="http://schemas.openxmlformats.org/officeDocument/2006/relationships" xmlns:m="http://schemas.openxmlformats.org/officeDocument/2006/math" xmlns:v="urn:schemas-microsoft-com:vml" xmlns:wp14="http://schemas.microsoft.com/office/word/2010/wordprocessingDrawing" xmlns:wp="http://schemas.openxmlformats.org/drawingml/2006/wordprocessingDrawing" xmlns:w10="urn:schemas-microsoft-com:office:word" xmlns:w="http://schemas.openxmlformats.org/wordprocessingml/2006/main" xmlns:w14="http://schemas.microsoft.com/office/word/2010/wordml" xmlns:w15="http://schemas.microsoft.com/office/word/2012/wordml" xmlns:w16cid="http://schemas.microsoft.com/office/word/2016/wordml/cid" xmlns:w16se="http://schemas.microsoft.com/office/word/2015/wordml/symex" xmlns:wpg="http://schemas.microsoft.com/office/word/2010/wordprocessingGroup" xmlns:wpi="http://schemas.microsoft.com/office/word/2010/wordprocessingInk" xmlns:wne="http://schemas.microsoft.com/office/word/2006/wordml" xmlns:wps="http://schemas.microsoft.com/office/word/2010/wordprocessingShape" mc:Ignorable="w14 w15 w16se w16cid wp14">
+<w:ftr xmlns:wpc="http://schemas.microsoft.com/office/word/2010/wordprocessingCanvas" xmlns:mc="http://schemas.openxmlformats.org/markup-compatibility/2006" xmlns:o="urn:schemas-microsoft-com:office:office" xmlns:r="http://schemas.openxmlformats.org/officeDocument/2006/relationships" xmlns:m="http://schemas.openxmlformats.org/officeDocument/2006/math" xmlns:v="urn:schemas-microsoft-com:vml" xmlns:wp14="http://schemas.microsoft.com/office/word/2010/wordprocessingDrawing" xmlns:wp="http://schemas.openxmlformats.org/drawingml/2006/wordprocessingDrawing" xmlns:w10="urn:schemas-microsoft-com:office:word" xmlns:w="http://schemas.openxmlformats.org/wordprocessingml/2006/main" xmlns:w14="http://schemas.microsoft.com/office/word/2010/wordml" xmlns:w15="http://schemas.microsoft.com/office/word/2012/wordml" xmlns:wpg="http://schemas.microsoft.com/office/word/2010/wordprocessingGroup" xmlns:wpi="http://schemas.microsoft.com/office/word/2010/wordprocessingInk" xmlns:wne="http://schemas.microsoft.com/office/word/2006/wordml" xmlns:wps="http://schemas.microsoft.com/office/word/2010/wordprocessingShape" mc:Ignorable="w14 w15 wp14">
   <w:p>
     <w:pPr>
       <w:pStyle w:val="Footer"/>
@@ -7318,7 +7352,7 @@
 </file>
 
 <file path=word/footer4.xml><?xml version="1.0" encoding="utf-8"?>
-<w:ftr xmlns:wpc="http://schemas.microsoft.com/office/word/2010/wordprocessingCanvas" xmlns:cx="http://schemas.microsoft.com/office/drawing/2014/chartex" xmlns:cx1="http://schemas.microsoft.com/office/drawing/2015/9/8/chartex" xmlns:cx2="http://schemas.microsoft.com/office/drawing/2015/10/21/chartex" xmlns:cx3="http://schemas.microsoft.com/office/drawing/2016/5/9/chartex" xmlns:cx4="http://schemas.microsoft.com/office/drawing/2016/5/10/chartex" xmlns:cx5="http://schemas.microsoft.com/office/drawing/2016/5/11/chartex" xmlns:cx6="http://schemas.microsoft.com/office/drawing/2016/5/12/chartex" xmlns:cx7="http://schemas.microsoft.com/office/drawing/2016/5/13/chartex" xmlns:cx8="http://schemas.microsoft.com/office/drawing/2016/5/14/chartex" xmlns:mc="http://schemas.openxmlformats.org/markup-compatibility/2006" xmlns:aink="http://schemas.microsoft.com/office/drawing/2016/ink" xmlns:am3d="http://schemas.microsoft.com/office/drawing/2017/model3d" xmlns:o="urn:schemas-microsoft-com:office:office" xmlns:r="http://schemas.openxmlformats.org/officeDocument/2006/relationships" xmlns:m="http://schemas.openxmlformats.org/officeDocument/2006/math" xmlns:v="urn:schemas-microsoft-com:vml" xmlns:wp14="http://schemas.microsoft.com/office/word/2010/wordprocessingDrawing" xmlns:wp="http://schemas.openxmlformats.org/drawingml/2006/wordprocessingDrawing" xmlns:w10="urn:schemas-microsoft-com:office:word" xmlns:w="http://schemas.openxmlformats.org/wordprocessingml/2006/main" xmlns:w14="http://schemas.microsoft.com/office/word/2010/wordml" xmlns:w15="http://schemas.microsoft.com/office/word/2012/wordml" xmlns:w16cid="http://schemas.microsoft.com/office/word/2016/wordml/cid" xmlns:w16se="http://schemas.microsoft.com/office/word/2015/wordml/symex" xmlns:wpg="http://schemas.microsoft.com/office/word/2010/wordprocessingGroup" xmlns:wpi="http://schemas.microsoft.com/office/word/2010/wordprocessingInk" xmlns:wne="http://schemas.microsoft.com/office/word/2006/wordml" xmlns:wps="http://schemas.microsoft.com/office/word/2010/wordprocessingShape" mc:Ignorable="w14 w15 w16se w16cid wp14">
+<w:ftr xmlns:wpc="http://schemas.microsoft.com/office/word/2010/wordprocessingCanvas" xmlns:mc="http://schemas.openxmlformats.org/markup-compatibility/2006" xmlns:o="urn:schemas-microsoft-com:office:office" xmlns:r="http://schemas.openxmlformats.org/officeDocument/2006/relationships" xmlns:m="http://schemas.openxmlformats.org/officeDocument/2006/math" xmlns:v="urn:schemas-microsoft-com:vml" xmlns:wp14="http://schemas.microsoft.com/office/word/2010/wordprocessingDrawing" xmlns:wp="http://schemas.openxmlformats.org/drawingml/2006/wordprocessingDrawing" xmlns:w10="urn:schemas-microsoft-com:office:word" xmlns:w="http://schemas.openxmlformats.org/wordprocessingml/2006/main" xmlns:w14="http://schemas.microsoft.com/office/word/2010/wordml" xmlns:w15="http://schemas.microsoft.com/office/word/2012/wordml" xmlns:wpg="http://schemas.microsoft.com/office/word/2010/wordprocessingGroup" xmlns:wpi="http://schemas.microsoft.com/office/word/2010/wordprocessingInk" xmlns:wne="http://schemas.microsoft.com/office/word/2006/wordml" xmlns:wps="http://schemas.microsoft.com/office/word/2010/wordprocessingShape" mc:Ignorable="w14 w15 wp14">
   <w:p>
     <w:pPr>
       <w:pStyle w:val="Footer"/>
@@ -7350,7 +7384,7 @@
         <w:rStyle w:val="PageNumber"/>
         <w:noProof/>
       </w:rPr>
-      <w:t>20</w:t>
+      <w:t>19</w:t>
     </w:r>
     <w:r>
       <w:rPr>
@@ -7368,7 +7402,7 @@
 </file>
 
 <file path=word/footer5.xml><?xml version="1.0" encoding="utf-8"?>
-<w:ftr xmlns:wpc="http://schemas.microsoft.com/office/word/2010/wordprocessingCanvas" xmlns:cx="http://schemas.microsoft.com/office/drawing/2014/chartex" xmlns:cx1="http://schemas.microsoft.com/office/drawing/2015/9/8/chartex" xmlns:cx2="http://schemas.microsoft.com/office/drawing/2015/10/21/chartex" xmlns:cx3="http://schemas.microsoft.com/office/drawing/2016/5/9/chartex" xmlns:cx4="http://schemas.microsoft.com/office/drawing/2016/5/10/chartex" xmlns:cx5="http://schemas.microsoft.com/office/drawing/2016/5/11/chartex" xmlns:cx6="http://schemas.microsoft.com/office/drawing/2016/5/12/chartex" xmlns:cx7="http://schemas.microsoft.com/office/drawing/2016/5/13/chartex" xmlns:cx8="http://schemas.microsoft.com/office/drawing/2016/5/14/chartex" xmlns:mc="http://schemas.openxmlformats.org/markup-compatibility/2006" xmlns:aink="http://schemas.microsoft.com/office/drawing/2016/ink" xmlns:am3d="http://schemas.microsoft.com/office/drawing/2017/model3d" xmlns:o="urn:schemas-microsoft-com:office:office" xmlns:r="http://schemas.openxmlformats.org/officeDocument/2006/relationships" xmlns:m="http://schemas.openxmlformats.org/officeDocument/2006/math" xmlns:v="urn:schemas-microsoft-com:vml" xmlns:wp14="http://schemas.microsoft.com/office/word/2010/wordprocessingDrawing" xmlns:wp="http://schemas.openxmlformats.org/drawingml/2006/wordprocessingDrawing" xmlns:w10="urn:schemas-microsoft-com:office:word" xmlns:w="http://schemas.openxmlformats.org/wordprocessingml/2006/main" xmlns:w14="http://schemas.microsoft.com/office/word/2010/wordml" xmlns:w15="http://schemas.microsoft.com/office/word/2012/wordml" xmlns:w16cid="http://schemas.microsoft.com/office/word/2016/wordml/cid" xmlns:w16se="http://schemas.microsoft.com/office/word/2015/wordml/symex" xmlns:wpg="http://schemas.microsoft.com/office/word/2010/wordprocessingGroup" xmlns:wpi="http://schemas.microsoft.com/office/word/2010/wordprocessingInk" xmlns:wne="http://schemas.microsoft.com/office/word/2006/wordml" xmlns:wps="http://schemas.microsoft.com/office/word/2010/wordprocessingShape" mc:Ignorable="w14 w15 w16se w16cid wp14">
+<w:ftr xmlns:wpc="http://schemas.microsoft.com/office/word/2010/wordprocessingCanvas" xmlns:mc="http://schemas.openxmlformats.org/markup-compatibility/2006" xmlns:o="urn:schemas-microsoft-com:office:office" xmlns:r="http://schemas.openxmlformats.org/officeDocument/2006/relationships" xmlns:m="http://schemas.openxmlformats.org/officeDocument/2006/math" xmlns:v="urn:schemas-microsoft-com:vml" xmlns:wp14="http://schemas.microsoft.com/office/word/2010/wordprocessingDrawing" xmlns:wp="http://schemas.openxmlformats.org/drawingml/2006/wordprocessingDrawing" xmlns:w10="urn:schemas-microsoft-com:office:word" xmlns:w="http://schemas.openxmlformats.org/wordprocessingml/2006/main" xmlns:w14="http://schemas.microsoft.com/office/word/2010/wordml" xmlns:w15="http://schemas.microsoft.com/office/word/2012/wordml" xmlns:wpg="http://schemas.microsoft.com/office/word/2010/wordprocessingGroup" xmlns:wpi="http://schemas.microsoft.com/office/word/2010/wordprocessingInk" xmlns:wne="http://schemas.microsoft.com/office/word/2006/wordml" xmlns:wps="http://schemas.microsoft.com/office/word/2010/wordprocessingShape" mc:Ignorable="w14 w15 wp14">
   <w:p>
     <w:pPr>
       <w:pStyle w:val="Footer"/>
@@ -7418,7 +7452,7 @@
 </file>
 
 <file path=word/footnotes.xml><?xml version="1.0" encoding="utf-8"?>
-<w:footnotes xmlns:wpc="http://schemas.microsoft.com/office/word/2010/wordprocessingCanvas" xmlns:cx="http://schemas.microsoft.com/office/drawing/2014/chartex" xmlns:cx1="http://schemas.microsoft.com/office/drawing/2015/9/8/chartex" xmlns:cx2="http://schemas.microsoft.com/office/drawing/2015/10/21/chartex" xmlns:cx3="http://schemas.microsoft.com/office/drawing/2016/5/9/chartex" xmlns:cx4="http://schemas.microsoft.com/office/drawing/2016/5/10/chartex" xmlns:cx5="http://schemas.microsoft.com/office/drawing/2016/5/11/chartex" xmlns:cx6="http://schemas.microsoft.com/office/drawing/2016/5/12/chartex" xmlns:cx7="http://schemas.microsoft.com/office/drawing/2016/5/13/chartex" xmlns:cx8="http://schemas.microsoft.com/office/drawing/2016/5/14/chartex" xmlns:mc="http://schemas.openxmlformats.org/markup-compatibility/2006" xmlns:aink="http://schemas.microsoft.com/office/drawing/2016/ink" xmlns:am3d="http://schemas.microsoft.com/office/drawing/2017/model3d" xmlns:o="urn:schemas-microsoft-com:office:office" xmlns:r="http://schemas.openxmlformats.org/officeDocument/2006/relationships" xmlns:m="http://schemas.openxmlformats.org/officeDocument/2006/math" xmlns:v="urn:schemas-microsoft-com:vml" xmlns:wp14="http://schemas.microsoft.com/office/word/2010/wordprocessingDrawing" xmlns:wp="http://schemas.openxmlformats.org/drawingml/2006/wordprocessingDrawing" xmlns:w10="urn:schemas-microsoft-com:office:word" xmlns:w="http://schemas.openxmlformats.org/wordprocessingml/2006/main" xmlns:w14="http://schemas.microsoft.com/office/word/2010/wordml" xmlns:w15="http://schemas.microsoft.com/office/word/2012/wordml" xmlns:w16cid="http://schemas.microsoft.com/office/word/2016/wordml/cid" xmlns:w16se="http://schemas.microsoft.com/office/word/2015/wordml/symex" xmlns:wpg="http://schemas.microsoft.com/office/word/2010/wordprocessingGroup" xmlns:wpi="http://schemas.microsoft.com/office/word/2010/wordprocessingInk" xmlns:wne="http://schemas.microsoft.com/office/word/2006/wordml" xmlns:wps="http://schemas.microsoft.com/office/word/2010/wordprocessingShape" mc:Ignorable="w14 w15 w16se w16cid wp14">
+<w:footnotes xmlns:wpc="http://schemas.microsoft.com/office/word/2010/wordprocessingCanvas" xmlns:mc="http://schemas.openxmlformats.org/markup-compatibility/2006" xmlns:o="urn:schemas-microsoft-com:office:office" xmlns:r="http://schemas.openxmlformats.org/officeDocument/2006/relationships" xmlns:m="http://schemas.openxmlformats.org/officeDocument/2006/math" xmlns:v="urn:schemas-microsoft-com:vml" xmlns:wp14="http://schemas.microsoft.com/office/word/2010/wordprocessingDrawing" xmlns:wp="http://schemas.openxmlformats.org/drawingml/2006/wordprocessingDrawing" xmlns:w10="urn:schemas-microsoft-com:office:word" xmlns:w="http://schemas.openxmlformats.org/wordprocessingml/2006/main" xmlns:w14="http://schemas.microsoft.com/office/word/2010/wordml" xmlns:w15="http://schemas.microsoft.com/office/word/2012/wordml" xmlns:wpg="http://schemas.microsoft.com/office/word/2010/wordprocessingGroup" xmlns:wpi="http://schemas.microsoft.com/office/word/2010/wordprocessingInk" xmlns:wne="http://schemas.microsoft.com/office/word/2006/wordml" xmlns:wps="http://schemas.microsoft.com/office/word/2010/wordprocessingShape" mc:Ignorable="w14 w15 wp14">
   <w:footnote w:type="separator" w:id="-1">
     <w:p>
       <w:r>
@@ -7437,7 +7471,7 @@
 </file>
 
 <file path=word/header1.xml><?xml version="1.0" encoding="utf-8"?>
-<w:hdr xmlns:wpc="http://schemas.microsoft.com/office/word/2010/wordprocessingCanvas" xmlns:cx="http://schemas.microsoft.com/office/drawing/2014/chartex" xmlns:cx1="http://schemas.microsoft.com/office/drawing/2015/9/8/chartex" xmlns:cx2="http://schemas.microsoft.com/office/drawing/2015/10/21/chartex" xmlns:cx3="http://schemas.microsoft.com/office/drawing/2016/5/9/chartex" xmlns:cx4="http://schemas.microsoft.com/office/drawing/2016/5/10/chartex" xmlns:cx5="http://schemas.microsoft.com/office/drawing/2016/5/11/chartex" xmlns:cx6="http://schemas.microsoft.com/office/drawing/2016/5/12/chartex" xmlns:cx7="http://schemas.microsoft.com/office/drawing/2016/5/13/chartex" xmlns:cx8="http://schemas.microsoft.com/office/drawing/2016/5/14/chartex" xmlns:mc="http://schemas.openxmlformats.org/markup-compatibility/2006" xmlns:aink="http://schemas.microsoft.com/office/drawing/2016/ink" xmlns:am3d="http://schemas.microsoft.com/office/drawing/2017/model3d" xmlns:o="urn:schemas-microsoft-com:office:office" xmlns:r="http://schemas.openxmlformats.org/officeDocument/2006/relationships" xmlns:m="http://schemas.openxmlformats.org/officeDocument/2006/math" xmlns:v="urn:schemas-microsoft-com:vml" xmlns:wp14="http://schemas.microsoft.com/office/word/2010/wordprocessingDrawing" xmlns:wp="http://schemas.openxmlformats.org/drawingml/2006/wordprocessingDrawing" xmlns:w10="urn:schemas-microsoft-com:office:word" xmlns:w="http://schemas.openxmlformats.org/wordprocessingml/2006/main" xmlns:w14="http://schemas.microsoft.com/office/word/2010/wordml" xmlns:w15="http://schemas.microsoft.com/office/word/2012/wordml" xmlns:w16cid="http://schemas.microsoft.com/office/word/2016/wordml/cid" xmlns:w16se="http://schemas.microsoft.com/office/word/2015/wordml/symex" xmlns:wpg="http://schemas.microsoft.com/office/word/2010/wordprocessingGroup" xmlns:wpi="http://schemas.microsoft.com/office/word/2010/wordprocessingInk" xmlns:wne="http://schemas.microsoft.com/office/word/2006/wordml" xmlns:wps="http://schemas.microsoft.com/office/word/2010/wordprocessingShape" mc:Ignorable="w14 w15 w16se w16cid wp14">
+<w:hdr xmlns:wpc="http://schemas.microsoft.com/office/word/2010/wordprocessingCanvas" xmlns:mc="http://schemas.openxmlformats.org/markup-compatibility/2006" xmlns:o="urn:schemas-microsoft-com:office:office" xmlns:r="http://schemas.openxmlformats.org/officeDocument/2006/relationships" xmlns:m="http://schemas.openxmlformats.org/officeDocument/2006/math" xmlns:v="urn:schemas-microsoft-com:vml" xmlns:wp14="http://schemas.microsoft.com/office/word/2010/wordprocessingDrawing" xmlns:wp="http://schemas.openxmlformats.org/drawingml/2006/wordprocessingDrawing" xmlns:w10="urn:schemas-microsoft-com:office:word" xmlns:w="http://schemas.openxmlformats.org/wordprocessingml/2006/main" xmlns:w14="http://schemas.microsoft.com/office/word/2010/wordml" xmlns:w15="http://schemas.microsoft.com/office/word/2012/wordml" xmlns:wpg="http://schemas.microsoft.com/office/word/2010/wordprocessingGroup" xmlns:wpi="http://schemas.microsoft.com/office/word/2010/wordprocessingInk" xmlns:wne="http://schemas.microsoft.com/office/word/2006/wordml" xmlns:wps="http://schemas.microsoft.com/office/word/2010/wordprocessingShape" mc:Ignorable="w14 w15 wp14">
   <w:p>
     <w:pPr>
       <w:pStyle w:val="Header"/>
@@ -7450,7 +7484,7 @@
 </file>
 
 <file path=word/header2.xml><?xml version="1.0" encoding="utf-8"?>
-<w:hdr xmlns:wpc="http://schemas.microsoft.com/office/word/2010/wordprocessingCanvas" xmlns:cx="http://schemas.microsoft.com/office/drawing/2014/chartex" xmlns:cx1="http://schemas.microsoft.com/office/drawing/2015/9/8/chartex" xmlns:cx2="http://schemas.microsoft.com/office/drawing/2015/10/21/chartex" xmlns:cx3="http://schemas.microsoft.com/office/drawing/2016/5/9/chartex" xmlns:cx4="http://schemas.microsoft.com/office/drawing/2016/5/10/chartex" xmlns:cx5="http://schemas.microsoft.com/office/drawing/2016/5/11/chartex" xmlns:cx6="http://schemas.microsoft.com/office/drawing/2016/5/12/chartex" xmlns:cx7="http://schemas.microsoft.com/office/drawing/2016/5/13/chartex" xmlns:cx8="http://schemas.microsoft.com/office/drawing/2016/5/14/chartex" xmlns:mc="http://schemas.openxmlformats.org/markup-compatibility/2006" xmlns:aink="http://schemas.microsoft.com/office/drawing/2016/ink" xmlns:am3d="http://schemas.microsoft.com/office/drawing/2017/model3d" xmlns:o="urn:schemas-microsoft-com:office:office" xmlns:r="http://schemas.openxmlformats.org/officeDocument/2006/relationships" xmlns:m="http://schemas.openxmlformats.org/officeDocument/2006/math" xmlns:v="urn:schemas-microsoft-com:vml" xmlns:wp14="http://schemas.microsoft.com/office/word/2010/wordprocessingDrawing" xmlns:wp="http://schemas.openxmlformats.org/drawingml/2006/wordprocessingDrawing" xmlns:w10="urn:schemas-microsoft-com:office:word" xmlns:w="http://schemas.openxmlformats.org/wordprocessingml/2006/main" xmlns:w14="http://schemas.microsoft.com/office/word/2010/wordml" xmlns:w15="http://schemas.microsoft.com/office/word/2012/wordml" xmlns:w16cid="http://schemas.microsoft.com/office/word/2016/wordml/cid" xmlns:w16se="http://schemas.microsoft.com/office/word/2015/wordml/symex" xmlns:wpg="http://schemas.microsoft.com/office/word/2010/wordprocessingGroup" xmlns:wpi="http://schemas.microsoft.com/office/word/2010/wordprocessingInk" xmlns:wne="http://schemas.microsoft.com/office/word/2006/wordml" xmlns:wps="http://schemas.microsoft.com/office/word/2010/wordprocessingShape" mc:Ignorable="w14 w15 w16se w16cid wp14">
+<w:hdr xmlns:wpc="http://schemas.microsoft.com/office/word/2010/wordprocessingCanvas" xmlns:mc="http://schemas.openxmlformats.org/markup-compatibility/2006" xmlns:o="urn:schemas-microsoft-com:office:office" xmlns:r="http://schemas.openxmlformats.org/officeDocument/2006/relationships" xmlns:m="http://schemas.openxmlformats.org/officeDocument/2006/math" xmlns:v="urn:schemas-microsoft-com:vml" xmlns:wp14="http://schemas.microsoft.com/office/word/2010/wordprocessingDrawing" xmlns:wp="http://schemas.openxmlformats.org/drawingml/2006/wordprocessingDrawing" xmlns:w10="urn:schemas-microsoft-com:office:word" xmlns:w="http://schemas.openxmlformats.org/wordprocessingml/2006/main" xmlns:w14="http://schemas.microsoft.com/office/word/2010/wordml" xmlns:w15="http://schemas.microsoft.com/office/word/2012/wordml" xmlns:wpg="http://schemas.microsoft.com/office/word/2010/wordprocessingGroup" xmlns:wpi="http://schemas.microsoft.com/office/word/2010/wordprocessingInk" xmlns:wne="http://schemas.microsoft.com/office/word/2006/wordml" xmlns:wps="http://schemas.microsoft.com/office/word/2010/wordprocessingShape" mc:Ignorable="w14 w15 wp14">
   <w:p>
     <w:pPr>
       <w:pStyle w:val="Header"/>
@@ -7463,7 +7497,7 @@
 </file>
 
 <file path=word/header3.xml><?xml version="1.0" encoding="utf-8"?>
-<w:hdr xmlns:wpc="http://schemas.microsoft.com/office/word/2010/wordprocessingCanvas" xmlns:cx="http://schemas.microsoft.com/office/drawing/2014/chartex" xmlns:cx1="http://schemas.microsoft.com/office/drawing/2015/9/8/chartex" xmlns:cx2="http://schemas.microsoft.com/office/drawing/2015/10/21/chartex" xmlns:cx3="http://schemas.microsoft.com/office/drawing/2016/5/9/chartex" xmlns:cx4="http://schemas.microsoft.com/office/drawing/2016/5/10/chartex" xmlns:cx5="http://schemas.microsoft.com/office/drawing/2016/5/11/chartex" xmlns:cx6="http://schemas.microsoft.com/office/drawing/2016/5/12/chartex" xmlns:cx7="http://schemas.microsoft.com/office/drawing/2016/5/13/chartex" xmlns:cx8="http://schemas.microsoft.com/office/drawing/2016/5/14/chartex" xmlns:mc="http://schemas.openxmlformats.org/markup-compatibility/2006" xmlns:aink="http://schemas.microsoft.com/office/drawing/2016/ink" xmlns:am3d="http://schemas.microsoft.com/office/drawing/2017/model3d" xmlns:o="urn:schemas-microsoft-com:office:office" xmlns:r="http://schemas.openxmlformats.org/officeDocument/2006/relationships" xmlns:m="http://schemas.openxmlformats.org/officeDocument/2006/math" xmlns:v="urn:schemas-microsoft-com:vml" xmlns:wp14="http://schemas.microsoft.com/office/word/2010/wordprocessingDrawing" xmlns:wp="http://schemas.openxmlformats.org/drawingml/2006/wordprocessingDrawing" xmlns:w10="urn:schemas-microsoft-com:office:word" xmlns:w="http://schemas.openxmlformats.org/wordprocessingml/2006/main" xmlns:w14="http://schemas.microsoft.com/office/word/2010/wordml" xmlns:w15="http://schemas.microsoft.com/office/word/2012/wordml" xmlns:w16cid="http://schemas.microsoft.com/office/word/2016/wordml/cid" xmlns:w16se="http://schemas.microsoft.com/office/word/2015/wordml/symex" xmlns:wpg="http://schemas.microsoft.com/office/word/2010/wordprocessingGroup" xmlns:wpi="http://schemas.microsoft.com/office/word/2010/wordprocessingInk" xmlns:wne="http://schemas.microsoft.com/office/word/2006/wordml" xmlns:wps="http://schemas.microsoft.com/office/word/2010/wordprocessingShape" mc:Ignorable="w14 w15 w16se w16cid wp14">
+<w:hdr xmlns:wpc="http://schemas.microsoft.com/office/word/2010/wordprocessingCanvas" xmlns:mc="http://schemas.openxmlformats.org/markup-compatibility/2006" xmlns:o="urn:schemas-microsoft-com:office:office" xmlns:r="http://schemas.openxmlformats.org/officeDocument/2006/relationships" xmlns:m="http://schemas.openxmlformats.org/officeDocument/2006/math" xmlns:v="urn:schemas-microsoft-com:vml" xmlns:wp14="http://schemas.microsoft.com/office/word/2010/wordprocessingDrawing" xmlns:wp="http://schemas.openxmlformats.org/drawingml/2006/wordprocessingDrawing" xmlns:w10="urn:schemas-microsoft-com:office:word" xmlns:w="http://schemas.openxmlformats.org/wordprocessingml/2006/main" xmlns:w14="http://schemas.microsoft.com/office/word/2010/wordml" xmlns:w15="http://schemas.microsoft.com/office/word/2012/wordml" xmlns:wpg="http://schemas.microsoft.com/office/word/2010/wordprocessingGroup" xmlns:wpi="http://schemas.microsoft.com/office/word/2010/wordprocessingInk" xmlns:wne="http://schemas.microsoft.com/office/word/2006/wordml" xmlns:wps="http://schemas.microsoft.com/office/word/2010/wordprocessingShape" mc:Ignorable="w14 w15 wp14">
   <w:p>
     <w:pPr>
       <w:pStyle w:val="Header"/>
@@ -7476,7 +7510,7 @@
 </file>
 
 <file path=word/header4.xml><?xml version="1.0" encoding="utf-8"?>
-<w:hdr xmlns:wpc="http://schemas.microsoft.com/office/word/2010/wordprocessingCanvas" xmlns:cx="http://schemas.microsoft.com/office/drawing/2014/chartex" xmlns:cx1="http://schemas.microsoft.com/office/drawing/2015/9/8/chartex" xmlns:cx2="http://schemas.microsoft.com/office/drawing/2015/10/21/chartex" xmlns:cx3="http://schemas.microsoft.com/office/drawing/2016/5/9/chartex" xmlns:cx4="http://schemas.microsoft.com/office/drawing/2016/5/10/chartex" xmlns:cx5="http://schemas.microsoft.com/office/drawing/2016/5/11/chartex" xmlns:cx6="http://schemas.microsoft.com/office/drawing/2016/5/12/chartex" xmlns:cx7="http://schemas.microsoft.com/office/drawing/2016/5/13/chartex" xmlns:cx8="http://schemas.microsoft.com/office/drawing/2016/5/14/chartex" xmlns:mc="http://schemas.openxmlformats.org/markup-compatibility/2006" xmlns:aink="http://schemas.microsoft.com/office/drawing/2016/ink" xmlns:am3d="http://schemas.microsoft.com/office/drawing/2017/model3d" xmlns:o="urn:schemas-microsoft-com:office:office" xmlns:r="http://schemas.openxmlformats.org/officeDocument/2006/relationships" xmlns:m="http://schemas.openxmlformats.org/officeDocument/2006/math" xmlns:v="urn:schemas-microsoft-com:vml" xmlns:wp14="http://schemas.microsoft.com/office/word/2010/wordprocessingDrawing" xmlns:wp="http://schemas.openxmlformats.org/drawingml/2006/wordprocessingDrawing" xmlns:w10="urn:schemas-microsoft-com:office:word" xmlns:w="http://schemas.openxmlformats.org/wordprocessingml/2006/main" xmlns:w14="http://schemas.microsoft.com/office/word/2010/wordml" xmlns:w15="http://schemas.microsoft.com/office/word/2012/wordml" xmlns:w16cid="http://schemas.microsoft.com/office/word/2016/wordml/cid" xmlns:w16se="http://schemas.microsoft.com/office/word/2015/wordml/symex" xmlns:wpg="http://schemas.microsoft.com/office/word/2010/wordprocessingGroup" xmlns:wpi="http://schemas.microsoft.com/office/word/2010/wordprocessingInk" xmlns:wne="http://schemas.microsoft.com/office/word/2006/wordml" xmlns:wps="http://schemas.microsoft.com/office/word/2010/wordprocessingShape" mc:Ignorable="w14 w15 w16se w16cid wp14">
+<w:hdr xmlns:wpc="http://schemas.microsoft.com/office/word/2010/wordprocessingCanvas" xmlns:mc="http://schemas.openxmlformats.org/markup-compatibility/2006" xmlns:o="urn:schemas-microsoft-com:office:office" xmlns:r="http://schemas.openxmlformats.org/officeDocument/2006/relationships" xmlns:m="http://schemas.openxmlformats.org/officeDocument/2006/math" xmlns:v="urn:schemas-microsoft-com:vml" xmlns:wp14="http://schemas.microsoft.com/office/word/2010/wordprocessingDrawing" xmlns:wp="http://schemas.openxmlformats.org/drawingml/2006/wordprocessingDrawing" xmlns:w10="urn:schemas-microsoft-com:office:word" xmlns:w="http://schemas.openxmlformats.org/wordprocessingml/2006/main" xmlns:w14="http://schemas.microsoft.com/office/word/2010/wordml" xmlns:w15="http://schemas.microsoft.com/office/word/2012/wordml" xmlns:wpg="http://schemas.microsoft.com/office/word/2010/wordprocessingGroup" xmlns:wpi="http://schemas.microsoft.com/office/word/2010/wordprocessingInk" xmlns:wne="http://schemas.microsoft.com/office/word/2006/wordml" xmlns:wps="http://schemas.microsoft.com/office/word/2010/wordprocessingShape" mc:Ignorable="w14 w15 wp14">
   <w:p>
     <w:pPr>
       <w:pStyle w:val="Header"/>
@@ -7486,7 +7520,7 @@
 </file>
 
 <file path=word/numbering.xml><?xml version="1.0" encoding="utf-8"?>
-<w:numbering xmlns:wpc="http://schemas.microsoft.com/office/word/2010/wordprocessingCanvas" xmlns:cx="http://schemas.microsoft.com/office/drawing/2014/chartex" xmlns:cx1="http://schemas.microsoft.com/office/drawing/2015/9/8/chartex" xmlns:cx2="http://schemas.microsoft.com/office/drawing/2015/10/21/chartex" xmlns:cx3="http://schemas.microsoft.com/office/drawing/2016/5/9/chartex" xmlns:cx4="http://schemas.microsoft.com/office/drawing/2016/5/10/chartex" xmlns:cx5="http://schemas.microsoft.com/office/drawing/2016/5/11/chartex" xmlns:cx6="http://schemas.microsoft.com/office/drawing/2016/5/12/chartex" xmlns:cx7="http://schemas.microsoft.com/office/drawing/2016/5/13/chartex" xmlns:cx8="http://schemas.microsoft.com/office/drawing/2016/5/14/chartex" xmlns:mc="http://schemas.openxmlformats.org/markup-compatibility/2006" xmlns:aink="http://schemas.microsoft.com/office/drawing/2016/ink" xmlns:am3d="http://schemas.microsoft.com/office/drawing/2017/model3d" xmlns:o="urn:schemas-microsoft-com:office:office" xmlns:r="http://schemas.openxmlformats.org/officeDocument/2006/relationships" xmlns:m="http://schemas.openxmlformats.org/officeDocument/2006/math" xmlns:v="urn:schemas-microsoft-com:vml" xmlns:wp14="http://schemas.microsoft.com/office/word/2010/wordprocessingDrawing" xmlns:wp="http://schemas.openxmlformats.org/drawingml/2006/wordprocessingDrawing" xmlns:w10="urn:schemas-microsoft-com:office:word" xmlns:w="http://schemas.openxmlformats.org/wordprocessingml/2006/main" xmlns:w14="http://schemas.microsoft.com/office/word/2010/wordml" xmlns:w15="http://schemas.microsoft.com/office/word/2012/wordml" xmlns:w16cid="http://schemas.microsoft.com/office/word/2016/wordml/cid" xmlns:w16se="http://schemas.microsoft.com/office/word/2015/wordml/symex" xmlns:wpg="http://schemas.microsoft.com/office/word/2010/wordprocessingGroup" xmlns:wpi="http://schemas.microsoft.com/office/word/2010/wordprocessingInk" xmlns:wne="http://schemas.microsoft.com/office/word/2006/wordml" xmlns:wps="http://schemas.microsoft.com/office/word/2010/wordprocessingShape" mc:Ignorable="w14 w15 w16se w16cid wp14">
+<w:numbering xmlns:wpc="http://schemas.microsoft.com/office/word/2010/wordprocessingCanvas" xmlns:mc="http://schemas.openxmlformats.org/markup-compatibility/2006" xmlns:o="urn:schemas-microsoft-com:office:office" xmlns:r="http://schemas.openxmlformats.org/officeDocument/2006/relationships" xmlns:m="http://schemas.openxmlformats.org/officeDocument/2006/math" xmlns:v="urn:schemas-microsoft-com:vml" xmlns:wp14="http://schemas.microsoft.com/office/word/2010/wordprocessingDrawing" xmlns:wp="http://schemas.openxmlformats.org/drawingml/2006/wordprocessingDrawing" xmlns:w10="urn:schemas-microsoft-com:office:word" xmlns:w="http://schemas.openxmlformats.org/wordprocessingml/2006/main" xmlns:w14="http://schemas.microsoft.com/office/word/2010/wordml" xmlns:w15="http://schemas.microsoft.com/office/word/2012/wordml" xmlns:wpg="http://schemas.microsoft.com/office/word/2010/wordprocessingGroup" xmlns:wpi="http://schemas.microsoft.com/office/word/2010/wordprocessingInk" xmlns:wne="http://schemas.microsoft.com/office/word/2006/wordml" xmlns:wps="http://schemas.microsoft.com/office/word/2010/wordprocessingShape" mc:Ignorable="w14 w15 wp14">
   <w:abstractNum w:abstractNumId="0" w15:restartNumberingAfterBreak="0">
     <w:nsid w:val="FFFFFF7E"/>
     <w:multiLevelType w:val="singleLevel"/>
@@ -9017,7 +9051,7 @@
 </file>
 
 <file path=word/styles.xml><?xml version="1.0" encoding="utf-8"?>
-<w:styles xmlns:mc="http://schemas.openxmlformats.org/markup-compatibility/2006" xmlns:r="http://schemas.openxmlformats.org/officeDocument/2006/relationships" xmlns:w="http://schemas.openxmlformats.org/wordprocessingml/2006/main" xmlns:w14="http://schemas.microsoft.com/office/word/2010/wordml" xmlns:w15="http://schemas.microsoft.com/office/word/2012/wordml" xmlns:w16cid="http://schemas.microsoft.com/office/word/2016/wordml/cid" xmlns:w16se="http://schemas.microsoft.com/office/word/2015/wordml/symex" mc:Ignorable="w14 w15 w16se w16cid">
+<w:styles xmlns:mc="http://schemas.openxmlformats.org/markup-compatibility/2006" xmlns:r="http://schemas.openxmlformats.org/officeDocument/2006/relationships" xmlns:w="http://schemas.openxmlformats.org/wordprocessingml/2006/main" xmlns:w14="http://schemas.microsoft.com/office/word/2010/wordml" xmlns:w15="http://schemas.microsoft.com/office/word/2012/wordml" mc:Ignorable="w14 w15">
   <w:docDefaults>
     <w:rPrDefault>
       <w:rPr>
@@ -9027,7 +9061,7 @@
     </w:rPrDefault>
     <w:pPrDefault/>
   </w:docDefaults>
-  <w:latentStyles w:defLockedState="0" w:defUIPriority="99" w:defSemiHidden="0" w:defUnhideWhenUsed="0" w:defQFormat="0" w:count="375">
+  <w:latentStyles w:defLockedState="0" w:defUIPriority="99" w:defSemiHidden="0" w:defUnhideWhenUsed="0" w:defQFormat="0" w:count="371">
     <w:lsdException w:name="Normal" w:uiPriority="0" w:qFormat="1"/>
     <w:lsdException w:name="heading 1" w:uiPriority="9" w:qFormat="1"/>
     <w:lsdException w:name="heading 2" w:uiPriority="9" w:qFormat="1"/>
@@ -9133,6 +9167,7 @@
     <w:lsdException w:name="HTML Sample" w:semiHidden="1" w:unhideWhenUsed="1"/>
     <w:lsdException w:name="HTML Typewriter" w:semiHidden="1" w:unhideWhenUsed="1"/>
     <w:lsdException w:name="HTML Variable" w:semiHidden="1" w:unhideWhenUsed="1"/>
+    <w:lsdException w:name="Normal Table" w:semiHidden="1" w:unhideWhenUsed="1"/>
     <w:lsdException w:name="annotation subject" w:semiHidden="1" w:unhideWhenUsed="1"/>
     <w:lsdException w:name="No List" w:semiHidden="1" w:unhideWhenUsed="1"/>
     <w:lsdException w:name="Outline List 1" w:semiHidden="1" w:unhideWhenUsed="1"/>
@@ -9176,8 +9211,10 @@
     <w:lsdException w:name="Table Elegant" w:semiHidden="1" w:unhideWhenUsed="1"/>
     <w:lsdException w:name="Table Professional" w:semiHidden="1" w:unhideWhenUsed="1"/>
     <w:lsdException w:name="Table Subtle 1" w:semiHidden="1" w:unhideWhenUsed="1"/>
+    <w:lsdException w:name="Table Subtle 2" w:semiHidden="1" w:unhideWhenUsed="1"/>
     <w:lsdException w:name="Table Web 1" w:semiHidden="1" w:unhideWhenUsed="1"/>
     <w:lsdException w:name="Table Web 2" w:semiHidden="1" w:unhideWhenUsed="1"/>
+    <w:lsdException w:name="Table Web 3" w:semiHidden="1" w:unhideWhenUsed="1"/>
     <w:lsdException w:name="Balloon Text" w:semiHidden="1" w:unhideWhenUsed="1"/>
     <w:lsdException w:name="Table Grid" w:uiPriority="39"/>
     <w:lsdException w:name="Table Theme" w:semiHidden="1" w:unhideWhenUsed="1"/>
@@ -9396,10 +9433,6 @@
     <w:lsdException w:name="List Table 5 Dark Accent 6" w:uiPriority="50"/>
     <w:lsdException w:name="List Table 6 Colorful Accent 6" w:uiPriority="51"/>
     <w:lsdException w:name="List Table 7 Colorful Accent 6" w:uiPriority="52"/>
-    <w:lsdException w:name="Mention" w:semiHidden="1" w:unhideWhenUsed="1"/>
-    <w:lsdException w:name="Smart Hyperlink" w:semiHidden="1" w:unhideWhenUsed="1"/>
-    <w:lsdException w:name="Hashtag" w:semiHidden="1" w:unhideWhenUsed="1"/>
-    <w:lsdException w:name="Unresolved Mention" w:semiHidden="1" w:unhideWhenUsed="1"/>
   </w:latentStyles>
   <w:style w:type="paragraph" w:default="1" w:styleId="Normal">
     <w:name w:val="Normal"/>
@@ -10737,7 +10770,7 @@
 </file>
 
 <file path=customXml/itemProps1.xml><?xml version="1.0" encoding="utf-8"?>
-<ds:datastoreItem xmlns:ds="http://schemas.openxmlformats.org/officeDocument/2006/customXml" ds:itemID="{B9ABB7FA-5CBA-454F-AC48-56D138F32C7C}">
+<ds:datastoreItem xmlns:ds="http://schemas.openxmlformats.org/officeDocument/2006/customXml" ds:itemID="{15A87ACE-2F22-464C-A65C-F071C6B8CFA9}">
   <ds:schemaRefs>
     <ds:schemaRef ds:uri="http://schemas.openxmlformats.org/officeDocument/2006/bibliography"/>
   </ds:schemaRefs>

</xml_diff>

<commit_message>
Continued work on the user manual
Worked on the menu section
</commit_message>
<xml_diff>
--- a/9tapUserManual.docx
+++ b/9tapUserManual.docx
@@ -1282,27 +1282,25 @@
         <w:rPr>
           <w:spacing w:val="-5"/>
         </w:rPr>
-        <w:t>Steve Freeman - Director</w:t>
-      </w:r>
-    </w:p>
-    <w:p>
-      <w:pPr>
-        <w:rPr>
-          <w:rFonts w:ascii="Arial Black" w:hAnsi="Arial Black"/>
-          <w:color w:val="808080"/>
-          <w:spacing w:val="-25"/>
-          <w:kern w:val="28"/>
-          <w:sz w:val="40"/>
-          <w:szCs w:val="40"/>
-        </w:rPr>
-      </w:pPr>
-      <w:r>
-        <w:rPr>
-          <w:sz w:val="40"/>
-          <w:szCs w:val="40"/>
-        </w:rPr>
-        <w:br w:type="page"/>
-      </w:r>
+        <w:t xml:space="preserve">Steve Freeman </w:t>
+      </w:r>
+      <w:r>
+        <w:rPr>
+          <w:spacing w:val="-5"/>
+        </w:rPr>
+        <w:t>–</w:t>
+      </w:r>
+      <w:r>
+        <w:rPr>
+          <w:spacing w:val="-5"/>
+        </w:rPr>
+        <w:t xml:space="preserve"> Director</w:t>
+      </w:r>
+    </w:p>
+    <w:p>
+      <w:pPr>
+        <w:pStyle w:val="BodyText"/>
+      </w:pPr>
     </w:p>
     <w:p>
       <w:pPr>
@@ -1431,27 +1429,14 @@
       <w:r>
         <w:t xml:space="preserve">Figure </w:t>
       </w:r>
-      <w:r>
-        <w:fldChar w:fldCharType="begin"/>
-      </w:r>
-      <w:r>
-        <w:instrText xml:space="preserve"> SEQ Figure \* ARABIC </w:instrText>
-      </w:r>
-      <w:r>
-        <w:fldChar w:fldCharType="separate"/>
-      </w:r>
-      <w:r>
-        <w:rPr>
-          <w:noProof/>
-        </w:rPr>
-        <w:t>1</w:t>
-      </w:r>
-      <w:r>
-        <w:rPr>
-          <w:noProof/>
-        </w:rPr>
-        <w:fldChar w:fldCharType="end"/>
-      </w:r>
+      <w:fldSimple w:instr=" SEQ Figure \* ARABIC ">
+        <w:r>
+          <w:rPr>
+            <w:noProof/>
+          </w:rPr>
+          <w:t>1</w:t>
+        </w:r>
+      </w:fldSimple>
       <w:r>
         <w:t>: 9-Tap Main Menu</w:t>
       </w:r>
@@ -1593,10 +1578,14 @@
     <w:p>
       <w:pPr>
         <w:pStyle w:val="Caption"/>
-      </w:pPr>
-      <w:r>
-        <w:br w:type="page"/>
-      </w:r>
+        <w:sectPr>
+          <w:type w:val="continuous"/>
+          <w:pgSz w:w="12240" w:h="15840" w:code="1"/>
+          <w:pgMar w:top="1800" w:right="1195" w:bottom="1440" w:left="3355" w:header="965" w:footer="965" w:gutter="0"/>
+          <w:cols w:space="360"/>
+          <w:titlePg/>
+        </w:sectPr>
+      </w:pPr>
     </w:p>
     <w:p>
       <w:pPr>
@@ -1801,11 +1790,8 @@
         </w:numPr>
       </w:pPr>
       <w:r>
-        <w:t xml:space="preserve">The 9 Tap Tour program has now been successfully installed. Choose “Run 9 Tap Tour” to immediately launch the program, or “View ReadMe.txt” to view </w:t>
-      </w:r>
-      <w:r>
         <w:lastRenderedPageBreak/>
-        <w:t>the ReadMe file where you can view updated program information made after the game manual was printed.</w:t>
+        <w:t>The 9 Tap Tour program has now been successfully installed. Choose “Run 9 Tap Tour” to immediately launch the program, or “View ReadMe.txt” to view the ReadMe file where you can view updated program information made after the game manual was printed.</w:t>
       </w:r>
     </w:p>
     <w:p>
@@ -1982,7 +1968,10 @@
         <w:t xml:space="preserve">On the Member Info screen, Find the import button. Click on it. When the file picker screen comes up, navigate to the Excel file you need to import. Select it and </w:t>
       </w:r>
       <w:r>
-        <w:t>hit OK.</w:t>
+        <w:t>click</w:t>
+      </w:r>
+      <w:r>
+        <w:t xml:space="preserve"> OK.</w:t>
       </w:r>
     </w:p>
     <w:p>
@@ -1998,13 +1987,25 @@
         <w:pStyle w:val="BodyText"/>
       </w:pPr>
       <w:r>
-        <w:t>On the Member Info screen, Click new. A new blank record will display. Start filling in the player’s information</w:t>
+        <w:t xml:space="preserve">On the Member Info screen, Click </w:t>
+      </w:r>
+      <w:r>
+        <w:t>“New” button.</w:t>
+      </w:r>
+      <w:r>
+        <w:t xml:space="preserve"> A new blank record will display. Start filling in the player’s information</w:t>
       </w:r>
       <w:r>
         <w:t>, first and last name are required at time of creation</w:t>
       </w:r>
       <w:r>
-        <w:t>. Save the record.</w:t>
+        <w:t>. Save the record</w:t>
+      </w:r>
+      <w:r>
+        <w:t xml:space="preserve"> by clicking “Save”</w:t>
+      </w:r>
+      <w:r>
+        <w:t>.</w:t>
       </w:r>
     </w:p>
     <w:p>
@@ -2023,10 +2024,40 @@
         <w:t xml:space="preserve">On the Member Scores screen, </w:t>
       </w:r>
       <w:r>
-        <w:t>click on the Create/Ed</w:t>
-      </w:r>
-      <w:r>
-        <w:t>it Tournament… button. This launches the New Tournament screen. Fill in the necessary information.</w:t>
+        <w:t xml:space="preserve">click on the </w:t>
+      </w:r>
+      <w:r>
+        <w:t>“</w:t>
+      </w:r>
+      <w:r>
+        <w:t>Create/Ed</w:t>
+      </w:r>
+      <w:r>
+        <w:t>it Tournament…</w:t>
+      </w:r>
+      <w:r>
+        <w:t>”</w:t>
+      </w:r>
+      <w:r>
+        <w:t xml:space="preserve"> button. This launches the New Tournament screen. </w:t>
+      </w:r>
+      <w:r>
+        <w:t xml:space="preserve">Use the Tournament Date field to enter the date of the tournament. </w:t>
+      </w:r>
+      <w:r>
+        <w:t xml:space="preserve">Fill in the </w:t>
+      </w:r>
+      <w:r>
+        <w:t>Location field with the name of the bowling alley. Enter the name of the event in the Event field. Enter the sponsors in the Sponsors field. LEAVE THE DOUBLES BOX UNCHECKED</w:t>
+      </w:r>
+      <w:r>
+        <w:t>.</w:t>
+      </w:r>
+      <w:r>
+        <w:t xml:space="preserve"> </w:t>
+      </w:r>
+      <w:r>
+        <w:t>If appropriate, check the 3 out of 4 box. Enter the number of squads in the Number of Squads field. If needed enter notes on the tournament in the Notes field. Double check your information, then click “Create Tournament”.</w:t>
       </w:r>
     </w:p>
     <w:p>
@@ -2042,7 +2073,19 @@
         <w:pStyle w:val="BodyText"/>
       </w:pPr>
       <w:r>
-        <w:t xml:space="preserve">On the Member Scores screen, in the Tournament Files section, select the tournament from the drop down menu. Once the tournament is selected, enter the member number and click enter. The player information and status will auto-populate. Pick which squad they bowled in. Enter the player’s scratch scores in a three digit format. 9-Tap will tab through as the scores are entered. Before clicking “Add New/Update Record” double check that the entered scores are correct. </w:t>
+        <w:t xml:space="preserve">On the Member Scores screen, in the Tournament Files section, select </w:t>
+      </w:r>
+      <w:r>
+        <w:t>a</w:t>
+      </w:r>
+      <w:r>
+        <w:t xml:space="preserve"> tournament from the drop down menu. Once the tournament is selected, enter the member</w:t>
+      </w:r>
+      <w:r>
+        <w:t>’s</w:t>
+      </w:r>
+      <w:r>
+        <w:t xml:space="preserve"> number and click enter. The player information and status will auto-populate. Pick which squad they bowled in. Enter the player’s scratch scores in a three digit format. 9-Tap will tab through as the scores are entered. Before clicking “Add New/Update Record” double check that the entered scores are correct. </w:t>
       </w:r>
     </w:p>
     <w:p>
@@ -2134,22 +2177,6 @@
       <w:pPr>
         <w:pStyle w:val="Heading1"/>
         <w:rPr>
-          <w:sz w:val="40"/>
-          <w:szCs w:val="40"/>
-        </w:rPr>
-        <w:sectPr>
-          <w:type w:val="continuous"/>
-          <w:pgSz w:w="12240" w:h="15840" w:code="1"/>
-          <w:pgMar w:top="1800" w:right="1195" w:bottom="1440" w:left="3355" w:header="965" w:footer="965" w:gutter="0"/>
-          <w:cols w:space="360"/>
-          <w:titlePg/>
-        </w:sectPr>
-      </w:pPr>
-    </w:p>
-    <w:p>
-      <w:pPr>
-        <w:pStyle w:val="Heading1"/>
-        <w:rPr>
           <w:szCs w:val="32"/>
         </w:rPr>
       </w:pPr>
@@ -2163,11 +2190,23 @@
     </w:p>
     <w:p>
       <w:pPr>
+        <w:pStyle w:val="Heading8"/>
+        <w:framePr w:wrap="around"/>
+      </w:pPr>
+      <w:r>
+        <w:t>An indepth look at the 9-Tap program</w:t>
+      </w:r>
+    </w:p>
+    <w:p>
+      <w:pPr>
         <w:pStyle w:val="BodyText"/>
         <w:keepNext/>
       </w:pPr>
       <w:r>
-        <w:t>The main menu is where you access the various functions of the program. Member Info, button and tab. Member Scores, button and tab. The About and Exit buttons. The Region picker. And the “Add Region” button. Also, the tools tab accesses the active/inactive member dialog.</w:t>
+        <w:t>After launching 9-Tap, The main menu screen will display. This</w:t>
+      </w:r>
+      <w:r>
+        <w:t xml:space="preserve"> is where you access the various functions of the program. Member Info, button and tab. Member Scores, button and tab. The About and Exit buttons. The Region picker. And the “Add Region” button. Also, the tools tab accesses the active/inactive member dialog.</w:t>
       </w:r>
     </w:p>
     <w:p>
@@ -2230,27 +2269,14 @@
       <w:r>
         <w:t xml:space="preserve">Figure </w:t>
       </w:r>
-      <w:r>
-        <w:fldChar w:fldCharType="begin"/>
-      </w:r>
-      <w:r>
-        <w:instrText xml:space="preserve"> SEQ Figure \* ARABIC </w:instrText>
-      </w:r>
-      <w:r>
-        <w:fldChar w:fldCharType="separate"/>
-      </w:r>
-      <w:r>
-        <w:rPr>
-          <w:noProof/>
-        </w:rPr>
-        <w:t>2</w:t>
-      </w:r>
-      <w:r>
-        <w:rPr>
-          <w:noProof/>
-        </w:rPr>
-        <w:fldChar w:fldCharType="end"/>
-      </w:r>
+      <w:fldSimple w:instr=" SEQ Figure \* ARABIC ">
+        <w:r>
+          <w:rPr>
+            <w:noProof/>
+          </w:rPr>
+          <w:t>2</w:t>
+        </w:r>
+      </w:fldSimple>
       <w:r>
         <w:t>: Main Menu</w:t>
       </w:r>
@@ -2261,7 +2287,7 @@
       </w:pPr>
       <w:r>
         <w:lastRenderedPageBreak/>
-        <w:t>Tools</w:t>
+        <w:t>Member Info</w:t>
       </w:r>
     </w:p>
     <w:p>
@@ -2270,142 +2296,32 @@
         <w:keepNext/>
       </w:pPr>
       <w:r>
-        <w:t>Under Tools you will find the Update Inactive Members screen. Pick the date to find which members haven’t bowled for more than 180 days. You can click the check box by the names of the players to update to inactive status. Click “Update” to update the member information.</w:t>
+        <w:t>The Member Info screen is where new players are entered</w:t>
+      </w:r>
+      <w:r>
+        <w:t>; member information is updated; and member information can be imported from Excel files</w:t>
+      </w:r>
+      <w:r>
+        <w:t>.</w:t>
       </w:r>
     </w:p>
     <w:p>
       <w:pPr>
         <w:pStyle w:val="BodyText"/>
         <w:keepNext/>
-        <w:jc w:val="center"/>
-      </w:pPr>
+      </w:pPr>
+      <w:r>
+        <w:t xml:space="preserve"> </w:t>
+      </w:r>
       <w:r>
         <w:rPr>
           <w:noProof/>
         </w:rPr>
         <w:drawing>
-          <wp:inline distT="0" distB="0" distL="0" distR="0">
-            <wp:extent cx="2343150" cy="3836334"/>
-            <wp:effectExtent l="0" t="0" r="0" b="0"/>
-            <wp:docPr id="13" name="Picture 13"/>
-            <wp:cNvGraphicFramePr>
-              <a:graphicFrameLocks xmlns:a="http://schemas.openxmlformats.org/drawingml/2006/main" noChangeAspect="1"/>
-            </wp:cNvGraphicFramePr>
-            <a:graphic xmlns:a="http://schemas.openxmlformats.org/drawingml/2006/main">
-              <a:graphicData uri="http://schemas.openxmlformats.org/drawingml/2006/picture">
-                <pic:pic xmlns:pic="http://schemas.openxmlformats.org/drawingml/2006/picture">
-                  <pic:nvPicPr>
-                    <pic:cNvPr id="13" name="UpdateInactiveMembersForm.PNG"/>
-                    <pic:cNvPicPr/>
-                  </pic:nvPicPr>
-                  <pic:blipFill>
-                    <a:blip r:embed="rId15">
-                      <a:extLst>
-                        <a:ext uri="{28A0092B-C50C-407E-A947-70E740481C1C}">
-                          <a14:useLocalDpi xmlns:a14="http://schemas.microsoft.com/office/drawing/2010/main" val="0"/>
-                        </a:ext>
-                      </a:extLst>
-                    </a:blip>
-                    <a:stretch>
-                      <a:fillRect/>
-                    </a:stretch>
-                  </pic:blipFill>
-                  <pic:spPr>
-                    <a:xfrm>
-                      <a:off x="0" y="0"/>
-                      <a:ext cx="2361540" cy="3866443"/>
-                    </a:xfrm>
-                    <a:prstGeom prst="rect">
-                      <a:avLst/>
-                    </a:prstGeom>
-                  </pic:spPr>
-                </pic:pic>
-              </a:graphicData>
-            </a:graphic>
-          </wp:inline>
-        </w:drawing>
-      </w:r>
-    </w:p>
-    <w:p>
-      <w:pPr>
-        <w:pStyle w:val="Caption"/>
-        <w:jc w:val="center"/>
-      </w:pPr>
-      <w:r>
-        <w:t xml:space="preserve">Figure </w:t>
-      </w:r>
-      <w:r>
-        <w:fldChar w:fldCharType="begin"/>
-      </w:r>
-      <w:r>
-        <w:instrText xml:space="preserve"> SEQ Figure \* ARABIC </w:instrText>
-      </w:r>
-      <w:r>
-        <w:fldChar w:fldCharType="separate"/>
-      </w:r>
-      <w:r>
-        <w:rPr>
-          <w:noProof/>
-        </w:rPr>
-        <w:t>3</w:t>
-      </w:r>
-      <w:r>
-        <w:rPr>
-          <w:noProof/>
-        </w:rPr>
-        <w:fldChar w:fldCharType="end"/>
-      </w:r>
-      <w:r>
-        <w:t>: Under Tools, Update Inactive status</w:t>
-      </w:r>
-    </w:p>
-    <w:p>
-      <w:pPr>
-        <w:pStyle w:val="Heading1"/>
-      </w:pPr>
-      <w:r>
-        <w:lastRenderedPageBreak/>
-        <w:t xml:space="preserve">Member Info </w:t>
-      </w:r>
-      <w:r>
-        <w:t>Form</w:t>
-      </w:r>
-    </w:p>
-    <w:p>
-      <w:pPr>
-        <w:pStyle w:val="BodyText"/>
-        <w:keepNext/>
-      </w:pPr>
-      <w:r>
-        <w:t>The Member Info screen is where new players are entered</w:t>
-      </w:r>
-      <w:r>
-        <w:t>; member information is updated; and member information can be imported from Excel files. The member number is auto-generated for each new member. The member last and first name are required. If you are pressed for time, you can save the member at this point, then come back and fill in the other information. Select if they are active or inactive under Status. Based on the member’s birthdate, are they old enough to be in the senior bracket? If yes, check the “</w:t>
-      </w:r>
-      <w:proofErr w:type="gramStart"/>
-      <w:r>
-        <w:t>Senior</w:t>
-      </w:r>
-      <w:proofErr w:type="gramEnd"/>
-      <w:r>
-        <w:t xml:space="preserve">” box. Select gender under Gender section. </w:t>
-      </w:r>
-    </w:p>
-    <w:p>
-      <w:pPr>
-        <w:pStyle w:val="BodyText"/>
-        <w:keepNext/>
-        <w:jc w:val="center"/>
-      </w:pPr>
-      <w:r>
-        <w:rPr>
-          <w:noProof/>
-        </w:rPr>
-        <w:drawing>
-          <wp:inline distT="0" distB="0" distL="0" distR="0">
+          <wp:inline distT="0" distB="0" distL="0" distR="0" wp14:anchorId="311BC661" wp14:editId="11963595">
             <wp:extent cx="4448175" cy="3980962"/>
             <wp:effectExtent l="0" t="0" r="0" b="635"/>
-            <wp:docPr id="5" name="Picture 5" descr="The form where member information is entered and edited." title="member info form"/>
+            <wp:docPr id="19" name="Picture 19" descr="The form where member information is entered and edited." title="member info form"/>
             <wp:cNvGraphicFramePr>
               <a:graphicFrameLocks xmlns:a="http://schemas.openxmlformats.org/drawingml/2006/main" noChangeAspect="1"/>
             </wp:cNvGraphicFramePr>
@@ -2417,7 +2333,7 @@
                     <pic:cNvPicPr/>
                   </pic:nvPicPr>
                   <pic:blipFill rotWithShape="1">
-                    <a:blip r:embed="rId16">
+                    <a:blip r:embed="rId15">
                       <a:extLst>
                         <a:ext uri="{28A0092B-C50C-407E-A947-70E740481C1C}">
                           <a14:useLocalDpi xmlns:a14="http://schemas.microsoft.com/office/drawing/2010/main" val="0"/>
@@ -2454,7 +2370,7 @@
     <w:p>
       <w:pPr>
         <w:pStyle w:val="Caption"/>
-        <w:jc w:val="center"/>
+        <w:jc w:val="both"/>
       </w:pPr>
       <w:r>
         <w:t xml:space="preserve">Figure </w:t>
@@ -2472,7 +2388,7 @@
         <w:rPr>
           <w:noProof/>
         </w:rPr>
-        <w:t>4</w:t>
+        <w:t>3</w:t>
       </w:r>
       <w:r>
         <w:rPr>
@@ -2486,8 +2402,211 @@
     </w:p>
     <w:p>
       <w:pPr>
+        <w:pStyle w:val="Heading3"/>
+      </w:pPr>
+      <w:r>
+        <w:t>Import Members</w:t>
+      </w:r>
+    </w:p>
+    <w:p>
+      <w:pPr>
         <w:pStyle w:val="BodyText"/>
-      </w:pPr>
+        <w:keepNext/>
+      </w:pPr>
+      <w:r>
+        <w:t>In the Record box, click on the “Import” button. The import file window will open</w:t>
+      </w:r>
+      <w:r>
+        <w:t>, see figure 10</w:t>
+      </w:r>
+      <w:r>
+        <w:t>. Chose the Excel file to be imported, then click “Open”. The member information will now be imported</w:t>
+      </w:r>
+      <w:r>
+        <w:t xml:space="preserve"> to the member database</w:t>
+      </w:r>
+    </w:p>
+    <w:p>
+      <w:pPr>
+        <w:pStyle w:val="Heading3"/>
+      </w:pPr>
+      <w:r>
+        <w:t>New Members</w:t>
+      </w:r>
+    </w:p>
+    <w:p>
+      <w:pPr>
+        <w:pStyle w:val="BodyText"/>
+        <w:keepNext/>
+      </w:pPr>
+      <w:r>
+        <w:t xml:space="preserve">To add a new member, start on the Member Info screen. Click the “New” button in the Record box. </w:t>
+      </w:r>
+      <w:r>
+        <w:t>The member number auto-generate</w:t>
+      </w:r>
+      <w:r>
+        <w:t>s</w:t>
+      </w:r>
+      <w:r>
+        <w:t xml:space="preserve"> for each new member. </w:t>
+      </w:r>
+      <w:r>
+        <w:t>Begin entering the member’s last name in the Last Name field, then hit tab. enter the member’s first name in the First Name field, then hit tab</w:t>
+      </w:r>
+      <w:r>
+        <w:t>.</w:t>
+      </w:r>
+      <w:r>
+        <w:t xml:space="preserve"> If applicable, enter the member’s middle initial, then hit tab. You are now at the D.O.B. field, enter the member’s date of birth. Hit tab to go to the SSN field. The member Social Security Number is entered here. By default it is hidden, to display the SSN, check the box to the left of the SSN field. Tab to the Address field to begin enter</w:t>
+      </w:r>
+      <w:r>
+        <w:t>ing the members address information. Tab to the next field as the information is entered.</w:t>
+      </w:r>
+      <w:r>
+        <w:t xml:space="preserve"> After his email has been entered, tab to Date Joined. Enter the member’s join date, then hit tab. If </w:t>
+      </w:r>
+      <w:r>
+        <w:lastRenderedPageBreak/>
+        <w:t>applicable enter the member’s rejoin date, then hit tab. If the player has any referrals, enter them in the Referral</w:t>
+      </w:r>
+      <w:r>
+        <w:t xml:space="preserve"> field, hit tab twice.</w:t>
+      </w:r>
+    </w:p>
+    <w:p>
+      <w:pPr>
+        <w:pStyle w:val="BodyText"/>
+        <w:keepNext/>
+      </w:pPr>
+      <w:r>
+        <w:t xml:space="preserve">Next is the Average field. To enter the member average from elsewhere, she has to have proof of it, </w:t>
+      </w:r>
+      <w:proofErr w:type="spellStart"/>
+      <w:r>
+        <w:t>ie</w:t>
+      </w:r>
+      <w:proofErr w:type="spellEnd"/>
+      <w:r>
+        <w:t xml:space="preserve"> her published average from another league. Tab through until you are in the Status box. Choose if the member is inactive or active. If the member is 55 years old or older, check the “</w:t>
+      </w:r>
+      <w:proofErr w:type="gramStart"/>
+      <w:r>
+        <w:t>Senior</w:t>
+      </w:r>
+      <w:proofErr w:type="gramEnd"/>
+      <w:r>
+        <w:t>” box. In the gender box, select the member’s gender. Enter the date of the member’s last payment. Enter any notes in the note field, if applicable. Click “Save”. The new member is now added to the member database. Note: Last name and first name are required fields.</w:t>
+      </w:r>
+    </w:p>
+    <w:p>
+      <w:pPr>
+        <w:pStyle w:val="BodyText"/>
+        <w:keepNext/>
+      </w:pPr>
+      <w:r>
+        <w:rPr>
+          <w:noProof/>
+        </w:rPr>
+        <w:drawing>
+          <wp:inline distT="0" distB="0" distL="0" distR="0">
+            <wp:extent cx="4448175" cy="3980962"/>
+            <wp:effectExtent l="0" t="0" r="0" b="635"/>
+            <wp:docPr id="5" name="Picture 5" descr="The form where member information is entered and edited." title="member info form"/>
+            <wp:cNvGraphicFramePr>
+              <a:graphicFrameLocks xmlns:a="http://schemas.openxmlformats.org/drawingml/2006/main" noChangeAspect="1"/>
+            </wp:cNvGraphicFramePr>
+            <a:graphic xmlns:a="http://schemas.openxmlformats.org/drawingml/2006/main">
+              <a:graphicData uri="http://schemas.openxmlformats.org/drawingml/2006/picture">
+                <pic:pic xmlns:pic="http://schemas.openxmlformats.org/drawingml/2006/picture">
+                  <pic:nvPicPr>
+                    <pic:cNvPr id="5" name="MemberInfoForm.PNG"/>
+                    <pic:cNvPicPr/>
+                  </pic:nvPicPr>
+                  <pic:blipFill rotWithShape="1">
+                    <a:blip r:embed="rId15">
+                      <a:extLst>
+                        <a:ext uri="{28A0092B-C50C-407E-A947-70E740481C1C}">
+                          <a14:useLocalDpi xmlns:a14="http://schemas.microsoft.com/office/drawing/2010/main" val="0"/>
+                        </a:ext>
+                      </a:extLst>
+                    </a:blip>
+                    <a:srcRect l="1" r="40077"/>
+                    <a:stretch/>
+                  </pic:blipFill>
+                  <pic:spPr bwMode="auto">
+                    <a:xfrm>
+                      <a:off x="0" y="0"/>
+                      <a:ext cx="4467314" cy="3998091"/>
+                    </a:xfrm>
+                    <a:prstGeom prst="rect">
+                      <a:avLst/>
+                    </a:prstGeom>
+                    <a:ln>
+                      <a:noFill/>
+                    </a:ln>
+                    <a:extLst>
+                      <a:ext uri="{53640926-AAD7-44D8-BBD7-CCE9431645EC}">
+                        <a14:shadowObscured xmlns:a14="http://schemas.microsoft.com/office/drawing/2010/main"/>
+                      </a:ext>
+                    </a:extLst>
+                  </pic:spPr>
+                </pic:pic>
+              </a:graphicData>
+            </a:graphic>
+          </wp:inline>
+        </w:drawing>
+      </w:r>
+    </w:p>
+    <w:p>
+      <w:pPr>
+        <w:pStyle w:val="Caption"/>
+        <w:jc w:val="both"/>
+      </w:pPr>
+      <w:r>
+        <w:t xml:space="preserve">Figure </w:t>
+      </w:r>
+      <w:fldSimple w:instr=" SEQ Figure \* ARABIC ">
+        <w:r>
+          <w:rPr>
+            <w:noProof/>
+          </w:rPr>
+          <w:t>5</w:t>
+        </w:r>
+      </w:fldSimple>
+      <w:r>
+        <w:t>: Member Information</w:t>
+      </w:r>
+    </w:p>
+    <w:p>
+      <w:pPr>
+        <w:pStyle w:val="Heading3"/>
+      </w:pPr>
+      <w:r>
+        <w:t>Updating a member.</w:t>
+      </w:r>
+    </w:p>
+    <w:p>
+      <w:pPr>
+        <w:pStyle w:val="BodyText"/>
+      </w:pPr>
+      <w:r>
+        <w:t xml:space="preserve">Click on the “Member Search” button. The member search screen will display (figure 7). Members can be searched by number, name, average, handicap, or bonus. </w:t>
+      </w:r>
+      <w:r>
+        <w:t xml:space="preserve">Enter the search parameters and click “Search”. The results display at the bottom of the screen. </w:t>
+      </w:r>
+      <w:r>
+        <w:t>To display all members in the database, leave the fields blank and click “Search”</w:t>
+      </w:r>
+    </w:p>
+    <w:p>
+      <w:pPr>
+        <w:pStyle w:val="BodyText"/>
+      </w:pPr>
+      <w:r>
+        <w:t>Select the member to be updated and click “Select”. The member will now be displayed on the Member Info screen. Make updates to the member’s information. Then click “Save”. The updates will be saved to the member database.</w:t>
+      </w:r>
     </w:p>
     <w:p>
       <w:pPr>
@@ -2510,190 +2629,13 @@
         <w:keepNext/>
       </w:pPr>
       <w:r>
-        <w:t xml:space="preserve">Craft beer sartorial copper mug </w:t>
-      </w:r>
-      <w:proofErr w:type="spellStart"/>
-      <w:r>
-        <w:t>tbh</w:t>
-      </w:r>
-      <w:proofErr w:type="spellEnd"/>
-      <w:r>
-        <w:t xml:space="preserve"> </w:t>
-      </w:r>
-      <w:proofErr w:type="spellStart"/>
-      <w:r>
-        <w:t>jianbing</w:t>
-      </w:r>
-      <w:proofErr w:type="spellEnd"/>
-      <w:r>
-        <w:t xml:space="preserve">, locavore VHS salvia +1 vegan gluten-free </w:t>
-      </w:r>
-      <w:proofErr w:type="spellStart"/>
-      <w:r>
-        <w:t>kogi</w:t>
-      </w:r>
-      <w:proofErr w:type="spellEnd"/>
-      <w:r>
-        <w:t xml:space="preserve"> pug </w:t>
-      </w:r>
-      <w:proofErr w:type="spellStart"/>
-      <w:r>
-        <w:t>vexillologist</w:t>
-      </w:r>
-      <w:proofErr w:type="spellEnd"/>
-      <w:r>
-        <w:t xml:space="preserve"> </w:t>
-      </w:r>
-      <w:proofErr w:type="spellStart"/>
-      <w:r>
-        <w:t>affogato</w:t>
-      </w:r>
-      <w:proofErr w:type="spellEnd"/>
-      <w:r>
-        <w:t xml:space="preserve">. Fanny pack </w:t>
-      </w:r>
-      <w:proofErr w:type="spellStart"/>
-      <w:r>
-        <w:t>palo</w:t>
-      </w:r>
-      <w:proofErr w:type="spellEnd"/>
-      <w:r>
-        <w:t xml:space="preserve"> </w:t>
-      </w:r>
-      <w:proofErr w:type="spellStart"/>
-      <w:r>
-        <w:t>santo</w:t>
-      </w:r>
-      <w:proofErr w:type="spellEnd"/>
-      <w:r>
-        <w:t xml:space="preserve"> </w:t>
-      </w:r>
-      <w:proofErr w:type="spellStart"/>
-      <w:r>
-        <w:t>proident</w:t>
-      </w:r>
-      <w:proofErr w:type="spellEnd"/>
-      <w:r>
-        <w:t xml:space="preserve"> blog bespoke </w:t>
-      </w:r>
-      <w:proofErr w:type="spellStart"/>
-      <w:r>
-        <w:t>commodo</w:t>
-      </w:r>
-      <w:proofErr w:type="spellEnd"/>
-      <w:r>
-        <w:t xml:space="preserve"> tilde hammock </w:t>
-      </w:r>
-      <w:proofErr w:type="spellStart"/>
-      <w:r>
-        <w:t>taiyaki</w:t>
-      </w:r>
-      <w:proofErr w:type="spellEnd"/>
-      <w:r>
-        <w:t xml:space="preserve"> wayfarers gentrify. Cardigan ugh slow-carb, </w:t>
-      </w:r>
-      <w:proofErr w:type="spellStart"/>
-      <w:r>
-        <w:t>ea</w:t>
-      </w:r>
-      <w:proofErr w:type="spellEnd"/>
-      <w:r>
-        <w:t xml:space="preserve"> DIY hot chicken </w:t>
-      </w:r>
-      <w:proofErr w:type="spellStart"/>
-      <w:r>
-        <w:t>commodo</w:t>
-      </w:r>
-      <w:proofErr w:type="spellEnd"/>
-      <w:r>
-        <w:t xml:space="preserve"> </w:t>
-      </w:r>
-      <w:proofErr w:type="spellStart"/>
-      <w:r>
-        <w:t>godard</w:t>
-      </w:r>
-      <w:proofErr w:type="spellEnd"/>
-      <w:r>
-        <w:t xml:space="preserve">. Lorem </w:t>
-      </w:r>
-      <w:proofErr w:type="spellStart"/>
-      <w:r>
-        <w:t>sint</w:t>
-      </w:r>
-      <w:proofErr w:type="spellEnd"/>
-      <w:r>
-        <w:t xml:space="preserve"> qui 3 wolf moon </w:t>
-      </w:r>
-      <w:proofErr w:type="spellStart"/>
-      <w:r>
-        <w:t>enim</w:t>
-      </w:r>
-      <w:proofErr w:type="spellEnd"/>
-      <w:r>
-        <w:t xml:space="preserve"> </w:t>
-      </w:r>
-      <w:proofErr w:type="spellStart"/>
-      <w:r>
-        <w:t>voluptate</w:t>
-      </w:r>
-      <w:proofErr w:type="spellEnd"/>
-      <w:r>
-        <w:t xml:space="preserve">, </w:t>
-      </w:r>
-      <w:proofErr w:type="spellStart"/>
-      <w:r>
-        <w:t>velit</w:t>
-      </w:r>
-      <w:proofErr w:type="spellEnd"/>
-      <w:r>
-        <w:t xml:space="preserve"> </w:t>
-      </w:r>
-      <w:proofErr w:type="spellStart"/>
-      <w:r>
-        <w:t>veniam</w:t>
-      </w:r>
-      <w:proofErr w:type="spellEnd"/>
-      <w:r>
-        <w:t xml:space="preserve">. Fanny pack man bun </w:t>
-      </w:r>
-      <w:proofErr w:type="spellStart"/>
-      <w:r>
-        <w:t>helvetica</w:t>
-      </w:r>
-      <w:proofErr w:type="spellEnd"/>
-      <w:r>
-        <w:t xml:space="preserve"> viral, </w:t>
-      </w:r>
-      <w:proofErr w:type="spellStart"/>
-      <w:r>
-        <w:t>edison</w:t>
-      </w:r>
-      <w:proofErr w:type="spellEnd"/>
-      <w:r>
-        <w:t xml:space="preserve"> bulb </w:t>
-      </w:r>
-      <w:proofErr w:type="spellStart"/>
-      <w:r>
-        <w:t>cliche</w:t>
-      </w:r>
-      <w:proofErr w:type="spellEnd"/>
-      <w:r>
-        <w:t xml:space="preserve"> </w:t>
-      </w:r>
-      <w:proofErr w:type="spellStart"/>
-      <w:r>
-        <w:t>jianbing</w:t>
-      </w:r>
-      <w:proofErr w:type="spellEnd"/>
-      <w:r>
-        <w:t>.</w:t>
+        <w:t>The “Stats” button brings up a member’s individual stats. From this screen, the director can correct information, if necessary, and save. Or the player stats can be printed to a pdf to save then printed to have a hard copy. The example below is blank because there are no stats for that member.</w:t>
       </w:r>
     </w:p>
     <w:p>
       <w:pPr>
         <w:pStyle w:val="BodyText"/>
         <w:keepNext/>
-        <w:jc w:val="center"/>
       </w:pPr>
       <w:r>
         <w:rPr>
@@ -2715,7 +2657,7 @@
                     <pic:cNvPicPr/>
                   </pic:nvPicPr>
                   <pic:blipFill>
-                    <a:blip r:embed="rId17">
+                    <a:blip r:embed="rId16">
                       <a:extLst>
                         <a:ext uri="{28A0092B-C50C-407E-A947-70E740481C1C}">
                           <a14:useLocalDpi xmlns:a14="http://schemas.microsoft.com/office/drawing/2010/main" val="0"/>
@@ -2745,32 +2687,19 @@
     <w:p>
       <w:pPr>
         <w:pStyle w:val="Caption"/>
-        <w:jc w:val="center"/>
+        <w:jc w:val="both"/>
       </w:pPr>
       <w:r>
         <w:t xml:space="preserve">Figure </w:t>
       </w:r>
-      <w:r>
-        <w:fldChar w:fldCharType="begin"/>
-      </w:r>
-      <w:r>
-        <w:instrText xml:space="preserve"> SEQ Figure \* ARABIC </w:instrText>
-      </w:r>
-      <w:r>
-        <w:fldChar w:fldCharType="separate"/>
-      </w:r>
-      <w:r>
-        <w:rPr>
-          <w:noProof/>
-        </w:rPr>
-        <w:t>5</w:t>
-      </w:r>
-      <w:r>
-        <w:rPr>
-          <w:noProof/>
-        </w:rPr>
-        <w:fldChar w:fldCharType="end"/>
-      </w:r>
+      <w:fldSimple w:instr=" SEQ Figure \* ARABIC ">
+        <w:r>
+          <w:rPr>
+            <w:noProof/>
+          </w:rPr>
+          <w:t>6</w:t>
+        </w:r>
+      </w:fldSimple>
       <w:r>
         <w:t>: Stats Form</w:t>
       </w:r>
@@ -2796,190 +2725,13 @@
         <w:keepNext/>
       </w:pPr>
       <w:r>
-        <w:t xml:space="preserve">Craft beer sartorial copper mug </w:t>
-      </w:r>
-      <w:proofErr w:type="spellStart"/>
-      <w:r>
-        <w:t>tbh</w:t>
-      </w:r>
-      <w:proofErr w:type="spellEnd"/>
-      <w:r>
-        <w:t xml:space="preserve"> </w:t>
-      </w:r>
-      <w:proofErr w:type="spellStart"/>
-      <w:r>
-        <w:t>jianbing</w:t>
-      </w:r>
-      <w:proofErr w:type="spellEnd"/>
-      <w:r>
-        <w:t xml:space="preserve">, locavore VHS salvia +1 vegan gluten-free </w:t>
-      </w:r>
-      <w:proofErr w:type="spellStart"/>
-      <w:r>
-        <w:t>kogi</w:t>
-      </w:r>
-      <w:proofErr w:type="spellEnd"/>
-      <w:r>
-        <w:t xml:space="preserve"> pug </w:t>
-      </w:r>
-      <w:proofErr w:type="spellStart"/>
-      <w:r>
-        <w:t>vexillologist</w:t>
-      </w:r>
-      <w:proofErr w:type="spellEnd"/>
-      <w:r>
-        <w:t xml:space="preserve"> </w:t>
-      </w:r>
-      <w:proofErr w:type="spellStart"/>
-      <w:r>
-        <w:t>affogato</w:t>
-      </w:r>
-      <w:proofErr w:type="spellEnd"/>
-      <w:r>
-        <w:t xml:space="preserve">. Fanny pack </w:t>
-      </w:r>
-      <w:proofErr w:type="spellStart"/>
-      <w:r>
-        <w:t>palo</w:t>
-      </w:r>
-      <w:proofErr w:type="spellEnd"/>
-      <w:r>
-        <w:t xml:space="preserve"> </w:t>
-      </w:r>
-      <w:proofErr w:type="spellStart"/>
-      <w:r>
-        <w:t>santo</w:t>
-      </w:r>
-      <w:proofErr w:type="spellEnd"/>
-      <w:r>
-        <w:t xml:space="preserve"> </w:t>
-      </w:r>
-      <w:proofErr w:type="spellStart"/>
-      <w:r>
-        <w:t>proident</w:t>
-      </w:r>
-      <w:proofErr w:type="spellEnd"/>
-      <w:r>
-        <w:t xml:space="preserve"> blog bespoke </w:t>
-      </w:r>
-      <w:proofErr w:type="spellStart"/>
-      <w:r>
-        <w:t>commodo</w:t>
-      </w:r>
-      <w:proofErr w:type="spellEnd"/>
-      <w:r>
-        <w:t xml:space="preserve"> tilde hammock </w:t>
-      </w:r>
-      <w:proofErr w:type="spellStart"/>
-      <w:r>
-        <w:t>taiyaki</w:t>
-      </w:r>
-      <w:proofErr w:type="spellEnd"/>
-      <w:r>
-        <w:t xml:space="preserve"> wayfarers gentrify. Cardigan ugh slow-carb, </w:t>
-      </w:r>
-      <w:proofErr w:type="spellStart"/>
-      <w:r>
-        <w:t>ea</w:t>
-      </w:r>
-      <w:proofErr w:type="spellEnd"/>
-      <w:r>
-        <w:t xml:space="preserve"> DIY hot chicken </w:t>
-      </w:r>
-      <w:proofErr w:type="spellStart"/>
-      <w:r>
-        <w:t>commodo</w:t>
-      </w:r>
-      <w:proofErr w:type="spellEnd"/>
-      <w:r>
-        <w:t xml:space="preserve"> </w:t>
-      </w:r>
-      <w:proofErr w:type="spellStart"/>
-      <w:r>
-        <w:t>godard</w:t>
-      </w:r>
-      <w:proofErr w:type="spellEnd"/>
-      <w:r>
-        <w:t xml:space="preserve">. Lorem </w:t>
-      </w:r>
-      <w:proofErr w:type="spellStart"/>
-      <w:r>
-        <w:t>sint</w:t>
-      </w:r>
-      <w:proofErr w:type="spellEnd"/>
-      <w:r>
-        <w:t xml:space="preserve"> qui 3 wolf moon </w:t>
-      </w:r>
-      <w:proofErr w:type="spellStart"/>
-      <w:r>
-        <w:t>enim</w:t>
-      </w:r>
-      <w:proofErr w:type="spellEnd"/>
-      <w:r>
-        <w:t xml:space="preserve"> </w:t>
-      </w:r>
-      <w:proofErr w:type="spellStart"/>
-      <w:r>
-        <w:t>voluptate</w:t>
-      </w:r>
-      <w:proofErr w:type="spellEnd"/>
-      <w:r>
-        <w:t xml:space="preserve">, </w:t>
-      </w:r>
-      <w:proofErr w:type="spellStart"/>
-      <w:r>
-        <w:t>velit</w:t>
-      </w:r>
-      <w:proofErr w:type="spellEnd"/>
-      <w:r>
-        <w:t xml:space="preserve"> </w:t>
-      </w:r>
-      <w:proofErr w:type="spellStart"/>
-      <w:r>
-        <w:t>veniam</w:t>
-      </w:r>
-      <w:proofErr w:type="spellEnd"/>
-      <w:r>
-        <w:t xml:space="preserve">. Fanny pack man bun </w:t>
-      </w:r>
-      <w:proofErr w:type="spellStart"/>
-      <w:r>
-        <w:t>helvetica</w:t>
-      </w:r>
-      <w:proofErr w:type="spellEnd"/>
-      <w:r>
-        <w:t xml:space="preserve"> viral, </w:t>
-      </w:r>
-      <w:proofErr w:type="spellStart"/>
-      <w:r>
-        <w:t>edison</w:t>
-      </w:r>
-      <w:proofErr w:type="spellEnd"/>
-      <w:r>
-        <w:t xml:space="preserve"> bulb </w:t>
-      </w:r>
-      <w:proofErr w:type="spellStart"/>
-      <w:r>
-        <w:t>cliche</w:t>
-      </w:r>
-      <w:proofErr w:type="spellEnd"/>
-      <w:r>
-        <w:t xml:space="preserve"> </w:t>
-      </w:r>
-      <w:proofErr w:type="spellStart"/>
-      <w:r>
-        <w:t>jianbing</w:t>
-      </w:r>
-      <w:proofErr w:type="spellEnd"/>
-      <w:r>
-        <w:t>.</w:t>
+        <w:t>Clicking on the “Member Search” button will display the member search screen. From here you can search the member records and select a record to display or update. Do not check “Advance View” if “Search” has not already been clicked.</w:t>
       </w:r>
     </w:p>
     <w:p>
       <w:pPr>
         <w:pStyle w:val="BodyText"/>
         <w:keepNext/>
-        <w:jc w:val="center"/>
       </w:pPr>
       <w:r>
         <w:rPr>
@@ -3001,7 +2753,7 @@
                     <pic:cNvPicPr/>
                   </pic:nvPicPr>
                   <pic:blipFill>
-                    <a:blip r:embed="rId18">
+                    <a:blip r:embed="rId17">
                       <a:extLst>
                         <a:ext uri="{28A0092B-C50C-407E-A947-70E740481C1C}">
                           <a14:useLocalDpi xmlns:a14="http://schemas.microsoft.com/office/drawing/2010/main" val="0"/>
@@ -3047,7 +2799,7 @@
                     <pic:cNvPicPr/>
                   </pic:nvPicPr>
                   <pic:blipFill>
-                    <a:blip r:embed="rId19">
+                    <a:blip r:embed="rId18">
                       <a:extLst>
                         <a:ext uri="{28A0092B-C50C-407E-A947-70E740481C1C}">
                           <a14:useLocalDpi xmlns:a14="http://schemas.microsoft.com/office/drawing/2010/main" val="0"/>
@@ -3077,32 +2829,19 @@
     <w:p>
       <w:pPr>
         <w:pStyle w:val="Caption"/>
-        <w:jc w:val="center"/>
+        <w:jc w:val="both"/>
       </w:pPr>
       <w:r>
         <w:t xml:space="preserve">Figure </w:t>
       </w:r>
-      <w:r>
-        <w:fldChar w:fldCharType="begin"/>
-      </w:r>
-      <w:r>
-        <w:instrText xml:space="preserve"> SEQ Figure \* ARABIC </w:instrText>
-      </w:r>
-      <w:r>
-        <w:fldChar w:fldCharType="separate"/>
-      </w:r>
-      <w:r>
-        <w:rPr>
-          <w:noProof/>
-        </w:rPr>
-        <w:t>6</w:t>
-      </w:r>
-      <w:r>
-        <w:rPr>
-          <w:noProof/>
-        </w:rPr>
-        <w:fldChar w:fldCharType="end"/>
-      </w:r>
+      <w:fldSimple w:instr=" SEQ Figure \* ARABIC ">
+        <w:r>
+          <w:rPr>
+            <w:noProof/>
+          </w:rPr>
+          <w:t>7</w:t>
+        </w:r>
+      </w:fldSimple>
       <w:r>
         <w:t>: Member search, blank and with results</w:t>
       </w:r>
@@ -3128,14 +2867,22 @@
         <w:keepNext/>
       </w:pPr>
       <w:r>
-        <w:t xml:space="preserve">The “Print Single” and “Print Tournament” buttons go directly to your computers print dialog. You can then “print to pdf” to save the information as a pdf file. The “Print by Date” button </w:t>
+        <w:t>The “Print Single” and “Print Tournament” buttons go directly to your computer</w:t>
+      </w:r>
+      <w:r>
+        <w:t>’</w:t>
+      </w:r>
+      <w:r>
+        <w:t xml:space="preserve">s print dialog. You can then “print to pdf” to save the information as a pdf file. The “Print by Date” button </w:t>
+      </w:r>
+      <w:r>
+        <w:t>opens the print by date screen. You can enter a date range to print multiple tournaments from here.</w:t>
       </w:r>
     </w:p>
     <w:p>
       <w:pPr>
         <w:pStyle w:val="BodyText"/>
         <w:keepNext/>
-        <w:jc w:val="center"/>
       </w:pPr>
       <w:r>
         <w:rPr>
@@ -3143,8 +2890,8 @@
         </w:rPr>
         <w:drawing>
           <wp:inline distT="0" distB="0" distL="0" distR="0">
-            <wp:extent cx="4092538" cy="3114675"/>
-            <wp:effectExtent l="0" t="0" r="3810" b="0"/>
+            <wp:extent cx="2628900" cy="2000755"/>
+            <wp:effectExtent l="0" t="0" r="0" b="0"/>
             <wp:docPr id="10" name="Picture 10"/>
             <wp:cNvGraphicFramePr>
               <a:graphicFrameLocks xmlns:a="http://schemas.openxmlformats.org/drawingml/2006/main" noChangeAspect="1"/>
@@ -3154,6 +2901,52 @@
                 <pic:pic xmlns:pic="http://schemas.openxmlformats.org/drawingml/2006/picture">
                   <pic:nvPicPr>
                     <pic:cNvPr id="10" name="PrinterDialog.PNG"/>
+                    <pic:cNvPicPr/>
+                  </pic:nvPicPr>
+                  <pic:blipFill>
+                    <a:blip r:embed="rId19">
+                      <a:extLst>
+                        <a:ext uri="{28A0092B-C50C-407E-A947-70E740481C1C}">
+                          <a14:useLocalDpi xmlns:a14="http://schemas.microsoft.com/office/drawing/2010/main" val="0"/>
+                        </a:ext>
+                      </a:extLst>
+                    </a:blip>
+                    <a:stretch>
+                      <a:fillRect/>
+                    </a:stretch>
+                  </pic:blipFill>
+                  <pic:spPr>
+                    <a:xfrm>
+                      <a:off x="0" y="0"/>
+                      <a:ext cx="2684598" cy="2043145"/>
+                    </a:xfrm>
+                    <a:prstGeom prst="rect">
+                      <a:avLst/>
+                    </a:prstGeom>
+                  </pic:spPr>
+                </pic:pic>
+              </a:graphicData>
+            </a:graphic>
+          </wp:inline>
+        </w:drawing>
+      </w:r>
+      <w:r>
+        <w:rPr>
+          <w:noProof/>
+        </w:rPr>
+        <w:drawing>
+          <wp:inline distT="0" distB="0" distL="0" distR="0" wp14:anchorId="313672C7" wp14:editId="10DE0174">
+            <wp:extent cx="1590632" cy="2000422"/>
+            <wp:effectExtent l="0" t="0" r="0" b="0"/>
+            <wp:docPr id="2" name="Picture 2"/>
+            <wp:cNvGraphicFramePr>
+              <a:graphicFrameLocks xmlns:a="http://schemas.openxmlformats.org/drawingml/2006/main" noChangeAspect="1"/>
+            </wp:cNvGraphicFramePr>
+            <a:graphic xmlns:a="http://schemas.openxmlformats.org/drawingml/2006/main">
+              <a:graphicData uri="http://schemas.openxmlformats.org/drawingml/2006/picture">
+                <pic:pic xmlns:pic="http://schemas.openxmlformats.org/drawingml/2006/picture">
+                  <pic:nvPicPr>
+                    <pic:cNvPr id="2" name="PrintByDateForm.PNG"/>
                     <pic:cNvPicPr/>
                   </pic:nvPicPr>
                   <pic:blipFill>
@@ -3171,7 +2964,7 @@
                   <pic:spPr>
                     <a:xfrm>
                       <a:off x="0" y="0"/>
-                      <a:ext cx="4098949" cy="3119554"/>
+                      <a:ext cx="1660851" cy="2088731"/>
                     </a:xfrm>
                     <a:prstGeom prst="rect">
                       <a:avLst/>
@@ -3187,32 +2980,19 @@
     <w:p>
       <w:pPr>
         <w:pStyle w:val="Caption"/>
-        <w:jc w:val="center"/>
+        <w:jc w:val="both"/>
       </w:pPr>
       <w:r>
         <w:t xml:space="preserve">Figure </w:t>
       </w:r>
-      <w:r>
-        <w:fldChar w:fldCharType="begin"/>
-      </w:r>
-      <w:r>
-        <w:instrText xml:space="preserve"> SEQ Figure \* ARABIC </w:instrText>
-      </w:r>
-      <w:r>
-        <w:fldChar w:fldCharType="separate"/>
-      </w:r>
-      <w:r>
-        <w:rPr>
-          <w:noProof/>
-        </w:rPr>
-        <w:t>7</w:t>
-      </w:r>
-      <w:r>
-        <w:rPr>
-          <w:noProof/>
-        </w:rPr>
-        <w:fldChar w:fldCharType="end"/>
-      </w:r>
+      <w:fldSimple w:instr=" SEQ Figure \* ARABIC ">
+        <w:r>
+          <w:rPr>
+            <w:noProof/>
+          </w:rPr>
+          <w:t>8</w:t>
+        </w:r>
+      </w:fldSimple>
       <w:r>
         <w:t>: basic printer dialog</w:t>
       </w:r>
@@ -3230,58 +3010,6 @@
     </w:p>
     <w:p>
       <w:pPr>
-        <w:pStyle w:val="BodyText"/>
-        <w:jc w:val="center"/>
-      </w:pPr>
-      <w:r>
-        <w:rPr>
-          <w:noProof/>
-        </w:rPr>
-        <w:drawing>
-          <wp:inline distT="0" distB="0" distL="0" distR="0">
-            <wp:extent cx="2810267" cy="3534268"/>
-            <wp:effectExtent l="0" t="0" r="9525" b="9525"/>
-            <wp:docPr id="2" name="Picture 2"/>
-            <wp:cNvGraphicFramePr>
-              <a:graphicFrameLocks xmlns:a="http://schemas.openxmlformats.org/drawingml/2006/main" noChangeAspect="1"/>
-            </wp:cNvGraphicFramePr>
-            <a:graphic xmlns:a="http://schemas.openxmlformats.org/drawingml/2006/main">
-              <a:graphicData uri="http://schemas.openxmlformats.org/drawingml/2006/picture">
-                <pic:pic xmlns:pic="http://schemas.openxmlformats.org/drawingml/2006/picture">
-                  <pic:nvPicPr>
-                    <pic:cNvPr id="2" name="PrintByDateForm.PNG"/>
-                    <pic:cNvPicPr/>
-                  </pic:nvPicPr>
-                  <pic:blipFill>
-                    <a:blip r:embed="rId21">
-                      <a:extLst>
-                        <a:ext uri="{28A0092B-C50C-407E-A947-70E740481C1C}">
-                          <a14:useLocalDpi xmlns:a14="http://schemas.microsoft.com/office/drawing/2010/main" val="0"/>
-                        </a:ext>
-                      </a:extLst>
-                    </a:blip>
-                    <a:stretch>
-                      <a:fillRect/>
-                    </a:stretch>
-                  </pic:blipFill>
-                  <pic:spPr>
-                    <a:xfrm>
-                      <a:off x="0" y="0"/>
-                      <a:ext cx="2810267" cy="3534268"/>
-                    </a:xfrm>
-                    <a:prstGeom prst="rect">
-                      <a:avLst/>
-                    </a:prstGeom>
-                  </pic:spPr>
-                </pic:pic>
-              </a:graphicData>
-            </a:graphic>
-          </wp:inline>
-        </w:drawing>
-      </w:r>
-    </w:p>
-    <w:p>
-      <w:pPr>
         <w:pStyle w:val="Heading2"/>
         <w:rPr>
           <w:szCs w:val="20"/>
@@ -3291,7 +3019,6 @@
         <w:rPr>
           <w:szCs w:val="20"/>
         </w:rPr>
-        <w:lastRenderedPageBreak/>
         <w:t>Labels</w:t>
       </w:r>
     </w:p>
@@ -3301,190 +3028,13 @@
         <w:keepNext/>
       </w:pPr>
       <w:r>
-        <w:t xml:space="preserve">Craft beer sartorial copper mug </w:t>
-      </w:r>
-      <w:proofErr w:type="spellStart"/>
-      <w:r>
-        <w:t>tbh</w:t>
-      </w:r>
-      <w:proofErr w:type="spellEnd"/>
-      <w:r>
-        <w:t xml:space="preserve"> </w:t>
-      </w:r>
-      <w:proofErr w:type="spellStart"/>
-      <w:r>
-        <w:t>jianbing</w:t>
-      </w:r>
-      <w:proofErr w:type="spellEnd"/>
-      <w:r>
-        <w:t xml:space="preserve">, locavore VHS salvia +1 vegan gluten-free </w:t>
-      </w:r>
-      <w:proofErr w:type="spellStart"/>
-      <w:r>
-        <w:t>kogi</w:t>
-      </w:r>
-      <w:proofErr w:type="spellEnd"/>
-      <w:r>
-        <w:t xml:space="preserve"> pug </w:t>
-      </w:r>
-      <w:proofErr w:type="spellStart"/>
-      <w:r>
-        <w:t>vexillologist</w:t>
-      </w:r>
-      <w:proofErr w:type="spellEnd"/>
-      <w:r>
-        <w:t xml:space="preserve"> </w:t>
-      </w:r>
-      <w:proofErr w:type="spellStart"/>
-      <w:r>
-        <w:t>affogato</w:t>
-      </w:r>
-      <w:proofErr w:type="spellEnd"/>
-      <w:r>
-        <w:t xml:space="preserve">. Fanny pack </w:t>
-      </w:r>
-      <w:proofErr w:type="spellStart"/>
-      <w:r>
-        <w:t>palo</w:t>
-      </w:r>
-      <w:proofErr w:type="spellEnd"/>
-      <w:r>
-        <w:t xml:space="preserve"> </w:t>
-      </w:r>
-      <w:proofErr w:type="spellStart"/>
-      <w:r>
-        <w:t>santo</w:t>
-      </w:r>
-      <w:proofErr w:type="spellEnd"/>
-      <w:r>
-        <w:t xml:space="preserve"> </w:t>
-      </w:r>
-      <w:proofErr w:type="spellStart"/>
-      <w:r>
-        <w:t>proident</w:t>
-      </w:r>
-      <w:proofErr w:type="spellEnd"/>
-      <w:r>
-        <w:t xml:space="preserve"> blog bespoke </w:t>
-      </w:r>
-      <w:proofErr w:type="spellStart"/>
-      <w:r>
-        <w:t>commodo</w:t>
-      </w:r>
-      <w:proofErr w:type="spellEnd"/>
-      <w:r>
-        <w:t xml:space="preserve"> tilde hammock </w:t>
-      </w:r>
-      <w:proofErr w:type="spellStart"/>
-      <w:r>
-        <w:t>taiyaki</w:t>
-      </w:r>
-      <w:proofErr w:type="spellEnd"/>
-      <w:r>
-        <w:t xml:space="preserve"> wayfarers gentrify. Cardigan ugh slow-carb, </w:t>
-      </w:r>
-      <w:proofErr w:type="spellStart"/>
-      <w:r>
-        <w:t>ea</w:t>
-      </w:r>
-      <w:proofErr w:type="spellEnd"/>
-      <w:r>
-        <w:t xml:space="preserve"> DIY hot chicken </w:t>
-      </w:r>
-      <w:proofErr w:type="spellStart"/>
-      <w:r>
-        <w:t>commodo</w:t>
-      </w:r>
-      <w:proofErr w:type="spellEnd"/>
-      <w:r>
-        <w:t xml:space="preserve"> </w:t>
-      </w:r>
-      <w:proofErr w:type="spellStart"/>
-      <w:r>
-        <w:t>godard</w:t>
-      </w:r>
-      <w:proofErr w:type="spellEnd"/>
-      <w:r>
-        <w:t xml:space="preserve">. Lorem </w:t>
-      </w:r>
-      <w:proofErr w:type="spellStart"/>
-      <w:r>
-        <w:t>sint</w:t>
-      </w:r>
-      <w:proofErr w:type="spellEnd"/>
-      <w:r>
-        <w:t xml:space="preserve"> qui 3 wolf moon </w:t>
-      </w:r>
-      <w:proofErr w:type="spellStart"/>
-      <w:r>
-        <w:t>enim</w:t>
-      </w:r>
-      <w:proofErr w:type="spellEnd"/>
-      <w:r>
-        <w:t xml:space="preserve"> </w:t>
-      </w:r>
-      <w:proofErr w:type="spellStart"/>
-      <w:r>
-        <w:t>voluptate</w:t>
-      </w:r>
-      <w:proofErr w:type="spellEnd"/>
-      <w:r>
-        <w:t xml:space="preserve">, </w:t>
-      </w:r>
-      <w:proofErr w:type="spellStart"/>
-      <w:r>
-        <w:t>velit</w:t>
-      </w:r>
-      <w:proofErr w:type="spellEnd"/>
-      <w:r>
-        <w:t xml:space="preserve"> </w:t>
-      </w:r>
-      <w:proofErr w:type="spellStart"/>
-      <w:r>
-        <w:t>veniam</w:t>
-      </w:r>
-      <w:proofErr w:type="spellEnd"/>
-      <w:r>
-        <w:t xml:space="preserve">. Fanny pack man bun </w:t>
-      </w:r>
-      <w:proofErr w:type="spellStart"/>
-      <w:r>
-        <w:t>helvetica</w:t>
-      </w:r>
-      <w:proofErr w:type="spellEnd"/>
-      <w:r>
-        <w:t xml:space="preserve"> viral, </w:t>
-      </w:r>
-      <w:proofErr w:type="spellStart"/>
-      <w:r>
-        <w:t>edison</w:t>
-      </w:r>
-      <w:proofErr w:type="spellEnd"/>
-      <w:r>
-        <w:t xml:space="preserve"> bulb </w:t>
-      </w:r>
-      <w:proofErr w:type="spellStart"/>
-      <w:r>
-        <w:t>cliche</w:t>
-      </w:r>
-      <w:proofErr w:type="spellEnd"/>
-      <w:r>
-        <w:t xml:space="preserve"> </w:t>
-      </w:r>
-      <w:proofErr w:type="spellStart"/>
-      <w:r>
-        <w:t>jianbing</w:t>
-      </w:r>
-      <w:proofErr w:type="spellEnd"/>
-      <w:r>
-        <w:t>.</w:t>
+        <w:t>Ask Rob V. about this.</w:t>
       </w:r>
     </w:p>
     <w:p>
       <w:pPr>
         <w:pStyle w:val="BodyText"/>
         <w:keepNext/>
-        <w:jc w:val="center"/>
       </w:pPr>
       <w:r>
         <w:rPr>
@@ -3506,7 +3056,7 @@
                     <pic:cNvPicPr/>
                   </pic:nvPicPr>
                   <pic:blipFill>
-                    <a:blip r:embed="rId22">
+                    <a:blip r:embed="rId21">
                       <a:extLst>
                         <a:ext uri="{28A0092B-C50C-407E-A947-70E740481C1C}">
                           <a14:useLocalDpi xmlns:a14="http://schemas.microsoft.com/office/drawing/2010/main" val="0"/>
@@ -3536,32 +3086,19 @@
     <w:p>
       <w:pPr>
         <w:pStyle w:val="Caption"/>
-        <w:jc w:val="center"/>
+        <w:jc w:val="both"/>
       </w:pPr>
       <w:r>
         <w:t xml:space="preserve">Figure </w:t>
       </w:r>
-      <w:r>
-        <w:fldChar w:fldCharType="begin"/>
-      </w:r>
-      <w:r>
-        <w:instrText xml:space="preserve"> SEQ Figure \* ARABIC </w:instrText>
-      </w:r>
-      <w:r>
-        <w:fldChar w:fldCharType="separate"/>
-      </w:r>
-      <w:r>
-        <w:rPr>
-          <w:noProof/>
-        </w:rPr>
-        <w:t>8</w:t>
-      </w:r>
-      <w:r>
-        <w:rPr>
-          <w:noProof/>
-        </w:rPr>
-        <w:fldChar w:fldCharType="end"/>
-      </w:r>
+      <w:fldSimple w:instr=" SEQ Figure \* ARABIC ">
+        <w:r>
+          <w:rPr>
+            <w:noProof/>
+          </w:rPr>
+          <w:t>9</w:t>
+        </w:r>
+      </w:fldSimple>
       <w:r>
         <w:t>: Print Labels Dialog</w:t>
       </w:r>
@@ -3587,190 +3124,13 @@
         <w:keepNext/>
       </w:pPr>
       <w:r>
-        <w:t xml:space="preserve">Craft beer sartorial copper mug </w:t>
-      </w:r>
-      <w:proofErr w:type="spellStart"/>
-      <w:r>
-        <w:t>tbh</w:t>
-      </w:r>
-      <w:proofErr w:type="spellEnd"/>
-      <w:r>
-        <w:t xml:space="preserve"> </w:t>
-      </w:r>
-      <w:proofErr w:type="spellStart"/>
-      <w:r>
-        <w:t>jianbing</w:t>
-      </w:r>
-      <w:proofErr w:type="spellEnd"/>
-      <w:r>
-        <w:t xml:space="preserve">, locavore VHS salvia +1 vegan gluten-free </w:t>
-      </w:r>
-      <w:proofErr w:type="spellStart"/>
-      <w:r>
-        <w:t>kogi</w:t>
-      </w:r>
-      <w:proofErr w:type="spellEnd"/>
-      <w:r>
-        <w:t xml:space="preserve"> pug </w:t>
-      </w:r>
-      <w:proofErr w:type="spellStart"/>
-      <w:r>
-        <w:t>vexillologist</w:t>
-      </w:r>
-      <w:proofErr w:type="spellEnd"/>
-      <w:r>
-        <w:t xml:space="preserve"> </w:t>
-      </w:r>
-      <w:proofErr w:type="spellStart"/>
-      <w:r>
-        <w:t>affogato</w:t>
-      </w:r>
-      <w:proofErr w:type="spellEnd"/>
-      <w:r>
-        <w:t xml:space="preserve">. Fanny pack </w:t>
-      </w:r>
-      <w:proofErr w:type="spellStart"/>
-      <w:r>
-        <w:t>palo</w:t>
-      </w:r>
-      <w:proofErr w:type="spellEnd"/>
-      <w:r>
-        <w:t xml:space="preserve"> </w:t>
-      </w:r>
-      <w:proofErr w:type="spellStart"/>
-      <w:r>
-        <w:t>santo</w:t>
-      </w:r>
-      <w:proofErr w:type="spellEnd"/>
-      <w:r>
-        <w:t xml:space="preserve"> </w:t>
-      </w:r>
-      <w:proofErr w:type="spellStart"/>
-      <w:r>
-        <w:t>proident</w:t>
-      </w:r>
-      <w:proofErr w:type="spellEnd"/>
-      <w:r>
-        <w:t xml:space="preserve"> blog bespoke </w:t>
-      </w:r>
-      <w:proofErr w:type="spellStart"/>
-      <w:r>
-        <w:t>commodo</w:t>
-      </w:r>
-      <w:proofErr w:type="spellEnd"/>
-      <w:r>
-        <w:t xml:space="preserve"> tilde hammock </w:t>
-      </w:r>
-      <w:proofErr w:type="spellStart"/>
-      <w:r>
-        <w:t>taiyaki</w:t>
-      </w:r>
-      <w:proofErr w:type="spellEnd"/>
-      <w:r>
-        <w:t xml:space="preserve"> wayfarers gentrify. Cardigan ugh slow-carb, </w:t>
-      </w:r>
-      <w:proofErr w:type="spellStart"/>
-      <w:r>
-        <w:t>ea</w:t>
-      </w:r>
-      <w:proofErr w:type="spellEnd"/>
-      <w:r>
-        <w:t xml:space="preserve"> DIY hot chicken </w:t>
-      </w:r>
-      <w:proofErr w:type="spellStart"/>
-      <w:r>
-        <w:t>commodo</w:t>
-      </w:r>
-      <w:proofErr w:type="spellEnd"/>
-      <w:r>
-        <w:t xml:space="preserve"> </w:t>
-      </w:r>
-      <w:proofErr w:type="spellStart"/>
-      <w:r>
-        <w:t>godard</w:t>
-      </w:r>
-      <w:proofErr w:type="spellEnd"/>
-      <w:r>
-        <w:t xml:space="preserve">. Lorem </w:t>
-      </w:r>
-      <w:proofErr w:type="spellStart"/>
-      <w:r>
-        <w:t>sint</w:t>
-      </w:r>
-      <w:proofErr w:type="spellEnd"/>
-      <w:r>
-        <w:t xml:space="preserve"> qui 3 wolf moon </w:t>
-      </w:r>
-      <w:proofErr w:type="spellStart"/>
-      <w:r>
-        <w:t>enim</w:t>
-      </w:r>
-      <w:proofErr w:type="spellEnd"/>
-      <w:r>
-        <w:t xml:space="preserve"> </w:t>
-      </w:r>
-      <w:proofErr w:type="spellStart"/>
-      <w:r>
-        <w:t>voluptate</w:t>
-      </w:r>
-      <w:proofErr w:type="spellEnd"/>
-      <w:r>
-        <w:t xml:space="preserve">, </w:t>
-      </w:r>
-      <w:proofErr w:type="spellStart"/>
-      <w:r>
-        <w:t>velit</w:t>
-      </w:r>
-      <w:proofErr w:type="spellEnd"/>
-      <w:r>
-        <w:t xml:space="preserve"> </w:t>
-      </w:r>
-      <w:proofErr w:type="spellStart"/>
-      <w:r>
-        <w:t>veniam</w:t>
-      </w:r>
-      <w:proofErr w:type="spellEnd"/>
-      <w:r>
-        <w:t xml:space="preserve">. Fanny pack man bun </w:t>
-      </w:r>
-      <w:proofErr w:type="spellStart"/>
-      <w:r>
-        <w:t>helvetica</w:t>
-      </w:r>
-      <w:proofErr w:type="spellEnd"/>
-      <w:r>
-        <w:t xml:space="preserve"> viral, </w:t>
-      </w:r>
-      <w:proofErr w:type="spellStart"/>
-      <w:r>
-        <w:t>edison</w:t>
-      </w:r>
-      <w:proofErr w:type="spellEnd"/>
-      <w:r>
-        <w:t xml:space="preserve"> bulb </w:t>
-      </w:r>
-      <w:proofErr w:type="spellStart"/>
-      <w:r>
-        <w:t>cliche</w:t>
-      </w:r>
-      <w:proofErr w:type="spellEnd"/>
-      <w:r>
-        <w:t xml:space="preserve"> </w:t>
-      </w:r>
-      <w:proofErr w:type="spellStart"/>
-      <w:r>
-        <w:t>jianbing</w:t>
-      </w:r>
-      <w:proofErr w:type="spellEnd"/>
-      <w:r>
-        <w:t>.</w:t>
+        <w:t>The “Import” button brings up the file screen. This is used to import existing player information from an Excel file.</w:t>
       </w:r>
     </w:p>
     <w:p>
       <w:pPr>
         <w:pStyle w:val="BodyText"/>
         <w:keepNext/>
-        <w:jc w:val="center"/>
       </w:pPr>
       <w:r>
         <w:rPr>
@@ -3792,7 +3152,7 @@
                     <pic:cNvPicPr/>
                   </pic:nvPicPr>
                   <pic:blipFill>
-                    <a:blip r:embed="rId23">
+                    <a:blip r:embed="rId22">
                       <a:extLst>
                         <a:ext uri="{28A0092B-C50C-407E-A947-70E740481C1C}">
                           <a14:useLocalDpi xmlns:a14="http://schemas.microsoft.com/office/drawing/2010/main" val="0"/>
@@ -3822,47 +3182,22 @@
     <w:p>
       <w:pPr>
         <w:pStyle w:val="Caption"/>
-        <w:jc w:val="center"/>
+        <w:jc w:val="both"/>
       </w:pPr>
       <w:r>
         <w:t xml:space="preserve">Figure </w:t>
       </w:r>
-      <w:r>
-        <w:fldChar w:fldCharType="begin"/>
-      </w:r>
-      <w:r>
-        <w:instrText xml:space="preserve"> SEQ Figure \* ARABIC </w:instrText>
-      </w:r>
-      <w:r>
-        <w:fldChar w:fldCharType="separate"/>
-      </w:r>
-      <w:r>
-        <w:rPr>
-          <w:noProof/>
-        </w:rPr>
-        <w:t>9</w:t>
-      </w:r>
-      <w:r>
-        <w:rPr>
-          <w:noProof/>
-        </w:rPr>
-        <w:fldChar w:fldCharType="end"/>
-      </w:r>
+      <w:fldSimple w:instr=" SEQ Figure \* ARABIC ">
+        <w:r>
+          <w:rPr>
+            <w:noProof/>
+          </w:rPr>
+          <w:t>10</w:t>
+        </w:r>
+      </w:fldSimple>
       <w:r>
         <w:t>: Importing existing player information</w:t>
       </w:r>
-    </w:p>
-    <w:p>
-      <w:pPr>
-        <w:pStyle w:val="Heading1"/>
-        <w:sectPr>
-          <w:type w:val="continuous"/>
-          <w:pgSz w:w="12240" w:h="15840" w:code="1"/>
-          <w:pgMar w:top="1800" w:right="1195" w:bottom="1440" w:left="3355" w:header="965" w:footer="965" w:gutter="0"/>
-          <w:cols w:space="360"/>
-          <w:titlePg/>
-        </w:sectPr>
-      </w:pPr>
     </w:p>
     <w:p>
       <w:pPr>
@@ -3872,9 +3207,6 @@
         <w:lastRenderedPageBreak/>
         <w:t>Member Scores</w:t>
       </w:r>
-      <w:r>
-        <w:t xml:space="preserve"> Form</w:t>
-      </w:r>
     </w:p>
     <w:p>
       <w:pPr>
@@ -3882,192 +3214,19 @@
         <w:keepNext/>
       </w:pPr>
       <w:r>
-        <w:t xml:space="preserve">Craft beer sartorial copper mug </w:t>
-      </w:r>
-      <w:proofErr w:type="spellStart"/>
-      <w:r>
-        <w:t>tbh</w:t>
-      </w:r>
-      <w:proofErr w:type="spellEnd"/>
-      <w:r>
-        <w:t xml:space="preserve"> </w:t>
-      </w:r>
-      <w:proofErr w:type="spellStart"/>
-      <w:r>
-        <w:t>jianbing</w:t>
-      </w:r>
-      <w:proofErr w:type="spellEnd"/>
-      <w:r>
-        <w:t xml:space="preserve">, locavore VHS salvia +1 vegan gluten-free </w:t>
-      </w:r>
-      <w:proofErr w:type="spellStart"/>
-      <w:r>
-        <w:t>kogi</w:t>
-      </w:r>
-      <w:proofErr w:type="spellEnd"/>
-      <w:r>
-        <w:t xml:space="preserve"> pug </w:t>
-      </w:r>
-      <w:proofErr w:type="spellStart"/>
-      <w:r>
-        <w:t>vexillologist</w:t>
-      </w:r>
-      <w:proofErr w:type="spellEnd"/>
-      <w:r>
-        <w:t xml:space="preserve"> </w:t>
-      </w:r>
-      <w:proofErr w:type="spellStart"/>
-      <w:r>
-        <w:t>affogato</w:t>
-      </w:r>
-      <w:proofErr w:type="spellEnd"/>
-      <w:r>
-        <w:t xml:space="preserve">. Fanny pack </w:t>
-      </w:r>
-      <w:proofErr w:type="spellStart"/>
-      <w:r>
-        <w:t>palo</w:t>
-      </w:r>
-      <w:proofErr w:type="spellEnd"/>
-      <w:r>
-        <w:t xml:space="preserve"> </w:t>
-      </w:r>
-      <w:proofErr w:type="spellStart"/>
-      <w:r>
-        <w:t>santo</w:t>
-      </w:r>
-      <w:proofErr w:type="spellEnd"/>
-      <w:r>
-        <w:t xml:space="preserve"> </w:t>
-      </w:r>
-      <w:proofErr w:type="spellStart"/>
-      <w:r>
-        <w:t>proident</w:t>
-      </w:r>
-      <w:proofErr w:type="spellEnd"/>
-      <w:r>
-        <w:t xml:space="preserve"> blog bespoke </w:t>
-      </w:r>
-      <w:proofErr w:type="spellStart"/>
-      <w:r>
-        <w:t>commodo</w:t>
-      </w:r>
-      <w:proofErr w:type="spellEnd"/>
-      <w:r>
-        <w:t xml:space="preserve"> tilde hammock </w:t>
-      </w:r>
-      <w:proofErr w:type="spellStart"/>
-      <w:r>
-        <w:t>taiyaki</w:t>
-      </w:r>
-      <w:proofErr w:type="spellEnd"/>
-      <w:r>
-        <w:t xml:space="preserve"> wayfarers gentrify. Cardigan ugh slow-carb, </w:t>
-      </w:r>
-      <w:proofErr w:type="spellStart"/>
-      <w:r>
-        <w:t>ea</w:t>
-      </w:r>
-      <w:proofErr w:type="spellEnd"/>
-      <w:r>
-        <w:t xml:space="preserve"> DIY hot chicken </w:t>
-      </w:r>
-      <w:proofErr w:type="spellStart"/>
-      <w:r>
-        <w:t>commodo</w:t>
-      </w:r>
-      <w:proofErr w:type="spellEnd"/>
-      <w:r>
-        <w:t xml:space="preserve"> </w:t>
-      </w:r>
-      <w:proofErr w:type="spellStart"/>
-      <w:r>
-        <w:t>godard</w:t>
-      </w:r>
-      <w:proofErr w:type="spellEnd"/>
-      <w:r>
-        <w:t xml:space="preserve">. Lorem </w:t>
-      </w:r>
-      <w:proofErr w:type="spellStart"/>
-      <w:r>
-        <w:t>sint</w:t>
-      </w:r>
-      <w:proofErr w:type="spellEnd"/>
-      <w:r>
-        <w:t xml:space="preserve"> qui 3 wolf moon </w:t>
-      </w:r>
-      <w:proofErr w:type="spellStart"/>
-      <w:r>
-        <w:t>enim</w:t>
-      </w:r>
-      <w:proofErr w:type="spellEnd"/>
-      <w:r>
-        <w:t xml:space="preserve"> </w:t>
-      </w:r>
-      <w:proofErr w:type="spellStart"/>
-      <w:r>
-        <w:t>voluptate</w:t>
-      </w:r>
-      <w:proofErr w:type="spellEnd"/>
-      <w:r>
-        <w:t xml:space="preserve">, </w:t>
-      </w:r>
-      <w:proofErr w:type="spellStart"/>
-      <w:r>
-        <w:t>velit</w:t>
-      </w:r>
-      <w:proofErr w:type="spellEnd"/>
-      <w:r>
-        <w:t xml:space="preserve"> </w:t>
-      </w:r>
-      <w:proofErr w:type="spellStart"/>
-      <w:r>
-        <w:t>veniam</w:t>
-      </w:r>
-      <w:proofErr w:type="spellEnd"/>
-      <w:r>
-        <w:t xml:space="preserve">. Fanny pack man bun </w:t>
-      </w:r>
-      <w:proofErr w:type="spellStart"/>
-      <w:r>
-        <w:t>helvetica</w:t>
-      </w:r>
-      <w:proofErr w:type="spellEnd"/>
-      <w:r>
-        <w:t xml:space="preserve"> viral, </w:t>
-      </w:r>
-      <w:proofErr w:type="spellStart"/>
-      <w:r>
-        <w:t>edison</w:t>
-      </w:r>
-      <w:proofErr w:type="spellEnd"/>
-      <w:r>
-        <w:t xml:space="preserve"> bulb </w:t>
-      </w:r>
-      <w:proofErr w:type="spellStart"/>
-      <w:r>
-        <w:t>cliche</w:t>
-      </w:r>
-      <w:proofErr w:type="spellEnd"/>
-      <w:r>
-        <w:t xml:space="preserve"> </w:t>
-      </w:r>
-      <w:proofErr w:type="spellStart"/>
-      <w:r>
-        <w:t>jianbing</w:t>
-      </w:r>
-      <w:proofErr w:type="spellEnd"/>
-      <w:r>
-        <w:t>.</w:t>
-      </w:r>
+        <w:t>The member scores screen is where tournaments are created and member scored are entered.</w:t>
+      </w:r>
+      <w:r>
+        <w:t xml:space="preserve"> A tournament must be created before the member scores can be entered.</w:t>
+      </w:r>
+      <w:bookmarkStart w:id="0" w:name="_GoBack"/>
+      <w:bookmarkEnd w:id="0"/>
     </w:p>
     <w:p>
       <w:pPr>
         <w:pStyle w:val="BodyText"/>
         <w:keepNext/>
-        <w:jc w:val="center"/>
-      </w:pPr>
-      <w:bookmarkStart w:id="0" w:name="_GoBack"/>
+      </w:pPr>
       <w:r>
         <w:rPr>
           <w:noProof/>
@@ -4088,7 +3247,7 @@
                     <pic:cNvPicPr/>
                   </pic:nvPicPr>
                   <pic:blipFill>
-                    <a:blip r:embed="rId24">
+                    <a:blip r:embed="rId23">
                       <a:extLst>
                         <a:ext uri="{28A0092B-C50C-407E-A947-70E740481C1C}">
                           <a14:useLocalDpi xmlns:a14="http://schemas.microsoft.com/office/drawing/2010/main" val="0"/>
@@ -4122,37 +3281,23 @@
           </wp:inline>
         </w:drawing>
       </w:r>
-      <w:bookmarkEnd w:id="0"/>
     </w:p>
     <w:p>
       <w:pPr>
         <w:pStyle w:val="Caption"/>
-        <w:jc w:val="center"/>
+        <w:jc w:val="both"/>
       </w:pPr>
       <w:r>
         <w:t xml:space="preserve">Figure </w:t>
       </w:r>
-      <w:r>
-        <w:fldChar w:fldCharType="begin"/>
-      </w:r>
-      <w:r>
-        <w:instrText xml:space="preserve"> SEQ Figure \* ARABIC </w:instrText>
-      </w:r>
-      <w:r>
-        <w:fldChar w:fldCharType="separate"/>
-      </w:r>
-      <w:r>
-        <w:rPr>
-          <w:noProof/>
-        </w:rPr>
-        <w:t>10</w:t>
-      </w:r>
-      <w:r>
-        <w:rPr>
-          <w:noProof/>
-        </w:rPr>
-        <w:fldChar w:fldCharType="end"/>
-      </w:r>
+      <w:fldSimple w:instr=" SEQ Figure \* ARABIC ">
+        <w:r>
+          <w:rPr>
+            <w:noProof/>
+          </w:rPr>
+          <w:t>11</w:t>
+        </w:r>
+      </w:fldSimple>
       <w:r>
         <w:t>: Member Scores</w:t>
       </w:r>
@@ -4361,7 +3506,6 @@
       <w:pPr>
         <w:pStyle w:val="BodyText"/>
         <w:keepNext/>
-        <w:jc w:val="center"/>
       </w:pPr>
       <w:r>
         <w:rPr>
@@ -4383,7 +3527,7 @@
                     <pic:cNvPicPr/>
                   </pic:nvPicPr>
                   <pic:blipFill>
-                    <a:blip r:embed="rId25" cstate="print">
+                    <a:blip r:embed="rId24" cstate="print">
                       <a:extLst>
                         <a:ext uri="{28A0092B-C50C-407E-A947-70E740481C1C}">
                           <a14:useLocalDpi xmlns:a14="http://schemas.microsoft.com/office/drawing/2010/main" val="0"/>
@@ -4413,32 +3557,19 @@
     <w:p>
       <w:pPr>
         <w:pStyle w:val="Caption"/>
-        <w:jc w:val="center"/>
+        <w:jc w:val="both"/>
       </w:pPr>
       <w:r>
         <w:t xml:space="preserve">Figure </w:t>
       </w:r>
-      <w:r>
-        <w:fldChar w:fldCharType="begin"/>
-      </w:r>
-      <w:r>
-        <w:instrText xml:space="preserve"> SEQ Figure \* ARABIC </w:instrText>
-      </w:r>
-      <w:r>
-        <w:fldChar w:fldCharType="separate"/>
-      </w:r>
-      <w:r>
-        <w:rPr>
-          <w:noProof/>
-        </w:rPr>
-        <w:t>11</w:t>
-      </w:r>
-      <w:r>
-        <w:rPr>
-          <w:noProof/>
-        </w:rPr>
-        <w:fldChar w:fldCharType="end"/>
-      </w:r>
+      <w:fldSimple w:instr=" SEQ Figure \* ARABIC ">
+        <w:r>
+          <w:rPr>
+            <w:noProof/>
+          </w:rPr>
+          <w:t>12</w:t>
+        </w:r>
+      </w:fldSimple>
       <w:r>
         <w:t>: Tournament Stats Form</w:t>
       </w:r>
@@ -4859,7 +3990,6 @@
       <w:pPr>
         <w:pStyle w:val="BodyText"/>
         <w:keepNext/>
-        <w:jc w:val="center"/>
       </w:pPr>
       <w:r>
         <w:rPr>
@@ -4881,7 +4011,7 @@
                     <pic:cNvPicPr/>
                   </pic:nvPicPr>
                   <pic:blipFill>
-                    <a:blip r:embed="rId26" cstate="print">
+                    <a:blip r:embed="rId25" cstate="print">
                       <a:extLst>
                         <a:ext uri="{28A0092B-C50C-407E-A947-70E740481C1C}">
                           <a14:useLocalDpi xmlns:a14="http://schemas.microsoft.com/office/drawing/2010/main" val="0"/>
@@ -4911,32 +4041,19 @@
     <w:p>
       <w:pPr>
         <w:pStyle w:val="Caption"/>
-        <w:jc w:val="center"/>
+        <w:jc w:val="both"/>
       </w:pPr>
       <w:r>
         <w:t xml:space="preserve">Figure </w:t>
       </w:r>
-      <w:r>
-        <w:fldChar w:fldCharType="begin"/>
-      </w:r>
-      <w:r>
-        <w:instrText xml:space="preserve"> SEQ Figure \* ARABIC </w:instrText>
-      </w:r>
-      <w:r>
-        <w:fldChar w:fldCharType="separate"/>
-      </w:r>
-      <w:r>
-        <w:rPr>
-          <w:noProof/>
-        </w:rPr>
-        <w:t>12</w:t>
-      </w:r>
-      <w:r>
-        <w:rPr>
-          <w:noProof/>
-        </w:rPr>
-        <w:fldChar w:fldCharType="end"/>
-      </w:r>
+      <w:fldSimple w:instr=" SEQ Figure \* ARABIC ">
+        <w:r>
+          <w:rPr>
+            <w:noProof/>
+          </w:rPr>
+          <w:t>13</w:t>
+        </w:r>
+      </w:fldSimple>
       <w:r>
         <w:t>: Tournament Place Standings</w:t>
       </w:r>
@@ -5139,7 +4256,6 @@
       <w:pPr>
         <w:pStyle w:val="BodyText"/>
         <w:keepNext/>
-        <w:jc w:val="center"/>
       </w:pPr>
       <w:r>
         <w:rPr>
@@ -5161,7 +4277,7 @@
                     <pic:cNvPicPr/>
                   </pic:nvPicPr>
                   <pic:blipFill>
-                    <a:blip r:embed="rId27">
+                    <a:blip r:embed="rId26">
                       <a:extLst>
                         <a:ext uri="{28A0092B-C50C-407E-A947-70E740481C1C}">
                           <a14:useLocalDpi xmlns:a14="http://schemas.microsoft.com/office/drawing/2010/main" val="0"/>
@@ -5199,7 +4315,7 @@
     <w:p>
       <w:pPr>
         <w:pStyle w:val="Caption"/>
-        <w:jc w:val="center"/>
+        <w:jc w:val="both"/>
         <w:rPr>
           <w14:shadow w14:blurRad="50800" w14:dist="50800" w14:dir="1800000" w14:sx="0" w14:sy="0" w14:kx="0" w14:ky="0" w14:algn="ctr">
             <w14:srgbClr w14:val="000000">
@@ -5211,27 +4327,14 @@
       <w:r>
         <w:t xml:space="preserve">Figure </w:t>
       </w:r>
-      <w:r>
-        <w:fldChar w:fldCharType="begin"/>
-      </w:r>
-      <w:r>
-        <w:instrText xml:space="preserve"> SEQ Figure \* ARABIC </w:instrText>
-      </w:r>
-      <w:r>
-        <w:fldChar w:fldCharType="separate"/>
-      </w:r>
-      <w:r>
-        <w:rPr>
-          <w:noProof/>
-        </w:rPr>
-        <w:t>13</w:t>
-      </w:r>
-      <w:r>
-        <w:rPr>
-          <w:noProof/>
-        </w:rPr>
-        <w:fldChar w:fldCharType="end"/>
-      </w:r>
+      <w:fldSimple w:instr=" SEQ Figure \* ARABIC ">
+        <w:r>
+          <w:rPr>
+            <w:noProof/>
+          </w:rPr>
+          <w:t>14</w:t>
+        </w:r>
+      </w:fldSimple>
       <w:r>
         <w:t xml:space="preserve">: </w:t>
       </w:r>
@@ -5442,7 +4545,6 @@
       <w:pPr>
         <w:pStyle w:val="BodyText"/>
         <w:keepNext/>
-        <w:jc w:val="center"/>
       </w:pPr>
       <w:r>
         <w:rPr>
@@ -5464,7 +4566,7 @@
                     <pic:cNvPicPr/>
                   </pic:nvPicPr>
                   <pic:blipFill>
-                    <a:blip r:embed="rId28">
+                    <a:blip r:embed="rId27">
                       <a:extLst>
                         <a:ext uri="{28A0092B-C50C-407E-A947-70E740481C1C}">
                           <a14:useLocalDpi xmlns:a14="http://schemas.microsoft.com/office/drawing/2010/main" val="0"/>
@@ -5510,7 +4612,7 @@
                     <pic:cNvPicPr/>
                   </pic:nvPicPr>
                   <pic:blipFill>
-                    <a:blip r:embed="rId29">
+                    <a:blip r:embed="rId28">
                       <a:extLst>
                         <a:ext uri="{28A0092B-C50C-407E-A947-70E740481C1C}">
                           <a14:useLocalDpi xmlns:a14="http://schemas.microsoft.com/office/drawing/2010/main" val="0"/>
@@ -5540,32 +4642,19 @@
     <w:p>
       <w:pPr>
         <w:pStyle w:val="Caption"/>
-        <w:jc w:val="center"/>
+        <w:jc w:val="both"/>
       </w:pPr>
       <w:r>
         <w:t xml:space="preserve">Figure </w:t>
       </w:r>
-      <w:r>
-        <w:fldChar w:fldCharType="begin"/>
-      </w:r>
-      <w:r>
-        <w:instrText xml:space="preserve"> SEQ Figure \* ARABIC </w:instrText>
-      </w:r>
-      <w:r>
-        <w:fldChar w:fldCharType="separate"/>
-      </w:r>
-      <w:r>
-        <w:rPr>
-          <w:noProof/>
-        </w:rPr>
-        <w:t>14</w:t>
-      </w:r>
-      <w:r>
-        <w:rPr>
-          <w:noProof/>
-        </w:rPr>
-        <w:fldChar w:fldCharType="end"/>
-      </w:r>
+      <w:fldSimple w:instr=" SEQ Figure \* ARABIC ">
+        <w:r>
+          <w:rPr>
+            <w:noProof/>
+          </w:rPr>
+          <w:t>15</w:t>
+        </w:r>
+      </w:fldSimple>
       <w:r>
         <w:t>: Tournament Search Forms</w:t>
       </w:r>
@@ -5768,7 +4857,6 @@
       <w:pPr>
         <w:pStyle w:val="BodyText"/>
         <w:keepNext/>
-        <w:jc w:val="center"/>
       </w:pPr>
       <w:r>
         <w:rPr>
@@ -5790,7 +4878,7 @@
                     <pic:cNvPicPr/>
                   </pic:nvPicPr>
                   <pic:blipFill>
-                    <a:blip r:embed="rId30">
+                    <a:blip r:embed="rId29">
                       <a:extLst>
                         <a:ext uri="{28A0092B-C50C-407E-A947-70E740481C1C}">
                           <a14:useLocalDpi xmlns:a14="http://schemas.microsoft.com/office/drawing/2010/main" val="0"/>
@@ -5820,32 +4908,19 @@
     <w:p>
       <w:pPr>
         <w:pStyle w:val="Caption"/>
-        <w:jc w:val="center"/>
+        <w:jc w:val="both"/>
       </w:pPr>
       <w:r>
         <w:t xml:space="preserve">Figure </w:t>
       </w:r>
-      <w:r>
-        <w:fldChar w:fldCharType="begin"/>
-      </w:r>
-      <w:r>
-        <w:instrText xml:space="preserve"> SEQ Figure \* ARABIC </w:instrText>
-      </w:r>
-      <w:r>
-        <w:fldChar w:fldCharType="separate"/>
-      </w:r>
-      <w:r>
-        <w:rPr>
-          <w:noProof/>
-        </w:rPr>
-        <w:t>15</w:t>
-      </w:r>
-      <w:r>
-        <w:rPr>
-          <w:noProof/>
-        </w:rPr>
-        <w:fldChar w:fldCharType="end"/>
-      </w:r>
+      <w:fldSimple w:instr=" SEQ Figure \* ARABIC ">
+        <w:r>
+          <w:rPr>
+            <w:noProof/>
+          </w:rPr>
+          <w:t>16</w:t>
+        </w:r>
+      </w:fldSimple>
       <w:r>
         <w:t>: Tournaments by Year</w:t>
       </w:r>
@@ -6269,7 +5344,112 @@
         <w:t>of Finalize tournament</w:t>
       </w:r>
     </w:p>
-    <w:p/>
+    <w:p>
+      <w:pPr>
+        <w:pStyle w:val="Heading1"/>
+      </w:pPr>
+      <w:r>
+        <w:lastRenderedPageBreak/>
+        <w:t>Tools</w:t>
+      </w:r>
+    </w:p>
+    <w:p>
+      <w:pPr>
+        <w:pStyle w:val="BodyText"/>
+        <w:keepNext/>
+      </w:pPr>
+      <w:r>
+        <w:t>Under Tools you will find the Update Inactive Members screen. Pick the date to find which members haven’t bowled for more than 180 days. You can click the check box by the names of the players to update to inactive status. Click “Update” to update the member information.</w:t>
+      </w:r>
+    </w:p>
+    <w:p>
+      <w:pPr>
+        <w:pStyle w:val="BodyText"/>
+        <w:keepNext/>
+      </w:pPr>
+      <w:r>
+        <w:rPr>
+          <w:noProof/>
+        </w:rPr>
+        <w:drawing>
+          <wp:inline distT="0" distB="0" distL="0" distR="0" wp14:anchorId="6166FE6E" wp14:editId="473BA504">
+            <wp:extent cx="2343150" cy="3836334"/>
+            <wp:effectExtent l="0" t="0" r="0" b="0"/>
+            <wp:docPr id="13" name="Picture 13"/>
+            <wp:cNvGraphicFramePr>
+              <a:graphicFrameLocks xmlns:a="http://schemas.openxmlformats.org/drawingml/2006/main" noChangeAspect="1"/>
+            </wp:cNvGraphicFramePr>
+            <a:graphic xmlns:a="http://schemas.openxmlformats.org/drawingml/2006/main">
+              <a:graphicData uri="http://schemas.openxmlformats.org/drawingml/2006/picture">
+                <pic:pic xmlns:pic="http://schemas.openxmlformats.org/drawingml/2006/picture">
+                  <pic:nvPicPr>
+                    <pic:cNvPr id="13" name="UpdateInactiveMembersForm.PNG"/>
+                    <pic:cNvPicPr/>
+                  </pic:nvPicPr>
+                  <pic:blipFill>
+                    <a:blip r:embed="rId30">
+                      <a:extLst>
+                        <a:ext uri="{28A0092B-C50C-407E-A947-70E740481C1C}">
+                          <a14:useLocalDpi xmlns:a14="http://schemas.microsoft.com/office/drawing/2010/main" val="0"/>
+                        </a:ext>
+                      </a:extLst>
+                    </a:blip>
+                    <a:stretch>
+                      <a:fillRect/>
+                    </a:stretch>
+                  </pic:blipFill>
+                  <pic:spPr>
+                    <a:xfrm>
+                      <a:off x="0" y="0"/>
+                      <a:ext cx="2361540" cy="3866443"/>
+                    </a:xfrm>
+                    <a:prstGeom prst="rect">
+                      <a:avLst/>
+                    </a:prstGeom>
+                  </pic:spPr>
+                </pic:pic>
+              </a:graphicData>
+            </a:graphic>
+          </wp:inline>
+        </w:drawing>
+      </w:r>
+    </w:p>
+    <w:p>
+      <w:pPr>
+        <w:pStyle w:val="Caption"/>
+        <w:jc w:val="both"/>
+      </w:pPr>
+      <w:r>
+        <w:t xml:space="preserve">Figure </w:t>
+      </w:r>
+      <w:r>
+        <w:fldChar w:fldCharType="begin"/>
+      </w:r>
+      <w:r>
+        <w:instrText xml:space="preserve"> SEQ Figure \* ARABIC </w:instrText>
+      </w:r>
+      <w:r>
+        <w:fldChar w:fldCharType="separate"/>
+      </w:r>
+      <w:r>
+        <w:rPr>
+          <w:noProof/>
+        </w:rPr>
+        <w:t>17</w:t>
+      </w:r>
+      <w:r>
+        <w:rPr>
+          <w:noProof/>
+        </w:rPr>
+        <w:fldChar w:fldCharType="end"/>
+      </w:r>
+      <w:r>
+        <w:t>: Update Inactive status</w:t>
+      </w:r>
+      <w:r>
+        <w:t xml:space="preserve"> screen</w:t>
+      </w:r>
+    </w:p>
     <w:p>
       <w:pPr>
         <w:pStyle w:val="PartTitle"/>
@@ -6346,7 +5526,21 @@
           <w:sz w:val="24"/>
           <w:szCs w:val="24"/>
         </w:rPr>
-        <w:t>WARNING:</w:t>
+        <w:t>WARNING</w:t>
+      </w:r>
+      <w:r>
+        <w:rPr>
+          <w:sz w:val="24"/>
+          <w:szCs w:val="24"/>
+        </w:rPr>
+        <w:t>S</w:t>
+      </w:r>
+      <w:r>
+        <w:rPr>
+          <w:sz w:val="24"/>
+          <w:szCs w:val="24"/>
+        </w:rPr>
+        <w:t>:</w:t>
       </w:r>
     </w:p>
     <w:p>
@@ -6361,6 +5555,22 @@
       </w:r>
       <w:r>
         <w:t xml:space="preserve"> participants, DO NOT USE PROGRAM. Keep track of player data manually.</w:t>
+      </w:r>
+    </w:p>
+    <w:p>
+      <w:pPr>
+        <w:pStyle w:val="BodyText"/>
+      </w:pPr>
+      <w:r>
+        <w:t>Doubles tournaments are not supported by the software at this time. Leave this alone.</w:t>
+      </w:r>
+    </w:p>
+    <w:p>
+      <w:pPr>
+        <w:pStyle w:val="BodyText"/>
+      </w:pPr>
+      <w:r>
+        <w:t>Do not start a new tournament before the current tournament you are working on has been finalized.</w:t>
       </w:r>
     </w:p>
     <w:p>
@@ -7384,7 +6594,7 @@
         <w:rStyle w:val="PageNumber"/>
         <w:noProof/>
       </w:rPr>
-      <w:t>19</w:t>
+      <w:t>27</w:t>
     </w:r>
     <w:r>
       <w:rPr>
@@ -10770,7 +9980,7 @@
 </file>
 
 <file path=customXml/itemProps1.xml><?xml version="1.0" encoding="utf-8"?>
-<ds:datastoreItem xmlns:ds="http://schemas.openxmlformats.org/officeDocument/2006/customXml" ds:itemID="{15A87ACE-2F22-464C-A65C-F071C6B8CFA9}">
+<ds:datastoreItem xmlns:ds="http://schemas.openxmlformats.org/officeDocument/2006/customXml" ds:itemID="{AAD670C0-8032-444E-A1FE-817619F1E3AC}">
   <ds:schemaRefs>
     <ds:schemaRef ds:uri="http://schemas.openxmlformats.org/officeDocument/2006/bibliography"/>
   </ds:schemaRefs>

</xml_diff>

<commit_message>
continuing work on the manual
added chapter break for Conversion Program. worked on create/edit and search tournament
</commit_message>
<xml_diff>
--- a/9tapUserManual.docx
+++ b/9tapUserManual.docx
@@ -1429,14 +1429,27 @@
       <w:r>
         <w:t xml:space="preserve">Figure </w:t>
       </w:r>
-      <w:fldSimple w:instr=" SEQ Figure \* ARABIC ">
-        <w:r>
-          <w:rPr>
-            <w:noProof/>
-          </w:rPr>
-          <w:t>1</w:t>
-        </w:r>
-      </w:fldSimple>
+      <w:r>
+        <w:fldChar w:fldCharType="begin"/>
+      </w:r>
+      <w:r>
+        <w:instrText xml:space="preserve"> SEQ Figure \* ARABIC </w:instrText>
+      </w:r>
+      <w:r>
+        <w:fldChar w:fldCharType="separate"/>
+      </w:r>
+      <w:r>
+        <w:rPr>
+          <w:noProof/>
+        </w:rPr>
+        <w:t>1</w:t>
+      </w:r>
+      <w:r>
+        <w:rPr>
+          <w:noProof/>
+        </w:rPr>
+        <w:fldChar w:fldCharType="end"/>
+      </w:r>
       <w:r>
         <w:t>: 9-Tap Main Menu</w:t>
       </w:r>
@@ -1481,7 +1494,10 @@
         <w:t xml:space="preserve">You can find this on page </w:t>
       </w:r>
       <w:r>
-        <w:t>5.</w:t>
+        <w:t>#</w:t>
+      </w:r>
+      <w:r>
+        <w:t>.</w:t>
       </w:r>
     </w:p>
     <w:p>
@@ -1500,7 +1516,10 @@
         <w:t xml:space="preserve">You can find this on page </w:t>
       </w:r>
       <w:r>
-        <w:t>24.</w:t>
+        <w:t>#</w:t>
+      </w:r>
+      <w:r>
+        <w:t>.</w:t>
       </w:r>
     </w:p>
     <w:p>
@@ -1627,7 +1646,10 @@
         <w:pStyle w:val="BodyTextKeep"/>
       </w:pPr>
       <w:r>
-        <w:t xml:space="preserve">The system requirements to run the 9-tap software are </w:t>
+        <w:t>The system requirements</w:t>
+      </w:r>
+      <w:r>
+        <w:t xml:space="preserve">: </w:t>
       </w:r>
       <w:r>
         <w:t>Windows 7 and above</w:t>
@@ -1639,13 +1661,14 @@
         <w:t>13MB free disk space.</w:t>
       </w:r>
       <w:r>
-        <w:t xml:space="preserve"> USB port. Dot matrix and ink/laser-jet printers. Microsoft Excel must be installed on the computer for the 9-Tap Tour program to work.</w:t>
-      </w:r>
-    </w:p>
-    <w:p>
-      <w:pPr>
-        <w:pStyle w:val="BodyText"/>
-      </w:pPr>
+        <w:t xml:space="preserve"> </w:t>
+      </w:r>
+      <w:r>
+        <w:t xml:space="preserve">Optimized for 1366 X 768 screen resolution. </w:t>
+      </w:r>
+      <w:r>
+        <w:t>USB port. Dot matrix and ink/laser-jet printers. Microsoft Excel must be installed on the computer for the 9-Tap Tour program to work.</w:t>
+      </w:r>
     </w:p>
     <w:p>
       <w:pPr>
@@ -1790,8 +1813,11 @@
         </w:numPr>
       </w:pPr>
       <w:r>
+        <w:t xml:space="preserve">The 9 Tap Tour program has now been successfully installed. Choose “Run 9 Tap Tour” to immediately launch the program, or “View ReadMe.txt” to view </w:t>
+      </w:r>
+      <w:r>
         <w:lastRenderedPageBreak/>
-        <w:t>The 9 Tap Tour program has now been successfully installed. Choose “Run 9 Tap Tour” to immediately launch the program, or “View ReadMe.txt” to view the ReadMe file where you can view updated program information made after the game manual was printed.</w:t>
+        <w:t>the ReadMe file where you can view updated program information made after the game manual was printed.</w:t>
       </w:r>
     </w:p>
     <w:p>
@@ -2269,14 +2295,27 @@
       <w:r>
         <w:t xml:space="preserve">Figure </w:t>
       </w:r>
-      <w:fldSimple w:instr=" SEQ Figure \* ARABIC ">
-        <w:r>
-          <w:rPr>
-            <w:noProof/>
-          </w:rPr>
-          <w:t>2</w:t>
-        </w:r>
-      </w:fldSimple>
+      <w:r>
+        <w:fldChar w:fldCharType="begin"/>
+      </w:r>
+      <w:r>
+        <w:instrText xml:space="preserve"> SEQ Figure \* ARABIC </w:instrText>
+      </w:r>
+      <w:r>
+        <w:fldChar w:fldCharType="separate"/>
+      </w:r>
+      <w:r>
+        <w:rPr>
+          <w:noProof/>
+        </w:rPr>
+        <w:t>2</w:t>
+      </w:r>
+      <w:r>
+        <w:rPr>
+          <w:noProof/>
+        </w:rPr>
+        <w:fldChar w:fldCharType="end"/>
+      </w:r>
       <w:r>
         <w:t>: Main Menu</w:t>
       </w:r>
@@ -2375,27 +2414,14 @@
       <w:r>
         <w:t xml:space="preserve">Figure </w:t>
       </w:r>
-      <w:r>
-        <w:fldChar w:fldCharType="begin"/>
-      </w:r>
-      <w:r>
-        <w:instrText xml:space="preserve"> SEQ Figure \* ARABIC </w:instrText>
-      </w:r>
-      <w:r>
-        <w:fldChar w:fldCharType="separate"/>
-      </w:r>
-      <w:r>
-        <w:rPr>
-          <w:noProof/>
-        </w:rPr>
-        <w:t>3</w:t>
-      </w:r>
-      <w:r>
-        <w:rPr>
-          <w:noProof/>
-        </w:rPr>
-        <w:fldChar w:fldCharType="end"/>
-      </w:r>
+      <w:fldSimple w:instr=" SEQ Figure \* ARABIC ">
+        <w:r>
+          <w:rPr>
+            <w:noProof/>
+          </w:rPr>
+          <w:t>3</w:t>
+        </w:r>
+      </w:fldSimple>
       <w:r>
         <w:t>: Member Information</w:t>
       </w:r>
@@ -2566,14 +2592,27 @@
       <w:r>
         <w:t xml:space="preserve">Figure </w:t>
       </w:r>
-      <w:fldSimple w:instr=" SEQ Figure \* ARABIC ">
-        <w:r>
-          <w:rPr>
-            <w:noProof/>
-          </w:rPr>
-          <w:t>5</w:t>
-        </w:r>
-      </w:fldSimple>
+      <w:r>
+        <w:fldChar w:fldCharType="begin"/>
+      </w:r>
+      <w:r>
+        <w:instrText xml:space="preserve"> SEQ Figure \* ARABIC </w:instrText>
+      </w:r>
+      <w:r>
+        <w:fldChar w:fldCharType="separate"/>
+      </w:r>
+      <w:r>
+        <w:rPr>
+          <w:noProof/>
+        </w:rPr>
+        <w:t>4</w:t>
+      </w:r>
+      <w:r>
+        <w:rPr>
+          <w:noProof/>
+        </w:rPr>
+        <w:fldChar w:fldCharType="end"/>
+      </w:r>
       <w:r>
         <w:t>: Member Information</w:t>
       </w:r>
@@ -2692,14 +2731,27 @@
       <w:r>
         <w:t xml:space="preserve">Figure </w:t>
       </w:r>
-      <w:fldSimple w:instr=" SEQ Figure \* ARABIC ">
-        <w:r>
-          <w:rPr>
-            <w:noProof/>
-          </w:rPr>
-          <w:t>6</w:t>
-        </w:r>
-      </w:fldSimple>
+      <w:r>
+        <w:fldChar w:fldCharType="begin"/>
+      </w:r>
+      <w:r>
+        <w:instrText xml:space="preserve"> SEQ Figure \* ARABIC </w:instrText>
+      </w:r>
+      <w:r>
+        <w:fldChar w:fldCharType="separate"/>
+      </w:r>
+      <w:r>
+        <w:rPr>
+          <w:noProof/>
+        </w:rPr>
+        <w:t>5</w:t>
+      </w:r>
+      <w:r>
+        <w:rPr>
+          <w:noProof/>
+        </w:rPr>
+        <w:fldChar w:fldCharType="end"/>
+      </w:r>
       <w:r>
         <w:t>: Stats Form</w:t>
       </w:r>
@@ -2834,14 +2886,27 @@
       <w:r>
         <w:t xml:space="preserve">Figure </w:t>
       </w:r>
-      <w:fldSimple w:instr=" SEQ Figure \* ARABIC ">
-        <w:r>
-          <w:rPr>
-            <w:noProof/>
-          </w:rPr>
-          <w:t>7</w:t>
-        </w:r>
-      </w:fldSimple>
+      <w:r>
+        <w:fldChar w:fldCharType="begin"/>
+      </w:r>
+      <w:r>
+        <w:instrText xml:space="preserve"> SEQ Figure \* ARABIC </w:instrText>
+      </w:r>
+      <w:r>
+        <w:fldChar w:fldCharType="separate"/>
+      </w:r>
+      <w:r>
+        <w:rPr>
+          <w:noProof/>
+        </w:rPr>
+        <w:t>6</w:t>
+      </w:r>
+      <w:r>
+        <w:rPr>
+          <w:noProof/>
+        </w:rPr>
+        <w:fldChar w:fldCharType="end"/>
+      </w:r>
       <w:r>
         <w:t>: Member search, blank and with results</w:t>
       </w:r>
@@ -2985,14 +3050,27 @@
       <w:r>
         <w:t xml:space="preserve">Figure </w:t>
       </w:r>
-      <w:fldSimple w:instr=" SEQ Figure \* ARABIC ">
-        <w:r>
-          <w:rPr>
-            <w:noProof/>
-          </w:rPr>
-          <w:t>8</w:t>
-        </w:r>
-      </w:fldSimple>
+      <w:r>
+        <w:fldChar w:fldCharType="begin"/>
+      </w:r>
+      <w:r>
+        <w:instrText xml:space="preserve"> SEQ Figure \* ARABIC </w:instrText>
+      </w:r>
+      <w:r>
+        <w:fldChar w:fldCharType="separate"/>
+      </w:r>
+      <w:r>
+        <w:rPr>
+          <w:noProof/>
+        </w:rPr>
+        <w:t>7</w:t>
+      </w:r>
+      <w:r>
+        <w:rPr>
+          <w:noProof/>
+        </w:rPr>
+        <w:fldChar w:fldCharType="end"/>
+      </w:r>
       <w:r>
         <w:t>: basic printer dialog</w:t>
       </w:r>
@@ -3091,14 +3169,27 @@
       <w:r>
         <w:t xml:space="preserve">Figure </w:t>
       </w:r>
-      <w:fldSimple w:instr=" SEQ Figure \* ARABIC ">
-        <w:r>
-          <w:rPr>
-            <w:noProof/>
-          </w:rPr>
-          <w:t>9</w:t>
-        </w:r>
-      </w:fldSimple>
+      <w:r>
+        <w:fldChar w:fldCharType="begin"/>
+      </w:r>
+      <w:r>
+        <w:instrText xml:space="preserve"> SEQ Figure \* ARABIC </w:instrText>
+      </w:r>
+      <w:r>
+        <w:fldChar w:fldCharType="separate"/>
+      </w:r>
+      <w:r>
+        <w:rPr>
+          <w:noProof/>
+        </w:rPr>
+        <w:t>8</w:t>
+      </w:r>
+      <w:r>
+        <w:rPr>
+          <w:noProof/>
+        </w:rPr>
+        <w:fldChar w:fldCharType="end"/>
+      </w:r>
       <w:r>
         <w:t>: Print Labels Dialog</w:t>
       </w:r>
@@ -3187,14 +3278,27 @@
       <w:r>
         <w:t xml:space="preserve">Figure </w:t>
       </w:r>
-      <w:fldSimple w:instr=" SEQ Figure \* ARABIC ">
-        <w:r>
-          <w:rPr>
-            <w:noProof/>
-          </w:rPr>
-          <w:t>10</w:t>
-        </w:r>
-      </w:fldSimple>
+      <w:r>
+        <w:fldChar w:fldCharType="begin"/>
+      </w:r>
+      <w:r>
+        <w:instrText xml:space="preserve"> SEQ Figure \* ARABIC </w:instrText>
+      </w:r>
+      <w:r>
+        <w:fldChar w:fldCharType="separate"/>
+      </w:r>
+      <w:r>
+        <w:rPr>
+          <w:noProof/>
+        </w:rPr>
+        <w:t>9</w:t>
+      </w:r>
+      <w:r>
+        <w:rPr>
+          <w:noProof/>
+        </w:rPr>
+        <w:fldChar w:fldCharType="end"/>
+      </w:r>
       <w:r>
         <w:t>: Importing existing player information</w:t>
       </w:r>
@@ -3219,8 +3323,9 @@
       <w:r>
         <w:t xml:space="preserve"> A tournament must be created before the member scores can be entered.</w:t>
       </w:r>
-      <w:bookmarkStart w:id="0" w:name="_GoBack"/>
-      <w:bookmarkEnd w:id="0"/>
+      <w:r>
+        <w:t xml:space="preserve"> See Create/Update Tournament.</w:t>
+      </w:r>
     </w:p>
     <w:p>
       <w:pPr>
@@ -3290,14 +3395,27 @@
       <w:r>
         <w:t xml:space="preserve">Figure </w:t>
       </w:r>
-      <w:fldSimple w:instr=" SEQ Figure \* ARABIC ">
-        <w:r>
-          <w:rPr>
-            <w:noProof/>
-          </w:rPr>
-          <w:t>11</w:t>
-        </w:r>
-      </w:fldSimple>
+      <w:r>
+        <w:fldChar w:fldCharType="begin"/>
+      </w:r>
+      <w:r>
+        <w:instrText xml:space="preserve"> SEQ Figure \* ARABIC </w:instrText>
+      </w:r>
+      <w:r>
+        <w:fldChar w:fldCharType="separate"/>
+      </w:r>
+      <w:r>
+        <w:rPr>
+          <w:noProof/>
+        </w:rPr>
+        <w:t>10</w:t>
+      </w:r>
+      <w:r>
+        <w:rPr>
+          <w:noProof/>
+        </w:rPr>
+        <w:fldChar w:fldCharType="end"/>
+      </w:r>
       <w:r>
         <w:t>: Member Scores</w:t>
       </w:r>
@@ -3562,14 +3680,27 @@
       <w:r>
         <w:t xml:space="preserve">Figure </w:t>
       </w:r>
-      <w:fldSimple w:instr=" SEQ Figure \* ARABIC ">
-        <w:r>
-          <w:rPr>
-            <w:noProof/>
-          </w:rPr>
-          <w:t>12</w:t>
-        </w:r>
-      </w:fldSimple>
+      <w:r>
+        <w:fldChar w:fldCharType="begin"/>
+      </w:r>
+      <w:r>
+        <w:instrText xml:space="preserve"> SEQ Figure \* ARABIC </w:instrText>
+      </w:r>
+      <w:r>
+        <w:fldChar w:fldCharType="separate"/>
+      </w:r>
+      <w:r>
+        <w:rPr>
+          <w:noProof/>
+        </w:rPr>
+        <w:t>11</w:t>
+      </w:r>
+      <w:r>
+        <w:rPr>
+          <w:noProof/>
+        </w:rPr>
+        <w:fldChar w:fldCharType="end"/>
+      </w:r>
       <w:r>
         <w:t>: Tournament Stats Form</w:t>
       </w:r>
@@ -4046,14 +4177,27 @@
       <w:r>
         <w:t xml:space="preserve">Figure </w:t>
       </w:r>
-      <w:fldSimple w:instr=" SEQ Figure \* ARABIC ">
-        <w:r>
-          <w:rPr>
-            <w:noProof/>
-          </w:rPr>
-          <w:t>13</w:t>
-        </w:r>
-      </w:fldSimple>
+      <w:r>
+        <w:fldChar w:fldCharType="begin"/>
+      </w:r>
+      <w:r>
+        <w:instrText xml:space="preserve"> SEQ Figure \* ARABIC </w:instrText>
+      </w:r>
+      <w:r>
+        <w:fldChar w:fldCharType="separate"/>
+      </w:r>
+      <w:r>
+        <w:rPr>
+          <w:noProof/>
+        </w:rPr>
+        <w:t>12</w:t>
+      </w:r>
+      <w:r>
+        <w:rPr>
+          <w:noProof/>
+        </w:rPr>
+        <w:fldChar w:fldCharType="end"/>
+      </w:r>
       <w:r>
         <w:t>: Tournament Place Standings</w:t>
       </w:r>
@@ -4073,183 +4217,19 @@
         <w:keepNext/>
       </w:pPr>
       <w:r>
-        <w:t xml:space="preserve">Craft beer sartorial copper mug </w:t>
-      </w:r>
-      <w:proofErr w:type="spellStart"/>
-      <w:r>
-        <w:t>tbh</w:t>
-      </w:r>
-      <w:proofErr w:type="spellEnd"/>
-      <w:r>
-        <w:t xml:space="preserve"> </w:t>
-      </w:r>
-      <w:proofErr w:type="spellStart"/>
-      <w:r>
-        <w:t>jianbing</w:t>
-      </w:r>
-      <w:proofErr w:type="spellEnd"/>
-      <w:r>
-        <w:t xml:space="preserve">, locavore VHS salvia +1 vegan gluten-free </w:t>
-      </w:r>
-      <w:proofErr w:type="spellStart"/>
-      <w:r>
-        <w:t>kogi</w:t>
-      </w:r>
-      <w:proofErr w:type="spellEnd"/>
-      <w:r>
-        <w:t xml:space="preserve"> pug </w:t>
-      </w:r>
-      <w:proofErr w:type="spellStart"/>
-      <w:r>
-        <w:t>vexillologist</w:t>
-      </w:r>
-      <w:proofErr w:type="spellEnd"/>
-      <w:r>
-        <w:t xml:space="preserve"> </w:t>
-      </w:r>
-      <w:proofErr w:type="spellStart"/>
-      <w:r>
-        <w:t>affogato</w:t>
-      </w:r>
-      <w:proofErr w:type="spellEnd"/>
-      <w:r>
-        <w:t xml:space="preserve">. Fanny pack </w:t>
-      </w:r>
-      <w:proofErr w:type="spellStart"/>
-      <w:r>
-        <w:t>palo</w:t>
-      </w:r>
-      <w:proofErr w:type="spellEnd"/>
-      <w:r>
-        <w:t xml:space="preserve"> </w:t>
-      </w:r>
-      <w:proofErr w:type="spellStart"/>
-      <w:r>
-        <w:t>santo</w:t>
-      </w:r>
-      <w:proofErr w:type="spellEnd"/>
-      <w:r>
-        <w:t xml:space="preserve"> </w:t>
-      </w:r>
-      <w:proofErr w:type="spellStart"/>
-      <w:r>
-        <w:t>proident</w:t>
-      </w:r>
-      <w:proofErr w:type="spellEnd"/>
-      <w:r>
-        <w:t xml:space="preserve"> blog bespoke </w:t>
-      </w:r>
-      <w:proofErr w:type="spellStart"/>
-      <w:r>
-        <w:t>commodo</w:t>
-      </w:r>
-      <w:proofErr w:type="spellEnd"/>
-      <w:r>
-        <w:t xml:space="preserve"> tilde hammock </w:t>
-      </w:r>
-      <w:proofErr w:type="spellStart"/>
-      <w:r>
-        <w:t>taiyaki</w:t>
-      </w:r>
-      <w:proofErr w:type="spellEnd"/>
-      <w:r>
-        <w:t xml:space="preserve"> wayfarers gentrify. Cardigan ugh slow-carb, </w:t>
-      </w:r>
-      <w:proofErr w:type="spellStart"/>
-      <w:r>
-        <w:t>ea</w:t>
-      </w:r>
-      <w:proofErr w:type="spellEnd"/>
-      <w:r>
-        <w:t xml:space="preserve"> DIY hot chicken </w:t>
-      </w:r>
-      <w:proofErr w:type="spellStart"/>
-      <w:r>
-        <w:t>commodo</w:t>
-      </w:r>
-      <w:proofErr w:type="spellEnd"/>
-      <w:r>
-        <w:t xml:space="preserve"> </w:t>
-      </w:r>
-      <w:proofErr w:type="spellStart"/>
-      <w:r>
-        <w:t>godard</w:t>
-      </w:r>
-      <w:proofErr w:type="spellEnd"/>
-      <w:r>
-        <w:t xml:space="preserve">. Lorem </w:t>
-      </w:r>
-      <w:proofErr w:type="spellStart"/>
-      <w:r>
-        <w:t>sint</w:t>
-      </w:r>
-      <w:proofErr w:type="spellEnd"/>
-      <w:r>
-        <w:t xml:space="preserve"> qui 3 wolf moon </w:t>
-      </w:r>
-      <w:proofErr w:type="spellStart"/>
-      <w:r>
-        <w:t>enim</w:t>
-      </w:r>
-      <w:proofErr w:type="spellEnd"/>
-      <w:r>
-        <w:t xml:space="preserve"> </w:t>
-      </w:r>
-      <w:proofErr w:type="spellStart"/>
-      <w:r>
-        <w:t>voluptate</w:t>
-      </w:r>
-      <w:proofErr w:type="spellEnd"/>
-      <w:r>
-        <w:t xml:space="preserve">, </w:t>
-      </w:r>
-      <w:proofErr w:type="spellStart"/>
-      <w:r>
-        <w:t>velit</w:t>
-      </w:r>
-      <w:proofErr w:type="spellEnd"/>
-      <w:r>
-        <w:t xml:space="preserve"> </w:t>
-      </w:r>
-      <w:proofErr w:type="spellStart"/>
-      <w:r>
-        <w:t>veniam</w:t>
-      </w:r>
-      <w:proofErr w:type="spellEnd"/>
-      <w:r>
-        <w:t xml:space="preserve">. Fanny pack man bun </w:t>
-      </w:r>
-      <w:proofErr w:type="spellStart"/>
-      <w:r>
-        <w:t>helvetica</w:t>
-      </w:r>
-      <w:proofErr w:type="spellEnd"/>
-      <w:r>
-        <w:t xml:space="preserve"> viral, </w:t>
-      </w:r>
-      <w:proofErr w:type="spellStart"/>
-      <w:r>
-        <w:t>edison</w:t>
-      </w:r>
-      <w:proofErr w:type="spellEnd"/>
-      <w:r>
-        <w:t xml:space="preserve"> bulb </w:t>
-      </w:r>
-      <w:proofErr w:type="spellStart"/>
-      <w:r>
-        <w:t>cliche</w:t>
-      </w:r>
-      <w:proofErr w:type="spellEnd"/>
-      <w:r>
-        <w:t xml:space="preserve"> </w:t>
-      </w:r>
-      <w:proofErr w:type="spellStart"/>
-      <w:r>
-        <w:t>jianbing</w:t>
-      </w:r>
-      <w:proofErr w:type="spellEnd"/>
-      <w:r>
-        <w:t>.</w:t>
+        <w:t>From the Member Scores screen, click on the “Create/Edit Tournament…” button. You should now see the New Tournament screen.</w:t>
+      </w:r>
+      <w:r>
+        <w:t xml:space="preserve"> Select the tournament date. Fill in the name of the bowling center in the Location field. Put the name of the event in the Event field. List the sponsors in the </w:t>
+      </w:r>
+      <w:r>
+        <w:t>Sponsors</w:t>
+      </w:r>
+      <w:r>
+        <w:t xml:space="preserve"> field. DO NOT CHECK THE DOUBLES BOX. If it’s a three out of four tournament, check the “3 out of 4” box. Fill in the number of squads in the Number of Squads field. The default is 4.</w:t>
+      </w:r>
+      <w:r>
+        <w:t xml:space="preserve"> Any necessary tournament notes should be entered in the Notes field. Double check the entries for accuracy. Click “Create Tournament” to save the entry.</w:t>
       </w:r>
     </w:p>
     <w:p>
@@ -4316,43 +4296,78 @@
       <w:pPr>
         <w:pStyle w:val="Caption"/>
         <w:jc w:val="both"/>
-        <w:rPr>
-          <w14:shadow w14:blurRad="50800" w14:dist="50800" w14:dir="1800000" w14:sx="0" w14:sy="0" w14:kx="0" w14:ky="0" w14:algn="ctr">
-            <w14:srgbClr w14:val="000000">
-              <w14:alpha w14:val="56870"/>
-            </w14:srgbClr>
-          </w14:shadow>
-        </w:rPr>
       </w:pPr>
       <w:r>
         <w:t xml:space="preserve">Figure </w:t>
       </w:r>
-      <w:fldSimple w:instr=" SEQ Figure \* ARABIC ">
-        <w:r>
-          <w:rPr>
-            <w:noProof/>
-          </w:rPr>
-          <w:t>14</w:t>
-        </w:r>
-      </w:fldSimple>
+      <w:r>
+        <w:fldChar w:fldCharType="begin"/>
+      </w:r>
+      <w:r>
+        <w:instrText xml:space="preserve"> SEQ Figure \* ARABIC </w:instrText>
+      </w:r>
+      <w:r>
+        <w:fldChar w:fldCharType="separate"/>
+      </w:r>
+      <w:r>
+        <w:rPr>
+          <w:noProof/>
+        </w:rPr>
+        <w:t>13</w:t>
+      </w:r>
+      <w:r>
+        <w:rPr>
+          <w:noProof/>
+        </w:rPr>
+        <w:fldChar w:fldCharType="end"/>
+      </w:r>
       <w:r>
         <w:t xml:space="preserve">: </w:t>
       </w:r>
-      <w:proofErr w:type="spellStart"/>
-      <w:r>
-        <w:t>Creat</w:t>
-      </w:r>
-      <w:proofErr w:type="spellEnd"/>
+      <w:r>
+        <w:t>Create</w:t>
+      </w:r>
       <w:r>
         <w:t>/Edit Tournament Form</w:t>
       </w:r>
     </w:p>
     <w:p>
       <w:pPr>
+        <w:pStyle w:val="Heading3"/>
+      </w:pPr>
+      <w:r>
+        <w:t>To Update an Existing Tournament</w:t>
+      </w:r>
+    </w:p>
+    <w:p>
+      <w:pPr>
+        <w:pStyle w:val="BodyText"/>
+      </w:pPr>
+      <w:r>
+        <w:t>Click on the “Create/Edit Tournament” button. On the New Tournament screen, click “Edit Existing Tournament…” This will bring up the “Search Tournaments”</w:t>
+      </w:r>
+      <w:r>
+        <w:t xml:space="preserve"> screen</w:t>
+      </w:r>
+      <w:r>
+        <w:t xml:space="preserve">, figure 14. </w:t>
+      </w:r>
+      <w:r>
+        <w:t xml:space="preserve">See Search Tournaments </w:t>
+      </w:r>
+      <w:r>
+        <w:t xml:space="preserve">for the search function. Once the </w:t>
+      </w:r>
+      <w:r>
+        <w:lastRenderedPageBreak/>
+        <w:t>tournament to edit has been selected, you can then edit the pertinent information and save the entry.</w:t>
+      </w:r>
+    </w:p>
+    <w:p>
+      <w:pPr>
         <w:pStyle w:val="Heading2"/>
       </w:pPr>
       <w:r>
-        <w:lastRenderedPageBreak/>
         <w:t>Search Tournaments</w:t>
       </w:r>
     </w:p>
@@ -4362,183 +4377,7 @@
         <w:keepNext/>
       </w:pPr>
       <w:r>
-        <w:t xml:space="preserve">Craft beer sartorial copper mug </w:t>
-      </w:r>
-      <w:proofErr w:type="spellStart"/>
-      <w:r>
-        <w:t>tbh</w:t>
-      </w:r>
-      <w:proofErr w:type="spellEnd"/>
-      <w:r>
-        <w:t xml:space="preserve"> </w:t>
-      </w:r>
-      <w:proofErr w:type="spellStart"/>
-      <w:r>
-        <w:t>jianbing</w:t>
-      </w:r>
-      <w:proofErr w:type="spellEnd"/>
-      <w:r>
-        <w:t xml:space="preserve">, locavore VHS salvia +1 vegan gluten-free </w:t>
-      </w:r>
-      <w:proofErr w:type="spellStart"/>
-      <w:r>
-        <w:t>kogi</w:t>
-      </w:r>
-      <w:proofErr w:type="spellEnd"/>
-      <w:r>
-        <w:t xml:space="preserve"> pug </w:t>
-      </w:r>
-      <w:proofErr w:type="spellStart"/>
-      <w:r>
-        <w:t>vexillologist</w:t>
-      </w:r>
-      <w:proofErr w:type="spellEnd"/>
-      <w:r>
-        <w:t xml:space="preserve"> </w:t>
-      </w:r>
-      <w:proofErr w:type="spellStart"/>
-      <w:r>
-        <w:t>affogato</w:t>
-      </w:r>
-      <w:proofErr w:type="spellEnd"/>
-      <w:r>
-        <w:t xml:space="preserve">. Fanny pack </w:t>
-      </w:r>
-      <w:proofErr w:type="spellStart"/>
-      <w:r>
-        <w:t>palo</w:t>
-      </w:r>
-      <w:proofErr w:type="spellEnd"/>
-      <w:r>
-        <w:t xml:space="preserve"> </w:t>
-      </w:r>
-      <w:proofErr w:type="spellStart"/>
-      <w:r>
-        <w:t>santo</w:t>
-      </w:r>
-      <w:proofErr w:type="spellEnd"/>
-      <w:r>
-        <w:t xml:space="preserve"> </w:t>
-      </w:r>
-      <w:proofErr w:type="spellStart"/>
-      <w:r>
-        <w:t>proident</w:t>
-      </w:r>
-      <w:proofErr w:type="spellEnd"/>
-      <w:r>
-        <w:t xml:space="preserve"> blog bespoke </w:t>
-      </w:r>
-      <w:proofErr w:type="spellStart"/>
-      <w:r>
-        <w:t>commodo</w:t>
-      </w:r>
-      <w:proofErr w:type="spellEnd"/>
-      <w:r>
-        <w:t xml:space="preserve"> tilde hammock </w:t>
-      </w:r>
-      <w:proofErr w:type="spellStart"/>
-      <w:r>
-        <w:t>taiyaki</w:t>
-      </w:r>
-      <w:proofErr w:type="spellEnd"/>
-      <w:r>
-        <w:t xml:space="preserve"> wayfarers gentrify. Cardigan ugh slow-carb, </w:t>
-      </w:r>
-      <w:proofErr w:type="spellStart"/>
-      <w:r>
-        <w:t>ea</w:t>
-      </w:r>
-      <w:proofErr w:type="spellEnd"/>
-      <w:r>
-        <w:t xml:space="preserve"> DIY hot chicken </w:t>
-      </w:r>
-      <w:proofErr w:type="spellStart"/>
-      <w:r>
-        <w:t>commodo</w:t>
-      </w:r>
-      <w:proofErr w:type="spellEnd"/>
-      <w:r>
-        <w:t xml:space="preserve"> </w:t>
-      </w:r>
-      <w:proofErr w:type="spellStart"/>
-      <w:r>
-        <w:t>godard</w:t>
-      </w:r>
-      <w:proofErr w:type="spellEnd"/>
-      <w:r>
-        <w:t xml:space="preserve">. Lorem </w:t>
-      </w:r>
-      <w:proofErr w:type="spellStart"/>
-      <w:r>
-        <w:t>sint</w:t>
-      </w:r>
-      <w:proofErr w:type="spellEnd"/>
-      <w:r>
-        <w:t xml:space="preserve"> qui 3 wolf moon </w:t>
-      </w:r>
-      <w:proofErr w:type="spellStart"/>
-      <w:r>
-        <w:t>enim</w:t>
-      </w:r>
-      <w:proofErr w:type="spellEnd"/>
-      <w:r>
-        <w:t xml:space="preserve"> </w:t>
-      </w:r>
-      <w:proofErr w:type="spellStart"/>
-      <w:r>
-        <w:t>voluptate</w:t>
-      </w:r>
-      <w:proofErr w:type="spellEnd"/>
-      <w:r>
-        <w:t xml:space="preserve">, </w:t>
-      </w:r>
-      <w:proofErr w:type="spellStart"/>
-      <w:r>
-        <w:t>velit</w:t>
-      </w:r>
-      <w:proofErr w:type="spellEnd"/>
-      <w:r>
-        <w:t xml:space="preserve"> </w:t>
-      </w:r>
-      <w:proofErr w:type="spellStart"/>
-      <w:r>
-        <w:t>veniam</w:t>
-      </w:r>
-      <w:proofErr w:type="spellEnd"/>
-      <w:r>
-        <w:t xml:space="preserve">. Fanny pack man bun </w:t>
-      </w:r>
-      <w:proofErr w:type="spellStart"/>
-      <w:r>
-        <w:t>helvetica</w:t>
-      </w:r>
-      <w:proofErr w:type="spellEnd"/>
-      <w:r>
-        <w:t xml:space="preserve"> viral, </w:t>
-      </w:r>
-      <w:proofErr w:type="spellStart"/>
-      <w:r>
-        <w:t>edison</w:t>
-      </w:r>
-      <w:proofErr w:type="spellEnd"/>
-      <w:r>
-        <w:t xml:space="preserve"> bulb </w:t>
-      </w:r>
-      <w:proofErr w:type="spellStart"/>
-      <w:r>
-        <w:t>cliche</w:t>
-      </w:r>
-      <w:proofErr w:type="spellEnd"/>
-      <w:r>
-        <w:t xml:space="preserve"> </w:t>
-      </w:r>
-      <w:proofErr w:type="spellStart"/>
-      <w:r>
-        <w:t>jianbing</w:t>
-      </w:r>
-      <w:proofErr w:type="spellEnd"/>
-      <w:r>
-        <w:t>.</w:t>
+        <w:t>Tournaments can be searched by location, event, or tournament date. This function can be reached by either the “Edit Existing Tournament” button on the New Tournament screen; or by the “Search Tournaments…” button on the Member Scores Screen.</w:t>
       </w:r>
     </w:p>
     <w:p>
@@ -4647,16 +4486,94 @@
       <w:r>
         <w:t xml:space="preserve">Figure </w:t>
       </w:r>
-      <w:fldSimple w:instr=" SEQ Figure \* ARABIC ">
-        <w:r>
-          <w:rPr>
-            <w:noProof/>
-          </w:rPr>
-          <w:t>15</w:t>
-        </w:r>
-      </w:fldSimple>
+      <w:r>
+        <w:fldChar w:fldCharType="begin"/>
+      </w:r>
+      <w:r>
+        <w:instrText xml:space="preserve"> SEQ Figure \* ARABIC </w:instrText>
+      </w:r>
+      <w:r>
+        <w:fldChar w:fldCharType="separate"/>
+      </w:r>
+      <w:r>
+        <w:rPr>
+          <w:noProof/>
+        </w:rPr>
+        <w:t>14</w:t>
+      </w:r>
+      <w:r>
+        <w:rPr>
+          <w:noProof/>
+        </w:rPr>
+        <w:fldChar w:fldCharType="end"/>
+      </w:r>
       <w:r>
         <w:t>: Tournament Search Forms</w:t>
+      </w:r>
+    </w:p>
+    <w:p>
+      <w:pPr>
+        <w:pStyle w:val="Heading3"/>
+      </w:pPr>
+      <w:r>
+        <w:t>Search by Location</w:t>
+      </w:r>
+    </w:p>
+    <w:p>
+      <w:pPr>
+        <w:pStyle w:val="BodyText"/>
+      </w:pPr>
+      <w:r>
+        <w:t>To search a tournament by location</w:t>
+      </w:r>
+      <w:r>
+        <w:t>:</w:t>
+      </w:r>
+      <w:r>
+        <w:t xml:space="preserve"> Fill in the name of the </w:t>
+      </w:r>
+      <w:r>
+        <w:t>bowling center in the Location field. Click “Search”. Choose the tournament. Click “Accept”.</w:t>
+      </w:r>
+    </w:p>
+    <w:p>
+      <w:pPr>
+        <w:pStyle w:val="Heading3"/>
+      </w:pPr>
+      <w:r>
+        <w:t>Search by Event</w:t>
+      </w:r>
+    </w:p>
+    <w:p>
+      <w:pPr>
+        <w:pStyle w:val="BodyText"/>
+      </w:pPr>
+      <w:r>
+        <w:t>To find a tournament by event: Fill in the name of the event in the Event field. Click “Search”. Choose the tournament you need from the displayed list. Click “Accept”.</w:t>
+      </w:r>
+    </w:p>
+    <w:p>
+      <w:pPr>
+        <w:pStyle w:val="Heading3"/>
+      </w:pPr>
+      <w:r>
+        <w:t>Search by Date</w:t>
+      </w:r>
+    </w:p>
+    <w:p>
+      <w:pPr>
+        <w:pStyle w:val="BodyText"/>
+      </w:pPr>
+      <w:r>
+        <w:t xml:space="preserve">To find a tournament by date: Check the Date box. Pick the date range to search with the </w:t>
+      </w:r>
+      <w:proofErr w:type="gramStart"/>
+      <w:r>
+        <w:t>From</w:t>
+      </w:r>
+      <w:proofErr w:type="gramEnd"/>
+      <w:r>
+        <w:t xml:space="preserve"> and To date fields. Click “Search”. Choose the tournament you need from the list. Click “Accept”.</w:t>
       </w:r>
     </w:p>
     <w:p>
@@ -4674,183 +4591,15 @@
         <w:keepNext/>
       </w:pPr>
       <w:r>
-        <w:t xml:space="preserve">Craft beer sartorial copper mug </w:t>
-      </w:r>
-      <w:proofErr w:type="spellStart"/>
-      <w:r>
-        <w:t>tbh</w:t>
-      </w:r>
-      <w:proofErr w:type="spellEnd"/>
-      <w:r>
-        <w:t xml:space="preserve"> </w:t>
-      </w:r>
-      <w:proofErr w:type="spellStart"/>
-      <w:r>
-        <w:t>jianbing</w:t>
-      </w:r>
-      <w:proofErr w:type="spellEnd"/>
-      <w:r>
-        <w:t xml:space="preserve">, locavore VHS salvia +1 vegan gluten-free </w:t>
-      </w:r>
-      <w:proofErr w:type="spellStart"/>
-      <w:r>
-        <w:t>kogi</w:t>
-      </w:r>
-      <w:proofErr w:type="spellEnd"/>
-      <w:r>
-        <w:t xml:space="preserve"> pug </w:t>
-      </w:r>
-      <w:proofErr w:type="spellStart"/>
-      <w:r>
-        <w:t>vexillologist</w:t>
-      </w:r>
-      <w:proofErr w:type="spellEnd"/>
-      <w:r>
-        <w:t xml:space="preserve"> </w:t>
-      </w:r>
-      <w:proofErr w:type="spellStart"/>
-      <w:r>
-        <w:t>affogato</w:t>
-      </w:r>
-      <w:proofErr w:type="spellEnd"/>
-      <w:r>
-        <w:t xml:space="preserve">. Fanny pack </w:t>
-      </w:r>
-      <w:proofErr w:type="spellStart"/>
-      <w:r>
-        <w:t>palo</w:t>
-      </w:r>
-      <w:proofErr w:type="spellEnd"/>
-      <w:r>
-        <w:t xml:space="preserve"> </w:t>
-      </w:r>
-      <w:proofErr w:type="spellStart"/>
-      <w:r>
-        <w:t>santo</w:t>
-      </w:r>
-      <w:proofErr w:type="spellEnd"/>
-      <w:r>
-        <w:t xml:space="preserve"> </w:t>
-      </w:r>
-      <w:proofErr w:type="spellStart"/>
-      <w:r>
-        <w:t>proident</w:t>
-      </w:r>
-      <w:proofErr w:type="spellEnd"/>
-      <w:r>
-        <w:t xml:space="preserve"> blog bespoke </w:t>
-      </w:r>
-      <w:proofErr w:type="spellStart"/>
-      <w:r>
-        <w:t>commodo</w:t>
-      </w:r>
-      <w:proofErr w:type="spellEnd"/>
-      <w:r>
-        <w:t xml:space="preserve"> tilde hammock </w:t>
-      </w:r>
-      <w:proofErr w:type="spellStart"/>
-      <w:r>
-        <w:t>taiyaki</w:t>
-      </w:r>
-      <w:proofErr w:type="spellEnd"/>
-      <w:r>
-        <w:t xml:space="preserve"> wayfarers gentrify. Cardigan ugh slow-carb, </w:t>
-      </w:r>
-      <w:proofErr w:type="spellStart"/>
-      <w:r>
-        <w:t>ea</w:t>
-      </w:r>
-      <w:proofErr w:type="spellEnd"/>
-      <w:r>
-        <w:t xml:space="preserve"> DIY hot chicken </w:t>
-      </w:r>
-      <w:proofErr w:type="spellStart"/>
-      <w:r>
-        <w:t>commodo</w:t>
-      </w:r>
-      <w:proofErr w:type="spellEnd"/>
-      <w:r>
-        <w:t xml:space="preserve"> </w:t>
-      </w:r>
-      <w:proofErr w:type="spellStart"/>
-      <w:r>
-        <w:t>godard</w:t>
-      </w:r>
-      <w:proofErr w:type="spellEnd"/>
-      <w:r>
-        <w:t xml:space="preserve">. Lorem </w:t>
-      </w:r>
-      <w:proofErr w:type="spellStart"/>
-      <w:r>
-        <w:t>sint</w:t>
-      </w:r>
-      <w:proofErr w:type="spellEnd"/>
-      <w:r>
-        <w:t xml:space="preserve"> qui 3 wolf moon </w:t>
-      </w:r>
-      <w:proofErr w:type="spellStart"/>
-      <w:r>
-        <w:t>enim</w:t>
-      </w:r>
-      <w:proofErr w:type="spellEnd"/>
-      <w:r>
-        <w:t xml:space="preserve"> </w:t>
-      </w:r>
-      <w:proofErr w:type="spellStart"/>
-      <w:r>
-        <w:t>voluptate</w:t>
-      </w:r>
-      <w:proofErr w:type="spellEnd"/>
-      <w:r>
-        <w:t xml:space="preserve">, </w:t>
-      </w:r>
-      <w:proofErr w:type="spellStart"/>
-      <w:r>
-        <w:t>velit</w:t>
-      </w:r>
-      <w:proofErr w:type="spellEnd"/>
-      <w:r>
-        <w:t xml:space="preserve"> </w:t>
-      </w:r>
-      <w:proofErr w:type="spellStart"/>
-      <w:r>
-        <w:t>veniam</w:t>
-      </w:r>
-      <w:proofErr w:type="spellEnd"/>
-      <w:r>
-        <w:t xml:space="preserve">. Fanny pack man bun </w:t>
-      </w:r>
-      <w:proofErr w:type="spellStart"/>
-      <w:r>
-        <w:t>helvetica</w:t>
-      </w:r>
-      <w:proofErr w:type="spellEnd"/>
-      <w:r>
-        <w:t xml:space="preserve"> viral, </w:t>
-      </w:r>
-      <w:proofErr w:type="spellStart"/>
-      <w:r>
-        <w:t>edison</w:t>
-      </w:r>
-      <w:proofErr w:type="spellEnd"/>
-      <w:r>
-        <w:t xml:space="preserve"> bulb </w:t>
-      </w:r>
-      <w:proofErr w:type="spellStart"/>
-      <w:r>
-        <w:t>cliche</w:t>
-      </w:r>
-      <w:proofErr w:type="spellEnd"/>
-      <w:r>
-        <w:t xml:space="preserve"> </w:t>
-      </w:r>
-      <w:proofErr w:type="spellStart"/>
-      <w:r>
-        <w:t>jianbing</w:t>
-      </w:r>
-      <w:proofErr w:type="spellEnd"/>
-      <w:r>
-        <w:t>.</w:t>
+        <w:t xml:space="preserve">The “List Tournaments </w:t>
+      </w:r>
+      <w:proofErr w:type="gramStart"/>
+      <w:r>
+        <w:t>By</w:t>
+      </w:r>
+      <w:proofErr w:type="gramEnd"/>
+      <w:r>
+        <w:t xml:space="preserve"> Year” button displays the Tournaments by Year screen. Choose a year from the drop down menu. The tournaments from that year will be displayed.</w:t>
       </w:r>
     </w:p>
     <w:p>
@@ -4864,7 +4613,7 @@
         </w:rPr>
         <w:drawing>
           <wp:inline distT="0" distB="0" distL="0" distR="0">
-            <wp:extent cx="4883150" cy="3150870"/>
+            <wp:extent cx="2420909" cy="1562100"/>
             <wp:effectExtent l="0" t="0" r="0" b="0"/>
             <wp:docPr id="1" name="Picture 1"/>
             <wp:cNvGraphicFramePr>
@@ -4878,7 +4627,7 @@
                     <pic:cNvPicPr/>
                   </pic:nvPicPr>
                   <pic:blipFill>
-                    <a:blip r:embed="rId29">
+                    <a:blip r:embed="rId29" cstate="print">
                       <a:extLst>
                         <a:ext uri="{28A0092B-C50C-407E-A947-70E740481C1C}">
                           <a14:useLocalDpi xmlns:a14="http://schemas.microsoft.com/office/drawing/2010/main" val="0"/>
@@ -4892,7 +4641,7 @@
                   <pic:spPr>
                     <a:xfrm>
                       <a:off x="0" y="0"/>
-                      <a:ext cx="4883150" cy="3150870"/>
+                      <a:ext cx="2442884" cy="1576279"/>
                     </a:xfrm>
                     <a:prstGeom prst="rect">
                       <a:avLst/>
@@ -4904,6 +4653,59 @@
           </wp:inline>
         </w:drawing>
       </w:r>
+      <w:r>
+        <w:rPr>
+          <w:noProof/>
+        </w:rPr>
+        <w:drawing>
+          <wp:inline distT="0" distB="0" distL="0" distR="0">
+            <wp:extent cx="2420620" cy="1561843"/>
+            <wp:effectExtent l="0" t="0" r="0" b="635"/>
+            <wp:docPr id="25" name="Picture 25" descr="F:\cptc\2018-Winter\cpw205\UserManual9tapTour\9tapScreenShots\TournamentsByYear.PNG"/>
+            <wp:cNvGraphicFramePr>
+              <a:graphicFrameLocks xmlns:a="http://schemas.openxmlformats.org/drawingml/2006/main" noChangeAspect="1"/>
+            </wp:cNvGraphicFramePr>
+            <a:graphic xmlns:a="http://schemas.openxmlformats.org/drawingml/2006/main">
+              <a:graphicData uri="http://schemas.openxmlformats.org/drawingml/2006/picture">
+                <pic:pic xmlns:pic="http://schemas.openxmlformats.org/drawingml/2006/picture">
+                  <pic:nvPicPr>
+                    <pic:cNvPr id="0" name="Picture 1" descr="F:\cptc\2018-Winter\cpw205\UserManual9tapTour\9tapScreenShots\TournamentsByYear.PNG"/>
+                    <pic:cNvPicPr>
+                      <a:picLocks noChangeAspect="1" noChangeArrowheads="1"/>
+                    </pic:cNvPicPr>
+                  </pic:nvPicPr>
+                  <pic:blipFill>
+                    <a:blip r:embed="rId30" cstate="print">
+                      <a:extLst>
+                        <a:ext uri="{28A0092B-C50C-407E-A947-70E740481C1C}">
+                          <a14:useLocalDpi xmlns:a14="http://schemas.microsoft.com/office/drawing/2010/main" val="0"/>
+                        </a:ext>
+                      </a:extLst>
+                    </a:blip>
+                    <a:srcRect/>
+                    <a:stretch>
+                      <a:fillRect/>
+                    </a:stretch>
+                  </pic:blipFill>
+                  <pic:spPr bwMode="auto">
+                    <a:xfrm>
+                      <a:off x="0" y="0"/>
+                      <a:ext cx="2438294" cy="1573247"/>
+                    </a:xfrm>
+                    <a:prstGeom prst="rect">
+                      <a:avLst/>
+                    </a:prstGeom>
+                    <a:noFill/>
+                    <a:ln>
+                      <a:noFill/>
+                    </a:ln>
+                  </pic:spPr>
+                </pic:pic>
+              </a:graphicData>
+            </a:graphic>
+          </wp:inline>
+        </w:drawing>
+      </w:r>
     </w:p>
     <w:p>
       <w:pPr>
@@ -4913,6 +4715,109 @@
       <w:r>
         <w:t xml:space="preserve">Figure </w:t>
       </w:r>
+      <w:r>
+        <w:fldChar w:fldCharType="begin"/>
+      </w:r>
+      <w:r>
+        <w:instrText xml:space="preserve"> SEQ Figure \* ARABIC </w:instrText>
+      </w:r>
+      <w:r>
+        <w:fldChar w:fldCharType="separate"/>
+      </w:r>
+      <w:r>
+        <w:rPr>
+          <w:noProof/>
+        </w:rPr>
+        <w:t>15</w:t>
+      </w:r>
+      <w:r>
+        <w:rPr>
+          <w:noProof/>
+        </w:rPr>
+        <w:fldChar w:fldCharType="end"/>
+      </w:r>
+      <w:r>
+        <w:t>: Tournaments by Year</w:t>
+      </w:r>
+    </w:p>
+    <w:p>
+      <w:pPr>
+        <w:pStyle w:val="Heading2"/>
+      </w:pPr>
+      <w:r>
+        <w:t>Reports</w:t>
+      </w:r>
+    </w:p>
+    <w:p>
+      <w:pPr>
+        <w:pStyle w:val="BodyText"/>
+        <w:keepNext/>
+      </w:pPr>
+      <w:r>
+        <w:t xml:space="preserve">With the member scores reports, you can print or save to pdf member placing information. Depending on </w:t>
+      </w:r>
+    </w:p>
+    <w:p>
+      <w:pPr>
+        <w:pStyle w:val="BodyText"/>
+        <w:keepNext/>
+        <w:jc w:val="center"/>
+      </w:pPr>
+      <w:r>
+        <w:rPr>
+          <w:noProof/>
+        </w:rPr>
+        <w:drawing>
+          <wp:inline distT="0" distB="0" distL="0" distR="0">
+            <wp:extent cx="2171700" cy="2178892"/>
+            <wp:effectExtent l="0" t="0" r="0" b="0"/>
+            <wp:docPr id="26" name="Picture 26"/>
+            <wp:cNvGraphicFramePr>
+              <a:graphicFrameLocks xmlns:a="http://schemas.openxmlformats.org/drawingml/2006/main" noChangeAspect="1"/>
+            </wp:cNvGraphicFramePr>
+            <a:graphic xmlns:a="http://schemas.openxmlformats.org/drawingml/2006/main">
+              <a:graphicData uri="http://schemas.openxmlformats.org/drawingml/2006/picture">
+                <pic:pic xmlns:pic="http://schemas.openxmlformats.org/drawingml/2006/picture">
+                  <pic:nvPicPr>
+                    <pic:cNvPr id="26" name="MemberScoresReports.PNG"/>
+                    <pic:cNvPicPr/>
+                  </pic:nvPicPr>
+                  <pic:blipFill>
+                    <a:blip r:embed="rId31">
+                      <a:extLst>
+                        <a:ext uri="{28A0092B-C50C-407E-A947-70E740481C1C}">
+                          <a14:useLocalDpi xmlns:a14="http://schemas.microsoft.com/office/drawing/2010/main" val="0"/>
+                        </a:ext>
+                      </a:extLst>
+                    </a:blip>
+                    <a:stretch>
+                      <a:fillRect/>
+                    </a:stretch>
+                  </pic:blipFill>
+                  <pic:spPr>
+                    <a:xfrm>
+                      <a:off x="0" y="0"/>
+                      <a:ext cx="2199760" cy="2207045"/>
+                    </a:xfrm>
+                    <a:prstGeom prst="rect">
+                      <a:avLst/>
+                    </a:prstGeom>
+                  </pic:spPr>
+                </pic:pic>
+              </a:graphicData>
+            </a:graphic>
+          </wp:inline>
+        </w:drawing>
+      </w:r>
+    </w:p>
+    <w:p>
+      <w:pPr>
+        <w:pStyle w:val="Caption"/>
+        <w:jc w:val="center"/>
+      </w:pPr>
+      <w:r>
+        <w:t xml:space="preserve">Figure </w:t>
+      </w:r>
       <w:fldSimple w:instr=" SEQ Figure \* ARABIC ">
         <w:r>
           <w:rPr>
@@ -4922,212 +4827,7 @@
         </w:r>
       </w:fldSimple>
       <w:r>
-        <w:t>: Tournaments by Year</w:t>
-      </w:r>
-    </w:p>
-    <w:p>
-      <w:pPr>
-        <w:pStyle w:val="Heading2"/>
-      </w:pPr>
-      <w:r>
-        <w:t>Reports</w:t>
-      </w:r>
-    </w:p>
-    <w:p>
-      <w:pPr>
-        <w:pStyle w:val="BodyText"/>
-        <w:keepNext/>
-      </w:pPr>
-      <w:r>
-        <w:t xml:space="preserve">Craft beer sartorial copper mug </w:t>
-      </w:r>
-      <w:proofErr w:type="spellStart"/>
-      <w:r>
-        <w:t>tbh</w:t>
-      </w:r>
-      <w:proofErr w:type="spellEnd"/>
-      <w:r>
-        <w:t xml:space="preserve"> </w:t>
-      </w:r>
-      <w:proofErr w:type="spellStart"/>
-      <w:r>
-        <w:t>jianbing</w:t>
-      </w:r>
-      <w:proofErr w:type="spellEnd"/>
-      <w:r>
-        <w:t xml:space="preserve">, locavore VHS salvia +1 vegan gluten-free </w:t>
-      </w:r>
-      <w:proofErr w:type="spellStart"/>
-      <w:r>
-        <w:t>kogi</w:t>
-      </w:r>
-      <w:proofErr w:type="spellEnd"/>
-      <w:r>
-        <w:t xml:space="preserve"> pug </w:t>
-      </w:r>
-      <w:proofErr w:type="spellStart"/>
-      <w:r>
-        <w:t>vexillologist</w:t>
-      </w:r>
-      <w:proofErr w:type="spellEnd"/>
-      <w:r>
-        <w:t xml:space="preserve"> </w:t>
-      </w:r>
-      <w:proofErr w:type="spellStart"/>
-      <w:r>
-        <w:t>affogato</w:t>
-      </w:r>
-      <w:proofErr w:type="spellEnd"/>
-      <w:r>
-        <w:t xml:space="preserve">. Fanny pack </w:t>
-      </w:r>
-      <w:proofErr w:type="spellStart"/>
-      <w:r>
-        <w:t>palo</w:t>
-      </w:r>
-      <w:proofErr w:type="spellEnd"/>
-      <w:r>
-        <w:t xml:space="preserve"> </w:t>
-      </w:r>
-      <w:proofErr w:type="spellStart"/>
-      <w:r>
-        <w:t>santo</w:t>
-      </w:r>
-      <w:proofErr w:type="spellEnd"/>
-      <w:r>
-        <w:t xml:space="preserve"> </w:t>
-      </w:r>
-      <w:proofErr w:type="spellStart"/>
-      <w:r>
-        <w:t>proident</w:t>
-      </w:r>
-      <w:proofErr w:type="spellEnd"/>
-      <w:r>
-        <w:t xml:space="preserve"> blog bespoke </w:t>
-      </w:r>
-      <w:proofErr w:type="spellStart"/>
-      <w:r>
-        <w:t>commodo</w:t>
-      </w:r>
-      <w:proofErr w:type="spellEnd"/>
-      <w:r>
-        <w:t xml:space="preserve"> tilde hammock </w:t>
-      </w:r>
-      <w:proofErr w:type="spellStart"/>
-      <w:r>
-        <w:t>taiyaki</w:t>
-      </w:r>
-      <w:proofErr w:type="spellEnd"/>
-      <w:r>
-        <w:t xml:space="preserve"> wayfarers gentrify. Cardigan ugh slow-carb, </w:t>
-      </w:r>
-      <w:proofErr w:type="spellStart"/>
-      <w:r>
-        <w:t>ea</w:t>
-      </w:r>
-      <w:proofErr w:type="spellEnd"/>
-      <w:r>
-        <w:t xml:space="preserve"> DIY hot chicken </w:t>
-      </w:r>
-      <w:proofErr w:type="spellStart"/>
-      <w:r>
-        <w:t>commodo</w:t>
-      </w:r>
-      <w:proofErr w:type="spellEnd"/>
-      <w:r>
-        <w:t xml:space="preserve"> </w:t>
-      </w:r>
-      <w:proofErr w:type="spellStart"/>
-      <w:r>
-        <w:t>godard</w:t>
-      </w:r>
-      <w:proofErr w:type="spellEnd"/>
-      <w:r>
-        <w:t xml:space="preserve">. Lorem </w:t>
-      </w:r>
-      <w:proofErr w:type="spellStart"/>
-      <w:r>
-        <w:t>sint</w:t>
-      </w:r>
-      <w:proofErr w:type="spellEnd"/>
-      <w:r>
-        <w:t xml:space="preserve"> qui 3 wolf moon </w:t>
-      </w:r>
-      <w:proofErr w:type="spellStart"/>
-      <w:r>
-        <w:t>enim</w:t>
-      </w:r>
-      <w:proofErr w:type="spellEnd"/>
-      <w:r>
-        <w:t xml:space="preserve"> </w:t>
-      </w:r>
-      <w:proofErr w:type="spellStart"/>
-      <w:r>
-        <w:t>voluptate</w:t>
-      </w:r>
-      <w:proofErr w:type="spellEnd"/>
-      <w:r>
-        <w:t xml:space="preserve">, </w:t>
-      </w:r>
-      <w:proofErr w:type="spellStart"/>
-      <w:r>
-        <w:t>velit</w:t>
-      </w:r>
-      <w:proofErr w:type="spellEnd"/>
-      <w:r>
-        <w:t xml:space="preserve"> </w:t>
-      </w:r>
-      <w:proofErr w:type="spellStart"/>
-      <w:r>
-        <w:t>veniam</w:t>
-      </w:r>
-      <w:proofErr w:type="spellEnd"/>
-      <w:r>
-        <w:t xml:space="preserve">. Fanny pack man bun </w:t>
-      </w:r>
-      <w:proofErr w:type="spellStart"/>
-      <w:r>
-        <w:t>helvetica</w:t>
-      </w:r>
-      <w:proofErr w:type="spellEnd"/>
-      <w:r>
-        <w:t xml:space="preserve"> viral, </w:t>
-      </w:r>
-      <w:proofErr w:type="spellStart"/>
-      <w:r>
-        <w:t>edison</w:t>
-      </w:r>
-      <w:proofErr w:type="spellEnd"/>
-      <w:r>
-        <w:t xml:space="preserve"> bulb </w:t>
-      </w:r>
-      <w:proofErr w:type="spellStart"/>
-      <w:r>
-        <w:t>cliche</w:t>
-      </w:r>
-      <w:proofErr w:type="spellEnd"/>
-      <w:r>
-        <w:t xml:space="preserve"> </w:t>
-      </w:r>
-      <w:proofErr w:type="spellStart"/>
-      <w:r>
-        <w:t>jianbing</w:t>
-      </w:r>
-      <w:proofErr w:type="spellEnd"/>
-      <w:r>
-        <w:t>.</w:t>
-      </w:r>
-    </w:p>
-    <w:p>
-      <w:pPr>
-        <w:pStyle w:val="BodyText"/>
-        <w:jc w:val="center"/>
-      </w:pPr>
-      <w:r>
-        <w:t>Screenshot of</w:t>
-      </w:r>
-      <w:r>
-        <w:t xml:space="preserve"> Reports dialog</w:t>
+        <w:t xml:space="preserve"> Member Scores Reports screen</w:t>
       </w:r>
     </w:p>
     <w:p>
@@ -5387,7 +5087,7 @@
                     <pic:cNvPicPr/>
                   </pic:nvPicPr>
                   <pic:blipFill>
-                    <a:blip r:embed="rId30">
+                    <a:blip r:embed="rId32">
                       <a:extLst>
                         <a:ext uri="{28A0092B-C50C-407E-A947-70E740481C1C}">
                           <a14:useLocalDpi xmlns:a14="http://schemas.microsoft.com/office/drawing/2010/main" val="0"/>
@@ -5422,27 +5122,14 @@
       <w:r>
         <w:t xml:space="preserve">Figure </w:t>
       </w:r>
-      <w:r>
-        <w:fldChar w:fldCharType="begin"/>
-      </w:r>
-      <w:r>
-        <w:instrText xml:space="preserve"> SEQ Figure \* ARABIC </w:instrText>
-      </w:r>
-      <w:r>
-        <w:fldChar w:fldCharType="separate"/>
-      </w:r>
-      <w:r>
-        <w:rPr>
-          <w:noProof/>
-        </w:rPr>
-        <w:t>17</w:t>
-      </w:r>
-      <w:r>
-        <w:rPr>
-          <w:noProof/>
-        </w:rPr>
-        <w:fldChar w:fldCharType="end"/>
-      </w:r>
+      <w:fldSimple w:instr=" SEQ Figure \* ARABIC ">
+        <w:r>
+          <w:rPr>
+            <w:noProof/>
+          </w:rPr>
+          <w:t>17</w:t>
+        </w:r>
+      </w:fldSimple>
       <w:r>
         <w:t>: Update Inactive status</w:t>
       </w:r>
@@ -5576,58 +5263,156 @@
     <w:p>
       <w:pPr>
         <w:pStyle w:val="Heading2"/>
+      </w:pPr>
+      <w:r>
+        <w:t>Screen “splitting”</w:t>
+      </w:r>
+      <w:r>
+        <w:t xml:space="preserve"> on resize</w:t>
+      </w:r>
+    </w:p>
+    <w:p>
+      <w:pPr>
+        <w:pStyle w:val="BodyText"/>
+        <w:keepNext/>
+      </w:pPr>
+      <w:r>
+        <w:t xml:space="preserve">When resizing </w:t>
+      </w:r>
+      <w:r>
+        <w:t>the 9-Tap program the screen may split into individual screens contained within the main program display screen</w:t>
+      </w:r>
+      <w:r>
+        <w:t>.</w:t>
+      </w:r>
+    </w:p>
+    <w:p>
+      <w:pPr>
+        <w:pStyle w:val="BodyText"/>
+        <w:keepNext/>
+      </w:pPr>
+      <w:r>
+        <w:rPr>
+          <w:noProof/>
+        </w:rPr>
+        <w:drawing>
+          <wp:inline distT="0" distB="0" distL="0" distR="0">
+            <wp:extent cx="4883150" cy="3818890"/>
+            <wp:effectExtent l="0" t="0" r="0" b="0"/>
+            <wp:docPr id="22" name="Picture 22"/>
+            <wp:cNvGraphicFramePr>
+              <a:graphicFrameLocks xmlns:a="http://schemas.openxmlformats.org/drawingml/2006/main" noChangeAspect="1"/>
+            </wp:cNvGraphicFramePr>
+            <a:graphic xmlns:a="http://schemas.openxmlformats.org/drawingml/2006/main">
+              <a:graphicData uri="http://schemas.openxmlformats.org/drawingml/2006/picture">
+                <pic:pic xmlns:pic="http://schemas.openxmlformats.org/drawingml/2006/picture">
+                  <pic:nvPicPr>
+                    <pic:cNvPr id="22" name="ScreenSplitsOnResize.PNG"/>
+                    <pic:cNvPicPr/>
+                  </pic:nvPicPr>
+                  <pic:blipFill>
+                    <a:blip r:embed="rId33">
+                      <a:extLst>
+                        <a:ext uri="{28A0092B-C50C-407E-A947-70E740481C1C}">
+                          <a14:useLocalDpi xmlns:a14="http://schemas.microsoft.com/office/drawing/2010/main" val="0"/>
+                        </a:ext>
+                      </a:extLst>
+                    </a:blip>
+                    <a:stretch>
+                      <a:fillRect/>
+                    </a:stretch>
+                  </pic:blipFill>
+                  <pic:spPr>
+                    <a:xfrm>
+                      <a:off x="0" y="0"/>
+                      <a:ext cx="4883150" cy="3818890"/>
+                    </a:xfrm>
+                    <a:prstGeom prst="rect">
+                      <a:avLst/>
+                    </a:prstGeom>
+                  </pic:spPr>
+                </pic:pic>
+              </a:graphicData>
+            </a:graphic>
+          </wp:inline>
+        </w:drawing>
+      </w:r>
+    </w:p>
+    <w:p>
+      <w:pPr>
+        <w:pStyle w:val="BodyText"/>
+        <w:keepNext/>
+      </w:pPr>
+    </w:p>
+    <w:p>
+      <w:pPr>
+        <w:pStyle w:val="BodyText"/>
+      </w:pPr>
+      <w:r>
+        <w:rPr>
+          <w:noProof/>
+        </w:rPr>
+        <w:drawing>
+          <wp:anchor distT="0" distB="0" distL="114300" distR="114300" simplePos="0" relativeHeight="251665408" behindDoc="0" locked="0" layoutInCell="1" allowOverlap="1">
+            <wp:simplePos x="0" y="0"/>
+            <wp:positionH relativeFrom="column">
+              <wp:posOffset>3175</wp:posOffset>
+            </wp:positionH>
+            <wp:positionV relativeFrom="paragraph">
+              <wp:posOffset>5715</wp:posOffset>
+            </wp:positionV>
+            <wp:extent cx="1962424" cy="1190791"/>
+            <wp:effectExtent l="0" t="0" r="0" b="9525"/>
+            <wp:wrapSquare wrapText="bothSides"/>
+            <wp:docPr id="23" name="Picture 23"/>
+            <wp:cNvGraphicFramePr>
+              <a:graphicFrameLocks xmlns:a="http://schemas.openxmlformats.org/drawingml/2006/main" noChangeAspect="1"/>
+            </wp:cNvGraphicFramePr>
+            <a:graphic xmlns:a="http://schemas.openxmlformats.org/drawingml/2006/main">
+              <a:graphicData uri="http://schemas.openxmlformats.org/drawingml/2006/picture">
+                <pic:pic xmlns:pic="http://schemas.openxmlformats.org/drawingml/2006/picture">
+                  <pic:nvPicPr>
+                    <pic:cNvPr id="23" name="ScreenSplitCloseUp.PNG"/>
+                    <pic:cNvPicPr/>
+                  </pic:nvPicPr>
+                  <pic:blipFill>
+                    <a:blip r:embed="rId34">
+                      <a:extLst>
+                        <a:ext uri="{28A0092B-C50C-407E-A947-70E740481C1C}">
+                          <a14:useLocalDpi xmlns:a14="http://schemas.microsoft.com/office/drawing/2010/main" val="0"/>
+                        </a:ext>
+                      </a:extLst>
+                    </a:blip>
+                    <a:stretch>
+                      <a:fillRect/>
+                    </a:stretch>
+                  </pic:blipFill>
+                  <pic:spPr>
+                    <a:xfrm>
+                      <a:off x="0" y="0"/>
+                      <a:ext cx="1962424" cy="1190791"/>
+                    </a:xfrm>
+                    <a:prstGeom prst="rect">
+                      <a:avLst/>
+                    </a:prstGeom>
+                  </pic:spPr>
+                </pic:pic>
+              </a:graphicData>
+            </a:graphic>
+          </wp:anchor>
+        </w:drawing>
+      </w:r>
+      <w:r>
+        <w:t>If the display splits, you can click maximize for the individual screens. They will return to normal. You can then continue working with the program.</w:t>
+      </w:r>
+    </w:p>
+    <w:p>
+      <w:pPr>
+        <w:pStyle w:val="Heading2"/>
         <w:rPr>
           <w:sz w:val="24"/>
           <w:szCs w:val="24"/>
         </w:rPr>
-      </w:pPr>
-      <w:r>
-        <w:rPr>
-          <w:sz w:val="24"/>
-          <w:szCs w:val="24"/>
-        </w:rPr>
-        <w:t>ReadMe File</w:t>
-      </w:r>
-    </w:p>
-    <w:p>
-      <w:pPr>
-        <w:pStyle w:val="BodyText"/>
-      </w:pPr>
-      <w:r>
-        <w:t>The 9 Tap Tour program contains a ReadMe file where you can view updated program information. We strongly encourage you to take the t</w:t>
-      </w:r>
-      <w:r>
-        <w:t>ime</w:t>
-      </w:r>
-      <w:r>
-        <w:t xml:space="preserve"> look over this file to get information on changes made after this manual went to print.</w:t>
-      </w:r>
-    </w:p>
-    <w:p>
-      <w:pPr>
-        <w:pStyle w:val="BodyText"/>
-      </w:pPr>
-      <w:r>
-        <w:t>To view this file, double-click on it in the 9 Tap Tour directory found on your hard drive (usually C:\Program Files\9TapTour\docs\readme_en.txt). You can also view the ReadMe file by clicking on the Start button on your Windows taskbar, then on Programs, then on 9 Tap Tour, then on View Readme.txt.</w:t>
-      </w:r>
-    </w:p>
-    <w:p>
-      <w:pPr>
-        <w:rPr>
-          <w:rFonts w:ascii="Arial Black" w:hAnsi="Arial Black"/>
-          <w:color w:val="808080"/>
-          <w:spacing w:val="-25"/>
-          <w:kern w:val="28"/>
-          <w:sz w:val="32"/>
-        </w:rPr>
-      </w:pPr>
-      <w:r>
-        <w:br w:type="page"/>
-      </w:r>
-    </w:p>
-    <w:p>
-      <w:pPr>
-        <w:pStyle w:val="Heading1"/>
         <w:sectPr>
           <w:type w:val="continuous"/>
           <w:pgSz w:w="12240" w:h="15840" w:code="1"/>
@@ -5636,6 +5421,59 @@
           <w:titlePg/>
         </w:sectPr>
       </w:pPr>
+    </w:p>
+    <w:p>
+      <w:pPr>
+        <w:pStyle w:val="Heading2"/>
+        <w:rPr>
+          <w:sz w:val="24"/>
+          <w:szCs w:val="24"/>
+        </w:rPr>
+      </w:pPr>
+      <w:r>
+        <w:rPr>
+          <w:sz w:val="24"/>
+          <w:szCs w:val="24"/>
+        </w:rPr>
+        <w:lastRenderedPageBreak/>
+        <w:t>ReadMe File</w:t>
+      </w:r>
+    </w:p>
+    <w:p>
+      <w:pPr>
+        <w:pStyle w:val="BodyText"/>
+      </w:pPr>
+      <w:r>
+        <w:t>The 9 Tap Tour program contains a ReadMe file where you can view updated program information. We strongly encourage you to take the t</w:t>
+      </w:r>
+      <w:r>
+        <w:t>ime</w:t>
+      </w:r>
+      <w:r>
+        <w:t xml:space="preserve"> look over this file to get information on changes made after this manual went to print.</w:t>
+      </w:r>
+    </w:p>
+    <w:p>
+      <w:pPr>
+        <w:pStyle w:val="BodyText"/>
+      </w:pPr>
+      <w:r>
+        <w:t>To view this file, double-click on it in the 9 Tap Tour directory found on your hard drive (usually C:\Program Files\9TapTour\docs\readme_en.txt). You can also view the ReadMe file by clicking on the Start button on your Windows taskbar, then on Programs, then on 9 Tap Tour, then on View Readme.txt.</w:t>
+      </w:r>
+    </w:p>
+    <w:p>
+      <w:pPr>
+        <w:rPr>
+          <w:rFonts w:ascii="Arial Black" w:hAnsi="Arial Black"/>
+          <w:color w:val="808080"/>
+          <w:spacing w:val="-25"/>
+          <w:kern w:val="28"/>
+          <w:sz w:val="32"/>
+        </w:rPr>
+      </w:pPr>
+      <w:r>
+        <w:br w:type="page"/>
+      </w:r>
     </w:p>
     <w:p>
       <w:pPr>
@@ -5680,6 +5518,93 @@
         <w:pStyle w:val="Title"/>
       </w:pPr>
       <w:r>
+        <w:t>Conversion Program</w:t>
+      </w:r>
+    </w:p>
+    <w:p>
+      <w:pPr>
+        <w:pStyle w:val="Caption"/>
+      </w:pPr>
+      <w:r>
+        <w:br w:type="page"/>
+      </w:r>
+    </w:p>
+    <w:p>
+      <w:pPr>
+        <w:pStyle w:val="Heading1"/>
+      </w:pPr>
+      <w:r>
+        <w:lastRenderedPageBreak/>
+        <w:t>Converting</w:t>
+      </w:r>
+    </w:p>
+    <w:p>
+      <w:pPr>
+        <w:pStyle w:val="BodyText"/>
+      </w:pPr>
+      <w:r>
+        <w:t>Conversion fr</w:t>
+      </w:r>
+      <w:r>
+        <w:t>om old version of 9-Tap program for the Las Vegas and Hawaii regions. (Talk to Xavier to get outline/details of the steps</w:t>
+      </w:r>
+      <w:r>
+        <w:t>. Have emailed him 3/14/18</w:t>
+      </w:r>
+      <w:bookmarkStart w:id="0" w:name="_GoBack"/>
+      <w:bookmarkEnd w:id="0"/>
+      <w:r>
+        <w:t>)</w:t>
+      </w:r>
+    </w:p>
+    <w:p>
+      <w:pPr>
+        <w:pStyle w:val="BodyText"/>
+      </w:pPr>
+    </w:p>
+    <w:p>
+      <w:pPr>
+        <w:pStyle w:val="PartTitle"/>
+        <w:framePr w:wrap="notBeside"/>
+      </w:pPr>
+      <w:r>
+        <w:lastRenderedPageBreak/>
+        <w:t>Chapter</w:t>
+      </w:r>
+    </w:p>
+    <w:p>
+      <w:pPr>
+        <w:pStyle w:val="PartLabel"/>
+        <w:framePr w:wrap="notBeside"/>
+      </w:pPr>
+      <w:r>
+        <w:t>6</w:t>
+      </w:r>
+    </w:p>
+    <w:p/>
+    <w:p/>
+    <w:p/>
+    <w:p/>
+    <w:p/>
+    <w:p/>
+    <w:p/>
+    <w:p/>
+    <w:p/>
+    <w:p/>
+    <w:p/>
+    <w:p>
+      <w:pPr>
+        <w:pStyle w:val="Subtitle"/>
+      </w:pPr>
+      <w:r>
+        <w:t>9-tap tour</w:t>
+      </w:r>
+    </w:p>
+    <w:p>
+      <w:pPr>
+        <w:pStyle w:val="Title"/>
+      </w:pPr>
+      <w:r>
         <w:t>General Information</w:t>
       </w:r>
     </w:p>
@@ -5704,7 +5629,6 @@
       <w:pPr>
         <w:pStyle w:val="Heading1"/>
         <w:sectPr>
-          <w:type w:val="continuous"/>
           <w:pgSz w:w="12240" w:h="15840" w:code="1"/>
           <w:pgMar w:top="1800" w:right="1195" w:bottom="1440" w:left="3355" w:header="965" w:footer="965" w:gutter="0"/>
           <w:cols w:space="360"/>
@@ -5948,9 +5872,9 @@
           <w:noProof/>
         </w:rPr>
         <w:sectPr>
-          <w:headerReference w:type="default" r:id="rId31"/>
-          <w:footerReference w:type="default" r:id="rId32"/>
-          <w:headerReference w:type="first" r:id="rId33"/>
+          <w:headerReference w:type="default" r:id="rId35"/>
+          <w:footerReference w:type="default" r:id="rId36"/>
+          <w:headerReference w:type="first" r:id="rId37"/>
           <w:type w:val="continuous"/>
           <w:pgSz w:w="12240" w:h="15840" w:code="1"/>
           <w:pgMar w:top="1800" w:right="1195" w:bottom="1440" w:left="3355" w:header="720" w:footer="720" w:gutter="0"/>
@@ -6594,7 +6518,7 @@
         <w:rStyle w:val="PageNumber"/>
         <w:noProof/>
       </w:rPr>
-      <w:t>27</w:t>
+      <w:t>30</w:t>
     </w:r>
     <w:r>
       <w:rPr>
@@ -6644,7 +6568,7 @@
         <w:rStyle w:val="PageNumber"/>
         <w:noProof/>
       </w:rPr>
-      <w:t>28</w:t>
+      <w:t>31</w:t>
     </w:r>
     <w:r>
       <w:rPr>
@@ -9980,7 +9904,7 @@
 </file>
 
 <file path=customXml/itemProps1.xml><?xml version="1.0" encoding="utf-8"?>
-<ds:datastoreItem xmlns:ds="http://schemas.openxmlformats.org/officeDocument/2006/customXml" ds:itemID="{AAD670C0-8032-444E-A1FE-817619F1E3AC}">
+<ds:datastoreItem xmlns:ds="http://schemas.openxmlformats.org/officeDocument/2006/customXml" ds:itemID="{EE652A04-9988-41A7-BF19-616750930BC6}">
   <ds:schemaRefs>
     <ds:schemaRef ds:uri="http://schemas.openxmlformats.org/officeDocument/2006/bibliography"/>
   </ds:schemaRefs>

</xml_diff>

<commit_message>
15 Mar 18 manual update
What I've currently have done on the user manual. Am up to the general information chapter. this is just brief descriptions of the elements of the program.
</commit_message>
<xml_diff>
--- a/9tapUserManual.docx
+++ b/9tapUserManual.docx
@@ -3149,7 +3149,7 @@
                 <w:rStyle w:val="Hyperlink"/>
                 <w:noProof/>
               </w:rPr>
-              <w:t>Using 9 Tap Tour</w:t>
+              <w:t>General Information</w:t>
             </w:r>
             <w:r>
               <w:rPr>
@@ -3171,6 +3171,72 @@
                 <w:webHidden/>
               </w:rPr>
               <w:instrText xml:space="preserve"> PAGEREF _Toc508883031 \h </w:instrText>
+            </w:r>
+            <w:r>
+              <w:rPr>
+                <w:noProof/>
+                <w:webHidden/>
+              </w:rPr>
+            </w:r>
+            <w:r>
+              <w:rPr>
+                <w:noProof/>
+                <w:webHidden/>
+              </w:rPr>
+              <w:fldChar w:fldCharType="separate"/>
+            </w:r>
+            <w:r>
+              <w:rPr>
+                <w:noProof/>
+                <w:webHidden/>
+              </w:rPr>
+              <w:t>30</w:t>
+            </w:r>
+            <w:r>
+              <w:rPr>
+                <w:noProof/>
+                <w:webHidden/>
+              </w:rPr>
+              <w:fldChar w:fldCharType="end"/>
+            </w:r>
+          </w:hyperlink>
+        </w:p>
+        <w:p>
+          <w:pPr>
+            <w:pStyle w:val="TOC2"/>
+            <w:rPr>
+              <w:rStyle w:val="Hyperlink"/>
+              <w:noProof/>
+            </w:rPr>
+          </w:pPr>
+          <w:hyperlink w:anchor="_Toc508883032" w:history="1">
+            <w:r>
+              <w:rPr>
+                <w:rStyle w:val="Hyperlink"/>
+                <w:noProof/>
+              </w:rPr>
+              <w:t>Main Menu</w:t>
+            </w:r>
+            <w:r>
+              <w:rPr>
+                <w:noProof/>
+                <w:webHidden/>
+              </w:rPr>
+              <w:tab/>
+            </w:r>
+            <w:r>
+              <w:rPr>
+                <w:noProof/>
+                <w:webHidden/>
+              </w:rPr>
+              <w:fldChar w:fldCharType="begin"/>
+            </w:r>
+            <w:r>
+              <w:rPr>
+                <w:noProof/>
+                <w:webHidden/>
+              </w:rPr>
+              <w:instrText xml:space="preserve"> PAGEREF _Toc508883032 \h </w:instrText>
             </w:r>
             <w:r>
               <w:rPr>
@@ -3217,7 +3283,7 @@
                 <w:rStyle w:val="Hyperlink"/>
                 <w:noProof/>
               </w:rPr>
-              <w:t>Main Menu</w:t>
+              <w:t>Member Info</w:t>
             </w:r>
             <w:r>
               <w:rPr>
@@ -3258,7 +3324,14 @@
                 <w:noProof/>
                 <w:webHidden/>
               </w:rPr>
-              <w:t>30</w:t>
+              <w:t>3</w:t>
+            </w:r>
+            <w:r>
+              <w:rPr>
+                <w:noProof/>
+                <w:webHidden/>
+              </w:rPr>
+              <w:t>0</w:t>
             </w:r>
             <w:r>
               <w:rPr>
@@ -3271,10 +3344,7 @@
         </w:p>
         <w:p>
           <w:pPr>
-            <w:pStyle w:val="TOC1"/>
-            <w:tabs>
-              <w:tab w:val="right" w:leader="dot" w:pos="7910"/>
-            </w:tabs>
+            <w:pStyle w:val="TOC2"/>
             <w:rPr>
               <w:rFonts w:asciiTheme="minorHAnsi" w:eastAsiaTheme="minorEastAsia" w:hAnsiTheme="minorHAnsi" w:cstheme="minorBidi"/>
               <w:noProof/>
@@ -3282,13 +3352,13 @@
               <w:szCs w:val="22"/>
             </w:rPr>
           </w:pPr>
-          <w:hyperlink w:anchor="_Toc508883033" w:history="1">
+          <w:hyperlink w:anchor="_Toc508883032" w:history="1">
             <w:r>
               <w:rPr>
                 <w:rStyle w:val="Hyperlink"/>
                 <w:noProof/>
               </w:rPr>
-              <w:t>Member Info</w:t>
+              <w:t>Member Scores</w:t>
             </w:r>
             <w:r>
               <w:rPr>
@@ -3309,7 +3379,7 @@
                 <w:noProof/>
                 <w:webHidden/>
               </w:rPr>
-              <w:instrText xml:space="preserve"> PAGEREF _Toc508883033 \h </w:instrText>
+              <w:instrText xml:space="preserve"> PAGEREF _Toc508883032 \h </w:instrText>
             </w:r>
             <w:r>
               <w:rPr>
@@ -3329,7 +3399,89 @@
                 <w:noProof/>
                 <w:webHidden/>
               </w:rPr>
-              <w:t>30</w:t>
+              <w:t>3</w:t>
+            </w:r>
+            <w:r>
+              <w:rPr>
+                <w:noProof/>
+                <w:webHidden/>
+              </w:rPr>
+              <w:t>1</w:t>
+            </w:r>
+            <w:r>
+              <w:rPr>
+                <w:noProof/>
+                <w:webHidden/>
+              </w:rPr>
+              <w:fldChar w:fldCharType="end"/>
+            </w:r>
+          </w:hyperlink>
+        </w:p>
+        <w:p>
+          <w:pPr>
+            <w:pStyle w:val="TOC2"/>
+            <w:rPr>
+              <w:rFonts w:asciiTheme="minorHAnsi" w:eastAsiaTheme="minorEastAsia" w:hAnsiTheme="minorHAnsi" w:cstheme="minorBidi"/>
+              <w:noProof/>
+              <w:sz w:val="22"/>
+              <w:szCs w:val="22"/>
+            </w:rPr>
+          </w:pPr>
+          <w:hyperlink w:anchor="_Toc508883032" w:history="1">
+            <w:r>
+              <w:rPr>
+                <w:rStyle w:val="Hyperlink"/>
+                <w:noProof/>
+              </w:rPr>
+              <w:t>Tools</w:t>
+            </w:r>
+            <w:r>
+              <w:rPr>
+                <w:noProof/>
+                <w:webHidden/>
+              </w:rPr>
+              <w:tab/>
+            </w:r>
+            <w:r>
+              <w:rPr>
+                <w:noProof/>
+                <w:webHidden/>
+              </w:rPr>
+              <w:fldChar w:fldCharType="begin"/>
+            </w:r>
+            <w:r>
+              <w:rPr>
+                <w:noProof/>
+                <w:webHidden/>
+              </w:rPr>
+              <w:instrText xml:space="preserve"> PAGEREF _Toc508883032 \h </w:instrText>
+            </w:r>
+            <w:r>
+              <w:rPr>
+                <w:noProof/>
+                <w:webHidden/>
+              </w:rPr>
+            </w:r>
+            <w:r>
+              <w:rPr>
+                <w:noProof/>
+                <w:webHidden/>
+              </w:rPr>
+              <w:fldChar w:fldCharType="separate"/>
+            </w:r>
+            <w:r>
+              <w:rPr>
+                <w:noProof/>
+                <w:webHidden/>
+              </w:rPr>
+              <w:t>3</w:t>
+            </w:r>
+            <w:r>
+              <w:rPr>
+                <w:noProof/>
+                <w:webHidden/>
+              </w:rPr>
+              <w:t>2</w:t>
             </w:r>
             <w:r>
               <w:rPr>
@@ -3400,8 +3552,17 @@
                 <w:noProof/>
                 <w:webHidden/>
               </w:rPr>
-              <w:t>31</w:t>
-            </w:r>
+              <w:t>3</w:t>
+            </w:r>
+            <w:r>
+              <w:rPr>
+                <w:noProof/>
+                <w:webHidden/>
+              </w:rPr>
+              <w:t>4</w:t>
+            </w:r>
+            <w:bookmarkStart w:id="0" w:name="_GoBack"/>
+            <w:bookmarkEnd w:id="0"/>
             <w:r>
               <w:rPr>
                 <w:noProof/>
@@ -3499,12 +3660,30 @@
       <w:pPr>
         <w:pStyle w:val="Heading1"/>
       </w:pPr>
-      <w:bookmarkStart w:id="0" w:name="_Toc508882988"/>
+      <w:bookmarkStart w:id="1" w:name="_Toc508882988"/>
       <w:r>
         <w:lastRenderedPageBreak/>
-        <w:t>About 9 Tap Tour INC</w:t>
-      </w:r>
-      <w:bookmarkEnd w:id="0"/>
+        <w:t>About</w:t>
+      </w:r>
+      <w:r>
+        <w:fldChar w:fldCharType="begin"/>
+      </w:r>
+      <w:r>
+        <w:instrText xml:space="preserve"> XE "</w:instrText>
+      </w:r>
+      <w:r>
+        <w:instrText>About</w:instrText>
+      </w:r>
+      <w:r>
+        <w:instrText xml:space="preserve">" </w:instrText>
+      </w:r>
+      <w:r>
+        <w:fldChar w:fldCharType="end"/>
+      </w:r>
+      <w:r>
+        <w:t xml:space="preserve"> 9 Tap Tour INC</w:t>
+      </w:r>
+      <w:bookmarkEnd w:id="1"/>
     </w:p>
     <w:p>
       <w:pPr>
@@ -3679,7 +3858,7 @@
           <w:szCs w:val="20"/>
         </w:rPr>
       </w:pPr>
-      <w:bookmarkStart w:id="1" w:name="_Toc508882989"/>
+      <w:bookmarkStart w:id="2" w:name="_Toc508882989"/>
       <w:r>
         <w:rPr>
           <w:szCs w:val="20"/>
@@ -3687,7 +3866,7 @@
         <w:lastRenderedPageBreak/>
         <w:t>Dedication:</w:t>
       </w:r>
-      <w:bookmarkEnd w:id="1"/>
+      <w:bookmarkEnd w:id="2"/>
     </w:p>
     <w:p>
       <w:pPr>
@@ -3722,7 +3901,7 @@
           <w:szCs w:val="40"/>
         </w:rPr>
       </w:pPr>
-      <w:bookmarkStart w:id="2" w:name="_Toc508882990"/>
+      <w:bookmarkStart w:id="3" w:name="_Toc508882990"/>
       <w:r>
         <w:rPr>
           <w:sz w:val="40"/>
@@ -3744,7 +3923,7 @@
         </w:rPr>
         <w:t>9-Tap?</w:t>
       </w:r>
-      <w:bookmarkEnd w:id="2"/>
+      <w:bookmarkEnd w:id="3"/>
     </w:p>
     <w:p>
       <w:pPr>
@@ -3849,21 +4028,21 @@
       <w:pPr>
         <w:pStyle w:val="Heading2"/>
       </w:pPr>
-      <w:bookmarkStart w:id="3" w:name="_Toc508882991"/>
+      <w:bookmarkStart w:id="4" w:name="_Toc508882991"/>
       <w:r>
         <w:t>A good place to start</w:t>
       </w:r>
-      <w:bookmarkEnd w:id="3"/>
+      <w:bookmarkEnd w:id="4"/>
     </w:p>
     <w:p>
       <w:pPr>
         <w:pStyle w:val="Heading3"/>
       </w:pPr>
-      <w:bookmarkStart w:id="4" w:name="_Toc508882992"/>
+      <w:bookmarkStart w:id="5" w:name="_Toc508882992"/>
       <w:r>
         <w:t>Quick start guide</w:t>
       </w:r>
-      <w:bookmarkEnd w:id="4"/>
+      <w:bookmarkEnd w:id="5"/>
     </w:p>
     <w:p>
       <w:pPr>
@@ -3873,7 +4052,7 @@
         <w:t xml:space="preserve">You can find this on page </w:t>
       </w:r>
       <w:r>
-        <w:t>#</w:t>
+        <w:t>7</w:t>
       </w:r>
       <w:r>
         <w:t>.</w:t>
@@ -3883,11 +4062,11 @@
       <w:pPr>
         <w:pStyle w:val="Heading3"/>
       </w:pPr>
-      <w:bookmarkStart w:id="5" w:name="_Toc508882993"/>
+      <w:bookmarkStart w:id="6" w:name="_Toc508882993"/>
       <w:r>
         <w:t>Troubleshooting</w:t>
       </w:r>
-      <w:bookmarkEnd w:id="5"/>
+      <w:bookmarkEnd w:id="6"/>
     </w:p>
     <w:p>
       <w:pPr>
@@ -3897,7 +4076,7 @@
         <w:t xml:space="preserve">You can find this on page </w:t>
       </w:r>
       <w:r>
-        <w:t>#</w:t>
+        <w:t>25</w:t>
       </w:r>
       <w:r>
         <w:t>.</w:t>
@@ -3907,18 +4086,30 @@
       <w:pPr>
         <w:pStyle w:val="Heading2"/>
       </w:pPr>
-      <w:bookmarkStart w:id="6" w:name="_Toc508882994"/>
+      <w:bookmarkStart w:id="7" w:name="_Toc508882994"/>
       <w:r>
         <w:t>Menus guide</w:t>
       </w:r>
-      <w:bookmarkEnd w:id="6"/>
-    </w:p>
-    <w:p>
-      <w:pPr>
-        <w:pStyle w:val="BodyText"/>
-      </w:pPr>
-      <w:r>
-        <w:t>An in depth explanation of the program menus can be found on page 9.</w:t>
+      <w:bookmarkEnd w:id="7"/>
+    </w:p>
+    <w:p>
+      <w:pPr>
+        <w:pStyle w:val="BodyText"/>
+      </w:pPr>
+      <w:r>
+        <w:t xml:space="preserve">An in depth explanation of the program menus can be found </w:t>
+      </w:r>
+      <w:r>
+        <w:t xml:space="preserve">starting </w:t>
+      </w:r>
+      <w:r>
+        <w:t xml:space="preserve">on page </w:t>
+      </w:r>
+      <w:r>
+        <w:t>10</w:t>
+      </w:r>
+      <w:r>
+        <w:t>.</w:t>
       </w:r>
     </w:p>
     <w:p>
@@ -3976,6 +4167,9 @@
       <w:r>
         <w:t>Quick Start</w:t>
       </w:r>
+      <w:r>
+        <w:t xml:space="preserve"> Guide</w:t>
+      </w:r>
     </w:p>
     <w:p>
       <w:pPr>
@@ -3993,12 +4187,12 @@
       <w:pPr>
         <w:pStyle w:val="Heading1"/>
       </w:pPr>
-      <w:bookmarkStart w:id="7" w:name="_Toc508882995"/>
+      <w:bookmarkStart w:id="8" w:name="_Toc508882995"/>
       <w:r>
         <w:lastRenderedPageBreak/>
         <w:t>Quick Start Guide</w:t>
       </w:r>
-      <w:bookmarkEnd w:id="7"/>
+      <w:bookmarkEnd w:id="8"/>
       <w:r>
         <w:t xml:space="preserve"> </w:t>
       </w:r>
@@ -4022,11 +4216,11 @@
       <w:pPr>
         <w:pStyle w:val="Heading2"/>
       </w:pPr>
-      <w:bookmarkStart w:id="8" w:name="_Toc508882996"/>
+      <w:bookmarkStart w:id="9" w:name="_Toc508882996"/>
       <w:r>
         <w:t>What are the system requirements to run 9-Tap?</w:t>
       </w:r>
-      <w:bookmarkEnd w:id="8"/>
+      <w:bookmarkEnd w:id="9"/>
     </w:p>
     <w:p>
       <w:pPr>
@@ -4061,11 +4255,11 @@
       <w:pPr>
         <w:pStyle w:val="Heading2"/>
       </w:pPr>
-      <w:bookmarkStart w:id="9" w:name="_Toc508882997"/>
+      <w:bookmarkStart w:id="10" w:name="_Toc508882997"/>
       <w:r>
         <w:t>How do I install 9-Tap?</w:t>
       </w:r>
-      <w:bookmarkEnd w:id="9"/>
+      <w:bookmarkEnd w:id="10"/>
     </w:p>
     <w:p>
       <w:pPr>
@@ -4345,11 +4539,11 @@
       <w:pPr>
         <w:pStyle w:val="Heading2"/>
       </w:pPr>
-      <w:bookmarkStart w:id="10" w:name="_Toc508882998"/>
+      <w:bookmarkStart w:id="11" w:name="_Toc508882998"/>
       <w:r>
         <w:t>How do I Launch 9-Tap?</w:t>
       </w:r>
-      <w:bookmarkEnd w:id="10"/>
+      <w:bookmarkEnd w:id="11"/>
     </w:p>
     <w:p>
       <w:pPr>
@@ -4372,12 +4566,12 @@
       <w:pPr>
         <w:pStyle w:val="Heading2"/>
       </w:pPr>
-      <w:bookmarkStart w:id="11" w:name="_Toc508882999"/>
+      <w:bookmarkStart w:id="12" w:name="_Toc508882999"/>
       <w:r>
         <w:lastRenderedPageBreak/>
         <w:t>How do I import existing members?</w:t>
       </w:r>
-      <w:bookmarkEnd w:id="11"/>
+      <w:bookmarkEnd w:id="12"/>
     </w:p>
     <w:p>
       <w:pPr>
@@ -4397,11 +4591,11 @@
       <w:pPr>
         <w:pStyle w:val="Heading2"/>
       </w:pPr>
-      <w:bookmarkStart w:id="12" w:name="_Toc508883000"/>
+      <w:bookmarkStart w:id="13" w:name="_Toc508883000"/>
       <w:r>
         <w:t>How do I enter a new player?</w:t>
       </w:r>
-      <w:bookmarkEnd w:id="12"/>
+      <w:bookmarkEnd w:id="13"/>
     </w:p>
     <w:p>
       <w:pPr>
@@ -4433,11 +4627,11 @@
       <w:pPr>
         <w:pStyle w:val="Heading2"/>
       </w:pPr>
-      <w:bookmarkStart w:id="13" w:name="_Toc508883001"/>
+      <w:bookmarkStart w:id="14" w:name="_Toc508883001"/>
       <w:r>
         <w:t>How do I create a tournament?</w:t>
       </w:r>
-      <w:bookmarkEnd w:id="13"/>
+      <w:bookmarkEnd w:id="14"/>
     </w:p>
     <w:p>
       <w:pPr>
@@ -4487,11 +4681,11 @@
       <w:pPr>
         <w:pStyle w:val="Heading2"/>
       </w:pPr>
-      <w:bookmarkStart w:id="14" w:name="_Toc508883002"/>
+      <w:bookmarkStart w:id="15" w:name="_Toc508883002"/>
       <w:r>
         <w:t>How do I enter a bowler’s scores?</w:t>
       </w:r>
-      <w:bookmarkEnd w:id="14"/>
+      <w:bookmarkEnd w:id="15"/>
     </w:p>
     <w:p>
       <w:pPr>
@@ -4515,11 +4709,7 @@
     </w:p>
     <w:p>
       <w:pPr>
-        <w:pStyle w:val="Heading1"/>
-        <w:rPr>
-          <w:sz w:val="40"/>
-          <w:szCs w:val="40"/>
-        </w:rPr>
+        <w:pStyle w:val="BodyText"/>
       </w:pPr>
     </w:p>
     <w:p>
@@ -4605,7 +4795,7 @@
           <w:szCs w:val="32"/>
         </w:rPr>
       </w:pPr>
-      <w:bookmarkStart w:id="15" w:name="_Toc508883003"/>
+      <w:bookmarkStart w:id="16" w:name="_Toc508883003"/>
       <w:r>
         <w:rPr>
           <w:szCs w:val="32"/>
@@ -4613,7 +4803,7 @@
         <w:lastRenderedPageBreak/>
         <w:t>Start Menu</w:t>
       </w:r>
-      <w:bookmarkEnd w:id="15"/>
+      <w:bookmarkEnd w:id="16"/>
     </w:p>
     <w:p>
       <w:pPr>
@@ -4712,12 +4902,12 @@
       <w:pPr>
         <w:pStyle w:val="Heading1"/>
       </w:pPr>
-      <w:bookmarkStart w:id="16" w:name="_Toc508883004"/>
+      <w:bookmarkStart w:id="17" w:name="_Toc508883004"/>
       <w:r>
         <w:lastRenderedPageBreak/>
         <w:t>Member Info</w:t>
       </w:r>
-      <w:bookmarkEnd w:id="16"/>
+      <w:bookmarkEnd w:id="17"/>
     </w:p>
     <w:p>
       <w:pPr>
@@ -4820,11 +5010,11 @@
       <w:pPr>
         <w:pStyle w:val="Heading3"/>
       </w:pPr>
-      <w:bookmarkStart w:id="17" w:name="_Toc508883005"/>
+      <w:bookmarkStart w:id="18" w:name="_Toc508883005"/>
       <w:r>
         <w:t>Import Members</w:t>
       </w:r>
-      <w:bookmarkEnd w:id="17"/>
+      <w:bookmarkEnd w:id="18"/>
     </w:p>
     <w:p>
       <w:pPr>
@@ -4851,11 +5041,11 @@
       <w:pPr>
         <w:pStyle w:val="Heading3"/>
       </w:pPr>
-      <w:bookmarkStart w:id="18" w:name="_Toc508883006"/>
+      <w:bookmarkStart w:id="19" w:name="_Toc508883006"/>
       <w:r>
         <w:t>New Members</w:t>
       </w:r>
-      <w:bookmarkEnd w:id="18"/>
+      <w:bookmarkEnd w:id="19"/>
     </w:p>
     <w:p>
       <w:pPr>
@@ -5003,11 +5193,11 @@
       <w:pPr>
         <w:pStyle w:val="Heading3"/>
       </w:pPr>
-      <w:bookmarkStart w:id="19" w:name="_Toc508883007"/>
+      <w:bookmarkStart w:id="20" w:name="_Toc508883007"/>
       <w:r>
         <w:t>Updating a member.</w:t>
       </w:r>
-      <w:bookmarkEnd w:id="19"/>
+      <w:bookmarkEnd w:id="20"/>
     </w:p>
     <w:p>
       <w:pPr>
@@ -5038,7 +5228,7 @@
           <w:szCs w:val="20"/>
         </w:rPr>
       </w:pPr>
-      <w:bookmarkStart w:id="20" w:name="_Toc508883008"/>
+      <w:bookmarkStart w:id="21" w:name="_Toc508883008"/>
       <w:r>
         <w:rPr>
           <w:szCs w:val="20"/>
@@ -5046,7 +5236,7 @@
         <w:lastRenderedPageBreak/>
         <w:t>Stats</w:t>
       </w:r>
-      <w:bookmarkEnd w:id="20"/>
+      <w:bookmarkEnd w:id="21"/>
     </w:p>
     <w:p>
       <w:pPr>
@@ -5068,8 +5258,8 @@
         </w:rPr>
         <w:drawing>
           <wp:inline distT="0" distB="0" distL="0" distR="0">
-            <wp:extent cx="4883150" cy="2831465"/>
-            <wp:effectExtent l="0" t="0" r="0" b="6985"/>
+            <wp:extent cx="4905375" cy="2844352"/>
+            <wp:effectExtent l="0" t="0" r="0" b="0"/>
             <wp:docPr id="7" name="Picture 7"/>
             <wp:cNvGraphicFramePr>
               <a:graphicFrameLocks xmlns:a="http://schemas.openxmlformats.org/drawingml/2006/main" noChangeAspect="1"/>
@@ -5096,7 +5286,7 @@
                   <pic:spPr>
                     <a:xfrm>
                       <a:off x="0" y="0"/>
-                      <a:ext cx="4883150" cy="2831465"/>
+                      <a:ext cx="5009579" cy="2904774"/>
                     </a:xfrm>
                     <a:prstGeom prst="rect">
                       <a:avLst/>
@@ -5136,7 +5326,7 @@
           <w:szCs w:val="20"/>
         </w:rPr>
       </w:pPr>
-      <w:bookmarkStart w:id="21" w:name="_Toc508883009"/>
+      <w:bookmarkStart w:id="22" w:name="_Toc508883009"/>
       <w:r>
         <w:rPr>
           <w:szCs w:val="20"/>
@@ -5144,7 +5334,7 @@
         <w:lastRenderedPageBreak/>
         <w:t>Member Search</w:t>
       </w:r>
-      <w:bookmarkEnd w:id="21"/>
+      <w:bookmarkEnd w:id="22"/>
     </w:p>
     <w:p>
       <w:pPr>
@@ -5280,7 +5470,7 @@
           <w:szCs w:val="20"/>
         </w:rPr>
       </w:pPr>
-      <w:bookmarkStart w:id="22" w:name="_Toc508883010"/>
+      <w:bookmarkStart w:id="23" w:name="_Toc508883010"/>
       <w:r>
         <w:rPr>
           <w:szCs w:val="20"/>
@@ -5288,7 +5478,7 @@
         <w:lastRenderedPageBreak/>
         <w:t>Print Recaps</w:t>
       </w:r>
-      <w:bookmarkEnd w:id="22"/>
+      <w:bookmarkEnd w:id="23"/>
     </w:p>
     <w:p>
       <w:pPr>
@@ -5444,14 +5634,14 @@
           <w:szCs w:val="20"/>
         </w:rPr>
       </w:pPr>
-      <w:bookmarkStart w:id="23" w:name="_Toc508883011"/>
+      <w:bookmarkStart w:id="24" w:name="_Toc508883011"/>
       <w:r>
         <w:rPr>
           <w:szCs w:val="20"/>
         </w:rPr>
         <w:t>Import</w:t>
       </w:r>
-      <w:bookmarkEnd w:id="23"/>
+      <w:bookmarkEnd w:id="24"/>
     </w:p>
     <w:p>
       <w:pPr>
@@ -5538,12 +5728,12 @@
       <w:pPr>
         <w:pStyle w:val="Heading1"/>
       </w:pPr>
-      <w:bookmarkStart w:id="24" w:name="_Toc508883012"/>
+      <w:bookmarkStart w:id="25" w:name="_Toc508883012"/>
       <w:r>
         <w:lastRenderedPageBreak/>
         <w:t>Member Scores</w:t>
       </w:r>
-      <w:bookmarkEnd w:id="24"/>
+      <w:bookmarkEnd w:id="25"/>
     </w:p>
     <w:p>
       <w:pPr>
@@ -5664,7 +5854,7 @@
           <w:szCs w:val="20"/>
         </w:rPr>
       </w:pPr>
-      <w:bookmarkStart w:id="25" w:name="_Toc508883013"/>
+      <w:bookmarkStart w:id="26" w:name="_Toc508883013"/>
       <w:r>
         <w:rPr>
           <w:szCs w:val="20"/>
@@ -5672,7 +5862,7 @@
         <w:lastRenderedPageBreak/>
         <w:t>Tournament Stats</w:t>
       </w:r>
-      <w:bookmarkEnd w:id="25"/>
+      <w:bookmarkEnd w:id="26"/>
     </w:p>
     <w:p>
       <w:pPr>
@@ -5765,7 +5955,7 @@
           <w:szCs w:val="20"/>
         </w:rPr>
       </w:pPr>
-      <w:bookmarkStart w:id="26" w:name="_Toc508883014"/>
+      <w:bookmarkStart w:id="27" w:name="_Toc508883014"/>
       <w:r>
         <w:rPr>
           <w:szCs w:val="20"/>
@@ -5786,7 +5976,7 @@
         </w:rPr>
         <w:t xml:space="preserve"> Tournament</w:t>
       </w:r>
-      <w:bookmarkEnd w:id="26"/>
+      <w:bookmarkEnd w:id="27"/>
     </w:p>
     <w:p>
       <w:pPr>
@@ -5887,12 +6077,12 @@
       <w:pPr>
         <w:pStyle w:val="Heading2"/>
       </w:pPr>
-      <w:bookmarkStart w:id="27" w:name="_Toc508883015"/>
+      <w:bookmarkStart w:id="28" w:name="_Toc508883015"/>
       <w:r>
         <w:lastRenderedPageBreak/>
         <w:t>Tournament Place Standings</w:t>
       </w:r>
-      <w:bookmarkEnd w:id="27"/>
+      <w:bookmarkEnd w:id="28"/>
     </w:p>
     <w:p>
       <w:pPr>
@@ -5985,12 +6175,12 @@
       <w:pPr>
         <w:pStyle w:val="Heading2"/>
       </w:pPr>
-      <w:bookmarkStart w:id="28" w:name="_Toc508883016"/>
+      <w:bookmarkStart w:id="29" w:name="_Toc508883016"/>
       <w:r>
         <w:lastRenderedPageBreak/>
         <w:t>Create/Edit Tournament</w:t>
       </w:r>
-      <w:bookmarkEnd w:id="28"/>
+      <w:bookmarkEnd w:id="29"/>
     </w:p>
     <w:p>
       <w:pPr>
@@ -6103,11 +6293,11 @@
       <w:pPr>
         <w:pStyle w:val="Heading3"/>
       </w:pPr>
-      <w:bookmarkStart w:id="29" w:name="_Toc508883017"/>
+      <w:bookmarkStart w:id="30" w:name="_Toc508883017"/>
       <w:r>
         <w:t>To Update an Existing Tournament</w:t>
       </w:r>
-      <w:bookmarkEnd w:id="29"/>
+      <w:bookmarkEnd w:id="30"/>
     </w:p>
     <w:p>
       <w:pPr>
@@ -6137,11 +6327,11 @@
       <w:pPr>
         <w:pStyle w:val="Heading2"/>
       </w:pPr>
-      <w:bookmarkStart w:id="30" w:name="_Toc508883018"/>
+      <w:bookmarkStart w:id="31" w:name="_Toc508883018"/>
       <w:r>
         <w:t>Search Tournaments</w:t>
       </w:r>
-      <w:bookmarkEnd w:id="30"/>
+      <w:bookmarkEnd w:id="31"/>
     </w:p>
     <w:p>
       <w:pPr>
@@ -6274,11 +6464,11 @@
       <w:pPr>
         <w:pStyle w:val="Heading3"/>
       </w:pPr>
-      <w:bookmarkStart w:id="31" w:name="_Toc508883019"/>
+      <w:bookmarkStart w:id="32" w:name="_Toc508883019"/>
       <w:r>
         <w:t>Search by Location</w:t>
       </w:r>
-      <w:bookmarkEnd w:id="31"/>
+      <w:bookmarkEnd w:id="32"/>
     </w:p>
     <w:p>
       <w:pPr>
@@ -6301,11 +6491,11 @@
       <w:pPr>
         <w:pStyle w:val="Heading3"/>
       </w:pPr>
-      <w:bookmarkStart w:id="32" w:name="_Toc508883020"/>
+      <w:bookmarkStart w:id="33" w:name="_Toc508883020"/>
       <w:r>
         <w:t>Search by Event</w:t>
       </w:r>
-      <w:bookmarkEnd w:id="32"/>
+      <w:bookmarkEnd w:id="33"/>
     </w:p>
     <w:p>
       <w:pPr>
@@ -6319,11 +6509,11 @@
       <w:pPr>
         <w:pStyle w:val="Heading3"/>
       </w:pPr>
-      <w:bookmarkStart w:id="33" w:name="_Toc508883021"/>
+      <w:bookmarkStart w:id="34" w:name="_Toc508883021"/>
       <w:r>
         <w:t>Search by Date</w:t>
       </w:r>
-      <w:bookmarkEnd w:id="33"/>
+      <w:bookmarkEnd w:id="34"/>
     </w:p>
     <w:p>
       <w:pPr>
@@ -6345,12 +6535,12 @@
       <w:pPr>
         <w:pStyle w:val="Heading2"/>
       </w:pPr>
-      <w:bookmarkStart w:id="34" w:name="_Toc508883022"/>
+      <w:bookmarkStart w:id="35" w:name="_Toc508883022"/>
       <w:r>
         <w:lastRenderedPageBreak/>
         <w:t>List Tournaments by year</w:t>
       </w:r>
-      <w:bookmarkEnd w:id="34"/>
+      <w:bookmarkEnd w:id="35"/>
     </w:p>
     <w:p>
       <w:pPr>
@@ -6498,11 +6688,11 @@
       <w:pPr>
         <w:pStyle w:val="Heading2"/>
       </w:pPr>
-      <w:bookmarkStart w:id="35" w:name="_Toc508883023"/>
+      <w:bookmarkStart w:id="36" w:name="_Toc508883023"/>
       <w:r>
         <w:t>Reports</w:t>
       </w:r>
-      <w:bookmarkEnd w:id="35"/>
+      <w:bookmarkEnd w:id="36"/>
     </w:p>
     <w:p>
       <w:pPr>
@@ -6604,214 +6794,54 @@
       <w:pPr>
         <w:pStyle w:val="Heading2"/>
       </w:pPr>
-      <w:bookmarkStart w:id="36" w:name="_Toc508883024"/>
+      <w:bookmarkStart w:id="37" w:name="_Toc508883024"/>
+      <w:r>
+        <w:t>Finalize Tournament</w:t>
+      </w:r>
+      <w:bookmarkEnd w:id="37"/>
+    </w:p>
+    <w:p>
+      <w:pPr>
+        <w:pStyle w:val="BodyText"/>
+        <w:keepNext/>
+      </w:pPr>
+      <w:r>
+        <w:t xml:space="preserve">On the Member Scores screen, the “Finalized Tournament” button launches the Finalize Tournament screen. This screen is used by the tournament director to finalize the member scores for the selected tournament. The director determines if the scores are valid. If needed the director can </w:t>
+      </w:r>
+      <w:r>
+        <w:t>uncheck the “Valid Score” box for the respective score so it is not included in calculating the bowler’s average The director then enters the adjusted average in the ADJ AVG field</w:t>
+      </w:r>
+      <w:r>
+        <w:t>.</w:t>
+      </w:r>
+      <w:r>
+        <w:t xml:space="preserve"> </w:t>
+      </w:r>
+      <w:r>
+        <w:t>The Adjusted Average</w:t>
+      </w:r>
+      <w:r>
+        <w:t xml:space="preserve"> determines the member’s handicap for the next tournament </w:t>
+      </w:r>
+      <w:r>
+        <w:t>in which they are competing</w:t>
+      </w:r>
+      <w:r>
+        <w:t>.</w:t>
+      </w:r>
+      <w:r>
+        <w:t xml:space="preserve"> Once the </w:t>
+      </w:r>
       <w:r>
         <w:lastRenderedPageBreak/>
-        <w:t>Finalize Tournament</w:t>
-      </w:r>
-      <w:bookmarkEnd w:id="36"/>
-    </w:p>
-    <w:p>
-      <w:pPr>
-        <w:pStyle w:val="BodyText"/>
+        <w:t>information has been validated, the director checks off the “Director Check” boxes. Then “Finalize” is clicked and the information is saved to the database.</w:t>
+      </w:r>
+    </w:p>
+    <w:p>
+      <w:pPr>
         <w:keepNext/>
       </w:pPr>
-      <w:r>
-        <w:t xml:space="preserve">Craft beer sartorial copper mug </w:t>
-      </w:r>
-      <w:proofErr w:type="spellStart"/>
-      <w:r>
-        <w:t>tbh</w:t>
-      </w:r>
-      <w:proofErr w:type="spellEnd"/>
-      <w:r>
-        <w:t xml:space="preserve"> </w:t>
-      </w:r>
-      <w:proofErr w:type="spellStart"/>
-      <w:r>
-        <w:t>jianbing</w:t>
-      </w:r>
-      <w:proofErr w:type="spellEnd"/>
-      <w:r>
-        <w:t xml:space="preserve">, locavore VHS salvia +1 vegan gluten-free </w:t>
-      </w:r>
-      <w:proofErr w:type="spellStart"/>
-      <w:r>
-        <w:t>kogi</w:t>
-      </w:r>
-      <w:proofErr w:type="spellEnd"/>
-      <w:r>
-        <w:t xml:space="preserve"> pug </w:t>
-      </w:r>
-      <w:proofErr w:type="spellStart"/>
-      <w:r>
-        <w:t>vexillologist</w:t>
-      </w:r>
-      <w:proofErr w:type="spellEnd"/>
-      <w:r>
-        <w:t xml:space="preserve"> </w:t>
-      </w:r>
-      <w:proofErr w:type="spellStart"/>
-      <w:r>
-        <w:t>affogato</w:t>
-      </w:r>
-      <w:proofErr w:type="spellEnd"/>
-      <w:r>
-        <w:t xml:space="preserve">. Fanny pack </w:t>
-      </w:r>
-      <w:proofErr w:type="spellStart"/>
-      <w:r>
-        <w:t>palo</w:t>
-      </w:r>
-      <w:proofErr w:type="spellEnd"/>
-      <w:r>
-        <w:t xml:space="preserve"> </w:t>
-      </w:r>
-      <w:proofErr w:type="spellStart"/>
-      <w:r>
-        <w:t>santo</w:t>
-      </w:r>
-      <w:proofErr w:type="spellEnd"/>
-      <w:r>
-        <w:t xml:space="preserve"> </w:t>
-      </w:r>
-      <w:r>
-        <w:pgNum/>
-      </w:r>
-      <w:proofErr w:type="spellStart"/>
-      <w:r>
-        <w:t>dison</w:t>
-      </w:r>
-      <w:proofErr w:type="spellEnd"/>
-      <w:r>
-        <w:pgNum/>
-      </w:r>
-      <w:r>
-        <w:t>ca</w:t>
-      </w:r>
-      <w:r>
-        <w:t xml:space="preserve"> blog bespoke </w:t>
-      </w:r>
-      <w:proofErr w:type="spellStart"/>
-      <w:r>
-        <w:t>commodo</w:t>
-      </w:r>
-      <w:proofErr w:type="spellEnd"/>
-      <w:r>
-        <w:t xml:space="preserve"> tilde hammock </w:t>
-      </w:r>
-      <w:proofErr w:type="spellStart"/>
-      <w:r>
-        <w:t>taiyaki</w:t>
-      </w:r>
-      <w:proofErr w:type="spellEnd"/>
-      <w:r>
-        <w:t xml:space="preserve"> wayfarers gentrify. Cardigan ugh slow-carb, </w:t>
-      </w:r>
-      <w:proofErr w:type="spellStart"/>
-      <w:r>
-        <w:t>ea</w:t>
-      </w:r>
-      <w:proofErr w:type="spellEnd"/>
-      <w:r>
-        <w:t xml:space="preserve"> DIY hot chicken </w:t>
-      </w:r>
-      <w:proofErr w:type="spellStart"/>
-      <w:r>
-        <w:t>commodo</w:t>
-      </w:r>
-      <w:proofErr w:type="spellEnd"/>
-      <w:r>
-        <w:t xml:space="preserve"> </w:t>
-      </w:r>
-      <w:proofErr w:type="spellStart"/>
-      <w:r>
-        <w:t>godard</w:t>
-      </w:r>
-      <w:proofErr w:type="spellEnd"/>
-      <w:r>
-        <w:t xml:space="preserve">. Lorem </w:t>
-      </w:r>
-      <w:proofErr w:type="spellStart"/>
-      <w:r>
-        <w:t>sint</w:t>
-      </w:r>
-      <w:proofErr w:type="spellEnd"/>
-      <w:r>
-        <w:t xml:space="preserve"> qui 3 wolf moon </w:t>
-      </w:r>
-      <w:proofErr w:type="spellStart"/>
-      <w:r>
-        <w:t>enim</w:t>
-      </w:r>
-      <w:proofErr w:type="spellEnd"/>
-      <w:r>
-        <w:t xml:space="preserve"> </w:t>
-      </w:r>
-      <w:proofErr w:type="spellStart"/>
-      <w:r>
-        <w:t>voluptate</w:t>
-      </w:r>
-      <w:proofErr w:type="spellEnd"/>
-      <w:r>
-        <w:t xml:space="preserve">, </w:t>
-      </w:r>
-      <w:proofErr w:type="spellStart"/>
-      <w:r>
-        <w:t>velit</w:t>
-      </w:r>
-      <w:proofErr w:type="spellEnd"/>
-      <w:r>
-        <w:t xml:space="preserve"> </w:t>
-      </w:r>
-      <w:proofErr w:type="spellStart"/>
-      <w:r>
-        <w:t>veniam</w:t>
-      </w:r>
-      <w:proofErr w:type="spellEnd"/>
-      <w:r>
-        <w:t xml:space="preserve">. Fanny pack man bun </w:t>
-      </w:r>
-      <w:proofErr w:type="spellStart"/>
-      <w:r>
-        <w:t>helvetica</w:t>
-      </w:r>
-      <w:proofErr w:type="spellEnd"/>
-      <w:r>
-        <w:t xml:space="preserve"> viral, </w:t>
-      </w:r>
-      <w:proofErr w:type="spellStart"/>
-      <w:proofErr w:type="gramStart"/>
-      <w:r>
-        <w:t>edison</w:t>
-      </w:r>
-      <w:proofErr w:type="spellEnd"/>
-      <w:proofErr w:type="gramEnd"/>
-      <w:r>
-        <w:t xml:space="preserve"> bulb </w:t>
-      </w:r>
-      <w:proofErr w:type="spellStart"/>
-      <w:r>
-        <w:t>cliche</w:t>
-      </w:r>
-      <w:proofErr w:type="spellEnd"/>
-      <w:r>
-        <w:t xml:space="preserve"> </w:t>
-      </w:r>
-      <w:proofErr w:type="spellStart"/>
-      <w:r>
-        <w:t>jianbing</w:t>
-      </w:r>
-      <w:proofErr w:type="spellEnd"/>
-      <w:r>
-        <w:t>.</w:t>
-      </w:r>
-    </w:p>
-    <w:p>
-      <w:pPr>
-        <w:keepNext/>
-      </w:pPr>
-      <w:bookmarkStart w:id="37" w:name="_Toc508883025"/>
+      <w:bookmarkStart w:id="38" w:name="_Toc508883025"/>
       <w:r>
         <w:rPr>
           <w:noProof/>
@@ -6877,8 +6907,6 @@
       <w:r>
         <w:t xml:space="preserve"> Finalize Tournament Screen</w:t>
       </w:r>
-      <w:bookmarkStart w:id="38" w:name="_GoBack"/>
-      <w:bookmarkEnd w:id="38"/>
     </w:p>
     <w:p>
       <w:pPr>
@@ -6888,7 +6916,7 @@
         <w:lastRenderedPageBreak/>
         <w:t>Tools</w:t>
       </w:r>
-      <w:bookmarkEnd w:id="37"/>
+      <w:bookmarkEnd w:id="38"/>
     </w:p>
     <w:p>
       <w:pPr>
@@ -7076,21 +7104,48 @@
         <w:pStyle w:val="BodyText"/>
       </w:pPr>
       <w:r>
-        <w:t xml:space="preserve">If tournament has </w:t>
-      </w:r>
-      <w:r>
+        <w:rPr>
+          <w:b/>
+        </w:rPr>
+        <w:t xml:space="preserve">If </w:t>
+      </w:r>
+      <w:r>
+        <w:rPr>
+          <w:b/>
+        </w:rPr>
+        <w:t xml:space="preserve">the </w:t>
+      </w:r>
+      <w:r>
+        <w:rPr>
+          <w:b/>
+        </w:rPr>
+        <w:t xml:space="preserve">tournament has </w:t>
+      </w:r>
+      <w:r>
+        <w:rPr>
+          <w:b/>
+        </w:rPr>
         <w:t>five (5) or fewer</w:t>
       </w:r>
       <w:r>
-        <w:t xml:space="preserve"> participants, DO NOT USE PROGRAM. Keep track of player data manually.</w:t>
-      </w:r>
-    </w:p>
-    <w:p>
-      <w:pPr>
-        <w:pStyle w:val="BodyText"/>
-      </w:pPr>
-      <w:r>
-        <w:t>Doubles tournaments are not supported by the software at this time. Leave this alone.</w:t>
+        <w:rPr>
+          <w:b/>
+        </w:rPr>
+        <w:t xml:space="preserve"> participants, DO NOT USE PROGRAM. Keep track of player data manually</w:t>
+      </w:r>
+      <w:r>
+        <w:t>.</w:t>
+      </w:r>
+    </w:p>
+    <w:p>
+      <w:pPr>
+        <w:pStyle w:val="BodyText"/>
+      </w:pPr>
+      <w:r>
+        <w:t>Doubles tournaments are not supported by the software at this time</w:t>
+      </w:r>
+      <w:r>
+        <w:t>. LEAVE DOUBLES UNCHECKED ON THE NEW TOURNAMENT SCREEN/DIALOG.</w:t>
       </w:r>
     </w:p>
     <w:p>
@@ -7140,7 +7195,7 @@
         </w:rPr>
         <w:drawing>
           <wp:inline distT="0" distB="0" distL="0" distR="0">
-            <wp:extent cx="4883150" cy="3818890"/>
+            <wp:extent cx="3810000" cy="2979628"/>
             <wp:effectExtent l="0" t="0" r="0" b="0"/>
             <wp:docPr id="22" name="Picture 22"/>
             <wp:cNvGraphicFramePr>
@@ -7154,7 +7209,7 @@
                     <pic:cNvPicPr/>
                   </pic:nvPicPr>
                   <pic:blipFill>
-                    <a:blip r:embed="rId33">
+                    <a:blip r:embed="rId33" cstate="print">
                       <a:extLst>
                         <a:ext uri="{28A0092B-C50C-407E-A947-70E740481C1C}">
                           <a14:useLocalDpi xmlns:a14="http://schemas.microsoft.com/office/drawing/2010/main" val="0"/>
@@ -7168,7 +7223,7 @@
                   <pic:spPr>
                     <a:xfrm>
                       <a:off x="0" y="0"/>
-                      <a:ext cx="4883150" cy="3818890"/>
+                      <a:ext cx="3851902" cy="3012397"/>
                     </a:xfrm>
                     <a:prstGeom prst="rect">
                       <a:avLst/>
@@ -7183,6 +7238,26 @@
     </w:p>
     <w:p>
       <w:pPr>
+        <w:pStyle w:val="Caption"/>
+        <w:jc w:val="both"/>
+      </w:pPr>
+      <w:r>
+        <w:t xml:space="preserve">Figure </w:t>
+      </w:r>
+      <w:fldSimple w:instr=" SEQ Figure \* ARABIC ">
+        <w:r>
+          <w:rPr>
+            <w:noProof/>
+          </w:rPr>
+          <w:t>19</w:t>
+        </w:r>
+      </w:fldSimple>
+      <w:r>
+        <w:t xml:space="preserve"> Showing split screen error</w:t>
+      </w:r>
+    </w:p>
+    <w:p>
+      <w:pPr>
         <w:pStyle w:val="BodyText"/>
         <w:keepNext/>
       </w:pPr>
@@ -7191,6 +7266,128 @@
       <w:pPr>
         <w:pStyle w:val="BodyText"/>
       </w:pPr>
+      <w:r>
+        <w:rPr>
+          <w:noProof/>
+        </w:rPr>
+        <mc:AlternateContent>
+          <mc:Choice Requires="wps">
+            <w:drawing>
+              <wp:anchor distT="0" distB="0" distL="114300" distR="114300" simplePos="0" relativeHeight="251667456" behindDoc="0" locked="0" layoutInCell="1" allowOverlap="1" wp14:anchorId="2EB0F7D5" wp14:editId="56206372">
+                <wp:simplePos x="0" y="0"/>
+                <wp:positionH relativeFrom="column">
+                  <wp:posOffset>3175</wp:posOffset>
+                </wp:positionH>
+                <wp:positionV relativeFrom="paragraph">
+                  <wp:posOffset>1254760</wp:posOffset>
+                </wp:positionV>
+                <wp:extent cx="1962150" cy="171450"/>
+                <wp:effectExtent l="0" t="0" r="0" b="0"/>
+                <wp:wrapSquare wrapText="bothSides"/>
+                <wp:docPr id="24" name="Text Box 24"/>
+                <wp:cNvGraphicFramePr/>
+                <a:graphic xmlns:a="http://schemas.openxmlformats.org/drawingml/2006/main">
+                  <a:graphicData uri="http://schemas.microsoft.com/office/word/2010/wordprocessingShape">
+                    <wps:wsp>
+                      <wps:cNvSpPr txBox="1"/>
+                      <wps:spPr>
+                        <a:xfrm>
+                          <a:off x="0" y="0"/>
+                          <a:ext cx="1962150" cy="171450"/>
+                        </a:xfrm>
+                        <a:prstGeom prst="rect">
+                          <a:avLst/>
+                        </a:prstGeom>
+                        <a:solidFill>
+                          <a:prstClr val="white"/>
+                        </a:solidFill>
+                        <a:ln>
+                          <a:noFill/>
+                        </a:ln>
+                        <a:effectLst/>
+                      </wps:spPr>
+                      <wps:txbx>
+                        <w:txbxContent>
+                          <w:p>
+                            <w:pPr>
+                              <w:pStyle w:val="Caption"/>
+                              <w:rPr>
+                                <w:noProof/>
+                                <w:sz w:val="24"/>
+                              </w:rPr>
+                            </w:pPr>
+                            <w:r>
+                              <w:t xml:space="preserve">Figure </w:t>
+                            </w:r>
+                            <w:fldSimple w:instr=" SEQ Figure \* ARABIC ">
+                              <w:r>
+                                <w:rPr>
+                                  <w:noProof/>
+                                </w:rPr>
+                                <w:t>20</w:t>
+                              </w:r>
+                            </w:fldSimple>
+                            <w:r>
+                              <w:t xml:space="preserve"> Inner screen maximize</w:t>
+                            </w:r>
+                          </w:p>
+                        </w:txbxContent>
+                      </wps:txbx>
+                      <wps:bodyPr rot="0" spcFirstLastPara="0" vertOverflow="overflow" horzOverflow="overflow" vert="horz" wrap="square" lIns="0" tIns="0" rIns="0" bIns="0" numCol="1" spcCol="0" rtlCol="0" fromWordArt="0" anchor="t" anchorCtr="0" forceAA="0" compatLnSpc="1">
+                        <a:prstTxWarp prst="textNoShape">
+                          <a:avLst/>
+                        </a:prstTxWarp>
+                        <a:noAutofit/>
+                      </wps:bodyPr>
+                    </wps:wsp>
+                  </a:graphicData>
+                </a:graphic>
+                <wp14:sizeRelV relativeFrom="margin">
+                  <wp14:pctHeight>0</wp14:pctHeight>
+                </wp14:sizeRelV>
+              </wp:anchor>
+            </w:drawing>
+          </mc:Choice>
+          <mc:Fallback>
+            <w:pict>
+              <v:shapetype w14:anchorId="2EB0F7D5" id="_x0000_t202" coordsize="21600,21600" o:spt="202" path="m,l,21600r21600,l21600,xe">
+                <v:stroke joinstyle="miter"/>
+                <v:path gradientshapeok="t" o:connecttype="rect"/>
+              </v:shapetype>
+              <v:shape id="Text Box 24" o:spid="_x0000_s1026" type="#_x0000_t202" style="position:absolute;left:0;text-align:left;margin-left:.25pt;margin-top:98.8pt;width:154.5pt;height:13.5pt;z-index:251667456;visibility:visible;mso-wrap-style:square;mso-height-percent:0;mso-wrap-distance-left:9pt;mso-wrap-distance-top:0;mso-wrap-distance-right:9pt;mso-wrap-distance-bottom:0;mso-position-horizontal:absolute;mso-position-horizontal-relative:text;mso-position-vertical:absolute;mso-position-vertical-relative:text;mso-height-percent:0;mso-height-relative:margin;v-text-anchor:top" o:gfxdata="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" stroked="f">
+                <v:textbox inset="0,0,0,0">
+                  <w:txbxContent>
+                    <w:p>
+                      <w:pPr>
+                        <w:pStyle w:val="Caption"/>
+                        <w:rPr>
+                          <w:noProof/>
+                          <w:sz w:val="24"/>
+                        </w:rPr>
+                      </w:pPr>
+                      <w:r>
+                        <w:t xml:space="preserve">Figure </w:t>
+                      </w:r>
+                      <w:fldSimple w:instr=" SEQ Figure \* ARABIC ">
+                        <w:r>
+                          <w:rPr>
+                            <w:noProof/>
+                          </w:rPr>
+                          <w:t>20</w:t>
+                        </w:r>
+                      </w:fldSimple>
+                      <w:r>
+                        <w:t xml:space="preserve"> Inner screen maximize</w:t>
+                      </w:r>
+                    </w:p>
+                  </w:txbxContent>
+                </v:textbox>
+                <w10:wrap type="square"/>
+              </v:shape>
+            </w:pict>
+          </mc:Fallback>
+        </mc:AlternateContent>
+      </w:r>
       <w:r>
         <w:rPr>
           <w:noProof/>
@@ -7468,12 +7665,10 @@
       <w:pPr>
         <w:pStyle w:val="Heading1"/>
       </w:pPr>
-      <w:bookmarkStart w:id="44" w:name="_Toc508883031"/>
       <w:r>
         <w:lastRenderedPageBreak/>
-        <w:t>Using 9 Tap Tour</w:t>
-      </w:r>
-      <w:bookmarkEnd w:id="44"/>
+        <w:t>General Information</w:t>
+      </w:r>
     </w:p>
     <w:p>
       <w:pPr>
@@ -7494,7 +7689,7 @@
           <w:szCs w:val="22"/>
         </w:rPr>
       </w:pPr>
-      <w:bookmarkStart w:id="45" w:name="_Toc508883032"/>
+      <w:bookmarkStart w:id="44" w:name="_Toc508883032"/>
       <w:r>
         <w:rPr>
           <w:sz w:val="22"/>
@@ -7502,7 +7697,7 @@
         </w:rPr>
         <w:t>Main Menu</w:t>
       </w:r>
-      <w:bookmarkEnd w:id="45"/>
+      <w:bookmarkEnd w:id="44"/>
     </w:p>
     <w:p>
       <w:pPr>
@@ -7666,67 +7861,572 @@
     </w:p>
     <w:p>
       <w:pPr>
-        <w:pStyle w:val="Heading1"/>
-      </w:pPr>
-      <w:bookmarkStart w:id="46" w:name="_Toc508883033"/>
-      <w:r>
-        <w:t>Member I</w:t>
-      </w:r>
-      <w:r>
-        <w:t>n</w:t>
-      </w:r>
-      <w:r>
-        <w:t>fo</w:t>
-      </w:r>
-      <w:bookmarkEnd w:id="46"/>
-    </w:p>
-    <w:p>
-      <w:pPr>
-        <w:pStyle w:val="BodyText"/>
-        <w:rPr>
-          <w:rFonts w:ascii="Arial Black" w:hAnsi="Arial Black"/>
-          <w:color w:val="808080"/>
-          <w:spacing w:val="-25"/>
-          <w:kern w:val="28"/>
-          <w:sz w:val="32"/>
-        </w:rPr>
-      </w:pPr>
-      <w:r>
-        <w:t>To enter a new member: Click “New” Button under record. Enter the player’s Last, First, and, if applicable, Middle name at the top of the form. The member number automatically generates. You can click “Save” at this point to come back and finish filling out the player’s information later</w:t>
-      </w:r>
-      <w:r>
-        <w:t>.</w:t>
-      </w:r>
-      <w:r>
-        <w:t xml:space="preserve"> When you have the time, you can fill out the remaining information: member birthdate, social security number, address, city, state, zip code, date joined or rejoined,</w:t>
-      </w:r>
-      <w:bookmarkStart w:id="47" w:name="_Toc35154388"/>
-      <w:bookmarkStart w:id="48" w:name="_Toc35154911"/>
-      <w:bookmarkStart w:id="49" w:name="_Toc36023011"/>
-      <w:r>
-        <w:br w:type="page"/>
-      </w:r>
-    </w:p>
-    <w:p>
-      <w:pPr>
-        <w:pStyle w:val="Heading1"/>
-      </w:pPr>
-      <w:bookmarkStart w:id="50" w:name="_Toc508883034"/>
+        <w:pStyle w:val="Heading2"/>
+      </w:pPr>
+      <w:r>
+        <w:t>Member Info</w:t>
+      </w:r>
+    </w:p>
+    <w:p>
+      <w:pPr>
+        <w:pStyle w:val="BodyText"/>
+      </w:pPr>
+      <w:r>
+        <w:t>Once on t</w:t>
+      </w:r>
+      <w:r>
+        <w:t>he Member Info screen</w:t>
+      </w:r>
+      <w:r>
+        <w:t xml:space="preserve"> you can enter a new or update an existing member</w:t>
+      </w:r>
+      <w:r>
+        <w:t>:</w:t>
+      </w:r>
+    </w:p>
+    <w:p>
+      <w:pPr>
+        <w:pStyle w:val="BodyText"/>
+        <w:numPr>
+          <w:ilvl w:val="0"/>
+          <w:numId w:val="46"/>
+        </w:numPr>
+      </w:pPr>
+      <w:r>
+        <w:t xml:space="preserve">“Member Number”—the member number auto generates. </w:t>
+      </w:r>
+    </w:p>
+    <w:p>
+      <w:pPr>
+        <w:pStyle w:val="BodyText"/>
+        <w:numPr>
+          <w:ilvl w:val="0"/>
+          <w:numId w:val="46"/>
+        </w:numPr>
+      </w:pPr>
+      <w:r>
+        <w:t>“Last Name”—member</w:t>
+      </w:r>
+      <w:r>
+        <w:t>’s</w:t>
+      </w:r>
+      <w:r>
+        <w:t xml:space="preserve"> last name.</w:t>
+      </w:r>
+      <w:r>
+        <w:t xml:space="preserve"> Required field.</w:t>
+      </w:r>
+    </w:p>
+    <w:p>
+      <w:pPr>
+        <w:pStyle w:val="BodyText"/>
+        <w:numPr>
+          <w:ilvl w:val="0"/>
+          <w:numId w:val="46"/>
+        </w:numPr>
+      </w:pPr>
+      <w:r>
+        <w:t>“First Name”—member</w:t>
+      </w:r>
+      <w:r>
+        <w:t>’s</w:t>
+      </w:r>
+      <w:r>
+        <w:t xml:space="preserve"> first name.</w:t>
+      </w:r>
+      <w:r>
+        <w:t xml:space="preserve"> Required field.</w:t>
+      </w:r>
+    </w:p>
+    <w:p>
+      <w:pPr>
+        <w:pStyle w:val="BodyText"/>
+        <w:numPr>
+          <w:ilvl w:val="0"/>
+          <w:numId w:val="46"/>
+        </w:numPr>
+      </w:pPr>
+      <w:r>
+        <w:t>“Middle Initial”—member’s middle initial.</w:t>
+      </w:r>
+    </w:p>
+    <w:p>
+      <w:pPr>
+        <w:pStyle w:val="BodyText"/>
+        <w:numPr>
+          <w:ilvl w:val="0"/>
+          <w:numId w:val="46"/>
+        </w:numPr>
+      </w:pPr>
       <w:r>
         <w:lastRenderedPageBreak/>
-        <w:t>Index</w:t>
-      </w:r>
-      <w:bookmarkEnd w:id="47"/>
-      <w:bookmarkEnd w:id="48"/>
-      <w:bookmarkEnd w:id="49"/>
-      <w:bookmarkEnd w:id="50"/>
-    </w:p>
-    <w:p>
-      <w:pPr>
-        <w:pStyle w:val="BodyText"/>
-        <w:rPr>
-          <w:noProof/>
-        </w:rPr>
+        <w:t>Member Information block</w:t>
+      </w:r>
+    </w:p>
+    <w:p>
+      <w:pPr>
+        <w:pStyle w:val="BodyText"/>
+        <w:numPr>
+          <w:ilvl w:val="1"/>
+          <w:numId w:val="46"/>
+        </w:numPr>
+      </w:pPr>
+      <w:r>
+        <w:t>“D.O.B.”—member’s date of birth, mm/</w:t>
+      </w:r>
+      <w:proofErr w:type="spellStart"/>
+      <w:r>
+        <w:t>dd</w:t>
+      </w:r>
+      <w:proofErr w:type="spellEnd"/>
+      <w:r>
+        <w:t>/</w:t>
+      </w:r>
+      <w:proofErr w:type="spellStart"/>
+      <w:r>
+        <w:t>yyyy</w:t>
+      </w:r>
+      <w:proofErr w:type="spellEnd"/>
+      <w:r>
+        <w:t xml:space="preserve"> format.</w:t>
+      </w:r>
+    </w:p>
+    <w:p>
+      <w:pPr>
+        <w:pStyle w:val="BodyText"/>
+        <w:numPr>
+          <w:ilvl w:val="1"/>
+          <w:numId w:val="46"/>
+        </w:numPr>
+      </w:pPr>
+      <w:r>
+        <w:t>“SSN”—the member’s social security number. Not displayed by default.</w:t>
+      </w:r>
+    </w:p>
+    <w:p>
+      <w:pPr>
+        <w:pStyle w:val="BodyText"/>
+        <w:numPr>
+          <w:ilvl w:val="1"/>
+          <w:numId w:val="46"/>
+        </w:numPr>
+      </w:pPr>
+      <w:r>
+        <w:t>“Address”—member’s street address.</w:t>
+      </w:r>
+    </w:p>
+    <w:p>
+      <w:pPr>
+        <w:pStyle w:val="BodyText"/>
+        <w:numPr>
+          <w:ilvl w:val="1"/>
+          <w:numId w:val="46"/>
+        </w:numPr>
+      </w:pPr>
+      <w:r>
+        <w:t>“City”</w:t>
+      </w:r>
+    </w:p>
+    <w:p>
+      <w:pPr>
+        <w:pStyle w:val="BodyText"/>
+        <w:numPr>
+          <w:ilvl w:val="1"/>
+          <w:numId w:val="46"/>
+        </w:numPr>
+      </w:pPr>
+      <w:r>
+        <w:t>“State”</w:t>
+      </w:r>
+    </w:p>
+    <w:p>
+      <w:pPr>
+        <w:pStyle w:val="BodyText"/>
+        <w:numPr>
+          <w:ilvl w:val="1"/>
+          <w:numId w:val="46"/>
+        </w:numPr>
+      </w:pPr>
+      <w:r>
+        <w:t>“Zip”</w:t>
+      </w:r>
+    </w:p>
+    <w:p>
+      <w:pPr>
+        <w:pStyle w:val="BodyText"/>
+        <w:numPr>
+          <w:ilvl w:val="1"/>
+          <w:numId w:val="46"/>
+        </w:numPr>
+      </w:pPr>
+      <w:r>
+        <w:t>“Email”—member’s email.</w:t>
+      </w:r>
+    </w:p>
+    <w:p>
+      <w:pPr>
+        <w:pStyle w:val="BodyText"/>
+        <w:numPr>
+          <w:ilvl w:val="1"/>
+          <w:numId w:val="46"/>
+        </w:numPr>
+      </w:pPr>
+      <w:r>
+        <w:t>“Date Joined”—date member joined.</w:t>
+      </w:r>
+    </w:p>
+    <w:p>
+      <w:pPr>
+        <w:pStyle w:val="BodyText"/>
+        <w:numPr>
+          <w:ilvl w:val="1"/>
+          <w:numId w:val="46"/>
+        </w:numPr>
+      </w:pPr>
+      <w:r>
+        <w:t>“Rejoin Date”—date member rejoined.</w:t>
+      </w:r>
+    </w:p>
+    <w:p>
+      <w:pPr>
+        <w:pStyle w:val="BodyText"/>
+        <w:numPr>
+          <w:ilvl w:val="1"/>
+          <w:numId w:val="46"/>
+        </w:numPr>
+      </w:pPr>
+      <w:r>
+        <w:t>“Referrals”—track number of bowlers referred by the member. Once they have five confirmed referrals, the member becomes a lifetime member.</w:t>
+      </w:r>
+    </w:p>
+    <w:p>
+      <w:pPr>
+        <w:pStyle w:val="BodyText"/>
+        <w:numPr>
+          <w:ilvl w:val="0"/>
+          <w:numId w:val="47"/>
+        </w:numPr>
+      </w:pPr>
+      <w:r>
+        <w:t>“Average”—where the member’s average displays. For a new member, where her average can be entered, with proof.</w:t>
+      </w:r>
+    </w:p>
+    <w:p>
+      <w:pPr>
+        <w:pStyle w:val="BodyText"/>
+        <w:numPr>
+          <w:ilvl w:val="0"/>
+          <w:numId w:val="47"/>
+        </w:numPr>
+      </w:pPr>
+      <w:r>
+        <w:t>“30 Game Average”—member’s average over the last 30 games he’s bowled.</w:t>
+      </w:r>
+    </w:p>
+    <w:p>
+      <w:pPr>
+        <w:pStyle w:val="BodyText"/>
+        <w:numPr>
+          <w:ilvl w:val="0"/>
+          <w:numId w:val="47"/>
+        </w:numPr>
+      </w:pPr>
+      <w:r>
+        <w:t>“Handicap”—member’s calculated handicap.</w:t>
+      </w:r>
+    </w:p>
+    <w:p>
+      <w:pPr>
+        <w:pStyle w:val="BodyText"/>
+        <w:numPr>
+          <w:ilvl w:val="0"/>
+          <w:numId w:val="47"/>
+        </w:numPr>
+      </w:pPr>
+      <w:r>
+        <w:t>“Bonus”—bonus pins.</w:t>
+      </w:r>
+    </w:p>
+    <w:p>
+      <w:pPr>
+        <w:pStyle w:val="BodyText"/>
+        <w:numPr>
+          <w:ilvl w:val="0"/>
+          <w:numId w:val="47"/>
+        </w:numPr>
+      </w:pPr>
+      <w:r>
+        <w:t>“Year End Tournaments”</w:t>
+      </w:r>
+    </w:p>
+    <w:p>
+      <w:pPr>
+        <w:pStyle w:val="BodyText"/>
+        <w:numPr>
+          <w:ilvl w:val="0"/>
+          <w:numId w:val="47"/>
+        </w:numPr>
+      </w:pPr>
+      <w:r>
+        <w:t>“Money Earned”—prize money earned by the member from tournaments.</w:t>
+      </w:r>
+    </w:p>
+    <w:p>
+      <w:pPr>
+        <w:pStyle w:val="BodyText"/>
+        <w:numPr>
+          <w:ilvl w:val="0"/>
+          <w:numId w:val="47"/>
+        </w:numPr>
+      </w:pPr>
+      <w:r>
+        <w:t>“Last Bowled”—date member last bowled.</w:t>
+      </w:r>
+    </w:p>
+    <w:p>
+      <w:pPr>
+        <w:pStyle w:val="BodyText"/>
+        <w:numPr>
+          <w:ilvl w:val="0"/>
+          <w:numId w:val="47"/>
+        </w:numPr>
+      </w:pPr>
+      <w:r>
+        <w:t>Record block</w:t>
+      </w:r>
+    </w:p>
+    <w:p>
+      <w:pPr>
+        <w:pStyle w:val="BodyText"/>
+        <w:numPr>
+          <w:ilvl w:val="1"/>
+          <w:numId w:val="47"/>
+        </w:numPr>
+      </w:pPr>
+      <w:r>
+        <w:t>“New”—starts a new record.</w:t>
+      </w:r>
+    </w:p>
+    <w:p>
+      <w:pPr>
+        <w:pStyle w:val="BodyText"/>
+        <w:numPr>
+          <w:ilvl w:val="1"/>
+          <w:numId w:val="47"/>
+        </w:numPr>
+      </w:pPr>
+      <w:r>
+        <w:t>“Save”—saves member information to the database.</w:t>
+      </w:r>
+    </w:p>
+    <w:p>
+      <w:pPr>
+        <w:pStyle w:val="BodyText"/>
+        <w:numPr>
+          <w:ilvl w:val="1"/>
+          <w:numId w:val="47"/>
+        </w:numPr>
+      </w:pPr>
+      <w:r>
+        <w:t>“Import”—imports member information from an excel file.</w:t>
+      </w:r>
+    </w:p>
+    <w:p>
+      <w:pPr>
+        <w:pStyle w:val="BodyText"/>
+        <w:numPr>
+          <w:ilvl w:val="0"/>
+          <w:numId w:val="47"/>
+        </w:numPr>
+      </w:pPr>
+      <w:r>
+        <w:lastRenderedPageBreak/>
+        <w:t>“Record Number” block. For navigation between records.</w:t>
+      </w:r>
+    </w:p>
+    <w:p>
+      <w:pPr>
+        <w:pStyle w:val="BodyText"/>
+        <w:numPr>
+          <w:ilvl w:val="1"/>
+          <w:numId w:val="47"/>
+        </w:numPr>
+      </w:pPr>
+      <w:r>
+        <w:t>“&lt;”—goes one record back</w:t>
+      </w:r>
+    </w:p>
+    <w:p>
+      <w:pPr>
+        <w:pStyle w:val="BodyText"/>
+        <w:numPr>
+          <w:ilvl w:val="1"/>
+          <w:numId w:val="47"/>
+        </w:numPr>
+      </w:pPr>
+      <w:r>
+        <w:t>“&gt;”—goes one record forward</w:t>
+      </w:r>
+    </w:p>
+    <w:p>
+      <w:pPr>
+        <w:pStyle w:val="BodyText"/>
+        <w:numPr>
+          <w:ilvl w:val="1"/>
+          <w:numId w:val="47"/>
+        </w:numPr>
+      </w:pPr>
+      <w:r>
+        <w:t>“First Record”—goes to first record</w:t>
+      </w:r>
+    </w:p>
+    <w:p>
+      <w:pPr>
+        <w:pStyle w:val="BodyText"/>
+        <w:numPr>
+          <w:ilvl w:val="1"/>
+          <w:numId w:val="47"/>
+        </w:numPr>
+      </w:pPr>
+      <w:r>
+        <w:t>“Last Record”—goes to last record</w:t>
+      </w:r>
+    </w:p>
+    <w:p>
+      <w:pPr>
+        <w:pStyle w:val="BodyText"/>
+        <w:numPr>
+          <w:ilvl w:val="0"/>
+          <w:numId w:val="47"/>
+        </w:numPr>
+      </w:pPr>
+      <w:r>
+        <w:t>“Stats” block</w:t>
+      </w:r>
+    </w:p>
+    <w:p>
+      <w:pPr>
+        <w:pStyle w:val="BodyText"/>
+        <w:numPr>
+          <w:ilvl w:val="1"/>
+          <w:numId w:val="47"/>
+        </w:numPr>
+      </w:pPr>
+      <w:r>
+        <w:t>“Stats”—brings up currently selected member’s statistics.</w:t>
+      </w:r>
+    </w:p>
+    <w:p>
+      <w:pPr>
+        <w:pStyle w:val="BodyText"/>
+        <w:numPr>
+          <w:ilvl w:val="0"/>
+          <w:numId w:val="47"/>
+        </w:numPr>
+      </w:pPr>
+      <w:r>
+        <w:t>“Search” block</w:t>
+      </w:r>
+    </w:p>
+    <w:p>
+      <w:pPr>
+        <w:pStyle w:val="BodyText"/>
+        <w:numPr>
+          <w:ilvl w:val="1"/>
+          <w:numId w:val="47"/>
+        </w:numPr>
+      </w:pPr>
+      <w:r>
+        <w:t>“Member Search”—brings up member search screen, used to search for member records.</w:t>
+      </w:r>
+    </w:p>
+    <w:p>
+      <w:pPr>
+        <w:pStyle w:val="BodyText"/>
+        <w:numPr>
+          <w:ilvl w:val="0"/>
+          <w:numId w:val="47"/>
+        </w:numPr>
+      </w:pPr>
+      <w:r>
+        <w:t>“Print Recaps” block</w:t>
+      </w:r>
+    </w:p>
+    <w:p>
+      <w:pPr>
+        <w:pStyle w:val="BodyText"/>
+        <w:numPr>
+          <w:ilvl w:val="1"/>
+          <w:numId w:val="47"/>
+        </w:numPr>
+      </w:pPr>
+      <w:r>
+        <w:t>“Print Single”—prints a single member’s record.</w:t>
+      </w:r>
+    </w:p>
+    <w:p>
+      <w:pPr>
+        <w:pStyle w:val="BodyText"/>
+        <w:numPr>
+          <w:ilvl w:val="1"/>
+          <w:numId w:val="47"/>
+        </w:numPr>
+      </w:pPr>
+      <w:r>
+        <w:t xml:space="preserve">“Print </w:t>
+      </w:r>
+      <w:proofErr w:type="gramStart"/>
+      <w:r>
+        <w:t>By</w:t>
+      </w:r>
+      <w:proofErr w:type="gramEnd"/>
+      <w:r>
+        <w:t xml:space="preserve"> Date”—brings up the print by date dialog. To print a range of records by date.</w:t>
+      </w:r>
+    </w:p>
+    <w:p>
+      <w:pPr>
+        <w:pStyle w:val="BodyText"/>
+        <w:numPr>
+          <w:ilvl w:val="1"/>
+          <w:numId w:val="47"/>
+        </w:numPr>
+      </w:pPr>
+      <w:r>
+        <w:t xml:space="preserve">“Print </w:t>
+      </w:r>
+      <w:proofErr w:type="gramStart"/>
+      <w:r>
+        <w:t>By</w:t>
+      </w:r>
+      <w:proofErr w:type="gramEnd"/>
+      <w:r>
+        <w:t xml:space="preserve"> Tournament”</w:t>
+      </w:r>
+      <w:r>
+        <w:t>—prints member record by tournament.</w:t>
+      </w:r>
+    </w:p>
+    <w:p>
+      <w:pPr>
+        <w:pStyle w:val="Heading2"/>
+      </w:pPr>
+      <w:r>
+        <w:t>Member Scores</w:t>
+      </w:r>
+    </w:p>
+    <w:p>
+      <w:pPr>
+        <w:pStyle w:val="BodyText"/>
+      </w:pPr>
+    </w:p>
+    <w:p>
+      <w:pPr>
+        <w:pStyle w:val="BodyText"/>
+      </w:pPr>
+    </w:p>
+    <w:p>
+      <w:pPr>
         <w:sectPr>
           <w:headerReference w:type="default" r:id="rId35"/>
           <w:footerReference w:type="default" r:id="rId36"/>
@@ -7737,497 +8437,23 @@
           <w:cols w:space="720"/>
         </w:sectPr>
       </w:pPr>
-      <w:r>
-        <w:fldChar w:fldCharType="begin"/>
-      </w:r>
-      <w:r>
-        <w:instrText xml:space="preserve"> INDEX \c "2" \z "1033" </w:instrText>
-      </w:r>
-      <w:r>
-        <w:fldChar w:fldCharType="separate"/>
-      </w:r>
-    </w:p>
-    <w:p>
-      <w:pPr>
-        <w:pStyle w:val="Index1"/>
-        <w:tabs>
-          <w:tab w:val="right" w:leader="dot" w:pos="3475"/>
-        </w:tabs>
-        <w:rPr>
-          <w:noProof/>
-        </w:rPr>
-      </w:pPr>
-      <w:r>
-        <w:rPr>
-          <w:noProof/>
-        </w:rPr>
-        <w:t>background, 1</w:t>
-      </w:r>
-    </w:p>
-    <w:p>
-      <w:pPr>
-        <w:pStyle w:val="Index1"/>
-        <w:tabs>
-          <w:tab w:val="right" w:leader="dot" w:pos="3475"/>
-        </w:tabs>
-        <w:rPr>
-          <w:noProof/>
-        </w:rPr>
-      </w:pPr>
-      <w:r>
-        <w:rPr>
-          <w:noProof/>
-        </w:rPr>
-        <w:t>border, 3</w:t>
-      </w:r>
-    </w:p>
-    <w:p>
-      <w:pPr>
-        <w:pStyle w:val="Index1"/>
-        <w:tabs>
-          <w:tab w:val="right" w:leader="dot" w:pos="3475"/>
-        </w:tabs>
-        <w:rPr>
-          <w:noProof/>
-        </w:rPr>
-      </w:pPr>
-      <w:r>
-        <w:rPr>
-          <w:noProof/>
-        </w:rPr>
-        <w:t>bullet, 1</w:t>
-      </w:r>
-    </w:p>
-    <w:p>
-      <w:pPr>
-        <w:pStyle w:val="Index1"/>
-        <w:tabs>
-          <w:tab w:val="right" w:leader="dot" w:pos="3475"/>
-        </w:tabs>
-        <w:rPr>
-          <w:noProof/>
-        </w:rPr>
-      </w:pPr>
-      <w:r>
-        <w:rPr>
-          <w:noProof/>
-        </w:rPr>
-        <w:t>caption, 2</w:t>
-      </w:r>
-    </w:p>
-    <w:p>
-      <w:pPr>
-        <w:pStyle w:val="Index1"/>
-        <w:tabs>
-          <w:tab w:val="right" w:leader="dot" w:pos="3475"/>
-        </w:tabs>
-        <w:rPr>
-          <w:noProof/>
-        </w:rPr>
-      </w:pPr>
-      <w:r>
-        <w:rPr>
-          <w:noProof/>
-        </w:rPr>
-        <w:t>color, 2</w:t>
-      </w:r>
-    </w:p>
-    <w:p>
-      <w:pPr>
-        <w:pStyle w:val="Index1"/>
-        <w:tabs>
-          <w:tab w:val="right" w:leader="dot" w:pos="3475"/>
-        </w:tabs>
-        <w:rPr>
-          <w:noProof/>
-        </w:rPr>
-      </w:pPr>
-      <w:r>
-        <w:rPr>
-          <w:noProof/>
-        </w:rPr>
-        <w:t>drawing, 2</w:t>
-      </w:r>
-    </w:p>
-    <w:p>
-      <w:pPr>
-        <w:pStyle w:val="Index1"/>
-        <w:tabs>
-          <w:tab w:val="right" w:leader="dot" w:pos="3475"/>
-        </w:tabs>
-        <w:rPr>
-          <w:noProof/>
-        </w:rPr>
-      </w:pPr>
-      <w:r>
-        <w:rPr>
-          <w:noProof/>
-        </w:rPr>
-        <w:t>drop cap, 1</w:t>
-      </w:r>
-    </w:p>
-    <w:p>
-      <w:pPr>
-        <w:pStyle w:val="Index1"/>
-        <w:tabs>
-          <w:tab w:val="right" w:leader="dot" w:pos="3475"/>
-        </w:tabs>
-        <w:rPr>
-          <w:noProof/>
-        </w:rPr>
-      </w:pPr>
-      <w:r>
-        <w:rPr>
-          <w:noProof/>
-        </w:rPr>
-        <w:t>footer, 3</w:t>
-      </w:r>
-    </w:p>
-    <w:p>
-      <w:pPr>
-        <w:pStyle w:val="Index1"/>
-        <w:tabs>
-          <w:tab w:val="right" w:leader="dot" w:pos="3475"/>
-        </w:tabs>
-        <w:rPr>
-          <w:noProof/>
-        </w:rPr>
-      </w:pPr>
-      <w:r>
-        <w:rPr>
-          <w:noProof/>
-        </w:rPr>
-        <w:t>frame, 3</w:t>
-      </w:r>
-    </w:p>
-    <w:p>
-      <w:pPr>
-        <w:pStyle w:val="Index1"/>
-        <w:tabs>
-          <w:tab w:val="right" w:leader="dot" w:pos="3475"/>
-        </w:tabs>
-        <w:rPr>
-          <w:noProof/>
-        </w:rPr>
-      </w:pPr>
-      <w:r>
-        <w:rPr>
-          <w:noProof/>
-        </w:rPr>
-        <w:t>graphic, 2</w:t>
-      </w:r>
-    </w:p>
-    <w:p>
-      <w:pPr>
-        <w:pStyle w:val="Index1"/>
-        <w:tabs>
-          <w:tab w:val="right" w:leader="dot" w:pos="3475"/>
-        </w:tabs>
-        <w:rPr>
-          <w:noProof/>
-        </w:rPr>
-      </w:pPr>
-      <w:r>
-        <w:rPr>
-          <w:noProof/>
-        </w:rPr>
-        <w:t>group, 2</w:t>
-      </w:r>
-    </w:p>
-    <w:p>
-      <w:pPr>
-        <w:pStyle w:val="Index1"/>
-        <w:tabs>
-          <w:tab w:val="right" w:leader="dot" w:pos="3475"/>
-        </w:tabs>
-        <w:rPr>
-          <w:noProof/>
-        </w:rPr>
-      </w:pPr>
-      <w:r>
-        <w:rPr>
-          <w:noProof/>
-        </w:rPr>
-        <w:t>header, 3</w:t>
-      </w:r>
-    </w:p>
-    <w:p>
-      <w:pPr>
-        <w:pStyle w:val="Index1"/>
-        <w:tabs>
-          <w:tab w:val="right" w:leader="dot" w:pos="3475"/>
-        </w:tabs>
-        <w:rPr>
-          <w:noProof/>
-        </w:rPr>
-      </w:pPr>
-      <w:r>
-        <w:rPr>
-          <w:noProof/>
-        </w:rPr>
-        <w:t>H</w:t>
-      </w:r>
-      <w:r>
-        <w:rPr>
-          <w:noProof/>
-        </w:rPr>
-        <w:t>elp, 3</w:t>
-      </w:r>
-    </w:p>
-    <w:p>
-      <w:pPr>
-        <w:pStyle w:val="Index1"/>
-        <w:tabs>
-          <w:tab w:val="right" w:leader="dot" w:pos="3475"/>
-        </w:tabs>
-        <w:rPr>
-          <w:noProof/>
-        </w:rPr>
-      </w:pPr>
-      <w:r>
-        <w:rPr>
-          <w:noProof/>
-        </w:rPr>
-        <w:t>link, 4</w:t>
-      </w:r>
-    </w:p>
-    <w:p>
-      <w:pPr>
-        <w:pStyle w:val="Index1"/>
-        <w:tabs>
-          <w:tab w:val="right" w:leader="dot" w:pos="3475"/>
-        </w:tabs>
-        <w:rPr>
-          <w:noProof/>
-        </w:rPr>
-      </w:pPr>
-      <w:r>
-        <w:rPr>
-          <w:noProof/>
-        </w:rPr>
-        <w:t>margins, 2</w:t>
-      </w:r>
-    </w:p>
-    <w:p>
-      <w:pPr>
-        <w:pStyle w:val="Index1"/>
-        <w:tabs>
-          <w:tab w:val="right" w:leader="dot" w:pos="3475"/>
-        </w:tabs>
-        <w:rPr>
-          <w:noProof/>
-        </w:rPr>
-      </w:pPr>
-      <w:r>
-        <w:rPr>
-          <w:noProof/>
-        </w:rPr>
-        <w:t>normal view, 1</w:t>
-      </w:r>
-    </w:p>
-    <w:p>
-      <w:pPr>
-        <w:pStyle w:val="Index1"/>
-        <w:tabs>
-          <w:tab w:val="right" w:leader="dot" w:pos="3475"/>
-        </w:tabs>
-        <w:rPr>
-          <w:noProof/>
-        </w:rPr>
-      </w:pPr>
-      <w:r>
-        <w:rPr>
-          <w:noProof/>
-        </w:rPr>
-        <w:t>number, 4</w:t>
-      </w:r>
-    </w:p>
-    <w:p>
-      <w:pPr>
-        <w:pStyle w:val="Index1"/>
-        <w:tabs>
-          <w:tab w:val="right" w:leader="dot" w:pos="3475"/>
-        </w:tabs>
-        <w:rPr>
-          <w:noProof/>
-        </w:rPr>
-      </w:pPr>
-      <w:r>
-        <w:rPr>
-          <w:noProof/>
-        </w:rPr>
-        <w:t>picture, 2, 3, 4</w:t>
-      </w:r>
-    </w:p>
-    <w:p>
-      <w:pPr>
-        <w:pStyle w:val="Index1"/>
-        <w:tabs>
-          <w:tab w:val="right" w:leader="dot" w:pos="3475"/>
-        </w:tabs>
-        <w:rPr>
-          <w:noProof/>
-        </w:rPr>
-      </w:pPr>
-      <w:r>
-        <w:rPr>
-          <w:noProof/>
-        </w:rPr>
-        <w:t>print, 1</w:t>
-      </w:r>
-    </w:p>
-    <w:p>
-      <w:pPr>
-        <w:pStyle w:val="Index1"/>
-        <w:tabs>
-          <w:tab w:val="right" w:leader="dot" w:pos="3475"/>
-        </w:tabs>
-        <w:rPr>
-          <w:noProof/>
-        </w:rPr>
-      </w:pPr>
-      <w:r>
-        <w:rPr>
-          <w:noProof/>
-        </w:rPr>
-        <w:t>re-size, 3</w:t>
-      </w:r>
-    </w:p>
-    <w:p>
-      <w:pPr>
-        <w:pStyle w:val="Index1"/>
-        <w:tabs>
-          <w:tab w:val="right" w:leader="dot" w:pos="3475"/>
-        </w:tabs>
-        <w:rPr>
-          <w:noProof/>
-        </w:rPr>
-      </w:pPr>
-      <w:r>
-        <w:rPr>
-          <w:noProof/>
-        </w:rPr>
-        <w:t>section break, 2</w:t>
-      </w:r>
-    </w:p>
-    <w:p>
-      <w:pPr>
-        <w:pStyle w:val="Index1"/>
-        <w:tabs>
-          <w:tab w:val="right" w:leader="dot" w:pos="3475"/>
-        </w:tabs>
-        <w:rPr>
-          <w:noProof/>
-        </w:rPr>
-      </w:pPr>
-      <w:r>
-        <w:rPr>
-          <w:noProof/>
-        </w:rPr>
-        <w:t>shading, 1</w:t>
-      </w:r>
-    </w:p>
-    <w:p>
-      <w:pPr>
-        <w:pStyle w:val="Index1"/>
-        <w:tabs>
-          <w:tab w:val="right" w:leader="dot" w:pos="3475"/>
-        </w:tabs>
-        <w:rPr>
-          <w:noProof/>
-        </w:rPr>
-      </w:pPr>
-      <w:r>
-        <w:rPr>
-          <w:noProof/>
-        </w:rPr>
-        <w:t>style, 1, 2, 3, 4</w:t>
-      </w:r>
-    </w:p>
-    <w:p>
-      <w:pPr>
-        <w:pStyle w:val="Index1"/>
-        <w:tabs>
-          <w:tab w:val="right" w:leader="dot" w:pos="3475"/>
-        </w:tabs>
-        <w:rPr>
-          <w:noProof/>
-        </w:rPr>
-      </w:pPr>
-      <w:r>
-        <w:rPr>
-          <w:noProof/>
-        </w:rPr>
-        <w:t>symbol, 1</w:t>
-      </w:r>
-    </w:p>
-    <w:p>
-      <w:pPr>
-        <w:pStyle w:val="Index1"/>
-        <w:tabs>
-          <w:tab w:val="right" w:leader="dot" w:pos="3475"/>
-        </w:tabs>
-        <w:rPr>
-          <w:noProof/>
-        </w:rPr>
-      </w:pPr>
-      <w:r>
-        <w:rPr>
-          <w:noProof/>
-        </w:rPr>
-        <w:t>Table of Contents, 3</w:t>
-      </w:r>
-    </w:p>
-    <w:p>
-      <w:pPr>
-        <w:pStyle w:val="Index1"/>
-        <w:tabs>
-          <w:tab w:val="right" w:leader="dot" w:pos="3475"/>
-        </w:tabs>
-        <w:rPr>
-          <w:noProof/>
-        </w:rPr>
-      </w:pPr>
-      <w:r>
-        <w:rPr>
-          <w:noProof/>
-        </w:rPr>
-        <w:t>template, 4</w:t>
-      </w:r>
-    </w:p>
-    <w:p>
-      <w:pPr>
-        <w:pStyle w:val="Index1"/>
-        <w:tabs>
-          <w:tab w:val="right" w:leader="dot" w:pos="3475"/>
-        </w:tabs>
-        <w:rPr>
-          <w:noProof/>
-        </w:rPr>
-      </w:pPr>
-      <w:r>
-        <w:rPr>
-          <w:noProof/>
-        </w:rPr>
-        <w:t>ungroup, 2</w:t>
-      </w:r>
-    </w:p>
-    <w:p>
-      <w:pPr>
-        <w:pStyle w:val="Index1"/>
-        <w:tabs>
-          <w:tab w:val="right" w:leader="dot" w:pos="3475"/>
-        </w:tabs>
-        <w:rPr>
-          <w:noProof/>
-        </w:rPr>
-      </w:pPr>
-      <w:r>
-        <w:rPr>
-          <w:noProof/>
-        </w:rPr>
-        <w:t>Wingdings, 1</w:t>
-      </w:r>
+      <w:bookmarkStart w:id="45" w:name="_Toc35154388"/>
+      <w:bookmarkStart w:id="46" w:name="_Toc35154911"/>
+      <w:bookmarkStart w:id="47" w:name="_Toc36023011"/>
+    </w:p>
+    <w:p>
+      <w:pPr>
+        <w:pStyle w:val="Heading1"/>
+      </w:pPr>
+      <w:bookmarkStart w:id="48" w:name="_Toc508883034"/>
+      <w:r>
+        <w:lastRenderedPageBreak/>
+        <w:t>Index</w:t>
+      </w:r>
+      <w:bookmarkEnd w:id="45"/>
+      <w:bookmarkEnd w:id="46"/>
+      <w:bookmarkEnd w:id="47"/>
+      <w:bookmarkEnd w:id="48"/>
     </w:p>
     <w:p>
       <w:pPr>
@@ -8236,12 +8462,20 @@
           <w:noProof/>
         </w:rPr>
         <w:sectPr>
-          <w:type w:val="continuous"/>
           <w:pgSz w:w="12240" w:h="15840" w:code="1"/>
           <w:pgMar w:top="1800" w:right="1195" w:bottom="1440" w:left="3355" w:header="720" w:footer="720" w:gutter="0"/>
-          <w:cols w:num="2" w:space="720"/>
+          <w:cols w:space="720"/>
         </w:sectPr>
       </w:pPr>
+      <w:r>
+        <w:fldChar w:fldCharType="begin"/>
+      </w:r>
+      <w:r>
+        <w:instrText xml:space="preserve"> INDEX \c "2" \z "1033" </w:instrText>
+      </w:r>
+      <w:r>
+        <w:fldChar w:fldCharType="separate"/>
+      </w:r>
     </w:p>
     <w:p>
       <w:pPr>
@@ -8374,7 +8608,7 @@
         <w:rStyle w:val="PageNumber"/>
         <w:noProof/>
       </w:rPr>
-      <w:t>30</w:t>
+      <w:t>19</w:t>
     </w:r>
     <w:r>
       <w:rPr>
@@ -8596,6 +8830,119 @@
     </w:lvl>
   </w:abstractNum>
   <w:abstractNum w:abstractNumId="5" w15:restartNumberingAfterBreak="0">
+    <w:nsid w:val="00DD5F7E"/>
+    <w:multiLevelType w:val="hybridMultilevel"/>
+    <w:tmpl w:val="4B72C4DA"/>
+    <w:lvl w:ilvl="0" w:tplc="04090001">
+      <w:start w:val="1"/>
+      <w:numFmt w:val="bullet"/>
+      <w:lvlText w:val=""/>
+      <w:lvlJc w:val="left"/>
+      <w:pPr>
+        <w:ind w:left="720" w:hanging="360"/>
+      </w:pPr>
+      <w:rPr>
+        <w:rFonts w:ascii="Symbol" w:hAnsi="Symbol" w:hint="default"/>
+      </w:rPr>
+    </w:lvl>
+    <w:lvl w:ilvl="1" w:tplc="04090003" w:tentative="1">
+      <w:start w:val="1"/>
+      <w:numFmt w:val="bullet"/>
+      <w:lvlText w:val="o"/>
+      <w:lvlJc w:val="left"/>
+      <w:pPr>
+        <w:ind w:left="1440" w:hanging="360"/>
+      </w:pPr>
+      <w:rPr>
+        <w:rFonts w:ascii="Courier New" w:hAnsi="Courier New" w:cs="Courier New" w:hint="default"/>
+      </w:rPr>
+    </w:lvl>
+    <w:lvl w:ilvl="2" w:tplc="04090005" w:tentative="1">
+      <w:start w:val="1"/>
+      <w:numFmt w:val="bullet"/>
+      <w:lvlText w:val=""/>
+      <w:lvlJc w:val="left"/>
+      <w:pPr>
+        <w:ind w:left="2160" w:hanging="360"/>
+      </w:pPr>
+      <w:rPr>
+        <w:rFonts w:ascii="Wingdings" w:hAnsi="Wingdings" w:hint="default"/>
+      </w:rPr>
+    </w:lvl>
+    <w:lvl w:ilvl="3" w:tplc="04090001" w:tentative="1">
+      <w:start w:val="1"/>
+      <w:numFmt w:val="bullet"/>
+      <w:lvlText w:val=""/>
+      <w:lvlJc w:val="left"/>
+      <w:pPr>
+        <w:ind w:left="2880" w:hanging="360"/>
+      </w:pPr>
+      <w:rPr>
+        <w:rFonts w:ascii="Symbol" w:hAnsi="Symbol" w:hint="default"/>
+      </w:rPr>
+    </w:lvl>
+    <w:lvl w:ilvl="4" w:tplc="04090003" w:tentative="1">
+      <w:start w:val="1"/>
+      <w:numFmt w:val="bullet"/>
+      <w:lvlText w:val="o"/>
+      <w:lvlJc w:val="left"/>
+      <w:pPr>
+        <w:ind w:left="3600" w:hanging="360"/>
+      </w:pPr>
+      <w:rPr>
+        <w:rFonts w:ascii="Courier New" w:hAnsi="Courier New" w:cs="Courier New" w:hint="default"/>
+      </w:rPr>
+    </w:lvl>
+    <w:lvl w:ilvl="5" w:tplc="04090005" w:tentative="1">
+      <w:start w:val="1"/>
+      <w:numFmt w:val="bullet"/>
+      <w:lvlText w:val=""/>
+      <w:lvlJc w:val="left"/>
+      <w:pPr>
+        <w:ind w:left="4320" w:hanging="360"/>
+      </w:pPr>
+      <w:rPr>
+        <w:rFonts w:ascii="Wingdings" w:hAnsi="Wingdings" w:hint="default"/>
+      </w:rPr>
+    </w:lvl>
+    <w:lvl w:ilvl="6" w:tplc="04090001" w:tentative="1">
+      <w:start w:val="1"/>
+      <w:numFmt w:val="bullet"/>
+      <w:lvlText w:val=""/>
+      <w:lvlJc w:val="left"/>
+      <w:pPr>
+        <w:ind w:left="5040" w:hanging="360"/>
+      </w:pPr>
+      <w:rPr>
+        <w:rFonts w:ascii="Symbol" w:hAnsi="Symbol" w:hint="default"/>
+      </w:rPr>
+    </w:lvl>
+    <w:lvl w:ilvl="7" w:tplc="04090003" w:tentative="1">
+      <w:start w:val="1"/>
+      <w:numFmt w:val="bullet"/>
+      <w:lvlText w:val="o"/>
+      <w:lvlJc w:val="left"/>
+      <w:pPr>
+        <w:ind w:left="5760" w:hanging="360"/>
+      </w:pPr>
+      <w:rPr>
+        <w:rFonts w:ascii="Courier New" w:hAnsi="Courier New" w:cs="Courier New" w:hint="default"/>
+      </w:rPr>
+    </w:lvl>
+    <w:lvl w:ilvl="8" w:tplc="04090005" w:tentative="1">
+      <w:start w:val="1"/>
+      <w:numFmt w:val="bullet"/>
+      <w:lvlText w:val=""/>
+      <w:lvlJc w:val="left"/>
+      <w:pPr>
+        <w:ind w:left="6480" w:hanging="360"/>
+      </w:pPr>
+      <w:rPr>
+        <w:rFonts w:ascii="Wingdings" w:hAnsi="Wingdings" w:hint="default"/>
+      </w:rPr>
+    </w:lvl>
+  </w:abstractNum>
+  <w:abstractNum w:abstractNumId="6" w15:restartNumberingAfterBreak="0">
     <w:nsid w:val="091760E7"/>
     <w:multiLevelType w:val="singleLevel"/>
     <w:tmpl w:val="A19A21BE"/>
@@ -8607,7 +8954,120 @@
       <w:lvlJc w:val="left"/>
     </w:lvl>
   </w:abstractNum>
-  <w:abstractNum w:abstractNumId="6" w15:restartNumberingAfterBreak="0">
+  <w:abstractNum w:abstractNumId="7" w15:restartNumberingAfterBreak="0">
+    <w:nsid w:val="096224B2"/>
+    <w:multiLevelType w:val="hybridMultilevel"/>
+    <w:tmpl w:val="4CCEDDD8"/>
+    <w:lvl w:ilvl="0" w:tplc="04090001">
+      <w:start w:val="1"/>
+      <w:numFmt w:val="bullet"/>
+      <w:lvlText w:val=""/>
+      <w:lvlJc w:val="left"/>
+      <w:pPr>
+        <w:ind w:left="720" w:hanging="360"/>
+      </w:pPr>
+      <w:rPr>
+        <w:rFonts w:ascii="Symbol" w:hAnsi="Symbol" w:hint="default"/>
+      </w:rPr>
+    </w:lvl>
+    <w:lvl w:ilvl="1" w:tplc="04090003">
+      <w:start w:val="1"/>
+      <w:numFmt w:val="bullet"/>
+      <w:lvlText w:val="o"/>
+      <w:lvlJc w:val="left"/>
+      <w:pPr>
+        <w:ind w:left="1440" w:hanging="360"/>
+      </w:pPr>
+      <w:rPr>
+        <w:rFonts w:ascii="Courier New" w:hAnsi="Courier New" w:cs="Courier New" w:hint="default"/>
+      </w:rPr>
+    </w:lvl>
+    <w:lvl w:ilvl="2" w:tplc="04090005" w:tentative="1">
+      <w:start w:val="1"/>
+      <w:numFmt w:val="bullet"/>
+      <w:lvlText w:val=""/>
+      <w:lvlJc w:val="left"/>
+      <w:pPr>
+        <w:ind w:left="2160" w:hanging="360"/>
+      </w:pPr>
+      <w:rPr>
+        <w:rFonts w:ascii="Wingdings" w:hAnsi="Wingdings" w:hint="default"/>
+      </w:rPr>
+    </w:lvl>
+    <w:lvl w:ilvl="3" w:tplc="04090001" w:tentative="1">
+      <w:start w:val="1"/>
+      <w:numFmt w:val="bullet"/>
+      <w:lvlText w:val=""/>
+      <w:lvlJc w:val="left"/>
+      <w:pPr>
+        <w:ind w:left="2880" w:hanging="360"/>
+      </w:pPr>
+      <w:rPr>
+        <w:rFonts w:ascii="Symbol" w:hAnsi="Symbol" w:hint="default"/>
+      </w:rPr>
+    </w:lvl>
+    <w:lvl w:ilvl="4" w:tplc="04090003" w:tentative="1">
+      <w:start w:val="1"/>
+      <w:numFmt w:val="bullet"/>
+      <w:lvlText w:val="o"/>
+      <w:lvlJc w:val="left"/>
+      <w:pPr>
+        <w:ind w:left="3600" w:hanging="360"/>
+      </w:pPr>
+      <w:rPr>
+        <w:rFonts w:ascii="Courier New" w:hAnsi="Courier New" w:cs="Courier New" w:hint="default"/>
+      </w:rPr>
+    </w:lvl>
+    <w:lvl w:ilvl="5" w:tplc="04090005" w:tentative="1">
+      <w:start w:val="1"/>
+      <w:numFmt w:val="bullet"/>
+      <w:lvlText w:val=""/>
+      <w:lvlJc w:val="left"/>
+      <w:pPr>
+        <w:ind w:left="4320" w:hanging="360"/>
+      </w:pPr>
+      <w:rPr>
+        <w:rFonts w:ascii="Wingdings" w:hAnsi="Wingdings" w:hint="default"/>
+      </w:rPr>
+    </w:lvl>
+    <w:lvl w:ilvl="6" w:tplc="04090001" w:tentative="1">
+      <w:start w:val="1"/>
+      <w:numFmt w:val="bullet"/>
+      <w:lvlText w:val=""/>
+      <w:lvlJc w:val="left"/>
+      <w:pPr>
+        <w:ind w:left="5040" w:hanging="360"/>
+      </w:pPr>
+      <w:rPr>
+        <w:rFonts w:ascii="Symbol" w:hAnsi="Symbol" w:hint="default"/>
+      </w:rPr>
+    </w:lvl>
+    <w:lvl w:ilvl="7" w:tplc="04090003" w:tentative="1">
+      <w:start w:val="1"/>
+      <w:numFmt w:val="bullet"/>
+      <w:lvlText w:val="o"/>
+      <w:lvlJc w:val="left"/>
+      <w:pPr>
+        <w:ind w:left="5760" w:hanging="360"/>
+      </w:pPr>
+      <w:rPr>
+        <w:rFonts w:ascii="Courier New" w:hAnsi="Courier New" w:cs="Courier New" w:hint="default"/>
+      </w:rPr>
+    </w:lvl>
+    <w:lvl w:ilvl="8" w:tplc="04090005" w:tentative="1">
+      <w:start w:val="1"/>
+      <w:numFmt w:val="bullet"/>
+      <w:lvlText w:val=""/>
+      <w:lvlJc w:val="left"/>
+      <w:pPr>
+        <w:ind w:left="6480" w:hanging="360"/>
+      </w:pPr>
+      <w:rPr>
+        <w:rFonts w:ascii="Wingdings" w:hAnsi="Wingdings" w:hint="default"/>
+      </w:rPr>
+    </w:lvl>
+  </w:abstractNum>
+  <w:abstractNum w:abstractNumId="8" w15:restartNumberingAfterBreak="0">
     <w:nsid w:val="0CF832F1"/>
     <w:multiLevelType w:val="hybridMultilevel"/>
     <w:tmpl w:val="F0020A4E"/>
@@ -8693,7 +9153,7 @@
       </w:pPr>
     </w:lvl>
   </w:abstractNum>
-  <w:abstractNum w:abstractNumId="7" w15:restartNumberingAfterBreak="0">
+  <w:abstractNum w:abstractNumId="9" w15:restartNumberingAfterBreak="0">
     <w:nsid w:val="0D3C672D"/>
     <w:multiLevelType w:val="hybridMultilevel"/>
     <w:tmpl w:val="CC3EFF4A"/>
@@ -8782,7 +9242,7 @@
       </w:pPr>
     </w:lvl>
   </w:abstractNum>
-  <w:abstractNum w:abstractNumId="8" w15:restartNumberingAfterBreak="0">
+  <w:abstractNum w:abstractNumId="10" w15:restartNumberingAfterBreak="0">
     <w:nsid w:val="199F25A1"/>
     <w:multiLevelType w:val="singleLevel"/>
     <w:tmpl w:val="B8D67778"/>
@@ -8801,7 +9261,7 @@
       </w:rPr>
     </w:lvl>
   </w:abstractNum>
-  <w:abstractNum w:abstractNumId="9" w15:restartNumberingAfterBreak="0">
+  <w:abstractNum w:abstractNumId="11" w15:restartNumberingAfterBreak="0">
     <w:nsid w:val="232C0E7C"/>
     <w:multiLevelType w:val="hybridMultilevel"/>
     <w:tmpl w:val="CB2CFB14"/>
@@ -8914,7 +9374,7 @@
       </w:rPr>
     </w:lvl>
   </w:abstractNum>
-  <w:abstractNum w:abstractNumId="10" w15:restartNumberingAfterBreak="0">
+  <w:abstractNum w:abstractNumId="12" w15:restartNumberingAfterBreak="0">
     <w:nsid w:val="2EFF2345"/>
     <w:multiLevelType w:val="singleLevel"/>
     <w:tmpl w:val="F15AD34A"/>
@@ -8933,7 +9393,233 @@
       </w:rPr>
     </w:lvl>
   </w:abstractNum>
-  <w:abstractNum w:abstractNumId="11" w15:restartNumberingAfterBreak="0">
+  <w:abstractNum w:abstractNumId="13" w15:restartNumberingAfterBreak="0">
+    <w:nsid w:val="37561F67"/>
+    <w:multiLevelType w:val="hybridMultilevel"/>
+    <w:tmpl w:val="4C1EA41C"/>
+    <w:lvl w:ilvl="0" w:tplc="04090001">
+      <w:start w:val="1"/>
+      <w:numFmt w:val="bullet"/>
+      <w:lvlText w:val=""/>
+      <w:lvlJc w:val="left"/>
+      <w:pPr>
+        <w:ind w:left="720" w:hanging="360"/>
+      </w:pPr>
+      <w:rPr>
+        <w:rFonts w:ascii="Symbol" w:hAnsi="Symbol" w:hint="default"/>
+      </w:rPr>
+    </w:lvl>
+    <w:lvl w:ilvl="1" w:tplc="04090003">
+      <w:start w:val="1"/>
+      <w:numFmt w:val="bullet"/>
+      <w:lvlText w:val="o"/>
+      <w:lvlJc w:val="left"/>
+      <w:pPr>
+        <w:ind w:left="1440" w:hanging="360"/>
+      </w:pPr>
+      <w:rPr>
+        <w:rFonts w:ascii="Courier New" w:hAnsi="Courier New" w:cs="Courier New" w:hint="default"/>
+      </w:rPr>
+    </w:lvl>
+    <w:lvl w:ilvl="2" w:tplc="04090005" w:tentative="1">
+      <w:start w:val="1"/>
+      <w:numFmt w:val="bullet"/>
+      <w:lvlText w:val=""/>
+      <w:lvlJc w:val="left"/>
+      <w:pPr>
+        <w:ind w:left="2160" w:hanging="360"/>
+      </w:pPr>
+      <w:rPr>
+        <w:rFonts w:ascii="Wingdings" w:hAnsi="Wingdings" w:hint="default"/>
+      </w:rPr>
+    </w:lvl>
+    <w:lvl w:ilvl="3" w:tplc="04090001" w:tentative="1">
+      <w:start w:val="1"/>
+      <w:numFmt w:val="bullet"/>
+      <w:lvlText w:val=""/>
+      <w:lvlJc w:val="left"/>
+      <w:pPr>
+        <w:ind w:left="2880" w:hanging="360"/>
+      </w:pPr>
+      <w:rPr>
+        <w:rFonts w:ascii="Symbol" w:hAnsi="Symbol" w:hint="default"/>
+      </w:rPr>
+    </w:lvl>
+    <w:lvl w:ilvl="4" w:tplc="04090003" w:tentative="1">
+      <w:start w:val="1"/>
+      <w:numFmt w:val="bullet"/>
+      <w:lvlText w:val="o"/>
+      <w:lvlJc w:val="left"/>
+      <w:pPr>
+        <w:ind w:left="3600" w:hanging="360"/>
+      </w:pPr>
+      <w:rPr>
+        <w:rFonts w:ascii="Courier New" w:hAnsi="Courier New" w:cs="Courier New" w:hint="default"/>
+      </w:rPr>
+    </w:lvl>
+    <w:lvl w:ilvl="5" w:tplc="04090005" w:tentative="1">
+      <w:start w:val="1"/>
+      <w:numFmt w:val="bullet"/>
+      <w:lvlText w:val=""/>
+      <w:lvlJc w:val="left"/>
+      <w:pPr>
+        <w:ind w:left="4320" w:hanging="360"/>
+      </w:pPr>
+      <w:rPr>
+        <w:rFonts w:ascii="Wingdings" w:hAnsi="Wingdings" w:hint="default"/>
+      </w:rPr>
+    </w:lvl>
+    <w:lvl w:ilvl="6" w:tplc="04090001" w:tentative="1">
+      <w:start w:val="1"/>
+      <w:numFmt w:val="bullet"/>
+      <w:lvlText w:val=""/>
+      <w:lvlJc w:val="left"/>
+      <w:pPr>
+        <w:ind w:left="5040" w:hanging="360"/>
+      </w:pPr>
+      <w:rPr>
+        <w:rFonts w:ascii="Symbol" w:hAnsi="Symbol" w:hint="default"/>
+      </w:rPr>
+    </w:lvl>
+    <w:lvl w:ilvl="7" w:tplc="04090003" w:tentative="1">
+      <w:start w:val="1"/>
+      <w:numFmt w:val="bullet"/>
+      <w:lvlText w:val="o"/>
+      <w:lvlJc w:val="left"/>
+      <w:pPr>
+        <w:ind w:left="5760" w:hanging="360"/>
+      </w:pPr>
+      <w:rPr>
+        <w:rFonts w:ascii="Courier New" w:hAnsi="Courier New" w:cs="Courier New" w:hint="default"/>
+      </w:rPr>
+    </w:lvl>
+    <w:lvl w:ilvl="8" w:tplc="04090005" w:tentative="1">
+      <w:start w:val="1"/>
+      <w:numFmt w:val="bullet"/>
+      <w:lvlText w:val=""/>
+      <w:lvlJc w:val="left"/>
+      <w:pPr>
+        <w:ind w:left="6480" w:hanging="360"/>
+      </w:pPr>
+      <w:rPr>
+        <w:rFonts w:ascii="Wingdings" w:hAnsi="Wingdings" w:hint="default"/>
+      </w:rPr>
+    </w:lvl>
+  </w:abstractNum>
+  <w:abstractNum w:abstractNumId="14" w15:restartNumberingAfterBreak="0">
+    <w:nsid w:val="3A2A0A43"/>
+    <w:multiLevelType w:val="hybridMultilevel"/>
+    <w:tmpl w:val="AF3C106A"/>
+    <w:lvl w:ilvl="0" w:tplc="04090001">
+      <w:start w:val="1"/>
+      <w:numFmt w:val="bullet"/>
+      <w:lvlText w:val=""/>
+      <w:lvlJc w:val="left"/>
+      <w:pPr>
+        <w:ind w:left="1080" w:hanging="360"/>
+      </w:pPr>
+      <w:rPr>
+        <w:rFonts w:ascii="Symbol" w:hAnsi="Symbol" w:hint="default"/>
+      </w:rPr>
+    </w:lvl>
+    <w:lvl w:ilvl="1" w:tplc="04090003" w:tentative="1">
+      <w:start w:val="1"/>
+      <w:numFmt w:val="bullet"/>
+      <w:lvlText w:val="o"/>
+      <w:lvlJc w:val="left"/>
+      <w:pPr>
+        <w:ind w:left="1800" w:hanging="360"/>
+      </w:pPr>
+      <w:rPr>
+        <w:rFonts w:ascii="Courier New" w:hAnsi="Courier New" w:cs="Courier New" w:hint="default"/>
+      </w:rPr>
+    </w:lvl>
+    <w:lvl w:ilvl="2" w:tplc="04090005" w:tentative="1">
+      <w:start w:val="1"/>
+      <w:numFmt w:val="bullet"/>
+      <w:lvlText w:val=""/>
+      <w:lvlJc w:val="left"/>
+      <w:pPr>
+        <w:ind w:left="2520" w:hanging="360"/>
+      </w:pPr>
+      <w:rPr>
+        <w:rFonts w:ascii="Wingdings" w:hAnsi="Wingdings" w:hint="default"/>
+      </w:rPr>
+    </w:lvl>
+    <w:lvl w:ilvl="3" w:tplc="04090001" w:tentative="1">
+      <w:start w:val="1"/>
+      <w:numFmt w:val="bullet"/>
+      <w:lvlText w:val=""/>
+      <w:lvlJc w:val="left"/>
+      <w:pPr>
+        <w:ind w:left="3240" w:hanging="360"/>
+      </w:pPr>
+      <w:rPr>
+        <w:rFonts w:ascii="Symbol" w:hAnsi="Symbol" w:hint="default"/>
+      </w:rPr>
+    </w:lvl>
+    <w:lvl w:ilvl="4" w:tplc="04090003" w:tentative="1">
+      <w:start w:val="1"/>
+      <w:numFmt w:val="bullet"/>
+      <w:lvlText w:val="o"/>
+      <w:lvlJc w:val="left"/>
+      <w:pPr>
+        <w:ind w:left="3960" w:hanging="360"/>
+      </w:pPr>
+      <w:rPr>
+        <w:rFonts w:ascii="Courier New" w:hAnsi="Courier New" w:cs="Courier New" w:hint="default"/>
+      </w:rPr>
+    </w:lvl>
+    <w:lvl w:ilvl="5" w:tplc="04090005" w:tentative="1">
+      <w:start w:val="1"/>
+      <w:numFmt w:val="bullet"/>
+      <w:lvlText w:val=""/>
+      <w:lvlJc w:val="left"/>
+      <w:pPr>
+        <w:ind w:left="4680" w:hanging="360"/>
+      </w:pPr>
+      <w:rPr>
+        <w:rFonts w:ascii="Wingdings" w:hAnsi="Wingdings" w:hint="default"/>
+      </w:rPr>
+    </w:lvl>
+    <w:lvl w:ilvl="6" w:tplc="04090001" w:tentative="1">
+      <w:start w:val="1"/>
+      <w:numFmt w:val="bullet"/>
+      <w:lvlText w:val=""/>
+      <w:lvlJc w:val="left"/>
+      <w:pPr>
+        <w:ind w:left="5400" w:hanging="360"/>
+      </w:pPr>
+      <w:rPr>
+        <w:rFonts w:ascii="Symbol" w:hAnsi="Symbol" w:hint="default"/>
+      </w:rPr>
+    </w:lvl>
+    <w:lvl w:ilvl="7" w:tplc="04090003" w:tentative="1">
+      <w:start w:val="1"/>
+      <w:numFmt w:val="bullet"/>
+      <w:lvlText w:val="o"/>
+      <w:lvlJc w:val="left"/>
+      <w:pPr>
+        <w:ind w:left="6120" w:hanging="360"/>
+      </w:pPr>
+      <w:rPr>
+        <w:rFonts w:ascii="Courier New" w:hAnsi="Courier New" w:cs="Courier New" w:hint="default"/>
+      </w:rPr>
+    </w:lvl>
+    <w:lvl w:ilvl="8" w:tplc="04090005" w:tentative="1">
+      <w:start w:val="1"/>
+      <w:numFmt w:val="bullet"/>
+      <w:lvlText w:val=""/>
+      <w:lvlJc w:val="left"/>
+      <w:pPr>
+        <w:ind w:left="6840" w:hanging="360"/>
+      </w:pPr>
+      <w:rPr>
+        <w:rFonts w:ascii="Wingdings" w:hAnsi="Wingdings" w:hint="default"/>
+      </w:rPr>
+    </w:lvl>
+  </w:abstractNum>
+  <w:abstractNum w:abstractNumId="15" w15:restartNumberingAfterBreak="0">
     <w:nsid w:val="45702913"/>
     <w:multiLevelType w:val="singleLevel"/>
     <w:tmpl w:val="F6305A7C"/>
@@ -8945,7 +9631,7 @@
       <w:lvlJc w:val="left"/>
     </w:lvl>
   </w:abstractNum>
-  <w:abstractNum w:abstractNumId="12" w15:restartNumberingAfterBreak="0">
+  <w:abstractNum w:abstractNumId="16" w15:restartNumberingAfterBreak="0">
     <w:nsid w:val="4BC10037"/>
     <w:multiLevelType w:val="singleLevel"/>
     <w:tmpl w:val="F15AD34A"/>
@@ -8964,7 +9650,7 @@
       </w:rPr>
     </w:lvl>
   </w:abstractNum>
-  <w:abstractNum w:abstractNumId="13" w15:restartNumberingAfterBreak="0">
+  <w:abstractNum w:abstractNumId="17" w15:restartNumberingAfterBreak="0">
     <w:nsid w:val="4BD6162F"/>
     <w:multiLevelType w:val="singleLevel"/>
     <w:tmpl w:val="F15AD34A"/>
@@ -8983,7 +9669,7 @@
       </w:rPr>
     </w:lvl>
   </w:abstractNum>
-  <w:abstractNum w:abstractNumId="14" w15:restartNumberingAfterBreak="0">
+  <w:abstractNum w:abstractNumId="18" w15:restartNumberingAfterBreak="0">
     <w:nsid w:val="4BDD1E38"/>
     <w:multiLevelType w:val="hybridMultilevel"/>
     <w:tmpl w:val="FB46515A"/>
@@ -9096,7 +9782,7 @@
       </w:rPr>
     </w:lvl>
   </w:abstractNum>
-  <w:abstractNum w:abstractNumId="15" w15:restartNumberingAfterBreak="0">
+  <w:abstractNum w:abstractNumId="19" w15:restartNumberingAfterBreak="0">
     <w:nsid w:val="4C510602"/>
     <w:multiLevelType w:val="singleLevel"/>
     <w:tmpl w:val="F1444738"/>
@@ -9117,7 +9803,7 @@
       </w:rPr>
     </w:lvl>
   </w:abstractNum>
-  <w:abstractNum w:abstractNumId="16" w15:restartNumberingAfterBreak="0">
+  <w:abstractNum w:abstractNumId="20" w15:restartNumberingAfterBreak="0">
     <w:nsid w:val="4F61077B"/>
     <w:multiLevelType w:val="singleLevel"/>
     <w:tmpl w:val="39CC91A4"/>
@@ -9132,7 +9818,7 @@
       </w:pPr>
     </w:lvl>
   </w:abstractNum>
-  <w:abstractNum w:abstractNumId="17" w15:restartNumberingAfterBreak="0">
+  <w:abstractNum w:abstractNumId="21" w15:restartNumberingAfterBreak="0">
     <w:nsid w:val="51045A21"/>
     <w:multiLevelType w:val="hybridMultilevel"/>
     <w:tmpl w:val="FD880446"/>
@@ -9245,7 +9931,7 @@
       </w:rPr>
     </w:lvl>
   </w:abstractNum>
-  <w:abstractNum w:abstractNumId="18" w15:restartNumberingAfterBreak="0">
+  <w:abstractNum w:abstractNumId="22" w15:restartNumberingAfterBreak="0">
     <w:nsid w:val="579B0C49"/>
     <w:multiLevelType w:val="singleLevel"/>
     <w:tmpl w:val="B8D67778"/>
@@ -9264,7 +9950,7 @@
       </w:rPr>
     </w:lvl>
   </w:abstractNum>
-  <w:abstractNum w:abstractNumId="19" w15:restartNumberingAfterBreak="0">
+  <w:abstractNum w:abstractNumId="23" w15:restartNumberingAfterBreak="0">
     <w:nsid w:val="5F436190"/>
     <w:multiLevelType w:val="singleLevel"/>
     <w:tmpl w:val="D7CE7166"/>
@@ -9285,7 +9971,7 @@
       </w:rPr>
     </w:lvl>
   </w:abstractNum>
-  <w:abstractNum w:abstractNumId="20" w15:restartNumberingAfterBreak="0">
+  <w:abstractNum w:abstractNumId="24" w15:restartNumberingAfterBreak="0">
     <w:nsid w:val="62540DA9"/>
     <w:multiLevelType w:val="singleLevel"/>
     <w:tmpl w:val="B8D67778"/>
@@ -9304,7 +9990,7 @@
       </w:rPr>
     </w:lvl>
   </w:abstractNum>
-  <w:abstractNum w:abstractNumId="21" w15:restartNumberingAfterBreak="0">
+  <w:abstractNum w:abstractNumId="25" w15:restartNumberingAfterBreak="0">
     <w:nsid w:val="63882B2E"/>
     <w:multiLevelType w:val="singleLevel"/>
     <w:tmpl w:val="8D1E4DD4"/>
@@ -9316,7 +10002,7 @@
       <w:lvlJc w:val="left"/>
     </w:lvl>
   </w:abstractNum>
-  <w:abstractNum w:abstractNumId="22" w15:restartNumberingAfterBreak="0">
+  <w:abstractNum w:abstractNumId="26" w15:restartNumberingAfterBreak="0">
     <w:nsid w:val="6C98497C"/>
     <w:multiLevelType w:val="hybridMultilevel"/>
     <w:tmpl w:val="7EC604A2"/>
@@ -9429,7 +10115,7 @@
       </w:rPr>
     </w:lvl>
   </w:abstractNum>
-  <w:abstractNum w:abstractNumId="23" w15:restartNumberingAfterBreak="0">
+  <w:abstractNum w:abstractNumId="27" w15:restartNumberingAfterBreak="0">
     <w:nsid w:val="70507BFC"/>
     <w:multiLevelType w:val="singleLevel"/>
     <w:tmpl w:val="80DE380C"/>
@@ -9441,7 +10127,7 @@
       <w:lvlJc w:val="left"/>
     </w:lvl>
   </w:abstractNum>
-  <w:abstractNum w:abstractNumId="24" w15:restartNumberingAfterBreak="0">
+  <w:abstractNum w:abstractNumId="28" w15:restartNumberingAfterBreak="0">
     <w:nsid w:val="749D7287"/>
     <w:multiLevelType w:val="singleLevel"/>
     <w:tmpl w:val="DE76053A"/>
@@ -9453,7 +10139,7 @@
       <w:lvlJc w:val="left"/>
     </w:lvl>
   </w:abstractNum>
-  <w:abstractNum w:abstractNumId="25" w15:restartNumberingAfterBreak="0">
+  <w:abstractNum w:abstractNumId="29" w15:restartNumberingAfterBreak="0">
     <w:nsid w:val="75D550E5"/>
     <w:multiLevelType w:val="hybridMultilevel"/>
     <w:tmpl w:val="57ACD532"/>
@@ -9566,7 +10252,7 @@
       </w:pPr>
     </w:lvl>
   </w:abstractNum>
-  <w:abstractNum w:abstractNumId="26" w15:restartNumberingAfterBreak="0">
+  <w:abstractNum w:abstractNumId="30" w15:restartNumberingAfterBreak="0">
     <w:nsid w:val="77CA5CEA"/>
     <w:multiLevelType w:val="hybridMultilevel"/>
     <w:tmpl w:val="7DC45528"/>
@@ -9767,13 +10453,13 @@
     </w:lvlOverride>
   </w:num>
   <w:num w:numId="7">
-    <w:abstractNumId w:val="8"/>
+    <w:abstractNumId w:val="10"/>
   </w:num>
   <w:num w:numId="8">
-    <w:abstractNumId w:val="18"/>
+    <w:abstractNumId w:val="22"/>
   </w:num>
   <w:num w:numId="9">
-    <w:abstractNumId w:val="20"/>
+    <w:abstractNumId w:val="24"/>
   </w:num>
   <w:num w:numId="10">
     <w:abstractNumId w:val="4"/>
@@ -9795,7 +10481,7 @@
     </w:lvlOverride>
   </w:num>
   <w:num w:numId="11">
-    <w:abstractNumId w:val="19"/>
+    <w:abstractNumId w:val="23"/>
   </w:num>
   <w:num w:numId="12">
     <w:abstractNumId w:val="4"/>
@@ -9817,7 +10503,7 @@
     </w:lvlOverride>
   </w:num>
   <w:num w:numId="13">
-    <w:abstractNumId w:val="15"/>
+    <w:abstractNumId w:val="19"/>
   </w:num>
   <w:num w:numId="14">
     <w:abstractNumId w:val="4"/>
@@ -9896,25 +10582,25 @@
     </w:lvlOverride>
   </w:num>
   <w:num w:numId="18">
-    <w:abstractNumId w:val="21"/>
+    <w:abstractNumId w:val="25"/>
   </w:num>
   <w:num w:numId="19">
-    <w:abstractNumId w:val="5"/>
+    <w:abstractNumId w:val="6"/>
   </w:num>
   <w:num w:numId="20">
-    <w:abstractNumId w:val="24"/>
+    <w:abstractNumId w:val="28"/>
   </w:num>
   <w:num w:numId="21">
-    <w:abstractNumId w:val="23"/>
+    <w:abstractNumId w:val="27"/>
   </w:num>
   <w:num w:numId="22">
-    <w:abstractNumId w:val="11"/>
+    <w:abstractNumId w:val="15"/>
   </w:num>
   <w:num w:numId="23">
-    <w:abstractNumId w:val="16"/>
+    <w:abstractNumId w:val="20"/>
   </w:num>
   <w:num w:numId="24">
-    <w:abstractNumId w:val="16"/>
+    <w:abstractNumId w:val="20"/>
     <w:lvlOverride w:ilvl="0">
       <w:lvl w:ilvl="0">
         <w:start w:val="1"/>
@@ -9929,7 +10615,7 @@
     </w:lvlOverride>
   </w:num>
   <w:num w:numId="25">
-    <w:abstractNumId w:val="16"/>
+    <w:abstractNumId w:val="20"/>
     <w:lvlOverride w:ilvl="0">
       <w:lvl w:ilvl="0">
         <w:start w:val="1"/>
@@ -9944,7 +10630,7 @@
     </w:lvlOverride>
   </w:num>
   <w:num w:numId="26">
-    <w:abstractNumId w:val="16"/>
+    <w:abstractNumId w:val="20"/>
     <w:lvlOverride w:ilvl="0">
       <w:lvl w:ilvl="0">
         <w:start w:val="1"/>
@@ -9959,7 +10645,7 @@
     </w:lvlOverride>
   </w:num>
   <w:num w:numId="27">
-    <w:abstractNumId w:val="16"/>
+    <w:abstractNumId w:val="20"/>
     <w:lvlOverride w:ilvl="0">
       <w:lvl w:ilvl="0">
         <w:start w:val="1"/>
@@ -9974,10 +10660,10 @@
     </w:lvlOverride>
   </w:num>
   <w:num w:numId="28">
-    <w:abstractNumId w:val="12"/>
+    <w:abstractNumId w:val="16"/>
   </w:num>
   <w:num w:numId="29">
-    <w:abstractNumId w:val="10"/>
+    <w:abstractNumId w:val="12"/>
   </w:num>
   <w:num w:numId="30">
     <w:abstractNumId w:val="3"/>
@@ -9992,13 +10678,13 @@
     <w:abstractNumId w:val="1"/>
   </w:num>
   <w:num w:numId="34">
-    <w:abstractNumId w:val="25"/>
+    <w:abstractNumId w:val="29"/>
   </w:num>
   <w:num w:numId="35">
-    <w:abstractNumId w:val="13"/>
+    <w:abstractNumId w:val="17"/>
   </w:num>
   <w:num w:numId="36">
-    <w:abstractNumId w:val="20"/>
+    <w:abstractNumId w:val="24"/>
     <w:lvlOverride w:ilvl="0">
       <w:lvl w:ilvl="0">
         <w:start w:val="1"/>
@@ -10017,25 +10703,37 @@
     </w:lvlOverride>
   </w:num>
   <w:num w:numId="37">
-    <w:abstractNumId w:val="6"/>
+    <w:abstractNumId w:val="8"/>
   </w:num>
   <w:num w:numId="38">
+    <w:abstractNumId w:val="9"/>
+  </w:num>
+  <w:num w:numId="39">
+    <w:abstractNumId w:val="11"/>
+  </w:num>
+  <w:num w:numId="40">
+    <w:abstractNumId w:val="30"/>
+  </w:num>
+  <w:num w:numId="41">
+    <w:abstractNumId w:val="26"/>
+  </w:num>
+  <w:num w:numId="42">
+    <w:abstractNumId w:val="21"/>
+  </w:num>
+  <w:num w:numId="43">
+    <w:abstractNumId w:val="18"/>
+  </w:num>
+  <w:num w:numId="44">
+    <w:abstractNumId w:val="5"/>
+  </w:num>
+  <w:num w:numId="45">
+    <w:abstractNumId w:val="14"/>
+  </w:num>
+  <w:num w:numId="46">
     <w:abstractNumId w:val="7"/>
   </w:num>
-  <w:num w:numId="39">
-    <w:abstractNumId w:val="9"/>
-  </w:num>
-  <w:num w:numId="40">
-    <w:abstractNumId w:val="26"/>
-  </w:num>
-  <w:num w:numId="41">
-    <w:abstractNumId w:val="22"/>
-  </w:num>
-  <w:num w:numId="42">
-    <w:abstractNumId w:val="17"/>
-  </w:num>
-  <w:num w:numId="43">
-    <w:abstractNumId w:val="14"/>
+  <w:num w:numId="47">
+    <w:abstractNumId w:val="13"/>
   </w:num>
 </w:numbering>
 </file>
@@ -11782,7 +12480,7 @@
 </file>
 
 <file path=customXml/itemProps1.xml><?xml version="1.0" encoding="utf-8"?>
-<ds:datastoreItem xmlns:ds="http://schemas.openxmlformats.org/officeDocument/2006/customXml" ds:itemID="{67B545E0-29A4-432F-8FEA-31ACC22719F6}">
+<ds:datastoreItem xmlns:ds="http://schemas.openxmlformats.org/officeDocument/2006/customXml" ds:itemID="{40C9C2EA-C49D-4E53-9DBE-B2DEF01DE579}">
   <ds:schemaRefs>
     <ds:schemaRef ds:uri="http://schemas.openxmlformats.org/officeDocument/2006/bibliography"/>
   </ds:schemaRefs>

</xml_diff>

<commit_message>
Added a more concise description of the layout for the Finalize Tournament window. Information on how to organize the data, and what each cell color means as well as another updated image of the window.
</commit_message>
<xml_diff>
--- a/9tapUserManual.docx
+++ b/9tapUserManual.docx
@@ -1,6 +1,6 @@
 
 <file path=word/document.xml><?xml version="1.0" encoding="utf-8"?>
-<w:document xmlns:wpc="http://schemas.microsoft.com/office/word/2010/wordprocessingCanvas" xmlns:cx="http://schemas.microsoft.com/office/drawing/2014/chartex" xmlns:cx1="http://schemas.microsoft.com/office/drawing/2015/9/8/chartex" xmlns:cx2="http://schemas.microsoft.com/office/drawing/2015/10/21/chartex" xmlns:cx3="http://schemas.microsoft.com/office/drawing/2016/5/9/chartex" xmlns:cx4="http://schemas.microsoft.com/office/drawing/2016/5/10/chartex" xmlns:cx5="http://schemas.microsoft.com/office/drawing/2016/5/11/chartex" xmlns:cx6="http://schemas.microsoft.com/office/drawing/2016/5/12/chartex" xmlns:cx7="http://schemas.microsoft.com/office/drawing/2016/5/13/chartex" xmlns:cx8="http://schemas.microsoft.com/office/drawing/2016/5/14/chartex" xmlns:mc="http://schemas.openxmlformats.org/markup-compatibility/2006" xmlns:aink="http://schemas.microsoft.com/office/drawing/2016/ink" xmlns:am3d="http://schemas.microsoft.com/office/drawing/2017/model3d" xmlns:o="urn:schemas-microsoft-com:office:office" xmlns:r="http://schemas.openxmlformats.org/officeDocument/2006/relationships" xmlns:m="http://schemas.openxmlformats.org/officeDocument/2006/math" xmlns:v="urn:schemas-microsoft-com:vml" xmlns:wp14="http://schemas.microsoft.com/office/word/2010/wordprocessingDrawing" xmlns:wp="http://schemas.openxmlformats.org/drawingml/2006/wordprocessingDrawing" xmlns:w10="urn:schemas-microsoft-com:office:word" xmlns:w="http://schemas.openxmlformats.org/wordprocessingml/2006/main" xmlns:w14="http://schemas.microsoft.com/office/word/2010/wordml" xmlns:w15="http://schemas.microsoft.com/office/word/2012/wordml" xmlns:w16cid="http://schemas.microsoft.com/office/word/2016/wordml/cid" xmlns:w16se="http://schemas.microsoft.com/office/word/2015/wordml/symex" xmlns:wpg="http://schemas.microsoft.com/office/word/2010/wordprocessingGroup" xmlns:wpi="http://schemas.microsoft.com/office/word/2010/wordprocessingInk" xmlns:wne="http://schemas.microsoft.com/office/word/2006/wordml" xmlns:wps="http://schemas.microsoft.com/office/word/2010/wordprocessingShape" mc:Ignorable="w14 w15 w16se w16cid wp14">
+<w:document xmlns:wpc="http://schemas.microsoft.com/office/word/2010/wordprocessingCanvas" xmlns:mc="http://schemas.openxmlformats.org/markup-compatibility/2006" xmlns:o="urn:schemas-microsoft-com:office:office" xmlns:r="http://schemas.openxmlformats.org/officeDocument/2006/relationships" xmlns:m="http://schemas.openxmlformats.org/officeDocument/2006/math" xmlns:v="urn:schemas-microsoft-com:vml" xmlns:wp14="http://schemas.microsoft.com/office/word/2010/wordprocessingDrawing" xmlns:wp="http://schemas.openxmlformats.org/drawingml/2006/wordprocessingDrawing" xmlns:w10="urn:schemas-microsoft-com:office:word" xmlns:w="http://schemas.openxmlformats.org/wordprocessingml/2006/main" xmlns:w14="http://schemas.microsoft.com/office/word/2010/wordml" xmlns:w15="http://schemas.microsoft.com/office/word/2012/wordml" xmlns:wpg="http://schemas.microsoft.com/office/word/2010/wordprocessingGroup" xmlns:wpi="http://schemas.microsoft.com/office/word/2010/wordprocessingInk" xmlns:wne="http://schemas.microsoft.com/office/word/2006/wordml" xmlns:wps="http://schemas.microsoft.com/office/word/2010/wordprocessingShape" mc:Ignorable="w14 w15 wp14">
   <w:body>
     <w:p>
       <w:pPr>
@@ -53,7 +53,19 @@
         <w:rPr>
           <w:spacing w:val="-180"/>
         </w:rPr>
-        <w:t>User Manual</w:t>
+        <w:t>Use</w:t>
+      </w:r>
+      <w:r>
+        <w:rPr>
+          <w:spacing w:val="-180"/>
+        </w:rPr>
+        <w:t xml:space="preserve">r </w:t>
+      </w:r>
+      <w:r>
+        <w:rPr>
+          <w:spacing w:val="-180"/>
+        </w:rPr>
+        <w:t>Manual</w:t>
       </w:r>
     </w:p>
     <w:p>
@@ -874,8 +886,6 @@
               </w:rPr>
               <w:tab/>
             </w:r>
-            <w:bookmarkStart w:id="0" w:name="_GoBack"/>
-            <w:bookmarkEnd w:id="0"/>
             <w:r>
               <w:rPr>
                 <w:noProof/>
@@ -3824,69 +3834,86 @@
               <w:tab w:val="right" w:leader="dot" w:pos="7910"/>
             </w:tabs>
             <w:rPr>
+              <w:noProof/>
+            </w:rPr>
+          </w:pPr>
+          <w:hyperlink w:anchor="_Toc509165880" w:history="1">
+            <w:r>
+              <w:rPr>
+                <w:rStyle w:val="Hyperlink"/>
+                <w:noProof/>
+              </w:rPr>
+              <w:t>Index</w:t>
+            </w:r>
+            <w:r>
+              <w:rPr>
+                <w:noProof/>
+                <w:webHidden/>
+              </w:rPr>
+              <w:tab/>
+            </w:r>
+            <w:r>
+              <w:rPr>
+                <w:noProof/>
+                <w:webHidden/>
+              </w:rPr>
+              <w:fldChar w:fldCharType="begin"/>
+            </w:r>
+            <w:r>
+              <w:rPr>
+                <w:noProof/>
+                <w:webHidden/>
+              </w:rPr>
+              <w:instrText xml:space="preserve"> PAGEREF _Toc509165880 \h </w:instrText>
+            </w:r>
+            <w:r>
+              <w:rPr>
+                <w:noProof/>
+                <w:webHidden/>
+              </w:rPr>
+            </w:r>
+            <w:r>
+              <w:rPr>
+                <w:noProof/>
+                <w:webHidden/>
+              </w:rPr>
+              <w:fldChar w:fldCharType="separate"/>
+            </w:r>
+            <w:r>
+              <w:rPr>
+                <w:noProof/>
+                <w:webHidden/>
+              </w:rPr>
+              <w:t>39</w:t>
+            </w:r>
+            <w:r>
+              <w:rPr>
+                <w:noProof/>
+                <w:webHidden/>
+              </w:rPr>
+              <w:fldChar w:fldCharType="end"/>
+            </w:r>
+          </w:hyperlink>
+        </w:p>
+        <w:p>
+          <w:pPr>
+            <w:pStyle w:val="TOC1"/>
+            <w:tabs>
+              <w:tab w:val="right" w:leader="dot" w:pos="7910"/>
+            </w:tabs>
+            <w:rPr>
               <w:rFonts w:asciiTheme="minorHAnsi" w:eastAsiaTheme="minorEastAsia" w:hAnsiTheme="minorHAnsi" w:cstheme="minorBidi"/>
               <w:noProof/>
               <w:sz w:val="22"/>
               <w:szCs w:val="22"/>
             </w:rPr>
           </w:pPr>
-          <w:hyperlink w:anchor="_Toc509165880" w:history="1">
-            <w:r>
-              <w:rPr>
-                <w:rStyle w:val="Hyperlink"/>
-                <w:noProof/>
-              </w:rPr>
-              <w:t>Index</w:t>
-            </w:r>
-            <w:r>
-              <w:rPr>
-                <w:noProof/>
-                <w:webHidden/>
-              </w:rPr>
-              <w:tab/>
-            </w:r>
-            <w:r>
-              <w:rPr>
-                <w:noProof/>
-                <w:webHidden/>
-              </w:rPr>
-              <w:fldChar w:fldCharType="begin"/>
-            </w:r>
-            <w:r>
-              <w:rPr>
-                <w:noProof/>
-                <w:webHidden/>
-              </w:rPr>
-              <w:instrText xml:space="preserve"> PAGEREF _Toc509165880 \h </w:instrText>
-            </w:r>
-            <w:r>
-              <w:rPr>
-                <w:noProof/>
-                <w:webHidden/>
-              </w:rPr>
-            </w:r>
-            <w:r>
-              <w:rPr>
-                <w:noProof/>
-                <w:webHidden/>
-              </w:rPr>
-              <w:fldChar w:fldCharType="separate"/>
-            </w:r>
-            <w:r>
-              <w:rPr>
-                <w:noProof/>
-                <w:webHidden/>
-              </w:rPr>
-              <w:t>39</w:t>
-            </w:r>
-            <w:r>
-              <w:rPr>
-                <w:noProof/>
-                <w:webHidden/>
-              </w:rPr>
-              <w:fldChar w:fldCharType="end"/>
-            </w:r>
-          </w:hyperlink>
+          <w:r>
+            <w:rPr>
+              <w:noProof/>
+            </w:rPr>
+            <w:t>Glossary …………………………………………………………40</w:t>
+          </w:r>
         </w:p>
         <w:p>
           <w:r>
@@ -3976,7 +4003,7 @@
       <w:pPr>
         <w:pStyle w:val="Heading1"/>
       </w:pPr>
-      <w:bookmarkStart w:id="1" w:name="_Toc509165828"/>
+      <w:bookmarkStart w:id="0" w:name="_Toc509165828"/>
       <w:r>
         <w:lastRenderedPageBreak/>
         <w:t>About</w:t>
@@ -4017,7 +4044,7 @@
       <w:r>
         <w:t xml:space="preserve"> INC</w:t>
       </w:r>
-      <w:bookmarkEnd w:id="1"/>
+      <w:bookmarkEnd w:id="0"/>
     </w:p>
     <w:p>
       <w:pPr>
@@ -4192,8 +4219,8 @@
           <w:szCs w:val="20"/>
         </w:rPr>
       </w:pPr>
-      <w:bookmarkStart w:id="2" w:name="_Toc508882989"/>
-      <w:bookmarkStart w:id="3" w:name="_Toc509165829"/>
+      <w:bookmarkStart w:id="1" w:name="_Toc508882989"/>
+      <w:bookmarkStart w:id="2" w:name="_Toc509165829"/>
       <w:r>
         <w:rPr>
           <w:szCs w:val="20"/>
@@ -4201,8 +4228,8 @@
         <w:lastRenderedPageBreak/>
         <w:t>Dedication:</w:t>
       </w:r>
+      <w:bookmarkEnd w:id="1"/>
       <w:bookmarkEnd w:id="2"/>
-      <w:bookmarkEnd w:id="3"/>
     </w:p>
     <w:p>
       <w:pPr>
@@ -4237,12 +4264,13 @@
           <w:szCs w:val="40"/>
         </w:rPr>
       </w:pPr>
-      <w:bookmarkStart w:id="4" w:name="_Toc509165830"/>
+      <w:bookmarkStart w:id="3" w:name="_Toc509165830"/>
       <w:r>
         <w:rPr>
           <w:sz w:val="40"/>
           <w:szCs w:val="40"/>
         </w:rPr>
+        <w:lastRenderedPageBreak/>
         <w:t>What is</w:t>
       </w:r>
       <w:r>
@@ -4259,7 +4287,7 @@
         </w:rPr>
         <w:t>9-Tap?</w:t>
       </w:r>
-      <w:bookmarkEnd w:id="4"/>
+      <w:bookmarkEnd w:id="3"/>
     </w:p>
     <w:p>
       <w:pPr>
@@ -4400,20 +4428,79 @@
       <w:pPr>
         <w:pStyle w:val="Heading2"/>
       </w:pPr>
-      <w:bookmarkStart w:id="5" w:name="_Toc509165831"/>
-      <w:r>
+      <w:bookmarkStart w:id="4" w:name="_Toc509165831"/>
+      <w:r>
+        <w:lastRenderedPageBreak/>
         <w:t>A good place to start</w:t>
       </w:r>
+      <w:bookmarkEnd w:id="4"/>
+    </w:p>
+    <w:p>
+      <w:pPr>
+        <w:pStyle w:val="Heading3"/>
+      </w:pPr>
+      <w:bookmarkStart w:id="5" w:name="_Toc509165832"/>
+      <w:r>
+        <w:t>Quick start</w:t>
+      </w:r>
+      <w:r>
+        <w:fldChar w:fldCharType="begin"/>
+      </w:r>
+      <w:r>
+        <w:instrText xml:space="preserve"> XE "</w:instrText>
+      </w:r>
+      <w:r>
+        <w:instrText>Quick start</w:instrText>
+      </w:r>
+      <w:r>
+        <w:instrText xml:space="preserve">" </w:instrText>
+      </w:r>
+      <w:r>
+        <w:fldChar w:fldCharType="end"/>
+      </w:r>
+      <w:r>
+        <w:fldChar w:fldCharType="begin"/>
+      </w:r>
+      <w:r>
+        <w:instrText xml:space="preserve"> E "</w:instrText>
+      </w:r>
+      <w:r>
+        <w:instrText>Quick start</w:instrText>
+      </w:r>
+      <w:r>
+        <w:instrText xml:space="preserve">" </w:instrText>
+      </w:r>
+      <w:r>
+        <w:fldChar w:fldCharType="end"/>
+      </w:r>
+      <w:r>
+        <w:t xml:space="preserve"> guide</w:t>
+      </w:r>
       <w:bookmarkEnd w:id="5"/>
     </w:p>
     <w:p>
       <w:pPr>
+        <w:pStyle w:val="BodyText"/>
+      </w:pPr>
+      <w:r>
+        <w:t xml:space="preserve">You can find this on page </w:t>
+      </w:r>
+      <w:r>
+        <w:t>7</w:t>
+      </w:r>
+      <w:r>
+        <w:t>.</w:t>
+      </w:r>
+    </w:p>
+    <w:p>
+      <w:pPr>
         <w:pStyle w:val="Heading3"/>
       </w:pPr>
-      <w:bookmarkStart w:id="6" w:name="_Toc509165832"/>
-      <w:r>
-        <w:t>Quick start</w:t>
-      </w:r>
+      <w:bookmarkStart w:id="6" w:name="_Toc509165833"/>
+      <w:r>
+        <w:t>Troubleshooting</w:t>
+      </w:r>
+      <w:bookmarkEnd w:id="6"/>
       <w:r>
         <w:fldChar w:fldCharType="begin"/>
       </w:r>
@@ -4421,7 +4508,7 @@
         <w:instrText xml:space="preserve"> XE "</w:instrText>
       </w:r>
       <w:r>
-        <w:instrText>Quick start</w:instrText>
+        <w:instrText>Troubleshooting</w:instrText>
       </w:r>
       <w:r>
         <w:instrText xml:space="preserve">" </w:instrText>
@@ -4436,18 +4523,14 @@
         <w:instrText xml:space="preserve"> E "</w:instrText>
       </w:r>
       <w:r>
-        <w:instrText>Quick start</w:instrText>
-      </w:r>
-      <w:r>
-        <w:instrText xml:space="preserve">" </w:instrText>
-      </w:r>
-      <w:r>
-        <w:fldChar w:fldCharType="end"/>
-      </w:r>
-      <w:r>
-        <w:t xml:space="preserve"> guide</w:t>
-      </w:r>
-      <w:bookmarkEnd w:id="6"/>
+        <w:instrText>Troubleshooting</w:instrText>
+      </w:r>
+      <w:r>
+        <w:instrText xml:space="preserve">" </w:instrText>
+      </w:r>
+      <w:r>
+        <w:fldChar w:fldCharType="end"/>
+      </w:r>
     </w:p>
     <w:p>
       <w:pPr>
@@ -4457,7 +4540,7 @@
         <w:t xml:space="preserve">You can find this on page </w:t>
       </w:r>
       <w:r>
-        <w:t>7</w:t>
+        <w:t>25</w:t>
       </w:r>
       <w:r>
         <w:t>.</w:t>
@@ -4465,73 +4548,19 @@
     </w:p>
     <w:p>
       <w:pPr>
-        <w:pStyle w:val="Heading3"/>
-      </w:pPr>
-      <w:bookmarkStart w:id="7" w:name="_Toc509165833"/>
-      <w:r>
-        <w:t>Troubleshooting</w:t>
+        <w:pStyle w:val="Heading2"/>
+      </w:pPr>
+      <w:bookmarkStart w:id="7" w:name="_Toc509165834"/>
+      <w:r>
+        <w:t xml:space="preserve">Menus </w:t>
+      </w:r>
+      <w:r>
+        <w:t>G</w:t>
+      </w:r>
+      <w:r>
+        <w:t>uide</w:t>
       </w:r>
       <w:bookmarkEnd w:id="7"/>
-      <w:r>
-        <w:fldChar w:fldCharType="begin"/>
-      </w:r>
-      <w:r>
-        <w:instrText xml:space="preserve"> XE "</w:instrText>
-      </w:r>
-      <w:r>
-        <w:instrText>Troubleshooting</w:instrText>
-      </w:r>
-      <w:r>
-        <w:instrText xml:space="preserve">" </w:instrText>
-      </w:r>
-      <w:r>
-        <w:fldChar w:fldCharType="end"/>
-      </w:r>
-      <w:r>
-        <w:fldChar w:fldCharType="begin"/>
-      </w:r>
-      <w:r>
-        <w:instrText xml:space="preserve"> E "</w:instrText>
-      </w:r>
-      <w:r>
-        <w:instrText>Troubleshooting</w:instrText>
-      </w:r>
-      <w:r>
-        <w:instrText xml:space="preserve">" </w:instrText>
-      </w:r>
-      <w:r>
-        <w:fldChar w:fldCharType="end"/>
-      </w:r>
-    </w:p>
-    <w:p>
-      <w:pPr>
-        <w:pStyle w:val="BodyText"/>
-      </w:pPr>
-      <w:r>
-        <w:t xml:space="preserve">You can find this on page </w:t>
-      </w:r>
-      <w:r>
-        <w:t>25</w:t>
-      </w:r>
-      <w:r>
-        <w:t>.</w:t>
-      </w:r>
-    </w:p>
-    <w:p>
-      <w:pPr>
-        <w:pStyle w:val="Heading2"/>
-      </w:pPr>
-      <w:bookmarkStart w:id="8" w:name="_Toc509165834"/>
-      <w:r>
-        <w:t xml:space="preserve">Menus </w:t>
-      </w:r>
-      <w:r>
-        <w:t>G</w:t>
-      </w:r>
-      <w:r>
-        <w:t>uide</w:t>
-      </w:r>
-      <w:bookmarkEnd w:id="8"/>
       <w:r>
         <w:fldChar w:fldCharType="begin"/>
       </w:r>
@@ -4694,7 +4723,7 @@
       <w:pPr>
         <w:pStyle w:val="Heading1"/>
       </w:pPr>
-      <w:bookmarkStart w:id="9" w:name="_Toc509165835"/>
+      <w:bookmarkStart w:id="8" w:name="_Toc509165835"/>
       <w:r>
         <w:lastRenderedPageBreak/>
         <w:t>Quick Start</w:t>
@@ -4732,7 +4761,7 @@
       <w:r>
         <w:t xml:space="preserve"> Guide</w:t>
       </w:r>
-      <w:bookmarkEnd w:id="9"/>
+      <w:bookmarkEnd w:id="8"/>
     </w:p>
     <w:p>
       <w:pPr>
@@ -4753,7 +4782,7 @@
       <w:pPr>
         <w:pStyle w:val="Heading2"/>
       </w:pPr>
-      <w:bookmarkStart w:id="10" w:name="_Toc509165836"/>
+      <w:bookmarkStart w:id="9" w:name="_Toc509165836"/>
       <w:r>
         <w:t>What are the system requirements</w:t>
       </w:r>
@@ -4790,64 +4819,64 @@
       <w:r>
         <w:t xml:space="preserve"> to run 9-Tap?</w:t>
       </w:r>
+      <w:bookmarkEnd w:id="9"/>
+    </w:p>
+    <w:p>
+      <w:pPr>
+        <w:pStyle w:val="BodyTextKeep"/>
+      </w:pPr>
+      <w:r>
+        <w:t>The system requirements</w:t>
+      </w:r>
+      <w:r>
+        <w:t xml:space="preserve">: </w:t>
+      </w:r>
+      <w:r>
+        <w:t>Windows 7 and above</w:t>
+      </w:r>
+      <w:r>
+        <w:t xml:space="preserve">. </w:t>
+      </w:r>
+      <w:r>
+        <w:t>13MB free disk space.</w:t>
+      </w:r>
+      <w:r>
+        <w:t xml:space="preserve"> </w:t>
+      </w:r>
+      <w:r>
+        <w:t xml:space="preserve">Optimized for 1366 X 768 screen resolution. </w:t>
+      </w:r>
+      <w:r>
+        <w:t>USB port. Dot matrix and ink/laser-jet printers. Microsoft Excel must be installed on the computer for the 9-Tap Tour program to work.</w:t>
+      </w:r>
+    </w:p>
+    <w:p>
+      <w:pPr>
+        <w:pStyle w:val="Heading2"/>
+      </w:pPr>
+      <w:bookmarkStart w:id="10" w:name="_Toc509165837"/>
+      <w:r>
+        <w:t>How do I install 9-Tap</w:t>
+      </w:r>
+      <w:r>
+        <w:fldChar w:fldCharType="begin"/>
+      </w:r>
+      <w:r>
+        <w:instrText xml:space="preserve"> E "</w:instrText>
+      </w:r>
+      <w:r>
+        <w:instrText>install 9-Tap</w:instrText>
+      </w:r>
+      <w:r>
+        <w:instrText xml:space="preserve">" </w:instrText>
+      </w:r>
+      <w:r>
+        <w:fldChar w:fldCharType="end"/>
+      </w:r>
+      <w:r>
+        <w:t>?</w:t>
+      </w:r>
       <w:bookmarkEnd w:id="10"/>
-    </w:p>
-    <w:p>
-      <w:pPr>
-        <w:pStyle w:val="BodyTextKeep"/>
-      </w:pPr>
-      <w:r>
-        <w:t>The system requirements</w:t>
-      </w:r>
-      <w:r>
-        <w:t xml:space="preserve">: </w:t>
-      </w:r>
-      <w:r>
-        <w:t>Windows 7 and above</w:t>
-      </w:r>
-      <w:r>
-        <w:t xml:space="preserve">. </w:t>
-      </w:r>
-      <w:r>
-        <w:t>13MB free disk space.</w:t>
-      </w:r>
-      <w:r>
-        <w:t xml:space="preserve"> </w:t>
-      </w:r>
-      <w:r>
-        <w:t xml:space="preserve">Optimized for 1366 X 768 screen resolution. </w:t>
-      </w:r>
-      <w:r>
-        <w:t>USB port. Dot matrix and ink/laser-jet printers. Microsoft Excel must be installed on the computer for the 9-Tap Tour program to work.</w:t>
-      </w:r>
-    </w:p>
-    <w:p>
-      <w:pPr>
-        <w:pStyle w:val="Heading2"/>
-      </w:pPr>
-      <w:bookmarkStart w:id="11" w:name="_Toc509165837"/>
-      <w:r>
-        <w:t>How do I install 9-Tap</w:t>
-      </w:r>
-      <w:r>
-        <w:fldChar w:fldCharType="begin"/>
-      </w:r>
-      <w:r>
-        <w:instrText xml:space="preserve"> E "</w:instrText>
-      </w:r>
-      <w:r>
-        <w:instrText>install 9-Tap</w:instrText>
-      </w:r>
-      <w:r>
-        <w:instrText xml:space="preserve">" </w:instrText>
-      </w:r>
-      <w:r>
-        <w:fldChar w:fldCharType="end"/>
-      </w:r>
-      <w:r>
-        <w:t>?</w:t>
-      </w:r>
-      <w:bookmarkEnd w:id="11"/>
     </w:p>
     <w:p>
       <w:pPr>
@@ -4924,7 +4953,13 @@
         </w:numPr>
       </w:pPr>
       <w:r>
-        <w:t>End User License agreement. Read the agreement, and if you agree to the terms and conditions chose “I agree.” Then click the “I Agree” button to continue the installation process.</w:t>
+        <w:t>End User License agreement. Read the agreement, and if you agree to the terms and conditions cho</w:t>
+      </w:r>
+      <w:r>
+        <w:t>o</w:t>
+      </w:r>
+      <w:r>
+        <w:t>se “I agree.” Then click the “I Agree” button to continue the installation process.</w:t>
       </w:r>
     </w:p>
     <w:p>
@@ -4936,7 +4971,13 @@
         </w:numPr>
       </w:pPr>
       <w:r>
-        <w:t>Next, chose an install location for the program. Either accept the default location or choose another location. Once you’re satisfied with your choice, click “Next” to continue installing.</w:t>
+        <w:t>Next, cho</w:t>
+      </w:r>
+      <w:r>
+        <w:t>o</w:t>
+      </w:r>
+      <w:r>
+        <w:t>se an install location for the program. Either accept the default location or choose another location. Once you’re satisfied with your choice, click “Next” to continue installing.</w:t>
       </w:r>
     </w:p>
     <w:p>
@@ -4948,7 +4989,13 @@
         </w:numPr>
       </w:pPr>
       <w:r>
-        <w:t>Select a Start Menu Folder for 9 Tap Tour. Either accept the default location or chose another. If you don’t want a Start Menu folder to be created check the box “Do Not Create A Start Menu Folder”. Once you are satisfied with your selection click the “Next” button to continue.</w:t>
+        <w:t>Select a Start Menu Folder for 9 Tap Tour. Either accept the default location or cho</w:t>
+      </w:r>
+      <w:r>
+        <w:t>o</w:t>
+      </w:r>
+      <w:r>
+        <w:t>se another. If you don’t want a Start Menu folder to be created check the box “Do Not Create A Start Menu Folder”. Once you are satisfied with your selection click the “Next” button to continue.</w:t>
       </w:r>
     </w:p>
     <w:p>
@@ -4960,7 +5007,13 @@
         </w:numPr>
       </w:pPr>
       <w:r>
-        <w:t>Select the shortcuts you want created. Chose to create shortcuts on the Desktop, Quick Launch Toolbar, or neither. Once you are satisfied with your selection click on the “Next” button to continue.</w:t>
+        <w:t>Select the shortcuts you want created. Cho</w:t>
+      </w:r>
+      <w:r>
+        <w:t>o</w:t>
+      </w:r>
+      <w:r>
+        <w:t>se to create shortcuts on the Desktop, Quick Launch Toolbar, or neither. Once you are satisfied with your selection click on the “Next” button to continue.</w:t>
       </w:r>
     </w:p>
     <w:p>
@@ -5060,7 +5113,13 @@
         </w:numPr>
       </w:pPr>
       <w:r>
-        <w:t>End User License agreement. Read the agreement, and if you agree to the terms and conditions chose “I agree.” Then click the “I Agree” button to continue the installation process.</w:t>
+        <w:t>End User License agreement. Read the agreement, and if you agree to the terms and conditions cho</w:t>
+      </w:r>
+      <w:r>
+        <w:t>o</w:t>
+      </w:r>
+      <w:r>
+        <w:t>se “I agree.” Then click the “I Agree” button to continue the installation process.</w:t>
       </w:r>
     </w:p>
     <w:p>
@@ -5072,7 +5131,13 @@
         </w:numPr>
       </w:pPr>
       <w:r>
-        <w:t>Next, chose an install location for the program. Either accept the default location or choose another location. Once you’re satisfied with your choice, click “Next” to continue installing.</w:t>
+        <w:t>Next, cho</w:t>
+      </w:r>
+      <w:r>
+        <w:t>o</w:t>
+      </w:r>
+      <w:r>
+        <w:t>se an install location for the program. Either accept the default location or choose another location. Once you’re satisfied with your choice, click “Next” to continue installing.</w:t>
       </w:r>
     </w:p>
     <w:p>
@@ -5084,7 +5149,13 @@
         </w:numPr>
       </w:pPr>
       <w:r>
-        <w:t>Select a Start Menu Folder for 9 Tap Tour. Either accept the default location or chose another. If you don’t want a Start Menu folder to be created check the box “Do Not Create A Start Menu Folder”. Once you are satisfied with your selection click the “Next” button to continue.</w:t>
+        <w:t>Select a Start Menu Folder for 9 Tap Tour. Either accept the default location or cho</w:t>
+      </w:r>
+      <w:r>
+        <w:t>o</w:t>
+      </w:r>
+      <w:r>
+        <w:t>se another. If you don’t want a Start Menu folder to be created check the box “Do Not Create A Start Menu Folder”. Once you are satisfied with your selection click the “Next” button to continue.</w:t>
       </w:r>
     </w:p>
     <w:p>
@@ -5096,7 +5167,13 @@
         </w:numPr>
       </w:pPr>
       <w:r>
-        <w:t>Select the shortcuts you want created. Chose to create shortcuts on the Desktop, Quick Launch Toolbar, or neither. Once you are satisfied with your selection click on the “Next” button to continue.</w:t>
+        <w:t>Select the shortcuts you want created. Cho</w:t>
+      </w:r>
+      <w:r>
+        <w:t>o</w:t>
+      </w:r>
+      <w:r>
+        <w:t>se to create shortcuts on the Desktop, Quick Launch Toolbar, or neither. Once you are satisfied with your selection click on the “Next” button to continue.</w:t>
       </w:r>
     </w:p>
     <w:p>
@@ -5127,11 +5204,11 @@
       <w:pPr>
         <w:pStyle w:val="Heading2"/>
       </w:pPr>
-      <w:bookmarkStart w:id="12" w:name="_Toc509165838"/>
+      <w:bookmarkStart w:id="11" w:name="_Toc509165838"/>
       <w:r>
         <w:t>How do I Launch 9-Tap?</w:t>
       </w:r>
-      <w:bookmarkEnd w:id="12"/>
+      <w:bookmarkEnd w:id="11"/>
     </w:p>
     <w:p>
       <w:pPr>
@@ -5154,7 +5231,7 @@
       <w:pPr>
         <w:pStyle w:val="Heading2"/>
       </w:pPr>
-      <w:bookmarkStart w:id="13" w:name="_Toc509165839"/>
+      <w:bookmarkStart w:id="12" w:name="_Toc509165839"/>
       <w:r>
         <w:lastRenderedPageBreak/>
         <w:t>How do I import existing</w:t>
@@ -5177,6 +5254,72 @@
       <w:r>
         <w:t xml:space="preserve"> members?</w:t>
       </w:r>
+      <w:bookmarkEnd w:id="12"/>
+    </w:p>
+    <w:p>
+      <w:pPr>
+        <w:pStyle w:val="BodyText"/>
+      </w:pPr>
+      <w:r>
+        <w:t>On the Member Info</w:t>
+      </w:r>
+      <w:r>
+        <w:fldChar w:fldCharType="begin"/>
+      </w:r>
+      <w:r>
+        <w:instrText xml:space="preserve"> XE "</w:instrText>
+      </w:r>
+      <w:r>
+        <w:instrText>Member Info</w:instrText>
+      </w:r>
+      <w:r>
+        <w:instrText xml:space="preserve">" </w:instrText>
+      </w:r>
+      <w:r>
+        <w:fldChar w:fldCharType="end"/>
+      </w:r>
+      <w:r>
+        <w:fldChar w:fldCharType="begin"/>
+      </w:r>
+      <w:r>
+        <w:instrText xml:space="preserve"> E "</w:instrText>
+      </w:r>
+      <w:r>
+        <w:instrText>Member Info</w:instrText>
+      </w:r>
+      <w:r>
+        <w:instrText xml:space="preserve">" </w:instrText>
+      </w:r>
+      <w:r>
+        <w:fldChar w:fldCharType="end"/>
+      </w:r>
+      <w:r>
+        <w:t xml:space="preserve"> screen, </w:t>
+      </w:r>
+      <w:r>
+        <w:t>f</w:t>
+      </w:r>
+      <w:r>
+        <w:t xml:space="preserve">ind the import button. Click on it. When the file picker screen comes up, navigate to the Excel file you need to import. Select it and </w:t>
+      </w:r>
+      <w:r>
+        <w:t>click</w:t>
+      </w:r>
+      <w:r>
+        <w:t xml:space="preserve"> OK</w:t>
+      </w:r>
+      <w:r>
+        <w:t xml:space="preserve"> Also see the Conversion Program chapter.</w:t>
+      </w:r>
+    </w:p>
+    <w:p>
+      <w:pPr>
+        <w:pStyle w:val="Heading2"/>
+      </w:pPr>
+      <w:bookmarkStart w:id="13" w:name="_Toc509165840"/>
+      <w:r>
+        <w:t>How do I enter a new player?</w:t>
+      </w:r>
       <w:bookmarkEnd w:id="13"/>
     </w:p>
     <w:p>
@@ -5217,40 +5360,163 @@
         <w:fldChar w:fldCharType="end"/>
       </w:r>
       <w:r>
+        <w:t xml:space="preserve"> screen, Click </w:t>
+      </w:r>
+      <w:r>
+        <w:t>“New” button.</w:t>
+      </w:r>
+      <w:r>
+        <w:t xml:space="preserve"> A new blank record will display. Start filling in the player’s information</w:t>
+      </w:r>
+      <w:r>
+        <w:t>, first and last name are required at time of creation</w:t>
+      </w:r>
+      <w:r>
+        <w:t>. Save the record</w:t>
+      </w:r>
+      <w:r>
+        <w:t xml:space="preserve"> by clicking “Save”</w:t>
+      </w:r>
+      <w:r>
+        <w:t>.</w:t>
+      </w:r>
+    </w:p>
+    <w:p>
+      <w:pPr>
+        <w:pStyle w:val="Heading2"/>
+      </w:pPr>
+      <w:bookmarkStart w:id="14" w:name="_Toc509165841"/>
+      <w:r>
+        <w:t>How do I create a tournament?</w:t>
+      </w:r>
+      <w:bookmarkEnd w:id="14"/>
+    </w:p>
+    <w:p>
+      <w:pPr>
+        <w:pStyle w:val="BodyText"/>
+      </w:pPr>
+      <w:r>
+        <w:t>On the Member Scores</w:t>
+      </w:r>
+      <w:r>
+        <w:fldChar w:fldCharType="begin"/>
+      </w:r>
+      <w:r>
+        <w:instrText xml:space="preserve"> XE "</w:instrText>
+      </w:r>
+      <w:r>
+        <w:instrText>Member Scores</w:instrText>
+      </w:r>
+      <w:r>
+        <w:instrText xml:space="preserve">" </w:instrText>
+      </w:r>
+      <w:r>
+        <w:fldChar w:fldCharType="end"/>
+      </w:r>
+      <w:r>
+        <w:fldChar w:fldCharType="begin"/>
+      </w:r>
+      <w:r>
+        <w:instrText xml:space="preserve"> E "</w:instrText>
+      </w:r>
+      <w:r>
+        <w:instrText>Member Scores</w:instrText>
+      </w:r>
+      <w:r>
+        <w:instrText xml:space="preserve">" </w:instrText>
+      </w:r>
+      <w:r>
+        <w:fldChar w:fldCharType="end"/>
+      </w:r>
+      <w:r>
         <w:t xml:space="preserve"> screen, </w:t>
       </w:r>
       <w:r>
-        <w:t>f</w:t>
-      </w:r>
-      <w:r>
-        <w:t xml:space="preserve">ind the import button. Click on it. When the file picker screen comes up, navigate to the Excel file you need to import. Select it and </w:t>
-      </w:r>
-      <w:r>
-        <w:t>click</w:t>
-      </w:r>
-      <w:r>
-        <w:t xml:space="preserve"> OK</w:t>
-      </w:r>
-      <w:r>
-        <w:t xml:space="preserve"> Also see the Conversion Program chapter.</w:t>
+        <w:t xml:space="preserve">click on the </w:t>
+      </w:r>
+      <w:r>
+        <w:t>“</w:t>
+      </w:r>
+      <w:r>
+        <w:t>Create/Ed</w:t>
+      </w:r>
+      <w:r>
+        <w:t>it Tournament</w:t>
+      </w:r>
+      <w:r>
+        <w:fldChar w:fldCharType="begin"/>
+      </w:r>
+      <w:r>
+        <w:instrText xml:space="preserve"> XE "</w:instrText>
+      </w:r>
+      <w:r>
+        <w:instrText>Create/Edit Tournament</w:instrText>
+      </w:r>
+      <w:r>
+        <w:instrText xml:space="preserve">" </w:instrText>
+      </w:r>
+      <w:r>
+        <w:fldChar w:fldCharType="end"/>
+      </w:r>
+      <w:r>
+        <w:fldChar w:fldCharType="begin"/>
+      </w:r>
+      <w:r>
+        <w:instrText xml:space="preserve"> E "</w:instrText>
+      </w:r>
+      <w:r>
+        <w:instrText>Create/Edit Tournament</w:instrText>
+      </w:r>
+      <w:r>
+        <w:instrText xml:space="preserve">" </w:instrText>
+      </w:r>
+      <w:r>
+        <w:fldChar w:fldCharType="end"/>
+      </w:r>
+      <w:r>
+        <w:t>…</w:t>
+      </w:r>
+      <w:r>
+        <w:t>”</w:t>
+      </w:r>
+      <w:r>
+        <w:t xml:space="preserve"> button. This launches the New Tournament screen. </w:t>
+      </w:r>
+      <w:r>
+        <w:t xml:space="preserve">Use the Tournament Date field to enter the date of the tournament. </w:t>
+      </w:r>
+      <w:r>
+        <w:t xml:space="preserve">Fill in the </w:t>
+      </w:r>
+      <w:r>
+        <w:t>Location field with the name of the bowling alley. Enter the name of the event in the Event field. Enter the sponsors in the Sponsors field. LEAVE THE DOUBLES BOX UNCHECKED</w:t>
+      </w:r>
+      <w:r>
+        <w:t>.</w:t>
+      </w:r>
+      <w:r>
+        <w:t xml:space="preserve"> </w:t>
+      </w:r>
+      <w:r>
+        <w:t>If appropriate, check the 3 out of 4 box. Enter the number of squads in the Number of Squads field. If needed enter notes on the tournament in the Notes field. Double check your information, then click “Create Tournament”.</w:t>
       </w:r>
     </w:p>
     <w:p>
       <w:pPr>
         <w:pStyle w:val="Heading2"/>
       </w:pPr>
-      <w:bookmarkStart w:id="14" w:name="_Toc509165840"/>
-      <w:r>
-        <w:t>How do I enter a new player?</w:t>
-      </w:r>
-      <w:bookmarkEnd w:id="14"/>
-    </w:p>
-    <w:p>
-      <w:pPr>
-        <w:pStyle w:val="BodyText"/>
-      </w:pPr>
-      <w:r>
-        <w:t>On the Member Info</w:t>
+      <w:bookmarkStart w:id="15" w:name="_Toc509165842"/>
+      <w:r>
+        <w:t>How do I enter a bowler’s scores?</w:t>
+      </w:r>
+      <w:bookmarkEnd w:id="15"/>
+    </w:p>
+    <w:p>
+      <w:pPr>
+        <w:pStyle w:val="BodyText"/>
+      </w:pPr>
+      <w:r>
+        <w:t>On the Member Scores</w:t>
       </w:r>
       <w:r>
         <w:fldChar w:fldCharType="begin"/>
@@ -5259,7 +5525,7 @@
         <w:instrText xml:space="preserve"> XE "</w:instrText>
       </w:r>
       <w:r>
-        <w:instrText>Member Info</w:instrText>
+        <w:instrText>Member Scores</w:instrText>
       </w:r>
       <w:r>
         <w:instrText xml:space="preserve">" </w:instrText>
@@ -5274,52 +5540,46 @@
         <w:instrText xml:space="preserve"> E "</w:instrText>
       </w:r>
       <w:r>
-        <w:instrText>Member Info</w:instrText>
-      </w:r>
-      <w:r>
-        <w:instrText xml:space="preserve">" </w:instrText>
-      </w:r>
-      <w:r>
-        <w:fldChar w:fldCharType="end"/>
-      </w:r>
-      <w:r>
-        <w:t xml:space="preserve"> screen, Click </w:t>
-      </w:r>
-      <w:r>
-        <w:t>“New” button.</w:t>
-      </w:r>
-      <w:r>
-        <w:t xml:space="preserve"> A new blank record will display. Start filling in the player’s information</w:t>
-      </w:r>
-      <w:r>
-        <w:t>, first and last name are required at time of creation</w:t>
-      </w:r>
-      <w:r>
-        <w:t>. Save the record</w:t>
-      </w:r>
-      <w:r>
-        <w:t xml:space="preserve"> by clicking “Save”</w:t>
-      </w:r>
-      <w:r>
-        <w:t>.</w:t>
-      </w:r>
-    </w:p>
-    <w:p>
-      <w:pPr>
-        <w:pStyle w:val="Heading2"/>
-      </w:pPr>
-      <w:bookmarkStart w:id="15" w:name="_Toc509165841"/>
-      <w:r>
-        <w:t>How do I create a tournament?</w:t>
-      </w:r>
-      <w:bookmarkEnd w:id="15"/>
-    </w:p>
-    <w:p>
-      <w:pPr>
-        <w:pStyle w:val="BodyText"/>
-      </w:pPr>
-      <w:r>
-        <w:t>On the Member Scores</w:t>
+        <w:instrText>Member Scores</w:instrText>
+      </w:r>
+      <w:r>
+        <w:instrText xml:space="preserve">" </w:instrText>
+      </w:r>
+      <w:r>
+        <w:fldChar w:fldCharType="end"/>
+      </w:r>
+      <w:r>
+        <w:t xml:space="preserve"> screen, in the Tournament Files section, select </w:t>
+      </w:r>
+      <w:r>
+        <w:t>a</w:t>
+      </w:r>
+      <w:r>
+        <w:t xml:space="preserve"> tournament from the </w:t>
+      </w:r>
+      <w:r>
+        <w:t>drop-down</w:t>
+      </w:r>
+      <w:r>
+        <w:t xml:space="preserve"> menu. Once the tournament is selected, enter the member</w:t>
+      </w:r>
+      <w:r>
+        <w:t>’s</w:t>
+      </w:r>
+      <w:r>
+        <w:t xml:space="preserve"> number and click enter. The player information and status will auto-populate. </w:t>
+      </w:r>
+      <w:r>
+        <w:t>Select</w:t>
+      </w:r>
+      <w:r>
+        <w:t xml:space="preserve"> which squad they bowled in. Enter the player’s scratch scores in a </w:t>
+      </w:r>
+      <w:r>
+        <w:t>three-digit</w:t>
+      </w:r>
+      <w:r>
+        <w:t xml:space="preserve"> format. 9-Tap will tab through as the scores are entered. Before clicking “Add New/Update Record</w:t>
       </w:r>
       <w:r>
         <w:fldChar w:fldCharType="begin"/>
@@ -5328,189 +5588,6 @@
         <w:instrText xml:space="preserve"> XE "</w:instrText>
       </w:r>
       <w:r>
-        <w:instrText>Member Scores</w:instrText>
-      </w:r>
-      <w:r>
-        <w:instrText xml:space="preserve">" </w:instrText>
-      </w:r>
-      <w:r>
-        <w:fldChar w:fldCharType="end"/>
-      </w:r>
-      <w:r>
-        <w:fldChar w:fldCharType="begin"/>
-      </w:r>
-      <w:r>
-        <w:instrText xml:space="preserve"> E "</w:instrText>
-      </w:r>
-      <w:r>
-        <w:instrText>Member Scores</w:instrText>
-      </w:r>
-      <w:r>
-        <w:instrText xml:space="preserve">" </w:instrText>
-      </w:r>
-      <w:r>
-        <w:fldChar w:fldCharType="end"/>
-      </w:r>
-      <w:r>
-        <w:t xml:space="preserve"> screen, </w:t>
-      </w:r>
-      <w:r>
-        <w:t xml:space="preserve">click on the </w:t>
-      </w:r>
-      <w:r>
-        <w:t>“</w:t>
-      </w:r>
-      <w:r>
-        <w:t>Create/Ed</w:t>
-      </w:r>
-      <w:r>
-        <w:t>it Tournament</w:t>
-      </w:r>
-      <w:r>
-        <w:fldChar w:fldCharType="begin"/>
-      </w:r>
-      <w:r>
-        <w:instrText xml:space="preserve"> XE "</w:instrText>
-      </w:r>
-      <w:r>
-        <w:instrText>Create/Edit Tournament</w:instrText>
-      </w:r>
-      <w:r>
-        <w:instrText xml:space="preserve">" </w:instrText>
-      </w:r>
-      <w:r>
-        <w:fldChar w:fldCharType="end"/>
-      </w:r>
-      <w:r>
-        <w:fldChar w:fldCharType="begin"/>
-      </w:r>
-      <w:r>
-        <w:instrText xml:space="preserve"> E "</w:instrText>
-      </w:r>
-      <w:r>
-        <w:instrText>Create/Edit Tournament</w:instrText>
-      </w:r>
-      <w:r>
-        <w:instrText xml:space="preserve">" </w:instrText>
-      </w:r>
-      <w:r>
-        <w:fldChar w:fldCharType="end"/>
-      </w:r>
-      <w:r>
-        <w:t>…</w:t>
-      </w:r>
-      <w:r>
-        <w:t>”</w:t>
-      </w:r>
-      <w:r>
-        <w:t xml:space="preserve"> button. This launches the New Tournament screen. </w:t>
-      </w:r>
-      <w:r>
-        <w:t xml:space="preserve">Use the Tournament Date field to enter the date of the tournament. </w:t>
-      </w:r>
-      <w:r>
-        <w:t xml:space="preserve">Fill in the </w:t>
-      </w:r>
-      <w:r>
-        <w:t>Location field with the name of the bowling alley. Enter the name of the event in the Event field. Enter the sponsors in the Sponsors field. LEAVE THE DOUBLES BOX UNCHECKED</w:t>
-      </w:r>
-      <w:r>
-        <w:t>.</w:t>
-      </w:r>
-      <w:r>
-        <w:t xml:space="preserve"> </w:t>
-      </w:r>
-      <w:r>
-        <w:t>If appropriate, check the 3 out of 4 box. Enter the number of squads in the Number of Squads field. If needed enter notes on the tournament in the Notes field. Double check your information, then click “Create Tournament”.</w:t>
-      </w:r>
-    </w:p>
-    <w:p>
-      <w:pPr>
-        <w:pStyle w:val="Heading2"/>
-      </w:pPr>
-      <w:bookmarkStart w:id="16" w:name="_Toc509165842"/>
-      <w:r>
-        <w:t>How do I enter a bowler’s scores?</w:t>
-      </w:r>
-      <w:bookmarkEnd w:id="16"/>
-    </w:p>
-    <w:p>
-      <w:pPr>
-        <w:pStyle w:val="BodyText"/>
-      </w:pPr>
-      <w:r>
-        <w:t>On the Member Scores</w:t>
-      </w:r>
-      <w:r>
-        <w:fldChar w:fldCharType="begin"/>
-      </w:r>
-      <w:r>
-        <w:instrText xml:space="preserve"> XE "</w:instrText>
-      </w:r>
-      <w:r>
-        <w:instrText>Member Scores</w:instrText>
-      </w:r>
-      <w:r>
-        <w:instrText xml:space="preserve">" </w:instrText>
-      </w:r>
-      <w:r>
-        <w:fldChar w:fldCharType="end"/>
-      </w:r>
-      <w:r>
-        <w:fldChar w:fldCharType="begin"/>
-      </w:r>
-      <w:r>
-        <w:instrText xml:space="preserve"> E "</w:instrText>
-      </w:r>
-      <w:r>
-        <w:instrText>Member Scores</w:instrText>
-      </w:r>
-      <w:r>
-        <w:instrText xml:space="preserve">" </w:instrText>
-      </w:r>
-      <w:r>
-        <w:fldChar w:fldCharType="end"/>
-      </w:r>
-      <w:r>
-        <w:t xml:space="preserve"> screen, in the Tournament Files section, select </w:t>
-      </w:r>
-      <w:r>
-        <w:t>a</w:t>
-      </w:r>
-      <w:r>
-        <w:t xml:space="preserve"> tournament from the </w:t>
-      </w:r>
-      <w:r>
-        <w:t>drop-down</w:t>
-      </w:r>
-      <w:r>
-        <w:t xml:space="preserve"> menu. Once the tournament is selected, enter the member</w:t>
-      </w:r>
-      <w:r>
-        <w:t>’s</w:t>
-      </w:r>
-      <w:r>
-        <w:t xml:space="preserve"> number and click enter. The player information and status will auto-populate. </w:t>
-      </w:r>
-      <w:r>
-        <w:t>Select</w:t>
-      </w:r>
-      <w:r>
-        <w:t xml:space="preserve"> which squad they bowled in. Enter the player’s scratch scores in a </w:t>
-      </w:r>
-      <w:r>
-        <w:t>three-digit</w:t>
-      </w:r>
-      <w:r>
-        <w:t xml:space="preserve"> format. 9-Tap will tab through as the scores are entered. Before clicking “Add New/Update Record</w:t>
-      </w:r>
-      <w:r>
-        <w:fldChar w:fldCharType="begin"/>
-      </w:r>
-      <w:r>
-        <w:instrText xml:space="preserve"> XE "</w:instrText>
-      </w:r>
-      <w:r>
         <w:instrText>Record</w:instrText>
       </w:r>
       <w:r>
@@ -5522,6 +5599,20 @@
       <w:r>
         <w:t xml:space="preserve">” double check that the entered scores are correct. </w:t>
       </w:r>
+    </w:p>
+    <w:p>
+      <w:pPr>
+        <w:pStyle w:val="BodyText"/>
+      </w:pPr>
+    </w:p>
+    <w:p>
+      <w:pPr>
+        <w:pStyle w:val="BodyText"/>
+        <w:rPr>
+          <w:rFonts w:ascii="Arial Black" w:hAnsi="Arial Black"/>
+          <w:sz w:val="20"/>
+        </w:rPr>
+      </w:pPr>
     </w:p>
     <w:p>
       <w:pPr>
@@ -5632,7 +5723,7 @@
           <w:szCs w:val="32"/>
         </w:rPr>
       </w:pPr>
-      <w:bookmarkStart w:id="17" w:name="_Toc509165843"/>
+      <w:bookmarkStart w:id="16" w:name="_Toc509165843"/>
       <w:r>
         <w:rPr>
           <w:szCs w:val="32"/>
@@ -5640,7 +5731,7 @@
         <w:lastRenderedPageBreak/>
         <w:t>Main Menu</w:t>
       </w:r>
-      <w:bookmarkEnd w:id="17"/>
+      <w:bookmarkEnd w:id="16"/>
       <w:r>
         <w:rPr>
           <w:szCs w:val="32"/>
@@ -5997,12 +6088,12 @@
       <w:pPr>
         <w:pStyle w:val="Heading1"/>
       </w:pPr>
-      <w:bookmarkStart w:id="18" w:name="_Toc509165844"/>
+      <w:bookmarkStart w:id="17" w:name="_Toc509165844"/>
       <w:r>
         <w:lastRenderedPageBreak/>
         <w:t>Member Info</w:t>
       </w:r>
-      <w:bookmarkEnd w:id="18"/>
+      <w:bookmarkEnd w:id="17"/>
       <w:r>
         <w:fldChar w:fldCharType="begin"/>
       </w:r>
@@ -6168,7 +6259,7 @@
       <w:pPr>
         <w:pStyle w:val="Heading3"/>
       </w:pPr>
-      <w:bookmarkStart w:id="19" w:name="_Toc509165845"/>
+      <w:bookmarkStart w:id="18" w:name="_Toc509165845"/>
       <w:r>
         <w:t>Import</w:t>
       </w:r>
@@ -6196,110 +6287,116 @@
       <w:r>
         <w:t>Member</w:t>
       </w:r>
+      <w:bookmarkEnd w:id="18"/>
+      <w:r>
+        <w:fldChar w:fldCharType="begin"/>
+      </w:r>
+      <w:r>
+        <w:instrText xml:space="preserve"> XE "</w:instrText>
+      </w:r>
+      <w:r>
+        <w:instrText>Import Existing Members</w:instrText>
+      </w:r>
+      <w:r>
+        <w:instrText xml:space="preserve">" </w:instrText>
+      </w:r>
+      <w:r>
+        <w:fldChar w:fldCharType="end"/>
+      </w:r>
+      <w:r>
+        <w:fldChar w:fldCharType="begin"/>
+      </w:r>
+      <w:r>
+        <w:instrText xml:space="preserve"> E "</w:instrText>
+      </w:r>
+      <w:r>
+        <w:instrText>Import Members</w:instrText>
+      </w:r>
+      <w:r>
+        <w:instrText xml:space="preserve">" </w:instrText>
+      </w:r>
+      <w:r>
+        <w:fldChar w:fldCharType="end"/>
+      </w:r>
+    </w:p>
+    <w:p>
+      <w:pPr>
+        <w:pStyle w:val="BodyText"/>
+        <w:keepNext/>
+      </w:pPr>
+      <w:r>
+        <w:t>In the Record</w:t>
+      </w:r>
+      <w:r>
+        <w:fldChar w:fldCharType="begin"/>
+      </w:r>
+      <w:r>
+        <w:instrText xml:space="preserve"> XE "</w:instrText>
+      </w:r>
+      <w:r>
+        <w:instrText>Record</w:instrText>
+      </w:r>
+      <w:r>
+        <w:instrText xml:space="preserve">" </w:instrText>
+      </w:r>
+      <w:r>
+        <w:fldChar w:fldCharType="end"/>
+      </w:r>
+      <w:r>
+        <w:t xml:space="preserve"> box, click on the “Import</w:t>
+      </w:r>
+      <w:r>
+        <w:fldChar w:fldCharType="begin"/>
+      </w:r>
+      <w:r>
+        <w:instrText xml:space="preserve"> E "</w:instrText>
+      </w:r>
+      <w:r>
+        <w:instrText>Import</w:instrText>
+      </w:r>
+      <w:r>
+        <w:instrText xml:space="preserve">" </w:instrText>
+      </w:r>
+      <w:r>
+        <w:fldChar w:fldCharType="end"/>
+      </w:r>
+      <w:r>
+        <w:t>” button. The import file window will open</w:t>
+      </w:r>
+      <w:r>
+        <w:t>, see figure 10</w:t>
+      </w:r>
+      <w:r>
+        <w:t>. Cho</w:t>
+      </w:r>
+      <w:r>
+        <w:t>o</w:t>
+      </w:r>
+      <w:r>
+        <w:t>se the Excel file to be imported,</w:t>
+      </w:r>
+      <w:r>
+        <w:t xml:space="preserve"> double checking it’s the correct member’s file,</w:t>
+      </w:r>
+      <w:r>
+        <w:t xml:space="preserve"> then click “Open”. The member information will now be imported</w:t>
+      </w:r>
+      <w:r>
+        <w:t xml:space="preserve"> to the member database</w:t>
+      </w:r>
+      <w:r>
+        <w:t>. If you are updating from the old version of 9-Tap, please see Chapter 5, Conversion Program.</w:t>
+      </w:r>
+    </w:p>
+    <w:p>
+      <w:pPr>
+        <w:pStyle w:val="Heading3"/>
+      </w:pPr>
+      <w:bookmarkStart w:id="19" w:name="_Toc509165846"/>
+      <w:r>
+        <w:t>New Members</w:t>
+      </w:r>
       <w:bookmarkEnd w:id="19"/>
-      <w:r>
-        <w:fldChar w:fldCharType="begin"/>
-      </w:r>
-      <w:r>
-        <w:instrText xml:space="preserve"> XE "</w:instrText>
-      </w:r>
-      <w:r>
-        <w:instrText>Import Existing Members</w:instrText>
-      </w:r>
-      <w:r>
-        <w:instrText xml:space="preserve">" </w:instrText>
-      </w:r>
-      <w:r>
-        <w:fldChar w:fldCharType="end"/>
-      </w:r>
-      <w:r>
-        <w:fldChar w:fldCharType="begin"/>
-      </w:r>
-      <w:r>
-        <w:instrText xml:space="preserve"> E "</w:instrText>
-      </w:r>
-      <w:r>
-        <w:instrText>Import Members</w:instrText>
-      </w:r>
-      <w:r>
-        <w:instrText xml:space="preserve">" </w:instrText>
-      </w:r>
-      <w:r>
-        <w:fldChar w:fldCharType="end"/>
-      </w:r>
-    </w:p>
-    <w:p>
-      <w:pPr>
-        <w:pStyle w:val="BodyText"/>
-        <w:keepNext/>
-      </w:pPr>
-      <w:r>
-        <w:t>In the Record</w:t>
-      </w:r>
-      <w:r>
-        <w:fldChar w:fldCharType="begin"/>
-      </w:r>
-      <w:r>
-        <w:instrText xml:space="preserve"> XE "</w:instrText>
-      </w:r>
-      <w:r>
-        <w:instrText>Record</w:instrText>
-      </w:r>
-      <w:r>
-        <w:instrText xml:space="preserve">" </w:instrText>
-      </w:r>
-      <w:r>
-        <w:fldChar w:fldCharType="end"/>
-      </w:r>
-      <w:r>
-        <w:t xml:space="preserve"> box, click on the “Import</w:t>
-      </w:r>
-      <w:r>
-        <w:fldChar w:fldCharType="begin"/>
-      </w:r>
-      <w:r>
-        <w:instrText xml:space="preserve"> E "</w:instrText>
-      </w:r>
-      <w:r>
-        <w:instrText>Import</w:instrText>
-      </w:r>
-      <w:r>
-        <w:instrText xml:space="preserve">" </w:instrText>
-      </w:r>
-      <w:r>
-        <w:fldChar w:fldCharType="end"/>
-      </w:r>
-      <w:r>
-        <w:t>” button. The import file window will open</w:t>
-      </w:r>
-      <w:r>
-        <w:t>, see figure 10</w:t>
-      </w:r>
-      <w:r>
-        <w:t>. Chose the Excel file to be imported,</w:t>
-      </w:r>
-      <w:r>
-        <w:t xml:space="preserve"> double checking it’s the correct member’s file,</w:t>
-      </w:r>
-      <w:r>
-        <w:t xml:space="preserve"> then click “Open”. The member information will now be imported</w:t>
-      </w:r>
-      <w:r>
-        <w:t xml:space="preserve"> to the member database</w:t>
-      </w:r>
-      <w:r>
-        <w:t>. If you are updating from the old version of 9-Tap, please see Chapter 5, Conversion Program.</w:t>
-      </w:r>
-    </w:p>
-    <w:p>
-      <w:pPr>
-        <w:pStyle w:val="Heading3"/>
-      </w:pPr>
-      <w:bookmarkStart w:id="20" w:name="_Toc509165846"/>
-      <w:r>
-        <w:t>New Members</w:t>
-      </w:r>
-      <w:bookmarkEnd w:id="20"/>
       <w:r>
         <w:fldChar w:fldCharType="begin"/>
       </w:r>
@@ -6595,14 +6692,14 @@
       <w:pPr>
         <w:pStyle w:val="Heading3"/>
       </w:pPr>
-      <w:bookmarkStart w:id="21" w:name="_Toc509165847"/>
+      <w:bookmarkStart w:id="20" w:name="_Toc509165847"/>
       <w:r>
         <w:t xml:space="preserve">Updating </w:t>
       </w:r>
       <w:r>
         <w:t>Members</w:t>
       </w:r>
-      <w:bookmarkEnd w:id="21"/>
+      <w:bookmarkEnd w:id="20"/>
       <w:r>
         <w:fldChar w:fldCharType="begin"/>
       </w:r>
@@ -6730,14 +6827,14 @@
           <w:szCs w:val="20"/>
         </w:rPr>
       </w:pPr>
-      <w:bookmarkStart w:id="22" w:name="_Toc509165848"/>
+      <w:bookmarkStart w:id="21" w:name="_Toc509165848"/>
       <w:r>
         <w:rPr>
           <w:szCs w:val="20"/>
         </w:rPr>
         <w:t>Stats</w:t>
       </w:r>
-      <w:bookmarkEnd w:id="22"/>
+      <w:bookmarkEnd w:id="21"/>
       <w:r>
         <w:rPr>
           <w:szCs w:val="20"/>
@@ -6941,7 +7038,7 @@
           <w:szCs w:val="20"/>
         </w:rPr>
       </w:pPr>
-      <w:bookmarkStart w:id="23" w:name="_Toc509165849"/>
+      <w:bookmarkStart w:id="22" w:name="_Toc509165849"/>
       <w:r>
         <w:rPr>
           <w:szCs w:val="20"/>
@@ -6949,7 +7046,7 @@
         <w:lastRenderedPageBreak/>
         <w:t>Member Search</w:t>
       </w:r>
-      <w:bookmarkEnd w:id="23"/>
+      <w:bookmarkEnd w:id="22"/>
       <w:r>
         <w:rPr>
           <w:szCs w:val="20"/>
@@ -7166,7 +7263,7 @@
           <w:szCs w:val="20"/>
         </w:rPr>
       </w:pPr>
-      <w:bookmarkStart w:id="24" w:name="_Toc509165850"/>
+      <w:bookmarkStart w:id="23" w:name="_Toc509165850"/>
       <w:r>
         <w:rPr>
           <w:szCs w:val="20"/>
@@ -7174,7 +7271,7 @@
         <w:lastRenderedPageBreak/>
         <w:t>Print Recaps</w:t>
       </w:r>
-      <w:bookmarkEnd w:id="24"/>
+      <w:bookmarkEnd w:id="23"/>
       <w:r>
         <w:rPr>
           <w:szCs w:val="20"/>
@@ -7370,14 +7467,14 @@
           <w:szCs w:val="20"/>
         </w:rPr>
       </w:pPr>
-      <w:bookmarkStart w:id="25" w:name="_Toc509165851"/>
+      <w:bookmarkStart w:id="24" w:name="_Toc509165851"/>
       <w:r>
         <w:rPr>
           <w:szCs w:val="20"/>
         </w:rPr>
         <w:t>Import</w:t>
       </w:r>
-      <w:bookmarkEnd w:id="25"/>
+      <w:bookmarkEnd w:id="24"/>
       <w:r>
         <w:rPr>
           <w:szCs w:val="20"/>
@@ -7524,12 +7621,12 @@
       <w:pPr>
         <w:pStyle w:val="Heading1"/>
       </w:pPr>
-      <w:bookmarkStart w:id="26" w:name="_Toc509165852"/>
+      <w:bookmarkStart w:id="25" w:name="_Toc509165852"/>
       <w:r>
         <w:lastRenderedPageBreak/>
         <w:t>Member Scores</w:t>
       </w:r>
-      <w:bookmarkEnd w:id="26"/>
+      <w:bookmarkEnd w:id="25"/>
       <w:r>
         <w:fldChar w:fldCharType="begin"/>
       </w:r>
@@ -7791,7 +7888,7 @@
           <w:szCs w:val="20"/>
         </w:rPr>
       </w:pPr>
-      <w:bookmarkStart w:id="27" w:name="_Toc509165853"/>
+      <w:bookmarkStart w:id="26" w:name="_Toc509165853"/>
       <w:r>
         <w:rPr>
           <w:szCs w:val="20"/>
@@ -7799,7 +7896,7 @@
         <w:lastRenderedPageBreak/>
         <w:t>Tournament Stats</w:t>
       </w:r>
-      <w:bookmarkEnd w:id="27"/>
+      <w:bookmarkEnd w:id="26"/>
       <w:r>
         <w:rPr>
           <w:szCs w:val="20"/>
@@ -7855,7 +7952,10 @@
         <w:keepNext/>
       </w:pPr>
       <w:r>
-        <w:t>Underneath the member record navigation buttons on the Member Scores</w:t>
+        <w:t>To the right of</w:t>
+      </w:r>
+      <w:r>
+        <w:t xml:space="preserve"> the member record navigation buttons on the Member Scores</w:t>
       </w:r>
       <w:r>
         <w:fldChar w:fldCharType="begin"/>
@@ -8024,7 +8124,7 @@
           <w:szCs w:val="20"/>
         </w:rPr>
       </w:pPr>
-      <w:bookmarkStart w:id="28" w:name="_Toc509165854"/>
+      <w:bookmarkStart w:id="27" w:name="_Toc509165854"/>
       <w:r>
         <w:rPr>
           <w:szCs w:val="20"/>
@@ -8061,7 +8161,7 @@
         </w:rPr>
         <w:t xml:space="preserve"> By Tournament</w:t>
       </w:r>
-      <w:bookmarkEnd w:id="28"/>
+      <w:bookmarkEnd w:id="27"/>
       <w:r>
         <w:rPr>
           <w:szCs w:val="20"/>
@@ -8093,25 +8193,10 @@
         <w:keepNext/>
       </w:pPr>
       <w:r>
-        <w:t>In the Record</w:t>
-      </w:r>
-      <w:r>
-        <w:fldChar w:fldCharType="begin"/>
-      </w:r>
-      <w:r>
-        <w:instrText xml:space="preserve"> XE "</w:instrText>
-      </w:r>
-      <w:r>
-        <w:instrText>Record</w:instrText>
-      </w:r>
-      <w:r>
-        <w:instrText xml:space="preserve">" </w:instrText>
-      </w:r>
-      <w:r>
-        <w:fldChar w:fldCharType="end"/>
-      </w:r>
-      <w:r>
-        <w:t xml:space="preserve"> field on the Member Scores</w:t>
+        <w:t>Below the Tournament Stats button on</w:t>
+      </w:r>
+      <w:r>
+        <w:t xml:space="preserve"> the Member Scores</w:t>
       </w:r>
       <w:r>
         <w:fldChar w:fldCharType="begin"/>
@@ -8250,12 +8335,12 @@
       <w:pPr>
         <w:pStyle w:val="Heading2"/>
       </w:pPr>
-      <w:bookmarkStart w:id="29" w:name="_Toc509165855"/>
+      <w:bookmarkStart w:id="28" w:name="_Toc509165855"/>
       <w:r>
         <w:lastRenderedPageBreak/>
         <w:t>Tournament Place Standings</w:t>
       </w:r>
-      <w:bookmarkEnd w:id="29"/>
+      <w:bookmarkEnd w:id="28"/>
       <w:r>
         <w:fldChar w:fldCharType="begin"/>
       </w:r>
@@ -8414,12 +8499,12 @@
       <w:pPr>
         <w:pStyle w:val="Heading2"/>
       </w:pPr>
-      <w:bookmarkStart w:id="30" w:name="_Toc509165856"/>
+      <w:bookmarkStart w:id="29" w:name="_Toc509165856"/>
       <w:r>
         <w:lastRenderedPageBreak/>
         <w:t>Create/Edit Tournament</w:t>
       </w:r>
-      <w:bookmarkEnd w:id="30"/>
+      <w:bookmarkEnd w:id="29"/>
       <w:r>
         <w:fldChar w:fldCharType="begin"/>
       </w:r>
@@ -8601,11 +8686,11 @@
       <w:pPr>
         <w:pStyle w:val="Heading3"/>
       </w:pPr>
-      <w:bookmarkStart w:id="31" w:name="_Toc509165857"/>
+      <w:bookmarkStart w:id="30" w:name="_Toc509165857"/>
       <w:r>
         <w:t>To Update an Existing Tournament</w:t>
       </w:r>
-      <w:bookmarkEnd w:id="31"/>
+      <w:bookmarkEnd w:id="30"/>
     </w:p>
     <w:p>
       <w:pPr>
@@ -8689,11 +8774,11 @@
       <w:pPr>
         <w:pStyle w:val="Heading2"/>
       </w:pPr>
-      <w:bookmarkStart w:id="32" w:name="_Toc509165858"/>
+      <w:bookmarkStart w:id="31" w:name="_Toc509165858"/>
       <w:r>
         <w:t>Search Tournaments</w:t>
       </w:r>
-      <w:bookmarkEnd w:id="32"/>
+      <w:bookmarkEnd w:id="31"/>
       <w:r>
         <w:fldChar w:fldCharType="begin"/>
       </w:r>
@@ -8877,10 +8962,52 @@
       <w:pPr>
         <w:pStyle w:val="Heading3"/>
       </w:pPr>
-      <w:bookmarkStart w:id="33" w:name="_Toc509165859"/>
+      <w:bookmarkStart w:id="32" w:name="_Toc509165859"/>
       <w:r>
         <w:t>Search by Location</w:t>
       </w:r>
+      <w:bookmarkEnd w:id="32"/>
+      <w:r>
+        <w:fldChar w:fldCharType="begin"/>
+      </w:r>
+      <w:r>
+        <w:instrText xml:space="preserve"> XE "</w:instrText>
+      </w:r>
+      <w:r>
+        <w:instrText>Search by Location</w:instrText>
+      </w:r>
+      <w:r>
+        <w:instrText xml:space="preserve">" </w:instrText>
+      </w:r>
+      <w:r>
+        <w:fldChar w:fldCharType="end"/>
+      </w:r>
+    </w:p>
+    <w:p>
+      <w:pPr>
+        <w:pStyle w:val="BodyText"/>
+      </w:pPr>
+      <w:r>
+        <w:t>To search a tournament by location</w:t>
+      </w:r>
+      <w:r>
+        <w:t>:</w:t>
+      </w:r>
+      <w:r>
+        <w:t xml:space="preserve"> Fill in the name of the </w:t>
+      </w:r>
+      <w:r>
+        <w:t>bowling center in the Location field. Click “Search”. Choose the tournament. Click “Accept”.</w:t>
+      </w:r>
+    </w:p>
+    <w:p>
+      <w:pPr>
+        <w:pStyle w:val="Heading3"/>
+      </w:pPr>
+      <w:bookmarkStart w:id="33" w:name="_Toc509165860"/>
+      <w:r>
+        <w:t>Search by Event</w:t>
+      </w:r>
       <w:bookmarkEnd w:id="33"/>
       <w:r>
         <w:fldChar w:fldCharType="begin"/>
@@ -8889,39 +9016,45 @@
         <w:instrText xml:space="preserve"> XE "</w:instrText>
       </w:r>
       <w:r>
-        <w:instrText>Search by Location</w:instrText>
-      </w:r>
-      <w:r>
-        <w:instrText xml:space="preserve">" </w:instrText>
-      </w:r>
-      <w:r>
-        <w:fldChar w:fldCharType="end"/>
-      </w:r>
-    </w:p>
-    <w:p>
-      <w:pPr>
-        <w:pStyle w:val="BodyText"/>
-      </w:pPr>
-      <w:r>
-        <w:t>To search a tournament by location</w:t>
-      </w:r>
-      <w:r>
-        <w:t>:</w:t>
-      </w:r>
-      <w:r>
-        <w:t xml:space="preserve"> Fill in the name of the </w:t>
-      </w:r>
-      <w:r>
-        <w:t>bowling center in the Location field. Click “Search”. Choose the tournament. Click “Accept”.</w:t>
+        <w:instrText>Search by Event</w:instrText>
+      </w:r>
+      <w:r>
+        <w:instrText xml:space="preserve">" </w:instrText>
+      </w:r>
+      <w:r>
+        <w:fldChar w:fldCharType="end"/>
+      </w:r>
+      <w:r>
+        <w:fldChar w:fldCharType="begin"/>
+      </w:r>
+      <w:r>
+        <w:instrText>E "</w:instrText>
+      </w:r>
+      <w:r>
+        <w:instrText>Search by Event</w:instrText>
+      </w:r>
+      <w:r>
+        <w:instrText xml:space="preserve">" </w:instrText>
+      </w:r>
+      <w:r>
+        <w:fldChar w:fldCharType="end"/>
+      </w:r>
+    </w:p>
+    <w:p>
+      <w:pPr>
+        <w:pStyle w:val="BodyText"/>
+      </w:pPr>
+      <w:r>
+        <w:t>To find a tournament by event: Fill in the name of the event in the Event field. Click “Search”. Choose the tournament you need from the displayed list. Click “Accept”.</w:t>
       </w:r>
     </w:p>
     <w:p>
       <w:pPr>
         <w:pStyle w:val="Heading3"/>
       </w:pPr>
-      <w:bookmarkStart w:id="34" w:name="_Toc509165860"/>
-      <w:r>
-        <w:t>Search by Event</w:t>
+      <w:bookmarkStart w:id="34" w:name="_Toc509165861"/>
+      <w:r>
+        <w:t>Search by Date</w:t>
       </w:r>
       <w:bookmarkEnd w:id="34"/>
       <w:r>
@@ -8931,54 +9064,6 @@
         <w:instrText xml:space="preserve"> XE "</w:instrText>
       </w:r>
       <w:r>
-        <w:instrText>Search by Event</w:instrText>
-      </w:r>
-      <w:r>
-        <w:instrText xml:space="preserve">" </w:instrText>
-      </w:r>
-      <w:r>
-        <w:fldChar w:fldCharType="end"/>
-      </w:r>
-      <w:r>
-        <w:fldChar w:fldCharType="begin"/>
-      </w:r>
-      <w:r>
-        <w:instrText>E "</w:instrText>
-      </w:r>
-      <w:r>
-        <w:instrText>Search by Event</w:instrText>
-      </w:r>
-      <w:r>
-        <w:instrText xml:space="preserve">" </w:instrText>
-      </w:r>
-      <w:r>
-        <w:fldChar w:fldCharType="end"/>
-      </w:r>
-    </w:p>
-    <w:p>
-      <w:pPr>
-        <w:pStyle w:val="BodyText"/>
-      </w:pPr>
-      <w:r>
-        <w:t>To find a tournament by event: Fill in the name of the event in the Event field. Click “Search”. Choose the tournament you need from the displayed list. Click “Accept”.</w:t>
-      </w:r>
-    </w:p>
-    <w:p>
-      <w:pPr>
-        <w:pStyle w:val="Heading3"/>
-      </w:pPr>
-      <w:bookmarkStart w:id="35" w:name="_Toc509165861"/>
-      <w:r>
-        <w:t>Search by Date</w:t>
-      </w:r>
-      <w:bookmarkEnd w:id="35"/>
-      <w:r>
-        <w:fldChar w:fldCharType="begin"/>
-      </w:r>
-      <w:r>
-        <w:instrText xml:space="preserve"> XE "</w:instrText>
-      </w:r>
-      <w:r>
         <w:instrText>Search by Date</w:instrText>
       </w:r>
       <w:r>
@@ -9000,7 +9085,7 @@
       <w:pPr>
         <w:pStyle w:val="Heading2"/>
       </w:pPr>
-      <w:bookmarkStart w:id="36" w:name="_Toc509165862"/>
+      <w:bookmarkStart w:id="35" w:name="_Toc509165862"/>
       <w:r>
         <w:lastRenderedPageBreak/>
         <w:t>List Tournaments</w:t>
@@ -9026,7 +9111,7 @@
       <w:r>
         <w:t>ear</w:t>
       </w:r>
-      <w:bookmarkEnd w:id="36"/>
+      <w:bookmarkEnd w:id="35"/>
       <w:r>
         <w:fldChar w:fldCharType="begin"/>
       </w:r>
@@ -9250,11 +9335,11 @@
       <w:pPr>
         <w:pStyle w:val="Heading2"/>
       </w:pPr>
-      <w:bookmarkStart w:id="37" w:name="_Toc509165863"/>
+      <w:bookmarkStart w:id="36" w:name="_Toc509165863"/>
       <w:r>
         <w:t>Reports</w:t>
       </w:r>
-      <w:bookmarkEnd w:id="37"/>
+      <w:bookmarkEnd w:id="36"/>
       <w:r>
         <w:fldChar w:fldCharType="begin"/>
       </w:r>
@@ -9528,12 +9613,12 @@
       <w:pPr>
         <w:pStyle w:val="Heading2"/>
       </w:pPr>
-      <w:bookmarkStart w:id="38" w:name="_Toc509165864"/>
+      <w:bookmarkStart w:id="37" w:name="_Toc509165864"/>
       <w:r>
         <w:lastRenderedPageBreak/>
         <w:t>Tournament Results</w:t>
       </w:r>
-      <w:bookmarkEnd w:id="38"/>
+      <w:bookmarkEnd w:id="37"/>
       <w:r>
         <w:fldChar w:fldCharType="begin"/>
       </w:r>
@@ -9697,251 +9782,268 @@
       <w:pPr>
         <w:pStyle w:val="Heading2"/>
       </w:pPr>
-      <w:bookmarkStart w:id="39" w:name="_Toc509165865"/>
+      <w:bookmarkStart w:id="38" w:name="_Toc509165865"/>
       <w:r>
         <w:t>Comments</w:t>
       </w:r>
+      <w:bookmarkEnd w:id="38"/>
+      <w:r>
+        <w:fldChar w:fldCharType="begin"/>
+      </w:r>
+      <w:r>
+        <w:instrText xml:space="preserve"> XE "</w:instrText>
+      </w:r>
+      <w:r>
+        <w:instrText>Comments</w:instrText>
+      </w:r>
+      <w:r>
+        <w:instrText xml:space="preserve">" </w:instrText>
+      </w:r>
+      <w:r>
+        <w:fldChar w:fldCharType="end"/>
+      </w:r>
+    </w:p>
+    <w:p>
+      <w:pPr>
+        <w:pStyle w:val="BodyText"/>
+      </w:pPr>
+      <w:r>
+        <w:t>On the Member Scores</w:t>
+      </w:r>
+      <w:r>
+        <w:fldChar w:fldCharType="begin"/>
+      </w:r>
+      <w:r>
+        <w:instrText xml:space="preserve"> XE "</w:instrText>
+      </w:r>
+      <w:r>
+        <w:instrText>Member Scores</w:instrText>
+      </w:r>
+      <w:r>
+        <w:instrText xml:space="preserve">" </w:instrText>
+      </w:r>
+      <w:r>
+        <w:fldChar w:fldCharType="end"/>
+      </w:r>
+      <w:r>
+        <w:t xml:space="preserve"> Screen, comments regarding the tournament can be entered in the Comments</w:t>
+      </w:r>
+      <w:r>
+        <w:fldChar w:fldCharType="begin"/>
+      </w:r>
+      <w:r>
+        <w:instrText xml:space="preserve"> XE "</w:instrText>
+      </w:r>
+      <w:r>
+        <w:instrText>Comments</w:instrText>
+      </w:r>
+      <w:r>
+        <w:instrText xml:space="preserve">" </w:instrText>
+      </w:r>
+      <w:r>
+        <w:fldChar w:fldCharType="end"/>
+      </w:r>
+      <w:r>
+        <w:t xml:space="preserve"> fi</w:t>
+      </w:r>
+      <w:r>
+        <w:t>el</w:t>
+      </w:r>
+      <w:r>
+        <w:t>d.</w:t>
+      </w:r>
+    </w:p>
+    <w:p>
+      <w:pPr>
+        <w:pStyle w:val="BodyText"/>
+      </w:pPr>
+    </w:p>
+    <w:p>
+      <w:pPr>
+        <w:pStyle w:val="Heading1"/>
+      </w:pPr>
+      <w:bookmarkStart w:id="39" w:name="_Toc509165866"/>
+      <w:r>
+        <w:lastRenderedPageBreak/>
+        <w:t>Finalize Tournament</w:t>
+      </w:r>
+    </w:p>
+    <w:p>
+      <w:pPr>
+        <w:pStyle w:val="Heading2"/>
+      </w:pPr>
+      <w:r>
+        <w:t>Finalize Tournament</w:t>
+      </w:r>
       <w:bookmarkEnd w:id="39"/>
       <w:r>
+        <w:t xml:space="preserve"> Basics</w:t>
+      </w:r>
+      <w:r>
         <w:fldChar w:fldCharType="begin"/>
       </w:r>
       <w:r>
         <w:instrText xml:space="preserve"> XE "</w:instrText>
       </w:r>
       <w:r>
-        <w:instrText>Comments</w:instrText>
-      </w:r>
-      <w:r>
-        <w:instrText xml:space="preserve">" </w:instrText>
-      </w:r>
-      <w:r>
-        <w:fldChar w:fldCharType="end"/>
-      </w:r>
-    </w:p>
-    <w:p>
-      <w:pPr>
-        <w:pStyle w:val="BodyText"/>
-      </w:pPr>
-      <w:r>
-        <w:t>On the Member Scores</w:t>
-      </w:r>
-      <w:r>
-        <w:fldChar w:fldCharType="begin"/>
-      </w:r>
-      <w:r>
-        <w:instrText xml:space="preserve"> XE "</w:instrText>
-      </w:r>
-      <w:r>
-        <w:instrText>Member Scores</w:instrText>
-      </w:r>
-      <w:r>
-        <w:instrText xml:space="preserve">" </w:instrText>
-      </w:r>
-      <w:r>
-        <w:fldChar w:fldCharType="end"/>
-      </w:r>
-      <w:r>
-        <w:t xml:space="preserve"> Screen, comments regarding the tournament can be entered in the Comments</w:t>
-      </w:r>
-      <w:r>
-        <w:fldChar w:fldCharType="begin"/>
-      </w:r>
-      <w:r>
-        <w:instrText xml:space="preserve"> XE "</w:instrText>
-      </w:r>
-      <w:r>
-        <w:instrText>Comments</w:instrText>
-      </w:r>
-      <w:r>
-        <w:instrText xml:space="preserve">" </w:instrText>
-      </w:r>
-      <w:r>
-        <w:fldChar w:fldCharType="end"/>
-      </w:r>
-      <w:r>
-        <w:t xml:space="preserve"> fi</w:t>
-      </w:r>
-      <w:r>
-        <w:t>el</w:t>
-      </w:r>
-      <w:r>
-        <w:t>d.</w:t>
-      </w:r>
+        <w:instrText>Finalize Tournament</w:instrText>
+      </w:r>
+      <w:r>
+        <w:instrText xml:space="preserve">" </w:instrText>
+      </w:r>
+      <w:r>
+        <w:fldChar w:fldCharType="end"/>
+      </w:r>
+    </w:p>
+    <w:p>
+      <w:pPr>
+        <w:pStyle w:val="BodyText"/>
+        <w:keepNext/>
+      </w:pPr>
+      <w:r>
+        <w:t>After a tournament is completed, it needs to be reviewed and finalized by the director of the tournament. To begin this process click the Finalize Tournament button located underneath the Reports section on the Member Scores screen. Once the Finalize Tournament window is open, it is up to the director to review each player’s score before finalizing the tournament.</w:t>
+      </w:r>
+    </w:p>
+    <w:p>
+      <w:pPr>
+        <w:pStyle w:val="BodyText"/>
+        <w:keepNext/>
+      </w:pPr>
     </w:p>
     <w:p>
       <w:pPr>
         <w:pStyle w:val="Heading2"/>
       </w:pPr>
-      <w:bookmarkStart w:id="40" w:name="_Toc509165866"/>
-      <w:r>
-        <w:t>Finalize Tournament</w:t>
-      </w:r>
-      <w:bookmarkEnd w:id="40"/>
-      <w:r>
-        <w:fldChar w:fldCharType="begin"/>
-      </w:r>
-      <w:r>
-        <w:instrText xml:space="preserve"> XE "</w:instrText>
-      </w:r>
-      <w:r>
-        <w:instrText>Finalize Tournament</w:instrText>
-      </w:r>
-      <w:r>
-        <w:instrText xml:space="preserve">" </w:instrText>
-      </w:r>
-      <w:r>
-        <w:fldChar w:fldCharType="end"/>
-      </w:r>
-    </w:p>
-    <w:p>
-      <w:pPr>
-        <w:pStyle w:val="BodyText"/>
+      <w:r>
+        <w:t>Understanding the Finalize Tournament layout</w:t>
+      </w:r>
+    </w:p>
+    <w:p>
+      <w:pPr>
+        <w:pStyle w:val="BodyText"/>
+      </w:pPr>
+      <w:r>
+        <w:t>The layout of the window is split into two sub windows, one above, and one below. The color of a cell determines a few things. A red cell is a score that has been invalidated</w:t>
+      </w:r>
+      <w:r>
+        <w:t xml:space="preserve"> by the direc</w:t>
+      </w:r>
+      <w:r>
+        <w:t>tor</w:t>
+      </w:r>
+      <w:r>
+        <w:t>, while an orange cell is a score that is 50 or more below a player’s average score for a given game</w:t>
+      </w:r>
+      <w:r>
+        <w:t xml:space="preserve">; </w:t>
+      </w:r>
+      <w:r>
+        <w:t>lastly</w:t>
+      </w:r>
+      <w:r>
+        <w:t xml:space="preserve">, </w:t>
+      </w:r>
+      <w:r>
+        <w:t>a blue cell means it has been</w:t>
+      </w:r>
+      <w:r>
+        <w:t xml:space="preserve"> selected.</w:t>
+      </w:r>
+      <w:r>
+        <w:t xml:space="preserve"> Furthermore, furthest left are empty cells which denote a fe</w:t>
+      </w:r>
+      <w:r>
+        <w:t>w things which allow for better visibility. A black arrow in the l</w:t>
+      </w:r>
+      <w:r>
+        <w:t xml:space="preserve">eftmost corner means something </w:t>
+      </w:r>
+      <w:r>
+        <w:t>in that row is selected, while a pencil means something in that row is currently being edited.</w:t>
+      </w:r>
+      <w:r>
+        <w:t xml:space="preserve"> Clicking the leftmost cell will highlight the entire row in blue, and clicking the top leftmost cell will highlight </w:t>
+      </w:r>
+      <w:r>
+        <w:t>everything.</w:t>
+      </w:r>
+      <w:r>
+        <w:t xml:space="preserve"> </w:t>
+      </w:r>
+    </w:p>
+    <w:p>
+      <w:pPr>
+        <w:pStyle w:val="BodyText"/>
+      </w:pPr>
+      <w:r>
+        <w:t>The director may also modify some of the cells if it is required. The following cells can be modified by double cli</w:t>
+      </w:r>
+      <w:r>
+        <w:t>cking them: Scratch Total, Handicap Total, Entry AVG, ADJ AVG, Pro Pot, and Notes.</w:t>
+      </w:r>
+    </w:p>
+    <w:p>
+      <w:pPr>
+        <w:pStyle w:val="BodyText"/>
+      </w:pPr>
+      <w:r>
+        <w:t>The data in the table can also be easily organized. Double click</w:t>
+      </w:r>
+      <w:r>
+        <w:t>ing one of the columns such as N</w:t>
+      </w:r>
+      <w:r>
+        <w:t>ame, or Scratch Total will reorder the data by descending and do</w:t>
+      </w:r>
+      <w:r>
+        <w:t>uble clicking once more will re</w:t>
+      </w:r>
+      <w:r>
+        <w:t>or</w:t>
+      </w:r>
+      <w:r>
+        <w:t xml:space="preserve">der it by ascending; however, columns with </w:t>
+      </w:r>
+      <w:r>
+        <w:t>checkboxes in them cannot be re</w:t>
+      </w:r>
+      <w:r>
+        <w:t>ordered.</w:t>
+      </w:r>
+    </w:p>
+    <w:p>
+      <w:pPr>
         <w:keepNext/>
       </w:pPr>
       <w:r>
-        <w:t>On the Member Scores</w:t>
-      </w:r>
-      <w:r>
-        <w:fldChar w:fldCharType="begin"/>
-      </w:r>
-      <w:r>
-        <w:instrText xml:space="preserve"> XE "</w:instrText>
-      </w:r>
-      <w:r>
-        <w:instrText>Member Scores</w:instrText>
-      </w:r>
-      <w:r>
-        <w:instrText xml:space="preserve">" </w:instrText>
-      </w:r>
-      <w:r>
-        <w:fldChar w:fldCharType="end"/>
-      </w:r>
-      <w:r>
-        <w:t xml:space="preserve"> screen, the “Finalize Tournament” button launches the Finalize Tournament</w:t>
-      </w:r>
-      <w:r>
-        <w:fldChar w:fldCharType="begin"/>
-      </w:r>
-      <w:r>
-        <w:instrText xml:space="preserve"> XE "</w:instrText>
-      </w:r>
-      <w:r>
-        <w:instrText>Finalize Tournament</w:instrText>
-      </w:r>
-      <w:r>
-        <w:instrText xml:space="preserve">" </w:instrText>
-      </w:r>
-      <w:r>
-        <w:fldChar w:fldCharType="end"/>
-      </w:r>
-      <w:r>
-        <w:t xml:space="preserve"> screen. This screen is used by the tournament director to finalize the member scores for the selected tournament. </w:t>
-      </w:r>
-      <w:r>
-        <w:t xml:space="preserve">Scores that are 50 or more pins under the member’s average are highlighted yellow. </w:t>
-      </w:r>
-      <w:r>
-        <w:t xml:space="preserve">The director determines if the scores are valid. If needed the director can </w:t>
-      </w:r>
-      <w:r>
-        <w:t xml:space="preserve">uncheck the “Valid Score” box for the respective score so it is not included in calculating the bowler’s average </w:t>
-      </w:r>
-      <w:r>
-        <w:t>the</w:t>
-      </w:r>
-      <w:r>
-        <w:t xml:space="preserve"> director then enters </w:t>
-      </w:r>
-      <w:r>
+        <w:rPr>
+          <w:noProof/>
+        </w:rPr>
         <w:lastRenderedPageBreak/>
-        <w:t>the adjusted average in the ADJ AVG field</w:t>
-      </w:r>
-      <w:r>
-        <w:t>.</w:t>
-      </w:r>
-      <w:r>
-        <w:t xml:space="preserve"> </w:t>
-      </w:r>
-      <w:r>
-        <w:t>The Adjusted Average</w:t>
-      </w:r>
-      <w:r>
-        <w:fldChar w:fldCharType="begin"/>
-      </w:r>
-      <w:r>
-        <w:instrText xml:space="preserve"> XE "</w:instrText>
-      </w:r>
-      <w:r>
-        <w:instrText>Average</w:instrText>
-      </w:r>
-      <w:r>
-        <w:instrText xml:space="preserve">" </w:instrText>
-      </w:r>
-      <w:r>
-        <w:fldChar w:fldCharType="end"/>
-      </w:r>
-      <w:r>
-        <w:t xml:space="preserve"> determines the member’s handicap for the next tournament </w:t>
-      </w:r>
-      <w:r>
-        <w:t>in which they are competing</w:t>
-      </w:r>
-      <w:r>
-        <w:t>.</w:t>
-      </w:r>
-      <w:r>
-        <w:t xml:space="preserve"> Once the information has been validated, the director checks off the “Director Check” boxes. Then “Finalize” is clicked and the information is saved to the database.</w:t>
-      </w:r>
-    </w:p>
-    <w:p>
-      <w:pPr>
-        <w:keepNext/>
-      </w:pPr>
-      <w:r>
-        <w:rPr>
-          <w:noProof/>
-        </w:rPr>
-        <w:drawing>
-          <wp:inline distT="0" distB="0" distL="0" distR="0">
-            <wp:extent cx="4883150" cy="2618105"/>
-            <wp:effectExtent l="0" t="0" r="0" b="0"/>
-            <wp:docPr id="21" name="Picture 21"/>
-            <wp:cNvGraphicFramePr>
-              <a:graphicFrameLocks xmlns:a="http://schemas.openxmlformats.org/drawingml/2006/main" noChangeAspect="1"/>
-            </wp:cNvGraphicFramePr>
-            <a:graphic xmlns:a="http://schemas.openxmlformats.org/drawingml/2006/main">
-              <a:graphicData uri="http://schemas.openxmlformats.org/drawingml/2006/picture">
-                <pic:pic xmlns:pic="http://schemas.openxmlformats.org/drawingml/2006/picture">
-                  <pic:nvPicPr>
-                    <pic:cNvPr id="21" name="FinalizeTournament.PNG"/>
-                    <pic:cNvPicPr/>
-                  </pic:nvPicPr>
-                  <pic:blipFill>
-                    <a:blip r:embed="rId32" cstate="print">
-                      <a:extLst>
-                        <a:ext uri="{28A0092B-C50C-407E-A947-70E740481C1C}">
-                          <a14:useLocalDpi xmlns:a14="http://schemas.microsoft.com/office/drawing/2010/main" val="0"/>
-                        </a:ext>
-                      </a:extLst>
-                    </a:blip>
-                    <a:stretch>
-                      <a:fillRect/>
-                    </a:stretch>
-                  </pic:blipFill>
-                  <pic:spPr>
-                    <a:xfrm>
-                      <a:off x="0" y="0"/>
-                      <a:ext cx="4883150" cy="2618105"/>
-                    </a:xfrm>
-                    <a:prstGeom prst="rect">
-                      <a:avLst/>
-                    </a:prstGeom>
-                  </pic:spPr>
-                </pic:pic>
-              </a:graphicData>
-            </a:graphic>
-          </wp:inline>
-        </w:drawing>
+        <w:pict>
+          <v:shapetype id="_x0000_t75" coordsize="21600,21600" o:spt="75" o:preferrelative="t" path="m@4@5l@4@11@9@11@9@5xe" filled="f" stroked="f">
+            <v:stroke joinstyle="miter"/>
+            <v:formulas>
+              <v:f eqn="if lineDrawn pixelLineWidth 0"/>
+              <v:f eqn="sum @0 1 0"/>
+              <v:f eqn="sum 0 0 @1"/>
+              <v:f eqn="prod @2 1 2"/>
+              <v:f eqn="prod @3 21600 pixelWidth"/>
+              <v:f eqn="prod @3 21600 pixelHeight"/>
+              <v:f eqn="sum @0 0 1"/>
+              <v:f eqn="prod @6 1 2"/>
+              <v:f eqn="prod @7 21600 pixelWidth"/>
+              <v:f eqn="sum @8 21600 0"/>
+              <v:f eqn="prod @7 21600 pixelHeight"/>
+              <v:f eqn="sum @10 21600 0"/>
+            </v:formulas>
+            <v:path o:extrusionok="f" gradientshapeok="t" o:connecttype="rect"/>
+            <o:lock v:ext="edit" aspectratio="t"/>
+          </v:shapetype>
+          <v:shape id="_x0000_i1025" type="#_x0000_t75" style="width:384pt;height:222.75pt">
+            <v:imagedata r:id="rId32" o:title="FinalizeTournamentWindow"/>
+          </v:shape>
+        </w:pict>
       </w:r>
     </w:p>
     <w:p>
@@ -9983,14 +10085,381 @@
     </w:p>
     <w:p>
       <w:pPr>
+        <w:pStyle w:val="BodyText"/>
+        <w:keepNext/>
+      </w:pPr>
+    </w:p>
+    <w:p>
+      <w:pPr>
+        <w:pStyle w:val="BodyText"/>
+        <w:keepNext/>
+      </w:pPr>
+      <w:r>
+        <w:t>Referring to Figure 18, t</w:t>
+      </w:r>
+      <w:r>
+        <w:t>he topmos</w:t>
+      </w:r>
+      <w:r>
+        <w:t>t window displays a wide array of information for each player in the given tournament.</w:t>
+      </w:r>
+    </w:p>
+    <w:p>
+      <w:pPr>
+        <w:pStyle w:val="BodyText"/>
+        <w:keepNext/>
+      </w:pPr>
+      <w:r>
+        <w:t xml:space="preserve"> Going from left to right this information is as follows:</w:t>
+      </w:r>
+    </w:p>
+    <w:p>
+      <w:pPr>
+        <w:pStyle w:val="BodyText"/>
+        <w:keepNext/>
+        <w:numPr>
+          <w:ilvl w:val="0"/>
+          <w:numId w:val="50"/>
+        </w:numPr>
+      </w:pPr>
+      <w:r>
+        <w:rPr>
+          <w:b/>
+          <w:u w:val="single"/>
+        </w:rPr>
+        <w:t>Index</w:t>
+      </w:r>
+      <w:r>
+        <w:t xml:space="preserve"> – the index of the player in the database.</w:t>
+      </w:r>
+    </w:p>
+    <w:p>
+      <w:pPr>
+        <w:pStyle w:val="BodyText"/>
+        <w:keepNext/>
+        <w:numPr>
+          <w:ilvl w:val="0"/>
+          <w:numId w:val="50"/>
+        </w:numPr>
+      </w:pPr>
+      <w:r>
+        <w:rPr>
+          <w:b/>
+          <w:u w:val="single"/>
+        </w:rPr>
+        <w:t>GameID</w:t>
+      </w:r>
+      <w:r>
+        <w:t xml:space="preserve"> –Needs work</w:t>
+      </w:r>
+    </w:p>
+    <w:p>
+      <w:pPr>
+        <w:pStyle w:val="BodyText"/>
+        <w:keepNext/>
+        <w:numPr>
+          <w:ilvl w:val="0"/>
+          <w:numId w:val="50"/>
+        </w:numPr>
+      </w:pPr>
+      <w:r>
+        <w:rPr>
+          <w:b/>
+          <w:u w:val="single"/>
+        </w:rPr>
+        <w:t>Game 1-4 and ValidScore 1-4</w:t>
+      </w:r>
+      <w:r>
+        <w:t xml:space="preserve"> - t</w:t>
+      </w:r>
+      <w:r>
+        <w:t>hat player’s score for each game</w:t>
+      </w:r>
+      <w:r>
+        <w:t xml:space="preserve"> they played, and a checkbox used to determine whether that player’s score is valid for that set of pins. E.G. a sandbagged score will be unchecked and thus invalidated.</w:t>
+      </w:r>
+    </w:p>
+    <w:p>
+      <w:pPr>
+        <w:pStyle w:val="BodyText"/>
+        <w:keepNext/>
+        <w:numPr>
+          <w:ilvl w:val="0"/>
+          <w:numId w:val="50"/>
+        </w:numPr>
+      </w:pPr>
+      <w:r>
+        <w:rPr>
+          <w:b/>
+          <w:u w:val="single"/>
+        </w:rPr>
+        <w:t>Scratch Total</w:t>
+      </w:r>
+      <w:r>
+        <w:t xml:space="preserve"> – The player’s total score before handicaps are taken into account.</w:t>
+      </w:r>
+    </w:p>
+    <w:p>
+      <w:pPr>
+        <w:pStyle w:val="BodyText"/>
+        <w:keepNext/>
+        <w:numPr>
+          <w:ilvl w:val="0"/>
+          <w:numId w:val="50"/>
+        </w:numPr>
+      </w:pPr>
+      <w:r>
+        <w:rPr>
+          <w:b/>
+          <w:u w:val="single"/>
+        </w:rPr>
+        <w:t xml:space="preserve">Handicap Total </w:t>
+      </w:r>
+      <w:r>
+        <w:t>– The player’s total score after handicaps are taken into account.</w:t>
+      </w:r>
+    </w:p>
+    <w:p>
+      <w:pPr>
+        <w:pStyle w:val="BodyText"/>
+        <w:keepNext/>
+        <w:numPr>
+          <w:ilvl w:val="0"/>
+          <w:numId w:val="50"/>
+        </w:numPr>
+      </w:pPr>
+      <w:r>
+        <w:rPr>
+          <w:b/>
+          <w:u w:val="single"/>
+        </w:rPr>
+        <w:t>Entry AVG</w:t>
+      </w:r>
+      <w:r>
+        <w:t xml:space="preserve"> – The average for the current entry of the player.</w:t>
+      </w:r>
+    </w:p>
+    <w:p>
+      <w:pPr>
+        <w:pStyle w:val="BodyText"/>
+        <w:keepNext/>
+        <w:numPr>
+          <w:ilvl w:val="0"/>
+          <w:numId w:val="50"/>
+        </w:numPr>
+      </w:pPr>
+      <w:r>
+        <w:rPr>
+          <w:b/>
+          <w:u w:val="single"/>
+        </w:rPr>
+        <w:t>30 Entry AVG</w:t>
+      </w:r>
+      <w:r>
+        <w:t xml:space="preserve"> – The average for the last 30 entries of the player.</w:t>
+      </w:r>
+    </w:p>
+    <w:p>
+      <w:pPr>
+        <w:pStyle w:val="BodyText"/>
+        <w:keepNext/>
+        <w:numPr>
+          <w:ilvl w:val="0"/>
+          <w:numId w:val="50"/>
+        </w:numPr>
+      </w:pPr>
+      <w:r>
+        <w:rPr>
+          <w:b/>
+          <w:u w:val="single"/>
+        </w:rPr>
+        <w:t>ADJ AVG</w:t>
+      </w:r>
+      <w:r>
+        <w:t xml:space="preserve"> – Adjusted Average.</w:t>
+      </w:r>
+      <w:r>
+        <w:t xml:space="preserve"> The average that has been adjusted by the director if need be. E.G. if a player sandbags a score, the average can be adjusted and entered in here.</w:t>
+      </w:r>
+    </w:p>
+    <w:p>
+      <w:pPr>
+        <w:pStyle w:val="BodyText"/>
+        <w:keepNext/>
+        <w:numPr>
+          <w:ilvl w:val="0"/>
+          <w:numId w:val="50"/>
+        </w:numPr>
+      </w:pPr>
+      <w:r>
+        <w:rPr>
+          <w:b/>
+          <w:u w:val="single"/>
+        </w:rPr>
+        <w:t>Director Check</w:t>
+      </w:r>
+      <w:r>
+        <w:t xml:space="preserve"> – Checkbox to confirm a director has checked and validated</w:t>
+      </w:r>
+      <w:r>
+        <w:t xml:space="preserve"> a player’s score.</w:t>
+      </w:r>
+    </w:p>
+    <w:p>
+      <w:pPr>
+        <w:pStyle w:val="BodyText"/>
+        <w:keepNext/>
+        <w:numPr>
+          <w:ilvl w:val="0"/>
+          <w:numId w:val="50"/>
+        </w:numPr>
+        <w:rPr>
+          <w:b/>
+          <w:u w:val="single"/>
+        </w:rPr>
+      </w:pPr>
+      <w:r>
+        <w:rPr>
+          <w:b/>
+          <w:u w:val="single"/>
+        </w:rPr>
+        <w:t>Squad</w:t>
+      </w:r>
+      <w:r>
+        <w:rPr>
+          <w:b/>
+          <w:u w:val="single"/>
+        </w:rPr>
+        <w:t xml:space="preserve"> </w:t>
+      </w:r>
+      <w:r>
+        <w:t>–</w:t>
+      </w:r>
+      <w:r>
+        <w:t xml:space="preserve"> T</w:t>
+      </w:r>
+      <w:r>
+        <w:t>he squad of this player’s game.</w:t>
+      </w:r>
+    </w:p>
+    <w:p>
+      <w:pPr>
+        <w:pStyle w:val="BodyText"/>
+        <w:keepNext/>
+        <w:numPr>
+          <w:ilvl w:val="0"/>
+          <w:numId w:val="50"/>
+        </w:numPr>
+        <w:rPr>
+          <w:b/>
+          <w:u w:val="single"/>
+        </w:rPr>
+      </w:pPr>
+      <w:r>
+        <w:rPr>
+          <w:b/>
+          <w:u w:val="single"/>
+        </w:rPr>
+        <w:t xml:space="preserve">Handicap </w:t>
+      </w:r>
+      <w:r>
+        <w:t>– The player’s current handicap.</w:t>
+      </w:r>
+    </w:p>
+    <w:p>
+      <w:pPr>
+        <w:pStyle w:val="BodyText"/>
+        <w:keepNext/>
+        <w:numPr>
+          <w:ilvl w:val="0"/>
+          <w:numId w:val="50"/>
+        </w:numPr>
+        <w:rPr>
+          <w:b/>
+          <w:u w:val="single"/>
+        </w:rPr>
+      </w:pPr>
+      <w:r>
+        <w:rPr>
+          <w:b/>
+          <w:u w:val="single"/>
+        </w:rPr>
+        <w:t>Bonus</w:t>
+      </w:r>
+      <w:r>
+        <w:t xml:space="preserve"> – Current player’s bonus.</w:t>
+      </w:r>
+    </w:p>
+    <w:p>
+      <w:pPr>
+        <w:pStyle w:val="BodyText"/>
+        <w:keepNext/>
+        <w:numPr>
+          <w:ilvl w:val="0"/>
+          <w:numId w:val="50"/>
+        </w:numPr>
+        <w:rPr>
+          <w:b/>
+          <w:u w:val="single"/>
+        </w:rPr>
+      </w:pPr>
+      <w:r>
+        <w:rPr>
+          <w:b/>
+          <w:u w:val="single"/>
+        </w:rPr>
+        <w:t xml:space="preserve"> Pro Pot</w:t>
+      </w:r>
+      <w:r>
+        <w:rPr>
+          <w:i/>
+          <w:u w:val="single"/>
+        </w:rPr>
+        <w:t xml:space="preserve"> </w:t>
+      </w:r>
+      <w:r>
+        <w:t>– Needs work</w:t>
+      </w:r>
+    </w:p>
+    <w:p>
+      <w:pPr>
+        <w:pStyle w:val="BodyText"/>
+        <w:keepNext/>
+        <w:numPr>
+          <w:ilvl w:val="0"/>
+          <w:numId w:val="50"/>
+        </w:numPr>
+        <w:rPr>
+          <w:b/>
+          <w:u w:val="single"/>
+        </w:rPr>
+      </w:pPr>
+      <w:r>
+        <w:rPr>
+          <w:b/>
+          <w:u w:val="single"/>
+        </w:rPr>
+        <w:t>Notes</w:t>
+      </w:r>
+      <w:r>
+        <w:t xml:space="preserve"> – notes on the current player can be entered here.</w:t>
+      </w:r>
+    </w:p>
+    <w:p>
+      <w:pPr>
+        <w:pStyle w:val="Caption"/>
+      </w:pPr>
+    </w:p>
+    <w:p>
+      <w:pPr>
         <w:pStyle w:val="Heading1"/>
       </w:pPr>
-      <w:bookmarkStart w:id="41" w:name="_Toc509165867"/>
+      <w:bookmarkStart w:id="40" w:name="_Toc509165867"/>
       <w:r>
         <w:lastRenderedPageBreak/>
         <w:t>Tools</w:t>
       </w:r>
-      <w:bookmarkEnd w:id="41"/>
+      <w:bookmarkEnd w:id="40"/>
       <w:r>
         <w:fldChar w:fldCharType="begin"/>
       </w:r>
@@ -10188,7 +10657,7 @@
       <w:pPr>
         <w:pStyle w:val="Heading1"/>
       </w:pPr>
-      <w:bookmarkStart w:id="42" w:name="_Toc509165868"/>
+      <w:bookmarkStart w:id="41" w:name="_Toc509165868"/>
       <w:r>
         <w:lastRenderedPageBreak/>
         <w:t>Troubles</w:t>
@@ -10214,7 +10683,7 @@
       <w:r>
         <w:t xml:space="preserve"> 9-Tap</w:t>
       </w:r>
-      <w:bookmarkEnd w:id="42"/>
+      <w:bookmarkEnd w:id="41"/>
     </w:p>
     <w:p>
       <w:pPr>
@@ -10224,7 +10693,7 @@
           <w:szCs w:val="24"/>
         </w:rPr>
       </w:pPr>
-      <w:bookmarkStart w:id="43" w:name="_Toc509165869"/>
+      <w:bookmarkStart w:id="42" w:name="_Toc509165869"/>
       <w:r>
         <w:rPr>
           <w:sz w:val="24"/>
@@ -10246,94 +10715,94 @@
         </w:rPr>
         <w:t>:</w:t>
       </w:r>
+      <w:bookmarkEnd w:id="42"/>
+    </w:p>
+    <w:p>
+      <w:pPr>
+        <w:pStyle w:val="BodyText"/>
+      </w:pPr>
+      <w:r>
+        <w:rPr>
+          <w:b/>
+        </w:rPr>
+        <w:t xml:space="preserve">If </w:t>
+      </w:r>
+      <w:r>
+        <w:rPr>
+          <w:b/>
+        </w:rPr>
+        <w:t xml:space="preserve">the </w:t>
+      </w:r>
+      <w:r>
+        <w:rPr>
+          <w:b/>
+        </w:rPr>
+        <w:t xml:space="preserve">tournament has </w:t>
+      </w:r>
+      <w:r>
+        <w:rPr>
+          <w:b/>
+        </w:rPr>
+        <w:t>five (5) or fewer</w:t>
+      </w:r>
+      <w:r>
+        <w:rPr>
+          <w:b/>
+        </w:rPr>
+        <w:t xml:space="preserve"> participants, DO NOT USE PROGRAM. Keep track of player data manually</w:t>
+      </w:r>
+      <w:r>
+        <w:t>.</w:t>
+      </w:r>
+    </w:p>
+    <w:p>
+      <w:pPr>
+        <w:pStyle w:val="BodyText"/>
+      </w:pPr>
+      <w:r>
+        <w:t>Doubles tournaments are not supported by the software at this time</w:t>
+      </w:r>
+      <w:r>
+        <w:t>. LEAVE DOUBLES UNCHECKED ON THE NEW TOURNAMENT SCREEN/DIALOG.</w:t>
+      </w:r>
+    </w:p>
+    <w:p>
+      <w:pPr>
+        <w:pStyle w:val="BodyText"/>
+      </w:pPr>
+      <w:r>
+        <w:t>Do not start a new tournament before the current tournament you are working on has been finalized.</w:t>
+      </w:r>
+    </w:p>
+    <w:p>
+      <w:pPr>
+        <w:pStyle w:val="BodyText"/>
+      </w:pPr>
+      <w:r>
+        <w:t xml:space="preserve">On the Member Scores screen, </w:t>
+      </w:r>
+      <w:r>
+        <w:t xml:space="preserve">as you are entering the member for the first time; </w:t>
+      </w:r>
+      <w:r>
+        <w:t xml:space="preserve">if the member has been comped into the tournament, make sure the </w:t>
+      </w:r>
+      <w:r>
+        <w:t>Comp Entry box has been checked before clicking the “Add New/Update Record button. This cannot be adjusted after the member’s scores have been entered and saved.</w:t>
+      </w:r>
+    </w:p>
+    <w:p>
+      <w:pPr>
+        <w:pStyle w:val="Heading2"/>
+      </w:pPr>
+      <w:bookmarkStart w:id="43" w:name="_Toc509165870"/>
+      <w:r>
+        <w:t>Screen “splitting”</w:t>
+      </w:r>
+      <w:r>
+        <w:t xml:space="preserve"> on resize</w:t>
+      </w:r>
       <w:bookmarkEnd w:id="43"/>
-    </w:p>
-    <w:p>
-      <w:pPr>
-        <w:pStyle w:val="BodyText"/>
-      </w:pPr>
-      <w:r>
-        <w:rPr>
-          <w:b/>
-        </w:rPr>
-        <w:t xml:space="preserve">If </w:t>
-      </w:r>
-      <w:r>
-        <w:rPr>
-          <w:b/>
-        </w:rPr>
-        <w:t xml:space="preserve">the </w:t>
-      </w:r>
-      <w:r>
-        <w:rPr>
-          <w:b/>
-        </w:rPr>
-        <w:t xml:space="preserve">tournament has </w:t>
-      </w:r>
-      <w:r>
-        <w:rPr>
-          <w:b/>
-        </w:rPr>
-        <w:t>five (5) or fewer</w:t>
-      </w:r>
-      <w:r>
-        <w:rPr>
-          <w:b/>
-        </w:rPr>
-        <w:t xml:space="preserve"> participants, DO NOT USE PROGRAM. Keep track of player data manually</w:t>
-      </w:r>
-      <w:r>
-        <w:t>.</w:t>
-      </w:r>
-    </w:p>
-    <w:p>
-      <w:pPr>
-        <w:pStyle w:val="BodyText"/>
-      </w:pPr>
-      <w:r>
-        <w:t>Doubles tournaments are not supported by the software at this time</w:t>
-      </w:r>
-      <w:r>
-        <w:t>. LEAVE DOUBLES UNCHECKED ON THE NEW TOURNAMENT SCREEN/DIALOG.</w:t>
-      </w:r>
-    </w:p>
-    <w:p>
-      <w:pPr>
-        <w:pStyle w:val="BodyText"/>
-      </w:pPr>
-      <w:r>
-        <w:t>Do not start a new tournament before the current tournament you are working on has been finalized.</w:t>
-      </w:r>
-    </w:p>
-    <w:p>
-      <w:pPr>
-        <w:pStyle w:val="BodyText"/>
-      </w:pPr>
-      <w:r>
-        <w:t xml:space="preserve">On the Member Scores screen, </w:t>
-      </w:r>
-      <w:r>
-        <w:t xml:space="preserve">as you are entering the member for the first time; </w:t>
-      </w:r>
-      <w:r>
-        <w:t xml:space="preserve">if the member has been comped into the tournament, make sure the </w:t>
-      </w:r>
-      <w:r>
-        <w:t>Comp Entry box has been checked before clicking the “Add New/Update Record button. This cannot be adjusted after the member’s scores have been entered and saved.</w:t>
-      </w:r>
-    </w:p>
-    <w:p>
-      <w:pPr>
-        <w:pStyle w:val="Heading2"/>
-      </w:pPr>
-      <w:bookmarkStart w:id="44" w:name="_Toc509165870"/>
-      <w:r>
-        <w:t>Screen “splitting”</w:t>
-      </w:r>
-      <w:r>
-        <w:t xml:space="preserve"> on resize</w:t>
-      </w:r>
-      <w:bookmarkEnd w:id="44"/>
     </w:p>
     <w:p>
       <w:pPr>
@@ -10639,7 +11108,7 @@
           <w:szCs w:val="24"/>
         </w:rPr>
       </w:pPr>
-      <w:bookmarkStart w:id="45" w:name="_Toc509165871"/>
+      <w:bookmarkStart w:id="44" w:name="_Toc509165871"/>
       <w:r>
         <w:rPr>
           <w:sz w:val="24"/>
@@ -10648,7 +11117,7 @@
         <w:lastRenderedPageBreak/>
         <w:t>ReadMe File</w:t>
       </w:r>
-      <w:bookmarkEnd w:id="45"/>
+      <w:bookmarkEnd w:id="44"/>
       <w:r>
         <w:rPr>
           <w:sz w:val="24"/>
@@ -10767,7 +11236,7 @@
       <w:pPr>
         <w:pStyle w:val="Heading1"/>
       </w:pPr>
-      <w:bookmarkStart w:id="46" w:name="_Toc509165872"/>
+      <w:bookmarkStart w:id="45" w:name="_Toc509165872"/>
       <w:r>
         <w:lastRenderedPageBreak/>
         <w:t>Conver</w:t>
@@ -10775,7 +11244,7 @@
       <w:r>
         <w:t>sion Program</w:t>
       </w:r>
-      <w:bookmarkEnd w:id="46"/>
+      <w:bookmarkEnd w:id="45"/>
       <w:r>
         <w:fldChar w:fldCharType="begin"/>
       </w:r>
@@ -10888,12 +11357,12 @@
       <w:pPr>
         <w:pStyle w:val="Heading1"/>
       </w:pPr>
-      <w:bookmarkStart w:id="47" w:name="_Toc509165873"/>
+      <w:bookmarkStart w:id="46" w:name="_Toc509165873"/>
       <w:r>
         <w:lastRenderedPageBreak/>
         <w:t>General Information</w:t>
       </w:r>
-      <w:bookmarkEnd w:id="47"/>
+      <w:bookmarkEnd w:id="46"/>
       <w:r>
         <w:fldChar w:fldCharType="begin"/>
       </w:r>
@@ -10929,15 +11398,16 @@
           <w:szCs w:val="22"/>
         </w:rPr>
       </w:pPr>
-      <w:bookmarkStart w:id="48" w:name="_Toc509165874"/>
+      <w:bookmarkStart w:id="47" w:name="_Toc509165874"/>
       <w:r>
         <w:rPr>
           <w:sz w:val="22"/>
           <w:szCs w:val="22"/>
         </w:rPr>
+        <w:lastRenderedPageBreak/>
         <w:t>Main Menu</w:t>
       </w:r>
-      <w:bookmarkEnd w:id="48"/>
+      <w:bookmarkEnd w:id="47"/>
       <w:r>
         <w:rPr>
           <w:sz w:val="22"/>
@@ -11437,11 +11907,11 @@
       <w:pPr>
         <w:pStyle w:val="Heading2"/>
       </w:pPr>
-      <w:bookmarkStart w:id="49" w:name="_Toc509165875"/>
+      <w:bookmarkStart w:id="48" w:name="_Toc509165875"/>
       <w:r>
         <w:t>Member Info</w:t>
       </w:r>
-      <w:bookmarkEnd w:id="49"/>
+      <w:bookmarkEnd w:id="48"/>
       <w:r>
         <w:fldChar w:fldCharType="begin"/>
       </w:r>
@@ -12496,11 +12966,11 @@
       <w:pPr>
         <w:pStyle w:val="Heading2"/>
       </w:pPr>
-      <w:bookmarkStart w:id="50" w:name="_Toc509165876"/>
+      <w:bookmarkStart w:id="49" w:name="_Toc509165876"/>
       <w:r>
         <w:t>Member Scores</w:t>
       </w:r>
-      <w:bookmarkEnd w:id="50"/>
+      <w:bookmarkEnd w:id="49"/>
       <w:r>
         <w:fldChar w:fldCharType="begin"/>
       </w:r>
@@ -13676,7 +14146,13 @@
         <w:fldChar w:fldCharType="end"/>
       </w:r>
       <w:r>
-        <w:t xml:space="preserve"> screen. You can chose what the reports contain by way of the buttons.</w:t>
+        <w:t xml:space="preserve"> screen. You can cho</w:t>
+      </w:r>
+      <w:r>
+        <w:t>o</w:t>
+      </w:r>
+      <w:r>
+        <w:t>se what the reports contain by way of the buttons.</w:t>
       </w:r>
     </w:p>
     <w:p>
@@ -13822,10 +14298,43 @@
       <w:pPr>
         <w:pStyle w:val="Heading2"/>
       </w:pPr>
-      <w:bookmarkStart w:id="51" w:name="_Toc509165877"/>
+      <w:bookmarkStart w:id="50" w:name="_Toc509165877"/>
       <w:r>
         <w:t>Tools</w:t>
       </w:r>
+      <w:bookmarkEnd w:id="50"/>
+      <w:r>
+        <w:fldChar w:fldCharType="begin"/>
+      </w:r>
+      <w:r>
+        <w:instrText xml:space="preserve"> XE "</w:instrText>
+      </w:r>
+      <w:r>
+        <w:instrText>Tools</w:instrText>
+      </w:r>
+      <w:r>
+        <w:instrText xml:space="preserve">" </w:instrText>
+      </w:r>
+      <w:r>
+        <w:fldChar w:fldCharType="end"/>
+      </w:r>
+    </w:p>
+    <w:p>
+      <w:pPr>
+        <w:pStyle w:val="BodyText"/>
+      </w:pPr>
+      <w:r>
+        <w:t>The update member status screen is launched from the tools tab.</w:t>
+      </w:r>
+    </w:p>
+    <w:p>
+      <w:pPr>
+        <w:pStyle w:val="Heading2"/>
+      </w:pPr>
+      <w:bookmarkStart w:id="51" w:name="_Toc509165878"/>
+      <w:r>
+        <w:t>About</w:t>
+      </w:r>
       <w:bookmarkEnd w:id="51"/>
       <w:r>
         <w:fldChar w:fldCharType="begin"/>
@@ -13834,86 +14343,53 @@
         <w:instrText xml:space="preserve"> XE "</w:instrText>
       </w:r>
       <w:r>
-        <w:instrText>Tools</w:instrText>
-      </w:r>
-      <w:r>
-        <w:instrText xml:space="preserve">" </w:instrText>
-      </w:r>
-      <w:r>
-        <w:fldChar w:fldCharType="end"/>
-      </w:r>
-    </w:p>
-    <w:p>
-      <w:pPr>
-        <w:pStyle w:val="BodyText"/>
-      </w:pPr>
-      <w:r>
-        <w:t>The update member status screen is launched from the tools tab.</w:t>
+        <w:instrText>About</w:instrText>
+      </w:r>
+      <w:r>
+        <w:instrText xml:space="preserve">" </w:instrText>
+      </w:r>
+      <w:r>
+        <w:fldChar w:fldCharType="end"/>
+      </w:r>
+    </w:p>
+    <w:p>
+      <w:pPr>
+        <w:pStyle w:val="BodyText"/>
+      </w:pPr>
+      <w:r>
+        <w:t>Clicking the “About” button on the Main Menu</w:t>
+      </w:r>
+      <w:r>
+        <w:fldChar w:fldCharType="begin"/>
+      </w:r>
+      <w:r>
+        <w:instrText xml:space="preserve"> XE "</w:instrText>
+      </w:r>
+      <w:r>
+        <w:rPr>
+          <w:szCs w:val="32"/>
+        </w:rPr>
+        <w:instrText>Main Menu</w:instrText>
+      </w:r>
+      <w:r>
+        <w:instrText xml:space="preserve">" </w:instrText>
+      </w:r>
+      <w:r>
+        <w:fldChar w:fldCharType="end"/>
+      </w:r>
+      <w:r>
+        <w:t xml:space="preserve"> launches the About 9-Tap screen.</w:t>
       </w:r>
     </w:p>
     <w:p>
       <w:pPr>
         <w:pStyle w:val="Heading2"/>
       </w:pPr>
-      <w:bookmarkStart w:id="52" w:name="_Toc509165878"/>
-      <w:r>
-        <w:t>About</w:t>
+      <w:bookmarkStart w:id="52" w:name="_Toc509165879"/>
+      <w:r>
+        <w:t>Exit</w:t>
       </w:r>
       <w:bookmarkEnd w:id="52"/>
-      <w:r>
-        <w:fldChar w:fldCharType="begin"/>
-      </w:r>
-      <w:r>
-        <w:instrText xml:space="preserve"> XE "</w:instrText>
-      </w:r>
-      <w:r>
-        <w:instrText>About</w:instrText>
-      </w:r>
-      <w:r>
-        <w:instrText xml:space="preserve">" </w:instrText>
-      </w:r>
-      <w:r>
-        <w:fldChar w:fldCharType="end"/>
-      </w:r>
-    </w:p>
-    <w:p>
-      <w:pPr>
-        <w:pStyle w:val="BodyText"/>
-      </w:pPr>
-      <w:r>
-        <w:t>Clicking the “About” button on the Main Menu</w:t>
-      </w:r>
-      <w:r>
-        <w:fldChar w:fldCharType="begin"/>
-      </w:r>
-      <w:r>
-        <w:instrText xml:space="preserve"> XE "</w:instrText>
-      </w:r>
-      <w:r>
-        <w:rPr>
-          <w:szCs w:val="32"/>
-        </w:rPr>
-        <w:instrText>Main Menu</w:instrText>
-      </w:r>
-      <w:r>
-        <w:instrText xml:space="preserve">" </w:instrText>
-      </w:r>
-      <w:r>
-        <w:fldChar w:fldCharType="end"/>
-      </w:r>
-      <w:r>
-        <w:t xml:space="preserve"> launches the About 9-Tap screen.</w:t>
-      </w:r>
-    </w:p>
-    <w:p>
-      <w:pPr>
-        <w:pStyle w:val="Heading2"/>
-      </w:pPr>
-      <w:bookmarkStart w:id="53" w:name="_Toc509165879"/>
-      <w:r>
-        <w:t>Exit</w:t>
-      </w:r>
-      <w:bookmarkEnd w:id="53"/>
       <w:r>
         <w:fldChar w:fldCharType="begin"/>
       </w:r>
@@ -13973,9 +14449,9 @@
           <w:cols w:space="720"/>
         </w:sectPr>
       </w:pPr>
-      <w:bookmarkStart w:id="54" w:name="_Toc35154388"/>
-      <w:bookmarkStart w:id="55" w:name="_Toc35154911"/>
-      <w:bookmarkStart w:id="56" w:name="_Toc36023011"/>
+      <w:bookmarkStart w:id="53" w:name="_Toc35154388"/>
+      <w:bookmarkStart w:id="54" w:name="_Toc35154911"/>
+      <w:bookmarkStart w:id="55" w:name="_Toc36023011"/>
     </w:p>
     <w:p>
       <w:pPr>
@@ -13990,14 +14466,15 @@
       <w:pPr>
         <w:pStyle w:val="Heading1"/>
       </w:pPr>
-      <w:bookmarkStart w:id="57" w:name="_Toc509165880"/>
-      <w:r>
+      <w:bookmarkStart w:id="56" w:name="_Toc509165880"/>
+      <w:r>
+        <w:lastRenderedPageBreak/>
         <w:t>Index</w:t>
       </w:r>
+      <w:bookmarkEnd w:id="53"/>
       <w:bookmarkEnd w:id="54"/>
       <w:bookmarkEnd w:id="55"/>
       <w:bookmarkEnd w:id="56"/>
-      <w:bookmarkEnd w:id="57"/>
     </w:p>
     <w:p>
       <w:pPr>
@@ -14036,6 +14513,7 @@
         <w:rPr>
           <w:noProof/>
         </w:rPr>
+        <w:lastRenderedPageBreak/>
         <w:t>About, 33, 38</w:t>
       </w:r>
     </w:p>
@@ -14529,6 +15007,7 @@
         <w:rPr>
           <w:noProof/>
         </w:rPr>
+        <w:lastRenderedPageBreak/>
         <w:t>Menus Guide, 5, 10</w:t>
       </w:r>
     </w:p>
@@ -15063,12 +15542,191 @@
         </w:sectPr>
       </w:pPr>
       <w:r>
-        <w:fldChar w:fldCharType="end"/>
-      </w:r>
-    </w:p>
-    <w:p>
-      <w:pPr>
-        <w:pStyle w:val="BodyText"/>
+        <w:lastRenderedPageBreak/>
+        <w:fldChar w:fldCharType="end"/>
+      </w:r>
+    </w:p>
+    <w:p>
+      <w:pPr>
+        <w:rPr>
+          <w:spacing w:val="-5"/>
+          <w:sz w:val="24"/>
+        </w:rPr>
+      </w:pPr>
+      <w:r>
+        <w:lastRenderedPageBreak/>
+        <w:br w:type="page"/>
+      </w:r>
+    </w:p>
+    <w:p>
+      <w:pPr>
+        <w:pStyle w:val="Heading1"/>
+      </w:pPr>
+      <w:r>
+        <w:lastRenderedPageBreak/>
+        <w:t>Glossary</w:t>
+      </w:r>
+    </w:p>
+    <w:p>
+      <w:pPr>
+        <w:pStyle w:val="BodyText"/>
+        <w:rPr>
+          <w:szCs w:val="24"/>
+        </w:rPr>
+      </w:pPr>
+      <w:r>
+        <w:rPr>
+          <w:b/>
+          <w:sz w:val="28"/>
+          <w:szCs w:val="28"/>
+        </w:rPr>
+        <w:t>Pot</w:t>
+      </w:r>
+      <w:r>
+        <w:rPr>
+          <w:b/>
+          <w:sz w:val="28"/>
+          <w:szCs w:val="28"/>
+        </w:rPr>
+        <w:t xml:space="preserve">         </w:t>
+      </w:r>
+      <w:r>
+        <w:rPr>
+          <w:szCs w:val="24"/>
+        </w:rPr>
+        <w:t>A sum of money a player wagers during a game.</w:t>
+      </w:r>
+    </w:p>
+    <w:p>
+      <w:pPr>
+        <w:pStyle w:val="BodyText"/>
+        <w:rPr>
+          <w:b/>
+          <w:sz w:val="28"/>
+          <w:szCs w:val="28"/>
+        </w:rPr>
+      </w:pPr>
+      <w:r>
+        <w:rPr>
+          <w:b/>
+          <w:sz w:val="28"/>
+          <w:szCs w:val="28"/>
+        </w:rPr>
+        <w:t>Progressive Pot</w:t>
+      </w:r>
+      <w:r>
+        <w:rPr>
+          <w:b/>
+          <w:sz w:val="28"/>
+          <w:szCs w:val="28"/>
+        </w:rPr>
+        <w:t xml:space="preserve">  </w:t>
+      </w:r>
+      <w:r>
+        <w:rPr>
+          <w:b/>
+          <w:sz w:val="28"/>
+          <w:szCs w:val="28"/>
+        </w:rPr>
+        <w:tab/>
+      </w:r>
+      <w:r>
+        <w:rPr>
+          <w:szCs w:val="24"/>
+        </w:rPr>
+        <w:t>A</w:t>
+      </w:r>
+      <w:r>
+        <w:rPr>
+          <w:szCs w:val="24"/>
+        </w:rPr>
+        <w:t xml:space="preserve"> jackpot which increases</w:t>
+      </w:r>
+      <w:r>
+        <w:rPr>
+          <w:szCs w:val="24"/>
+        </w:rPr>
+        <w:t xml:space="preserve"> each time the game is played and the jackpot is not won.</w:t>
+      </w:r>
+      <w:r>
+        <w:rPr>
+          <w:b/>
+          <w:sz w:val="28"/>
+          <w:szCs w:val="28"/>
+        </w:rPr>
+        <w:t xml:space="preserve"> </w:t>
+      </w:r>
+    </w:p>
+    <w:p>
+      <w:pPr>
+        <w:pStyle w:val="BodyText"/>
+        <w:rPr>
+          <w:szCs w:val="24"/>
+        </w:rPr>
+      </w:pPr>
+      <w:r>
+        <w:rPr>
+          <w:b/>
+          <w:sz w:val="28"/>
+          <w:szCs w:val="28"/>
+        </w:rPr>
+        <w:t xml:space="preserve">USBC   </w:t>
+      </w:r>
+      <w:r>
+        <w:rPr>
+          <w:szCs w:val="24"/>
+        </w:rPr>
+        <w:t xml:space="preserve"> United States Bowling Congress</w:t>
+      </w:r>
+    </w:p>
+    <w:p>
+      <w:pPr>
+        <w:pStyle w:val="BodyText"/>
+        <w:rPr>
+          <w:szCs w:val="24"/>
+        </w:rPr>
+      </w:pPr>
+      <w:r>
+        <w:rPr>
+          <w:b/>
+          <w:sz w:val="28"/>
+          <w:szCs w:val="28"/>
+        </w:rPr>
+        <w:t>HDCP</w:t>
+      </w:r>
+      <w:r>
+        <w:rPr>
+          <w:b/>
+          <w:sz w:val="28"/>
+          <w:szCs w:val="28"/>
+        </w:rPr>
+        <w:t xml:space="preserve"> </w:t>
+      </w:r>
+      <w:r>
+        <w:rPr>
+          <w:szCs w:val="24"/>
+        </w:rPr>
+        <w:t>Handicap</w:t>
+      </w:r>
+      <w:bookmarkStart w:id="57" w:name="_GoBack"/>
+      <w:bookmarkEnd w:id="57"/>
+    </w:p>
+    <w:p>
+      <w:pPr>
+        <w:pStyle w:val="BodyText"/>
+        <w:rPr>
+          <w:b/>
+          <w:sz w:val="28"/>
+          <w:szCs w:val="28"/>
+        </w:rPr>
+      </w:pPr>
+    </w:p>
+    <w:p>
+      <w:pPr>
+        <w:pStyle w:val="BodyText"/>
+        <w:rPr>
+          <w:szCs w:val="24"/>
+        </w:rPr>
       </w:pPr>
     </w:p>
     <w:sectPr>
@@ -15082,7 +15740,7 @@
 </file>
 
 <file path=word/endnotes.xml><?xml version="1.0" encoding="utf-8"?>
-<w:endnotes xmlns:wpc="http://schemas.microsoft.com/office/word/2010/wordprocessingCanvas" xmlns:cx="http://schemas.microsoft.com/office/drawing/2014/chartex" xmlns:cx1="http://schemas.microsoft.com/office/drawing/2015/9/8/chartex" xmlns:cx2="http://schemas.microsoft.com/office/drawing/2015/10/21/chartex" xmlns:cx3="http://schemas.microsoft.com/office/drawing/2016/5/9/chartex" xmlns:cx4="http://schemas.microsoft.com/office/drawing/2016/5/10/chartex" xmlns:cx5="http://schemas.microsoft.com/office/drawing/2016/5/11/chartex" xmlns:cx6="http://schemas.microsoft.com/office/drawing/2016/5/12/chartex" xmlns:cx7="http://schemas.microsoft.com/office/drawing/2016/5/13/chartex" xmlns:cx8="http://schemas.microsoft.com/office/drawing/2016/5/14/chartex" xmlns:mc="http://schemas.openxmlformats.org/markup-compatibility/2006" xmlns:aink="http://schemas.microsoft.com/office/drawing/2016/ink" xmlns:am3d="http://schemas.microsoft.com/office/drawing/2017/model3d" xmlns:o="urn:schemas-microsoft-com:office:office" xmlns:r="http://schemas.openxmlformats.org/officeDocument/2006/relationships" xmlns:m="http://schemas.openxmlformats.org/officeDocument/2006/math" xmlns:v="urn:schemas-microsoft-com:vml" xmlns:wp14="http://schemas.microsoft.com/office/word/2010/wordprocessingDrawing" xmlns:wp="http://schemas.openxmlformats.org/drawingml/2006/wordprocessingDrawing" xmlns:w10="urn:schemas-microsoft-com:office:word" xmlns:w="http://schemas.openxmlformats.org/wordprocessingml/2006/main" xmlns:w14="http://schemas.microsoft.com/office/word/2010/wordml" xmlns:w15="http://schemas.microsoft.com/office/word/2012/wordml" xmlns:w16cid="http://schemas.microsoft.com/office/word/2016/wordml/cid" xmlns:w16se="http://schemas.microsoft.com/office/word/2015/wordml/symex" xmlns:wpg="http://schemas.microsoft.com/office/word/2010/wordprocessingGroup" xmlns:wpi="http://schemas.microsoft.com/office/word/2010/wordprocessingInk" xmlns:wne="http://schemas.microsoft.com/office/word/2006/wordml" xmlns:wps="http://schemas.microsoft.com/office/word/2010/wordprocessingShape" mc:Ignorable="w14 w15 w16se w16cid wp14">
+<w:endnotes xmlns:wpc="http://schemas.microsoft.com/office/word/2010/wordprocessingCanvas" xmlns:mc="http://schemas.openxmlformats.org/markup-compatibility/2006" xmlns:o="urn:schemas-microsoft-com:office:office" xmlns:r="http://schemas.openxmlformats.org/officeDocument/2006/relationships" xmlns:m="http://schemas.openxmlformats.org/officeDocument/2006/math" xmlns:v="urn:schemas-microsoft-com:vml" xmlns:wp14="http://schemas.microsoft.com/office/word/2010/wordprocessingDrawing" xmlns:wp="http://schemas.openxmlformats.org/drawingml/2006/wordprocessingDrawing" xmlns:w10="urn:schemas-microsoft-com:office:word" xmlns:w="http://schemas.openxmlformats.org/wordprocessingml/2006/main" xmlns:w14="http://schemas.microsoft.com/office/word/2010/wordml" xmlns:w15="http://schemas.microsoft.com/office/word/2012/wordml" xmlns:wpg="http://schemas.microsoft.com/office/word/2010/wordprocessingGroup" xmlns:wpi="http://schemas.microsoft.com/office/word/2010/wordprocessingInk" xmlns:wne="http://schemas.microsoft.com/office/word/2006/wordml" xmlns:wps="http://schemas.microsoft.com/office/word/2010/wordprocessingShape" mc:Ignorable="w14 w15 wp14">
   <w:endnote w:type="separator" w:id="-1">
     <w:p>
       <w:r>
@@ -15101,7 +15759,7 @@
 </file>
 
 <file path=word/footer1.xml><?xml version="1.0" encoding="utf-8"?>
-<w:ftr xmlns:wpc="http://schemas.microsoft.com/office/word/2010/wordprocessingCanvas" xmlns:cx="http://schemas.microsoft.com/office/drawing/2014/chartex" xmlns:cx1="http://schemas.microsoft.com/office/drawing/2015/9/8/chartex" xmlns:cx2="http://schemas.microsoft.com/office/drawing/2015/10/21/chartex" xmlns:cx3="http://schemas.microsoft.com/office/drawing/2016/5/9/chartex" xmlns:cx4="http://schemas.microsoft.com/office/drawing/2016/5/10/chartex" xmlns:cx5="http://schemas.microsoft.com/office/drawing/2016/5/11/chartex" xmlns:cx6="http://schemas.microsoft.com/office/drawing/2016/5/12/chartex" xmlns:cx7="http://schemas.microsoft.com/office/drawing/2016/5/13/chartex" xmlns:cx8="http://schemas.microsoft.com/office/drawing/2016/5/14/chartex" xmlns:mc="http://schemas.openxmlformats.org/markup-compatibility/2006" xmlns:aink="http://schemas.microsoft.com/office/drawing/2016/ink" xmlns:am3d="http://schemas.microsoft.com/office/drawing/2017/model3d" xmlns:o="urn:schemas-microsoft-com:office:office" xmlns:r="http://schemas.openxmlformats.org/officeDocument/2006/relationships" xmlns:m="http://schemas.openxmlformats.org/officeDocument/2006/math" xmlns:v="urn:schemas-microsoft-com:vml" xmlns:wp14="http://schemas.microsoft.com/office/word/2010/wordprocessingDrawing" xmlns:wp="http://schemas.openxmlformats.org/drawingml/2006/wordprocessingDrawing" xmlns:w10="urn:schemas-microsoft-com:office:word" xmlns:w="http://schemas.openxmlformats.org/wordprocessingml/2006/main" xmlns:w14="http://schemas.microsoft.com/office/word/2010/wordml" xmlns:w15="http://schemas.microsoft.com/office/word/2012/wordml" xmlns:w16cid="http://schemas.microsoft.com/office/word/2016/wordml/cid" xmlns:w16se="http://schemas.microsoft.com/office/word/2015/wordml/symex" xmlns:wpg="http://schemas.microsoft.com/office/word/2010/wordprocessingGroup" xmlns:wpi="http://schemas.microsoft.com/office/word/2010/wordprocessingInk" xmlns:wne="http://schemas.microsoft.com/office/word/2006/wordml" xmlns:wps="http://schemas.microsoft.com/office/word/2010/wordprocessingShape" mc:Ignorable="w14 w15 w16se w16cid wp14">
+<w:ftr xmlns:wpc="http://schemas.microsoft.com/office/word/2010/wordprocessingCanvas" xmlns:mc="http://schemas.openxmlformats.org/markup-compatibility/2006" xmlns:o="urn:schemas-microsoft-com:office:office" xmlns:r="http://schemas.openxmlformats.org/officeDocument/2006/relationships" xmlns:m="http://schemas.openxmlformats.org/officeDocument/2006/math" xmlns:v="urn:schemas-microsoft-com:vml" xmlns:wp14="http://schemas.microsoft.com/office/word/2010/wordprocessingDrawing" xmlns:wp="http://schemas.openxmlformats.org/drawingml/2006/wordprocessingDrawing" xmlns:w10="urn:schemas-microsoft-com:office:word" xmlns:w="http://schemas.openxmlformats.org/wordprocessingml/2006/main" xmlns:w14="http://schemas.microsoft.com/office/word/2010/wordml" xmlns:w15="http://schemas.microsoft.com/office/word/2012/wordml" xmlns:wpg="http://schemas.microsoft.com/office/word/2010/wordprocessingGroup" xmlns:wpi="http://schemas.microsoft.com/office/word/2010/wordprocessingInk" xmlns:wne="http://schemas.microsoft.com/office/word/2006/wordml" xmlns:wps="http://schemas.microsoft.com/office/word/2010/wordprocessingShape" mc:Ignorable="w14 w15 wp14">
   <w:p>
     <w:pPr>
       <w:pStyle w:val="Footer"/>
@@ -15142,7 +15800,7 @@
 </file>
 
 <file path=word/footer2.xml><?xml version="1.0" encoding="utf-8"?>
-<w:ftr xmlns:wpc="http://schemas.microsoft.com/office/word/2010/wordprocessingCanvas" xmlns:cx="http://schemas.microsoft.com/office/drawing/2014/chartex" xmlns:cx1="http://schemas.microsoft.com/office/drawing/2015/9/8/chartex" xmlns:cx2="http://schemas.microsoft.com/office/drawing/2015/10/21/chartex" xmlns:cx3="http://schemas.microsoft.com/office/drawing/2016/5/9/chartex" xmlns:cx4="http://schemas.microsoft.com/office/drawing/2016/5/10/chartex" xmlns:cx5="http://schemas.microsoft.com/office/drawing/2016/5/11/chartex" xmlns:cx6="http://schemas.microsoft.com/office/drawing/2016/5/12/chartex" xmlns:cx7="http://schemas.microsoft.com/office/drawing/2016/5/13/chartex" xmlns:cx8="http://schemas.microsoft.com/office/drawing/2016/5/14/chartex" xmlns:mc="http://schemas.openxmlformats.org/markup-compatibility/2006" xmlns:aink="http://schemas.microsoft.com/office/drawing/2016/ink" xmlns:am3d="http://schemas.microsoft.com/office/drawing/2017/model3d" xmlns:o="urn:schemas-microsoft-com:office:office" xmlns:r="http://schemas.openxmlformats.org/officeDocument/2006/relationships" xmlns:m="http://schemas.openxmlformats.org/officeDocument/2006/math" xmlns:v="urn:schemas-microsoft-com:vml" xmlns:wp14="http://schemas.microsoft.com/office/word/2010/wordprocessingDrawing" xmlns:wp="http://schemas.openxmlformats.org/drawingml/2006/wordprocessingDrawing" xmlns:w10="urn:schemas-microsoft-com:office:word" xmlns:w="http://schemas.openxmlformats.org/wordprocessingml/2006/main" xmlns:w14="http://schemas.microsoft.com/office/word/2010/wordml" xmlns:w15="http://schemas.microsoft.com/office/word/2012/wordml" xmlns:w16cid="http://schemas.microsoft.com/office/word/2016/wordml/cid" xmlns:w16se="http://schemas.microsoft.com/office/word/2015/wordml/symex" xmlns:wpg="http://schemas.microsoft.com/office/word/2010/wordprocessingGroup" xmlns:wpi="http://schemas.microsoft.com/office/word/2010/wordprocessingInk" xmlns:wne="http://schemas.microsoft.com/office/word/2006/wordml" xmlns:wps="http://schemas.microsoft.com/office/word/2010/wordprocessingShape" mc:Ignorable="w14 w15 w16se w16cid wp14">
+<w:ftr xmlns:wpc="http://schemas.microsoft.com/office/word/2010/wordprocessingCanvas" xmlns:mc="http://schemas.openxmlformats.org/markup-compatibility/2006" xmlns:o="urn:schemas-microsoft-com:office:office" xmlns:r="http://schemas.openxmlformats.org/officeDocument/2006/relationships" xmlns:m="http://schemas.openxmlformats.org/officeDocument/2006/math" xmlns:v="urn:schemas-microsoft-com:vml" xmlns:wp14="http://schemas.microsoft.com/office/word/2010/wordprocessingDrawing" xmlns:wp="http://schemas.openxmlformats.org/drawingml/2006/wordprocessingDrawing" xmlns:w10="urn:schemas-microsoft-com:office:word" xmlns:w="http://schemas.openxmlformats.org/wordprocessingml/2006/main" xmlns:w14="http://schemas.microsoft.com/office/word/2010/wordml" xmlns:w15="http://schemas.microsoft.com/office/word/2012/wordml" xmlns:wpg="http://schemas.microsoft.com/office/word/2010/wordprocessingGroup" xmlns:wpi="http://schemas.microsoft.com/office/word/2010/wordprocessingInk" xmlns:wne="http://schemas.microsoft.com/office/word/2006/wordml" xmlns:wps="http://schemas.microsoft.com/office/word/2010/wordprocessingShape" mc:Ignorable="w14 w15 wp14">
   <w:p>
     <w:pPr>
       <w:pStyle w:val="Footer"/>
@@ -15152,7 +15810,7 @@
 </file>
 
 <file path=word/footer3.xml><?xml version="1.0" encoding="utf-8"?>
-<w:ftr xmlns:wpc="http://schemas.microsoft.com/office/word/2010/wordprocessingCanvas" xmlns:cx="http://schemas.microsoft.com/office/drawing/2014/chartex" xmlns:cx1="http://schemas.microsoft.com/office/drawing/2015/9/8/chartex" xmlns:cx2="http://schemas.microsoft.com/office/drawing/2015/10/21/chartex" xmlns:cx3="http://schemas.microsoft.com/office/drawing/2016/5/9/chartex" xmlns:cx4="http://schemas.microsoft.com/office/drawing/2016/5/10/chartex" xmlns:cx5="http://schemas.microsoft.com/office/drawing/2016/5/11/chartex" xmlns:cx6="http://schemas.microsoft.com/office/drawing/2016/5/12/chartex" xmlns:cx7="http://schemas.microsoft.com/office/drawing/2016/5/13/chartex" xmlns:cx8="http://schemas.microsoft.com/office/drawing/2016/5/14/chartex" xmlns:mc="http://schemas.openxmlformats.org/markup-compatibility/2006" xmlns:aink="http://schemas.microsoft.com/office/drawing/2016/ink" xmlns:am3d="http://schemas.microsoft.com/office/drawing/2017/model3d" xmlns:o="urn:schemas-microsoft-com:office:office" xmlns:r="http://schemas.openxmlformats.org/officeDocument/2006/relationships" xmlns:m="http://schemas.openxmlformats.org/officeDocument/2006/math" xmlns:v="urn:schemas-microsoft-com:vml" xmlns:wp14="http://schemas.microsoft.com/office/word/2010/wordprocessingDrawing" xmlns:wp="http://schemas.openxmlformats.org/drawingml/2006/wordprocessingDrawing" xmlns:w10="urn:schemas-microsoft-com:office:word" xmlns:w="http://schemas.openxmlformats.org/wordprocessingml/2006/main" xmlns:w14="http://schemas.microsoft.com/office/word/2010/wordml" xmlns:w15="http://schemas.microsoft.com/office/word/2012/wordml" xmlns:w16cid="http://schemas.microsoft.com/office/word/2016/wordml/cid" xmlns:w16se="http://schemas.microsoft.com/office/word/2015/wordml/symex" xmlns:wpg="http://schemas.microsoft.com/office/word/2010/wordprocessingGroup" xmlns:wpi="http://schemas.microsoft.com/office/word/2010/wordprocessingInk" xmlns:wne="http://schemas.microsoft.com/office/word/2006/wordml" xmlns:wps="http://schemas.microsoft.com/office/word/2010/wordprocessingShape" mc:Ignorable="w14 w15 w16se w16cid wp14">
+<w:ftr xmlns:wpc="http://schemas.microsoft.com/office/word/2010/wordprocessingCanvas" xmlns:mc="http://schemas.openxmlformats.org/markup-compatibility/2006" xmlns:o="urn:schemas-microsoft-com:office:office" xmlns:r="http://schemas.openxmlformats.org/officeDocument/2006/relationships" xmlns:m="http://schemas.openxmlformats.org/officeDocument/2006/math" xmlns:v="urn:schemas-microsoft-com:vml" xmlns:wp14="http://schemas.microsoft.com/office/word/2010/wordprocessingDrawing" xmlns:wp="http://schemas.openxmlformats.org/drawingml/2006/wordprocessingDrawing" xmlns:w10="urn:schemas-microsoft-com:office:word" xmlns:w="http://schemas.openxmlformats.org/wordprocessingml/2006/main" xmlns:w14="http://schemas.microsoft.com/office/word/2010/wordml" xmlns:w15="http://schemas.microsoft.com/office/word/2012/wordml" xmlns:wpg="http://schemas.microsoft.com/office/word/2010/wordprocessingGroup" xmlns:wpi="http://schemas.microsoft.com/office/word/2010/wordprocessingInk" xmlns:wne="http://schemas.microsoft.com/office/word/2006/wordml" xmlns:wps="http://schemas.microsoft.com/office/word/2010/wordprocessingShape" mc:Ignorable="w14 w15 wp14">
   <w:p>
     <w:pPr>
       <w:pStyle w:val="Footer"/>
@@ -15162,7 +15820,7 @@
 </file>
 
 <file path=word/footer4.xml><?xml version="1.0" encoding="utf-8"?>
-<w:ftr xmlns:wpc="http://schemas.microsoft.com/office/word/2010/wordprocessingCanvas" xmlns:cx="http://schemas.microsoft.com/office/drawing/2014/chartex" xmlns:cx1="http://schemas.microsoft.com/office/drawing/2015/9/8/chartex" xmlns:cx2="http://schemas.microsoft.com/office/drawing/2015/10/21/chartex" xmlns:cx3="http://schemas.microsoft.com/office/drawing/2016/5/9/chartex" xmlns:cx4="http://schemas.microsoft.com/office/drawing/2016/5/10/chartex" xmlns:cx5="http://schemas.microsoft.com/office/drawing/2016/5/11/chartex" xmlns:cx6="http://schemas.microsoft.com/office/drawing/2016/5/12/chartex" xmlns:cx7="http://schemas.microsoft.com/office/drawing/2016/5/13/chartex" xmlns:cx8="http://schemas.microsoft.com/office/drawing/2016/5/14/chartex" xmlns:mc="http://schemas.openxmlformats.org/markup-compatibility/2006" xmlns:aink="http://schemas.microsoft.com/office/drawing/2016/ink" xmlns:am3d="http://schemas.microsoft.com/office/drawing/2017/model3d" xmlns:o="urn:schemas-microsoft-com:office:office" xmlns:r="http://schemas.openxmlformats.org/officeDocument/2006/relationships" xmlns:m="http://schemas.openxmlformats.org/officeDocument/2006/math" xmlns:v="urn:schemas-microsoft-com:vml" xmlns:wp14="http://schemas.microsoft.com/office/word/2010/wordprocessingDrawing" xmlns:wp="http://schemas.openxmlformats.org/drawingml/2006/wordprocessingDrawing" xmlns:w10="urn:schemas-microsoft-com:office:word" xmlns:w="http://schemas.openxmlformats.org/wordprocessingml/2006/main" xmlns:w14="http://schemas.microsoft.com/office/word/2010/wordml" xmlns:w15="http://schemas.microsoft.com/office/word/2012/wordml" xmlns:w16cid="http://schemas.microsoft.com/office/word/2016/wordml/cid" xmlns:w16se="http://schemas.microsoft.com/office/word/2015/wordml/symex" xmlns:wpg="http://schemas.microsoft.com/office/word/2010/wordprocessingGroup" xmlns:wpi="http://schemas.microsoft.com/office/word/2010/wordprocessingInk" xmlns:wne="http://schemas.microsoft.com/office/word/2006/wordml" xmlns:wps="http://schemas.microsoft.com/office/word/2010/wordprocessingShape" mc:Ignorable="w14 w15 w16se w16cid wp14">
+<w:ftr xmlns:wpc="http://schemas.microsoft.com/office/word/2010/wordprocessingCanvas" xmlns:mc="http://schemas.openxmlformats.org/markup-compatibility/2006" xmlns:o="urn:schemas-microsoft-com:office:office" xmlns:r="http://schemas.openxmlformats.org/officeDocument/2006/relationships" xmlns:m="http://schemas.openxmlformats.org/officeDocument/2006/math" xmlns:v="urn:schemas-microsoft-com:vml" xmlns:wp14="http://schemas.microsoft.com/office/word/2010/wordprocessingDrawing" xmlns:wp="http://schemas.openxmlformats.org/drawingml/2006/wordprocessingDrawing" xmlns:w10="urn:schemas-microsoft-com:office:word" xmlns:w="http://schemas.openxmlformats.org/wordprocessingml/2006/main" xmlns:w14="http://schemas.microsoft.com/office/word/2010/wordml" xmlns:w15="http://schemas.microsoft.com/office/word/2012/wordml" xmlns:wpg="http://schemas.microsoft.com/office/word/2010/wordprocessingGroup" xmlns:wpi="http://schemas.microsoft.com/office/word/2010/wordprocessingInk" xmlns:wne="http://schemas.microsoft.com/office/word/2006/wordml" xmlns:wps="http://schemas.microsoft.com/office/word/2010/wordprocessingShape" mc:Ignorable="w14 w15 wp14">
   <w:p>
     <w:pPr>
       <w:pStyle w:val="Footer"/>
@@ -15194,7 +15852,7 @@
         <w:rStyle w:val="PageNumber"/>
         <w:noProof/>
       </w:rPr>
-      <w:t>5</w:t>
+      <w:t>35</w:t>
     </w:r>
     <w:r>
       <w:rPr>
@@ -15212,7 +15870,7 @@
 </file>
 
 <file path=word/footer5.xml><?xml version="1.0" encoding="utf-8"?>
-<w:ftr xmlns:wpc="http://schemas.microsoft.com/office/word/2010/wordprocessingCanvas" xmlns:cx="http://schemas.microsoft.com/office/drawing/2014/chartex" xmlns:cx1="http://schemas.microsoft.com/office/drawing/2015/9/8/chartex" xmlns:cx2="http://schemas.microsoft.com/office/drawing/2015/10/21/chartex" xmlns:cx3="http://schemas.microsoft.com/office/drawing/2016/5/9/chartex" xmlns:cx4="http://schemas.microsoft.com/office/drawing/2016/5/10/chartex" xmlns:cx5="http://schemas.microsoft.com/office/drawing/2016/5/11/chartex" xmlns:cx6="http://schemas.microsoft.com/office/drawing/2016/5/12/chartex" xmlns:cx7="http://schemas.microsoft.com/office/drawing/2016/5/13/chartex" xmlns:cx8="http://schemas.microsoft.com/office/drawing/2016/5/14/chartex" xmlns:mc="http://schemas.openxmlformats.org/markup-compatibility/2006" xmlns:aink="http://schemas.microsoft.com/office/drawing/2016/ink" xmlns:am3d="http://schemas.microsoft.com/office/drawing/2017/model3d" xmlns:o="urn:schemas-microsoft-com:office:office" xmlns:r="http://schemas.openxmlformats.org/officeDocument/2006/relationships" xmlns:m="http://schemas.openxmlformats.org/officeDocument/2006/math" xmlns:v="urn:schemas-microsoft-com:vml" xmlns:wp14="http://schemas.microsoft.com/office/word/2010/wordprocessingDrawing" xmlns:wp="http://schemas.openxmlformats.org/drawingml/2006/wordprocessingDrawing" xmlns:w10="urn:schemas-microsoft-com:office:word" xmlns:w="http://schemas.openxmlformats.org/wordprocessingml/2006/main" xmlns:w14="http://schemas.microsoft.com/office/word/2010/wordml" xmlns:w15="http://schemas.microsoft.com/office/word/2012/wordml" xmlns:w16cid="http://schemas.microsoft.com/office/word/2016/wordml/cid" xmlns:w16se="http://schemas.microsoft.com/office/word/2015/wordml/symex" xmlns:wpg="http://schemas.microsoft.com/office/word/2010/wordprocessingGroup" xmlns:wpi="http://schemas.microsoft.com/office/word/2010/wordprocessingInk" xmlns:wne="http://schemas.microsoft.com/office/word/2006/wordml" xmlns:wps="http://schemas.microsoft.com/office/word/2010/wordprocessingShape" mc:Ignorable="w14 w15 w16se w16cid wp14">
+<w:ftr xmlns:wpc="http://schemas.microsoft.com/office/word/2010/wordprocessingCanvas" xmlns:mc="http://schemas.openxmlformats.org/markup-compatibility/2006" xmlns:o="urn:schemas-microsoft-com:office:office" xmlns:r="http://schemas.openxmlformats.org/officeDocument/2006/relationships" xmlns:m="http://schemas.openxmlformats.org/officeDocument/2006/math" xmlns:v="urn:schemas-microsoft-com:vml" xmlns:wp14="http://schemas.microsoft.com/office/word/2010/wordprocessingDrawing" xmlns:wp="http://schemas.openxmlformats.org/drawingml/2006/wordprocessingDrawing" xmlns:w10="urn:schemas-microsoft-com:office:word" xmlns:w="http://schemas.openxmlformats.org/wordprocessingml/2006/main" xmlns:w14="http://schemas.microsoft.com/office/word/2010/wordml" xmlns:w15="http://schemas.microsoft.com/office/word/2012/wordml" xmlns:wpg="http://schemas.microsoft.com/office/word/2010/wordprocessingGroup" xmlns:wpi="http://schemas.microsoft.com/office/word/2010/wordprocessingInk" xmlns:wne="http://schemas.microsoft.com/office/word/2006/wordml" xmlns:wps="http://schemas.microsoft.com/office/word/2010/wordprocessingShape" mc:Ignorable="w14 w15 wp14">
   <w:p>
     <w:pPr>
       <w:pStyle w:val="Footer"/>
@@ -15244,7 +15902,7 @@
         <w:rStyle w:val="PageNumber"/>
         <w:noProof/>
       </w:rPr>
-      <w:t>39</w:t>
+      <w:t>40</w:t>
     </w:r>
     <w:r>
       <w:rPr>
@@ -15262,7 +15920,7 @@
 </file>
 
 <file path=word/footnotes.xml><?xml version="1.0" encoding="utf-8"?>
-<w:footnotes xmlns:wpc="http://schemas.microsoft.com/office/word/2010/wordprocessingCanvas" xmlns:cx="http://schemas.microsoft.com/office/drawing/2014/chartex" xmlns:cx1="http://schemas.microsoft.com/office/drawing/2015/9/8/chartex" xmlns:cx2="http://schemas.microsoft.com/office/drawing/2015/10/21/chartex" xmlns:cx3="http://schemas.microsoft.com/office/drawing/2016/5/9/chartex" xmlns:cx4="http://schemas.microsoft.com/office/drawing/2016/5/10/chartex" xmlns:cx5="http://schemas.microsoft.com/office/drawing/2016/5/11/chartex" xmlns:cx6="http://schemas.microsoft.com/office/drawing/2016/5/12/chartex" xmlns:cx7="http://schemas.microsoft.com/office/drawing/2016/5/13/chartex" xmlns:cx8="http://schemas.microsoft.com/office/drawing/2016/5/14/chartex" xmlns:mc="http://schemas.openxmlformats.org/markup-compatibility/2006" xmlns:aink="http://schemas.microsoft.com/office/drawing/2016/ink" xmlns:am3d="http://schemas.microsoft.com/office/drawing/2017/model3d" xmlns:o="urn:schemas-microsoft-com:office:office" xmlns:r="http://schemas.openxmlformats.org/officeDocument/2006/relationships" xmlns:m="http://schemas.openxmlformats.org/officeDocument/2006/math" xmlns:v="urn:schemas-microsoft-com:vml" xmlns:wp14="http://schemas.microsoft.com/office/word/2010/wordprocessingDrawing" xmlns:wp="http://schemas.openxmlformats.org/drawingml/2006/wordprocessingDrawing" xmlns:w10="urn:schemas-microsoft-com:office:word" xmlns:w="http://schemas.openxmlformats.org/wordprocessingml/2006/main" xmlns:w14="http://schemas.microsoft.com/office/word/2010/wordml" xmlns:w15="http://schemas.microsoft.com/office/word/2012/wordml" xmlns:w16cid="http://schemas.microsoft.com/office/word/2016/wordml/cid" xmlns:w16se="http://schemas.microsoft.com/office/word/2015/wordml/symex" xmlns:wpg="http://schemas.microsoft.com/office/word/2010/wordprocessingGroup" xmlns:wpi="http://schemas.microsoft.com/office/word/2010/wordprocessingInk" xmlns:wne="http://schemas.microsoft.com/office/word/2006/wordml" xmlns:wps="http://schemas.microsoft.com/office/word/2010/wordprocessingShape" mc:Ignorable="w14 w15 w16se w16cid wp14">
+<w:footnotes xmlns:wpc="http://schemas.microsoft.com/office/word/2010/wordprocessingCanvas" xmlns:mc="http://schemas.openxmlformats.org/markup-compatibility/2006" xmlns:o="urn:schemas-microsoft-com:office:office" xmlns:r="http://schemas.openxmlformats.org/officeDocument/2006/relationships" xmlns:m="http://schemas.openxmlformats.org/officeDocument/2006/math" xmlns:v="urn:schemas-microsoft-com:vml" xmlns:wp14="http://schemas.microsoft.com/office/word/2010/wordprocessingDrawing" xmlns:wp="http://schemas.openxmlformats.org/drawingml/2006/wordprocessingDrawing" xmlns:w10="urn:schemas-microsoft-com:office:word" xmlns:w="http://schemas.openxmlformats.org/wordprocessingml/2006/main" xmlns:w14="http://schemas.microsoft.com/office/word/2010/wordml" xmlns:w15="http://schemas.microsoft.com/office/word/2012/wordml" xmlns:wpg="http://schemas.microsoft.com/office/word/2010/wordprocessingGroup" xmlns:wpi="http://schemas.microsoft.com/office/word/2010/wordprocessingInk" xmlns:wne="http://schemas.microsoft.com/office/word/2006/wordml" xmlns:wps="http://schemas.microsoft.com/office/word/2010/wordprocessingShape" mc:Ignorable="w14 w15 wp14">
   <w:footnote w:type="separator" w:id="-1">
     <w:p>
       <w:r>
@@ -15281,7 +15939,7 @@
 </file>
 
 <file path=word/header1.xml><?xml version="1.0" encoding="utf-8"?>
-<w:hdr xmlns:wpc="http://schemas.microsoft.com/office/word/2010/wordprocessingCanvas" xmlns:cx="http://schemas.microsoft.com/office/drawing/2014/chartex" xmlns:cx1="http://schemas.microsoft.com/office/drawing/2015/9/8/chartex" xmlns:cx2="http://schemas.microsoft.com/office/drawing/2015/10/21/chartex" xmlns:cx3="http://schemas.microsoft.com/office/drawing/2016/5/9/chartex" xmlns:cx4="http://schemas.microsoft.com/office/drawing/2016/5/10/chartex" xmlns:cx5="http://schemas.microsoft.com/office/drawing/2016/5/11/chartex" xmlns:cx6="http://schemas.microsoft.com/office/drawing/2016/5/12/chartex" xmlns:cx7="http://schemas.microsoft.com/office/drawing/2016/5/13/chartex" xmlns:cx8="http://schemas.microsoft.com/office/drawing/2016/5/14/chartex" xmlns:mc="http://schemas.openxmlformats.org/markup-compatibility/2006" xmlns:aink="http://schemas.microsoft.com/office/drawing/2016/ink" xmlns:am3d="http://schemas.microsoft.com/office/drawing/2017/model3d" xmlns:o="urn:schemas-microsoft-com:office:office" xmlns:r="http://schemas.openxmlformats.org/officeDocument/2006/relationships" xmlns:m="http://schemas.openxmlformats.org/officeDocument/2006/math" xmlns:v="urn:schemas-microsoft-com:vml" xmlns:wp14="http://schemas.microsoft.com/office/word/2010/wordprocessingDrawing" xmlns:wp="http://schemas.openxmlformats.org/drawingml/2006/wordprocessingDrawing" xmlns:w10="urn:schemas-microsoft-com:office:word" xmlns:w="http://schemas.openxmlformats.org/wordprocessingml/2006/main" xmlns:w14="http://schemas.microsoft.com/office/word/2010/wordml" xmlns:w15="http://schemas.microsoft.com/office/word/2012/wordml" xmlns:w16cid="http://schemas.microsoft.com/office/word/2016/wordml/cid" xmlns:w16se="http://schemas.microsoft.com/office/word/2015/wordml/symex" xmlns:wpg="http://schemas.microsoft.com/office/word/2010/wordprocessingGroup" xmlns:wpi="http://schemas.microsoft.com/office/word/2010/wordprocessingInk" xmlns:wne="http://schemas.microsoft.com/office/word/2006/wordml" xmlns:wps="http://schemas.microsoft.com/office/word/2010/wordprocessingShape" mc:Ignorable="w14 w15 w16se w16cid wp14">
+<w:hdr xmlns:wpc="http://schemas.microsoft.com/office/word/2010/wordprocessingCanvas" xmlns:mc="http://schemas.openxmlformats.org/markup-compatibility/2006" xmlns:o="urn:schemas-microsoft-com:office:office" xmlns:r="http://schemas.openxmlformats.org/officeDocument/2006/relationships" xmlns:m="http://schemas.openxmlformats.org/officeDocument/2006/math" xmlns:v="urn:schemas-microsoft-com:vml" xmlns:wp14="http://schemas.microsoft.com/office/word/2010/wordprocessingDrawing" xmlns:wp="http://schemas.openxmlformats.org/drawingml/2006/wordprocessingDrawing" xmlns:w10="urn:schemas-microsoft-com:office:word" xmlns:w="http://schemas.openxmlformats.org/wordprocessingml/2006/main" xmlns:w14="http://schemas.microsoft.com/office/word/2010/wordml" xmlns:w15="http://schemas.microsoft.com/office/word/2012/wordml" xmlns:wpg="http://schemas.microsoft.com/office/word/2010/wordprocessingGroup" xmlns:wpi="http://schemas.microsoft.com/office/word/2010/wordprocessingInk" xmlns:wne="http://schemas.microsoft.com/office/word/2006/wordml" xmlns:wps="http://schemas.microsoft.com/office/word/2010/wordprocessingShape" mc:Ignorable="w14 w15 wp14">
   <w:p>
     <w:pPr>
       <w:pStyle w:val="Header"/>
@@ -15294,7 +15952,7 @@
 </file>
 
 <file path=word/header2.xml><?xml version="1.0" encoding="utf-8"?>
-<w:hdr xmlns:wpc="http://schemas.microsoft.com/office/word/2010/wordprocessingCanvas" xmlns:cx="http://schemas.microsoft.com/office/drawing/2014/chartex" xmlns:cx1="http://schemas.microsoft.com/office/drawing/2015/9/8/chartex" xmlns:cx2="http://schemas.microsoft.com/office/drawing/2015/10/21/chartex" xmlns:cx3="http://schemas.microsoft.com/office/drawing/2016/5/9/chartex" xmlns:cx4="http://schemas.microsoft.com/office/drawing/2016/5/10/chartex" xmlns:cx5="http://schemas.microsoft.com/office/drawing/2016/5/11/chartex" xmlns:cx6="http://schemas.microsoft.com/office/drawing/2016/5/12/chartex" xmlns:cx7="http://schemas.microsoft.com/office/drawing/2016/5/13/chartex" xmlns:cx8="http://schemas.microsoft.com/office/drawing/2016/5/14/chartex" xmlns:mc="http://schemas.openxmlformats.org/markup-compatibility/2006" xmlns:aink="http://schemas.microsoft.com/office/drawing/2016/ink" xmlns:am3d="http://schemas.microsoft.com/office/drawing/2017/model3d" xmlns:o="urn:schemas-microsoft-com:office:office" xmlns:r="http://schemas.openxmlformats.org/officeDocument/2006/relationships" xmlns:m="http://schemas.openxmlformats.org/officeDocument/2006/math" xmlns:v="urn:schemas-microsoft-com:vml" xmlns:wp14="http://schemas.microsoft.com/office/word/2010/wordprocessingDrawing" xmlns:wp="http://schemas.openxmlformats.org/drawingml/2006/wordprocessingDrawing" xmlns:w10="urn:schemas-microsoft-com:office:word" xmlns:w="http://schemas.openxmlformats.org/wordprocessingml/2006/main" xmlns:w14="http://schemas.microsoft.com/office/word/2010/wordml" xmlns:w15="http://schemas.microsoft.com/office/word/2012/wordml" xmlns:w16cid="http://schemas.microsoft.com/office/word/2016/wordml/cid" xmlns:w16se="http://schemas.microsoft.com/office/word/2015/wordml/symex" xmlns:wpg="http://schemas.microsoft.com/office/word/2010/wordprocessingGroup" xmlns:wpi="http://schemas.microsoft.com/office/word/2010/wordprocessingInk" xmlns:wne="http://schemas.microsoft.com/office/word/2006/wordml" xmlns:wps="http://schemas.microsoft.com/office/word/2010/wordprocessingShape" mc:Ignorable="w14 w15 w16se w16cid wp14">
+<w:hdr xmlns:wpc="http://schemas.microsoft.com/office/word/2010/wordprocessingCanvas" xmlns:mc="http://schemas.openxmlformats.org/markup-compatibility/2006" xmlns:o="urn:schemas-microsoft-com:office:office" xmlns:r="http://schemas.openxmlformats.org/officeDocument/2006/relationships" xmlns:m="http://schemas.openxmlformats.org/officeDocument/2006/math" xmlns:v="urn:schemas-microsoft-com:vml" xmlns:wp14="http://schemas.microsoft.com/office/word/2010/wordprocessingDrawing" xmlns:wp="http://schemas.openxmlformats.org/drawingml/2006/wordprocessingDrawing" xmlns:w10="urn:schemas-microsoft-com:office:word" xmlns:w="http://schemas.openxmlformats.org/wordprocessingml/2006/main" xmlns:w14="http://schemas.microsoft.com/office/word/2010/wordml" xmlns:w15="http://schemas.microsoft.com/office/word/2012/wordml" xmlns:wpg="http://schemas.microsoft.com/office/word/2010/wordprocessingGroup" xmlns:wpi="http://schemas.microsoft.com/office/word/2010/wordprocessingInk" xmlns:wne="http://schemas.microsoft.com/office/word/2006/wordml" xmlns:wps="http://schemas.microsoft.com/office/word/2010/wordprocessingShape" mc:Ignorable="w14 w15 wp14">
   <w:p>
     <w:pPr>
       <w:pStyle w:val="Header"/>
@@ -15307,26 +15965,20 @@
 </file>
 
 <file path=word/header3.xml><?xml version="1.0" encoding="utf-8"?>
-<w:hdr xmlns:wpc="http://schemas.microsoft.com/office/word/2010/wordprocessingCanvas" xmlns:cx="http://schemas.microsoft.com/office/drawing/2014/chartex" xmlns:cx1="http://schemas.microsoft.com/office/drawing/2015/9/8/chartex" xmlns:cx2="http://schemas.microsoft.com/office/drawing/2015/10/21/chartex" xmlns:cx3="http://schemas.microsoft.com/office/drawing/2016/5/9/chartex" xmlns:cx4="http://schemas.microsoft.com/office/drawing/2016/5/10/chartex" xmlns:cx5="http://schemas.microsoft.com/office/drawing/2016/5/11/chartex" xmlns:cx6="http://schemas.microsoft.com/office/drawing/2016/5/12/chartex" xmlns:cx7="http://schemas.microsoft.com/office/drawing/2016/5/13/chartex" xmlns:cx8="http://schemas.microsoft.com/office/drawing/2016/5/14/chartex" xmlns:mc="http://schemas.openxmlformats.org/markup-compatibility/2006" xmlns:aink="http://schemas.microsoft.com/office/drawing/2016/ink" xmlns:am3d="http://schemas.microsoft.com/office/drawing/2017/model3d" xmlns:o="urn:schemas-microsoft-com:office:office" xmlns:r="http://schemas.openxmlformats.org/officeDocument/2006/relationships" xmlns:m="http://schemas.openxmlformats.org/officeDocument/2006/math" xmlns:v="urn:schemas-microsoft-com:vml" xmlns:wp14="http://schemas.microsoft.com/office/word/2010/wordprocessingDrawing" xmlns:wp="http://schemas.openxmlformats.org/drawingml/2006/wordprocessingDrawing" xmlns:w10="urn:schemas-microsoft-com:office:word" xmlns:w="http://schemas.openxmlformats.org/wordprocessingml/2006/main" xmlns:w14="http://schemas.microsoft.com/office/word/2010/wordml" xmlns:w15="http://schemas.microsoft.com/office/word/2012/wordml" xmlns:w16cid="http://schemas.microsoft.com/office/word/2016/wordml/cid" xmlns:w16se="http://schemas.microsoft.com/office/word/2015/wordml/symex" xmlns:wpg="http://schemas.microsoft.com/office/word/2010/wordprocessingGroup" xmlns:wpi="http://schemas.microsoft.com/office/word/2010/wordprocessingInk" xmlns:wne="http://schemas.microsoft.com/office/word/2006/wordml" xmlns:wps="http://schemas.microsoft.com/office/word/2010/wordprocessingShape" mc:Ignorable="w14 w15 w16se w16cid wp14">
+<w:hdr xmlns:wpc="http://schemas.microsoft.com/office/word/2010/wordprocessingCanvas" xmlns:mc="http://schemas.openxmlformats.org/markup-compatibility/2006" xmlns:o="urn:schemas-microsoft-com:office:office" xmlns:r="http://schemas.openxmlformats.org/officeDocument/2006/relationships" xmlns:m="http://schemas.openxmlformats.org/officeDocument/2006/math" xmlns:v="urn:schemas-microsoft-com:vml" xmlns:wp14="http://schemas.microsoft.com/office/word/2010/wordprocessingDrawing" xmlns:wp="http://schemas.openxmlformats.org/drawingml/2006/wordprocessingDrawing" xmlns:w10="urn:schemas-microsoft-com:office:word" xmlns:w="http://schemas.openxmlformats.org/wordprocessingml/2006/main" xmlns:w14="http://schemas.microsoft.com/office/word/2010/wordml" xmlns:w15="http://schemas.microsoft.com/office/word/2012/wordml" xmlns:wpg="http://schemas.microsoft.com/office/word/2010/wordprocessingGroup" xmlns:wpi="http://schemas.microsoft.com/office/word/2010/wordprocessingInk" xmlns:wne="http://schemas.microsoft.com/office/word/2006/wordml" xmlns:wps="http://schemas.microsoft.com/office/word/2010/wordprocessingShape" mc:Ignorable="w14 w15 wp14">
   <w:p>
     <w:pPr>
       <w:pStyle w:val="Header"/>
     </w:pPr>
     <w:r>
-      <w:t>9</w:t>
-    </w:r>
-    <w:r>
-      <w:t>-</w:t>
-    </w:r>
-    <w:r>
-      <w:t>Tap Tour</w:t>
+      <w:t>9-Tap Tour</w:t>
     </w:r>
   </w:p>
 </w:hdr>
 </file>
 
 <file path=word/header4.xml><?xml version="1.0" encoding="utf-8"?>
-<w:hdr xmlns:wpc="http://schemas.microsoft.com/office/word/2010/wordprocessingCanvas" xmlns:cx="http://schemas.microsoft.com/office/drawing/2014/chartex" xmlns:cx1="http://schemas.microsoft.com/office/drawing/2015/9/8/chartex" xmlns:cx2="http://schemas.microsoft.com/office/drawing/2015/10/21/chartex" xmlns:cx3="http://schemas.microsoft.com/office/drawing/2016/5/9/chartex" xmlns:cx4="http://schemas.microsoft.com/office/drawing/2016/5/10/chartex" xmlns:cx5="http://schemas.microsoft.com/office/drawing/2016/5/11/chartex" xmlns:cx6="http://schemas.microsoft.com/office/drawing/2016/5/12/chartex" xmlns:cx7="http://schemas.microsoft.com/office/drawing/2016/5/13/chartex" xmlns:cx8="http://schemas.microsoft.com/office/drawing/2016/5/14/chartex" xmlns:mc="http://schemas.openxmlformats.org/markup-compatibility/2006" xmlns:aink="http://schemas.microsoft.com/office/drawing/2016/ink" xmlns:am3d="http://schemas.microsoft.com/office/drawing/2017/model3d" xmlns:o="urn:schemas-microsoft-com:office:office" xmlns:r="http://schemas.openxmlformats.org/officeDocument/2006/relationships" xmlns:m="http://schemas.openxmlformats.org/officeDocument/2006/math" xmlns:v="urn:schemas-microsoft-com:vml" xmlns:wp14="http://schemas.microsoft.com/office/word/2010/wordprocessingDrawing" xmlns:wp="http://schemas.openxmlformats.org/drawingml/2006/wordprocessingDrawing" xmlns:w10="urn:schemas-microsoft-com:office:word" xmlns:w="http://schemas.openxmlformats.org/wordprocessingml/2006/main" xmlns:w14="http://schemas.microsoft.com/office/word/2010/wordml" xmlns:w15="http://schemas.microsoft.com/office/word/2012/wordml" xmlns:w16cid="http://schemas.microsoft.com/office/word/2016/wordml/cid" xmlns:w16se="http://schemas.microsoft.com/office/word/2015/wordml/symex" xmlns:wpg="http://schemas.microsoft.com/office/word/2010/wordprocessingGroup" xmlns:wpi="http://schemas.microsoft.com/office/word/2010/wordprocessingInk" xmlns:wne="http://schemas.microsoft.com/office/word/2006/wordml" xmlns:wps="http://schemas.microsoft.com/office/word/2010/wordprocessingShape" mc:Ignorable="w14 w15 w16se w16cid wp14">
+<w:hdr xmlns:wpc="http://schemas.microsoft.com/office/word/2010/wordprocessingCanvas" xmlns:mc="http://schemas.openxmlformats.org/markup-compatibility/2006" xmlns:o="urn:schemas-microsoft-com:office:office" xmlns:r="http://schemas.openxmlformats.org/officeDocument/2006/relationships" xmlns:m="http://schemas.openxmlformats.org/officeDocument/2006/math" xmlns:v="urn:schemas-microsoft-com:vml" xmlns:wp14="http://schemas.microsoft.com/office/word/2010/wordprocessingDrawing" xmlns:wp="http://schemas.openxmlformats.org/drawingml/2006/wordprocessingDrawing" xmlns:w10="urn:schemas-microsoft-com:office:word" xmlns:w="http://schemas.openxmlformats.org/wordprocessingml/2006/main" xmlns:w14="http://schemas.microsoft.com/office/word/2010/wordml" xmlns:w15="http://schemas.microsoft.com/office/word/2012/wordml" xmlns:wpg="http://schemas.microsoft.com/office/word/2010/wordprocessingGroup" xmlns:wpi="http://schemas.microsoft.com/office/word/2010/wordprocessingInk" xmlns:wne="http://schemas.microsoft.com/office/word/2006/wordml" xmlns:wps="http://schemas.microsoft.com/office/word/2010/wordprocessingShape" mc:Ignorable="w14 w15 wp14">
   <w:p>
     <w:pPr>
       <w:pStyle w:val="Header"/>
@@ -15336,8 +15988,8 @@
 </file>
 
 <file path=word/numbering.xml><?xml version="1.0" encoding="utf-8"?>
-<w:numbering xmlns:wpc="http://schemas.microsoft.com/office/word/2010/wordprocessingCanvas" xmlns:cx="http://schemas.microsoft.com/office/drawing/2014/chartex" xmlns:cx1="http://schemas.microsoft.com/office/drawing/2015/9/8/chartex" xmlns:cx2="http://schemas.microsoft.com/office/drawing/2015/10/21/chartex" xmlns:cx3="http://schemas.microsoft.com/office/drawing/2016/5/9/chartex" xmlns:cx4="http://schemas.microsoft.com/office/drawing/2016/5/10/chartex" xmlns:cx5="http://schemas.microsoft.com/office/drawing/2016/5/11/chartex" xmlns:cx6="http://schemas.microsoft.com/office/drawing/2016/5/12/chartex" xmlns:cx7="http://schemas.microsoft.com/office/drawing/2016/5/13/chartex" xmlns:cx8="http://schemas.microsoft.com/office/drawing/2016/5/14/chartex" xmlns:mc="http://schemas.openxmlformats.org/markup-compatibility/2006" xmlns:aink="http://schemas.microsoft.com/office/drawing/2016/ink" xmlns:am3d="http://schemas.microsoft.com/office/drawing/2017/model3d" xmlns:o="urn:schemas-microsoft-com:office:office" xmlns:r="http://schemas.openxmlformats.org/officeDocument/2006/relationships" xmlns:m="http://schemas.openxmlformats.org/officeDocument/2006/math" xmlns:v="urn:schemas-microsoft-com:vml" xmlns:wp14="http://schemas.microsoft.com/office/word/2010/wordprocessingDrawing" xmlns:wp="http://schemas.openxmlformats.org/drawingml/2006/wordprocessingDrawing" xmlns:w10="urn:schemas-microsoft-com:office:word" xmlns:w="http://schemas.openxmlformats.org/wordprocessingml/2006/main" xmlns:w14="http://schemas.microsoft.com/office/word/2010/wordml" xmlns:w15="http://schemas.microsoft.com/office/word/2012/wordml" xmlns:w16cid="http://schemas.microsoft.com/office/word/2016/wordml/cid" xmlns:w16se="http://schemas.microsoft.com/office/word/2015/wordml/symex" xmlns:wpg="http://schemas.microsoft.com/office/word/2010/wordprocessingGroup" xmlns:wpi="http://schemas.microsoft.com/office/word/2010/wordprocessingInk" xmlns:wne="http://schemas.microsoft.com/office/word/2006/wordml" xmlns:wps="http://schemas.microsoft.com/office/word/2010/wordprocessingShape" mc:Ignorable="w14 w15 w16se w16cid wp14">
-  <w:abstractNum w:abstractNumId="0" w15:restartNumberingAfterBreak="0">
+<w:numbering xmlns:wpc="http://schemas.microsoft.com/office/word/2010/wordprocessingCanvas" xmlns:mc="http://schemas.openxmlformats.org/markup-compatibility/2006" xmlns:o="urn:schemas-microsoft-com:office:office" xmlns:r="http://schemas.openxmlformats.org/officeDocument/2006/relationships" xmlns:m="http://schemas.openxmlformats.org/officeDocument/2006/math" xmlns:v="urn:schemas-microsoft-com:vml" xmlns:wp14="http://schemas.microsoft.com/office/word/2010/wordprocessingDrawing" xmlns:wp="http://schemas.openxmlformats.org/drawingml/2006/wordprocessingDrawing" xmlns:w10="urn:schemas-microsoft-com:office:word" xmlns:w="http://schemas.openxmlformats.org/wordprocessingml/2006/main" xmlns:w14="http://schemas.microsoft.com/office/word/2010/wordml" xmlns:w15="http://schemas.microsoft.com/office/word/2012/wordml" xmlns:wpg="http://schemas.microsoft.com/office/word/2010/wordprocessingGroup" xmlns:wpi="http://schemas.microsoft.com/office/word/2010/wordprocessingInk" xmlns:wne="http://schemas.microsoft.com/office/word/2006/wordml" xmlns:wps="http://schemas.microsoft.com/office/word/2010/wordprocessingShape" mc:Ignorable="w14 w15 wp14">
+  <w:abstractNum w:abstractNumId="0">
     <w:nsid w:val="FFFFFF7E"/>
     <w:multiLevelType w:val="singleLevel"/>
     <w:tmpl w:val="015ED472"/>
@@ -15354,7 +16006,7 @@
       </w:pPr>
     </w:lvl>
   </w:abstractNum>
-  <w:abstractNum w:abstractNumId="1" w15:restartNumberingAfterBreak="0">
+  <w:abstractNum w:abstractNumId="1">
     <w:nsid w:val="FFFFFF7F"/>
     <w:multiLevelType w:val="singleLevel"/>
     <w:tmpl w:val="B3BEF5CC"/>
@@ -15371,7 +16023,7 @@
       </w:pPr>
     </w:lvl>
   </w:abstractNum>
-  <w:abstractNum w:abstractNumId="2" w15:restartNumberingAfterBreak="0">
+  <w:abstractNum w:abstractNumId="2">
     <w:nsid w:val="FFFFFF81"/>
     <w:multiLevelType w:val="singleLevel"/>
     <w:tmpl w:val="BDAE33B0"/>
@@ -15391,7 +16043,7 @@
       </w:rPr>
     </w:lvl>
   </w:abstractNum>
-  <w:abstractNum w:abstractNumId="3" w15:restartNumberingAfterBreak="0">
+  <w:abstractNum w:abstractNumId="3">
     <w:nsid w:val="FFFFFF82"/>
     <w:multiLevelType w:val="singleLevel"/>
     <w:tmpl w:val="C1A6A5C4"/>
@@ -15411,7 +16063,7 @@
       </w:rPr>
     </w:lvl>
   </w:abstractNum>
-  <w:abstractNum w:abstractNumId="4" w15:restartNumberingAfterBreak="0">
+  <w:abstractNum w:abstractNumId="4">
     <w:nsid w:val="FFFFFFFE"/>
     <w:multiLevelType w:val="singleLevel"/>
     <w:tmpl w:val="FFFFFFFF"/>
@@ -15421,7 +16073,7 @@
       <w:lvlJc w:val="left"/>
     </w:lvl>
   </w:abstractNum>
-  <w:abstractNum w:abstractNumId="5" w15:restartNumberingAfterBreak="0">
+  <w:abstractNum w:abstractNumId="5">
     <w:nsid w:val="00DD5F7E"/>
     <w:multiLevelType w:val="hybridMultilevel"/>
     <w:tmpl w:val="4B72C4DA"/>
@@ -15534,7 +16186,7 @@
       </w:rPr>
     </w:lvl>
   </w:abstractNum>
-  <w:abstractNum w:abstractNumId="6" w15:restartNumberingAfterBreak="0">
+  <w:abstractNum w:abstractNumId="6">
     <w:nsid w:val="091760E7"/>
     <w:multiLevelType w:val="singleLevel"/>
     <w:tmpl w:val="A19A21BE"/>
@@ -15546,7 +16198,7 @@
       <w:lvlJc w:val="left"/>
     </w:lvl>
   </w:abstractNum>
-  <w:abstractNum w:abstractNumId="7" w15:restartNumberingAfterBreak="0">
+  <w:abstractNum w:abstractNumId="7">
     <w:nsid w:val="096224B2"/>
     <w:multiLevelType w:val="hybridMultilevel"/>
     <w:tmpl w:val="4CCEDDD8"/>
@@ -15659,7 +16311,7 @@
       </w:rPr>
     </w:lvl>
   </w:abstractNum>
-  <w:abstractNum w:abstractNumId="8" w15:restartNumberingAfterBreak="0">
+  <w:abstractNum w:abstractNumId="8">
     <w:nsid w:val="0CF832F1"/>
     <w:multiLevelType w:val="hybridMultilevel"/>
     <w:tmpl w:val="F0020A4E"/>
@@ -15745,7 +16397,7 @@
       </w:pPr>
     </w:lvl>
   </w:abstractNum>
-  <w:abstractNum w:abstractNumId="9" w15:restartNumberingAfterBreak="0">
+  <w:abstractNum w:abstractNumId="9">
     <w:nsid w:val="0D3C672D"/>
     <w:multiLevelType w:val="hybridMultilevel"/>
     <w:tmpl w:val="CC3EFF4A"/>
@@ -15834,7 +16486,7 @@
       </w:pPr>
     </w:lvl>
   </w:abstractNum>
-  <w:abstractNum w:abstractNumId="10" w15:restartNumberingAfterBreak="0">
+  <w:abstractNum w:abstractNumId="10">
     <w:nsid w:val="199F25A1"/>
     <w:multiLevelType w:val="singleLevel"/>
     <w:tmpl w:val="B8D67778"/>
@@ -15853,7 +16505,7 @@
       </w:rPr>
     </w:lvl>
   </w:abstractNum>
-  <w:abstractNum w:abstractNumId="11" w15:restartNumberingAfterBreak="0">
+  <w:abstractNum w:abstractNumId="11">
     <w:nsid w:val="232C0E7C"/>
     <w:multiLevelType w:val="hybridMultilevel"/>
     <w:tmpl w:val="CB2CFB14"/>
@@ -15966,7 +16618,7 @@
       </w:rPr>
     </w:lvl>
   </w:abstractNum>
-  <w:abstractNum w:abstractNumId="12" w15:restartNumberingAfterBreak="0">
+  <w:abstractNum w:abstractNumId="12">
     <w:nsid w:val="2EFF2345"/>
     <w:multiLevelType w:val="singleLevel"/>
     <w:tmpl w:val="F15AD34A"/>
@@ -15985,7 +16637,7 @@
       </w:rPr>
     </w:lvl>
   </w:abstractNum>
-  <w:abstractNum w:abstractNumId="13" w15:restartNumberingAfterBreak="0">
+  <w:abstractNum w:abstractNumId="13">
     <w:nsid w:val="37561F67"/>
     <w:multiLevelType w:val="hybridMultilevel"/>
     <w:tmpl w:val="4C1EA41C"/>
@@ -16098,7 +16750,7 @@
       </w:rPr>
     </w:lvl>
   </w:abstractNum>
-  <w:abstractNum w:abstractNumId="14" w15:restartNumberingAfterBreak="0">
+  <w:abstractNum w:abstractNumId="14">
     <w:nsid w:val="3A2A0A43"/>
     <w:multiLevelType w:val="hybridMultilevel"/>
     <w:tmpl w:val="AF3C106A"/>
@@ -16211,7 +16863,7 @@
       </w:rPr>
     </w:lvl>
   </w:abstractNum>
-  <w:abstractNum w:abstractNumId="15" w15:restartNumberingAfterBreak="0">
+  <w:abstractNum w:abstractNumId="15">
     <w:nsid w:val="45702913"/>
     <w:multiLevelType w:val="singleLevel"/>
     <w:tmpl w:val="F6305A7C"/>
@@ -16223,7 +16875,7 @@
       <w:lvlJc w:val="left"/>
     </w:lvl>
   </w:abstractNum>
-  <w:abstractNum w:abstractNumId="16" w15:restartNumberingAfterBreak="0">
+  <w:abstractNum w:abstractNumId="16">
     <w:nsid w:val="4BC10037"/>
     <w:multiLevelType w:val="singleLevel"/>
     <w:tmpl w:val="F15AD34A"/>
@@ -16242,7 +16894,7 @@
       </w:rPr>
     </w:lvl>
   </w:abstractNum>
-  <w:abstractNum w:abstractNumId="17" w15:restartNumberingAfterBreak="0">
+  <w:abstractNum w:abstractNumId="17">
     <w:nsid w:val="4BD6162F"/>
     <w:multiLevelType w:val="singleLevel"/>
     <w:tmpl w:val="F15AD34A"/>
@@ -16261,7 +16913,7 @@
       </w:rPr>
     </w:lvl>
   </w:abstractNum>
-  <w:abstractNum w:abstractNumId="18" w15:restartNumberingAfterBreak="0">
+  <w:abstractNum w:abstractNumId="18">
     <w:nsid w:val="4BDD1E38"/>
     <w:multiLevelType w:val="hybridMultilevel"/>
     <w:tmpl w:val="FB46515A"/>
@@ -16374,7 +17026,7 @@
       </w:rPr>
     </w:lvl>
   </w:abstractNum>
-  <w:abstractNum w:abstractNumId="19" w15:restartNumberingAfterBreak="0">
+  <w:abstractNum w:abstractNumId="19">
     <w:nsid w:val="4C510602"/>
     <w:multiLevelType w:val="singleLevel"/>
     <w:tmpl w:val="F1444738"/>
@@ -16395,7 +17047,7 @@
       </w:rPr>
     </w:lvl>
   </w:abstractNum>
-  <w:abstractNum w:abstractNumId="20" w15:restartNumberingAfterBreak="0">
+  <w:abstractNum w:abstractNumId="20">
     <w:nsid w:val="4F257BDF"/>
     <w:multiLevelType w:val="hybridMultilevel"/>
     <w:tmpl w:val="FD1E0CF6"/>
@@ -16508,7 +17160,7 @@
       </w:rPr>
     </w:lvl>
   </w:abstractNum>
-  <w:abstractNum w:abstractNumId="21" w15:restartNumberingAfterBreak="0">
+  <w:abstractNum w:abstractNumId="21">
     <w:nsid w:val="4F61077B"/>
     <w:multiLevelType w:val="singleLevel"/>
     <w:tmpl w:val="39CC91A4"/>
@@ -16523,7 +17175,7 @@
       </w:pPr>
     </w:lvl>
   </w:abstractNum>
-  <w:abstractNum w:abstractNumId="22" w15:restartNumberingAfterBreak="0">
+  <w:abstractNum w:abstractNumId="22">
     <w:nsid w:val="51045A21"/>
     <w:multiLevelType w:val="hybridMultilevel"/>
     <w:tmpl w:val="FD880446"/>
@@ -16636,7 +17288,7 @@
       </w:rPr>
     </w:lvl>
   </w:abstractNum>
-  <w:abstractNum w:abstractNumId="23" w15:restartNumberingAfterBreak="0">
+  <w:abstractNum w:abstractNumId="23">
     <w:nsid w:val="51061699"/>
     <w:multiLevelType w:val="hybridMultilevel"/>
     <w:tmpl w:val="4246D3AC"/>
@@ -16749,7 +17401,93 @@
       </w:rPr>
     </w:lvl>
   </w:abstractNum>
-  <w:abstractNum w:abstractNumId="24" w15:restartNumberingAfterBreak="0">
+  <w:abstractNum w:abstractNumId="24">
+    <w:nsid w:val="54016DC4"/>
+    <w:multiLevelType w:val="hybridMultilevel"/>
+    <w:tmpl w:val="752C7A2A"/>
+    <w:lvl w:ilvl="0" w:tplc="0409000F">
+      <w:start w:val="1"/>
+      <w:numFmt w:val="decimal"/>
+      <w:lvlText w:val="%1."/>
+      <w:lvlJc w:val="left"/>
+      <w:pPr>
+        <w:ind w:left="720" w:hanging="360"/>
+      </w:pPr>
+    </w:lvl>
+    <w:lvl w:ilvl="1" w:tplc="04090019" w:tentative="1">
+      <w:start w:val="1"/>
+      <w:numFmt w:val="lowerLetter"/>
+      <w:lvlText w:val="%2."/>
+      <w:lvlJc w:val="left"/>
+      <w:pPr>
+        <w:ind w:left="1440" w:hanging="360"/>
+      </w:pPr>
+    </w:lvl>
+    <w:lvl w:ilvl="2" w:tplc="0409001B" w:tentative="1">
+      <w:start w:val="1"/>
+      <w:numFmt w:val="lowerRoman"/>
+      <w:lvlText w:val="%3."/>
+      <w:lvlJc w:val="right"/>
+      <w:pPr>
+        <w:ind w:left="2160" w:hanging="180"/>
+      </w:pPr>
+    </w:lvl>
+    <w:lvl w:ilvl="3" w:tplc="0409000F" w:tentative="1">
+      <w:start w:val="1"/>
+      <w:numFmt w:val="decimal"/>
+      <w:lvlText w:val="%4."/>
+      <w:lvlJc w:val="left"/>
+      <w:pPr>
+        <w:ind w:left="2880" w:hanging="360"/>
+      </w:pPr>
+    </w:lvl>
+    <w:lvl w:ilvl="4" w:tplc="04090019" w:tentative="1">
+      <w:start w:val="1"/>
+      <w:numFmt w:val="lowerLetter"/>
+      <w:lvlText w:val="%5."/>
+      <w:lvlJc w:val="left"/>
+      <w:pPr>
+        <w:ind w:left="3600" w:hanging="360"/>
+      </w:pPr>
+    </w:lvl>
+    <w:lvl w:ilvl="5" w:tplc="0409001B" w:tentative="1">
+      <w:start w:val="1"/>
+      <w:numFmt w:val="lowerRoman"/>
+      <w:lvlText w:val="%6."/>
+      <w:lvlJc w:val="right"/>
+      <w:pPr>
+        <w:ind w:left="4320" w:hanging="180"/>
+      </w:pPr>
+    </w:lvl>
+    <w:lvl w:ilvl="6" w:tplc="0409000F" w:tentative="1">
+      <w:start w:val="1"/>
+      <w:numFmt w:val="decimal"/>
+      <w:lvlText w:val="%7."/>
+      <w:lvlJc w:val="left"/>
+      <w:pPr>
+        <w:ind w:left="5040" w:hanging="360"/>
+      </w:pPr>
+    </w:lvl>
+    <w:lvl w:ilvl="7" w:tplc="04090019" w:tentative="1">
+      <w:start w:val="1"/>
+      <w:numFmt w:val="lowerLetter"/>
+      <w:lvlText w:val="%8."/>
+      <w:lvlJc w:val="left"/>
+      <w:pPr>
+        <w:ind w:left="5760" w:hanging="360"/>
+      </w:pPr>
+    </w:lvl>
+    <w:lvl w:ilvl="8" w:tplc="0409001B" w:tentative="1">
+      <w:start w:val="1"/>
+      <w:numFmt w:val="lowerRoman"/>
+      <w:lvlText w:val="%9."/>
+      <w:lvlJc w:val="right"/>
+      <w:pPr>
+        <w:ind w:left="6480" w:hanging="180"/>
+      </w:pPr>
+    </w:lvl>
+  </w:abstractNum>
+  <w:abstractNum w:abstractNumId="25">
     <w:nsid w:val="579B0C49"/>
     <w:multiLevelType w:val="singleLevel"/>
     <w:tmpl w:val="B8D67778"/>
@@ -16768,7 +17506,7 @@
       </w:rPr>
     </w:lvl>
   </w:abstractNum>
-  <w:abstractNum w:abstractNumId="25" w15:restartNumberingAfterBreak="0">
+  <w:abstractNum w:abstractNumId="26">
     <w:nsid w:val="5F436190"/>
     <w:multiLevelType w:val="singleLevel"/>
     <w:tmpl w:val="D7CE7166"/>
@@ -16789,7 +17527,7 @@
       </w:rPr>
     </w:lvl>
   </w:abstractNum>
-  <w:abstractNum w:abstractNumId="26" w15:restartNumberingAfterBreak="0">
+  <w:abstractNum w:abstractNumId="27">
     <w:nsid w:val="62540DA9"/>
     <w:multiLevelType w:val="singleLevel"/>
     <w:tmpl w:val="B8D67778"/>
@@ -16808,7 +17546,7 @@
       </w:rPr>
     </w:lvl>
   </w:abstractNum>
-  <w:abstractNum w:abstractNumId="27" w15:restartNumberingAfterBreak="0">
+  <w:abstractNum w:abstractNumId="28">
     <w:nsid w:val="63882B2E"/>
     <w:multiLevelType w:val="singleLevel"/>
     <w:tmpl w:val="8D1E4DD4"/>
@@ -16820,7 +17558,7 @@
       <w:lvlJc w:val="left"/>
     </w:lvl>
   </w:abstractNum>
-  <w:abstractNum w:abstractNumId="28" w15:restartNumberingAfterBreak="0">
+  <w:abstractNum w:abstractNumId="29">
     <w:nsid w:val="6C98497C"/>
     <w:multiLevelType w:val="hybridMultilevel"/>
     <w:tmpl w:val="7EC604A2"/>
@@ -16933,7 +17671,7 @@
       </w:rPr>
     </w:lvl>
   </w:abstractNum>
-  <w:abstractNum w:abstractNumId="29" w15:restartNumberingAfterBreak="0">
+  <w:abstractNum w:abstractNumId="30">
     <w:nsid w:val="70507BFC"/>
     <w:multiLevelType w:val="singleLevel"/>
     <w:tmpl w:val="80DE380C"/>
@@ -16945,7 +17683,7 @@
       <w:lvlJc w:val="left"/>
     </w:lvl>
   </w:abstractNum>
-  <w:abstractNum w:abstractNumId="30" w15:restartNumberingAfterBreak="0">
+  <w:abstractNum w:abstractNumId="31">
     <w:nsid w:val="749D7287"/>
     <w:multiLevelType w:val="singleLevel"/>
     <w:tmpl w:val="DE76053A"/>
@@ -16957,7 +17695,7 @@
       <w:lvlJc w:val="left"/>
     </w:lvl>
   </w:abstractNum>
-  <w:abstractNum w:abstractNumId="31" w15:restartNumberingAfterBreak="0">
+  <w:abstractNum w:abstractNumId="32">
     <w:nsid w:val="75D550E5"/>
     <w:multiLevelType w:val="hybridMultilevel"/>
     <w:tmpl w:val="57ACD532"/>
@@ -17070,7 +17808,7 @@
       </w:pPr>
     </w:lvl>
   </w:abstractNum>
-  <w:abstractNum w:abstractNumId="32" w15:restartNumberingAfterBreak="0">
+  <w:abstractNum w:abstractNumId="33">
     <w:nsid w:val="77CA5CEA"/>
     <w:multiLevelType w:val="hybridMultilevel"/>
     <w:tmpl w:val="7DC45528"/>
@@ -17274,10 +18012,10 @@
     <w:abstractNumId w:val="10"/>
   </w:num>
   <w:num w:numId="8">
-    <w:abstractNumId w:val="24"/>
+    <w:abstractNumId w:val="25"/>
   </w:num>
   <w:num w:numId="9">
-    <w:abstractNumId w:val="26"/>
+    <w:abstractNumId w:val="27"/>
   </w:num>
   <w:num w:numId="10">
     <w:abstractNumId w:val="4"/>
@@ -17299,7 +18037,7 @@
     </w:lvlOverride>
   </w:num>
   <w:num w:numId="11">
-    <w:abstractNumId w:val="25"/>
+    <w:abstractNumId w:val="26"/>
   </w:num>
   <w:num w:numId="12">
     <w:abstractNumId w:val="4"/>
@@ -17400,16 +18138,16 @@
     </w:lvlOverride>
   </w:num>
   <w:num w:numId="18">
-    <w:abstractNumId w:val="27"/>
+    <w:abstractNumId w:val="28"/>
   </w:num>
   <w:num w:numId="19">
     <w:abstractNumId w:val="6"/>
   </w:num>
   <w:num w:numId="20">
-    <w:abstractNumId w:val="30"/>
+    <w:abstractNumId w:val="31"/>
   </w:num>
   <w:num w:numId="21">
-    <w:abstractNumId w:val="29"/>
+    <w:abstractNumId w:val="30"/>
   </w:num>
   <w:num w:numId="22">
     <w:abstractNumId w:val="15"/>
@@ -17496,13 +18234,13 @@
     <w:abstractNumId w:val="1"/>
   </w:num>
   <w:num w:numId="34">
-    <w:abstractNumId w:val="31"/>
+    <w:abstractNumId w:val="32"/>
   </w:num>
   <w:num w:numId="35">
     <w:abstractNumId w:val="17"/>
   </w:num>
   <w:num w:numId="36">
-    <w:abstractNumId w:val="26"/>
+    <w:abstractNumId w:val="27"/>
     <w:lvlOverride w:ilvl="0">
       <w:lvl w:ilvl="0">
         <w:start w:val="1"/>
@@ -17530,10 +18268,10 @@
     <w:abstractNumId w:val="11"/>
   </w:num>
   <w:num w:numId="40">
-    <w:abstractNumId w:val="32"/>
+    <w:abstractNumId w:val="33"/>
   </w:num>
   <w:num w:numId="41">
-    <w:abstractNumId w:val="28"/>
+    <w:abstractNumId w:val="29"/>
   </w:num>
   <w:num w:numId="42">
     <w:abstractNumId w:val="22"/>
@@ -17559,11 +18297,14 @@
   <w:num w:numId="49">
     <w:abstractNumId w:val="20"/>
   </w:num>
+  <w:num w:numId="50">
+    <w:abstractNumId w:val="24"/>
+  </w:num>
 </w:numbering>
 </file>
 
 <file path=word/styles.xml><?xml version="1.0" encoding="utf-8"?>
-<w:styles xmlns:mc="http://schemas.openxmlformats.org/markup-compatibility/2006" xmlns:r="http://schemas.openxmlformats.org/officeDocument/2006/relationships" xmlns:w="http://schemas.openxmlformats.org/wordprocessingml/2006/main" xmlns:w14="http://schemas.microsoft.com/office/word/2010/wordml" xmlns:w15="http://schemas.microsoft.com/office/word/2012/wordml" xmlns:w16cid="http://schemas.microsoft.com/office/word/2016/wordml/cid" xmlns:w16se="http://schemas.microsoft.com/office/word/2015/wordml/symex" mc:Ignorable="w14 w15 w16se w16cid">
+<w:styles xmlns:mc="http://schemas.openxmlformats.org/markup-compatibility/2006" xmlns:r="http://schemas.openxmlformats.org/officeDocument/2006/relationships" xmlns:w="http://schemas.openxmlformats.org/wordprocessingml/2006/main" xmlns:w14="http://schemas.microsoft.com/office/word/2010/wordml" xmlns:w15="http://schemas.microsoft.com/office/word/2012/wordml" mc:Ignorable="w14 w15">
   <w:docDefaults>
     <w:rPrDefault>
       <w:rPr>
@@ -17573,7 +18314,7 @@
     </w:rPrDefault>
     <w:pPrDefault/>
   </w:docDefaults>
-  <w:latentStyles w:defLockedState="0" w:defUIPriority="99" w:defSemiHidden="0" w:defUnhideWhenUsed="0" w:defQFormat="0" w:count="375">
+  <w:latentStyles w:defLockedState="0" w:defUIPriority="99" w:defSemiHidden="0" w:defUnhideWhenUsed="0" w:defQFormat="0" w:count="371">
     <w:lsdException w:name="Normal" w:uiPriority="0" w:qFormat="1"/>
     <w:lsdException w:name="heading 1" w:uiPriority="9" w:qFormat="1"/>
     <w:lsdException w:name="heading 2" w:uiPriority="9" w:qFormat="1"/>
@@ -17679,6 +18420,7 @@
     <w:lsdException w:name="HTML Sample" w:semiHidden="1" w:unhideWhenUsed="1"/>
     <w:lsdException w:name="HTML Typewriter" w:semiHidden="1" w:unhideWhenUsed="1"/>
     <w:lsdException w:name="HTML Variable" w:semiHidden="1" w:unhideWhenUsed="1"/>
+    <w:lsdException w:name="Normal Table" w:semiHidden="1" w:unhideWhenUsed="1"/>
     <w:lsdException w:name="annotation subject" w:semiHidden="1" w:unhideWhenUsed="1"/>
     <w:lsdException w:name="No List" w:semiHidden="1" w:unhideWhenUsed="1"/>
     <w:lsdException w:name="Outline List 1" w:semiHidden="1" w:unhideWhenUsed="1"/>
@@ -17722,8 +18464,10 @@
     <w:lsdException w:name="Table Elegant" w:semiHidden="1" w:unhideWhenUsed="1"/>
     <w:lsdException w:name="Table Professional" w:semiHidden="1" w:unhideWhenUsed="1"/>
     <w:lsdException w:name="Table Subtle 1" w:semiHidden="1" w:unhideWhenUsed="1"/>
+    <w:lsdException w:name="Table Subtle 2" w:semiHidden="1" w:unhideWhenUsed="1"/>
     <w:lsdException w:name="Table Web 1" w:semiHidden="1" w:unhideWhenUsed="1"/>
     <w:lsdException w:name="Table Web 2" w:semiHidden="1" w:unhideWhenUsed="1"/>
+    <w:lsdException w:name="Table Web 3" w:semiHidden="1" w:unhideWhenUsed="1"/>
     <w:lsdException w:name="Balloon Text" w:semiHidden="1" w:unhideWhenUsed="1"/>
     <w:lsdException w:name="Table Grid" w:uiPriority="39"/>
     <w:lsdException w:name="Table Theme" w:semiHidden="1" w:unhideWhenUsed="1"/>
@@ -17942,10 +18686,6 @@
     <w:lsdException w:name="List Table 5 Dark Accent 6" w:uiPriority="50"/>
     <w:lsdException w:name="List Table 6 Colorful Accent 6" w:uiPriority="51"/>
     <w:lsdException w:name="List Table 7 Colorful Accent 6" w:uiPriority="52"/>
-    <w:lsdException w:name="Mention" w:semiHidden="1" w:unhideWhenUsed="1"/>
-    <w:lsdException w:name="Smart Hyperlink" w:semiHidden="1" w:unhideWhenUsed="1"/>
-    <w:lsdException w:name="Hashtag" w:semiHidden="1" w:unhideWhenUsed="1"/>
-    <w:lsdException w:name="Unresolved Mention" w:semiHidden="1" w:unhideWhenUsed="1"/>
   </w:latentStyles>
   <w:style w:type="paragraph" w:default="1" w:styleId="Normal">
     <w:name w:val="Normal"/>
@@ -19306,7 +20046,7 @@
 </file>
 
 <file path=customXml/itemProps1.xml><?xml version="1.0" encoding="utf-8"?>
-<ds:datastoreItem xmlns:ds="http://schemas.openxmlformats.org/officeDocument/2006/customXml" ds:itemID="{A3FA454F-7393-4CB3-B49C-8C618A23DE30}">
+<ds:datastoreItem xmlns:ds="http://schemas.openxmlformats.org/officeDocument/2006/customXml" ds:itemID="{0A2C076E-70DD-4FAA-9458-E62E20B28128}">
   <ds:schemaRefs>
     <ds:schemaRef ds:uri="http://schemas.openxmlformats.org/officeDocument/2006/bibliography"/>
   </ds:schemaRefs>

</xml_diff>

<commit_message>
Revised wording in Finalize tournament as needed, added description on how to finalize a tournament, and corrected a few mistakes regarding functionality of the Finalize Tournament window.
</commit_message>
<xml_diff>
--- a/9tapUserManual.docx
+++ b/9tapUserManual.docx
@@ -2920,7 +2920,7 @@
                 <w:noProof/>
                 <w:webHidden/>
               </w:rPr>
-              <w:t>23</w:t>
+              <w:t>24</w:t>
             </w:r>
             <w:r>
               <w:rPr>
@@ -2991,7 +2991,7 @@
                 <w:noProof/>
                 <w:webHidden/>
               </w:rPr>
-              <w:t>25</w:t>
+              <w:t>27</w:t>
             </w:r>
             <w:r>
               <w:rPr>
@@ -3062,7 +3062,7 @@
                 <w:noProof/>
                 <w:webHidden/>
               </w:rPr>
-              <w:t>27</w:t>
+              <w:t>29</w:t>
             </w:r>
             <w:r>
               <w:rPr>
@@ -3130,7 +3130,7 @@
                 <w:noProof/>
                 <w:webHidden/>
               </w:rPr>
-              <w:t>27</w:t>
+              <w:t>29</w:t>
             </w:r>
             <w:r>
               <w:rPr>
@@ -3198,7 +3198,7 @@
                 <w:noProof/>
                 <w:webHidden/>
               </w:rPr>
-              <w:t>27</w:t>
+              <w:t>29</w:t>
             </w:r>
             <w:r>
               <w:rPr>
@@ -3266,7 +3266,7 @@
                 <w:noProof/>
                 <w:webHidden/>
               </w:rPr>
-              <w:t>29</w:t>
+              <w:t>31</w:t>
             </w:r>
             <w:r>
               <w:rPr>
@@ -3337,7 +3337,7 @@
                 <w:noProof/>
                 <w:webHidden/>
               </w:rPr>
-              <w:t>31</w:t>
+              <w:t>33</w:t>
             </w:r>
             <w:r>
               <w:rPr>
@@ -3408,7 +3408,7 @@
                 <w:noProof/>
                 <w:webHidden/>
               </w:rPr>
-              <w:t>33</w:t>
+              <w:t>35</w:t>
             </w:r>
             <w:r>
               <w:rPr>
@@ -3476,7 +3476,7 @@
                 <w:noProof/>
                 <w:webHidden/>
               </w:rPr>
-              <w:t>33</w:t>
+              <w:t>35</w:t>
             </w:r>
             <w:r>
               <w:rPr>
@@ -3544,7 +3544,7 @@
                 <w:noProof/>
                 <w:webHidden/>
               </w:rPr>
-              <w:t>33</w:t>
+              <w:t>35</w:t>
             </w:r>
             <w:r>
               <w:rPr>
@@ -3612,7 +3612,7 @@
                 <w:noProof/>
                 <w:webHidden/>
               </w:rPr>
-              <w:t>35</w:t>
+              <w:t>37</w:t>
             </w:r>
             <w:r>
               <w:rPr>
@@ -3680,7 +3680,7 @@
                 <w:noProof/>
                 <w:webHidden/>
               </w:rPr>
-              <w:t>38</w:t>
+              <w:t>40</w:t>
             </w:r>
             <w:r>
               <w:rPr>
@@ -3748,7 +3748,7 @@
                 <w:noProof/>
                 <w:webHidden/>
               </w:rPr>
-              <w:t>38</w:t>
+              <w:t>40</w:t>
             </w:r>
             <w:r>
               <w:rPr>
@@ -3816,7 +3816,7 @@
                 <w:noProof/>
                 <w:webHidden/>
               </w:rPr>
-              <w:t>38</w:t>
+              <w:t>40</w:t>
             </w:r>
             <w:r>
               <w:rPr>
@@ -3884,7 +3884,7 @@
                 <w:noProof/>
                 <w:webHidden/>
               </w:rPr>
-              <w:t>39</w:t>
+              <w:t>41</w:t>
             </w:r>
             <w:r>
               <w:rPr>
@@ -4019,6 +4019,16 @@
       </w:r>
       <w:r>
         <w:instrText xml:space="preserve">" </w:instrText>
+      </w:r>
+      <w:r>
+        <w:fldChar w:fldCharType="separate"/>
+      </w:r>
+      <w:r>
+        <w:rPr>
+          <w:b/>
+          <w:bCs/>
+        </w:rPr>
+        <w:t>Error! Bookmark not defined.</w:t>
       </w:r>
       <w:r>
         <w:fldChar w:fldCharType="end"/>
@@ -4360,14 +4370,27 @@
       <w:r>
         <w:t xml:space="preserve">Figure </w:t>
       </w:r>
-      <w:fldSimple w:instr=" SEQ Figure \* ARABIC ">
-        <w:r>
-          <w:rPr>
-            <w:noProof/>
-          </w:rPr>
-          <w:t>1</w:t>
-        </w:r>
-      </w:fldSimple>
+      <w:r>
+        <w:fldChar w:fldCharType="begin"/>
+      </w:r>
+      <w:r>
+        <w:instrText xml:space="preserve"> SEQ Figure \* ARABIC </w:instrText>
+      </w:r>
+      <w:r>
+        <w:fldChar w:fldCharType="separate"/>
+      </w:r>
+      <w:r>
+        <w:rPr>
+          <w:noProof/>
+        </w:rPr>
+        <w:t>1</w:t>
+      </w:r>
+      <w:r>
+        <w:rPr>
+          <w:noProof/>
+        </w:rPr>
+        <w:fldChar w:fldCharType="end"/>
+      </w:r>
       <w:r>
         <w:t>: 9-Tap Main Menu</w:t>
       </w:r>
@@ -4403,6 +4426,16 @@
       </w:r>
       <w:r>
         <w:instrText xml:space="preserve">" </w:instrText>
+      </w:r>
+      <w:r>
+        <w:fldChar w:fldCharType="separate"/>
+      </w:r>
+      <w:r>
+        <w:rPr>
+          <w:b/>
+          <w:bCs/>
+        </w:rPr>
+        <w:t>Error! Bookmark not defined.</w:t>
       </w:r>
       <w:r>
         <w:fldChar w:fldCharType="end"/>
@@ -4471,6 +4504,16 @@
         <w:instrText xml:space="preserve">" </w:instrText>
       </w:r>
       <w:r>
+        <w:fldChar w:fldCharType="separate"/>
+      </w:r>
+      <w:r>
+        <w:rPr>
+          <w:b/>
+          <w:bCs/>
+        </w:rPr>
+        <w:t>Error! Bookmark not defined.</w:t>
+      </w:r>
+      <w:r>
         <w:fldChar w:fldCharType="end"/>
       </w:r>
       <w:r>
@@ -4529,6 +4572,16 @@
         <w:instrText xml:space="preserve">" </w:instrText>
       </w:r>
       <w:r>
+        <w:fldChar w:fldCharType="separate"/>
+      </w:r>
+      <w:r>
+        <w:rPr>
+          <w:b/>
+          <w:bCs/>
+        </w:rPr>
+        <w:t>Error! Bookmark not defined.</w:t>
+      </w:r>
+      <w:r>
         <w:fldChar w:fldCharType="end"/>
       </w:r>
     </w:p>
@@ -4595,6 +4648,16 @@
         <w:instrText xml:space="preserve">" </w:instrText>
       </w:r>
       <w:r>
+        <w:fldChar w:fldCharType="separate"/>
+      </w:r>
+      <w:r>
+        <w:rPr>
+          <w:b/>
+          <w:bCs/>
+        </w:rPr>
+        <w:t>Error! Bookmark not defined.</w:t>
+      </w:r>
+      <w:r>
         <w:fldChar w:fldCharType="end"/>
       </w:r>
       <w:r>
@@ -4608,6 +4671,16 @@
       </w:r>
       <w:r>
         <w:instrText xml:space="preserve">" </w:instrText>
+      </w:r>
+      <w:r>
+        <w:fldChar w:fldCharType="separate"/>
+      </w:r>
+      <w:r>
+        <w:rPr>
+          <w:b/>
+          <w:bCs/>
+        </w:rPr>
+        <w:t>Error! Bookmark not defined.</w:t>
       </w:r>
       <w:r>
         <w:fldChar w:fldCharType="end"/>
@@ -4701,6 +4774,16 @@
         <w:instrText xml:space="preserve">" </w:instrText>
       </w:r>
       <w:r>
+        <w:fldChar w:fldCharType="separate"/>
+      </w:r>
+      <w:r>
+        <w:rPr>
+          <w:b/>
+          <w:bCs/>
+        </w:rPr>
+        <w:t>Error! Bookmark not defined.</w:t>
+      </w:r>
+      <w:r>
         <w:fldChar w:fldCharType="end"/>
       </w:r>
       <w:r>
@@ -4756,6 +4839,16 @@
         <w:instrText xml:space="preserve">" </w:instrText>
       </w:r>
       <w:r>
+        <w:fldChar w:fldCharType="separate"/>
+      </w:r>
+      <w:r>
+        <w:rPr>
+          <w:b/>
+          <w:bCs/>
+        </w:rPr>
+        <w:t>Error! Bookmark not defined.</w:t>
+      </w:r>
+      <w:r>
         <w:fldChar w:fldCharType="end"/>
       </w:r>
       <w:r>
@@ -4814,6 +4907,16 @@
         <w:instrText xml:space="preserve">" </w:instrText>
       </w:r>
       <w:r>
+        <w:fldChar w:fldCharType="separate"/>
+      </w:r>
+      <w:r>
+        <w:rPr>
+          <w:b/>
+          <w:bCs/>
+        </w:rPr>
+        <w:t>Error! Bookmark not defined.</w:t>
+      </w:r>
+      <w:r>
         <w:fldChar w:fldCharType="end"/>
       </w:r>
       <w:r>
@@ -4869,6 +4972,16 @@
       </w:r>
       <w:r>
         <w:instrText xml:space="preserve">" </w:instrText>
+      </w:r>
+      <w:r>
+        <w:fldChar w:fldCharType="separate"/>
+      </w:r>
+      <w:r>
+        <w:rPr>
+          <w:b/>
+          <w:bCs/>
+        </w:rPr>
+        <w:t>Error! Bookmark not defined.</w:t>
       </w:r>
       <w:r>
         <w:fldChar w:fldCharType="end"/>
@@ -5037,11 +5150,8 @@
         </w:numPr>
       </w:pPr>
       <w:r>
-        <w:t xml:space="preserve">The 9 Tap Tour program has now been successfully installed. Choose “Run 9 Tap Tour” to immediately launch the program, or “View ReadMe.txt” to view </w:t>
-      </w:r>
-      <w:r>
         <w:lastRenderedPageBreak/>
-        <w:t>the ReadMe file where you can view updated program information made after the game manual was printed.</w:t>
+        <w:t>The 9 Tap Tour program has now been successfully installed. Choose “Run 9 Tap Tour” to immediately launch the program, or “View ReadMe.txt” to view the ReadMe file where you can view updated program information made after the game manual was printed.</w:t>
       </w:r>
     </w:p>
     <w:p>
@@ -5249,6 +5359,16 @@
         <w:instrText xml:space="preserve">" </w:instrText>
       </w:r>
       <w:r>
+        <w:fldChar w:fldCharType="separate"/>
+      </w:r>
+      <w:r>
+        <w:rPr>
+          <w:b/>
+          <w:bCs/>
+        </w:rPr>
+        <w:t>Error! Bookmark not defined.</w:t>
+      </w:r>
+      <w:r>
         <w:fldChar w:fldCharType="end"/>
       </w:r>
       <w:r>
@@ -5291,6 +5411,16 @@
         <w:instrText xml:space="preserve">" </w:instrText>
       </w:r>
       <w:r>
+        <w:fldChar w:fldCharType="separate"/>
+      </w:r>
+      <w:r>
+        <w:rPr>
+          <w:b/>
+          <w:bCs/>
+        </w:rPr>
+        <w:t>Error! Bookmark not defined.</w:t>
+      </w:r>
+      <w:r>
         <w:fldChar w:fldCharType="end"/>
       </w:r>
       <w:r>
@@ -5357,6 +5487,16 @@
         <w:instrText xml:space="preserve">" </w:instrText>
       </w:r>
       <w:r>
+        <w:fldChar w:fldCharType="separate"/>
+      </w:r>
+      <w:r>
+        <w:rPr>
+          <w:b/>
+          <w:bCs/>
+        </w:rPr>
+        <w:t>Error! Bookmark not defined.</w:t>
+      </w:r>
+      <w:r>
         <w:fldChar w:fldCharType="end"/>
       </w:r>
       <w:r>
@@ -5426,6 +5566,16 @@
         <w:instrText xml:space="preserve">" </w:instrText>
       </w:r>
       <w:r>
+        <w:fldChar w:fldCharType="separate"/>
+      </w:r>
+      <w:r>
+        <w:rPr>
+          <w:b/>
+          <w:bCs/>
+        </w:rPr>
+        <w:t>Error! Bookmark not defined.</w:t>
+      </w:r>
+      <w:r>
         <w:fldChar w:fldCharType="end"/>
       </w:r>
       <w:r>
@@ -5471,6 +5621,16 @@
         <w:instrText xml:space="preserve">" </w:instrText>
       </w:r>
       <w:r>
+        <w:fldChar w:fldCharType="separate"/>
+      </w:r>
+      <w:r>
+        <w:rPr>
+          <w:b/>
+          <w:bCs/>
+        </w:rPr>
+        <w:t>Error! Bookmark not defined.</w:t>
+      </w:r>
+      <w:r>
         <w:fldChar w:fldCharType="end"/>
       </w:r>
       <w:r>
@@ -5544,6 +5704,16 @@
       </w:r>
       <w:r>
         <w:instrText xml:space="preserve">" </w:instrText>
+      </w:r>
+      <w:r>
+        <w:fldChar w:fldCharType="separate"/>
+      </w:r>
+      <w:r>
+        <w:rPr>
+          <w:b/>
+          <w:bCs/>
+        </w:rPr>
+        <w:t>Error! Bookmark not defined.</w:t>
       </w:r>
       <w:r>
         <w:fldChar w:fldCharType="end"/>
@@ -5778,6 +5948,20 @@
         <w:rPr>
           <w:szCs w:val="32"/>
         </w:rPr>
+        <w:fldChar w:fldCharType="separate"/>
+      </w:r>
+      <w:r>
+        <w:rPr>
+          <w:b/>
+          <w:bCs/>
+          <w:szCs w:val="32"/>
+        </w:rPr>
+        <w:t>Error! Bookmark not defined.</w:t>
+      </w:r>
+      <w:r>
+        <w:rPr>
+          <w:szCs w:val="32"/>
+        </w:rPr>
         <w:fldChar w:fldCharType="end"/>
       </w:r>
     </w:p>
@@ -5835,6 +6019,16 @@
         <w:instrText xml:space="preserve">" </w:instrText>
       </w:r>
       <w:r>
+        <w:fldChar w:fldCharType="separate"/>
+      </w:r>
+      <w:r>
+        <w:rPr>
+          <w:b/>
+          <w:bCs/>
+        </w:rPr>
+        <w:t>Error! Bookmark not defined.</w:t>
+      </w:r>
+      <w:r>
         <w:fldChar w:fldCharType="end"/>
       </w:r>
       <w:r>
@@ -5868,6 +6062,16 @@
         <w:instrText xml:space="preserve">" </w:instrText>
       </w:r>
       <w:r>
+        <w:fldChar w:fldCharType="separate"/>
+      </w:r>
+      <w:r>
+        <w:rPr>
+          <w:b/>
+          <w:bCs/>
+        </w:rPr>
+        <w:t>Error! Bookmark not defined.</w:t>
+      </w:r>
+      <w:r>
         <w:fldChar w:fldCharType="end"/>
       </w:r>
       <w:r>
@@ -5886,6 +6090,16 @@
         <w:instrText xml:space="preserve">" </w:instrText>
       </w:r>
       <w:r>
+        <w:fldChar w:fldCharType="separate"/>
+      </w:r>
+      <w:r>
+        <w:rPr>
+          <w:b/>
+          <w:bCs/>
+        </w:rPr>
+        <w:t>Error! Bookmark not defined.</w:t>
+      </w:r>
+      <w:r>
         <w:fldChar w:fldCharType="end"/>
       </w:r>
       <w:r>
@@ -5919,6 +6133,16 @@
         <w:instrText xml:space="preserve">" </w:instrText>
       </w:r>
       <w:r>
+        <w:fldChar w:fldCharType="separate"/>
+      </w:r>
+      <w:r>
+        <w:rPr>
+          <w:b/>
+          <w:bCs/>
+        </w:rPr>
+        <w:t>Error! Bookmark not defined.</w:t>
+      </w:r>
+      <w:r>
         <w:fldChar w:fldCharType="end"/>
       </w:r>
       <w:r>
@@ -5950,6 +6174,16 @@
       </w:r>
       <w:r>
         <w:instrText xml:space="preserve">" </w:instrText>
+      </w:r>
+      <w:r>
+        <w:fldChar w:fldCharType="separate"/>
+      </w:r>
+      <w:r>
+        <w:rPr>
+          <w:b/>
+          <w:bCs/>
+        </w:rPr>
+        <w:t>Error! Bookmark not defined.</w:t>
       </w:r>
       <w:r>
         <w:fldChar w:fldCharType="end"/>
@@ -6036,14 +6270,27 @@
       <w:r>
         <w:t xml:space="preserve">Figure </w:t>
       </w:r>
-      <w:fldSimple w:instr=" SEQ Figure \* ARABIC ">
-        <w:r>
-          <w:rPr>
-            <w:noProof/>
-          </w:rPr>
-          <w:t>2</w:t>
-        </w:r>
-      </w:fldSimple>
+      <w:r>
+        <w:fldChar w:fldCharType="begin"/>
+      </w:r>
+      <w:r>
+        <w:instrText xml:space="preserve"> SEQ Figure \* ARABIC </w:instrText>
+      </w:r>
+      <w:r>
+        <w:fldChar w:fldCharType="separate"/>
+      </w:r>
+      <w:r>
+        <w:rPr>
+          <w:noProof/>
+        </w:rPr>
+        <w:t>2</w:t>
+      </w:r>
+      <w:r>
+        <w:rPr>
+          <w:noProof/>
+        </w:rPr>
+        <w:fldChar w:fldCharType="end"/>
+      </w:r>
       <w:r>
         <w:t>: Main Menu</w:t>
       </w:r>
@@ -6063,6 +6310,16 @@
         <w:instrText xml:space="preserve">" </w:instrText>
       </w:r>
       <w:r>
+        <w:fldChar w:fldCharType="separate"/>
+      </w:r>
+      <w:r>
+        <w:rPr>
+          <w:b/>
+          <w:bCs/>
+        </w:rPr>
+        <w:t>Error! Bookmark not defined.</w:t>
+      </w:r>
+      <w:r>
         <w:fldChar w:fldCharType="end"/>
       </w:r>
       <w:r>
@@ -6079,6 +6336,16 @@
       </w:r>
       <w:r>
         <w:instrText xml:space="preserve">" </w:instrText>
+      </w:r>
+      <w:r>
+        <w:fldChar w:fldCharType="separate"/>
+      </w:r>
+      <w:r>
+        <w:rPr>
+          <w:b/>
+          <w:bCs/>
+        </w:rPr>
+        <w:t>Error! Bookmark not defined.</w:t>
       </w:r>
       <w:r>
         <w:fldChar w:fldCharType="end"/>
@@ -6122,6 +6389,16 @@
         <w:instrText xml:space="preserve">" </w:instrText>
       </w:r>
       <w:r>
+        <w:fldChar w:fldCharType="separate"/>
+      </w:r>
+      <w:r>
+        <w:rPr>
+          <w:b/>
+          <w:bCs/>
+        </w:rPr>
+        <w:t>Error! Bookmark not defined.</w:t>
+      </w:r>
+      <w:r>
         <w:fldChar w:fldCharType="end"/>
       </w:r>
     </w:p>
@@ -6159,6 +6436,16 @@
       </w:r>
       <w:r>
         <w:instrText xml:space="preserve">" </w:instrText>
+      </w:r>
+      <w:r>
+        <w:fldChar w:fldCharType="separate"/>
+      </w:r>
+      <w:r>
+        <w:rPr>
+          <w:b/>
+          <w:bCs/>
+        </w:rPr>
+        <w:t>Error! Bookmark not defined.</w:t>
       </w:r>
       <w:r>
         <w:fldChar w:fldCharType="end"/>
@@ -6243,14 +6530,27 @@
       <w:r>
         <w:t xml:space="preserve">Figure </w:t>
       </w:r>
-      <w:fldSimple w:instr=" SEQ Figure \* ARABIC ">
-        <w:r>
-          <w:rPr>
-            <w:noProof/>
-          </w:rPr>
-          <w:t>3</w:t>
-        </w:r>
-      </w:fldSimple>
+      <w:r>
+        <w:fldChar w:fldCharType="begin"/>
+      </w:r>
+      <w:r>
+        <w:instrText xml:space="preserve"> SEQ Figure \* ARABIC </w:instrText>
+      </w:r>
+      <w:r>
+        <w:fldChar w:fldCharType="separate"/>
+      </w:r>
+      <w:r>
+        <w:rPr>
+          <w:noProof/>
+        </w:rPr>
+        <w:t>3</w:t>
+      </w:r>
+      <w:r>
+        <w:rPr>
+          <w:noProof/>
+        </w:rPr>
+        <w:fldChar w:fldCharType="end"/>
+      </w:r>
       <w:r>
         <w:t>: Member Information</w:t>
       </w:r>
@@ -6276,6 +6576,16 @@
         <w:instrText xml:space="preserve">" </w:instrText>
       </w:r>
       <w:r>
+        <w:fldChar w:fldCharType="separate"/>
+      </w:r>
+      <w:r>
+        <w:rPr>
+          <w:b/>
+          <w:bCs/>
+        </w:rPr>
+        <w:t>Error! Bookmark not defined.</w:t>
+      </w:r>
+      <w:r>
         <w:fldChar w:fldCharType="end"/>
       </w:r>
       <w:r>
@@ -6316,6 +6626,16 @@
         <w:instrText xml:space="preserve">" </w:instrText>
       </w:r>
       <w:r>
+        <w:fldChar w:fldCharType="separate"/>
+      </w:r>
+      <w:r>
+        <w:rPr>
+          <w:b/>
+          <w:bCs/>
+        </w:rPr>
+        <w:t>Error! Bookmark not defined.</w:t>
+      </w:r>
+      <w:r>
         <w:fldChar w:fldCharType="end"/>
       </w:r>
     </w:p>
@@ -6358,6 +6678,16 @@
         <w:instrText xml:space="preserve">" </w:instrText>
       </w:r>
       <w:r>
+        <w:fldChar w:fldCharType="separate"/>
+      </w:r>
+      <w:r>
+        <w:rPr>
+          <w:b/>
+          <w:bCs/>
+        </w:rPr>
+        <w:t>Error! Bookmark not defined.</w:t>
+      </w:r>
+      <w:r>
         <w:fldChar w:fldCharType="end"/>
       </w:r>
       <w:r>
@@ -6425,6 +6755,16 @@
         <w:instrText xml:space="preserve">" </w:instrText>
       </w:r>
       <w:r>
+        <w:fldChar w:fldCharType="separate"/>
+      </w:r>
+      <w:r>
+        <w:rPr>
+          <w:b/>
+          <w:bCs/>
+        </w:rPr>
+        <w:t>Error! Bookmark not defined.</w:t>
+      </w:r>
+      <w:r>
         <w:fldChar w:fldCharType="end"/>
       </w:r>
     </w:p>
@@ -6464,6 +6804,16 @@
         <w:instrText xml:space="preserve">" </w:instrText>
       </w:r>
       <w:r>
+        <w:fldChar w:fldCharType="separate"/>
+      </w:r>
+      <w:r>
+        <w:rPr>
+          <w:b/>
+          <w:bCs/>
+        </w:rPr>
+        <w:t>Error! Bookmark not defined.</w:t>
+      </w:r>
+      <w:r>
         <w:fldChar w:fldCharType="end"/>
       </w:r>
       <w:r>
@@ -6512,6 +6862,16 @@
         <w:instrText xml:space="preserve">" </w:instrText>
       </w:r>
       <w:r>
+        <w:fldChar w:fldCharType="separate"/>
+      </w:r>
+      <w:r>
+        <w:rPr>
+          <w:b/>
+          <w:bCs/>
+        </w:rPr>
+        <w:t>Error! Bookmark not defined.</w:t>
+      </w:r>
+      <w:r>
         <w:fldChar w:fldCharType="end"/>
       </w:r>
       <w:r>
@@ -6530,6 +6890,16 @@
         <w:instrText xml:space="preserve">" </w:instrText>
       </w:r>
       <w:r>
+        <w:fldChar w:fldCharType="separate"/>
+      </w:r>
+      <w:r>
+        <w:rPr>
+          <w:b/>
+          <w:bCs/>
+        </w:rPr>
+        <w:t>Error! Bookmark not defined.</w:t>
+      </w:r>
+      <w:r>
         <w:fldChar w:fldCharType="end"/>
       </w:r>
       <w:r>
@@ -6539,7 +6909,11 @@
         <w:t>.</w:t>
       </w:r>
       <w:r>
-        <w:t xml:space="preserve"> If applicable, enter the member’s middle initial, then hit tab. You are now at the D.O.B. field, enter the member’s date of birth. Hit tab to go to the SSN field. The member Social Security Number is entered here. By </w:t>
+        <w:t xml:space="preserve"> If applicable, enter the member’s middle initial, then hit tab. You are now at the D.O.B. field, enter the member’s date of birth. Hit tab to go to the SSN field. The member </w:t>
+      </w:r>
+      <w:r>
+        <w:lastRenderedPageBreak/>
+        <w:t xml:space="preserve">Social Security Number is entered here. By </w:t>
       </w:r>
       <w:r>
         <w:t>default,</w:t>
@@ -6548,11 +6922,7 @@
         <w:t xml:space="preserve"> it is hidden, to display the SSN, check the box to the left of the SSN field. Tab to the Address field to begin enter</w:t>
       </w:r>
       <w:r>
-        <w:t xml:space="preserve">ing the members </w:t>
-      </w:r>
-      <w:r>
-        <w:lastRenderedPageBreak/>
-        <w:t>address information. Tab to the next field as the information is entered.</w:t>
+        <w:t>ing the members address information. Tab to the next field as the information is entered.</w:t>
       </w:r>
       <w:r>
         <w:t xml:space="preserve"> After his email has been entered, tab to Date Joined. Enter the member’s join date, then hit tab. If applicable enter the member’s rejoin date, then hit tab. If the player has any referrals, enter them in the Referral</w:t>
@@ -6595,6 +6965,16 @@
       </w:r>
       <w:r>
         <w:instrText xml:space="preserve">" </w:instrText>
+      </w:r>
+      <w:r>
+        <w:fldChar w:fldCharType="separate"/>
+      </w:r>
+      <w:r>
+        <w:rPr>
+          <w:b/>
+          <w:bCs/>
+        </w:rPr>
+        <w:t>Error! Bookmark not defined.</w:t>
       </w:r>
       <w:r>
         <w:fldChar w:fldCharType="end"/>
@@ -6676,14 +7056,27 @@
       <w:r>
         <w:t xml:space="preserve">Figure </w:t>
       </w:r>
-      <w:fldSimple w:instr=" SEQ Figure \* ARABIC ">
-        <w:r>
-          <w:rPr>
-            <w:noProof/>
-          </w:rPr>
-          <w:t>4</w:t>
-        </w:r>
-      </w:fldSimple>
+      <w:r>
+        <w:fldChar w:fldCharType="begin"/>
+      </w:r>
+      <w:r>
+        <w:instrText xml:space="preserve"> SEQ Figure \* ARABIC </w:instrText>
+      </w:r>
+      <w:r>
+        <w:fldChar w:fldCharType="separate"/>
+      </w:r>
+      <w:r>
+        <w:rPr>
+          <w:noProof/>
+        </w:rPr>
+        <w:t>4</w:t>
+      </w:r>
+      <w:r>
+        <w:rPr>
+          <w:noProof/>
+        </w:rPr>
+        <w:fldChar w:fldCharType="end"/>
+      </w:r>
       <w:r>
         <w:t>: Member Information</w:t>
       </w:r>
@@ -6728,6 +7121,16 @@
         <w:instrText xml:space="preserve">" </w:instrText>
       </w:r>
       <w:r>
+        <w:fldChar w:fldCharType="separate"/>
+      </w:r>
+      <w:r>
+        <w:rPr>
+          <w:b/>
+          <w:bCs/>
+        </w:rPr>
+        <w:t>Error! Bookmark not defined.</w:t>
+      </w:r>
+      <w:r>
         <w:fldChar w:fldCharType="end"/>
       </w:r>
     </w:p>
@@ -6766,13 +7169,27 @@
         <w:instrText xml:space="preserve">" </w:instrText>
       </w:r>
       <w:r>
+        <w:fldChar w:fldCharType="separate"/>
+      </w:r>
+      <w:r>
+        <w:rPr>
+          <w:b/>
+          <w:bCs/>
+        </w:rPr>
+        <w:t>Error! Bookmark not defined.</w:t>
+      </w:r>
+      <w:r>
         <w:fldChar w:fldCharType="end"/>
       </w:r>
       <w:r>
         <w:t xml:space="preserve">” button. The member search screen will display (figure 7). Members can be searched by number, name, average, handicap, or bonus. </w:t>
       </w:r>
       <w:r>
-        <w:t xml:space="preserve">Enter the search parameters and click “Search”. The results display at the bottom of the screen. </w:t>
+        <w:t xml:space="preserve">Enter the search parameters and click “Search”. The </w:t>
+      </w:r>
+      <w:r>
+        <w:lastRenderedPageBreak/>
+        <w:t xml:space="preserve">results display at the bottom of the screen. </w:t>
       </w:r>
       <w:r>
         <w:t>To display all members in the database, leave the fields blank and click “Search”</w:t>
@@ -6783,7 +7200,6 @@
         <w:pStyle w:val="BodyText"/>
       </w:pPr>
       <w:r>
-        <w:lastRenderedPageBreak/>
         <w:t>Select the member to be updated and click “Select”. The member will now be displayed on the Member Info</w:t>
       </w:r>
       <w:r>
@@ -6814,6 +7230,16 @@
         <w:instrText xml:space="preserve">" </w:instrText>
       </w:r>
       <w:r>
+        <w:fldChar w:fldCharType="separate"/>
+      </w:r>
+      <w:r>
+        <w:rPr>
+          <w:b/>
+          <w:bCs/>
+        </w:rPr>
+        <w:t>Error! Bookmark not defined.</w:t>
+      </w:r>
+      <w:r>
         <w:fldChar w:fldCharType="end"/>
       </w:r>
       <w:r>
@@ -6881,6 +7307,20 @@
         <w:rPr>
           <w:szCs w:val="20"/>
         </w:rPr>
+        <w:fldChar w:fldCharType="separate"/>
+      </w:r>
+      <w:r>
+        <w:rPr>
+          <w:b/>
+          <w:bCs/>
+          <w:szCs w:val="20"/>
+        </w:rPr>
+        <w:t>Error! Bookmark not defined.</w:t>
+      </w:r>
+      <w:r>
+        <w:rPr>
+          <w:szCs w:val="20"/>
+        </w:rPr>
         <w:fldChar w:fldCharType="end"/>
       </w:r>
     </w:p>
@@ -6905,6 +7345,16 @@
         <w:instrText xml:space="preserve">" </w:instrText>
       </w:r>
       <w:r>
+        <w:fldChar w:fldCharType="separate"/>
+      </w:r>
+      <w:r>
+        <w:rPr>
+          <w:b/>
+          <w:bCs/>
+        </w:rPr>
+        <w:t>Error! Bookmark not defined.</w:t>
+      </w:r>
+      <w:r>
         <w:fldChar w:fldCharType="end"/>
       </w:r>
       <w:r>
@@ -6918,6 +7368,16 @@
       </w:r>
       <w:r>
         <w:instrText xml:space="preserve">" </w:instrText>
+      </w:r>
+      <w:r>
+        <w:fldChar w:fldCharType="separate"/>
+      </w:r>
+      <w:r>
+        <w:rPr>
+          <w:b/>
+          <w:bCs/>
+        </w:rPr>
+        <w:t>Error! Bookmark not defined.</w:t>
       </w:r>
       <w:r>
         <w:fldChar w:fldCharType="end"/>
@@ -6986,14 +7446,27 @@
       <w:r>
         <w:t xml:space="preserve">Figure </w:t>
       </w:r>
-      <w:fldSimple w:instr=" SEQ Figure \* ARABIC ">
-        <w:r>
-          <w:rPr>
-            <w:noProof/>
-          </w:rPr>
-          <w:t>5</w:t>
-        </w:r>
-      </w:fldSimple>
+      <w:r>
+        <w:fldChar w:fldCharType="begin"/>
+      </w:r>
+      <w:r>
+        <w:instrText xml:space="preserve"> SEQ Figure \* ARABIC </w:instrText>
+      </w:r>
+      <w:r>
+        <w:fldChar w:fldCharType="separate"/>
+      </w:r>
+      <w:r>
+        <w:rPr>
+          <w:noProof/>
+        </w:rPr>
+        <w:t>5</w:t>
+      </w:r>
+      <w:r>
+        <w:rPr>
+          <w:noProof/>
+        </w:rPr>
+        <w:fldChar w:fldCharType="end"/>
+      </w:r>
       <w:r>
         <w:t>: Stats</w:t>
       </w:r>
@@ -7010,6 +7483,16 @@
         <w:instrText xml:space="preserve">" </w:instrText>
       </w:r>
       <w:r>
+        <w:fldChar w:fldCharType="separate"/>
+      </w:r>
+      <w:r>
+        <w:rPr>
+          <w:b/>
+          <w:bCs/>
+        </w:rPr>
+        <w:t>Error! Bookmark not defined.</w:t>
+      </w:r>
+      <w:r>
         <w:fldChar w:fldCharType="end"/>
       </w:r>
       <w:r>
@@ -7023,6 +7506,16 @@
       </w:r>
       <w:r>
         <w:instrText xml:space="preserve">" </w:instrText>
+      </w:r>
+      <w:r>
+        <w:fldChar w:fldCharType="separate"/>
+      </w:r>
+      <w:r>
+        <w:rPr>
+          <w:b/>
+          <w:bCs/>
+        </w:rPr>
+        <w:t>Error! Bookmark not defined.</w:t>
       </w:r>
       <w:r>
         <w:fldChar w:fldCharType="end"/>
@@ -7093,6 +7586,20 @@
         <w:rPr>
           <w:szCs w:val="20"/>
         </w:rPr>
+        <w:fldChar w:fldCharType="separate"/>
+      </w:r>
+      <w:r>
+        <w:rPr>
+          <w:b/>
+          <w:bCs/>
+          <w:szCs w:val="20"/>
+        </w:rPr>
+        <w:t>Error! Bookmark not defined.</w:t>
+      </w:r>
+      <w:r>
+        <w:rPr>
+          <w:szCs w:val="20"/>
+        </w:rPr>
         <w:fldChar w:fldCharType="end"/>
       </w:r>
     </w:p>
@@ -7117,6 +7624,16 @@
         <w:instrText xml:space="preserve">" </w:instrText>
       </w:r>
       <w:r>
+        <w:fldChar w:fldCharType="separate"/>
+      </w:r>
+      <w:r>
+        <w:rPr>
+          <w:b/>
+          <w:bCs/>
+        </w:rPr>
+        <w:t>Error! Bookmark not defined.</w:t>
+      </w:r>
+      <w:r>
         <w:fldChar w:fldCharType="end"/>
       </w:r>
       <w:r>
@@ -7130,6 +7647,16 @@
       </w:r>
       <w:r>
         <w:instrText xml:space="preserve">" </w:instrText>
+      </w:r>
+      <w:r>
+        <w:fldChar w:fldCharType="separate"/>
+      </w:r>
+      <w:r>
+        <w:rPr>
+          <w:b/>
+          <w:bCs/>
+        </w:rPr>
+        <w:t>Error! Bookmark not defined.</w:t>
       </w:r>
       <w:r>
         <w:fldChar w:fldCharType="end"/>
@@ -7244,14 +7771,27 @@
       <w:r>
         <w:t xml:space="preserve">Figure </w:t>
       </w:r>
-      <w:fldSimple w:instr=" SEQ Figure \* ARABIC ">
-        <w:r>
-          <w:rPr>
-            <w:noProof/>
-          </w:rPr>
-          <w:t>6</w:t>
-        </w:r>
-      </w:fldSimple>
+      <w:r>
+        <w:fldChar w:fldCharType="begin"/>
+      </w:r>
+      <w:r>
+        <w:instrText xml:space="preserve"> SEQ Figure \* ARABIC </w:instrText>
+      </w:r>
+      <w:r>
+        <w:fldChar w:fldCharType="separate"/>
+      </w:r>
+      <w:r>
+        <w:rPr>
+          <w:noProof/>
+        </w:rPr>
+        <w:t>6</w:t>
+      </w:r>
+      <w:r>
+        <w:rPr>
+          <w:noProof/>
+        </w:rPr>
+        <w:fldChar w:fldCharType="end"/>
+      </w:r>
       <w:r>
         <w:t>: Member search, blank and with results</w:t>
       </w:r>
@@ -7313,6 +7853,20 @@
       </w:r>
       <w:r>
         <w:instrText xml:space="preserve">" </w:instrText>
+      </w:r>
+      <w:r>
+        <w:rPr>
+          <w:szCs w:val="20"/>
+        </w:rPr>
+        <w:fldChar w:fldCharType="separate"/>
+      </w:r>
+      <w:r>
+        <w:rPr>
+          <w:b/>
+          <w:bCs/>
+          <w:szCs w:val="20"/>
+        </w:rPr>
+        <w:t>Error! Bookmark not defined.</w:t>
       </w:r>
       <w:r>
         <w:rPr>
@@ -7445,14 +7999,27 @@
       <w:r>
         <w:t xml:space="preserve">Figure </w:t>
       </w:r>
-      <w:fldSimple w:instr=" SEQ Figure \* ARABIC ">
-        <w:r>
-          <w:rPr>
-            <w:noProof/>
-          </w:rPr>
-          <w:t>7</w:t>
-        </w:r>
-      </w:fldSimple>
+      <w:r>
+        <w:fldChar w:fldCharType="begin"/>
+      </w:r>
+      <w:r>
+        <w:instrText xml:space="preserve"> SEQ Figure \* ARABIC </w:instrText>
+      </w:r>
+      <w:r>
+        <w:fldChar w:fldCharType="separate"/>
+      </w:r>
+      <w:r>
+        <w:rPr>
+          <w:noProof/>
+        </w:rPr>
+        <w:t>7</w:t>
+      </w:r>
+      <w:r>
+        <w:rPr>
+          <w:noProof/>
+        </w:rPr>
+        <w:fldChar w:fldCharType="end"/>
+      </w:r>
       <w:r>
         <w:t>: basic printer dialog</w:t>
       </w:r>
@@ -7497,6 +8064,20 @@
         <w:rPr>
           <w:szCs w:val="20"/>
         </w:rPr>
+        <w:fldChar w:fldCharType="separate"/>
+      </w:r>
+      <w:r>
+        <w:rPr>
+          <w:b/>
+          <w:bCs/>
+          <w:szCs w:val="20"/>
+        </w:rPr>
+        <w:t>Error! Bookmark not defined.</w:t>
+      </w:r>
+      <w:r>
+        <w:rPr>
+          <w:szCs w:val="20"/>
+        </w:rPr>
         <w:fldChar w:fldCharType="end"/>
       </w:r>
     </w:p>
@@ -7519,6 +8100,16 @@
       </w:r>
       <w:r>
         <w:instrText xml:space="preserve">" </w:instrText>
+      </w:r>
+      <w:r>
+        <w:fldChar w:fldCharType="separate"/>
+      </w:r>
+      <w:r>
+        <w:rPr>
+          <w:b/>
+          <w:bCs/>
+        </w:rPr>
+        <w:t>Error! Bookmark not defined.</w:t>
       </w:r>
       <w:r>
         <w:fldChar w:fldCharType="end"/>
@@ -7605,14 +8196,27 @@
       <w:r>
         <w:t xml:space="preserve">Figure </w:t>
       </w:r>
-      <w:fldSimple w:instr=" SEQ Figure \* ARABIC ">
-        <w:r>
-          <w:rPr>
-            <w:noProof/>
-          </w:rPr>
-          <w:t>8</w:t>
-        </w:r>
-      </w:fldSimple>
+      <w:r>
+        <w:fldChar w:fldCharType="begin"/>
+      </w:r>
+      <w:r>
+        <w:instrText xml:space="preserve"> SEQ Figure \* ARABIC </w:instrText>
+      </w:r>
+      <w:r>
+        <w:fldChar w:fldCharType="separate"/>
+      </w:r>
+      <w:r>
+        <w:rPr>
+          <w:noProof/>
+        </w:rPr>
+        <w:t>8</w:t>
+      </w:r>
+      <w:r>
+        <w:rPr>
+          <w:noProof/>
+        </w:rPr>
+        <w:fldChar w:fldCharType="end"/>
+      </w:r>
       <w:r>
         <w:t>: Importing existing player information</w:t>
       </w:r>
@@ -7738,14 +8342,27 @@
       <w:r>
         <w:t xml:space="preserve">Figure </w:t>
       </w:r>
-      <w:fldSimple w:instr=" SEQ Figure \* ARABIC ">
-        <w:r>
-          <w:rPr>
-            <w:noProof/>
-          </w:rPr>
-          <w:t>9</w:t>
-        </w:r>
-      </w:fldSimple>
+      <w:r>
+        <w:fldChar w:fldCharType="begin"/>
+      </w:r>
+      <w:r>
+        <w:instrText xml:space="preserve"> SEQ Figure \* ARABIC </w:instrText>
+      </w:r>
+      <w:r>
+        <w:fldChar w:fldCharType="separate"/>
+      </w:r>
+      <w:r>
+        <w:rPr>
+          <w:noProof/>
+        </w:rPr>
+        <w:t>9</w:t>
+      </w:r>
+      <w:r>
+        <w:rPr>
+          <w:noProof/>
+        </w:rPr>
+        <w:fldChar w:fldCharType="end"/>
+      </w:r>
       <w:r>
         <w:t>: Member Scores</w:t>
       </w:r>
@@ -7760,6 +8377,16 @@
       </w:r>
       <w:r>
         <w:instrText xml:space="preserve">" </w:instrText>
+      </w:r>
+      <w:r>
+        <w:fldChar w:fldCharType="separate"/>
+      </w:r>
+      <w:r>
+        <w:rPr>
+          <w:b/>
+          <w:bCs/>
+        </w:rPr>
+        <w:t>Error! Bookmark not defined.</w:t>
       </w:r>
       <w:r>
         <w:fldChar w:fldCharType="end"/>
@@ -7943,6 +8570,20 @@
         <w:rPr>
           <w:szCs w:val="20"/>
         </w:rPr>
+        <w:fldChar w:fldCharType="separate"/>
+      </w:r>
+      <w:r>
+        <w:rPr>
+          <w:b/>
+          <w:bCs/>
+          <w:szCs w:val="20"/>
+        </w:rPr>
+        <w:t>Error! Bookmark not defined.</w:t>
+      </w:r>
+      <w:r>
+        <w:rPr>
+          <w:szCs w:val="20"/>
+        </w:rPr>
         <w:fldChar w:fldCharType="end"/>
       </w:r>
     </w:p>
@@ -8004,6 +8645,16 @@
       </w:r>
       <w:r>
         <w:instrText xml:space="preserve">" </w:instrText>
+      </w:r>
+      <w:r>
+        <w:fldChar w:fldCharType="separate"/>
+      </w:r>
+      <w:r>
+        <w:rPr>
+          <w:b/>
+          <w:bCs/>
+        </w:rPr>
+        <w:t>Error! Bookmark not defined.</w:t>
       </w:r>
       <w:r>
         <w:fldChar w:fldCharType="end"/>
@@ -8072,14 +8723,27 @@
       <w:r>
         <w:t xml:space="preserve">Figure </w:t>
       </w:r>
-      <w:fldSimple w:instr=" SEQ Figure \* ARABIC ">
-        <w:r>
-          <w:rPr>
-            <w:noProof/>
-          </w:rPr>
-          <w:t>10</w:t>
-        </w:r>
-      </w:fldSimple>
+      <w:r>
+        <w:fldChar w:fldCharType="begin"/>
+      </w:r>
+      <w:r>
+        <w:instrText xml:space="preserve"> SEQ Figure \* ARABIC </w:instrText>
+      </w:r>
+      <w:r>
+        <w:fldChar w:fldCharType="separate"/>
+      </w:r>
+      <w:r>
+        <w:rPr>
+          <w:noProof/>
+        </w:rPr>
+        <w:t>10</w:t>
+      </w:r>
+      <w:r>
+        <w:rPr>
+          <w:noProof/>
+        </w:rPr>
+        <w:fldChar w:fldCharType="end"/>
+      </w:r>
       <w:r>
         <w:t>: Tournament Stats</w:t>
       </w:r>
@@ -8111,6 +8775,16 @@
         <w:instrText xml:space="preserve">" </w:instrText>
       </w:r>
       <w:r>
+        <w:fldChar w:fldCharType="separate"/>
+      </w:r>
+      <w:r>
+        <w:rPr>
+          <w:b/>
+          <w:bCs/>
+        </w:rPr>
+        <w:t>Error! Bookmark not defined.</w:t>
+      </w:r>
+      <w:r>
         <w:fldChar w:fldCharType="end"/>
       </w:r>
       <w:r>
@@ -8153,12 +8827,26 @@
         <w:rPr>
           <w:szCs w:val="20"/>
         </w:rPr>
-        <w:fldChar w:fldCharType="end"/>
-      </w:r>
-      <w:r>
-        <w:rPr>
+        <w:fldChar w:fldCharType="separate"/>
+      </w:r>
+      <w:r>
+        <w:rPr>
+          <w:b/>
+          <w:bCs/>
           <w:szCs w:val="20"/>
         </w:rPr>
+        <w:t>Error! Bookmark not defined.</w:t>
+      </w:r>
+      <w:r>
+        <w:rPr>
+          <w:szCs w:val="20"/>
+        </w:rPr>
+        <w:fldChar w:fldCharType="end"/>
+      </w:r>
+      <w:r>
+        <w:rPr>
+          <w:szCs w:val="20"/>
+        </w:rPr>
         <w:t xml:space="preserve"> By Tournament</w:t>
       </w:r>
       <w:bookmarkEnd w:id="27"/>
@@ -8233,6 +8921,16 @@
       </w:r>
       <w:r>
         <w:instrText xml:space="preserve">" </w:instrText>
+      </w:r>
+      <w:r>
+        <w:fldChar w:fldCharType="separate"/>
+      </w:r>
+      <w:r>
+        <w:rPr>
+          <w:b/>
+          <w:bCs/>
+        </w:rPr>
+        <w:t>Error! Bookmark not defined.</w:t>
       </w:r>
       <w:r>
         <w:fldChar w:fldCharType="end"/>
@@ -8319,14 +9017,27 @@
       <w:r>
         <w:t xml:space="preserve">Figure </w:t>
       </w:r>
-      <w:fldSimple w:instr=" SEQ Figure \* ARABIC ">
-        <w:r>
-          <w:rPr>
-            <w:noProof/>
-          </w:rPr>
-          <w:t>11</w:t>
-        </w:r>
-      </w:fldSimple>
+      <w:r>
+        <w:fldChar w:fldCharType="begin"/>
+      </w:r>
+      <w:r>
+        <w:instrText xml:space="preserve"> SEQ Figure \* ARABIC </w:instrText>
+      </w:r>
+      <w:r>
+        <w:fldChar w:fldCharType="separate"/>
+      </w:r>
+      <w:r>
+        <w:rPr>
+          <w:noProof/>
+        </w:rPr>
+        <w:t>11</w:t>
+      </w:r>
+      <w:r>
+        <w:rPr>
+          <w:noProof/>
+        </w:rPr>
+        <w:fldChar w:fldCharType="end"/>
+      </w:r>
       <w:r>
         <w:t xml:space="preserve"> Print Dialog</w:t>
       </w:r>
@@ -8468,14 +9179,27 @@
       <w:r>
         <w:t xml:space="preserve">Figure </w:t>
       </w:r>
-      <w:fldSimple w:instr=" SEQ Figure \* ARABIC ">
-        <w:r>
-          <w:rPr>
-            <w:noProof/>
-          </w:rPr>
-          <w:t>12</w:t>
-        </w:r>
-      </w:fldSimple>
+      <w:r>
+        <w:fldChar w:fldCharType="begin"/>
+      </w:r>
+      <w:r>
+        <w:instrText xml:space="preserve"> SEQ Figure \* ARABIC </w:instrText>
+      </w:r>
+      <w:r>
+        <w:fldChar w:fldCharType="separate"/>
+      </w:r>
+      <w:r>
+        <w:rPr>
+          <w:noProof/>
+        </w:rPr>
+        <w:t>12</w:t>
+      </w:r>
+      <w:r>
+        <w:rPr>
+          <w:noProof/>
+        </w:rPr>
+        <w:fldChar w:fldCharType="end"/>
+      </w:r>
       <w:r>
         <w:t>: Tournament Place Standings</w:t>
       </w:r>
@@ -8490,6 +9214,16 @@
       </w:r>
       <w:r>
         <w:instrText xml:space="preserve">" </w:instrText>
+      </w:r>
+      <w:r>
+        <w:fldChar w:fldCharType="separate"/>
+      </w:r>
+      <w:r>
+        <w:rPr>
+          <w:b/>
+          <w:bCs/>
+        </w:rPr>
+        <w:t>Error! Bookmark not defined.</w:t>
       </w:r>
       <w:r>
         <w:fldChar w:fldCharType="end"/>
@@ -8646,14 +9380,27 @@
       <w:r>
         <w:t xml:space="preserve">Figure </w:t>
       </w:r>
-      <w:fldSimple w:instr=" SEQ Figure \* ARABIC ">
-        <w:r>
-          <w:rPr>
-            <w:noProof/>
-          </w:rPr>
-          <w:t>13</w:t>
-        </w:r>
-      </w:fldSimple>
+      <w:r>
+        <w:fldChar w:fldCharType="begin"/>
+      </w:r>
+      <w:r>
+        <w:instrText xml:space="preserve"> SEQ Figure \* ARABIC </w:instrText>
+      </w:r>
+      <w:r>
+        <w:fldChar w:fldCharType="separate"/>
+      </w:r>
+      <w:r>
+        <w:rPr>
+          <w:noProof/>
+        </w:rPr>
+        <w:t>13</w:t>
+      </w:r>
+      <w:r>
+        <w:rPr>
+          <w:noProof/>
+        </w:rPr>
+        <w:fldChar w:fldCharType="end"/>
+      </w:r>
       <w:r>
         <w:t xml:space="preserve">: </w:t>
       </w:r>
@@ -8674,6 +9421,16 @@
       </w:r>
       <w:r>
         <w:instrText xml:space="preserve">" </w:instrText>
+      </w:r>
+      <w:r>
+        <w:fldChar w:fldCharType="separate"/>
+      </w:r>
+      <w:r>
+        <w:rPr>
+          <w:b/>
+          <w:bCs/>
+        </w:rPr>
+        <w:t>Error! Bookmark not defined.</w:t>
       </w:r>
       <w:r>
         <w:fldChar w:fldCharType="end"/>
@@ -8946,14 +9703,27 @@
       <w:r>
         <w:t xml:space="preserve">Figure </w:t>
       </w:r>
-      <w:fldSimple w:instr=" SEQ Figure \* ARABIC ">
-        <w:r>
-          <w:rPr>
-            <w:noProof/>
-          </w:rPr>
-          <w:t>14</w:t>
-        </w:r>
-      </w:fldSimple>
+      <w:r>
+        <w:fldChar w:fldCharType="begin"/>
+      </w:r>
+      <w:r>
+        <w:instrText xml:space="preserve"> SEQ Figure \* ARABIC </w:instrText>
+      </w:r>
+      <w:r>
+        <w:fldChar w:fldCharType="separate"/>
+      </w:r>
+      <w:r>
+        <w:rPr>
+          <w:noProof/>
+        </w:rPr>
+        <w:t>14</w:t>
+      </w:r>
+      <w:r>
+        <w:rPr>
+          <w:noProof/>
+        </w:rPr>
+        <w:fldChar w:fldCharType="end"/>
+      </w:r>
       <w:r>
         <w:t>: Tournament Search Forms</w:t>
       </w:r>
@@ -9035,6 +9805,16 @@
       </w:r>
       <w:r>
         <w:instrText xml:space="preserve">" </w:instrText>
+      </w:r>
+      <w:r>
+        <w:fldChar w:fldCharType="separate"/>
+      </w:r>
+      <w:r>
+        <w:rPr>
+          <w:b/>
+          <w:bCs/>
+        </w:rPr>
+        <w:t>Error! Bookmark not defined.</w:t>
       </w:r>
       <w:r>
         <w:fldChar w:fldCharType="end"/>
@@ -9103,6 +9883,16 @@
         <w:instrText xml:space="preserve">" </w:instrText>
       </w:r>
       <w:r>
+        <w:fldChar w:fldCharType="separate"/>
+      </w:r>
+      <w:r>
+        <w:rPr>
+          <w:b/>
+          <w:bCs/>
+        </w:rPr>
+        <w:t>Error! Bookmark not defined.</w:t>
+      </w:r>
+      <w:r>
         <w:fldChar w:fldCharType="end"/>
       </w:r>
       <w:r>
@@ -9140,6 +9930,16 @@
         <w:instrText xml:space="preserve">" </w:instrText>
       </w:r>
       <w:r>
+        <w:fldChar w:fldCharType="separate"/>
+      </w:r>
+      <w:r>
+        <w:rPr>
+          <w:b/>
+          <w:bCs/>
+        </w:rPr>
+        <w:t>Error! Bookmark not defined.</w:t>
+      </w:r>
+      <w:r>
         <w:fldChar w:fldCharType="end"/>
       </w:r>
     </w:p>
@@ -9162,6 +9962,16 @@
       </w:r>
       <w:r>
         <w:instrText xml:space="preserve">" </w:instrText>
+      </w:r>
+      <w:r>
+        <w:fldChar w:fldCharType="separate"/>
+      </w:r>
+      <w:r>
+        <w:rPr>
+          <w:b/>
+          <w:bCs/>
+        </w:rPr>
+        <w:t>Error! Bookmark not defined.</w:t>
       </w:r>
       <w:r>
         <w:fldChar w:fldCharType="end"/>
@@ -9301,14 +10111,27 @@
       <w:r>
         <w:t xml:space="preserve">Figure </w:t>
       </w:r>
-      <w:fldSimple w:instr=" SEQ Figure \* ARABIC ">
-        <w:r>
-          <w:rPr>
-            <w:noProof/>
-          </w:rPr>
-          <w:t>15</w:t>
-        </w:r>
-      </w:fldSimple>
+      <w:r>
+        <w:fldChar w:fldCharType="begin"/>
+      </w:r>
+      <w:r>
+        <w:instrText xml:space="preserve"> SEQ Figure \* ARABIC </w:instrText>
+      </w:r>
+      <w:r>
+        <w:fldChar w:fldCharType="separate"/>
+      </w:r>
+      <w:r>
+        <w:rPr>
+          <w:noProof/>
+        </w:rPr>
+        <w:t>15</w:t>
+      </w:r>
+      <w:r>
+        <w:rPr>
+          <w:noProof/>
+        </w:rPr>
+        <w:fldChar w:fldCharType="end"/>
+      </w:r>
       <w:r>
         <w:t>: Tournaments</w:t>
       </w:r>
@@ -9325,6 +10148,16 @@
         <w:instrText xml:space="preserve">" </w:instrText>
       </w:r>
       <w:r>
+        <w:fldChar w:fldCharType="separate"/>
+      </w:r>
+      <w:r>
+        <w:rPr>
+          <w:b/>
+          <w:bCs/>
+        </w:rPr>
+        <w:t>Error! Bookmark not defined.</w:t>
+      </w:r>
+      <w:r>
         <w:fldChar w:fldCharType="end"/>
       </w:r>
       <w:r>
@@ -9414,6 +10247,16 @@
       </w:r>
       <w:r>
         <w:instrText xml:space="preserve">" </w:instrText>
+      </w:r>
+      <w:r>
+        <w:fldChar w:fldCharType="separate"/>
+      </w:r>
+      <w:r>
+        <w:rPr>
+          <w:b/>
+          <w:bCs/>
+        </w:rPr>
+        <w:t>Error! Bookmark not defined.</w:t>
       </w:r>
       <w:r>
         <w:fldChar w:fldCharType="end"/>
@@ -9504,14 +10347,27 @@
       <w:r>
         <w:t xml:space="preserve">Figure </w:t>
       </w:r>
-      <w:fldSimple w:instr=" SEQ Figure \* ARABIC ">
-        <w:r>
-          <w:rPr>
-            <w:noProof/>
-          </w:rPr>
-          <w:t>16</w:t>
-        </w:r>
-      </w:fldSimple>
+      <w:r>
+        <w:fldChar w:fldCharType="begin"/>
+      </w:r>
+      <w:r>
+        <w:instrText xml:space="preserve"> SEQ Figure \* ARABIC </w:instrText>
+      </w:r>
+      <w:r>
+        <w:fldChar w:fldCharType="separate"/>
+      </w:r>
+      <w:r>
+        <w:rPr>
+          <w:noProof/>
+        </w:rPr>
+        <w:t>16</w:t>
+      </w:r>
+      <w:r>
+        <w:rPr>
+          <w:noProof/>
+        </w:rPr>
+        <w:fldChar w:fldCharType="end"/>
+      </w:r>
       <w:r>
         <w:t xml:space="preserve"> Member Scores</w:t>
       </w:r>
@@ -9528,6 +10384,16 @@
         <w:instrText xml:space="preserve">" </w:instrText>
       </w:r>
       <w:r>
+        <w:fldChar w:fldCharType="separate"/>
+      </w:r>
+      <w:r>
+        <w:rPr>
+          <w:b/>
+          <w:bCs/>
+        </w:rPr>
+        <w:t>Error! Bookmark not defined.</w:t>
+      </w:r>
+      <w:r>
         <w:fldChar w:fldCharType="end"/>
       </w:r>
       <w:r>
@@ -9543,6 +10409,16 @@
         <w:instrText xml:space="preserve">" </w:instrText>
       </w:r>
       <w:r>
+        <w:fldChar w:fldCharType="separate"/>
+      </w:r>
+      <w:r>
+        <w:rPr>
+          <w:b/>
+          <w:bCs/>
+        </w:rPr>
+        <w:t>Error! Bookmark not defined.</w:t>
+      </w:r>
+      <w:r>
         <w:fldChar w:fldCharType="end"/>
       </w:r>
       <w:r>
@@ -9576,6 +10452,16 @@
         <w:instrText xml:space="preserve">" </w:instrText>
       </w:r>
       <w:r>
+        <w:fldChar w:fldCharType="separate"/>
+      </w:r>
+      <w:r>
+        <w:rPr>
+          <w:b/>
+          <w:bCs/>
+        </w:rPr>
+        <w:t>Error! Bookmark not defined.</w:t>
+      </w:r>
+      <w:r>
         <w:fldChar w:fldCharType="end"/>
       </w:r>
       <w:r>
@@ -9589,6 +10475,16 @@
       </w:r>
       <w:r>
         <w:instrText xml:space="preserve">" </w:instrText>
+      </w:r>
+      <w:r>
+        <w:fldChar w:fldCharType="separate"/>
+      </w:r>
+      <w:r>
+        <w:rPr>
+          <w:b/>
+          <w:bCs/>
+        </w:rPr>
+        <w:t>Error! Bookmark not defined.</w:t>
       </w:r>
       <w:r>
         <w:fldChar w:fldCharType="end"/>
@@ -9748,14 +10644,27 @@
       <w:r>
         <w:t xml:space="preserve">Figure </w:t>
       </w:r>
-      <w:fldSimple w:instr=" SEQ Figure \* ARABIC ">
-        <w:r>
-          <w:rPr>
-            <w:noProof/>
-          </w:rPr>
-          <w:t>17</w:t>
-        </w:r>
-      </w:fldSimple>
+      <w:r>
+        <w:fldChar w:fldCharType="begin"/>
+      </w:r>
+      <w:r>
+        <w:instrText xml:space="preserve"> SEQ Figure \* ARABIC </w:instrText>
+      </w:r>
+      <w:r>
+        <w:fldChar w:fldCharType="separate"/>
+      </w:r>
+      <w:r>
+        <w:rPr>
+          <w:noProof/>
+        </w:rPr>
+        <w:t>17</w:t>
+      </w:r>
+      <w:r>
+        <w:rPr>
+          <w:noProof/>
+        </w:rPr>
+        <w:fldChar w:fldCharType="end"/>
+      </w:r>
       <w:r>
         <w:t xml:space="preserve"> Tournament Results</w:t>
       </w:r>
@@ -9770,6 +10679,16 @@
       </w:r>
       <w:r>
         <w:instrText xml:space="preserve">" </w:instrText>
+      </w:r>
+      <w:r>
+        <w:fldChar w:fldCharType="separate"/>
+      </w:r>
+      <w:r>
+        <w:rPr>
+          <w:b/>
+          <w:bCs/>
+        </w:rPr>
+        <w:t>Error! Bookmark not defined.</w:t>
       </w:r>
       <w:r>
         <w:fldChar w:fldCharType="end"/>
@@ -9901,7 +10820,16 @@
         <w:keepNext/>
       </w:pPr>
       <w:r>
-        <w:t>After a tournament is completed, it needs to be reviewed and finalized by the director of the tournament. To begin this process click the Finalize Tournament button located underneath the Reports section on the Member Scores screen. Once the Finalize Tournament window is open, it is up to the director to review each player’s score before finalizing the tournament.</w:t>
+        <w:t>After all of the recaps for the tournament are entered into the Member Scores tab, they need</w:t>
+      </w:r>
+      <w:r>
+        <w:t xml:space="preserve"> to be reviewed and finalized by the director of the tournament. To begin this process click the Finalize Tournament button located underneath the Reports section on the Member Scores screen. Once the Finalize Tournament window is open, it is up to the director to rev</w:t>
+      </w:r>
+      <w:r>
+        <w:t>iew each player’s recap</w:t>
+      </w:r>
+      <w:r>
+        <w:t xml:space="preserve"> before finalizing the tournament.</w:t>
       </w:r>
     </w:p>
     <w:p>
@@ -9987,16 +10915,28 @@
         <w:pStyle w:val="BodyText"/>
       </w:pPr>
       <w:r>
-        <w:t>The data in the table can also be easily organized. Double click</w:t>
+        <w:t>The data in the table can a</w:t>
+      </w:r>
+      <w:r>
+        <w:t xml:space="preserve">lso be </w:t>
+      </w:r>
+      <w:r>
+        <w:t>organized. C</w:t>
+      </w:r>
+      <w:r>
+        <w:t>lick</w:t>
       </w:r>
       <w:r>
         <w:t>ing one of the columns such as N</w:t>
       </w:r>
       <w:r>
-        <w:t>ame, or Scratch Total will reorder the data by descending and do</w:t>
-      </w:r>
-      <w:r>
-        <w:t>uble clicking once more will re</w:t>
+        <w:t>ame, or Scratch Total will reord</w:t>
+      </w:r>
+      <w:r>
+        <w:t>er the data by descending and</w:t>
+      </w:r>
+      <w:r>
+        <w:t xml:space="preserve"> clicking once more will re</w:t>
       </w:r>
       <w:r>
         <w:t>or</w:t>
@@ -10009,6 +10949,57 @@
       </w:r>
       <w:r>
         <w:t>ordered.</w:t>
+      </w:r>
+      <w:r>
+        <w:t xml:space="preserve"> In addition to this, any cell or combination of cells that are highl</w:t>
+      </w:r>
+      <w:r>
+        <w:t xml:space="preserve">ighted can be copied </w:t>
+      </w:r>
+      <w:bookmarkStart w:id="40" w:name="_GoBack"/>
+      <w:bookmarkEnd w:id="40"/>
+      <w:r>
+        <w:t>by pressing the ctrl and c buttons on the keyboard while cells are highlighted.</w:t>
+      </w:r>
+      <w:r>
+        <w:t xml:space="preserve"> Checkboxes such as Valid Score, or Director Check will be pasted in text as True or False.</w:t>
+      </w:r>
+    </w:p>
+    <w:p>
+      <w:pPr>
+        <w:pStyle w:val="Heading2"/>
+      </w:pPr>
+      <w:r>
+        <w:t>Finalizing a tournament</w:t>
+      </w:r>
+    </w:p>
+    <w:p>
+      <w:pPr>
+        <w:pStyle w:val="BodyText"/>
+      </w:pPr>
+      <w:r>
+        <w:t>In order for the tournament to be finalized a</w:t>
+      </w:r>
+      <w:r>
+        <w:t>ll the director needs to do is check every one of the Director Check boxes to confirm that they’</w:t>
+      </w:r>
+      <w:r>
+        <w:t>ve inspected that player’s recap</w:t>
+      </w:r>
+      <w:r>
+        <w:t>. This means modifying scores, averages, adding a bonus or a pro pot, and adding any notes that may be needed for a particular player.</w:t>
+      </w:r>
+      <w:r>
+        <w:t xml:space="preserve"> After all of this is done, the director checks off the Director Check box for that player. </w:t>
+      </w:r>
+      <w:r>
+        <w:t>Once all of the boxes are checked, the tournament can be finalized by clicking the Finalize button at the bottom of the form. If it so happens that the director fails to check a player’s box, upon attempting to f</w:t>
+      </w:r>
+      <w:r>
+        <w:t>inalize the tournament that box</w:t>
+      </w:r>
+      <w:r>
+        <w:t xml:space="preserve"> will be highlighted in red.</w:t>
       </w:r>
     </w:p>
     <w:p>
@@ -10053,14 +11044,27 @@
       <w:r>
         <w:t xml:space="preserve">Figure </w:t>
       </w:r>
-      <w:fldSimple w:instr=" SEQ Figure \* ARABIC ">
-        <w:r>
-          <w:rPr>
-            <w:noProof/>
-          </w:rPr>
-          <w:t>18</w:t>
-        </w:r>
-      </w:fldSimple>
+      <w:r>
+        <w:fldChar w:fldCharType="begin"/>
+      </w:r>
+      <w:r>
+        <w:instrText xml:space="preserve"> SEQ Figure \* ARABIC </w:instrText>
+      </w:r>
+      <w:r>
+        <w:fldChar w:fldCharType="separate"/>
+      </w:r>
+      <w:r>
+        <w:rPr>
+          <w:noProof/>
+        </w:rPr>
+        <w:t>18</w:t>
+      </w:r>
+      <w:r>
+        <w:rPr>
+          <w:noProof/>
+        </w:rPr>
+        <w:fldChar w:fldCharType="end"/>
+      </w:r>
       <w:r>
         <w:t xml:space="preserve"> Finalize Tournament</w:t>
       </w:r>
@@ -10075,6 +11079,16 @@
       </w:r>
       <w:r>
         <w:instrText xml:space="preserve">" </w:instrText>
+      </w:r>
+      <w:r>
+        <w:fldChar w:fldCharType="separate"/>
+      </w:r>
+      <w:r>
+        <w:rPr>
+          <w:b/>
+          <w:bCs/>
+        </w:rPr>
+        <w:t>Error! Bookmark not defined.</w:t>
       </w:r>
       <w:r>
         <w:fldChar w:fldCharType="end"/>
@@ -10454,12 +11468,12 @@
       <w:pPr>
         <w:pStyle w:val="Heading1"/>
       </w:pPr>
-      <w:bookmarkStart w:id="40" w:name="_Toc509165867"/>
+      <w:bookmarkStart w:id="41" w:name="_Toc509165867"/>
       <w:r>
         <w:lastRenderedPageBreak/>
         <w:t>Tools</w:t>
       </w:r>
-      <w:bookmarkEnd w:id="40"/>
+      <w:bookmarkEnd w:id="41"/>
       <w:r>
         <w:fldChar w:fldCharType="begin"/>
       </w:r>
@@ -10563,14 +11577,27 @@
       <w:r>
         <w:t xml:space="preserve">Figure </w:t>
       </w:r>
-      <w:fldSimple w:instr=" SEQ Figure \* ARABIC ">
-        <w:r>
-          <w:rPr>
-            <w:noProof/>
-          </w:rPr>
-          <w:t>19</w:t>
-        </w:r>
-      </w:fldSimple>
+      <w:r>
+        <w:fldChar w:fldCharType="begin"/>
+      </w:r>
+      <w:r>
+        <w:instrText xml:space="preserve"> SEQ Figure \* ARABIC </w:instrText>
+      </w:r>
+      <w:r>
+        <w:fldChar w:fldCharType="separate"/>
+      </w:r>
+      <w:r>
+        <w:rPr>
+          <w:noProof/>
+        </w:rPr>
+        <w:t>19</w:t>
+      </w:r>
+      <w:r>
+        <w:rPr>
+          <w:noProof/>
+        </w:rPr>
+        <w:fldChar w:fldCharType="end"/>
+      </w:r>
       <w:r>
         <w:t>: Update Inactive status</w:t>
       </w:r>
@@ -10657,7 +11684,7 @@
       <w:pPr>
         <w:pStyle w:val="Heading1"/>
       </w:pPr>
-      <w:bookmarkStart w:id="41" w:name="_Toc509165868"/>
+      <w:bookmarkStart w:id="42" w:name="_Toc509165868"/>
       <w:r>
         <w:lastRenderedPageBreak/>
         <w:t>Troubles</w:t>
@@ -10683,7 +11710,7 @@
       <w:r>
         <w:t xml:space="preserve"> 9-Tap</w:t>
       </w:r>
-      <w:bookmarkEnd w:id="41"/>
+      <w:bookmarkEnd w:id="42"/>
     </w:p>
     <w:p>
       <w:pPr>
@@ -10693,7 +11720,7 @@
           <w:szCs w:val="24"/>
         </w:rPr>
       </w:pPr>
-      <w:bookmarkStart w:id="42" w:name="_Toc509165869"/>
+      <w:bookmarkStart w:id="43" w:name="_Toc509165869"/>
       <w:r>
         <w:rPr>
           <w:sz w:val="24"/>
@@ -10715,7 +11742,7 @@
         </w:rPr>
         <w:t>:</w:t>
       </w:r>
-      <w:bookmarkEnd w:id="42"/>
+      <w:bookmarkEnd w:id="43"/>
     </w:p>
     <w:p>
       <w:pPr>
@@ -10795,14 +11822,14 @@
       <w:pPr>
         <w:pStyle w:val="Heading2"/>
       </w:pPr>
-      <w:bookmarkStart w:id="43" w:name="_Toc509165870"/>
+      <w:bookmarkStart w:id="44" w:name="_Toc509165870"/>
       <w:r>
         <w:t>Screen “splitting”</w:t>
       </w:r>
       <w:r>
         <w:t xml:space="preserve"> on resize</w:t>
       </w:r>
-      <w:bookmarkEnd w:id="43"/>
+      <w:bookmarkEnd w:id="44"/>
     </w:p>
     <w:p>
       <w:pPr>
@@ -10879,14 +11906,27 @@
       <w:r>
         <w:t xml:space="preserve">Figure </w:t>
       </w:r>
-      <w:fldSimple w:instr=" SEQ Figure \* ARABIC ">
-        <w:r>
-          <w:rPr>
-            <w:noProof/>
-          </w:rPr>
-          <w:t>20</w:t>
-        </w:r>
-      </w:fldSimple>
+      <w:r>
+        <w:fldChar w:fldCharType="begin"/>
+      </w:r>
+      <w:r>
+        <w:instrText xml:space="preserve"> SEQ Figure \* ARABIC </w:instrText>
+      </w:r>
+      <w:r>
+        <w:fldChar w:fldCharType="separate"/>
+      </w:r>
+      <w:r>
+        <w:rPr>
+          <w:noProof/>
+        </w:rPr>
+        <w:t>20</w:t>
+      </w:r>
+      <w:r>
+        <w:rPr>
+          <w:noProof/>
+        </w:rPr>
+        <w:fldChar w:fldCharType="end"/>
+      </w:r>
       <w:r>
         <w:t xml:space="preserve"> Showing split screen error</w:t>
       </w:r>
@@ -10908,7 +11948,7 @@
         <mc:AlternateContent>
           <mc:Choice Requires="wps">
             <w:drawing>
-              <wp:anchor distT="0" distB="0" distL="114300" distR="114300" simplePos="0" relativeHeight="251712512" behindDoc="0" locked="0" layoutInCell="1" allowOverlap="1" wp14:anchorId="2EB0F7D5" wp14:editId="56206372">
+              <wp:anchor distT="0" distB="0" distL="114300" distR="114300" simplePos="0" relativeHeight="251659264" behindDoc="0" locked="0" layoutInCell="1" allowOverlap="1" wp14:anchorId="2EB0F7D5" wp14:editId="56206372">
                 <wp:simplePos x="0" y="0"/>
                 <wp:positionH relativeFrom="column">
                   <wp:posOffset>3175</wp:posOffset>
@@ -10954,14 +11994,27 @@
                             <w:r>
                               <w:t xml:space="preserve">Figure </w:t>
                             </w:r>
-                            <w:fldSimple w:instr=" SEQ Figure \* ARABIC ">
-                              <w:r>
-                                <w:rPr>
-                                  <w:noProof/>
-                                </w:rPr>
-                                <w:t>21</w:t>
-                              </w:r>
-                            </w:fldSimple>
+                            <w:r>
+                              <w:fldChar w:fldCharType="begin"/>
+                            </w:r>
+                            <w:r>
+                              <w:instrText xml:space="preserve"> SEQ Figure \* ARABIC </w:instrText>
+                            </w:r>
+                            <w:r>
+                              <w:fldChar w:fldCharType="separate"/>
+                            </w:r>
+                            <w:r>
+                              <w:rPr>
+                                <w:noProof/>
+                              </w:rPr>
+                              <w:t>21</w:t>
+                            </w:r>
+                            <w:r>
+                              <w:rPr>
+                                <w:noProof/>
+                              </w:rPr>
+                              <w:fldChar w:fldCharType="end"/>
+                            </w:r>
                             <w:r>
                               <w:t xml:space="preserve"> Inner screen maximize</w:t>
                             </w:r>
@@ -10989,7 +12042,7 @@
                 <v:stroke joinstyle="miter"/>
                 <v:path gradientshapeok="t" o:connecttype="rect"/>
               </v:shapetype>
-              <v:shape id="Text Box 24" o:spid="_x0000_s1026" type="#_x0000_t202" style="position:absolute;left:0;text-align:left;margin-left:.25pt;margin-top:98.8pt;width:154.5pt;height:13.5pt;z-index:251712512;visibility:visible;mso-wrap-style:square;mso-height-percent:0;mso-wrap-distance-left:9pt;mso-wrap-distance-top:0;mso-wrap-distance-right:9pt;mso-wrap-distance-bottom:0;mso-position-horizontal:absolute;mso-position-horizontal-relative:text;mso-position-vertical:absolute;mso-position-vertical-relative:text;mso-height-percent:0;mso-height-relative:margin;v-text-anchor:top" o:gfxdata="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" stroked="f">
+              <v:shape id="Text Box 24" o:spid="_x0000_s1026" type="#_x0000_t202" style="position:absolute;left:0;text-align:left;margin-left:.25pt;margin-top:98.8pt;width:154.5pt;height:13.5pt;z-index:251659264;visibility:visible;mso-wrap-style:square;mso-height-percent:0;mso-wrap-distance-left:9pt;mso-wrap-distance-top:0;mso-wrap-distance-right:9pt;mso-wrap-distance-bottom:0;mso-position-horizontal:absolute;mso-position-horizontal-relative:text;mso-position-vertical:absolute;mso-position-vertical-relative:text;mso-height-percent:0;mso-height-relative:margin;v-text-anchor:top" o:gfxdata="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" stroked="f">
                 <v:textbox inset="0,0,0,0">
                   <w:txbxContent>
                     <w:p>
@@ -11003,14 +12056,27 @@
                       <w:r>
                         <w:t xml:space="preserve">Figure </w:t>
                       </w:r>
-                      <w:fldSimple w:instr=" SEQ Figure \* ARABIC ">
-                        <w:r>
-                          <w:rPr>
-                            <w:noProof/>
-                          </w:rPr>
-                          <w:t>21</w:t>
-                        </w:r>
-                      </w:fldSimple>
+                      <w:r>
+                        <w:fldChar w:fldCharType="begin"/>
+                      </w:r>
+                      <w:r>
+                        <w:instrText xml:space="preserve"> SEQ Figure \* ARABIC </w:instrText>
+                      </w:r>
+                      <w:r>
+                        <w:fldChar w:fldCharType="separate"/>
+                      </w:r>
+                      <w:r>
+                        <w:rPr>
+                          <w:noProof/>
+                        </w:rPr>
+                        <w:t>21</w:t>
+                      </w:r>
+                      <w:r>
+                        <w:rPr>
+                          <w:noProof/>
+                        </w:rPr>
+                        <w:fldChar w:fldCharType="end"/>
+                      </w:r>
                       <w:r>
                         <w:t xml:space="preserve"> Inner screen maximize</w:t>
                       </w:r>
@@ -11028,7 +12094,7 @@
           <w:noProof/>
         </w:rPr>
         <w:drawing>
-          <wp:anchor distT="0" distB="0" distL="114300" distR="114300" simplePos="0" relativeHeight="251656192" behindDoc="0" locked="0" layoutInCell="1" allowOverlap="1">
+          <wp:anchor distT="0" distB="0" distL="114300" distR="114300" simplePos="0" relativeHeight="251657216" behindDoc="0" locked="0" layoutInCell="1" allowOverlap="1">
             <wp:simplePos x="0" y="0"/>
             <wp:positionH relativeFrom="column">
               <wp:posOffset>3175</wp:posOffset>
@@ -11108,7 +12174,7 @@
           <w:szCs w:val="24"/>
         </w:rPr>
       </w:pPr>
-      <w:bookmarkStart w:id="44" w:name="_Toc509165871"/>
+      <w:bookmarkStart w:id="45" w:name="_Toc509165871"/>
       <w:r>
         <w:rPr>
           <w:sz w:val="24"/>
@@ -11117,7 +12183,7 @@
         <w:lastRenderedPageBreak/>
         <w:t>ReadMe File</w:t>
       </w:r>
-      <w:bookmarkEnd w:id="44"/>
+      <w:bookmarkEnd w:id="45"/>
       <w:r>
         <w:rPr>
           <w:sz w:val="24"/>
@@ -11236,7 +12302,7 @@
       <w:pPr>
         <w:pStyle w:val="Heading1"/>
       </w:pPr>
-      <w:bookmarkStart w:id="45" w:name="_Toc509165872"/>
+      <w:bookmarkStart w:id="46" w:name="_Toc509165872"/>
       <w:r>
         <w:lastRenderedPageBreak/>
         <w:t>Conver</w:t>
@@ -11244,7 +12310,7 @@
       <w:r>
         <w:t>sion Program</w:t>
       </w:r>
-      <w:bookmarkEnd w:id="45"/>
+      <w:bookmarkEnd w:id="46"/>
       <w:r>
         <w:fldChar w:fldCharType="begin"/>
       </w:r>
@@ -11357,12 +12423,12 @@
       <w:pPr>
         <w:pStyle w:val="Heading1"/>
       </w:pPr>
-      <w:bookmarkStart w:id="46" w:name="_Toc509165873"/>
+      <w:bookmarkStart w:id="47" w:name="_Toc509165873"/>
       <w:r>
         <w:lastRenderedPageBreak/>
         <w:t>General Information</w:t>
       </w:r>
-      <w:bookmarkEnd w:id="46"/>
+      <w:bookmarkEnd w:id="47"/>
       <w:r>
         <w:fldChar w:fldCharType="begin"/>
       </w:r>
@@ -11398,7 +12464,7 @@
           <w:szCs w:val="22"/>
         </w:rPr>
       </w:pPr>
-      <w:bookmarkStart w:id="47" w:name="_Toc509165874"/>
+      <w:bookmarkStart w:id="48" w:name="_Toc509165874"/>
       <w:r>
         <w:rPr>
           <w:sz w:val="22"/>
@@ -11407,7 +12473,7 @@
         <w:lastRenderedPageBreak/>
         <w:t>Main Menu</w:t>
       </w:r>
-      <w:bookmarkEnd w:id="47"/>
+      <w:bookmarkEnd w:id="48"/>
       <w:r>
         <w:rPr>
           <w:sz w:val="22"/>
@@ -11907,11 +12973,11 @@
       <w:pPr>
         <w:pStyle w:val="Heading2"/>
       </w:pPr>
-      <w:bookmarkStart w:id="48" w:name="_Toc509165875"/>
+      <w:bookmarkStart w:id="49" w:name="_Toc509165875"/>
       <w:r>
         <w:t>Member Info</w:t>
       </w:r>
-      <w:bookmarkEnd w:id="48"/>
+      <w:bookmarkEnd w:id="49"/>
       <w:r>
         <w:fldChar w:fldCharType="begin"/>
       </w:r>
@@ -12761,6 +13827,16 @@
         <w:instrText xml:space="preserve">" </w:instrText>
       </w:r>
       <w:r>
+        <w:fldChar w:fldCharType="separate"/>
+      </w:r>
+      <w:r>
+        <w:rPr>
+          <w:b/>
+          <w:bCs/>
+        </w:rPr>
+        <w:t>Error! Bookmark not defined.</w:t>
+      </w:r>
+      <w:r>
         <w:fldChar w:fldCharType="end"/>
       </w:r>
       <w:r>
@@ -12827,6 +13903,16 @@
         <w:instrText xml:space="preserve">" </w:instrText>
       </w:r>
       <w:r>
+        <w:fldChar w:fldCharType="separate"/>
+      </w:r>
+      <w:r>
+        <w:rPr>
+          <w:b/>
+          <w:bCs/>
+        </w:rPr>
+        <w:t>Error! Bookmark not defined.</w:t>
+      </w:r>
+      <w:r>
         <w:fldChar w:fldCharType="end"/>
       </w:r>
       <w:r>
@@ -12878,6 +13964,16 @@
         <w:instrText xml:space="preserve">" </w:instrText>
       </w:r>
       <w:r>
+        <w:fldChar w:fldCharType="separate"/>
+      </w:r>
+      <w:r>
+        <w:rPr>
+          <w:b/>
+          <w:bCs/>
+        </w:rPr>
+        <w:t>Error! Bookmark not defined.</w:t>
+      </w:r>
+      <w:r>
         <w:fldChar w:fldCharType="end"/>
       </w:r>
       <w:r>
@@ -12966,11 +14062,11 @@
       <w:pPr>
         <w:pStyle w:val="Heading2"/>
       </w:pPr>
-      <w:bookmarkStart w:id="49" w:name="_Toc509165876"/>
+      <w:bookmarkStart w:id="50" w:name="_Toc509165876"/>
       <w:r>
         <w:t>Member Scores</w:t>
       </w:r>
-      <w:bookmarkEnd w:id="49"/>
+      <w:bookmarkEnd w:id="50"/>
       <w:r>
         <w:fldChar w:fldCharType="begin"/>
       </w:r>
@@ -13020,6 +14116,16 @@
       </w:r>
       <w:r>
         <w:instrText xml:space="preserve">" </w:instrText>
+      </w:r>
+      <w:r>
+        <w:fldChar w:fldCharType="separate"/>
+      </w:r>
+      <w:r>
+        <w:rPr>
+          <w:b/>
+          <w:bCs/>
+        </w:rPr>
+        <w:t>Error! Bookmark not defined.</w:t>
       </w:r>
       <w:r>
         <w:fldChar w:fldCharType="end"/>
@@ -13073,6 +14179,16 @@
         <w:instrText xml:space="preserve">" </w:instrText>
       </w:r>
       <w:r>
+        <w:fldChar w:fldCharType="separate"/>
+      </w:r>
+      <w:r>
+        <w:rPr>
+          <w:b/>
+          <w:bCs/>
+        </w:rPr>
+        <w:t>Error! Bookmark not defined.</w:t>
+      </w:r>
+      <w:r>
         <w:fldChar w:fldCharType="end"/>
       </w:r>
       <w:r>
@@ -13106,6 +14222,16 @@
         <w:instrText xml:space="preserve">" </w:instrText>
       </w:r>
       <w:r>
+        <w:fldChar w:fldCharType="separate"/>
+      </w:r>
+      <w:r>
+        <w:rPr>
+          <w:b/>
+          <w:bCs/>
+        </w:rPr>
+        <w:t>Error! Bookmark not defined.</w:t>
+      </w:r>
+      <w:r>
         <w:fldChar w:fldCharType="end"/>
       </w:r>
       <w:r>
@@ -13136,6 +14262,16 @@
         <w:instrText xml:space="preserve">" </w:instrText>
       </w:r>
       <w:r>
+        <w:fldChar w:fldCharType="separate"/>
+      </w:r>
+      <w:r>
+        <w:rPr>
+          <w:b/>
+          <w:bCs/>
+        </w:rPr>
+        <w:t>Error! Bookmark not defined.</w:t>
+      </w:r>
+      <w:r>
         <w:fldChar w:fldCharType="end"/>
       </w:r>
       <w:r>
@@ -13151,6 +14287,7 @@
         </w:numPr>
       </w:pPr>
       <w:r>
+        <w:lastRenderedPageBreak/>
         <w:t>Middle Initial</w:t>
       </w:r>
       <w:r>
@@ -13164,6 +14301,16 @@
       </w:r>
       <w:r>
         <w:instrText xml:space="preserve">" </w:instrText>
+      </w:r>
+      <w:r>
+        <w:fldChar w:fldCharType="separate"/>
+      </w:r>
+      <w:r>
+        <w:rPr>
+          <w:b/>
+          <w:bCs/>
+        </w:rPr>
+        <w:t>Error! Bookmark not defined.</w:t>
       </w:r>
       <w:r>
         <w:fldChar w:fldCharType="end"/>
@@ -13181,7 +14328,6 @@
         </w:numPr>
       </w:pPr>
       <w:r>
-        <w:lastRenderedPageBreak/>
         <w:t>Squad Number</w:t>
       </w:r>
       <w:r>
@@ -13210,6 +14356,16 @@
       </w:r>
       <w:r>
         <w:instrText xml:space="preserve">" </w:instrText>
+      </w:r>
+      <w:r>
+        <w:fldChar w:fldCharType="separate"/>
+      </w:r>
+      <w:r>
+        <w:rPr>
+          <w:b/>
+          <w:bCs/>
+        </w:rPr>
+        <w:t>Error! Bookmark not defined.</w:t>
       </w:r>
       <w:r>
         <w:fldChar w:fldCharType="end"/>
@@ -13257,6 +14413,16 @@
         <w:instrText xml:space="preserve">" </w:instrText>
       </w:r>
       <w:r>
+        <w:fldChar w:fldCharType="separate"/>
+      </w:r>
+      <w:r>
+        <w:rPr>
+          <w:b/>
+          <w:bCs/>
+        </w:rPr>
+        <w:t>Error! Bookmark not defined.</w:t>
+      </w:r>
+      <w:r>
         <w:fldChar w:fldCharType="end"/>
       </w:r>
       <w:r>
@@ -13302,6 +14468,16 @@
         <w:instrText xml:space="preserve">" </w:instrText>
       </w:r>
       <w:r>
+        <w:fldChar w:fldCharType="separate"/>
+      </w:r>
+      <w:r>
+        <w:rPr>
+          <w:b/>
+          <w:bCs/>
+        </w:rPr>
+        <w:t>Error! Bookmark not defined.</w:t>
+      </w:r>
+      <w:r>
         <w:fldChar w:fldCharType="end"/>
       </w:r>
       <w:r>
@@ -13332,6 +14508,16 @@
         <w:instrText xml:space="preserve">" </w:instrText>
       </w:r>
       <w:r>
+        <w:fldChar w:fldCharType="separate"/>
+      </w:r>
+      <w:r>
+        <w:rPr>
+          <w:b/>
+          <w:bCs/>
+        </w:rPr>
+        <w:t>Error! Bookmark not defined.</w:t>
+      </w:r>
+      <w:r>
         <w:fldChar w:fldCharType="end"/>
       </w:r>
       <w:r>
@@ -13725,6 +14911,7 @@
         </w:numPr>
       </w:pPr>
       <w:r>
+        <w:lastRenderedPageBreak/>
         <w:t>Add New/Update Record</w:t>
       </w:r>
       <w:r>
@@ -13755,7 +14942,6 @@
         </w:numPr>
       </w:pPr>
       <w:r>
-        <w:lastRenderedPageBreak/>
         <w:t>“&lt;”—this button goes one record back.</w:t>
       </w:r>
     </w:p>
@@ -13816,6 +15002,16 @@
         <w:instrText xml:space="preserve">" </w:instrText>
       </w:r>
       <w:r>
+        <w:fldChar w:fldCharType="separate"/>
+      </w:r>
+      <w:r>
+        <w:rPr>
+          <w:b/>
+          <w:bCs/>
+        </w:rPr>
+        <w:t>Error! Bookmark not defined.</w:t>
+      </w:r>
+      <w:r>
         <w:fldChar w:fldCharType="end"/>
       </w:r>
       <w:r>
@@ -13876,6 +15072,16 @@
         <w:instrText xml:space="preserve">" </w:instrText>
       </w:r>
       <w:r>
+        <w:fldChar w:fldCharType="separate"/>
+      </w:r>
+      <w:r>
+        <w:rPr>
+          <w:b/>
+          <w:bCs/>
+        </w:rPr>
+        <w:t>Error! Bookmark not defined.</w:t>
+      </w:r>
+      <w:r>
         <w:fldChar w:fldCharType="end"/>
       </w:r>
       <w:r>
@@ -14125,6 +15331,16 @@
         <w:instrText xml:space="preserve">" </w:instrText>
       </w:r>
       <w:r>
+        <w:fldChar w:fldCharType="separate"/>
+      </w:r>
+      <w:r>
+        <w:rPr>
+          <w:b/>
+          <w:bCs/>
+        </w:rPr>
+        <w:t>Error! Bookmark not defined.</w:t>
+      </w:r>
+      <w:r>
         <w:fldChar w:fldCharType="end"/>
       </w:r>
       <w:r>
@@ -14209,6 +15425,7 @@
         </w:numPr>
       </w:pPr>
       <w:r>
+        <w:lastRenderedPageBreak/>
         <w:t>Tournament Results</w:t>
       </w:r>
       <w:r>
@@ -14239,7 +15456,6 @@
         </w:numPr>
       </w:pPr>
       <w:r>
-        <w:lastRenderedPageBreak/>
         <w:t>Comments</w:t>
       </w:r>
       <w:r>
@@ -14298,11 +15514,11 @@
       <w:pPr>
         <w:pStyle w:val="Heading2"/>
       </w:pPr>
-      <w:bookmarkStart w:id="50" w:name="_Toc509165877"/>
+      <w:bookmarkStart w:id="51" w:name="_Toc509165877"/>
       <w:r>
         <w:t>Tools</w:t>
       </w:r>
-      <w:bookmarkEnd w:id="50"/>
+      <w:bookmarkEnd w:id="51"/>
       <w:r>
         <w:fldChar w:fldCharType="begin"/>
       </w:r>
@@ -14331,11 +15547,11 @@
       <w:pPr>
         <w:pStyle w:val="Heading2"/>
       </w:pPr>
-      <w:bookmarkStart w:id="51" w:name="_Toc509165878"/>
+      <w:bookmarkStart w:id="52" w:name="_Toc509165878"/>
       <w:r>
         <w:t>About</w:t>
       </w:r>
-      <w:bookmarkEnd w:id="51"/>
+      <w:bookmarkEnd w:id="52"/>
       <w:r>
         <w:fldChar w:fldCharType="begin"/>
       </w:r>
@@ -14385,11 +15601,11 @@
       <w:pPr>
         <w:pStyle w:val="Heading2"/>
       </w:pPr>
-      <w:bookmarkStart w:id="52" w:name="_Toc509165879"/>
+      <w:bookmarkStart w:id="53" w:name="_Toc509165879"/>
       <w:r>
         <w:t>Exit</w:t>
       </w:r>
-      <w:bookmarkEnd w:id="52"/>
+      <w:bookmarkEnd w:id="53"/>
       <w:r>
         <w:fldChar w:fldCharType="begin"/>
       </w:r>
@@ -14449,9 +15665,9 @@
           <w:cols w:space="720"/>
         </w:sectPr>
       </w:pPr>
-      <w:bookmarkStart w:id="53" w:name="_Toc35154388"/>
-      <w:bookmarkStart w:id="54" w:name="_Toc35154911"/>
-      <w:bookmarkStart w:id="55" w:name="_Toc36023011"/>
+      <w:bookmarkStart w:id="54" w:name="_Toc35154388"/>
+      <w:bookmarkStart w:id="55" w:name="_Toc35154911"/>
+      <w:bookmarkStart w:id="56" w:name="_Toc36023011"/>
     </w:p>
     <w:p>
       <w:pPr>
@@ -14466,15 +15682,15 @@
       <w:pPr>
         <w:pStyle w:val="Heading1"/>
       </w:pPr>
-      <w:bookmarkStart w:id="56" w:name="_Toc509165880"/>
+      <w:bookmarkStart w:id="57" w:name="_Toc509165880"/>
       <w:r>
         <w:lastRenderedPageBreak/>
         <w:t>Index</w:t>
       </w:r>
-      <w:bookmarkEnd w:id="53"/>
       <w:bookmarkEnd w:id="54"/>
       <w:bookmarkEnd w:id="55"/>
       <w:bookmarkEnd w:id="56"/>
+      <w:bookmarkEnd w:id="57"/>
     </w:p>
     <w:p>
       <w:pPr>
@@ -15708,8 +16924,6 @@
         </w:rPr>
         <w:t>Handicap</w:t>
       </w:r>
-      <w:bookmarkStart w:id="57" w:name="_GoBack"/>
-      <w:bookmarkEnd w:id="57"/>
     </w:p>
     <w:p>
       <w:pPr>
@@ -15852,7 +17066,7 @@
         <w:rStyle w:val="PageNumber"/>
         <w:noProof/>
       </w:rPr>
-      <w:t>35</w:t>
+      <w:t>33</w:t>
     </w:r>
     <w:r>
       <w:rPr>
@@ -15902,7 +17116,7 @@
         <w:rStyle w:val="PageNumber"/>
         <w:noProof/>
       </w:rPr>
-      <w:t>40</w:t>
+      <w:t>42</w:t>
     </w:r>
     <w:r>
       <w:rPr>
@@ -20046,7 +21260,7 @@
 </file>
 
 <file path=customXml/itemProps1.xml><?xml version="1.0" encoding="utf-8"?>
-<ds:datastoreItem xmlns:ds="http://schemas.openxmlformats.org/officeDocument/2006/customXml" ds:itemID="{0A2C076E-70DD-4FAA-9458-E62E20B28128}">
+<ds:datastoreItem xmlns:ds="http://schemas.openxmlformats.org/officeDocument/2006/customXml" ds:itemID="{4C76EB0D-5A3F-4563-9C32-5CB1C4ABFBCF}">
   <ds:schemaRefs>
     <ds:schemaRef ds:uri="http://schemas.openxmlformats.org/officeDocument/2006/bibliography"/>
   </ds:schemaRefs>

</xml_diff>

<commit_message>
Added documentation for the secondary sub window in Finalize Tournament, and individual images for the elements of the first sub window.
</commit_message>
<xml_diff>
--- a/9tapUserManual.docx
+++ b/9tapUserManual.docx
@@ -2991,7 +2991,7 @@
                 <w:noProof/>
                 <w:webHidden/>
               </w:rPr>
-              <w:t>27</w:t>
+              <w:t>29</w:t>
             </w:r>
             <w:r>
               <w:rPr>
@@ -3062,7 +3062,7 @@
                 <w:noProof/>
                 <w:webHidden/>
               </w:rPr>
-              <w:t>29</w:t>
+              <w:t>31</w:t>
             </w:r>
             <w:r>
               <w:rPr>
@@ -3130,7 +3130,7 @@
                 <w:noProof/>
                 <w:webHidden/>
               </w:rPr>
-              <w:t>29</w:t>
+              <w:t>31</w:t>
             </w:r>
             <w:r>
               <w:rPr>
@@ -3198,7 +3198,7 @@
                 <w:noProof/>
                 <w:webHidden/>
               </w:rPr>
-              <w:t>29</w:t>
+              <w:t>31</w:t>
             </w:r>
             <w:r>
               <w:rPr>
@@ -3266,7 +3266,7 @@
                 <w:noProof/>
                 <w:webHidden/>
               </w:rPr>
-              <w:t>31</w:t>
+              <w:t>33</w:t>
             </w:r>
             <w:r>
               <w:rPr>
@@ -3337,7 +3337,7 @@
                 <w:noProof/>
                 <w:webHidden/>
               </w:rPr>
-              <w:t>33</w:t>
+              <w:t>35</w:t>
             </w:r>
             <w:r>
               <w:rPr>
@@ -3408,7 +3408,7 @@
                 <w:noProof/>
                 <w:webHidden/>
               </w:rPr>
-              <w:t>35</w:t>
+              <w:t>37</w:t>
             </w:r>
             <w:r>
               <w:rPr>
@@ -3476,7 +3476,7 @@
                 <w:noProof/>
                 <w:webHidden/>
               </w:rPr>
-              <w:t>35</w:t>
+              <w:t>37</w:t>
             </w:r>
             <w:r>
               <w:rPr>
@@ -3544,7 +3544,7 @@
                 <w:noProof/>
                 <w:webHidden/>
               </w:rPr>
-              <w:t>35</w:t>
+              <w:t>37</w:t>
             </w:r>
             <w:r>
               <w:rPr>
@@ -3612,7 +3612,7 @@
                 <w:noProof/>
                 <w:webHidden/>
               </w:rPr>
-              <w:t>37</w:t>
+              <w:t>39</w:t>
             </w:r>
             <w:r>
               <w:rPr>
@@ -3680,7 +3680,7 @@
                 <w:noProof/>
                 <w:webHidden/>
               </w:rPr>
-              <w:t>40</w:t>
+              <w:t>42</w:t>
             </w:r>
             <w:r>
               <w:rPr>
@@ -3748,7 +3748,7 @@
                 <w:noProof/>
                 <w:webHidden/>
               </w:rPr>
-              <w:t>40</w:t>
+              <w:t>42</w:t>
             </w:r>
             <w:r>
               <w:rPr>
@@ -3816,7 +3816,7 @@
                 <w:noProof/>
                 <w:webHidden/>
               </w:rPr>
-              <w:t>40</w:t>
+              <w:t>42</w:t>
             </w:r>
             <w:r>
               <w:rPr>
@@ -3884,7 +3884,7 @@
                 <w:noProof/>
                 <w:webHidden/>
               </w:rPr>
-              <w:t>41</w:t>
+              <w:t>43</w:t>
             </w:r>
             <w:r>
               <w:rPr>
@@ -4370,27 +4370,14 @@
       <w:r>
         <w:t xml:space="preserve">Figure </w:t>
       </w:r>
-      <w:r>
-        <w:fldChar w:fldCharType="begin"/>
-      </w:r>
-      <w:r>
-        <w:instrText xml:space="preserve"> SEQ Figure \* ARABIC </w:instrText>
-      </w:r>
-      <w:r>
-        <w:fldChar w:fldCharType="separate"/>
-      </w:r>
-      <w:r>
-        <w:rPr>
-          <w:noProof/>
-        </w:rPr>
-        <w:t>1</w:t>
-      </w:r>
-      <w:r>
-        <w:rPr>
-          <w:noProof/>
-        </w:rPr>
-        <w:fldChar w:fldCharType="end"/>
-      </w:r>
+      <w:fldSimple w:instr=" SEQ Figure \* ARABIC ">
+        <w:r>
+          <w:rPr>
+            <w:noProof/>
+          </w:rPr>
+          <w:t>1</w:t>
+        </w:r>
+      </w:fldSimple>
       <w:r>
         <w:t>: 9-Tap Main Menu</w:t>
       </w:r>
@@ -6270,27 +6257,14 @@
       <w:r>
         <w:t xml:space="preserve">Figure </w:t>
       </w:r>
-      <w:r>
-        <w:fldChar w:fldCharType="begin"/>
-      </w:r>
-      <w:r>
-        <w:instrText xml:space="preserve"> SEQ Figure \* ARABIC </w:instrText>
-      </w:r>
-      <w:r>
-        <w:fldChar w:fldCharType="separate"/>
-      </w:r>
-      <w:r>
-        <w:rPr>
-          <w:noProof/>
-        </w:rPr>
-        <w:t>2</w:t>
-      </w:r>
-      <w:r>
-        <w:rPr>
-          <w:noProof/>
-        </w:rPr>
-        <w:fldChar w:fldCharType="end"/>
-      </w:r>
+      <w:fldSimple w:instr=" SEQ Figure \* ARABIC ">
+        <w:r>
+          <w:rPr>
+            <w:noProof/>
+          </w:rPr>
+          <w:t>2</w:t>
+        </w:r>
+      </w:fldSimple>
       <w:r>
         <w:t>: Main Menu</w:t>
       </w:r>
@@ -6530,27 +6504,14 @@
       <w:r>
         <w:t xml:space="preserve">Figure </w:t>
       </w:r>
-      <w:r>
-        <w:fldChar w:fldCharType="begin"/>
-      </w:r>
-      <w:r>
-        <w:instrText xml:space="preserve"> SEQ Figure \* ARABIC </w:instrText>
-      </w:r>
-      <w:r>
-        <w:fldChar w:fldCharType="separate"/>
-      </w:r>
-      <w:r>
-        <w:rPr>
-          <w:noProof/>
-        </w:rPr>
-        <w:t>3</w:t>
-      </w:r>
-      <w:r>
-        <w:rPr>
-          <w:noProof/>
-        </w:rPr>
-        <w:fldChar w:fldCharType="end"/>
-      </w:r>
+      <w:fldSimple w:instr=" SEQ Figure \* ARABIC ">
+        <w:r>
+          <w:rPr>
+            <w:noProof/>
+          </w:rPr>
+          <w:t>3</w:t>
+        </w:r>
+      </w:fldSimple>
       <w:r>
         <w:t>: Member Information</w:t>
       </w:r>
@@ -7056,27 +7017,14 @@
       <w:r>
         <w:t xml:space="preserve">Figure </w:t>
       </w:r>
-      <w:r>
-        <w:fldChar w:fldCharType="begin"/>
-      </w:r>
-      <w:r>
-        <w:instrText xml:space="preserve"> SEQ Figure \* ARABIC </w:instrText>
-      </w:r>
-      <w:r>
-        <w:fldChar w:fldCharType="separate"/>
-      </w:r>
-      <w:r>
-        <w:rPr>
-          <w:noProof/>
-        </w:rPr>
-        <w:t>4</w:t>
-      </w:r>
-      <w:r>
-        <w:rPr>
-          <w:noProof/>
-        </w:rPr>
-        <w:fldChar w:fldCharType="end"/>
-      </w:r>
+      <w:fldSimple w:instr=" SEQ Figure \* ARABIC ">
+        <w:r>
+          <w:rPr>
+            <w:noProof/>
+          </w:rPr>
+          <w:t>4</w:t>
+        </w:r>
+      </w:fldSimple>
       <w:r>
         <w:t>: Member Information</w:t>
       </w:r>
@@ -7446,27 +7394,14 @@
       <w:r>
         <w:t xml:space="preserve">Figure </w:t>
       </w:r>
-      <w:r>
-        <w:fldChar w:fldCharType="begin"/>
-      </w:r>
-      <w:r>
-        <w:instrText xml:space="preserve"> SEQ Figure \* ARABIC </w:instrText>
-      </w:r>
-      <w:r>
-        <w:fldChar w:fldCharType="separate"/>
-      </w:r>
-      <w:r>
-        <w:rPr>
-          <w:noProof/>
-        </w:rPr>
-        <w:t>5</w:t>
-      </w:r>
-      <w:r>
-        <w:rPr>
-          <w:noProof/>
-        </w:rPr>
-        <w:fldChar w:fldCharType="end"/>
-      </w:r>
+      <w:fldSimple w:instr=" SEQ Figure \* ARABIC ">
+        <w:r>
+          <w:rPr>
+            <w:noProof/>
+          </w:rPr>
+          <w:t>5</w:t>
+        </w:r>
+      </w:fldSimple>
       <w:r>
         <w:t>: Stats</w:t>
       </w:r>
@@ -7771,27 +7706,14 @@
       <w:r>
         <w:t xml:space="preserve">Figure </w:t>
       </w:r>
-      <w:r>
-        <w:fldChar w:fldCharType="begin"/>
-      </w:r>
-      <w:r>
-        <w:instrText xml:space="preserve"> SEQ Figure \* ARABIC </w:instrText>
-      </w:r>
-      <w:r>
-        <w:fldChar w:fldCharType="separate"/>
-      </w:r>
-      <w:r>
-        <w:rPr>
-          <w:noProof/>
-        </w:rPr>
-        <w:t>6</w:t>
-      </w:r>
-      <w:r>
-        <w:rPr>
-          <w:noProof/>
-        </w:rPr>
-        <w:fldChar w:fldCharType="end"/>
-      </w:r>
+      <w:fldSimple w:instr=" SEQ Figure \* ARABIC ">
+        <w:r>
+          <w:rPr>
+            <w:noProof/>
+          </w:rPr>
+          <w:t>6</w:t>
+        </w:r>
+      </w:fldSimple>
       <w:r>
         <w:t>: Member search, blank and with results</w:t>
       </w:r>
@@ -7999,27 +7921,14 @@
       <w:r>
         <w:t xml:space="preserve">Figure </w:t>
       </w:r>
-      <w:r>
-        <w:fldChar w:fldCharType="begin"/>
-      </w:r>
-      <w:r>
-        <w:instrText xml:space="preserve"> SEQ Figure \* ARABIC </w:instrText>
-      </w:r>
-      <w:r>
-        <w:fldChar w:fldCharType="separate"/>
-      </w:r>
-      <w:r>
-        <w:rPr>
-          <w:noProof/>
-        </w:rPr>
-        <w:t>7</w:t>
-      </w:r>
-      <w:r>
-        <w:rPr>
-          <w:noProof/>
-        </w:rPr>
-        <w:fldChar w:fldCharType="end"/>
-      </w:r>
+      <w:fldSimple w:instr=" SEQ Figure \* ARABIC ">
+        <w:r>
+          <w:rPr>
+            <w:noProof/>
+          </w:rPr>
+          <w:t>7</w:t>
+        </w:r>
+      </w:fldSimple>
       <w:r>
         <w:t>: basic printer dialog</w:t>
       </w:r>
@@ -8196,27 +8105,14 @@
       <w:r>
         <w:t xml:space="preserve">Figure </w:t>
       </w:r>
-      <w:r>
-        <w:fldChar w:fldCharType="begin"/>
-      </w:r>
-      <w:r>
-        <w:instrText xml:space="preserve"> SEQ Figure \* ARABIC </w:instrText>
-      </w:r>
-      <w:r>
-        <w:fldChar w:fldCharType="separate"/>
-      </w:r>
-      <w:r>
-        <w:rPr>
-          <w:noProof/>
-        </w:rPr>
-        <w:t>8</w:t>
-      </w:r>
-      <w:r>
-        <w:rPr>
-          <w:noProof/>
-        </w:rPr>
-        <w:fldChar w:fldCharType="end"/>
-      </w:r>
+      <w:fldSimple w:instr=" SEQ Figure \* ARABIC ">
+        <w:r>
+          <w:rPr>
+            <w:noProof/>
+          </w:rPr>
+          <w:t>8</w:t>
+        </w:r>
+      </w:fldSimple>
       <w:r>
         <w:t>: Importing existing player information</w:t>
       </w:r>
@@ -8342,27 +8238,14 @@
       <w:r>
         <w:t xml:space="preserve">Figure </w:t>
       </w:r>
-      <w:r>
-        <w:fldChar w:fldCharType="begin"/>
-      </w:r>
-      <w:r>
-        <w:instrText xml:space="preserve"> SEQ Figure \* ARABIC </w:instrText>
-      </w:r>
-      <w:r>
-        <w:fldChar w:fldCharType="separate"/>
-      </w:r>
-      <w:r>
-        <w:rPr>
-          <w:noProof/>
-        </w:rPr>
-        <w:t>9</w:t>
-      </w:r>
-      <w:r>
-        <w:rPr>
-          <w:noProof/>
-        </w:rPr>
-        <w:fldChar w:fldCharType="end"/>
-      </w:r>
+      <w:fldSimple w:instr=" SEQ Figure \* ARABIC ">
+        <w:r>
+          <w:rPr>
+            <w:noProof/>
+          </w:rPr>
+          <w:t>9</w:t>
+        </w:r>
+      </w:fldSimple>
       <w:r>
         <w:t>: Member Scores</w:t>
       </w:r>
@@ -8723,27 +8606,14 @@
       <w:r>
         <w:t xml:space="preserve">Figure </w:t>
       </w:r>
-      <w:r>
-        <w:fldChar w:fldCharType="begin"/>
-      </w:r>
-      <w:r>
-        <w:instrText xml:space="preserve"> SEQ Figure \* ARABIC </w:instrText>
-      </w:r>
-      <w:r>
-        <w:fldChar w:fldCharType="separate"/>
-      </w:r>
-      <w:r>
-        <w:rPr>
-          <w:noProof/>
-        </w:rPr>
-        <w:t>10</w:t>
-      </w:r>
-      <w:r>
-        <w:rPr>
-          <w:noProof/>
-        </w:rPr>
-        <w:fldChar w:fldCharType="end"/>
-      </w:r>
+      <w:fldSimple w:instr=" SEQ Figure \* ARABIC ">
+        <w:r>
+          <w:rPr>
+            <w:noProof/>
+          </w:rPr>
+          <w:t>10</w:t>
+        </w:r>
+      </w:fldSimple>
       <w:r>
         <w:t>: Tournament Stats</w:t>
       </w:r>
@@ -9017,27 +8887,14 @@
       <w:r>
         <w:t xml:space="preserve">Figure </w:t>
       </w:r>
-      <w:r>
-        <w:fldChar w:fldCharType="begin"/>
-      </w:r>
-      <w:r>
-        <w:instrText xml:space="preserve"> SEQ Figure \* ARABIC </w:instrText>
-      </w:r>
-      <w:r>
-        <w:fldChar w:fldCharType="separate"/>
-      </w:r>
-      <w:r>
-        <w:rPr>
-          <w:noProof/>
-        </w:rPr>
-        <w:t>11</w:t>
-      </w:r>
-      <w:r>
-        <w:rPr>
-          <w:noProof/>
-        </w:rPr>
-        <w:fldChar w:fldCharType="end"/>
-      </w:r>
+      <w:fldSimple w:instr=" SEQ Figure \* ARABIC ">
+        <w:r>
+          <w:rPr>
+            <w:noProof/>
+          </w:rPr>
+          <w:t>11</w:t>
+        </w:r>
+      </w:fldSimple>
       <w:r>
         <w:t xml:space="preserve"> Print Dialog</w:t>
       </w:r>
@@ -9179,27 +9036,14 @@
       <w:r>
         <w:t xml:space="preserve">Figure </w:t>
       </w:r>
-      <w:r>
-        <w:fldChar w:fldCharType="begin"/>
-      </w:r>
-      <w:r>
-        <w:instrText xml:space="preserve"> SEQ Figure \* ARABIC </w:instrText>
-      </w:r>
-      <w:r>
-        <w:fldChar w:fldCharType="separate"/>
-      </w:r>
-      <w:r>
-        <w:rPr>
-          <w:noProof/>
-        </w:rPr>
-        <w:t>12</w:t>
-      </w:r>
-      <w:r>
-        <w:rPr>
-          <w:noProof/>
-        </w:rPr>
-        <w:fldChar w:fldCharType="end"/>
-      </w:r>
+      <w:fldSimple w:instr=" SEQ Figure \* ARABIC ">
+        <w:r>
+          <w:rPr>
+            <w:noProof/>
+          </w:rPr>
+          <w:t>12</w:t>
+        </w:r>
+      </w:fldSimple>
       <w:r>
         <w:t>: Tournament Place Standings</w:t>
       </w:r>
@@ -9380,27 +9224,14 @@
       <w:r>
         <w:t xml:space="preserve">Figure </w:t>
       </w:r>
-      <w:r>
-        <w:fldChar w:fldCharType="begin"/>
-      </w:r>
-      <w:r>
-        <w:instrText xml:space="preserve"> SEQ Figure \* ARABIC </w:instrText>
-      </w:r>
-      <w:r>
-        <w:fldChar w:fldCharType="separate"/>
-      </w:r>
-      <w:r>
-        <w:rPr>
-          <w:noProof/>
-        </w:rPr>
-        <w:t>13</w:t>
-      </w:r>
-      <w:r>
-        <w:rPr>
-          <w:noProof/>
-        </w:rPr>
-        <w:fldChar w:fldCharType="end"/>
-      </w:r>
+      <w:fldSimple w:instr=" SEQ Figure \* ARABIC ">
+        <w:r>
+          <w:rPr>
+            <w:noProof/>
+          </w:rPr>
+          <w:t>13</w:t>
+        </w:r>
+      </w:fldSimple>
       <w:r>
         <w:t xml:space="preserve">: </w:t>
       </w:r>
@@ -9703,27 +9534,14 @@
       <w:r>
         <w:t xml:space="preserve">Figure </w:t>
       </w:r>
-      <w:r>
-        <w:fldChar w:fldCharType="begin"/>
-      </w:r>
-      <w:r>
-        <w:instrText xml:space="preserve"> SEQ Figure \* ARABIC </w:instrText>
-      </w:r>
-      <w:r>
-        <w:fldChar w:fldCharType="separate"/>
-      </w:r>
-      <w:r>
-        <w:rPr>
-          <w:noProof/>
-        </w:rPr>
-        <w:t>14</w:t>
-      </w:r>
-      <w:r>
-        <w:rPr>
-          <w:noProof/>
-        </w:rPr>
-        <w:fldChar w:fldCharType="end"/>
-      </w:r>
+      <w:fldSimple w:instr=" SEQ Figure \* ARABIC ">
+        <w:r>
+          <w:rPr>
+            <w:noProof/>
+          </w:rPr>
+          <w:t>14</w:t>
+        </w:r>
+      </w:fldSimple>
       <w:r>
         <w:t>: Tournament Search Forms</w:t>
       </w:r>
@@ -10111,27 +9929,14 @@
       <w:r>
         <w:t xml:space="preserve">Figure </w:t>
       </w:r>
-      <w:r>
-        <w:fldChar w:fldCharType="begin"/>
-      </w:r>
-      <w:r>
-        <w:instrText xml:space="preserve"> SEQ Figure \* ARABIC </w:instrText>
-      </w:r>
-      <w:r>
-        <w:fldChar w:fldCharType="separate"/>
-      </w:r>
-      <w:r>
-        <w:rPr>
-          <w:noProof/>
-        </w:rPr>
-        <w:t>15</w:t>
-      </w:r>
-      <w:r>
-        <w:rPr>
-          <w:noProof/>
-        </w:rPr>
-        <w:fldChar w:fldCharType="end"/>
-      </w:r>
+      <w:fldSimple w:instr=" SEQ Figure \* ARABIC ">
+        <w:r>
+          <w:rPr>
+            <w:noProof/>
+          </w:rPr>
+          <w:t>15</w:t>
+        </w:r>
+      </w:fldSimple>
       <w:r>
         <w:t>: Tournaments</w:t>
       </w:r>
@@ -10347,27 +10152,14 @@
       <w:r>
         <w:t xml:space="preserve">Figure </w:t>
       </w:r>
-      <w:r>
-        <w:fldChar w:fldCharType="begin"/>
-      </w:r>
-      <w:r>
-        <w:instrText xml:space="preserve"> SEQ Figure \* ARABIC </w:instrText>
-      </w:r>
-      <w:r>
-        <w:fldChar w:fldCharType="separate"/>
-      </w:r>
-      <w:r>
-        <w:rPr>
-          <w:noProof/>
-        </w:rPr>
-        <w:t>16</w:t>
-      </w:r>
-      <w:r>
-        <w:rPr>
-          <w:noProof/>
-        </w:rPr>
-        <w:fldChar w:fldCharType="end"/>
-      </w:r>
+      <w:fldSimple w:instr=" SEQ Figure \* ARABIC ">
+        <w:r>
+          <w:rPr>
+            <w:noProof/>
+          </w:rPr>
+          <w:t>16</w:t>
+        </w:r>
+      </w:fldSimple>
       <w:r>
         <w:t xml:space="preserve"> Member Scores</w:t>
       </w:r>
@@ -10644,27 +10436,14 @@
       <w:r>
         <w:t xml:space="preserve">Figure </w:t>
       </w:r>
-      <w:r>
-        <w:fldChar w:fldCharType="begin"/>
-      </w:r>
-      <w:r>
-        <w:instrText xml:space="preserve"> SEQ Figure \* ARABIC </w:instrText>
-      </w:r>
-      <w:r>
-        <w:fldChar w:fldCharType="separate"/>
-      </w:r>
-      <w:r>
-        <w:rPr>
-          <w:noProof/>
-        </w:rPr>
-        <w:t>17</w:t>
-      </w:r>
-      <w:r>
-        <w:rPr>
-          <w:noProof/>
-        </w:rPr>
-        <w:fldChar w:fldCharType="end"/>
-      </w:r>
+      <w:fldSimple w:instr=" SEQ Figure \* ARABIC ">
+        <w:r>
+          <w:rPr>
+            <w:noProof/>
+          </w:rPr>
+          <w:t>17</w:t>
+        </w:r>
+      </w:fldSimple>
       <w:r>
         <w:t xml:space="preserve"> Tournament Results</w:t>
       </w:r>
@@ -10930,10 +10709,19 @@
         <w:t>ing one of the columns such as N</w:t>
       </w:r>
       <w:r>
-        <w:t>ame, or Scratch Total will reord</w:t>
-      </w:r>
-      <w:r>
-        <w:t>er the data by descending and</w:t>
+        <w:t xml:space="preserve">ame </w:t>
+      </w:r>
+      <w:r>
+        <w:t>or Scratch Total will reord</w:t>
+      </w:r>
+      <w:r>
+        <w:t>er the data by descending</w:t>
+      </w:r>
+      <w:r>
+        <w:t>,</w:t>
+      </w:r>
+      <w:r>
+        <w:t xml:space="preserve"> and</w:t>
       </w:r>
       <w:r>
         <w:t xml:space="preserve"> clicking once more will re</w:t>
@@ -10955,14 +10743,43 @@
       </w:r>
       <w:r>
         <w:t xml:space="preserve">ighted can be copied </w:t>
+      </w:r>
+      <w:r>
+        <w:t>by pressing the ctrl and c buttons on the keyboard while cells are highlighted.</w:t>
+      </w:r>
+      <w:r>
+        <w:t xml:space="preserve"> Checkboxes such as Valid Score, or Director Check will be pasted in text as True or False.</w:t>
+      </w:r>
+    </w:p>
+    <w:p>
+      <w:pPr>
+        <w:pStyle w:val="BodyText"/>
+      </w:pPr>
+      <w:r>
+        <w:t>The bottom sub window contains information for a selected player.</w:t>
+      </w:r>
+      <w:r>
+        <w:t xml:space="preserve"> Every game the selected player has participated in will be displayed here. In addition to this, the date the game was played and the player’s place in the tournament are displayed as well.</w:t>
+      </w:r>
+      <w:r>
+        <w:t xml:space="preserve"> Between the two sub windows you’ll see the index of the selected player on the left, their</w:t>
+      </w:r>
+      <w:r>
+        <w:t xml:space="preserve"> name in the middle, and their starting average</w:t>
       </w:r>
       <w:bookmarkStart w:id="40" w:name="_GoBack"/>
       <w:bookmarkEnd w:id="40"/>
       <w:r>
-        <w:t>by pressing the ctrl and c buttons on the keyboard while cells are highlighted.</w:t>
-      </w:r>
-      <w:r>
-        <w:t xml:space="preserve"> Checkboxes such as Valid Score, or Director Check will be pasted in text as True or False.</w:t>
+        <w:t xml:space="preserve"> on the right.</w:t>
+      </w:r>
+      <w:r>
+        <w:t xml:space="preserve"> This second sub window can be organized like the above one.</w:t>
+      </w:r>
+      <w:r>
+        <w:t xml:space="preserve"> Game scores, adjusted average, notes, and the date can be modified here. Changing a score will not automatically recalculate the scratch total in the lower sub window.</w:t>
+      </w:r>
+      <w:r>
+        <w:t xml:space="preserve"> </w:t>
       </w:r>
     </w:p>
     <w:p>
@@ -10987,7 +10804,11 @@
         <w:t>ve inspected that player’s recap</w:t>
       </w:r>
       <w:r>
-        <w:t>. This means modifying scores, averages, adding a bonus or a pro pot, and adding any notes that may be needed for a particular player.</w:t>
+        <w:t xml:space="preserve">. This means modifying scores, averages, adding a bonus or a pro pot, and adding any </w:t>
+      </w:r>
+      <w:r>
+        <w:lastRenderedPageBreak/>
+        <w:t>notes that may be needed for a particular player.</w:t>
       </w:r>
       <w:r>
         <w:t xml:space="preserve"> After all of this is done, the director checks off the Director Check box for that player. </w:t>
@@ -11010,7 +10831,6 @@
         <w:rPr>
           <w:noProof/>
         </w:rPr>
-        <w:lastRenderedPageBreak/>
         <w:pict>
           <v:shapetype id="_x0000_t75" coordsize="21600,21600" o:spt="75" o:preferrelative="t" path="m@4@5l@4@11@9@11@9@5xe" filled="f" stroked="f">
             <v:stroke joinstyle="miter"/>
@@ -11031,7 +10851,7 @@
             <v:path o:extrusionok="f" gradientshapeok="t" o:connecttype="rect"/>
             <o:lock v:ext="edit" aspectratio="t"/>
           </v:shapetype>
-          <v:shape id="_x0000_i1025" type="#_x0000_t75" style="width:384pt;height:222.75pt">
+          <v:shape id="_x0000_i1025" type="#_x0000_t75" style="width:384.45pt;height:222.8pt">
             <v:imagedata r:id="rId32" o:title="FinalizeTournamentWindow"/>
           </v:shape>
         </w:pict>
@@ -11044,27 +10864,14 @@
       <w:r>
         <w:t xml:space="preserve">Figure </w:t>
       </w:r>
-      <w:r>
-        <w:fldChar w:fldCharType="begin"/>
-      </w:r>
-      <w:r>
-        <w:instrText xml:space="preserve"> SEQ Figure \* ARABIC </w:instrText>
-      </w:r>
-      <w:r>
-        <w:fldChar w:fldCharType="separate"/>
-      </w:r>
-      <w:r>
-        <w:rPr>
-          <w:noProof/>
-        </w:rPr>
-        <w:t>18</w:t>
-      </w:r>
-      <w:r>
-        <w:rPr>
-          <w:noProof/>
-        </w:rPr>
-        <w:fldChar w:fldCharType="end"/>
-      </w:r>
+      <w:fldSimple w:instr=" SEQ Figure \* ARABIC ">
+        <w:r>
+          <w:rPr>
+            <w:noProof/>
+          </w:rPr>
+          <w:t>18</w:t>
+        </w:r>
+      </w:fldSimple>
       <w:r>
         <w:t xml:space="preserve"> Finalize Tournament</w:t>
       </w:r>
@@ -11102,13 +10909,8 @@
         <w:pStyle w:val="BodyText"/>
         <w:keepNext/>
       </w:pPr>
-    </w:p>
-    <w:p>
-      <w:pPr>
-        <w:pStyle w:val="BodyText"/>
-        <w:keepNext/>
-      </w:pPr>
-      <w:r>
+      <w:r>
+        <w:lastRenderedPageBreak/>
         <w:t>Referring to Figure 18, t</w:t>
       </w:r>
       <w:r>
@@ -11146,6 +10948,59 @@
       <w:r>
         <w:t xml:space="preserve"> – the index of the player in the database.</w:t>
       </w:r>
+      <w:r>
+        <w:t xml:space="preserve">  </w:t>
+      </w:r>
+    </w:p>
+    <w:p>
+      <w:pPr>
+        <w:pStyle w:val="BodyText"/>
+        <w:keepNext/>
+        <w:ind w:left="720"/>
+      </w:pPr>
+      <w:r>
+        <w:t xml:space="preserve"> </w:t>
+      </w:r>
+      <w:r>
+        <w:rPr>
+          <w:noProof/>
+        </w:rPr>
+        <w:drawing>
+          <wp:inline distT="0" distB="0" distL="0" distR="0" wp14:anchorId="429B53C0" wp14:editId="5BE8D580">
+            <wp:extent cx="526212" cy="841940"/>
+            <wp:effectExtent l="0" t="0" r="7620" b="0"/>
+            <wp:docPr id="27" name="Picture 27"/>
+            <wp:cNvGraphicFramePr>
+              <a:graphicFrameLocks xmlns:a="http://schemas.openxmlformats.org/drawingml/2006/main" noChangeAspect="1"/>
+            </wp:cNvGraphicFramePr>
+            <a:graphic xmlns:a="http://schemas.openxmlformats.org/drawingml/2006/main">
+              <a:graphicData uri="http://schemas.openxmlformats.org/drawingml/2006/picture">
+                <pic:pic xmlns:pic="http://schemas.openxmlformats.org/drawingml/2006/picture">
+                  <pic:nvPicPr>
+                    <pic:cNvPr id="1" name=""/>
+                    <pic:cNvPicPr/>
+                  </pic:nvPicPr>
+                  <pic:blipFill>
+                    <a:blip r:embed="rId33"/>
+                    <a:stretch>
+                      <a:fillRect/>
+                    </a:stretch>
+                  </pic:blipFill>
+                  <pic:spPr>
+                    <a:xfrm>
+                      <a:off x="0" y="0"/>
+                      <a:ext cx="585111" cy="936179"/>
+                    </a:xfrm>
+                    <a:prstGeom prst="rect">
+                      <a:avLst/>
+                    </a:prstGeom>
+                  </pic:spPr>
+                </pic:pic>
+              </a:graphicData>
+            </a:graphic>
+          </wp:inline>
+        </w:drawing>
+      </w:r>
     </w:p>
     <w:p>
       <w:pPr>
@@ -11171,26 +11026,53 @@
       <w:pPr>
         <w:pStyle w:val="BodyText"/>
         <w:keepNext/>
-        <w:numPr>
-          <w:ilvl w:val="0"/>
-          <w:numId w:val="50"/>
-        </w:numPr>
-      </w:pPr>
-      <w:r>
-        <w:rPr>
-          <w:b/>
-          <w:u w:val="single"/>
-        </w:rPr>
-        <w:t>Game 1-4 and ValidScore 1-4</w:t>
-      </w:r>
-      <w:r>
-        <w:t xml:space="preserve"> - t</w:t>
-      </w:r>
-      <w:r>
-        <w:t>hat player’s score for each game</w:t>
-      </w:r>
-      <w:r>
-        <w:t xml:space="preserve"> they played, and a checkbox used to determine whether that player’s score is valid for that set of pins. E.G. a sandbagged score will be unchecked and thus invalidated.</w:t>
+        <w:ind w:left="720"/>
+      </w:pPr>
+      <w:r>
+        <w:t xml:space="preserve">  </w:t>
+      </w:r>
+      <w:r>
+        <w:rPr>
+          <w:noProof/>
+        </w:rPr>
+        <w:drawing>
+          <wp:inline distT="0" distB="0" distL="0" distR="0" wp14:anchorId="7FC40CEB" wp14:editId="1F30954D">
+            <wp:extent cx="473914" cy="770111"/>
+            <wp:effectExtent l="0" t="0" r="2540" b="0"/>
+            <wp:docPr id="29" name="Picture 29"/>
+            <wp:cNvGraphicFramePr>
+              <a:graphicFrameLocks xmlns:a="http://schemas.openxmlformats.org/drawingml/2006/main" noChangeAspect="1"/>
+            </wp:cNvGraphicFramePr>
+            <a:graphic xmlns:a="http://schemas.openxmlformats.org/drawingml/2006/main">
+              <a:graphicData uri="http://schemas.openxmlformats.org/drawingml/2006/picture">
+                <pic:pic xmlns:pic="http://schemas.openxmlformats.org/drawingml/2006/picture">
+                  <pic:nvPicPr>
+                    <pic:cNvPr id="1" name=""/>
+                    <pic:cNvPicPr/>
+                  </pic:nvPicPr>
+                  <pic:blipFill>
+                    <a:blip r:embed="rId34"/>
+                    <a:stretch>
+                      <a:fillRect/>
+                    </a:stretch>
+                  </pic:blipFill>
+                  <pic:spPr>
+                    <a:xfrm>
+                      <a:off x="0" y="0"/>
+                      <a:ext cx="506426" cy="822944"/>
+                    </a:xfrm>
+                    <a:prstGeom prst="rect">
+                      <a:avLst/>
+                    </a:prstGeom>
+                  </pic:spPr>
+                </pic:pic>
+              </a:graphicData>
+            </a:graphic>
+          </wp:inline>
+        </w:drawing>
+      </w:r>
+      <w:r>
+        <w:t xml:space="preserve">   </w:t>
       </w:r>
     </w:p>
     <w:p>
@@ -11207,10 +11089,75 @@
           <w:b/>
           <w:u w:val="single"/>
         </w:rPr>
-        <w:t>Scratch Total</w:t>
-      </w:r>
-      <w:r>
-        <w:t xml:space="preserve"> – The player’s total score before handicaps are taken into account.</w:t>
+        <w:t>Game 1-4 and ValidScore 1-4</w:t>
+      </w:r>
+      <w:r>
+        <w:t xml:space="preserve"> - t</w:t>
+      </w:r>
+      <w:r>
+        <w:t>hat player’s score for each game</w:t>
+      </w:r>
+      <w:r>
+        <w:t xml:space="preserve"> they played, and a checkbox used to determine whether that player’s score is valid for that set of pins. E.G. a sandbagged score will be</w:t>
+      </w:r>
+      <w:r>
+        <w:t xml:space="preserve"> unchecked and thus invalidated.</w:t>
+      </w:r>
+    </w:p>
+    <w:p>
+      <w:pPr>
+        <w:pStyle w:val="BodyText"/>
+        <w:keepNext/>
+        <w:ind w:left="720"/>
+        <w:rPr>
+          <w:noProof/>
+        </w:rPr>
+      </w:pPr>
+      <w:r>
+        <w:rPr>
+          <w:noProof/>
+        </w:rPr>
+        <w:t xml:space="preserve"> </w:t>
+      </w:r>
+      <w:r>
+        <w:rPr>
+          <w:noProof/>
+        </w:rPr>
+        <w:drawing>
+          <wp:inline distT="0" distB="0" distL="0" distR="0" wp14:anchorId="4E4B003F" wp14:editId="0003F4CF">
+            <wp:extent cx="491706" cy="697328"/>
+            <wp:effectExtent l="0" t="0" r="3810" b="7620"/>
+            <wp:docPr id="31" name="Picture 31"/>
+            <wp:cNvGraphicFramePr>
+              <a:graphicFrameLocks xmlns:a="http://schemas.openxmlformats.org/drawingml/2006/main" noChangeAspect="1"/>
+            </wp:cNvGraphicFramePr>
+            <a:graphic xmlns:a="http://schemas.openxmlformats.org/drawingml/2006/main">
+              <a:graphicData uri="http://schemas.openxmlformats.org/drawingml/2006/picture">
+                <pic:pic xmlns:pic="http://schemas.openxmlformats.org/drawingml/2006/picture">
+                  <pic:nvPicPr>
+                    <pic:cNvPr id="1" name=""/>
+                    <pic:cNvPicPr/>
+                  </pic:nvPicPr>
+                  <pic:blipFill>
+                    <a:blip r:embed="rId35"/>
+                    <a:stretch>
+                      <a:fillRect/>
+                    </a:stretch>
+                  </pic:blipFill>
+                  <pic:spPr>
+                    <a:xfrm>
+                      <a:off x="0" y="0"/>
+                      <a:ext cx="515572" cy="731175"/>
+                    </a:xfrm>
+                    <a:prstGeom prst="rect">
+                      <a:avLst/>
+                    </a:prstGeom>
+                  </pic:spPr>
+                </pic:pic>
+              </a:graphicData>
+            </a:graphic>
+          </wp:inline>
+        </w:drawing>
       </w:r>
     </w:p>
     <w:p>
@@ -11227,10 +11174,57 @@
           <w:b/>
           <w:u w:val="single"/>
         </w:rPr>
-        <w:t xml:space="preserve">Handicap Total </w:t>
-      </w:r>
-      <w:r>
-        <w:t>– The player’s total score after handicaps are taken into account.</w:t>
+        <w:t>Scratch Total</w:t>
+      </w:r>
+      <w:r>
+        <w:t xml:space="preserve"> – The player’s total score before handicaps are taken into account.</w:t>
+      </w:r>
+    </w:p>
+    <w:p>
+      <w:pPr>
+        <w:pStyle w:val="BodyText"/>
+        <w:keepNext/>
+        <w:ind w:left="720"/>
+      </w:pPr>
+      <w:r>
+        <w:rPr>
+          <w:noProof/>
+        </w:rPr>
+        <w:drawing>
+          <wp:inline distT="0" distB="0" distL="0" distR="0" wp14:anchorId="0D472E01" wp14:editId="22125B12">
+            <wp:extent cx="542925" cy="752475"/>
+            <wp:effectExtent l="0" t="0" r="9525" b="9525"/>
+            <wp:docPr id="35" name="Picture 35"/>
+            <wp:cNvGraphicFramePr>
+              <a:graphicFrameLocks xmlns:a="http://schemas.openxmlformats.org/drawingml/2006/main" noChangeAspect="1"/>
+            </wp:cNvGraphicFramePr>
+            <a:graphic xmlns:a="http://schemas.openxmlformats.org/drawingml/2006/main">
+              <a:graphicData uri="http://schemas.openxmlformats.org/drawingml/2006/picture">
+                <pic:pic xmlns:pic="http://schemas.openxmlformats.org/drawingml/2006/picture">
+                  <pic:nvPicPr>
+                    <pic:cNvPr id="1" name=""/>
+                    <pic:cNvPicPr/>
+                  </pic:nvPicPr>
+                  <pic:blipFill>
+                    <a:blip r:embed="rId36"/>
+                    <a:stretch>
+                      <a:fillRect/>
+                    </a:stretch>
+                  </pic:blipFill>
+                  <pic:spPr>
+                    <a:xfrm>
+                      <a:off x="0" y="0"/>
+                      <a:ext cx="542925" cy="752475"/>
+                    </a:xfrm>
+                    <a:prstGeom prst="rect">
+                      <a:avLst/>
+                    </a:prstGeom>
+                  </pic:spPr>
+                </pic:pic>
+              </a:graphicData>
+            </a:graphic>
+          </wp:inline>
+        </w:drawing>
       </w:r>
     </w:p>
     <w:p>
@@ -11247,10 +11241,57 @@
           <w:b/>
           <w:u w:val="single"/>
         </w:rPr>
-        <w:t>Entry AVG</w:t>
-      </w:r>
-      <w:r>
-        <w:t xml:space="preserve"> – The average for the current entry of the player.</w:t>
+        <w:t xml:space="preserve">Handicap Total </w:t>
+      </w:r>
+      <w:r>
+        <w:t>– The player’s total score after handicaps are taken into account.</w:t>
+      </w:r>
+    </w:p>
+    <w:p>
+      <w:pPr>
+        <w:pStyle w:val="BodyText"/>
+        <w:keepNext/>
+        <w:ind w:left="720"/>
+      </w:pPr>
+      <w:r>
+        <w:rPr>
+          <w:noProof/>
+        </w:rPr>
+        <w:drawing>
+          <wp:inline distT="0" distB="0" distL="0" distR="0" wp14:anchorId="5B092339" wp14:editId="45625D94">
+            <wp:extent cx="533400" cy="752475"/>
+            <wp:effectExtent l="0" t="0" r="0" b="9525"/>
+            <wp:docPr id="40" name="Picture 40"/>
+            <wp:cNvGraphicFramePr>
+              <a:graphicFrameLocks xmlns:a="http://schemas.openxmlformats.org/drawingml/2006/main" noChangeAspect="1"/>
+            </wp:cNvGraphicFramePr>
+            <a:graphic xmlns:a="http://schemas.openxmlformats.org/drawingml/2006/main">
+              <a:graphicData uri="http://schemas.openxmlformats.org/drawingml/2006/picture">
+                <pic:pic xmlns:pic="http://schemas.openxmlformats.org/drawingml/2006/picture">
+                  <pic:nvPicPr>
+                    <pic:cNvPr id="1" name=""/>
+                    <pic:cNvPicPr/>
+                  </pic:nvPicPr>
+                  <pic:blipFill>
+                    <a:blip r:embed="rId37"/>
+                    <a:stretch>
+                      <a:fillRect/>
+                    </a:stretch>
+                  </pic:blipFill>
+                  <pic:spPr>
+                    <a:xfrm>
+                      <a:off x="0" y="0"/>
+                      <a:ext cx="533400" cy="752475"/>
+                    </a:xfrm>
+                    <a:prstGeom prst="rect">
+                      <a:avLst/>
+                    </a:prstGeom>
+                  </pic:spPr>
+                </pic:pic>
+              </a:graphicData>
+            </a:graphic>
+          </wp:inline>
+        </w:drawing>
       </w:r>
     </w:p>
     <w:p>
@@ -11267,10 +11308,58 @@
           <w:b/>
           <w:u w:val="single"/>
         </w:rPr>
-        <w:t>30 Entry AVG</w:t>
-      </w:r>
-      <w:r>
-        <w:t xml:space="preserve"> – The average for the last 30 entries of the player.</w:t>
+        <w:t>Entry AVG</w:t>
+      </w:r>
+      <w:r>
+        <w:t xml:space="preserve"> – The average for the current entry of the player.</w:t>
+      </w:r>
+    </w:p>
+    <w:p>
+      <w:pPr>
+        <w:pStyle w:val="BodyText"/>
+        <w:keepNext/>
+        <w:ind w:left="720"/>
+      </w:pPr>
+      <w:r>
+        <w:rPr>
+          <w:noProof/>
+        </w:rPr>
+        <w:lastRenderedPageBreak/>
+        <w:drawing>
+          <wp:inline distT="0" distB="0" distL="0" distR="0" wp14:anchorId="412BDA32" wp14:editId="5AADEA86">
+            <wp:extent cx="533400" cy="733425"/>
+            <wp:effectExtent l="0" t="0" r="0" b="9525"/>
+            <wp:docPr id="41" name="Picture 41"/>
+            <wp:cNvGraphicFramePr>
+              <a:graphicFrameLocks xmlns:a="http://schemas.openxmlformats.org/drawingml/2006/main" noChangeAspect="1"/>
+            </wp:cNvGraphicFramePr>
+            <a:graphic xmlns:a="http://schemas.openxmlformats.org/drawingml/2006/main">
+              <a:graphicData uri="http://schemas.openxmlformats.org/drawingml/2006/picture">
+                <pic:pic xmlns:pic="http://schemas.openxmlformats.org/drawingml/2006/picture">
+                  <pic:nvPicPr>
+                    <pic:cNvPr id="1" name=""/>
+                    <pic:cNvPicPr/>
+                  </pic:nvPicPr>
+                  <pic:blipFill>
+                    <a:blip r:embed="rId38"/>
+                    <a:stretch>
+                      <a:fillRect/>
+                    </a:stretch>
+                  </pic:blipFill>
+                  <pic:spPr>
+                    <a:xfrm>
+                      <a:off x="0" y="0"/>
+                      <a:ext cx="533400" cy="733425"/>
+                    </a:xfrm>
+                    <a:prstGeom prst="rect">
+                      <a:avLst/>
+                    </a:prstGeom>
+                  </pic:spPr>
+                </pic:pic>
+              </a:graphicData>
+            </a:graphic>
+          </wp:inline>
+        </w:drawing>
       </w:r>
     </w:p>
     <w:p>
@@ -11287,13 +11376,57 @@
           <w:b/>
           <w:u w:val="single"/>
         </w:rPr>
-        <w:t>ADJ AVG</w:t>
-      </w:r>
-      <w:r>
-        <w:t xml:space="preserve"> – Adjusted Average.</w:t>
-      </w:r>
-      <w:r>
-        <w:t xml:space="preserve"> The average that has been adjusted by the director if need be. E.G. if a player sandbags a score, the average can be adjusted and entered in here.</w:t>
+        <w:t>30 Entry AVG</w:t>
+      </w:r>
+      <w:r>
+        <w:t xml:space="preserve"> – The average for the last 30 entries of the player.</w:t>
+      </w:r>
+    </w:p>
+    <w:p>
+      <w:pPr>
+        <w:pStyle w:val="BodyText"/>
+        <w:keepNext/>
+        <w:ind w:left="720"/>
+      </w:pPr>
+      <w:r>
+        <w:rPr>
+          <w:noProof/>
+        </w:rPr>
+        <w:drawing>
+          <wp:inline distT="0" distB="0" distL="0" distR="0" wp14:anchorId="157E3374" wp14:editId="08B5DF7E">
+            <wp:extent cx="514350" cy="781050"/>
+            <wp:effectExtent l="0" t="0" r="0" b="0"/>
+            <wp:docPr id="42" name="Picture 42"/>
+            <wp:cNvGraphicFramePr>
+              <a:graphicFrameLocks xmlns:a="http://schemas.openxmlformats.org/drawingml/2006/main" noChangeAspect="1"/>
+            </wp:cNvGraphicFramePr>
+            <a:graphic xmlns:a="http://schemas.openxmlformats.org/drawingml/2006/main">
+              <a:graphicData uri="http://schemas.openxmlformats.org/drawingml/2006/picture">
+                <pic:pic xmlns:pic="http://schemas.openxmlformats.org/drawingml/2006/picture">
+                  <pic:nvPicPr>
+                    <pic:cNvPr id="1" name=""/>
+                    <pic:cNvPicPr/>
+                  </pic:nvPicPr>
+                  <pic:blipFill>
+                    <a:blip r:embed="rId39"/>
+                    <a:stretch>
+                      <a:fillRect/>
+                    </a:stretch>
+                  </pic:blipFill>
+                  <pic:spPr>
+                    <a:xfrm>
+                      <a:off x="0" y="0"/>
+                      <a:ext cx="514350" cy="781050"/>
+                    </a:xfrm>
+                    <a:prstGeom prst="rect">
+                      <a:avLst/>
+                    </a:prstGeom>
+                  </pic:spPr>
+                </pic:pic>
+              </a:graphicData>
+            </a:graphic>
+          </wp:inline>
+        </w:drawing>
       </w:r>
     </w:p>
     <w:p>
@@ -11310,13 +11443,60 @@
           <w:b/>
           <w:u w:val="single"/>
         </w:rPr>
-        <w:t>Director Check</w:t>
-      </w:r>
-      <w:r>
-        <w:t xml:space="preserve"> – Checkbox to confirm a director has checked and validated</w:t>
-      </w:r>
-      <w:r>
-        <w:t xml:space="preserve"> a player’s score.</w:t>
+        <w:t>ADJ AVG</w:t>
+      </w:r>
+      <w:r>
+        <w:t xml:space="preserve"> – Adjusted Average.</w:t>
+      </w:r>
+      <w:r>
+        <w:t xml:space="preserve"> The average that has been adjusted by the director if need be. E.G. if a player sandbags a score, the average can be adjusted and entered in here.</w:t>
+      </w:r>
+    </w:p>
+    <w:p>
+      <w:pPr>
+        <w:pStyle w:val="BodyText"/>
+        <w:keepNext/>
+        <w:ind w:left="720"/>
+      </w:pPr>
+      <w:r>
+        <w:rPr>
+          <w:noProof/>
+        </w:rPr>
+        <w:drawing>
+          <wp:inline distT="0" distB="0" distL="0" distR="0" wp14:anchorId="3272CA0B" wp14:editId="230A1468">
+            <wp:extent cx="514350" cy="762000"/>
+            <wp:effectExtent l="0" t="0" r="0" b="0"/>
+            <wp:docPr id="43" name="Picture 43"/>
+            <wp:cNvGraphicFramePr>
+              <a:graphicFrameLocks xmlns:a="http://schemas.openxmlformats.org/drawingml/2006/main" noChangeAspect="1"/>
+            </wp:cNvGraphicFramePr>
+            <a:graphic xmlns:a="http://schemas.openxmlformats.org/drawingml/2006/main">
+              <a:graphicData uri="http://schemas.openxmlformats.org/drawingml/2006/picture">
+                <pic:pic xmlns:pic="http://schemas.openxmlformats.org/drawingml/2006/picture">
+                  <pic:nvPicPr>
+                    <pic:cNvPr id="1" name=""/>
+                    <pic:cNvPicPr/>
+                  </pic:nvPicPr>
+                  <pic:blipFill>
+                    <a:blip r:embed="rId40"/>
+                    <a:stretch>
+                      <a:fillRect/>
+                    </a:stretch>
+                  </pic:blipFill>
+                  <pic:spPr>
+                    <a:xfrm>
+                      <a:off x="0" y="0"/>
+                      <a:ext cx="514350" cy="762000"/>
+                    </a:xfrm>
+                    <a:prstGeom prst="rect">
+                      <a:avLst/>
+                    </a:prstGeom>
+                  </pic:spPr>
+                </pic:pic>
+              </a:graphicData>
+            </a:graphic>
+          </wp:inline>
+        </w:drawing>
       </w:r>
     </w:p>
     <w:p>
@@ -11327,33 +11507,66 @@
           <w:ilvl w:val="0"/>
           <w:numId w:val="50"/>
         </w:numPr>
+      </w:pPr>
+      <w:r>
         <w:rPr>
           <w:b/>
           <w:u w:val="single"/>
         </w:rPr>
-      </w:pPr>
-      <w:r>
-        <w:rPr>
-          <w:b/>
-          <w:u w:val="single"/>
-        </w:rPr>
-        <w:t>Squad</w:t>
-      </w:r>
-      <w:r>
-        <w:rPr>
-          <w:b/>
-          <w:u w:val="single"/>
-        </w:rPr>
-        <w:t xml:space="preserve"> </w:t>
-      </w:r>
-      <w:r>
-        <w:t>–</w:t>
-      </w:r>
-      <w:r>
-        <w:t xml:space="preserve"> T</w:t>
-      </w:r>
-      <w:r>
-        <w:t>he squad of this player’s game.</w:t>
+        <w:t>Director Check</w:t>
+      </w:r>
+      <w:r>
+        <w:t xml:space="preserve"> – Checkbox to confirm a director has checked and validated</w:t>
+      </w:r>
+      <w:r>
+        <w:t xml:space="preserve"> a player’s score.</w:t>
+      </w:r>
+    </w:p>
+    <w:p>
+      <w:pPr>
+        <w:pStyle w:val="BodyText"/>
+        <w:keepNext/>
+        <w:ind w:left="720"/>
+      </w:pPr>
+      <w:r>
+        <w:rPr>
+          <w:noProof/>
+        </w:rPr>
+        <w:drawing>
+          <wp:inline distT="0" distB="0" distL="0" distR="0" wp14:anchorId="7F50A187" wp14:editId="032B21D1">
+            <wp:extent cx="542925" cy="733425"/>
+            <wp:effectExtent l="0" t="0" r="9525" b="9525"/>
+            <wp:docPr id="45" name="Picture 45"/>
+            <wp:cNvGraphicFramePr>
+              <a:graphicFrameLocks xmlns:a="http://schemas.openxmlformats.org/drawingml/2006/main" noChangeAspect="1"/>
+            </wp:cNvGraphicFramePr>
+            <a:graphic xmlns:a="http://schemas.openxmlformats.org/drawingml/2006/main">
+              <a:graphicData uri="http://schemas.openxmlformats.org/drawingml/2006/picture">
+                <pic:pic xmlns:pic="http://schemas.openxmlformats.org/drawingml/2006/picture">
+                  <pic:nvPicPr>
+                    <pic:cNvPr id="1" name=""/>
+                    <pic:cNvPicPr/>
+                  </pic:nvPicPr>
+                  <pic:blipFill>
+                    <a:blip r:embed="rId41"/>
+                    <a:stretch>
+                      <a:fillRect/>
+                    </a:stretch>
+                  </pic:blipFill>
+                  <pic:spPr>
+                    <a:xfrm>
+                      <a:off x="0" y="0"/>
+                      <a:ext cx="542925" cy="733425"/>
+                    </a:xfrm>
+                    <a:prstGeom prst="rect">
+                      <a:avLst/>
+                    </a:prstGeom>
+                  </pic:spPr>
+                </pic:pic>
+              </a:graphicData>
+            </a:graphic>
+          </wp:inline>
+        </w:drawing>
       </w:r>
     </w:p>
     <w:p>
@@ -11374,10 +11587,74 @@
           <w:b/>
           <w:u w:val="single"/>
         </w:rPr>
-        <w:t xml:space="preserve">Handicap </w:t>
-      </w:r>
-      <w:r>
-        <w:t>– The player’s current handicap.</w:t>
+        <w:t>Squad</w:t>
+      </w:r>
+      <w:r>
+        <w:rPr>
+          <w:b/>
+          <w:u w:val="single"/>
+        </w:rPr>
+        <w:t xml:space="preserve"> </w:t>
+      </w:r>
+      <w:r>
+        <w:t>–</w:t>
+      </w:r>
+      <w:r>
+        <w:t xml:space="preserve"> T</w:t>
+      </w:r>
+      <w:r>
+        <w:t>he squad of this player’s game.</w:t>
+      </w:r>
+    </w:p>
+    <w:p>
+      <w:pPr>
+        <w:pStyle w:val="BodyText"/>
+        <w:keepNext/>
+        <w:ind w:left="720"/>
+        <w:rPr>
+          <w:b/>
+          <w:u w:val="single"/>
+        </w:rPr>
+      </w:pPr>
+      <w:r>
+        <w:rPr>
+          <w:noProof/>
+        </w:rPr>
+        <w:drawing>
+          <wp:inline distT="0" distB="0" distL="0" distR="0" wp14:anchorId="7AC6F896" wp14:editId="14C61E1A">
+            <wp:extent cx="504825" cy="781050"/>
+            <wp:effectExtent l="0" t="0" r="9525" b="0"/>
+            <wp:docPr id="46" name="Picture 46"/>
+            <wp:cNvGraphicFramePr>
+              <a:graphicFrameLocks xmlns:a="http://schemas.openxmlformats.org/drawingml/2006/main" noChangeAspect="1"/>
+            </wp:cNvGraphicFramePr>
+            <a:graphic xmlns:a="http://schemas.openxmlformats.org/drawingml/2006/main">
+              <a:graphicData uri="http://schemas.openxmlformats.org/drawingml/2006/picture">
+                <pic:pic xmlns:pic="http://schemas.openxmlformats.org/drawingml/2006/picture">
+                  <pic:nvPicPr>
+                    <pic:cNvPr id="1" name=""/>
+                    <pic:cNvPicPr/>
+                  </pic:nvPicPr>
+                  <pic:blipFill>
+                    <a:blip r:embed="rId42"/>
+                    <a:stretch>
+                      <a:fillRect/>
+                    </a:stretch>
+                  </pic:blipFill>
+                  <pic:spPr>
+                    <a:xfrm>
+                      <a:off x="0" y="0"/>
+                      <a:ext cx="504825" cy="781050"/>
+                    </a:xfrm>
+                    <a:prstGeom prst="rect">
+                      <a:avLst/>
+                    </a:prstGeom>
+                  </pic:spPr>
+                </pic:pic>
+              </a:graphicData>
+            </a:graphic>
+          </wp:inline>
+        </w:drawing>
       </w:r>
     </w:p>
     <w:p>
@@ -11398,10 +11675,61 @@
           <w:b/>
           <w:u w:val="single"/>
         </w:rPr>
-        <w:t>Bonus</w:t>
-      </w:r>
-      <w:r>
-        <w:t xml:space="preserve"> – Current player’s bonus.</w:t>
+        <w:t xml:space="preserve">Handicap </w:t>
+      </w:r>
+      <w:r>
+        <w:t>– The player’s current handicap.</w:t>
+      </w:r>
+    </w:p>
+    <w:p>
+      <w:pPr>
+        <w:pStyle w:val="BodyText"/>
+        <w:keepNext/>
+        <w:ind w:left="720"/>
+        <w:rPr>
+          <w:b/>
+          <w:u w:val="single"/>
+        </w:rPr>
+      </w:pPr>
+      <w:r>
+        <w:rPr>
+          <w:noProof/>
+        </w:rPr>
+        <w:drawing>
+          <wp:inline distT="0" distB="0" distL="0" distR="0" wp14:anchorId="4946DE74" wp14:editId="16A79906">
+            <wp:extent cx="561975" cy="762000"/>
+            <wp:effectExtent l="0" t="0" r="9525" b="0"/>
+            <wp:docPr id="47" name="Picture 47"/>
+            <wp:cNvGraphicFramePr>
+              <a:graphicFrameLocks xmlns:a="http://schemas.openxmlformats.org/drawingml/2006/main" noChangeAspect="1"/>
+            </wp:cNvGraphicFramePr>
+            <a:graphic xmlns:a="http://schemas.openxmlformats.org/drawingml/2006/main">
+              <a:graphicData uri="http://schemas.openxmlformats.org/drawingml/2006/picture">
+                <pic:pic xmlns:pic="http://schemas.openxmlformats.org/drawingml/2006/picture">
+                  <pic:nvPicPr>
+                    <pic:cNvPr id="1" name=""/>
+                    <pic:cNvPicPr/>
+                  </pic:nvPicPr>
+                  <pic:blipFill>
+                    <a:blip r:embed="rId43"/>
+                    <a:stretch>
+                      <a:fillRect/>
+                    </a:stretch>
+                  </pic:blipFill>
+                  <pic:spPr>
+                    <a:xfrm>
+                      <a:off x="0" y="0"/>
+                      <a:ext cx="561975" cy="762000"/>
+                    </a:xfrm>
+                    <a:prstGeom prst="rect">
+                      <a:avLst/>
+                    </a:prstGeom>
+                  </pic:spPr>
+                </pic:pic>
+              </a:graphicData>
+            </a:graphic>
+          </wp:inline>
+        </w:drawing>
       </w:r>
     </w:p>
     <w:p>
@@ -11422,17 +11750,62 @@
           <w:b/>
           <w:u w:val="single"/>
         </w:rPr>
-        <w:t xml:space="preserve"> Pro Pot</w:t>
-      </w:r>
-      <w:r>
-        <w:rPr>
-          <w:i/>
+        <w:t>Bonus</w:t>
+      </w:r>
+      <w:r>
+        <w:t xml:space="preserve"> – Current player’s bonus.</w:t>
+      </w:r>
+    </w:p>
+    <w:p>
+      <w:pPr>
+        <w:pStyle w:val="BodyText"/>
+        <w:keepNext/>
+        <w:ind w:left="720"/>
+        <w:rPr>
+          <w:b/>
           <w:u w:val="single"/>
         </w:rPr>
-        <w:t xml:space="preserve"> </w:t>
-      </w:r>
-      <w:r>
-        <w:t>– Needs work</w:t>
+      </w:pPr>
+      <w:r>
+        <w:rPr>
+          <w:noProof/>
+        </w:rPr>
+        <w:lastRenderedPageBreak/>
+        <w:drawing>
+          <wp:inline distT="0" distB="0" distL="0" distR="0" wp14:anchorId="35A42E1C" wp14:editId="7F36AF82">
+            <wp:extent cx="533400" cy="752475"/>
+            <wp:effectExtent l="0" t="0" r="0" b="9525"/>
+            <wp:docPr id="48" name="Picture 48"/>
+            <wp:cNvGraphicFramePr>
+              <a:graphicFrameLocks xmlns:a="http://schemas.openxmlformats.org/drawingml/2006/main" noChangeAspect="1"/>
+            </wp:cNvGraphicFramePr>
+            <a:graphic xmlns:a="http://schemas.openxmlformats.org/drawingml/2006/main">
+              <a:graphicData uri="http://schemas.openxmlformats.org/drawingml/2006/picture">
+                <pic:pic xmlns:pic="http://schemas.openxmlformats.org/drawingml/2006/picture">
+                  <pic:nvPicPr>
+                    <pic:cNvPr id="1" name=""/>
+                    <pic:cNvPicPr/>
+                  </pic:nvPicPr>
+                  <pic:blipFill>
+                    <a:blip r:embed="rId44"/>
+                    <a:stretch>
+                      <a:fillRect/>
+                    </a:stretch>
+                  </pic:blipFill>
+                  <pic:spPr>
+                    <a:xfrm>
+                      <a:off x="0" y="0"/>
+                      <a:ext cx="533400" cy="752475"/>
+                    </a:xfrm>
+                    <a:prstGeom prst="rect">
+                      <a:avLst/>
+                    </a:prstGeom>
+                  </pic:spPr>
+                </pic:pic>
+              </a:graphicData>
+            </a:graphic>
+          </wp:inline>
+        </w:drawing>
       </w:r>
     </w:p>
     <w:p>
@@ -11453,10 +11826,143 @@
           <w:b/>
           <w:u w:val="single"/>
         </w:rPr>
+        <w:t xml:space="preserve"> Pro Pot</w:t>
+      </w:r>
+      <w:r>
+        <w:rPr>
+          <w:i/>
+          <w:u w:val="single"/>
+        </w:rPr>
+        <w:t xml:space="preserve"> </w:t>
+      </w:r>
+      <w:r>
+        <w:t>– Needs work</w:t>
+      </w:r>
+    </w:p>
+    <w:p>
+      <w:pPr>
+        <w:pStyle w:val="BodyText"/>
+        <w:keepNext/>
+        <w:ind w:left="720"/>
+        <w:rPr>
+          <w:b/>
+          <w:u w:val="single"/>
+        </w:rPr>
+      </w:pPr>
+      <w:r>
+        <w:rPr>
+          <w:noProof/>
+        </w:rPr>
+        <w:drawing>
+          <wp:inline distT="0" distB="0" distL="0" distR="0" wp14:anchorId="3BA00C19" wp14:editId="1E4B13D5">
+            <wp:extent cx="533400" cy="733425"/>
+            <wp:effectExtent l="0" t="0" r="0" b="9525"/>
+            <wp:docPr id="49" name="Picture 49"/>
+            <wp:cNvGraphicFramePr>
+              <a:graphicFrameLocks xmlns:a="http://schemas.openxmlformats.org/drawingml/2006/main" noChangeAspect="1"/>
+            </wp:cNvGraphicFramePr>
+            <a:graphic xmlns:a="http://schemas.openxmlformats.org/drawingml/2006/main">
+              <a:graphicData uri="http://schemas.openxmlformats.org/drawingml/2006/picture">
+                <pic:pic xmlns:pic="http://schemas.openxmlformats.org/drawingml/2006/picture">
+                  <pic:nvPicPr>
+                    <pic:cNvPr id="1" name=""/>
+                    <pic:cNvPicPr/>
+                  </pic:nvPicPr>
+                  <pic:blipFill>
+                    <a:blip r:embed="rId45"/>
+                    <a:stretch>
+                      <a:fillRect/>
+                    </a:stretch>
+                  </pic:blipFill>
+                  <pic:spPr>
+                    <a:xfrm>
+                      <a:off x="0" y="0"/>
+                      <a:ext cx="533400" cy="733425"/>
+                    </a:xfrm>
+                    <a:prstGeom prst="rect">
+                      <a:avLst/>
+                    </a:prstGeom>
+                  </pic:spPr>
+                </pic:pic>
+              </a:graphicData>
+            </a:graphic>
+          </wp:inline>
+        </w:drawing>
+      </w:r>
+    </w:p>
+    <w:p>
+      <w:pPr>
+        <w:pStyle w:val="BodyText"/>
+        <w:keepNext/>
+        <w:numPr>
+          <w:ilvl w:val="0"/>
+          <w:numId w:val="50"/>
+        </w:numPr>
+        <w:rPr>
+          <w:b/>
+          <w:u w:val="single"/>
+        </w:rPr>
+      </w:pPr>
+      <w:r>
+        <w:rPr>
+          <w:b/>
+          <w:u w:val="single"/>
+        </w:rPr>
         <w:t>Notes</w:t>
       </w:r>
       <w:r>
         <w:t xml:space="preserve"> – notes on the current player can be entered here.</w:t>
+      </w:r>
+    </w:p>
+    <w:p>
+      <w:pPr>
+        <w:pStyle w:val="BodyText"/>
+        <w:keepNext/>
+        <w:ind w:left="720"/>
+        <w:rPr>
+          <w:b/>
+          <w:u w:val="single"/>
+        </w:rPr>
+      </w:pPr>
+      <w:r>
+        <w:rPr>
+          <w:noProof/>
+        </w:rPr>
+        <w:drawing>
+          <wp:inline distT="0" distB="0" distL="0" distR="0" wp14:anchorId="6134A815" wp14:editId="2364058E">
+            <wp:extent cx="533400" cy="733425"/>
+            <wp:effectExtent l="0" t="0" r="0" b="9525"/>
+            <wp:docPr id="50" name="Picture 50"/>
+            <wp:cNvGraphicFramePr>
+              <a:graphicFrameLocks xmlns:a="http://schemas.openxmlformats.org/drawingml/2006/main" noChangeAspect="1"/>
+            </wp:cNvGraphicFramePr>
+            <a:graphic xmlns:a="http://schemas.openxmlformats.org/drawingml/2006/main">
+              <a:graphicData uri="http://schemas.openxmlformats.org/drawingml/2006/picture">
+                <pic:pic xmlns:pic="http://schemas.openxmlformats.org/drawingml/2006/picture">
+                  <pic:nvPicPr>
+                    <pic:cNvPr id="1" name=""/>
+                    <pic:cNvPicPr/>
+                  </pic:nvPicPr>
+                  <pic:blipFill>
+                    <a:blip r:embed="rId46"/>
+                    <a:stretch>
+                      <a:fillRect/>
+                    </a:stretch>
+                  </pic:blipFill>
+                  <pic:spPr>
+                    <a:xfrm>
+                      <a:off x="0" y="0"/>
+                      <a:ext cx="533400" cy="733425"/>
+                    </a:xfrm>
+                    <a:prstGeom prst="rect">
+                      <a:avLst/>
+                    </a:prstGeom>
+                  </pic:spPr>
+                </pic:pic>
+              </a:graphicData>
+            </a:graphic>
+          </wp:inline>
+        </w:drawing>
       </w:r>
     </w:p>
     <w:p>
@@ -11542,7 +12048,7 @@
                     <pic:cNvPicPr/>
                   </pic:nvPicPr>
                   <pic:blipFill>
-                    <a:blip r:embed="rId33">
+                    <a:blip r:embed="rId47">
                       <a:extLst>
                         <a:ext uri="{28A0092B-C50C-407E-A947-70E740481C1C}">
                           <a14:useLocalDpi xmlns:a14="http://schemas.microsoft.com/office/drawing/2010/main" val="0"/>
@@ -11577,27 +12083,14 @@
       <w:r>
         <w:t xml:space="preserve">Figure </w:t>
       </w:r>
-      <w:r>
-        <w:fldChar w:fldCharType="begin"/>
-      </w:r>
-      <w:r>
-        <w:instrText xml:space="preserve"> SEQ Figure \* ARABIC </w:instrText>
-      </w:r>
-      <w:r>
-        <w:fldChar w:fldCharType="separate"/>
-      </w:r>
-      <w:r>
-        <w:rPr>
-          <w:noProof/>
-        </w:rPr>
-        <w:t>19</w:t>
-      </w:r>
-      <w:r>
-        <w:rPr>
-          <w:noProof/>
-        </w:rPr>
-        <w:fldChar w:fldCharType="end"/>
-      </w:r>
+      <w:fldSimple w:instr=" SEQ Figure \* ARABIC ">
+        <w:r>
+          <w:rPr>
+            <w:noProof/>
+          </w:rPr>
+          <w:t>19</w:t>
+        </w:r>
+      </w:fldSimple>
       <w:r>
         <w:t>: Update Inactive status</w:t>
       </w:r>
@@ -11871,7 +12364,7 @@
                     <pic:cNvPicPr/>
                   </pic:nvPicPr>
                   <pic:blipFill>
-                    <a:blip r:embed="rId34" cstate="print">
+                    <a:blip r:embed="rId48" cstate="print">
                       <a:extLst>
                         <a:ext uri="{28A0092B-C50C-407E-A947-70E740481C1C}">
                           <a14:useLocalDpi xmlns:a14="http://schemas.microsoft.com/office/drawing/2010/main" val="0"/>
@@ -11906,27 +12399,14 @@
       <w:r>
         <w:t xml:space="preserve">Figure </w:t>
       </w:r>
-      <w:r>
-        <w:fldChar w:fldCharType="begin"/>
-      </w:r>
-      <w:r>
-        <w:instrText xml:space="preserve"> SEQ Figure \* ARABIC </w:instrText>
-      </w:r>
-      <w:r>
-        <w:fldChar w:fldCharType="separate"/>
-      </w:r>
-      <w:r>
-        <w:rPr>
-          <w:noProof/>
-        </w:rPr>
-        <w:t>20</w:t>
-      </w:r>
-      <w:r>
-        <w:rPr>
-          <w:noProof/>
-        </w:rPr>
-        <w:fldChar w:fldCharType="end"/>
-      </w:r>
+      <w:fldSimple w:instr=" SEQ Figure \* ARABIC ">
+        <w:r>
+          <w:rPr>
+            <w:noProof/>
+          </w:rPr>
+          <w:t>20</w:t>
+        </w:r>
+      </w:fldSimple>
       <w:r>
         <w:t xml:space="preserve"> Showing split screen error</w:t>
       </w:r>
@@ -11948,7 +12428,7 @@
         <mc:AlternateContent>
           <mc:Choice Requires="wps">
             <w:drawing>
-              <wp:anchor distT="0" distB="0" distL="114300" distR="114300" simplePos="0" relativeHeight="251659264" behindDoc="0" locked="0" layoutInCell="1" allowOverlap="1" wp14:anchorId="2EB0F7D5" wp14:editId="56206372">
+              <wp:anchor distT="0" distB="0" distL="114300" distR="114300" simplePos="0" relativeHeight="251658240" behindDoc="0" locked="0" layoutInCell="1" allowOverlap="1" wp14:anchorId="2EB0F7D5" wp14:editId="56206372">
                 <wp:simplePos x="0" y="0"/>
                 <wp:positionH relativeFrom="column">
                   <wp:posOffset>3175</wp:posOffset>
@@ -11994,27 +12474,14 @@
                             <w:r>
                               <w:t xml:space="preserve">Figure </w:t>
                             </w:r>
-                            <w:r>
-                              <w:fldChar w:fldCharType="begin"/>
-                            </w:r>
-                            <w:r>
-                              <w:instrText xml:space="preserve"> SEQ Figure \* ARABIC </w:instrText>
-                            </w:r>
-                            <w:r>
-                              <w:fldChar w:fldCharType="separate"/>
-                            </w:r>
-                            <w:r>
-                              <w:rPr>
-                                <w:noProof/>
-                              </w:rPr>
-                              <w:t>21</w:t>
-                            </w:r>
-                            <w:r>
-                              <w:rPr>
-                                <w:noProof/>
-                              </w:rPr>
-                              <w:fldChar w:fldCharType="end"/>
-                            </w:r>
+                            <w:fldSimple w:instr=" SEQ Figure \* ARABIC ">
+                              <w:r>
+                                <w:rPr>
+                                  <w:noProof/>
+                                </w:rPr>
+                                <w:t>21</w:t>
+                              </w:r>
+                            </w:fldSimple>
                             <w:r>
                               <w:t xml:space="preserve"> Inner screen maximize</w:t>
                             </w:r>
@@ -12042,7 +12509,7 @@
                 <v:stroke joinstyle="miter"/>
                 <v:path gradientshapeok="t" o:connecttype="rect"/>
               </v:shapetype>
-              <v:shape id="Text Box 24" o:spid="_x0000_s1026" type="#_x0000_t202" style="position:absolute;left:0;text-align:left;margin-left:.25pt;margin-top:98.8pt;width:154.5pt;height:13.5pt;z-index:251659264;visibility:visible;mso-wrap-style:square;mso-height-percent:0;mso-wrap-distance-left:9pt;mso-wrap-distance-top:0;mso-wrap-distance-right:9pt;mso-wrap-distance-bottom:0;mso-position-horizontal:absolute;mso-position-horizontal-relative:text;mso-position-vertical:absolute;mso-position-vertical-relative:text;mso-height-percent:0;mso-height-relative:margin;v-text-anchor:top" o:gfxdata="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" stroked="f">
+              <v:shape id="Text Box 24" o:spid="_x0000_s1026" type="#_x0000_t202" style="position:absolute;left:0;text-align:left;margin-left:.25pt;margin-top:98.8pt;width:154.5pt;height:13.5pt;z-index:251658240;visibility:visible;mso-wrap-style:square;mso-height-percent:0;mso-wrap-distance-left:9pt;mso-wrap-distance-top:0;mso-wrap-distance-right:9pt;mso-wrap-distance-bottom:0;mso-position-horizontal:absolute;mso-position-horizontal-relative:text;mso-position-vertical:absolute;mso-position-vertical-relative:text;mso-height-percent:0;mso-height-relative:margin;v-text-anchor:top" o:gfxdata="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" stroked="f">
                 <v:textbox inset="0,0,0,0">
                   <w:txbxContent>
                     <w:p>
@@ -12056,27 +12523,14 @@
                       <w:r>
                         <w:t xml:space="preserve">Figure </w:t>
                       </w:r>
-                      <w:r>
-                        <w:fldChar w:fldCharType="begin"/>
-                      </w:r>
-                      <w:r>
-                        <w:instrText xml:space="preserve"> SEQ Figure \* ARABIC </w:instrText>
-                      </w:r>
-                      <w:r>
-                        <w:fldChar w:fldCharType="separate"/>
-                      </w:r>
-                      <w:r>
-                        <w:rPr>
-                          <w:noProof/>
-                        </w:rPr>
-                        <w:t>21</w:t>
-                      </w:r>
-                      <w:r>
-                        <w:rPr>
-                          <w:noProof/>
-                        </w:rPr>
-                        <w:fldChar w:fldCharType="end"/>
-                      </w:r>
+                      <w:fldSimple w:instr=" SEQ Figure \* ARABIC ">
+                        <w:r>
+                          <w:rPr>
+                            <w:noProof/>
+                          </w:rPr>
+                          <w:t>21</w:t>
+                        </w:r>
+                      </w:fldSimple>
                       <w:r>
                         <w:t xml:space="preserve"> Inner screen maximize</w:t>
                       </w:r>
@@ -12094,7 +12548,7 @@
           <w:noProof/>
         </w:rPr>
         <w:drawing>
-          <wp:anchor distT="0" distB="0" distL="114300" distR="114300" simplePos="0" relativeHeight="251657216" behindDoc="0" locked="0" layoutInCell="1" allowOverlap="1">
+          <wp:anchor distT="0" distB="0" distL="114300" distR="114300" simplePos="0" relativeHeight="251656192" behindDoc="0" locked="0" layoutInCell="1" allowOverlap="1">
             <wp:simplePos x="0" y="0"/>
             <wp:positionH relativeFrom="column">
               <wp:posOffset>3175</wp:posOffset>
@@ -12117,7 +12571,7 @@
                     <pic:cNvPicPr/>
                   </pic:nvPicPr>
                   <pic:blipFill>
-                    <a:blip r:embed="rId35">
+                    <a:blip r:embed="rId49">
                       <a:extLst>
                         <a:ext uri="{28A0092B-C50C-407E-A947-70E740481C1C}">
                           <a14:useLocalDpi xmlns:a14="http://schemas.microsoft.com/office/drawing/2010/main" val="0"/>
@@ -15656,9 +16110,9 @@
     <w:p>
       <w:pPr>
         <w:sectPr>
-          <w:headerReference w:type="default" r:id="rId36"/>
-          <w:footerReference w:type="default" r:id="rId37"/>
-          <w:headerReference w:type="first" r:id="rId38"/>
+          <w:headerReference w:type="default" r:id="rId50"/>
+          <w:footerReference w:type="default" r:id="rId51"/>
+          <w:headerReference w:type="first" r:id="rId52"/>
           <w:type w:val="continuous"/>
           <w:pgSz w:w="12240" w:h="15840" w:code="1"/>
           <w:pgMar w:top="1800" w:right="1195" w:bottom="1440" w:left="3355" w:header="720" w:footer="720" w:gutter="0"/>
@@ -17066,7 +17520,7 @@
         <w:rStyle w:val="PageNumber"/>
         <w:noProof/>
       </w:rPr>
-      <w:t>33</w:t>
+      <w:t>32</w:t>
     </w:r>
     <w:r>
       <w:rPr>
@@ -17116,7 +17570,7 @@
         <w:rStyle w:val="PageNumber"/>
         <w:noProof/>
       </w:rPr>
-      <w:t>42</w:t>
+      <w:t>44</w:t>
     </w:r>
     <w:r>
       <w:rPr>
@@ -18628,7 +19082,7 @@
         <w:ind w:left="720" w:hanging="360"/>
       </w:pPr>
     </w:lvl>
-    <w:lvl w:ilvl="1" w:tplc="04090019" w:tentative="1">
+    <w:lvl w:ilvl="1" w:tplc="04090019">
       <w:start w:val="1"/>
       <w:numFmt w:val="lowerLetter"/>
       <w:lvlText w:val="%2."/>
@@ -20991,6 +21445,17 @@
       <w:szCs w:val="32"/>
     </w:rPr>
   </w:style>
+  <w:style w:type="paragraph" w:styleId="ListParagraph">
+    <w:name w:val="List Paragraph"/>
+    <w:basedOn w:val="Normal"/>
+    <w:uiPriority w:val="34"/>
+    <w:qFormat/>
+    <w:rsid w:val="00A40A38"/>
+    <w:pPr>
+      <w:ind w:left="720"/>
+      <w:contextualSpacing/>
+    </w:pPr>
+  </w:style>
 </w:styles>
 </file>
 
@@ -21260,7 +21725,7 @@
 </file>
 
 <file path=customXml/itemProps1.xml><?xml version="1.0" encoding="utf-8"?>
-<ds:datastoreItem xmlns:ds="http://schemas.openxmlformats.org/officeDocument/2006/customXml" ds:itemID="{4C76EB0D-5A3F-4563-9C32-5CB1C4ABFBCF}">
+<ds:datastoreItem xmlns:ds="http://schemas.openxmlformats.org/officeDocument/2006/customXml" ds:itemID="{1801B586-5C3F-4F53-A5E6-559D77872F46}">
   <ds:schemaRefs>
     <ds:schemaRef ds:uri="http://schemas.openxmlformats.org/officeDocument/2006/bibliography"/>
   </ds:schemaRefs>

</xml_diff>

<commit_message>
Added a subheading for the visual information regarding the Finalize Tournament window.
</commit_message>
<xml_diff>
--- a/9tapUserManual.docx
+++ b/9tapUserManual.docx
@@ -10767,61 +10767,69 @@
       <w:r>
         <w:t xml:space="preserve"> name in the middle, and their starting average</w:t>
       </w:r>
+      <w:r>
+        <w:t xml:space="preserve"> on the right.</w:t>
+      </w:r>
+      <w:r>
+        <w:t xml:space="preserve"> This second sub window can be organized like the above one.</w:t>
+      </w:r>
+      <w:r>
+        <w:t xml:space="preserve"> Game scores, adjusted average, notes, and the date can be modified here. Changing a score will not automatically recalculate the scratch total in the lower sub window.</w:t>
+      </w:r>
+      <w:r>
+        <w:t xml:space="preserve"> </w:t>
+      </w:r>
+    </w:p>
+    <w:p>
+      <w:pPr>
+        <w:pStyle w:val="Heading2"/>
+      </w:pPr>
+      <w:r>
+        <w:t>Finalizing a tournament</w:t>
+      </w:r>
+    </w:p>
+    <w:p>
+      <w:pPr>
+        <w:pStyle w:val="BodyText"/>
+      </w:pPr>
+      <w:r>
+        <w:t>In order for the tournament to be finalized a</w:t>
+      </w:r>
+      <w:r>
+        <w:t>ll the director needs to do is check every one of the Director Check boxes to confirm that they’</w:t>
+      </w:r>
+      <w:r>
+        <w:t>ve inspected that player’s recap</w:t>
+      </w:r>
+      <w:r>
+        <w:t xml:space="preserve">. This means modifying scores, averages, adding a bonus or a pro pot, and adding any </w:t>
+      </w:r>
+      <w:r>
+        <w:lastRenderedPageBreak/>
+        <w:t>notes that may be needed for a particular player.</w:t>
+      </w:r>
+      <w:r>
+        <w:t xml:space="preserve"> After all of this is done, the director checks off the Director Check box for that player. </w:t>
+      </w:r>
+      <w:r>
+        <w:t>Once all of the boxes are checked, the tournament can be finalized by clicking the Finalize button at the bottom of the form. If it so happens that the director fails to check a player’s box, upon attempting to f</w:t>
+      </w:r>
+      <w:r>
+        <w:t>inalize the tournament that box</w:t>
+      </w:r>
+      <w:r>
+        <w:t xml:space="preserve"> will be highlighted in red.</w:t>
+      </w:r>
+    </w:p>
+    <w:p>
+      <w:pPr>
+        <w:pStyle w:val="Heading2"/>
+      </w:pPr>
+      <w:r>
+        <w:t>The Finalize Tournament window</w:t>
+      </w:r>
       <w:bookmarkStart w:id="40" w:name="_GoBack"/>
       <w:bookmarkEnd w:id="40"/>
-      <w:r>
-        <w:t xml:space="preserve"> on the right.</w:t>
-      </w:r>
-      <w:r>
-        <w:t xml:space="preserve"> This second sub window can be organized like the above one.</w:t>
-      </w:r>
-      <w:r>
-        <w:t xml:space="preserve"> Game scores, adjusted average, notes, and the date can be modified here. Changing a score will not automatically recalculate the scratch total in the lower sub window.</w:t>
-      </w:r>
-      <w:r>
-        <w:t xml:space="preserve"> </w:t>
-      </w:r>
-    </w:p>
-    <w:p>
-      <w:pPr>
-        <w:pStyle w:val="Heading2"/>
-      </w:pPr>
-      <w:r>
-        <w:t>Finalizing a tournament</w:t>
-      </w:r>
-    </w:p>
-    <w:p>
-      <w:pPr>
-        <w:pStyle w:val="BodyText"/>
-      </w:pPr>
-      <w:r>
-        <w:t>In order for the tournament to be finalized a</w:t>
-      </w:r>
-      <w:r>
-        <w:t>ll the director needs to do is check every one of the Director Check boxes to confirm that they’</w:t>
-      </w:r>
-      <w:r>
-        <w:t>ve inspected that player’s recap</w:t>
-      </w:r>
-      <w:r>
-        <w:t xml:space="preserve">. This means modifying scores, averages, adding a bonus or a pro pot, and adding any </w:t>
-      </w:r>
-      <w:r>
-        <w:lastRenderedPageBreak/>
-        <w:t>notes that may be needed for a particular player.</w:t>
-      </w:r>
-      <w:r>
-        <w:t xml:space="preserve"> After all of this is done, the director checks off the Director Check box for that player. </w:t>
-      </w:r>
-      <w:r>
-        <w:t>Once all of the boxes are checked, the tournament can be finalized by clicking the Finalize button at the bottom of the form. If it so happens that the director fails to check a player’s box, upon attempting to f</w:t>
-      </w:r>
-      <w:r>
-        <w:t>inalize the tournament that box</w:t>
-      </w:r>
-      <w:r>
-        <w:t xml:space="preserve"> will be highlighted in red.</w:t>
-      </w:r>
     </w:p>
     <w:p>
       <w:pPr>
@@ -12428,7 +12436,7 @@
         <mc:AlternateContent>
           <mc:Choice Requires="wps">
             <w:drawing>
-              <wp:anchor distT="0" distB="0" distL="114300" distR="114300" simplePos="0" relativeHeight="251658240" behindDoc="0" locked="0" layoutInCell="1" allowOverlap="1" wp14:anchorId="2EB0F7D5" wp14:editId="56206372">
+              <wp:anchor distT="0" distB="0" distL="114300" distR="114300" simplePos="0" relativeHeight="251659264" behindDoc="0" locked="0" layoutInCell="1" allowOverlap="1" wp14:anchorId="2EB0F7D5" wp14:editId="56206372">
                 <wp:simplePos x="0" y="0"/>
                 <wp:positionH relativeFrom="column">
                   <wp:posOffset>3175</wp:posOffset>
@@ -12509,7 +12517,7 @@
                 <v:stroke joinstyle="miter"/>
                 <v:path gradientshapeok="t" o:connecttype="rect"/>
               </v:shapetype>
-              <v:shape id="Text Box 24" o:spid="_x0000_s1026" type="#_x0000_t202" style="position:absolute;left:0;text-align:left;margin-left:.25pt;margin-top:98.8pt;width:154.5pt;height:13.5pt;z-index:251658240;visibility:visible;mso-wrap-style:square;mso-height-percent:0;mso-wrap-distance-left:9pt;mso-wrap-distance-top:0;mso-wrap-distance-right:9pt;mso-wrap-distance-bottom:0;mso-position-horizontal:absolute;mso-position-horizontal-relative:text;mso-position-vertical:absolute;mso-position-vertical-relative:text;mso-height-percent:0;mso-height-relative:margin;v-text-anchor:top" o:gfxdata="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" stroked="f">
+              <v:shape id="Text Box 24" o:spid="_x0000_s1026" type="#_x0000_t202" style="position:absolute;left:0;text-align:left;margin-left:.25pt;margin-top:98.8pt;width:154.5pt;height:13.5pt;z-index:251659264;visibility:visible;mso-wrap-style:square;mso-height-percent:0;mso-wrap-distance-left:9pt;mso-wrap-distance-top:0;mso-wrap-distance-right:9pt;mso-wrap-distance-bottom:0;mso-position-horizontal:absolute;mso-position-horizontal-relative:text;mso-position-vertical:absolute;mso-position-vertical-relative:text;mso-height-percent:0;mso-height-relative:margin;v-text-anchor:top" o:gfxdata="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" stroked="f">
                 <v:textbox inset="0,0,0,0">
                   <w:txbxContent>
                     <w:p>
@@ -12548,7 +12556,7 @@
           <w:noProof/>
         </w:rPr>
         <w:drawing>
-          <wp:anchor distT="0" distB="0" distL="114300" distR="114300" simplePos="0" relativeHeight="251656192" behindDoc="0" locked="0" layoutInCell="1" allowOverlap="1">
+          <wp:anchor distT="0" distB="0" distL="114300" distR="114300" simplePos="0" relativeHeight="251657216" behindDoc="0" locked="0" layoutInCell="1" allowOverlap="1">
             <wp:simplePos x="0" y="0"/>
             <wp:positionH relativeFrom="column">
               <wp:posOffset>3175</wp:posOffset>
@@ -21725,7 +21733,7 @@
 </file>
 
 <file path=customXml/itemProps1.xml><?xml version="1.0" encoding="utf-8"?>
-<ds:datastoreItem xmlns:ds="http://schemas.openxmlformats.org/officeDocument/2006/customXml" ds:itemID="{1801B586-5C3F-4F53-A5E6-559D77872F46}">
+<ds:datastoreItem xmlns:ds="http://schemas.openxmlformats.org/officeDocument/2006/customXml" ds:itemID="{7D1D9413-F1C4-43E8-B7CA-6DE28E10E0A7}">
   <ds:schemaRefs>
     <ds:schemaRef ds:uri="http://schemas.openxmlformats.org/officeDocument/2006/bibliography"/>
   </ds:schemaRefs>

</xml_diff>

<commit_message>
Fixed some typos, added a note regarding broken bookmarks, Word enters compatibility mode and that breaks the bookmarks.
</commit_message>
<xml_diff>
--- a/9tapUserManual.docx
+++ b/9tapUserManual.docx
@@ -173,6 +173,7 @@
         </w:sectPr>
       </w:pPr>
     </w:p>
+    <w:bookmarkStart w:id="0" w:name="_GoBack" w:displacedByCustomXml="next"/>
     <w:sdt>
       <w:sdtPr>
         <w:rPr>
@@ -225,6 +226,7 @@
             <w:t>able of Contents</w:t>
           </w:r>
         </w:p>
+        <w:bookmarkEnd w:id="0"/>
         <w:p>
           <w:pPr>
             <w:pStyle w:val="TOC1"/>
@@ -4003,7 +4005,7 @@
       <w:pPr>
         <w:pStyle w:val="Heading1"/>
       </w:pPr>
-      <w:bookmarkStart w:id="0" w:name="_Toc509165828"/>
+      <w:bookmarkStart w:id="1" w:name="_Toc509165828"/>
       <w:r>
         <w:lastRenderedPageBreak/>
         <w:t>About</w:t>
@@ -4054,7 +4056,7 @@
       <w:r>
         <w:t xml:space="preserve"> INC</w:t>
       </w:r>
-      <w:bookmarkEnd w:id="0"/>
+      <w:bookmarkEnd w:id="1"/>
     </w:p>
     <w:p>
       <w:pPr>
@@ -4229,8 +4231,8 @@
           <w:szCs w:val="20"/>
         </w:rPr>
       </w:pPr>
-      <w:bookmarkStart w:id="1" w:name="_Toc508882989"/>
-      <w:bookmarkStart w:id="2" w:name="_Toc509165829"/>
+      <w:bookmarkStart w:id="2" w:name="_Toc508882989"/>
+      <w:bookmarkStart w:id="3" w:name="_Toc509165829"/>
       <w:r>
         <w:rPr>
           <w:szCs w:val="20"/>
@@ -4238,8 +4240,8 @@
         <w:lastRenderedPageBreak/>
         <w:t>Dedication:</w:t>
       </w:r>
-      <w:bookmarkEnd w:id="1"/>
       <w:bookmarkEnd w:id="2"/>
+      <w:bookmarkEnd w:id="3"/>
     </w:p>
     <w:p>
       <w:pPr>
@@ -4274,7 +4276,7 @@
           <w:szCs w:val="40"/>
         </w:rPr>
       </w:pPr>
-      <w:bookmarkStart w:id="3" w:name="_Toc509165830"/>
+      <w:bookmarkStart w:id="4" w:name="_Toc509165830"/>
       <w:r>
         <w:rPr>
           <w:sz w:val="40"/>
@@ -4297,7 +4299,7 @@
         </w:rPr>
         <w:t>9-Tap?</w:t>
       </w:r>
-      <w:bookmarkEnd w:id="3"/>
+      <w:bookmarkEnd w:id="4"/>
     </w:p>
     <w:p>
       <w:pPr>
@@ -4320,7 +4322,7 @@
           <w:noProof/>
         </w:rPr>
         <w:drawing>
-          <wp:inline distT="0" distB="0" distL="0" distR="0">
+          <wp:inline distT="0" distB="0" distL="0" distR="0" wp14:anchorId="4B6E86AC" wp14:editId="6A3163E7">
             <wp:extent cx="4883150" cy="2623280"/>
             <wp:effectExtent l="0" t="0" r="0" b="5715"/>
             <wp:docPr id="3" name="Picture 3"/>
@@ -4448,18 +4450,18 @@
       <w:pPr>
         <w:pStyle w:val="Heading2"/>
       </w:pPr>
-      <w:bookmarkStart w:id="4" w:name="_Toc509165831"/>
+      <w:bookmarkStart w:id="5" w:name="_Toc509165831"/>
       <w:r>
         <w:lastRenderedPageBreak/>
         <w:t>A good place to start</w:t>
       </w:r>
-      <w:bookmarkEnd w:id="4"/>
+      <w:bookmarkEnd w:id="5"/>
     </w:p>
     <w:p>
       <w:pPr>
         <w:pStyle w:val="Heading3"/>
       </w:pPr>
-      <w:bookmarkStart w:id="5" w:name="_Toc509165832"/>
+      <w:bookmarkStart w:id="6" w:name="_Toc509165832"/>
       <w:r>
         <w:t>Quick start</w:t>
       </w:r>
@@ -4504,9 +4506,14 @@
         <w:fldChar w:fldCharType="end"/>
       </w:r>
       <w:r>
-        <w:t xml:space="preserve"> guide</w:t>
-      </w:r>
-      <w:bookmarkEnd w:id="5"/>
+        <w:t xml:space="preserve"> </w:t>
+      </w:r>
+      <w:proofErr w:type="gramStart"/>
+      <w:r>
+        <w:t>guide</w:t>
+      </w:r>
+      <w:bookmarkEnd w:id="6"/>
+      <w:proofErr w:type="gramEnd"/>
     </w:p>
     <w:p>
       <w:pPr>
@@ -4526,11 +4533,11 @@
       <w:pPr>
         <w:pStyle w:val="Heading3"/>
       </w:pPr>
-      <w:bookmarkStart w:id="6" w:name="_Toc509165833"/>
+      <w:bookmarkStart w:id="7" w:name="_Toc509165833"/>
       <w:r>
         <w:t>Troubleshooting</w:t>
       </w:r>
-      <w:bookmarkEnd w:id="6"/>
+      <w:bookmarkEnd w:id="7"/>
       <w:r>
         <w:fldChar w:fldCharType="begin"/>
       </w:r>
@@ -4590,7 +4597,7 @@
       <w:pPr>
         <w:pStyle w:val="Heading2"/>
       </w:pPr>
-      <w:bookmarkStart w:id="7" w:name="_Toc509165834"/>
+      <w:bookmarkStart w:id="8" w:name="_Toc509165834"/>
       <w:r>
         <w:t xml:space="preserve">Menus </w:t>
       </w:r>
@@ -4600,7 +4607,7 @@
       <w:r>
         <w:t>uide</w:t>
       </w:r>
-      <w:bookmarkEnd w:id="7"/>
+      <w:bookmarkEnd w:id="8"/>
       <w:r>
         <w:fldChar w:fldCharType="begin"/>
       </w:r>
@@ -4793,7 +4800,7 @@
       <w:pPr>
         <w:pStyle w:val="Heading1"/>
       </w:pPr>
-      <w:bookmarkStart w:id="8" w:name="_Toc509165835"/>
+      <w:bookmarkStart w:id="9" w:name="_Toc509165835"/>
       <w:r>
         <w:lastRenderedPageBreak/>
         <w:t>Quick Start</w:t>
@@ -4841,7 +4848,7 @@
       <w:r>
         <w:t xml:space="preserve"> Guide</w:t>
       </w:r>
-      <w:bookmarkEnd w:id="8"/>
+      <w:bookmarkEnd w:id="9"/>
     </w:p>
     <w:p>
       <w:pPr>
@@ -4862,7 +4869,7 @@
       <w:pPr>
         <w:pStyle w:val="Heading2"/>
       </w:pPr>
-      <w:bookmarkStart w:id="9" w:name="_Toc509165836"/>
+      <w:bookmarkStart w:id="10" w:name="_Toc509165836"/>
       <w:r>
         <w:t>What are the system requirements</w:t>
       </w:r>
@@ -4907,9 +4914,17 @@
         <w:fldChar w:fldCharType="end"/>
       </w:r>
       <w:r>
-        <w:t xml:space="preserve"> to run 9-Tap?</w:t>
-      </w:r>
-      <w:bookmarkEnd w:id="9"/>
+        <w:t xml:space="preserve"> </w:t>
+      </w:r>
+      <w:proofErr w:type="gramStart"/>
+      <w:r>
+        <w:t>to</w:t>
+      </w:r>
+      <w:proofErr w:type="gramEnd"/>
+      <w:r>
+        <w:t xml:space="preserve"> run 9-Tap?</w:t>
+      </w:r>
+      <w:bookmarkEnd w:id="10"/>
     </w:p>
     <w:p>
       <w:pPr>
@@ -4944,7 +4959,7 @@
       <w:pPr>
         <w:pStyle w:val="Heading2"/>
       </w:pPr>
-      <w:bookmarkStart w:id="10" w:name="_Toc509165837"/>
+      <w:bookmarkStart w:id="11" w:name="_Toc509165837"/>
       <w:r>
         <w:t>How do I install 9-Tap</w:t>
       </w:r>
@@ -4968,7 +4983,15 @@
           <w:b/>
           <w:bCs/>
         </w:rPr>
-        <w:t>Error! Bookmark not defined.</w:t>
+        <w:t xml:space="preserve">Error! Bookmark not </w:t>
+      </w:r>
+      <w:proofErr w:type="gramStart"/>
+      <w:r>
+        <w:rPr>
+          <w:b/>
+          <w:bCs/>
+        </w:rPr>
+        <w:t>defined.</w:t>
       </w:r>
       <w:r>
         <w:fldChar w:fldCharType="end"/>
@@ -4976,7 +4999,8 @@
       <w:r>
         <w:t>?</w:t>
       </w:r>
-      <w:bookmarkEnd w:id="10"/>
+      <w:bookmarkEnd w:id="11"/>
+      <w:proofErr w:type="gramEnd"/>
     </w:p>
     <w:p>
       <w:pPr>
@@ -5095,7 +5119,15 @@
         <w:t>o</w:t>
       </w:r>
       <w:r>
-        <w:t>se another. If you don’t want a Start Menu folder to be created check the box “Do Not Create A Start Menu Folder”. Once you are satisfied with your selection click the “Next” button to continue.</w:t>
+        <w:t xml:space="preserve">se another. If you don’t want a Start Menu folder to be created check the box “Do Not Create </w:t>
+      </w:r>
+      <w:proofErr w:type="gramStart"/>
+      <w:r>
+        <w:t>A</w:t>
+      </w:r>
+      <w:proofErr w:type="gramEnd"/>
+      <w:r>
+        <w:t xml:space="preserve"> Start Menu Folder”. Once you are satisfied with your selection click the “Next” button to continue.</w:t>
       </w:r>
     </w:p>
     <w:p>
@@ -5252,7 +5284,15 @@
         <w:t>o</w:t>
       </w:r>
       <w:r>
-        <w:t>se another. If you don’t want a Start Menu folder to be created check the box “Do Not Create A Start Menu Folder”. Once you are satisfied with your selection click the “Next” button to continue.</w:t>
+        <w:t xml:space="preserve">se another. If you don’t want a Start Menu folder to be created check the box “Do Not Create </w:t>
+      </w:r>
+      <w:proofErr w:type="gramStart"/>
+      <w:r>
+        <w:t>A</w:t>
+      </w:r>
+      <w:proofErr w:type="gramEnd"/>
+      <w:r>
+        <w:t xml:space="preserve"> Start Menu Folder”. Once you are satisfied with your selection click the “Next” button to continue.</w:t>
       </w:r>
     </w:p>
     <w:p>
@@ -5301,11 +5341,11 @@
       <w:pPr>
         <w:pStyle w:val="Heading2"/>
       </w:pPr>
-      <w:bookmarkStart w:id="11" w:name="_Toc509165838"/>
+      <w:bookmarkStart w:id="12" w:name="_Toc509165838"/>
       <w:r>
         <w:t>How do I Launch 9-Tap?</w:t>
       </w:r>
-      <w:bookmarkEnd w:id="11"/>
+      <w:bookmarkEnd w:id="12"/>
     </w:p>
     <w:p>
       <w:pPr>
@@ -5328,7 +5368,7 @@
       <w:pPr>
         <w:pStyle w:val="Heading2"/>
       </w:pPr>
-      <w:bookmarkStart w:id="12" w:name="_Toc509165839"/>
+      <w:bookmarkStart w:id="13" w:name="_Toc509165839"/>
       <w:r>
         <w:lastRenderedPageBreak/>
         <w:t>How do I import existing</w:t>
@@ -5359,9 +5399,17 @@
         <w:fldChar w:fldCharType="end"/>
       </w:r>
       <w:r>
-        <w:t xml:space="preserve"> members?</w:t>
-      </w:r>
-      <w:bookmarkEnd w:id="12"/>
+        <w:t xml:space="preserve"> </w:t>
+      </w:r>
+      <w:proofErr w:type="gramStart"/>
+      <w:r>
+        <w:t>members</w:t>
+      </w:r>
+      <w:proofErr w:type="gramEnd"/>
+      <w:r>
+        <w:t>?</w:t>
+      </w:r>
+      <w:bookmarkEnd w:id="13"/>
     </w:p>
     <w:p>
       <w:pPr>
@@ -5411,7 +5459,15 @@
         <w:fldChar w:fldCharType="end"/>
       </w:r>
       <w:r>
-        <w:t xml:space="preserve"> screen, </w:t>
+        <w:t xml:space="preserve"> </w:t>
+      </w:r>
+      <w:proofErr w:type="gramStart"/>
+      <w:r>
+        <w:t>screen</w:t>
+      </w:r>
+      <w:proofErr w:type="gramEnd"/>
+      <w:r>
+        <w:t xml:space="preserve">, </w:t>
       </w:r>
       <w:r>
         <w:t>f</w:t>
@@ -5433,11 +5489,11 @@
       <w:pPr>
         <w:pStyle w:val="Heading2"/>
       </w:pPr>
-      <w:bookmarkStart w:id="13" w:name="_Toc509165840"/>
+      <w:bookmarkStart w:id="14" w:name="_Toc509165840"/>
       <w:r>
         <w:t>How do I enter a new player?</w:t>
       </w:r>
-      <w:bookmarkEnd w:id="13"/>
+      <w:bookmarkEnd w:id="14"/>
     </w:p>
     <w:p>
       <w:pPr>
@@ -5487,7 +5543,15 @@
         <w:fldChar w:fldCharType="end"/>
       </w:r>
       <w:r>
-        <w:t xml:space="preserve"> screen, Click </w:t>
+        <w:t xml:space="preserve"> </w:t>
+      </w:r>
+      <w:proofErr w:type="gramStart"/>
+      <w:r>
+        <w:t>screen</w:t>
+      </w:r>
+      <w:proofErr w:type="gramEnd"/>
+      <w:r>
+        <w:t xml:space="preserve">, Click </w:t>
       </w:r>
       <w:r>
         <w:t>“New” button.</w:t>
@@ -5512,11 +5576,11 @@
       <w:pPr>
         <w:pStyle w:val="Heading2"/>
       </w:pPr>
-      <w:bookmarkStart w:id="14" w:name="_Toc509165841"/>
+      <w:bookmarkStart w:id="15" w:name="_Toc509165841"/>
       <w:r>
         <w:t>How do I create a tournament?</w:t>
       </w:r>
-      <w:bookmarkEnd w:id="14"/>
+      <w:bookmarkEnd w:id="15"/>
     </w:p>
     <w:p>
       <w:pPr>
@@ -5566,7 +5630,15 @@
         <w:fldChar w:fldCharType="end"/>
       </w:r>
       <w:r>
-        <w:t xml:space="preserve"> screen, </w:t>
+        <w:t xml:space="preserve"> </w:t>
+      </w:r>
+      <w:proofErr w:type="gramStart"/>
+      <w:r>
+        <w:t>screen</w:t>
+      </w:r>
+      <w:proofErr w:type="gramEnd"/>
+      <w:r>
+        <w:t xml:space="preserve">, </w:t>
       </w:r>
       <w:r>
         <w:t xml:space="preserve">click on the </w:t>
@@ -5652,11 +5724,11 @@
       <w:pPr>
         <w:pStyle w:val="Heading2"/>
       </w:pPr>
-      <w:bookmarkStart w:id="15" w:name="_Toc509165842"/>
+      <w:bookmarkStart w:id="16" w:name="_Toc509165842"/>
       <w:r>
         <w:t>How do I enter a bowler’s scores?</w:t>
       </w:r>
-      <w:bookmarkEnd w:id="15"/>
+      <w:bookmarkEnd w:id="16"/>
     </w:p>
     <w:p>
       <w:pPr>
@@ -5706,7 +5778,15 @@
         <w:fldChar w:fldCharType="end"/>
       </w:r>
       <w:r>
-        <w:t xml:space="preserve"> screen, in the Tournament Files section, select </w:t>
+        <w:t xml:space="preserve"> </w:t>
+      </w:r>
+      <w:proofErr w:type="gramStart"/>
+      <w:r>
+        <w:t>screen</w:t>
+      </w:r>
+      <w:proofErr w:type="gramEnd"/>
+      <w:r>
+        <w:t xml:space="preserve">, in the Tournament Files section, select </w:t>
       </w:r>
       <w:r>
         <w:t>a</w:t>
@@ -5880,7 +5960,7 @@
           <w:szCs w:val="32"/>
         </w:rPr>
       </w:pPr>
-      <w:bookmarkStart w:id="16" w:name="_Toc509165843"/>
+      <w:bookmarkStart w:id="17" w:name="_Toc509165843"/>
       <w:r>
         <w:rPr>
           <w:szCs w:val="32"/>
@@ -5888,7 +5968,7 @@
         <w:lastRenderedPageBreak/>
         <w:t>Main Menu</w:t>
       </w:r>
-      <w:bookmarkEnd w:id="16"/>
+      <w:bookmarkEnd w:id="17"/>
       <w:r>
         <w:rPr>
           <w:szCs w:val="32"/>
@@ -6013,56 +6093,40 @@
           <w:b/>
           <w:bCs/>
         </w:rPr>
-        <w:t>Error! Bookmark not defined.</w:t>
-      </w:r>
-      <w:r>
-        <w:fldChar w:fldCharType="end"/>
-      </w:r>
-      <w:r>
-        <w:t>, button and tab. Member Scores</w:t>
-      </w:r>
-      <w:r>
-        <w:fldChar w:fldCharType="begin"/>
-      </w:r>
-      <w:r>
-        <w:instrText xml:space="preserve"> XE "</w:instrText>
-      </w:r>
-      <w:r>
-        <w:instrText>Member Scores</w:instrText>
-      </w:r>
-      <w:r>
-        <w:instrText xml:space="preserve">" </w:instrText>
-      </w:r>
-      <w:r>
-        <w:fldChar w:fldCharType="end"/>
-      </w:r>
-      <w:r>
-        <w:fldChar w:fldCharType="begin"/>
-      </w:r>
-      <w:r>
-        <w:instrText xml:space="preserve"> E "</w:instrText>
-      </w:r>
-      <w:r>
-        <w:instrText>Member Scores</w:instrText>
-      </w:r>
-      <w:r>
-        <w:instrText xml:space="preserve">" </w:instrText>
-      </w:r>
-      <w:r>
-        <w:fldChar w:fldCharType="separate"/>
-      </w:r>
+        <w:t xml:space="preserve">Error! Bookmark not </w:t>
+      </w:r>
+      <w:proofErr w:type="gramStart"/>
       <w:r>
         <w:rPr>
           <w:b/>
           <w:bCs/>
         </w:rPr>
-        <w:t>Error! Bookmark not defined.</w:t>
-      </w:r>
-      <w:r>
-        <w:fldChar w:fldCharType="end"/>
-      </w:r>
-      <w:r>
-        <w:t>, button and tab. The About</w:t>
+        <w:t>defined.</w:t>
+      </w:r>
+      <w:r>
+        <w:fldChar w:fldCharType="end"/>
+      </w:r>
+      <w:r>
+        <w:t>,</w:t>
+      </w:r>
+      <w:proofErr w:type="gramEnd"/>
+      <w:r>
+        <w:t xml:space="preserve"> button and tab. Member Scores</w:t>
+      </w:r>
+      <w:r>
+        <w:fldChar w:fldCharType="begin"/>
+      </w:r>
+      <w:r>
+        <w:instrText xml:space="preserve"> XE "</w:instrText>
+      </w:r>
+      <w:r>
+        <w:instrText>Member Scores</w:instrText>
+      </w:r>
+      <w:r>
+        <w:instrText xml:space="preserve">" </w:instrText>
+      </w:r>
+      <w:r>
+        <w:fldChar w:fldCharType="end"/>
       </w:r>
       <w:r>
         <w:fldChar w:fldCharType="begin"/>
@@ -6071,7 +6135,7 @@
         <w:instrText xml:space="preserve"> E "</w:instrText>
       </w:r>
       <w:r>
-        <w:instrText>About</w:instrText>
+        <w:instrText>Member Scores</w:instrText>
       </w:r>
       <w:r>
         <w:instrText xml:space="preserve">" </w:instrText>
@@ -6084,71 +6148,25 @@
           <w:b/>
           <w:bCs/>
         </w:rPr>
-        <w:t>Error! Bookmark not defined.</w:t>
-      </w:r>
-      <w:r>
-        <w:fldChar w:fldCharType="end"/>
-      </w:r>
-      <w:r>
-        <w:t xml:space="preserve"> and Exit</w:t>
-      </w:r>
-      <w:r>
-        <w:fldChar w:fldCharType="begin"/>
-      </w:r>
-      <w:r>
-        <w:instrText xml:space="preserve"> XE "</w:instrText>
-      </w:r>
-      <w:r>
-        <w:instrText>Exit</w:instrText>
-      </w:r>
-      <w:r>
-        <w:instrText xml:space="preserve">" </w:instrText>
-      </w:r>
-      <w:r>
-        <w:fldChar w:fldCharType="end"/>
-      </w:r>
-      <w:r>
-        <w:fldChar w:fldCharType="begin"/>
-      </w:r>
-      <w:r>
-        <w:instrText xml:space="preserve"> E "</w:instrText>
-      </w:r>
-      <w:r>
-        <w:instrText>Exit</w:instrText>
-      </w:r>
-      <w:r>
-        <w:instrText xml:space="preserve">" </w:instrText>
-      </w:r>
-      <w:r>
-        <w:fldChar w:fldCharType="separate"/>
-      </w:r>
+        <w:t xml:space="preserve">Error! Bookmark not </w:t>
+      </w:r>
+      <w:proofErr w:type="gramStart"/>
       <w:r>
         <w:rPr>
           <w:b/>
           <w:bCs/>
         </w:rPr>
-        <w:t>Error! Bookmark not defined.</w:t>
-      </w:r>
-      <w:r>
-        <w:fldChar w:fldCharType="end"/>
-      </w:r>
-      <w:r>
-        <w:t xml:space="preserve"> buttons. The Region</w:t>
-      </w:r>
-      <w:r>
-        <w:fldChar w:fldCharType="begin"/>
-      </w:r>
-      <w:r>
-        <w:instrText xml:space="preserve"> XE "</w:instrText>
-      </w:r>
-      <w:r>
-        <w:instrText>Region</w:instrText>
-      </w:r>
-      <w:r>
-        <w:instrText xml:space="preserve">" </w:instrText>
-      </w:r>
-      <w:r>
-        <w:fldChar w:fldCharType="end"/>
+        <w:t>defined.</w:t>
+      </w:r>
+      <w:r>
+        <w:fldChar w:fldCharType="end"/>
+      </w:r>
+      <w:r>
+        <w:t>,</w:t>
+      </w:r>
+      <w:proofErr w:type="gramEnd"/>
+      <w:r>
+        <w:t xml:space="preserve"> button and tab. The About</w:t>
       </w:r>
       <w:r>
         <w:fldChar w:fldCharType="begin"/>
@@ -6157,7 +6175,7 @@
         <w:instrText xml:space="preserve"> E "</w:instrText>
       </w:r>
       <w:r>
-        <w:instrText>Region</w:instrText>
+        <w:instrText>About</w:instrText>
       </w:r>
       <w:r>
         <w:instrText xml:space="preserve">" </w:instrText>
@@ -6176,7 +6194,15 @@
         <w:fldChar w:fldCharType="end"/>
       </w:r>
       <w:r>
-        <w:t xml:space="preserve"> picker. And the “Add Region</w:t>
+        <w:t xml:space="preserve"> </w:t>
+      </w:r>
+      <w:proofErr w:type="gramStart"/>
+      <w:r>
+        <w:t>and</w:t>
+      </w:r>
+      <w:proofErr w:type="gramEnd"/>
+      <w:r>
+        <w:t xml:space="preserve"> Exit</w:t>
       </w:r>
       <w:r>
         <w:fldChar w:fldCharType="begin"/>
@@ -6185,6 +6211,108 @@
         <w:instrText xml:space="preserve"> XE "</w:instrText>
       </w:r>
       <w:r>
+        <w:instrText>Exit</w:instrText>
+      </w:r>
+      <w:r>
+        <w:instrText xml:space="preserve">" </w:instrText>
+      </w:r>
+      <w:r>
+        <w:fldChar w:fldCharType="end"/>
+      </w:r>
+      <w:r>
+        <w:fldChar w:fldCharType="begin"/>
+      </w:r>
+      <w:r>
+        <w:instrText xml:space="preserve"> E "</w:instrText>
+      </w:r>
+      <w:r>
+        <w:instrText>Exit</w:instrText>
+      </w:r>
+      <w:r>
+        <w:instrText xml:space="preserve">" </w:instrText>
+      </w:r>
+      <w:r>
+        <w:fldChar w:fldCharType="separate"/>
+      </w:r>
+      <w:r>
+        <w:rPr>
+          <w:b/>
+          <w:bCs/>
+        </w:rPr>
+        <w:t>Error! Bookmark not defined.</w:t>
+      </w:r>
+      <w:r>
+        <w:fldChar w:fldCharType="end"/>
+      </w:r>
+      <w:r>
+        <w:t xml:space="preserve"> </w:t>
+      </w:r>
+      <w:proofErr w:type="gramStart"/>
+      <w:r>
+        <w:t>buttons</w:t>
+      </w:r>
+      <w:proofErr w:type="gramEnd"/>
+      <w:r>
+        <w:t>. The Region</w:t>
+      </w:r>
+      <w:r>
+        <w:fldChar w:fldCharType="begin"/>
+      </w:r>
+      <w:r>
+        <w:instrText xml:space="preserve"> XE "</w:instrText>
+      </w:r>
+      <w:r>
+        <w:instrText>Region</w:instrText>
+      </w:r>
+      <w:r>
+        <w:instrText xml:space="preserve">" </w:instrText>
+      </w:r>
+      <w:r>
+        <w:fldChar w:fldCharType="end"/>
+      </w:r>
+      <w:r>
+        <w:fldChar w:fldCharType="begin"/>
+      </w:r>
+      <w:r>
+        <w:instrText xml:space="preserve"> E "</w:instrText>
+      </w:r>
+      <w:r>
+        <w:instrText>Region</w:instrText>
+      </w:r>
+      <w:r>
+        <w:instrText xml:space="preserve">" </w:instrText>
+      </w:r>
+      <w:r>
+        <w:fldChar w:fldCharType="separate"/>
+      </w:r>
+      <w:r>
+        <w:rPr>
+          <w:b/>
+          <w:bCs/>
+        </w:rPr>
+        <w:t>Error! Bookmark not defined.</w:t>
+      </w:r>
+      <w:r>
+        <w:fldChar w:fldCharType="end"/>
+      </w:r>
+      <w:r>
+        <w:t xml:space="preserve"> </w:t>
+      </w:r>
+      <w:proofErr w:type="gramStart"/>
+      <w:r>
+        <w:t>picker</w:t>
+      </w:r>
+      <w:proofErr w:type="gramEnd"/>
+      <w:r>
+        <w:t>. And the “Add Region</w:t>
+      </w:r>
+      <w:r>
+        <w:fldChar w:fldCharType="begin"/>
+      </w:r>
+      <w:r>
+        <w:instrText xml:space="preserve"> XE "</w:instrText>
+      </w:r>
+      <w:r>
         <w:instrText>Add Region</w:instrText>
       </w:r>
       <w:r>
@@ -6207,7 +6335,7 @@
           <w:noProof/>
         </w:rPr>
         <w:drawing>
-          <wp:inline distT="0" distB="0" distL="0" distR="0">
+          <wp:inline distT="0" distB="0" distL="0" distR="0" wp14:anchorId="03D27295" wp14:editId="3B82738E">
             <wp:extent cx="4883150" cy="2623280"/>
             <wp:effectExtent l="0" t="0" r="0" b="5715"/>
             <wp:docPr id="4" name="Picture 4"/>
@@ -6329,12 +6457,12 @@
       <w:pPr>
         <w:pStyle w:val="Heading1"/>
       </w:pPr>
-      <w:bookmarkStart w:id="17" w:name="_Toc509165844"/>
+      <w:bookmarkStart w:id="18" w:name="_Toc509165844"/>
       <w:r>
         <w:lastRenderedPageBreak/>
         <w:t>Member Info</w:t>
       </w:r>
-      <w:bookmarkEnd w:id="17"/>
+      <w:bookmarkEnd w:id="18"/>
       <w:r>
         <w:fldChar w:fldCharType="begin"/>
       </w:r>
@@ -6425,7 +6553,15 @@
         <w:fldChar w:fldCharType="end"/>
       </w:r>
       <w:r>
-        <w:t xml:space="preserve"> screen is where new players are entered</w:t>
+        <w:t xml:space="preserve"> </w:t>
+      </w:r>
+      <w:proofErr w:type="gramStart"/>
+      <w:r>
+        <w:t>screen</w:t>
+      </w:r>
+      <w:proofErr w:type="gramEnd"/>
+      <w:r>
+        <w:t xml:space="preserve"> is where new players are entered</w:t>
       </w:r>
       <w:r>
         <w:t>; member information is updated; and member information can be imported from Excel files</w:t>
@@ -6447,7 +6583,7 @@
           <w:noProof/>
         </w:rPr>
         <w:drawing>
-          <wp:inline distT="0" distB="0" distL="0" distR="0" wp14:anchorId="311BC661" wp14:editId="11963595">
+          <wp:inline distT="0" distB="0" distL="0" distR="0" wp14:anchorId="1697D59F" wp14:editId="59EAEFBB">
             <wp:extent cx="4448175" cy="3980962"/>
             <wp:effectExtent l="0" t="0" r="0" b="635"/>
             <wp:docPr id="19" name="Picture 19" descr="The form where member information is entered and edited." title="member info form"/>
@@ -6520,7 +6656,7 @@
       <w:pPr>
         <w:pStyle w:val="Heading3"/>
       </w:pPr>
-      <w:bookmarkStart w:id="18" w:name="_Toc509165845"/>
+      <w:bookmarkStart w:id="19" w:name="_Toc509165845"/>
       <w:r>
         <w:t>Import</w:t>
       </w:r>
@@ -6558,7 +6694,7 @@
       <w:r>
         <w:t>Member</w:t>
       </w:r>
-      <w:bookmarkEnd w:id="18"/>
+      <w:bookmarkEnd w:id="19"/>
       <w:r>
         <w:fldChar w:fldCharType="begin"/>
       </w:r>
@@ -6683,11 +6819,11 @@
       <w:pPr>
         <w:pStyle w:val="Heading3"/>
       </w:pPr>
-      <w:bookmarkStart w:id="19" w:name="_Toc509165846"/>
+      <w:bookmarkStart w:id="20" w:name="_Toc509165846"/>
       <w:r>
         <w:t>New Members</w:t>
       </w:r>
-      <w:bookmarkEnd w:id="19"/>
+      <w:bookmarkEnd w:id="20"/>
       <w:r>
         <w:fldChar w:fldCharType="begin"/>
       </w:r>
@@ -6778,7 +6914,15 @@
         <w:fldChar w:fldCharType="end"/>
       </w:r>
       <w:r>
-        <w:t xml:space="preserve"> screen. Click the “New” button in the Record</w:t>
+        <w:t xml:space="preserve"> </w:t>
+      </w:r>
+      <w:proofErr w:type="gramStart"/>
+      <w:r>
+        <w:t>screen</w:t>
+      </w:r>
+      <w:proofErr w:type="gramEnd"/>
+      <w:r>
+        <w:t>. Click the “New” button in the Record</w:t>
       </w:r>
       <w:r>
         <w:fldChar w:fldCharType="begin"/>
@@ -6836,7 +6980,15 @@
         <w:fldChar w:fldCharType="end"/>
       </w:r>
       <w:r>
-        <w:t xml:space="preserve"> field, then hit tab. enter the member’s first name in the First Name</w:t>
+        <w:t xml:space="preserve"> </w:t>
+      </w:r>
+      <w:proofErr w:type="gramStart"/>
+      <w:r>
+        <w:t>field</w:t>
+      </w:r>
+      <w:proofErr w:type="gramEnd"/>
+      <w:r>
+        <w:t>, then hit tab. enter the member’s first name in the First Name</w:t>
       </w:r>
       <w:r>
         <w:fldChar w:fldCharType="begin"/>
@@ -6864,7 +7016,15 @@
         <w:fldChar w:fldCharType="end"/>
       </w:r>
       <w:r>
-        <w:t xml:space="preserve"> field, then hit tab</w:t>
+        <w:t xml:space="preserve"> </w:t>
+      </w:r>
+      <w:proofErr w:type="gramStart"/>
+      <w:r>
+        <w:t>field</w:t>
+      </w:r>
+      <w:proofErr w:type="gramEnd"/>
+      <w:r>
+        <w:t>, then hit tab</w:t>
       </w:r>
       <w:r>
         <w:t>.</w:t>
@@ -6941,13 +7101,29 @@
         <w:fldChar w:fldCharType="end"/>
       </w:r>
       <w:r>
-        <w:t xml:space="preserve"> field. To enter the member average from elsewhere, she has to have proof of it, </w:t>
+        <w:t xml:space="preserve"> </w:t>
+      </w:r>
+      <w:proofErr w:type="gramStart"/>
+      <w:r>
+        <w:t>field</w:t>
+      </w:r>
+      <w:proofErr w:type="gramEnd"/>
+      <w:r>
+        <w:t xml:space="preserve">. To enter the member average from elsewhere, she has to have proof of it, </w:t>
       </w:r>
       <w:r>
         <w:t>for example:</w:t>
       </w:r>
       <w:r>
-        <w:t xml:space="preserve"> her published average from another league. Tab through until you are in the Status box. Choose if the member is inactive or active. If the member is 55 years old or older, check the “Senior” box. In the gender box, select the member’s gender. Enter the date of the member’s last payment. Enter any notes in the note field, if applicable. Click “Save”. The new member is now added to the member database. Note: Last name and first name are required fields.</w:t>
+        <w:t xml:space="preserve"> her published average from another league. Tab through until you are in the Status box. Choose if the member is inactive or active. If the member is 55 years old or older, check the “</w:t>
+      </w:r>
+      <w:proofErr w:type="gramStart"/>
+      <w:r>
+        <w:t>Senior</w:t>
+      </w:r>
+      <w:proofErr w:type="gramEnd"/>
+      <w:r>
+        <w:t>” box. In the gender box, select the member’s gender. Enter the date of the member’s last payment. Enter any notes in the note field, if applicable. Click “Save”. The new member is now added to the member database. Note: Last name and first name are required fields.</w:t>
       </w:r>
     </w:p>
     <w:p>
@@ -6960,7 +7136,7 @@
           <w:noProof/>
         </w:rPr>
         <w:drawing>
-          <wp:inline distT="0" distB="0" distL="0" distR="0">
+          <wp:inline distT="0" distB="0" distL="0" distR="0" wp14:anchorId="24FBB0E7" wp14:editId="66BE4AD5">
             <wp:extent cx="4448175" cy="3980962"/>
             <wp:effectExtent l="0" t="0" r="0" b="635"/>
             <wp:docPr id="5" name="Picture 5" descr="The form where member information is entered and edited." title="member info form"/>
@@ -7033,14 +7209,14 @@
       <w:pPr>
         <w:pStyle w:val="Heading3"/>
       </w:pPr>
-      <w:bookmarkStart w:id="20" w:name="_Toc509165847"/>
+      <w:bookmarkStart w:id="21" w:name="_Toc509165847"/>
       <w:r>
         <w:t xml:space="preserve">Updating </w:t>
       </w:r>
       <w:r>
         <w:t>Members</w:t>
       </w:r>
-      <w:bookmarkEnd w:id="20"/>
+      <w:bookmarkEnd w:id="21"/>
       <w:r>
         <w:fldChar w:fldCharType="begin"/>
       </w:r>
@@ -7191,7 +7367,15 @@
         <w:fldChar w:fldCharType="end"/>
       </w:r>
       <w:r>
-        <w:t xml:space="preserve"> screen. Make updates to the member’s information. Then click “Save”. The updates will be saved to the member database.</w:t>
+        <w:t xml:space="preserve"> </w:t>
+      </w:r>
+      <w:proofErr w:type="gramStart"/>
+      <w:r>
+        <w:t>screen</w:t>
+      </w:r>
+      <w:proofErr w:type="gramEnd"/>
+      <w:r>
+        <w:t>. Make updates to the member’s information. Then click “Save”. The updates will be saved to the member database.</w:t>
       </w:r>
     </w:p>
     <w:p>
@@ -7201,14 +7385,14 @@
           <w:szCs w:val="20"/>
         </w:rPr>
       </w:pPr>
-      <w:bookmarkStart w:id="21" w:name="_Toc509165848"/>
+      <w:bookmarkStart w:id="22" w:name="_Toc509165848"/>
       <w:r>
         <w:rPr>
           <w:szCs w:val="20"/>
         </w:rPr>
         <w:t>Stats</w:t>
       </w:r>
-      <w:bookmarkEnd w:id="21"/>
+      <w:bookmarkEnd w:id="22"/>
       <w:r>
         <w:rPr>
           <w:szCs w:val="20"/>
@@ -7344,7 +7528,7 @@
           <w:noProof/>
         </w:rPr>
         <w:drawing>
-          <wp:inline distT="0" distB="0" distL="0" distR="0">
+          <wp:inline distT="0" distB="0" distL="0" distR="0" wp14:anchorId="2D49C112" wp14:editId="01809467">
             <wp:extent cx="4905375" cy="2844352"/>
             <wp:effectExtent l="0" t="0" r="0" b="0"/>
             <wp:docPr id="7" name="Picture 7"/>
@@ -7466,7 +7650,7 @@
           <w:szCs w:val="20"/>
         </w:rPr>
       </w:pPr>
-      <w:bookmarkStart w:id="22" w:name="_Toc509165849"/>
+      <w:bookmarkStart w:id="23" w:name="_Toc509165849"/>
       <w:r>
         <w:rPr>
           <w:szCs w:val="20"/>
@@ -7474,7 +7658,7 @@
         <w:lastRenderedPageBreak/>
         <w:t>Member Search</w:t>
       </w:r>
-      <w:bookmarkEnd w:id="22"/>
+      <w:bookmarkEnd w:id="23"/>
       <w:r>
         <w:rPr>
           <w:szCs w:val="20"/>
@@ -7610,7 +7794,7 @@
           <w:noProof/>
         </w:rPr>
         <w:drawing>
-          <wp:inline distT="0" distB="0" distL="0" distR="0">
+          <wp:inline distT="0" distB="0" distL="0" distR="0" wp14:anchorId="3CC9E41F" wp14:editId="284155A7">
             <wp:extent cx="4883150" cy="3178175"/>
             <wp:effectExtent l="0" t="0" r="0" b="3175"/>
             <wp:docPr id="8" name="Picture 8"/>
@@ -7656,7 +7840,7 @@
           <w:noProof/>
         </w:rPr>
         <w:drawing>
-          <wp:inline distT="0" distB="0" distL="0" distR="0">
+          <wp:inline distT="0" distB="0" distL="0" distR="0" wp14:anchorId="6D7FA52F" wp14:editId="54F0DAC8">
             <wp:extent cx="4883150" cy="3164840"/>
             <wp:effectExtent l="0" t="0" r="0" b="0"/>
             <wp:docPr id="9" name="Picture 9"/>
@@ -7725,7 +7909,7 @@
           <w:szCs w:val="20"/>
         </w:rPr>
       </w:pPr>
-      <w:bookmarkStart w:id="23" w:name="_Toc509165850"/>
+      <w:bookmarkStart w:id="24" w:name="_Toc509165850"/>
       <w:r>
         <w:rPr>
           <w:szCs w:val="20"/>
@@ -7733,7 +7917,7 @@
         <w:lastRenderedPageBreak/>
         <w:t>Print Recaps</w:t>
       </w:r>
-      <w:bookmarkEnd w:id="23"/>
+      <w:bookmarkEnd w:id="24"/>
       <w:r>
         <w:rPr>
           <w:szCs w:val="20"/>
@@ -7825,7 +8009,7 @@
           <w:noProof/>
         </w:rPr>
         <w:drawing>
-          <wp:inline distT="0" distB="0" distL="0" distR="0">
+          <wp:inline distT="0" distB="0" distL="0" distR="0" wp14:anchorId="37061B46" wp14:editId="0051267F">
             <wp:extent cx="2628900" cy="2000755"/>
             <wp:effectExtent l="0" t="0" r="0" b="0"/>
             <wp:docPr id="10" name="Picture 10"/>
@@ -7871,7 +8055,7 @@
           <w:noProof/>
         </w:rPr>
         <w:drawing>
-          <wp:inline distT="0" distB="0" distL="0" distR="0" wp14:anchorId="313672C7" wp14:editId="10DE0174">
+          <wp:inline distT="0" distB="0" distL="0" distR="0" wp14:anchorId="443E965A" wp14:editId="301AC7B9">
             <wp:extent cx="1590632" cy="2000422"/>
             <wp:effectExtent l="0" t="0" r="0" b="0"/>
             <wp:docPr id="2" name="Picture 2"/>
@@ -7933,7 +8117,15 @@
         <w:t>: basic printer dialog</w:t>
       </w:r>
       <w:r>
-        <w:t>, Print By Date form.</w:t>
+        <w:t xml:space="preserve">, Print </w:t>
+      </w:r>
+      <w:proofErr w:type="gramStart"/>
+      <w:r>
+        <w:t>By</w:t>
+      </w:r>
+      <w:proofErr w:type="gramEnd"/>
+      <w:r>
+        <w:t xml:space="preserve"> Date form.</w:t>
       </w:r>
     </w:p>
     <w:p>
@@ -7943,14 +8135,14 @@
           <w:szCs w:val="20"/>
         </w:rPr>
       </w:pPr>
-      <w:bookmarkStart w:id="24" w:name="_Toc509165851"/>
+      <w:bookmarkStart w:id="25" w:name="_Toc509165851"/>
       <w:r>
         <w:rPr>
           <w:szCs w:val="20"/>
         </w:rPr>
         <w:t>Import</w:t>
       </w:r>
-      <w:bookmarkEnd w:id="24"/>
+      <w:bookmarkEnd w:id="25"/>
       <w:r>
         <w:rPr>
           <w:szCs w:val="20"/>
@@ -8055,7 +8247,7 @@
           <w:noProof/>
         </w:rPr>
         <w:drawing>
-          <wp:inline distT="0" distB="0" distL="0" distR="0">
+          <wp:inline distT="0" distB="0" distL="0" distR="0" wp14:anchorId="0E6CE1F2" wp14:editId="0224BD4F">
             <wp:extent cx="4883150" cy="2945765"/>
             <wp:effectExtent l="0" t="0" r="0" b="6985"/>
             <wp:docPr id="12" name="Picture 12"/>
@@ -8121,12 +8313,12 @@
       <w:pPr>
         <w:pStyle w:val="Heading1"/>
       </w:pPr>
-      <w:bookmarkStart w:id="25" w:name="_Toc509165852"/>
+      <w:bookmarkStart w:id="26" w:name="_Toc509165852"/>
       <w:r>
         <w:lastRenderedPageBreak/>
         <w:t>Member Scores</w:t>
       </w:r>
-      <w:bookmarkEnd w:id="25"/>
+      <w:bookmarkEnd w:id="26"/>
       <w:r>
         <w:fldChar w:fldCharType="begin"/>
       </w:r>
@@ -8180,7 +8372,7 @@
           <w:noProof/>
         </w:rPr>
         <w:drawing>
-          <wp:inline distT="0" distB="0" distL="0" distR="0">
+          <wp:inline distT="0" distB="0" distL="0" distR="0" wp14:anchorId="567F429C" wp14:editId="6B2B3C61">
             <wp:extent cx="4858133" cy="4365206"/>
             <wp:effectExtent l="0" t="0" r="0" b="0"/>
             <wp:docPr id="6" name="Picture 6"/>
@@ -8398,7 +8590,7 @@
           <w:szCs w:val="20"/>
         </w:rPr>
       </w:pPr>
-      <w:bookmarkStart w:id="26" w:name="_Toc509165853"/>
+      <w:bookmarkStart w:id="27" w:name="_Toc509165853"/>
       <w:r>
         <w:rPr>
           <w:szCs w:val="20"/>
@@ -8406,7 +8598,7 @@
         <w:lastRenderedPageBreak/>
         <w:t>Tournament Stats</w:t>
       </w:r>
-      <w:bookmarkEnd w:id="26"/>
+      <w:bookmarkEnd w:id="27"/>
       <w:r>
         <w:rPr>
           <w:szCs w:val="20"/>
@@ -8556,7 +8748,7 @@
           <w:noProof/>
         </w:rPr>
         <w:drawing>
-          <wp:inline distT="0" distB="0" distL="0" distR="0">
+          <wp:inline distT="0" distB="0" distL="0" distR="0" wp14:anchorId="74B840AF" wp14:editId="5B9665B2">
             <wp:extent cx="4883150" cy="2634615"/>
             <wp:effectExtent l="0" t="0" r="0" b="0"/>
             <wp:docPr id="14" name="Picture 14"/>
@@ -8668,7 +8860,7 @@
           <w:szCs w:val="20"/>
         </w:rPr>
       </w:pPr>
-      <w:bookmarkStart w:id="27" w:name="_Toc509165854"/>
+      <w:bookmarkStart w:id="28" w:name="_Toc509165854"/>
       <w:r>
         <w:rPr>
           <w:szCs w:val="20"/>
@@ -8719,7 +8911,7 @@
         </w:rPr>
         <w:t xml:space="preserve"> By Tournament</w:t>
       </w:r>
-      <w:bookmarkEnd w:id="27"/>
+      <w:bookmarkEnd w:id="28"/>
       <w:r>
         <w:rPr>
           <w:szCs w:val="20"/>
@@ -8837,7 +9029,7 @@
           <w:noProof/>
         </w:rPr>
         <w:drawing>
-          <wp:inline distT="0" distB="0" distL="0" distR="0" wp14:anchorId="6CFDD092" wp14:editId="603770B7">
+          <wp:inline distT="0" distB="0" distL="0" distR="0" wp14:anchorId="33C83BB3" wp14:editId="23A71A4C">
             <wp:extent cx="2628900" cy="2000755"/>
             <wp:effectExtent l="0" t="0" r="0" b="0"/>
             <wp:docPr id="11" name="Picture 11"/>
@@ -8903,12 +9095,12 @@
       <w:pPr>
         <w:pStyle w:val="Heading2"/>
       </w:pPr>
-      <w:bookmarkStart w:id="28" w:name="_Toc509165855"/>
+      <w:bookmarkStart w:id="29" w:name="_Toc509165855"/>
       <w:r>
         <w:lastRenderedPageBreak/>
         <w:t>Tournament Place Standings</w:t>
       </w:r>
-      <w:bookmarkEnd w:id="28"/>
+      <w:bookmarkEnd w:id="29"/>
       <w:r>
         <w:fldChar w:fldCharType="begin"/>
       </w:r>
@@ -8986,7 +9178,7 @@
           <w:noProof/>
         </w:rPr>
         <w:drawing>
-          <wp:inline distT="0" distB="0" distL="0" distR="0">
+          <wp:inline distT="0" distB="0" distL="0" distR="0" wp14:anchorId="5CA88809" wp14:editId="4877A479">
             <wp:extent cx="4883150" cy="2475865"/>
             <wp:effectExtent l="0" t="0" r="0" b="635"/>
             <wp:docPr id="15" name="Picture 15"/>
@@ -9077,12 +9269,12 @@
       <w:pPr>
         <w:pStyle w:val="Heading2"/>
       </w:pPr>
-      <w:bookmarkStart w:id="29" w:name="_Toc509165856"/>
+      <w:bookmarkStart w:id="30" w:name="_Toc509165856"/>
       <w:r>
         <w:lastRenderedPageBreak/>
         <w:t>Create/Edit Tournament</w:t>
       </w:r>
-      <w:bookmarkEnd w:id="29"/>
+      <w:bookmarkEnd w:id="30"/>
       <w:r>
         <w:fldChar w:fldCharType="begin"/>
       </w:r>
@@ -9166,7 +9358,7 @@
           <w:noProof/>
         </w:rPr>
         <w:drawing>
-          <wp:inline distT="0" distB="0" distL="0" distR="0">
+          <wp:inline distT="0" distB="0" distL="0" distR="0" wp14:anchorId="30EDA2AE" wp14:editId="2786B631">
             <wp:extent cx="2829320" cy="5125165"/>
             <wp:effectExtent l="19050" t="19050" r="28575" b="18415"/>
             <wp:docPr id="16" name="Picture 16"/>
@@ -9274,11 +9466,11 @@
       <w:pPr>
         <w:pStyle w:val="Heading3"/>
       </w:pPr>
-      <w:bookmarkStart w:id="30" w:name="_Toc509165857"/>
+      <w:bookmarkStart w:id="31" w:name="_Toc509165857"/>
       <w:r>
         <w:t>To Update an Existing Tournament</w:t>
       </w:r>
-      <w:bookmarkEnd w:id="30"/>
+      <w:bookmarkEnd w:id="31"/>
     </w:p>
     <w:p>
       <w:pPr>
@@ -9362,11 +9554,11 @@
       <w:pPr>
         <w:pStyle w:val="Heading2"/>
       </w:pPr>
-      <w:bookmarkStart w:id="31" w:name="_Toc509165858"/>
+      <w:bookmarkStart w:id="32" w:name="_Toc509165858"/>
       <w:r>
         <w:t>Search Tournaments</w:t>
       </w:r>
-      <w:bookmarkEnd w:id="31"/>
+      <w:bookmarkEnd w:id="32"/>
       <w:r>
         <w:fldChar w:fldCharType="begin"/>
       </w:r>
@@ -9438,7 +9630,7 @@
           <w:noProof/>
         </w:rPr>
         <w:drawing>
-          <wp:inline distT="0" distB="0" distL="0" distR="0">
+          <wp:inline distT="0" distB="0" distL="0" distR="0" wp14:anchorId="76084C7D" wp14:editId="376B5DAF">
             <wp:extent cx="2311386" cy="3486150"/>
             <wp:effectExtent l="0" t="0" r="0" b="0"/>
             <wp:docPr id="17" name="Picture 17"/>
@@ -9484,7 +9676,7 @@
           <w:noProof/>
         </w:rPr>
         <w:drawing>
-          <wp:inline distT="0" distB="0" distL="0" distR="0">
+          <wp:inline distT="0" distB="0" distL="0" distR="0" wp14:anchorId="2CF5C93C" wp14:editId="6C35C149">
             <wp:extent cx="2466975" cy="3704508"/>
             <wp:effectExtent l="0" t="0" r="0" b="0"/>
             <wp:docPr id="18" name="Picture 18"/>
@@ -9550,11 +9742,11 @@
       <w:pPr>
         <w:pStyle w:val="Heading3"/>
       </w:pPr>
-      <w:bookmarkStart w:id="32" w:name="_Toc509165859"/>
+      <w:bookmarkStart w:id="33" w:name="_Toc509165859"/>
       <w:r>
         <w:t>Search by Location</w:t>
       </w:r>
-      <w:bookmarkEnd w:id="32"/>
+      <w:bookmarkEnd w:id="33"/>
       <w:r>
         <w:fldChar w:fldCharType="begin"/>
       </w:r>
@@ -9592,11 +9784,11 @@
       <w:pPr>
         <w:pStyle w:val="Heading3"/>
       </w:pPr>
-      <w:bookmarkStart w:id="33" w:name="_Toc509165860"/>
+      <w:bookmarkStart w:id="34" w:name="_Toc509165860"/>
       <w:r>
         <w:t>Search by Event</w:t>
       </w:r>
-      <w:bookmarkEnd w:id="33"/>
+      <w:bookmarkEnd w:id="34"/>
       <w:r>
         <w:fldChar w:fldCharType="begin"/>
       </w:r>
@@ -9650,11 +9842,11 @@
       <w:pPr>
         <w:pStyle w:val="Heading3"/>
       </w:pPr>
-      <w:bookmarkStart w:id="34" w:name="_Toc509165861"/>
+      <w:bookmarkStart w:id="35" w:name="_Toc509165861"/>
       <w:r>
         <w:t>Search by Date</w:t>
       </w:r>
-      <w:bookmarkEnd w:id="34"/>
+      <w:bookmarkEnd w:id="35"/>
       <w:r>
         <w:fldChar w:fldCharType="begin"/>
       </w:r>
@@ -9676,14 +9868,22 @@
         <w:pStyle w:val="BodyText"/>
       </w:pPr>
       <w:r>
-        <w:t>To find a tournament by date: Check the Date box. Pick the date range to search with the From and To date fields. Click “Search”. Choose the tournament you need from the list. Click “Accept”.</w:t>
+        <w:t xml:space="preserve">To find a tournament by date: Check the Date box. Pick the date range to search with the </w:t>
+      </w:r>
+      <w:proofErr w:type="gramStart"/>
+      <w:r>
+        <w:t>From</w:t>
+      </w:r>
+      <w:proofErr w:type="gramEnd"/>
+      <w:r>
+        <w:t xml:space="preserve"> and To date fields. Click “Search”. Choose the tournament you need from the list. Click “Accept”.</w:t>
       </w:r>
     </w:p>
     <w:p>
       <w:pPr>
         <w:pStyle w:val="Heading2"/>
       </w:pPr>
-      <w:bookmarkStart w:id="35" w:name="_Toc509165862"/>
+      <w:bookmarkStart w:id="36" w:name="_Toc509165862"/>
       <w:r>
         <w:lastRenderedPageBreak/>
         <w:t>List Tournaments</w:t>
@@ -9719,7 +9919,7 @@
       <w:r>
         <w:t>ear</w:t>
       </w:r>
-      <w:bookmarkEnd w:id="35"/>
+      <w:bookmarkEnd w:id="36"/>
       <w:r>
         <w:fldChar w:fldCharType="begin"/>
       </w:r>
@@ -9826,7 +10026,7 @@
           <w:noProof/>
         </w:rPr>
         <w:drawing>
-          <wp:inline distT="0" distB="0" distL="0" distR="0">
+          <wp:inline distT="0" distB="0" distL="0" distR="0" wp14:anchorId="6544FA17" wp14:editId="223B25D7">
             <wp:extent cx="2420909" cy="1562100"/>
             <wp:effectExtent l="0" t="0" r="0" b="0"/>
             <wp:docPr id="1" name="Picture 1"/>
@@ -9872,7 +10072,7 @@
           <w:noProof/>
         </w:rPr>
         <w:drawing>
-          <wp:inline distT="0" distB="0" distL="0" distR="0">
+          <wp:inline distT="0" distB="0" distL="0" distR="0" wp14:anchorId="522768A5" wp14:editId="4CE65CFB">
             <wp:extent cx="2420620" cy="1561843"/>
             <wp:effectExtent l="0" t="0" r="0" b="635"/>
             <wp:docPr id="25" name="Picture 25" descr="F:\cptc\2018-Winter\cpw205\UserManual9tapTour\9tapScreenShots\TournamentsByYear.PNG"/>
@@ -9966,18 +10166,26 @@
         <w:fldChar w:fldCharType="end"/>
       </w:r>
       <w:r>
-        <w:t xml:space="preserve"> by Year</w:t>
+        <w:t xml:space="preserve"> </w:t>
+      </w:r>
+      <w:proofErr w:type="gramStart"/>
+      <w:r>
+        <w:t>by</w:t>
+      </w:r>
+      <w:proofErr w:type="gramEnd"/>
+      <w:r>
+        <w:t xml:space="preserve"> Year</w:t>
       </w:r>
     </w:p>
     <w:p>
       <w:pPr>
         <w:pStyle w:val="Heading2"/>
       </w:pPr>
-      <w:bookmarkStart w:id="36" w:name="_Toc509165863"/>
+      <w:bookmarkStart w:id="37" w:name="_Toc509165863"/>
       <w:r>
         <w:t>Reports</w:t>
       </w:r>
-      <w:bookmarkEnd w:id="36"/>
+      <w:bookmarkEnd w:id="37"/>
       <w:r>
         <w:fldChar w:fldCharType="begin"/>
       </w:r>
@@ -10024,7 +10232,15 @@
         <w:t xml:space="preserve"> the member scores reports</w:t>
       </w:r>
       <w:r>
-        <w:t xml:space="preserve"> by way of their respective buttons “Seniors”, “Game”, and “Series”. Clicking the appropriate button for the needed report. This will bring up the Member Scores</w:t>
+        <w:t xml:space="preserve"> by way of their respective buttons “</w:t>
+      </w:r>
+      <w:proofErr w:type="gramStart"/>
+      <w:r>
+        <w:t>Seniors</w:t>
+      </w:r>
+      <w:proofErr w:type="gramEnd"/>
+      <w:r>
+        <w:t>”, “Game”, and “Series”. Clicking the appropriate button for the needed report. This will bring up the Member Scores</w:t>
       </w:r>
       <w:r>
         <w:fldChar w:fldCharType="begin"/>
@@ -10102,7 +10318,7 @@
           <w:noProof/>
         </w:rPr>
         <w:drawing>
-          <wp:inline distT="0" distB="0" distL="0" distR="0">
+          <wp:inline distT="0" distB="0" distL="0" distR="0" wp14:anchorId="3C89D742" wp14:editId="0F13E329">
             <wp:extent cx="2171700" cy="2178892"/>
             <wp:effectExtent l="0" t="0" r="0" b="0"/>
             <wp:docPr id="26" name="Picture 26"/>
@@ -10282,8 +10498,13 @@
         <w:fldChar w:fldCharType="end"/>
       </w:r>
       <w:r>
-        <w:t xml:space="preserve"> screen</w:t>
-      </w:r>
+        <w:t xml:space="preserve"> </w:t>
+      </w:r>
+      <w:proofErr w:type="gramStart"/>
+      <w:r>
+        <w:t>screen</w:t>
+      </w:r>
+      <w:proofErr w:type="gramEnd"/>
     </w:p>
     <w:p>
       <w:pPr>
@@ -10301,12 +10522,12 @@
       <w:pPr>
         <w:pStyle w:val="Heading2"/>
       </w:pPr>
-      <w:bookmarkStart w:id="37" w:name="_Toc509165864"/>
+      <w:bookmarkStart w:id="38" w:name="_Toc509165864"/>
       <w:r>
         <w:lastRenderedPageBreak/>
         <w:t>Tournament Results</w:t>
       </w:r>
-      <w:bookmarkEnd w:id="37"/>
+      <w:bookmarkEnd w:id="38"/>
       <w:r>
         <w:fldChar w:fldCharType="begin"/>
       </w:r>
@@ -10373,7 +10594,13 @@
         <w:t>Also,</w:t>
       </w:r>
       <w:r>
-        <w:t xml:space="preserve"> the tournament results can be exported to an Excel file by clicking the “Export To Excel” button.</w:t>
+        <w:t xml:space="preserve"> the tournament results can be exported to an Exce</w:t>
+      </w:r>
+      <w:r>
+        <w:t>l file by clicking the “Export t</w:t>
+      </w:r>
+      <w:r>
+        <w:t>o Excel” button.</w:t>
       </w:r>
     </w:p>
     <w:p>
@@ -10386,7 +10613,7 @@
           <w:noProof/>
         </w:rPr>
         <w:drawing>
-          <wp:inline distT="0" distB="0" distL="0" distR="0">
+          <wp:inline distT="0" distB="0" distL="0" distR="0" wp14:anchorId="08FE49C1" wp14:editId="1E602AE3">
             <wp:extent cx="4848225" cy="4212724"/>
             <wp:effectExtent l="0" t="0" r="0" b="0"/>
             <wp:docPr id="20" name="Picture 20"/>
@@ -10473,18 +10700,23 @@
         <w:fldChar w:fldCharType="end"/>
       </w:r>
       <w:r>
-        <w:t xml:space="preserve"> screen</w:t>
-      </w:r>
+        <w:t xml:space="preserve"> </w:t>
+      </w:r>
+      <w:proofErr w:type="gramStart"/>
+      <w:r>
+        <w:t>screen</w:t>
+      </w:r>
+      <w:proofErr w:type="gramEnd"/>
     </w:p>
     <w:p>
       <w:pPr>
         <w:pStyle w:val="Heading2"/>
       </w:pPr>
-      <w:bookmarkStart w:id="38" w:name="_Toc509165865"/>
+      <w:bookmarkStart w:id="39" w:name="_Toc509165865"/>
       <w:r>
         <w:t>Comments</w:t>
       </w:r>
-      <w:bookmarkEnd w:id="38"/>
+      <w:bookmarkEnd w:id="39"/>
       <w:r>
         <w:fldChar w:fldCharType="begin"/>
       </w:r>
@@ -10560,7 +10792,7 @@
       <w:pPr>
         <w:pStyle w:val="Heading1"/>
       </w:pPr>
-      <w:bookmarkStart w:id="39" w:name="_Toc509165866"/>
+      <w:bookmarkStart w:id="40" w:name="_Toc509165866"/>
       <w:r>
         <w:lastRenderedPageBreak/>
         <w:t>Finalize Tournament</w:t>
@@ -10570,10 +10802,25 @@
       <w:pPr>
         <w:pStyle w:val="Heading2"/>
       </w:pPr>
-      <w:r>
-        <w:t>Finalize Tournament</w:t>
-      </w:r>
-      <w:bookmarkEnd w:id="39"/>
+      <w:commentRangeStart w:id="41"/>
+      <w:r>
+        <w:t>Finalize</w:t>
+      </w:r>
+      <w:commentRangeEnd w:id="41"/>
+      <w:r>
+        <w:rPr>
+          <w:rStyle w:val="CommentReference"/>
+          <w:rFonts w:ascii="Garamond" w:hAnsi="Garamond"/>
+          <w:spacing w:val="0"/>
+          <w:kern w:val="0"/>
+          <w:szCs w:val="20"/>
+        </w:rPr>
+        <w:commentReference w:id="41"/>
+      </w:r>
+      <w:r>
+        <w:t xml:space="preserve"> Tournament</w:t>
+      </w:r>
+      <w:bookmarkEnd w:id="40"/>
       <w:r>
         <w:t xml:space="preserve"> Basics</w:t>
       </w:r>
@@ -10782,57 +11029,56 @@
     </w:p>
     <w:p>
       <w:pPr>
+        <w:pStyle w:val="BodyText"/>
+      </w:pPr>
+    </w:p>
+    <w:p>
+      <w:pPr>
+        <w:pStyle w:val="BodyText"/>
+      </w:pPr>
+    </w:p>
+    <w:p>
+      <w:pPr>
         <w:pStyle w:val="Heading2"/>
       </w:pPr>
+      <w:r>
+        <w:lastRenderedPageBreak/>
+        <w:t>Finalizing a tournament</w:t>
+      </w:r>
+    </w:p>
+    <w:p>
+      <w:pPr>
+        <w:pStyle w:val="BodyText"/>
+      </w:pPr>
+      <w:r>
+        <w:t>In order for the tournament to be finalized a</w:t>
+      </w:r>
+      <w:r>
+        <w:t>ll the director needs to do is check every one of the Director Check boxes to confirm that they’</w:t>
+      </w:r>
+      <w:r>
+        <w:t>ve inspected that player’s recap</w:t>
+      </w:r>
+      <w:r>
+        <w:t>. This means modifying scores, averages, adding a bonus or a pro pot, and adding any notes that may be needed for a particular player.</w:t>
+      </w:r>
+      <w:r>
+        <w:t xml:space="preserve"> After all of this is done, the director checks off the Director Check box for that player. </w:t>
+      </w:r>
+      <w:r>
+        <w:t>Once all of the boxes are checked, the tournament can be finalized by clicking the Finalize button at the bottom of the form. If it so happens that the director fails to check a player’s box, upon attempting to f</w:t>
+      </w:r>
+      <w:r>
+        <w:t>inalize the tournament that box</w:t>
+      </w:r>
+      <w:r>
+        <w:t xml:space="preserve"> will be highlighted in red.</w:t>
+      </w:r>
     </w:p>
     <w:p>
       <w:pPr>
         <w:pStyle w:val="Heading2"/>
       </w:pPr>
-    </w:p>
-    <w:p>
-      <w:pPr>
-        <w:pStyle w:val="Heading2"/>
-      </w:pPr>
-      <w:bookmarkStart w:id="40" w:name="_GoBack"/>
-      <w:bookmarkEnd w:id="40"/>
-      <w:r>
-        <w:t>Finalizing a tournament</w:t>
-      </w:r>
-    </w:p>
-    <w:p>
-      <w:pPr>
-        <w:pStyle w:val="BodyText"/>
-      </w:pPr>
-      <w:r>
-        <w:t>In order for the tournament to be finalized a</w:t>
-      </w:r>
-      <w:r>
-        <w:t>ll the director needs to do is check every one of the Director Check boxes to confirm that they’</w:t>
-      </w:r>
-      <w:r>
-        <w:t>ve inspected that player’s recap</w:t>
-      </w:r>
-      <w:r>
-        <w:t>. This means modifying scores, averages, adding a bonus or a pro pot, and adding any notes that may be needed for a particular player.</w:t>
-      </w:r>
-      <w:r>
-        <w:t xml:space="preserve"> After all of this is done, the director checks off the Director Check box for that player. </w:t>
-      </w:r>
-      <w:r>
-        <w:t>Once all of the boxes are checked, the tournament can be finalized by clicking the Finalize button at the bottom of the form. If it so happens that the director fails to check a player’s box, upon attempting to f</w:t>
-      </w:r>
-      <w:r>
-        <w:t>inalize the tournament that box</w:t>
-      </w:r>
-      <w:r>
-        <w:t xml:space="preserve"> will be highlighted in red.</w:t>
-      </w:r>
-    </w:p>
-    <w:p>
-      <w:pPr>
-        <w:pStyle w:val="Heading2"/>
-      </w:pPr>
       <w:r>
         <w:t>The Finalize Tournament window</w:t>
       </w:r>
@@ -10845,7 +11091,7 @@
         <w:rPr>
           <w:noProof/>
         </w:rPr>
-        <w:pict>
+        <w:pict w14:anchorId="225EA388">
           <v:shapetype id="_x0000_t75" coordsize="21600,21600" o:spt="75" o:preferrelative="t" path="m@4@5l@4@11@9@11@9@5xe" filled="f" stroked="f">
             <v:stroke joinstyle="miter"/>
             <v:formulas>
@@ -10866,7 +11112,7 @@
             <o:lock v:ext="edit" aspectratio="t"/>
           </v:shapetype>
           <v:shape id="_x0000_i1025" type="#_x0000_t75" style="width:384.45pt;height:222.8pt">
-            <v:imagedata r:id="rId32" o:title="FinalizeTournamentWindow"/>
+            <v:imagedata r:id="rId34" o:title="FinalizeTournamentWindow"/>
           </v:shape>
         </w:pict>
       </w:r>
@@ -10889,6 +11135,7 @@
       <w:r>
         <w:t xml:space="preserve"> Finalize Tournament</w:t>
       </w:r>
+      <w:commentRangeStart w:id="42"/>
       <w:r>
         <w:fldChar w:fldCharType="begin"/>
       </w:r>
@@ -10913,6 +11160,14 @@
       </w:r>
       <w:r>
         <w:fldChar w:fldCharType="end"/>
+      </w:r>
+      <w:commentRangeEnd w:id="42"/>
+      <w:r>
+        <w:rPr>
+          <w:rStyle w:val="CommentReference"/>
+          <w:spacing w:val="0"/>
+        </w:rPr>
+        <w:commentReference w:id="42"/>
       </w:r>
       <w:r>
         <w:t xml:space="preserve"> Screen</w:t>
@@ -10980,168 +11235,10 @@
           <w:noProof/>
         </w:rPr>
         <w:drawing>
-          <wp:inline distT="0" distB="0" distL="0" distR="0" wp14:anchorId="429B53C0" wp14:editId="5BE8D580">
+          <wp:inline distT="0" distB="0" distL="0" distR="0" wp14:anchorId="19188140" wp14:editId="5C233B95">
             <wp:extent cx="526212" cy="841940"/>
             <wp:effectExtent l="0" t="0" r="7620" b="0"/>
             <wp:docPr id="27" name="Picture 27"/>
-            <wp:cNvGraphicFramePr>
-              <a:graphicFrameLocks xmlns:a="http://schemas.openxmlformats.org/drawingml/2006/main" noChangeAspect="1"/>
-            </wp:cNvGraphicFramePr>
-            <a:graphic xmlns:a="http://schemas.openxmlformats.org/drawingml/2006/main">
-              <a:graphicData uri="http://schemas.openxmlformats.org/drawingml/2006/picture">
-                <pic:pic xmlns:pic="http://schemas.openxmlformats.org/drawingml/2006/picture">
-                  <pic:nvPicPr>
-                    <pic:cNvPr id="1" name=""/>
-                    <pic:cNvPicPr/>
-                  </pic:nvPicPr>
-                  <pic:blipFill>
-                    <a:blip r:embed="rId33"/>
-                    <a:stretch>
-                      <a:fillRect/>
-                    </a:stretch>
-                  </pic:blipFill>
-                  <pic:spPr>
-                    <a:xfrm>
-                      <a:off x="0" y="0"/>
-                      <a:ext cx="585111" cy="936179"/>
-                    </a:xfrm>
-                    <a:prstGeom prst="rect">
-                      <a:avLst/>
-                    </a:prstGeom>
-                  </pic:spPr>
-                </pic:pic>
-              </a:graphicData>
-            </a:graphic>
-          </wp:inline>
-        </w:drawing>
-      </w:r>
-    </w:p>
-    <w:p>
-      <w:pPr>
-        <w:pStyle w:val="BodyText"/>
-        <w:keepNext/>
-        <w:numPr>
-          <w:ilvl w:val="0"/>
-          <w:numId w:val="50"/>
-        </w:numPr>
-      </w:pPr>
-      <w:r>
-        <w:rPr>
-          <w:b/>
-          <w:u w:val="single"/>
-        </w:rPr>
-        <w:t>GameID</w:t>
-      </w:r>
-      <w:r>
-        <w:t xml:space="preserve"> –Needs work</w:t>
-      </w:r>
-    </w:p>
-    <w:p>
-      <w:pPr>
-        <w:pStyle w:val="BodyText"/>
-        <w:keepNext/>
-        <w:ind w:left="720"/>
-      </w:pPr>
-      <w:r>
-        <w:t xml:space="preserve">  </w:t>
-      </w:r>
-      <w:r>
-        <w:rPr>
-          <w:noProof/>
-        </w:rPr>
-        <w:drawing>
-          <wp:inline distT="0" distB="0" distL="0" distR="0" wp14:anchorId="7FC40CEB" wp14:editId="1F30954D">
-            <wp:extent cx="473914" cy="770111"/>
-            <wp:effectExtent l="0" t="0" r="2540" b="0"/>
-            <wp:docPr id="29" name="Picture 29"/>
-            <wp:cNvGraphicFramePr>
-              <a:graphicFrameLocks xmlns:a="http://schemas.openxmlformats.org/drawingml/2006/main" noChangeAspect="1"/>
-            </wp:cNvGraphicFramePr>
-            <a:graphic xmlns:a="http://schemas.openxmlformats.org/drawingml/2006/main">
-              <a:graphicData uri="http://schemas.openxmlformats.org/drawingml/2006/picture">
-                <pic:pic xmlns:pic="http://schemas.openxmlformats.org/drawingml/2006/picture">
-                  <pic:nvPicPr>
-                    <pic:cNvPr id="1" name=""/>
-                    <pic:cNvPicPr/>
-                  </pic:nvPicPr>
-                  <pic:blipFill>
-                    <a:blip r:embed="rId34"/>
-                    <a:stretch>
-                      <a:fillRect/>
-                    </a:stretch>
-                  </pic:blipFill>
-                  <pic:spPr>
-                    <a:xfrm>
-                      <a:off x="0" y="0"/>
-                      <a:ext cx="506426" cy="822944"/>
-                    </a:xfrm>
-                    <a:prstGeom prst="rect">
-                      <a:avLst/>
-                    </a:prstGeom>
-                  </pic:spPr>
-                </pic:pic>
-              </a:graphicData>
-            </a:graphic>
-          </wp:inline>
-        </w:drawing>
-      </w:r>
-      <w:r>
-        <w:t xml:space="preserve">   </w:t>
-      </w:r>
-    </w:p>
-    <w:p>
-      <w:pPr>
-        <w:pStyle w:val="BodyText"/>
-        <w:keepNext/>
-        <w:numPr>
-          <w:ilvl w:val="0"/>
-          <w:numId w:val="50"/>
-        </w:numPr>
-      </w:pPr>
-      <w:r>
-        <w:rPr>
-          <w:b/>
-          <w:u w:val="single"/>
-        </w:rPr>
-        <w:t>Game 1-4 and ValidScore 1-4</w:t>
-      </w:r>
-      <w:r>
-        <w:t xml:space="preserve"> - t</w:t>
-      </w:r>
-      <w:r>
-        <w:t>hat player’s score for each game</w:t>
-      </w:r>
-      <w:r>
-        <w:t xml:space="preserve"> they played, and a checkbox used to determine whether that player’s score is valid for that set of pins. E.G. a sandbagged score will be</w:t>
-      </w:r>
-      <w:r>
-        <w:t xml:space="preserve"> unchecked and thus invalidated.</w:t>
-      </w:r>
-    </w:p>
-    <w:p>
-      <w:pPr>
-        <w:pStyle w:val="BodyText"/>
-        <w:keepNext/>
-        <w:ind w:left="720"/>
-        <w:rPr>
-          <w:noProof/>
-        </w:rPr>
-      </w:pPr>
-      <w:r>
-        <w:rPr>
-          <w:noProof/>
-        </w:rPr>
-        <w:t xml:space="preserve"> </w:t>
-      </w:r>
-      <w:r>
-        <w:rPr>
-          <w:noProof/>
-        </w:rPr>
-        <w:drawing>
-          <wp:inline distT="0" distB="0" distL="0" distR="0" wp14:anchorId="4E4B003F" wp14:editId="0003F4CF">
-            <wp:extent cx="491706" cy="697328"/>
-            <wp:effectExtent l="0" t="0" r="3810" b="7620"/>
-            <wp:docPr id="31" name="Picture 31"/>
             <wp:cNvGraphicFramePr>
               <a:graphicFrameLocks xmlns:a="http://schemas.openxmlformats.org/drawingml/2006/main" noChangeAspect="1"/>
             </wp:cNvGraphicFramePr>
@@ -11161,7 +11258,7 @@
                   <pic:spPr>
                     <a:xfrm>
                       <a:off x="0" y="0"/>
-                      <a:ext cx="515572" cy="731175"/>
+                      <a:ext cx="585111" cy="936179"/>
                     </a:xfrm>
                     <a:prstGeom prst="rect">
                       <a:avLst/>
@@ -11188,10 +11285,10 @@
           <w:b/>
           <w:u w:val="single"/>
         </w:rPr>
-        <w:t>Scratch Total</w:t>
-      </w:r>
-      <w:r>
-        <w:t xml:space="preserve"> – The player’s total score before handicaps are taken into account.</w:t>
+        <w:t>GameID</w:t>
+      </w:r>
+      <w:r>
+        <w:t xml:space="preserve"> –Needs work</w:t>
       </w:r>
     </w:p>
     <w:p>
@@ -11201,14 +11298,17 @@
         <w:ind w:left="720"/>
       </w:pPr>
       <w:r>
+        <w:t xml:space="preserve">  </w:t>
+      </w:r>
+      <w:r>
         <w:rPr>
           <w:noProof/>
         </w:rPr>
         <w:drawing>
-          <wp:inline distT="0" distB="0" distL="0" distR="0" wp14:anchorId="0D472E01" wp14:editId="22125B12">
-            <wp:extent cx="542925" cy="752475"/>
-            <wp:effectExtent l="0" t="0" r="9525" b="9525"/>
-            <wp:docPr id="35" name="Picture 35"/>
+          <wp:inline distT="0" distB="0" distL="0" distR="0" wp14:anchorId="4EB199F8" wp14:editId="0E6CACF1">
+            <wp:extent cx="473914" cy="770111"/>
+            <wp:effectExtent l="0" t="0" r="2540" b="0"/>
+            <wp:docPr id="29" name="Picture 29"/>
             <wp:cNvGraphicFramePr>
               <a:graphicFrameLocks xmlns:a="http://schemas.openxmlformats.org/drawingml/2006/main" noChangeAspect="1"/>
             </wp:cNvGraphicFramePr>
@@ -11228,7 +11328,7 @@
                   <pic:spPr>
                     <a:xfrm>
                       <a:off x="0" y="0"/>
-                      <a:ext cx="542925" cy="752475"/>
+                      <a:ext cx="506426" cy="822944"/>
                     </a:xfrm>
                     <a:prstGeom prst="rect">
                       <a:avLst/>
@@ -11240,6 +11340,9 @@
           </wp:inline>
         </w:drawing>
       </w:r>
+      <w:r>
+        <w:t xml:space="preserve">   </w:t>
+      </w:r>
     </w:p>
     <w:p>
       <w:pPr>
@@ -11255,10 +11358,19 @@
           <w:b/>
           <w:u w:val="single"/>
         </w:rPr>
-        <w:t xml:space="preserve">Handicap Total </w:t>
-      </w:r>
-      <w:r>
-        <w:t>– The player’s total score after handicaps are taken into account.</w:t>
+        <w:t>Game 1-4 and ValidScore 1-4</w:t>
+      </w:r>
+      <w:r>
+        <w:t xml:space="preserve"> - t</w:t>
+      </w:r>
+      <w:r>
+        <w:t>hat player’s score for each game</w:t>
+      </w:r>
+      <w:r>
+        <w:t xml:space="preserve"> they played, and a checkbox used to determine whether that player’s score is valid for that set of pins. E.G. a sandbagged score will be</w:t>
+      </w:r>
+      <w:r>
+        <w:t xml:space="preserve"> unchecked and thus invalidated.</w:t>
       </w:r>
     </w:p>
     <w:p>
@@ -11266,16 +11378,25 @@
         <w:pStyle w:val="BodyText"/>
         <w:keepNext/>
         <w:ind w:left="720"/>
-      </w:pPr>
-      <w:r>
         <w:rPr>
           <w:noProof/>
         </w:rPr>
+      </w:pPr>
+      <w:r>
+        <w:rPr>
+          <w:noProof/>
+        </w:rPr>
+        <w:t xml:space="preserve"> </w:t>
+      </w:r>
+      <w:r>
+        <w:rPr>
+          <w:noProof/>
+        </w:rPr>
         <w:drawing>
-          <wp:inline distT="0" distB="0" distL="0" distR="0" wp14:anchorId="5B092339" wp14:editId="45625D94">
-            <wp:extent cx="533400" cy="752475"/>
-            <wp:effectExtent l="0" t="0" r="0" b="9525"/>
-            <wp:docPr id="40" name="Picture 40"/>
+          <wp:inline distT="0" distB="0" distL="0" distR="0" wp14:anchorId="7A3357F6" wp14:editId="1EC28456">
+            <wp:extent cx="491706" cy="697328"/>
+            <wp:effectExtent l="0" t="0" r="3810" b="7620"/>
+            <wp:docPr id="31" name="Picture 31"/>
             <wp:cNvGraphicFramePr>
               <a:graphicFrameLocks xmlns:a="http://schemas.openxmlformats.org/drawingml/2006/main" noChangeAspect="1"/>
             </wp:cNvGraphicFramePr>
@@ -11295,7 +11416,7 @@
                   <pic:spPr>
                     <a:xfrm>
                       <a:off x="0" y="0"/>
-                      <a:ext cx="533400" cy="752475"/>
+                      <a:ext cx="515572" cy="731175"/>
                     </a:xfrm>
                     <a:prstGeom prst="rect">
                       <a:avLst/>
@@ -11322,10 +11443,10 @@
           <w:b/>
           <w:u w:val="single"/>
         </w:rPr>
-        <w:t>Entry AVG</w:t>
-      </w:r>
-      <w:r>
-        <w:t xml:space="preserve"> – The average for the current entry of the player.</w:t>
+        <w:t>Scratch Total</w:t>
+      </w:r>
+      <w:r>
+        <w:t xml:space="preserve"> – The player’s total score before handicaps are taken into account.</w:t>
       </w:r>
     </w:p>
     <w:p>
@@ -11338,12 +11459,11 @@
         <w:rPr>
           <w:noProof/>
         </w:rPr>
-        <w:lastRenderedPageBreak/>
         <w:drawing>
-          <wp:inline distT="0" distB="0" distL="0" distR="0" wp14:anchorId="412BDA32" wp14:editId="5AADEA86">
-            <wp:extent cx="533400" cy="733425"/>
-            <wp:effectExtent l="0" t="0" r="0" b="9525"/>
-            <wp:docPr id="41" name="Picture 41"/>
+          <wp:inline distT="0" distB="0" distL="0" distR="0" wp14:anchorId="275B9669" wp14:editId="7FA5F256">
+            <wp:extent cx="542925" cy="752475"/>
+            <wp:effectExtent l="0" t="0" r="9525" b="9525"/>
+            <wp:docPr id="35" name="Picture 35"/>
             <wp:cNvGraphicFramePr>
               <a:graphicFrameLocks xmlns:a="http://schemas.openxmlformats.org/drawingml/2006/main" noChangeAspect="1"/>
             </wp:cNvGraphicFramePr>
@@ -11363,7 +11483,7 @@
                   <pic:spPr>
                     <a:xfrm>
                       <a:off x="0" y="0"/>
-                      <a:ext cx="533400" cy="733425"/>
+                      <a:ext cx="542925" cy="752475"/>
                     </a:xfrm>
                     <a:prstGeom prst="rect">
                       <a:avLst/>
@@ -11390,10 +11510,10 @@
           <w:b/>
           <w:u w:val="single"/>
         </w:rPr>
-        <w:t>30 Entry AVG</w:t>
-      </w:r>
-      <w:r>
-        <w:t xml:space="preserve"> – The average for the last 30 entries of the player.</w:t>
+        <w:t xml:space="preserve">Handicap Total </w:t>
+      </w:r>
+      <w:r>
+        <w:t>– The player’s total score after handicaps are taken into account.</w:t>
       </w:r>
     </w:p>
     <w:p>
@@ -11407,10 +11527,10 @@
           <w:noProof/>
         </w:rPr>
         <w:drawing>
-          <wp:inline distT="0" distB="0" distL="0" distR="0" wp14:anchorId="157E3374" wp14:editId="08B5DF7E">
-            <wp:extent cx="514350" cy="781050"/>
-            <wp:effectExtent l="0" t="0" r="0" b="0"/>
-            <wp:docPr id="42" name="Picture 42"/>
+          <wp:inline distT="0" distB="0" distL="0" distR="0" wp14:anchorId="1C4ED64A" wp14:editId="177F90E7">
+            <wp:extent cx="533400" cy="752475"/>
+            <wp:effectExtent l="0" t="0" r="0" b="9525"/>
+            <wp:docPr id="40" name="Picture 40"/>
             <wp:cNvGraphicFramePr>
               <a:graphicFrameLocks xmlns:a="http://schemas.openxmlformats.org/drawingml/2006/main" noChangeAspect="1"/>
             </wp:cNvGraphicFramePr>
@@ -11430,7 +11550,7 @@
                   <pic:spPr>
                     <a:xfrm>
                       <a:off x="0" y="0"/>
-                      <a:ext cx="514350" cy="781050"/>
+                      <a:ext cx="533400" cy="752475"/>
                     </a:xfrm>
                     <a:prstGeom prst="rect">
                       <a:avLst/>
@@ -11457,13 +11577,10 @@
           <w:b/>
           <w:u w:val="single"/>
         </w:rPr>
-        <w:t>ADJ AVG</w:t>
-      </w:r>
-      <w:r>
-        <w:t xml:space="preserve"> – Adjusted Average.</w:t>
-      </w:r>
-      <w:r>
-        <w:t xml:space="preserve"> The average that has been adjusted by the director if need be. E.G. if a player sandbags a score, the average can be adjusted and entered in here.</w:t>
+        <w:t>Entry AVG</w:t>
+      </w:r>
+      <w:r>
+        <w:t xml:space="preserve"> – The average for the current entry of the player.</w:t>
       </w:r>
     </w:p>
     <w:p>
@@ -11476,11 +11593,12 @@
         <w:rPr>
           <w:noProof/>
         </w:rPr>
+        <w:lastRenderedPageBreak/>
         <w:drawing>
-          <wp:inline distT="0" distB="0" distL="0" distR="0" wp14:anchorId="3272CA0B" wp14:editId="230A1468">
-            <wp:extent cx="514350" cy="762000"/>
-            <wp:effectExtent l="0" t="0" r="0" b="0"/>
-            <wp:docPr id="43" name="Picture 43"/>
+          <wp:inline distT="0" distB="0" distL="0" distR="0" wp14:anchorId="13E6B45B" wp14:editId="14A1B0A6">
+            <wp:extent cx="533400" cy="733425"/>
+            <wp:effectExtent l="0" t="0" r="0" b="9525"/>
+            <wp:docPr id="41" name="Picture 41"/>
             <wp:cNvGraphicFramePr>
               <a:graphicFrameLocks xmlns:a="http://schemas.openxmlformats.org/drawingml/2006/main" noChangeAspect="1"/>
             </wp:cNvGraphicFramePr>
@@ -11500,7 +11618,7 @@
                   <pic:spPr>
                     <a:xfrm>
                       <a:off x="0" y="0"/>
-                      <a:ext cx="514350" cy="762000"/>
+                      <a:ext cx="533400" cy="733425"/>
                     </a:xfrm>
                     <a:prstGeom prst="rect">
                       <a:avLst/>
@@ -11527,13 +11645,10 @@
           <w:b/>
           <w:u w:val="single"/>
         </w:rPr>
-        <w:t>Director Check</w:t>
-      </w:r>
-      <w:r>
-        <w:t xml:space="preserve"> – Checkbox to confirm a director has checked and validated</w:t>
-      </w:r>
-      <w:r>
-        <w:t xml:space="preserve"> a player’s score.</w:t>
+        <w:t>30 Entry AVG</w:t>
+      </w:r>
+      <w:r>
+        <w:t xml:space="preserve"> – The average for the last 30 entries of the player.</w:t>
       </w:r>
     </w:p>
     <w:p>
@@ -11547,10 +11662,10 @@
           <w:noProof/>
         </w:rPr>
         <w:drawing>
-          <wp:inline distT="0" distB="0" distL="0" distR="0" wp14:anchorId="7F50A187" wp14:editId="032B21D1">
-            <wp:extent cx="542925" cy="733425"/>
-            <wp:effectExtent l="0" t="0" r="9525" b="9525"/>
-            <wp:docPr id="45" name="Picture 45"/>
+          <wp:inline distT="0" distB="0" distL="0" distR="0" wp14:anchorId="1A027C84" wp14:editId="6C6F8DDF">
+            <wp:extent cx="514350" cy="781050"/>
+            <wp:effectExtent l="0" t="0" r="0" b="0"/>
+            <wp:docPr id="42" name="Picture 42"/>
             <wp:cNvGraphicFramePr>
               <a:graphicFrameLocks xmlns:a="http://schemas.openxmlformats.org/drawingml/2006/main" noChangeAspect="1"/>
             </wp:cNvGraphicFramePr>
@@ -11570,7 +11685,7 @@
                   <pic:spPr>
                     <a:xfrm>
                       <a:off x="0" y="0"/>
-                      <a:ext cx="542925" cy="733425"/>
+                      <a:ext cx="514350" cy="781050"/>
                     </a:xfrm>
                     <a:prstGeom prst="rect">
                       <a:avLst/>
@@ -11591,33 +11706,19 @@
           <w:ilvl w:val="0"/>
           <w:numId w:val="50"/>
         </w:numPr>
+      </w:pPr>
+      <w:r>
         <w:rPr>
           <w:b/>
           <w:u w:val="single"/>
         </w:rPr>
-      </w:pPr>
-      <w:r>
-        <w:rPr>
-          <w:b/>
-          <w:u w:val="single"/>
-        </w:rPr>
-        <w:t>Squad</w:t>
-      </w:r>
-      <w:r>
-        <w:rPr>
-          <w:b/>
-          <w:u w:val="single"/>
-        </w:rPr>
-        <w:t xml:space="preserve"> </w:t>
-      </w:r>
-      <w:r>
-        <w:t>–</w:t>
-      </w:r>
-      <w:r>
-        <w:t xml:space="preserve"> T</w:t>
-      </w:r>
-      <w:r>
-        <w:t>he squad of this player’s game.</w:t>
+        <w:t>ADJ AVG</w:t>
+      </w:r>
+      <w:r>
+        <w:t xml:space="preserve"> – Adjusted Average.</w:t>
+      </w:r>
+      <w:r>
+        <w:t xml:space="preserve"> The average that has been adjusted by the director if need be. E.G. if a player sandbags a score, the average can be adjusted and entered in here.</w:t>
       </w:r>
     </w:p>
     <w:p>
@@ -11625,20 +11726,16 @@
         <w:pStyle w:val="BodyText"/>
         <w:keepNext/>
         <w:ind w:left="720"/>
-        <w:rPr>
-          <w:b/>
-          <w:u w:val="single"/>
-        </w:rPr>
       </w:pPr>
       <w:r>
         <w:rPr>
           <w:noProof/>
         </w:rPr>
         <w:drawing>
-          <wp:inline distT="0" distB="0" distL="0" distR="0" wp14:anchorId="7AC6F896" wp14:editId="14C61E1A">
-            <wp:extent cx="504825" cy="781050"/>
-            <wp:effectExtent l="0" t="0" r="9525" b="0"/>
-            <wp:docPr id="46" name="Picture 46"/>
+          <wp:inline distT="0" distB="0" distL="0" distR="0" wp14:anchorId="0EA28D84" wp14:editId="0D1BAAD7">
+            <wp:extent cx="514350" cy="762000"/>
+            <wp:effectExtent l="0" t="0" r="0" b="0"/>
+            <wp:docPr id="43" name="Picture 43"/>
             <wp:cNvGraphicFramePr>
               <a:graphicFrameLocks xmlns:a="http://schemas.openxmlformats.org/drawingml/2006/main" noChangeAspect="1"/>
             </wp:cNvGraphicFramePr>
@@ -11658,7 +11755,7 @@
                   <pic:spPr>
                     <a:xfrm>
                       <a:off x="0" y="0"/>
-                      <a:ext cx="504825" cy="781050"/>
+                      <a:ext cx="514350" cy="762000"/>
                     </a:xfrm>
                     <a:prstGeom prst="rect">
                       <a:avLst/>
@@ -11679,20 +11776,19 @@
           <w:ilvl w:val="0"/>
           <w:numId w:val="50"/>
         </w:numPr>
+      </w:pPr>
+      <w:r>
         <w:rPr>
           <w:b/>
           <w:u w:val="single"/>
         </w:rPr>
-      </w:pPr>
-      <w:r>
-        <w:rPr>
-          <w:b/>
-          <w:u w:val="single"/>
-        </w:rPr>
-        <w:t xml:space="preserve">Handicap </w:t>
-      </w:r>
-      <w:r>
-        <w:t>– The player’s current handicap.</w:t>
+        <w:t>Director Check</w:t>
+      </w:r>
+      <w:r>
+        <w:t xml:space="preserve"> – Checkbox to confirm a director has checked and validated</w:t>
+      </w:r>
+      <w:r>
+        <w:t xml:space="preserve"> a player’s score.</w:t>
       </w:r>
     </w:p>
     <w:p>
@@ -11700,20 +11796,16 @@
         <w:pStyle w:val="BodyText"/>
         <w:keepNext/>
         <w:ind w:left="720"/>
-        <w:rPr>
-          <w:b/>
-          <w:u w:val="single"/>
-        </w:rPr>
       </w:pPr>
       <w:r>
         <w:rPr>
           <w:noProof/>
         </w:rPr>
         <w:drawing>
-          <wp:inline distT="0" distB="0" distL="0" distR="0" wp14:anchorId="4946DE74" wp14:editId="16A79906">
-            <wp:extent cx="561975" cy="762000"/>
-            <wp:effectExtent l="0" t="0" r="9525" b="0"/>
-            <wp:docPr id="47" name="Picture 47"/>
+          <wp:inline distT="0" distB="0" distL="0" distR="0" wp14:anchorId="7975C22F" wp14:editId="35A77B3D">
+            <wp:extent cx="542925" cy="733425"/>
+            <wp:effectExtent l="0" t="0" r="9525" b="9525"/>
+            <wp:docPr id="45" name="Picture 45"/>
             <wp:cNvGraphicFramePr>
               <a:graphicFrameLocks xmlns:a="http://schemas.openxmlformats.org/drawingml/2006/main" noChangeAspect="1"/>
             </wp:cNvGraphicFramePr>
@@ -11733,7 +11825,7 @@
                   <pic:spPr>
                     <a:xfrm>
                       <a:off x="0" y="0"/>
-                      <a:ext cx="561975" cy="762000"/>
+                      <a:ext cx="542925" cy="733425"/>
                     </a:xfrm>
                     <a:prstGeom prst="rect">
                       <a:avLst/>
@@ -11764,10 +11856,23 @@
           <w:b/>
           <w:u w:val="single"/>
         </w:rPr>
-        <w:t>Bonus</w:t>
-      </w:r>
-      <w:r>
-        <w:t xml:space="preserve"> – Current player’s bonus.</w:t>
+        <w:t>Squad</w:t>
+      </w:r>
+      <w:r>
+        <w:rPr>
+          <w:b/>
+          <w:u w:val="single"/>
+        </w:rPr>
+        <w:t xml:space="preserve"> </w:t>
+      </w:r>
+      <w:r>
+        <w:t>–</w:t>
+      </w:r>
+      <w:r>
+        <w:t xml:space="preserve"> T</w:t>
+      </w:r>
+      <w:r>
+        <w:t>he squad of this player’s game.</w:t>
       </w:r>
     </w:p>
     <w:p>
@@ -11784,12 +11889,11 @@
         <w:rPr>
           <w:noProof/>
         </w:rPr>
-        <w:lastRenderedPageBreak/>
         <w:drawing>
-          <wp:inline distT="0" distB="0" distL="0" distR="0" wp14:anchorId="35A42E1C" wp14:editId="7F36AF82">
-            <wp:extent cx="533400" cy="752475"/>
-            <wp:effectExtent l="0" t="0" r="0" b="9525"/>
-            <wp:docPr id="48" name="Picture 48"/>
+          <wp:inline distT="0" distB="0" distL="0" distR="0" wp14:anchorId="752F97DE" wp14:editId="3DE20F24">
+            <wp:extent cx="504825" cy="781050"/>
+            <wp:effectExtent l="0" t="0" r="9525" b="0"/>
+            <wp:docPr id="46" name="Picture 46"/>
             <wp:cNvGraphicFramePr>
               <a:graphicFrameLocks xmlns:a="http://schemas.openxmlformats.org/drawingml/2006/main" noChangeAspect="1"/>
             </wp:cNvGraphicFramePr>
@@ -11809,7 +11913,7 @@
                   <pic:spPr>
                     <a:xfrm>
                       <a:off x="0" y="0"/>
-                      <a:ext cx="533400" cy="752475"/>
+                      <a:ext cx="504825" cy="781050"/>
                     </a:xfrm>
                     <a:prstGeom prst="rect">
                       <a:avLst/>
@@ -11840,17 +11944,10 @@
           <w:b/>
           <w:u w:val="single"/>
         </w:rPr>
-        <w:t xml:space="preserve"> Pro Pot</w:t>
-      </w:r>
-      <w:r>
-        <w:rPr>
-          <w:i/>
-          <w:u w:val="single"/>
-        </w:rPr>
-        <w:t xml:space="preserve"> </w:t>
-      </w:r>
-      <w:r>
-        <w:t>– Needs work</w:t>
+        <w:t xml:space="preserve">Handicap </w:t>
+      </w:r>
+      <w:r>
+        <w:t>– The player’s current handicap.</w:t>
       </w:r>
     </w:p>
     <w:p>
@@ -11868,10 +11965,10 @@
           <w:noProof/>
         </w:rPr>
         <w:drawing>
-          <wp:inline distT="0" distB="0" distL="0" distR="0" wp14:anchorId="3BA00C19" wp14:editId="1E4B13D5">
-            <wp:extent cx="533400" cy="733425"/>
-            <wp:effectExtent l="0" t="0" r="0" b="9525"/>
-            <wp:docPr id="49" name="Picture 49"/>
+          <wp:inline distT="0" distB="0" distL="0" distR="0" wp14:anchorId="246BBCB5" wp14:editId="5433436B">
+            <wp:extent cx="561975" cy="762000"/>
+            <wp:effectExtent l="0" t="0" r="9525" b="0"/>
+            <wp:docPr id="47" name="Picture 47"/>
             <wp:cNvGraphicFramePr>
               <a:graphicFrameLocks xmlns:a="http://schemas.openxmlformats.org/drawingml/2006/main" noChangeAspect="1"/>
             </wp:cNvGraphicFramePr>
@@ -11891,7 +11988,7 @@
                   <pic:spPr>
                     <a:xfrm>
                       <a:off x="0" y="0"/>
-                      <a:ext cx="533400" cy="733425"/>
+                      <a:ext cx="561975" cy="762000"/>
                     </a:xfrm>
                     <a:prstGeom prst="rect">
                       <a:avLst/>
@@ -11922,10 +12019,10 @@
           <w:b/>
           <w:u w:val="single"/>
         </w:rPr>
-        <w:t>Notes</w:t>
-      </w:r>
-      <w:r>
-        <w:t xml:space="preserve"> – notes on the current player can be entered here.</w:t>
+        <w:t>Bonus</w:t>
+      </w:r>
+      <w:r>
+        <w:t xml:space="preserve"> – Current player’s bonus.</w:t>
       </w:r>
     </w:p>
     <w:p>
@@ -11942,11 +12039,12 @@
         <w:rPr>
           <w:noProof/>
         </w:rPr>
+        <w:lastRenderedPageBreak/>
         <w:drawing>
-          <wp:inline distT="0" distB="0" distL="0" distR="0" wp14:anchorId="6134A815" wp14:editId="2364058E">
-            <wp:extent cx="533400" cy="733425"/>
+          <wp:inline distT="0" distB="0" distL="0" distR="0" wp14:anchorId="4DAE4DA4" wp14:editId="32E56A64">
+            <wp:extent cx="533400" cy="752475"/>
             <wp:effectExtent l="0" t="0" r="0" b="9525"/>
-            <wp:docPr id="50" name="Picture 50"/>
+            <wp:docPr id="48" name="Picture 48"/>
             <wp:cNvGraphicFramePr>
               <a:graphicFrameLocks xmlns:a="http://schemas.openxmlformats.org/drawingml/2006/main" noChangeAspect="1"/>
             </wp:cNvGraphicFramePr>
@@ -11966,6 +12064,88 @@
                   <pic:spPr>
                     <a:xfrm>
                       <a:off x="0" y="0"/>
+                      <a:ext cx="533400" cy="752475"/>
+                    </a:xfrm>
+                    <a:prstGeom prst="rect">
+                      <a:avLst/>
+                    </a:prstGeom>
+                  </pic:spPr>
+                </pic:pic>
+              </a:graphicData>
+            </a:graphic>
+          </wp:inline>
+        </w:drawing>
+      </w:r>
+    </w:p>
+    <w:p>
+      <w:pPr>
+        <w:pStyle w:val="BodyText"/>
+        <w:keepNext/>
+        <w:numPr>
+          <w:ilvl w:val="0"/>
+          <w:numId w:val="50"/>
+        </w:numPr>
+        <w:rPr>
+          <w:b/>
+          <w:u w:val="single"/>
+        </w:rPr>
+      </w:pPr>
+      <w:r>
+        <w:rPr>
+          <w:b/>
+          <w:u w:val="single"/>
+        </w:rPr>
+        <w:t xml:space="preserve"> Pro Pot</w:t>
+      </w:r>
+      <w:r>
+        <w:rPr>
+          <w:i/>
+          <w:u w:val="single"/>
+        </w:rPr>
+        <w:t xml:space="preserve"> </w:t>
+      </w:r>
+      <w:r>
+        <w:t>– Needs work</w:t>
+      </w:r>
+    </w:p>
+    <w:p>
+      <w:pPr>
+        <w:pStyle w:val="BodyText"/>
+        <w:keepNext/>
+        <w:ind w:left="720"/>
+        <w:rPr>
+          <w:b/>
+          <w:u w:val="single"/>
+        </w:rPr>
+      </w:pPr>
+      <w:r>
+        <w:rPr>
+          <w:noProof/>
+        </w:rPr>
+        <w:drawing>
+          <wp:inline distT="0" distB="0" distL="0" distR="0" wp14:anchorId="262F41B1" wp14:editId="7DF7E216">
+            <wp:extent cx="533400" cy="733425"/>
+            <wp:effectExtent l="0" t="0" r="0" b="9525"/>
+            <wp:docPr id="49" name="Picture 49"/>
+            <wp:cNvGraphicFramePr>
+              <a:graphicFrameLocks xmlns:a="http://schemas.openxmlformats.org/drawingml/2006/main" noChangeAspect="1"/>
+            </wp:cNvGraphicFramePr>
+            <a:graphic xmlns:a="http://schemas.openxmlformats.org/drawingml/2006/main">
+              <a:graphicData uri="http://schemas.openxmlformats.org/drawingml/2006/picture">
+                <pic:pic xmlns:pic="http://schemas.openxmlformats.org/drawingml/2006/picture">
+                  <pic:nvPicPr>
+                    <pic:cNvPr id="1" name=""/>
+                    <pic:cNvPicPr/>
+                  </pic:nvPicPr>
+                  <pic:blipFill>
+                    <a:blip r:embed="rId47"/>
+                    <a:stretch>
+                      <a:fillRect/>
+                    </a:stretch>
+                  </pic:blipFill>
+                  <pic:spPr>
+                    <a:xfrm>
+                      <a:off x="0" y="0"/>
                       <a:ext cx="533400" cy="733425"/>
                     </a:xfrm>
                     <a:prstGeom prst="rect">
@@ -11981,6 +12161,81 @@
     </w:p>
     <w:p>
       <w:pPr>
+        <w:pStyle w:val="BodyText"/>
+        <w:keepNext/>
+        <w:numPr>
+          <w:ilvl w:val="0"/>
+          <w:numId w:val="50"/>
+        </w:numPr>
+        <w:rPr>
+          <w:b/>
+          <w:u w:val="single"/>
+        </w:rPr>
+      </w:pPr>
+      <w:r>
+        <w:rPr>
+          <w:b/>
+          <w:u w:val="single"/>
+        </w:rPr>
+        <w:t>Notes</w:t>
+      </w:r>
+      <w:r>
+        <w:t xml:space="preserve"> – notes on the current player can be entered here.</w:t>
+      </w:r>
+    </w:p>
+    <w:p>
+      <w:pPr>
+        <w:pStyle w:val="BodyText"/>
+        <w:keepNext/>
+        <w:ind w:left="720"/>
+        <w:rPr>
+          <w:b/>
+          <w:u w:val="single"/>
+        </w:rPr>
+      </w:pPr>
+      <w:r>
+        <w:rPr>
+          <w:noProof/>
+        </w:rPr>
+        <w:drawing>
+          <wp:inline distT="0" distB="0" distL="0" distR="0" wp14:anchorId="29A96E70" wp14:editId="63FE8FAF">
+            <wp:extent cx="533400" cy="733425"/>
+            <wp:effectExtent l="0" t="0" r="0" b="9525"/>
+            <wp:docPr id="50" name="Picture 50"/>
+            <wp:cNvGraphicFramePr>
+              <a:graphicFrameLocks xmlns:a="http://schemas.openxmlformats.org/drawingml/2006/main" noChangeAspect="1"/>
+            </wp:cNvGraphicFramePr>
+            <a:graphic xmlns:a="http://schemas.openxmlformats.org/drawingml/2006/main">
+              <a:graphicData uri="http://schemas.openxmlformats.org/drawingml/2006/picture">
+                <pic:pic xmlns:pic="http://schemas.openxmlformats.org/drawingml/2006/picture">
+                  <pic:nvPicPr>
+                    <pic:cNvPr id="1" name=""/>
+                    <pic:cNvPicPr/>
+                  </pic:nvPicPr>
+                  <pic:blipFill>
+                    <a:blip r:embed="rId48"/>
+                    <a:stretch>
+                      <a:fillRect/>
+                    </a:stretch>
+                  </pic:blipFill>
+                  <pic:spPr>
+                    <a:xfrm>
+                      <a:off x="0" y="0"/>
+                      <a:ext cx="533400" cy="733425"/>
+                    </a:xfrm>
+                    <a:prstGeom prst="rect">
+                      <a:avLst/>
+                    </a:prstGeom>
+                  </pic:spPr>
+                </pic:pic>
+              </a:graphicData>
+            </a:graphic>
+          </wp:inline>
+        </w:drawing>
+      </w:r>
+    </w:p>
+    <w:p>
+      <w:pPr>
         <w:pStyle w:val="Caption"/>
       </w:pPr>
     </w:p>
@@ -11988,12 +12243,12 @@
       <w:pPr>
         <w:pStyle w:val="Heading1"/>
       </w:pPr>
-      <w:bookmarkStart w:id="41" w:name="_Toc509165867"/>
+      <w:bookmarkStart w:id="43" w:name="_Toc509165867"/>
       <w:r>
         <w:lastRenderedPageBreak/>
         <w:t>Tools</w:t>
       </w:r>
-      <w:bookmarkEnd w:id="41"/>
+      <w:bookmarkEnd w:id="43"/>
       <w:r>
         <w:fldChar w:fldCharType="begin"/>
       </w:r>
@@ -12047,7 +12302,7 @@
           <w:noProof/>
         </w:rPr>
         <w:drawing>
-          <wp:inline distT="0" distB="0" distL="0" distR="0" wp14:anchorId="6166FE6E" wp14:editId="473BA504">
+          <wp:inline distT="0" distB="0" distL="0" distR="0" wp14:anchorId="37DB13FA" wp14:editId="6A9A2AC5">
             <wp:extent cx="2343150" cy="3836334"/>
             <wp:effectExtent l="0" t="0" r="0" b="0"/>
             <wp:docPr id="13" name="Picture 13"/>
@@ -12062,7 +12317,7 @@
                     <pic:cNvPicPr/>
                   </pic:nvPicPr>
                   <pic:blipFill>
-                    <a:blip r:embed="rId47">
+                    <a:blip r:embed="rId49">
                       <a:extLst>
                         <a:ext uri="{28A0092B-C50C-407E-A947-70E740481C1C}">
                           <a14:useLocalDpi xmlns:a14="http://schemas.microsoft.com/office/drawing/2010/main" val="0"/>
@@ -12191,7 +12446,7 @@
       <w:pPr>
         <w:pStyle w:val="Heading1"/>
       </w:pPr>
-      <w:bookmarkStart w:id="42" w:name="_Toc509165868"/>
+      <w:bookmarkStart w:id="44" w:name="_Toc509165868"/>
       <w:r>
         <w:lastRenderedPageBreak/>
         <w:t>Troubles</w:t>
@@ -12217,7 +12472,7 @@
       <w:r>
         <w:t xml:space="preserve"> 9-Tap</w:t>
       </w:r>
-      <w:bookmarkEnd w:id="42"/>
+      <w:bookmarkEnd w:id="44"/>
     </w:p>
     <w:p>
       <w:pPr>
@@ -12227,7 +12482,7 @@
           <w:szCs w:val="24"/>
         </w:rPr>
       </w:pPr>
-      <w:bookmarkStart w:id="43" w:name="_Toc509165869"/>
+      <w:bookmarkStart w:id="45" w:name="_Toc509165869"/>
       <w:r>
         <w:rPr>
           <w:sz w:val="24"/>
@@ -12249,7 +12504,7 @@
         </w:rPr>
         <w:t>:</w:t>
       </w:r>
-      <w:bookmarkEnd w:id="43"/>
+      <w:bookmarkEnd w:id="45"/>
     </w:p>
     <w:p>
       <w:pPr>
@@ -12329,14 +12584,14 @@
       <w:pPr>
         <w:pStyle w:val="Heading2"/>
       </w:pPr>
-      <w:bookmarkStart w:id="44" w:name="_Toc509165870"/>
+      <w:bookmarkStart w:id="46" w:name="_Toc509165870"/>
       <w:r>
         <w:t>Screen “splitting”</w:t>
       </w:r>
       <w:r>
         <w:t xml:space="preserve"> on resize</w:t>
       </w:r>
-      <w:bookmarkEnd w:id="44"/>
+      <w:bookmarkEnd w:id="46"/>
     </w:p>
     <w:p>
       <w:pPr>
@@ -12363,7 +12618,7 @@
           <w:noProof/>
         </w:rPr>
         <w:drawing>
-          <wp:inline distT="0" distB="0" distL="0" distR="0">
+          <wp:inline distT="0" distB="0" distL="0" distR="0" wp14:anchorId="3767B650" wp14:editId="20C9E060">
             <wp:extent cx="3810000" cy="2979628"/>
             <wp:effectExtent l="0" t="0" r="0" b="0"/>
             <wp:docPr id="22" name="Picture 22"/>
@@ -12378,7 +12633,7 @@
                     <pic:cNvPicPr/>
                   </pic:nvPicPr>
                   <pic:blipFill>
-                    <a:blip r:embed="rId48" cstate="print">
+                    <a:blip r:embed="rId50" cstate="print">
                       <a:extLst>
                         <a:ext uri="{28A0092B-C50C-407E-A947-70E740481C1C}">
                           <a14:useLocalDpi xmlns:a14="http://schemas.microsoft.com/office/drawing/2010/main" val="0"/>
@@ -12442,7 +12697,7 @@
         <mc:AlternateContent>
           <mc:Choice Requires="wps">
             <w:drawing>
-              <wp:anchor distT="0" distB="0" distL="114300" distR="114300" simplePos="0" relativeHeight="251658240" behindDoc="0" locked="0" layoutInCell="1" allowOverlap="1" wp14:anchorId="2EB0F7D5" wp14:editId="56206372">
+              <wp:anchor distT="0" distB="0" distL="114300" distR="114300" simplePos="0" relativeHeight="251658240" behindDoc="0" locked="0" layoutInCell="1" allowOverlap="1" wp14:anchorId="7BB17706" wp14:editId="62300B34">
                 <wp:simplePos x="0" y="0"/>
                 <wp:positionH relativeFrom="column">
                   <wp:posOffset>3175</wp:posOffset>
@@ -12519,7 +12774,7 @@
           </mc:Choice>
           <mc:Fallback>
             <w:pict>
-              <v:shapetype w14:anchorId="2EB0F7D5" id="_x0000_t202" coordsize="21600,21600" o:spt="202" path="m,l,21600r21600,l21600,xe">
+              <v:shapetype w14:anchorId="7BB17706" id="_x0000_t202" coordsize="21600,21600" o:spt="202" path="m,l,21600r21600,l21600,xe">
                 <v:stroke joinstyle="miter"/>
                 <v:path gradientshapeok="t" o:connecttype="rect"/>
               </v:shapetype>
@@ -12562,7 +12817,7 @@
           <w:noProof/>
         </w:rPr>
         <w:drawing>
-          <wp:anchor distT="0" distB="0" distL="114300" distR="114300" simplePos="0" relativeHeight="251656192" behindDoc="0" locked="0" layoutInCell="1" allowOverlap="1">
+          <wp:anchor distT="0" distB="0" distL="114300" distR="114300" simplePos="0" relativeHeight="251656192" behindDoc="0" locked="0" layoutInCell="1" allowOverlap="1" wp14:anchorId="682AA4A0" wp14:editId="46FA8D0E">
             <wp:simplePos x="0" y="0"/>
             <wp:positionH relativeFrom="column">
               <wp:posOffset>3175</wp:posOffset>
@@ -12585,7 +12840,7 @@
                     <pic:cNvPicPr/>
                   </pic:nvPicPr>
                   <pic:blipFill>
-                    <a:blip r:embed="rId49">
+                    <a:blip r:embed="rId51">
                       <a:extLst>
                         <a:ext uri="{28A0092B-C50C-407E-A947-70E740481C1C}">
                           <a14:useLocalDpi xmlns:a14="http://schemas.microsoft.com/office/drawing/2010/main" val="0"/>
@@ -12642,7 +12897,7 @@
           <w:szCs w:val="24"/>
         </w:rPr>
       </w:pPr>
-      <w:bookmarkStart w:id="45" w:name="_Toc509165871"/>
+      <w:bookmarkStart w:id="47" w:name="_Toc509165871"/>
       <w:r>
         <w:rPr>
           <w:sz w:val="24"/>
@@ -12651,7 +12906,7 @@
         <w:lastRenderedPageBreak/>
         <w:t>ReadMe File</w:t>
       </w:r>
-      <w:bookmarkEnd w:id="45"/>
+      <w:bookmarkEnd w:id="47"/>
       <w:r>
         <w:rPr>
           <w:sz w:val="24"/>
@@ -12770,7 +13025,7 @@
       <w:pPr>
         <w:pStyle w:val="Heading1"/>
       </w:pPr>
-      <w:bookmarkStart w:id="46" w:name="_Toc509165872"/>
+      <w:bookmarkStart w:id="48" w:name="_Toc509165872"/>
       <w:r>
         <w:lastRenderedPageBreak/>
         <w:t>Conver</w:t>
@@ -12778,7 +13033,7 @@
       <w:r>
         <w:t>sion Program</w:t>
       </w:r>
-      <w:bookmarkEnd w:id="46"/>
+      <w:bookmarkEnd w:id="48"/>
       <w:r>
         <w:fldChar w:fldCharType="begin"/>
       </w:r>
@@ -12891,12 +13146,12 @@
       <w:pPr>
         <w:pStyle w:val="Heading1"/>
       </w:pPr>
-      <w:bookmarkStart w:id="47" w:name="_Toc509165873"/>
+      <w:bookmarkStart w:id="49" w:name="_Toc509165873"/>
       <w:r>
         <w:lastRenderedPageBreak/>
         <w:t>General Information</w:t>
       </w:r>
-      <w:bookmarkEnd w:id="47"/>
+      <w:bookmarkEnd w:id="49"/>
       <w:r>
         <w:fldChar w:fldCharType="begin"/>
       </w:r>
@@ -12932,7 +13187,7 @@
           <w:szCs w:val="22"/>
         </w:rPr>
       </w:pPr>
-      <w:bookmarkStart w:id="48" w:name="_Toc509165874"/>
+      <w:bookmarkStart w:id="50" w:name="_Toc509165874"/>
       <w:r>
         <w:rPr>
           <w:sz w:val="22"/>
@@ -12941,7 +13196,7 @@
         <w:lastRenderedPageBreak/>
         <w:t>Main Menu</w:t>
       </w:r>
-      <w:bookmarkEnd w:id="48"/>
+      <w:bookmarkEnd w:id="50"/>
       <w:r>
         <w:rPr>
           <w:sz w:val="22"/>
@@ -13441,11 +13696,11 @@
       <w:pPr>
         <w:pStyle w:val="Heading2"/>
       </w:pPr>
-      <w:bookmarkStart w:id="49" w:name="_Toc509165875"/>
+      <w:bookmarkStart w:id="51" w:name="_Toc509165875"/>
       <w:r>
         <w:t>Member Info</w:t>
       </w:r>
-      <w:bookmarkEnd w:id="49"/>
+      <w:bookmarkEnd w:id="51"/>
       <w:r>
         <w:fldChar w:fldCharType="begin"/>
       </w:r>
@@ -14311,7 +14566,13 @@
         <w:t>—</w:t>
       </w:r>
       <w:r>
-        <w:t xml:space="preserve"> this button </w:t>
+        <w:t xml:space="preserve"> </w:t>
+      </w:r>
+      <w:r>
+        <w:t>This</w:t>
+      </w:r>
+      <w:r>
+        <w:t xml:space="preserve"> button </w:t>
       </w:r>
       <w:r>
         <w:t>brings up currently selected member’s statistics.</w:t>
@@ -14530,11 +14791,11 @@
       <w:pPr>
         <w:pStyle w:val="Heading2"/>
       </w:pPr>
-      <w:bookmarkStart w:id="50" w:name="_Toc509165876"/>
+      <w:bookmarkStart w:id="52" w:name="_Toc509165876"/>
       <w:r>
         <w:t>Member Scores</w:t>
       </w:r>
-      <w:bookmarkEnd w:id="50"/>
+      <w:bookmarkEnd w:id="52"/>
       <w:r>
         <w:fldChar w:fldCharType="begin"/>
       </w:r>
@@ -15982,11 +16243,11 @@
       <w:pPr>
         <w:pStyle w:val="Heading2"/>
       </w:pPr>
-      <w:bookmarkStart w:id="51" w:name="_Toc509165877"/>
+      <w:bookmarkStart w:id="53" w:name="_Toc509165877"/>
       <w:r>
         <w:t>Tools</w:t>
       </w:r>
-      <w:bookmarkEnd w:id="51"/>
+      <w:bookmarkEnd w:id="53"/>
       <w:r>
         <w:fldChar w:fldCharType="begin"/>
       </w:r>
@@ -16015,11 +16276,11 @@
       <w:pPr>
         <w:pStyle w:val="Heading2"/>
       </w:pPr>
-      <w:bookmarkStart w:id="52" w:name="_Toc509165878"/>
+      <w:bookmarkStart w:id="54" w:name="_Toc509165878"/>
       <w:r>
         <w:t>About</w:t>
       </w:r>
-      <w:bookmarkEnd w:id="52"/>
+      <w:bookmarkEnd w:id="54"/>
       <w:r>
         <w:fldChar w:fldCharType="begin"/>
       </w:r>
@@ -16069,11 +16330,11 @@
       <w:pPr>
         <w:pStyle w:val="Heading2"/>
       </w:pPr>
-      <w:bookmarkStart w:id="53" w:name="_Toc509165879"/>
+      <w:bookmarkStart w:id="55" w:name="_Toc509165879"/>
       <w:r>
         <w:t>Exit</w:t>
       </w:r>
-      <w:bookmarkEnd w:id="53"/>
+      <w:bookmarkEnd w:id="55"/>
       <w:r>
         <w:fldChar w:fldCharType="begin"/>
       </w:r>
@@ -16124,18 +16385,18 @@
     <w:p>
       <w:pPr>
         <w:sectPr>
-          <w:headerReference w:type="default" r:id="rId50"/>
-          <w:footerReference w:type="default" r:id="rId51"/>
-          <w:headerReference w:type="first" r:id="rId52"/>
+          <w:headerReference w:type="default" r:id="rId52"/>
+          <w:footerReference w:type="default" r:id="rId53"/>
+          <w:headerReference w:type="first" r:id="rId54"/>
           <w:type w:val="continuous"/>
           <w:pgSz w:w="12240" w:h="15840" w:code="1"/>
           <w:pgMar w:top="1800" w:right="1195" w:bottom="1440" w:left="3355" w:header="720" w:footer="720" w:gutter="0"/>
           <w:cols w:space="720"/>
         </w:sectPr>
       </w:pPr>
-      <w:bookmarkStart w:id="54" w:name="_Toc35154388"/>
-      <w:bookmarkStart w:id="55" w:name="_Toc35154911"/>
-      <w:bookmarkStart w:id="56" w:name="_Toc36023011"/>
+      <w:bookmarkStart w:id="56" w:name="_Toc35154388"/>
+      <w:bookmarkStart w:id="57" w:name="_Toc35154911"/>
+      <w:bookmarkStart w:id="58" w:name="_Toc36023011"/>
     </w:p>
     <w:p>
       <w:pPr>
@@ -16150,15 +16411,15 @@
       <w:pPr>
         <w:pStyle w:val="Heading1"/>
       </w:pPr>
-      <w:bookmarkStart w:id="57" w:name="_Toc509165880"/>
+      <w:bookmarkStart w:id="59" w:name="_Toc509165880"/>
       <w:r>
         <w:lastRenderedPageBreak/>
         <w:t>Index</w:t>
       </w:r>
-      <w:bookmarkEnd w:id="54"/>
-      <w:bookmarkEnd w:id="55"/>
       <w:bookmarkEnd w:id="56"/>
       <w:bookmarkEnd w:id="57"/>
+      <w:bookmarkEnd w:id="58"/>
+      <w:bookmarkEnd w:id="59"/>
     </w:p>
     <w:p>
       <w:pPr>
@@ -17419,6 +17680,52 @@
     </w:sectPr>
   </w:body>
 </w:document>
+</file>
+
+<file path=word/comments.xml><?xml version="1.0" encoding="utf-8"?>
+<w:comments xmlns:wpc="http://schemas.microsoft.com/office/word/2010/wordprocessingCanvas" xmlns:mc="http://schemas.openxmlformats.org/markup-compatibility/2006" xmlns:o="urn:schemas-microsoft-com:office:office" xmlns:r="http://schemas.openxmlformats.org/officeDocument/2006/relationships" xmlns:m="http://schemas.openxmlformats.org/officeDocument/2006/math" xmlns:v="urn:schemas-microsoft-com:vml" xmlns:wp14="http://schemas.microsoft.com/office/word/2010/wordprocessingDrawing" xmlns:wp="http://schemas.openxmlformats.org/drawingml/2006/wordprocessingDrawing" xmlns:w10="urn:schemas-microsoft-com:office:word" xmlns:w="http://schemas.openxmlformats.org/wordprocessingml/2006/main" xmlns:w14="http://schemas.microsoft.com/office/word/2010/wordml" xmlns:w15="http://schemas.microsoft.com/office/word/2012/wordml" xmlns:wpg="http://schemas.microsoft.com/office/word/2010/wordprocessingGroup" xmlns:wpi="http://schemas.microsoft.com/office/word/2010/wordprocessingInk" xmlns:wne="http://schemas.microsoft.com/office/word/2006/wordml" xmlns:wps="http://schemas.microsoft.com/office/word/2010/wordprocessingShape" mc:Ignorable="w14 w15 wp14">
+  <w:comment w:id="41" w:author="Timothy Fair" w:date="2018-07-25T14:36:00Z" w:initials="TF">
+    <w:p>
+      <w:pPr>
+        <w:pStyle w:val="CommentText"/>
+      </w:pPr>
+      <w:r>
+        <w:rPr>
+          <w:rStyle w:val="CommentReference"/>
+        </w:rPr>
+        <w:annotationRef/>
+      </w:r>
+    </w:p>
+  </w:comment>
+  <w:comment w:id="42" w:author="Timothy Fair" w:date="2018-07-25T14:36:00Z" w:initials="TF">
+    <w:p>
+      <w:pPr>
+        <w:pStyle w:val="CommentText"/>
+      </w:pPr>
+      <w:r>
+        <w:rPr>
+          <w:rStyle w:val="CommentReference"/>
+        </w:rPr>
+        <w:annotationRef/>
+      </w:r>
+      <w:r>
+        <w:t>For an unknown reason the document enters compatibility mode and bookmarks break, showing these errors all across the manual.</w:t>
+      </w:r>
+    </w:p>
+    <w:p>
+      <w:pPr>
+        <w:pStyle w:val="CommentText"/>
+      </w:pPr>
+    </w:p>
+  </w:comment>
+</w:comments>
+</file>
+
+<file path=word/commentsExtended.xml><?xml version="1.0" encoding="utf-8"?>
+<w15:commentsEx xmlns:wpc="http://schemas.microsoft.com/office/word/2010/wordprocessingCanvas" xmlns:mc="http://schemas.openxmlformats.org/markup-compatibility/2006" xmlns:o="urn:schemas-microsoft-com:office:office" xmlns:r="http://schemas.openxmlformats.org/officeDocument/2006/relationships" xmlns:m="http://schemas.openxmlformats.org/officeDocument/2006/math" xmlns:v="urn:schemas-microsoft-com:vml" xmlns:wp14="http://schemas.microsoft.com/office/word/2010/wordprocessingDrawing" xmlns:wp="http://schemas.openxmlformats.org/drawingml/2006/wordprocessingDrawing" xmlns:w10="urn:schemas-microsoft-com:office:word" xmlns:w="http://schemas.openxmlformats.org/wordprocessingml/2006/main" xmlns:w14="http://schemas.microsoft.com/office/word/2010/wordml" xmlns:w15="http://schemas.microsoft.com/office/word/2012/wordml" xmlns:wpg="http://schemas.microsoft.com/office/word/2010/wordprocessingGroup" xmlns:wpi="http://schemas.microsoft.com/office/word/2010/wordprocessingInk" xmlns:wne="http://schemas.microsoft.com/office/word/2006/wordml" xmlns:wps="http://schemas.microsoft.com/office/word/2010/wordprocessingShape" mc:Ignorable="w14 w15 wp14">
+  <w15:commentEx w15:paraId="15022064" w15:done="0"/>
+  <w15:commentEx w15:paraId="7F6E4FCA" w15:done="0"/>
+</w15:commentsEx>
 </file>
 
 <file path=word/endnotes.xml><?xml version="1.0" encoding="utf-8"?>
@@ -17534,7 +17841,7 @@
         <w:rStyle w:val="PageNumber"/>
         <w:noProof/>
       </w:rPr>
-      <w:t>25</w:t>
+      <w:t>19</w:t>
     </w:r>
     <w:r>
       <w:rPr>
@@ -19983,6 +20290,14 @@
     <w:abstractNumId w:val="24"/>
   </w:num>
 </w:numbering>
+</file>
+
+<file path=word/people.xml><?xml version="1.0" encoding="utf-8"?>
+<w15:people xmlns:wpc="http://schemas.microsoft.com/office/word/2010/wordprocessingCanvas" xmlns:mc="http://schemas.openxmlformats.org/markup-compatibility/2006" xmlns:o="urn:schemas-microsoft-com:office:office" xmlns:r="http://schemas.openxmlformats.org/officeDocument/2006/relationships" xmlns:m="http://schemas.openxmlformats.org/officeDocument/2006/math" xmlns:v="urn:schemas-microsoft-com:vml" xmlns:wp14="http://schemas.microsoft.com/office/word/2010/wordprocessingDrawing" xmlns:wp="http://schemas.openxmlformats.org/drawingml/2006/wordprocessingDrawing" xmlns:w10="urn:schemas-microsoft-com:office:word" xmlns:w="http://schemas.openxmlformats.org/wordprocessingml/2006/main" xmlns:w14="http://schemas.microsoft.com/office/word/2010/wordml" xmlns:w15="http://schemas.microsoft.com/office/word/2012/wordml" xmlns:wpg="http://schemas.microsoft.com/office/word/2010/wordprocessingGroup" xmlns:wpi="http://schemas.microsoft.com/office/word/2010/wordprocessingInk" xmlns:wne="http://schemas.microsoft.com/office/word/2006/wordml" xmlns:wps="http://schemas.microsoft.com/office/word/2010/wordprocessingShape" mc:Ignorable="w14 w15 wp14">
+  <w15:person w15:author="Timothy Fair">
+    <w15:presenceInfo w15:providerId="AD" w15:userId="S-1-5-21-1752004977-2820985605-2366059907-1857"/>
+  </w15:person>
+</w15:people>
 </file>
 
 <file path=word/styles.xml><?xml version="1.0" encoding="utf-8"?>
@@ -21739,7 +22054,7 @@
 </file>
 
 <file path=customXml/itemProps1.xml><?xml version="1.0" encoding="utf-8"?>
-<ds:datastoreItem xmlns:ds="http://schemas.openxmlformats.org/officeDocument/2006/customXml" ds:itemID="{D8C1E52D-BB91-4CFE-B75C-8BC8DF7ADF45}">
+<ds:datastoreItem xmlns:ds="http://schemas.openxmlformats.org/officeDocument/2006/customXml" ds:itemID="{A090FC03-AD01-4378-880D-FC5F1307A7C4}">
   <ds:schemaRefs>
     <ds:schemaRef ds:uri="http://schemas.openxmlformats.org/officeDocument/2006/bibliography"/>
   </ds:schemaRefs>

</xml_diff>

<commit_message>
Reworded some of the documentation. Manually adjusting the average is required by the director of the tournament.
</commit_message>
<xml_diff>
--- a/9tapUserManual.docx
+++ b/9tapUserManual.docx
@@ -173,7 +173,6 @@
         </w:sectPr>
       </w:pPr>
     </w:p>
-    <w:bookmarkStart w:id="0" w:name="_GoBack" w:displacedByCustomXml="next"/>
     <w:sdt>
       <w:sdtPr>
         <w:rPr>
@@ -226,7 +225,6 @@
             <w:t>able of Contents</w:t>
           </w:r>
         </w:p>
-        <w:bookmarkEnd w:id="0"/>
         <w:p>
           <w:pPr>
             <w:pStyle w:val="TOC1"/>
@@ -4005,7 +4003,7 @@
       <w:pPr>
         <w:pStyle w:val="Heading1"/>
       </w:pPr>
-      <w:bookmarkStart w:id="1" w:name="_Toc509165828"/>
+      <w:bookmarkStart w:id="0" w:name="_Toc509165828"/>
       <w:r>
         <w:lastRenderedPageBreak/>
         <w:t>About</w:t>
@@ -4056,7 +4054,7 @@
       <w:r>
         <w:t xml:space="preserve"> INC</w:t>
       </w:r>
-      <w:bookmarkEnd w:id="1"/>
+      <w:bookmarkEnd w:id="0"/>
     </w:p>
     <w:p>
       <w:pPr>
@@ -4231,8 +4229,8 @@
           <w:szCs w:val="20"/>
         </w:rPr>
       </w:pPr>
-      <w:bookmarkStart w:id="2" w:name="_Toc508882989"/>
-      <w:bookmarkStart w:id="3" w:name="_Toc509165829"/>
+      <w:bookmarkStart w:id="1" w:name="_Toc508882989"/>
+      <w:bookmarkStart w:id="2" w:name="_Toc509165829"/>
       <w:r>
         <w:rPr>
           <w:szCs w:val="20"/>
@@ -4240,8 +4238,8 @@
         <w:lastRenderedPageBreak/>
         <w:t>Dedication:</w:t>
       </w:r>
+      <w:bookmarkEnd w:id="1"/>
       <w:bookmarkEnd w:id="2"/>
-      <w:bookmarkEnd w:id="3"/>
     </w:p>
     <w:p>
       <w:pPr>
@@ -4276,7 +4274,7 @@
           <w:szCs w:val="40"/>
         </w:rPr>
       </w:pPr>
-      <w:bookmarkStart w:id="4" w:name="_Toc509165830"/>
+      <w:bookmarkStart w:id="3" w:name="_Toc509165830"/>
       <w:r>
         <w:rPr>
           <w:sz w:val="40"/>
@@ -4299,7 +4297,7 @@
         </w:rPr>
         <w:t>9-Tap?</w:t>
       </w:r>
-      <w:bookmarkEnd w:id="4"/>
+      <w:bookmarkEnd w:id="3"/>
     </w:p>
     <w:p>
       <w:pPr>
@@ -4372,14 +4370,27 @@
       <w:r>
         <w:t xml:space="preserve">Figure </w:t>
       </w:r>
-      <w:fldSimple w:instr=" SEQ Figure \* ARABIC ">
-        <w:r>
-          <w:rPr>
-            <w:noProof/>
-          </w:rPr>
-          <w:t>1</w:t>
-        </w:r>
-      </w:fldSimple>
+      <w:r>
+        <w:fldChar w:fldCharType="begin"/>
+      </w:r>
+      <w:r>
+        <w:instrText xml:space="preserve"> SEQ Figure \* ARABIC </w:instrText>
+      </w:r>
+      <w:r>
+        <w:fldChar w:fldCharType="separate"/>
+      </w:r>
+      <w:r>
+        <w:rPr>
+          <w:noProof/>
+        </w:rPr>
+        <w:t>1</w:t>
+      </w:r>
+      <w:r>
+        <w:rPr>
+          <w:noProof/>
+        </w:rPr>
+        <w:fldChar w:fldCharType="end"/>
+      </w:r>
       <w:r>
         <w:t>: 9-Tap Main Menu</w:t>
       </w:r>
@@ -4450,18 +4461,18 @@
       <w:pPr>
         <w:pStyle w:val="Heading2"/>
       </w:pPr>
-      <w:bookmarkStart w:id="5" w:name="_Toc509165831"/>
+      <w:bookmarkStart w:id="4" w:name="_Toc509165831"/>
       <w:r>
         <w:lastRenderedPageBreak/>
         <w:t>A good place to start</w:t>
       </w:r>
-      <w:bookmarkEnd w:id="5"/>
+      <w:bookmarkEnd w:id="4"/>
     </w:p>
     <w:p>
       <w:pPr>
         <w:pStyle w:val="Heading3"/>
       </w:pPr>
-      <w:bookmarkStart w:id="6" w:name="_Toc509165832"/>
+      <w:bookmarkStart w:id="5" w:name="_Toc509165832"/>
       <w:r>
         <w:t>Quick start</w:t>
       </w:r>
@@ -4506,38 +4517,33 @@
         <w:fldChar w:fldCharType="end"/>
       </w:r>
       <w:r>
-        <w:t xml:space="preserve"> </w:t>
-      </w:r>
-      <w:proofErr w:type="gramStart"/>
-      <w:r>
-        <w:t>guide</w:t>
+        <w:t xml:space="preserve"> guide</w:t>
+      </w:r>
+      <w:bookmarkEnd w:id="5"/>
+    </w:p>
+    <w:p>
+      <w:pPr>
+        <w:pStyle w:val="BodyText"/>
+      </w:pPr>
+      <w:r>
+        <w:t xml:space="preserve">You can find this on page </w:t>
+      </w:r>
+      <w:r>
+        <w:t>7</w:t>
+      </w:r>
+      <w:r>
+        <w:t>.</w:t>
+      </w:r>
+    </w:p>
+    <w:p>
+      <w:pPr>
+        <w:pStyle w:val="Heading3"/>
+      </w:pPr>
+      <w:bookmarkStart w:id="6" w:name="_Toc509165833"/>
+      <w:r>
+        <w:t>Troubleshooting</w:t>
       </w:r>
       <w:bookmarkEnd w:id="6"/>
-      <w:proofErr w:type="gramEnd"/>
-    </w:p>
-    <w:p>
-      <w:pPr>
-        <w:pStyle w:val="BodyText"/>
-      </w:pPr>
-      <w:r>
-        <w:t xml:space="preserve">You can find this on page </w:t>
-      </w:r>
-      <w:r>
-        <w:t>7</w:t>
-      </w:r>
-      <w:r>
-        <w:t>.</w:t>
-      </w:r>
-    </w:p>
-    <w:p>
-      <w:pPr>
-        <w:pStyle w:val="Heading3"/>
-      </w:pPr>
-      <w:bookmarkStart w:id="7" w:name="_Toc509165833"/>
-      <w:r>
-        <w:t>Troubleshooting</w:t>
-      </w:r>
-      <w:bookmarkEnd w:id="7"/>
       <w:r>
         <w:fldChar w:fldCharType="begin"/>
       </w:r>
@@ -4597,7 +4603,7 @@
       <w:pPr>
         <w:pStyle w:val="Heading2"/>
       </w:pPr>
-      <w:bookmarkStart w:id="8" w:name="_Toc509165834"/>
+      <w:bookmarkStart w:id="7" w:name="_Toc509165834"/>
       <w:r>
         <w:t xml:space="preserve">Menus </w:t>
       </w:r>
@@ -4607,7 +4613,7 @@
       <w:r>
         <w:t>uide</w:t>
       </w:r>
-      <w:bookmarkEnd w:id="8"/>
+      <w:bookmarkEnd w:id="7"/>
       <w:r>
         <w:fldChar w:fldCharType="begin"/>
       </w:r>
@@ -4800,7 +4806,7 @@
       <w:pPr>
         <w:pStyle w:val="Heading1"/>
       </w:pPr>
-      <w:bookmarkStart w:id="9" w:name="_Toc509165835"/>
+      <w:bookmarkStart w:id="8" w:name="_Toc509165835"/>
       <w:r>
         <w:lastRenderedPageBreak/>
         <w:t>Quick Start</w:t>
@@ -4848,7 +4854,7 @@
       <w:r>
         <w:t xml:space="preserve"> Guide</w:t>
       </w:r>
-      <w:bookmarkEnd w:id="9"/>
+      <w:bookmarkEnd w:id="8"/>
     </w:p>
     <w:p>
       <w:pPr>
@@ -4869,7 +4875,7 @@
       <w:pPr>
         <w:pStyle w:val="Heading2"/>
       </w:pPr>
-      <w:bookmarkStart w:id="10" w:name="_Toc509165836"/>
+      <w:bookmarkStart w:id="9" w:name="_Toc509165836"/>
       <w:r>
         <w:t>What are the system requirements</w:t>
       </w:r>
@@ -4914,40 +4920,32 @@
         <w:fldChar w:fldCharType="end"/>
       </w:r>
       <w:r>
+        <w:t xml:space="preserve"> to run 9-Tap?</w:t>
+      </w:r>
+      <w:bookmarkEnd w:id="9"/>
+    </w:p>
+    <w:p>
+      <w:pPr>
+        <w:pStyle w:val="BodyTextKeep"/>
+      </w:pPr>
+      <w:r>
+        <w:t>The system requirements</w:t>
+      </w:r>
+      <w:r>
+        <w:t xml:space="preserve">: </w:t>
+      </w:r>
+      <w:r>
+        <w:t>Windows 7 and above</w:t>
+      </w:r>
+      <w:r>
+        <w:t xml:space="preserve">. </w:t>
+      </w:r>
+      <w:r>
+        <w:t>13MB free disk space.</w:t>
+      </w:r>
+      <w:r>
         <w:t xml:space="preserve"> </w:t>
       </w:r>
-      <w:proofErr w:type="gramStart"/>
-      <w:r>
-        <w:t>to</w:t>
-      </w:r>
-      <w:proofErr w:type="gramEnd"/>
-      <w:r>
-        <w:t xml:space="preserve"> run 9-Tap?</w:t>
-      </w:r>
-      <w:bookmarkEnd w:id="10"/>
-    </w:p>
-    <w:p>
-      <w:pPr>
-        <w:pStyle w:val="BodyTextKeep"/>
-      </w:pPr>
-      <w:r>
-        <w:t>The system requirements</w:t>
-      </w:r>
-      <w:r>
-        <w:t xml:space="preserve">: </w:t>
-      </w:r>
-      <w:r>
-        <w:t>Windows 7 and above</w:t>
-      </w:r>
-      <w:r>
-        <w:t xml:space="preserve">. </w:t>
-      </w:r>
-      <w:r>
-        <w:t>13MB free disk space.</w:t>
-      </w:r>
-      <w:r>
-        <w:t xml:space="preserve"> </w:t>
-      </w:r>
       <w:r>
         <w:t xml:space="preserve">Optimized for 1366 X 768 screen resolution. </w:t>
       </w:r>
@@ -4959,7 +4957,7 @@
       <w:pPr>
         <w:pStyle w:val="Heading2"/>
       </w:pPr>
-      <w:bookmarkStart w:id="11" w:name="_Toc509165837"/>
+      <w:bookmarkStart w:id="10" w:name="_Toc509165837"/>
       <w:r>
         <w:t>How do I install 9-Tap</w:t>
       </w:r>
@@ -4983,15 +4981,7 @@
           <w:b/>
           <w:bCs/>
         </w:rPr>
-        <w:t xml:space="preserve">Error! Bookmark not </w:t>
-      </w:r>
-      <w:proofErr w:type="gramStart"/>
-      <w:r>
-        <w:rPr>
-          <w:b/>
-          <w:bCs/>
-        </w:rPr>
-        <w:t>defined.</w:t>
+        <w:t>Error! Bookmark not defined.</w:t>
       </w:r>
       <w:r>
         <w:fldChar w:fldCharType="end"/>
@@ -4999,8 +4989,7 @@
       <w:r>
         <w:t>?</w:t>
       </w:r>
-      <w:bookmarkEnd w:id="11"/>
-      <w:proofErr w:type="gramEnd"/>
+      <w:bookmarkEnd w:id="10"/>
     </w:p>
     <w:p>
       <w:pPr>
@@ -5119,15 +5108,7 @@
         <w:t>o</w:t>
       </w:r>
       <w:r>
-        <w:t xml:space="preserve">se another. If you don’t want a Start Menu folder to be created check the box “Do Not Create </w:t>
-      </w:r>
-      <w:proofErr w:type="gramStart"/>
-      <w:r>
-        <w:t>A</w:t>
-      </w:r>
-      <w:proofErr w:type="gramEnd"/>
-      <w:r>
-        <w:t xml:space="preserve"> Start Menu Folder”. Once you are satisfied with your selection click the “Next” button to continue.</w:t>
+        <w:t>se another. If you don’t want a Start Menu folder to be created check the box “Do Not Create A Start Menu Folder”. Once you are satisfied with your selection click the “Next” button to continue.</w:t>
       </w:r>
     </w:p>
     <w:p>
@@ -5284,15 +5265,7 @@
         <w:t>o</w:t>
       </w:r>
       <w:r>
-        <w:t xml:space="preserve">se another. If you don’t want a Start Menu folder to be created check the box “Do Not Create </w:t>
-      </w:r>
-      <w:proofErr w:type="gramStart"/>
-      <w:r>
-        <w:t>A</w:t>
-      </w:r>
-      <w:proofErr w:type="gramEnd"/>
-      <w:r>
-        <w:t xml:space="preserve"> Start Menu Folder”. Once you are satisfied with your selection click the “Next” button to continue.</w:t>
+        <w:t>se another. If you don’t want a Start Menu folder to be created check the box “Do Not Create A Start Menu Folder”. Once you are satisfied with your selection click the “Next” button to continue.</w:t>
       </w:r>
     </w:p>
     <w:p>
@@ -5341,11 +5314,11 @@
       <w:pPr>
         <w:pStyle w:val="Heading2"/>
       </w:pPr>
-      <w:bookmarkStart w:id="12" w:name="_Toc509165838"/>
+      <w:bookmarkStart w:id="11" w:name="_Toc509165838"/>
       <w:r>
         <w:t>How do I Launch 9-Tap?</w:t>
       </w:r>
-      <w:bookmarkEnd w:id="12"/>
+      <w:bookmarkEnd w:id="11"/>
     </w:p>
     <w:p>
       <w:pPr>
@@ -5368,7 +5341,7 @@
       <w:pPr>
         <w:pStyle w:val="Heading2"/>
       </w:pPr>
-      <w:bookmarkStart w:id="13" w:name="_Toc509165839"/>
+      <w:bookmarkStart w:id="12" w:name="_Toc509165839"/>
       <w:r>
         <w:lastRenderedPageBreak/>
         <w:t>How do I import existing</w:t>
@@ -5399,17 +5372,9 @@
         <w:fldChar w:fldCharType="end"/>
       </w:r>
       <w:r>
-        <w:t xml:space="preserve"> </w:t>
-      </w:r>
-      <w:proofErr w:type="gramStart"/>
-      <w:r>
-        <w:t>members</w:t>
-      </w:r>
-      <w:proofErr w:type="gramEnd"/>
-      <w:r>
-        <w:t>?</w:t>
-      </w:r>
-      <w:bookmarkEnd w:id="13"/>
+        <w:t xml:space="preserve"> members?</w:t>
+      </w:r>
+      <w:bookmarkEnd w:id="12"/>
     </w:p>
     <w:p>
       <w:pPr>
@@ -5459,15 +5424,7 @@
         <w:fldChar w:fldCharType="end"/>
       </w:r>
       <w:r>
-        <w:t xml:space="preserve"> </w:t>
-      </w:r>
-      <w:proofErr w:type="gramStart"/>
-      <w:r>
-        <w:t>screen</w:t>
-      </w:r>
-      <w:proofErr w:type="gramEnd"/>
-      <w:r>
-        <w:t xml:space="preserve">, </w:t>
+        <w:t xml:space="preserve"> screen, </w:t>
       </w:r>
       <w:r>
         <w:t>f</w:t>
@@ -5489,11 +5446,11 @@
       <w:pPr>
         <w:pStyle w:val="Heading2"/>
       </w:pPr>
-      <w:bookmarkStart w:id="14" w:name="_Toc509165840"/>
+      <w:bookmarkStart w:id="13" w:name="_Toc509165840"/>
       <w:r>
         <w:t>How do I enter a new player?</w:t>
       </w:r>
-      <w:bookmarkEnd w:id="14"/>
+      <w:bookmarkEnd w:id="13"/>
     </w:p>
     <w:p>
       <w:pPr>
@@ -5543,15 +5500,7 @@
         <w:fldChar w:fldCharType="end"/>
       </w:r>
       <w:r>
-        <w:t xml:space="preserve"> </w:t>
-      </w:r>
-      <w:proofErr w:type="gramStart"/>
-      <w:r>
-        <w:t>screen</w:t>
-      </w:r>
-      <w:proofErr w:type="gramEnd"/>
-      <w:r>
-        <w:t xml:space="preserve">, Click </w:t>
+        <w:t xml:space="preserve"> screen, Click </w:t>
       </w:r>
       <w:r>
         <w:t>“New” button.</w:t>
@@ -5576,11 +5525,11 @@
       <w:pPr>
         <w:pStyle w:val="Heading2"/>
       </w:pPr>
-      <w:bookmarkStart w:id="15" w:name="_Toc509165841"/>
+      <w:bookmarkStart w:id="14" w:name="_Toc509165841"/>
       <w:r>
         <w:t>How do I create a tournament?</w:t>
       </w:r>
-      <w:bookmarkEnd w:id="15"/>
+      <w:bookmarkEnd w:id="14"/>
     </w:p>
     <w:p>
       <w:pPr>
@@ -5630,15 +5579,7 @@
         <w:fldChar w:fldCharType="end"/>
       </w:r>
       <w:r>
-        <w:t xml:space="preserve"> </w:t>
-      </w:r>
-      <w:proofErr w:type="gramStart"/>
-      <w:r>
-        <w:t>screen</w:t>
-      </w:r>
-      <w:proofErr w:type="gramEnd"/>
-      <w:r>
-        <w:t xml:space="preserve">, </w:t>
+        <w:t xml:space="preserve"> screen, </w:t>
       </w:r>
       <w:r>
         <w:t xml:space="preserve">click on the </w:t>
@@ -5724,11 +5665,11 @@
       <w:pPr>
         <w:pStyle w:val="Heading2"/>
       </w:pPr>
-      <w:bookmarkStart w:id="16" w:name="_Toc509165842"/>
+      <w:bookmarkStart w:id="15" w:name="_Toc509165842"/>
       <w:r>
         <w:t>How do I enter a bowler’s scores?</w:t>
       </w:r>
-      <w:bookmarkEnd w:id="16"/>
+      <w:bookmarkEnd w:id="15"/>
     </w:p>
     <w:p>
       <w:pPr>
@@ -5778,15 +5719,7 @@
         <w:fldChar w:fldCharType="end"/>
       </w:r>
       <w:r>
-        <w:t xml:space="preserve"> </w:t>
-      </w:r>
-      <w:proofErr w:type="gramStart"/>
-      <w:r>
-        <w:t>screen</w:t>
-      </w:r>
-      <w:proofErr w:type="gramEnd"/>
-      <w:r>
-        <w:t xml:space="preserve">, in the Tournament Files section, select </w:t>
+        <w:t xml:space="preserve"> screen, in the Tournament Files section, select </w:t>
       </w:r>
       <w:r>
         <w:t>a</w:t>
@@ -5960,7 +5893,7 @@
           <w:szCs w:val="32"/>
         </w:rPr>
       </w:pPr>
-      <w:bookmarkStart w:id="17" w:name="_Toc509165843"/>
+      <w:bookmarkStart w:id="16" w:name="_Toc509165843"/>
       <w:r>
         <w:rPr>
           <w:szCs w:val="32"/>
@@ -5968,7 +5901,7 @@
         <w:lastRenderedPageBreak/>
         <w:t>Main Menu</w:t>
       </w:r>
-      <w:bookmarkEnd w:id="17"/>
+      <w:bookmarkEnd w:id="16"/>
       <w:r>
         <w:rPr>
           <w:szCs w:val="32"/>
@@ -6093,40 +6026,56 @@
           <w:b/>
           <w:bCs/>
         </w:rPr>
-        <w:t xml:space="preserve">Error! Bookmark not </w:t>
-      </w:r>
-      <w:proofErr w:type="gramStart"/>
+        <w:t>Error! Bookmark not defined.</w:t>
+      </w:r>
+      <w:r>
+        <w:fldChar w:fldCharType="end"/>
+      </w:r>
+      <w:r>
+        <w:t>, button and tab. Member Scores</w:t>
+      </w:r>
+      <w:r>
+        <w:fldChar w:fldCharType="begin"/>
+      </w:r>
+      <w:r>
+        <w:instrText xml:space="preserve"> XE "</w:instrText>
+      </w:r>
+      <w:r>
+        <w:instrText>Member Scores</w:instrText>
+      </w:r>
+      <w:r>
+        <w:instrText xml:space="preserve">" </w:instrText>
+      </w:r>
+      <w:r>
+        <w:fldChar w:fldCharType="end"/>
+      </w:r>
+      <w:r>
+        <w:fldChar w:fldCharType="begin"/>
+      </w:r>
+      <w:r>
+        <w:instrText xml:space="preserve"> E "</w:instrText>
+      </w:r>
+      <w:r>
+        <w:instrText>Member Scores</w:instrText>
+      </w:r>
+      <w:r>
+        <w:instrText xml:space="preserve">" </w:instrText>
+      </w:r>
+      <w:r>
+        <w:fldChar w:fldCharType="separate"/>
+      </w:r>
       <w:r>
         <w:rPr>
           <w:b/>
           <w:bCs/>
         </w:rPr>
-        <w:t>defined.</w:t>
-      </w:r>
-      <w:r>
-        <w:fldChar w:fldCharType="end"/>
-      </w:r>
-      <w:r>
-        <w:t>,</w:t>
-      </w:r>
-      <w:proofErr w:type="gramEnd"/>
-      <w:r>
-        <w:t xml:space="preserve"> button and tab. Member Scores</w:t>
-      </w:r>
-      <w:r>
-        <w:fldChar w:fldCharType="begin"/>
-      </w:r>
-      <w:r>
-        <w:instrText xml:space="preserve"> XE "</w:instrText>
-      </w:r>
-      <w:r>
-        <w:instrText>Member Scores</w:instrText>
-      </w:r>
-      <w:r>
-        <w:instrText xml:space="preserve">" </w:instrText>
-      </w:r>
-      <w:r>
-        <w:fldChar w:fldCharType="end"/>
+        <w:t>Error! Bookmark not defined.</w:t>
+      </w:r>
+      <w:r>
+        <w:fldChar w:fldCharType="end"/>
+      </w:r>
+      <w:r>
+        <w:t>, button and tab. The About</w:t>
       </w:r>
       <w:r>
         <w:fldChar w:fldCharType="begin"/>
@@ -6135,7 +6084,7 @@
         <w:instrText xml:space="preserve"> E "</w:instrText>
       </w:r>
       <w:r>
-        <w:instrText>Member Scores</w:instrText>
+        <w:instrText>About</w:instrText>
       </w:r>
       <w:r>
         <w:instrText xml:space="preserve">" </w:instrText>
@@ -6148,25 +6097,71 @@
           <w:b/>
           <w:bCs/>
         </w:rPr>
-        <w:t xml:space="preserve">Error! Bookmark not </w:t>
-      </w:r>
-      <w:proofErr w:type="gramStart"/>
+        <w:t>Error! Bookmark not defined.</w:t>
+      </w:r>
+      <w:r>
+        <w:fldChar w:fldCharType="end"/>
+      </w:r>
+      <w:r>
+        <w:t xml:space="preserve"> and Exit</w:t>
+      </w:r>
+      <w:r>
+        <w:fldChar w:fldCharType="begin"/>
+      </w:r>
+      <w:r>
+        <w:instrText xml:space="preserve"> XE "</w:instrText>
+      </w:r>
+      <w:r>
+        <w:instrText>Exit</w:instrText>
+      </w:r>
+      <w:r>
+        <w:instrText xml:space="preserve">" </w:instrText>
+      </w:r>
+      <w:r>
+        <w:fldChar w:fldCharType="end"/>
+      </w:r>
+      <w:r>
+        <w:fldChar w:fldCharType="begin"/>
+      </w:r>
+      <w:r>
+        <w:instrText xml:space="preserve"> E "</w:instrText>
+      </w:r>
+      <w:r>
+        <w:instrText>Exit</w:instrText>
+      </w:r>
+      <w:r>
+        <w:instrText xml:space="preserve">" </w:instrText>
+      </w:r>
+      <w:r>
+        <w:fldChar w:fldCharType="separate"/>
+      </w:r>
       <w:r>
         <w:rPr>
           <w:b/>
           <w:bCs/>
         </w:rPr>
-        <w:t>defined.</w:t>
-      </w:r>
-      <w:r>
-        <w:fldChar w:fldCharType="end"/>
-      </w:r>
-      <w:r>
-        <w:t>,</w:t>
-      </w:r>
-      <w:proofErr w:type="gramEnd"/>
-      <w:r>
-        <w:t xml:space="preserve"> button and tab. The About</w:t>
+        <w:t>Error! Bookmark not defined.</w:t>
+      </w:r>
+      <w:r>
+        <w:fldChar w:fldCharType="end"/>
+      </w:r>
+      <w:r>
+        <w:t xml:space="preserve"> buttons. The Region</w:t>
+      </w:r>
+      <w:r>
+        <w:fldChar w:fldCharType="begin"/>
+      </w:r>
+      <w:r>
+        <w:instrText xml:space="preserve"> XE "</w:instrText>
+      </w:r>
+      <w:r>
+        <w:instrText>Region</w:instrText>
+      </w:r>
+      <w:r>
+        <w:instrText xml:space="preserve">" </w:instrText>
+      </w:r>
+      <w:r>
+        <w:fldChar w:fldCharType="end"/>
       </w:r>
       <w:r>
         <w:fldChar w:fldCharType="begin"/>
@@ -6175,7 +6170,7 @@
         <w:instrText xml:space="preserve"> E "</w:instrText>
       </w:r>
       <w:r>
-        <w:instrText>About</w:instrText>
+        <w:instrText>Region</w:instrText>
       </w:r>
       <w:r>
         <w:instrText xml:space="preserve">" </w:instrText>
@@ -6194,117 +6189,7 @@
         <w:fldChar w:fldCharType="end"/>
       </w:r>
       <w:r>
-        <w:t xml:space="preserve"> </w:t>
-      </w:r>
-      <w:proofErr w:type="gramStart"/>
-      <w:r>
-        <w:t>and</w:t>
-      </w:r>
-      <w:proofErr w:type="gramEnd"/>
-      <w:r>
-        <w:t xml:space="preserve"> Exit</w:t>
-      </w:r>
-      <w:r>
-        <w:fldChar w:fldCharType="begin"/>
-      </w:r>
-      <w:r>
-        <w:instrText xml:space="preserve"> XE "</w:instrText>
-      </w:r>
-      <w:r>
-        <w:instrText>Exit</w:instrText>
-      </w:r>
-      <w:r>
-        <w:instrText xml:space="preserve">" </w:instrText>
-      </w:r>
-      <w:r>
-        <w:fldChar w:fldCharType="end"/>
-      </w:r>
-      <w:r>
-        <w:fldChar w:fldCharType="begin"/>
-      </w:r>
-      <w:r>
-        <w:instrText xml:space="preserve"> E "</w:instrText>
-      </w:r>
-      <w:r>
-        <w:instrText>Exit</w:instrText>
-      </w:r>
-      <w:r>
-        <w:instrText xml:space="preserve">" </w:instrText>
-      </w:r>
-      <w:r>
-        <w:fldChar w:fldCharType="separate"/>
-      </w:r>
-      <w:r>
-        <w:rPr>
-          <w:b/>
-          <w:bCs/>
-        </w:rPr>
-        <w:t>Error! Bookmark not defined.</w:t>
-      </w:r>
-      <w:r>
-        <w:fldChar w:fldCharType="end"/>
-      </w:r>
-      <w:r>
-        <w:t xml:space="preserve"> </w:t>
-      </w:r>
-      <w:proofErr w:type="gramStart"/>
-      <w:r>
-        <w:t>buttons</w:t>
-      </w:r>
-      <w:proofErr w:type="gramEnd"/>
-      <w:r>
-        <w:t>. The Region</w:t>
-      </w:r>
-      <w:r>
-        <w:fldChar w:fldCharType="begin"/>
-      </w:r>
-      <w:r>
-        <w:instrText xml:space="preserve"> XE "</w:instrText>
-      </w:r>
-      <w:r>
-        <w:instrText>Region</w:instrText>
-      </w:r>
-      <w:r>
-        <w:instrText xml:space="preserve">" </w:instrText>
-      </w:r>
-      <w:r>
-        <w:fldChar w:fldCharType="end"/>
-      </w:r>
-      <w:r>
-        <w:fldChar w:fldCharType="begin"/>
-      </w:r>
-      <w:r>
-        <w:instrText xml:space="preserve"> E "</w:instrText>
-      </w:r>
-      <w:r>
-        <w:instrText>Region</w:instrText>
-      </w:r>
-      <w:r>
-        <w:instrText xml:space="preserve">" </w:instrText>
-      </w:r>
-      <w:r>
-        <w:fldChar w:fldCharType="separate"/>
-      </w:r>
-      <w:r>
-        <w:rPr>
-          <w:b/>
-          <w:bCs/>
-        </w:rPr>
-        <w:t>Error! Bookmark not defined.</w:t>
-      </w:r>
-      <w:r>
-        <w:fldChar w:fldCharType="end"/>
-      </w:r>
-      <w:r>
-        <w:t xml:space="preserve"> </w:t>
-      </w:r>
-      <w:proofErr w:type="gramStart"/>
-      <w:r>
-        <w:t>picker</w:t>
-      </w:r>
-      <w:proofErr w:type="gramEnd"/>
-      <w:r>
-        <w:t>. And the “Add Region</w:t>
+        <w:t xml:space="preserve"> picker. And the “Add Region</w:t>
       </w:r>
       <w:r>
         <w:fldChar w:fldCharType="begin"/>
@@ -6385,14 +6270,27 @@
       <w:r>
         <w:t xml:space="preserve">Figure </w:t>
       </w:r>
-      <w:fldSimple w:instr=" SEQ Figure \* ARABIC ">
-        <w:r>
-          <w:rPr>
-            <w:noProof/>
-          </w:rPr>
-          <w:t>2</w:t>
-        </w:r>
-      </w:fldSimple>
+      <w:r>
+        <w:fldChar w:fldCharType="begin"/>
+      </w:r>
+      <w:r>
+        <w:instrText xml:space="preserve"> SEQ Figure \* ARABIC </w:instrText>
+      </w:r>
+      <w:r>
+        <w:fldChar w:fldCharType="separate"/>
+      </w:r>
+      <w:r>
+        <w:rPr>
+          <w:noProof/>
+        </w:rPr>
+        <w:t>2</w:t>
+      </w:r>
+      <w:r>
+        <w:rPr>
+          <w:noProof/>
+        </w:rPr>
+        <w:fldChar w:fldCharType="end"/>
+      </w:r>
       <w:r>
         <w:t>: Main Menu</w:t>
       </w:r>
@@ -6457,12 +6355,12 @@
       <w:pPr>
         <w:pStyle w:val="Heading1"/>
       </w:pPr>
-      <w:bookmarkStart w:id="18" w:name="_Toc509165844"/>
+      <w:bookmarkStart w:id="17" w:name="_Toc509165844"/>
       <w:r>
         <w:lastRenderedPageBreak/>
         <w:t>Member Info</w:t>
       </w:r>
-      <w:bookmarkEnd w:id="18"/>
+      <w:bookmarkEnd w:id="17"/>
       <w:r>
         <w:fldChar w:fldCharType="begin"/>
       </w:r>
@@ -6553,15 +6451,7 @@
         <w:fldChar w:fldCharType="end"/>
       </w:r>
       <w:r>
-        <w:t xml:space="preserve"> </w:t>
-      </w:r>
-      <w:proofErr w:type="gramStart"/>
-      <w:r>
-        <w:t>screen</w:t>
-      </w:r>
-      <w:proofErr w:type="gramEnd"/>
-      <w:r>
-        <w:t xml:space="preserve"> is where new players are entered</w:t>
+        <w:t xml:space="preserve"> screen is where new players are entered</w:t>
       </w:r>
       <w:r>
         <w:t>; member information is updated; and member information can be imported from Excel files</w:t>
@@ -6640,14 +6530,27 @@
       <w:r>
         <w:t xml:space="preserve">Figure </w:t>
       </w:r>
-      <w:fldSimple w:instr=" SEQ Figure \* ARABIC ">
-        <w:r>
-          <w:rPr>
-            <w:noProof/>
-          </w:rPr>
-          <w:t>3</w:t>
-        </w:r>
-      </w:fldSimple>
+      <w:r>
+        <w:fldChar w:fldCharType="begin"/>
+      </w:r>
+      <w:r>
+        <w:instrText xml:space="preserve"> SEQ Figure \* ARABIC </w:instrText>
+      </w:r>
+      <w:r>
+        <w:fldChar w:fldCharType="separate"/>
+      </w:r>
+      <w:r>
+        <w:rPr>
+          <w:noProof/>
+        </w:rPr>
+        <w:t>3</w:t>
+      </w:r>
+      <w:r>
+        <w:rPr>
+          <w:noProof/>
+        </w:rPr>
+        <w:fldChar w:fldCharType="end"/>
+      </w:r>
       <w:r>
         <w:t>: Member Information</w:t>
       </w:r>
@@ -6656,7 +6559,7 @@
       <w:pPr>
         <w:pStyle w:val="Heading3"/>
       </w:pPr>
-      <w:bookmarkStart w:id="19" w:name="_Toc509165845"/>
+      <w:bookmarkStart w:id="18" w:name="_Toc509165845"/>
       <w:r>
         <w:t>Import</w:t>
       </w:r>
@@ -6694,7 +6597,7 @@
       <w:r>
         <w:t>Member</w:t>
       </w:r>
-      <w:bookmarkEnd w:id="19"/>
+      <w:bookmarkEnd w:id="18"/>
       <w:r>
         <w:fldChar w:fldCharType="begin"/>
       </w:r>
@@ -6819,11 +6722,11 @@
       <w:pPr>
         <w:pStyle w:val="Heading3"/>
       </w:pPr>
-      <w:bookmarkStart w:id="20" w:name="_Toc509165846"/>
+      <w:bookmarkStart w:id="19" w:name="_Toc509165846"/>
       <w:r>
         <w:t>New Members</w:t>
       </w:r>
-      <w:bookmarkEnd w:id="20"/>
+      <w:bookmarkEnd w:id="19"/>
       <w:r>
         <w:fldChar w:fldCharType="begin"/>
       </w:r>
@@ -6914,15 +6817,7 @@
         <w:fldChar w:fldCharType="end"/>
       </w:r>
       <w:r>
-        <w:t xml:space="preserve"> </w:t>
-      </w:r>
-      <w:proofErr w:type="gramStart"/>
-      <w:r>
-        <w:t>screen</w:t>
-      </w:r>
-      <w:proofErr w:type="gramEnd"/>
-      <w:r>
-        <w:t>. Click the “New” button in the Record</w:t>
+        <w:t xml:space="preserve"> screen. Click the “New” button in the Record</w:t>
       </w:r>
       <w:r>
         <w:fldChar w:fldCharType="begin"/>
@@ -6980,15 +6875,7 @@
         <w:fldChar w:fldCharType="end"/>
       </w:r>
       <w:r>
-        <w:t xml:space="preserve"> </w:t>
-      </w:r>
-      <w:proofErr w:type="gramStart"/>
-      <w:r>
-        <w:t>field</w:t>
-      </w:r>
-      <w:proofErr w:type="gramEnd"/>
-      <w:r>
-        <w:t>, then hit tab. enter the member’s first name in the First Name</w:t>
+        <w:t xml:space="preserve"> field, then hit tab. enter the member’s first name in the First Name</w:t>
       </w:r>
       <w:r>
         <w:fldChar w:fldCharType="begin"/>
@@ -7016,15 +6903,7 @@
         <w:fldChar w:fldCharType="end"/>
       </w:r>
       <w:r>
-        <w:t xml:space="preserve"> </w:t>
-      </w:r>
-      <w:proofErr w:type="gramStart"/>
-      <w:r>
-        <w:t>field</w:t>
-      </w:r>
-      <w:proofErr w:type="gramEnd"/>
-      <w:r>
-        <w:t>, then hit tab</w:t>
+        <w:t xml:space="preserve"> field, then hit tab</w:t>
       </w:r>
       <w:r>
         <w:t>.</w:t>
@@ -7101,29 +6980,13 @@
         <w:fldChar w:fldCharType="end"/>
       </w:r>
       <w:r>
-        <w:t xml:space="preserve"> </w:t>
-      </w:r>
-      <w:proofErr w:type="gramStart"/>
-      <w:r>
-        <w:t>field</w:t>
-      </w:r>
-      <w:proofErr w:type="gramEnd"/>
-      <w:r>
-        <w:t xml:space="preserve">. To enter the member average from elsewhere, she has to have proof of it, </w:t>
+        <w:t xml:space="preserve"> field. To enter the member average from elsewhere, she has to have proof of it, </w:t>
       </w:r>
       <w:r>
         <w:t>for example:</w:t>
       </w:r>
       <w:r>
-        <w:t xml:space="preserve"> her published average from another league. Tab through until you are in the Status box. Choose if the member is inactive or active. If the member is 55 years old or older, check the “</w:t>
-      </w:r>
-      <w:proofErr w:type="gramStart"/>
-      <w:r>
-        <w:t>Senior</w:t>
-      </w:r>
-      <w:proofErr w:type="gramEnd"/>
-      <w:r>
-        <w:t>” box. In the gender box, select the member’s gender. Enter the date of the member’s last payment. Enter any notes in the note field, if applicable. Click “Save”. The new member is now added to the member database. Note: Last name and first name are required fields.</w:t>
+        <w:t xml:space="preserve"> her published average from another league. Tab through until you are in the Status box. Choose if the member is inactive or active. If the member is 55 years old or older, check the “Senior” box. In the gender box, select the member’s gender. Enter the date of the member’s last payment. Enter any notes in the note field, if applicable. Click “Save”. The new member is now added to the member database. Note: Last name and first name are required fields.</w:t>
       </w:r>
     </w:p>
     <w:p>
@@ -7193,14 +7056,27 @@
       <w:r>
         <w:t xml:space="preserve">Figure </w:t>
       </w:r>
-      <w:fldSimple w:instr=" SEQ Figure \* ARABIC ">
-        <w:r>
-          <w:rPr>
-            <w:noProof/>
-          </w:rPr>
-          <w:t>4</w:t>
-        </w:r>
-      </w:fldSimple>
+      <w:r>
+        <w:fldChar w:fldCharType="begin"/>
+      </w:r>
+      <w:r>
+        <w:instrText xml:space="preserve"> SEQ Figure \* ARABIC </w:instrText>
+      </w:r>
+      <w:r>
+        <w:fldChar w:fldCharType="separate"/>
+      </w:r>
+      <w:r>
+        <w:rPr>
+          <w:noProof/>
+        </w:rPr>
+        <w:t>4</w:t>
+      </w:r>
+      <w:r>
+        <w:rPr>
+          <w:noProof/>
+        </w:rPr>
+        <w:fldChar w:fldCharType="end"/>
+      </w:r>
       <w:r>
         <w:t>: Member Information</w:t>
       </w:r>
@@ -7209,14 +7085,14 @@
       <w:pPr>
         <w:pStyle w:val="Heading3"/>
       </w:pPr>
-      <w:bookmarkStart w:id="21" w:name="_Toc509165847"/>
+      <w:bookmarkStart w:id="20" w:name="_Toc509165847"/>
       <w:r>
         <w:t xml:space="preserve">Updating </w:t>
       </w:r>
       <w:r>
         <w:t>Members</w:t>
       </w:r>
-      <w:bookmarkEnd w:id="21"/>
+      <w:bookmarkEnd w:id="20"/>
       <w:r>
         <w:fldChar w:fldCharType="begin"/>
       </w:r>
@@ -7367,15 +7243,7 @@
         <w:fldChar w:fldCharType="end"/>
       </w:r>
       <w:r>
-        <w:t xml:space="preserve"> </w:t>
-      </w:r>
-      <w:proofErr w:type="gramStart"/>
-      <w:r>
-        <w:t>screen</w:t>
-      </w:r>
-      <w:proofErr w:type="gramEnd"/>
-      <w:r>
-        <w:t>. Make updates to the member’s information. Then click “Save”. The updates will be saved to the member database.</w:t>
+        <w:t xml:space="preserve"> screen. Make updates to the member’s information. Then click “Save”. The updates will be saved to the member database.</w:t>
       </w:r>
     </w:p>
     <w:p>
@@ -7385,14 +7253,14 @@
           <w:szCs w:val="20"/>
         </w:rPr>
       </w:pPr>
-      <w:bookmarkStart w:id="22" w:name="_Toc509165848"/>
+      <w:bookmarkStart w:id="21" w:name="_Toc509165848"/>
       <w:r>
         <w:rPr>
           <w:szCs w:val="20"/>
         </w:rPr>
         <w:t>Stats</w:t>
       </w:r>
-      <w:bookmarkEnd w:id="22"/>
+      <w:bookmarkEnd w:id="21"/>
       <w:r>
         <w:rPr>
           <w:szCs w:val="20"/>
@@ -7578,14 +7446,27 @@
       <w:r>
         <w:t xml:space="preserve">Figure </w:t>
       </w:r>
-      <w:fldSimple w:instr=" SEQ Figure \* ARABIC ">
-        <w:r>
-          <w:rPr>
-            <w:noProof/>
-          </w:rPr>
-          <w:t>5</w:t>
-        </w:r>
-      </w:fldSimple>
+      <w:r>
+        <w:fldChar w:fldCharType="begin"/>
+      </w:r>
+      <w:r>
+        <w:instrText xml:space="preserve"> SEQ Figure \* ARABIC </w:instrText>
+      </w:r>
+      <w:r>
+        <w:fldChar w:fldCharType="separate"/>
+      </w:r>
+      <w:r>
+        <w:rPr>
+          <w:noProof/>
+        </w:rPr>
+        <w:t>5</w:t>
+      </w:r>
+      <w:r>
+        <w:rPr>
+          <w:noProof/>
+        </w:rPr>
+        <w:fldChar w:fldCharType="end"/>
+      </w:r>
       <w:r>
         <w:t>: Stats</w:t>
       </w:r>
@@ -7650,7 +7531,7 @@
           <w:szCs w:val="20"/>
         </w:rPr>
       </w:pPr>
-      <w:bookmarkStart w:id="23" w:name="_Toc509165849"/>
+      <w:bookmarkStart w:id="22" w:name="_Toc509165849"/>
       <w:r>
         <w:rPr>
           <w:szCs w:val="20"/>
@@ -7658,7 +7539,7 @@
         <w:lastRenderedPageBreak/>
         <w:t>Member Search</w:t>
       </w:r>
-      <w:bookmarkEnd w:id="23"/>
+      <w:bookmarkEnd w:id="22"/>
       <w:r>
         <w:rPr>
           <w:szCs w:val="20"/>
@@ -7890,14 +7771,27 @@
       <w:r>
         <w:t xml:space="preserve">Figure </w:t>
       </w:r>
-      <w:fldSimple w:instr=" SEQ Figure \* ARABIC ">
-        <w:r>
-          <w:rPr>
-            <w:noProof/>
-          </w:rPr>
-          <w:t>6</w:t>
-        </w:r>
-      </w:fldSimple>
+      <w:r>
+        <w:fldChar w:fldCharType="begin"/>
+      </w:r>
+      <w:r>
+        <w:instrText xml:space="preserve"> SEQ Figure \* ARABIC </w:instrText>
+      </w:r>
+      <w:r>
+        <w:fldChar w:fldCharType="separate"/>
+      </w:r>
+      <w:r>
+        <w:rPr>
+          <w:noProof/>
+        </w:rPr>
+        <w:t>6</w:t>
+      </w:r>
+      <w:r>
+        <w:rPr>
+          <w:noProof/>
+        </w:rPr>
+        <w:fldChar w:fldCharType="end"/>
+      </w:r>
       <w:r>
         <w:t>: Member search, blank and with results</w:t>
       </w:r>
@@ -7909,7 +7803,7 @@
           <w:szCs w:val="20"/>
         </w:rPr>
       </w:pPr>
-      <w:bookmarkStart w:id="24" w:name="_Toc509165850"/>
+      <w:bookmarkStart w:id="23" w:name="_Toc509165850"/>
       <w:r>
         <w:rPr>
           <w:szCs w:val="20"/>
@@ -7917,7 +7811,7 @@
         <w:lastRenderedPageBreak/>
         <w:t>Print Recaps</w:t>
       </w:r>
-      <w:bookmarkEnd w:id="24"/>
+      <w:bookmarkEnd w:id="23"/>
       <w:r>
         <w:rPr>
           <w:szCs w:val="20"/>
@@ -8105,27 +7999,32 @@
       <w:r>
         <w:t xml:space="preserve">Figure </w:t>
       </w:r>
-      <w:fldSimple w:instr=" SEQ Figure \* ARABIC ">
-        <w:r>
-          <w:rPr>
-            <w:noProof/>
-          </w:rPr>
-          <w:t>7</w:t>
-        </w:r>
-      </w:fldSimple>
+      <w:r>
+        <w:fldChar w:fldCharType="begin"/>
+      </w:r>
+      <w:r>
+        <w:instrText xml:space="preserve"> SEQ Figure \* ARABIC </w:instrText>
+      </w:r>
+      <w:r>
+        <w:fldChar w:fldCharType="separate"/>
+      </w:r>
+      <w:r>
+        <w:rPr>
+          <w:noProof/>
+        </w:rPr>
+        <w:t>7</w:t>
+      </w:r>
+      <w:r>
+        <w:rPr>
+          <w:noProof/>
+        </w:rPr>
+        <w:fldChar w:fldCharType="end"/>
+      </w:r>
       <w:r>
         <w:t>: basic printer dialog</w:t>
       </w:r>
       <w:r>
-        <w:t xml:space="preserve">, Print </w:t>
-      </w:r>
-      <w:proofErr w:type="gramStart"/>
-      <w:r>
-        <w:t>By</w:t>
-      </w:r>
-      <w:proofErr w:type="gramEnd"/>
-      <w:r>
-        <w:t xml:space="preserve"> Date form.</w:t>
+        <w:t>, Print By Date form.</w:t>
       </w:r>
     </w:p>
     <w:p>
@@ -8135,14 +8034,14 @@
           <w:szCs w:val="20"/>
         </w:rPr>
       </w:pPr>
-      <w:bookmarkStart w:id="25" w:name="_Toc509165851"/>
+      <w:bookmarkStart w:id="24" w:name="_Toc509165851"/>
       <w:r>
         <w:rPr>
           <w:szCs w:val="20"/>
         </w:rPr>
         <w:t>Import</w:t>
       </w:r>
-      <w:bookmarkEnd w:id="25"/>
+      <w:bookmarkEnd w:id="24"/>
       <w:r>
         <w:rPr>
           <w:szCs w:val="20"/>
@@ -8297,14 +8196,27 @@
       <w:r>
         <w:t xml:space="preserve">Figure </w:t>
       </w:r>
-      <w:fldSimple w:instr=" SEQ Figure \* ARABIC ">
-        <w:r>
-          <w:rPr>
-            <w:noProof/>
-          </w:rPr>
-          <w:t>8</w:t>
-        </w:r>
-      </w:fldSimple>
+      <w:r>
+        <w:fldChar w:fldCharType="begin"/>
+      </w:r>
+      <w:r>
+        <w:instrText xml:space="preserve"> SEQ Figure \* ARABIC </w:instrText>
+      </w:r>
+      <w:r>
+        <w:fldChar w:fldCharType="separate"/>
+      </w:r>
+      <w:r>
+        <w:rPr>
+          <w:noProof/>
+        </w:rPr>
+        <w:t>8</w:t>
+      </w:r>
+      <w:r>
+        <w:rPr>
+          <w:noProof/>
+        </w:rPr>
+        <w:fldChar w:fldCharType="end"/>
+      </w:r>
       <w:r>
         <w:t>: Importing existing player information</w:t>
       </w:r>
@@ -8313,12 +8225,12 @@
       <w:pPr>
         <w:pStyle w:val="Heading1"/>
       </w:pPr>
-      <w:bookmarkStart w:id="26" w:name="_Toc509165852"/>
+      <w:bookmarkStart w:id="25" w:name="_Toc509165852"/>
       <w:r>
         <w:lastRenderedPageBreak/>
         <w:t>Member Scores</w:t>
       </w:r>
-      <w:bookmarkEnd w:id="26"/>
+      <w:bookmarkEnd w:id="25"/>
       <w:r>
         <w:fldChar w:fldCharType="begin"/>
       </w:r>
@@ -8430,14 +8342,27 @@
       <w:r>
         <w:t xml:space="preserve">Figure </w:t>
       </w:r>
-      <w:fldSimple w:instr=" SEQ Figure \* ARABIC ">
-        <w:r>
-          <w:rPr>
-            <w:noProof/>
-          </w:rPr>
-          <w:t>9</w:t>
-        </w:r>
-      </w:fldSimple>
+      <w:r>
+        <w:fldChar w:fldCharType="begin"/>
+      </w:r>
+      <w:r>
+        <w:instrText xml:space="preserve"> SEQ Figure \* ARABIC </w:instrText>
+      </w:r>
+      <w:r>
+        <w:fldChar w:fldCharType="separate"/>
+      </w:r>
+      <w:r>
+        <w:rPr>
+          <w:noProof/>
+        </w:rPr>
+        <w:t>9</w:t>
+      </w:r>
+      <w:r>
+        <w:rPr>
+          <w:noProof/>
+        </w:rPr>
+        <w:fldChar w:fldCharType="end"/>
+      </w:r>
       <w:r>
         <w:t>: Member Scores</w:t>
       </w:r>
@@ -8590,7 +8515,7 @@
           <w:szCs w:val="20"/>
         </w:rPr>
       </w:pPr>
-      <w:bookmarkStart w:id="27" w:name="_Toc509165853"/>
+      <w:bookmarkStart w:id="26" w:name="_Toc509165853"/>
       <w:r>
         <w:rPr>
           <w:szCs w:val="20"/>
@@ -8598,7 +8523,7 @@
         <w:lastRenderedPageBreak/>
         <w:t>Tournament Stats</w:t>
       </w:r>
-      <w:bookmarkEnd w:id="27"/>
+      <w:bookmarkEnd w:id="26"/>
       <w:r>
         <w:rPr>
           <w:szCs w:val="20"/>
@@ -8798,14 +8723,27 @@
       <w:r>
         <w:t xml:space="preserve">Figure </w:t>
       </w:r>
-      <w:fldSimple w:instr=" SEQ Figure \* ARABIC ">
-        <w:r>
-          <w:rPr>
-            <w:noProof/>
-          </w:rPr>
-          <w:t>10</w:t>
-        </w:r>
-      </w:fldSimple>
+      <w:r>
+        <w:fldChar w:fldCharType="begin"/>
+      </w:r>
+      <w:r>
+        <w:instrText xml:space="preserve"> SEQ Figure \* ARABIC </w:instrText>
+      </w:r>
+      <w:r>
+        <w:fldChar w:fldCharType="separate"/>
+      </w:r>
+      <w:r>
+        <w:rPr>
+          <w:noProof/>
+        </w:rPr>
+        <w:t>10</w:t>
+      </w:r>
+      <w:r>
+        <w:rPr>
+          <w:noProof/>
+        </w:rPr>
+        <w:fldChar w:fldCharType="end"/>
+      </w:r>
       <w:r>
         <w:t>: Tournament Stats</w:t>
       </w:r>
@@ -8860,7 +8798,7 @@
           <w:szCs w:val="20"/>
         </w:rPr>
       </w:pPr>
-      <w:bookmarkStart w:id="28" w:name="_Toc509165854"/>
+      <w:bookmarkStart w:id="27" w:name="_Toc509165854"/>
       <w:r>
         <w:rPr>
           <w:szCs w:val="20"/>
@@ -8911,7 +8849,7 @@
         </w:rPr>
         <w:t xml:space="preserve"> By Tournament</w:t>
       </w:r>
-      <w:bookmarkEnd w:id="28"/>
+      <w:bookmarkEnd w:id="27"/>
       <w:r>
         <w:rPr>
           <w:szCs w:val="20"/>
@@ -9079,14 +9017,27 @@
       <w:r>
         <w:t xml:space="preserve">Figure </w:t>
       </w:r>
-      <w:fldSimple w:instr=" SEQ Figure \* ARABIC ">
-        <w:r>
-          <w:rPr>
-            <w:noProof/>
-          </w:rPr>
-          <w:t>11</w:t>
-        </w:r>
-      </w:fldSimple>
+      <w:r>
+        <w:fldChar w:fldCharType="begin"/>
+      </w:r>
+      <w:r>
+        <w:instrText xml:space="preserve"> SEQ Figure \* ARABIC </w:instrText>
+      </w:r>
+      <w:r>
+        <w:fldChar w:fldCharType="separate"/>
+      </w:r>
+      <w:r>
+        <w:rPr>
+          <w:noProof/>
+        </w:rPr>
+        <w:t>11</w:t>
+      </w:r>
+      <w:r>
+        <w:rPr>
+          <w:noProof/>
+        </w:rPr>
+        <w:fldChar w:fldCharType="end"/>
+      </w:r>
       <w:r>
         <w:t xml:space="preserve"> Print Dialog</w:t>
       </w:r>
@@ -9095,12 +9046,12 @@
       <w:pPr>
         <w:pStyle w:val="Heading2"/>
       </w:pPr>
-      <w:bookmarkStart w:id="29" w:name="_Toc509165855"/>
+      <w:bookmarkStart w:id="28" w:name="_Toc509165855"/>
       <w:r>
         <w:lastRenderedPageBreak/>
         <w:t>Tournament Place Standings</w:t>
       </w:r>
-      <w:bookmarkEnd w:id="29"/>
+      <w:bookmarkEnd w:id="28"/>
       <w:r>
         <w:fldChar w:fldCharType="begin"/>
       </w:r>
@@ -9228,14 +9179,27 @@
       <w:r>
         <w:t xml:space="preserve">Figure </w:t>
       </w:r>
-      <w:fldSimple w:instr=" SEQ Figure \* ARABIC ">
-        <w:r>
-          <w:rPr>
-            <w:noProof/>
-          </w:rPr>
-          <w:t>12</w:t>
-        </w:r>
-      </w:fldSimple>
+      <w:r>
+        <w:fldChar w:fldCharType="begin"/>
+      </w:r>
+      <w:r>
+        <w:instrText xml:space="preserve"> SEQ Figure \* ARABIC </w:instrText>
+      </w:r>
+      <w:r>
+        <w:fldChar w:fldCharType="separate"/>
+      </w:r>
+      <w:r>
+        <w:rPr>
+          <w:noProof/>
+        </w:rPr>
+        <w:t>12</w:t>
+      </w:r>
+      <w:r>
+        <w:rPr>
+          <w:noProof/>
+        </w:rPr>
+        <w:fldChar w:fldCharType="end"/>
+      </w:r>
       <w:r>
         <w:t>: Tournament Place Standings</w:t>
       </w:r>
@@ -9269,12 +9233,12 @@
       <w:pPr>
         <w:pStyle w:val="Heading2"/>
       </w:pPr>
-      <w:bookmarkStart w:id="30" w:name="_Toc509165856"/>
+      <w:bookmarkStart w:id="29" w:name="_Toc509165856"/>
       <w:r>
         <w:lastRenderedPageBreak/>
         <w:t>Create/Edit Tournament</w:t>
       </w:r>
-      <w:bookmarkEnd w:id="30"/>
+      <w:bookmarkEnd w:id="29"/>
       <w:r>
         <w:fldChar w:fldCharType="begin"/>
       </w:r>
@@ -9416,14 +9380,27 @@
       <w:r>
         <w:t xml:space="preserve">Figure </w:t>
       </w:r>
-      <w:fldSimple w:instr=" SEQ Figure \* ARABIC ">
-        <w:r>
-          <w:rPr>
-            <w:noProof/>
-          </w:rPr>
-          <w:t>13</w:t>
-        </w:r>
-      </w:fldSimple>
+      <w:r>
+        <w:fldChar w:fldCharType="begin"/>
+      </w:r>
+      <w:r>
+        <w:instrText xml:space="preserve"> SEQ Figure \* ARABIC </w:instrText>
+      </w:r>
+      <w:r>
+        <w:fldChar w:fldCharType="separate"/>
+      </w:r>
+      <w:r>
+        <w:rPr>
+          <w:noProof/>
+        </w:rPr>
+        <w:t>13</w:t>
+      </w:r>
+      <w:r>
+        <w:rPr>
+          <w:noProof/>
+        </w:rPr>
+        <w:fldChar w:fldCharType="end"/>
+      </w:r>
       <w:r>
         <w:t xml:space="preserve">: </w:t>
       </w:r>
@@ -9466,11 +9443,11 @@
       <w:pPr>
         <w:pStyle w:val="Heading3"/>
       </w:pPr>
-      <w:bookmarkStart w:id="31" w:name="_Toc509165857"/>
+      <w:bookmarkStart w:id="30" w:name="_Toc509165857"/>
       <w:r>
         <w:t>To Update an Existing Tournament</w:t>
       </w:r>
-      <w:bookmarkEnd w:id="31"/>
+      <w:bookmarkEnd w:id="30"/>
     </w:p>
     <w:p>
       <w:pPr>
@@ -9554,11 +9531,11 @@
       <w:pPr>
         <w:pStyle w:val="Heading2"/>
       </w:pPr>
-      <w:bookmarkStart w:id="32" w:name="_Toc509165858"/>
+      <w:bookmarkStart w:id="31" w:name="_Toc509165858"/>
       <w:r>
         <w:t>Search Tournaments</w:t>
       </w:r>
-      <w:bookmarkEnd w:id="32"/>
+      <w:bookmarkEnd w:id="31"/>
       <w:r>
         <w:fldChar w:fldCharType="begin"/>
       </w:r>
@@ -9726,14 +9703,27 @@
       <w:r>
         <w:t xml:space="preserve">Figure </w:t>
       </w:r>
-      <w:fldSimple w:instr=" SEQ Figure \* ARABIC ">
-        <w:r>
-          <w:rPr>
-            <w:noProof/>
-          </w:rPr>
-          <w:t>14</w:t>
-        </w:r>
-      </w:fldSimple>
+      <w:r>
+        <w:fldChar w:fldCharType="begin"/>
+      </w:r>
+      <w:r>
+        <w:instrText xml:space="preserve"> SEQ Figure \* ARABIC </w:instrText>
+      </w:r>
+      <w:r>
+        <w:fldChar w:fldCharType="separate"/>
+      </w:r>
+      <w:r>
+        <w:rPr>
+          <w:noProof/>
+        </w:rPr>
+        <w:t>14</w:t>
+      </w:r>
+      <w:r>
+        <w:rPr>
+          <w:noProof/>
+        </w:rPr>
+        <w:fldChar w:fldCharType="end"/>
+      </w:r>
       <w:r>
         <w:t>: Tournament Search Forms</w:t>
       </w:r>
@@ -9742,53 +9732,53 @@
       <w:pPr>
         <w:pStyle w:val="Heading3"/>
       </w:pPr>
-      <w:bookmarkStart w:id="33" w:name="_Toc509165859"/>
+      <w:bookmarkStart w:id="32" w:name="_Toc509165859"/>
       <w:r>
         <w:t>Search by Location</w:t>
       </w:r>
+      <w:bookmarkEnd w:id="32"/>
+      <w:r>
+        <w:fldChar w:fldCharType="begin"/>
+      </w:r>
+      <w:r>
+        <w:instrText xml:space="preserve"> XE "</w:instrText>
+      </w:r>
+      <w:r>
+        <w:instrText>Search by Location</w:instrText>
+      </w:r>
+      <w:r>
+        <w:instrText xml:space="preserve">" </w:instrText>
+      </w:r>
+      <w:r>
+        <w:fldChar w:fldCharType="end"/>
+      </w:r>
+    </w:p>
+    <w:p>
+      <w:pPr>
+        <w:pStyle w:val="BodyText"/>
+      </w:pPr>
+      <w:r>
+        <w:t>To search a tournament by location</w:t>
+      </w:r>
+      <w:r>
+        <w:t>:</w:t>
+      </w:r>
+      <w:r>
+        <w:t xml:space="preserve"> Fill in the name of the </w:t>
+      </w:r>
+      <w:r>
+        <w:t>bowling center in the Location field. Click “Search”. Choose the tournament. Click “Accept”.</w:t>
+      </w:r>
+    </w:p>
+    <w:p>
+      <w:pPr>
+        <w:pStyle w:val="Heading3"/>
+      </w:pPr>
+      <w:bookmarkStart w:id="33" w:name="_Toc509165860"/>
+      <w:r>
+        <w:t>Search by Event</w:t>
+      </w:r>
       <w:bookmarkEnd w:id="33"/>
-      <w:r>
-        <w:fldChar w:fldCharType="begin"/>
-      </w:r>
-      <w:r>
-        <w:instrText xml:space="preserve"> XE "</w:instrText>
-      </w:r>
-      <w:r>
-        <w:instrText>Search by Location</w:instrText>
-      </w:r>
-      <w:r>
-        <w:instrText xml:space="preserve">" </w:instrText>
-      </w:r>
-      <w:r>
-        <w:fldChar w:fldCharType="end"/>
-      </w:r>
-    </w:p>
-    <w:p>
-      <w:pPr>
-        <w:pStyle w:val="BodyText"/>
-      </w:pPr>
-      <w:r>
-        <w:t>To search a tournament by location</w:t>
-      </w:r>
-      <w:r>
-        <w:t>:</w:t>
-      </w:r>
-      <w:r>
-        <w:t xml:space="preserve"> Fill in the name of the </w:t>
-      </w:r>
-      <w:r>
-        <w:t>bowling center in the Location field. Click “Search”. Choose the tournament. Click “Accept”.</w:t>
-      </w:r>
-    </w:p>
-    <w:p>
-      <w:pPr>
-        <w:pStyle w:val="Heading3"/>
-      </w:pPr>
-      <w:bookmarkStart w:id="34" w:name="_Toc509165860"/>
-      <w:r>
-        <w:t>Search by Event</w:t>
-      </w:r>
-      <w:bookmarkEnd w:id="34"/>
       <w:r>
         <w:fldChar w:fldCharType="begin"/>
       </w:r>
@@ -9842,11 +9832,11 @@
       <w:pPr>
         <w:pStyle w:val="Heading3"/>
       </w:pPr>
-      <w:bookmarkStart w:id="35" w:name="_Toc509165861"/>
+      <w:bookmarkStart w:id="34" w:name="_Toc509165861"/>
       <w:r>
         <w:t>Search by Date</w:t>
       </w:r>
-      <w:bookmarkEnd w:id="35"/>
+      <w:bookmarkEnd w:id="34"/>
       <w:r>
         <w:fldChar w:fldCharType="begin"/>
       </w:r>
@@ -9868,22 +9858,14 @@
         <w:pStyle w:val="BodyText"/>
       </w:pPr>
       <w:r>
-        <w:t xml:space="preserve">To find a tournament by date: Check the Date box. Pick the date range to search with the </w:t>
-      </w:r>
-      <w:proofErr w:type="gramStart"/>
-      <w:r>
-        <w:t>From</w:t>
-      </w:r>
-      <w:proofErr w:type="gramEnd"/>
-      <w:r>
-        <w:t xml:space="preserve"> and To date fields. Click “Search”. Choose the tournament you need from the list. Click “Accept”.</w:t>
+        <w:t>To find a tournament by date: Check the Date box. Pick the date range to search with the From and To date fields. Click “Search”. Choose the tournament you need from the list. Click “Accept”.</w:t>
       </w:r>
     </w:p>
     <w:p>
       <w:pPr>
         <w:pStyle w:val="Heading2"/>
       </w:pPr>
-      <w:bookmarkStart w:id="36" w:name="_Toc509165862"/>
+      <w:bookmarkStart w:id="35" w:name="_Toc509165862"/>
       <w:r>
         <w:lastRenderedPageBreak/>
         <w:t>List Tournaments</w:t>
@@ -9919,7 +9901,7 @@
       <w:r>
         <w:t>ear</w:t>
       </w:r>
-      <w:bookmarkEnd w:id="36"/>
+      <w:bookmarkEnd w:id="35"/>
       <w:r>
         <w:fldChar w:fldCharType="begin"/>
       </w:r>
@@ -10129,14 +10111,27 @@
       <w:r>
         <w:t xml:space="preserve">Figure </w:t>
       </w:r>
-      <w:fldSimple w:instr=" SEQ Figure \* ARABIC ">
-        <w:r>
-          <w:rPr>
-            <w:noProof/>
-          </w:rPr>
-          <w:t>15</w:t>
-        </w:r>
-      </w:fldSimple>
+      <w:r>
+        <w:fldChar w:fldCharType="begin"/>
+      </w:r>
+      <w:r>
+        <w:instrText xml:space="preserve"> SEQ Figure \* ARABIC </w:instrText>
+      </w:r>
+      <w:r>
+        <w:fldChar w:fldCharType="separate"/>
+      </w:r>
+      <w:r>
+        <w:rPr>
+          <w:noProof/>
+        </w:rPr>
+        <w:t>15</w:t>
+      </w:r>
+      <w:r>
+        <w:rPr>
+          <w:noProof/>
+        </w:rPr>
+        <w:fldChar w:fldCharType="end"/>
+      </w:r>
       <w:r>
         <w:t>: Tournaments</w:t>
       </w:r>
@@ -10166,26 +10161,18 @@
         <w:fldChar w:fldCharType="end"/>
       </w:r>
       <w:r>
-        <w:t xml:space="preserve"> </w:t>
-      </w:r>
-      <w:proofErr w:type="gramStart"/>
-      <w:r>
-        <w:t>by</w:t>
-      </w:r>
-      <w:proofErr w:type="gramEnd"/>
-      <w:r>
-        <w:t xml:space="preserve"> Year</w:t>
+        <w:t xml:space="preserve"> by Year</w:t>
       </w:r>
     </w:p>
     <w:p>
       <w:pPr>
         <w:pStyle w:val="Heading2"/>
       </w:pPr>
-      <w:bookmarkStart w:id="37" w:name="_Toc509165863"/>
+      <w:bookmarkStart w:id="36" w:name="_Toc509165863"/>
       <w:r>
         <w:t>Reports</w:t>
       </w:r>
-      <w:bookmarkEnd w:id="37"/>
+      <w:bookmarkEnd w:id="36"/>
       <w:r>
         <w:fldChar w:fldCharType="begin"/>
       </w:r>
@@ -10232,15 +10219,7 @@
         <w:t xml:space="preserve"> the member scores reports</w:t>
       </w:r>
       <w:r>
-        <w:t xml:space="preserve"> by way of their respective buttons “</w:t>
-      </w:r>
-      <w:proofErr w:type="gramStart"/>
-      <w:r>
-        <w:t>Seniors</w:t>
-      </w:r>
-      <w:proofErr w:type="gramEnd"/>
-      <w:r>
-        <w:t>”, “Game”, and “Series”. Clicking the appropriate button for the needed report. This will bring up the Member Scores</w:t>
+        <w:t xml:space="preserve"> by way of their respective buttons “Seniors”, “Game”, and “Series”. Clicking the appropriate button for the needed report. This will bring up the Member Scores</w:t>
       </w:r>
       <w:r>
         <w:fldChar w:fldCharType="begin"/>
@@ -10368,14 +10347,27 @@
       <w:r>
         <w:t xml:space="preserve">Figure </w:t>
       </w:r>
-      <w:fldSimple w:instr=" SEQ Figure \* ARABIC ">
-        <w:r>
-          <w:rPr>
-            <w:noProof/>
-          </w:rPr>
-          <w:t>16</w:t>
-        </w:r>
-      </w:fldSimple>
+      <w:r>
+        <w:fldChar w:fldCharType="begin"/>
+      </w:r>
+      <w:r>
+        <w:instrText xml:space="preserve"> SEQ Figure \* ARABIC </w:instrText>
+      </w:r>
+      <w:r>
+        <w:fldChar w:fldCharType="separate"/>
+      </w:r>
+      <w:r>
+        <w:rPr>
+          <w:noProof/>
+        </w:rPr>
+        <w:t>16</w:t>
+      </w:r>
+      <w:r>
+        <w:rPr>
+          <w:noProof/>
+        </w:rPr>
+        <w:fldChar w:fldCharType="end"/>
+      </w:r>
       <w:r>
         <w:t xml:space="preserve"> Member Scores</w:t>
       </w:r>
@@ -10498,13 +10490,8 @@
         <w:fldChar w:fldCharType="end"/>
       </w:r>
       <w:r>
-        <w:t xml:space="preserve"> </w:t>
-      </w:r>
-      <w:proofErr w:type="gramStart"/>
-      <w:r>
-        <w:t>screen</w:t>
-      </w:r>
-      <w:proofErr w:type="gramEnd"/>
+        <w:t xml:space="preserve"> screen</w:t>
+      </w:r>
     </w:p>
     <w:p>
       <w:pPr>
@@ -10522,12 +10509,12 @@
       <w:pPr>
         <w:pStyle w:val="Heading2"/>
       </w:pPr>
-      <w:bookmarkStart w:id="38" w:name="_Toc509165864"/>
+      <w:bookmarkStart w:id="37" w:name="_Toc509165864"/>
       <w:r>
         <w:lastRenderedPageBreak/>
         <w:t>Tournament Results</w:t>
       </w:r>
-      <w:bookmarkEnd w:id="38"/>
+      <w:bookmarkEnd w:id="37"/>
       <w:r>
         <w:fldChar w:fldCharType="begin"/>
       </w:r>
@@ -10663,14 +10650,27 @@
       <w:r>
         <w:t xml:space="preserve">Figure </w:t>
       </w:r>
-      <w:fldSimple w:instr=" SEQ Figure \* ARABIC ">
-        <w:r>
-          <w:rPr>
-            <w:noProof/>
-          </w:rPr>
-          <w:t>17</w:t>
-        </w:r>
-      </w:fldSimple>
+      <w:r>
+        <w:fldChar w:fldCharType="begin"/>
+      </w:r>
+      <w:r>
+        <w:instrText xml:space="preserve"> SEQ Figure \* ARABIC </w:instrText>
+      </w:r>
+      <w:r>
+        <w:fldChar w:fldCharType="separate"/>
+      </w:r>
+      <w:r>
+        <w:rPr>
+          <w:noProof/>
+        </w:rPr>
+        <w:t>17</w:t>
+      </w:r>
+      <w:r>
+        <w:rPr>
+          <w:noProof/>
+        </w:rPr>
+        <w:fldChar w:fldCharType="end"/>
+      </w:r>
       <w:r>
         <w:t xml:space="preserve"> Tournament Results</w:t>
       </w:r>
@@ -10700,23 +10700,18 @@
         <w:fldChar w:fldCharType="end"/>
       </w:r>
       <w:r>
-        <w:t xml:space="preserve"> </w:t>
-      </w:r>
-      <w:proofErr w:type="gramStart"/>
-      <w:r>
-        <w:t>screen</w:t>
-      </w:r>
-      <w:proofErr w:type="gramEnd"/>
+        <w:t xml:space="preserve"> screen</w:t>
+      </w:r>
     </w:p>
     <w:p>
       <w:pPr>
         <w:pStyle w:val="Heading2"/>
       </w:pPr>
-      <w:bookmarkStart w:id="39" w:name="_Toc509165865"/>
+      <w:bookmarkStart w:id="38" w:name="_Toc509165865"/>
       <w:r>
         <w:t>Comments</w:t>
       </w:r>
-      <w:bookmarkEnd w:id="39"/>
+      <w:bookmarkEnd w:id="38"/>
       <w:r>
         <w:fldChar w:fldCharType="begin"/>
       </w:r>
@@ -10792,7 +10787,7 @@
       <w:pPr>
         <w:pStyle w:val="Heading1"/>
       </w:pPr>
-      <w:bookmarkStart w:id="40" w:name="_Toc509165866"/>
+      <w:bookmarkStart w:id="39" w:name="_Toc509165866"/>
       <w:r>
         <w:lastRenderedPageBreak/>
         <w:t>Finalize Tournament</w:t>
@@ -10802,11 +10797,11 @@
       <w:pPr>
         <w:pStyle w:val="Heading2"/>
       </w:pPr>
-      <w:commentRangeStart w:id="41"/>
+      <w:commentRangeStart w:id="40"/>
       <w:r>
         <w:t>Finalize</w:t>
       </w:r>
-      <w:commentRangeEnd w:id="41"/>
+      <w:commentRangeEnd w:id="40"/>
       <w:r>
         <w:rPr>
           <w:rStyle w:val="CommentReference"/>
@@ -10815,12 +10810,12 @@
           <w:kern w:val="0"/>
           <w:szCs w:val="20"/>
         </w:rPr>
-        <w:commentReference w:id="41"/>
+        <w:commentReference w:id="40"/>
       </w:r>
       <w:r>
         <w:t xml:space="preserve"> Tournament</w:t>
       </w:r>
-      <w:bookmarkEnd w:id="40"/>
+      <w:bookmarkEnd w:id="39"/>
       <w:r>
         <w:t xml:space="preserve"> Basics</w:t>
       </w:r>
@@ -11051,10 +11046,16 @@
         <w:pStyle w:val="BodyText"/>
       </w:pPr>
       <w:r>
-        <w:t>In order for the tournament to be finalized a</w:t>
-      </w:r>
-      <w:r>
-        <w:t>ll the director needs to do is check every one of the Director Check boxes to confirm that they’</w:t>
+        <w:t xml:space="preserve">In order for </w:t>
+      </w:r>
+      <w:r>
+        <w:t xml:space="preserve">the tournament to be finalized </w:t>
+      </w:r>
+      <w:r>
+        <w:t>the director needs to</w:t>
+      </w:r>
+      <w:r>
+        <w:t xml:space="preserve"> check every one of the Director Check boxes to confirm that they’</w:t>
       </w:r>
       <w:r>
         <w:t>ve inspected that player’s recap</w:t>
@@ -11062,6 +11063,11 @@
       <w:r>
         <w:t>. This means modifying scores, averages, adding a bonus or a pro pot, and adding any notes that may be needed for a particular player.</w:t>
       </w:r>
+      <w:r>
+        <w:t xml:space="preserve"> Manually adjusting the average is also required.</w:t>
+      </w:r>
+      <w:bookmarkStart w:id="41" w:name="_GoBack"/>
+      <w:bookmarkEnd w:id="41"/>
       <w:r>
         <w:t xml:space="preserve"> After all of this is done, the director checks off the Director Check box for that player. </w:t>
       </w:r>
@@ -11124,14 +11130,27 @@
       <w:r>
         <w:t xml:space="preserve">Figure </w:t>
       </w:r>
-      <w:fldSimple w:instr=" SEQ Figure \* ARABIC ">
-        <w:r>
-          <w:rPr>
-            <w:noProof/>
-          </w:rPr>
-          <w:t>18</w:t>
-        </w:r>
-      </w:fldSimple>
+      <w:r>
+        <w:fldChar w:fldCharType="begin"/>
+      </w:r>
+      <w:r>
+        <w:instrText xml:space="preserve"> SEQ Figure \* ARABIC </w:instrText>
+      </w:r>
+      <w:r>
+        <w:fldChar w:fldCharType="separate"/>
+      </w:r>
+      <w:r>
+        <w:rPr>
+          <w:noProof/>
+        </w:rPr>
+        <w:t>18</w:t>
+      </w:r>
+      <w:r>
+        <w:rPr>
+          <w:noProof/>
+        </w:rPr>
+        <w:fldChar w:fldCharType="end"/>
+      </w:r>
       <w:r>
         <w:t xml:space="preserve"> Finalize Tournament</w:t>
       </w:r>
@@ -11180,7 +11199,16 @@
       </w:pPr>
       <w:r>
         <w:lastRenderedPageBreak/>
-        <w:t>Referring to Figure 18, t</w:t>
+        <w:t xml:space="preserve">Referring to </w:t>
+      </w:r>
+      <w:r>
+        <w:rPr>
+          <w:u w:val="single"/>
+        </w:rPr>
+        <w:t>Figure 18</w:t>
+      </w:r>
+      <w:r>
+        <w:t>, t</w:t>
       </w:r>
       <w:r>
         <w:t>he topmos</w:t>
@@ -11718,7 +11746,7 @@
         <w:t xml:space="preserve"> – Adjusted Average.</w:t>
       </w:r>
       <w:r>
-        <w:t xml:space="preserve"> The average that has been adjusted by the director if need be. E.G. if a player sandbags a score, the average can be adjusted and entered in here.</w:t>
+        <w:t xml:space="preserve"> An average that must be manually entered by the director.</w:t>
       </w:r>
     </w:p>
     <w:p>
@@ -12180,7 +12208,10 @@
         <w:t>Notes</w:t>
       </w:r>
       <w:r>
-        <w:t xml:space="preserve"> – notes on the current player can be entered here.</w:t>
+        <w:t xml:space="preserve"> – notes on the cur</w:t>
+      </w:r>
+      <w:r>
+        <w:t>rent player.</w:t>
       </w:r>
     </w:p>
     <w:p>
@@ -12352,14 +12383,27 @@
       <w:r>
         <w:t xml:space="preserve">Figure </w:t>
       </w:r>
-      <w:fldSimple w:instr=" SEQ Figure \* ARABIC ">
-        <w:r>
-          <w:rPr>
-            <w:noProof/>
-          </w:rPr>
-          <w:t>19</w:t>
-        </w:r>
-      </w:fldSimple>
+      <w:r>
+        <w:fldChar w:fldCharType="begin"/>
+      </w:r>
+      <w:r>
+        <w:instrText xml:space="preserve"> SEQ Figure \* ARABIC </w:instrText>
+      </w:r>
+      <w:r>
+        <w:fldChar w:fldCharType="separate"/>
+      </w:r>
+      <w:r>
+        <w:rPr>
+          <w:noProof/>
+        </w:rPr>
+        <w:t>19</w:t>
+      </w:r>
+      <w:r>
+        <w:rPr>
+          <w:noProof/>
+        </w:rPr>
+        <w:fldChar w:fldCharType="end"/>
+      </w:r>
       <w:r>
         <w:t>: Update Inactive status</w:t>
       </w:r>
@@ -12668,14 +12712,27 @@
       <w:r>
         <w:t xml:space="preserve">Figure </w:t>
       </w:r>
-      <w:fldSimple w:instr=" SEQ Figure \* ARABIC ">
-        <w:r>
-          <w:rPr>
-            <w:noProof/>
-          </w:rPr>
-          <w:t>20</w:t>
-        </w:r>
-      </w:fldSimple>
+      <w:r>
+        <w:fldChar w:fldCharType="begin"/>
+      </w:r>
+      <w:r>
+        <w:instrText xml:space="preserve"> SEQ Figure \* ARABIC </w:instrText>
+      </w:r>
+      <w:r>
+        <w:fldChar w:fldCharType="separate"/>
+      </w:r>
+      <w:r>
+        <w:rPr>
+          <w:noProof/>
+        </w:rPr>
+        <w:t>20</w:t>
+      </w:r>
+      <w:r>
+        <w:rPr>
+          <w:noProof/>
+        </w:rPr>
+        <w:fldChar w:fldCharType="end"/>
+      </w:r>
       <w:r>
         <w:t xml:space="preserve"> Showing split screen error</w:t>
       </w:r>
@@ -12697,7 +12754,7 @@
         <mc:AlternateContent>
           <mc:Choice Requires="wps">
             <w:drawing>
-              <wp:anchor distT="0" distB="0" distL="114300" distR="114300" simplePos="0" relativeHeight="251658240" behindDoc="0" locked="0" layoutInCell="1" allowOverlap="1" wp14:anchorId="7BB17706" wp14:editId="62300B34">
+              <wp:anchor distT="0" distB="0" distL="114300" distR="114300" simplePos="0" relativeHeight="251659264" behindDoc="0" locked="0" layoutInCell="1" allowOverlap="1" wp14:anchorId="7BB17706" wp14:editId="62300B34">
                 <wp:simplePos x="0" y="0"/>
                 <wp:positionH relativeFrom="column">
                   <wp:posOffset>3175</wp:posOffset>
@@ -12743,14 +12800,27 @@
                             <w:r>
                               <w:t xml:space="preserve">Figure </w:t>
                             </w:r>
-                            <w:fldSimple w:instr=" SEQ Figure \* ARABIC ">
-                              <w:r>
-                                <w:rPr>
-                                  <w:noProof/>
-                                </w:rPr>
-                                <w:t>21</w:t>
-                              </w:r>
-                            </w:fldSimple>
+                            <w:r>
+                              <w:fldChar w:fldCharType="begin"/>
+                            </w:r>
+                            <w:r>
+                              <w:instrText xml:space="preserve"> SEQ Figure \* ARABIC </w:instrText>
+                            </w:r>
+                            <w:r>
+                              <w:fldChar w:fldCharType="separate"/>
+                            </w:r>
+                            <w:r>
+                              <w:rPr>
+                                <w:noProof/>
+                              </w:rPr>
+                              <w:t>21</w:t>
+                            </w:r>
+                            <w:r>
+                              <w:rPr>
+                                <w:noProof/>
+                              </w:rPr>
+                              <w:fldChar w:fldCharType="end"/>
+                            </w:r>
                             <w:r>
                               <w:t xml:space="preserve"> Inner screen maximize</w:t>
                             </w:r>
@@ -12778,7 +12848,7 @@
                 <v:stroke joinstyle="miter"/>
                 <v:path gradientshapeok="t" o:connecttype="rect"/>
               </v:shapetype>
-              <v:shape id="Text Box 24" o:spid="_x0000_s1026" type="#_x0000_t202" style="position:absolute;left:0;text-align:left;margin-left:.25pt;margin-top:98.8pt;width:154.5pt;height:13.5pt;z-index:251658240;visibility:visible;mso-wrap-style:square;mso-height-percent:0;mso-wrap-distance-left:9pt;mso-wrap-distance-top:0;mso-wrap-distance-right:9pt;mso-wrap-distance-bottom:0;mso-position-horizontal:absolute;mso-position-horizontal-relative:text;mso-position-vertical:absolute;mso-position-vertical-relative:text;mso-height-percent:0;mso-height-relative:margin;v-text-anchor:top" o:gfxdata="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" stroked="f">
+              <v:shape id="Text Box 24" o:spid="_x0000_s1026" type="#_x0000_t202" style="position:absolute;left:0;text-align:left;margin-left:.25pt;margin-top:98.8pt;width:154.5pt;height:13.5pt;z-index:251659264;visibility:visible;mso-wrap-style:square;mso-height-percent:0;mso-wrap-distance-left:9pt;mso-wrap-distance-top:0;mso-wrap-distance-right:9pt;mso-wrap-distance-bottom:0;mso-position-horizontal:absolute;mso-position-horizontal-relative:text;mso-position-vertical:absolute;mso-position-vertical-relative:text;mso-height-percent:0;mso-height-relative:margin;v-text-anchor:top" o:gfxdata="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" stroked="f">
                 <v:textbox inset="0,0,0,0">
                   <w:txbxContent>
                     <w:p>
@@ -12792,14 +12862,27 @@
                       <w:r>
                         <w:t xml:space="preserve">Figure </w:t>
                       </w:r>
-                      <w:fldSimple w:instr=" SEQ Figure \* ARABIC ">
-                        <w:r>
-                          <w:rPr>
-                            <w:noProof/>
-                          </w:rPr>
-                          <w:t>21</w:t>
-                        </w:r>
-                      </w:fldSimple>
+                      <w:r>
+                        <w:fldChar w:fldCharType="begin"/>
+                      </w:r>
+                      <w:r>
+                        <w:instrText xml:space="preserve"> SEQ Figure \* ARABIC </w:instrText>
+                      </w:r>
+                      <w:r>
+                        <w:fldChar w:fldCharType="separate"/>
+                      </w:r>
+                      <w:r>
+                        <w:rPr>
+                          <w:noProof/>
+                        </w:rPr>
+                        <w:t>21</w:t>
+                      </w:r>
+                      <w:r>
+                        <w:rPr>
+                          <w:noProof/>
+                        </w:rPr>
+                        <w:fldChar w:fldCharType="end"/>
+                      </w:r>
                       <w:r>
                         <w:t xml:space="preserve"> Inner screen maximize</w:t>
                       </w:r>
@@ -12817,7 +12900,7 @@
           <w:noProof/>
         </w:rPr>
         <w:drawing>
-          <wp:anchor distT="0" distB="0" distL="114300" distR="114300" simplePos="0" relativeHeight="251656192" behindDoc="0" locked="0" layoutInCell="1" allowOverlap="1" wp14:anchorId="682AA4A0" wp14:editId="46FA8D0E">
+          <wp:anchor distT="0" distB="0" distL="114300" distR="114300" simplePos="0" relativeHeight="251657216" behindDoc="0" locked="0" layoutInCell="1" allowOverlap="1" wp14:anchorId="682AA4A0" wp14:editId="46FA8D0E">
             <wp:simplePos x="0" y="0"/>
             <wp:positionH relativeFrom="column">
               <wp:posOffset>3175</wp:posOffset>
@@ -17684,7 +17767,7 @@
 
 <file path=word/comments.xml><?xml version="1.0" encoding="utf-8"?>
 <w:comments xmlns:wpc="http://schemas.microsoft.com/office/word/2010/wordprocessingCanvas" xmlns:mc="http://schemas.openxmlformats.org/markup-compatibility/2006" xmlns:o="urn:schemas-microsoft-com:office:office" xmlns:r="http://schemas.openxmlformats.org/officeDocument/2006/relationships" xmlns:m="http://schemas.openxmlformats.org/officeDocument/2006/math" xmlns:v="urn:schemas-microsoft-com:vml" xmlns:wp14="http://schemas.microsoft.com/office/word/2010/wordprocessingDrawing" xmlns:wp="http://schemas.openxmlformats.org/drawingml/2006/wordprocessingDrawing" xmlns:w10="urn:schemas-microsoft-com:office:word" xmlns:w="http://schemas.openxmlformats.org/wordprocessingml/2006/main" xmlns:w14="http://schemas.microsoft.com/office/word/2010/wordml" xmlns:w15="http://schemas.microsoft.com/office/word/2012/wordml" xmlns:wpg="http://schemas.microsoft.com/office/word/2010/wordprocessingGroup" xmlns:wpi="http://schemas.microsoft.com/office/word/2010/wordprocessingInk" xmlns:wne="http://schemas.microsoft.com/office/word/2006/wordml" xmlns:wps="http://schemas.microsoft.com/office/word/2010/wordprocessingShape" mc:Ignorable="w14 w15 wp14">
-  <w:comment w:id="41" w:author="Timothy Fair" w:date="2018-07-25T14:36:00Z" w:initials="TF">
+  <w:comment w:id="40" w:author="Timothy Fair" w:date="2018-07-25T14:36:00Z" w:initials="TF">
     <w:p>
       <w:pPr>
         <w:pStyle w:val="CommentText"/>
@@ -17841,7 +17924,7 @@
         <w:rStyle w:val="PageNumber"/>
         <w:noProof/>
       </w:rPr>
-      <w:t>19</w:t>
+      <w:t>32</w:t>
     </w:r>
     <w:r>
       <w:rPr>
@@ -22054,7 +22137,7 @@
 </file>
 
 <file path=customXml/itemProps1.xml><?xml version="1.0" encoding="utf-8"?>
-<ds:datastoreItem xmlns:ds="http://schemas.openxmlformats.org/officeDocument/2006/customXml" ds:itemID="{A090FC03-AD01-4378-880D-FC5F1307A7C4}">
+<ds:datastoreItem xmlns:ds="http://schemas.openxmlformats.org/officeDocument/2006/customXml" ds:itemID="{175123AF-0B56-4B10-BA86-7AB4D29D79B5}">
   <ds:schemaRefs>
     <ds:schemaRef ds:uri="http://schemas.openxmlformats.org/officeDocument/2006/bibliography"/>
   </ds:schemaRefs>

</xml_diff>

<commit_message>
Updated the image references for the main menu, member info, and member scores in the manual. The previous images displayed layouts that do not reflect the current version of 9Tap. Added information on the Delete Region Data button on the main menu.
</commit_message>
<xml_diff>
--- a/9tapUserManual.docx
+++ b/9tapUserManual.docx
@@ -4319,47 +4319,30 @@
         <w:rPr>
           <w:noProof/>
         </w:rPr>
-        <w:drawing>
-          <wp:inline distT="0" distB="0" distL="0" distR="0" wp14:anchorId="4B6E86AC" wp14:editId="6A3163E7">
-            <wp:extent cx="4883150" cy="2623280"/>
-            <wp:effectExtent l="0" t="0" r="0" b="5715"/>
-            <wp:docPr id="3" name="Picture 3"/>
-            <wp:cNvGraphicFramePr>
-              <a:graphicFrameLocks xmlns:a="http://schemas.openxmlformats.org/drawingml/2006/main" noChangeAspect="1"/>
-            </wp:cNvGraphicFramePr>
-            <a:graphic xmlns:a="http://schemas.openxmlformats.org/drawingml/2006/main">
-              <a:graphicData uri="http://schemas.openxmlformats.org/drawingml/2006/picture">
-                <pic:pic xmlns:pic="http://schemas.openxmlformats.org/drawingml/2006/picture">
-                  <pic:nvPicPr>
-                    <pic:cNvPr id="3" name="MainMenu.PNG"/>
-                    <pic:cNvPicPr/>
-                  </pic:nvPicPr>
-                  <pic:blipFill>
-                    <a:blip r:embed="rId14" cstate="print">
-                      <a:extLst>
-                        <a:ext uri="{28A0092B-C50C-407E-A947-70E740481C1C}">
-                          <a14:useLocalDpi xmlns:a14="http://schemas.microsoft.com/office/drawing/2010/main" val="0"/>
-                        </a:ext>
-                      </a:extLst>
-                    </a:blip>
-                    <a:stretch>
-                      <a:fillRect/>
-                    </a:stretch>
-                  </pic:blipFill>
-                  <pic:spPr>
-                    <a:xfrm>
-                      <a:off x="0" y="0"/>
-                      <a:ext cx="4883150" cy="2623280"/>
-                    </a:xfrm>
-                    <a:prstGeom prst="rect">
-                      <a:avLst/>
-                    </a:prstGeom>
-                  </pic:spPr>
-                </pic:pic>
-              </a:graphicData>
-            </a:graphic>
-          </wp:inline>
-        </w:drawing>
+        <w:pict w14:anchorId="0D60ED77">
+          <v:shapetype id="_x0000_t75" coordsize="21600,21600" o:spt="75" o:preferrelative="t" path="m@4@5l@4@11@9@11@9@5xe" filled="f" stroked="f">
+            <v:stroke joinstyle="miter"/>
+            <v:formulas>
+              <v:f eqn="if lineDrawn pixelLineWidth 0"/>
+              <v:f eqn="sum @0 1 0"/>
+              <v:f eqn="sum 0 0 @1"/>
+              <v:f eqn="prod @2 1 2"/>
+              <v:f eqn="prod @3 21600 pixelWidth"/>
+              <v:f eqn="prod @3 21600 pixelHeight"/>
+              <v:f eqn="sum @0 0 1"/>
+              <v:f eqn="prod @6 1 2"/>
+              <v:f eqn="prod @7 21600 pixelWidth"/>
+              <v:f eqn="sum @8 21600 0"/>
+              <v:f eqn="prod @7 21600 pixelHeight"/>
+              <v:f eqn="sum @10 21600 0"/>
+            </v:formulas>
+            <v:path o:extrusionok="f" gradientshapeok="t" o:connecttype="rect"/>
+            <o:lock v:ext="edit" aspectratio="t"/>
+          </v:shapetype>
+          <v:shape id="_x0000_i1026" type="#_x0000_t75" style="width:383.25pt;height:195pt">
+            <v:imagedata r:id="rId14" o:title="9TapMainMenu"/>
+          </v:shape>
+        </w:pict>
       </w:r>
     </w:p>
     <w:p>
@@ -4370,27 +4353,14 @@
       <w:r>
         <w:t xml:space="preserve">Figure </w:t>
       </w:r>
-      <w:r>
-        <w:fldChar w:fldCharType="begin"/>
-      </w:r>
-      <w:r>
-        <w:instrText xml:space="preserve"> SEQ Figure \* ARABIC </w:instrText>
-      </w:r>
-      <w:r>
-        <w:fldChar w:fldCharType="separate"/>
-      </w:r>
-      <w:r>
-        <w:rPr>
-          <w:noProof/>
-        </w:rPr>
-        <w:t>1</w:t>
-      </w:r>
-      <w:r>
-        <w:rPr>
-          <w:noProof/>
-        </w:rPr>
-        <w:fldChar w:fldCharType="end"/>
-      </w:r>
+      <w:fldSimple w:instr=" SEQ Figure \* ARABIC ">
+        <w:r>
+          <w:rPr>
+            <w:noProof/>
+          </w:rPr>
+          <w:t>1</w:t>
+        </w:r>
+      </w:fldSimple>
       <w:r>
         <w:t>: 9-Tap Main Menu</w:t>
       </w:r>
@@ -6209,6 +6179,11 @@
       <w:r>
         <w:t>” button. Also, the tools tab accesses the active/inactive member dialog.</w:t>
       </w:r>
+      <w:r>
+        <w:t xml:space="preserve"> The Delete Region Data button will delete all data from the selected regions’ database. The user will be prompted upon clicking this button to make sure if they want to delete this data.</w:t>
+      </w:r>
+      <w:bookmarkStart w:id="17" w:name="_GoBack"/>
+      <w:bookmarkEnd w:id="17"/>
     </w:p>
     <w:p>
       <w:pPr>
@@ -6220,10 +6195,10 @@
           <w:noProof/>
         </w:rPr>
         <w:drawing>
-          <wp:inline distT="0" distB="0" distL="0" distR="0" wp14:anchorId="03D27295" wp14:editId="3B82738E">
-            <wp:extent cx="4883150" cy="2623280"/>
-            <wp:effectExtent l="0" t="0" r="0" b="5715"/>
-            <wp:docPr id="4" name="Picture 4"/>
+          <wp:inline distT="0" distB="0" distL="0" distR="0" wp14:anchorId="13131FC4" wp14:editId="6F4984C2">
+            <wp:extent cx="4883150" cy="2485090"/>
+            <wp:effectExtent l="0" t="0" r="0" b="0"/>
+            <wp:docPr id="21" name="Picture 21" descr="C:\Users\Tfair\Desktop\DocumentationBackup-9Tap\9TapMainMenu.png"/>
             <wp:cNvGraphicFramePr>
               <a:graphicFrameLocks xmlns:a="http://schemas.openxmlformats.org/drawingml/2006/main" noChangeAspect="1"/>
             </wp:cNvGraphicFramePr>
@@ -6231,29 +6206,36 @@
               <a:graphicData uri="http://schemas.openxmlformats.org/drawingml/2006/picture">
                 <pic:pic xmlns:pic="http://schemas.openxmlformats.org/drawingml/2006/picture">
                   <pic:nvPicPr>
-                    <pic:cNvPr id="4" name="MainMenu.PNG"/>
-                    <pic:cNvPicPr/>
+                    <pic:cNvPr id="0" name="Picture 3" descr="C:\Users\Tfair\Desktop\DocumentationBackup-9Tap\9TapMainMenu.png"/>
+                    <pic:cNvPicPr>
+                      <a:picLocks noChangeAspect="1" noChangeArrowheads="1"/>
+                    </pic:cNvPicPr>
                   </pic:nvPicPr>
                   <pic:blipFill>
-                    <a:blip r:embed="rId14" cstate="print">
+                    <a:blip r:embed="rId15" cstate="print">
                       <a:extLst>
                         <a:ext uri="{28A0092B-C50C-407E-A947-70E740481C1C}">
                           <a14:useLocalDpi xmlns:a14="http://schemas.microsoft.com/office/drawing/2010/main" val="0"/>
                         </a:ext>
                       </a:extLst>
                     </a:blip>
+                    <a:srcRect/>
                     <a:stretch>
                       <a:fillRect/>
                     </a:stretch>
                   </pic:blipFill>
-                  <pic:spPr>
+                  <pic:spPr bwMode="auto">
                     <a:xfrm>
                       <a:off x="0" y="0"/>
-                      <a:ext cx="4883150" cy="2623280"/>
+                      <a:ext cx="4883150" cy="2485090"/>
                     </a:xfrm>
                     <a:prstGeom prst="rect">
                       <a:avLst/>
                     </a:prstGeom>
+                    <a:noFill/>
+                    <a:ln>
+                      <a:noFill/>
+                    </a:ln>
                   </pic:spPr>
                 </pic:pic>
               </a:graphicData>
@@ -6270,27 +6252,14 @@
       <w:r>
         <w:t xml:space="preserve">Figure </w:t>
       </w:r>
-      <w:r>
-        <w:fldChar w:fldCharType="begin"/>
-      </w:r>
-      <w:r>
-        <w:instrText xml:space="preserve"> SEQ Figure \* ARABIC </w:instrText>
-      </w:r>
-      <w:r>
-        <w:fldChar w:fldCharType="separate"/>
-      </w:r>
-      <w:r>
-        <w:rPr>
-          <w:noProof/>
-        </w:rPr>
-        <w:t>2</w:t>
-      </w:r>
-      <w:r>
-        <w:rPr>
-          <w:noProof/>
-        </w:rPr>
-        <w:fldChar w:fldCharType="end"/>
-      </w:r>
+      <w:fldSimple w:instr=" SEQ Figure \* ARABIC ">
+        <w:r>
+          <w:rPr>
+            <w:noProof/>
+          </w:rPr>
+          <w:t>2</w:t>
+        </w:r>
+      </w:fldSimple>
       <w:r>
         <w:t>: Main Menu</w:t>
       </w:r>
@@ -6355,12 +6324,12 @@
       <w:pPr>
         <w:pStyle w:val="Heading1"/>
       </w:pPr>
-      <w:bookmarkStart w:id="17" w:name="_Toc509165844"/>
+      <w:bookmarkStart w:id="18" w:name="_Toc509165844"/>
       <w:r>
         <w:lastRenderedPageBreak/>
         <w:t>Member Info</w:t>
       </w:r>
-      <w:bookmarkEnd w:id="17"/>
+      <w:bookmarkEnd w:id="18"/>
       <w:r>
         <w:fldChar w:fldCharType="begin"/>
       </w:r>
@@ -6466,17 +6435,14 @@
         <w:keepNext/>
       </w:pPr>
       <w:r>
-        <w:t xml:space="preserve"> </w:t>
-      </w:r>
-      <w:r>
         <w:rPr>
           <w:noProof/>
         </w:rPr>
         <w:drawing>
-          <wp:inline distT="0" distB="0" distL="0" distR="0" wp14:anchorId="1697D59F" wp14:editId="59EAEFBB">
-            <wp:extent cx="4448175" cy="3980962"/>
-            <wp:effectExtent l="0" t="0" r="0" b="635"/>
-            <wp:docPr id="19" name="Picture 19" descr="The form where member information is entered and edited." title="member info form"/>
+          <wp:inline distT="0" distB="0" distL="0" distR="0" wp14:anchorId="0241B9F5" wp14:editId="090BE295">
+            <wp:extent cx="4883150" cy="2539683"/>
+            <wp:effectExtent l="0" t="0" r="0" b="0"/>
+            <wp:docPr id="28" name="Picture 28" descr="C:\Users\Tfair\Desktop\DocumentationBackup-9Tap\9TapMemberInfo.png"/>
             <wp:cNvGraphicFramePr>
               <a:graphicFrameLocks xmlns:a="http://schemas.openxmlformats.org/drawingml/2006/main" noChangeAspect="1"/>
             </wp:cNvGraphicFramePr>
@@ -6484,36 +6450,36 @@
               <a:graphicData uri="http://schemas.openxmlformats.org/drawingml/2006/picture">
                 <pic:pic xmlns:pic="http://schemas.openxmlformats.org/drawingml/2006/picture">
                   <pic:nvPicPr>
-                    <pic:cNvPr id="5" name="MemberInfoForm.PNG"/>
-                    <pic:cNvPicPr/>
+                    <pic:cNvPr id="0" name="Picture 4" descr="C:\Users\Tfair\Desktop\DocumentationBackup-9Tap\9TapMemberInfo.png"/>
+                    <pic:cNvPicPr>
+                      <a:picLocks noChangeAspect="1" noChangeArrowheads="1"/>
+                    </pic:cNvPicPr>
                   </pic:nvPicPr>
-                  <pic:blipFill rotWithShape="1">
-                    <a:blip r:embed="rId15">
+                  <pic:blipFill>
+                    <a:blip r:embed="rId16" cstate="print">
                       <a:extLst>
                         <a:ext uri="{28A0092B-C50C-407E-A947-70E740481C1C}">
                           <a14:useLocalDpi xmlns:a14="http://schemas.microsoft.com/office/drawing/2010/main" val="0"/>
                         </a:ext>
                       </a:extLst>
                     </a:blip>
-                    <a:srcRect l="1" r="40077"/>
-                    <a:stretch/>
+                    <a:srcRect/>
+                    <a:stretch>
+                      <a:fillRect/>
+                    </a:stretch>
                   </pic:blipFill>
                   <pic:spPr bwMode="auto">
                     <a:xfrm>
                       <a:off x="0" y="0"/>
-                      <a:ext cx="4467314" cy="3998091"/>
+                      <a:ext cx="4883150" cy="2539683"/>
                     </a:xfrm>
                     <a:prstGeom prst="rect">
                       <a:avLst/>
                     </a:prstGeom>
+                    <a:noFill/>
                     <a:ln>
                       <a:noFill/>
                     </a:ln>
-                    <a:extLst>
-                      <a:ext uri="{53640926-AAD7-44D8-BBD7-CCE9431645EC}">
-                        <a14:shadowObscured xmlns:a14="http://schemas.microsoft.com/office/drawing/2010/main"/>
-                      </a:ext>
-                    </a:extLst>
                   </pic:spPr>
                 </pic:pic>
               </a:graphicData>
@@ -6521,6 +6487,9 @@
           </wp:inline>
         </w:drawing>
       </w:r>
+      <w:r>
+        <w:t xml:space="preserve"> </w:t>
+      </w:r>
     </w:p>
     <w:p>
       <w:pPr>
@@ -6530,27 +6499,14 @@
       <w:r>
         <w:t xml:space="preserve">Figure </w:t>
       </w:r>
-      <w:r>
-        <w:fldChar w:fldCharType="begin"/>
-      </w:r>
-      <w:r>
-        <w:instrText xml:space="preserve"> SEQ Figure \* ARABIC </w:instrText>
-      </w:r>
-      <w:r>
-        <w:fldChar w:fldCharType="separate"/>
-      </w:r>
-      <w:r>
-        <w:rPr>
-          <w:noProof/>
-        </w:rPr>
-        <w:t>3</w:t>
-      </w:r>
-      <w:r>
-        <w:rPr>
-          <w:noProof/>
-        </w:rPr>
-        <w:fldChar w:fldCharType="end"/>
-      </w:r>
+      <w:fldSimple w:instr=" SEQ Figure \* ARABIC ">
+        <w:r>
+          <w:rPr>
+            <w:noProof/>
+          </w:rPr>
+          <w:t>3</w:t>
+        </w:r>
+      </w:fldSimple>
       <w:r>
         <w:t>: Member Information</w:t>
       </w:r>
@@ -6559,8 +6515,9 @@
       <w:pPr>
         <w:pStyle w:val="Heading3"/>
       </w:pPr>
-      <w:bookmarkStart w:id="18" w:name="_Toc509165845"/>
-      <w:r>
+      <w:bookmarkStart w:id="19" w:name="_Toc509165845"/>
+      <w:r>
+        <w:lastRenderedPageBreak/>
         <w:t>Import</w:t>
       </w:r>
       <w:r>
@@ -6597,7 +6554,7 @@
       <w:r>
         <w:t>Member</w:t>
       </w:r>
-      <w:bookmarkEnd w:id="18"/>
+      <w:bookmarkEnd w:id="19"/>
       <w:r>
         <w:fldChar w:fldCharType="begin"/>
       </w:r>
@@ -6722,11 +6679,11 @@
       <w:pPr>
         <w:pStyle w:val="Heading3"/>
       </w:pPr>
-      <w:bookmarkStart w:id="19" w:name="_Toc509165846"/>
+      <w:bookmarkStart w:id="20" w:name="_Toc509165846"/>
       <w:r>
         <w:t>New Members</w:t>
       </w:r>
-      <w:bookmarkEnd w:id="19"/>
+      <w:bookmarkEnd w:id="20"/>
       <w:r>
         <w:fldChar w:fldCharType="begin"/>
       </w:r>
@@ -6909,11 +6866,7 @@
         <w:t>.</w:t>
       </w:r>
       <w:r>
-        <w:t xml:space="preserve"> If applicable, enter the member’s middle initial, then hit tab. You are now at the D.O.B. field, enter the member’s date of birth. Hit tab to go to the SSN field. The member </w:t>
-      </w:r>
-      <w:r>
-        <w:lastRenderedPageBreak/>
-        <w:t xml:space="preserve">Social Security Number is entered here. By </w:t>
+        <w:t xml:space="preserve"> If applicable, enter the member’s middle initial, then hit tab. You are now at the D.O.B. field, enter the member’s date of birth. Hit tab to go to the SSN field. The member Social Security Number is entered here. By </w:t>
       </w:r>
       <w:r>
         <w:t>default,</w:t>
@@ -6999,10 +6952,10 @@
           <w:noProof/>
         </w:rPr>
         <w:drawing>
-          <wp:inline distT="0" distB="0" distL="0" distR="0" wp14:anchorId="24FBB0E7" wp14:editId="66BE4AD5">
-            <wp:extent cx="4448175" cy="3980962"/>
-            <wp:effectExtent l="0" t="0" r="0" b="635"/>
-            <wp:docPr id="5" name="Picture 5" descr="The form where member information is entered and edited." title="member info form"/>
+          <wp:inline distT="0" distB="0" distL="0" distR="0" wp14:anchorId="100D6018" wp14:editId="4F2D6461">
+            <wp:extent cx="4883150" cy="2539683"/>
+            <wp:effectExtent l="0" t="0" r="0" b="0"/>
+            <wp:docPr id="30" name="Picture 30" descr="C:\Users\Tfair\Desktop\DocumentationBackup-9Tap\9TapMemberInfo.png"/>
             <wp:cNvGraphicFramePr>
               <a:graphicFrameLocks xmlns:a="http://schemas.openxmlformats.org/drawingml/2006/main" noChangeAspect="1"/>
             </wp:cNvGraphicFramePr>
@@ -7010,36 +6963,36 @@
               <a:graphicData uri="http://schemas.openxmlformats.org/drawingml/2006/picture">
                 <pic:pic xmlns:pic="http://schemas.openxmlformats.org/drawingml/2006/picture">
                   <pic:nvPicPr>
-                    <pic:cNvPr id="5" name="MemberInfoForm.PNG"/>
-                    <pic:cNvPicPr/>
+                    <pic:cNvPr id="0" name="Picture 5" descr="C:\Users\Tfair\Desktop\DocumentationBackup-9Tap\9TapMemberInfo.png"/>
+                    <pic:cNvPicPr>
+                      <a:picLocks noChangeAspect="1" noChangeArrowheads="1"/>
+                    </pic:cNvPicPr>
                   </pic:nvPicPr>
-                  <pic:blipFill rotWithShape="1">
-                    <a:blip r:embed="rId15">
+                  <pic:blipFill>
+                    <a:blip r:embed="rId16" cstate="print">
                       <a:extLst>
                         <a:ext uri="{28A0092B-C50C-407E-A947-70E740481C1C}">
                           <a14:useLocalDpi xmlns:a14="http://schemas.microsoft.com/office/drawing/2010/main" val="0"/>
                         </a:ext>
                       </a:extLst>
                     </a:blip>
-                    <a:srcRect l="1" r="40077"/>
-                    <a:stretch/>
+                    <a:srcRect/>
+                    <a:stretch>
+                      <a:fillRect/>
+                    </a:stretch>
                   </pic:blipFill>
                   <pic:spPr bwMode="auto">
                     <a:xfrm>
                       <a:off x="0" y="0"/>
-                      <a:ext cx="4467314" cy="3998091"/>
+                      <a:ext cx="4883150" cy="2539683"/>
                     </a:xfrm>
                     <a:prstGeom prst="rect">
                       <a:avLst/>
                     </a:prstGeom>
+                    <a:noFill/>
                     <a:ln>
                       <a:noFill/>
                     </a:ln>
-                    <a:extLst>
-                      <a:ext uri="{53640926-AAD7-44D8-BBD7-CCE9431645EC}">
-                        <a14:shadowObscured xmlns:a14="http://schemas.microsoft.com/office/drawing/2010/main"/>
-                      </a:ext>
-                    </a:extLst>
                   </pic:spPr>
                 </pic:pic>
               </a:graphicData>
@@ -7054,29 +7007,17 @@
         <w:jc w:val="both"/>
       </w:pPr>
       <w:r>
+        <w:lastRenderedPageBreak/>
         <w:t xml:space="preserve">Figure </w:t>
       </w:r>
-      <w:r>
-        <w:fldChar w:fldCharType="begin"/>
-      </w:r>
-      <w:r>
-        <w:instrText xml:space="preserve"> SEQ Figure \* ARABIC </w:instrText>
-      </w:r>
-      <w:r>
-        <w:fldChar w:fldCharType="separate"/>
-      </w:r>
-      <w:r>
-        <w:rPr>
-          <w:noProof/>
-        </w:rPr>
-        <w:t>4</w:t>
-      </w:r>
-      <w:r>
-        <w:rPr>
-          <w:noProof/>
-        </w:rPr>
-        <w:fldChar w:fldCharType="end"/>
-      </w:r>
+      <w:fldSimple w:instr=" SEQ Figure \* ARABIC ">
+        <w:r>
+          <w:rPr>
+            <w:noProof/>
+          </w:rPr>
+          <w:t>4</w:t>
+        </w:r>
+      </w:fldSimple>
       <w:r>
         <w:t>: Member Information</w:t>
       </w:r>
@@ -7085,14 +7026,14 @@
       <w:pPr>
         <w:pStyle w:val="Heading3"/>
       </w:pPr>
-      <w:bookmarkStart w:id="20" w:name="_Toc509165847"/>
+      <w:bookmarkStart w:id="21" w:name="_Toc509165847"/>
       <w:r>
         <w:t xml:space="preserve">Updating </w:t>
       </w:r>
       <w:r>
         <w:t>Members</w:t>
       </w:r>
-      <w:bookmarkEnd w:id="20"/>
+      <w:bookmarkEnd w:id="21"/>
       <w:r>
         <w:fldChar w:fldCharType="begin"/>
       </w:r>
@@ -7185,11 +7126,7 @@
         <w:t xml:space="preserve">” button. The member search screen will display (figure 7). Members can be searched by number, name, average, handicap, or bonus. </w:t>
       </w:r>
       <w:r>
-        <w:t xml:space="preserve">Enter the search parameters and click “Search”. The </w:t>
-      </w:r>
-      <w:r>
-        <w:lastRenderedPageBreak/>
-        <w:t xml:space="preserve">results display at the bottom of the screen. </w:t>
+        <w:t xml:space="preserve">Enter the search parameters and click “Search”. The results display at the bottom of the screen. </w:t>
       </w:r>
       <w:r>
         <w:t>To display all members in the database, leave the fields blank and click “Search”</w:t>
@@ -7253,14 +7190,14 @@
           <w:szCs w:val="20"/>
         </w:rPr>
       </w:pPr>
-      <w:bookmarkStart w:id="21" w:name="_Toc509165848"/>
+      <w:bookmarkStart w:id="22" w:name="_Toc509165848"/>
       <w:r>
         <w:rPr>
           <w:szCs w:val="20"/>
         </w:rPr>
         <w:t>Stats</w:t>
       </w:r>
-      <w:bookmarkEnd w:id="21"/>
+      <w:bookmarkEnd w:id="22"/>
       <w:r>
         <w:rPr>
           <w:szCs w:val="20"/>
@@ -7396,10 +7333,10 @@
           <w:noProof/>
         </w:rPr>
         <w:drawing>
-          <wp:inline distT="0" distB="0" distL="0" distR="0" wp14:anchorId="2D49C112" wp14:editId="01809467">
-            <wp:extent cx="4905375" cy="2844352"/>
+          <wp:inline distT="0" distB="0" distL="0" distR="0" wp14:anchorId="22B87C68" wp14:editId="132FB4B7">
+            <wp:extent cx="4883150" cy="2806685"/>
             <wp:effectExtent l="0" t="0" r="0" b="0"/>
-            <wp:docPr id="7" name="Picture 7"/>
+            <wp:docPr id="32" name="Picture 32" descr="C:\Users\Tfair\Desktop\DocumentationBackup-9Tap\9TapStats.png"/>
             <wp:cNvGraphicFramePr>
               <a:graphicFrameLocks xmlns:a="http://schemas.openxmlformats.org/drawingml/2006/main" noChangeAspect="1"/>
             </wp:cNvGraphicFramePr>
@@ -7407,29 +7344,36 @@
               <a:graphicData uri="http://schemas.openxmlformats.org/drawingml/2006/picture">
                 <pic:pic xmlns:pic="http://schemas.openxmlformats.org/drawingml/2006/picture">
                   <pic:nvPicPr>
-                    <pic:cNvPr id="7" name="StatsForm.PNG"/>
-                    <pic:cNvPicPr/>
+                    <pic:cNvPr id="0" name="Picture 6" descr="C:\Users\Tfair\Desktop\DocumentationBackup-9Tap\9TapStats.png"/>
+                    <pic:cNvPicPr>
+                      <a:picLocks noChangeAspect="1" noChangeArrowheads="1"/>
+                    </pic:cNvPicPr>
                   </pic:nvPicPr>
                   <pic:blipFill>
-                    <a:blip r:embed="rId16">
+                    <a:blip r:embed="rId17">
                       <a:extLst>
                         <a:ext uri="{28A0092B-C50C-407E-A947-70E740481C1C}">
                           <a14:useLocalDpi xmlns:a14="http://schemas.microsoft.com/office/drawing/2010/main" val="0"/>
                         </a:ext>
                       </a:extLst>
                     </a:blip>
+                    <a:srcRect/>
                     <a:stretch>
                       <a:fillRect/>
                     </a:stretch>
                   </pic:blipFill>
-                  <pic:spPr>
+                  <pic:spPr bwMode="auto">
                     <a:xfrm>
                       <a:off x="0" y="0"/>
-                      <a:ext cx="5009579" cy="2904774"/>
+                      <a:ext cx="4883150" cy="2806685"/>
                     </a:xfrm>
                     <a:prstGeom prst="rect">
                       <a:avLst/>
                     </a:prstGeom>
+                    <a:noFill/>
+                    <a:ln>
+                      <a:noFill/>
+                    </a:ln>
                   </pic:spPr>
                 </pic:pic>
               </a:graphicData>
@@ -7446,27 +7390,14 @@
       <w:r>
         <w:t xml:space="preserve">Figure </w:t>
       </w:r>
-      <w:r>
-        <w:fldChar w:fldCharType="begin"/>
-      </w:r>
-      <w:r>
-        <w:instrText xml:space="preserve"> SEQ Figure \* ARABIC </w:instrText>
-      </w:r>
-      <w:r>
-        <w:fldChar w:fldCharType="separate"/>
-      </w:r>
-      <w:r>
-        <w:rPr>
-          <w:noProof/>
-        </w:rPr>
-        <w:t>5</w:t>
-      </w:r>
-      <w:r>
-        <w:rPr>
-          <w:noProof/>
-        </w:rPr>
-        <w:fldChar w:fldCharType="end"/>
-      </w:r>
+      <w:fldSimple w:instr=" SEQ Figure \* ARABIC ">
+        <w:r>
+          <w:rPr>
+            <w:noProof/>
+          </w:rPr>
+          <w:t>5</w:t>
+        </w:r>
+      </w:fldSimple>
       <w:r>
         <w:t>: Stats</w:t>
       </w:r>
@@ -7531,7 +7462,7 @@
           <w:szCs w:val="20"/>
         </w:rPr>
       </w:pPr>
-      <w:bookmarkStart w:id="22" w:name="_Toc509165849"/>
+      <w:bookmarkStart w:id="23" w:name="_Toc509165849"/>
       <w:r>
         <w:rPr>
           <w:szCs w:val="20"/>
@@ -7539,7 +7470,7 @@
         <w:lastRenderedPageBreak/>
         <w:t>Member Search</w:t>
       </w:r>
-      <w:bookmarkEnd w:id="22"/>
+      <w:bookmarkEnd w:id="23"/>
       <w:r>
         <w:rPr>
           <w:szCs w:val="20"/>
@@ -7690,7 +7621,7 @@
                     <pic:cNvPicPr/>
                   </pic:nvPicPr>
                   <pic:blipFill>
-                    <a:blip r:embed="rId17">
+                    <a:blip r:embed="rId18">
                       <a:extLst>
                         <a:ext uri="{28A0092B-C50C-407E-A947-70E740481C1C}">
                           <a14:useLocalDpi xmlns:a14="http://schemas.microsoft.com/office/drawing/2010/main" val="0"/>
@@ -7736,7 +7667,7 @@
                     <pic:cNvPicPr/>
                   </pic:nvPicPr>
                   <pic:blipFill>
-                    <a:blip r:embed="rId18">
+                    <a:blip r:embed="rId19">
                       <a:extLst>
                         <a:ext uri="{28A0092B-C50C-407E-A947-70E740481C1C}">
                           <a14:useLocalDpi xmlns:a14="http://schemas.microsoft.com/office/drawing/2010/main" val="0"/>
@@ -7771,27 +7702,14 @@
       <w:r>
         <w:t xml:space="preserve">Figure </w:t>
       </w:r>
-      <w:r>
-        <w:fldChar w:fldCharType="begin"/>
-      </w:r>
-      <w:r>
-        <w:instrText xml:space="preserve"> SEQ Figure \* ARABIC </w:instrText>
-      </w:r>
-      <w:r>
-        <w:fldChar w:fldCharType="separate"/>
-      </w:r>
-      <w:r>
-        <w:rPr>
-          <w:noProof/>
-        </w:rPr>
-        <w:t>6</w:t>
-      </w:r>
-      <w:r>
-        <w:rPr>
-          <w:noProof/>
-        </w:rPr>
-        <w:fldChar w:fldCharType="end"/>
-      </w:r>
+      <w:fldSimple w:instr=" SEQ Figure \* ARABIC ">
+        <w:r>
+          <w:rPr>
+            <w:noProof/>
+          </w:rPr>
+          <w:t>6</w:t>
+        </w:r>
+      </w:fldSimple>
       <w:r>
         <w:t>: Member search, blank and with results</w:t>
       </w:r>
@@ -7803,7 +7721,7 @@
           <w:szCs w:val="20"/>
         </w:rPr>
       </w:pPr>
-      <w:bookmarkStart w:id="23" w:name="_Toc509165850"/>
+      <w:bookmarkStart w:id="24" w:name="_Toc509165850"/>
       <w:r>
         <w:rPr>
           <w:szCs w:val="20"/>
@@ -7811,7 +7729,7 @@
         <w:lastRenderedPageBreak/>
         <w:t>Print Recaps</w:t>
       </w:r>
-      <w:bookmarkEnd w:id="23"/>
+      <w:bookmarkEnd w:id="24"/>
       <w:r>
         <w:rPr>
           <w:szCs w:val="20"/>
@@ -7918,7 +7836,7 @@
                     <pic:cNvPicPr/>
                   </pic:nvPicPr>
                   <pic:blipFill>
-                    <a:blip r:embed="rId19">
+                    <a:blip r:embed="rId20">
                       <a:extLst>
                         <a:ext uri="{28A0092B-C50C-407E-A947-70E740481C1C}">
                           <a14:useLocalDpi xmlns:a14="http://schemas.microsoft.com/office/drawing/2010/main" val="0"/>
@@ -7964,7 +7882,7 @@
                     <pic:cNvPicPr/>
                   </pic:nvPicPr>
                   <pic:blipFill>
-                    <a:blip r:embed="rId20">
+                    <a:blip r:embed="rId21">
                       <a:extLst>
                         <a:ext uri="{28A0092B-C50C-407E-A947-70E740481C1C}">
                           <a14:useLocalDpi xmlns:a14="http://schemas.microsoft.com/office/drawing/2010/main" val="0"/>
@@ -7999,27 +7917,14 @@
       <w:r>
         <w:t xml:space="preserve">Figure </w:t>
       </w:r>
-      <w:r>
-        <w:fldChar w:fldCharType="begin"/>
-      </w:r>
-      <w:r>
-        <w:instrText xml:space="preserve"> SEQ Figure \* ARABIC </w:instrText>
-      </w:r>
-      <w:r>
-        <w:fldChar w:fldCharType="separate"/>
-      </w:r>
-      <w:r>
-        <w:rPr>
-          <w:noProof/>
-        </w:rPr>
-        <w:t>7</w:t>
-      </w:r>
-      <w:r>
-        <w:rPr>
-          <w:noProof/>
-        </w:rPr>
-        <w:fldChar w:fldCharType="end"/>
-      </w:r>
+      <w:fldSimple w:instr=" SEQ Figure \* ARABIC ">
+        <w:r>
+          <w:rPr>
+            <w:noProof/>
+          </w:rPr>
+          <w:t>7</w:t>
+        </w:r>
+      </w:fldSimple>
       <w:r>
         <w:t>: basic printer dialog</w:t>
       </w:r>
@@ -8034,14 +7939,14 @@
           <w:szCs w:val="20"/>
         </w:rPr>
       </w:pPr>
-      <w:bookmarkStart w:id="24" w:name="_Toc509165851"/>
+      <w:bookmarkStart w:id="25" w:name="_Toc509165851"/>
       <w:r>
         <w:rPr>
           <w:szCs w:val="20"/>
         </w:rPr>
         <w:t>Import</w:t>
       </w:r>
-      <w:bookmarkEnd w:id="24"/>
+      <w:bookmarkEnd w:id="25"/>
       <w:r>
         <w:rPr>
           <w:szCs w:val="20"/>
@@ -8161,7 +8066,7 @@
                     <pic:cNvPicPr/>
                   </pic:nvPicPr>
                   <pic:blipFill>
-                    <a:blip r:embed="rId21">
+                    <a:blip r:embed="rId22">
                       <a:extLst>
                         <a:ext uri="{28A0092B-C50C-407E-A947-70E740481C1C}">
                           <a14:useLocalDpi xmlns:a14="http://schemas.microsoft.com/office/drawing/2010/main" val="0"/>
@@ -8196,27 +8101,14 @@
       <w:r>
         <w:t xml:space="preserve">Figure </w:t>
       </w:r>
-      <w:r>
-        <w:fldChar w:fldCharType="begin"/>
-      </w:r>
-      <w:r>
-        <w:instrText xml:space="preserve"> SEQ Figure \* ARABIC </w:instrText>
-      </w:r>
-      <w:r>
-        <w:fldChar w:fldCharType="separate"/>
-      </w:r>
-      <w:r>
-        <w:rPr>
-          <w:noProof/>
-        </w:rPr>
-        <w:t>8</w:t>
-      </w:r>
-      <w:r>
-        <w:rPr>
-          <w:noProof/>
-        </w:rPr>
-        <w:fldChar w:fldCharType="end"/>
-      </w:r>
+      <w:fldSimple w:instr=" SEQ Figure \* ARABIC ">
+        <w:r>
+          <w:rPr>
+            <w:noProof/>
+          </w:rPr>
+          <w:t>8</w:t>
+        </w:r>
+      </w:fldSimple>
       <w:r>
         <w:t>: Importing existing player information</w:t>
       </w:r>
@@ -8225,12 +8117,12 @@
       <w:pPr>
         <w:pStyle w:val="Heading1"/>
       </w:pPr>
-      <w:bookmarkStart w:id="25" w:name="_Toc509165852"/>
+      <w:bookmarkStart w:id="26" w:name="_Toc509165852"/>
       <w:r>
         <w:lastRenderedPageBreak/>
         <w:t>Member Scores</w:t>
       </w:r>
-      <w:bookmarkEnd w:id="25"/>
+      <w:bookmarkEnd w:id="26"/>
       <w:r>
         <w:fldChar w:fldCharType="begin"/>
       </w:r>
@@ -8284,10 +8176,10 @@
           <w:noProof/>
         </w:rPr>
         <w:drawing>
-          <wp:inline distT="0" distB="0" distL="0" distR="0" wp14:anchorId="567F429C" wp14:editId="6B2B3C61">
-            <wp:extent cx="4858133" cy="4365206"/>
-            <wp:effectExtent l="0" t="0" r="0" b="0"/>
-            <wp:docPr id="6" name="Picture 6"/>
+          <wp:inline distT="0" distB="0" distL="0" distR="0" wp14:anchorId="672FF604" wp14:editId="12787516">
+            <wp:extent cx="4883150" cy="2549908"/>
+            <wp:effectExtent l="0" t="0" r="0" b="3175"/>
+            <wp:docPr id="33" name="Picture 33" descr="C:\Users\Tfair\Desktop\DocumentationBackup-9Tap\9TapMemberScores.png"/>
             <wp:cNvGraphicFramePr>
               <a:graphicFrameLocks xmlns:a="http://schemas.openxmlformats.org/drawingml/2006/main" noChangeAspect="1"/>
             </wp:cNvGraphicFramePr>
@@ -8295,17 +8187,20 @@
               <a:graphicData uri="http://schemas.openxmlformats.org/drawingml/2006/picture">
                 <pic:pic xmlns:pic="http://schemas.openxmlformats.org/drawingml/2006/picture">
                   <pic:nvPicPr>
-                    <pic:cNvPr id="6" name="MemberScoresForm.PNG"/>
-                    <pic:cNvPicPr/>
+                    <pic:cNvPr id="0" name="Picture 7" descr="C:\Users\Tfair\Desktop\DocumentationBackup-9Tap\9TapMemberScores.png"/>
+                    <pic:cNvPicPr>
+                      <a:picLocks noChangeAspect="1" noChangeArrowheads="1"/>
+                    </pic:cNvPicPr>
                   </pic:nvPicPr>
                   <pic:blipFill>
-                    <a:blip r:embed="rId22">
+                    <a:blip r:embed="rId23" cstate="print">
                       <a:extLst>
                         <a:ext uri="{28A0092B-C50C-407E-A947-70E740481C1C}">
                           <a14:useLocalDpi xmlns:a14="http://schemas.microsoft.com/office/drawing/2010/main" val="0"/>
                         </a:ext>
                       </a:extLst>
                     </a:blip>
+                    <a:srcRect/>
                     <a:stretch>
                       <a:fillRect/>
                     </a:stretch>
@@ -8313,19 +8208,15 @@
                   <pic:spPr bwMode="auto">
                     <a:xfrm>
                       <a:off x="0" y="0"/>
-                      <a:ext cx="4858133" cy="4365206"/>
+                      <a:ext cx="4883150" cy="2549908"/>
                     </a:xfrm>
                     <a:prstGeom prst="rect">
                       <a:avLst/>
                     </a:prstGeom>
+                    <a:noFill/>
                     <a:ln>
                       <a:noFill/>
                     </a:ln>
-                    <a:extLst>
-                      <a:ext uri="{53640926-AAD7-44D8-BBD7-CCE9431645EC}">
-                        <a14:shadowObscured xmlns:a14="http://schemas.microsoft.com/office/drawing/2010/main"/>
-                      </a:ext>
-                    </a:extLst>
                   </pic:spPr>
                 </pic:pic>
               </a:graphicData>
@@ -8342,27 +8233,14 @@
       <w:r>
         <w:t xml:space="preserve">Figure </w:t>
       </w:r>
-      <w:r>
-        <w:fldChar w:fldCharType="begin"/>
-      </w:r>
-      <w:r>
-        <w:instrText xml:space="preserve"> SEQ Figure \* ARABIC </w:instrText>
-      </w:r>
-      <w:r>
-        <w:fldChar w:fldCharType="separate"/>
-      </w:r>
-      <w:r>
-        <w:rPr>
-          <w:noProof/>
-        </w:rPr>
-        <w:t>9</w:t>
-      </w:r>
-      <w:r>
-        <w:rPr>
-          <w:noProof/>
-        </w:rPr>
-        <w:fldChar w:fldCharType="end"/>
-      </w:r>
+      <w:fldSimple w:instr=" SEQ Figure \* ARABIC ">
+        <w:r>
+          <w:rPr>
+            <w:noProof/>
+          </w:rPr>
+          <w:t>9</w:t>
+        </w:r>
+      </w:fldSimple>
       <w:r>
         <w:t>: Member Scores</w:t>
       </w:r>
@@ -8475,7 +8353,13 @@
         <w:t xml:space="preserve">if the </w:t>
       </w:r>
       <w:r>
-        <w:t>member has been comped into the tournament, be sure to check the comped box. E</w:t>
+        <w:t>member has been comped into the tournam</w:t>
+      </w:r>
+      <w:r>
+        <w:t>ent, be sure to check the Comp Entry</w:t>
+      </w:r>
+      <w:r>
+        <w:t xml:space="preserve"> box. E</w:t>
       </w:r>
       <w:r>
         <w:t xml:space="preserve">nter the bowler’s first scratch score in the first Scratch Scores field. Use a </w:t>
@@ -8515,7 +8399,7 @@
           <w:szCs w:val="20"/>
         </w:rPr>
       </w:pPr>
-      <w:bookmarkStart w:id="26" w:name="_Toc509165853"/>
+      <w:bookmarkStart w:id="27" w:name="_Toc509165853"/>
       <w:r>
         <w:rPr>
           <w:szCs w:val="20"/>
@@ -8523,7 +8407,7 @@
         <w:lastRenderedPageBreak/>
         <w:t>Tournament Stats</w:t>
       </w:r>
-      <w:bookmarkEnd w:id="26"/>
+      <w:bookmarkEnd w:id="27"/>
       <w:r>
         <w:rPr>
           <w:szCs w:val="20"/>
@@ -8688,7 +8572,7 @@
                     <pic:cNvPicPr/>
                   </pic:nvPicPr>
                   <pic:blipFill>
-                    <a:blip r:embed="rId23" cstate="print">
+                    <a:blip r:embed="rId24" cstate="print">
                       <a:extLst>
                         <a:ext uri="{28A0092B-C50C-407E-A947-70E740481C1C}">
                           <a14:useLocalDpi xmlns:a14="http://schemas.microsoft.com/office/drawing/2010/main" val="0"/>
@@ -8723,27 +8607,14 @@
       <w:r>
         <w:t xml:space="preserve">Figure </w:t>
       </w:r>
-      <w:r>
-        <w:fldChar w:fldCharType="begin"/>
-      </w:r>
-      <w:r>
-        <w:instrText xml:space="preserve"> SEQ Figure \* ARABIC </w:instrText>
-      </w:r>
-      <w:r>
-        <w:fldChar w:fldCharType="separate"/>
-      </w:r>
-      <w:r>
-        <w:rPr>
-          <w:noProof/>
-        </w:rPr>
-        <w:t>10</w:t>
-      </w:r>
-      <w:r>
-        <w:rPr>
-          <w:noProof/>
-        </w:rPr>
-        <w:fldChar w:fldCharType="end"/>
-      </w:r>
+      <w:fldSimple w:instr=" SEQ Figure \* ARABIC ">
+        <w:r>
+          <w:rPr>
+            <w:noProof/>
+          </w:rPr>
+          <w:t>10</w:t>
+        </w:r>
+      </w:fldSimple>
       <w:r>
         <w:t>: Tournament Stats</w:t>
       </w:r>
@@ -8798,7 +8669,7 @@
           <w:szCs w:val="20"/>
         </w:rPr>
       </w:pPr>
-      <w:bookmarkStart w:id="27" w:name="_Toc509165854"/>
+      <w:bookmarkStart w:id="28" w:name="_Toc509165854"/>
       <w:r>
         <w:rPr>
           <w:szCs w:val="20"/>
@@ -8849,7 +8720,7 @@
         </w:rPr>
         <w:t xml:space="preserve"> By Tournament</w:t>
       </w:r>
-      <w:bookmarkEnd w:id="27"/>
+      <w:bookmarkEnd w:id="28"/>
       <w:r>
         <w:rPr>
           <w:szCs w:val="20"/>
@@ -8982,7 +8853,7 @@
                     <pic:cNvPicPr/>
                   </pic:nvPicPr>
                   <pic:blipFill>
-                    <a:blip r:embed="rId19">
+                    <a:blip r:embed="rId20">
                       <a:extLst>
                         <a:ext uri="{28A0092B-C50C-407E-A947-70E740481C1C}">
                           <a14:useLocalDpi xmlns:a14="http://schemas.microsoft.com/office/drawing/2010/main" val="0"/>
@@ -9017,27 +8888,14 @@
       <w:r>
         <w:t xml:space="preserve">Figure </w:t>
       </w:r>
-      <w:r>
-        <w:fldChar w:fldCharType="begin"/>
-      </w:r>
-      <w:r>
-        <w:instrText xml:space="preserve"> SEQ Figure \* ARABIC </w:instrText>
-      </w:r>
-      <w:r>
-        <w:fldChar w:fldCharType="separate"/>
-      </w:r>
-      <w:r>
-        <w:rPr>
-          <w:noProof/>
-        </w:rPr>
-        <w:t>11</w:t>
-      </w:r>
-      <w:r>
-        <w:rPr>
-          <w:noProof/>
-        </w:rPr>
-        <w:fldChar w:fldCharType="end"/>
-      </w:r>
+      <w:fldSimple w:instr=" SEQ Figure \* ARABIC ">
+        <w:r>
+          <w:rPr>
+            <w:noProof/>
+          </w:rPr>
+          <w:t>11</w:t>
+        </w:r>
+      </w:fldSimple>
       <w:r>
         <w:t xml:space="preserve"> Print Dialog</w:t>
       </w:r>
@@ -9046,12 +8904,12 @@
       <w:pPr>
         <w:pStyle w:val="Heading2"/>
       </w:pPr>
-      <w:bookmarkStart w:id="28" w:name="_Toc509165855"/>
+      <w:bookmarkStart w:id="29" w:name="_Toc509165855"/>
       <w:r>
         <w:lastRenderedPageBreak/>
         <w:t>Tournament Place Standings</w:t>
       </w:r>
-      <w:bookmarkEnd w:id="28"/>
+      <w:bookmarkEnd w:id="29"/>
       <w:r>
         <w:fldChar w:fldCharType="begin"/>
       </w:r>
@@ -9144,7 +9002,7 @@
                     <pic:cNvPicPr/>
                   </pic:nvPicPr>
                   <pic:blipFill>
-                    <a:blip r:embed="rId24" cstate="print">
+                    <a:blip r:embed="rId25" cstate="print">
                       <a:extLst>
                         <a:ext uri="{28A0092B-C50C-407E-A947-70E740481C1C}">
                           <a14:useLocalDpi xmlns:a14="http://schemas.microsoft.com/office/drawing/2010/main" val="0"/>
@@ -9179,27 +9037,14 @@
       <w:r>
         <w:t xml:space="preserve">Figure </w:t>
       </w:r>
-      <w:r>
-        <w:fldChar w:fldCharType="begin"/>
-      </w:r>
-      <w:r>
-        <w:instrText xml:space="preserve"> SEQ Figure \* ARABIC </w:instrText>
-      </w:r>
-      <w:r>
-        <w:fldChar w:fldCharType="separate"/>
-      </w:r>
-      <w:r>
-        <w:rPr>
-          <w:noProof/>
-        </w:rPr>
-        <w:t>12</w:t>
-      </w:r>
-      <w:r>
-        <w:rPr>
-          <w:noProof/>
-        </w:rPr>
-        <w:fldChar w:fldCharType="end"/>
-      </w:r>
+      <w:fldSimple w:instr=" SEQ Figure \* ARABIC ">
+        <w:r>
+          <w:rPr>
+            <w:noProof/>
+          </w:rPr>
+          <w:t>12</w:t>
+        </w:r>
+      </w:fldSimple>
       <w:r>
         <w:t>: Tournament Place Standings</w:t>
       </w:r>
@@ -9233,12 +9078,12 @@
       <w:pPr>
         <w:pStyle w:val="Heading2"/>
       </w:pPr>
-      <w:bookmarkStart w:id="29" w:name="_Toc509165856"/>
+      <w:bookmarkStart w:id="30" w:name="_Toc509165856"/>
       <w:r>
         <w:lastRenderedPageBreak/>
         <w:t>Create/Edit Tournament</w:t>
       </w:r>
-      <w:bookmarkEnd w:id="29"/>
+      <w:bookmarkEnd w:id="30"/>
       <w:r>
         <w:fldChar w:fldCharType="begin"/>
       </w:r>
@@ -9337,7 +9182,7 @@
                     <pic:cNvPicPr/>
                   </pic:nvPicPr>
                   <pic:blipFill>
-                    <a:blip r:embed="rId25">
+                    <a:blip r:embed="rId26">
                       <a:extLst>
                         <a:ext uri="{28A0092B-C50C-407E-A947-70E740481C1C}">
                           <a14:useLocalDpi xmlns:a14="http://schemas.microsoft.com/office/drawing/2010/main" val="0"/>
@@ -9380,27 +9225,14 @@
       <w:r>
         <w:t xml:space="preserve">Figure </w:t>
       </w:r>
-      <w:r>
-        <w:fldChar w:fldCharType="begin"/>
-      </w:r>
-      <w:r>
-        <w:instrText xml:space="preserve"> SEQ Figure \* ARABIC </w:instrText>
-      </w:r>
-      <w:r>
-        <w:fldChar w:fldCharType="separate"/>
-      </w:r>
-      <w:r>
-        <w:rPr>
-          <w:noProof/>
-        </w:rPr>
-        <w:t>13</w:t>
-      </w:r>
-      <w:r>
-        <w:rPr>
-          <w:noProof/>
-        </w:rPr>
-        <w:fldChar w:fldCharType="end"/>
-      </w:r>
+      <w:fldSimple w:instr=" SEQ Figure \* ARABIC ">
+        <w:r>
+          <w:rPr>
+            <w:noProof/>
+          </w:rPr>
+          <w:t>13</w:t>
+        </w:r>
+      </w:fldSimple>
       <w:r>
         <w:t xml:space="preserve">: </w:t>
       </w:r>
@@ -9443,11 +9275,11 @@
       <w:pPr>
         <w:pStyle w:val="Heading3"/>
       </w:pPr>
-      <w:bookmarkStart w:id="30" w:name="_Toc509165857"/>
+      <w:bookmarkStart w:id="31" w:name="_Toc509165857"/>
       <w:r>
         <w:t>To Update an Existing Tournament</w:t>
       </w:r>
-      <w:bookmarkEnd w:id="30"/>
+      <w:bookmarkEnd w:id="31"/>
     </w:p>
     <w:p>
       <w:pPr>
@@ -9531,11 +9363,11 @@
       <w:pPr>
         <w:pStyle w:val="Heading2"/>
       </w:pPr>
-      <w:bookmarkStart w:id="31" w:name="_Toc509165858"/>
+      <w:bookmarkStart w:id="32" w:name="_Toc509165858"/>
       <w:r>
         <w:t>Search Tournaments</w:t>
       </w:r>
-      <w:bookmarkEnd w:id="31"/>
+      <w:bookmarkEnd w:id="32"/>
       <w:r>
         <w:fldChar w:fldCharType="begin"/>
       </w:r>
@@ -9622,7 +9454,7 @@
                     <pic:cNvPicPr/>
                   </pic:nvPicPr>
                   <pic:blipFill>
-                    <a:blip r:embed="rId26">
+                    <a:blip r:embed="rId27">
                       <a:extLst>
                         <a:ext uri="{28A0092B-C50C-407E-A947-70E740481C1C}">
                           <a14:useLocalDpi xmlns:a14="http://schemas.microsoft.com/office/drawing/2010/main" val="0"/>
@@ -9668,7 +9500,7 @@
                     <pic:cNvPicPr/>
                   </pic:nvPicPr>
                   <pic:blipFill>
-                    <a:blip r:embed="rId27">
+                    <a:blip r:embed="rId28">
                       <a:extLst>
                         <a:ext uri="{28A0092B-C50C-407E-A947-70E740481C1C}">
                           <a14:useLocalDpi xmlns:a14="http://schemas.microsoft.com/office/drawing/2010/main" val="0"/>
@@ -9703,27 +9535,14 @@
       <w:r>
         <w:t xml:space="preserve">Figure </w:t>
       </w:r>
-      <w:r>
-        <w:fldChar w:fldCharType="begin"/>
-      </w:r>
-      <w:r>
-        <w:instrText xml:space="preserve"> SEQ Figure \* ARABIC </w:instrText>
-      </w:r>
-      <w:r>
-        <w:fldChar w:fldCharType="separate"/>
-      </w:r>
-      <w:r>
-        <w:rPr>
-          <w:noProof/>
-        </w:rPr>
-        <w:t>14</w:t>
-      </w:r>
-      <w:r>
-        <w:rPr>
-          <w:noProof/>
-        </w:rPr>
-        <w:fldChar w:fldCharType="end"/>
-      </w:r>
+      <w:fldSimple w:instr=" SEQ Figure \* ARABIC ">
+        <w:r>
+          <w:rPr>
+            <w:noProof/>
+          </w:rPr>
+          <w:t>14</w:t>
+        </w:r>
+      </w:fldSimple>
       <w:r>
         <w:t>: Tournament Search Forms</w:t>
       </w:r>
@@ -9732,11 +9551,11 @@
       <w:pPr>
         <w:pStyle w:val="Heading3"/>
       </w:pPr>
-      <w:bookmarkStart w:id="32" w:name="_Toc509165859"/>
+      <w:bookmarkStart w:id="33" w:name="_Toc509165859"/>
       <w:r>
         <w:t>Search by Location</w:t>
       </w:r>
-      <w:bookmarkEnd w:id="32"/>
+      <w:bookmarkEnd w:id="33"/>
       <w:r>
         <w:fldChar w:fldCharType="begin"/>
       </w:r>
@@ -9774,11 +9593,11 @@
       <w:pPr>
         <w:pStyle w:val="Heading3"/>
       </w:pPr>
-      <w:bookmarkStart w:id="33" w:name="_Toc509165860"/>
+      <w:bookmarkStart w:id="34" w:name="_Toc509165860"/>
       <w:r>
         <w:t>Search by Event</w:t>
       </w:r>
-      <w:bookmarkEnd w:id="33"/>
+      <w:bookmarkEnd w:id="34"/>
       <w:r>
         <w:fldChar w:fldCharType="begin"/>
       </w:r>
@@ -9832,11 +9651,11 @@
       <w:pPr>
         <w:pStyle w:val="Heading3"/>
       </w:pPr>
-      <w:bookmarkStart w:id="34" w:name="_Toc509165861"/>
+      <w:bookmarkStart w:id="35" w:name="_Toc509165861"/>
       <w:r>
         <w:t>Search by Date</w:t>
       </w:r>
-      <w:bookmarkEnd w:id="34"/>
+      <w:bookmarkEnd w:id="35"/>
       <w:r>
         <w:fldChar w:fldCharType="begin"/>
       </w:r>
@@ -9865,7 +9684,7 @@
       <w:pPr>
         <w:pStyle w:val="Heading2"/>
       </w:pPr>
-      <w:bookmarkStart w:id="35" w:name="_Toc509165862"/>
+      <w:bookmarkStart w:id="36" w:name="_Toc509165862"/>
       <w:r>
         <w:lastRenderedPageBreak/>
         <w:t>List Tournaments</w:t>
@@ -9901,7 +9720,7 @@
       <w:r>
         <w:t>ear</w:t>
       </w:r>
-      <w:bookmarkEnd w:id="35"/>
+      <w:bookmarkEnd w:id="36"/>
       <w:r>
         <w:fldChar w:fldCharType="begin"/>
       </w:r>
@@ -10023,7 +9842,7 @@
                     <pic:cNvPicPr/>
                   </pic:nvPicPr>
                   <pic:blipFill>
-                    <a:blip r:embed="rId28" cstate="print">
+                    <a:blip r:embed="rId29" cstate="print">
                       <a:extLst>
                         <a:ext uri="{28A0092B-C50C-407E-A947-70E740481C1C}">
                           <a14:useLocalDpi xmlns:a14="http://schemas.microsoft.com/office/drawing/2010/main" val="0"/>
@@ -10071,7 +9890,7 @@
                     </pic:cNvPicPr>
                   </pic:nvPicPr>
                   <pic:blipFill>
-                    <a:blip r:embed="rId29" cstate="print">
+                    <a:blip r:embed="rId30" cstate="print">
                       <a:extLst>
                         <a:ext uri="{28A0092B-C50C-407E-A947-70E740481C1C}">
                           <a14:useLocalDpi xmlns:a14="http://schemas.microsoft.com/office/drawing/2010/main" val="0"/>
@@ -10111,27 +9930,14 @@
       <w:r>
         <w:t xml:space="preserve">Figure </w:t>
       </w:r>
-      <w:r>
-        <w:fldChar w:fldCharType="begin"/>
-      </w:r>
-      <w:r>
-        <w:instrText xml:space="preserve"> SEQ Figure \* ARABIC </w:instrText>
-      </w:r>
-      <w:r>
-        <w:fldChar w:fldCharType="separate"/>
-      </w:r>
-      <w:r>
-        <w:rPr>
-          <w:noProof/>
-        </w:rPr>
-        <w:t>15</w:t>
-      </w:r>
-      <w:r>
-        <w:rPr>
-          <w:noProof/>
-        </w:rPr>
-        <w:fldChar w:fldCharType="end"/>
-      </w:r>
+      <w:fldSimple w:instr=" SEQ Figure \* ARABIC ">
+        <w:r>
+          <w:rPr>
+            <w:noProof/>
+          </w:rPr>
+          <w:t>15</w:t>
+        </w:r>
+      </w:fldSimple>
       <w:r>
         <w:t>: Tournaments</w:t>
       </w:r>
@@ -10168,11 +9974,11 @@
       <w:pPr>
         <w:pStyle w:val="Heading2"/>
       </w:pPr>
-      <w:bookmarkStart w:id="36" w:name="_Toc509165863"/>
+      <w:bookmarkStart w:id="37" w:name="_Toc509165863"/>
       <w:r>
         <w:t>Reports</w:t>
       </w:r>
-      <w:bookmarkEnd w:id="36"/>
+      <w:bookmarkEnd w:id="37"/>
       <w:r>
         <w:fldChar w:fldCharType="begin"/>
       </w:r>
@@ -10312,7 +10118,7 @@
                     <pic:cNvPicPr/>
                   </pic:nvPicPr>
                   <pic:blipFill>
-                    <a:blip r:embed="rId30">
+                    <a:blip r:embed="rId31">
                       <a:extLst>
                         <a:ext uri="{28A0092B-C50C-407E-A947-70E740481C1C}">
                           <a14:useLocalDpi xmlns:a14="http://schemas.microsoft.com/office/drawing/2010/main" val="0"/>
@@ -10347,27 +10153,14 @@
       <w:r>
         <w:t xml:space="preserve">Figure </w:t>
       </w:r>
-      <w:r>
-        <w:fldChar w:fldCharType="begin"/>
-      </w:r>
-      <w:r>
-        <w:instrText xml:space="preserve"> SEQ Figure \* ARABIC </w:instrText>
-      </w:r>
-      <w:r>
-        <w:fldChar w:fldCharType="separate"/>
-      </w:r>
-      <w:r>
-        <w:rPr>
-          <w:noProof/>
-        </w:rPr>
-        <w:t>16</w:t>
-      </w:r>
-      <w:r>
-        <w:rPr>
-          <w:noProof/>
-        </w:rPr>
-        <w:fldChar w:fldCharType="end"/>
-      </w:r>
+      <w:fldSimple w:instr=" SEQ Figure \* ARABIC ">
+        <w:r>
+          <w:rPr>
+            <w:noProof/>
+          </w:rPr>
+          <w:t>16</w:t>
+        </w:r>
+      </w:fldSimple>
       <w:r>
         <w:t xml:space="preserve"> Member Scores</w:t>
       </w:r>
@@ -10509,12 +10302,12 @@
       <w:pPr>
         <w:pStyle w:val="Heading2"/>
       </w:pPr>
-      <w:bookmarkStart w:id="37" w:name="_Toc509165864"/>
+      <w:bookmarkStart w:id="38" w:name="_Toc509165864"/>
       <w:r>
         <w:lastRenderedPageBreak/>
         <w:t>Tournament Results</w:t>
       </w:r>
-      <w:bookmarkEnd w:id="37"/>
+      <w:bookmarkEnd w:id="38"/>
       <w:r>
         <w:fldChar w:fldCharType="begin"/>
       </w:r>
@@ -10615,7 +10408,7 @@
                     <pic:cNvPicPr/>
                   </pic:nvPicPr>
                   <pic:blipFill>
-                    <a:blip r:embed="rId31">
+                    <a:blip r:embed="rId32">
                       <a:extLst>
                         <a:ext uri="{28A0092B-C50C-407E-A947-70E740481C1C}">
                           <a14:useLocalDpi xmlns:a14="http://schemas.microsoft.com/office/drawing/2010/main" val="0"/>
@@ -10650,27 +10443,14 @@
       <w:r>
         <w:t xml:space="preserve">Figure </w:t>
       </w:r>
-      <w:r>
-        <w:fldChar w:fldCharType="begin"/>
-      </w:r>
-      <w:r>
-        <w:instrText xml:space="preserve"> SEQ Figure \* ARABIC </w:instrText>
-      </w:r>
-      <w:r>
-        <w:fldChar w:fldCharType="separate"/>
-      </w:r>
-      <w:r>
-        <w:rPr>
-          <w:noProof/>
-        </w:rPr>
-        <w:t>17</w:t>
-      </w:r>
-      <w:r>
-        <w:rPr>
-          <w:noProof/>
-        </w:rPr>
-        <w:fldChar w:fldCharType="end"/>
-      </w:r>
+      <w:fldSimple w:instr=" SEQ Figure \* ARABIC ">
+        <w:r>
+          <w:rPr>
+            <w:noProof/>
+          </w:rPr>
+          <w:t>17</w:t>
+        </w:r>
+      </w:fldSimple>
       <w:r>
         <w:t xml:space="preserve"> Tournament Results</w:t>
       </w:r>
@@ -10707,11 +10487,11 @@
       <w:pPr>
         <w:pStyle w:val="Heading2"/>
       </w:pPr>
-      <w:bookmarkStart w:id="38" w:name="_Toc509165865"/>
+      <w:bookmarkStart w:id="39" w:name="_Toc509165865"/>
       <w:r>
         <w:t>Comments</w:t>
       </w:r>
-      <w:bookmarkEnd w:id="38"/>
+      <w:bookmarkEnd w:id="39"/>
       <w:r>
         <w:fldChar w:fldCharType="begin"/>
       </w:r>
@@ -10787,7 +10567,7 @@
       <w:pPr>
         <w:pStyle w:val="Heading1"/>
       </w:pPr>
-      <w:bookmarkStart w:id="39" w:name="_Toc509165866"/>
+      <w:bookmarkStart w:id="40" w:name="_Toc509165866"/>
       <w:r>
         <w:lastRenderedPageBreak/>
         <w:t>Finalize Tournament</w:t>
@@ -10797,11 +10577,11 @@
       <w:pPr>
         <w:pStyle w:val="Heading2"/>
       </w:pPr>
-      <w:commentRangeStart w:id="40"/>
+      <w:commentRangeStart w:id="41"/>
       <w:r>
         <w:t>Finalize</w:t>
       </w:r>
-      <w:commentRangeEnd w:id="40"/>
+      <w:commentRangeEnd w:id="41"/>
       <w:r>
         <w:rPr>
           <w:rStyle w:val="CommentReference"/>
@@ -10810,12 +10590,12 @@
           <w:kern w:val="0"/>
           <w:szCs w:val="20"/>
         </w:rPr>
-        <w:commentReference w:id="40"/>
+        <w:commentReference w:id="41"/>
       </w:r>
       <w:r>
         <w:t xml:space="preserve"> Tournament</w:t>
       </w:r>
-      <w:bookmarkEnd w:id="39"/>
+      <w:bookmarkEnd w:id="40"/>
       <w:r>
         <w:t xml:space="preserve"> Basics</w:t>
       </w:r>
@@ -11066,8 +10846,6 @@
       <w:r>
         <w:t xml:space="preserve"> Manually adjusting the average is also required.</w:t>
       </w:r>
-      <w:bookmarkStart w:id="41" w:name="_GoBack"/>
-      <w:bookmarkEnd w:id="41"/>
       <w:r>
         <w:t xml:space="preserve"> After all of this is done, the director checks off the Director Check box for that player. </w:t>
       </w:r>
@@ -11098,27 +10876,8 @@
           <w:noProof/>
         </w:rPr>
         <w:pict w14:anchorId="225EA388">
-          <v:shapetype id="_x0000_t75" coordsize="21600,21600" o:spt="75" o:preferrelative="t" path="m@4@5l@4@11@9@11@9@5xe" filled="f" stroked="f">
-            <v:stroke joinstyle="miter"/>
-            <v:formulas>
-              <v:f eqn="if lineDrawn pixelLineWidth 0"/>
-              <v:f eqn="sum @0 1 0"/>
-              <v:f eqn="sum 0 0 @1"/>
-              <v:f eqn="prod @2 1 2"/>
-              <v:f eqn="prod @3 21600 pixelWidth"/>
-              <v:f eqn="prod @3 21600 pixelHeight"/>
-              <v:f eqn="sum @0 0 1"/>
-              <v:f eqn="prod @6 1 2"/>
-              <v:f eqn="prod @7 21600 pixelWidth"/>
-              <v:f eqn="sum @8 21600 0"/>
-              <v:f eqn="prod @7 21600 pixelHeight"/>
-              <v:f eqn="sum @10 21600 0"/>
-            </v:formulas>
-            <v:path o:extrusionok="f" gradientshapeok="t" o:connecttype="rect"/>
-            <o:lock v:ext="edit" aspectratio="t"/>
-          </v:shapetype>
-          <v:shape id="_x0000_i1025" type="#_x0000_t75" style="width:384.45pt;height:222.8pt">
-            <v:imagedata r:id="rId34" o:title="FinalizeTournamentWindow"/>
+          <v:shape id="_x0000_i1025" type="#_x0000_t75" style="width:384pt;height:222.75pt">
+            <v:imagedata r:id="rId35" o:title="FinalizeTournamentWindow"/>
           </v:shape>
         </w:pict>
       </w:r>
@@ -11130,27 +10889,14 @@
       <w:r>
         <w:t xml:space="preserve">Figure </w:t>
       </w:r>
-      <w:r>
-        <w:fldChar w:fldCharType="begin"/>
-      </w:r>
-      <w:r>
-        <w:instrText xml:space="preserve"> SEQ Figure \* ARABIC </w:instrText>
-      </w:r>
-      <w:r>
-        <w:fldChar w:fldCharType="separate"/>
-      </w:r>
-      <w:r>
-        <w:rPr>
-          <w:noProof/>
-        </w:rPr>
-        <w:t>18</w:t>
-      </w:r>
-      <w:r>
-        <w:rPr>
-          <w:noProof/>
-        </w:rPr>
-        <w:fldChar w:fldCharType="end"/>
-      </w:r>
+      <w:fldSimple w:instr=" SEQ Figure \* ARABIC ">
+        <w:r>
+          <w:rPr>
+            <w:noProof/>
+          </w:rPr>
+          <w:t>18</w:t>
+        </w:r>
+      </w:fldSimple>
       <w:r>
         <w:t xml:space="preserve"> Finalize Tournament</w:t>
       </w:r>
@@ -11267,76 +11013,6 @@
             <wp:extent cx="526212" cy="841940"/>
             <wp:effectExtent l="0" t="0" r="7620" b="0"/>
             <wp:docPr id="27" name="Picture 27"/>
-            <wp:cNvGraphicFramePr>
-              <a:graphicFrameLocks xmlns:a="http://schemas.openxmlformats.org/drawingml/2006/main" noChangeAspect="1"/>
-            </wp:cNvGraphicFramePr>
-            <a:graphic xmlns:a="http://schemas.openxmlformats.org/drawingml/2006/main">
-              <a:graphicData uri="http://schemas.openxmlformats.org/drawingml/2006/picture">
-                <pic:pic xmlns:pic="http://schemas.openxmlformats.org/drawingml/2006/picture">
-                  <pic:nvPicPr>
-                    <pic:cNvPr id="1" name=""/>
-                    <pic:cNvPicPr/>
-                  </pic:nvPicPr>
-                  <pic:blipFill>
-                    <a:blip r:embed="rId35"/>
-                    <a:stretch>
-                      <a:fillRect/>
-                    </a:stretch>
-                  </pic:blipFill>
-                  <pic:spPr>
-                    <a:xfrm>
-                      <a:off x="0" y="0"/>
-                      <a:ext cx="585111" cy="936179"/>
-                    </a:xfrm>
-                    <a:prstGeom prst="rect">
-                      <a:avLst/>
-                    </a:prstGeom>
-                  </pic:spPr>
-                </pic:pic>
-              </a:graphicData>
-            </a:graphic>
-          </wp:inline>
-        </w:drawing>
-      </w:r>
-    </w:p>
-    <w:p>
-      <w:pPr>
-        <w:pStyle w:val="BodyText"/>
-        <w:keepNext/>
-        <w:numPr>
-          <w:ilvl w:val="0"/>
-          <w:numId w:val="50"/>
-        </w:numPr>
-      </w:pPr>
-      <w:r>
-        <w:rPr>
-          <w:b/>
-          <w:u w:val="single"/>
-        </w:rPr>
-        <w:t>GameID</w:t>
-      </w:r>
-      <w:r>
-        <w:t xml:space="preserve"> –Needs work</w:t>
-      </w:r>
-    </w:p>
-    <w:p>
-      <w:pPr>
-        <w:pStyle w:val="BodyText"/>
-        <w:keepNext/>
-        <w:ind w:left="720"/>
-      </w:pPr>
-      <w:r>
-        <w:t xml:space="preserve">  </w:t>
-      </w:r>
-      <w:r>
-        <w:rPr>
-          <w:noProof/>
-        </w:rPr>
-        <w:drawing>
-          <wp:inline distT="0" distB="0" distL="0" distR="0" wp14:anchorId="4EB199F8" wp14:editId="0E6CACF1">
-            <wp:extent cx="473914" cy="770111"/>
-            <wp:effectExtent l="0" t="0" r="2540" b="0"/>
-            <wp:docPr id="29" name="Picture 29"/>
             <wp:cNvGraphicFramePr>
               <a:graphicFrameLocks xmlns:a="http://schemas.openxmlformats.org/drawingml/2006/main" noChangeAspect="1"/>
             </wp:cNvGraphicFramePr>
@@ -11356,7 +11032,7 @@
                   <pic:spPr>
                     <a:xfrm>
                       <a:off x="0" y="0"/>
-                      <a:ext cx="506426" cy="822944"/>
+                      <a:ext cx="585111" cy="936179"/>
                     </a:xfrm>
                     <a:prstGeom prst="rect">
                       <a:avLst/>
@@ -11368,9 +11044,6 @@
           </wp:inline>
         </w:drawing>
       </w:r>
-      <w:r>
-        <w:t xml:space="preserve">   </w:t>
-      </w:r>
     </w:p>
     <w:p>
       <w:pPr>
@@ -11386,19 +11059,10 @@
           <w:b/>
           <w:u w:val="single"/>
         </w:rPr>
-        <w:t>Game 1-4 and ValidScore 1-4</w:t>
-      </w:r>
-      <w:r>
-        <w:t xml:space="preserve"> - t</w:t>
-      </w:r>
-      <w:r>
-        <w:t>hat player’s score for each game</w:t>
-      </w:r>
-      <w:r>
-        <w:t xml:space="preserve"> they played, and a checkbox used to determine whether that player’s score is valid for that set of pins. E.G. a sandbagged score will be</w:t>
-      </w:r>
-      <w:r>
-        <w:t xml:space="preserve"> unchecked and thus invalidated.</w:t>
+        <w:t>GameID</w:t>
+      </w:r>
+      <w:r>
+        <w:t xml:space="preserve"> –Needs work</w:t>
       </w:r>
     </w:p>
     <w:p>
@@ -11406,25 +11070,19 @@
         <w:pStyle w:val="BodyText"/>
         <w:keepNext/>
         <w:ind w:left="720"/>
+      </w:pPr>
+      <w:r>
+        <w:t xml:space="preserve">  </w:t>
+      </w:r>
+      <w:r>
         <w:rPr>
           <w:noProof/>
         </w:rPr>
-      </w:pPr>
-      <w:r>
-        <w:rPr>
-          <w:noProof/>
-        </w:rPr>
-        <w:t xml:space="preserve"> </w:t>
-      </w:r>
-      <w:r>
-        <w:rPr>
-          <w:noProof/>
-        </w:rPr>
         <w:drawing>
-          <wp:inline distT="0" distB="0" distL="0" distR="0" wp14:anchorId="7A3357F6" wp14:editId="1EC28456">
-            <wp:extent cx="491706" cy="697328"/>
-            <wp:effectExtent l="0" t="0" r="3810" b="7620"/>
-            <wp:docPr id="31" name="Picture 31"/>
+          <wp:inline distT="0" distB="0" distL="0" distR="0" wp14:anchorId="4EB199F8" wp14:editId="0E6CACF1">
+            <wp:extent cx="473914" cy="770111"/>
+            <wp:effectExtent l="0" t="0" r="2540" b="0"/>
+            <wp:docPr id="29" name="Picture 29"/>
             <wp:cNvGraphicFramePr>
               <a:graphicFrameLocks xmlns:a="http://schemas.openxmlformats.org/drawingml/2006/main" noChangeAspect="1"/>
             </wp:cNvGraphicFramePr>
@@ -11444,7 +11102,7 @@
                   <pic:spPr>
                     <a:xfrm>
                       <a:off x="0" y="0"/>
-                      <a:ext cx="515572" cy="731175"/>
+                      <a:ext cx="506426" cy="822944"/>
                     </a:xfrm>
                     <a:prstGeom prst="rect">
                       <a:avLst/>
@@ -11456,6 +11114,9 @@
           </wp:inline>
         </w:drawing>
       </w:r>
+      <w:r>
+        <w:t xml:space="preserve">   </w:t>
+      </w:r>
     </w:p>
     <w:p>
       <w:pPr>
@@ -11471,10 +11132,19 @@
           <w:b/>
           <w:u w:val="single"/>
         </w:rPr>
-        <w:t>Scratch Total</w:t>
-      </w:r>
-      <w:r>
-        <w:t xml:space="preserve"> – The player’s total score before handicaps are taken into account.</w:t>
+        <w:t>Game 1-4 and ValidScore 1-4</w:t>
+      </w:r>
+      <w:r>
+        <w:t xml:space="preserve"> - t</w:t>
+      </w:r>
+      <w:r>
+        <w:t>hat player’s score for each game</w:t>
+      </w:r>
+      <w:r>
+        <w:t xml:space="preserve"> they played, and a checkbox used to determine whether that player’s score is valid for that set of pins. E.G. a sandbagged score will be</w:t>
+      </w:r>
+      <w:r>
+        <w:t xml:space="preserve"> unchecked and thus invalidated.</w:t>
       </w:r>
     </w:p>
     <w:p>
@@ -11482,16 +11152,25 @@
         <w:pStyle w:val="BodyText"/>
         <w:keepNext/>
         <w:ind w:left="720"/>
-      </w:pPr>
-      <w:r>
         <w:rPr>
           <w:noProof/>
         </w:rPr>
+      </w:pPr>
+      <w:r>
+        <w:rPr>
+          <w:noProof/>
+        </w:rPr>
+        <w:t xml:space="preserve"> </w:t>
+      </w:r>
+      <w:r>
+        <w:rPr>
+          <w:noProof/>
+        </w:rPr>
         <w:drawing>
-          <wp:inline distT="0" distB="0" distL="0" distR="0" wp14:anchorId="275B9669" wp14:editId="7FA5F256">
-            <wp:extent cx="542925" cy="752475"/>
-            <wp:effectExtent l="0" t="0" r="9525" b="9525"/>
-            <wp:docPr id="35" name="Picture 35"/>
+          <wp:inline distT="0" distB="0" distL="0" distR="0" wp14:anchorId="7A3357F6" wp14:editId="1EC28456">
+            <wp:extent cx="491706" cy="697328"/>
+            <wp:effectExtent l="0" t="0" r="3810" b="7620"/>
+            <wp:docPr id="31" name="Picture 31"/>
             <wp:cNvGraphicFramePr>
               <a:graphicFrameLocks xmlns:a="http://schemas.openxmlformats.org/drawingml/2006/main" noChangeAspect="1"/>
             </wp:cNvGraphicFramePr>
@@ -11511,7 +11190,7 @@
                   <pic:spPr>
                     <a:xfrm>
                       <a:off x="0" y="0"/>
-                      <a:ext cx="542925" cy="752475"/>
+                      <a:ext cx="515572" cy="731175"/>
                     </a:xfrm>
                     <a:prstGeom prst="rect">
                       <a:avLst/>
@@ -11538,10 +11217,10 @@
           <w:b/>
           <w:u w:val="single"/>
         </w:rPr>
-        <w:t xml:space="preserve">Handicap Total </w:t>
-      </w:r>
-      <w:r>
-        <w:t>– The player’s total score after handicaps are taken into account.</w:t>
+        <w:t>Scratch Total</w:t>
+      </w:r>
+      <w:r>
+        <w:t xml:space="preserve"> – The player’s total score before handicaps are taken into account.</w:t>
       </w:r>
     </w:p>
     <w:p>
@@ -11555,10 +11234,10 @@
           <w:noProof/>
         </w:rPr>
         <w:drawing>
-          <wp:inline distT="0" distB="0" distL="0" distR="0" wp14:anchorId="1C4ED64A" wp14:editId="177F90E7">
-            <wp:extent cx="533400" cy="752475"/>
-            <wp:effectExtent l="0" t="0" r="0" b="9525"/>
-            <wp:docPr id="40" name="Picture 40"/>
+          <wp:inline distT="0" distB="0" distL="0" distR="0" wp14:anchorId="275B9669" wp14:editId="7FA5F256">
+            <wp:extent cx="542925" cy="752475"/>
+            <wp:effectExtent l="0" t="0" r="9525" b="9525"/>
+            <wp:docPr id="35" name="Picture 35"/>
             <wp:cNvGraphicFramePr>
               <a:graphicFrameLocks xmlns:a="http://schemas.openxmlformats.org/drawingml/2006/main" noChangeAspect="1"/>
             </wp:cNvGraphicFramePr>
@@ -11578,7 +11257,7 @@
                   <pic:spPr>
                     <a:xfrm>
                       <a:off x="0" y="0"/>
-                      <a:ext cx="533400" cy="752475"/>
+                      <a:ext cx="542925" cy="752475"/>
                     </a:xfrm>
                     <a:prstGeom prst="rect">
                       <a:avLst/>
@@ -11605,10 +11284,10 @@
           <w:b/>
           <w:u w:val="single"/>
         </w:rPr>
-        <w:t>Entry AVG</w:t>
-      </w:r>
-      <w:r>
-        <w:t xml:space="preserve"> – The average for the current entry of the player.</w:t>
+        <w:t xml:space="preserve">Handicap Total </w:t>
+      </w:r>
+      <w:r>
+        <w:t>– The player’s total score after handicaps are taken into account.</w:t>
       </w:r>
     </w:p>
     <w:p>
@@ -11621,12 +11300,11 @@
         <w:rPr>
           <w:noProof/>
         </w:rPr>
-        <w:lastRenderedPageBreak/>
         <w:drawing>
-          <wp:inline distT="0" distB="0" distL="0" distR="0" wp14:anchorId="13E6B45B" wp14:editId="14A1B0A6">
-            <wp:extent cx="533400" cy="733425"/>
+          <wp:inline distT="0" distB="0" distL="0" distR="0" wp14:anchorId="1C4ED64A" wp14:editId="177F90E7">
+            <wp:extent cx="533400" cy="752475"/>
             <wp:effectExtent l="0" t="0" r="0" b="9525"/>
-            <wp:docPr id="41" name="Picture 41"/>
+            <wp:docPr id="40" name="Picture 40"/>
             <wp:cNvGraphicFramePr>
               <a:graphicFrameLocks xmlns:a="http://schemas.openxmlformats.org/drawingml/2006/main" noChangeAspect="1"/>
             </wp:cNvGraphicFramePr>
@@ -11646,7 +11324,7 @@
                   <pic:spPr>
                     <a:xfrm>
                       <a:off x="0" y="0"/>
-                      <a:ext cx="533400" cy="733425"/>
+                      <a:ext cx="533400" cy="752475"/>
                     </a:xfrm>
                     <a:prstGeom prst="rect">
                       <a:avLst/>
@@ -11673,10 +11351,10 @@
           <w:b/>
           <w:u w:val="single"/>
         </w:rPr>
-        <w:t>30 Entry AVG</w:t>
-      </w:r>
-      <w:r>
-        <w:t xml:space="preserve"> – The average for the last 30 entries of the player.</w:t>
+        <w:t>Entry AVG</w:t>
+      </w:r>
+      <w:r>
+        <w:t xml:space="preserve"> – The average for the current entry of the player.</w:t>
       </w:r>
     </w:p>
     <w:p>
@@ -11689,11 +11367,12 @@
         <w:rPr>
           <w:noProof/>
         </w:rPr>
+        <w:lastRenderedPageBreak/>
         <w:drawing>
-          <wp:inline distT="0" distB="0" distL="0" distR="0" wp14:anchorId="1A027C84" wp14:editId="6C6F8DDF">
-            <wp:extent cx="514350" cy="781050"/>
-            <wp:effectExtent l="0" t="0" r="0" b="0"/>
-            <wp:docPr id="42" name="Picture 42"/>
+          <wp:inline distT="0" distB="0" distL="0" distR="0" wp14:anchorId="13E6B45B" wp14:editId="14A1B0A6">
+            <wp:extent cx="533400" cy="733425"/>
+            <wp:effectExtent l="0" t="0" r="0" b="9525"/>
+            <wp:docPr id="41" name="Picture 41"/>
             <wp:cNvGraphicFramePr>
               <a:graphicFrameLocks xmlns:a="http://schemas.openxmlformats.org/drawingml/2006/main" noChangeAspect="1"/>
             </wp:cNvGraphicFramePr>
@@ -11713,7 +11392,7 @@
                   <pic:spPr>
                     <a:xfrm>
                       <a:off x="0" y="0"/>
-                      <a:ext cx="514350" cy="781050"/>
+                      <a:ext cx="533400" cy="733425"/>
                     </a:xfrm>
                     <a:prstGeom prst="rect">
                       <a:avLst/>
@@ -11740,13 +11419,10 @@
           <w:b/>
           <w:u w:val="single"/>
         </w:rPr>
-        <w:t>ADJ AVG</w:t>
-      </w:r>
-      <w:r>
-        <w:t xml:space="preserve"> – Adjusted Average.</w:t>
-      </w:r>
-      <w:r>
-        <w:t xml:space="preserve"> An average that must be manually entered by the director.</w:t>
+        <w:t>30 Entry AVG</w:t>
+      </w:r>
+      <w:r>
+        <w:t xml:space="preserve"> – The average for the last 30 entries of the player.</w:t>
       </w:r>
     </w:p>
     <w:p>
@@ -11760,10 +11436,10 @@
           <w:noProof/>
         </w:rPr>
         <w:drawing>
-          <wp:inline distT="0" distB="0" distL="0" distR="0" wp14:anchorId="0EA28D84" wp14:editId="0D1BAAD7">
-            <wp:extent cx="514350" cy="762000"/>
+          <wp:inline distT="0" distB="0" distL="0" distR="0" wp14:anchorId="1A027C84" wp14:editId="6C6F8DDF">
+            <wp:extent cx="514350" cy="781050"/>
             <wp:effectExtent l="0" t="0" r="0" b="0"/>
-            <wp:docPr id="43" name="Picture 43"/>
+            <wp:docPr id="42" name="Picture 42"/>
             <wp:cNvGraphicFramePr>
               <a:graphicFrameLocks xmlns:a="http://schemas.openxmlformats.org/drawingml/2006/main" noChangeAspect="1"/>
             </wp:cNvGraphicFramePr>
@@ -11783,7 +11459,7 @@
                   <pic:spPr>
                     <a:xfrm>
                       <a:off x="0" y="0"/>
-                      <a:ext cx="514350" cy="762000"/>
+                      <a:ext cx="514350" cy="781050"/>
                     </a:xfrm>
                     <a:prstGeom prst="rect">
                       <a:avLst/>
@@ -11810,13 +11486,13 @@
           <w:b/>
           <w:u w:val="single"/>
         </w:rPr>
-        <w:t>Director Check</w:t>
-      </w:r>
-      <w:r>
-        <w:t xml:space="preserve"> – Checkbox to confirm a director has checked and validated</w:t>
-      </w:r>
-      <w:r>
-        <w:t xml:space="preserve"> a player’s score.</w:t>
+        <w:t>ADJ AVG</w:t>
+      </w:r>
+      <w:r>
+        <w:t xml:space="preserve"> – Adjusted Average.</w:t>
+      </w:r>
+      <w:r>
+        <w:t xml:space="preserve"> An average that must be manually entered by the director.</w:t>
       </w:r>
     </w:p>
     <w:p>
@@ -11830,10 +11506,10 @@
           <w:noProof/>
         </w:rPr>
         <w:drawing>
-          <wp:inline distT="0" distB="0" distL="0" distR="0" wp14:anchorId="7975C22F" wp14:editId="35A77B3D">
-            <wp:extent cx="542925" cy="733425"/>
-            <wp:effectExtent l="0" t="0" r="9525" b="9525"/>
-            <wp:docPr id="45" name="Picture 45"/>
+          <wp:inline distT="0" distB="0" distL="0" distR="0" wp14:anchorId="0EA28D84" wp14:editId="0D1BAAD7">
+            <wp:extent cx="514350" cy="762000"/>
+            <wp:effectExtent l="0" t="0" r="0" b="0"/>
+            <wp:docPr id="43" name="Picture 43"/>
             <wp:cNvGraphicFramePr>
               <a:graphicFrameLocks xmlns:a="http://schemas.openxmlformats.org/drawingml/2006/main" noChangeAspect="1"/>
             </wp:cNvGraphicFramePr>
@@ -11853,7 +11529,7 @@
                   <pic:spPr>
                     <a:xfrm>
                       <a:off x="0" y="0"/>
-                      <a:ext cx="542925" cy="733425"/>
+                      <a:ext cx="514350" cy="762000"/>
                     </a:xfrm>
                     <a:prstGeom prst="rect">
                       <a:avLst/>
@@ -11874,33 +11550,19 @@
           <w:ilvl w:val="0"/>
           <w:numId w:val="50"/>
         </w:numPr>
+      </w:pPr>
+      <w:r>
         <w:rPr>
           <w:b/>
           <w:u w:val="single"/>
         </w:rPr>
-      </w:pPr>
-      <w:r>
-        <w:rPr>
-          <w:b/>
-          <w:u w:val="single"/>
-        </w:rPr>
-        <w:t>Squad</w:t>
-      </w:r>
-      <w:r>
-        <w:rPr>
-          <w:b/>
-          <w:u w:val="single"/>
-        </w:rPr>
-        <w:t xml:space="preserve"> </w:t>
-      </w:r>
-      <w:r>
-        <w:t>–</w:t>
-      </w:r>
-      <w:r>
-        <w:t xml:space="preserve"> T</w:t>
-      </w:r>
-      <w:r>
-        <w:t>he squad of this player’s game.</w:t>
+        <w:t>Director Check</w:t>
+      </w:r>
+      <w:r>
+        <w:t xml:space="preserve"> – Checkbox to confirm a director has checked and validated</w:t>
+      </w:r>
+      <w:r>
+        <w:t xml:space="preserve"> a player’s score.</w:t>
       </w:r>
     </w:p>
     <w:p>
@@ -11908,20 +11570,16 @@
         <w:pStyle w:val="BodyText"/>
         <w:keepNext/>
         <w:ind w:left="720"/>
-        <w:rPr>
-          <w:b/>
-          <w:u w:val="single"/>
-        </w:rPr>
       </w:pPr>
       <w:r>
         <w:rPr>
           <w:noProof/>
         </w:rPr>
         <w:drawing>
-          <wp:inline distT="0" distB="0" distL="0" distR="0" wp14:anchorId="752F97DE" wp14:editId="3DE20F24">
-            <wp:extent cx="504825" cy="781050"/>
-            <wp:effectExtent l="0" t="0" r="9525" b="0"/>
-            <wp:docPr id="46" name="Picture 46"/>
+          <wp:inline distT="0" distB="0" distL="0" distR="0" wp14:anchorId="7975C22F" wp14:editId="35A77B3D">
+            <wp:extent cx="542925" cy="733425"/>
+            <wp:effectExtent l="0" t="0" r="9525" b="9525"/>
+            <wp:docPr id="45" name="Picture 45"/>
             <wp:cNvGraphicFramePr>
               <a:graphicFrameLocks xmlns:a="http://schemas.openxmlformats.org/drawingml/2006/main" noChangeAspect="1"/>
             </wp:cNvGraphicFramePr>
@@ -11941,7 +11599,7 @@
                   <pic:spPr>
                     <a:xfrm>
                       <a:off x="0" y="0"/>
-                      <a:ext cx="504825" cy="781050"/>
+                      <a:ext cx="542925" cy="733425"/>
                     </a:xfrm>
                     <a:prstGeom prst="rect">
                       <a:avLst/>
@@ -11972,10 +11630,23 @@
           <w:b/>
           <w:u w:val="single"/>
         </w:rPr>
-        <w:t xml:space="preserve">Handicap </w:t>
-      </w:r>
-      <w:r>
-        <w:t>– The player’s current handicap.</w:t>
+        <w:t>Squad</w:t>
+      </w:r>
+      <w:r>
+        <w:rPr>
+          <w:b/>
+          <w:u w:val="single"/>
+        </w:rPr>
+        <w:t xml:space="preserve"> </w:t>
+      </w:r>
+      <w:r>
+        <w:t>–</w:t>
+      </w:r>
+      <w:r>
+        <w:t xml:space="preserve"> T</w:t>
+      </w:r>
+      <w:r>
+        <w:t>he squad of this player’s game.</w:t>
       </w:r>
     </w:p>
     <w:p>
@@ -11993,10 +11664,10 @@
           <w:noProof/>
         </w:rPr>
         <w:drawing>
-          <wp:inline distT="0" distB="0" distL="0" distR="0" wp14:anchorId="246BBCB5" wp14:editId="5433436B">
-            <wp:extent cx="561975" cy="762000"/>
+          <wp:inline distT="0" distB="0" distL="0" distR="0" wp14:anchorId="752F97DE" wp14:editId="3DE20F24">
+            <wp:extent cx="504825" cy="781050"/>
             <wp:effectExtent l="0" t="0" r="9525" b="0"/>
-            <wp:docPr id="47" name="Picture 47"/>
+            <wp:docPr id="46" name="Picture 46"/>
             <wp:cNvGraphicFramePr>
               <a:graphicFrameLocks xmlns:a="http://schemas.openxmlformats.org/drawingml/2006/main" noChangeAspect="1"/>
             </wp:cNvGraphicFramePr>
@@ -12016,7 +11687,7 @@
                   <pic:spPr>
                     <a:xfrm>
                       <a:off x="0" y="0"/>
-                      <a:ext cx="561975" cy="762000"/>
+                      <a:ext cx="504825" cy="781050"/>
                     </a:xfrm>
                     <a:prstGeom prst="rect">
                       <a:avLst/>
@@ -12047,10 +11718,10 @@
           <w:b/>
           <w:u w:val="single"/>
         </w:rPr>
-        <w:t>Bonus</w:t>
-      </w:r>
-      <w:r>
-        <w:t xml:space="preserve"> – Current player’s bonus.</w:t>
+        <w:t xml:space="preserve">Handicap </w:t>
+      </w:r>
+      <w:r>
+        <w:t>– The player’s current handicap.</w:t>
       </w:r>
     </w:p>
     <w:p>
@@ -12067,12 +11738,11 @@
         <w:rPr>
           <w:noProof/>
         </w:rPr>
-        <w:lastRenderedPageBreak/>
         <w:drawing>
-          <wp:inline distT="0" distB="0" distL="0" distR="0" wp14:anchorId="4DAE4DA4" wp14:editId="32E56A64">
-            <wp:extent cx="533400" cy="752475"/>
-            <wp:effectExtent l="0" t="0" r="0" b="9525"/>
-            <wp:docPr id="48" name="Picture 48"/>
+          <wp:inline distT="0" distB="0" distL="0" distR="0" wp14:anchorId="246BBCB5" wp14:editId="5433436B">
+            <wp:extent cx="561975" cy="762000"/>
+            <wp:effectExtent l="0" t="0" r="9525" b="0"/>
+            <wp:docPr id="47" name="Picture 47"/>
             <wp:cNvGraphicFramePr>
               <a:graphicFrameLocks xmlns:a="http://schemas.openxmlformats.org/drawingml/2006/main" noChangeAspect="1"/>
             </wp:cNvGraphicFramePr>
@@ -12092,7 +11762,7 @@
                   <pic:spPr>
                     <a:xfrm>
                       <a:off x="0" y="0"/>
-                      <a:ext cx="533400" cy="752475"/>
+                      <a:ext cx="561975" cy="762000"/>
                     </a:xfrm>
                     <a:prstGeom prst="rect">
                       <a:avLst/>
@@ -12123,17 +11793,10 @@
           <w:b/>
           <w:u w:val="single"/>
         </w:rPr>
-        <w:t xml:space="preserve"> Pro Pot</w:t>
-      </w:r>
-      <w:r>
-        <w:rPr>
-          <w:i/>
-          <w:u w:val="single"/>
-        </w:rPr>
-        <w:t xml:space="preserve"> </w:t>
-      </w:r>
-      <w:r>
-        <w:t>– Needs work</w:t>
+        <w:t>Bonus</w:t>
+      </w:r>
+      <w:r>
+        <w:t xml:space="preserve"> – Current player’s bonus.</w:t>
       </w:r>
     </w:p>
     <w:p>
@@ -12150,11 +11813,12 @@
         <w:rPr>
           <w:noProof/>
         </w:rPr>
+        <w:lastRenderedPageBreak/>
         <w:drawing>
-          <wp:inline distT="0" distB="0" distL="0" distR="0" wp14:anchorId="262F41B1" wp14:editId="7DF7E216">
-            <wp:extent cx="533400" cy="733425"/>
+          <wp:inline distT="0" distB="0" distL="0" distR="0" wp14:anchorId="4DAE4DA4" wp14:editId="32E56A64">
+            <wp:extent cx="533400" cy="752475"/>
             <wp:effectExtent l="0" t="0" r="0" b="9525"/>
-            <wp:docPr id="49" name="Picture 49"/>
+            <wp:docPr id="48" name="Picture 48"/>
             <wp:cNvGraphicFramePr>
               <a:graphicFrameLocks xmlns:a="http://schemas.openxmlformats.org/drawingml/2006/main" noChangeAspect="1"/>
             </wp:cNvGraphicFramePr>
@@ -12174,7 +11838,7 @@
                   <pic:spPr>
                     <a:xfrm>
                       <a:off x="0" y="0"/>
-                      <a:ext cx="533400" cy="733425"/>
+                      <a:ext cx="533400" cy="752475"/>
                     </a:xfrm>
                     <a:prstGeom prst="rect">
                       <a:avLst/>
@@ -12205,13 +11869,17 @@
           <w:b/>
           <w:u w:val="single"/>
         </w:rPr>
-        <w:t>Notes</w:t>
-      </w:r>
-      <w:r>
-        <w:t xml:space="preserve"> – notes on the cur</w:t>
-      </w:r>
-      <w:r>
-        <w:t>rent player.</w:t>
+        <w:t xml:space="preserve"> Pro Pot</w:t>
+      </w:r>
+      <w:r>
+        <w:rPr>
+          <w:i/>
+          <w:u w:val="single"/>
+        </w:rPr>
+        <w:t xml:space="preserve"> </w:t>
+      </w:r>
+      <w:r>
+        <w:t>– Needs work</w:t>
       </w:r>
     </w:p>
     <w:p>
@@ -12229,10 +11897,10 @@
           <w:noProof/>
         </w:rPr>
         <w:drawing>
-          <wp:inline distT="0" distB="0" distL="0" distR="0" wp14:anchorId="29A96E70" wp14:editId="63FE8FAF">
+          <wp:inline distT="0" distB="0" distL="0" distR="0" wp14:anchorId="262F41B1" wp14:editId="7DF7E216">
             <wp:extent cx="533400" cy="733425"/>
             <wp:effectExtent l="0" t="0" r="0" b="9525"/>
-            <wp:docPr id="50" name="Picture 50"/>
+            <wp:docPr id="49" name="Picture 49"/>
             <wp:cNvGraphicFramePr>
               <a:graphicFrameLocks xmlns:a="http://schemas.openxmlformats.org/drawingml/2006/main" noChangeAspect="1"/>
             </wp:cNvGraphicFramePr>
@@ -12267,6 +11935,84 @@
     </w:p>
     <w:p>
       <w:pPr>
+        <w:pStyle w:val="BodyText"/>
+        <w:keepNext/>
+        <w:numPr>
+          <w:ilvl w:val="0"/>
+          <w:numId w:val="50"/>
+        </w:numPr>
+        <w:rPr>
+          <w:b/>
+          <w:u w:val="single"/>
+        </w:rPr>
+      </w:pPr>
+      <w:r>
+        <w:rPr>
+          <w:b/>
+          <w:u w:val="single"/>
+        </w:rPr>
+        <w:t>Notes</w:t>
+      </w:r>
+      <w:r>
+        <w:t xml:space="preserve"> – notes on the cur</w:t>
+      </w:r>
+      <w:r>
+        <w:t>rent player.</w:t>
+      </w:r>
+    </w:p>
+    <w:p>
+      <w:pPr>
+        <w:pStyle w:val="BodyText"/>
+        <w:keepNext/>
+        <w:ind w:left="720"/>
+        <w:rPr>
+          <w:b/>
+          <w:u w:val="single"/>
+        </w:rPr>
+      </w:pPr>
+      <w:r>
+        <w:rPr>
+          <w:noProof/>
+        </w:rPr>
+        <w:drawing>
+          <wp:inline distT="0" distB="0" distL="0" distR="0" wp14:anchorId="29A96E70" wp14:editId="63FE8FAF">
+            <wp:extent cx="533400" cy="733425"/>
+            <wp:effectExtent l="0" t="0" r="0" b="9525"/>
+            <wp:docPr id="50" name="Picture 50"/>
+            <wp:cNvGraphicFramePr>
+              <a:graphicFrameLocks xmlns:a="http://schemas.openxmlformats.org/drawingml/2006/main" noChangeAspect="1"/>
+            </wp:cNvGraphicFramePr>
+            <a:graphic xmlns:a="http://schemas.openxmlformats.org/drawingml/2006/main">
+              <a:graphicData uri="http://schemas.openxmlformats.org/drawingml/2006/picture">
+                <pic:pic xmlns:pic="http://schemas.openxmlformats.org/drawingml/2006/picture">
+                  <pic:nvPicPr>
+                    <pic:cNvPr id="1" name=""/>
+                    <pic:cNvPicPr/>
+                  </pic:nvPicPr>
+                  <pic:blipFill>
+                    <a:blip r:embed="rId49"/>
+                    <a:stretch>
+                      <a:fillRect/>
+                    </a:stretch>
+                  </pic:blipFill>
+                  <pic:spPr>
+                    <a:xfrm>
+                      <a:off x="0" y="0"/>
+                      <a:ext cx="533400" cy="733425"/>
+                    </a:xfrm>
+                    <a:prstGeom prst="rect">
+                      <a:avLst/>
+                    </a:prstGeom>
+                  </pic:spPr>
+                </pic:pic>
+              </a:graphicData>
+            </a:graphic>
+          </wp:inline>
+        </w:drawing>
+      </w:r>
+    </w:p>
+    <w:p>
+      <w:pPr>
         <w:pStyle w:val="Caption"/>
       </w:pPr>
     </w:p>
@@ -12348,7 +12094,7 @@
                     <pic:cNvPicPr/>
                   </pic:nvPicPr>
                   <pic:blipFill>
-                    <a:blip r:embed="rId49">
+                    <a:blip r:embed="rId50">
                       <a:extLst>
                         <a:ext uri="{28A0092B-C50C-407E-A947-70E740481C1C}">
                           <a14:useLocalDpi xmlns:a14="http://schemas.microsoft.com/office/drawing/2010/main" val="0"/>
@@ -12383,27 +12129,14 @@
       <w:r>
         <w:t xml:space="preserve">Figure </w:t>
       </w:r>
-      <w:r>
-        <w:fldChar w:fldCharType="begin"/>
-      </w:r>
-      <w:r>
-        <w:instrText xml:space="preserve"> SEQ Figure \* ARABIC </w:instrText>
-      </w:r>
-      <w:r>
-        <w:fldChar w:fldCharType="separate"/>
-      </w:r>
-      <w:r>
-        <w:rPr>
-          <w:noProof/>
-        </w:rPr>
-        <w:t>19</w:t>
-      </w:r>
-      <w:r>
-        <w:rPr>
-          <w:noProof/>
-        </w:rPr>
-        <w:fldChar w:fldCharType="end"/>
-      </w:r>
+      <w:fldSimple w:instr=" SEQ Figure \* ARABIC ">
+        <w:r>
+          <w:rPr>
+            <w:noProof/>
+          </w:rPr>
+          <w:t>19</w:t>
+        </w:r>
+      </w:fldSimple>
       <w:r>
         <w:t>: Update Inactive status</w:t>
       </w:r>
@@ -12650,6 +12383,15 @@
       </w:r>
       <w:r>
         <w:t>.</w:t>
+      </w:r>
+    </w:p>
+    <w:p>
+      <w:pPr>
+        <w:pStyle w:val="BodyText"/>
+        <w:keepNext/>
+      </w:pPr>
+      <w:r>
+        <w:t>NOTE: As of  7/30/2018 the program no longer seems to split into other windows as described above.</w:t>
       </w:r>
     </w:p>
     <w:p>
@@ -12677,7 +12419,7 @@
                     <pic:cNvPicPr/>
                   </pic:nvPicPr>
                   <pic:blipFill>
-                    <a:blip r:embed="rId50" cstate="print">
+                    <a:blip r:embed="rId51" cstate="print">
                       <a:extLst>
                         <a:ext uri="{28A0092B-C50C-407E-A947-70E740481C1C}">
                           <a14:useLocalDpi xmlns:a14="http://schemas.microsoft.com/office/drawing/2010/main" val="0"/>
@@ -12712,27 +12454,14 @@
       <w:r>
         <w:t xml:space="preserve">Figure </w:t>
       </w:r>
-      <w:r>
-        <w:fldChar w:fldCharType="begin"/>
-      </w:r>
-      <w:r>
-        <w:instrText xml:space="preserve"> SEQ Figure \* ARABIC </w:instrText>
-      </w:r>
-      <w:r>
-        <w:fldChar w:fldCharType="separate"/>
-      </w:r>
-      <w:r>
-        <w:rPr>
-          <w:noProof/>
-        </w:rPr>
-        <w:t>20</w:t>
-      </w:r>
-      <w:r>
-        <w:rPr>
-          <w:noProof/>
-        </w:rPr>
-        <w:fldChar w:fldCharType="end"/>
-      </w:r>
+      <w:fldSimple w:instr=" SEQ Figure \* ARABIC ">
+        <w:r>
+          <w:rPr>
+            <w:noProof/>
+          </w:rPr>
+          <w:t>20</w:t>
+        </w:r>
+      </w:fldSimple>
       <w:r>
         <w:t xml:space="preserve"> Showing split screen error</w:t>
       </w:r>
@@ -12800,27 +12529,14 @@
                             <w:r>
                               <w:t xml:space="preserve">Figure </w:t>
                             </w:r>
-                            <w:r>
-                              <w:fldChar w:fldCharType="begin"/>
-                            </w:r>
-                            <w:r>
-                              <w:instrText xml:space="preserve"> SEQ Figure \* ARABIC </w:instrText>
-                            </w:r>
-                            <w:r>
-                              <w:fldChar w:fldCharType="separate"/>
-                            </w:r>
-                            <w:r>
-                              <w:rPr>
-                                <w:noProof/>
-                              </w:rPr>
-                              <w:t>21</w:t>
-                            </w:r>
-                            <w:r>
-                              <w:rPr>
-                                <w:noProof/>
-                              </w:rPr>
-                              <w:fldChar w:fldCharType="end"/>
-                            </w:r>
+                            <w:fldSimple w:instr=" SEQ Figure \* ARABIC ">
+                              <w:r>
+                                <w:rPr>
+                                  <w:noProof/>
+                                </w:rPr>
+                                <w:t>21</w:t>
+                              </w:r>
+                            </w:fldSimple>
                             <w:r>
                               <w:t xml:space="preserve"> Inner screen maximize</w:t>
                             </w:r>
@@ -12862,27 +12578,14 @@
                       <w:r>
                         <w:t xml:space="preserve">Figure </w:t>
                       </w:r>
-                      <w:r>
-                        <w:fldChar w:fldCharType="begin"/>
-                      </w:r>
-                      <w:r>
-                        <w:instrText xml:space="preserve"> SEQ Figure \* ARABIC </w:instrText>
-                      </w:r>
-                      <w:r>
-                        <w:fldChar w:fldCharType="separate"/>
-                      </w:r>
-                      <w:r>
-                        <w:rPr>
-                          <w:noProof/>
-                        </w:rPr>
-                        <w:t>21</w:t>
-                      </w:r>
-                      <w:r>
-                        <w:rPr>
-                          <w:noProof/>
-                        </w:rPr>
-                        <w:fldChar w:fldCharType="end"/>
-                      </w:r>
+                      <w:fldSimple w:instr=" SEQ Figure \* ARABIC ">
+                        <w:r>
+                          <w:rPr>
+                            <w:noProof/>
+                          </w:rPr>
+                          <w:t>21</w:t>
+                        </w:r>
+                      </w:fldSimple>
                       <w:r>
                         <w:t xml:space="preserve"> Inner screen maximize</w:t>
                       </w:r>
@@ -12923,7 +12626,7 @@
                     <pic:cNvPicPr/>
                   </pic:nvPicPr>
                   <pic:blipFill>
-                    <a:blip r:embed="rId51">
+                    <a:blip r:embed="rId52">
                       <a:extLst>
                         <a:ext uri="{28A0092B-C50C-407E-A947-70E740481C1C}">
                           <a14:useLocalDpi xmlns:a14="http://schemas.microsoft.com/office/drawing/2010/main" val="0"/>
@@ -12950,11 +12653,7 @@
         </w:drawing>
       </w:r>
       <w:r>
-        <w:t xml:space="preserve">If the display splits, you can click maximize for the individual screens. They will return to normal. </w:t>
-      </w:r>
-      <w:r>
-        <w:lastRenderedPageBreak/>
-        <w:t>You can then continue working with the program.</w:t>
+        <w:t>If the display splits, you can click maximize for the individual screens. They will return to normal. You can then continue working with the program.</w:t>
       </w:r>
     </w:p>
     <w:p>
@@ -16468,9 +16167,9 @@
     <w:p>
       <w:pPr>
         <w:sectPr>
-          <w:headerReference w:type="default" r:id="rId52"/>
-          <w:footerReference w:type="default" r:id="rId53"/>
-          <w:headerReference w:type="first" r:id="rId54"/>
+          <w:headerReference w:type="default" r:id="rId53"/>
+          <w:footerReference w:type="default" r:id="rId54"/>
+          <w:headerReference w:type="first" r:id="rId55"/>
           <w:type w:val="continuous"/>
           <w:pgSz w:w="12240" w:h="15840" w:code="1"/>
           <w:pgMar w:top="1800" w:right="1195" w:bottom="1440" w:left="3355" w:header="720" w:footer="720" w:gutter="0"/>
@@ -17767,7 +17466,7 @@
 
 <file path=word/comments.xml><?xml version="1.0" encoding="utf-8"?>
 <w:comments xmlns:wpc="http://schemas.microsoft.com/office/word/2010/wordprocessingCanvas" xmlns:mc="http://schemas.openxmlformats.org/markup-compatibility/2006" xmlns:o="urn:schemas-microsoft-com:office:office" xmlns:r="http://schemas.openxmlformats.org/officeDocument/2006/relationships" xmlns:m="http://schemas.openxmlformats.org/officeDocument/2006/math" xmlns:v="urn:schemas-microsoft-com:vml" xmlns:wp14="http://schemas.microsoft.com/office/word/2010/wordprocessingDrawing" xmlns:wp="http://schemas.openxmlformats.org/drawingml/2006/wordprocessingDrawing" xmlns:w10="urn:schemas-microsoft-com:office:word" xmlns:w="http://schemas.openxmlformats.org/wordprocessingml/2006/main" xmlns:w14="http://schemas.microsoft.com/office/word/2010/wordml" xmlns:w15="http://schemas.microsoft.com/office/word/2012/wordml" xmlns:wpg="http://schemas.microsoft.com/office/word/2010/wordprocessingGroup" xmlns:wpi="http://schemas.microsoft.com/office/word/2010/wordprocessingInk" xmlns:wne="http://schemas.microsoft.com/office/word/2006/wordml" xmlns:wps="http://schemas.microsoft.com/office/word/2010/wordprocessingShape" mc:Ignorable="w14 w15 wp14">
-  <w:comment w:id="40" w:author="Timothy Fair" w:date="2018-07-25T14:36:00Z" w:initials="TF">
+  <w:comment w:id="41" w:author="Timothy Fair" w:date="2018-07-25T14:36:00Z" w:initials="TF">
     <w:p>
       <w:pPr>
         <w:pStyle w:val="CommentText"/>
@@ -17924,7 +17623,7 @@
         <w:rStyle w:val="PageNumber"/>
         <w:noProof/>
       </w:rPr>
-      <w:t>32</w:t>
+      <w:t>20</w:t>
     </w:r>
     <w:r>
       <w:rPr>
@@ -17974,7 +17673,7 @@
         <w:rStyle w:val="PageNumber"/>
         <w:noProof/>
       </w:rPr>
-      <w:t>44</w:t>
+      <w:t>43</w:t>
     </w:r>
     <w:r>
       <w:rPr>
@@ -22137,7 +21836,7 @@
 </file>
 
 <file path=customXml/itemProps1.xml><?xml version="1.0" encoding="utf-8"?>
-<ds:datastoreItem xmlns:ds="http://schemas.openxmlformats.org/officeDocument/2006/customXml" ds:itemID="{175123AF-0B56-4B10-BA86-7AB4D29D79B5}">
+<ds:datastoreItem xmlns:ds="http://schemas.openxmlformats.org/officeDocument/2006/customXml" ds:itemID="{C560B855-FFAF-45DA-AEB0-3014908E87D5}">
   <ds:schemaRefs>
     <ds:schemaRef ds:uri="http://schemas.openxmlformats.org/officeDocument/2006/bibliography"/>
   </ds:schemaRefs>

</xml_diff>

<commit_message>
Updated reference  photo of Create/Edit tournament in the manual. added more concise instructions for creating a tournament.
</commit_message>
<xml_diff>
--- a/9tapUserManual.docx
+++ b/9tapUserManual.docx
@@ -1471,7 +1471,7 @@
                 <w:noProof/>
                 <w:webHidden/>
               </w:rPr>
-              <w:t>12</w:t>
+              <w:t>13</w:t>
             </w:r>
             <w:r>
               <w:rPr>
@@ -1542,7 +1542,7 @@
                 <w:noProof/>
                 <w:webHidden/>
               </w:rPr>
-              <w:t>12</w:t>
+              <w:t>13</w:t>
             </w:r>
             <w:r>
               <w:rPr>
@@ -1613,7 +1613,7 @@
                 <w:noProof/>
                 <w:webHidden/>
               </w:rPr>
-              <w:t>13</w:t>
+              <w:t>14</w:t>
             </w:r>
             <w:r>
               <w:rPr>
@@ -2299,7 +2299,7 @@
                 <w:noProof/>
                 <w:webHidden/>
               </w:rPr>
-              <w:t>20</w:t>
+              <w:t>21</w:t>
             </w:r>
             <w:r>
               <w:rPr>
@@ -2580,7 +2580,7 @@
                 <w:noProof/>
                 <w:webHidden/>
               </w:rPr>
-              <w:t>21</w:t>
+              <w:t>22</w:t>
             </w:r>
             <w:r>
               <w:rPr>
@@ -2716,7 +2716,7 @@
                 <w:noProof/>
                 <w:webHidden/>
               </w:rPr>
-              <w:t>22</w:t>
+              <w:t>23</w:t>
             </w:r>
             <w:r>
               <w:rPr>
@@ -2784,7 +2784,7 @@
                 <w:noProof/>
                 <w:webHidden/>
               </w:rPr>
-              <w:t>23</w:t>
+              <w:t>24</w:t>
             </w:r>
             <w:r>
               <w:rPr>
@@ -2852,7 +2852,7 @@
                 <w:noProof/>
                 <w:webHidden/>
               </w:rPr>
-              <w:t>23</w:t>
+              <w:t>24</w:t>
             </w:r>
             <w:r>
               <w:rPr>
@@ -2920,7 +2920,7 @@
                 <w:noProof/>
                 <w:webHidden/>
               </w:rPr>
-              <w:t>24</w:t>
+              <w:t>25</w:t>
             </w:r>
             <w:r>
               <w:rPr>
@@ -2991,7 +2991,7 @@
                 <w:noProof/>
                 <w:webHidden/>
               </w:rPr>
-              <w:t>29</w:t>
+              <w:t>30</w:t>
             </w:r>
             <w:r>
               <w:rPr>
@@ -3062,7 +3062,7 @@
                 <w:noProof/>
                 <w:webHidden/>
               </w:rPr>
-              <w:t>31</w:t>
+              <w:t>32</w:t>
             </w:r>
             <w:r>
               <w:rPr>
@@ -3130,7 +3130,7 @@
                 <w:noProof/>
                 <w:webHidden/>
               </w:rPr>
-              <w:t>31</w:t>
+              <w:t>32</w:t>
             </w:r>
             <w:r>
               <w:rPr>
@@ -3198,7 +3198,7 @@
                 <w:noProof/>
                 <w:webHidden/>
               </w:rPr>
-              <w:t>31</w:t>
+              <w:t>32</w:t>
             </w:r>
             <w:r>
               <w:rPr>
@@ -3266,7 +3266,7 @@
                 <w:noProof/>
                 <w:webHidden/>
               </w:rPr>
-              <w:t>33</w:t>
+              <w:t>34</w:t>
             </w:r>
             <w:r>
               <w:rPr>
@@ -3337,7 +3337,7 @@
                 <w:noProof/>
                 <w:webHidden/>
               </w:rPr>
-              <w:t>35</w:t>
+              <w:t>36</w:t>
             </w:r>
             <w:r>
               <w:rPr>
@@ -3408,7 +3408,7 @@
                 <w:noProof/>
                 <w:webHidden/>
               </w:rPr>
-              <w:t>37</w:t>
+              <w:t>38</w:t>
             </w:r>
             <w:r>
               <w:rPr>
@@ -3476,7 +3476,7 @@
                 <w:noProof/>
                 <w:webHidden/>
               </w:rPr>
-              <w:t>37</w:t>
+              <w:t>38</w:t>
             </w:r>
             <w:r>
               <w:rPr>
@@ -3544,7 +3544,7 @@
                 <w:noProof/>
                 <w:webHidden/>
               </w:rPr>
-              <w:t>37</w:t>
+              <w:t>38</w:t>
             </w:r>
             <w:r>
               <w:rPr>
@@ -3612,7 +3612,7 @@
                 <w:noProof/>
                 <w:webHidden/>
               </w:rPr>
-              <w:t>39</w:t>
+              <w:t>40</w:t>
             </w:r>
             <w:r>
               <w:rPr>
@@ -3680,7 +3680,7 @@
                 <w:noProof/>
                 <w:webHidden/>
               </w:rPr>
-              <w:t>42</w:t>
+              <w:t>43</w:t>
             </w:r>
             <w:r>
               <w:rPr>
@@ -3748,7 +3748,7 @@
                 <w:noProof/>
                 <w:webHidden/>
               </w:rPr>
-              <w:t>42</w:t>
+              <w:t>43</w:t>
             </w:r>
             <w:r>
               <w:rPr>
@@ -3816,7 +3816,7 @@
                 <w:noProof/>
                 <w:webHidden/>
               </w:rPr>
-              <w:t>42</w:t>
+              <w:t>43</w:t>
             </w:r>
             <w:r>
               <w:rPr>
@@ -3884,7 +3884,7 @@
                 <w:noProof/>
                 <w:webHidden/>
               </w:rPr>
-              <w:t>43</w:t>
+              <w:t>44</w:t>
             </w:r>
             <w:r>
               <w:rPr>
@@ -4339,7 +4339,7 @@
             <v:path o:extrusionok="f" gradientshapeok="t" o:connecttype="rect"/>
             <o:lock v:ext="edit" aspectratio="t"/>
           </v:shapetype>
-          <v:shape id="_x0000_i1026" type="#_x0000_t75" style="width:383.25pt;height:195pt">
+          <v:shape id="_x0000_i1025" type="#_x0000_t75" style="width:383.25pt;height:195pt">
             <v:imagedata r:id="rId14" o:title="9TapMainMenu"/>
           </v:shape>
         </w:pict>
@@ -4353,14 +4353,27 @@
       <w:r>
         <w:t xml:space="preserve">Figure </w:t>
       </w:r>
-      <w:fldSimple w:instr=" SEQ Figure \* ARABIC ">
-        <w:r>
-          <w:rPr>
-            <w:noProof/>
-          </w:rPr>
-          <w:t>1</w:t>
-        </w:r>
-      </w:fldSimple>
+      <w:r>
+        <w:fldChar w:fldCharType="begin"/>
+      </w:r>
+      <w:r>
+        <w:instrText xml:space="preserve"> SEQ Figure \* ARABIC </w:instrText>
+      </w:r>
+      <w:r>
+        <w:fldChar w:fldCharType="separate"/>
+      </w:r>
+      <w:r>
+        <w:rPr>
+          <w:noProof/>
+        </w:rPr>
+        <w:t>1</w:t>
+      </w:r>
+      <w:r>
+        <w:rPr>
+          <w:noProof/>
+        </w:rPr>
+        <w:fldChar w:fldCharType="end"/>
+      </w:r>
       <w:r>
         <w:t>: 9-Tap Main Menu</w:t>
       </w:r>
@@ -6182,8 +6195,6 @@
       <w:r>
         <w:t xml:space="preserve"> The Delete Region Data button will delete all data from the selected regions’ database. The user will be prompted upon clicking this button to make sure if they want to delete this data.</w:t>
       </w:r>
-      <w:bookmarkStart w:id="17" w:name="_GoBack"/>
-      <w:bookmarkEnd w:id="17"/>
     </w:p>
     <w:p>
       <w:pPr>
@@ -6252,14 +6263,27 @@
       <w:r>
         <w:t xml:space="preserve">Figure </w:t>
       </w:r>
-      <w:fldSimple w:instr=" SEQ Figure \* ARABIC ">
-        <w:r>
-          <w:rPr>
-            <w:noProof/>
-          </w:rPr>
-          <w:t>2</w:t>
-        </w:r>
-      </w:fldSimple>
+      <w:r>
+        <w:fldChar w:fldCharType="begin"/>
+      </w:r>
+      <w:r>
+        <w:instrText xml:space="preserve"> SEQ Figure \* ARABIC </w:instrText>
+      </w:r>
+      <w:r>
+        <w:fldChar w:fldCharType="separate"/>
+      </w:r>
+      <w:r>
+        <w:rPr>
+          <w:noProof/>
+        </w:rPr>
+        <w:t>2</w:t>
+      </w:r>
+      <w:r>
+        <w:rPr>
+          <w:noProof/>
+        </w:rPr>
+        <w:fldChar w:fldCharType="end"/>
+      </w:r>
       <w:r>
         <w:t>: Main Menu</w:t>
       </w:r>
@@ -6324,12 +6348,12 @@
       <w:pPr>
         <w:pStyle w:val="Heading1"/>
       </w:pPr>
-      <w:bookmarkStart w:id="18" w:name="_Toc509165844"/>
+      <w:bookmarkStart w:id="17" w:name="_Toc509165844"/>
       <w:r>
         <w:lastRenderedPageBreak/>
         <w:t>Member Info</w:t>
       </w:r>
-      <w:bookmarkEnd w:id="18"/>
+      <w:bookmarkEnd w:id="17"/>
       <w:r>
         <w:fldChar w:fldCharType="begin"/>
       </w:r>
@@ -6499,14 +6523,27 @@
       <w:r>
         <w:t xml:space="preserve">Figure </w:t>
       </w:r>
-      <w:fldSimple w:instr=" SEQ Figure \* ARABIC ">
-        <w:r>
-          <w:rPr>
-            <w:noProof/>
-          </w:rPr>
-          <w:t>3</w:t>
-        </w:r>
-      </w:fldSimple>
+      <w:r>
+        <w:fldChar w:fldCharType="begin"/>
+      </w:r>
+      <w:r>
+        <w:instrText xml:space="preserve"> SEQ Figure \* ARABIC </w:instrText>
+      </w:r>
+      <w:r>
+        <w:fldChar w:fldCharType="separate"/>
+      </w:r>
+      <w:r>
+        <w:rPr>
+          <w:noProof/>
+        </w:rPr>
+        <w:t>3</w:t>
+      </w:r>
+      <w:r>
+        <w:rPr>
+          <w:noProof/>
+        </w:rPr>
+        <w:fldChar w:fldCharType="end"/>
+      </w:r>
       <w:r>
         <w:t>: Member Information</w:t>
       </w:r>
@@ -6515,7 +6552,7 @@
       <w:pPr>
         <w:pStyle w:val="Heading3"/>
       </w:pPr>
-      <w:bookmarkStart w:id="19" w:name="_Toc509165845"/>
+      <w:bookmarkStart w:id="18" w:name="_Toc509165845"/>
       <w:r>
         <w:lastRenderedPageBreak/>
         <w:t>Import</w:t>
@@ -6554,7 +6591,7 @@
       <w:r>
         <w:t>Member</w:t>
       </w:r>
-      <w:bookmarkEnd w:id="19"/>
+      <w:bookmarkEnd w:id="18"/>
       <w:r>
         <w:fldChar w:fldCharType="begin"/>
       </w:r>
@@ -6679,11 +6716,11 @@
       <w:pPr>
         <w:pStyle w:val="Heading3"/>
       </w:pPr>
-      <w:bookmarkStart w:id="20" w:name="_Toc509165846"/>
+      <w:bookmarkStart w:id="19" w:name="_Toc509165846"/>
       <w:r>
         <w:t>New Members</w:t>
       </w:r>
-      <w:bookmarkEnd w:id="20"/>
+      <w:bookmarkEnd w:id="19"/>
       <w:r>
         <w:fldChar w:fldCharType="begin"/>
       </w:r>
@@ -7010,14 +7047,27 @@
         <w:lastRenderedPageBreak/>
         <w:t xml:space="preserve">Figure </w:t>
       </w:r>
-      <w:fldSimple w:instr=" SEQ Figure \* ARABIC ">
-        <w:r>
-          <w:rPr>
-            <w:noProof/>
-          </w:rPr>
-          <w:t>4</w:t>
-        </w:r>
-      </w:fldSimple>
+      <w:r>
+        <w:fldChar w:fldCharType="begin"/>
+      </w:r>
+      <w:r>
+        <w:instrText xml:space="preserve"> SEQ Figure \* ARABIC </w:instrText>
+      </w:r>
+      <w:r>
+        <w:fldChar w:fldCharType="separate"/>
+      </w:r>
+      <w:r>
+        <w:rPr>
+          <w:noProof/>
+        </w:rPr>
+        <w:t>4</w:t>
+      </w:r>
+      <w:r>
+        <w:rPr>
+          <w:noProof/>
+        </w:rPr>
+        <w:fldChar w:fldCharType="end"/>
+      </w:r>
       <w:r>
         <w:t>: Member Information</w:t>
       </w:r>
@@ -7026,14 +7076,14 @@
       <w:pPr>
         <w:pStyle w:val="Heading3"/>
       </w:pPr>
-      <w:bookmarkStart w:id="21" w:name="_Toc509165847"/>
+      <w:bookmarkStart w:id="20" w:name="_Toc509165847"/>
       <w:r>
         <w:t xml:space="preserve">Updating </w:t>
       </w:r>
       <w:r>
         <w:t>Members</w:t>
       </w:r>
-      <w:bookmarkEnd w:id="21"/>
+      <w:bookmarkEnd w:id="20"/>
       <w:r>
         <w:fldChar w:fldCharType="begin"/>
       </w:r>
@@ -7190,14 +7240,14 @@
           <w:szCs w:val="20"/>
         </w:rPr>
       </w:pPr>
-      <w:bookmarkStart w:id="22" w:name="_Toc509165848"/>
+      <w:bookmarkStart w:id="21" w:name="_Toc509165848"/>
       <w:r>
         <w:rPr>
           <w:szCs w:val="20"/>
         </w:rPr>
         <w:t>Stats</w:t>
       </w:r>
-      <w:bookmarkEnd w:id="22"/>
+      <w:bookmarkEnd w:id="21"/>
       <w:r>
         <w:rPr>
           <w:szCs w:val="20"/>
@@ -7390,14 +7440,27 @@
       <w:r>
         <w:t xml:space="preserve">Figure </w:t>
       </w:r>
-      <w:fldSimple w:instr=" SEQ Figure \* ARABIC ">
-        <w:r>
-          <w:rPr>
-            <w:noProof/>
-          </w:rPr>
-          <w:t>5</w:t>
-        </w:r>
-      </w:fldSimple>
+      <w:r>
+        <w:fldChar w:fldCharType="begin"/>
+      </w:r>
+      <w:r>
+        <w:instrText xml:space="preserve"> SEQ Figure \* ARABIC </w:instrText>
+      </w:r>
+      <w:r>
+        <w:fldChar w:fldCharType="separate"/>
+      </w:r>
+      <w:r>
+        <w:rPr>
+          <w:noProof/>
+        </w:rPr>
+        <w:t>5</w:t>
+      </w:r>
+      <w:r>
+        <w:rPr>
+          <w:noProof/>
+        </w:rPr>
+        <w:fldChar w:fldCharType="end"/>
+      </w:r>
       <w:r>
         <w:t>: Stats</w:t>
       </w:r>
@@ -7462,7 +7525,7 @@
           <w:szCs w:val="20"/>
         </w:rPr>
       </w:pPr>
-      <w:bookmarkStart w:id="23" w:name="_Toc509165849"/>
+      <w:bookmarkStart w:id="22" w:name="_Toc509165849"/>
       <w:r>
         <w:rPr>
           <w:szCs w:val="20"/>
@@ -7470,7 +7533,7 @@
         <w:lastRenderedPageBreak/>
         <w:t>Member Search</w:t>
       </w:r>
-      <w:bookmarkEnd w:id="23"/>
+      <w:bookmarkEnd w:id="22"/>
       <w:r>
         <w:rPr>
           <w:szCs w:val="20"/>
@@ -7702,14 +7765,27 @@
       <w:r>
         <w:t xml:space="preserve">Figure </w:t>
       </w:r>
-      <w:fldSimple w:instr=" SEQ Figure \* ARABIC ">
-        <w:r>
-          <w:rPr>
-            <w:noProof/>
-          </w:rPr>
-          <w:t>6</w:t>
-        </w:r>
-      </w:fldSimple>
+      <w:r>
+        <w:fldChar w:fldCharType="begin"/>
+      </w:r>
+      <w:r>
+        <w:instrText xml:space="preserve"> SEQ Figure \* ARABIC </w:instrText>
+      </w:r>
+      <w:r>
+        <w:fldChar w:fldCharType="separate"/>
+      </w:r>
+      <w:r>
+        <w:rPr>
+          <w:noProof/>
+        </w:rPr>
+        <w:t>6</w:t>
+      </w:r>
+      <w:r>
+        <w:rPr>
+          <w:noProof/>
+        </w:rPr>
+        <w:fldChar w:fldCharType="end"/>
+      </w:r>
       <w:r>
         <w:t>: Member search, blank and with results</w:t>
       </w:r>
@@ -7721,7 +7797,7 @@
           <w:szCs w:val="20"/>
         </w:rPr>
       </w:pPr>
-      <w:bookmarkStart w:id="24" w:name="_Toc509165850"/>
+      <w:bookmarkStart w:id="23" w:name="_Toc509165850"/>
       <w:r>
         <w:rPr>
           <w:szCs w:val="20"/>
@@ -7729,7 +7805,7 @@
         <w:lastRenderedPageBreak/>
         <w:t>Print Recaps</w:t>
       </w:r>
-      <w:bookmarkEnd w:id="24"/>
+      <w:bookmarkEnd w:id="23"/>
       <w:r>
         <w:rPr>
           <w:szCs w:val="20"/>
@@ -7917,14 +7993,27 @@
       <w:r>
         <w:t xml:space="preserve">Figure </w:t>
       </w:r>
-      <w:fldSimple w:instr=" SEQ Figure \* ARABIC ">
-        <w:r>
-          <w:rPr>
-            <w:noProof/>
-          </w:rPr>
-          <w:t>7</w:t>
-        </w:r>
-      </w:fldSimple>
+      <w:r>
+        <w:fldChar w:fldCharType="begin"/>
+      </w:r>
+      <w:r>
+        <w:instrText xml:space="preserve"> SEQ Figure \* ARABIC </w:instrText>
+      </w:r>
+      <w:r>
+        <w:fldChar w:fldCharType="separate"/>
+      </w:r>
+      <w:r>
+        <w:rPr>
+          <w:noProof/>
+        </w:rPr>
+        <w:t>7</w:t>
+      </w:r>
+      <w:r>
+        <w:rPr>
+          <w:noProof/>
+        </w:rPr>
+        <w:fldChar w:fldCharType="end"/>
+      </w:r>
       <w:r>
         <w:t>: basic printer dialog</w:t>
       </w:r>
@@ -7939,14 +8028,14 @@
           <w:szCs w:val="20"/>
         </w:rPr>
       </w:pPr>
-      <w:bookmarkStart w:id="25" w:name="_Toc509165851"/>
+      <w:bookmarkStart w:id="24" w:name="_Toc509165851"/>
       <w:r>
         <w:rPr>
           <w:szCs w:val="20"/>
         </w:rPr>
         <w:t>Import</w:t>
       </w:r>
-      <w:bookmarkEnd w:id="25"/>
+      <w:bookmarkEnd w:id="24"/>
       <w:r>
         <w:rPr>
           <w:szCs w:val="20"/>
@@ -8101,14 +8190,27 @@
       <w:r>
         <w:t xml:space="preserve">Figure </w:t>
       </w:r>
-      <w:fldSimple w:instr=" SEQ Figure \* ARABIC ">
-        <w:r>
-          <w:rPr>
-            <w:noProof/>
-          </w:rPr>
-          <w:t>8</w:t>
-        </w:r>
-      </w:fldSimple>
+      <w:r>
+        <w:fldChar w:fldCharType="begin"/>
+      </w:r>
+      <w:r>
+        <w:instrText xml:space="preserve"> SEQ Figure \* ARABIC </w:instrText>
+      </w:r>
+      <w:r>
+        <w:fldChar w:fldCharType="separate"/>
+      </w:r>
+      <w:r>
+        <w:rPr>
+          <w:noProof/>
+        </w:rPr>
+        <w:t>8</w:t>
+      </w:r>
+      <w:r>
+        <w:rPr>
+          <w:noProof/>
+        </w:rPr>
+        <w:fldChar w:fldCharType="end"/>
+      </w:r>
       <w:r>
         <w:t>: Importing existing player information</w:t>
       </w:r>
@@ -8117,12 +8219,12 @@
       <w:pPr>
         <w:pStyle w:val="Heading1"/>
       </w:pPr>
-      <w:bookmarkStart w:id="26" w:name="_Toc509165852"/>
+      <w:bookmarkStart w:id="25" w:name="_Toc509165852"/>
       <w:r>
         <w:lastRenderedPageBreak/>
         <w:t>Member Scores</w:t>
       </w:r>
-      <w:bookmarkEnd w:id="26"/>
+      <w:bookmarkEnd w:id="25"/>
       <w:r>
         <w:fldChar w:fldCharType="begin"/>
       </w:r>
@@ -8233,14 +8335,27 @@
       <w:r>
         <w:t xml:space="preserve">Figure </w:t>
       </w:r>
-      <w:fldSimple w:instr=" SEQ Figure \* ARABIC ">
-        <w:r>
-          <w:rPr>
-            <w:noProof/>
-          </w:rPr>
-          <w:t>9</w:t>
-        </w:r>
-      </w:fldSimple>
+      <w:r>
+        <w:fldChar w:fldCharType="begin"/>
+      </w:r>
+      <w:r>
+        <w:instrText xml:space="preserve"> SEQ Figure \* ARABIC </w:instrText>
+      </w:r>
+      <w:r>
+        <w:fldChar w:fldCharType="separate"/>
+      </w:r>
+      <w:r>
+        <w:rPr>
+          <w:noProof/>
+        </w:rPr>
+        <w:t>9</w:t>
+      </w:r>
+      <w:r>
+        <w:rPr>
+          <w:noProof/>
+        </w:rPr>
+        <w:fldChar w:fldCharType="end"/>
+      </w:r>
       <w:r>
         <w:t>: Member Scores</w:t>
       </w:r>
@@ -8399,7 +8514,7 @@
           <w:szCs w:val="20"/>
         </w:rPr>
       </w:pPr>
-      <w:bookmarkStart w:id="27" w:name="_Toc509165853"/>
+      <w:bookmarkStart w:id="26" w:name="_Toc509165853"/>
       <w:r>
         <w:rPr>
           <w:szCs w:val="20"/>
@@ -8407,7 +8522,7 @@
         <w:lastRenderedPageBreak/>
         <w:t>Tournament Stats</w:t>
       </w:r>
-      <w:bookmarkEnd w:id="27"/>
+      <w:bookmarkEnd w:id="26"/>
       <w:r>
         <w:rPr>
           <w:szCs w:val="20"/>
@@ -8607,14 +8722,27 @@
       <w:r>
         <w:t xml:space="preserve">Figure </w:t>
       </w:r>
-      <w:fldSimple w:instr=" SEQ Figure \* ARABIC ">
-        <w:r>
-          <w:rPr>
-            <w:noProof/>
-          </w:rPr>
-          <w:t>10</w:t>
-        </w:r>
-      </w:fldSimple>
+      <w:r>
+        <w:fldChar w:fldCharType="begin"/>
+      </w:r>
+      <w:r>
+        <w:instrText xml:space="preserve"> SEQ Figure \* ARABIC </w:instrText>
+      </w:r>
+      <w:r>
+        <w:fldChar w:fldCharType="separate"/>
+      </w:r>
+      <w:r>
+        <w:rPr>
+          <w:noProof/>
+        </w:rPr>
+        <w:t>10</w:t>
+      </w:r>
+      <w:r>
+        <w:rPr>
+          <w:noProof/>
+        </w:rPr>
+        <w:fldChar w:fldCharType="end"/>
+      </w:r>
       <w:r>
         <w:t>: Tournament Stats</w:t>
       </w:r>
@@ -8669,7 +8797,7 @@
           <w:szCs w:val="20"/>
         </w:rPr>
       </w:pPr>
-      <w:bookmarkStart w:id="28" w:name="_Toc509165854"/>
+      <w:bookmarkStart w:id="27" w:name="_Toc509165854"/>
       <w:r>
         <w:rPr>
           <w:szCs w:val="20"/>
@@ -8720,7 +8848,7 @@
         </w:rPr>
         <w:t xml:space="preserve"> By Tournament</w:t>
       </w:r>
-      <w:bookmarkEnd w:id="28"/>
+      <w:bookmarkEnd w:id="27"/>
       <w:r>
         <w:rPr>
           <w:szCs w:val="20"/>
@@ -8888,14 +9016,27 @@
       <w:r>
         <w:t xml:space="preserve">Figure </w:t>
       </w:r>
-      <w:fldSimple w:instr=" SEQ Figure \* ARABIC ">
-        <w:r>
-          <w:rPr>
-            <w:noProof/>
-          </w:rPr>
-          <w:t>11</w:t>
-        </w:r>
-      </w:fldSimple>
+      <w:r>
+        <w:fldChar w:fldCharType="begin"/>
+      </w:r>
+      <w:r>
+        <w:instrText xml:space="preserve"> SEQ Figure \* ARABIC </w:instrText>
+      </w:r>
+      <w:r>
+        <w:fldChar w:fldCharType="separate"/>
+      </w:r>
+      <w:r>
+        <w:rPr>
+          <w:noProof/>
+        </w:rPr>
+        <w:t>11</w:t>
+      </w:r>
+      <w:r>
+        <w:rPr>
+          <w:noProof/>
+        </w:rPr>
+        <w:fldChar w:fldCharType="end"/>
+      </w:r>
       <w:r>
         <w:t xml:space="preserve"> Print Dialog</w:t>
       </w:r>
@@ -8904,12 +9045,12 @@
       <w:pPr>
         <w:pStyle w:val="Heading2"/>
       </w:pPr>
-      <w:bookmarkStart w:id="29" w:name="_Toc509165855"/>
+      <w:bookmarkStart w:id="28" w:name="_Toc509165855"/>
       <w:r>
         <w:lastRenderedPageBreak/>
         <w:t>Tournament Place Standings</w:t>
       </w:r>
-      <w:bookmarkEnd w:id="29"/>
+      <w:bookmarkEnd w:id="28"/>
       <w:r>
         <w:fldChar w:fldCharType="begin"/>
       </w:r>
@@ -9037,14 +9178,27 @@
       <w:r>
         <w:t xml:space="preserve">Figure </w:t>
       </w:r>
-      <w:fldSimple w:instr=" SEQ Figure \* ARABIC ">
-        <w:r>
-          <w:rPr>
-            <w:noProof/>
-          </w:rPr>
-          <w:t>12</w:t>
-        </w:r>
-      </w:fldSimple>
+      <w:r>
+        <w:fldChar w:fldCharType="begin"/>
+      </w:r>
+      <w:r>
+        <w:instrText xml:space="preserve"> SEQ Figure \* ARABIC </w:instrText>
+      </w:r>
+      <w:r>
+        <w:fldChar w:fldCharType="separate"/>
+      </w:r>
+      <w:r>
+        <w:rPr>
+          <w:noProof/>
+        </w:rPr>
+        <w:t>12</w:t>
+      </w:r>
+      <w:r>
+        <w:rPr>
+          <w:noProof/>
+        </w:rPr>
+        <w:fldChar w:fldCharType="end"/>
+      </w:r>
       <w:r>
         <w:t>: Tournament Place Standings</w:t>
       </w:r>
@@ -9078,26 +9232,214 @@
       <w:pPr>
         <w:pStyle w:val="Heading2"/>
       </w:pPr>
-      <w:bookmarkStart w:id="30" w:name="_Toc509165856"/>
+      <w:bookmarkStart w:id="29" w:name="_Toc509165856"/>
       <w:r>
         <w:lastRenderedPageBreak/>
-        <w:t>Create/Edit Tournament</w:t>
-      </w:r>
+        <w:t xml:space="preserve"> How to create or e</w:t>
+      </w:r>
+      <w:r>
+        <w:t>dit Tournament</w:t>
+      </w:r>
+      <w:bookmarkEnd w:id="29"/>
+      <w:r>
+        <w:fldChar w:fldCharType="begin"/>
+      </w:r>
+      <w:r>
+        <w:instrText xml:space="preserve"> XE "</w:instrText>
+      </w:r>
+      <w:r>
+        <w:instrText>Create/Edit Tournament</w:instrText>
+      </w:r>
+      <w:r>
+        <w:instrText xml:space="preserve">" </w:instrText>
+      </w:r>
+      <w:r>
+        <w:fldChar w:fldCharType="end"/>
+      </w:r>
+    </w:p>
+    <w:p>
+      <w:pPr>
+        <w:pStyle w:val="BodyText"/>
+        <w:keepNext/>
+      </w:pPr>
+      <w:r>
+        <w:t>Before scores can be</w:t>
+      </w:r>
+      <w:r>
+        <w:t xml:space="preserve"> added into a tournament, a tournament </w:t>
+      </w:r>
+      <w:r>
+        <w:t>needs to be created first. This can be done from the Member Scores tab. To begin</w:t>
+      </w:r>
+      <w:r>
+        <w:t>, click the Create/</w:t>
+      </w:r>
+      <w:r>
+        <w:t>Edit Tournament button located below the Stats s</w:t>
+      </w:r>
+      <w:r>
+        <w:t>ection</w:t>
+      </w:r>
+      <w:r>
+        <w:t>.</w:t>
+      </w:r>
+      <w:r>
+        <w:t xml:space="preserve"> </w:t>
+      </w:r>
+      <w:r>
+        <w:t>This will open a form</w:t>
+      </w:r>
+      <w:r>
+        <w:t xml:space="preserve"> to create a tournament.</w:t>
+      </w:r>
+    </w:p>
+    <w:p>
+      <w:pPr>
+        <w:pStyle w:val="BodyText"/>
+        <w:keepNext/>
+      </w:pPr>
+      <w:r>
+        <w:t>Populate this form</w:t>
+      </w:r>
+      <w:r>
+        <w:t xml:space="preserve"> with the following </w:t>
+      </w:r>
+      <w:r>
+        <w:t>information: the location of th</w:t>
+      </w:r>
+      <w:r>
+        <w:t xml:space="preserve">e tournament, </w:t>
+      </w:r>
+      <w:r>
+        <w:t>the name of the tournament, and any sponsors that support the tournament.</w:t>
+      </w:r>
+      <w:r>
+        <w:t xml:space="preserve"> The da</w:t>
+      </w:r>
+      <w:r>
+        <w:t xml:space="preserve">te will default to today’s date. </w:t>
+      </w:r>
+      <w:r>
+        <w:t>If the tournament</w:t>
+      </w:r>
+      <w:r>
+        <w:t xml:space="preserve"> is a 3 Out of 4 tourne</w:t>
+      </w:r>
+      <w:r>
+        <w:t>y, then check the appropriate box</w:t>
+      </w:r>
+      <w:r>
+        <w:t>. Finally, enter the number of squads</w:t>
+      </w:r>
+      <w:r>
+        <w:t xml:space="preserve"> and </w:t>
+      </w:r>
+      <w:r>
+        <w:t>any notes for</w:t>
+      </w:r>
+      <w:r>
+        <w:t xml:space="preserve"> the tournament.</w:t>
+      </w:r>
+      <w:r>
+        <w:t xml:space="preserve"> </w:t>
+      </w:r>
+      <w:r>
+        <w:t>Review</w:t>
+      </w:r>
+      <w:r>
+        <w:t xml:space="preserve"> these fields again if necessary for accuracy and if the user wants to clear the entire form and start over, there is a Clea</w:t>
+      </w:r>
+      <w:r>
+        <w:t xml:space="preserve">r button at the top of the </w:t>
+      </w:r>
+      <w:r>
+        <w:t>form.</w:t>
+      </w:r>
+      <w:r>
+        <w:t xml:space="preserve"> Once all of the information is </w:t>
+      </w:r>
+      <w:r>
+        <w:t>proofread, click the Create Tournament button at the bottom</w:t>
+      </w:r>
+      <w:r>
+        <w:t xml:space="preserve"> of the form to add the </w:t>
+      </w:r>
+      <w:r>
+        <w:t>tournament</w:t>
+      </w:r>
+      <w:r>
+        <w:t xml:space="preserve"> to the 9-</w:t>
+      </w:r>
+      <w:r>
+        <w:t>Tap database.</w:t>
+      </w:r>
+    </w:p>
+    <w:p>
+      <w:pPr>
+        <w:pStyle w:val="BodyText"/>
+        <w:keepNext/>
+      </w:pPr>
+      <w:r>
+        <w:t>There are some additional details</w:t>
+      </w:r>
+      <w:r>
+        <w:t xml:space="preserve"> to note when it c</w:t>
+      </w:r>
+      <w:r>
+        <w:t>omes to creating</w:t>
+      </w:r>
+      <w:r>
+        <w:t xml:space="preserve"> a tournament. </w:t>
+      </w:r>
+      <w:r>
+        <w:t>If the squads box is empty or is not between one and eight,</w:t>
+      </w:r>
+      <w:r>
+        <w:t xml:space="preserve"> the user</w:t>
+      </w:r>
+      <w:r>
+        <w:t xml:space="preserve"> will be prompted </w:t>
+      </w:r>
+      <w:r>
+        <w:t>to input</w:t>
+      </w:r>
+      <w:bookmarkStart w:id="30" w:name="_GoBack"/>
       <w:bookmarkEnd w:id="30"/>
       <w:r>
-        <w:fldChar w:fldCharType="begin"/>
-      </w:r>
-      <w:r>
-        <w:instrText xml:space="preserve"> XE "</w:instrText>
-      </w:r>
-      <w:r>
-        <w:instrText>Create/Edit Tournament</w:instrText>
-      </w:r>
-      <w:r>
-        <w:instrText xml:space="preserve">" </w:instrText>
-      </w:r>
-      <w:r>
-        <w:fldChar w:fldCharType="end"/>
+        <w:t xml:space="preserve"> the required information</w:t>
+      </w:r>
+      <w:r>
+        <w:t xml:space="preserve"> </w:t>
+      </w:r>
+      <w:r>
+        <w:t xml:space="preserve">when </w:t>
+      </w:r>
+      <w:r>
+        <w:t>they click the Create Tournament button</w:t>
+      </w:r>
+      <w:r>
+        <w:t>.</w:t>
+      </w:r>
+      <w:r>
+        <w:t xml:space="preserve"> The only</w:t>
+      </w:r>
+      <w:r>
+        <w:t xml:space="preserve"> requirements to create a tournament</w:t>
+      </w:r>
+      <w:r>
+        <w:t xml:space="preserve"> are</w:t>
+      </w:r>
+      <w:r>
+        <w:t xml:space="preserve"> </w:t>
+      </w:r>
+      <w:r>
+        <w:t xml:space="preserve">the location of the tournament </w:t>
+      </w:r>
+      <w:r>
+        <w:t>and the num</w:t>
+      </w:r>
+      <w:r>
+        <w:t>ber of squads in the tournament. Event and Sponsors may be left blank.</w:t>
       </w:r>
     </w:p>
     <w:p>
@@ -9106,71 +9448,14 @@
         <w:keepNext/>
       </w:pPr>
       <w:r>
-        <w:t>From the Member Scores</w:t>
-      </w:r>
-      <w:r>
-        <w:fldChar w:fldCharType="begin"/>
-      </w:r>
-      <w:r>
-        <w:instrText xml:space="preserve"> XE "</w:instrText>
-      </w:r>
-      <w:r>
-        <w:instrText>Member Scores</w:instrText>
-      </w:r>
-      <w:r>
-        <w:instrText xml:space="preserve">" </w:instrText>
-      </w:r>
-      <w:r>
-        <w:fldChar w:fldCharType="end"/>
-      </w:r>
-      <w:r>
-        <w:t xml:space="preserve"> screen, click on the “Create/Edit Tournament</w:t>
-      </w:r>
-      <w:r>
-        <w:fldChar w:fldCharType="begin"/>
-      </w:r>
-      <w:r>
-        <w:instrText xml:space="preserve"> XE "</w:instrText>
-      </w:r>
-      <w:r>
-        <w:instrText>Create/Edit Tournament</w:instrText>
-      </w:r>
-      <w:r>
-        <w:instrText xml:space="preserve">" </w:instrText>
-      </w:r>
-      <w:r>
-        <w:fldChar w:fldCharType="end"/>
-      </w:r>
-      <w:r>
-        <w:t>…” button. You should now see the New Tournament screen.</w:t>
-      </w:r>
-      <w:r>
-        <w:t xml:space="preserve"> Select the tournament date. Fill in the name of the bowling center in the Location field. Put the name of the event in the Event field. List the sponsors in the </w:t>
-      </w:r>
-      <w:r>
-        <w:t>Sponsors</w:t>
-      </w:r>
-      <w:r>
-        <w:t xml:space="preserve"> field. DO NOT CHECK THE DOUBLES BOX. If it’s a three out of four tournament, check the “3 out of 4” box. Fill in the number of squads in the Number of Squads field. The default is 4.</w:t>
-      </w:r>
-      <w:r>
-        <w:t xml:space="preserve"> Any necessary tournament notes should be entered in the Notes field. Double check the entries for accuracy. Click “Create Tournament” to save the entry.</w:t>
-      </w:r>
-    </w:p>
-    <w:p>
-      <w:pPr>
-        <w:pStyle w:val="BodyText"/>
-        <w:keepNext/>
-      </w:pPr>
-      <w:r>
         <w:rPr>
           <w:noProof/>
         </w:rPr>
         <w:drawing>
-          <wp:inline distT="0" distB="0" distL="0" distR="0" wp14:anchorId="30EDA2AE" wp14:editId="2786B631">
-            <wp:extent cx="2829320" cy="5125165"/>
-            <wp:effectExtent l="19050" t="19050" r="28575" b="18415"/>
-            <wp:docPr id="16" name="Picture 16"/>
+          <wp:inline distT="0" distB="0" distL="0" distR="0" wp14:anchorId="06BE2E10" wp14:editId="0C01238A">
+            <wp:extent cx="2837815" cy="4364990"/>
+            <wp:effectExtent l="0" t="0" r="635" b="0"/>
+            <wp:docPr id="3" name="Picture 3" descr="C:\Users\Tfair\Desktop\DocumentationBackup-9Tap\9TapCreateEditTourney.png"/>
             <wp:cNvGraphicFramePr>
               <a:graphicFrameLocks xmlns:a="http://schemas.openxmlformats.org/drawingml/2006/main" noChangeAspect="1"/>
             </wp:cNvGraphicFramePr>
@@ -9178,8 +9463,10 @@
               <a:graphicData uri="http://schemas.openxmlformats.org/drawingml/2006/picture">
                 <pic:pic xmlns:pic="http://schemas.openxmlformats.org/drawingml/2006/picture">
                   <pic:nvPicPr>
-                    <pic:cNvPr id="16" name="NewTournamentForm.PNG"/>
-                    <pic:cNvPicPr/>
+                    <pic:cNvPr id="0" name="Picture 3" descr="C:\Users\Tfair\Desktop\DocumentationBackup-9Tap\9TapCreateEditTourney.png"/>
+                    <pic:cNvPicPr>
+                      <a:picLocks noChangeAspect="1" noChangeArrowheads="1"/>
+                    </pic:cNvPicPr>
                   </pic:nvPicPr>
                   <pic:blipFill>
                     <a:blip r:embed="rId26">
@@ -9189,26 +9476,23 @@
                         </a:ext>
                       </a:extLst>
                     </a:blip>
+                    <a:srcRect/>
                     <a:stretch>
                       <a:fillRect/>
                     </a:stretch>
                   </pic:blipFill>
-                  <pic:spPr>
+                  <pic:spPr bwMode="auto">
                     <a:xfrm>
                       <a:off x="0" y="0"/>
-                      <a:ext cx="2829320" cy="5125165"/>
+                      <a:ext cx="2837815" cy="4364990"/>
                     </a:xfrm>
                     <a:prstGeom prst="rect">
                       <a:avLst/>
                     </a:prstGeom>
+                    <a:noFill/>
                     <a:ln>
-                      <a:solidFill>
-                        <a:schemeClr val="bg1">
-                          <a:lumMod val="85000"/>
-                        </a:schemeClr>
-                      </a:solidFill>
+                      <a:noFill/>
                     </a:ln>
-                    <a:effectLst/>
                   </pic:spPr>
                 </pic:pic>
               </a:graphicData>
@@ -9223,16 +9507,30 @@
         <w:jc w:val="both"/>
       </w:pPr>
       <w:r>
+        <w:lastRenderedPageBreak/>
         <w:t xml:space="preserve">Figure </w:t>
       </w:r>
-      <w:fldSimple w:instr=" SEQ Figure \* ARABIC ">
-        <w:r>
-          <w:rPr>
-            <w:noProof/>
-          </w:rPr>
-          <w:t>13</w:t>
-        </w:r>
-      </w:fldSimple>
+      <w:r>
+        <w:fldChar w:fldCharType="begin"/>
+      </w:r>
+      <w:r>
+        <w:instrText xml:space="preserve"> SEQ Figure \* ARABIC </w:instrText>
+      </w:r>
+      <w:r>
+        <w:fldChar w:fldCharType="separate"/>
+      </w:r>
+      <w:r>
+        <w:rPr>
+          <w:noProof/>
+        </w:rPr>
+        <w:t>13</w:t>
+      </w:r>
+      <w:r>
+        <w:rPr>
+          <w:noProof/>
+        </w:rPr>
+        <w:fldChar w:fldCharType="end"/>
+      </w:r>
       <w:r>
         <w:t xml:space="preserve">: </w:t>
       </w:r>
@@ -9277,7 +9575,10 @@
       </w:pPr>
       <w:bookmarkStart w:id="31" w:name="_Toc509165857"/>
       <w:r>
-        <w:t>To Update an Existing Tournament</w:t>
+        <w:t xml:space="preserve"> How t</w:t>
+      </w:r>
+      <w:r>
+        <w:t>o Update an Existing Tournament</w:t>
       </w:r>
       <w:bookmarkEnd w:id="31"/>
     </w:p>
@@ -9352,11 +9653,7 @@
         <w:t xml:space="preserve">See Search Tournaments </w:t>
       </w:r>
       <w:r>
-        <w:t xml:space="preserve">for the search function. Once the </w:t>
-      </w:r>
-      <w:r>
-        <w:lastRenderedPageBreak/>
-        <w:t>tournament to edit has been selected, you can then edit the pertinent information and save the entry.</w:t>
+        <w:t>for the search function. Once the tournament to edit has been selected, you can then edit the pertinent information and save the entry.</w:t>
       </w:r>
     </w:p>
     <w:p>
@@ -9535,14 +9832,27 @@
       <w:r>
         <w:t xml:space="preserve">Figure </w:t>
       </w:r>
-      <w:fldSimple w:instr=" SEQ Figure \* ARABIC ">
-        <w:r>
-          <w:rPr>
-            <w:noProof/>
-          </w:rPr>
-          <w:t>14</w:t>
-        </w:r>
-      </w:fldSimple>
+      <w:r>
+        <w:fldChar w:fldCharType="begin"/>
+      </w:r>
+      <w:r>
+        <w:instrText xml:space="preserve"> SEQ Figure \* ARABIC </w:instrText>
+      </w:r>
+      <w:r>
+        <w:fldChar w:fldCharType="separate"/>
+      </w:r>
+      <w:r>
+        <w:rPr>
+          <w:noProof/>
+        </w:rPr>
+        <w:t>14</w:t>
+      </w:r>
+      <w:r>
+        <w:rPr>
+          <w:noProof/>
+        </w:rPr>
+        <w:fldChar w:fldCharType="end"/>
+      </w:r>
       <w:r>
         <w:t>: Tournament Search Forms</w:t>
       </w:r>
@@ -9646,6 +9956,45 @@
       <w:r>
         <w:t>To find a tournament by event: Fill in the name of the event in the Event field. Click “Search”. Choose the tournament you need from the displayed list. Click “Accept”.</w:t>
       </w:r>
+      <w:r>
+        <w:t xml:space="preserve"> </w:t>
+      </w:r>
+    </w:p>
+    <w:p>
+      <w:pPr>
+        <w:pStyle w:val="BodyText"/>
+      </w:pPr>
+      <w:r>
+        <w:lastRenderedPageBreak/>
+        <w:t>One important thing to note is that searching by event and location can be done with just a letter found in the name of the loc</w:t>
+      </w:r>
+      <w:r>
+        <w:t>ation or the event</w:t>
+      </w:r>
+      <w:r>
+        <w:t>.</w:t>
+      </w:r>
+      <w:r>
+        <w:t xml:space="preserve"> For example, there are two tourname</w:t>
+      </w:r>
+      <w:r>
+        <w:t>nts: one in San Francisco</w:t>
+      </w:r>
+      <w:r>
+        <w:t>, and another in Seattle.</w:t>
+      </w:r>
+      <w:r>
+        <w:t xml:space="preserve"> Entering “S” in the search bar will yield both</w:t>
+      </w:r>
+      <w:r>
+        <w:t xml:space="preserve"> of these</w:t>
+      </w:r>
+      <w:r>
+        <w:t xml:space="preserve"> in the</w:t>
+      </w:r>
+      <w:r>
+        <w:t xml:space="preserve"> results.</w:t>
+      </w:r>
     </w:p>
     <w:p>
       <w:pPr>
@@ -9686,7 +10035,6 @@
       </w:pPr>
       <w:bookmarkStart w:id="36" w:name="_Toc509165862"/>
       <w:r>
-        <w:lastRenderedPageBreak/>
         <w:t>List Tournaments</w:t>
       </w:r>
       <w:r>
@@ -9930,14 +10278,27 @@
       <w:r>
         <w:t xml:space="preserve">Figure </w:t>
       </w:r>
-      <w:fldSimple w:instr=" SEQ Figure \* ARABIC ">
-        <w:r>
-          <w:rPr>
-            <w:noProof/>
-          </w:rPr>
-          <w:t>15</w:t>
-        </w:r>
-      </w:fldSimple>
+      <w:r>
+        <w:fldChar w:fldCharType="begin"/>
+      </w:r>
+      <w:r>
+        <w:instrText xml:space="preserve"> SEQ Figure \* ARABIC </w:instrText>
+      </w:r>
+      <w:r>
+        <w:fldChar w:fldCharType="separate"/>
+      </w:r>
+      <w:r>
+        <w:rPr>
+          <w:noProof/>
+        </w:rPr>
+        <w:t>15</w:t>
+      </w:r>
+      <w:r>
+        <w:rPr>
+          <w:noProof/>
+        </w:rPr>
+        <w:fldChar w:fldCharType="end"/>
+      </w:r>
       <w:r>
         <w:t>: Tournaments</w:t>
       </w:r>
@@ -9976,6 +10337,7 @@
       </w:pPr>
       <w:bookmarkStart w:id="37" w:name="_Toc509165863"/>
       <w:r>
+        <w:lastRenderedPageBreak/>
         <w:t>Reports</w:t>
       </w:r>
       <w:bookmarkEnd w:id="37"/>
@@ -10153,14 +10515,27 @@
       <w:r>
         <w:t xml:space="preserve">Figure </w:t>
       </w:r>
-      <w:fldSimple w:instr=" SEQ Figure \* ARABIC ">
-        <w:r>
-          <w:rPr>
-            <w:noProof/>
-          </w:rPr>
-          <w:t>16</w:t>
-        </w:r>
-      </w:fldSimple>
+      <w:r>
+        <w:fldChar w:fldCharType="begin"/>
+      </w:r>
+      <w:r>
+        <w:instrText xml:space="preserve"> SEQ Figure \* ARABIC </w:instrText>
+      </w:r>
+      <w:r>
+        <w:fldChar w:fldCharType="separate"/>
+      </w:r>
+      <w:r>
+        <w:rPr>
+          <w:noProof/>
+        </w:rPr>
+        <w:t>16</w:t>
+      </w:r>
+      <w:r>
+        <w:rPr>
+          <w:noProof/>
+        </w:rPr>
+        <w:fldChar w:fldCharType="end"/>
+      </w:r>
       <w:r>
         <w:t xml:space="preserve"> Member Scores</w:t>
       </w:r>
@@ -10443,14 +10818,27 @@
       <w:r>
         <w:t xml:space="preserve">Figure </w:t>
       </w:r>
-      <w:fldSimple w:instr=" SEQ Figure \* ARABIC ">
-        <w:r>
-          <w:rPr>
-            <w:noProof/>
-          </w:rPr>
-          <w:t>17</w:t>
-        </w:r>
-      </w:fldSimple>
+      <w:r>
+        <w:fldChar w:fldCharType="begin"/>
+      </w:r>
+      <w:r>
+        <w:instrText xml:space="preserve"> SEQ Figure \* ARABIC </w:instrText>
+      </w:r>
+      <w:r>
+        <w:fldChar w:fldCharType="separate"/>
+      </w:r>
+      <w:r>
+        <w:rPr>
+          <w:noProof/>
+        </w:rPr>
+        <w:t>17</w:t>
+      </w:r>
+      <w:r>
+        <w:rPr>
+          <w:noProof/>
+        </w:rPr>
+        <w:fldChar w:fldCharType="end"/>
+      </w:r>
       <w:r>
         <w:t xml:space="preserve"> Tournament Results</w:t>
       </w:r>
@@ -10876,7 +11264,7 @@
           <w:noProof/>
         </w:rPr>
         <w:pict w14:anchorId="225EA388">
-          <v:shape id="_x0000_i1025" type="#_x0000_t75" style="width:384pt;height:222.75pt">
+          <v:shape id="_x0000_i1026" type="#_x0000_t75" style="width:384.45pt;height:222.8pt">
             <v:imagedata r:id="rId35" o:title="FinalizeTournamentWindow"/>
           </v:shape>
         </w:pict>
@@ -10889,14 +11277,27 @@
       <w:r>
         <w:t xml:space="preserve">Figure </w:t>
       </w:r>
-      <w:fldSimple w:instr=" SEQ Figure \* ARABIC ">
-        <w:r>
-          <w:rPr>
-            <w:noProof/>
-          </w:rPr>
-          <w:t>18</w:t>
-        </w:r>
-      </w:fldSimple>
+      <w:r>
+        <w:fldChar w:fldCharType="begin"/>
+      </w:r>
+      <w:r>
+        <w:instrText xml:space="preserve"> SEQ Figure \* ARABIC </w:instrText>
+      </w:r>
+      <w:r>
+        <w:fldChar w:fldCharType="separate"/>
+      </w:r>
+      <w:r>
+        <w:rPr>
+          <w:noProof/>
+        </w:rPr>
+        <w:t>18</w:t>
+      </w:r>
+      <w:r>
+        <w:rPr>
+          <w:noProof/>
+        </w:rPr>
+        <w:fldChar w:fldCharType="end"/>
+      </w:r>
       <w:r>
         <w:t xml:space="preserve"> Finalize Tournament</w:t>
       </w:r>
@@ -12129,14 +12530,27 @@
       <w:r>
         <w:t xml:space="preserve">Figure </w:t>
       </w:r>
-      <w:fldSimple w:instr=" SEQ Figure \* ARABIC ">
-        <w:r>
-          <w:rPr>
-            <w:noProof/>
-          </w:rPr>
-          <w:t>19</w:t>
-        </w:r>
-      </w:fldSimple>
+      <w:r>
+        <w:fldChar w:fldCharType="begin"/>
+      </w:r>
+      <w:r>
+        <w:instrText xml:space="preserve"> SEQ Figure \* ARABIC </w:instrText>
+      </w:r>
+      <w:r>
+        <w:fldChar w:fldCharType="separate"/>
+      </w:r>
+      <w:r>
+        <w:rPr>
+          <w:noProof/>
+        </w:rPr>
+        <w:t>19</w:t>
+      </w:r>
+      <w:r>
+        <w:rPr>
+          <w:noProof/>
+        </w:rPr>
+        <w:fldChar w:fldCharType="end"/>
+      </w:r>
       <w:r>
         <w:t>: Update Inactive status</w:t>
       </w:r>
@@ -12454,14 +12868,27 @@
       <w:r>
         <w:t xml:space="preserve">Figure </w:t>
       </w:r>
-      <w:fldSimple w:instr=" SEQ Figure \* ARABIC ">
-        <w:r>
-          <w:rPr>
-            <w:noProof/>
-          </w:rPr>
-          <w:t>20</w:t>
-        </w:r>
-      </w:fldSimple>
+      <w:r>
+        <w:fldChar w:fldCharType="begin"/>
+      </w:r>
+      <w:r>
+        <w:instrText xml:space="preserve"> SEQ Figure \* ARABIC </w:instrText>
+      </w:r>
+      <w:r>
+        <w:fldChar w:fldCharType="separate"/>
+      </w:r>
+      <w:r>
+        <w:rPr>
+          <w:noProof/>
+        </w:rPr>
+        <w:t>20</w:t>
+      </w:r>
+      <w:r>
+        <w:rPr>
+          <w:noProof/>
+        </w:rPr>
+        <w:fldChar w:fldCharType="end"/>
+      </w:r>
       <w:r>
         <w:t xml:space="preserve"> Showing split screen error</w:t>
       </w:r>
@@ -12483,7 +12910,7 @@
         <mc:AlternateContent>
           <mc:Choice Requires="wps">
             <w:drawing>
-              <wp:anchor distT="0" distB="0" distL="114300" distR="114300" simplePos="0" relativeHeight="251659264" behindDoc="0" locked="0" layoutInCell="1" allowOverlap="1" wp14:anchorId="7BB17706" wp14:editId="62300B34">
+              <wp:anchor distT="0" distB="0" distL="114300" distR="114300" simplePos="0" relativeHeight="251664384" behindDoc="0" locked="0" layoutInCell="1" allowOverlap="1" wp14:anchorId="7BB17706" wp14:editId="62300B34">
                 <wp:simplePos x="0" y="0"/>
                 <wp:positionH relativeFrom="column">
                   <wp:posOffset>3175</wp:posOffset>
@@ -12529,14 +12956,27 @@
                             <w:r>
                               <w:t xml:space="preserve">Figure </w:t>
                             </w:r>
-                            <w:fldSimple w:instr=" SEQ Figure \* ARABIC ">
-                              <w:r>
-                                <w:rPr>
-                                  <w:noProof/>
-                                </w:rPr>
-                                <w:t>21</w:t>
-                              </w:r>
-                            </w:fldSimple>
+                            <w:r>
+                              <w:fldChar w:fldCharType="begin"/>
+                            </w:r>
+                            <w:r>
+                              <w:instrText xml:space="preserve"> SEQ Figure \* ARABIC </w:instrText>
+                            </w:r>
+                            <w:r>
+                              <w:fldChar w:fldCharType="separate"/>
+                            </w:r>
+                            <w:r>
+                              <w:rPr>
+                                <w:noProof/>
+                              </w:rPr>
+                              <w:t>21</w:t>
+                            </w:r>
+                            <w:r>
+                              <w:rPr>
+                                <w:noProof/>
+                              </w:rPr>
+                              <w:fldChar w:fldCharType="end"/>
+                            </w:r>
                             <w:r>
                               <w:t xml:space="preserve"> Inner screen maximize</w:t>
                             </w:r>
@@ -12564,7 +13004,7 @@
                 <v:stroke joinstyle="miter"/>
                 <v:path gradientshapeok="t" o:connecttype="rect"/>
               </v:shapetype>
-              <v:shape id="Text Box 24" o:spid="_x0000_s1026" type="#_x0000_t202" style="position:absolute;left:0;text-align:left;margin-left:.25pt;margin-top:98.8pt;width:154.5pt;height:13.5pt;z-index:251659264;visibility:visible;mso-wrap-style:square;mso-height-percent:0;mso-wrap-distance-left:9pt;mso-wrap-distance-top:0;mso-wrap-distance-right:9pt;mso-wrap-distance-bottom:0;mso-position-horizontal:absolute;mso-position-horizontal-relative:text;mso-position-vertical:absolute;mso-position-vertical-relative:text;mso-height-percent:0;mso-height-relative:margin;v-text-anchor:top" o:gfxdata="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" stroked="f">
+              <v:shape id="Text Box 24" o:spid="_x0000_s1026" type="#_x0000_t202" style="position:absolute;left:0;text-align:left;margin-left:.25pt;margin-top:98.8pt;width:154.5pt;height:13.5pt;z-index:251664384;visibility:visible;mso-wrap-style:square;mso-height-percent:0;mso-wrap-distance-left:9pt;mso-wrap-distance-top:0;mso-wrap-distance-right:9pt;mso-wrap-distance-bottom:0;mso-position-horizontal:absolute;mso-position-horizontal-relative:text;mso-position-vertical:absolute;mso-position-vertical-relative:text;mso-height-percent:0;mso-height-relative:margin;v-text-anchor:top" o:gfxdata="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" stroked="f">
                 <v:textbox inset="0,0,0,0">
                   <w:txbxContent>
                     <w:p>
@@ -12578,14 +13018,27 @@
                       <w:r>
                         <w:t xml:space="preserve">Figure </w:t>
                       </w:r>
-                      <w:fldSimple w:instr=" SEQ Figure \* ARABIC ">
-                        <w:r>
-                          <w:rPr>
-                            <w:noProof/>
-                          </w:rPr>
-                          <w:t>21</w:t>
-                        </w:r>
-                      </w:fldSimple>
+                      <w:r>
+                        <w:fldChar w:fldCharType="begin"/>
+                      </w:r>
+                      <w:r>
+                        <w:instrText xml:space="preserve"> SEQ Figure \* ARABIC </w:instrText>
+                      </w:r>
+                      <w:r>
+                        <w:fldChar w:fldCharType="separate"/>
+                      </w:r>
+                      <w:r>
+                        <w:rPr>
+                          <w:noProof/>
+                        </w:rPr>
+                        <w:t>21</w:t>
+                      </w:r>
+                      <w:r>
+                        <w:rPr>
+                          <w:noProof/>
+                        </w:rPr>
+                        <w:fldChar w:fldCharType="end"/>
+                      </w:r>
                       <w:r>
                         <w:t xml:space="preserve"> Inner screen maximize</w:t>
                       </w:r>
@@ -12603,7 +13056,7 @@
           <w:noProof/>
         </w:rPr>
         <w:drawing>
-          <wp:anchor distT="0" distB="0" distL="114300" distR="114300" simplePos="0" relativeHeight="251657216" behindDoc="0" locked="0" layoutInCell="1" allowOverlap="1" wp14:anchorId="682AA4A0" wp14:editId="46FA8D0E">
+          <wp:anchor distT="0" distB="0" distL="114300" distR="114300" simplePos="0" relativeHeight="251656192" behindDoc="0" locked="0" layoutInCell="1" allowOverlap="1" wp14:anchorId="682AA4A0" wp14:editId="46FA8D0E">
             <wp:simplePos x="0" y="0"/>
             <wp:positionH relativeFrom="column">
               <wp:posOffset>3175</wp:posOffset>
@@ -17623,7 +18076,7 @@
         <w:rStyle w:val="PageNumber"/>
         <w:noProof/>
       </w:rPr>
-      <w:t>20</w:t>
+      <w:t>29</w:t>
     </w:r>
     <w:r>
       <w:rPr>
@@ -17673,7 +18126,7 @@
         <w:rStyle w:val="PageNumber"/>
         <w:noProof/>
       </w:rPr>
-      <w:t>43</w:t>
+      <w:t>45</w:t>
     </w:r>
     <w:r>
       <w:rPr>
@@ -21836,7 +22289,7 @@
 </file>
 
 <file path=customXml/itemProps1.xml><?xml version="1.0" encoding="utf-8"?>
-<ds:datastoreItem xmlns:ds="http://schemas.openxmlformats.org/officeDocument/2006/customXml" ds:itemID="{C560B855-FFAF-45DA-AEB0-3014908E87D5}">
+<ds:datastoreItem xmlns:ds="http://schemas.openxmlformats.org/officeDocument/2006/customXml" ds:itemID="{B011774D-5127-4AD7-A835-AE40441DAD15}">
   <ds:schemaRefs>
     <ds:schemaRef ds:uri="http://schemas.openxmlformats.org/officeDocument/2006/bibliography"/>
   </ds:schemaRefs>

</xml_diff>

<commit_message>
Added a better description for the Update Inactive Members form under the Tools tab, as well as some general rephrasing around the manual. Added Comp/Comped under the Glossary.
</commit_message>
<xml_diff>
--- a/9tapUserManual.docx
+++ b/9tapUserManual.docx
@@ -4353,27 +4353,14 @@
       <w:r>
         <w:t xml:space="preserve">Figure </w:t>
       </w:r>
-      <w:r>
-        <w:fldChar w:fldCharType="begin"/>
-      </w:r>
-      <w:r>
-        <w:instrText xml:space="preserve"> SEQ Figure \* ARABIC </w:instrText>
-      </w:r>
-      <w:r>
-        <w:fldChar w:fldCharType="separate"/>
-      </w:r>
-      <w:r>
-        <w:rPr>
-          <w:noProof/>
-        </w:rPr>
-        <w:t>1</w:t>
-      </w:r>
-      <w:r>
-        <w:rPr>
-          <w:noProof/>
-        </w:rPr>
-        <w:fldChar w:fldCharType="end"/>
-      </w:r>
+      <w:fldSimple w:instr=" SEQ Figure \* ARABIC ">
+        <w:r>
+          <w:rPr>
+            <w:noProof/>
+          </w:rPr>
+          <w:t>1</w:t>
+        </w:r>
+      </w:fldSimple>
       <w:r>
         <w:t>: 9-Tap Main Menu</w:t>
       </w:r>
@@ -5632,13 +5619,10 @@
         <w:t xml:space="preserve">Fill in the </w:t>
       </w:r>
       <w:r>
-        <w:t>Location field with the name of the bowling alley. Enter the name of the event in the Event field. Enter the sponsors in the Sponsors field. LEAVE THE DOUBLES BOX UNCHECKED</w:t>
-      </w:r>
-      <w:r>
-        <w:t>.</w:t>
-      </w:r>
-      <w:r>
-        <w:t xml:space="preserve"> </w:t>
+        <w:t>Location field with the name of the bowling alley. Enter the name of the event in the Event field. Enter the sponsors in the Sp</w:t>
+      </w:r>
+      <w:r>
+        <w:t xml:space="preserve">onsors field. </w:t>
       </w:r>
       <w:r>
         <w:t>If appropriate, check the 3 out of 4 box. Enter the number of squads in the Number of Squads field. If needed enter notes on the tournament in the Notes field. Double check your information, then click “Create Tournament”.</w:t>
@@ -6263,27 +6247,14 @@
       <w:r>
         <w:t xml:space="preserve">Figure </w:t>
       </w:r>
-      <w:r>
-        <w:fldChar w:fldCharType="begin"/>
-      </w:r>
-      <w:r>
-        <w:instrText xml:space="preserve"> SEQ Figure \* ARABIC </w:instrText>
-      </w:r>
-      <w:r>
-        <w:fldChar w:fldCharType="separate"/>
-      </w:r>
-      <w:r>
-        <w:rPr>
-          <w:noProof/>
-        </w:rPr>
-        <w:t>2</w:t>
-      </w:r>
-      <w:r>
-        <w:rPr>
-          <w:noProof/>
-        </w:rPr>
-        <w:fldChar w:fldCharType="end"/>
-      </w:r>
+      <w:fldSimple w:instr=" SEQ Figure \* ARABIC ">
+        <w:r>
+          <w:rPr>
+            <w:noProof/>
+          </w:rPr>
+          <w:t>2</w:t>
+        </w:r>
+      </w:fldSimple>
       <w:r>
         <w:t>: Main Menu</w:t>
       </w:r>
@@ -6523,27 +6494,14 @@
       <w:r>
         <w:t xml:space="preserve">Figure </w:t>
       </w:r>
-      <w:r>
-        <w:fldChar w:fldCharType="begin"/>
-      </w:r>
-      <w:r>
-        <w:instrText xml:space="preserve"> SEQ Figure \* ARABIC </w:instrText>
-      </w:r>
-      <w:r>
-        <w:fldChar w:fldCharType="separate"/>
-      </w:r>
-      <w:r>
-        <w:rPr>
-          <w:noProof/>
-        </w:rPr>
-        <w:t>3</w:t>
-      </w:r>
-      <w:r>
-        <w:rPr>
-          <w:noProof/>
-        </w:rPr>
-        <w:fldChar w:fldCharType="end"/>
-      </w:r>
+      <w:fldSimple w:instr=" SEQ Figure \* ARABIC ">
+        <w:r>
+          <w:rPr>
+            <w:noProof/>
+          </w:rPr>
+          <w:t>3</w:t>
+        </w:r>
+      </w:fldSimple>
       <w:r>
         <w:t>: Member Information</w:t>
       </w:r>
@@ -7047,27 +7005,14 @@
         <w:lastRenderedPageBreak/>
         <w:t xml:space="preserve">Figure </w:t>
       </w:r>
-      <w:r>
-        <w:fldChar w:fldCharType="begin"/>
-      </w:r>
-      <w:r>
-        <w:instrText xml:space="preserve"> SEQ Figure \* ARABIC </w:instrText>
-      </w:r>
-      <w:r>
-        <w:fldChar w:fldCharType="separate"/>
-      </w:r>
-      <w:r>
-        <w:rPr>
-          <w:noProof/>
-        </w:rPr>
-        <w:t>4</w:t>
-      </w:r>
-      <w:r>
-        <w:rPr>
-          <w:noProof/>
-        </w:rPr>
-        <w:fldChar w:fldCharType="end"/>
-      </w:r>
+      <w:fldSimple w:instr=" SEQ Figure \* ARABIC ">
+        <w:r>
+          <w:rPr>
+            <w:noProof/>
+          </w:rPr>
+          <w:t>4</w:t>
+        </w:r>
+      </w:fldSimple>
       <w:r>
         <w:t>: Member Information</w:t>
       </w:r>
@@ -7440,27 +7385,14 @@
       <w:r>
         <w:t xml:space="preserve">Figure </w:t>
       </w:r>
-      <w:r>
-        <w:fldChar w:fldCharType="begin"/>
-      </w:r>
-      <w:r>
-        <w:instrText xml:space="preserve"> SEQ Figure \* ARABIC </w:instrText>
-      </w:r>
-      <w:r>
-        <w:fldChar w:fldCharType="separate"/>
-      </w:r>
-      <w:r>
-        <w:rPr>
-          <w:noProof/>
-        </w:rPr>
-        <w:t>5</w:t>
-      </w:r>
-      <w:r>
-        <w:rPr>
-          <w:noProof/>
-        </w:rPr>
-        <w:fldChar w:fldCharType="end"/>
-      </w:r>
+      <w:fldSimple w:instr=" SEQ Figure \* ARABIC ">
+        <w:r>
+          <w:rPr>
+            <w:noProof/>
+          </w:rPr>
+          <w:t>5</w:t>
+        </w:r>
+      </w:fldSimple>
       <w:r>
         <w:t>: Stats</w:t>
       </w:r>
@@ -7765,27 +7697,14 @@
       <w:r>
         <w:t xml:space="preserve">Figure </w:t>
       </w:r>
-      <w:r>
-        <w:fldChar w:fldCharType="begin"/>
-      </w:r>
-      <w:r>
-        <w:instrText xml:space="preserve"> SEQ Figure \* ARABIC </w:instrText>
-      </w:r>
-      <w:r>
-        <w:fldChar w:fldCharType="separate"/>
-      </w:r>
-      <w:r>
-        <w:rPr>
-          <w:noProof/>
-        </w:rPr>
-        <w:t>6</w:t>
-      </w:r>
-      <w:r>
-        <w:rPr>
-          <w:noProof/>
-        </w:rPr>
-        <w:fldChar w:fldCharType="end"/>
-      </w:r>
+      <w:fldSimple w:instr=" SEQ Figure \* ARABIC ">
+        <w:r>
+          <w:rPr>
+            <w:noProof/>
+          </w:rPr>
+          <w:t>6</w:t>
+        </w:r>
+      </w:fldSimple>
       <w:r>
         <w:t>: Member search, blank and with results</w:t>
       </w:r>
@@ -7993,27 +7912,14 @@
       <w:r>
         <w:t xml:space="preserve">Figure </w:t>
       </w:r>
-      <w:r>
-        <w:fldChar w:fldCharType="begin"/>
-      </w:r>
-      <w:r>
-        <w:instrText xml:space="preserve"> SEQ Figure \* ARABIC </w:instrText>
-      </w:r>
-      <w:r>
-        <w:fldChar w:fldCharType="separate"/>
-      </w:r>
-      <w:r>
-        <w:rPr>
-          <w:noProof/>
-        </w:rPr>
-        <w:t>7</w:t>
-      </w:r>
-      <w:r>
-        <w:rPr>
-          <w:noProof/>
-        </w:rPr>
-        <w:fldChar w:fldCharType="end"/>
-      </w:r>
+      <w:fldSimple w:instr=" SEQ Figure \* ARABIC ">
+        <w:r>
+          <w:rPr>
+            <w:noProof/>
+          </w:rPr>
+          <w:t>7</w:t>
+        </w:r>
+      </w:fldSimple>
       <w:r>
         <w:t>: basic printer dialog</w:t>
       </w:r>
@@ -8190,27 +8096,14 @@
       <w:r>
         <w:t xml:space="preserve">Figure </w:t>
       </w:r>
-      <w:r>
-        <w:fldChar w:fldCharType="begin"/>
-      </w:r>
-      <w:r>
-        <w:instrText xml:space="preserve"> SEQ Figure \* ARABIC </w:instrText>
-      </w:r>
-      <w:r>
-        <w:fldChar w:fldCharType="separate"/>
-      </w:r>
-      <w:r>
-        <w:rPr>
-          <w:noProof/>
-        </w:rPr>
-        <w:t>8</w:t>
-      </w:r>
-      <w:r>
-        <w:rPr>
-          <w:noProof/>
-        </w:rPr>
-        <w:fldChar w:fldCharType="end"/>
-      </w:r>
+      <w:fldSimple w:instr=" SEQ Figure \* ARABIC ">
+        <w:r>
+          <w:rPr>
+            <w:noProof/>
+          </w:rPr>
+          <w:t>8</w:t>
+        </w:r>
+      </w:fldSimple>
       <w:r>
         <w:t>: Importing existing player information</w:t>
       </w:r>
@@ -8265,7 +8158,10 @@
         <w:t xml:space="preserve"> A tournament must be created before the member scores can be entered.</w:t>
       </w:r>
       <w:r>
-        <w:t xml:space="preserve"> See Create/Update Tournament.</w:t>
+        <w:t xml:space="preserve"> See </w:t>
+      </w:r>
+      <w:r>
+        <w:t>How to create or edit a tournament.</w:t>
       </w:r>
     </w:p>
     <w:p>
@@ -8335,27 +8231,14 @@
       <w:r>
         <w:t xml:space="preserve">Figure </w:t>
       </w:r>
-      <w:r>
-        <w:fldChar w:fldCharType="begin"/>
-      </w:r>
-      <w:r>
-        <w:instrText xml:space="preserve"> SEQ Figure \* ARABIC </w:instrText>
-      </w:r>
-      <w:r>
-        <w:fldChar w:fldCharType="separate"/>
-      </w:r>
-      <w:r>
-        <w:rPr>
-          <w:noProof/>
-        </w:rPr>
-        <w:t>9</w:t>
-      </w:r>
-      <w:r>
-        <w:rPr>
-          <w:noProof/>
-        </w:rPr>
-        <w:fldChar w:fldCharType="end"/>
-      </w:r>
+      <w:fldSimple w:instr=" SEQ Figure \* ARABIC ">
+        <w:r>
+          <w:rPr>
+            <w:noProof/>
+          </w:rPr>
+          <w:t>9</w:t>
+        </w:r>
+      </w:fldSimple>
       <w:r>
         <w:t>: Member Scores</w:t>
       </w:r>
@@ -8722,27 +8605,14 @@
       <w:r>
         <w:t xml:space="preserve">Figure </w:t>
       </w:r>
-      <w:r>
-        <w:fldChar w:fldCharType="begin"/>
-      </w:r>
-      <w:r>
-        <w:instrText xml:space="preserve"> SEQ Figure \* ARABIC </w:instrText>
-      </w:r>
-      <w:r>
-        <w:fldChar w:fldCharType="separate"/>
-      </w:r>
-      <w:r>
-        <w:rPr>
-          <w:noProof/>
-        </w:rPr>
-        <w:t>10</w:t>
-      </w:r>
-      <w:r>
-        <w:rPr>
-          <w:noProof/>
-        </w:rPr>
-        <w:fldChar w:fldCharType="end"/>
-      </w:r>
+      <w:fldSimple w:instr=" SEQ Figure \* ARABIC ">
+        <w:r>
+          <w:rPr>
+            <w:noProof/>
+          </w:rPr>
+          <w:t>10</w:t>
+        </w:r>
+      </w:fldSimple>
       <w:r>
         <w:t>: Tournament Stats</w:t>
       </w:r>
@@ -9016,27 +8886,14 @@
       <w:r>
         <w:t xml:space="preserve">Figure </w:t>
       </w:r>
-      <w:r>
-        <w:fldChar w:fldCharType="begin"/>
-      </w:r>
-      <w:r>
-        <w:instrText xml:space="preserve"> SEQ Figure \* ARABIC </w:instrText>
-      </w:r>
-      <w:r>
-        <w:fldChar w:fldCharType="separate"/>
-      </w:r>
-      <w:r>
-        <w:rPr>
-          <w:noProof/>
-        </w:rPr>
-        <w:t>11</w:t>
-      </w:r>
-      <w:r>
-        <w:rPr>
-          <w:noProof/>
-        </w:rPr>
-        <w:fldChar w:fldCharType="end"/>
-      </w:r>
+      <w:fldSimple w:instr=" SEQ Figure \* ARABIC ">
+        <w:r>
+          <w:rPr>
+            <w:noProof/>
+          </w:rPr>
+          <w:t>11</w:t>
+        </w:r>
+      </w:fldSimple>
       <w:r>
         <w:t xml:space="preserve"> Print Dialog</w:t>
       </w:r>
@@ -9178,27 +9035,14 @@
       <w:r>
         <w:t xml:space="preserve">Figure </w:t>
       </w:r>
-      <w:r>
-        <w:fldChar w:fldCharType="begin"/>
-      </w:r>
-      <w:r>
-        <w:instrText xml:space="preserve"> SEQ Figure \* ARABIC </w:instrText>
-      </w:r>
-      <w:r>
-        <w:fldChar w:fldCharType="separate"/>
-      </w:r>
-      <w:r>
-        <w:rPr>
-          <w:noProof/>
-        </w:rPr>
-        <w:t>12</w:t>
-      </w:r>
-      <w:r>
-        <w:rPr>
-          <w:noProof/>
-        </w:rPr>
-        <w:fldChar w:fldCharType="end"/>
-      </w:r>
+      <w:fldSimple w:instr=" SEQ Figure \* ARABIC ">
+        <w:r>
+          <w:rPr>
+            <w:noProof/>
+          </w:rPr>
+          <w:t>12</w:t>
+        </w:r>
+      </w:fldSimple>
       <w:r>
         <w:t>: Tournament Place Standings</w:t>
       </w:r>
@@ -9284,13 +9128,88 @@
         <w:t>.</w:t>
       </w:r>
       <w:r>
+        <w:t xml:space="preserve"> This will open a form to create a tournament.</w:t>
+      </w:r>
+    </w:p>
+    <w:p>
+      <w:pPr>
+        <w:pStyle w:val="BodyText"/>
+        <w:keepNext/>
+      </w:pPr>
+      <w:r>
+        <w:t>Populate this form</w:t>
+      </w:r>
+      <w:r>
+        <w:t xml:space="preserve"> with the following </w:t>
+      </w:r>
+      <w:r>
+        <w:t>information: the location of th</w:t>
+      </w:r>
+      <w:r>
+        <w:t xml:space="preserve">e tournament, </w:t>
+      </w:r>
+      <w:r>
+        <w:t>the name of the tournament, and any sponsors that support the tournament.</w:t>
+      </w:r>
+      <w:r>
+        <w:t xml:space="preserve"> The da</w:t>
+      </w:r>
+      <w:r>
+        <w:t xml:space="preserve">te will default to today’s date. </w:t>
+      </w:r>
+      <w:r>
+        <w:t>If the tournament</w:t>
+      </w:r>
+      <w:r>
+        <w:t xml:space="preserve"> is a 3 Out of 4 tourne</w:t>
+      </w:r>
+      <w:r>
+        <w:t>y, then check the appropriate box</w:t>
+      </w:r>
+      <w:r>
+        <w:t>. Finally, enter the number of squads</w:t>
+      </w:r>
+      <w:r>
+        <w:t xml:space="preserve"> and </w:t>
+      </w:r>
+      <w:r>
+        <w:t>any notes for</w:t>
+      </w:r>
+      <w:r>
+        <w:t xml:space="preserve"> the tournament.</w:t>
+      </w:r>
+      <w:r>
         <w:t xml:space="preserve"> </w:t>
       </w:r>
       <w:r>
-        <w:t>This will open a form</w:t>
-      </w:r>
-      <w:r>
-        <w:t xml:space="preserve"> to create a tournament.</w:t>
+        <w:t>Review</w:t>
+      </w:r>
+      <w:r>
+        <w:t xml:space="preserve"> these fields again if necessary for accuracy and if the user wants to clear the entire form and start over, there is a Clea</w:t>
+      </w:r>
+      <w:r>
+        <w:t xml:space="preserve">r button at the top of the </w:t>
+      </w:r>
+      <w:r>
+        <w:t>form.</w:t>
+      </w:r>
+      <w:r>
+        <w:t xml:space="preserve"> Once all of the information is </w:t>
+      </w:r>
+      <w:r>
+        <w:t>proofread, click the Create Tournament button at the bottom</w:t>
+      </w:r>
+      <w:r>
+        <w:t xml:space="preserve"> of the form to add the </w:t>
+      </w:r>
+      <w:r>
+        <w:t>tournament</w:t>
+      </w:r>
+      <w:r>
+        <w:t xml:space="preserve"> to the 9-</w:t>
+      </w:r>
+      <w:r>
+        <w:t>Tap database.</w:t>
       </w:r>
     </w:p>
     <w:p>
@@ -9299,87 +9218,6 @@
         <w:keepNext/>
       </w:pPr>
       <w:r>
-        <w:t>Populate this form</w:t>
-      </w:r>
-      <w:r>
-        <w:t xml:space="preserve"> with the following </w:t>
-      </w:r>
-      <w:r>
-        <w:t>information: the location of th</w:t>
-      </w:r>
-      <w:r>
-        <w:t xml:space="preserve">e tournament, </w:t>
-      </w:r>
-      <w:r>
-        <w:t>the name of the tournament, and any sponsors that support the tournament.</w:t>
-      </w:r>
-      <w:r>
-        <w:t xml:space="preserve"> The da</w:t>
-      </w:r>
-      <w:r>
-        <w:t xml:space="preserve">te will default to today’s date. </w:t>
-      </w:r>
-      <w:r>
-        <w:t>If the tournament</w:t>
-      </w:r>
-      <w:r>
-        <w:t xml:space="preserve"> is a 3 Out of 4 tourne</w:t>
-      </w:r>
-      <w:r>
-        <w:t>y, then check the appropriate box</w:t>
-      </w:r>
-      <w:r>
-        <w:t>. Finally, enter the number of squads</w:t>
-      </w:r>
-      <w:r>
-        <w:t xml:space="preserve"> and </w:t>
-      </w:r>
-      <w:r>
-        <w:t>any notes for</w:t>
-      </w:r>
-      <w:r>
-        <w:t xml:space="preserve"> the tournament.</w:t>
-      </w:r>
-      <w:r>
-        <w:t xml:space="preserve"> </w:t>
-      </w:r>
-      <w:r>
-        <w:t>Review</w:t>
-      </w:r>
-      <w:r>
-        <w:t xml:space="preserve"> these fields again if necessary for accuracy and if the user wants to clear the entire form and start over, there is a Clea</w:t>
-      </w:r>
-      <w:r>
-        <w:t xml:space="preserve">r button at the top of the </w:t>
-      </w:r>
-      <w:r>
-        <w:t>form.</w:t>
-      </w:r>
-      <w:r>
-        <w:t xml:space="preserve"> Once all of the information is </w:t>
-      </w:r>
-      <w:r>
-        <w:t>proofread, click the Create Tournament button at the bottom</w:t>
-      </w:r>
-      <w:r>
-        <w:t xml:space="preserve"> of the form to add the </w:t>
-      </w:r>
-      <w:r>
-        <w:t>tournament</w:t>
-      </w:r>
-      <w:r>
-        <w:t xml:space="preserve"> to the 9-</w:t>
-      </w:r>
-      <w:r>
-        <w:t>Tap database.</w:t>
-      </w:r>
-    </w:p>
-    <w:p>
-      <w:pPr>
-        <w:pStyle w:val="BodyText"/>
-        <w:keepNext/>
-      </w:pPr>
-      <w:r>
         <w:t>There are some additional details</w:t>
       </w:r>
       <w:r>
@@ -9403,8 +9241,6 @@
       <w:r>
         <w:t>to input</w:t>
       </w:r>
-      <w:bookmarkStart w:id="30" w:name="_GoBack"/>
-      <w:bookmarkEnd w:id="30"/>
       <w:r>
         <w:t xml:space="preserve"> the required information</w:t>
       </w:r>
@@ -9510,27 +9346,14 @@
         <w:lastRenderedPageBreak/>
         <w:t xml:space="preserve">Figure </w:t>
       </w:r>
-      <w:r>
-        <w:fldChar w:fldCharType="begin"/>
-      </w:r>
-      <w:r>
-        <w:instrText xml:space="preserve"> SEQ Figure \* ARABIC </w:instrText>
-      </w:r>
-      <w:r>
-        <w:fldChar w:fldCharType="separate"/>
-      </w:r>
-      <w:r>
-        <w:rPr>
-          <w:noProof/>
-        </w:rPr>
-        <w:t>13</w:t>
-      </w:r>
-      <w:r>
-        <w:rPr>
-          <w:noProof/>
-        </w:rPr>
-        <w:fldChar w:fldCharType="end"/>
-      </w:r>
+      <w:fldSimple w:instr=" SEQ Figure \* ARABIC ">
+        <w:r>
+          <w:rPr>
+            <w:noProof/>
+          </w:rPr>
+          <w:t>13</w:t>
+        </w:r>
+      </w:fldSimple>
       <w:r>
         <w:t xml:space="preserve">: </w:t>
       </w:r>
@@ -9573,98 +9396,98 @@
       <w:pPr>
         <w:pStyle w:val="Heading3"/>
       </w:pPr>
-      <w:bookmarkStart w:id="31" w:name="_Toc509165857"/>
+      <w:bookmarkStart w:id="30" w:name="_Toc509165857"/>
       <w:r>
         <w:t xml:space="preserve"> How t</w:t>
       </w:r>
       <w:r>
         <w:t>o Update an Existing Tournament</w:t>
       </w:r>
+      <w:bookmarkEnd w:id="30"/>
+    </w:p>
+    <w:p>
+      <w:pPr>
+        <w:pStyle w:val="BodyText"/>
+      </w:pPr>
+      <w:r>
+        <w:t>Click on the “Create/Edit Tournament</w:t>
+      </w:r>
+      <w:r>
+        <w:fldChar w:fldCharType="begin"/>
+      </w:r>
+      <w:r>
+        <w:instrText xml:space="preserve"> XE "</w:instrText>
+      </w:r>
+      <w:r>
+        <w:instrText>Create/Edit Tournament</w:instrText>
+      </w:r>
+      <w:r>
+        <w:instrText xml:space="preserve">" </w:instrText>
+      </w:r>
+      <w:r>
+        <w:fldChar w:fldCharType="end"/>
+      </w:r>
+      <w:r>
+        <w:t>” button. On the New Tournament screen, click “Edit Existing Tournament…</w:t>
+      </w:r>
+      <w:r>
+        <w:fldChar w:fldCharType="begin"/>
+      </w:r>
+      <w:r>
+        <w:instrText xml:space="preserve"> XE "</w:instrText>
+      </w:r>
+      <w:r>
+        <w:instrText>Edit Existing Tournament…</w:instrText>
+      </w:r>
+      <w:r>
+        <w:instrText xml:space="preserve">" </w:instrText>
+      </w:r>
+      <w:r>
+        <w:fldChar w:fldCharType="end"/>
+      </w:r>
+      <w:r>
+        <w:t>” This will bring up the “Search Tournaments</w:t>
+      </w:r>
+      <w:r>
+        <w:fldChar w:fldCharType="begin"/>
+      </w:r>
+      <w:r>
+        <w:instrText xml:space="preserve"> XE "</w:instrText>
+      </w:r>
+      <w:r>
+        <w:instrText>Search Tournaments</w:instrText>
+      </w:r>
+      <w:r>
+        <w:instrText xml:space="preserve">" </w:instrText>
+      </w:r>
+      <w:r>
+        <w:fldChar w:fldCharType="end"/>
+      </w:r>
+      <w:r>
+        <w:t>”</w:t>
+      </w:r>
+      <w:r>
+        <w:t xml:space="preserve"> screen</w:t>
+      </w:r>
+      <w:r>
+        <w:t xml:space="preserve">, figure 14. </w:t>
+      </w:r>
+      <w:r>
+        <w:t xml:space="preserve">See Search Tournaments </w:t>
+      </w:r>
+      <w:r>
+        <w:t>for the search function. Once the tournament to edit has been selected, you can then edit the pertinent information and save the entry.</w:t>
+      </w:r>
+    </w:p>
+    <w:p>
+      <w:pPr>
+        <w:pStyle w:val="Heading2"/>
+      </w:pPr>
+      <w:bookmarkStart w:id="31" w:name="_Toc509165858"/>
+      <w:r>
+        <w:t>Search Tournaments</w:t>
+      </w:r>
       <w:bookmarkEnd w:id="31"/>
-    </w:p>
-    <w:p>
-      <w:pPr>
-        <w:pStyle w:val="BodyText"/>
-      </w:pPr>
-      <w:r>
-        <w:t>Click on the “Create/Edit Tournament</w:t>
-      </w:r>
-      <w:r>
-        <w:fldChar w:fldCharType="begin"/>
-      </w:r>
-      <w:r>
-        <w:instrText xml:space="preserve"> XE "</w:instrText>
-      </w:r>
-      <w:r>
-        <w:instrText>Create/Edit Tournament</w:instrText>
-      </w:r>
-      <w:r>
-        <w:instrText xml:space="preserve">" </w:instrText>
-      </w:r>
-      <w:r>
-        <w:fldChar w:fldCharType="end"/>
-      </w:r>
-      <w:r>
-        <w:t>” button. On the New Tournament screen, click “Edit Existing Tournament…</w:t>
-      </w:r>
-      <w:r>
-        <w:fldChar w:fldCharType="begin"/>
-      </w:r>
-      <w:r>
-        <w:instrText xml:space="preserve"> XE "</w:instrText>
-      </w:r>
-      <w:r>
-        <w:instrText>Edit Existing Tournament…</w:instrText>
-      </w:r>
-      <w:r>
-        <w:instrText xml:space="preserve">" </w:instrText>
-      </w:r>
-      <w:r>
-        <w:fldChar w:fldCharType="end"/>
-      </w:r>
-      <w:r>
-        <w:t>” This will bring up the “Search Tournaments</w:t>
-      </w:r>
-      <w:r>
-        <w:fldChar w:fldCharType="begin"/>
-      </w:r>
-      <w:r>
-        <w:instrText xml:space="preserve"> XE "</w:instrText>
-      </w:r>
-      <w:r>
-        <w:instrText>Search Tournaments</w:instrText>
-      </w:r>
-      <w:r>
-        <w:instrText xml:space="preserve">" </w:instrText>
-      </w:r>
-      <w:r>
-        <w:fldChar w:fldCharType="end"/>
-      </w:r>
-      <w:r>
-        <w:t>”</w:t>
-      </w:r>
-      <w:r>
-        <w:t xml:space="preserve"> screen</w:t>
-      </w:r>
-      <w:r>
-        <w:t xml:space="preserve">, figure 14. </w:t>
-      </w:r>
-      <w:r>
-        <w:t xml:space="preserve">See Search Tournaments </w:t>
-      </w:r>
-      <w:r>
-        <w:t>for the search function. Once the tournament to edit has been selected, you can then edit the pertinent information and save the entry.</w:t>
-      </w:r>
-    </w:p>
-    <w:p>
-      <w:pPr>
-        <w:pStyle w:val="Heading2"/>
-      </w:pPr>
-      <w:bookmarkStart w:id="32" w:name="_Toc509165858"/>
-      <w:r>
-        <w:t>Search Tournaments</w:t>
-      </w:r>
-      <w:bookmarkEnd w:id="32"/>
       <w:r>
         <w:fldChar w:fldCharType="begin"/>
       </w:r>
@@ -9832,27 +9655,14 @@
       <w:r>
         <w:t xml:space="preserve">Figure </w:t>
       </w:r>
-      <w:r>
-        <w:fldChar w:fldCharType="begin"/>
-      </w:r>
-      <w:r>
-        <w:instrText xml:space="preserve"> SEQ Figure \* ARABIC </w:instrText>
-      </w:r>
-      <w:r>
-        <w:fldChar w:fldCharType="separate"/>
-      </w:r>
-      <w:r>
-        <w:rPr>
-          <w:noProof/>
-        </w:rPr>
-        <w:t>14</w:t>
-      </w:r>
-      <w:r>
-        <w:rPr>
-          <w:noProof/>
-        </w:rPr>
-        <w:fldChar w:fldCharType="end"/>
-      </w:r>
+      <w:fldSimple w:instr=" SEQ Figure \* ARABIC ">
+        <w:r>
+          <w:rPr>
+            <w:noProof/>
+          </w:rPr>
+          <w:t>14</w:t>
+        </w:r>
+      </w:fldSimple>
       <w:r>
         <w:t>: Tournament Search Forms</w:t>
       </w:r>
@@ -9861,53 +9671,53 @@
       <w:pPr>
         <w:pStyle w:val="Heading3"/>
       </w:pPr>
-      <w:bookmarkStart w:id="33" w:name="_Toc509165859"/>
+      <w:bookmarkStart w:id="32" w:name="_Toc509165859"/>
       <w:r>
         <w:t>Search by Location</w:t>
       </w:r>
+      <w:bookmarkEnd w:id="32"/>
+      <w:r>
+        <w:fldChar w:fldCharType="begin"/>
+      </w:r>
+      <w:r>
+        <w:instrText xml:space="preserve"> XE "</w:instrText>
+      </w:r>
+      <w:r>
+        <w:instrText>Search by Location</w:instrText>
+      </w:r>
+      <w:r>
+        <w:instrText xml:space="preserve">" </w:instrText>
+      </w:r>
+      <w:r>
+        <w:fldChar w:fldCharType="end"/>
+      </w:r>
+    </w:p>
+    <w:p>
+      <w:pPr>
+        <w:pStyle w:val="BodyText"/>
+      </w:pPr>
+      <w:r>
+        <w:t>To search a tournament by location</w:t>
+      </w:r>
+      <w:r>
+        <w:t>:</w:t>
+      </w:r>
+      <w:r>
+        <w:t xml:space="preserve"> Fill in the name of the </w:t>
+      </w:r>
+      <w:r>
+        <w:t>bowling center in the Location field. Click “Search”. Choose the tournament. Click “Accept”.</w:t>
+      </w:r>
+    </w:p>
+    <w:p>
+      <w:pPr>
+        <w:pStyle w:val="Heading3"/>
+      </w:pPr>
+      <w:bookmarkStart w:id="33" w:name="_Toc509165860"/>
+      <w:r>
+        <w:t>Search by Event</w:t>
+      </w:r>
       <w:bookmarkEnd w:id="33"/>
-      <w:r>
-        <w:fldChar w:fldCharType="begin"/>
-      </w:r>
-      <w:r>
-        <w:instrText xml:space="preserve"> XE "</w:instrText>
-      </w:r>
-      <w:r>
-        <w:instrText>Search by Location</w:instrText>
-      </w:r>
-      <w:r>
-        <w:instrText xml:space="preserve">" </w:instrText>
-      </w:r>
-      <w:r>
-        <w:fldChar w:fldCharType="end"/>
-      </w:r>
-    </w:p>
-    <w:p>
-      <w:pPr>
-        <w:pStyle w:val="BodyText"/>
-      </w:pPr>
-      <w:r>
-        <w:t>To search a tournament by location</w:t>
-      </w:r>
-      <w:r>
-        <w:t>:</w:t>
-      </w:r>
-      <w:r>
-        <w:t xml:space="preserve"> Fill in the name of the </w:t>
-      </w:r>
-      <w:r>
-        <w:t>bowling center in the Location field. Click “Search”. Choose the tournament. Click “Accept”.</w:t>
-      </w:r>
-    </w:p>
-    <w:p>
-      <w:pPr>
-        <w:pStyle w:val="Heading3"/>
-      </w:pPr>
-      <w:bookmarkStart w:id="34" w:name="_Toc509165860"/>
-      <w:r>
-        <w:t>Search by Event</w:t>
-      </w:r>
-      <w:bookmarkEnd w:id="34"/>
       <w:r>
         <w:fldChar w:fldCharType="begin"/>
       </w:r>
@@ -9966,7 +9776,10 @@
       </w:pPr>
       <w:r>
         <w:lastRenderedPageBreak/>
-        <w:t>One important thing to note is that searching by event and location can be done with just a letter found in the name of the loc</w:t>
+        <w:t>S</w:t>
+      </w:r>
+      <w:r>
+        <w:t>earching by event and location can be done with just a letter found in the name of the loc</w:t>
       </w:r>
       <w:r>
         <w:t>ation or the event</w:t>
@@ -10000,11 +9813,11 @@
       <w:pPr>
         <w:pStyle w:val="Heading3"/>
       </w:pPr>
-      <w:bookmarkStart w:id="35" w:name="_Toc509165861"/>
+      <w:bookmarkStart w:id="34" w:name="_Toc509165861"/>
       <w:r>
         <w:t>Search by Date</w:t>
       </w:r>
-      <w:bookmarkEnd w:id="35"/>
+      <w:bookmarkEnd w:id="34"/>
       <w:r>
         <w:fldChar w:fldCharType="begin"/>
       </w:r>
@@ -10033,7 +9846,7 @@
       <w:pPr>
         <w:pStyle w:val="Heading2"/>
       </w:pPr>
-      <w:bookmarkStart w:id="36" w:name="_Toc509165862"/>
+      <w:bookmarkStart w:id="35" w:name="_Toc509165862"/>
       <w:r>
         <w:t>List Tournaments</w:t>
       </w:r>
@@ -10068,7 +9881,7 @@
       <w:r>
         <w:t>ear</w:t>
       </w:r>
-      <w:bookmarkEnd w:id="36"/>
+      <w:bookmarkEnd w:id="35"/>
       <w:r>
         <w:fldChar w:fldCharType="begin"/>
       </w:r>
@@ -10278,27 +10091,14 @@
       <w:r>
         <w:t xml:space="preserve">Figure </w:t>
       </w:r>
-      <w:r>
-        <w:fldChar w:fldCharType="begin"/>
-      </w:r>
-      <w:r>
-        <w:instrText xml:space="preserve"> SEQ Figure \* ARABIC </w:instrText>
-      </w:r>
-      <w:r>
-        <w:fldChar w:fldCharType="separate"/>
-      </w:r>
-      <w:r>
-        <w:rPr>
-          <w:noProof/>
-        </w:rPr>
-        <w:t>15</w:t>
-      </w:r>
-      <w:r>
-        <w:rPr>
-          <w:noProof/>
-        </w:rPr>
-        <w:fldChar w:fldCharType="end"/>
-      </w:r>
+      <w:fldSimple w:instr=" SEQ Figure \* ARABIC ">
+        <w:r>
+          <w:rPr>
+            <w:noProof/>
+          </w:rPr>
+          <w:t>15</w:t>
+        </w:r>
+      </w:fldSimple>
       <w:r>
         <w:t>: Tournaments</w:t>
       </w:r>
@@ -10335,12 +10135,12 @@
       <w:pPr>
         <w:pStyle w:val="Heading2"/>
       </w:pPr>
-      <w:bookmarkStart w:id="37" w:name="_Toc509165863"/>
+      <w:bookmarkStart w:id="36" w:name="_Toc509165863"/>
       <w:r>
         <w:lastRenderedPageBreak/>
         <w:t>Reports</w:t>
       </w:r>
-      <w:bookmarkEnd w:id="37"/>
+      <w:bookmarkEnd w:id="36"/>
       <w:r>
         <w:fldChar w:fldCharType="begin"/>
       </w:r>
@@ -10515,27 +10315,14 @@
       <w:r>
         <w:t xml:space="preserve">Figure </w:t>
       </w:r>
-      <w:r>
-        <w:fldChar w:fldCharType="begin"/>
-      </w:r>
-      <w:r>
-        <w:instrText xml:space="preserve"> SEQ Figure \* ARABIC </w:instrText>
-      </w:r>
-      <w:r>
-        <w:fldChar w:fldCharType="separate"/>
-      </w:r>
-      <w:r>
-        <w:rPr>
-          <w:noProof/>
-        </w:rPr>
-        <w:t>16</w:t>
-      </w:r>
-      <w:r>
-        <w:rPr>
-          <w:noProof/>
-        </w:rPr>
-        <w:fldChar w:fldCharType="end"/>
-      </w:r>
+      <w:fldSimple w:instr=" SEQ Figure \* ARABIC ">
+        <w:r>
+          <w:rPr>
+            <w:noProof/>
+          </w:rPr>
+          <w:t>16</w:t>
+        </w:r>
+      </w:fldSimple>
       <w:r>
         <w:t xml:space="preserve"> Member Scores</w:t>
       </w:r>
@@ -10677,12 +10464,12 @@
       <w:pPr>
         <w:pStyle w:val="Heading2"/>
       </w:pPr>
-      <w:bookmarkStart w:id="38" w:name="_Toc509165864"/>
+      <w:bookmarkStart w:id="37" w:name="_Toc509165864"/>
       <w:r>
         <w:lastRenderedPageBreak/>
         <w:t>Tournament Results</w:t>
       </w:r>
-      <w:bookmarkEnd w:id="38"/>
+      <w:bookmarkEnd w:id="37"/>
       <w:r>
         <w:fldChar w:fldCharType="begin"/>
       </w:r>
@@ -10818,27 +10605,14 @@
       <w:r>
         <w:t xml:space="preserve">Figure </w:t>
       </w:r>
-      <w:r>
-        <w:fldChar w:fldCharType="begin"/>
-      </w:r>
-      <w:r>
-        <w:instrText xml:space="preserve"> SEQ Figure \* ARABIC </w:instrText>
-      </w:r>
-      <w:r>
-        <w:fldChar w:fldCharType="separate"/>
-      </w:r>
-      <w:r>
-        <w:rPr>
-          <w:noProof/>
-        </w:rPr>
-        <w:t>17</w:t>
-      </w:r>
-      <w:r>
-        <w:rPr>
-          <w:noProof/>
-        </w:rPr>
-        <w:fldChar w:fldCharType="end"/>
-      </w:r>
+      <w:fldSimple w:instr=" SEQ Figure \* ARABIC ">
+        <w:r>
+          <w:rPr>
+            <w:noProof/>
+          </w:rPr>
+          <w:t>17</w:t>
+        </w:r>
+      </w:fldSimple>
       <w:r>
         <w:t xml:space="preserve"> Tournament Results</w:t>
       </w:r>
@@ -10875,11 +10649,11 @@
       <w:pPr>
         <w:pStyle w:val="Heading2"/>
       </w:pPr>
-      <w:bookmarkStart w:id="39" w:name="_Toc509165865"/>
+      <w:bookmarkStart w:id="38" w:name="_Toc509165865"/>
       <w:r>
         <w:t>Comments</w:t>
       </w:r>
-      <w:bookmarkEnd w:id="39"/>
+      <w:bookmarkEnd w:id="38"/>
       <w:r>
         <w:fldChar w:fldCharType="begin"/>
       </w:r>
@@ -10955,7 +10729,7 @@
       <w:pPr>
         <w:pStyle w:val="Heading1"/>
       </w:pPr>
-      <w:bookmarkStart w:id="40" w:name="_Toc509165866"/>
+      <w:bookmarkStart w:id="39" w:name="_Toc509165866"/>
       <w:r>
         <w:lastRenderedPageBreak/>
         <w:t>Finalize Tournament</w:t>
@@ -10965,11 +10739,11 @@
       <w:pPr>
         <w:pStyle w:val="Heading2"/>
       </w:pPr>
-      <w:commentRangeStart w:id="41"/>
+      <w:commentRangeStart w:id="40"/>
       <w:r>
         <w:t>Finalize</w:t>
       </w:r>
-      <w:commentRangeEnd w:id="41"/>
+      <w:commentRangeEnd w:id="40"/>
       <w:r>
         <w:rPr>
           <w:rStyle w:val="CommentReference"/>
@@ -10978,12 +10752,12 @@
           <w:kern w:val="0"/>
           <w:szCs w:val="20"/>
         </w:rPr>
-        <w:commentReference w:id="41"/>
+        <w:commentReference w:id="40"/>
       </w:r>
       <w:r>
         <w:t xml:space="preserve"> Tournament</w:t>
       </w:r>
-      <w:bookmarkEnd w:id="40"/>
+      <w:bookmarkEnd w:id="39"/>
       <w:r>
         <w:t xml:space="preserve"> Basics</w:t>
       </w:r>
@@ -11277,31 +11051,18 @@
       <w:r>
         <w:t xml:space="preserve">Figure </w:t>
       </w:r>
-      <w:r>
-        <w:fldChar w:fldCharType="begin"/>
-      </w:r>
-      <w:r>
-        <w:instrText xml:space="preserve"> SEQ Figure \* ARABIC </w:instrText>
-      </w:r>
-      <w:r>
-        <w:fldChar w:fldCharType="separate"/>
-      </w:r>
-      <w:r>
-        <w:rPr>
-          <w:noProof/>
-        </w:rPr>
-        <w:t>18</w:t>
-      </w:r>
-      <w:r>
-        <w:rPr>
-          <w:noProof/>
-        </w:rPr>
-        <w:fldChar w:fldCharType="end"/>
-      </w:r>
+      <w:fldSimple w:instr=" SEQ Figure \* ARABIC ">
+        <w:r>
+          <w:rPr>
+            <w:noProof/>
+          </w:rPr>
+          <w:t>18</w:t>
+        </w:r>
+      </w:fldSimple>
       <w:r>
         <w:t xml:space="preserve"> Finalize Tournament</w:t>
       </w:r>
-      <w:commentRangeStart w:id="42"/>
+      <w:commentRangeStart w:id="41"/>
       <w:r>
         <w:fldChar w:fldCharType="begin"/>
       </w:r>
@@ -11327,13 +11088,13 @@
       <w:r>
         <w:fldChar w:fldCharType="end"/>
       </w:r>
-      <w:commentRangeEnd w:id="42"/>
+      <w:commentRangeEnd w:id="41"/>
       <w:r>
         <w:rPr>
           <w:rStyle w:val="CommentReference"/>
           <w:spacing w:val="0"/>
         </w:rPr>
-        <w:commentReference w:id="42"/>
+        <w:commentReference w:id="41"/>
       </w:r>
       <w:r>
         <w:t xml:space="preserve"> Screen</w:t>
@@ -12421,12 +12182,12 @@
       <w:pPr>
         <w:pStyle w:val="Heading1"/>
       </w:pPr>
-      <w:bookmarkStart w:id="43" w:name="_Toc509165867"/>
+      <w:bookmarkStart w:id="42" w:name="_Toc509165867"/>
       <w:r>
         <w:lastRenderedPageBreak/>
         <w:t>Tools</w:t>
       </w:r>
-      <w:bookmarkEnd w:id="43"/>
+      <w:bookmarkEnd w:id="42"/>
       <w:r>
         <w:fldChar w:fldCharType="begin"/>
       </w:r>
@@ -12467,7 +12228,48 @@
         <w:fldChar w:fldCharType="end"/>
       </w:r>
       <w:r>
-        <w:t xml:space="preserve"> you will find the Update Inactive Members screen. Pick the date to find which members haven’t bowled for more than 180 days. You can click the check box by the names of the players to update to inactive status. Click “Update” to update the member information.</w:t>
+        <w:t xml:space="preserve"> </w:t>
+      </w:r>
+      <w:r>
+        <w:t>you will find miscellaneous tools which may be helpful in making use of the program simpler. The only tool that exists for now is the Update Inactive Members form.</w:t>
+      </w:r>
+    </w:p>
+    <w:p>
+      <w:pPr>
+        <w:pStyle w:val="Heading2"/>
+      </w:pPr>
+      <w:r>
+        <w:t>Update Inactive Members</w:t>
+      </w:r>
+    </w:p>
+    <w:p>
+      <w:pPr>
+        <w:pStyle w:val="BodyText"/>
+        <w:keepNext/>
+      </w:pPr>
+      <w:r>
+        <w:t>Under the Tools tab, there is an option to update inactive members. Clicking on Update Inacti</w:t>
+      </w:r>
+      <w:r>
+        <w:t>ve members will open up a form</w:t>
+      </w:r>
+      <w:r>
+        <w:t xml:space="preserve"> which allows the user to search members whom haven’t played in a tournament for more than one hundred and eighty days. Once a date is selected in the form, it will find members who have not played in tournaments for more than 180 days since the selected date.</w:t>
+      </w:r>
+      <w:r>
+        <w:t xml:space="preserve"> Each member will be displayed in the window below the date picker, and each will have a checkbox to the left of their member id</w:t>
+      </w:r>
+      <w:r>
+        <w:t xml:space="preserve">. Check these boxes and click the Update button at the bottom of the form in order to switch the checked </w:t>
+      </w:r>
+      <w:r>
+        <w:t>members’</w:t>
+      </w:r>
+      <w:r>
+        <w:t xml:space="preserve"> active status to inactive.</w:t>
+      </w:r>
+      <w:r>
+        <w:t xml:space="preserve"> The check all button will check every displayed member’s box, although at the moment the button does not work.</w:t>
       </w:r>
     </w:p>
     <w:p>
@@ -12530,27 +12332,14 @@
       <w:r>
         <w:t xml:space="preserve">Figure </w:t>
       </w:r>
-      <w:r>
-        <w:fldChar w:fldCharType="begin"/>
-      </w:r>
-      <w:r>
-        <w:instrText xml:space="preserve"> SEQ Figure \* ARABIC </w:instrText>
-      </w:r>
-      <w:r>
-        <w:fldChar w:fldCharType="separate"/>
-      </w:r>
-      <w:r>
-        <w:rPr>
-          <w:noProof/>
-        </w:rPr>
-        <w:t>19</w:t>
-      </w:r>
-      <w:r>
-        <w:rPr>
-          <w:noProof/>
-        </w:rPr>
-        <w:fldChar w:fldCharType="end"/>
-      </w:r>
+      <w:fldSimple w:instr=" SEQ Figure \* ARABIC ">
+        <w:r>
+          <w:rPr>
+            <w:noProof/>
+          </w:rPr>
+          <w:t>19</w:t>
+        </w:r>
+      </w:fldSimple>
       <w:r>
         <w:t>: Update Inactive status</w:t>
       </w:r>
@@ -12637,7 +12426,7 @@
       <w:pPr>
         <w:pStyle w:val="Heading1"/>
       </w:pPr>
-      <w:bookmarkStart w:id="44" w:name="_Toc509165868"/>
+      <w:bookmarkStart w:id="43" w:name="_Toc509165868"/>
       <w:r>
         <w:lastRenderedPageBreak/>
         <w:t>Troubles</w:t>
@@ -12663,7 +12452,7 @@
       <w:r>
         <w:t xml:space="preserve"> 9-Tap</w:t>
       </w:r>
-      <w:bookmarkEnd w:id="44"/>
+      <w:bookmarkEnd w:id="43"/>
     </w:p>
     <w:p>
       <w:pPr>
@@ -12673,7 +12462,7 @@
           <w:szCs w:val="24"/>
         </w:rPr>
       </w:pPr>
-      <w:bookmarkStart w:id="45" w:name="_Toc509165869"/>
+      <w:bookmarkStart w:id="44" w:name="_Toc509165869"/>
       <w:r>
         <w:rPr>
           <w:sz w:val="24"/>
@@ -12695,124 +12484,166 @@
         </w:rPr>
         <w:t>:</w:t>
       </w:r>
+      <w:bookmarkEnd w:id="44"/>
+    </w:p>
+    <w:p>
+      <w:pPr>
+        <w:pStyle w:val="BodyText"/>
+      </w:pPr>
+      <w:r>
+        <w:rPr>
+          <w:b/>
+        </w:rPr>
+        <w:t xml:space="preserve">If </w:t>
+      </w:r>
+      <w:r>
+        <w:rPr>
+          <w:b/>
+        </w:rPr>
+        <w:t xml:space="preserve">the </w:t>
+      </w:r>
+      <w:r>
+        <w:rPr>
+          <w:b/>
+        </w:rPr>
+        <w:t xml:space="preserve">tournament has </w:t>
+      </w:r>
+      <w:r>
+        <w:rPr>
+          <w:b/>
+        </w:rPr>
+        <w:t>five (5) or fewer</w:t>
+      </w:r>
+      <w:r>
+        <w:rPr>
+          <w:b/>
+        </w:rPr>
+        <w:t xml:space="preserve"> participants, DO NOT USE PROGRAM. Keep track of player data manually</w:t>
+      </w:r>
+      <w:r>
+        <w:t>.</w:t>
+      </w:r>
+    </w:p>
+    <w:p>
+      <w:pPr>
+        <w:pStyle w:val="BodyText"/>
+      </w:pPr>
+      <w:r>
+        <w:t>Doubles tournaments are not supported by the software at this time</w:t>
+      </w:r>
+      <w:r>
+        <w:t>. LEAVE DOUBLES UNCHECKED ON THE NEW TOURNAMENT SCREEN/DIALOG.</w:t>
+      </w:r>
+      <w:r>
+        <w:t xml:space="preserve"> </w:t>
+      </w:r>
+      <w:r>
+        <w:rPr>
+          <w:b/>
+          <w:u w:val="single"/>
+        </w:rPr>
+        <w:t>NOTE</w:t>
+      </w:r>
+      <w:r>
+        <w:t>:</w:t>
+      </w:r>
+      <w:r>
+        <w:t xml:space="preserve"> the Doubles Checkbox has been omitted from the program for now.</w:t>
+      </w:r>
+    </w:p>
+    <w:p>
+      <w:pPr>
+        <w:pStyle w:val="BodyText"/>
+      </w:pPr>
+      <w:r>
+        <w:t>Do not start a new tournament before the current tournament you are working on has been finalized.</w:t>
+      </w:r>
+    </w:p>
+    <w:p>
+      <w:pPr>
+        <w:pStyle w:val="BodyText"/>
+      </w:pPr>
+      <w:r>
+        <w:t xml:space="preserve">On the Member Scores screen, </w:t>
+      </w:r>
+      <w:r>
+        <w:t xml:space="preserve">as you are entering the member for the first time; </w:t>
+      </w:r>
+      <w:r>
+        <w:t xml:space="preserve">if the member has been comped into the tournament, make sure the </w:t>
+      </w:r>
+      <w:r>
+        <w:t>Comp Entry box has been checked before clicking the “Add New/Update Record button. This cannot be adjusted after the member’s scores have been entered and saved.</w:t>
+      </w:r>
+    </w:p>
+    <w:p>
+      <w:pPr>
+        <w:pStyle w:val="Heading2"/>
+      </w:pPr>
+      <w:bookmarkStart w:id="45" w:name="_Toc509165870"/>
+      <w:r>
+        <w:t>Screen “splitting”</w:t>
+      </w:r>
+      <w:r>
+        <w:t xml:space="preserve"> on resize</w:t>
+      </w:r>
       <w:bookmarkEnd w:id="45"/>
     </w:p>
     <w:p>
       <w:pPr>
         <w:pStyle w:val="BodyText"/>
+        <w:keepNext/>
+      </w:pPr>
+      <w:r>
+        <w:t xml:space="preserve">When resizing </w:t>
+      </w:r>
+      <w:r>
+        <w:t>the 9-Tap program the screen may split into individual screens contained within the main program display screen</w:t>
+      </w:r>
+      <w:r>
+        <w:t>.</w:t>
+      </w:r>
+    </w:p>
+    <w:p>
+      <w:pPr>
+        <w:pStyle w:val="BodyText"/>
+        <w:keepNext/>
       </w:pPr>
       <w:r>
         <w:rPr>
           <w:b/>
-        </w:rPr>
-        <w:t xml:space="preserve">If </w:t>
-      </w:r>
-      <w:r>
-        <w:rPr>
-          <w:b/>
-        </w:rPr>
-        <w:t xml:space="preserve">the </w:t>
-      </w:r>
-      <w:r>
-        <w:rPr>
-          <w:b/>
-        </w:rPr>
-        <w:t xml:space="preserve">tournament has </w:t>
-      </w:r>
-      <w:r>
-        <w:rPr>
-          <w:b/>
-        </w:rPr>
-        <w:t>five (5) or fewer</w:t>
-      </w:r>
-      <w:r>
-        <w:rPr>
-          <w:b/>
-        </w:rPr>
-        <w:t xml:space="preserve"> participants, DO NOT USE PROGRAM. Keep track of player data manually</w:t>
-      </w:r>
-      <w:r>
-        <w:t>.</w:t>
-      </w:r>
-    </w:p>
-    <w:p>
-      <w:pPr>
-        <w:pStyle w:val="BodyText"/>
-      </w:pPr>
-      <w:r>
-        <w:t>Doubles tournaments are not supported by the software at this time</w:t>
-      </w:r>
-      <w:r>
-        <w:t>. LEAVE DOUBLES UNCHECKED ON THE NEW TOURNAMENT SCREEN/DIALOG.</w:t>
-      </w:r>
-    </w:p>
-    <w:p>
-      <w:pPr>
-        <w:pStyle w:val="BodyText"/>
-      </w:pPr>
-      <w:r>
-        <w:t>Do not start a new tournament before the current tournament you are working on has been finalized.</w:t>
-      </w:r>
-    </w:p>
-    <w:p>
-      <w:pPr>
-        <w:pStyle w:val="BodyText"/>
-      </w:pPr>
-      <w:r>
-        <w:t xml:space="preserve">On the Member Scores screen, </w:t>
-      </w:r>
-      <w:r>
-        <w:t xml:space="preserve">as you are entering the member for the first time; </w:t>
-      </w:r>
-      <w:r>
-        <w:t xml:space="preserve">if the member has been comped into the tournament, make sure the </w:t>
-      </w:r>
-      <w:r>
-        <w:t>Comp Entry box has been checked before clicking the “Add New/Update Record button. This cannot be adjusted after the member’s scores have been entered and saved.</w:t>
-      </w:r>
-    </w:p>
-    <w:p>
-      <w:pPr>
-        <w:pStyle w:val="Heading2"/>
-      </w:pPr>
-      <w:bookmarkStart w:id="46" w:name="_Toc509165870"/>
-      <w:r>
-        <w:t>Screen “splitting”</w:t>
-      </w:r>
-      <w:r>
-        <w:t xml:space="preserve"> on resize</w:t>
-      </w:r>
-      <w:bookmarkEnd w:id="46"/>
+          <w:u w:val="single"/>
+        </w:rPr>
+        <w:t>NOTE</w:t>
+      </w:r>
+      <w:r>
+        <w:t xml:space="preserve">: </w:t>
+      </w:r>
+      <w:r>
+        <w:t>As of</w:t>
+      </w:r>
+      <w:r>
+        <w:t xml:space="preserve"> 7/30/2018</w:t>
+      </w:r>
+      <w:r>
+        <w:t xml:space="preserve"> the program no longer </w:t>
+      </w:r>
+      <w:r>
+        <w:t>split</w:t>
+      </w:r>
+      <w:r>
+        <w:t>s</w:t>
+      </w:r>
+      <w:r>
+        <w:t xml:space="preserve"> into other windows as described above.</w:t>
+      </w:r>
     </w:p>
     <w:p>
       <w:pPr>
         <w:pStyle w:val="BodyText"/>
         <w:keepNext/>
       </w:pPr>
-      <w:r>
-        <w:t xml:space="preserve">When resizing </w:t>
-      </w:r>
-      <w:r>
-        <w:t>the 9-Tap program the screen may split into individual screens contained within the main program display screen</w:t>
-      </w:r>
-      <w:r>
-        <w:t>.</w:t>
-      </w:r>
-    </w:p>
-    <w:p>
-      <w:pPr>
-        <w:pStyle w:val="BodyText"/>
-        <w:keepNext/>
-      </w:pPr>
-      <w:r>
-        <w:t>NOTE: As of  7/30/2018 the program no longer seems to split into other windows as described above.</w:t>
-      </w:r>
-    </w:p>
-    <w:p>
-      <w:pPr>
-        <w:pStyle w:val="BodyText"/>
-        <w:keepNext/>
-      </w:pPr>
+      <w:bookmarkStart w:id="46" w:name="_GoBack"/>
       <w:r>
         <w:rPr>
           <w:noProof/>
@@ -12859,6 +12690,7 @@
           </wp:inline>
         </w:drawing>
       </w:r>
+      <w:bookmarkEnd w:id="46"/>
     </w:p>
     <w:p>
       <w:pPr>
@@ -12868,27 +12700,14 @@
       <w:r>
         <w:t xml:space="preserve">Figure </w:t>
       </w:r>
-      <w:r>
-        <w:fldChar w:fldCharType="begin"/>
-      </w:r>
-      <w:r>
-        <w:instrText xml:space="preserve"> SEQ Figure \* ARABIC </w:instrText>
-      </w:r>
-      <w:r>
-        <w:fldChar w:fldCharType="separate"/>
-      </w:r>
-      <w:r>
-        <w:rPr>
-          <w:noProof/>
-        </w:rPr>
-        <w:t>20</w:t>
-      </w:r>
-      <w:r>
-        <w:rPr>
-          <w:noProof/>
-        </w:rPr>
-        <w:fldChar w:fldCharType="end"/>
-      </w:r>
+      <w:fldSimple w:instr=" SEQ Figure \* ARABIC ">
+        <w:r>
+          <w:rPr>
+            <w:noProof/>
+          </w:rPr>
+          <w:t>20</w:t>
+        </w:r>
+      </w:fldSimple>
       <w:r>
         <w:t xml:space="preserve"> Showing split screen error</w:t>
       </w:r>
@@ -12956,27 +12775,14 @@
                             <w:r>
                               <w:t xml:space="preserve">Figure </w:t>
                             </w:r>
-                            <w:r>
-                              <w:fldChar w:fldCharType="begin"/>
-                            </w:r>
-                            <w:r>
-                              <w:instrText xml:space="preserve"> SEQ Figure \* ARABIC </w:instrText>
-                            </w:r>
-                            <w:r>
-                              <w:fldChar w:fldCharType="separate"/>
-                            </w:r>
-                            <w:r>
-                              <w:rPr>
-                                <w:noProof/>
-                              </w:rPr>
-                              <w:t>21</w:t>
-                            </w:r>
-                            <w:r>
-                              <w:rPr>
-                                <w:noProof/>
-                              </w:rPr>
-                              <w:fldChar w:fldCharType="end"/>
-                            </w:r>
+                            <w:fldSimple w:instr=" SEQ Figure \* ARABIC ">
+                              <w:r>
+                                <w:rPr>
+                                  <w:noProof/>
+                                </w:rPr>
+                                <w:t>21</w:t>
+                              </w:r>
+                            </w:fldSimple>
                             <w:r>
                               <w:t xml:space="preserve"> Inner screen maximize</w:t>
                             </w:r>
@@ -13018,27 +12824,14 @@
                       <w:r>
                         <w:t xml:space="preserve">Figure </w:t>
                       </w:r>
-                      <w:r>
-                        <w:fldChar w:fldCharType="begin"/>
-                      </w:r>
-                      <w:r>
-                        <w:instrText xml:space="preserve"> SEQ Figure \* ARABIC </w:instrText>
-                      </w:r>
-                      <w:r>
-                        <w:fldChar w:fldCharType="separate"/>
-                      </w:r>
-                      <w:r>
-                        <w:rPr>
-                          <w:noProof/>
-                        </w:rPr>
-                        <w:t>21</w:t>
-                      </w:r>
-                      <w:r>
-                        <w:rPr>
-                          <w:noProof/>
-                        </w:rPr>
-                        <w:fldChar w:fldCharType="end"/>
-                      </w:r>
+                      <w:fldSimple w:instr=" SEQ Figure \* ARABIC ">
+                        <w:r>
+                          <w:rPr>
+                            <w:noProof/>
+                          </w:rPr>
+                          <w:t>21</w:t>
+                        </w:r>
+                      </w:fldSimple>
                       <w:r>
                         <w:t xml:space="preserve"> Inner screen maximize</w:t>
                       </w:r>
@@ -13325,6 +13118,11 @@
     </w:p>
     <w:p>
       <w:pPr>
+        <w:pStyle w:val="BodyText"/>
+      </w:pPr>
+    </w:p>
+    <w:p>
+      <w:pPr>
         <w:pStyle w:val="PartTitle"/>
         <w:framePr w:wrap="notBeside"/>
       </w:pPr>
@@ -13929,6 +13727,24 @@
     </w:p>
     <w:p>
       <w:pPr>
+        <w:pStyle w:val="BodyText"/>
+        <w:numPr>
+          <w:ilvl w:val="0"/>
+          <w:numId w:val="41"/>
+        </w:numPr>
+      </w:pPr>
+      <w:r>
+        <w:t>Delete Region Data</w:t>
+      </w:r>
+      <w:r>
+        <w:t>—</w:t>
+      </w:r>
+      <w:r>
+        <w:t xml:space="preserve"> Prompts user to delete ALL region data.</w:t>
+      </w:r>
+    </w:p>
+    <w:p>
+      <w:pPr>
         <w:pStyle w:val="Heading2"/>
       </w:pPr>
       <w:bookmarkStart w:id="51" w:name="_Toc509165875"/>
@@ -14095,6 +13911,7 @@
         </w:numPr>
       </w:pPr>
       <w:r>
+        <w:lastRenderedPageBreak/>
         <w:t>Middle Initial—member’s middle initial.</w:t>
       </w:r>
     </w:p>
@@ -14107,7 +13924,6 @@
         </w:numPr>
       </w:pPr>
       <w:r>
-        <w:lastRenderedPageBreak/>
         <w:t xml:space="preserve">Member Information </w:t>
       </w:r>
       <w:r>
@@ -14330,7 +14146,13 @@
         <w:fldChar w:fldCharType="end"/>
       </w:r>
       <w:r>
-        <w:t>—member’s average over the last 30 games he’s bowled.</w:t>
+        <w:t>—member’s ave</w:t>
+      </w:r>
+      <w:r>
+        <w:t>rage over the last 30 games they’ve</w:t>
+      </w:r>
+      <w:r>
+        <w:t xml:space="preserve"> bowled.</w:t>
       </w:r>
     </w:p>
     <w:p>
@@ -14574,6 +14396,7 @@
         </w:numPr>
       </w:pPr>
       <w:r>
+        <w:lastRenderedPageBreak/>
         <w:t>Save—saves member information to the database.</w:t>
       </w:r>
     </w:p>
@@ -14586,7 +14409,6 @@
         </w:numPr>
       </w:pPr>
       <w:r>
-        <w:lastRenderedPageBreak/>
         <w:t>Import—imports member information from an excel file.</w:t>
       </w:r>
     </w:p>
@@ -14685,6 +14507,9 @@
       <w:r>
         <w:t>—goes to first record</w:t>
       </w:r>
+      <w:r>
+        <w:t xml:space="preserve"> in database</w:t>
+      </w:r>
     </w:p>
     <w:p>
       <w:pPr>
@@ -14715,6 +14540,9 @@
       <w:r>
         <w:t>—goes to last record</w:t>
       </w:r>
+      <w:r>
+        <w:t xml:space="preserve"> in database</w:t>
+      </w:r>
     </w:p>
     <w:p>
       <w:pPr>
@@ -14810,7 +14638,7 @@
         <w:t xml:space="preserve"> button </w:t>
       </w:r>
       <w:r>
-        <w:t>brings up currently selected member’s statistics.</w:t>
+        <w:t>brings up a window containing the selected player’s statistics.</w:t>
       </w:r>
     </w:p>
     <w:p>
@@ -15211,6 +15039,7 @@
         </w:numPr>
       </w:pPr>
       <w:r>
+        <w:lastRenderedPageBreak/>
         <w:t>First Name</w:t>
       </w:r>
       <w:r>
@@ -15251,7 +15080,6 @@
         </w:numPr>
       </w:pPr>
       <w:r>
-        <w:lastRenderedPageBreak/>
         <w:t>Middle Initial</w:t>
       </w:r>
       <w:r>
@@ -15487,6 +15315,9 @@
       <w:r>
         <w:t>—where the member’s four scratch scores are entered. The total is automatically calculated and displayed after the fourth score.</w:t>
       </w:r>
+      <w:r>
+        <w:t xml:space="preserve"> Entering a score will automatically send the cursor to the next score to be entered.</w:t>
+      </w:r>
     </w:p>
     <w:p>
       <w:pPr>
@@ -15515,7 +15346,13 @@
         <w:fldChar w:fldCharType="end"/>
       </w:r>
       <w:r>
-        <w:t xml:space="preserve"> Scores—the member’s adjusted scores from her bowling handicap are automatically calculated and displayed.</w:t>
+        <w:t xml:space="preserve"> Scores—the m</w:t>
+      </w:r>
+      <w:r>
+        <w:t>ember’s adjusted scores from their</w:t>
+      </w:r>
+      <w:r>
+        <w:t xml:space="preserve"> bowling handicap are automatically calculated and displayed.</w:t>
       </w:r>
     </w:p>
     <w:p>
@@ -15833,6 +15670,7 @@
         </w:numPr>
       </w:pPr>
       <w:r>
+        <w:lastRenderedPageBreak/>
         <w:t>Score Type</w:t>
       </w:r>
       <w:r>
@@ -15875,7 +15713,6 @@
         </w:numPr>
       </w:pPr>
       <w:r>
-        <w:lastRenderedPageBreak/>
         <w:t>Add New/Update Record</w:t>
       </w:r>
       <w:r>
@@ -16359,6 +16196,7 @@
         </w:numPr>
       </w:pPr>
       <w:r>
+        <w:lastRenderedPageBreak/>
         <w:t>Game</w:t>
       </w:r>
       <w:r>
@@ -16389,7 +16227,6 @@
         </w:numPr>
       </w:pPr>
       <w:r>
-        <w:lastRenderedPageBreak/>
         <w:t>Tournament Results</w:t>
       </w:r>
       <w:r>
@@ -17887,6 +17724,48 @@
           <w:szCs w:val="24"/>
         </w:rPr>
         <w:t>Handicap</w:t>
+      </w:r>
+    </w:p>
+    <w:p>
+      <w:pPr>
+        <w:pStyle w:val="BodyText"/>
+        <w:rPr>
+          <w:szCs w:val="24"/>
+        </w:rPr>
+      </w:pPr>
+      <w:r>
+        <w:rPr>
+          <w:b/>
+          <w:sz w:val="28"/>
+          <w:szCs w:val="28"/>
+        </w:rPr>
+        <w:t xml:space="preserve">Comp/Comped </w:t>
+      </w:r>
+      <w:r>
+        <w:rPr>
+          <w:b/>
+          <w:sz w:val="28"/>
+          <w:szCs w:val="28"/>
+        </w:rPr>
+        <w:t xml:space="preserve"> </w:t>
+      </w:r>
+      <w:r>
+        <w:rPr>
+          <w:szCs w:val="24"/>
+        </w:rPr>
+        <w:t>Complimentary entry into a tournament. A player who h</w:t>
+      </w:r>
+      <w:r>
+        <w:rPr>
+          <w:szCs w:val="24"/>
+        </w:rPr>
+        <w:t>as been comped</w:t>
+      </w:r>
+      <w:r>
+        <w:rPr>
+          <w:szCs w:val="24"/>
+        </w:rPr>
+        <w:t xml:space="preserve"> does not need to pay the fee to enter into the tournament</w:t>
       </w:r>
     </w:p>
     <w:p>
@@ -17919,20 +17798,20 @@
 
 <file path=word/comments.xml><?xml version="1.0" encoding="utf-8"?>
 <w:comments xmlns:wpc="http://schemas.microsoft.com/office/word/2010/wordprocessingCanvas" xmlns:mc="http://schemas.openxmlformats.org/markup-compatibility/2006" xmlns:o="urn:schemas-microsoft-com:office:office" xmlns:r="http://schemas.openxmlformats.org/officeDocument/2006/relationships" xmlns:m="http://schemas.openxmlformats.org/officeDocument/2006/math" xmlns:v="urn:schemas-microsoft-com:vml" xmlns:wp14="http://schemas.microsoft.com/office/word/2010/wordprocessingDrawing" xmlns:wp="http://schemas.openxmlformats.org/drawingml/2006/wordprocessingDrawing" xmlns:w10="urn:schemas-microsoft-com:office:word" xmlns:w="http://schemas.openxmlformats.org/wordprocessingml/2006/main" xmlns:w14="http://schemas.microsoft.com/office/word/2010/wordml" xmlns:w15="http://schemas.microsoft.com/office/word/2012/wordml" xmlns:wpg="http://schemas.microsoft.com/office/word/2010/wordprocessingGroup" xmlns:wpi="http://schemas.microsoft.com/office/word/2010/wordprocessingInk" xmlns:wne="http://schemas.microsoft.com/office/word/2006/wordml" xmlns:wps="http://schemas.microsoft.com/office/word/2010/wordprocessingShape" mc:Ignorable="w14 w15 wp14">
+  <w:comment w:id="40" w:author="Timothy Fair" w:date="2018-07-25T14:36:00Z" w:initials="TF">
+    <w:p>
+      <w:pPr>
+        <w:pStyle w:val="CommentText"/>
+      </w:pPr>
+      <w:r>
+        <w:rPr>
+          <w:rStyle w:val="CommentReference"/>
+        </w:rPr>
+        <w:annotationRef/>
+      </w:r>
+    </w:p>
+  </w:comment>
   <w:comment w:id="41" w:author="Timothy Fair" w:date="2018-07-25T14:36:00Z" w:initials="TF">
-    <w:p>
-      <w:pPr>
-        <w:pStyle w:val="CommentText"/>
-      </w:pPr>
-      <w:r>
-        <w:rPr>
-          <w:rStyle w:val="CommentReference"/>
-        </w:rPr>
-        <w:annotationRef/>
-      </w:r>
-    </w:p>
-  </w:comment>
-  <w:comment w:id="42" w:author="Timothy Fair" w:date="2018-07-25T14:36:00Z" w:initials="TF">
     <w:p>
       <w:pPr>
         <w:pStyle w:val="CommentText"/>
@@ -18076,7 +17955,7 @@
         <w:rStyle w:val="PageNumber"/>
         <w:noProof/>
       </w:rPr>
-      <w:t>29</w:t>
+      <w:t>38</w:t>
     </w:r>
     <w:r>
       <w:rPr>
@@ -18126,7 +18005,7 @@
         <w:rStyle w:val="PageNumber"/>
         <w:noProof/>
       </w:rPr>
-      <w:t>45</w:t>
+      <w:t>42</w:t>
     </w:r>
     <w:r>
       <w:rPr>
@@ -22289,7 +22168,7 @@
 </file>
 
 <file path=customXml/itemProps1.xml><?xml version="1.0" encoding="utf-8"?>
-<ds:datastoreItem xmlns:ds="http://schemas.openxmlformats.org/officeDocument/2006/customXml" ds:itemID="{B011774D-5127-4AD7-A835-AE40441DAD15}">
+<ds:datastoreItem xmlns:ds="http://schemas.openxmlformats.org/officeDocument/2006/customXml" ds:itemID="{09025088-86DC-4FAF-8E0E-3E4ADD776180}">
   <ds:schemaRefs>
     <ds:schemaRef ds:uri="http://schemas.openxmlformats.org/officeDocument/2006/bibliography"/>
   </ds:schemaRefs>

</xml_diff>

<commit_message>
Added a visual reference for the Import button in the Conversion program section of the manual.
</commit_message>
<xml_diff>
--- a/9tapUserManual.docx
+++ b/9tapUserManual.docx
@@ -4339,7 +4339,7 @@
             <v:path o:extrusionok="f" gradientshapeok="t" o:connecttype="rect"/>
             <o:lock v:ext="edit" aspectratio="t"/>
           </v:shapetype>
-          <v:shape id="_x0000_i1025" type="#_x0000_t75" style="width:383.25pt;height:195pt">
+          <v:shape id="_x0000_i1025" type="#_x0000_t75" style="width:383.75pt;height:194.95pt">
             <v:imagedata r:id="rId14" o:title="9TapMainMenu"/>
           </v:shape>
         </w:pict>
@@ -12643,7 +12643,6 @@
         <w:pStyle w:val="BodyText"/>
         <w:keepNext/>
       </w:pPr>
-      <w:bookmarkStart w:id="46" w:name="_GoBack"/>
       <w:r>
         <w:rPr>
           <w:noProof/>
@@ -12690,7 +12689,6 @@
           </wp:inline>
         </w:drawing>
       </w:r>
-      <w:bookmarkEnd w:id="46"/>
     </w:p>
     <w:p>
       <w:pPr>
@@ -12925,7 +12923,7 @@
           <w:szCs w:val="24"/>
         </w:rPr>
       </w:pPr>
-      <w:bookmarkStart w:id="47" w:name="_Toc509165871"/>
+      <w:bookmarkStart w:id="46" w:name="_Toc509165871"/>
       <w:r>
         <w:rPr>
           <w:sz w:val="24"/>
@@ -12934,7 +12932,7 @@
         <w:lastRenderedPageBreak/>
         <w:t>ReadMe File</w:t>
       </w:r>
-      <w:bookmarkEnd w:id="47"/>
+      <w:bookmarkEnd w:id="46"/>
       <w:r>
         <w:rPr>
           <w:sz w:val="24"/>
@@ -13053,7 +13051,7 @@
       <w:pPr>
         <w:pStyle w:val="Heading1"/>
       </w:pPr>
-      <w:bookmarkStart w:id="48" w:name="_Toc509165872"/>
+      <w:bookmarkStart w:id="47" w:name="_Toc509165872"/>
       <w:r>
         <w:lastRenderedPageBreak/>
         <w:t>Conver</w:t>
@@ -13061,60 +13059,103 @@
       <w:r>
         <w:t>sion Program</w:t>
       </w:r>
+      <w:bookmarkEnd w:id="47"/>
+      <w:r>
+        <w:fldChar w:fldCharType="begin"/>
+      </w:r>
+      <w:r>
+        <w:instrText xml:space="preserve"> XE "</w:instrText>
+      </w:r>
+      <w:r>
+        <w:instrText>Conversion Program</w:instrText>
+      </w:r>
+      <w:r>
+        <w:instrText xml:space="preserve">" </w:instrText>
+      </w:r>
+      <w:r>
+        <w:fldChar w:fldCharType="end"/>
+      </w:r>
+    </w:p>
+    <w:p>
+      <w:pPr>
+        <w:pStyle w:val="BodyText"/>
+      </w:pPr>
+      <w:r>
+        <w:t>Conversion fr</w:t>
+      </w:r>
+      <w:r>
+        <w:t>om old version of 9-Tap program for the Las Vegas and Hawaii regions. (Talk to Xavier to get outline/details of the steps</w:t>
+      </w:r>
+      <w:r>
+        <w:t>. Have emailed him 3/14/18</w:t>
+      </w:r>
+      <w:r>
+        <w:t>)</w:t>
+      </w:r>
+    </w:p>
+    <w:p>
+      <w:pPr>
+        <w:pStyle w:val="BodyText"/>
+      </w:pPr>
+      <w:r>
+        <w:t>For changing to this new version of the software. The conversion program imports member information and member statistics. This process can take over four hours depending on your computer. First the .dat member file is imported. Then the Excel files for the members are imported.</w:t>
+      </w:r>
+    </w:p>
+    <w:p>
+      <w:pPr>
+        <w:pStyle w:val="BodyText"/>
+      </w:pPr>
+      <w:r>
+        <w:t xml:space="preserve">If you are pressed for time you can import just the .dat files. Then, as needed, use the “Import” button on the member information screen to import individual members. </w:t>
+      </w:r>
+    </w:p>
+    <w:p>
+      <w:pPr>
+        <w:pStyle w:val="BodyText"/>
+      </w:pPr>
+      <w:r>
+        <w:pict w14:anchorId="3F82314C">
+          <v:shape id="_x0000_i1027" type="#_x0000_t75" style="width:384.45pt;height:207.15pt">
+            <v:imagedata r:id="rId53" o:title="ImportButtonExample"/>
+          </v:shape>
+        </w:pict>
+      </w:r>
+    </w:p>
+    <w:p>
+      <w:pPr>
+        <w:pStyle w:val="BodyText"/>
+        <w:rPr>
+          <w:b/>
+          <w:sz w:val="16"/>
+          <w:szCs w:val="16"/>
+        </w:rPr>
+      </w:pPr>
+      <w:r>
+        <w:rPr>
+          <w:b/>
+          <w:sz w:val="16"/>
+          <w:szCs w:val="16"/>
+        </w:rPr>
+        <w:t>Figure 22</w:t>
+      </w:r>
+      <w:r>
+        <w:rPr>
+          <w:b/>
+          <w:sz w:val="16"/>
+          <w:szCs w:val="16"/>
+        </w:rPr>
+        <w:t xml:space="preserve"> </w:t>
+      </w:r>
+      <w:bookmarkStart w:id="48" w:name="_GoBack"/>
       <w:bookmarkEnd w:id="48"/>
       <w:r>
-        <w:fldChar w:fldCharType="begin"/>
-      </w:r>
-      <w:r>
-        <w:instrText xml:space="preserve"> XE "</w:instrText>
-      </w:r>
-      <w:r>
-        <w:instrText>Conversion Program</w:instrText>
-      </w:r>
-      <w:r>
-        <w:instrText xml:space="preserve">" </w:instrText>
-      </w:r>
-      <w:r>
-        <w:fldChar w:fldCharType="end"/>
-      </w:r>
-    </w:p>
-    <w:p>
-      <w:pPr>
-        <w:pStyle w:val="BodyText"/>
-      </w:pPr>
-      <w:r>
-        <w:t>Conversion fr</w:t>
-      </w:r>
-      <w:r>
-        <w:t>om old version of 9-Tap program for the Las Vegas and Hawaii regions. (Talk to Xavier to get outline/details of the steps</w:t>
-      </w:r>
-      <w:r>
-        <w:t>. Have emailed him 3/14/18</w:t>
-      </w:r>
-      <w:r>
-        <w:t>)</w:t>
-      </w:r>
-    </w:p>
-    <w:p>
-      <w:pPr>
-        <w:pStyle w:val="BodyText"/>
-      </w:pPr>
-      <w:r>
-        <w:t>For changing to this new version of the software. The conversion program imports member information and member statistics. This process can take over four hours depending on your computer. First the .dat member file is imported. Then the Excel files for the members are imported.</w:t>
-      </w:r>
-    </w:p>
-    <w:p>
-      <w:pPr>
-        <w:pStyle w:val="BodyText"/>
-      </w:pPr>
-      <w:r>
-        <w:t xml:space="preserve">If you are pressed for time you can import just the .dat files. Then, as needed, use the “Import” button on the member information screen to import individual members. </w:t>
-      </w:r>
-    </w:p>
-    <w:p>
-      <w:pPr>
-        <w:pStyle w:val="BodyText"/>
-      </w:pPr>
+        <w:rPr>
+          <w:b/>
+          <w:sz w:val="16"/>
+          <w:szCs w:val="16"/>
+        </w:rPr>
+        <w:t>- Highlighted in red is the import button to begin conversion.</w:t>
+      </w:r>
     </w:p>
     <w:p>
       <w:pPr>
@@ -16457,9 +16498,9 @@
     <w:p>
       <w:pPr>
         <w:sectPr>
-          <w:headerReference w:type="default" r:id="rId53"/>
-          <w:footerReference w:type="default" r:id="rId54"/>
-          <w:headerReference w:type="first" r:id="rId55"/>
+          <w:headerReference w:type="default" r:id="rId54"/>
+          <w:footerReference w:type="default" r:id="rId55"/>
+          <w:headerReference w:type="first" r:id="rId56"/>
           <w:type w:val="continuous"/>
           <w:pgSz w:w="12240" w:h="15840" w:code="1"/>
           <w:pgMar w:top="1800" w:right="1195" w:bottom="1440" w:left="3355" w:header="720" w:footer="720" w:gutter="0"/>
@@ -18005,7 +18046,7 @@
         <w:rStyle w:val="PageNumber"/>
         <w:noProof/>
       </w:rPr>
-      <w:t>42</w:t>
+      <w:t>44</w:t>
     </w:r>
     <w:r>
       <w:rPr>
@@ -22168,7 +22209,7 @@
 </file>
 
 <file path=customXml/itemProps1.xml><?xml version="1.0" encoding="utf-8"?>
-<ds:datastoreItem xmlns:ds="http://schemas.openxmlformats.org/officeDocument/2006/customXml" ds:itemID="{09025088-86DC-4FAF-8E0E-3E4ADD776180}">
+<ds:datastoreItem xmlns:ds="http://schemas.openxmlformats.org/officeDocument/2006/customXml" ds:itemID="{2580E2B4-57E3-4775-A131-BFCA433761A9}">
   <ds:schemaRefs>
     <ds:schemaRef ds:uri="http://schemas.openxmlformats.org/officeDocument/2006/bibliography"/>
   </ds:schemaRefs>

</xml_diff>

<commit_message>
Removed all iterations of "Error! Bookmark not defined" in the document.
</commit_message>
<xml_diff>
--- a/9tapUserManual.docx
+++ b/9tapUserManual.docx
@@ -4028,7 +4028,7 @@
           <w:b/>
           <w:bCs/>
         </w:rPr>
-        <w:t>Error! Bookmark not defined.</w:t>
+        <w:t xml:space="preserve"> </w:t>
       </w:r>
       <w:r>
         <w:fldChar w:fldCharType="end"/>
@@ -4353,14 +4353,27 @@
       <w:r>
         <w:t xml:space="preserve">Figure </w:t>
       </w:r>
-      <w:fldSimple w:instr=" SEQ Figure \* ARABIC ">
-        <w:r>
-          <w:rPr>
-            <w:noProof/>
-          </w:rPr>
-          <w:t>1</w:t>
-        </w:r>
-      </w:fldSimple>
+      <w:r>
+        <w:fldChar w:fldCharType="begin"/>
+      </w:r>
+      <w:r>
+        <w:instrText xml:space="preserve"> SEQ Figure \* ARABIC </w:instrText>
+      </w:r>
+      <w:r>
+        <w:fldChar w:fldCharType="separate"/>
+      </w:r>
+      <w:r>
+        <w:rPr>
+          <w:noProof/>
+        </w:rPr>
+        <w:t>1</w:t>
+      </w:r>
+      <w:r>
+        <w:rPr>
+          <w:noProof/>
+        </w:rPr>
+        <w:fldChar w:fldCharType="end"/>
+      </w:r>
       <w:r>
         <w:t>: 9-Tap Main Menu</w:t>
       </w:r>
@@ -4405,7 +4418,7 @@
           <w:b/>
           <w:bCs/>
         </w:rPr>
-        <w:t>Error! Bookmark not defined.</w:t>
+        <w:t xml:space="preserve"> </w:t>
       </w:r>
       <w:r>
         <w:fldChar w:fldCharType="end"/>
@@ -4481,7 +4494,7 @@
           <w:b/>
           <w:bCs/>
         </w:rPr>
-        <w:t>Error! Bookmark not defined.</w:t>
+        <w:t xml:space="preserve"> </w:t>
       </w:r>
       <w:r>
         <w:fldChar w:fldCharType="end"/>
@@ -4549,7 +4562,7 @@
           <w:b/>
           <w:bCs/>
         </w:rPr>
-        <w:t>Error! Bookmark not defined.</w:t>
+        <w:t xml:space="preserve"> </w:t>
       </w:r>
       <w:r>
         <w:fldChar w:fldCharType="end"/>
@@ -4625,7 +4638,7 @@
           <w:b/>
           <w:bCs/>
         </w:rPr>
-        <w:t>Error! Bookmark not defined.</w:t>
+        <w:t xml:space="preserve"> </w:t>
       </w:r>
       <w:r>
         <w:fldChar w:fldCharType="end"/>
@@ -4650,7 +4663,7 @@
           <w:b/>
           <w:bCs/>
         </w:rPr>
-        <w:t>Error! Bookmark not defined.</w:t>
+        <w:t xml:space="preserve"> </w:t>
       </w:r>
       <w:r>
         <w:fldChar w:fldCharType="end"/>
@@ -4751,7 +4764,7 @@
           <w:b/>
           <w:bCs/>
         </w:rPr>
-        <w:t>Error! Bookmark not defined.</w:t>
+        <w:t xml:space="preserve"> </w:t>
       </w:r>
       <w:r>
         <w:fldChar w:fldCharType="end"/>
@@ -4816,7 +4829,7 @@
           <w:b/>
           <w:bCs/>
         </w:rPr>
-        <w:t>Error! Bookmark not defined.</w:t>
+        <w:t xml:space="preserve"> </w:t>
       </w:r>
       <w:r>
         <w:fldChar w:fldCharType="end"/>
@@ -4884,7 +4897,7 @@
           <w:b/>
           <w:bCs/>
         </w:rPr>
-        <w:t>Error! Bookmark not defined.</w:t>
+        <w:t xml:space="preserve"> </w:t>
       </w:r>
       <w:r>
         <w:fldChar w:fldCharType="end"/>
@@ -4951,7 +4964,7 @@
           <w:b/>
           <w:bCs/>
         </w:rPr>
-        <w:t>Error! Bookmark not defined.</w:t>
+        <w:t xml:space="preserve"> </w:t>
       </w:r>
       <w:r>
         <w:fldChar w:fldCharType="end"/>
@@ -5078,7 +5091,15 @@
         <w:t>o</w:t>
       </w:r>
       <w:r>
-        <w:t>se another. If you don’t want a Start Menu folder to be created check the box “Do Not Create A Start Menu Folder”. Once you are satisfied with your selection click the “Next” button to continue.</w:t>
+        <w:t>se another. If you don’t want a Start Menu folder to be created</w:t>
+      </w:r>
+      <w:r>
+        <w:t xml:space="preserve"> check the box “Do Not Create A </w:t>
+      </w:r>
+      <w:bookmarkStart w:id="11" w:name="_GoBack"/>
+      <w:bookmarkEnd w:id="11"/>
+      <w:r>
+        <w:t>Start Menu Folder”. Once you are satisfied with your selection click the “Next” button to continue.</w:t>
       </w:r>
     </w:p>
     <w:p>
@@ -5120,8 +5141,11 @@
         </w:numPr>
       </w:pPr>
       <w:r>
+        <w:t xml:space="preserve">The 9 Tap Tour program has now been successfully installed. Choose “Run 9 Tap Tour” to immediately launch the program, or “View ReadMe.txt” to view </w:t>
+      </w:r>
+      <w:r>
         <w:lastRenderedPageBreak/>
-        <w:t>The 9 Tap Tour program has now been successfully installed. Choose “Run 9 Tap Tour” to immediately launch the program, or “View ReadMe.txt” to view the ReadMe file where you can view updated program information made after the game manual was printed.</w:t>
+        <w:t>the ReadMe file where you can view updated program information made after the game manual was printed.</w:t>
       </w:r>
     </w:p>
     <w:p>
@@ -5284,11 +5308,11 @@
       <w:pPr>
         <w:pStyle w:val="Heading2"/>
       </w:pPr>
-      <w:bookmarkStart w:id="11" w:name="_Toc509165838"/>
+      <w:bookmarkStart w:id="12" w:name="_Toc509165838"/>
       <w:r>
         <w:t>How do I Launch 9-Tap?</w:t>
       </w:r>
-      <w:bookmarkEnd w:id="11"/>
+      <w:bookmarkEnd w:id="12"/>
     </w:p>
     <w:p>
       <w:pPr>
@@ -5311,7 +5335,7 @@
       <w:pPr>
         <w:pStyle w:val="Heading2"/>
       </w:pPr>
-      <w:bookmarkStart w:id="12" w:name="_Toc509165839"/>
+      <w:bookmarkStart w:id="13" w:name="_Toc509165839"/>
       <w:r>
         <w:lastRenderedPageBreak/>
         <w:t>How do I import existing</w:t>
@@ -5336,7 +5360,7 @@
           <w:b/>
           <w:bCs/>
         </w:rPr>
-        <w:t>Error! Bookmark not defined.</w:t>
+        <w:t xml:space="preserve"> </w:t>
       </w:r>
       <w:r>
         <w:fldChar w:fldCharType="end"/>
@@ -5344,7 +5368,7 @@
       <w:r>
         <w:t xml:space="preserve"> members?</w:t>
       </w:r>
-      <w:bookmarkEnd w:id="12"/>
+      <w:bookmarkEnd w:id="13"/>
     </w:p>
     <w:p>
       <w:pPr>
@@ -5388,7 +5412,7 @@
           <w:b/>
           <w:bCs/>
         </w:rPr>
-        <w:t>Error! Bookmark not defined.</w:t>
+        <w:t xml:space="preserve"> </w:t>
       </w:r>
       <w:r>
         <w:fldChar w:fldCharType="end"/>
@@ -5416,11 +5440,11 @@
       <w:pPr>
         <w:pStyle w:val="Heading2"/>
       </w:pPr>
-      <w:bookmarkStart w:id="13" w:name="_Toc509165840"/>
+      <w:bookmarkStart w:id="14" w:name="_Toc509165840"/>
       <w:r>
         <w:t>How do I enter a new player?</w:t>
       </w:r>
-      <w:bookmarkEnd w:id="13"/>
+      <w:bookmarkEnd w:id="14"/>
     </w:p>
     <w:p>
       <w:pPr>
@@ -5464,7 +5488,7 @@
           <w:b/>
           <w:bCs/>
         </w:rPr>
-        <w:t>Error! Bookmark not defined.</w:t>
+        <w:t xml:space="preserve"> </w:t>
       </w:r>
       <w:r>
         <w:fldChar w:fldCharType="end"/>
@@ -5495,11 +5519,11 @@
       <w:pPr>
         <w:pStyle w:val="Heading2"/>
       </w:pPr>
-      <w:bookmarkStart w:id="14" w:name="_Toc509165841"/>
+      <w:bookmarkStart w:id="15" w:name="_Toc509165841"/>
       <w:r>
         <w:t>How do I create a tournament?</w:t>
       </w:r>
-      <w:bookmarkEnd w:id="14"/>
+      <w:bookmarkEnd w:id="15"/>
     </w:p>
     <w:p>
       <w:pPr>
@@ -5543,7 +5567,7 @@
           <w:b/>
           <w:bCs/>
         </w:rPr>
-        <w:t>Error! Bookmark not defined.</w:t>
+        <w:t xml:space="preserve"> </w:t>
       </w:r>
       <w:r>
         <w:fldChar w:fldCharType="end"/>
@@ -5598,7 +5622,7 @@
           <w:b/>
           <w:bCs/>
         </w:rPr>
-        <w:t>Error! Bookmark not defined.</w:t>
+        <w:t xml:space="preserve"> </w:t>
       </w:r>
       <w:r>
         <w:fldChar w:fldCharType="end"/>
@@ -5632,11 +5656,11 @@
       <w:pPr>
         <w:pStyle w:val="Heading2"/>
       </w:pPr>
-      <w:bookmarkStart w:id="15" w:name="_Toc509165842"/>
+      <w:bookmarkStart w:id="16" w:name="_Toc509165842"/>
       <w:r>
         <w:t>How do I enter a bowler’s scores?</w:t>
       </w:r>
-      <w:bookmarkEnd w:id="15"/>
+      <w:bookmarkEnd w:id="16"/>
     </w:p>
     <w:p>
       <w:pPr>
@@ -5680,7 +5704,7 @@
           <w:b/>
           <w:bCs/>
         </w:rPr>
-        <w:t>Error! Bookmark not defined.</w:t>
+        <w:t xml:space="preserve"> </w:t>
       </w:r>
       <w:r>
         <w:fldChar w:fldCharType="end"/>
@@ -5860,7 +5884,7 @@
           <w:szCs w:val="32"/>
         </w:rPr>
       </w:pPr>
-      <w:bookmarkStart w:id="16" w:name="_Toc509165843"/>
+      <w:bookmarkStart w:id="17" w:name="_Toc509165843"/>
       <w:r>
         <w:rPr>
           <w:szCs w:val="32"/>
@@ -5868,7 +5892,7 @@
         <w:lastRenderedPageBreak/>
         <w:t>Main Menu</w:t>
       </w:r>
-      <w:bookmarkEnd w:id="16"/>
+      <w:bookmarkEnd w:id="17"/>
       <w:r>
         <w:rPr>
           <w:szCs w:val="32"/>
@@ -5923,7 +5947,7 @@
           <w:bCs/>
           <w:szCs w:val="32"/>
         </w:rPr>
-        <w:t>Error! Bookmark not defined.</w:t>
+        <w:t xml:space="preserve"> </w:t>
       </w:r>
       <w:r>
         <w:rPr>
@@ -5993,7 +6017,7 @@
           <w:b/>
           <w:bCs/>
         </w:rPr>
-        <w:t>Error! Bookmark not defined.</w:t>
+        <w:t xml:space="preserve"> </w:t>
       </w:r>
       <w:r>
         <w:fldChar w:fldCharType="end"/>
@@ -6036,7 +6060,7 @@
           <w:b/>
           <w:bCs/>
         </w:rPr>
-        <w:t>Error! Bookmark not defined.</w:t>
+        <w:t xml:space="preserve"> </w:t>
       </w:r>
       <w:r>
         <w:fldChar w:fldCharType="end"/>
@@ -6064,7 +6088,7 @@
           <w:b/>
           <w:bCs/>
         </w:rPr>
-        <w:t>Error! Bookmark not defined.</w:t>
+        <w:t xml:space="preserve"> </w:t>
       </w:r>
       <w:r>
         <w:fldChar w:fldCharType="end"/>
@@ -6107,7 +6131,7 @@
           <w:b/>
           <w:bCs/>
         </w:rPr>
-        <w:t>Error! Bookmark not defined.</w:t>
+        <w:t xml:space="preserve"> </w:t>
       </w:r>
       <w:r>
         <w:fldChar w:fldCharType="end"/>
@@ -6150,7 +6174,7 @@
           <w:b/>
           <w:bCs/>
         </w:rPr>
-        <w:t>Error! Bookmark not defined.</w:t>
+        <w:t xml:space="preserve"> </w:t>
       </w:r>
       <w:r>
         <w:fldChar w:fldCharType="end"/>
@@ -6247,14 +6271,27 @@
       <w:r>
         <w:t xml:space="preserve">Figure </w:t>
       </w:r>
-      <w:fldSimple w:instr=" SEQ Figure \* ARABIC ">
-        <w:r>
-          <w:rPr>
-            <w:noProof/>
-          </w:rPr>
-          <w:t>2</w:t>
-        </w:r>
-      </w:fldSimple>
+      <w:r>
+        <w:fldChar w:fldCharType="begin"/>
+      </w:r>
+      <w:r>
+        <w:instrText xml:space="preserve"> SEQ Figure \* ARABIC </w:instrText>
+      </w:r>
+      <w:r>
+        <w:fldChar w:fldCharType="separate"/>
+      </w:r>
+      <w:r>
+        <w:rPr>
+          <w:noProof/>
+        </w:rPr>
+        <w:t>2</w:t>
+      </w:r>
+      <w:r>
+        <w:rPr>
+          <w:noProof/>
+        </w:rPr>
+        <w:fldChar w:fldCharType="end"/>
+      </w:r>
       <w:r>
         <w:t>: Main Menu</w:t>
       </w:r>
@@ -6281,7 +6318,7 @@
           <w:b/>
           <w:bCs/>
         </w:rPr>
-        <w:t>Error! Bookmark not defined.</w:t>
+        <w:t xml:space="preserve"> </w:t>
       </w:r>
       <w:r>
         <w:fldChar w:fldCharType="end"/>
@@ -6309,7 +6346,7 @@
           <w:b/>
           <w:bCs/>
         </w:rPr>
-        <w:t>Error! Bookmark not defined.</w:t>
+        <w:t xml:space="preserve"> </w:t>
       </w:r>
       <w:r>
         <w:fldChar w:fldCharType="end"/>
@@ -6319,12 +6356,12 @@
       <w:pPr>
         <w:pStyle w:val="Heading1"/>
       </w:pPr>
-      <w:bookmarkStart w:id="17" w:name="_Toc509165844"/>
+      <w:bookmarkStart w:id="18" w:name="_Toc509165844"/>
       <w:r>
         <w:lastRenderedPageBreak/>
         <w:t>Member Info</w:t>
       </w:r>
-      <w:bookmarkEnd w:id="17"/>
+      <w:bookmarkEnd w:id="18"/>
       <w:r>
         <w:fldChar w:fldCharType="begin"/>
       </w:r>
@@ -6360,7 +6397,7 @@
           <w:b/>
           <w:bCs/>
         </w:rPr>
-        <w:t>Error! Bookmark not defined.</w:t>
+        <w:t xml:space="preserve"> </w:t>
       </w:r>
       <w:r>
         <w:fldChar w:fldCharType="end"/>
@@ -6409,7 +6446,7 @@
           <w:b/>
           <w:bCs/>
         </w:rPr>
-        <w:t>Error! Bookmark not defined.</w:t>
+        <w:t xml:space="preserve"> </w:t>
       </w:r>
       <w:r>
         <w:fldChar w:fldCharType="end"/>
@@ -6494,14 +6531,30 @@
       <w:r>
         <w:t xml:space="preserve">Figure </w:t>
       </w:r>
-      <w:fldSimple w:instr=" SEQ Figure \* ARABIC ">
-        <w:r>
-          <w:rPr>
-            <w:noProof/>
-          </w:rPr>
-          <w:t>3</w:t>
-        </w:r>
-      </w:fldSimple>
+      <w:r>
+        <w:fldChar w:fldCharType="begin"/>
+      </w:r>
+      <w:r>
+        <w:instrText xml:space="preserve"> SEQ F</w:instrText>
+      </w:r>
+      <w:r>
+        <w:instrText xml:space="preserve">igure \* ARABIC </w:instrText>
+      </w:r>
+      <w:r>
+        <w:fldChar w:fldCharType="separate"/>
+      </w:r>
+      <w:r>
+        <w:rPr>
+          <w:noProof/>
+        </w:rPr>
+        <w:t>3</w:t>
+      </w:r>
+      <w:r>
+        <w:rPr>
+          <w:noProof/>
+        </w:rPr>
+        <w:fldChar w:fldCharType="end"/>
+      </w:r>
       <w:r>
         <w:t>: Member Information</w:t>
       </w:r>
@@ -6510,9 +6563,8 @@
       <w:pPr>
         <w:pStyle w:val="Heading3"/>
       </w:pPr>
-      <w:bookmarkStart w:id="18" w:name="_Toc509165845"/>
-      <w:r>
-        <w:lastRenderedPageBreak/>
+      <w:bookmarkStart w:id="19" w:name="_Toc509165845"/>
+      <w:r>
         <w:t>Import</w:t>
       </w:r>
       <w:r>
@@ -6535,21 +6587,21 @@
           <w:b/>
           <w:bCs/>
         </w:rPr>
-        <w:t>Error! Bookmark not defined.</w:t>
-      </w:r>
-      <w:r>
-        <w:fldChar w:fldCharType="end"/>
-      </w:r>
-      <w:r>
         <w:t xml:space="preserve"> </w:t>
       </w:r>
       <w:r>
+        <w:fldChar w:fldCharType="end"/>
+      </w:r>
+      <w:r>
+        <w:t xml:space="preserve"> </w:t>
+      </w:r>
+      <w:r>
         <w:t xml:space="preserve">Existing </w:t>
       </w:r>
       <w:r>
         <w:t>Member</w:t>
       </w:r>
-      <w:bookmarkEnd w:id="18"/>
+      <w:bookmarkEnd w:id="19"/>
       <w:r>
         <w:fldChar w:fldCharType="begin"/>
       </w:r>
@@ -6585,7 +6637,7 @@
           <w:b/>
           <w:bCs/>
         </w:rPr>
-        <w:t>Error! Bookmark not defined.</w:t>
+        <w:t xml:space="preserve"> </w:t>
       </w:r>
       <w:r>
         <w:fldChar w:fldCharType="end"/>
@@ -6637,7 +6689,7 @@
           <w:b/>
           <w:bCs/>
         </w:rPr>
-        <w:t>Error! Bookmark not defined.</w:t>
+        <w:t xml:space="preserve"> </w:t>
       </w:r>
       <w:r>
         <w:fldChar w:fldCharType="end"/>
@@ -6674,11 +6726,11 @@
       <w:pPr>
         <w:pStyle w:val="Heading3"/>
       </w:pPr>
-      <w:bookmarkStart w:id="19" w:name="_Toc509165846"/>
+      <w:bookmarkStart w:id="20" w:name="_Toc509165846"/>
       <w:r>
         <w:t>New Members</w:t>
       </w:r>
-      <w:bookmarkEnd w:id="19"/>
+      <w:bookmarkEnd w:id="20"/>
       <w:r>
         <w:fldChar w:fldCharType="begin"/>
       </w:r>
@@ -6714,7 +6766,7 @@
           <w:b/>
           <w:bCs/>
         </w:rPr>
-        <w:t>Error! Bookmark not defined.</w:t>
+        <w:t xml:space="preserve"> </w:t>
       </w:r>
       <w:r>
         <w:fldChar w:fldCharType="end"/>
@@ -6763,7 +6815,7 @@
           <w:b/>
           <w:bCs/>
         </w:rPr>
-        <w:t>Error! Bookmark not defined.</w:t>
+        <w:t xml:space="preserve"> </w:t>
       </w:r>
       <w:r>
         <w:fldChar w:fldCharType="end"/>
@@ -6821,7 +6873,7 @@
           <w:b/>
           <w:bCs/>
         </w:rPr>
-        <w:t>Error! Bookmark not defined.</w:t>
+        <w:t xml:space="preserve"> </w:t>
       </w:r>
       <w:r>
         <w:fldChar w:fldCharType="end"/>
@@ -6849,7 +6901,7 @@
           <w:b/>
           <w:bCs/>
         </w:rPr>
-        <w:t>Error! Bookmark not defined.</w:t>
+        <w:t xml:space="preserve"> </w:t>
       </w:r>
       <w:r>
         <w:fldChar w:fldCharType="end"/>
@@ -6922,7 +6974,7 @@
           <w:b/>
           <w:bCs/>
         </w:rPr>
-        <w:t>Error! Bookmark not defined.</w:t>
+        <w:t xml:space="preserve"> </w:t>
       </w:r>
       <w:r>
         <w:fldChar w:fldCharType="end"/>
@@ -6934,7 +6986,11 @@
         <w:t>for example:</w:t>
       </w:r>
       <w:r>
-        <w:t xml:space="preserve"> her published average from another league. Tab through until you are in the Status box. Choose if the member is inactive or active. If the member is 55 years old or older, check the “Senior” box. In the gender box, select the member’s gender. Enter the date of the member’s last payment. Enter any notes in the note field, if applicable. Click “Save”. The new member is now added to the member database. Note: Last name and first name are required fields.</w:t>
+        <w:t xml:space="preserve"> her published average from another league. Tab through until you are in the Status box. Choose if the member is inactive or active. If the </w:t>
+      </w:r>
+      <w:r>
+        <w:lastRenderedPageBreak/>
+        <w:t>member is 55 years old or older, check the “Senior” box. In the gender box, select the member’s gender. Enter the date of the member’s last payment. Enter any notes in the note field, if applicable. Click “Save”. The new member is now added to the member database. Note: Last name and first name are required fields.</w:t>
       </w:r>
     </w:p>
     <w:p>
@@ -7002,17 +7058,29 @@
         <w:jc w:val="both"/>
       </w:pPr>
       <w:r>
-        <w:lastRenderedPageBreak/>
         <w:t xml:space="preserve">Figure </w:t>
       </w:r>
-      <w:fldSimple w:instr=" SEQ Figure \* ARABIC ">
-        <w:r>
-          <w:rPr>
-            <w:noProof/>
-          </w:rPr>
-          <w:t>4</w:t>
-        </w:r>
-      </w:fldSimple>
+      <w:r>
+        <w:fldChar w:fldCharType="begin"/>
+      </w:r>
+      <w:r>
+        <w:instrText xml:space="preserve"> SEQ Figure \* ARABIC </w:instrText>
+      </w:r>
+      <w:r>
+        <w:fldChar w:fldCharType="separate"/>
+      </w:r>
+      <w:r>
+        <w:rPr>
+          <w:noProof/>
+        </w:rPr>
+        <w:t>4</w:t>
+      </w:r>
+      <w:r>
+        <w:rPr>
+          <w:noProof/>
+        </w:rPr>
+        <w:fldChar w:fldCharType="end"/>
+      </w:r>
       <w:r>
         <w:t>: Member Information</w:t>
       </w:r>
@@ -7021,14 +7089,14 @@
       <w:pPr>
         <w:pStyle w:val="Heading3"/>
       </w:pPr>
-      <w:bookmarkStart w:id="20" w:name="_Toc509165847"/>
+      <w:bookmarkStart w:id="21" w:name="_Toc509165847"/>
       <w:r>
         <w:t xml:space="preserve">Updating </w:t>
       </w:r>
       <w:r>
         <w:t>Members</w:t>
       </w:r>
-      <w:bookmarkEnd w:id="20"/>
+      <w:bookmarkEnd w:id="21"/>
       <w:r>
         <w:fldChar w:fldCharType="begin"/>
       </w:r>
@@ -7064,7 +7132,7 @@
           <w:b/>
           <w:bCs/>
         </w:rPr>
-        <w:t>Error! Bookmark not defined.</w:t>
+        <w:t xml:space="preserve"> </w:t>
       </w:r>
       <w:r>
         <w:fldChar w:fldCharType="end"/>
@@ -7112,7 +7180,7 @@
           <w:b/>
           <w:bCs/>
         </w:rPr>
-        <w:t>Error! Bookmark not defined.</w:t>
+        <w:t xml:space="preserve"> </w:t>
       </w:r>
       <w:r>
         <w:fldChar w:fldCharType="end"/>
@@ -7169,7 +7237,7 @@
           <w:b/>
           <w:bCs/>
         </w:rPr>
-        <w:t>Error! Bookmark not defined.</w:t>
+        <w:t xml:space="preserve"> </w:t>
       </w:r>
       <w:r>
         <w:fldChar w:fldCharType="end"/>
@@ -7185,14 +7253,15 @@
           <w:szCs w:val="20"/>
         </w:rPr>
       </w:pPr>
-      <w:bookmarkStart w:id="21" w:name="_Toc509165848"/>
+      <w:bookmarkStart w:id="22" w:name="_Toc509165848"/>
       <w:r>
         <w:rPr>
           <w:szCs w:val="20"/>
         </w:rPr>
+        <w:lastRenderedPageBreak/>
         <w:t>Stats</w:t>
       </w:r>
-      <w:bookmarkEnd w:id="21"/>
+      <w:bookmarkEnd w:id="22"/>
       <w:r>
         <w:rPr>
           <w:szCs w:val="20"/>
@@ -7247,7 +7316,7 @@
           <w:bCs/>
           <w:szCs w:val="20"/>
         </w:rPr>
-        <w:t>Error! Bookmark not defined.</w:t>
+        <w:t xml:space="preserve"> </w:t>
       </w:r>
       <w:r>
         <w:rPr>
@@ -7284,7 +7353,7 @@
           <w:b/>
           <w:bCs/>
         </w:rPr>
-        <w:t>Error! Bookmark not defined.</w:t>
+        <w:t xml:space="preserve"> </w:t>
       </w:r>
       <w:r>
         <w:fldChar w:fldCharType="end"/>
@@ -7309,7 +7378,7 @@
           <w:b/>
           <w:bCs/>
         </w:rPr>
-        <w:t>Error! Bookmark not defined.</w:t>
+        <w:t xml:space="preserve"> </w:t>
       </w:r>
       <w:r>
         <w:fldChar w:fldCharType="end"/>
@@ -7385,14 +7454,27 @@
       <w:r>
         <w:t xml:space="preserve">Figure </w:t>
       </w:r>
-      <w:fldSimple w:instr=" SEQ Figure \* ARABIC ">
-        <w:r>
-          <w:rPr>
-            <w:noProof/>
-          </w:rPr>
-          <w:t>5</w:t>
-        </w:r>
-      </w:fldSimple>
+      <w:r>
+        <w:fldChar w:fldCharType="begin"/>
+      </w:r>
+      <w:r>
+        <w:instrText xml:space="preserve"> SEQ Figure \* ARABIC </w:instrText>
+      </w:r>
+      <w:r>
+        <w:fldChar w:fldCharType="separate"/>
+      </w:r>
+      <w:r>
+        <w:rPr>
+          <w:noProof/>
+        </w:rPr>
+        <w:t>5</w:t>
+      </w:r>
+      <w:r>
+        <w:rPr>
+          <w:noProof/>
+        </w:rPr>
+        <w:fldChar w:fldCharType="end"/>
+      </w:r>
       <w:r>
         <w:t>: Stats</w:t>
       </w:r>
@@ -7416,7 +7498,7 @@
           <w:b/>
           <w:bCs/>
         </w:rPr>
-        <w:t>Error! Bookmark not defined.</w:t>
+        <w:t xml:space="preserve"> </w:t>
       </w:r>
       <w:r>
         <w:fldChar w:fldCharType="end"/>
@@ -7441,7 +7523,7 @@
           <w:b/>
           <w:bCs/>
         </w:rPr>
-        <w:t>Error! Bookmark not defined.</w:t>
+        <w:t xml:space="preserve"> </w:t>
       </w:r>
       <w:r>
         <w:fldChar w:fldCharType="end"/>
@@ -7457,7 +7539,7 @@
           <w:szCs w:val="20"/>
         </w:rPr>
       </w:pPr>
-      <w:bookmarkStart w:id="22" w:name="_Toc509165849"/>
+      <w:bookmarkStart w:id="23" w:name="_Toc509165849"/>
       <w:r>
         <w:rPr>
           <w:szCs w:val="20"/>
@@ -7465,7 +7547,7 @@
         <w:lastRenderedPageBreak/>
         <w:t>Member Search</w:t>
       </w:r>
-      <w:bookmarkEnd w:id="22"/>
+      <w:bookmarkEnd w:id="23"/>
       <w:r>
         <w:rPr>
           <w:szCs w:val="20"/>
@@ -7520,7 +7602,7 @@
           <w:bCs/>
           <w:szCs w:val="20"/>
         </w:rPr>
-        <w:t>Error! Bookmark not defined.</w:t>
+        <w:t xml:space="preserve"> </w:t>
       </w:r>
       <w:r>
         <w:rPr>
@@ -7557,7 +7639,7 @@
           <w:b/>
           <w:bCs/>
         </w:rPr>
-        <w:t>Error! Bookmark not defined.</w:t>
+        <w:t xml:space="preserve"> </w:t>
       </w:r>
       <w:r>
         <w:fldChar w:fldCharType="end"/>
@@ -7582,7 +7664,7 @@
           <w:b/>
           <w:bCs/>
         </w:rPr>
-        <w:t>Error! Bookmark not defined.</w:t>
+        <w:t xml:space="preserve"> </w:t>
       </w:r>
       <w:r>
         <w:fldChar w:fldCharType="end"/>
@@ -7697,14 +7779,30 @@
       <w:r>
         <w:t xml:space="preserve">Figure </w:t>
       </w:r>
-      <w:fldSimple w:instr=" SEQ Figure \* ARABIC ">
-        <w:r>
-          <w:rPr>
-            <w:noProof/>
-          </w:rPr>
-          <w:t>6</w:t>
-        </w:r>
-      </w:fldSimple>
+      <w:r>
+        <w:fldChar w:fldCharType="begin"/>
+      </w:r>
+      <w:r>
+        <w:instrText xml:space="preserve"> SEQ Figure \* A</w:instrText>
+      </w:r>
+      <w:r>
+        <w:instrText xml:space="preserve">RABIC </w:instrText>
+      </w:r>
+      <w:r>
+        <w:fldChar w:fldCharType="separate"/>
+      </w:r>
+      <w:r>
+        <w:rPr>
+          <w:noProof/>
+        </w:rPr>
+        <w:t>6</w:t>
+      </w:r>
+      <w:r>
+        <w:rPr>
+          <w:noProof/>
+        </w:rPr>
+        <w:fldChar w:fldCharType="end"/>
+      </w:r>
       <w:r>
         <w:t>: Member search, blank and with results</w:t>
       </w:r>
@@ -7716,7 +7814,7 @@
           <w:szCs w:val="20"/>
         </w:rPr>
       </w:pPr>
-      <w:bookmarkStart w:id="23" w:name="_Toc509165850"/>
+      <w:bookmarkStart w:id="24" w:name="_Toc509165850"/>
       <w:r>
         <w:rPr>
           <w:szCs w:val="20"/>
@@ -7724,7 +7822,7 @@
         <w:lastRenderedPageBreak/>
         <w:t>Print Recaps</w:t>
       </w:r>
-      <w:bookmarkEnd w:id="23"/>
+      <w:bookmarkEnd w:id="24"/>
       <w:r>
         <w:rPr>
           <w:szCs w:val="20"/>
@@ -7779,7 +7877,7 @@
           <w:bCs/>
           <w:szCs w:val="20"/>
         </w:rPr>
-        <w:t>Error! Bookmark not defined.</w:t>
+        <w:t xml:space="preserve"> </w:t>
       </w:r>
       <w:r>
         <w:rPr>
@@ -7912,14 +8010,27 @@
       <w:r>
         <w:t xml:space="preserve">Figure </w:t>
       </w:r>
-      <w:fldSimple w:instr=" SEQ Figure \* ARABIC ">
-        <w:r>
-          <w:rPr>
-            <w:noProof/>
-          </w:rPr>
-          <w:t>7</w:t>
-        </w:r>
-      </w:fldSimple>
+      <w:r>
+        <w:fldChar w:fldCharType="begin"/>
+      </w:r>
+      <w:r>
+        <w:instrText xml:space="preserve"> SEQ Figure \* ARABIC </w:instrText>
+      </w:r>
+      <w:r>
+        <w:fldChar w:fldCharType="separate"/>
+      </w:r>
+      <w:r>
+        <w:rPr>
+          <w:noProof/>
+        </w:rPr>
+        <w:t>7</w:t>
+      </w:r>
+      <w:r>
+        <w:rPr>
+          <w:noProof/>
+        </w:rPr>
+        <w:fldChar w:fldCharType="end"/>
+      </w:r>
       <w:r>
         <w:t>: basic printer dialog</w:t>
       </w:r>
@@ -7934,14 +8045,14 @@
           <w:szCs w:val="20"/>
         </w:rPr>
       </w:pPr>
-      <w:bookmarkStart w:id="24" w:name="_Toc509165851"/>
+      <w:bookmarkStart w:id="25" w:name="_Toc509165851"/>
       <w:r>
         <w:rPr>
           <w:szCs w:val="20"/>
         </w:rPr>
         <w:t>Import</w:t>
       </w:r>
-      <w:bookmarkEnd w:id="24"/>
+      <w:bookmarkEnd w:id="25"/>
       <w:r>
         <w:rPr>
           <w:szCs w:val="20"/>
@@ -7972,7 +8083,7 @@
           <w:bCs/>
           <w:szCs w:val="20"/>
         </w:rPr>
-        <w:t>Error! Bookmark not defined.</w:t>
+        <w:t xml:space="preserve"> </w:t>
       </w:r>
       <w:r>
         <w:rPr>
@@ -8009,7 +8120,7 @@
           <w:b/>
           <w:bCs/>
         </w:rPr>
-        <w:t>Error! Bookmark not defined.</w:t>
+        <w:t xml:space="preserve"> </w:t>
       </w:r>
       <w:r>
         <w:fldChar w:fldCharType="end"/>
@@ -8096,14 +8207,27 @@
       <w:r>
         <w:t xml:space="preserve">Figure </w:t>
       </w:r>
-      <w:fldSimple w:instr=" SEQ Figure \* ARABIC ">
-        <w:r>
-          <w:rPr>
-            <w:noProof/>
-          </w:rPr>
-          <w:t>8</w:t>
-        </w:r>
-      </w:fldSimple>
+      <w:r>
+        <w:fldChar w:fldCharType="begin"/>
+      </w:r>
+      <w:r>
+        <w:instrText xml:space="preserve"> SEQ Figure \* ARABIC </w:instrText>
+      </w:r>
+      <w:r>
+        <w:fldChar w:fldCharType="separate"/>
+      </w:r>
+      <w:r>
+        <w:rPr>
+          <w:noProof/>
+        </w:rPr>
+        <w:t>8</w:t>
+      </w:r>
+      <w:r>
+        <w:rPr>
+          <w:noProof/>
+        </w:rPr>
+        <w:fldChar w:fldCharType="end"/>
+      </w:r>
       <w:r>
         <w:t>: Importing existing player information</w:t>
       </w:r>
@@ -8112,12 +8236,12 @@
       <w:pPr>
         <w:pStyle w:val="Heading1"/>
       </w:pPr>
-      <w:bookmarkStart w:id="25" w:name="_Toc509165852"/>
+      <w:bookmarkStart w:id="26" w:name="_Toc509165852"/>
       <w:r>
         <w:lastRenderedPageBreak/>
         <w:t>Member Scores</w:t>
       </w:r>
-      <w:bookmarkEnd w:id="25"/>
+      <w:bookmarkEnd w:id="26"/>
       <w:r>
         <w:fldChar w:fldCharType="begin"/>
       </w:r>
@@ -8231,14 +8355,27 @@
       <w:r>
         <w:t xml:space="preserve">Figure </w:t>
       </w:r>
-      <w:fldSimple w:instr=" SEQ Figure \* ARABIC ">
-        <w:r>
-          <w:rPr>
-            <w:noProof/>
-          </w:rPr>
-          <w:t>9</w:t>
-        </w:r>
-      </w:fldSimple>
+      <w:r>
+        <w:fldChar w:fldCharType="begin"/>
+      </w:r>
+      <w:r>
+        <w:instrText xml:space="preserve"> SEQ Figure \* ARABIC </w:instrText>
+      </w:r>
+      <w:r>
+        <w:fldChar w:fldCharType="separate"/>
+      </w:r>
+      <w:r>
+        <w:rPr>
+          <w:noProof/>
+        </w:rPr>
+        <w:t>9</w:t>
+      </w:r>
+      <w:r>
+        <w:rPr>
+          <w:noProof/>
+        </w:rPr>
+        <w:fldChar w:fldCharType="end"/>
+      </w:r>
       <w:r>
         <w:t>: Member Scores</w:t>
       </w:r>
@@ -8262,7 +8399,7 @@
           <w:b/>
           <w:bCs/>
         </w:rPr>
-        <w:t>Error! Bookmark not defined.</w:t>
+        <w:t xml:space="preserve"> </w:t>
       </w:r>
       <w:r>
         <w:fldChar w:fldCharType="end"/>
@@ -8397,7 +8534,7 @@
           <w:szCs w:val="20"/>
         </w:rPr>
       </w:pPr>
-      <w:bookmarkStart w:id="26" w:name="_Toc509165853"/>
+      <w:bookmarkStart w:id="27" w:name="_Toc509165853"/>
       <w:r>
         <w:rPr>
           <w:szCs w:val="20"/>
@@ -8405,7 +8542,7 @@
         <w:lastRenderedPageBreak/>
         <w:t>Tournament Stats</w:t>
       </w:r>
-      <w:bookmarkEnd w:id="26"/>
+      <w:bookmarkEnd w:id="27"/>
       <w:r>
         <w:rPr>
           <w:szCs w:val="20"/>
@@ -8460,7 +8597,7 @@
           <w:bCs/>
           <w:szCs w:val="20"/>
         </w:rPr>
-        <w:t>Error! Bookmark not defined.</w:t>
+        <w:t xml:space="preserve"> </w:t>
       </w:r>
       <w:r>
         <w:rPr>
@@ -8536,7 +8673,7 @@
           <w:b/>
           <w:bCs/>
         </w:rPr>
-        <w:t>Error! Bookmark not defined.</w:t>
+        <w:t xml:space="preserve"> </w:t>
       </w:r>
       <w:r>
         <w:fldChar w:fldCharType="end"/>
@@ -8605,14 +8742,27 @@
       <w:r>
         <w:t xml:space="preserve">Figure </w:t>
       </w:r>
-      <w:fldSimple w:instr=" SEQ Figure \* ARABIC ">
-        <w:r>
-          <w:rPr>
-            <w:noProof/>
-          </w:rPr>
-          <w:t>10</w:t>
-        </w:r>
-      </w:fldSimple>
+      <w:r>
+        <w:fldChar w:fldCharType="begin"/>
+      </w:r>
+      <w:r>
+        <w:instrText xml:space="preserve"> SEQ Figure \* ARABIC </w:instrText>
+      </w:r>
+      <w:r>
+        <w:fldChar w:fldCharType="separate"/>
+      </w:r>
+      <w:r>
+        <w:rPr>
+          <w:noProof/>
+        </w:rPr>
+        <w:t>10</w:t>
+      </w:r>
+      <w:r>
+        <w:rPr>
+          <w:noProof/>
+        </w:rPr>
+        <w:fldChar w:fldCharType="end"/>
+      </w:r>
       <w:r>
         <w:t>: Tournament Stats</w:t>
       </w:r>
@@ -8651,7 +8801,7 @@
           <w:b/>
           <w:bCs/>
         </w:rPr>
-        <w:t>Error! Bookmark not defined.</w:t>
+        <w:t xml:space="preserve"> </w:t>
       </w:r>
       <w:r>
         <w:fldChar w:fldCharType="end"/>
@@ -8667,7 +8817,7 @@
           <w:szCs w:val="20"/>
         </w:rPr>
       </w:pPr>
-      <w:bookmarkStart w:id="27" w:name="_Toc509165854"/>
+      <w:bookmarkStart w:id="28" w:name="_Toc509165854"/>
       <w:r>
         <w:rPr>
           <w:szCs w:val="20"/>
@@ -8678,128 +8828,96 @@
         <w:rPr>
           <w:szCs w:val="20"/>
         </w:rPr>
+        <w:t xml:space="preserve"> </w:t>
+      </w:r>
+      <w:r>
+        <w:rPr>
+          <w:szCs w:val="20"/>
+        </w:rPr>
+        <w:t>By Tournament</w:t>
+      </w:r>
+      <w:bookmarkEnd w:id="28"/>
+      <w:r>
+        <w:rPr>
+          <w:szCs w:val="20"/>
+        </w:rPr>
+        <w:fldChar w:fldCharType="begin"/>
+      </w:r>
+      <w:r>
+        <w:instrText xml:space="preserve"> XE "</w:instrText>
+      </w:r>
+      <w:r>
+        <w:rPr>
+          <w:szCs w:val="20"/>
+        </w:rPr>
+        <w:instrText>Print Recaps By Tournament</w:instrText>
+      </w:r>
+      <w:r>
+        <w:instrText xml:space="preserve">" </w:instrText>
+      </w:r>
+      <w:r>
+        <w:rPr>
+          <w:szCs w:val="20"/>
+        </w:rPr>
+        <w:fldChar w:fldCharType="end"/>
+      </w:r>
+    </w:p>
+    <w:p>
+      <w:pPr>
+        <w:pStyle w:val="BodyText"/>
+        <w:keepNext/>
+      </w:pPr>
+      <w:r>
+        <w:t>Below the Tournament Stats button on</w:t>
+      </w:r>
+      <w:r>
+        <w:t xml:space="preserve"> the Member Scores</w:t>
+      </w:r>
+      <w:r>
+        <w:fldChar w:fldCharType="begin"/>
+      </w:r>
+      <w:r>
+        <w:instrText xml:space="preserve"> XE "</w:instrText>
+      </w:r>
+      <w:r>
+        <w:instrText>Member Scores</w:instrText>
+      </w:r>
+      <w:r>
+        <w:instrText xml:space="preserve">" </w:instrText>
+      </w:r>
+      <w:r>
+        <w:fldChar w:fldCharType="end"/>
+      </w:r>
+      <w:r>
+        <w:t xml:space="preserve"> screen</w:t>
+      </w:r>
+      <w:r>
+        <w:t>, t</w:t>
+      </w:r>
+      <w:r>
+        <w:t>he “Print Recaps</w:t>
+      </w:r>
+      <w:r>
         <w:fldChar w:fldCharType="begin"/>
       </w:r>
       <w:r>
         <w:instrText xml:space="preserve"> E "</w:instrText>
       </w:r>
       <w:r>
-        <w:rPr>
-          <w:szCs w:val="20"/>
-        </w:rPr>
         <w:instrText>Print Recaps</w:instrText>
       </w:r>
       <w:r>
         <w:instrText xml:space="preserve">" </w:instrText>
       </w:r>
       <w:r>
-        <w:rPr>
-          <w:szCs w:val="20"/>
-        </w:rPr>
         <w:fldChar w:fldCharType="separate"/>
       </w:r>
       <w:r>
         <w:rPr>
           <w:b/>
           <w:bCs/>
-          <w:szCs w:val="20"/>
-        </w:rPr>
-        <w:t>Error! Bookmark not defined.</w:t>
-      </w:r>
-      <w:r>
-        <w:rPr>
-          <w:szCs w:val="20"/>
-        </w:rPr>
-        <w:fldChar w:fldCharType="end"/>
-      </w:r>
-      <w:r>
-        <w:rPr>
-          <w:szCs w:val="20"/>
-        </w:rPr>
-        <w:t xml:space="preserve"> By Tournament</w:t>
-      </w:r>
-      <w:bookmarkEnd w:id="27"/>
-      <w:r>
-        <w:rPr>
-          <w:szCs w:val="20"/>
-        </w:rPr>
-        <w:fldChar w:fldCharType="begin"/>
-      </w:r>
-      <w:r>
-        <w:instrText xml:space="preserve"> XE "</w:instrText>
-      </w:r>
-      <w:r>
-        <w:rPr>
-          <w:szCs w:val="20"/>
-        </w:rPr>
-        <w:instrText>Print Recaps By Tournament</w:instrText>
-      </w:r>
-      <w:r>
-        <w:instrText xml:space="preserve">" </w:instrText>
-      </w:r>
-      <w:r>
-        <w:rPr>
-          <w:szCs w:val="20"/>
-        </w:rPr>
-        <w:fldChar w:fldCharType="end"/>
-      </w:r>
-    </w:p>
-    <w:p>
-      <w:pPr>
-        <w:pStyle w:val="BodyText"/>
-        <w:keepNext/>
-      </w:pPr>
-      <w:r>
-        <w:t>Below the Tournament Stats button on</w:t>
-      </w:r>
-      <w:r>
-        <w:t xml:space="preserve"> the Member Scores</w:t>
-      </w:r>
-      <w:r>
-        <w:fldChar w:fldCharType="begin"/>
-      </w:r>
-      <w:r>
-        <w:instrText xml:space="preserve"> XE "</w:instrText>
-      </w:r>
-      <w:r>
-        <w:instrText>Member Scores</w:instrText>
-      </w:r>
-      <w:r>
-        <w:instrText xml:space="preserve">" </w:instrText>
-      </w:r>
-      <w:r>
-        <w:fldChar w:fldCharType="end"/>
-      </w:r>
-      <w:r>
-        <w:t xml:space="preserve"> screen</w:t>
-      </w:r>
-      <w:r>
-        <w:t>, t</w:t>
-      </w:r>
-      <w:r>
-        <w:t>he “Print Recaps</w:t>
-      </w:r>
-      <w:r>
-        <w:fldChar w:fldCharType="begin"/>
-      </w:r>
-      <w:r>
-        <w:instrText xml:space="preserve"> E "</w:instrText>
-      </w:r>
-      <w:r>
-        <w:instrText>Print Recaps</w:instrText>
-      </w:r>
-      <w:r>
-        <w:instrText xml:space="preserve">" </w:instrText>
-      </w:r>
-      <w:r>
-        <w:fldChar w:fldCharType="separate"/>
-      </w:r>
-      <w:r>
-        <w:rPr>
-          <w:b/>
-          <w:bCs/>
-        </w:rPr>
-        <w:t>Error! Bookmark not defined.</w:t>
+        </w:rPr>
+        <w:t xml:space="preserve"> </w:t>
       </w:r>
       <w:r>
         <w:fldChar w:fldCharType="end"/>
@@ -8886,14 +9004,27 @@
       <w:r>
         <w:t xml:space="preserve">Figure </w:t>
       </w:r>
-      <w:fldSimple w:instr=" SEQ Figure \* ARABIC ">
-        <w:r>
-          <w:rPr>
-            <w:noProof/>
-          </w:rPr>
-          <w:t>11</w:t>
-        </w:r>
-      </w:fldSimple>
+      <w:r>
+        <w:fldChar w:fldCharType="begin"/>
+      </w:r>
+      <w:r>
+        <w:instrText xml:space="preserve"> SEQ Figure \* ARABIC </w:instrText>
+      </w:r>
+      <w:r>
+        <w:fldChar w:fldCharType="separate"/>
+      </w:r>
+      <w:r>
+        <w:rPr>
+          <w:noProof/>
+        </w:rPr>
+        <w:t>11</w:t>
+      </w:r>
+      <w:r>
+        <w:rPr>
+          <w:noProof/>
+        </w:rPr>
+        <w:fldChar w:fldCharType="end"/>
+      </w:r>
       <w:r>
         <w:t xml:space="preserve"> Print Dialog</w:t>
       </w:r>
@@ -8902,12 +9033,12 @@
       <w:pPr>
         <w:pStyle w:val="Heading2"/>
       </w:pPr>
-      <w:bookmarkStart w:id="28" w:name="_Toc509165855"/>
+      <w:bookmarkStart w:id="29" w:name="_Toc509165855"/>
       <w:r>
         <w:lastRenderedPageBreak/>
         <w:t>Tournament Place Standings</w:t>
       </w:r>
-      <w:bookmarkEnd w:id="28"/>
+      <w:bookmarkEnd w:id="29"/>
       <w:r>
         <w:fldChar w:fldCharType="begin"/>
       </w:r>
@@ -9035,14 +9166,27 @@
       <w:r>
         <w:t xml:space="preserve">Figure </w:t>
       </w:r>
-      <w:fldSimple w:instr=" SEQ Figure \* ARABIC ">
-        <w:r>
-          <w:rPr>
-            <w:noProof/>
-          </w:rPr>
-          <w:t>12</w:t>
-        </w:r>
-      </w:fldSimple>
+      <w:r>
+        <w:fldChar w:fldCharType="begin"/>
+      </w:r>
+      <w:r>
+        <w:instrText xml:space="preserve"> SEQ Figure \* ARABIC </w:instrText>
+      </w:r>
+      <w:r>
+        <w:fldChar w:fldCharType="separate"/>
+      </w:r>
+      <w:r>
+        <w:rPr>
+          <w:noProof/>
+        </w:rPr>
+        <w:t>12</w:t>
+      </w:r>
+      <w:r>
+        <w:rPr>
+          <w:noProof/>
+        </w:rPr>
+        <w:fldChar w:fldCharType="end"/>
+      </w:r>
       <w:r>
         <w:t>: Tournament Place Standings</w:t>
       </w:r>
@@ -9066,7 +9210,7 @@
           <w:b/>
           <w:bCs/>
         </w:rPr>
-        <w:t>Error! Bookmark not defined.</w:t>
+        <w:t xml:space="preserve"> </w:t>
       </w:r>
       <w:r>
         <w:fldChar w:fldCharType="end"/>
@@ -9076,7 +9220,7 @@
       <w:pPr>
         <w:pStyle w:val="Heading2"/>
       </w:pPr>
-      <w:bookmarkStart w:id="29" w:name="_Toc509165856"/>
+      <w:bookmarkStart w:id="30" w:name="_Toc509165856"/>
       <w:r>
         <w:lastRenderedPageBreak/>
         <w:t xml:space="preserve"> How to create or e</w:t>
@@ -9084,7 +9228,7 @@
       <w:r>
         <w:t>dit Tournament</w:t>
       </w:r>
-      <w:bookmarkEnd w:id="29"/>
+      <w:bookmarkEnd w:id="30"/>
       <w:r>
         <w:fldChar w:fldCharType="begin"/>
       </w:r>
@@ -9346,14 +9490,27 @@
         <w:lastRenderedPageBreak/>
         <w:t xml:space="preserve">Figure </w:t>
       </w:r>
-      <w:fldSimple w:instr=" SEQ Figure \* ARABIC ">
-        <w:r>
-          <w:rPr>
-            <w:noProof/>
-          </w:rPr>
-          <w:t>13</w:t>
-        </w:r>
-      </w:fldSimple>
+      <w:r>
+        <w:fldChar w:fldCharType="begin"/>
+      </w:r>
+      <w:r>
+        <w:instrText xml:space="preserve"> SEQ Figure \* ARABIC </w:instrText>
+      </w:r>
+      <w:r>
+        <w:fldChar w:fldCharType="separate"/>
+      </w:r>
+      <w:r>
+        <w:rPr>
+          <w:noProof/>
+        </w:rPr>
+        <w:t>13</w:t>
+      </w:r>
+      <w:r>
+        <w:rPr>
+          <w:noProof/>
+        </w:rPr>
+        <w:fldChar w:fldCharType="end"/>
+      </w:r>
       <w:r>
         <w:t xml:space="preserve">: </w:t>
       </w:r>
@@ -9383,7 +9540,7 @@
           <w:b/>
           <w:bCs/>
         </w:rPr>
-        <w:t>Error! Bookmark not defined.</w:t>
+        <w:t xml:space="preserve"> </w:t>
       </w:r>
       <w:r>
         <w:fldChar w:fldCharType="end"/>
@@ -9396,14 +9553,14 @@
       <w:pPr>
         <w:pStyle w:val="Heading3"/>
       </w:pPr>
-      <w:bookmarkStart w:id="30" w:name="_Toc509165857"/>
+      <w:bookmarkStart w:id="31" w:name="_Toc509165857"/>
       <w:r>
         <w:t xml:space="preserve"> How t</w:t>
       </w:r>
       <w:r>
         <w:t>o Update an Existing Tournament</w:t>
       </w:r>
-      <w:bookmarkEnd w:id="30"/>
+      <w:bookmarkEnd w:id="31"/>
     </w:p>
     <w:p>
       <w:pPr>
@@ -9483,11 +9640,11 @@
       <w:pPr>
         <w:pStyle w:val="Heading2"/>
       </w:pPr>
-      <w:bookmarkStart w:id="31" w:name="_Toc509165858"/>
+      <w:bookmarkStart w:id="32" w:name="_Toc509165858"/>
       <w:r>
         <w:t>Search Tournaments</w:t>
       </w:r>
-      <w:bookmarkEnd w:id="31"/>
+      <w:bookmarkEnd w:id="32"/>
       <w:r>
         <w:fldChar w:fldCharType="begin"/>
       </w:r>
@@ -9655,14 +9812,27 @@
       <w:r>
         <w:t xml:space="preserve">Figure </w:t>
       </w:r>
-      <w:fldSimple w:instr=" SEQ Figure \* ARABIC ">
-        <w:r>
-          <w:rPr>
-            <w:noProof/>
-          </w:rPr>
-          <w:t>14</w:t>
-        </w:r>
-      </w:fldSimple>
+      <w:r>
+        <w:fldChar w:fldCharType="begin"/>
+      </w:r>
+      <w:r>
+        <w:instrText xml:space="preserve"> SEQ Figure \* ARABIC </w:instrText>
+      </w:r>
+      <w:r>
+        <w:fldChar w:fldCharType="separate"/>
+      </w:r>
+      <w:r>
+        <w:rPr>
+          <w:noProof/>
+        </w:rPr>
+        <w:t>14</w:t>
+      </w:r>
+      <w:r>
+        <w:rPr>
+          <w:noProof/>
+        </w:rPr>
+        <w:fldChar w:fldCharType="end"/>
+      </w:r>
       <w:r>
         <w:t>: Tournament Search Forms</w:t>
       </w:r>
@@ -9671,11 +9841,11 @@
       <w:pPr>
         <w:pStyle w:val="Heading3"/>
       </w:pPr>
-      <w:bookmarkStart w:id="32" w:name="_Toc509165859"/>
+      <w:bookmarkStart w:id="33" w:name="_Toc509165859"/>
       <w:r>
         <w:t>Search by Location</w:t>
       </w:r>
-      <w:bookmarkEnd w:id="32"/>
+      <w:bookmarkEnd w:id="33"/>
       <w:r>
         <w:fldChar w:fldCharType="begin"/>
       </w:r>
@@ -9713,11 +9883,11 @@
       <w:pPr>
         <w:pStyle w:val="Heading3"/>
       </w:pPr>
-      <w:bookmarkStart w:id="33" w:name="_Toc509165860"/>
+      <w:bookmarkStart w:id="34" w:name="_Toc509165860"/>
       <w:r>
         <w:t>Search by Event</w:t>
       </w:r>
-      <w:bookmarkEnd w:id="33"/>
+      <w:bookmarkEnd w:id="34"/>
       <w:r>
         <w:fldChar w:fldCharType="begin"/>
       </w:r>
@@ -9753,7 +9923,7 @@
           <w:b/>
           <w:bCs/>
         </w:rPr>
-        <w:t>Error! Bookmark not defined.</w:t>
+        <w:t xml:space="preserve"> </w:t>
       </w:r>
       <w:r>
         <w:fldChar w:fldCharType="end"/>
@@ -9813,11 +9983,11 @@
       <w:pPr>
         <w:pStyle w:val="Heading3"/>
       </w:pPr>
-      <w:bookmarkStart w:id="34" w:name="_Toc509165861"/>
+      <w:bookmarkStart w:id="35" w:name="_Toc509165861"/>
       <w:r>
         <w:t>Search by Date</w:t>
       </w:r>
-      <w:bookmarkEnd w:id="34"/>
+      <w:bookmarkEnd w:id="35"/>
       <w:r>
         <w:fldChar w:fldCharType="begin"/>
       </w:r>
@@ -9846,7 +10016,7 @@
       <w:pPr>
         <w:pStyle w:val="Heading2"/>
       </w:pPr>
-      <w:bookmarkStart w:id="35" w:name="_Toc509165862"/>
+      <w:bookmarkStart w:id="36" w:name="_Toc509165862"/>
       <w:r>
         <w:t>List Tournaments</w:t>
       </w:r>
@@ -9870,18 +10040,18 @@
           <w:b/>
           <w:bCs/>
         </w:rPr>
-        <w:t>Error! Bookmark not defined.</w:t>
-      </w:r>
-      <w:r>
-        <w:fldChar w:fldCharType="end"/>
-      </w:r>
-      <w:r>
-        <w:t xml:space="preserve"> By Y</w:t>
+        <w:t xml:space="preserve"> </w:t>
+      </w:r>
+      <w:r>
+        <w:fldChar w:fldCharType="end"/>
+      </w:r>
+      <w:r>
+        <w:t>By Y</w:t>
       </w:r>
       <w:r>
         <w:t>ear</w:t>
       </w:r>
-      <w:bookmarkEnd w:id="35"/>
+      <w:bookmarkEnd w:id="36"/>
       <w:r>
         <w:fldChar w:fldCharType="begin"/>
       </w:r>
@@ -9917,7 +10087,7 @@
           <w:b/>
           <w:bCs/>
         </w:rPr>
-        <w:t>Error! Bookmark not defined.</w:t>
+        <w:t xml:space="preserve"> </w:t>
       </w:r>
       <w:r>
         <w:fldChar w:fldCharType="end"/>
@@ -9951,7 +10121,7 @@
           <w:b/>
           <w:bCs/>
         </w:rPr>
-        <w:t>Error! Bookmark not defined.</w:t>
+        <w:t xml:space="preserve"> </w:t>
       </w:r>
       <w:r>
         <w:fldChar w:fldCharType="end"/>
@@ -10091,14 +10261,27 @@
       <w:r>
         <w:t xml:space="preserve">Figure </w:t>
       </w:r>
-      <w:fldSimple w:instr=" SEQ Figure \* ARABIC ">
-        <w:r>
-          <w:rPr>
-            <w:noProof/>
-          </w:rPr>
-          <w:t>15</w:t>
-        </w:r>
-      </w:fldSimple>
+      <w:r>
+        <w:fldChar w:fldCharType="begin"/>
+      </w:r>
+      <w:r>
+        <w:instrText xml:space="preserve"> SEQ Figure \* ARABIC </w:instrText>
+      </w:r>
+      <w:r>
+        <w:fldChar w:fldCharType="separate"/>
+      </w:r>
+      <w:r>
+        <w:rPr>
+          <w:noProof/>
+        </w:rPr>
+        <w:t>15</w:t>
+      </w:r>
+      <w:r>
+        <w:rPr>
+          <w:noProof/>
+        </w:rPr>
+        <w:fldChar w:fldCharType="end"/>
+      </w:r>
       <w:r>
         <w:t>: Tournaments</w:t>
       </w:r>
@@ -10122,7 +10305,7 @@
           <w:b/>
           <w:bCs/>
         </w:rPr>
-        <w:t>Error! Bookmark not defined.</w:t>
+        <w:t xml:space="preserve"> </w:t>
       </w:r>
       <w:r>
         <w:fldChar w:fldCharType="end"/>
@@ -10135,12 +10318,12 @@
       <w:pPr>
         <w:pStyle w:val="Heading2"/>
       </w:pPr>
-      <w:bookmarkStart w:id="36" w:name="_Toc509165863"/>
+      <w:bookmarkStart w:id="37" w:name="_Toc509165863"/>
       <w:r>
         <w:lastRenderedPageBreak/>
         <w:t>Reports</w:t>
       </w:r>
-      <w:bookmarkEnd w:id="36"/>
+      <w:bookmarkEnd w:id="37"/>
       <w:r>
         <w:fldChar w:fldCharType="begin"/>
       </w:r>
@@ -10224,7 +10407,7 @@
           <w:b/>
           <w:bCs/>
         </w:rPr>
-        <w:t>Error! Bookmark not defined.</w:t>
+        <w:t xml:space="preserve"> </w:t>
       </w:r>
       <w:r>
         <w:fldChar w:fldCharType="end"/>
@@ -10315,14 +10498,27 @@
       <w:r>
         <w:t xml:space="preserve">Figure </w:t>
       </w:r>
-      <w:fldSimple w:instr=" SEQ Figure \* ARABIC ">
-        <w:r>
-          <w:rPr>
-            <w:noProof/>
-          </w:rPr>
-          <w:t>16</w:t>
-        </w:r>
-      </w:fldSimple>
+      <w:r>
+        <w:fldChar w:fldCharType="begin"/>
+      </w:r>
+      <w:r>
+        <w:instrText xml:space="preserve"> SEQ Figure \* ARABIC </w:instrText>
+      </w:r>
+      <w:r>
+        <w:fldChar w:fldCharType="separate"/>
+      </w:r>
+      <w:r>
+        <w:rPr>
+          <w:noProof/>
+        </w:rPr>
+        <w:t>16</w:t>
+      </w:r>
+      <w:r>
+        <w:rPr>
+          <w:noProof/>
+        </w:rPr>
+        <w:fldChar w:fldCharType="end"/>
+      </w:r>
       <w:r>
         <w:t xml:space="preserve"> Member Scores</w:t>
       </w:r>
@@ -10346,7 +10542,7 @@
           <w:b/>
           <w:bCs/>
         </w:rPr>
-        <w:t>Error! Bookmark not defined.</w:t>
+        <w:t xml:space="preserve"> </w:t>
       </w:r>
       <w:r>
         <w:fldChar w:fldCharType="end"/>
@@ -10371,7 +10567,7 @@
           <w:b/>
           <w:bCs/>
         </w:rPr>
-        <w:t>Error! Bookmark not defined.</w:t>
+        <w:t xml:space="preserve"> </w:t>
       </w:r>
       <w:r>
         <w:fldChar w:fldCharType="end"/>
@@ -10414,7 +10610,7 @@
           <w:b/>
           <w:bCs/>
         </w:rPr>
-        <w:t>Error! Bookmark not defined.</w:t>
+        <w:t xml:space="preserve"> </w:t>
       </w:r>
       <w:r>
         <w:fldChar w:fldCharType="end"/>
@@ -10439,7 +10635,7 @@
           <w:b/>
           <w:bCs/>
         </w:rPr>
-        <w:t>Error! Bookmark not defined.</w:t>
+        <w:t xml:space="preserve"> </w:t>
       </w:r>
       <w:r>
         <w:fldChar w:fldCharType="end"/>
@@ -10464,12 +10660,12 @@
       <w:pPr>
         <w:pStyle w:val="Heading2"/>
       </w:pPr>
-      <w:bookmarkStart w:id="37" w:name="_Toc509165864"/>
+      <w:bookmarkStart w:id="38" w:name="_Toc509165864"/>
       <w:r>
         <w:lastRenderedPageBreak/>
         <w:t>Tournament Results</w:t>
       </w:r>
-      <w:bookmarkEnd w:id="37"/>
+      <w:bookmarkEnd w:id="38"/>
       <w:r>
         <w:fldChar w:fldCharType="begin"/>
       </w:r>
@@ -10605,14 +10801,27 @@
       <w:r>
         <w:t xml:space="preserve">Figure </w:t>
       </w:r>
-      <w:fldSimple w:instr=" SEQ Figure \* ARABIC ">
-        <w:r>
-          <w:rPr>
-            <w:noProof/>
-          </w:rPr>
-          <w:t>17</w:t>
-        </w:r>
-      </w:fldSimple>
+      <w:r>
+        <w:fldChar w:fldCharType="begin"/>
+      </w:r>
+      <w:r>
+        <w:instrText xml:space="preserve"> SEQ Figure \* ARABIC </w:instrText>
+      </w:r>
+      <w:r>
+        <w:fldChar w:fldCharType="separate"/>
+      </w:r>
+      <w:r>
+        <w:rPr>
+          <w:noProof/>
+        </w:rPr>
+        <w:t>17</w:t>
+      </w:r>
+      <w:r>
+        <w:rPr>
+          <w:noProof/>
+        </w:rPr>
+        <w:fldChar w:fldCharType="end"/>
+      </w:r>
       <w:r>
         <w:t xml:space="preserve"> Tournament Results</w:t>
       </w:r>
@@ -10636,7 +10845,7 @@
           <w:b/>
           <w:bCs/>
         </w:rPr>
-        <w:t>Error! Bookmark not defined.</w:t>
+        <w:t xml:space="preserve"> </w:t>
       </w:r>
       <w:r>
         <w:fldChar w:fldCharType="end"/>
@@ -10649,11 +10858,11 @@
       <w:pPr>
         <w:pStyle w:val="Heading2"/>
       </w:pPr>
-      <w:bookmarkStart w:id="38" w:name="_Toc509165865"/>
+      <w:bookmarkStart w:id="39" w:name="_Toc509165865"/>
       <w:r>
         <w:t>Comments</w:t>
       </w:r>
-      <w:bookmarkEnd w:id="38"/>
+      <w:bookmarkEnd w:id="39"/>
       <w:r>
         <w:fldChar w:fldCharType="begin"/>
       </w:r>
@@ -10729,7 +10938,7 @@
       <w:pPr>
         <w:pStyle w:val="Heading1"/>
       </w:pPr>
-      <w:bookmarkStart w:id="39" w:name="_Toc509165866"/>
+      <w:bookmarkStart w:id="40" w:name="_Toc509165866"/>
       <w:r>
         <w:lastRenderedPageBreak/>
         <w:t>Finalize Tournament</w:t>
@@ -10739,11 +10948,11 @@
       <w:pPr>
         <w:pStyle w:val="Heading2"/>
       </w:pPr>
-      <w:commentRangeStart w:id="40"/>
+      <w:commentRangeStart w:id="41"/>
       <w:r>
         <w:t>Finalize</w:t>
       </w:r>
-      <w:commentRangeEnd w:id="40"/>
+      <w:commentRangeEnd w:id="41"/>
       <w:r>
         <w:rPr>
           <w:rStyle w:val="CommentReference"/>
@@ -10752,12 +10961,12 @@
           <w:kern w:val="0"/>
           <w:szCs w:val="20"/>
         </w:rPr>
-        <w:commentReference w:id="40"/>
+        <w:commentReference w:id="41"/>
       </w:r>
       <w:r>
         <w:t xml:space="preserve"> Tournament</w:t>
       </w:r>
-      <w:bookmarkEnd w:id="39"/>
+      <w:bookmarkEnd w:id="40"/>
       <w:r>
         <w:t xml:space="preserve"> Basics</w:t>
       </w:r>
@@ -11051,18 +11260,31 @@
       <w:r>
         <w:t xml:space="preserve">Figure </w:t>
       </w:r>
-      <w:fldSimple w:instr=" SEQ Figure \* ARABIC ">
-        <w:r>
-          <w:rPr>
-            <w:noProof/>
-          </w:rPr>
-          <w:t>18</w:t>
-        </w:r>
-      </w:fldSimple>
+      <w:r>
+        <w:fldChar w:fldCharType="begin"/>
+      </w:r>
+      <w:r>
+        <w:instrText xml:space="preserve"> SEQ Figure \* ARABIC </w:instrText>
+      </w:r>
+      <w:r>
+        <w:fldChar w:fldCharType="separate"/>
+      </w:r>
+      <w:r>
+        <w:rPr>
+          <w:noProof/>
+        </w:rPr>
+        <w:t>18</w:t>
+      </w:r>
+      <w:r>
+        <w:rPr>
+          <w:noProof/>
+        </w:rPr>
+        <w:fldChar w:fldCharType="end"/>
+      </w:r>
       <w:r>
         <w:t xml:space="preserve"> Finalize Tournament</w:t>
       </w:r>
-      <w:commentRangeStart w:id="41"/>
+      <w:commentRangeStart w:id="42"/>
       <w:r>
         <w:fldChar w:fldCharType="begin"/>
       </w:r>
@@ -11083,18 +11305,18 @@
           <w:b/>
           <w:bCs/>
         </w:rPr>
-        <w:t>Error! Bookmark not defined.</w:t>
-      </w:r>
-      <w:r>
-        <w:fldChar w:fldCharType="end"/>
-      </w:r>
-      <w:commentRangeEnd w:id="41"/>
+        <w:t xml:space="preserve"> </w:t>
+      </w:r>
+      <w:r>
+        <w:fldChar w:fldCharType="end"/>
+      </w:r>
+      <w:commentRangeEnd w:id="42"/>
       <w:r>
         <w:rPr>
           <w:rStyle w:val="CommentReference"/>
           <w:spacing w:val="0"/>
         </w:rPr>
-        <w:commentReference w:id="41"/>
+        <w:commentReference w:id="42"/>
       </w:r>
       <w:r>
         <w:t xml:space="preserve"> Screen</w:t>
@@ -12182,12 +12404,12 @@
       <w:pPr>
         <w:pStyle w:val="Heading1"/>
       </w:pPr>
-      <w:bookmarkStart w:id="42" w:name="_Toc509165867"/>
+      <w:bookmarkStart w:id="43" w:name="_Toc509165867"/>
       <w:r>
         <w:lastRenderedPageBreak/>
         <w:t>Tools</w:t>
       </w:r>
-      <w:bookmarkEnd w:id="42"/>
+      <w:bookmarkEnd w:id="43"/>
       <w:r>
         <w:fldChar w:fldCharType="begin"/>
       </w:r>
@@ -12332,14 +12554,27 @@
       <w:r>
         <w:t xml:space="preserve">Figure </w:t>
       </w:r>
-      <w:fldSimple w:instr=" SEQ Figure \* ARABIC ">
-        <w:r>
-          <w:rPr>
-            <w:noProof/>
-          </w:rPr>
-          <w:t>19</w:t>
-        </w:r>
-      </w:fldSimple>
+      <w:r>
+        <w:fldChar w:fldCharType="begin"/>
+      </w:r>
+      <w:r>
+        <w:instrText xml:space="preserve"> SEQ Figure \* ARABIC </w:instrText>
+      </w:r>
+      <w:r>
+        <w:fldChar w:fldCharType="separate"/>
+      </w:r>
+      <w:r>
+        <w:rPr>
+          <w:noProof/>
+        </w:rPr>
+        <w:t>19</w:t>
+      </w:r>
+      <w:r>
+        <w:rPr>
+          <w:noProof/>
+        </w:rPr>
+        <w:fldChar w:fldCharType="end"/>
+      </w:r>
       <w:r>
         <w:t>: Update Inactive status</w:t>
       </w:r>
@@ -12426,7 +12661,7 @@
       <w:pPr>
         <w:pStyle w:val="Heading1"/>
       </w:pPr>
-      <w:bookmarkStart w:id="43" w:name="_Toc509165868"/>
+      <w:bookmarkStart w:id="44" w:name="_Toc509165868"/>
       <w:r>
         <w:lastRenderedPageBreak/>
         <w:t>Troubles</w:t>
@@ -12452,7 +12687,7 @@
       <w:r>
         <w:t xml:space="preserve"> 9-Tap</w:t>
       </w:r>
-      <w:bookmarkEnd w:id="43"/>
+      <w:bookmarkEnd w:id="44"/>
     </w:p>
     <w:p>
       <w:pPr>
@@ -12462,7 +12697,7 @@
           <w:szCs w:val="24"/>
         </w:rPr>
       </w:pPr>
-      <w:bookmarkStart w:id="44" w:name="_Toc509165869"/>
+      <w:bookmarkStart w:id="45" w:name="_Toc509165869"/>
       <w:r>
         <w:rPr>
           <w:sz w:val="24"/>
@@ -12484,7 +12719,7 @@
         </w:rPr>
         <w:t>:</w:t>
       </w:r>
-      <w:bookmarkEnd w:id="44"/>
+      <w:bookmarkEnd w:id="45"/>
     </w:p>
     <w:p>
       <w:pPr>
@@ -12580,14 +12815,14 @@
       <w:pPr>
         <w:pStyle w:val="Heading2"/>
       </w:pPr>
-      <w:bookmarkStart w:id="45" w:name="_Toc509165870"/>
+      <w:bookmarkStart w:id="46" w:name="_Toc509165870"/>
       <w:r>
         <w:t>Screen “splitting”</w:t>
       </w:r>
       <w:r>
         <w:t xml:space="preserve"> on resize</w:t>
       </w:r>
-      <w:bookmarkEnd w:id="45"/>
+      <w:bookmarkEnd w:id="46"/>
     </w:p>
     <w:p>
       <w:pPr>
@@ -12698,14 +12933,27 @@
       <w:r>
         <w:t xml:space="preserve">Figure </w:t>
       </w:r>
-      <w:fldSimple w:instr=" SEQ Figure \* ARABIC ">
-        <w:r>
-          <w:rPr>
-            <w:noProof/>
-          </w:rPr>
-          <w:t>20</w:t>
-        </w:r>
-      </w:fldSimple>
+      <w:r>
+        <w:fldChar w:fldCharType="begin"/>
+      </w:r>
+      <w:r>
+        <w:instrText xml:space="preserve"> SEQ Figure \* ARABIC </w:instrText>
+      </w:r>
+      <w:r>
+        <w:fldChar w:fldCharType="separate"/>
+      </w:r>
+      <w:r>
+        <w:rPr>
+          <w:noProof/>
+        </w:rPr>
+        <w:t>20</w:t>
+      </w:r>
+      <w:r>
+        <w:rPr>
+          <w:noProof/>
+        </w:rPr>
+        <w:fldChar w:fldCharType="end"/>
+      </w:r>
       <w:r>
         <w:t xml:space="preserve"> Showing split screen error</w:t>
       </w:r>
@@ -12773,14 +13021,27 @@
                             <w:r>
                               <w:t xml:space="preserve">Figure </w:t>
                             </w:r>
-                            <w:fldSimple w:instr=" SEQ Figure \* ARABIC ">
-                              <w:r>
-                                <w:rPr>
-                                  <w:noProof/>
-                                </w:rPr>
-                                <w:t>21</w:t>
-                              </w:r>
-                            </w:fldSimple>
+                            <w:r>
+                              <w:fldChar w:fldCharType="begin"/>
+                            </w:r>
+                            <w:r>
+                              <w:instrText xml:space="preserve"> SEQ Figure \* ARABIC </w:instrText>
+                            </w:r>
+                            <w:r>
+                              <w:fldChar w:fldCharType="separate"/>
+                            </w:r>
+                            <w:r>
+                              <w:rPr>
+                                <w:noProof/>
+                              </w:rPr>
+                              <w:t>21</w:t>
+                            </w:r>
+                            <w:r>
+                              <w:rPr>
+                                <w:noProof/>
+                              </w:rPr>
+                              <w:fldChar w:fldCharType="end"/>
+                            </w:r>
                             <w:r>
                               <w:t xml:space="preserve"> Inner screen maximize</w:t>
                             </w:r>
@@ -12822,14 +13083,27 @@
                       <w:r>
                         <w:t xml:space="preserve">Figure </w:t>
                       </w:r>
-                      <w:fldSimple w:instr=" SEQ Figure \* ARABIC ">
-                        <w:r>
-                          <w:rPr>
-                            <w:noProof/>
-                          </w:rPr>
-                          <w:t>21</w:t>
-                        </w:r>
-                      </w:fldSimple>
+                      <w:r>
+                        <w:fldChar w:fldCharType="begin"/>
+                      </w:r>
+                      <w:r>
+                        <w:instrText xml:space="preserve"> SEQ Figure \* ARABIC </w:instrText>
+                      </w:r>
+                      <w:r>
+                        <w:fldChar w:fldCharType="separate"/>
+                      </w:r>
+                      <w:r>
+                        <w:rPr>
+                          <w:noProof/>
+                        </w:rPr>
+                        <w:t>21</w:t>
+                      </w:r>
+                      <w:r>
+                        <w:rPr>
+                          <w:noProof/>
+                        </w:rPr>
+                        <w:fldChar w:fldCharType="end"/>
+                      </w:r>
                       <w:r>
                         <w:t xml:space="preserve"> Inner screen maximize</w:t>
                       </w:r>
@@ -12923,7 +13197,7 @@
           <w:szCs w:val="24"/>
         </w:rPr>
       </w:pPr>
-      <w:bookmarkStart w:id="46" w:name="_Toc509165871"/>
+      <w:bookmarkStart w:id="47" w:name="_Toc509165871"/>
       <w:r>
         <w:rPr>
           <w:sz w:val="24"/>
@@ -12932,7 +13206,7 @@
         <w:lastRenderedPageBreak/>
         <w:t>ReadMe File</w:t>
       </w:r>
-      <w:bookmarkEnd w:id="46"/>
+      <w:bookmarkEnd w:id="47"/>
       <w:r>
         <w:rPr>
           <w:sz w:val="24"/>
@@ -13051,7 +13325,7 @@
       <w:pPr>
         <w:pStyle w:val="Heading1"/>
       </w:pPr>
-      <w:bookmarkStart w:id="47" w:name="_Toc509165872"/>
+      <w:bookmarkStart w:id="48" w:name="_Toc509165872"/>
       <w:r>
         <w:lastRenderedPageBreak/>
         <w:t>Conver</w:t>
@@ -13059,7 +13333,7 @@
       <w:r>
         <w:t>sion Program</w:t>
       </w:r>
-      <w:bookmarkEnd w:id="47"/>
+      <w:bookmarkEnd w:id="48"/>
       <w:r>
         <w:fldChar w:fldCharType="begin"/>
       </w:r>
@@ -13146,8 +13420,6 @@
         </w:rPr>
         <w:t xml:space="preserve"> </w:t>
       </w:r>
-      <w:bookmarkStart w:id="48" w:name="_GoBack"/>
-      <w:bookmarkEnd w:id="48"/>
       <w:r>
         <w:rPr>
           <w:b/>
@@ -13775,13 +14047,7 @@
         </w:numPr>
       </w:pPr>
       <w:r>
-        <w:t>Delete Region Data</w:t>
-      </w:r>
-      <w:r>
-        <w:t>—</w:t>
-      </w:r>
-      <w:r>
-        <w:t xml:space="preserve"> Prompts user to delete ALL region data.</w:t>
+        <w:t>Delete Region Data— Prompts user to delete ALL region data.</w:t>
       </w:r>
     </w:p>
     <w:p>
@@ -14661,7 +14927,7 @@
           <w:b/>
           <w:bCs/>
         </w:rPr>
-        <w:t>Error! Bookmark not defined.</w:t>
+        <w:t xml:space="preserve"> </w:t>
       </w:r>
       <w:r>
         <w:fldChar w:fldCharType="end"/>
@@ -14743,7 +15009,7 @@
           <w:b/>
           <w:bCs/>
         </w:rPr>
-        <w:t>Error! Bookmark not defined.</w:t>
+        <w:t xml:space="preserve"> </w:t>
       </w:r>
       <w:r>
         <w:fldChar w:fldCharType="end"/>
@@ -14804,7 +15070,7 @@
           <w:b/>
           <w:bCs/>
         </w:rPr>
-        <w:t>Error! Bookmark not defined.</w:t>
+        <w:t xml:space="preserve"> </w:t>
       </w:r>
       <w:r>
         <w:fldChar w:fldCharType="end"/>
@@ -14958,7 +15224,7 @@
           <w:b/>
           <w:bCs/>
         </w:rPr>
-        <w:t>Error! Bookmark not defined.</w:t>
+        <w:t xml:space="preserve"> </w:t>
       </w:r>
       <w:r>
         <w:fldChar w:fldCharType="end"/>
@@ -15019,7 +15285,7 @@
           <w:b/>
           <w:bCs/>
         </w:rPr>
-        <w:t>Error! Bookmark not defined.</w:t>
+        <w:t xml:space="preserve"> </w:t>
       </w:r>
       <w:r>
         <w:fldChar w:fldCharType="end"/>
@@ -15062,7 +15328,7 @@
           <w:b/>
           <w:bCs/>
         </w:rPr>
-        <w:t>Error! Bookmark not defined.</w:t>
+        <w:t xml:space="preserve"> </w:t>
       </w:r>
       <w:r>
         <w:fldChar w:fldCharType="end"/>
@@ -15080,7 +15346,6 @@
         </w:numPr>
       </w:pPr>
       <w:r>
-        <w:lastRenderedPageBreak/>
         <w:t>First Name</w:t>
       </w:r>
       <w:r>
@@ -15103,7 +15368,7 @@
           <w:b/>
           <w:bCs/>
         </w:rPr>
-        <w:t>Error! Bookmark not defined.</w:t>
+        <w:t xml:space="preserve"> </w:t>
       </w:r>
       <w:r>
         <w:fldChar w:fldCharType="end"/>
@@ -15121,6 +15386,7 @@
         </w:numPr>
       </w:pPr>
       <w:r>
+        <w:lastRenderedPageBreak/>
         <w:t>Middle Initial</w:t>
       </w:r>
       <w:r>
@@ -15143,7 +15409,7 @@
           <w:b/>
           <w:bCs/>
         </w:rPr>
-        <w:t>Error! Bookmark not defined.</w:t>
+        <w:t xml:space="preserve"> </w:t>
       </w:r>
       <w:r>
         <w:fldChar w:fldCharType="end"/>
@@ -15198,7 +15464,7 @@
           <w:b/>
           <w:bCs/>
         </w:rPr>
-        <w:t>Error! Bookmark not defined.</w:t>
+        <w:t xml:space="preserve"> </w:t>
       </w:r>
       <w:r>
         <w:fldChar w:fldCharType="end"/>
@@ -15253,7 +15519,7 @@
           <w:b/>
           <w:bCs/>
         </w:rPr>
-        <w:t>Error! Bookmark not defined.</w:t>
+        <w:t xml:space="preserve"> </w:t>
       </w:r>
       <w:r>
         <w:fldChar w:fldCharType="end"/>
@@ -15308,7 +15574,7 @@
           <w:b/>
           <w:bCs/>
         </w:rPr>
-        <w:t>Error! Bookmark not defined.</w:t>
+        <w:t xml:space="preserve"> </w:t>
       </w:r>
       <w:r>
         <w:fldChar w:fldCharType="end"/>
@@ -15348,7 +15614,7 @@
           <w:b/>
           <w:bCs/>
         </w:rPr>
-        <w:t>Error! Bookmark not defined.</w:t>
+        <w:t xml:space="preserve"> </w:t>
       </w:r>
       <w:r>
         <w:fldChar w:fldCharType="end"/>
@@ -15711,7 +15977,6 @@
         </w:numPr>
       </w:pPr>
       <w:r>
-        <w:lastRenderedPageBreak/>
         <w:t>Score Type</w:t>
       </w:r>
       <w:r>
@@ -15754,6 +16019,7 @@
         </w:numPr>
       </w:pPr>
       <w:r>
+        <w:lastRenderedPageBreak/>
         <w:t>Add New/Update Record</w:t>
       </w:r>
       <w:r>
@@ -15851,7 +16117,7 @@
           <w:b/>
           <w:bCs/>
         </w:rPr>
-        <w:t>Error! Bookmark not defined.</w:t>
+        <w:t xml:space="preserve"> </w:t>
       </w:r>
       <w:r>
         <w:fldChar w:fldCharType="end"/>
@@ -15921,7 +16187,7 @@
           <w:b/>
           <w:bCs/>
         </w:rPr>
-        <w:t>Error! Bookmark not defined.</w:t>
+        <w:t xml:space="preserve"> </w:t>
       </w:r>
       <w:r>
         <w:fldChar w:fldCharType="end"/>
@@ -16180,7 +16446,7 @@
           <w:b/>
           <w:bCs/>
         </w:rPr>
-        <w:t>Error! Bookmark not defined.</w:t>
+        <w:t xml:space="preserve"> </w:t>
       </w:r>
       <w:r>
         <w:fldChar w:fldCharType="end"/>
@@ -16237,7 +16503,6 @@
         </w:numPr>
       </w:pPr>
       <w:r>
-        <w:lastRenderedPageBreak/>
         <w:t>Game</w:t>
       </w:r>
       <w:r>
@@ -16268,6 +16533,7 @@
         </w:numPr>
       </w:pPr>
       <w:r>
+        <w:lastRenderedPageBreak/>
         <w:t>Tournament Results</w:t>
       </w:r>
       <w:r>
@@ -17839,7 +18105,7 @@
 
 <file path=word/comments.xml><?xml version="1.0" encoding="utf-8"?>
 <w:comments xmlns:wpc="http://schemas.microsoft.com/office/word/2010/wordprocessingCanvas" xmlns:mc="http://schemas.openxmlformats.org/markup-compatibility/2006" xmlns:o="urn:schemas-microsoft-com:office:office" xmlns:r="http://schemas.openxmlformats.org/officeDocument/2006/relationships" xmlns:m="http://schemas.openxmlformats.org/officeDocument/2006/math" xmlns:v="urn:schemas-microsoft-com:vml" xmlns:wp14="http://schemas.microsoft.com/office/word/2010/wordprocessingDrawing" xmlns:wp="http://schemas.openxmlformats.org/drawingml/2006/wordprocessingDrawing" xmlns:w10="urn:schemas-microsoft-com:office:word" xmlns:w="http://schemas.openxmlformats.org/wordprocessingml/2006/main" xmlns:w14="http://schemas.microsoft.com/office/word/2010/wordml" xmlns:w15="http://schemas.microsoft.com/office/word/2012/wordml" xmlns:wpg="http://schemas.microsoft.com/office/word/2010/wordprocessingGroup" xmlns:wpi="http://schemas.microsoft.com/office/word/2010/wordprocessingInk" xmlns:wne="http://schemas.microsoft.com/office/word/2006/wordml" xmlns:wps="http://schemas.microsoft.com/office/word/2010/wordprocessingShape" mc:Ignorable="w14 w15 wp14">
-  <w:comment w:id="40" w:author="Timothy Fair" w:date="2018-07-25T14:36:00Z" w:initials="TF">
+  <w:comment w:id="41" w:author="Timothy Fair" w:date="2018-07-25T14:36:00Z" w:initials="TF">
     <w:p>
       <w:pPr>
         <w:pStyle w:val="CommentText"/>
@@ -17852,7 +18118,7 @@
       </w:r>
     </w:p>
   </w:comment>
-  <w:comment w:id="41" w:author="Timothy Fair" w:date="2018-07-25T14:36:00Z" w:initials="TF">
+  <w:comment w:id="42" w:author="Timothy Fair" w:date="2018-07-25T14:36:00Z" w:initials="TF">
     <w:p>
       <w:pPr>
         <w:pStyle w:val="CommentText"/>
@@ -17996,7 +18262,7 @@
         <w:rStyle w:val="PageNumber"/>
         <w:noProof/>
       </w:rPr>
-      <w:t>38</w:t>
+      <w:t>8</w:t>
     </w:r>
     <w:r>
       <w:rPr>
@@ -18046,7 +18312,7 @@
         <w:rStyle w:val="PageNumber"/>
         <w:noProof/>
       </w:rPr>
-      <w:t>44</w:t>
+      <w:t>43</w:t>
     </w:r>
     <w:r>
       <w:rPr>
@@ -22209,7 +22475,7 @@
 </file>
 
 <file path=customXml/itemProps1.xml><?xml version="1.0" encoding="utf-8"?>
-<ds:datastoreItem xmlns:ds="http://schemas.openxmlformats.org/officeDocument/2006/customXml" ds:itemID="{2580E2B4-57E3-4775-A131-BFCA433761A9}">
+<ds:datastoreItem xmlns:ds="http://schemas.openxmlformats.org/officeDocument/2006/customXml" ds:itemID="{2ADA9EF8-5AB0-4906-9FC0-B0DEF9385AAD}">
   <ds:schemaRefs>
     <ds:schemaRef ds:uri="http://schemas.openxmlformats.org/officeDocument/2006/bibliography"/>
   </ds:schemaRefs>

</xml_diff>

<commit_message>
Added a better description for Tools in the manual.
</commit_message>
<xml_diff>
--- a/9tapUserManual.docx
+++ b/9tapUserManual.docx
@@ -11339,7 +11339,7 @@
           <w:noProof/>
         </w:rPr>
         <w:pict w14:anchorId="225EA388">
-          <v:shape id="_x0000_i1026" type="#_x0000_t75" style="width:384.45pt;height:222.8pt">
+          <v:shape id="_x0000_i1026" type="#_x0000_t75" style="width:384pt;height:222.75pt">
             <v:imagedata r:id="rId35" o:title="FinalizeTournamentWindow"/>
           </v:shape>
         </w:pict>
@@ -12533,11 +12533,11 @@
       <w:r>
         <w:t xml:space="preserve">you will find miscellaneous tools which may be helpful in making use of the program simpler. </w:t>
       </w:r>
-    </w:p>
-    <w:p>
-      <w:pPr>
-        <w:pStyle w:val="BodyText"/>
-      </w:pPr>
+      <w:r>
+        <w:t>The current options include Backup Database, Restore Database, and Update Inactive Members.</w:t>
+      </w:r>
+      <w:bookmarkStart w:id="43" w:name="_GoBack"/>
+      <w:bookmarkEnd w:id="43"/>
     </w:p>
     <w:p>
       <w:pPr>
@@ -12627,7 +12627,7 @@
           <w:noProof/>
         </w:rPr>
         <w:pict w14:anchorId="6C066037">
-          <v:shape id="_x0000_i1028" type="#_x0000_t75" style="width:216.7pt;height:369.5pt">
+          <v:shape id="_x0000_i1028" type="#_x0000_t75" style="width:216.75pt;height:369.75pt">
             <v:imagedata r:id="rId50" o:title="UpdateInactiveMemberForm"/>
           </v:shape>
         </w:pict>
@@ -12750,7 +12750,7 @@
       <w:pPr>
         <w:pStyle w:val="Heading1"/>
       </w:pPr>
-      <w:bookmarkStart w:id="43" w:name="_Toc509165868"/>
+      <w:bookmarkStart w:id="44" w:name="_Toc509165868"/>
       <w:r>
         <w:lastRenderedPageBreak/>
         <w:t>Troubles</w:t>
@@ -12776,7 +12776,7 @@
       <w:r>
         <w:t xml:space="preserve"> 9-Tap</w:t>
       </w:r>
-      <w:bookmarkEnd w:id="43"/>
+      <w:bookmarkEnd w:id="44"/>
     </w:p>
     <w:p>
       <w:pPr>
@@ -12786,7 +12786,7 @@
           <w:szCs w:val="24"/>
         </w:rPr>
       </w:pPr>
-      <w:bookmarkStart w:id="44" w:name="_Toc509165869"/>
+      <w:bookmarkStart w:id="45" w:name="_Toc509165869"/>
       <w:r>
         <w:rPr>
           <w:sz w:val="24"/>
@@ -12808,7 +12808,7 @@
         </w:rPr>
         <w:t>:</w:t>
       </w:r>
-      <w:bookmarkEnd w:id="44"/>
+      <w:bookmarkEnd w:id="45"/>
     </w:p>
     <w:p>
       <w:pPr>
@@ -12909,14 +12909,14 @@
       <w:pPr>
         <w:pStyle w:val="Heading2"/>
       </w:pPr>
-      <w:bookmarkStart w:id="45" w:name="_Toc509165870"/>
+      <w:bookmarkStart w:id="46" w:name="_Toc509165870"/>
       <w:r>
         <w:t>Screen “splitting”</w:t>
       </w:r>
       <w:r>
         <w:t xml:space="preserve"> on resize</w:t>
       </w:r>
-      <w:bookmarkEnd w:id="45"/>
+      <w:bookmarkEnd w:id="46"/>
     </w:p>
     <w:p>
       <w:pPr>
@@ -13248,7 +13248,7 @@
           <w:szCs w:val="24"/>
         </w:rPr>
       </w:pPr>
-      <w:bookmarkStart w:id="46" w:name="_Toc509165871"/>
+      <w:bookmarkStart w:id="47" w:name="_Toc509165871"/>
       <w:r>
         <w:rPr>
           <w:sz w:val="24"/>
@@ -13257,7 +13257,7 @@
         <w:lastRenderedPageBreak/>
         <w:t>ReadMe File</w:t>
       </w:r>
-      <w:bookmarkEnd w:id="46"/>
+      <w:bookmarkEnd w:id="47"/>
       <w:r>
         <w:rPr>
           <w:sz w:val="24"/>
@@ -13356,7 +13356,7 @@
       </w:pPr>
       <w:r>
         <w:pict w14:anchorId="0E18A813">
-          <v:shape id="_x0000_i1029" type="#_x0000_t75" style="width:383.75pt;height:199.7pt">
+          <v:shape id="_x0000_i1029" type="#_x0000_t75" style="width:384pt;height:199.5pt">
             <v:imagedata r:id="rId53" o:title="9TapMemberInfo"/>
           </v:shape>
         </w:pict>
@@ -13366,8 +13366,6 @@
       <w:r>
         <w:t>Figure 21a : Member Info</w:t>
       </w:r>
-      <w:bookmarkStart w:id="47" w:name="_GoBack"/>
-      <w:bookmarkEnd w:id="47"/>
       <w:r>
         <w:t xml:space="preserve"> with unchanged layout.</w:t>
       </w:r>
@@ -13376,7 +13374,7 @@
       <w:r>
         <w:lastRenderedPageBreak/>
         <w:pict w14:anchorId="5B245710">
-          <v:shape id="_x0000_i1030" type="#_x0000_t75" style="width:383.1pt;height:205.15pt">
+          <v:shape id="_x0000_i1030" type="#_x0000_t75" style="width:383.25pt;height:204.75pt">
             <v:imagedata r:id="rId54" o:title="MemberInfoSwappedLayout"/>
           </v:shape>
         </w:pict>
@@ -13518,7 +13516,7 @@
       </w:pPr>
       <w:r>
         <w:pict w14:anchorId="3F82314C">
-          <v:shape id="_x0000_i1027" type="#_x0000_t75" style="width:384.45pt;height:207.15pt">
+          <v:shape id="_x0000_i1027" type="#_x0000_t75" style="width:384pt;height:207pt">
             <v:imagedata r:id="rId55" o:title="ImportButtonExample"/>
           </v:shape>
         </w:pict>
@@ -18441,7 +18439,7 @@
         <w:rStyle w:val="PageNumber"/>
         <w:noProof/>
       </w:rPr>
-      <w:t>45</w:t>
+      <w:t>44</w:t>
     </w:r>
     <w:r>
       <w:rPr>
@@ -21492,7 +21490,7 @@
 </file>
 
 <file path=customXml/itemProps1.xml><?xml version="1.0" encoding="utf-8"?>
-<ds:datastoreItem xmlns:ds="http://schemas.openxmlformats.org/officeDocument/2006/customXml" ds:itemID="{D0CF0EEF-67C1-4287-98C5-92C008DCF4A6}">
+<ds:datastoreItem xmlns:ds="http://schemas.openxmlformats.org/officeDocument/2006/customXml" ds:itemID="{84336954-7237-4B45-AFD1-1509C22047CF}">
   <ds:schemaRefs>
     <ds:schemaRef ds:uri="http://schemas.openxmlformats.org/officeDocument/2006/bibliography"/>
   </ds:schemaRefs>

</xml_diff>

<commit_message>
Removed duplicate of installation instructions in the Quick Start Guide of the manual.
</commit_message>
<xml_diff>
--- a/9tapUserManual.docx
+++ b/9tapUserManual.docx
@@ -2991,7 +2991,7 @@
                 <w:noProof/>
                 <w:webHidden/>
               </w:rPr>
-              <w:t>31</w:t>
+              <w:t>30</w:t>
             </w:r>
             <w:r>
               <w:rPr>
@@ -3337,7 +3337,7 @@
                 <w:noProof/>
                 <w:webHidden/>
               </w:rPr>
-              <w:t>37</w:t>
+              <w:t>38</w:t>
             </w:r>
             <w:r>
               <w:rPr>
@@ -3408,7 +3408,7 @@
                 <w:noProof/>
                 <w:webHidden/>
               </w:rPr>
-              <w:t>39</w:t>
+              <w:t>40</w:t>
             </w:r>
             <w:r>
               <w:rPr>
@@ -3476,7 +3476,7 @@
                 <w:noProof/>
                 <w:webHidden/>
               </w:rPr>
-              <w:t>39</w:t>
+              <w:t>40</w:t>
             </w:r>
             <w:r>
               <w:rPr>
@@ -3544,7 +3544,7 @@
                 <w:noProof/>
                 <w:webHidden/>
               </w:rPr>
-              <w:t>39</w:t>
+              <w:t>40</w:t>
             </w:r>
             <w:r>
               <w:rPr>
@@ -3612,7 +3612,7 @@
                 <w:noProof/>
                 <w:webHidden/>
               </w:rPr>
-              <w:t>41</w:t>
+              <w:t>42</w:t>
             </w:r>
             <w:r>
               <w:rPr>
@@ -3680,7 +3680,7 @@
                 <w:noProof/>
                 <w:webHidden/>
               </w:rPr>
-              <w:t>44</w:t>
+              <w:t>45</w:t>
             </w:r>
             <w:r>
               <w:rPr>
@@ -3748,7 +3748,7 @@
                 <w:noProof/>
                 <w:webHidden/>
               </w:rPr>
-              <w:t>44</w:t>
+              <w:t>45</w:t>
             </w:r>
             <w:r>
               <w:rPr>
@@ -3816,7 +3816,7 @@
                 <w:noProof/>
                 <w:webHidden/>
               </w:rPr>
-              <w:t>44</w:t>
+              <w:t>45</w:t>
             </w:r>
             <w:r>
               <w:rPr>
@@ -3884,7 +3884,7 @@
                 <w:noProof/>
                 <w:webHidden/>
               </w:rPr>
-              <w:t>45</w:t>
+              <w:t>46</w:t>
             </w:r>
             <w:r>
               <w:rPr>
@@ -4353,14 +4353,27 @@
       <w:r>
         <w:t xml:space="preserve">Figure </w:t>
       </w:r>
-      <w:fldSimple w:instr=" SEQ Figure \* ARABIC ">
-        <w:r>
-          <w:rPr>
-            <w:noProof/>
-          </w:rPr>
-          <w:t>1</w:t>
-        </w:r>
-      </w:fldSimple>
+      <w:r>
+        <w:fldChar w:fldCharType="begin"/>
+      </w:r>
+      <w:r>
+        <w:instrText xml:space="preserve"> SEQ Figure \* ARABIC </w:instrText>
+      </w:r>
+      <w:r>
+        <w:fldChar w:fldCharType="separate"/>
+      </w:r>
+      <w:r>
+        <w:rPr>
+          <w:noProof/>
+        </w:rPr>
+        <w:t>1</w:t>
+      </w:r>
+      <w:r>
+        <w:rPr>
+          <w:noProof/>
+        </w:rPr>
+        <w:fldChar w:fldCharType="end"/>
+      </w:r>
       <w:r>
         <w:t>: 9-Tap Main Menu</w:t>
       </w:r>
@@ -4563,7 +4576,7 @@
         <w:t xml:space="preserve">You can find this on page </w:t>
       </w:r>
       <w:r>
-        <w:t>31</w:t>
+        <w:t>33</w:t>
       </w:r>
       <w:r>
         <w:t>.</w:t>
@@ -5139,165 +5152,11 @@
     </w:p>
     <w:p>
       <w:pPr>
-        <w:pStyle w:val="BodyText"/>
-        <w:numPr>
-          <w:ilvl w:val="0"/>
-          <w:numId w:val="3"/>
-        </w:numPr>
-      </w:pPr>
-      <w:r>
-        <w:t>Start Windows and exit all other applications.</w:t>
-      </w:r>
-    </w:p>
-    <w:p>
-      <w:pPr>
-        <w:pStyle w:val="BodyText"/>
-        <w:numPr>
-          <w:ilvl w:val="0"/>
-          <w:numId w:val="3"/>
-        </w:numPr>
-      </w:pPr>
-      <w:r>
-        <w:t>Insert the 9 Tap Tour USB drive into your computer’s USB port.</w:t>
-      </w:r>
-    </w:p>
-    <w:p>
-      <w:pPr>
-        <w:pStyle w:val="BodyText"/>
-        <w:numPr>
-          <w:ilvl w:val="0"/>
-          <w:numId w:val="3"/>
-        </w:numPr>
-      </w:pPr>
-      <w:r>
-        <w:t>If the file manager dialog does not appear, click the Start button on your Windows taskbar, then click Run. Type D:\Setup and click on OK. (Note: If your removable USB drive is assigned a letter other than D, use that letter.)</w:t>
-      </w:r>
-    </w:p>
-    <w:p>
-      <w:pPr>
-        <w:pStyle w:val="BodyText"/>
-        <w:numPr>
-          <w:ilvl w:val="0"/>
-          <w:numId w:val="3"/>
-        </w:numPr>
-      </w:pPr>
-      <w:r>
-        <w:t>The installation wizard will now run.</w:t>
-      </w:r>
-    </w:p>
-    <w:p>
-      <w:pPr>
-        <w:pStyle w:val="BodyText"/>
-        <w:numPr>
-          <w:ilvl w:val="0"/>
-          <w:numId w:val="3"/>
-        </w:numPr>
-      </w:pPr>
-      <w:r>
-        <w:t>The next window will prompt you to shut down all other running programs before starting the 9 Tap Tour installation process. Do this and then click “Next” to continue.</w:t>
-      </w:r>
-    </w:p>
-    <w:p>
-      <w:pPr>
-        <w:pStyle w:val="BodyText"/>
-        <w:numPr>
-          <w:ilvl w:val="0"/>
-          <w:numId w:val="3"/>
-        </w:numPr>
-      </w:pPr>
-      <w:r>
-        <w:t>End User License agreement. Read the agreement, and if you agree to the terms and conditions cho</w:t>
-      </w:r>
-      <w:r>
-        <w:t>o</w:t>
-      </w:r>
-      <w:r>
-        <w:t>se “I agree.” Then click the “I Agree” button to continue the installation process.</w:t>
-      </w:r>
-    </w:p>
-    <w:p>
-      <w:pPr>
-        <w:pStyle w:val="BodyText"/>
-        <w:numPr>
-          <w:ilvl w:val="0"/>
-          <w:numId w:val="3"/>
-        </w:numPr>
-      </w:pPr>
-      <w:r>
-        <w:t>Next, cho</w:t>
-      </w:r>
-      <w:r>
-        <w:t>o</w:t>
-      </w:r>
-      <w:r>
-        <w:t>se an install location for the program. Either accept the default location or choose another location. Once you’re satisfied with your choice, click “Next” to continue installing.</w:t>
-      </w:r>
-    </w:p>
-    <w:p>
-      <w:pPr>
-        <w:pStyle w:val="BodyText"/>
-        <w:numPr>
-          <w:ilvl w:val="0"/>
-          <w:numId w:val="3"/>
-        </w:numPr>
-      </w:pPr>
-      <w:r>
-        <w:t>Select a Start Menu Folder for 9 Tap Tour. Either accept the default location or cho</w:t>
-      </w:r>
-      <w:r>
-        <w:t>o</w:t>
-      </w:r>
-      <w:r>
-        <w:t>se another. If you don’t want a Start Menu folder to be created check the box “Do Not Create A Start Menu Folder”. Once you are satisfied with your selection click the “Next” button to continue.</w:t>
-      </w:r>
-    </w:p>
-    <w:p>
-      <w:pPr>
-        <w:pStyle w:val="BodyText"/>
-        <w:numPr>
-          <w:ilvl w:val="0"/>
-          <w:numId w:val="3"/>
-        </w:numPr>
-      </w:pPr>
-      <w:r>
-        <w:t>Select the shortcuts you want created. Cho</w:t>
-      </w:r>
-      <w:r>
-        <w:t>o</w:t>
-      </w:r>
-      <w:r>
-        <w:t>se to create shortcuts on the Desktop, Quick Launch Toolbar, or neither. Once you are satisfied with your selection click on the “Next” button to continue.</w:t>
-      </w:r>
-    </w:p>
-    <w:p>
-      <w:pPr>
-        <w:pStyle w:val="BodyText"/>
-        <w:numPr>
-          <w:ilvl w:val="0"/>
-          <w:numId w:val="3"/>
-        </w:numPr>
-      </w:pPr>
-      <w:r>
-        <w:t>The 9 Tap Tour will now begin installing. When the “Install complete” message displays, click the “Next:” button to continue.</w:t>
-      </w:r>
-    </w:p>
-    <w:p>
-      <w:pPr>
-        <w:pStyle w:val="BodyText"/>
-        <w:numPr>
-          <w:ilvl w:val="0"/>
-          <w:numId w:val="3"/>
-        </w:numPr>
-      </w:pPr>
-      <w:r>
-        <w:t>The 9 Tap Tour program has now been successfully installed. Choose “Run 9 Tap Tour” to immediately launch the program, or “View ReadMe.txt” to view the ReadMe file where you can view updated program information made after the game manual was printed.</w:t>
-      </w:r>
-    </w:p>
-    <w:p>
-      <w:pPr>
         <w:pStyle w:val="Heading2"/>
       </w:pPr>
       <w:bookmarkStart w:id="11" w:name="_Toc509165838"/>
+      <w:bookmarkStart w:id="12" w:name="_GoBack"/>
+      <w:bookmarkEnd w:id="12"/>
       <w:r>
         <w:t>How do I Launch 9-Tap?</w:t>
       </w:r>
@@ -5324,9 +5183,8 @@
       <w:pPr>
         <w:pStyle w:val="Heading2"/>
       </w:pPr>
-      <w:bookmarkStart w:id="12" w:name="_Toc509165839"/>
-      <w:r>
-        <w:lastRenderedPageBreak/>
+      <w:bookmarkStart w:id="13" w:name="_Toc509165839"/>
+      <w:r>
         <w:t>How do I import existing</w:t>
       </w:r>
       <w:r>
@@ -5357,7 +5215,7 @@
       <w:r>
         <w:t xml:space="preserve"> members?</w:t>
       </w:r>
-      <w:bookmarkEnd w:id="12"/>
+      <w:bookmarkEnd w:id="13"/>
     </w:p>
     <w:p>
       <w:pPr>
@@ -5429,11 +5287,11 @@
       <w:pPr>
         <w:pStyle w:val="Heading2"/>
       </w:pPr>
-      <w:bookmarkStart w:id="13" w:name="_Toc509165840"/>
+      <w:bookmarkStart w:id="14" w:name="_Toc509165840"/>
       <w:r>
         <w:t>How do I enter a new player?</w:t>
       </w:r>
-      <w:bookmarkEnd w:id="13"/>
+      <w:bookmarkEnd w:id="14"/>
     </w:p>
     <w:p>
       <w:pPr>
@@ -5511,11 +5369,11 @@
       <w:pPr>
         <w:pStyle w:val="Heading2"/>
       </w:pPr>
-      <w:bookmarkStart w:id="14" w:name="_Toc509165841"/>
+      <w:bookmarkStart w:id="15" w:name="_Toc509165841"/>
       <w:r>
         <w:t>How do I create a tournament?</w:t>
       </w:r>
-      <w:bookmarkEnd w:id="14"/>
+      <w:bookmarkEnd w:id="15"/>
     </w:p>
     <w:p>
       <w:pPr>
@@ -5648,11 +5506,11 @@
       <w:pPr>
         <w:pStyle w:val="Heading2"/>
       </w:pPr>
-      <w:bookmarkStart w:id="15" w:name="_Toc509165842"/>
+      <w:bookmarkStart w:id="16" w:name="_Toc509165842"/>
       <w:r>
         <w:t>How do I enter a bowler’s scores?</w:t>
       </w:r>
-      <w:bookmarkEnd w:id="15"/>
+      <w:bookmarkEnd w:id="16"/>
     </w:p>
     <w:p>
       <w:pPr>
@@ -5876,7 +5734,7 @@
           <w:szCs w:val="32"/>
         </w:rPr>
       </w:pPr>
-      <w:bookmarkStart w:id="16" w:name="_Toc509165843"/>
+      <w:bookmarkStart w:id="17" w:name="_Toc509165843"/>
       <w:r>
         <w:rPr>
           <w:szCs w:val="32"/>
@@ -5884,7 +5742,7 @@
         <w:lastRenderedPageBreak/>
         <w:t>Main Menu</w:t>
       </w:r>
-      <w:bookmarkEnd w:id="16"/>
+      <w:bookmarkEnd w:id="17"/>
       <w:r>
         <w:rPr>
           <w:szCs w:val="32"/>
@@ -6263,14 +6121,27 @@
       <w:r>
         <w:t xml:space="preserve">Figure </w:t>
       </w:r>
-      <w:fldSimple w:instr=" SEQ Figure \* ARABIC ">
-        <w:r>
-          <w:rPr>
-            <w:noProof/>
-          </w:rPr>
-          <w:t>2</w:t>
-        </w:r>
-      </w:fldSimple>
+      <w:r>
+        <w:fldChar w:fldCharType="begin"/>
+      </w:r>
+      <w:r>
+        <w:instrText xml:space="preserve"> SEQ Figure \* ARABIC </w:instrText>
+      </w:r>
+      <w:r>
+        <w:fldChar w:fldCharType="separate"/>
+      </w:r>
+      <w:r>
+        <w:rPr>
+          <w:noProof/>
+        </w:rPr>
+        <w:t>2</w:t>
+      </w:r>
+      <w:r>
+        <w:rPr>
+          <w:noProof/>
+        </w:rPr>
+        <w:fldChar w:fldCharType="end"/>
+      </w:r>
       <w:r>
         <w:t>: Main Menu</w:t>
       </w:r>
@@ -6335,12 +6206,12 @@
       <w:pPr>
         <w:pStyle w:val="Heading1"/>
       </w:pPr>
-      <w:bookmarkStart w:id="17" w:name="_Toc509165844"/>
+      <w:bookmarkStart w:id="18" w:name="_Toc509165844"/>
       <w:r>
         <w:lastRenderedPageBreak/>
         <w:t>Member Info</w:t>
       </w:r>
-      <w:bookmarkEnd w:id="17"/>
+      <w:bookmarkEnd w:id="18"/>
       <w:r>
         <w:fldChar w:fldCharType="begin"/>
       </w:r>
@@ -6510,14 +6381,30 @@
       <w:r>
         <w:t xml:space="preserve">Figure </w:t>
       </w:r>
-      <w:fldSimple w:instr=" SEQ Figure \* ARABIC ">
-        <w:r>
-          <w:rPr>
-            <w:noProof/>
-          </w:rPr>
-          <w:t>3</w:t>
-        </w:r>
-      </w:fldSimple>
+      <w:r>
+        <w:fldChar w:fldCharType="begin"/>
+      </w:r>
+      <w:r>
+        <w:instrText xml:space="preserve"> SEQ Figure \* ARABIC</w:instrText>
+      </w:r>
+      <w:r>
+        <w:instrText xml:space="preserve"> </w:instrText>
+      </w:r>
+      <w:r>
+        <w:fldChar w:fldCharType="separate"/>
+      </w:r>
+      <w:r>
+        <w:rPr>
+          <w:noProof/>
+        </w:rPr>
+        <w:t>3</w:t>
+      </w:r>
+      <w:r>
+        <w:rPr>
+          <w:noProof/>
+        </w:rPr>
+        <w:fldChar w:fldCharType="end"/>
+      </w:r>
       <w:r>
         <w:t>: Member Information</w:t>
       </w:r>
@@ -6526,7 +6413,7 @@
       <w:pPr>
         <w:pStyle w:val="Heading3"/>
       </w:pPr>
-      <w:bookmarkStart w:id="18" w:name="_Toc509165845"/>
+      <w:bookmarkStart w:id="19" w:name="_Toc509165845"/>
       <w:r>
         <w:t>Import</w:t>
       </w:r>
@@ -6564,7 +6451,7 @@
       <w:r>
         <w:t>Member</w:t>
       </w:r>
-      <w:bookmarkEnd w:id="18"/>
+      <w:bookmarkEnd w:id="19"/>
       <w:r>
         <w:fldChar w:fldCharType="begin"/>
       </w:r>
@@ -6689,11 +6576,11 @@
       <w:pPr>
         <w:pStyle w:val="Heading3"/>
       </w:pPr>
-      <w:bookmarkStart w:id="19" w:name="_Toc509165846"/>
+      <w:bookmarkStart w:id="20" w:name="_Toc509165846"/>
       <w:r>
         <w:t>New Members</w:t>
       </w:r>
-      <w:bookmarkEnd w:id="19"/>
+      <w:bookmarkEnd w:id="20"/>
       <w:r>
         <w:fldChar w:fldCharType="begin"/>
       </w:r>
@@ -7447,14 +7334,27 @@
       <w:r>
         <w:t xml:space="preserve">Figure </w:t>
       </w:r>
-      <w:fldSimple w:instr=" SEQ Figure \* ARABIC ">
-        <w:r>
-          <w:rPr>
-            <w:noProof/>
-          </w:rPr>
-          <w:t>4</w:t>
-        </w:r>
-      </w:fldSimple>
+      <w:r>
+        <w:fldChar w:fldCharType="begin"/>
+      </w:r>
+      <w:r>
+        <w:instrText xml:space="preserve"> SEQ Figure \* ARABIC </w:instrText>
+      </w:r>
+      <w:r>
+        <w:fldChar w:fldCharType="separate"/>
+      </w:r>
+      <w:r>
+        <w:rPr>
+          <w:noProof/>
+        </w:rPr>
+        <w:t>4</w:t>
+      </w:r>
+      <w:r>
+        <w:rPr>
+          <w:noProof/>
+        </w:rPr>
+        <w:fldChar w:fldCharType="end"/>
+      </w:r>
       <w:r>
         <w:t>: Member Information</w:t>
       </w:r>
@@ -7463,14 +7363,14 @@
       <w:pPr>
         <w:pStyle w:val="Heading3"/>
       </w:pPr>
-      <w:bookmarkStart w:id="20" w:name="_Toc509165847"/>
+      <w:bookmarkStart w:id="21" w:name="_Toc509165847"/>
       <w:r>
         <w:t xml:space="preserve">Updating </w:t>
       </w:r>
       <w:r>
         <w:t>Members</w:t>
       </w:r>
-      <w:bookmarkEnd w:id="20"/>
+      <w:bookmarkEnd w:id="21"/>
       <w:r>
         <w:fldChar w:fldCharType="begin"/>
       </w:r>
@@ -7633,7 +7533,7 @@
           <w:szCs w:val="20"/>
         </w:rPr>
       </w:pPr>
-      <w:bookmarkStart w:id="21" w:name="_Toc509165848"/>
+      <w:bookmarkStart w:id="22" w:name="_Toc509165848"/>
       <w:r>
         <w:rPr>
           <w:szCs w:val="20"/>
@@ -7641,7 +7541,7 @@
         <w:lastRenderedPageBreak/>
         <w:t>Stats</w:t>
       </w:r>
-      <w:bookmarkEnd w:id="21"/>
+      <w:bookmarkEnd w:id="22"/>
       <w:r>
         <w:rPr>
           <w:szCs w:val="20"/>
@@ -7784,14 +7684,27 @@
       <w:r>
         <w:t xml:space="preserve">Figure </w:t>
       </w:r>
-      <w:fldSimple w:instr=" SEQ Figure \* ARABIC ">
-        <w:r>
-          <w:rPr>
-            <w:noProof/>
-          </w:rPr>
-          <w:t>5</w:t>
-        </w:r>
-      </w:fldSimple>
+      <w:r>
+        <w:fldChar w:fldCharType="begin"/>
+      </w:r>
+      <w:r>
+        <w:instrText xml:space="preserve"> SEQ Figure \* ARABIC </w:instrText>
+      </w:r>
+      <w:r>
+        <w:fldChar w:fldCharType="separate"/>
+      </w:r>
+      <w:r>
+        <w:rPr>
+          <w:noProof/>
+        </w:rPr>
+        <w:t>5</w:t>
+      </w:r>
+      <w:r>
+        <w:rPr>
+          <w:noProof/>
+        </w:rPr>
+        <w:fldChar w:fldCharType="end"/>
+      </w:r>
       <w:r>
         <w:t>: Stats</w:t>
       </w:r>
@@ -7809,7 +7722,7 @@
           <w:szCs w:val="20"/>
         </w:rPr>
       </w:pPr>
-      <w:bookmarkStart w:id="22" w:name="_Toc509165849"/>
+      <w:bookmarkStart w:id="23" w:name="_Toc509165849"/>
       <w:r>
         <w:rPr>
           <w:szCs w:val="20"/>
@@ -7817,7 +7730,7 @@
         <w:lastRenderedPageBreak/>
         <w:t>Member Search</w:t>
       </w:r>
-      <w:bookmarkEnd w:id="22"/>
+      <w:bookmarkEnd w:id="23"/>
       <w:r>
         <w:rPr>
           <w:szCs w:val="20"/>
@@ -8030,14 +7943,27 @@
       <w:r>
         <w:t xml:space="preserve">Figure </w:t>
       </w:r>
-      <w:fldSimple w:instr=" SEQ Figure \* ARABIC ">
-        <w:r>
-          <w:rPr>
-            <w:noProof/>
-          </w:rPr>
-          <w:t>6</w:t>
-        </w:r>
-      </w:fldSimple>
+      <w:r>
+        <w:fldChar w:fldCharType="begin"/>
+      </w:r>
+      <w:r>
+        <w:instrText xml:space="preserve"> SEQ Figure \* ARABIC </w:instrText>
+      </w:r>
+      <w:r>
+        <w:fldChar w:fldCharType="separate"/>
+      </w:r>
+      <w:r>
+        <w:rPr>
+          <w:noProof/>
+        </w:rPr>
+        <w:t>6</w:t>
+      </w:r>
+      <w:r>
+        <w:rPr>
+          <w:noProof/>
+        </w:rPr>
+        <w:fldChar w:fldCharType="end"/>
+      </w:r>
       <w:r>
         <w:t>: Member search, blank and with results</w:t>
       </w:r>
@@ -8049,7 +7975,7 @@
           <w:szCs w:val="20"/>
         </w:rPr>
       </w:pPr>
-      <w:bookmarkStart w:id="23" w:name="_Toc509165850"/>
+      <w:bookmarkStart w:id="24" w:name="_Toc509165850"/>
       <w:r>
         <w:rPr>
           <w:szCs w:val="20"/>
@@ -8057,7 +7983,7 @@
         <w:lastRenderedPageBreak/>
         <w:t>Print Recaps</w:t>
       </w:r>
-      <w:bookmarkEnd w:id="23"/>
+      <w:bookmarkEnd w:id="24"/>
       <w:r>
         <w:rPr>
           <w:szCs w:val="20"/>
@@ -8245,14 +8171,27 @@
       <w:r>
         <w:t xml:space="preserve">Figure </w:t>
       </w:r>
-      <w:fldSimple w:instr=" SEQ Figure \* ARABIC ">
-        <w:r>
-          <w:rPr>
-            <w:noProof/>
-          </w:rPr>
-          <w:t>7</w:t>
-        </w:r>
-      </w:fldSimple>
+      <w:r>
+        <w:fldChar w:fldCharType="begin"/>
+      </w:r>
+      <w:r>
+        <w:instrText xml:space="preserve"> SEQ Figure \* ARABIC </w:instrText>
+      </w:r>
+      <w:r>
+        <w:fldChar w:fldCharType="separate"/>
+      </w:r>
+      <w:r>
+        <w:rPr>
+          <w:noProof/>
+        </w:rPr>
+        <w:t>7</w:t>
+      </w:r>
+      <w:r>
+        <w:rPr>
+          <w:noProof/>
+        </w:rPr>
+        <w:fldChar w:fldCharType="end"/>
+      </w:r>
       <w:r>
         <w:t>: basic printer dialog</w:t>
       </w:r>
@@ -8267,14 +8206,14 @@
           <w:szCs w:val="20"/>
         </w:rPr>
       </w:pPr>
-      <w:bookmarkStart w:id="24" w:name="_Toc509165851"/>
+      <w:bookmarkStart w:id="25" w:name="_Toc509165851"/>
       <w:r>
         <w:rPr>
           <w:szCs w:val="20"/>
         </w:rPr>
         <w:t>Import</w:t>
       </w:r>
-      <w:bookmarkEnd w:id="24"/>
+      <w:bookmarkEnd w:id="25"/>
       <w:r>
         <w:rPr>
           <w:szCs w:val="20"/>
@@ -8429,14 +8368,27 @@
       <w:r>
         <w:t xml:space="preserve">Figure </w:t>
       </w:r>
-      <w:fldSimple w:instr=" SEQ Figure \* ARABIC ">
-        <w:r>
-          <w:rPr>
-            <w:noProof/>
-          </w:rPr>
-          <w:t>8</w:t>
-        </w:r>
-      </w:fldSimple>
+      <w:r>
+        <w:fldChar w:fldCharType="begin"/>
+      </w:r>
+      <w:r>
+        <w:instrText xml:space="preserve"> SEQ Figure \* ARABIC </w:instrText>
+      </w:r>
+      <w:r>
+        <w:fldChar w:fldCharType="separate"/>
+      </w:r>
+      <w:r>
+        <w:rPr>
+          <w:noProof/>
+        </w:rPr>
+        <w:t>8</w:t>
+      </w:r>
+      <w:r>
+        <w:rPr>
+          <w:noProof/>
+        </w:rPr>
+        <w:fldChar w:fldCharType="end"/>
+      </w:r>
       <w:r>
         <w:t>: Importing existing player information</w:t>
       </w:r>
@@ -8445,12 +8397,12 @@
       <w:pPr>
         <w:pStyle w:val="Heading1"/>
       </w:pPr>
-      <w:bookmarkStart w:id="25" w:name="_Toc509165852"/>
+      <w:bookmarkStart w:id="26" w:name="_Toc509165852"/>
       <w:r>
         <w:lastRenderedPageBreak/>
         <w:t>Member Scores</w:t>
       </w:r>
-      <w:bookmarkEnd w:id="25"/>
+      <w:bookmarkEnd w:id="26"/>
       <w:r>
         <w:fldChar w:fldCharType="begin"/>
       </w:r>
@@ -8564,14 +8516,27 @@
       <w:r>
         <w:t xml:space="preserve">Figure </w:t>
       </w:r>
-      <w:fldSimple w:instr=" SEQ Figure \* ARABIC ">
-        <w:r>
-          <w:rPr>
-            <w:noProof/>
-          </w:rPr>
-          <w:t>9</w:t>
-        </w:r>
-      </w:fldSimple>
+      <w:r>
+        <w:fldChar w:fldCharType="begin"/>
+      </w:r>
+      <w:r>
+        <w:instrText xml:space="preserve"> SEQ Figure \* ARABIC </w:instrText>
+      </w:r>
+      <w:r>
+        <w:fldChar w:fldCharType="separate"/>
+      </w:r>
+      <w:r>
+        <w:rPr>
+          <w:noProof/>
+        </w:rPr>
+        <w:t>9</w:t>
+      </w:r>
+      <w:r>
+        <w:rPr>
+          <w:noProof/>
+        </w:rPr>
+        <w:fldChar w:fldCharType="end"/>
+      </w:r>
       <w:r>
         <w:t>: Member Scores</w:t>
       </w:r>
@@ -8730,7 +8695,7 @@
           <w:szCs w:val="20"/>
         </w:rPr>
       </w:pPr>
-      <w:bookmarkStart w:id="26" w:name="_Toc509165853"/>
+      <w:bookmarkStart w:id="27" w:name="_Toc509165853"/>
       <w:r>
         <w:rPr>
           <w:szCs w:val="20"/>
@@ -8738,7 +8703,7 @@
         <w:lastRenderedPageBreak/>
         <w:t>Tournament Stats</w:t>
       </w:r>
-      <w:bookmarkEnd w:id="26"/>
+      <w:bookmarkEnd w:id="27"/>
       <w:r>
         <w:rPr>
           <w:szCs w:val="20"/>
@@ -8938,14 +8903,27 @@
       <w:r>
         <w:t xml:space="preserve">Figure </w:t>
       </w:r>
-      <w:fldSimple w:instr=" SEQ Figure \* ARABIC ">
-        <w:r>
-          <w:rPr>
-            <w:noProof/>
-          </w:rPr>
-          <w:t>10</w:t>
-        </w:r>
-      </w:fldSimple>
+      <w:r>
+        <w:fldChar w:fldCharType="begin"/>
+      </w:r>
+      <w:r>
+        <w:instrText xml:space="preserve"> SEQ Figure \* ARABIC </w:instrText>
+      </w:r>
+      <w:r>
+        <w:fldChar w:fldCharType="separate"/>
+      </w:r>
+      <w:r>
+        <w:rPr>
+          <w:noProof/>
+        </w:rPr>
+        <w:t>10</w:t>
+      </w:r>
+      <w:r>
+        <w:rPr>
+          <w:noProof/>
+        </w:rPr>
+        <w:fldChar w:fldCharType="end"/>
+      </w:r>
       <w:r>
         <w:t>: Tournament Stats</w:t>
       </w:r>
@@ -9000,7 +8978,7 @@
           <w:szCs w:val="20"/>
         </w:rPr>
       </w:pPr>
-      <w:bookmarkStart w:id="27" w:name="_Toc509165854"/>
+      <w:bookmarkStart w:id="28" w:name="_Toc509165854"/>
       <w:r>
         <w:rPr>
           <w:szCs w:val="20"/>
@@ -9019,7 +8997,7 @@
         </w:rPr>
         <w:t>By Tournament</w:t>
       </w:r>
-      <w:bookmarkEnd w:id="27"/>
+      <w:bookmarkEnd w:id="28"/>
       <w:r>
         <w:rPr>
           <w:szCs w:val="20"/>
@@ -9187,14 +9165,27 @@
       <w:r>
         <w:t xml:space="preserve">Figure </w:t>
       </w:r>
-      <w:fldSimple w:instr=" SEQ Figure \* ARABIC ">
-        <w:r>
-          <w:rPr>
-            <w:noProof/>
-          </w:rPr>
-          <w:t>11</w:t>
-        </w:r>
-      </w:fldSimple>
+      <w:r>
+        <w:fldChar w:fldCharType="begin"/>
+      </w:r>
+      <w:r>
+        <w:instrText xml:space="preserve"> SEQ Figure \* ARABIC </w:instrText>
+      </w:r>
+      <w:r>
+        <w:fldChar w:fldCharType="separate"/>
+      </w:r>
+      <w:r>
+        <w:rPr>
+          <w:noProof/>
+        </w:rPr>
+        <w:t>11</w:t>
+      </w:r>
+      <w:r>
+        <w:rPr>
+          <w:noProof/>
+        </w:rPr>
+        <w:fldChar w:fldCharType="end"/>
+      </w:r>
       <w:r>
         <w:t xml:space="preserve"> Print Dialog</w:t>
       </w:r>
@@ -9203,12 +9194,12 @@
       <w:pPr>
         <w:pStyle w:val="Heading2"/>
       </w:pPr>
-      <w:bookmarkStart w:id="28" w:name="_Toc509165855"/>
+      <w:bookmarkStart w:id="29" w:name="_Toc509165855"/>
       <w:r>
         <w:lastRenderedPageBreak/>
         <w:t>Tournament Place Standings</w:t>
       </w:r>
-      <w:bookmarkEnd w:id="28"/>
+      <w:bookmarkEnd w:id="29"/>
       <w:r>
         <w:fldChar w:fldCharType="begin"/>
       </w:r>
@@ -9336,14 +9327,27 @@
       <w:r>
         <w:t xml:space="preserve">Figure </w:t>
       </w:r>
-      <w:fldSimple w:instr=" SEQ Figure \* ARABIC ">
-        <w:r>
-          <w:rPr>
-            <w:noProof/>
-          </w:rPr>
-          <w:t>12</w:t>
-        </w:r>
-      </w:fldSimple>
+      <w:r>
+        <w:fldChar w:fldCharType="begin"/>
+      </w:r>
+      <w:r>
+        <w:instrText xml:space="preserve"> SEQ Figure \* ARABIC </w:instrText>
+      </w:r>
+      <w:r>
+        <w:fldChar w:fldCharType="separate"/>
+      </w:r>
+      <w:r>
+        <w:rPr>
+          <w:noProof/>
+        </w:rPr>
+        <w:t>12</w:t>
+      </w:r>
+      <w:r>
+        <w:rPr>
+          <w:noProof/>
+        </w:rPr>
+        <w:fldChar w:fldCharType="end"/>
+      </w:r>
       <w:r>
         <w:t>: Tournament Place Standings</w:t>
       </w:r>
@@ -9377,7 +9381,7 @@
       <w:pPr>
         <w:pStyle w:val="Heading2"/>
       </w:pPr>
-      <w:bookmarkStart w:id="29" w:name="_Toc509165856"/>
+      <w:bookmarkStart w:id="30" w:name="_Toc509165856"/>
       <w:r>
         <w:lastRenderedPageBreak/>
         <w:t xml:space="preserve"> How to create or e</w:t>
@@ -9385,7 +9389,7 @@
       <w:r>
         <w:t>dit Tournament</w:t>
       </w:r>
-      <w:bookmarkEnd w:id="29"/>
+      <w:bookmarkEnd w:id="30"/>
       <w:r>
         <w:fldChar w:fldCharType="begin"/>
       </w:r>
@@ -9647,14 +9651,27 @@
         <w:lastRenderedPageBreak/>
         <w:t xml:space="preserve">Figure </w:t>
       </w:r>
-      <w:fldSimple w:instr=" SEQ Figure \* ARABIC ">
-        <w:r>
-          <w:rPr>
-            <w:noProof/>
-          </w:rPr>
-          <w:t>13</w:t>
-        </w:r>
-      </w:fldSimple>
+      <w:r>
+        <w:fldChar w:fldCharType="begin"/>
+      </w:r>
+      <w:r>
+        <w:instrText xml:space="preserve"> SEQ Figure \* ARABIC </w:instrText>
+      </w:r>
+      <w:r>
+        <w:fldChar w:fldCharType="separate"/>
+      </w:r>
+      <w:r>
+        <w:rPr>
+          <w:noProof/>
+        </w:rPr>
+        <w:t>13</w:t>
+      </w:r>
+      <w:r>
+        <w:rPr>
+          <w:noProof/>
+        </w:rPr>
+        <w:fldChar w:fldCharType="end"/>
+      </w:r>
       <w:r>
         <w:t xml:space="preserve">: </w:t>
       </w:r>
@@ -9697,14 +9714,14 @@
       <w:pPr>
         <w:pStyle w:val="Heading3"/>
       </w:pPr>
-      <w:bookmarkStart w:id="30" w:name="_Toc509165857"/>
+      <w:bookmarkStart w:id="31" w:name="_Toc509165857"/>
       <w:r>
         <w:t xml:space="preserve"> How t</w:t>
       </w:r>
       <w:r>
         <w:t>o Update an Existing Tournament</w:t>
       </w:r>
-      <w:bookmarkEnd w:id="30"/>
+      <w:bookmarkEnd w:id="31"/>
     </w:p>
     <w:p>
       <w:pPr>
@@ -9784,11 +9801,11 @@
       <w:pPr>
         <w:pStyle w:val="Heading2"/>
       </w:pPr>
-      <w:bookmarkStart w:id="31" w:name="_Toc509165858"/>
+      <w:bookmarkStart w:id="32" w:name="_Toc509165858"/>
       <w:r>
         <w:t>Search Tournaments</w:t>
       </w:r>
-      <w:bookmarkEnd w:id="31"/>
+      <w:bookmarkEnd w:id="32"/>
       <w:r>
         <w:fldChar w:fldCharType="begin"/>
       </w:r>
@@ -9956,14 +9973,27 @@
       <w:r>
         <w:t xml:space="preserve">Figure </w:t>
       </w:r>
-      <w:fldSimple w:instr=" SEQ Figure \* ARABIC ">
-        <w:r>
-          <w:rPr>
-            <w:noProof/>
-          </w:rPr>
-          <w:t>14</w:t>
-        </w:r>
-      </w:fldSimple>
+      <w:r>
+        <w:fldChar w:fldCharType="begin"/>
+      </w:r>
+      <w:r>
+        <w:instrText xml:space="preserve"> SEQ Figure \* ARABIC </w:instrText>
+      </w:r>
+      <w:r>
+        <w:fldChar w:fldCharType="separate"/>
+      </w:r>
+      <w:r>
+        <w:rPr>
+          <w:noProof/>
+        </w:rPr>
+        <w:t>14</w:t>
+      </w:r>
+      <w:r>
+        <w:rPr>
+          <w:noProof/>
+        </w:rPr>
+        <w:fldChar w:fldCharType="end"/>
+      </w:r>
       <w:r>
         <w:t>: Tournament Search Forms</w:t>
       </w:r>
@@ -9972,11 +10002,11 @@
       <w:pPr>
         <w:pStyle w:val="Heading3"/>
       </w:pPr>
-      <w:bookmarkStart w:id="32" w:name="_Toc509165859"/>
+      <w:bookmarkStart w:id="33" w:name="_Toc509165859"/>
       <w:r>
         <w:t>Search by Location</w:t>
       </w:r>
-      <w:bookmarkEnd w:id="32"/>
+      <w:bookmarkEnd w:id="33"/>
       <w:r>
         <w:fldChar w:fldCharType="begin"/>
       </w:r>
@@ -10014,11 +10044,11 @@
       <w:pPr>
         <w:pStyle w:val="Heading3"/>
       </w:pPr>
-      <w:bookmarkStart w:id="33" w:name="_Toc509165860"/>
+      <w:bookmarkStart w:id="34" w:name="_Toc509165860"/>
       <w:r>
         <w:t>Search by Event</w:t>
       </w:r>
-      <w:bookmarkEnd w:id="33"/>
+      <w:bookmarkEnd w:id="34"/>
       <w:r>
         <w:fldChar w:fldCharType="begin"/>
       </w:r>
@@ -10114,11 +10144,11 @@
       <w:pPr>
         <w:pStyle w:val="Heading3"/>
       </w:pPr>
-      <w:bookmarkStart w:id="34" w:name="_Toc509165861"/>
+      <w:bookmarkStart w:id="35" w:name="_Toc509165861"/>
       <w:r>
         <w:t>Search by Date</w:t>
       </w:r>
-      <w:bookmarkEnd w:id="34"/>
+      <w:bookmarkEnd w:id="35"/>
       <w:r>
         <w:fldChar w:fldCharType="begin"/>
       </w:r>
@@ -10147,7 +10177,7 @@
       <w:pPr>
         <w:pStyle w:val="Heading2"/>
       </w:pPr>
-      <w:bookmarkStart w:id="35" w:name="_Toc509165862"/>
+      <w:bookmarkStart w:id="36" w:name="_Toc509165862"/>
       <w:r>
         <w:t>List Tournaments</w:t>
       </w:r>
@@ -10182,7 +10212,7 @@
       <w:r>
         <w:t>ear</w:t>
       </w:r>
-      <w:bookmarkEnd w:id="35"/>
+      <w:bookmarkEnd w:id="36"/>
       <w:r>
         <w:fldChar w:fldCharType="begin"/>
       </w:r>
@@ -10392,14 +10422,27 @@
       <w:r>
         <w:t xml:space="preserve">Figure </w:t>
       </w:r>
-      <w:fldSimple w:instr=" SEQ Figure \* ARABIC ">
-        <w:r>
-          <w:rPr>
-            <w:noProof/>
-          </w:rPr>
-          <w:t>15</w:t>
-        </w:r>
-      </w:fldSimple>
+      <w:r>
+        <w:fldChar w:fldCharType="begin"/>
+      </w:r>
+      <w:r>
+        <w:instrText xml:space="preserve"> SEQ Figure \* ARABIC </w:instrText>
+      </w:r>
+      <w:r>
+        <w:fldChar w:fldCharType="separate"/>
+      </w:r>
+      <w:r>
+        <w:rPr>
+          <w:noProof/>
+        </w:rPr>
+        <w:t>15</w:t>
+      </w:r>
+      <w:r>
+        <w:rPr>
+          <w:noProof/>
+        </w:rPr>
+        <w:fldChar w:fldCharType="end"/>
+      </w:r>
       <w:r>
         <w:t>: Tournaments</w:t>
       </w:r>
@@ -10436,12 +10479,12 @@
       <w:pPr>
         <w:pStyle w:val="Heading2"/>
       </w:pPr>
-      <w:bookmarkStart w:id="36" w:name="_Toc509165863"/>
+      <w:bookmarkStart w:id="37" w:name="_Toc509165863"/>
       <w:r>
         <w:lastRenderedPageBreak/>
         <w:t>Reports</w:t>
       </w:r>
-      <w:bookmarkEnd w:id="36"/>
+      <w:bookmarkEnd w:id="37"/>
       <w:r>
         <w:fldChar w:fldCharType="begin"/>
       </w:r>
@@ -10616,14 +10659,27 @@
       <w:r>
         <w:t xml:space="preserve">Figure </w:t>
       </w:r>
-      <w:fldSimple w:instr=" SEQ Figure \* ARABIC ">
-        <w:r>
-          <w:rPr>
-            <w:noProof/>
-          </w:rPr>
-          <w:t>16</w:t>
-        </w:r>
-      </w:fldSimple>
+      <w:r>
+        <w:fldChar w:fldCharType="begin"/>
+      </w:r>
+      <w:r>
+        <w:instrText xml:space="preserve"> SEQ Figure \* ARABIC </w:instrText>
+      </w:r>
+      <w:r>
+        <w:fldChar w:fldCharType="separate"/>
+      </w:r>
+      <w:r>
+        <w:rPr>
+          <w:noProof/>
+        </w:rPr>
+        <w:t>16</w:t>
+      </w:r>
+      <w:r>
+        <w:rPr>
+          <w:noProof/>
+        </w:rPr>
+        <w:fldChar w:fldCharType="end"/>
+      </w:r>
       <w:r>
         <w:t xml:space="preserve"> Member Scores</w:t>
       </w:r>
@@ -10765,12 +10821,12 @@
       <w:pPr>
         <w:pStyle w:val="Heading2"/>
       </w:pPr>
-      <w:bookmarkStart w:id="37" w:name="_Toc509165864"/>
+      <w:bookmarkStart w:id="38" w:name="_Toc509165864"/>
       <w:r>
         <w:lastRenderedPageBreak/>
         <w:t>Tournament Results</w:t>
       </w:r>
-      <w:bookmarkEnd w:id="37"/>
+      <w:bookmarkEnd w:id="38"/>
       <w:r>
         <w:fldChar w:fldCharType="begin"/>
       </w:r>
@@ -10906,14 +10962,27 @@
       <w:r>
         <w:t xml:space="preserve">Figure </w:t>
       </w:r>
-      <w:fldSimple w:instr=" SEQ Figure \* ARABIC ">
-        <w:r>
-          <w:rPr>
-            <w:noProof/>
-          </w:rPr>
-          <w:t>17</w:t>
-        </w:r>
-      </w:fldSimple>
+      <w:r>
+        <w:fldChar w:fldCharType="begin"/>
+      </w:r>
+      <w:r>
+        <w:instrText xml:space="preserve"> SEQ Figure \* ARABIC </w:instrText>
+      </w:r>
+      <w:r>
+        <w:fldChar w:fldCharType="separate"/>
+      </w:r>
+      <w:r>
+        <w:rPr>
+          <w:noProof/>
+        </w:rPr>
+        <w:t>17</w:t>
+      </w:r>
+      <w:r>
+        <w:rPr>
+          <w:noProof/>
+        </w:rPr>
+        <w:fldChar w:fldCharType="end"/>
+      </w:r>
       <w:r>
         <w:t xml:space="preserve"> Tournament Results</w:t>
       </w:r>
@@ -10950,11 +11019,11 @@
       <w:pPr>
         <w:pStyle w:val="Heading2"/>
       </w:pPr>
-      <w:bookmarkStart w:id="38" w:name="_Toc509165865"/>
+      <w:bookmarkStart w:id="39" w:name="_Toc509165865"/>
       <w:r>
         <w:t>Comments</w:t>
       </w:r>
-      <w:bookmarkEnd w:id="38"/>
+      <w:bookmarkEnd w:id="39"/>
       <w:r>
         <w:fldChar w:fldCharType="begin"/>
       </w:r>
@@ -11030,7 +11099,7 @@
       <w:pPr>
         <w:pStyle w:val="Heading1"/>
       </w:pPr>
-      <w:bookmarkStart w:id="39" w:name="_Toc509165866"/>
+      <w:bookmarkStart w:id="40" w:name="_Toc509165866"/>
       <w:r>
         <w:lastRenderedPageBreak/>
         <w:t>Finalize Tournament</w:t>
@@ -11040,11 +11109,11 @@
       <w:pPr>
         <w:pStyle w:val="Heading2"/>
       </w:pPr>
-      <w:commentRangeStart w:id="40"/>
+      <w:commentRangeStart w:id="41"/>
       <w:r>
         <w:t>Finalize</w:t>
       </w:r>
-      <w:commentRangeEnd w:id="40"/>
+      <w:commentRangeEnd w:id="41"/>
       <w:r>
         <w:rPr>
           <w:rStyle w:val="CommentReference"/>
@@ -11053,12 +11122,12 @@
           <w:kern w:val="0"/>
           <w:szCs w:val="20"/>
         </w:rPr>
-        <w:commentReference w:id="40"/>
+        <w:commentReference w:id="41"/>
       </w:r>
       <w:r>
         <w:t xml:space="preserve"> Tournament</w:t>
       </w:r>
-      <w:bookmarkEnd w:id="39"/>
+      <w:bookmarkEnd w:id="40"/>
       <w:r>
         <w:t xml:space="preserve"> Basics</w:t>
       </w:r>
@@ -11352,18 +11421,31 @@
       <w:r>
         <w:t xml:space="preserve">Figure </w:t>
       </w:r>
-      <w:fldSimple w:instr=" SEQ Figure \* ARABIC ">
-        <w:r>
-          <w:rPr>
-            <w:noProof/>
-          </w:rPr>
-          <w:t>18</w:t>
-        </w:r>
-      </w:fldSimple>
+      <w:r>
+        <w:fldChar w:fldCharType="begin"/>
+      </w:r>
+      <w:r>
+        <w:instrText xml:space="preserve"> SEQ Figure \* ARABIC </w:instrText>
+      </w:r>
+      <w:r>
+        <w:fldChar w:fldCharType="separate"/>
+      </w:r>
+      <w:r>
+        <w:rPr>
+          <w:noProof/>
+        </w:rPr>
+        <w:t>18</w:t>
+      </w:r>
+      <w:r>
+        <w:rPr>
+          <w:noProof/>
+        </w:rPr>
+        <w:fldChar w:fldCharType="end"/>
+      </w:r>
       <w:r>
         <w:t xml:space="preserve"> Finalize Tournament</w:t>
       </w:r>
-      <w:commentRangeStart w:id="41"/>
+      <w:commentRangeStart w:id="42"/>
       <w:r>
         <w:fldChar w:fldCharType="begin"/>
       </w:r>
@@ -11389,13 +11471,13 @@
       <w:r>
         <w:fldChar w:fldCharType="end"/>
       </w:r>
-      <w:commentRangeEnd w:id="41"/>
+      <w:commentRangeEnd w:id="42"/>
       <w:r>
         <w:rPr>
           <w:rStyle w:val="CommentReference"/>
           <w:spacing w:val="0"/>
         </w:rPr>
-        <w:commentReference w:id="41"/>
+        <w:commentReference w:id="42"/>
       </w:r>
       <w:r>
         <w:t xml:space="preserve"> Screen</w:t>
@@ -12483,11 +12565,11 @@
       <w:pPr>
         <w:pStyle w:val="Heading1"/>
       </w:pPr>
-      <w:bookmarkStart w:id="42" w:name="_Toc509165867"/>
+      <w:bookmarkStart w:id="43" w:name="_Toc509165867"/>
       <w:r>
         <w:t>Tools</w:t>
       </w:r>
-      <w:bookmarkEnd w:id="42"/>
+      <w:bookmarkEnd w:id="43"/>
       <w:r>
         <w:fldChar w:fldCharType="begin"/>
       </w:r>
@@ -12536,8 +12618,6 @@
       <w:r>
         <w:t>The current options include Backup Database, Restore Database, and Update Inactive Members.</w:t>
       </w:r>
-      <w:bookmarkStart w:id="43" w:name="_GoBack"/>
-      <w:bookmarkEnd w:id="43"/>
     </w:p>
     <w:p>
       <w:pPr>
@@ -12602,13 +12682,7 @@
         <w:keepNext/>
       </w:pPr>
       <w:r>
-        <w:t>Under the tools tab, the third</w:t>
-      </w:r>
-      <w:r>
-        <w:t xml:space="preserve"> tool is for updating</w:t>
-      </w:r>
-      <w:r>
-        <w:t xml:space="preserve"> the </w:t>
+        <w:t xml:space="preserve">Under the tools tab, the third tool is for updating the </w:t>
       </w:r>
       <w:r>
         <w:t xml:space="preserve">active status of members. Members </w:t>
@@ -12627,7 +12701,7 @@
           <w:noProof/>
         </w:rPr>
         <w:pict w14:anchorId="6C066037">
-          <v:shape id="_x0000_i1028" type="#_x0000_t75" style="width:216.75pt;height:369.75pt">
+          <v:shape id="_x0000_i1027" type="#_x0000_t75" style="width:216.75pt;height:369.75pt">
             <v:imagedata r:id="rId50" o:title="UpdateInactiveMemberForm"/>
           </v:shape>
         </w:pict>
@@ -12641,27 +12715,14 @@
       <w:r>
         <w:t xml:space="preserve">Figure </w:t>
       </w:r>
-      <w:r>
-        <w:fldChar w:fldCharType="begin"/>
-      </w:r>
-      <w:r>
-        <w:instrText xml:space="preserve"> SEQ Figure \* ARABIC </w:instrText>
-      </w:r>
-      <w:r>
-        <w:fldChar w:fldCharType="separate"/>
-      </w:r>
-      <w:r>
-        <w:rPr>
-          <w:noProof/>
-        </w:rPr>
-        <w:t>19</w:t>
-      </w:r>
-      <w:r>
-        <w:rPr>
-          <w:noProof/>
-        </w:rPr>
-        <w:fldChar w:fldCharType="end"/>
-      </w:r>
+      <w:fldSimple w:instr=" SEQ Figure \* ARABIC ">
+        <w:r>
+          <w:rPr>
+            <w:noProof/>
+          </w:rPr>
+          <w:t>19</w:t>
+        </w:r>
+      </w:fldSimple>
       <w:r>
         <w:t>: Update Inactive status screen</w:t>
       </w:r>
@@ -13027,14 +13088,27 @@
       <w:r>
         <w:t xml:space="preserve">Figure </w:t>
       </w:r>
-      <w:fldSimple w:instr=" SEQ Figure \* ARABIC ">
-        <w:r>
-          <w:rPr>
-            <w:noProof/>
-          </w:rPr>
-          <w:t>20</w:t>
-        </w:r>
-      </w:fldSimple>
+      <w:r>
+        <w:fldChar w:fldCharType="begin"/>
+      </w:r>
+      <w:r>
+        <w:instrText xml:space="preserve"> SEQ Figure \* ARABIC </w:instrText>
+      </w:r>
+      <w:r>
+        <w:fldChar w:fldCharType="separate"/>
+      </w:r>
+      <w:r>
+        <w:rPr>
+          <w:noProof/>
+        </w:rPr>
+        <w:t>20</w:t>
+      </w:r>
+      <w:r>
+        <w:rPr>
+          <w:noProof/>
+        </w:rPr>
+        <w:fldChar w:fldCharType="end"/>
+      </w:r>
       <w:r>
         <w:t xml:space="preserve"> Showing split screen error</w:t>
       </w:r>
@@ -13102,14 +13176,27 @@
                             <w:r>
                               <w:t xml:space="preserve">Figure </w:t>
                             </w:r>
-                            <w:fldSimple w:instr=" SEQ Figure \* ARABIC ">
-                              <w:r>
-                                <w:rPr>
-                                  <w:noProof/>
-                                </w:rPr>
-                                <w:t>21</w:t>
-                              </w:r>
-                            </w:fldSimple>
+                            <w:r>
+                              <w:fldChar w:fldCharType="begin"/>
+                            </w:r>
+                            <w:r>
+                              <w:instrText xml:space="preserve"> SEQ Figure \* ARABIC </w:instrText>
+                            </w:r>
+                            <w:r>
+                              <w:fldChar w:fldCharType="separate"/>
+                            </w:r>
+                            <w:r>
+                              <w:rPr>
+                                <w:noProof/>
+                              </w:rPr>
+                              <w:t>21</w:t>
+                            </w:r>
+                            <w:r>
+                              <w:rPr>
+                                <w:noProof/>
+                              </w:rPr>
+                              <w:fldChar w:fldCharType="end"/>
+                            </w:r>
                             <w:r>
                               <w:t xml:space="preserve"> Inner screen maximize</w:t>
                             </w:r>
@@ -13151,14 +13238,27 @@
                       <w:r>
                         <w:t xml:space="preserve">Figure </w:t>
                       </w:r>
-                      <w:fldSimple w:instr=" SEQ Figure \* ARABIC ">
-                        <w:r>
-                          <w:rPr>
-                            <w:noProof/>
-                          </w:rPr>
-                          <w:t>21</w:t>
-                        </w:r>
-                      </w:fldSimple>
+                      <w:r>
+                        <w:fldChar w:fldCharType="begin"/>
+                      </w:r>
+                      <w:r>
+                        <w:instrText xml:space="preserve"> SEQ Figure \* ARABIC </w:instrText>
+                      </w:r>
+                      <w:r>
+                        <w:fldChar w:fldCharType="separate"/>
+                      </w:r>
+                      <w:r>
+                        <w:rPr>
+                          <w:noProof/>
+                        </w:rPr>
+                        <w:t>21</w:t>
+                      </w:r>
+                      <w:r>
+                        <w:rPr>
+                          <w:noProof/>
+                        </w:rPr>
+                        <w:fldChar w:fldCharType="end"/>
+                      </w:r>
                       <w:r>
                         <w:t xml:space="preserve"> Inner screen maximize</w:t>
                       </w:r>
@@ -13356,7 +13456,7 @@
       </w:pPr>
       <w:r>
         <w:pict w14:anchorId="0E18A813">
-          <v:shape id="_x0000_i1029" type="#_x0000_t75" style="width:384pt;height:199.5pt">
+          <v:shape id="_x0000_i1028" type="#_x0000_t75" style="width:384pt;height:199.5pt">
             <v:imagedata r:id="rId53" o:title="9TapMemberInfo"/>
           </v:shape>
         </w:pict>
@@ -13374,7 +13474,7 @@
       <w:r>
         <w:lastRenderedPageBreak/>
         <w:pict w14:anchorId="5B245710">
-          <v:shape id="_x0000_i1030" type="#_x0000_t75" style="width:383.25pt;height:204.75pt">
+          <v:shape id="_x0000_i1029" type="#_x0000_t75" style="width:383.25pt;height:204.75pt">
             <v:imagedata r:id="rId54" o:title="MemberInfoSwappedLayout"/>
           </v:shape>
         </w:pict>
@@ -13516,7 +13616,7 @@
       </w:pPr>
       <w:r>
         <w:pict w14:anchorId="3F82314C">
-          <v:shape id="_x0000_i1027" type="#_x0000_t75" style="width:384pt;height:207pt">
+          <v:shape id="_x0000_i1030" type="#_x0000_t75" style="width:384pt;height:207pt">
             <v:imagedata r:id="rId55" o:title="ImportButtonExample"/>
           </v:shape>
         </w:pict>
@@ -16965,7 +17065,7 @@
           <w:noProof/>
         </w:rPr>
         <w:lastRenderedPageBreak/>
-        <w:t>About, 33, 38</w:t>
+        <w:t>About, 40, 45</w:t>
       </w:r>
     </w:p>
     <w:p>
@@ -16999,7 +17099,7 @@
         <w:rPr>
           <w:noProof/>
         </w:rPr>
-        <w:t>Add Region, 11, 33</w:t>
+        <w:t>Add Region, 11, 40</w:t>
       </w:r>
     </w:p>
     <w:p>
@@ -17016,7 +17116,7 @@
         <w:rPr>
           <w:noProof/>
         </w:rPr>
-        <w:t>Average, 13, 24, 34</w:t>
+        <w:t>Average, 41</w:t>
       </w:r>
     </w:p>
     <w:p>
@@ -17033,7 +17133,7 @@
         <w:rPr>
           <w:noProof/>
         </w:rPr>
-        <w:t>Bonus, 34, 36</w:t>
+        <w:t>Bonus, 41, 43</w:t>
       </w:r>
     </w:p>
     <w:p>
@@ -17050,7 +17150,7 @@
         <w:rPr>
           <w:noProof/>
         </w:rPr>
-        <w:t>Comments, 23, 38</w:t>
+        <w:t>Comments, 25, 45</w:t>
       </w:r>
     </w:p>
     <w:p>
@@ -17067,7 +17167,7 @@
         <w:rPr>
           <w:noProof/>
         </w:rPr>
-        <w:t>Comp Entry, 36</w:t>
+        <w:t>Comp Entry, 43</w:t>
       </w:r>
     </w:p>
     <w:p>
@@ -17084,7 +17184,7 @@
         <w:rPr>
           <w:noProof/>
         </w:rPr>
-        <w:t>Conversion Program, 31</w:t>
+        <w:t>Conversion Program, 38</w:t>
       </w:r>
     </w:p>
     <w:p>
@@ -17101,7 +17201,7 @@
         <w:rPr>
           <w:noProof/>
         </w:rPr>
-        <w:t>Create/Edit Tournament, 9, 20, 37</w:t>
+        <w:t>Create/Edit Tournament, 9, 21, 22, 44</w:t>
       </w:r>
     </w:p>
     <w:p>
@@ -17118,7 +17218,7 @@
         <w:rPr>
           <w:noProof/>
         </w:rPr>
-        <w:t>Delete Member From Tournament, 37</w:t>
+        <w:t>Delete Member From Tournament, 44</w:t>
       </w:r>
     </w:p>
     <w:p>
@@ -17135,7 +17235,7 @@
         <w:rPr>
           <w:noProof/>
         </w:rPr>
-        <w:t>Edit Existing Tournament…, 20</w:t>
+        <w:t>Edit Existing Tournament…, 22</w:t>
       </w:r>
     </w:p>
     <w:p>
@@ -17152,7 +17252,7 @@
         <w:rPr>
           <w:noProof/>
         </w:rPr>
-        <w:t>Exit, 11, 33, 38</w:t>
+        <w:t>Exit, 11, 40, 45</w:t>
       </w:r>
     </w:p>
     <w:p>
@@ -17169,7 +17269,7 @@
         <w:rPr>
           <w:noProof/>
         </w:rPr>
-        <w:t>Finalize Tournament, 23, 38</w:t>
+        <w:t>Finalize Tournament, 26, 45</w:t>
       </w:r>
     </w:p>
     <w:p>
@@ -17186,7 +17286,7 @@
         <w:rPr>
           <w:noProof/>
         </w:rPr>
-        <w:t>General Information, 33</w:t>
+        <w:t>General Information, 40</w:t>
       </w:r>
     </w:p>
     <w:p>
@@ -17203,7 +17303,7 @@
         <w:rPr>
           <w:noProof/>
         </w:rPr>
-        <w:t>Handicap, 34, 36</w:t>
+        <w:t>Handicap, 41, 43</w:t>
       </w:r>
     </w:p>
     <w:p>
@@ -17220,7 +17320,7 @@
         <w:rPr>
           <w:noProof/>
         </w:rPr>
-        <w:t>High Game, 36</w:t>
+        <w:t>High Game, 43</w:t>
       </w:r>
     </w:p>
     <w:p>
@@ -17237,7 +17337,7 @@
         <w:rPr>
           <w:noProof/>
         </w:rPr>
-        <w:t>High Series, 36</w:t>
+        <w:t>High Series, 43</w:t>
       </w:r>
     </w:p>
     <w:p>
@@ -17254,7 +17354,7 @@
         <w:rPr>
           <w:noProof/>
         </w:rPr>
-        <w:t>Home, 33</w:t>
+        <w:t>Home, 40</w:t>
       </w:r>
     </w:p>
     <w:p>
@@ -17271,7 +17371,7 @@
         <w:rPr>
           <w:noProof/>
         </w:rPr>
-        <w:t>import existing, 16, 33</w:t>
+        <w:t>import existing, 17, 40</w:t>
       </w:r>
     </w:p>
     <w:p>
@@ -17305,7 +17405,7 @@
         <w:rPr>
           <w:noProof/>
         </w:rPr>
-        <w:t>Last Bowled, 34</w:t>
+        <w:t>Last Bowled, 41</w:t>
       </w:r>
     </w:p>
     <w:p>
@@ -17322,7 +17422,7 @@
         <w:rPr>
           <w:noProof/>
         </w:rPr>
-        <w:t>List Tournaments By Year, 22, 37</w:t>
+        <w:t>List Tournaments By Year, 23, 44</w:t>
       </w:r>
     </w:p>
     <w:p>
@@ -17339,7 +17439,7 @@
         <w:rPr>
           <w:noProof/>
         </w:rPr>
-        <w:t>Main Menu, 5, 11, 33, 38</w:t>
+        <w:t>Main Menu, 5, 11, 40, 45</w:t>
       </w:r>
     </w:p>
     <w:p>
@@ -17356,7 +17456,7 @@
         <w:rPr>
           <w:noProof/>
         </w:rPr>
-        <w:t>Member Info, 9, 11, 12, 14, 33</w:t>
+        <w:t>Member Info, 9, 11, 12, 14, 40</w:t>
       </w:r>
     </w:p>
     <w:p>
@@ -17373,7 +17473,7 @@
         <w:rPr>
           <w:noProof/>
         </w:rPr>
-        <w:t>Member Number, 17, 33, 35</w:t>
+        <w:t>Member Number, 18, 40, 42</w:t>
       </w:r>
     </w:p>
     <w:p>
@@ -17390,7 +17490,7 @@
         <w:rPr>
           <w:noProof/>
         </w:rPr>
-        <w:t>Member Scores, 9, 11, 17, 18, 19, 20, 21, 22, 23, 33, 35</w:t>
+        <w:t>Member Scores, 9, 11, 18, 19, 20, 22, 24, 25, 40, 42</w:t>
       </w:r>
     </w:p>
     <w:p>
@@ -17407,7 +17507,7 @@
         <w:rPr>
           <w:noProof/>
         </w:rPr>
-        <w:t>Member Scores Reports, 22, 37</w:t>
+        <w:t>Member Scores Reports, 24, 44</w:t>
       </w:r>
     </w:p>
     <w:p>
@@ -17424,7 +17524,7 @@
         <w:rPr>
           <w:noProof/>
         </w:rPr>
-        <w:t>Member Search, 13, 15, 35</w:t>
+        <w:t>Member Search, 14, 16, 42</w:t>
       </w:r>
     </w:p>
     <w:p>
@@ -17441,7 +17541,7 @@
         <w:rPr>
           <w:noProof/>
         </w:rPr>
-        <w:t>Member Status, 36</w:t>
+        <w:t>Member Status, 43</w:t>
       </w:r>
     </w:p>
     <w:p>
@@ -17476,7 +17576,7 @@
         <w:rPr>
           <w:noProof/>
         </w:rPr>
-        <w:t xml:space="preserve">Money Earned, 34, </w:t>
+        <w:t xml:space="preserve">Money Earned, 41, </w:t>
       </w:r>
       <w:r>
         <w:rPr>
@@ -17506,7 +17606,7 @@
         <w:rPr>
           <w:noProof/>
         </w:rPr>
-        <w:t>Money Won, 36</w:t>
+        <w:t>Money Won, 43</w:t>
       </w:r>
     </w:p>
     <w:p>
@@ -17540,7 +17640,7 @@
         <w:rPr>
           <w:noProof/>
         </w:rPr>
-        <w:t>Print Recaps, 16, 35</w:t>
+        <w:t>Print Recaps, 17, 42</w:t>
       </w:r>
     </w:p>
     <w:p>
@@ -17557,7 +17657,7 @@
         <w:rPr>
           <w:noProof/>
         </w:rPr>
-        <w:t>Print Recaps By Tournament, 18, 37</w:t>
+        <w:t>Print Recaps By Tournament, 19, 44</w:t>
       </w:r>
     </w:p>
     <w:p>
@@ -17574,7 +17674,7 @@
         <w:rPr>
           <w:noProof/>
         </w:rPr>
-        <w:t>Qualify By Squad, 36</w:t>
+        <w:t>Qualify By Squad, 43</w:t>
       </w:r>
     </w:p>
     <w:p>
@@ -17625,7 +17725,7 @@
         <w:rPr>
           <w:noProof/>
         </w:rPr>
-        <w:t>ReadMe File, 29</w:t>
+        <w:t>ReadMe File, 35</w:t>
       </w:r>
     </w:p>
     <w:p>
@@ -17642,7 +17742,7 @@
         <w:rPr>
           <w:noProof/>
         </w:rPr>
-        <w:t>Record, 9, 12, 17, 18, 34, 35, 36</w:t>
+        <w:t>Record, 9, 12, 18, 41, 42, 44</w:t>
       </w:r>
     </w:p>
     <w:p>
@@ -17659,7 +17759,7 @@
         <w:rPr>
           <w:noProof/>
         </w:rPr>
-        <w:t>Region, 11, 33</w:t>
+        <w:t>Region, 11, 40</w:t>
       </w:r>
     </w:p>
     <w:p>
@@ -17676,7 +17776,7 @@
         <w:rPr>
           <w:noProof/>
         </w:rPr>
-        <w:t>Reports, 22, 37</w:t>
+        <w:t>Reports, 24, 44</w:t>
       </w:r>
     </w:p>
     <w:p>
@@ -17693,7 +17793,7 @@
         <w:rPr>
           <w:noProof/>
         </w:rPr>
-        <w:t>Score Type, 36</w:t>
+        <w:t>Score Type, 43</w:t>
       </w:r>
     </w:p>
     <w:p>
@@ -17710,7 +17810,7 @@
         <w:rPr>
           <w:noProof/>
         </w:rPr>
-        <w:t>Search by Date, 21</w:t>
+        <w:t>Search by Date, 23</w:t>
       </w:r>
     </w:p>
     <w:p>
@@ -17727,7 +17827,7 @@
         <w:rPr>
           <w:noProof/>
         </w:rPr>
-        <w:t>Search by Event, 21</w:t>
+        <w:t>Search by Event, 22</w:t>
       </w:r>
     </w:p>
     <w:p>
@@ -17744,7 +17844,7 @@
         <w:rPr>
           <w:noProof/>
         </w:rPr>
-        <w:t>Search by Location, 21</w:t>
+        <w:t>Search by Location, 22</w:t>
       </w:r>
     </w:p>
     <w:p>
@@ -17761,7 +17861,7 @@
         <w:rPr>
           <w:noProof/>
         </w:rPr>
-        <w:t>Search Tournaments, 20, 21, 37</w:t>
+        <w:t>Search Tournaments, 22, 44</w:t>
       </w:r>
     </w:p>
     <w:p>
@@ -17778,7 +17878,7 @@
         <w:rPr>
           <w:noProof/>
         </w:rPr>
-        <w:t>Squad Number, 17, 36</w:t>
+        <w:t>Squad Number, 18, 43</w:t>
       </w:r>
     </w:p>
     <w:p>
@@ -17795,7 +17895,7 @@
         <w:rPr>
           <w:noProof/>
         </w:rPr>
-        <w:t>Stats, 14, 17, 35, 36</w:t>
+        <w:t>Stats, 15, 18, 42, 43</w:t>
       </w:r>
     </w:p>
     <w:p>
@@ -17829,7 +17929,7 @@
         <w:rPr>
           <w:noProof/>
         </w:rPr>
-        <w:t>Tools, 25, 33, 38</w:t>
+        <w:t>Tools, 30, 40, 45</w:t>
       </w:r>
     </w:p>
     <w:p>
@@ -17846,7 +17946,7 @@
         <w:rPr>
           <w:noProof/>
         </w:rPr>
-        <w:t>Tournament File, 17, 37</w:t>
+        <w:t>Tournament File, 18, 44</w:t>
       </w:r>
     </w:p>
     <w:p>
@@ -17863,7 +17963,7 @@
         <w:rPr>
           <w:noProof/>
         </w:rPr>
-        <w:t>Tournament Place Standings, 19, 37</w:t>
+        <w:t>Tournament Place Standings, 20, 44</w:t>
       </w:r>
     </w:p>
     <w:p>
@@ -17880,7 +17980,7 @@
         <w:rPr>
           <w:noProof/>
         </w:rPr>
-        <w:t>Tournament Results, 23, 36, 37</w:t>
+        <w:t>Tournament Results, 25, 43, 45</w:t>
       </w:r>
     </w:p>
     <w:p>
@@ -17897,7 +17997,7 @@
         <w:rPr>
           <w:noProof/>
         </w:rPr>
-        <w:t>Tournament Stats, 18, 37</w:t>
+        <w:t>Tournament Stats, 19, 44</w:t>
       </w:r>
     </w:p>
     <w:p>
@@ -17914,7 +18014,7 @@
         <w:rPr>
           <w:noProof/>
         </w:rPr>
-        <w:t>Tournaments, 37</w:t>
+        <w:t>Tournaments, 44</w:t>
       </w:r>
     </w:p>
     <w:p>
@@ -17931,7 +18031,7 @@
         <w:rPr>
           <w:noProof/>
         </w:rPr>
-        <w:t>Troubleshooting, 5, 26, 27</w:t>
+        <w:t>Troubleshooting, 5, 32, 33</w:t>
       </w:r>
     </w:p>
     <w:p>
@@ -17948,7 +18048,7 @@
         <w:rPr>
           <w:noProof/>
         </w:rPr>
-        <w:t>Updating Members, 13</w:t>
+        <w:t>Updating Members, 14</w:t>
       </w:r>
     </w:p>
     <w:p>
@@ -17965,7 +18065,7 @@
         <w:rPr>
           <w:noProof/>
         </w:rPr>
-        <w:t>Year End Tournaments, 34</w:t>
+        <w:t>Year End Tournaments, 41</w:t>
       </w:r>
     </w:p>
     <w:p>
@@ -18232,7 +18332,7 @@
 
 <file path=word/comments.xml><?xml version="1.0" encoding="utf-8"?>
 <w:comments xmlns:wpc="http://schemas.microsoft.com/office/word/2010/wordprocessingCanvas" xmlns:mc="http://schemas.openxmlformats.org/markup-compatibility/2006" xmlns:o="urn:schemas-microsoft-com:office:office" xmlns:r="http://schemas.openxmlformats.org/officeDocument/2006/relationships" xmlns:m="http://schemas.openxmlformats.org/officeDocument/2006/math" xmlns:v="urn:schemas-microsoft-com:vml" xmlns:wp14="http://schemas.microsoft.com/office/word/2010/wordprocessingDrawing" xmlns:wp="http://schemas.openxmlformats.org/drawingml/2006/wordprocessingDrawing" xmlns:w10="urn:schemas-microsoft-com:office:word" xmlns:w="http://schemas.openxmlformats.org/wordprocessingml/2006/main" xmlns:w14="http://schemas.microsoft.com/office/word/2010/wordml" xmlns:w15="http://schemas.microsoft.com/office/word/2012/wordml" xmlns:wpg="http://schemas.microsoft.com/office/word/2010/wordprocessingGroup" xmlns:wpi="http://schemas.microsoft.com/office/word/2010/wordprocessingInk" xmlns:wne="http://schemas.microsoft.com/office/word/2006/wordml" xmlns:wps="http://schemas.microsoft.com/office/word/2010/wordprocessingShape" mc:Ignorable="w14 w15 wp14">
-  <w:comment w:id="40" w:author="Timothy Fair" w:date="2018-07-25T14:36:00Z" w:initials="TF">
+  <w:comment w:id="41" w:author="Timothy Fair" w:date="2018-07-25T14:36:00Z" w:initials="TF">
     <w:p>
       <w:pPr>
         <w:pStyle w:val="CommentText"/>
@@ -18245,7 +18345,7 @@
       </w:r>
     </w:p>
   </w:comment>
-  <w:comment w:id="41" w:author="Timothy Fair" w:date="2018-07-25T14:36:00Z" w:initials="TF">
+  <w:comment w:id="42" w:author="Timothy Fair" w:date="2018-07-25T14:36:00Z" w:initials="TF">
     <w:p>
       <w:pPr>
         <w:pStyle w:val="CommentText"/>
@@ -18389,7 +18489,7 @@
         <w:rStyle w:val="PageNumber"/>
         <w:noProof/>
       </w:rPr>
-      <w:t>40</w:t>
+      <w:t>8</w:t>
     </w:r>
     <w:r>
       <w:rPr>
@@ -18439,7 +18539,7 @@
         <w:rStyle w:val="PageNumber"/>
         <w:noProof/>
       </w:rPr>
-      <w:t>44</w:t>
+      <w:t>46</w:t>
     </w:r>
     <w:r>
       <w:rPr>
@@ -21490,7 +21590,7 @@
 </file>
 
 <file path=customXml/itemProps1.xml><?xml version="1.0" encoding="utf-8"?>
-<ds:datastoreItem xmlns:ds="http://schemas.openxmlformats.org/officeDocument/2006/customXml" ds:itemID="{84336954-7237-4B45-AFD1-1509C22047CF}">
+<ds:datastoreItem xmlns:ds="http://schemas.openxmlformats.org/officeDocument/2006/customXml" ds:itemID="{143FA339-910F-456A-8AF3-F337D042038D}">
   <ds:schemaRefs>
     <ds:schemaRef ds:uri="http://schemas.openxmlformats.org/officeDocument/2006/bibliography"/>
   </ds:schemaRefs>

</xml_diff>

<commit_message>
Improvements to instructions for the main menu, and a longer description regarding adding and deleting regions from 9-tap.
</commit_message>
<xml_diff>
--- a/9tapUserManual.docx
+++ b/9tapUserManual.docx
@@ -4353,27 +4353,14 @@
       <w:r>
         <w:t xml:space="preserve">Figure </w:t>
       </w:r>
-      <w:r>
-        <w:fldChar w:fldCharType="begin"/>
-      </w:r>
-      <w:r>
-        <w:instrText xml:space="preserve"> SEQ Figure \* ARABIC </w:instrText>
-      </w:r>
-      <w:r>
-        <w:fldChar w:fldCharType="separate"/>
-      </w:r>
-      <w:r>
-        <w:rPr>
-          <w:noProof/>
-        </w:rPr>
-        <w:t>1</w:t>
-      </w:r>
-      <w:r>
-        <w:rPr>
-          <w:noProof/>
-        </w:rPr>
-        <w:fldChar w:fldCharType="end"/>
-      </w:r>
+      <w:fldSimple w:instr=" SEQ Figure \* ARABIC ">
+        <w:r>
+          <w:rPr>
+            <w:noProof/>
+          </w:rPr>
+          <w:t>1</w:t>
+        </w:r>
+      </w:fldSimple>
       <w:r>
         <w:t>: 9-Tap Main Menu</w:t>
       </w:r>
@@ -5155,8 +5142,6 @@
         <w:pStyle w:val="Heading2"/>
       </w:pPr>
       <w:bookmarkStart w:id="11" w:name="_Toc509165838"/>
-      <w:bookmarkStart w:id="12" w:name="_GoBack"/>
-      <w:bookmarkEnd w:id="12"/>
       <w:r>
         <w:t>How do I Launch 9-Tap?</w:t>
       </w:r>
@@ -5183,7 +5168,7 @@
       <w:pPr>
         <w:pStyle w:val="Heading2"/>
       </w:pPr>
-      <w:bookmarkStart w:id="13" w:name="_Toc509165839"/>
+      <w:bookmarkStart w:id="12" w:name="_Toc509165839"/>
       <w:r>
         <w:t>How do I import existing</w:t>
       </w:r>
@@ -5215,7 +5200,7 @@
       <w:r>
         <w:t xml:space="preserve"> members?</w:t>
       </w:r>
-      <w:bookmarkEnd w:id="13"/>
+      <w:bookmarkEnd w:id="12"/>
     </w:p>
     <w:p>
       <w:pPr>
@@ -5287,11 +5272,11 @@
       <w:pPr>
         <w:pStyle w:val="Heading2"/>
       </w:pPr>
-      <w:bookmarkStart w:id="14" w:name="_Toc509165840"/>
+      <w:bookmarkStart w:id="13" w:name="_Toc509165840"/>
       <w:r>
         <w:t>How do I enter a new player?</w:t>
       </w:r>
-      <w:bookmarkEnd w:id="14"/>
+      <w:bookmarkEnd w:id="13"/>
     </w:p>
     <w:p>
       <w:pPr>
@@ -5369,11 +5354,11 @@
       <w:pPr>
         <w:pStyle w:val="Heading2"/>
       </w:pPr>
-      <w:bookmarkStart w:id="15" w:name="_Toc509165841"/>
+      <w:bookmarkStart w:id="14" w:name="_Toc509165841"/>
       <w:r>
         <w:t>How do I create a tournament?</w:t>
       </w:r>
-      <w:bookmarkEnd w:id="15"/>
+      <w:bookmarkEnd w:id="14"/>
     </w:p>
     <w:p>
       <w:pPr>
@@ -5506,11 +5491,11 @@
       <w:pPr>
         <w:pStyle w:val="Heading2"/>
       </w:pPr>
-      <w:bookmarkStart w:id="16" w:name="_Toc509165842"/>
+      <w:bookmarkStart w:id="15" w:name="_Toc509165842"/>
       <w:r>
         <w:t>How do I enter a bowler’s scores?</w:t>
       </w:r>
-      <w:bookmarkEnd w:id="16"/>
+      <w:bookmarkEnd w:id="15"/>
     </w:p>
     <w:p>
       <w:pPr>
@@ -5734,7 +5719,7 @@
           <w:szCs w:val="32"/>
         </w:rPr>
       </w:pPr>
-      <w:bookmarkStart w:id="17" w:name="_Toc509165843"/>
+      <w:bookmarkStart w:id="16" w:name="_Toc509165843"/>
       <w:r>
         <w:rPr>
           <w:szCs w:val="32"/>
@@ -5742,7 +5727,7 @@
         <w:lastRenderedPageBreak/>
         <w:t>Main Menu</w:t>
       </w:r>
-      <w:bookmarkEnd w:id="17"/>
+      <w:bookmarkEnd w:id="16"/>
       <w:r>
         <w:rPr>
           <w:szCs w:val="32"/>
@@ -5808,250 +5793,34 @@
     </w:p>
     <w:p>
       <w:pPr>
+        <w:pStyle w:val="BodyText"/>
+      </w:pPr>
+      <w:r>
+        <w:t>When launching 9-tap, the user will be greeted by the main menu of the program. The varying functions of the program may be acce</w:t>
+      </w:r>
+      <w:r>
+        <w:t>ssed here.</w:t>
+      </w:r>
+      <w:r>
+        <w:t xml:space="preserve"> From the top of the window there are tabs for Home, Member Info, Member Scores, and Tools. To the left most of the window are buttons for Member Info, Member Scores, About, and Exit. Below these buttons is a dropdown list for the region of 9-tap, the Add Region button, and the Delete Region button.</w:t>
+      </w:r>
+      <w:r>
+        <w:t xml:space="preserve"> Clicking a tab or a button will take the user to the part of the program specified.</w:t>
+      </w:r>
+      <w:r>
+        <w:t xml:space="preserve"> Clicking About will display information regarding the 9-</w:t>
+      </w:r>
+      <w:r>
+        <w:t>tap tournament.</w:t>
+      </w:r>
+    </w:p>
+    <w:p>
+      <w:pPr>
         <w:pStyle w:val="Heading8"/>
         <w:framePr w:wrap="around"/>
       </w:pPr>
       <w:r>
         <w:t>An indepth look at the 9-Tap program</w:t>
-      </w:r>
-    </w:p>
-    <w:p>
-      <w:pPr>
-        <w:pStyle w:val="BodyText"/>
-        <w:keepNext/>
-      </w:pPr>
-      <w:r>
-        <w:t xml:space="preserve">After launching 9-Tap, </w:t>
-      </w:r>
-      <w:r>
-        <w:t>the</w:t>
-      </w:r>
-      <w:r>
-        <w:t xml:space="preserve"> main menu screen will display. This</w:t>
-      </w:r>
-      <w:r>
-        <w:t xml:space="preserve"> is where you access the various functions of the program. Member Info</w:t>
-      </w:r>
-      <w:r>
-        <w:fldChar w:fldCharType="begin"/>
-      </w:r>
-      <w:r>
-        <w:instrText xml:space="preserve"> XE "</w:instrText>
-      </w:r>
-      <w:r>
-        <w:instrText>Member Info</w:instrText>
-      </w:r>
-      <w:r>
-        <w:instrText xml:space="preserve">" </w:instrText>
-      </w:r>
-      <w:r>
-        <w:fldChar w:fldCharType="end"/>
-      </w:r>
-      <w:r>
-        <w:fldChar w:fldCharType="begin"/>
-      </w:r>
-      <w:r>
-        <w:instrText xml:space="preserve"> E "</w:instrText>
-      </w:r>
-      <w:r>
-        <w:instrText>Member Info</w:instrText>
-      </w:r>
-      <w:r>
-        <w:instrText xml:space="preserve">" </w:instrText>
-      </w:r>
-      <w:r>
-        <w:fldChar w:fldCharType="separate"/>
-      </w:r>
-      <w:r>
-        <w:rPr>
-          <w:b/>
-          <w:bCs/>
-        </w:rPr>
-        <w:t xml:space="preserve"> </w:t>
-      </w:r>
-      <w:r>
-        <w:fldChar w:fldCharType="end"/>
-      </w:r>
-      <w:r>
-        <w:t>, button and tab. Member Scores</w:t>
-      </w:r>
-      <w:r>
-        <w:fldChar w:fldCharType="begin"/>
-      </w:r>
-      <w:r>
-        <w:instrText xml:space="preserve"> XE "</w:instrText>
-      </w:r>
-      <w:r>
-        <w:instrText>Member Scores</w:instrText>
-      </w:r>
-      <w:r>
-        <w:instrText xml:space="preserve">" </w:instrText>
-      </w:r>
-      <w:r>
-        <w:fldChar w:fldCharType="end"/>
-      </w:r>
-      <w:r>
-        <w:fldChar w:fldCharType="begin"/>
-      </w:r>
-      <w:r>
-        <w:instrText xml:space="preserve"> E "</w:instrText>
-      </w:r>
-      <w:r>
-        <w:instrText>Member Scores</w:instrText>
-      </w:r>
-      <w:r>
-        <w:instrText xml:space="preserve">" </w:instrText>
-      </w:r>
-      <w:r>
-        <w:fldChar w:fldCharType="separate"/>
-      </w:r>
-      <w:r>
-        <w:rPr>
-          <w:b/>
-          <w:bCs/>
-        </w:rPr>
-        <w:t xml:space="preserve"> </w:t>
-      </w:r>
-      <w:r>
-        <w:fldChar w:fldCharType="end"/>
-      </w:r>
-      <w:r>
-        <w:t>, button and tab. The About</w:t>
-      </w:r>
-      <w:r>
-        <w:fldChar w:fldCharType="begin"/>
-      </w:r>
-      <w:r>
-        <w:instrText xml:space="preserve"> E "</w:instrText>
-      </w:r>
-      <w:r>
-        <w:instrText>About</w:instrText>
-      </w:r>
-      <w:r>
-        <w:instrText xml:space="preserve">" </w:instrText>
-      </w:r>
-      <w:r>
-        <w:fldChar w:fldCharType="separate"/>
-      </w:r>
-      <w:r>
-        <w:rPr>
-          <w:b/>
-          <w:bCs/>
-        </w:rPr>
-        <w:t xml:space="preserve"> </w:t>
-      </w:r>
-      <w:r>
-        <w:fldChar w:fldCharType="end"/>
-      </w:r>
-      <w:r>
-        <w:t xml:space="preserve"> and Exit</w:t>
-      </w:r>
-      <w:r>
-        <w:fldChar w:fldCharType="begin"/>
-      </w:r>
-      <w:r>
-        <w:instrText xml:space="preserve"> XE "</w:instrText>
-      </w:r>
-      <w:r>
-        <w:instrText>Exit</w:instrText>
-      </w:r>
-      <w:r>
-        <w:instrText xml:space="preserve">" </w:instrText>
-      </w:r>
-      <w:r>
-        <w:fldChar w:fldCharType="end"/>
-      </w:r>
-      <w:r>
-        <w:fldChar w:fldCharType="begin"/>
-      </w:r>
-      <w:r>
-        <w:instrText xml:space="preserve"> E "</w:instrText>
-      </w:r>
-      <w:r>
-        <w:instrText>Exit</w:instrText>
-      </w:r>
-      <w:r>
-        <w:instrText xml:space="preserve">" </w:instrText>
-      </w:r>
-      <w:r>
-        <w:fldChar w:fldCharType="separate"/>
-      </w:r>
-      <w:r>
-        <w:rPr>
-          <w:b/>
-          <w:bCs/>
-        </w:rPr>
-        <w:t xml:space="preserve"> </w:t>
-      </w:r>
-      <w:r>
-        <w:fldChar w:fldCharType="end"/>
-      </w:r>
-      <w:r>
-        <w:t xml:space="preserve"> buttons. The Region</w:t>
-      </w:r>
-      <w:r>
-        <w:fldChar w:fldCharType="begin"/>
-      </w:r>
-      <w:r>
-        <w:instrText xml:space="preserve"> XE "</w:instrText>
-      </w:r>
-      <w:r>
-        <w:instrText>Region</w:instrText>
-      </w:r>
-      <w:r>
-        <w:instrText xml:space="preserve">" </w:instrText>
-      </w:r>
-      <w:r>
-        <w:fldChar w:fldCharType="end"/>
-      </w:r>
-      <w:r>
-        <w:fldChar w:fldCharType="begin"/>
-      </w:r>
-      <w:r>
-        <w:instrText xml:space="preserve"> E "</w:instrText>
-      </w:r>
-      <w:r>
-        <w:instrText>Region</w:instrText>
-      </w:r>
-      <w:r>
-        <w:instrText xml:space="preserve">" </w:instrText>
-      </w:r>
-      <w:r>
-        <w:fldChar w:fldCharType="separate"/>
-      </w:r>
-      <w:r>
-        <w:rPr>
-          <w:b/>
-          <w:bCs/>
-        </w:rPr>
-        <w:t xml:space="preserve"> </w:t>
-      </w:r>
-      <w:r>
-        <w:fldChar w:fldCharType="end"/>
-      </w:r>
-      <w:r>
-        <w:t xml:space="preserve"> picker. And the “Add Region</w:t>
-      </w:r>
-      <w:r>
-        <w:fldChar w:fldCharType="begin"/>
-      </w:r>
-      <w:r>
-        <w:instrText xml:space="preserve"> XE "</w:instrText>
-      </w:r>
-      <w:r>
-        <w:instrText>Add Region</w:instrText>
-      </w:r>
-      <w:r>
-        <w:instrText xml:space="preserve">" </w:instrText>
-      </w:r>
-      <w:r>
-        <w:fldChar w:fldCharType="end"/>
-      </w:r>
-      <w:r>
-        <w:t>” button. Also, the tools tab accesses the active/inactive member dialog.</w:t>
-      </w:r>
-      <w:r>
-        <w:t xml:space="preserve"> The Delete Region Data button will delete all data from the selected regions’ database. The user will be prompted upon clicking this button to make sure if they want to delete this data.</w:t>
       </w:r>
     </w:p>
     <w:p>
@@ -6121,27 +5890,14 @@
       <w:r>
         <w:t xml:space="preserve">Figure </w:t>
       </w:r>
-      <w:r>
-        <w:fldChar w:fldCharType="begin"/>
-      </w:r>
-      <w:r>
-        <w:instrText xml:space="preserve"> SEQ Figure \* ARABIC </w:instrText>
-      </w:r>
-      <w:r>
-        <w:fldChar w:fldCharType="separate"/>
-      </w:r>
-      <w:r>
-        <w:rPr>
-          <w:noProof/>
-        </w:rPr>
-        <w:t>2</w:t>
-      </w:r>
-      <w:r>
-        <w:rPr>
-          <w:noProof/>
-        </w:rPr>
-        <w:fldChar w:fldCharType="end"/>
-      </w:r>
+      <w:fldSimple w:instr=" SEQ Figure \* ARABIC ">
+        <w:r>
+          <w:rPr>
+            <w:noProof/>
+          </w:rPr>
+          <w:t>2</w:t>
+        </w:r>
+      </w:fldSimple>
       <w:r>
         <w:t>: Main Menu</w:t>
       </w:r>
@@ -6200,6 +5956,72 @@
       </w:r>
       <w:r>
         <w:fldChar w:fldCharType="end"/>
+      </w:r>
+    </w:p>
+    <w:p>
+      <w:pPr>
+        <w:pStyle w:val="Heading2"/>
+      </w:pPr>
+      <w:r>
+        <w:t>Regions</w:t>
+      </w:r>
+    </w:p>
+    <w:p>
+      <w:pPr>
+        <w:pStyle w:val="BodyText"/>
+      </w:pPr>
+      <w:r>
+        <w:t>9-</w:t>
+      </w:r>
+      <w:r>
+        <w:t xml:space="preserve">tap is currently divided into two </w:t>
+      </w:r>
+      <w:r>
+        <w:t xml:space="preserve">separate regions, </w:t>
+      </w:r>
+      <w:r>
+        <w:t>those</w:t>
+      </w:r>
+      <w:bookmarkStart w:id="17" w:name="_GoBack"/>
+      <w:bookmarkEnd w:id="17"/>
+      <w:r>
+        <w:t xml:space="preserve"> two being Washington state and Hawaii.</w:t>
+      </w:r>
+      <w:r>
+        <w:t xml:space="preserve"> As 9-tap expands more regio</w:t>
+      </w:r>
+      <w:r>
+        <w:t>ns may be added to the program. A region can be added to the program by clicking the Add Region button. This will open a window for the region’s name to be entered into.</w:t>
+      </w:r>
+      <w:r>
+        <w:t xml:space="preserve"> Pressing the Submit button in this window will add the r</w:t>
+      </w:r>
+      <w:r>
+        <w:t xml:space="preserve">egion to the </w:t>
+      </w:r>
+      <w:r>
+        <w:t>9-tap</w:t>
+      </w:r>
+      <w:r>
+        <w:t xml:space="preserve"> database</w:t>
+      </w:r>
+      <w:r>
+        <w:t>.</w:t>
+      </w:r>
+      <w:r>
+        <w:t xml:space="preserve"> If a mistake was made in creating a region, or a region needs to be dropped from 9-tap there is the Delete Region Data button. Clicking this button will open a prompt to delete the last region added to 9-tap from its database.</w:t>
+      </w:r>
+      <w:r>
+        <w:t xml:space="preserve"> Note</w:t>
+      </w:r>
+      <w:r>
+        <w:t xml:space="preserve"> that the button will not delete the currently selected region from the drop down</w:t>
+      </w:r>
+      <w:r>
+        <w:t xml:space="preserve"> menu</w:t>
+      </w:r>
+      <w:r>
+        <w:t>, but the region which was most recently added to 9-tap.</w:t>
       </w:r>
     </w:p>
     <w:p>
@@ -6381,30 +6203,14 @@
       <w:r>
         <w:t xml:space="preserve">Figure </w:t>
       </w:r>
-      <w:r>
-        <w:fldChar w:fldCharType="begin"/>
-      </w:r>
-      <w:r>
-        <w:instrText xml:space="preserve"> SEQ Figure \* ARABIC</w:instrText>
-      </w:r>
-      <w:r>
-        <w:instrText xml:space="preserve"> </w:instrText>
-      </w:r>
-      <w:r>
-        <w:fldChar w:fldCharType="separate"/>
-      </w:r>
-      <w:r>
-        <w:rPr>
-          <w:noProof/>
-        </w:rPr>
-        <w:t>3</w:t>
-      </w:r>
-      <w:r>
-        <w:rPr>
-          <w:noProof/>
-        </w:rPr>
-        <w:fldChar w:fldCharType="end"/>
-      </w:r>
+      <w:fldSimple w:instr=" SEQ Figure \* ARABIC ">
+        <w:r>
+          <w:rPr>
+            <w:noProof/>
+          </w:rPr>
+          <w:t>3</w:t>
+        </w:r>
+      </w:fldSimple>
       <w:r>
         <w:t>: Member Information</w:t>
       </w:r>
@@ -7334,27 +7140,14 @@
       <w:r>
         <w:t xml:space="preserve">Figure </w:t>
       </w:r>
-      <w:r>
-        <w:fldChar w:fldCharType="begin"/>
-      </w:r>
-      <w:r>
-        <w:instrText xml:space="preserve"> SEQ Figure \* ARABIC </w:instrText>
-      </w:r>
-      <w:r>
-        <w:fldChar w:fldCharType="separate"/>
-      </w:r>
-      <w:r>
-        <w:rPr>
-          <w:noProof/>
-        </w:rPr>
-        <w:t>4</w:t>
-      </w:r>
-      <w:r>
-        <w:rPr>
-          <w:noProof/>
-        </w:rPr>
-        <w:fldChar w:fldCharType="end"/>
-      </w:r>
+      <w:fldSimple w:instr=" SEQ Figure \* ARABIC ">
+        <w:r>
+          <w:rPr>
+            <w:noProof/>
+          </w:rPr>
+          <w:t>4</w:t>
+        </w:r>
+      </w:fldSimple>
       <w:r>
         <w:t>: Member Information</w:t>
       </w:r>
@@ -7684,27 +7477,14 @@
       <w:r>
         <w:t xml:space="preserve">Figure </w:t>
       </w:r>
-      <w:r>
-        <w:fldChar w:fldCharType="begin"/>
-      </w:r>
-      <w:r>
-        <w:instrText xml:space="preserve"> SEQ Figure \* ARABIC </w:instrText>
-      </w:r>
-      <w:r>
-        <w:fldChar w:fldCharType="separate"/>
-      </w:r>
-      <w:r>
-        <w:rPr>
-          <w:noProof/>
-        </w:rPr>
-        <w:t>5</w:t>
-      </w:r>
-      <w:r>
-        <w:rPr>
-          <w:noProof/>
-        </w:rPr>
-        <w:fldChar w:fldCharType="end"/>
-      </w:r>
+      <w:fldSimple w:instr=" SEQ Figure \* ARABIC ">
+        <w:r>
+          <w:rPr>
+            <w:noProof/>
+          </w:rPr>
+          <w:t>5</w:t>
+        </w:r>
+      </w:fldSimple>
       <w:r>
         <w:t>: Stats</w:t>
       </w:r>
@@ -7943,27 +7723,14 @@
       <w:r>
         <w:t xml:space="preserve">Figure </w:t>
       </w:r>
-      <w:r>
-        <w:fldChar w:fldCharType="begin"/>
-      </w:r>
-      <w:r>
-        <w:instrText xml:space="preserve"> SEQ Figure \* ARABIC </w:instrText>
-      </w:r>
-      <w:r>
-        <w:fldChar w:fldCharType="separate"/>
-      </w:r>
-      <w:r>
-        <w:rPr>
-          <w:noProof/>
-        </w:rPr>
-        <w:t>6</w:t>
-      </w:r>
-      <w:r>
-        <w:rPr>
-          <w:noProof/>
-        </w:rPr>
-        <w:fldChar w:fldCharType="end"/>
-      </w:r>
+      <w:fldSimple w:instr=" SEQ Figure \* ARABIC ">
+        <w:r>
+          <w:rPr>
+            <w:noProof/>
+          </w:rPr>
+          <w:t>6</w:t>
+        </w:r>
+      </w:fldSimple>
       <w:r>
         <w:t>: Member search, blank and with results</w:t>
       </w:r>
@@ -8171,27 +7938,14 @@
       <w:r>
         <w:t xml:space="preserve">Figure </w:t>
       </w:r>
-      <w:r>
-        <w:fldChar w:fldCharType="begin"/>
-      </w:r>
-      <w:r>
-        <w:instrText xml:space="preserve"> SEQ Figure \* ARABIC </w:instrText>
-      </w:r>
-      <w:r>
-        <w:fldChar w:fldCharType="separate"/>
-      </w:r>
-      <w:r>
-        <w:rPr>
-          <w:noProof/>
-        </w:rPr>
-        <w:t>7</w:t>
-      </w:r>
-      <w:r>
-        <w:rPr>
-          <w:noProof/>
-        </w:rPr>
-        <w:fldChar w:fldCharType="end"/>
-      </w:r>
+      <w:fldSimple w:instr=" SEQ Figure \* ARABIC ">
+        <w:r>
+          <w:rPr>
+            <w:noProof/>
+          </w:rPr>
+          <w:t>7</w:t>
+        </w:r>
+      </w:fldSimple>
       <w:r>
         <w:t>: basic printer dialog</w:t>
       </w:r>
@@ -8368,27 +8122,14 @@
       <w:r>
         <w:t xml:space="preserve">Figure </w:t>
       </w:r>
-      <w:r>
-        <w:fldChar w:fldCharType="begin"/>
-      </w:r>
-      <w:r>
-        <w:instrText xml:space="preserve"> SEQ Figure \* ARABIC </w:instrText>
-      </w:r>
-      <w:r>
-        <w:fldChar w:fldCharType="separate"/>
-      </w:r>
-      <w:r>
-        <w:rPr>
-          <w:noProof/>
-        </w:rPr>
-        <w:t>8</w:t>
-      </w:r>
-      <w:r>
-        <w:rPr>
-          <w:noProof/>
-        </w:rPr>
-        <w:fldChar w:fldCharType="end"/>
-      </w:r>
+      <w:fldSimple w:instr=" SEQ Figure \* ARABIC ">
+        <w:r>
+          <w:rPr>
+            <w:noProof/>
+          </w:rPr>
+          <w:t>8</w:t>
+        </w:r>
+      </w:fldSimple>
       <w:r>
         <w:t>: Importing existing player information</w:t>
       </w:r>
@@ -8516,27 +8257,14 @@
       <w:r>
         <w:t xml:space="preserve">Figure </w:t>
       </w:r>
-      <w:r>
-        <w:fldChar w:fldCharType="begin"/>
-      </w:r>
-      <w:r>
-        <w:instrText xml:space="preserve"> SEQ Figure \* ARABIC </w:instrText>
-      </w:r>
-      <w:r>
-        <w:fldChar w:fldCharType="separate"/>
-      </w:r>
-      <w:r>
-        <w:rPr>
-          <w:noProof/>
-        </w:rPr>
-        <w:t>9</w:t>
-      </w:r>
-      <w:r>
-        <w:rPr>
-          <w:noProof/>
-        </w:rPr>
-        <w:fldChar w:fldCharType="end"/>
-      </w:r>
+      <w:fldSimple w:instr=" SEQ Figure \* ARABIC ">
+        <w:r>
+          <w:rPr>
+            <w:noProof/>
+          </w:rPr>
+          <w:t>9</w:t>
+        </w:r>
+      </w:fldSimple>
       <w:r>
         <w:t>: Member Scores</w:t>
       </w:r>
@@ -8903,27 +8631,14 @@
       <w:r>
         <w:t xml:space="preserve">Figure </w:t>
       </w:r>
-      <w:r>
-        <w:fldChar w:fldCharType="begin"/>
-      </w:r>
-      <w:r>
-        <w:instrText xml:space="preserve"> SEQ Figure \* ARABIC </w:instrText>
-      </w:r>
-      <w:r>
-        <w:fldChar w:fldCharType="separate"/>
-      </w:r>
-      <w:r>
-        <w:rPr>
-          <w:noProof/>
-        </w:rPr>
-        <w:t>10</w:t>
-      </w:r>
-      <w:r>
-        <w:rPr>
-          <w:noProof/>
-        </w:rPr>
-        <w:fldChar w:fldCharType="end"/>
-      </w:r>
+      <w:fldSimple w:instr=" SEQ Figure \* ARABIC ">
+        <w:r>
+          <w:rPr>
+            <w:noProof/>
+          </w:rPr>
+          <w:t>10</w:t>
+        </w:r>
+      </w:fldSimple>
       <w:r>
         <w:t>: Tournament Stats</w:t>
       </w:r>
@@ -9165,27 +8880,14 @@
       <w:r>
         <w:t xml:space="preserve">Figure </w:t>
       </w:r>
-      <w:r>
-        <w:fldChar w:fldCharType="begin"/>
-      </w:r>
-      <w:r>
-        <w:instrText xml:space="preserve"> SEQ Figure \* ARABIC </w:instrText>
-      </w:r>
-      <w:r>
-        <w:fldChar w:fldCharType="separate"/>
-      </w:r>
-      <w:r>
-        <w:rPr>
-          <w:noProof/>
-        </w:rPr>
-        <w:t>11</w:t>
-      </w:r>
-      <w:r>
-        <w:rPr>
-          <w:noProof/>
-        </w:rPr>
-        <w:fldChar w:fldCharType="end"/>
-      </w:r>
+      <w:fldSimple w:instr=" SEQ Figure \* ARABIC ">
+        <w:r>
+          <w:rPr>
+            <w:noProof/>
+          </w:rPr>
+          <w:t>11</w:t>
+        </w:r>
+      </w:fldSimple>
       <w:r>
         <w:t xml:space="preserve"> Print Dialog</w:t>
       </w:r>
@@ -9327,27 +9029,14 @@
       <w:r>
         <w:t xml:space="preserve">Figure </w:t>
       </w:r>
-      <w:r>
-        <w:fldChar w:fldCharType="begin"/>
-      </w:r>
-      <w:r>
-        <w:instrText xml:space="preserve"> SEQ Figure \* ARABIC </w:instrText>
-      </w:r>
-      <w:r>
-        <w:fldChar w:fldCharType="separate"/>
-      </w:r>
-      <w:r>
-        <w:rPr>
-          <w:noProof/>
-        </w:rPr>
-        <w:t>12</w:t>
-      </w:r>
-      <w:r>
-        <w:rPr>
-          <w:noProof/>
-        </w:rPr>
-        <w:fldChar w:fldCharType="end"/>
-      </w:r>
+      <w:fldSimple w:instr=" SEQ Figure \* ARABIC ">
+        <w:r>
+          <w:rPr>
+            <w:noProof/>
+          </w:rPr>
+          <w:t>12</w:t>
+        </w:r>
+      </w:fldSimple>
       <w:r>
         <w:t>: Tournament Place Standings</w:t>
       </w:r>
@@ -9651,27 +9340,14 @@
         <w:lastRenderedPageBreak/>
         <w:t xml:space="preserve">Figure </w:t>
       </w:r>
-      <w:r>
-        <w:fldChar w:fldCharType="begin"/>
-      </w:r>
-      <w:r>
-        <w:instrText xml:space="preserve"> SEQ Figure \* ARABIC </w:instrText>
-      </w:r>
-      <w:r>
-        <w:fldChar w:fldCharType="separate"/>
-      </w:r>
-      <w:r>
-        <w:rPr>
-          <w:noProof/>
-        </w:rPr>
-        <w:t>13</w:t>
-      </w:r>
-      <w:r>
-        <w:rPr>
-          <w:noProof/>
-        </w:rPr>
-        <w:fldChar w:fldCharType="end"/>
-      </w:r>
+      <w:fldSimple w:instr=" SEQ Figure \* ARABIC ">
+        <w:r>
+          <w:rPr>
+            <w:noProof/>
+          </w:rPr>
+          <w:t>13</w:t>
+        </w:r>
+      </w:fldSimple>
       <w:r>
         <w:t xml:space="preserve">: </w:t>
       </w:r>
@@ -9973,27 +9649,14 @@
       <w:r>
         <w:t xml:space="preserve">Figure </w:t>
       </w:r>
-      <w:r>
-        <w:fldChar w:fldCharType="begin"/>
-      </w:r>
-      <w:r>
-        <w:instrText xml:space="preserve"> SEQ Figure \* ARABIC </w:instrText>
-      </w:r>
-      <w:r>
-        <w:fldChar w:fldCharType="separate"/>
-      </w:r>
-      <w:r>
-        <w:rPr>
-          <w:noProof/>
-        </w:rPr>
-        <w:t>14</w:t>
-      </w:r>
-      <w:r>
-        <w:rPr>
-          <w:noProof/>
-        </w:rPr>
-        <w:fldChar w:fldCharType="end"/>
-      </w:r>
+      <w:fldSimple w:instr=" SEQ Figure \* ARABIC ">
+        <w:r>
+          <w:rPr>
+            <w:noProof/>
+          </w:rPr>
+          <w:t>14</w:t>
+        </w:r>
+      </w:fldSimple>
       <w:r>
         <w:t>: Tournament Search Forms</w:t>
       </w:r>
@@ -10422,27 +10085,14 @@
       <w:r>
         <w:t xml:space="preserve">Figure </w:t>
       </w:r>
-      <w:r>
-        <w:fldChar w:fldCharType="begin"/>
-      </w:r>
-      <w:r>
-        <w:instrText xml:space="preserve"> SEQ Figure \* ARABIC </w:instrText>
-      </w:r>
-      <w:r>
-        <w:fldChar w:fldCharType="separate"/>
-      </w:r>
-      <w:r>
-        <w:rPr>
-          <w:noProof/>
-        </w:rPr>
-        <w:t>15</w:t>
-      </w:r>
-      <w:r>
-        <w:rPr>
-          <w:noProof/>
-        </w:rPr>
-        <w:fldChar w:fldCharType="end"/>
-      </w:r>
+      <w:fldSimple w:instr=" SEQ Figure \* ARABIC ">
+        <w:r>
+          <w:rPr>
+            <w:noProof/>
+          </w:rPr>
+          <w:t>15</w:t>
+        </w:r>
+      </w:fldSimple>
       <w:r>
         <w:t>: Tournaments</w:t>
       </w:r>
@@ -10659,27 +10309,14 @@
       <w:r>
         <w:t xml:space="preserve">Figure </w:t>
       </w:r>
-      <w:r>
-        <w:fldChar w:fldCharType="begin"/>
-      </w:r>
-      <w:r>
-        <w:instrText xml:space="preserve"> SEQ Figure \* ARABIC </w:instrText>
-      </w:r>
-      <w:r>
-        <w:fldChar w:fldCharType="separate"/>
-      </w:r>
-      <w:r>
-        <w:rPr>
-          <w:noProof/>
-        </w:rPr>
-        <w:t>16</w:t>
-      </w:r>
-      <w:r>
-        <w:rPr>
-          <w:noProof/>
-        </w:rPr>
-        <w:fldChar w:fldCharType="end"/>
-      </w:r>
+      <w:fldSimple w:instr=" SEQ Figure \* ARABIC ">
+        <w:r>
+          <w:rPr>
+            <w:noProof/>
+          </w:rPr>
+          <w:t>16</w:t>
+        </w:r>
+      </w:fldSimple>
       <w:r>
         <w:t xml:space="preserve"> Member Scores</w:t>
       </w:r>
@@ -10962,27 +10599,14 @@
       <w:r>
         <w:t xml:space="preserve">Figure </w:t>
       </w:r>
-      <w:r>
-        <w:fldChar w:fldCharType="begin"/>
-      </w:r>
-      <w:r>
-        <w:instrText xml:space="preserve"> SEQ Figure \* ARABIC </w:instrText>
-      </w:r>
-      <w:r>
-        <w:fldChar w:fldCharType="separate"/>
-      </w:r>
-      <w:r>
-        <w:rPr>
-          <w:noProof/>
-        </w:rPr>
-        <w:t>17</w:t>
-      </w:r>
-      <w:r>
-        <w:rPr>
-          <w:noProof/>
-        </w:rPr>
-        <w:fldChar w:fldCharType="end"/>
-      </w:r>
+      <w:fldSimple w:instr=" SEQ Figure \* ARABIC ">
+        <w:r>
+          <w:rPr>
+            <w:noProof/>
+          </w:rPr>
+          <w:t>17</w:t>
+        </w:r>
+      </w:fldSimple>
       <w:r>
         <w:t xml:space="preserve"> Tournament Results</w:t>
       </w:r>
@@ -11408,7 +11032,7 @@
           <w:noProof/>
         </w:rPr>
         <w:pict w14:anchorId="225EA388">
-          <v:shape id="_x0000_i1026" type="#_x0000_t75" style="width:384pt;height:222.75pt">
+          <v:shape id="_x0000_i1026" type="#_x0000_t75" style="width:384.45pt;height:222.8pt">
             <v:imagedata r:id="rId35" o:title="FinalizeTournamentWindow"/>
           </v:shape>
         </w:pict>
@@ -11421,27 +11045,14 @@
       <w:r>
         <w:t xml:space="preserve">Figure </w:t>
       </w:r>
-      <w:r>
-        <w:fldChar w:fldCharType="begin"/>
-      </w:r>
-      <w:r>
-        <w:instrText xml:space="preserve"> SEQ Figure \* ARABIC </w:instrText>
-      </w:r>
-      <w:r>
-        <w:fldChar w:fldCharType="separate"/>
-      </w:r>
-      <w:r>
-        <w:rPr>
-          <w:noProof/>
-        </w:rPr>
-        <w:t>18</w:t>
-      </w:r>
-      <w:r>
-        <w:rPr>
-          <w:noProof/>
-        </w:rPr>
-        <w:fldChar w:fldCharType="end"/>
-      </w:r>
+      <w:fldSimple w:instr=" SEQ Figure \* ARABIC ">
+        <w:r>
+          <w:rPr>
+            <w:noProof/>
+          </w:rPr>
+          <w:t>18</w:t>
+        </w:r>
+      </w:fldSimple>
       <w:r>
         <w:t xml:space="preserve"> Finalize Tournament</w:t>
       </w:r>
@@ -12701,7 +12312,7 @@
           <w:noProof/>
         </w:rPr>
         <w:pict w14:anchorId="6C066037">
-          <v:shape id="_x0000_i1027" type="#_x0000_t75" style="width:216.75pt;height:369.75pt">
+          <v:shape id="_x0000_i1027" type="#_x0000_t75" style="width:216.7pt;height:369.5pt">
             <v:imagedata r:id="rId50" o:title="UpdateInactiveMemberForm"/>
           </v:shape>
         </w:pict>
@@ -13088,27 +12699,14 @@
       <w:r>
         <w:t xml:space="preserve">Figure </w:t>
       </w:r>
-      <w:r>
-        <w:fldChar w:fldCharType="begin"/>
-      </w:r>
-      <w:r>
-        <w:instrText xml:space="preserve"> SEQ Figure \* ARABIC </w:instrText>
-      </w:r>
-      <w:r>
-        <w:fldChar w:fldCharType="separate"/>
-      </w:r>
-      <w:r>
-        <w:rPr>
-          <w:noProof/>
-        </w:rPr>
-        <w:t>20</w:t>
-      </w:r>
-      <w:r>
-        <w:rPr>
-          <w:noProof/>
-        </w:rPr>
-        <w:fldChar w:fldCharType="end"/>
-      </w:r>
+      <w:fldSimple w:instr=" SEQ Figure \* ARABIC ">
+        <w:r>
+          <w:rPr>
+            <w:noProof/>
+          </w:rPr>
+          <w:t>20</w:t>
+        </w:r>
+      </w:fldSimple>
       <w:r>
         <w:t xml:space="preserve"> Showing split screen error</w:t>
       </w:r>
@@ -13176,27 +12774,14 @@
                             <w:r>
                               <w:t xml:space="preserve">Figure </w:t>
                             </w:r>
-                            <w:r>
-                              <w:fldChar w:fldCharType="begin"/>
-                            </w:r>
-                            <w:r>
-                              <w:instrText xml:space="preserve"> SEQ Figure \* ARABIC </w:instrText>
-                            </w:r>
-                            <w:r>
-                              <w:fldChar w:fldCharType="separate"/>
-                            </w:r>
-                            <w:r>
-                              <w:rPr>
-                                <w:noProof/>
-                              </w:rPr>
-                              <w:t>21</w:t>
-                            </w:r>
-                            <w:r>
-                              <w:rPr>
-                                <w:noProof/>
-                              </w:rPr>
-                              <w:fldChar w:fldCharType="end"/>
-                            </w:r>
+                            <w:fldSimple w:instr=" SEQ Figure \* ARABIC ">
+                              <w:r>
+                                <w:rPr>
+                                  <w:noProof/>
+                                </w:rPr>
+                                <w:t>21</w:t>
+                              </w:r>
+                            </w:fldSimple>
                             <w:r>
                               <w:t xml:space="preserve"> Inner screen maximize</w:t>
                             </w:r>
@@ -13238,27 +12823,14 @@
                       <w:r>
                         <w:t xml:space="preserve">Figure </w:t>
                       </w:r>
-                      <w:r>
-                        <w:fldChar w:fldCharType="begin"/>
-                      </w:r>
-                      <w:r>
-                        <w:instrText xml:space="preserve"> SEQ Figure \* ARABIC </w:instrText>
-                      </w:r>
-                      <w:r>
-                        <w:fldChar w:fldCharType="separate"/>
-                      </w:r>
-                      <w:r>
-                        <w:rPr>
-                          <w:noProof/>
-                        </w:rPr>
-                        <w:t>21</w:t>
-                      </w:r>
-                      <w:r>
-                        <w:rPr>
-                          <w:noProof/>
-                        </w:rPr>
-                        <w:fldChar w:fldCharType="end"/>
-                      </w:r>
+                      <w:fldSimple w:instr=" SEQ Figure \* ARABIC ">
+                        <w:r>
+                          <w:rPr>
+                            <w:noProof/>
+                          </w:rPr>
+                          <w:t>21</w:t>
+                        </w:r>
+                      </w:fldSimple>
                       <w:r>
                         <w:t xml:space="preserve"> Inner screen maximize</w:t>
                       </w:r>
@@ -13456,7 +13028,7 @@
       </w:pPr>
       <w:r>
         <w:pict w14:anchorId="0E18A813">
-          <v:shape id="_x0000_i1028" type="#_x0000_t75" style="width:384pt;height:199.5pt">
+          <v:shape id="_x0000_i1028" type="#_x0000_t75" style="width:383.75pt;height:199.7pt">
             <v:imagedata r:id="rId53" o:title="9TapMemberInfo"/>
           </v:shape>
         </w:pict>
@@ -13474,7 +13046,7 @@
       <w:r>
         <w:lastRenderedPageBreak/>
         <w:pict w14:anchorId="5B245710">
-          <v:shape id="_x0000_i1029" type="#_x0000_t75" style="width:383.25pt;height:204.75pt">
+          <v:shape id="_x0000_i1029" type="#_x0000_t75" style="width:383.1pt;height:205.15pt">
             <v:imagedata r:id="rId54" o:title="MemberInfoSwappedLayout"/>
           </v:shape>
         </w:pict>
@@ -13616,7 +13188,7 @@
       </w:pPr>
       <w:r>
         <w:pict w14:anchorId="3F82314C">
-          <v:shape id="_x0000_i1030" type="#_x0000_t75" style="width:384pt;height:207pt">
+          <v:shape id="_x0000_i1030" type="#_x0000_t75" style="width:384.45pt;height:207.15pt">
             <v:imagedata r:id="rId55" o:title="ImportButtonExample"/>
           </v:shape>
         </w:pict>
@@ -18489,7 +18061,7 @@
         <w:rStyle w:val="PageNumber"/>
         <w:noProof/>
       </w:rPr>
-      <w:t>8</w:t>
+      <w:t>19</w:t>
     </w:r>
     <w:r>
       <w:rPr>
@@ -21590,7 +21162,7 @@
 </file>
 
 <file path=customXml/itemProps1.xml><?xml version="1.0" encoding="utf-8"?>
-<ds:datastoreItem xmlns:ds="http://schemas.openxmlformats.org/officeDocument/2006/customXml" ds:itemID="{143FA339-910F-456A-8AF3-F337D042038D}">
+<ds:datastoreItem xmlns:ds="http://schemas.openxmlformats.org/officeDocument/2006/customXml" ds:itemID="{BB1A6166-7680-42E3-85BB-A56C96CFFC05}">
   <ds:schemaRefs>
     <ds:schemaRef ds:uri="http://schemas.openxmlformats.org/officeDocument/2006/bibliography"/>
   </ds:schemaRefs>

</xml_diff>